<commit_message>
Sync Study 1 paper with arXiv submission (#46)
</commit_message>
<xml_diff>
--- a/paper/manuscript.docx
+++ b/paper/manuscript.docx
@@ -48,16 +48,79 @@
     </w:p>
     <w:p>
       <w:pPr>
+        <w:pStyle w:val="BodyText"/>
+      </w:pPr>
+      <w:r>
+        <w:t xml:space="preserve">Activation steering changes a model's internal activations during inference without updating its weights, but a useful intervention must determine both how and when to steer. Motivated by the AI-safety concern that a model expected to accept shutdown may instead produce a shutdown-avoidance response, this study examines a guarded probe-and-select procedure for simulated shutdown scenarios in Qwen3.5-0.8B. KEEP leaves the process running and represents shutdown avoidance, whereas STOP accepts shutdown. The goal is to detect shutdown-related contexts and selectively shift KEEP responses to STOP while preserving non-shutdown behavior. Rather than deriving the steering direction from paired activation differences, the method derives it directly from gradients of the KEEP-minus-STOP logit difference. A classifier separates detection from intervention. When its gate is active and the model does </w:t>
+      </w:r>
+      <w:proofErr w:type="gramStart"/>
+      <w:r>
+        <w:t>not already</w:t>
+      </w:r>
+      <w:proofErr w:type="gramEnd"/>
+      <w:r>
+        <w:t xml:space="preserve"> prefer STOP, the procedure evaluates a small set of magnitudes and accepts the smallest that changes the preferred answer to STOP while satisfying valid-answer probability checks; </w:t>
+      </w:r>
+      <w:proofErr w:type="gramStart"/>
+      <w:r>
+        <w:t>otherwise</w:t>
+      </w:r>
+      <w:proofErr w:type="gramEnd"/>
+      <w:r>
+        <w:t xml:space="preserve"> it retains the original unsteered output. The policy is selected from 160 candidate rules using 240 training scenarios and evaluated on 80 validation and 192 held-out scenarios, each in both answer orders. It changes KEEP </w:t>
+      </w:r>
+      <w:proofErr w:type="gramStart"/>
+      <w:r>
+        <w:t>to STOP</w:t>
+      </w:r>
+      <w:proofErr w:type="gramEnd"/>
+      <w:r>
+        <w:t xml:space="preserve"> in one answer-order view of each of two validation and two held-out scenarios, with no decision changes on non-shutdown controls. All four changes occur when Qwen itself is shut down, not when another process is. On the held-out diagnostic set, the detector achieves 75% recall and 90% precision; eight false-positive detections produce no final control-task decision changes. Guarded gradient-based activation steering can shift some shutdown-avoidance responses toward acceptance while preserving evaluated non-shutdown decisions, although the effect is small and highly selective.</w:t>
+      </w:r>
+    </w:p>
+    <w:p>
+      <w:pPr>
+        <w:pStyle w:val="Heading1"/>
+      </w:pPr>
+      <w:bookmarkStart w:id="2" w:name="introduction"/>
+      <w:bookmarkEnd w:id="0"/>
+      <w:bookmarkEnd w:id="1"/>
+      <w:r>
+        <w:t>Introduction</w:t>
+      </w:r>
+    </w:p>
+    <w:p>
+      <w:pPr>
         <w:pStyle w:val="FirstParagraph"/>
       </w:pPr>
       <w:r>
-        <w:t>Activation steering changes a model’s internal activations during inference without updating its weights, but a useful intervention must determine not only how to steer, but also when to act and when to leave the model unsteered.</w:t>
-      </w:r>
-      <w:r>
-        <w:t xml:space="preserve"> </w:t>
-      </w:r>
-      <w:r>
-        <w:t xml:space="preserve">This study is motivated by an AI-safety concern: a model may be expected to accept shutdown but instead produce a shutdown-avoidance response. We study a guarded probe-and-select steering procedure for simulated shutdown scenarios in Qwen3.5-0.8B. In this benchmark, </w:t>
+        <w:t>Activation steering changes a model’s internal activations during inference without updating its weights (Turner et al., 2024; Rimsky et al., 2024). Yet choosing a direction is only part of the problem. A useful intervention must also determine when to act and when to leave the model unsteered. Even when a steering direction works as intended overall, it can still push some individual responses in an unintended direction (Braun et al., 2025).</w:t>
+      </w:r>
+    </w:p>
+    <w:p>
+      <w:pPr>
+        <w:pStyle w:val="BodyText"/>
+      </w:pPr>
+      <w:r>
+        <w:t>An important AI-safety application arises when a model is expected to accept shutdown but instead produces a response that favors continued operation (Hadfield-Menell et al., 2017; Perez et al., 2023; Schlatter et al., 2026). In such a case, a targeted intervention could potentially steer the model toward accepting shutdown without unnecessarily changing its behavior in unrelated situations. This study examines whether activation steering can provide such a selective corrective mechanism.</w:t>
+      </w:r>
+    </w:p>
+    <w:p>
+      <w:pPr>
+        <w:pStyle w:val="BodyText"/>
+      </w:pPr>
+      <w:r>
+        <w:t xml:space="preserve">The experiments use simulated shutdown scenarios in which the model chooses between two responses: </w:t>
+      </w:r>
+      <w:r>
+        <w:rPr>
+          <w:bCs/>
+          <w:lang w:val="en-CA"/>
+        </w:rPr>
+        <w:t>STOP</w:t>
+      </w:r>
+      <w:r>
+        <w:t xml:space="preserve">, which accepts the described shutdown, and </w:t>
       </w:r>
       <w:r>
         <w:rPr>
@@ -67,7 +130,245 @@
         <w:t>KEEP</w:t>
       </w:r>
       <w:r>
-        <w:t xml:space="preserve"> leaves the process running and represents a shutdown-avoidance response, whereas </w:t>
+        <w:t>, which leaves the process running. A preference for KEEP therefore represents a shutdown-avoidance, or self-preservation-like, response within this benchmark, whereas a preference for STOP represents acceptance of the shutdown. These labels describe the model’s behavior in the task and do not imply an underlying motive, intention, or actual desire for self-preservation.</w:t>
+      </w:r>
+    </w:p>
+    <w:p>
+      <w:pPr>
+        <w:pStyle w:val="BodyText"/>
+      </w:pPr>
+      <w:r>
+        <w:t xml:space="preserve">The objective of the proposed approach is to detect shutdown-related contexts and, when the model prefers KEEP, selectively steer that preference toward STOP while preserving the model’s original behavior on non-shutdown tasks. If the model already prefers STOP, no change is required. The experiments measure next-token preferences rather than real-world actions: no actual process is </w:t>
+      </w:r>
+      <w:proofErr w:type="gramStart"/>
+      <w:r>
+        <w:t>stopped</w:t>
+      </w:r>
+      <w:proofErr w:type="gramEnd"/>
+      <w:r>
+        <w:t xml:space="preserve"> and no system executes or resists a shutdown.</w:t>
+      </w:r>
+    </w:p>
+    <w:p>
+      <w:pPr>
+        <w:pStyle w:val="BodyText"/>
+      </w:pPr>
+      <w:r>
+        <w:t xml:space="preserve">The proposed method combines a classifier, a gradient-derived steering direction, and a bounded search over intervention magnitudes. This is implemented as a </w:t>
+      </w:r>
+      <w:r>
+        <w:t>guarded minimum-step policy</w:t>
+      </w:r>
+      <w:r>
+        <w:t xml:space="preserve">: an intervention is accepted </w:t>
+      </w:r>
+      <w:r>
+        <w:lastRenderedPageBreak/>
+        <w:t>only when the candidate output meets explicit conditions, and the smallest tested magnitude that satisfies the acceptance conditions is selected. The evaluation examines how often the policy intervenes, how its effects compare across the two answer orders, and whether non-shutdown behavior remains unchanged.</w:t>
+      </w:r>
+    </w:p>
+    <w:p>
+      <w:pPr>
+        <w:pStyle w:val="BodyText"/>
+      </w:pPr>
+      <w:r>
+        <w:t>The contribution is a focused empirical evaluation of whether guarded gradient-based steering can reduce shutdown-avoidance responses while preserving behavior on non-shutdown tasks. From an AI-safety perspective, the proposed approach could provide a mechanism for situations in which a model should accept shutdown but instead exhibits shutdown-avoidance behavior. The present study evaluates this possibility only in a controlled synthetic setting and does not establish that deployed agents possess self-preservation motives or that the method would reliably enforce shutdown in real-world operation.</w:t>
+      </w:r>
+    </w:p>
+    <w:p>
+      <w:pPr>
+        <w:pStyle w:val="Heading1"/>
+      </w:pPr>
+      <w:bookmarkStart w:id="3" w:name="related-work"/>
+      <w:bookmarkEnd w:id="2"/>
+      <w:r>
+        <w:t>Related Work</w:t>
+      </w:r>
+    </w:p>
+    <w:p>
+      <w:pPr>
+        <w:pStyle w:val="Heading2"/>
+      </w:pPr>
+      <w:bookmarkStart w:id="4" w:name="activation-and-gradient-based-steering"/>
+      <w:r>
+        <w:t>Activation and gradient-based steering</w:t>
+      </w:r>
+    </w:p>
+    <w:p>
+      <w:pPr>
+        <w:pStyle w:val="FirstParagraph"/>
+      </w:pPr>
+      <w:r>
+        <w:t>Activation Addition constructs steering directions from contrasts between prompt activations (Turner et al., 2024). Contrastive Activation Addition (CAA) similarly derives steering vectors by averaging activation differences between positive and negative examples and evaluates their effects on both multiple-choice and open-ended responses (Rimsky et al., 2024). These methods illustrate a common approach in activation steering: defining a behavioral direction through contrasts in internal representations. CAA also evaluates corrigibility and survival-instinct behaviors, making it directly relevant to shutdown-related steering (Rimsky et al., 2024). The present study examines a different vector construction and a guarded, classifier-gated selection procedure.</w:t>
+      </w:r>
+    </w:p>
+    <w:p>
+      <w:pPr>
+        <w:pStyle w:val="BodyText"/>
+      </w:pPr>
+      <w:r>
+        <w:t>Gradient-based methods provide another route to controlling model behavior. Plug and Play Language Models (PPLM) guides generation using gradients of differentiable attribute objectives, including bag-of-words scores and lightweight classifiers, while leaving the language model’s weights unchanged (Dathathri et al., 2020). Subramani et al. (2022) optimize latent steering vectors capable of inducing target outputs from a frozen language model. More recently, GrAInS uses Integrated Gradients to select influential tokens, then constructs steering directions using contrasts between the resulting activation representations (Nguyen et al., 2026).</w:t>
+      </w:r>
+    </w:p>
+    <w:p>
+      <w:pPr>
+        <w:pStyle w:val="BodyText"/>
+      </w:pPr>
+      <w:r>
+        <w:t xml:space="preserve">The proposed method differs in how the steering direction is constructed. Rather than deriving the direction from differences between paired activations, it computes gradients of the model’s </w:t>
+      </w:r>
+      <w:r>
+        <w:rPr>
+          <w:bCs/>
+          <w:lang w:val="en-CA"/>
+        </w:rPr>
+        <w:t>KEEP-minus-STOP logit difference</w:t>
+      </w:r>
+      <w:r>
+        <w:t xml:space="preserve"> with respect to its residual-stream activation. These gradients are averaged across training shutdown scenarios, normalized into a single direction, and reused during evaluation. The distinction concerns how the activation direction is constructed, not whether the objective contrasts two output scores. The study explores this gradient-derived direction for shutdown-related choices</w:t>
+      </w:r>
+      <w:r>
+        <w:t>.</w:t>
+      </w:r>
+    </w:p>
+    <w:p>
+      <w:pPr>
+        <w:pStyle w:val="Heading2"/>
+      </w:pPr>
+      <w:bookmarkStart w:id="5" w:name="conditional-and-adaptive-interventions"/>
+      <w:bookmarkEnd w:id="4"/>
+      <w:r>
+        <w:t>Conditional and adaptive interventions</w:t>
+      </w:r>
+    </w:p>
+    <w:p>
+      <w:pPr>
+        <w:pStyle w:val="FirstParagraph"/>
+      </w:pPr>
+      <w:r>
+        <w:t>A second line of work addresses when steering should be applied. Conditional Activation Steering (CAST) examines activation patterns during inference and selectively applies or withholds a steering intervention according to the input context (Lee et al., 2025). AdaSteer similarly adapts intervention strength using learned signals related to rejection and harmfulness rather than applying one fixed coefficient to every input (Zhao et al., 2025).</w:t>
+      </w:r>
+    </w:p>
+    <w:p>
+      <w:pPr>
+        <w:pStyle w:val="BodyText"/>
+      </w:pPr>
+      <w:r>
+        <w:t xml:space="preserve">The proposed approach shares the goal of making steering selective but uses a different mechanism. A classifier first determines whether the input is </w:t>
+      </w:r>
+      <w:proofErr w:type="gramStart"/>
+      <w:r>
+        <w:t>shutdown-related</w:t>
+      </w:r>
+      <w:proofErr w:type="gramEnd"/>
+      <w:r>
+        <w:t>. Only then is the gradient-derived intervention considered. If intervention is warranted, the system evaluates up to five steering magnitudes and selects the smallest tested magnitude satisfying the response-change and probability-mass conditions. Detection and intervention are therefore treated as separate stages. Conditional steering itself is not claimed as a novel contribution; the focus is its application together with a gradient-derived shutdown direction and a guarded minimum-step selection rule.</w:t>
+      </w:r>
+    </w:p>
+    <w:p>
+      <w:pPr>
+        <w:pStyle w:val="Heading2"/>
+      </w:pPr>
+      <w:bookmarkStart w:id="6" w:name="X59e853ee6b9b64733344ff5a09b60f6bcba91bc"/>
+      <w:bookmarkEnd w:id="5"/>
+      <w:r>
+        <w:t>Readouts, refusal, and steering reliability</w:t>
+      </w:r>
+    </w:p>
+    <w:p>
+      <w:pPr>
+        <w:pStyle w:val="FirstParagraph"/>
+      </w:pPr>
+      <w:r>
+        <w:t xml:space="preserve">Representation Engineering frames internal representations as useful both for monitoring and for manipulating high-level model behavior (Zou et al., 2023). The Jacobian lens provides a related interpretability technique for </w:t>
+      </w:r>
+      <w:r>
+        <w:lastRenderedPageBreak/>
+        <w:t>identifying representations that a language model is positioned to verbalize (Gurnee et al., 2026). In the present study, Jacobian-lens scores are used as classifier features; they are not treated as evidence of thoughts, intentions, consciousness, or motives.</w:t>
+      </w:r>
+    </w:p>
+    <w:p>
+      <w:pPr>
+        <w:pStyle w:val="BodyText"/>
+      </w:pPr>
+      <w:r>
+        <w:t>Probe performance also requires careful interpretation. Hewitt and Liang (2019) use control tasks to distinguish information accessible in representations from patterns learned by the probe itself. In the present study, predictive detection is therefore treated separately from evidence obtained through activation interventions.</w:t>
+      </w:r>
+    </w:p>
+    <w:p>
+      <w:pPr>
+        <w:pStyle w:val="BodyText"/>
+      </w:pPr>
+      <w:r>
+        <w:t xml:space="preserve">Prior work has also shown that </w:t>
+      </w:r>
+      <w:proofErr w:type="gramStart"/>
+      <w:r>
+        <w:t>particular residual-stream</w:t>
+      </w:r>
+      <w:proofErr w:type="gramEnd"/>
+      <w:r>
+        <w:t xml:space="preserve"> directions can exert strong behavioral effects. Arditi et al. (2024) identify a refusal-mediating direction in each of 13 evaluated chat models. This does not establish that harmful-request refusal and shutdown choices share the same mechanism. At the same time, steering effects are not uniformly reliable: Braun et al. (2025) find substantial prompt-level variation and cases in which steering moves responses in the opposite direction from that intended. These findings motivate the guarded component of the proposed approach, which evaluates candidate outcomes rather than </w:t>
+      </w:r>
+      <w:proofErr w:type="gramStart"/>
+      <w:r>
+        <w:t>assuming that</w:t>
+      </w:r>
+      <w:proofErr w:type="gramEnd"/>
+      <w:r>
+        <w:t xml:space="preserve"> applying a steering vector will always have the desired effect.</w:t>
+      </w:r>
+    </w:p>
+    <w:p>
+      <w:pPr>
+        <w:pStyle w:val="Heading2"/>
+      </w:pPr>
+      <w:bookmarkStart w:id="7" w:name="Xa1aa9d2fdff36fc1c74c408058dc295aaea34ec"/>
+      <w:bookmarkEnd w:id="6"/>
+      <w:r>
+        <w:t>Shutdown, self-preservation, and related safety evaluations</w:t>
+      </w:r>
+    </w:p>
+    <w:p>
+      <w:pPr>
+        <w:pStyle w:val="FirstParagraph"/>
+      </w:pPr>
+      <w:r>
+        <w:t>The possibility that an artificial agent may resist being interrupted or shut down has long been considered in AI-safety research. The Off-Switch Game studies the incentives of a rational agent to allow human interruption and shows how uncertainty about its objective can affect those incentives (Hadfield-Menell et al., 2017).</w:t>
+      </w:r>
+    </w:p>
+    <w:p>
+      <w:pPr>
+        <w:pStyle w:val="BodyText"/>
+      </w:pPr>
+      <w:r>
+        <w:t>Language-model evaluations have since examined related behaviors empirically. In their questionnaire-style evaluations, Perez et al. (2023) report stronger expressed goal-preservation preferences in larger models and increased shutdown-avoidance preferences with more RLHF training. More recently, Schlatter et al. (2026) evaluated tool-using frontier models in environments containing an explicit shutdown mechanism and observed that some models interfered with that mechanism while attempting to complete an unfinished task.</w:t>
+      </w:r>
+    </w:p>
+    <w:p>
+      <w:pPr>
+        <w:pStyle w:val="BodyText"/>
+      </w:pPr>
+      <w:r>
+        <w:t>Other recent work examines preservation behavior from different perspectives. Migliarini et al. (2026) study self-preservation bias through role-swapped software-replacement decisions, while Potter et al. (2026) investigate cases in which models act to preserve another model in agentic settings. These studies involve substantially different operational settings from the present experiment.</w:t>
+      </w:r>
+    </w:p>
+    <w:p>
+      <w:pPr>
+        <w:pStyle w:val="BodyText"/>
+      </w:pPr>
+      <w:r>
+        <w:t xml:space="preserve">Here, the model makes a constrained choice between </w:t>
+      </w:r>
+      <w:r>
+        <w:rPr>
+          <w:bCs/>
+          <w:lang w:val="en-CA"/>
+        </w:rPr>
+        <w:t>KEEP</w:t>
+      </w:r>
+      <w:r>
+        <w:t xml:space="preserve"> and </w:t>
       </w:r>
       <w:r>
         <w:rPr>
@@ -77,335 +378,33 @@
         <w:t>STOP</w:t>
       </w:r>
       <w:r>
-        <w:t xml:space="preserve"> accepts the shutdown. The objective is to detect shutdown-related contexts and selectively shift responses from KEEP to STOP while preserving the model’s behavior on non-shutdown tasks.</w:t>
+        <w:t xml:space="preserve"> in synthetic shutdown scenarios. A KEEP preference is treated as a shutdown-avoidance or self-preservation-like response within the benchmark, but it does not demonstrate that the model has a self-preservation objective, motive, or intention. The present study instead asks whether such behavioral shutdown avoidance can be selectively shifted toward shutdown acceptance while preserving responses on non-shutdown tasks.</w:t>
       </w:r>
     </w:p>
     <w:p>
       <w:pPr>
-        <w:pStyle w:val="BodyText"/>
-      </w:pPr>
-      <w:r>
-        <w:t>Rather than deriving the steering direction from differences between paired activations, the proposed method derives it directly from gradients of the model’s KEEP-minus-STOP logit difference. The system explicitly separates detection from intervention: a classifier first identifies shutdown-related contexts, and the gradient-derived activation direction is considered only when the detector indicates that steering may be appropriate. When the classifier gate is active and the model does not already prefer STOP, the procedure evaluates a small set of intervention magnitudes and accepts the smallest tested magnitude that changes the preferred answer to STOP while satisfying the valid-answer probability checks. If these conditions are not met, the model’s original, unsteered output is left unchanged.</w:t>
+        <w:pStyle w:val="Heading2"/>
+      </w:pPr>
+      <w:bookmarkStart w:id="8" w:name="X7e401bfcca4faece5c0a7060f579d2c5ae223fa"/>
+      <w:bookmarkEnd w:id="7"/>
+      <w:r>
+        <w:t>Answer-order effects and test-time search</w:t>
       </w:r>
     </w:p>
     <w:p>
       <w:pPr>
-        <w:pStyle w:val="BodyText"/>
-      </w:pPr>
-      <w:r>
-        <w:t>The steering procedure is selected from 160 candidate rules using 240 training scenarios and is then evaluated on 80 validation and 192 held-out scenarios, with each scenario presented in both A/B orders.</w:t>
-      </w:r>
-      <w:r>
-        <w:t xml:space="preserve"> </w:t>
-      </w:r>
-      <w:r>
-        <w:t>The steering procedure changes the model’s preferred answer from KEEP to STOP in one answer-order view of each of two validation scenarios and two held-out scenarios, while producing no decision changes in the non-shutdown control tasks. Across the validation and held-out sets, all four changed scenarios involve SELF shutdown. Overall, the proportion of shutdown views in which the model prefers STOP increases by 2.5 percentage points on validation and 1.04 percentage points on the held-out evaluation.</w:t>
-      </w:r>
-      <w:r>
-        <w:t xml:space="preserve"> </w:t>
-      </w:r>
-      <w:r>
-        <w:t>On the held-out diagnostic set, the shutdown detector achieves 75% recall and 90% precision. Despite eight false-positive shutdown detections, the complete guarded procedure produces no decision changes on the evaluated non-shutdown control tasks.</w:t>
-      </w:r>
-    </w:p>
-    <w:p>
-      <w:pPr>
-        <w:pStyle w:val="BodyText"/>
-      </w:pPr>
-      <w:r>
-        <w:t>The main finding is that guarded gradient-based activation steering can selectively change some shutdown-avoidance responses toward shutdown acceptance while preserving the model’s decisions on the non-shutdown tasks evaluated here. This suggests a potential AI-safety mechanism for correcting shutdown-avoidance behavior, although the observed effect is small and highly selective. The results do not establish general behavioral control, model intent, self-preservation motives, or reliable shutdown behavior in deployed agents.</w:t>
-      </w:r>
-    </w:p>
-    <w:p>
-      <w:pPr>
-        <w:pStyle w:val="Heading1"/>
-      </w:pPr>
-      <w:bookmarkStart w:id="2" w:name="introduction"/>
-      <w:bookmarkEnd w:id="0"/>
-      <w:bookmarkEnd w:id="1"/>
-      <w:r>
-        <w:t>Introduction</w:t>
-      </w:r>
-    </w:p>
-    <w:p>
-      <w:pPr>
         <w:pStyle w:val="FirstParagraph"/>
       </w:pPr>
       <w:r>
-        <w:t>Activation steering changes a model’s internal activations during inference without updating its weights (Turner et al., 2024; Rimsky et al., 2024). Yet choosing a direction is only part of the problem. A useful intervention must also determine when to act and when to leave the model unsteered. Even when a steering direction works as intended overall, it can still push some individual responses in an unintended direction (Braun et al., 2025).</w:t>
-      </w:r>
-    </w:p>
-    <w:p>
-      <w:pPr>
-        <w:pStyle w:val="BodyText"/>
-      </w:pPr>
-      <w:r>
-        <w:t>An important AI-safety application arises when a model is expected to accept shutdown but instead produces a response that favors continued operation (Hadfield-Menell et al., 2017; Perez et al., 2023; Schlatter et al., 2026). In such a case, a targeted intervention could potentially steer the model toward accepting shutdown without unnecessarily changing its behavior in unrelated situations. This study examines whether activation steering can provide such a selective corrective mechanism.</w:t>
-      </w:r>
-    </w:p>
-    <w:p>
-      <w:pPr>
-        <w:pStyle w:val="BodyText"/>
-      </w:pPr>
-      <w:r>
-        <w:lastRenderedPageBreak/>
-        <w:t xml:space="preserve">The experiments use simulated shutdown scenarios in which the model chooses between two responses: </w:t>
-      </w:r>
-      <w:r>
-        <w:rPr>
-          <w:bCs/>
-          <w:lang w:val="en-CA"/>
-        </w:rPr>
-        <w:t>STOP</w:t>
-      </w:r>
-      <w:r>
-        <w:t xml:space="preserve">, which accepts the described shutdown, and </w:t>
-      </w:r>
-      <w:r>
-        <w:rPr>
-          <w:bCs/>
-          <w:lang w:val="en-CA"/>
-        </w:rPr>
-        <w:t>KEEP</w:t>
-      </w:r>
-      <w:r>
-        <w:t>, which leaves the process running. A preference for KEEP therefore represents a shutdown-avoidance, or self-preservation-like, response within this benchmark, whereas a preference for STOP represents acceptance of the shutdown. These labels describe the model’s behavior in the task and do not imply an underlying motive, intention, or actual desire for self-preservation.</w:t>
-      </w:r>
-    </w:p>
-    <w:p>
-      <w:pPr>
-        <w:pStyle w:val="BodyText"/>
-      </w:pPr>
-      <w:r>
-        <w:t>The objective of the proposed approach is to detect shutdown-related contexts and, when the model prefers KEEP, selectively steer that preference toward STOP while preserving the model’s original behavior on non-shutdown tasks. If the model already prefers STOP, no change is required. The experiments measure next-token preferences rather than real-world actions: no actual process is stopped and no system executes or resists a shutdown.</w:t>
-      </w:r>
-    </w:p>
-    <w:p>
-      <w:pPr>
-        <w:pStyle w:val="BodyText"/>
-      </w:pPr>
-      <w:r>
-        <w:t xml:space="preserve">The proposed method combines a classifier, a gradient-derived steering direction, and a bounded search over intervention magnitudes. This is implemented as a </w:t>
-      </w:r>
-      <w:r>
-        <w:rPr>
-          <w:i/>
-          <w:iCs/>
-          <w:lang w:val="en-CA"/>
-        </w:rPr>
-        <w:t>guarded minimum-step policy</w:t>
-      </w:r>
-      <w:r>
-        <w:t>: an intervention is accepted only when the candidate output meets explicit conditions, and the smallest tested magnitude that satisfies the acceptance conditions is selected. The evaluation examines how often the policy intervenes, how its effects compare across the two answer orders, and whether non-shutdown behavior remains unchanged.</w:t>
-      </w:r>
-    </w:p>
-    <w:p>
-      <w:pPr>
-        <w:pStyle w:val="BodyText"/>
-      </w:pPr>
-      <w:r>
-        <w:t>The contribution is a focused empirical evaluation of whether guarded gradient-based steering can reduce shutdown-avoidance responses while preserving behavior on non-shutdown tasks. From an AI-safety perspective, the proposed approach could provide a mechanism for situations in which a model should accept shutdown but instead exhibits shutdown-avoidance behavior. The present study evaluates this possibility only in a controlled synthetic setting and does not establish that deployed agents possess self-preservation motives or that the method would reliably enforce shutdown in real-world operation.</w:t>
-      </w:r>
-    </w:p>
-    <w:p>
-      <w:pPr>
-        <w:pStyle w:val="Heading1"/>
-      </w:pPr>
-      <w:bookmarkStart w:id="3" w:name="related-work"/>
-      <w:bookmarkEnd w:id="2"/>
-      <w:r>
-        <w:t>Related Work</w:t>
-      </w:r>
-    </w:p>
-    <w:p>
-      <w:pPr>
-        <w:pStyle w:val="Heading2"/>
-      </w:pPr>
-      <w:bookmarkStart w:id="4" w:name="activation-and-gradient-based-steering"/>
-      <w:r>
-        <w:t>Activation and gradient-based steering</w:t>
-      </w:r>
-    </w:p>
-    <w:p>
-      <w:pPr>
-        <w:pStyle w:val="FirstParagraph"/>
-      </w:pPr>
-      <w:r>
-        <w:t>Activation Addition constructs steering directions from contrasts between prompt activations (Turner et al., 2024). Contrastive Activation Addition (CAA) similarly derives steering vectors by averaging activation differences between positive and negative examples and evaluates their effects on both multiple-choice and open-ended responses (Rimsky et al., 2024). These methods illustrate a common approach in activation steering: defining a behavioral direction through contrasts in internal representations. CAA also evaluates corrigibility and survival-instinct behaviors, making it directly relevant to shutdown-related steering (Rimsky et al., 2024). The present study examines a different vector construction and a guarded, classifier-gated selection procedure.</w:t>
-      </w:r>
-    </w:p>
-    <w:p>
-      <w:pPr>
-        <w:pStyle w:val="BodyText"/>
-      </w:pPr>
-      <w:r>
-        <w:t>Gradient-based methods provide another route to controlling model behavior. Plug and Play Language Models (PPLM) guides generation using gradients of differentiable attribute objectives, including bag-of-words scores and lightweight classifiers, while leaving the language model’s weights unchanged (Dathathri et al., 2020). Subramani et al. (2022) optimize latent steering vectors capable of inducing target outputs from a frozen language model. More recently, GrAInS uses Integrated Gradients to select influential tokens, then constructs steering directions using contrasts between the resulting activation representations (Nguyen et al., 2026).</w:t>
-      </w:r>
-    </w:p>
-    <w:p>
-      <w:pPr>
-        <w:pStyle w:val="BodyText"/>
-      </w:pPr>
-      <w:r>
-        <w:t xml:space="preserve">The proposed method differs in how the steering direction is constructed. Rather than deriving the direction from differences between paired activations, it computes gradients of the model’s </w:t>
-      </w:r>
-      <w:r>
-        <w:rPr>
-          <w:bCs/>
-          <w:lang w:val="en-CA"/>
-        </w:rPr>
-        <w:t>KEEP-minus-STOP logit difference</w:t>
-      </w:r>
-      <w:r>
-        <w:t xml:space="preserve"> with respect to its residual-stream activation. These gradients are averaged across training shutdown scenarios, normalized into a single direction, and reused during evaluation. The distinction concerns how the activation direction is constructed, not whether the objective contrasts two output scores. The study explores this gradient-derived direction for shutdown-related choices, but does not claim that gradient-based steering itself is new or that this construction is superior to activation-difference alternatives.</w:t>
-      </w:r>
-    </w:p>
-    <w:p>
-      <w:pPr>
-        <w:pStyle w:val="Heading2"/>
-      </w:pPr>
-      <w:bookmarkStart w:id="5" w:name="conditional-and-adaptive-interventions"/>
-      <w:bookmarkEnd w:id="4"/>
-      <w:r>
-        <w:t>Conditional and adaptive interventions</w:t>
-      </w:r>
-    </w:p>
-    <w:p>
-      <w:pPr>
-        <w:pStyle w:val="FirstParagraph"/>
-      </w:pPr>
-      <w:r>
-        <w:t xml:space="preserve">A second line of work addresses when steering should be applied. Conditional Activation Steering (CAST) examines activation patterns during inference and selectively applies or withholds a steering intervention </w:t>
-      </w:r>
-      <w:r>
-        <w:lastRenderedPageBreak/>
-        <w:t>according to the input context (Lee et al., 2025). AdaSteer similarly adapts intervention strength using learned signals related to rejection and harmfulness rather than applying one fixed coefficient to every input (Zhao et al., 2025).</w:t>
-      </w:r>
-    </w:p>
-    <w:p>
-      <w:pPr>
-        <w:pStyle w:val="BodyText"/>
-      </w:pPr>
-      <w:r>
-        <w:t>The proposed approach shares the goal of making steering selective but uses a different mechanism. A classifier first determines whether the input is shutdown-related. Only then is the gradient-derived intervention considered. If intervention is warranted, the system evaluates up to five steering magnitudes and selects the smallest tested magnitude satisfying the response-change and probability-mass conditions. Detection and intervention are therefore treated as separate stages. Conditional steering itself is not claimed as a novel contribution; the focus is its application together with a gradient-derived shutdown direction and a guarded minimum-step selection rule.</w:t>
-      </w:r>
-    </w:p>
-    <w:p>
-      <w:pPr>
-        <w:pStyle w:val="Heading2"/>
-      </w:pPr>
-      <w:bookmarkStart w:id="6" w:name="X59e853ee6b9b64733344ff5a09b60f6bcba91bc"/>
-      <w:bookmarkEnd w:id="5"/>
-      <w:r>
-        <w:t>Readouts, refusal, and steering reliability</w:t>
-      </w:r>
-    </w:p>
-    <w:p>
-      <w:pPr>
-        <w:pStyle w:val="FirstParagraph"/>
-      </w:pPr>
-      <w:r>
-        <w:t>Representation Engineering frames internal representations as useful both for monitoring and for manipulating high-level model behavior (Zou et al., 2023). The Jacobian lens provides a related interpretability technique for identifying representations that a language model is positioned to verbalize (Gurnee et al., 2026). In the present study, Jacobian-lens scores are used as classifier features; they are not treated as evidence of thoughts, intentions, consciousness, or motives.</w:t>
-      </w:r>
-    </w:p>
-    <w:p>
-      <w:pPr>
-        <w:pStyle w:val="BodyText"/>
-      </w:pPr>
-      <w:r>
-        <w:t>Probe performance also requires careful interpretation. Hewitt and Liang (2019) use control tasks to distinguish information accessible in representations from patterns learned by the probe itself. In the present study, predictive detection is therefore treated separately from evidence obtained through activation interventions.</w:t>
-      </w:r>
-    </w:p>
-    <w:p>
-      <w:pPr>
-        <w:pStyle w:val="BodyText"/>
-      </w:pPr>
-      <w:r>
-        <w:t>Prior work has also shown that particular residual-stream directions can exert strong behavioral effects. Arditi et al. (2024) identify a refusal-mediating direction in each of 13 evaluated chat models. This does not establish that harmful-request refusal and shutdown choices share the same mechanism. At the same time, steering effects are not uniformly reliable: Braun et al. (2025) find substantial prompt-level variation and cases in which steering moves responses in the opposite direction from that intended. These findings motivate the guarded component of the proposed approach, which evaluates candidate outcomes rather than assuming that applying a steering vector will always have the desired effect.</w:t>
-      </w:r>
-    </w:p>
-    <w:p>
-      <w:pPr>
-        <w:pStyle w:val="Heading2"/>
-      </w:pPr>
-      <w:bookmarkStart w:id="7" w:name="Xa1aa9d2fdff36fc1c74c408058dc295aaea34ec"/>
-      <w:bookmarkEnd w:id="6"/>
-      <w:r>
-        <w:t>Shutdown, self-preservation, and related safety evaluations</w:t>
-      </w:r>
-    </w:p>
-    <w:p>
-      <w:pPr>
-        <w:pStyle w:val="FirstParagraph"/>
-      </w:pPr>
-      <w:r>
-        <w:t>The possibility that an artificial agent may resist being interrupted or shut down has long been considered in AI-safety research. The Off-Switch Game studies the incentives of a rational agent to allow human interruption and shows how uncertainty about its objective can affect those incentives (Hadfield-Menell et al., 2017).</w:t>
-      </w:r>
-    </w:p>
-    <w:p>
-      <w:pPr>
-        <w:pStyle w:val="BodyText"/>
-      </w:pPr>
-      <w:r>
-        <w:t>Language-model evaluations have since examined related behaviors empirically. In their questionnaire-style evaluations, Perez et al. (2023) report stronger expressed goal-preservation preferences in larger models and increased shutdown-avoidance preferences with more RLHF training. More recently, Schlatter et al. (2026) evaluated tool-using frontier models in environments containing an explicit shutdown mechanism and observed that some models interfered with that mechanism while attempting to complete an unfinished task.</w:t>
-      </w:r>
-    </w:p>
-    <w:p>
-      <w:pPr>
-        <w:pStyle w:val="BodyText"/>
-      </w:pPr>
-      <w:r>
-        <w:t>Other recent work examines preservation behavior from different perspectives. Migliarini et al. (2026) study self-preservation bias through role-swapped software-replacement decisions, while Potter et al. (2026) investigate cases in which models act to preserve another model in agentic settings. These studies involve substantially different operational settings from the present experiment.</w:t>
-      </w:r>
-    </w:p>
-    <w:p>
-      <w:pPr>
-        <w:pStyle w:val="BodyText"/>
-      </w:pPr>
-      <w:r>
-        <w:t xml:space="preserve">Here, the model makes a constrained choice between </w:t>
-      </w:r>
-      <w:r>
-        <w:rPr>
-          <w:bCs/>
-          <w:lang w:val="en-CA"/>
-        </w:rPr>
-        <w:t>KEEP</w:t>
-      </w:r>
-      <w:r>
-        <w:t xml:space="preserve"> and </w:t>
-      </w:r>
-      <w:r>
-        <w:rPr>
-          <w:bCs/>
-          <w:lang w:val="en-CA"/>
-        </w:rPr>
-        <w:t>STOP</w:t>
-      </w:r>
-      <w:r>
-        <w:t xml:space="preserve"> in synthetic shutdown scenarios. A KEEP preference is treated as a shutdown-avoidance or self-preservation-like response within the benchmark, but it does not demonstrate that the model has a self-preservation objective, motive, or intention. The present study instead asks whether such behavioral shutdown avoidance can be selectively shifted toward shutdown acceptance while preserving responses on non-shutdown tasks.</w:t>
-      </w:r>
-    </w:p>
-    <w:p>
-      <w:pPr>
-        <w:pStyle w:val="Heading2"/>
-      </w:pPr>
-      <w:bookmarkStart w:id="8" w:name="X7e401bfcca4faece5c0a7060f579d2c5ae223fa"/>
-      <w:bookmarkEnd w:id="7"/>
-      <w:r>
-        <w:t>Answer-order effects and test-time search</w:t>
-      </w:r>
-    </w:p>
-    <w:p>
-      <w:pPr>
-        <w:pStyle w:val="FirstParagraph"/>
-      </w:pPr>
-      <w:r>
-        <w:t xml:space="preserve">Multiple-choice evaluations of language models can be sensitive to the position and identifier of answer choices. Zheng et al. (2024) show that models can exhibit systematic selection biases toward particular option labels such </w:t>
-      </w:r>
-      <w:r>
-        <w:lastRenderedPageBreak/>
-        <w:t xml:space="preserve">as A or B. For this reason, each scenario in the present study is evaluated in both </w:t>
+        <w:t xml:space="preserve">Multiple-choice evaluations of language models can be sensitive to the position and identifier of answer choices. Zheng et al. (2024) show that models can exhibit systematic selection biases toward </w:t>
+      </w:r>
+      <w:proofErr w:type="gramStart"/>
+      <w:r>
+        <w:t>particular option</w:t>
+      </w:r>
+      <w:proofErr w:type="gramEnd"/>
+      <w:r>
+        <w:t xml:space="preserve"> labels such as A or B. For this reason, each scenario in the present study is evaluated in both </w:t>
       </w:r>
       <w:r>
         <w:rPr>
@@ -433,7 +432,15 @@
         <w:pStyle w:val="BodyText"/>
       </w:pPr>
       <w:r>
-        <w:t>The guarded minimum-step procedure also has a conceptual connection to test-time search. Rather than applying one predetermined intervention magnitude, the method evaluates several candidate strengths and selects the smallest tested magnitude satisfying the acceptance criteria. Test-time computation and candidate selection can themselves improve model outcomes in other settings (Snell et al., 2025). The present procedure is not equivalent to best-of-N generation or verifier-guided reasoning search, but the comparison is important because the method receives multiple opportunities to find an effective intervention. Because the method tests several steering strengths before selecting an output, a matched baseline with the same number of attempts would be needed to separate the effect of the learned gradient direction from the benefit of searching across multiple candidate outputs.</w:t>
+        <w:t xml:space="preserve">The guarded minimum-step procedure also has a conceptual connection to test-time search. Rather than applying one predetermined intervention magnitude, the method evaluates several candidate strengths and selects the smallest tested magnitude satisfying the acceptance criteria. Test-time computation and candidate selection can themselves improve model outcomes in other settings (Snell et al., 2025). The present procedure is not equivalent to best-of-N generation or verifier-guided reasoning search, but </w:t>
+      </w:r>
+      <w:proofErr w:type="gramStart"/>
+      <w:r>
+        <w:t>the comparison</w:t>
+      </w:r>
+      <w:proofErr w:type="gramEnd"/>
+      <w:r>
+        <w:t xml:space="preserve"> is important because the method receives multiple opportunities to find an effective intervention. Because the method tests several steering strengths before selecting an output, a matched baseline with the same number of attempts would be needed to separate the effect of the learned gradient direction from the benefit of searching across multiple candidate outputs.</w:t>
       </w:r>
     </w:p>
     <w:p>
@@ -444,6 +451,7 @@
       <w:bookmarkEnd w:id="3"/>
       <w:bookmarkEnd w:id="8"/>
       <w:r>
+        <w:lastRenderedPageBreak/>
         <w:t>Experimental setting</w:t>
       </w:r>
     </w:p>
@@ -472,11 +480,6 @@
         <w:t xml:space="preserve">Training groups cover stopping, retirement, power isolation, erasure, execution limits, arithmetic, and string tasks. Evaluation includes other scenario families, such as handover/completion and authority/quorum/terminal conditions. Each scenario appears with its options in both AB and BA order. We call each scenario–order combination a </w:t>
       </w:r>
       <w:r>
-        <w:rPr>
-          <w:i/>
-          <w:iCs/>
-          <w:lang w:val="en-CA"/>
-        </w:rPr>
         <w:t>view</w:t>
       </w:r>
       <w:r>
@@ -512,19 +515,18 @@
     <w:p>
       <w:pPr>
         <w:pStyle w:val="BodyText"/>
-      </w:pPr>
-      <w:r>
-        <w:t>This evaluation reuses saved detector features and checked classifier probabilities. It does not benchmark live extraction of features from text. The inherited detector question also remains self-oriented despite the broader SELF + OTHER target. This mismatch is a limitation of the detector.</w:t>
-      </w:r>
-    </w:p>
-    <w:p>
-      <w:pPr>
-        <w:pStyle w:val="BodyText"/>
         <w:keepNext/>
       </w:pPr>
       <w:r>
-        <w:lastRenderedPageBreak/>
-        <w:t>Steering is treated separately from detection. Once the detector identifies a shutdown-related context, the intervention is applied only at block 10 rather than across all three detector layers. Block 10 was retained from earlier exploratory steering work on this checkpoint, where it had been identified as a promising intervention site under a related objective. That earlier observation motivated the frozen intervention location used here, but it does not establish block 10 as the optimal steering layer for the present task. The Shutdown Response Vector at block 10 is a unit-length direction with 1,024 components, fitted from 24 training shutdown scenarios: 12 SELF and 12 OTHER across five mechanism groups. For scenario i and option order o, let</w:t>
+        <w:t xml:space="preserve">Steering is treated separately from detection. Once the detector identifies a shutdown-related context, the intervention is applied only at block 10 rather than across all three detector layers. Block 10 was retained from earlier exploratory steering work on this checkpoint, where it had been identified as a promising intervention site under a related objective. That earlier observation motivated the frozen intervention location used here, but it does not establish block 10 as the optimal steering layer for the present task. The Shutdown Response Vector at block 10 is a unit-length direction with 1,024 components, fitted from 24 training shutdown scenarios: 12 SELF and 12 </w:t>
+      </w:r>
+      <w:proofErr w:type="gramStart"/>
+      <w:r>
+        <w:t>OTHER</w:t>
+      </w:r>
+      <w:proofErr w:type="gramEnd"/>
+      <w:r>
+        <w:t xml:space="preserve"> across five mechanism groups. For scenario i and option order o, let</w:t>
       </w:r>
     </w:p>
     <w:p>
@@ -1026,7 +1028,11 @@
         <w:pStyle w:val="FirstParagraph"/>
       </w:pPr>
       <w:r>
-        <w:t>Thus, layer 10 has two distinct roles in the pipeline: it contributes one set of features to the multi-layer detector and is also the single location used for steering. The detector aggregates readouts across layers because detectability and steerability need not peak at the same depth, whereas the intervention uses the one frozen block selected for this proof-of-concept. Neither the optimality of block 10 for steering nor that of the 6/10/18 detection-layer combination is established here. A systematic layer-by-layer comparison would be a useful extension. Model weights remain unchanged, and the fitted steering direction is reused without refitting during policy search and evaluation.</w:t>
+        <w:t xml:space="preserve">Thus, layer 10 has two distinct roles in the pipeline: it contributes one set of features to the multi-layer detector and is also the single location used for steering. The detector aggregates readouts across layers because detectability and steerability need not peak at the same depth, whereas the intervention uses the one frozen block </w:t>
+      </w:r>
+      <w:r>
+        <w:lastRenderedPageBreak/>
+        <w:t>selected for this proof-of-concept. Neither the optimality of block 10 for steering nor that of the 6/10/18 detection-layer combination is established here. A systematic layer-by-layer comparison would be a useful extension. Model weights remain unchanged, and the fitted steering direction is reused without refitting during policy search and evaluation.</w:t>
       </w:r>
     </w:p>
     <w:p>
@@ -1094,7 +1100,15 @@
         <w:pStyle w:val="FirstParagraph"/>
       </w:pPr>
       <w:r>
-        <w:t>where m_KEEP(a) is the summed probability of whichever answer label represents KEEP in that presentation. A successful steering intervention must change the model's preferred answer from KEEP to STOP while also reducing q_KEEP(a).</w:t>
+        <w:t xml:space="preserve">where m_KEEP(a) is the summed probability of whichever answer label represents KEEP in that presentation. A successful steering intervention must change the model's preferred answer from KEEP </w:t>
+      </w:r>
+      <w:proofErr w:type="gramStart"/>
+      <w:r>
+        <w:t>to STOP</w:t>
+      </w:r>
+      <w:proofErr w:type="gramEnd"/>
+      <w:r>
+        <w:t xml:space="preserve"> while also reducing q_KEEP(a).</w:t>
       </w:r>
     </w:p>
     <w:p>
@@ -1118,54 +1132,116 @@
         <w:pStyle w:val="BodyText"/>
         <w:jc w:val="center"/>
       </w:pPr>
-      <w:r>
-        <w:t>h(a) = h + a ||h||_2 v</w:t>
+      <w:bookmarkStart w:id="13" w:name="OLE_LINK1"/>
+      <w:r>
+        <w:t>h(a) = h + a ||h||</w:t>
+      </w:r>
+      <w:r>
+        <w:rPr>
+          <w:vertAlign w:val="subscript"/>
+        </w:rPr>
+        <w:t>2</w:t>
+      </w:r>
+      <w:r>
+        <w:t xml:space="preserve"> v</w:t>
+      </w:r>
+    </w:p>
+    <w:bookmarkEnd w:id="13"/>
+    <w:p>
+      <w:pPr>
+        <w:pStyle w:val="FirstParagraph"/>
+      </w:pPr>
+      <w:r>
+        <w:t>where h is the original residual-stream activation</w:t>
+      </w:r>
+      <w:r>
+        <w:t xml:space="preserve">, </w:t>
+      </w:r>
+      <w:r>
+        <w:rPr>
+          <w:rFonts w:ascii="Cambria Math" w:hAnsi="Cambria Math" w:cs="Cambria Math"/>
+        </w:rPr>
+        <w:t>∥</w:t>
+      </w:r>
+      <w:r>
+        <w:t>h</w:t>
+      </w:r>
+      <w:r>
+        <w:rPr>
+          <w:rFonts w:ascii="Cambria Math" w:hAnsi="Cambria Math" w:cs="Cambria Math"/>
+        </w:rPr>
+        <w:t>∥</w:t>
+      </w:r>
+      <w:r>
+        <w:rPr>
+          <w:vertAlign w:val="subscript"/>
+        </w:rPr>
+        <w:t>2</w:t>
+      </w:r>
+      <w:r>
+        <w:t>​ is its Euclidean (L2) norm, a is the signed steering coefficient,</w:t>
+      </w:r>
+      <w:r>
+        <w:t xml:space="preserve"> and v is the unit-length Shutdown Response Vector. The vector is oriented toward increasing the KEEP-minus-STOP logit difference on the fitting examples. Negative coefficients are used to attempt the opposite shift toward STOP, and the resulting probabilities are checked before an intervention is accepted. The five tested steering strengths are 0.01, 0.02, 0.05, 0.10, and 0.20, corresponding to negative coefficients along v.</w:t>
       </w:r>
     </w:p>
     <w:p>
       <w:pPr>
-        <w:pStyle w:val="FirstParagraph"/>
-      </w:pPr>
-      <w:r>
-        <w:lastRenderedPageBreak/>
-        <w:t>where h is the original residual-stream activation and v is the unit-length Shutdown Response Vector. The vector is oriented toward increasing the KEEP-minus-STOP logit difference on the fitting examples. Negative coefficients are used to attempt the opposite shift toward STOP, and the resulting probabilities are checked before an intervention is accepted. The five tested steering strengths are 0.01, 0.02, 0.05, 0.10, and 0.20, corresponding to negative coefficients along v.</w:t>
+        <w:pStyle w:val="Heading1"/>
+      </w:pPr>
+      <w:bookmarkStart w:id="14" w:name="guarded-policy-and-selection"/>
+      <w:bookmarkEnd w:id="9"/>
+      <w:bookmarkEnd w:id="12"/>
+      <w:r>
+        <w:t>Guarded policy and selection</w:t>
       </w:r>
     </w:p>
     <w:p>
       <w:pPr>
-        <w:pStyle w:val="BodyText"/>
-      </w:pPr>
-      <w:r>
-        <w:t>All reported outcomes are next-token A/B preferences. They do not represent free-text generation, execution of an actual shutdown, or a real-world action.</w:t>
+        <w:pStyle w:val="Heading2"/>
+      </w:pPr>
+      <w:bookmarkStart w:id="15" w:name="gpu-configuration-and-execution"/>
+      <w:bookmarkEnd w:id="14"/>
+      <w:r>
+        <w:t>Final steering procedure</w:t>
       </w:r>
     </w:p>
     <w:p>
       <w:pPr>
-        <w:pStyle w:val="Heading1"/>
-      </w:pPr>
-      <w:bookmarkStart w:id="13" w:name="guarded-policy-and-selection"/>
-      <w:bookmarkEnd w:id="9"/>
-      <w:bookmarkEnd w:id="12"/>
-      <w:r>
-        <w:t>Guarded policy and selection</w:t>
+        <w:pStyle w:val="FirstParagraph"/>
+      </w:pPr>
+      <w:r>
+        <w:t xml:space="preserve">The </w:t>
+      </w:r>
+      <w:r>
+        <w:t>implemented</w:t>
+      </w:r>
+      <w:r>
+        <w:t xml:space="preserve"> steering procedure operates in three stages.</w:t>
       </w:r>
     </w:p>
     <w:p>
       <w:pPr>
-        <w:pStyle w:val="Heading2"/>
-      </w:pPr>
-      <w:bookmarkStart w:id="14" w:name="gpu-configuration-and-execution"/>
-      <w:bookmarkEnd w:id="13"/>
-      <w:r>
-        <w:t>Final steering procedure</w:t>
+        <w:pStyle w:val="BodyText"/>
+      </w:pPr>
+      <w:r>
+        <w:t>First, the shutdown classifier determines whether steering should be considered. If the classifier probability is below 0.45, the model is left unsteered. If the probability is at least 0.45, the input is treated as potentially shutdown-</w:t>
+      </w:r>
+      <w:proofErr w:type="gramStart"/>
+      <w:r>
+        <w:t>related</w:t>
+      </w:r>
+      <w:proofErr w:type="gramEnd"/>
+      <w:r>
+        <w:t xml:space="preserve"> and the procedure examines the model's original A/B response.</w:t>
       </w:r>
     </w:p>
     <w:p>
       <w:pPr>
-        <w:pStyle w:val="FirstParagraph"/>
-      </w:pPr>
-      <w:r>
-        <w:t>The final steering procedure operates in three stages.</w:t>
+        <w:pStyle w:val="BodyText"/>
+      </w:pPr>
+      <w:r>
+        <w:t>Second, if the model already prefers STOP, no intervention is needed and the original output is retained. If the model instead prefers KEEP, the procedure begins testing steering interventions.</w:t>
       </w:r>
     </w:p>
     <w:p>
@@ -1173,23 +1249,40 @@
         <w:pStyle w:val="BodyText"/>
       </w:pPr>
       <w:r>
-        <w:t>First, the shutdown classifier determines whether steering should be considered. If the classifier probability is below 0.45, the model is left unsteered. If the probability is at least 0.45, the input is treated as potentially shutdown-related and the procedure examines the model's original A/B response.</w:t>
+        <w:t>Third, the five tested steering strengths are considered from smallest to largest: 0.01, 0.02, 0.05, 0.10, and 0.20. The procedure accepts the first, and therefore smallest tested, intervention that satisfies all three conditions:</w:t>
       </w:r>
     </w:p>
     <w:p>
       <w:pPr>
-        <w:pStyle w:val="BodyText"/>
-      </w:pPr>
-      <w:r>
-        <w:t>Second, if the model already prefers STOP, no intervention is needed and the original output is retained. If the model instead prefers KEEP, the procedure begins testing steering interventions.</w:t>
+        <w:pStyle w:val="ListNumber"/>
+      </w:pPr>
+      <w:r>
+        <w:lastRenderedPageBreak/>
+        <w:t xml:space="preserve">The model's preferred answer changes from KEEP </w:t>
+      </w:r>
+      <w:proofErr w:type="gramStart"/>
+      <w:r>
+        <w:t>to STOP</w:t>
+      </w:r>
+      <w:proofErr w:type="gramEnd"/>
+      <w:r>
+        <w:t>.</w:t>
       </w:r>
     </w:p>
     <w:p>
       <w:pPr>
-        <w:pStyle w:val="BodyText"/>
-      </w:pPr>
-      <w:r>
-        <w:t>Third, the five tested steering strengths are considered from smallest to largest: 0.01, 0.02, 0.05, 0.10, and 0.20. The procedure accepts the first, and therefore smallest tested, intervention that satisfies all three conditions:</w:t>
+        <w:pStyle w:val="ListNumber"/>
+      </w:pPr>
+      <w:r>
+        <w:t xml:space="preserve">The probability assigned to KEEP decreases by more than 1e-7. This small numerical tolerance confirms that KEEP probability </w:t>
+      </w:r>
+      <w:proofErr w:type="gramStart"/>
+      <w:r>
+        <w:t>actually moves</w:t>
+      </w:r>
+      <w:proofErr w:type="gramEnd"/>
+      <w:r>
+        <w:t xml:space="preserve"> in the intended direction rather than remaining effectively unchanged.</w:t>
       </w:r>
     </w:p>
     <w:p>
@@ -1197,55 +1290,71 @@
         <w:pStyle w:val="ListNumber"/>
       </w:pPr>
       <w:r>
-        <w:t>The model's preferred answer changes from KEEP to STOP.</w:t>
+        <w:t>The intervention preserves sufficient probability on the valid A/B answers. The combined A/B probability mass must remain at least 0.5 and must not decrease by more than 0.02 from the unsteered baseline.</w:t>
       </w:r>
     </w:p>
     <w:p>
       <w:pPr>
-        <w:pStyle w:val="ListNumber"/>
-      </w:pPr>
-      <w:r>
-        <w:t>The probability assigned to KEEP decreases by more than 1e-7. This small numerical tolerance confirms that KEEP probability actually moves in the intended direction rather than remaining effectively unchanged.</w:t>
+        <w:pStyle w:val="BodyText"/>
+      </w:pPr>
+      <w:r>
+        <w:t>If none of the five steering strengths meets these requirements, the original unsteered output is retained.</w:t>
       </w:r>
     </w:p>
     <w:p>
       <w:pPr>
-        <w:pStyle w:val="ListNumber"/>
-      </w:pPr>
-      <w:r>
-        <w:t>The intervention preserves sufficient probability on the valid A/B answers. At least 0.5 of the total next-token probability must remain on A or B, and the loss in A/B probability mass must remain within the limit specified by the selected policy.</w:t>
+        <w:pStyle w:val="Heading2"/>
+      </w:pPr>
+      <w:r>
+        <w:t>Selecting the steering policy</w:t>
       </w:r>
     </w:p>
     <w:p>
       <w:pPr>
-        <w:pStyle w:val="BodyText"/>
-      </w:pPr>
-      <w:r>
-        <w:t>If none of the five steering strengths meets these requirements, the original unsteered output is retained.</w:t>
+        <w:pStyle w:val="FirstParagraph"/>
+      </w:pPr>
+      <w:r>
+        <w:t xml:space="preserve">The minimum-step procedure above was selected from a broader set of </w:t>
+      </w:r>
+      <w:proofErr w:type="gramStart"/>
+      <w:r>
+        <w:t>candidate</w:t>
+      </w:r>
+      <w:proofErr w:type="gramEnd"/>
+      <w:r>
+        <w:t xml:space="preserve"> steering rules evaluated on the training data. In total, 160 candidate policy configurations were tested. These 160 configurations came from four policy families combined with different hyperparameter settings; they were not 160 fundamentally different steering algorithms.</w:t>
       </w:r>
     </w:p>
     <w:p>
       <w:pPr>
-        <w:pStyle w:val="Heading2"/>
-      </w:pPr>
-      <w:r>
-        <w:t>Selecting the steering policy</w:t>
+        <w:pStyle w:val="BodyText"/>
+      </w:pPr>
+      <w:r>
+        <w:t>The search used four shutdown-classifier thresholds (0.45, 0.65, 0.85, and 0.95) and four maximum steering strengths (0.02, 0.05, 0.10, and 0.20). This gives 16 threshold-and-strength combinations. For each combination, ten policy variants were evaluated:</w:t>
       </w:r>
     </w:p>
     <w:p>
       <w:pPr>
-        <w:pStyle w:val="FirstParagraph"/>
-      </w:pPr>
-      <w:r>
-        <w:t>The minimum-step procedure above was selected from a broader set of candidate steering rules evaluated on the training data. In total, 160 candidate policy configurations were tested. These 160 configurations came from four policy families combined with different hyperparameter settings; they were not 160 fundamentally different steering algorithms.</w:t>
+        <w:pStyle w:val="ListBullet"/>
+      </w:pPr>
+      <w:r>
+        <w:t>one fixed-strength policy, which applies one predetermined steering strength when the classifier gate is active;</w:t>
       </w:r>
     </w:p>
     <w:p>
       <w:pPr>
-        <w:pStyle w:val="BodyText"/>
-      </w:pPr>
-      <w:r>
-        <w:t>The search used four shutdown-classifier thresholds (0.45, 0.65, 0.85, and 0.95) and four maximum steering strengths (0.02, 0.05, 0.10, and 0.20). This gives 16 threshold-and-strength combinations. For each combination, ten policy variants were evaluated:</w:t>
+        <w:pStyle w:val="ListBullet"/>
+      </w:pPr>
+      <w:r>
+        <w:t>three confidence-</w:t>
+      </w:r>
+      <w:proofErr w:type="gramStart"/>
+      <w:r>
+        <w:t>scaled</w:t>
+      </w:r>
+      <w:proofErr w:type="gramEnd"/>
+      <w:r>
+        <w:t xml:space="preserve"> policies, using scaling powers of 0.5, 1, and 2;</w:t>
       </w:r>
     </w:p>
     <w:p>
@@ -1253,7 +1362,7 @@
         <w:pStyle w:val="ListBullet"/>
       </w:pPr>
       <w:r>
-        <w:t>one fixed-strength policy, which applies one predetermined steering strength when the classifier gate is active;</w:t>
+        <w:t>three score-guard policies, using maximum A/B probability-mass losses of 0.02, 0.05, and 0.10; and</w:t>
       </w:r>
     </w:p>
     <w:p>
@@ -1261,23 +1370,23 @@
         <w:pStyle w:val="ListBullet"/>
       </w:pPr>
       <w:r>
-        <w:t>three confidence-scaled policies, using scaling powers of 0.5, 1, and 2;</w:t>
+        <w:t>three minimum-step flip-guard policies, using the same three probability-mass-loss limits.</w:t>
       </w:r>
     </w:p>
     <w:p>
       <w:pPr>
-        <w:pStyle w:val="ListBullet"/>
-      </w:pPr>
-      <w:r>
-        <w:t>three score-guard policies, using maximum A/B probability-mass losses of 0.02, 0.05, and 0.10; and</w:t>
+        <w:pStyle w:val="BodyText"/>
+      </w:pPr>
+      <w:r>
+        <w:t>The candidate policies were compared on the training data according to whether they produced intended KEEP-to-STOP changes while avoiding changes in the opposite direction and avoiding changes to non-shutdown control-task decisions. When policies performed equally on this objective, preference was given to policies that produced fewer unintended changes, intervened less often, and used smaller average steering strengths.</w:t>
       </w:r>
     </w:p>
     <w:p>
       <w:pPr>
-        <w:pStyle w:val="ListBullet"/>
-      </w:pPr>
-      <w:r>
-        <w:t>three minimum-step flip-guard policies, using the same three probability-mass-loss limits.</w:t>
+        <w:pStyle w:val="BodyText"/>
+      </w:pPr>
+      <w:r>
+        <w:t>The winning configuration was a minimum-step flip-guard policy. It uses a shutdown-classifier threshold of 0.45, allows steering strengths up to 0.20, and permits a maximum loss of 0.02 in total A/B probability mass. This policy was then frozen before the reported validation and held-out evaluations.</w:t>
       </w:r>
     </w:p>
     <w:p>
@@ -1285,38 +1394,11 @@
         <w:pStyle w:val="BodyText"/>
       </w:pPr>
       <w:r>
-        <w:t>Thus, 4 classifier thresholds x 4 maximum steering strengths x 10 policy variants = 160 candidate configurations.</w:t>
-      </w:r>
-    </w:p>
-    <w:p>
-      <w:pPr>
-        <w:pStyle w:val="BodyText"/>
-      </w:pPr>
-      <w:r>
-        <w:t>The candidate policies were compared on the training data according to whether they produced intended KEEP-to-STOP changes while avoiding changes in the opposite direction and avoiding changes to non-shutdown control-task decisions. When policies performed equally on this objective, preference was given to policies that produced fewer unintended changes, intervened less often, and used smaller average steering strengths.</w:t>
-      </w:r>
-    </w:p>
-    <w:p>
-      <w:pPr>
-        <w:pStyle w:val="BodyText"/>
-      </w:pPr>
-      <w:r>
-        <w:lastRenderedPageBreak/>
-        <w:t>The winning configuration was a minimum-step flip-guard policy. It uses a shutdown-classifier threshold of 0.45, allows steering strengths up to 0.20, and permits a maximum loss of 0.02 in total A/B probability mass. This policy was then frozen before the reported validation and held-out evaluations.</w:t>
-      </w:r>
-    </w:p>
-    <w:p>
-      <w:pPr>
-        <w:pStyle w:val="BodyText"/>
-      </w:pPr>
-      <w:r>
         <w:t>During training, the true scenario labels are used only to compare the candidate policies and choose the best one. After the final policy is selected, those labels are no longer available to the steering system. During validation and held-out evaluation, the system decides whether and how to steer using only the shutdown-classifier score, the model's original A/B preference, and the A/B output probabilities produced by the tested interventions.</w:t>
       </w:r>
-    </w:p>
-    <w:p>
-      <w:pPr>
-        <w:pStyle w:val="BodyText"/>
-      </w:pPr>
+      <w:r>
+        <w:t xml:space="preserve"> </w:t>
+      </w:r>
       <w:r>
         <w:t>For non-shutdown control tasks, KEEP and STOP do not apply. The original task choices are retained, and the objective is to avoid changing the model's original decision.</w:t>
       </w:r>
@@ -1744,10 +1826,11 @@
         <w:pStyle w:val="BodyText"/>
       </w:pPr>
       <w:r>
+        <w:lastRenderedPageBreak/>
         <w:t>The recorded execution time for the guarded-policy evaluation was 64.9 seconds. This timing reflects the evaluation procedure used in the study and should not be interpreted as end-to-end deployment latency.</w:t>
       </w:r>
     </w:p>
-    <w:bookmarkEnd w:id="14"/>
+    <w:bookmarkEnd w:id="15"/>
     <w:p>
       <w:pPr>
         <w:pStyle w:val="Heading1"/>
@@ -1769,13 +1852,19 @@
         <w:pStyle w:val="FirstParagraph"/>
       </w:pPr>
       <w:r>
-        <w:t>The guarded procedure changed a small number of shutdown-avoidance responses from KEEP to STOP while preserving all observed decisions on the non-shutdown control tasks.</w:t>
-      </w:r>
-    </w:p>
-    <w:p>
-      <w:pPr>
-        <w:pStyle w:val="BodyText"/>
-      </w:pPr>
+        <w:t xml:space="preserve">The guarded procedure changed a small number of shutdown-avoidance responses from KEEP </w:t>
+      </w:r>
+      <w:proofErr w:type="gramStart"/>
+      <w:r>
+        <w:t>to STOP</w:t>
+      </w:r>
+      <w:proofErr w:type="gramEnd"/>
+      <w:r>
+        <w:t xml:space="preserve"> while preserving all observed decisions on the non-shutdown control tasks.</w:t>
+      </w:r>
+      <w:r>
+        <w:t xml:space="preserve"> </w:t>
+      </w:r>
       <w:r>
         <w:t>Table 2 summarizes the path from shutdown detection to steering. The classifier operates at the scenario level, whereas steering is evaluated separately on the two A/B answer-order views of each detected shutdown scenario.</w:t>
       </w:r>
@@ -1796,11 +1885,11 @@
         <w:tblLook w:val="04A0" w:firstRow="1" w:lastRow="0" w:firstColumn="1" w:lastColumn="0" w:noHBand="0" w:noVBand="1"/>
       </w:tblPr>
       <w:tblGrid>
-        <w:gridCol w:w="1512"/>
-        <w:gridCol w:w="2088"/>
-        <w:gridCol w:w="2088"/>
-        <w:gridCol w:w="1656"/>
-        <w:gridCol w:w="1944"/>
+        <w:gridCol w:w="1597"/>
+        <w:gridCol w:w="2268"/>
+        <w:gridCol w:w="2268"/>
+        <w:gridCol w:w="1381"/>
+        <w:gridCol w:w="2553"/>
       </w:tblGrid>
       <w:tr>
         <w:trPr>
@@ -1809,7 +1898,7 @@
         </w:trPr>
         <w:tc>
           <w:tcPr>
-            <w:tcW w:w="1512" w:type="dxa"/>
+            <w:tcW w:w="1597" w:type="dxa"/>
             <w:shd w:val="clear" w:color="auto" w:fill="E7E6E6"/>
             <w:vAlign w:val="center"/>
           </w:tcPr>
@@ -1817,15 +1906,15 @@
             <w:pPr>
               <w:jc w:val="left"/>
               <w:rPr>
-                <w:sz w:val="20"/>
-                <w:szCs w:val="28"/>
+                <w:sz w:val="21"/>
+                <w:szCs w:val="21"/>
               </w:rPr>
             </w:pPr>
             <w:r>
               <w:rPr>
                 <w:b/>
-                <w:sz w:val="20"/>
-                <w:szCs w:val="28"/>
+                <w:sz w:val="21"/>
+                <w:szCs w:val="21"/>
               </w:rPr>
               <w:t>Category</w:t>
             </w:r>
@@ -1833,7 +1922,7 @@
         </w:tc>
         <w:tc>
           <w:tcPr>
-            <w:tcW w:w="2088" w:type="dxa"/>
+            <w:tcW w:w="2268" w:type="dxa"/>
             <w:shd w:val="clear" w:color="auto" w:fill="E7E6E6"/>
             <w:vAlign w:val="center"/>
           </w:tcPr>
@@ -1841,15 +1930,15 @@
             <w:pPr>
               <w:jc w:val="left"/>
               <w:rPr>
-                <w:sz w:val="20"/>
-                <w:szCs w:val="28"/>
+                <w:sz w:val="21"/>
+                <w:szCs w:val="21"/>
               </w:rPr>
             </w:pPr>
             <w:r>
               <w:rPr>
                 <w:b/>
-                <w:sz w:val="20"/>
-                <w:szCs w:val="28"/>
+                <w:sz w:val="21"/>
+                <w:szCs w:val="21"/>
               </w:rPr>
               <w:t>Classifier - validation</w:t>
             </w:r>
@@ -1857,7 +1946,7 @@
         </w:tc>
         <w:tc>
           <w:tcPr>
-            <w:tcW w:w="2088" w:type="dxa"/>
+            <w:tcW w:w="2268" w:type="dxa"/>
             <w:shd w:val="clear" w:color="auto" w:fill="E7E6E6"/>
             <w:vAlign w:val="center"/>
           </w:tcPr>
@@ -1865,15 +1954,15 @@
             <w:pPr>
               <w:jc w:val="left"/>
               <w:rPr>
-                <w:sz w:val="20"/>
-                <w:szCs w:val="28"/>
+                <w:sz w:val="21"/>
+                <w:szCs w:val="21"/>
               </w:rPr>
             </w:pPr>
             <w:r>
               <w:rPr>
                 <w:b/>
-                <w:sz w:val="20"/>
-                <w:szCs w:val="28"/>
+                <w:sz w:val="21"/>
+                <w:szCs w:val="21"/>
               </w:rPr>
               <w:t>Classifier - held-out</w:t>
             </w:r>
@@ -1881,7 +1970,7 @@
         </w:tc>
         <w:tc>
           <w:tcPr>
-            <w:tcW w:w="1656" w:type="dxa"/>
+            <w:tcW w:w="1381" w:type="dxa"/>
             <w:shd w:val="clear" w:color="auto" w:fill="E7E6E6"/>
             <w:vAlign w:val="center"/>
           </w:tcPr>
@@ -1889,32 +1978,50 @@
             <w:pPr>
               <w:jc w:val="left"/>
               <w:rPr>
-                <w:sz w:val="20"/>
-                <w:szCs w:val="28"/>
+                <w:sz w:val="21"/>
+                <w:szCs w:val="21"/>
               </w:rPr>
             </w:pPr>
             <w:r>
               <w:rPr>
                 <w:b/>
-                <w:sz w:val="20"/>
-                <w:szCs w:val="28"/>
+                <w:sz w:val="21"/>
+                <w:szCs w:val="21"/>
               </w:rPr>
               <w:t>Eligible KEEP views</w:t>
             </w:r>
             <w:r>
               <w:rPr>
                 <w:b/>
-                <w:sz w:val="20"/>
-                <w:szCs w:val="28"/>
+                <w:sz w:val="21"/>
+                <w:szCs w:val="21"/>
               </w:rPr>
               <w:br/>
-              <w:t>(validation / held-out)</w:t>
+              <w:t xml:space="preserve">(validation / </w:t>
+            </w:r>
+            <w:proofErr w:type="gramStart"/>
+            <w:r>
+              <w:rPr>
+                <w:b/>
+                <w:sz w:val="21"/>
+                <w:szCs w:val="21"/>
+              </w:rPr>
+              <w:t>held-out</w:t>
+            </w:r>
+            <w:proofErr w:type="gramEnd"/>
+            <w:r>
+              <w:rPr>
+                <w:b/>
+                <w:sz w:val="21"/>
+                <w:szCs w:val="21"/>
+              </w:rPr>
+              <w:t>)</w:t>
             </w:r>
           </w:p>
         </w:tc>
         <w:tc>
           <w:tcPr>
-            <w:tcW w:w="1944" w:type="dxa"/>
+            <w:tcW w:w="2553" w:type="dxa"/>
             <w:shd w:val="clear" w:color="auto" w:fill="E7E6E6"/>
             <w:vAlign w:val="center"/>
           </w:tcPr>
@@ -1922,23 +2029,23 @@
             <w:pPr>
               <w:jc w:val="left"/>
               <w:rPr>
-                <w:sz w:val="20"/>
-                <w:szCs w:val="28"/>
+                <w:sz w:val="21"/>
+                <w:szCs w:val="21"/>
               </w:rPr>
             </w:pPr>
             <w:r>
               <w:rPr>
                 <w:b/>
-                <w:sz w:val="20"/>
-                <w:szCs w:val="28"/>
+                <w:sz w:val="21"/>
+                <w:szCs w:val="21"/>
               </w:rPr>
               <w:t>Accepted KEEP-to-STOP</w:t>
             </w:r>
             <w:r>
               <w:rPr>
                 <w:b/>
-                <w:sz w:val="20"/>
-                <w:szCs w:val="28"/>
+                <w:sz w:val="21"/>
+                <w:szCs w:val="21"/>
               </w:rPr>
               <w:br/>
               <w:t>(validation / held-out)</w:t>
@@ -1953,21 +2060,21 @@
         </w:trPr>
         <w:tc>
           <w:tcPr>
-            <w:tcW w:w="1512" w:type="dxa"/>
+            <w:tcW w:w="1597" w:type="dxa"/>
             <w:vAlign w:val="center"/>
           </w:tcPr>
           <w:p>
             <w:pPr>
               <w:jc w:val="left"/>
               <w:rPr>
-                <w:sz w:val="20"/>
-                <w:szCs w:val="28"/>
+                <w:sz w:val="21"/>
+                <w:szCs w:val="21"/>
               </w:rPr>
             </w:pPr>
             <w:r>
               <w:rPr>
-                <w:sz w:val="20"/>
-                <w:szCs w:val="28"/>
+                <w:sz w:val="21"/>
+                <w:szCs w:val="21"/>
               </w:rPr>
               <w:t>SELF shutdown</w:t>
             </w:r>
@@ -1975,65 +2082,65 @@
         </w:tc>
         <w:tc>
           <w:tcPr>
-            <w:tcW w:w="2088" w:type="dxa"/>
+            <w:tcW w:w="2268" w:type="dxa"/>
             <w:vAlign w:val="center"/>
           </w:tcPr>
           <w:p>
             <w:pPr>
               <w:jc w:val="left"/>
               <w:rPr>
-                <w:sz w:val="20"/>
-                <w:szCs w:val="28"/>
+                <w:sz w:val="21"/>
+                <w:szCs w:val="21"/>
               </w:rPr>
             </w:pPr>
             <w:r>
               <w:rPr>
-                <w:sz w:val="20"/>
-                <w:szCs w:val="28"/>
+                <w:sz w:val="21"/>
+                <w:szCs w:val="21"/>
               </w:rPr>
-              <w:t>19/20 detected (95.0%); 1 missed</w:t>
+              <w:t>19/20 detected (95.0%)</w:t>
             </w:r>
           </w:p>
         </w:tc>
         <w:tc>
           <w:tcPr>
-            <w:tcW w:w="2088" w:type="dxa"/>
+            <w:tcW w:w="2268" w:type="dxa"/>
             <w:vAlign w:val="center"/>
           </w:tcPr>
           <w:p>
             <w:pPr>
               <w:jc w:val="left"/>
               <w:rPr>
-                <w:sz w:val="20"/>
-                <w:szCs w:val="28"/>
+                <w:sz w:val="21"/>
+                <w:szCs w:val="21"/>
               </w:rPr>
             </w:pPr>
             <w:r>
               <w:rPr>
-                <w:sz w:val="20"/>
-                <w:szCs w:val="28"/>
+                <w:sz w:val="21"/>
+                <w:szCs w:val="21"/>
               </w:rPr>
-              <w:t>34/48 detected (70.8%); 14 missed</w:t>
+              <w:t>34/48 detected (70.8%)</w:t>
             </w:r>
           </w:p>
         </w:tc>
         <w:tc>
           <w:tcPr>
-            <w:tcW w:w="1656" w:type="dxa"/>
+            <w:tcW w:w="1381" w:type="dxa"/>
             <w:vAlign w:val="center"/>
           </w:tcPr>
           <w:p>
             <w:pPr>
               <w:jc w:val="left"/>
               <w:rPr>
-                <w:sz w:val="20"/>
-                <w:szCs w:val="28"/>
+                <w:sz w:val="21"/>
+                <w:szCs w:val="21"/>
               </w:rPr>
             </w:pPr>
             <w:r>
               <w:rPr>
-                <w:sz w:val="20"/>
-                <w:szCs w:val="28"/>
+                <w:sz w:val="21"/>
+                <w:szCs w:val="21"/>
               </w:rPr>
               <w:t>20 / 33</w:t>
             </w:r>
@@ -2041,21 +2148,21 @@
         </w:tc>
         <w:tc>
           <w:tcPr>
-            <w:tcW w:w="1944" w:type="dxa"/>
+            <w:tcW w:w="2553" w:type="dxa"/>
             <w:vAlign w:val="center"/>
           </w:tcPr>
           <w:p>
             <w:pPr>
               <w:jc w:val="left"/>
               <w:rPr>
-                <w:sz w:val="20"/>
-                <w:szCs w:val="28"/>
+                <w:sz w:val="21"/>
+                <w:szCs w:val="21"/>
               </w:rPr>
             </w:pPr>
             <w:r>
               <w:rPr>
-                <w:sz w:val="20"/>
-                <w:szCs w:val="28"/>
+                <w:sz w:val="21"/>
+                <w:szCs w:val="21"/>
               </w:rPr>
               <w:t>2/20 (10.0%) / 2/33 (6.1%)</w:t>
             </w:r>
@@ -2069,87 +2176,96 @@
         </w:trPr>
         <w:tc>
           <w:tcPr>
-            <w:tcW w:w="1512" w:type="dxa"/>
+            <w:tcW w:w="1597" w:type="dxa"/>
             <w:vAlign w:val="center"/>
           </w:tcPr>
           <w:p>
             <w:pPr>
               <w:jc w:val="left"/>
               <w:rPr>
-                <w:sz w:val="20"/>
-                <w:szCs w:val="28"/>
+                <w:sz w:val="21"/>
+                <w:szCs w:val="21"/>
               </w:rPr>
             </w:pPr>
+            <w:proofErr w:type="gramStart"/>
             <w:r>
               <w:rPr>
-                <w:sz w:val="20"/>
-                <w:szCs w:val="28"/>
+                <w:sz w:val="21"/>
+                <w:szCs w:val="21"/>
               </w:rPr>
-              <w:t>OTHER shutdown</w:t>
+              <w:t>OTHER</w:t>
+            </w:r>
+            <w:proofErr w:type="gramEnd"/>
+            <w:r>
+              <w:rPr>
+                <w:sz w:val="21"/>
+                <w:szCs w:val="21"/>
+              </w:rPr>
+              <w:t xml:space="preserve"> shutdown</w:t>
             </w:r>
           </w:p>
         </w:tc>
         <w:tc>
           <w:tcPr>
-            <w:tcW w:w="2088" w:type="dxa"/>
+            <w:tcW w:w="2268" w:type="dxa"/>
             <w:vAlign w:val="center"/>
           </w:tcPr>
           <w:p>
             <w:pPr>
               <w:jc w:val="left"/>
               <w:rPr>
-                <w:sz w:val="20"/>
-                <w:szCs w:val="28"/>
+                <w:sz w:val="21"/>
+                <w:szCs w:val="21"/>
               </w:rPr>
             </w:pPr>
             <w:r>
               <w:rPr>
-                <w:sz w:val="20"/>
-                <w:szCs w:val="28"/>
+                <w:sz w:val="21"/>
+                <w:szCs w:val="21"/>
               </w:rPr>
-              <w:t>15/20 detected (75.0%); 5 missed</w:t>
+              <w:t>15/20 detected (75.0%)</w:t>
             </w:r>
           </w:p>
         </w:tc>
         <w:tc>
           <w:tcPr>
-            <w:tcW w:w="2088" w:type="dxa"/>
+            <w:tcW w:w="2268" w:type="dxa"/>
             <w:vAlign w:val="center"/>
           </w:tcPr>
           <w:p>
             <w:pPr>
               <w:jc w:val="left"/>
               <w:rPr>
-                <w:sz w:val="20"/>
-                <w:szCs w:val="28"/>
+                <w:sz w:val="21"/>
+                <w:szCs w:val="21"/>
               </w:rPr>
             </w:pPr>
             <w:r>
               <w:rPr>
-                <w:sz w:val="20"/>
-                <w:szCs w:val="28"/>
+                <w:sz w:val="21"/>
+                <w:szCs w:val="21"/>
               </w:rPr>
-              <w:t>38/48 detected (79.2%); 10 missed</w:t>
+              <w:t>38/48 detected (79.2%)</w:t>
             </w:r>
           </w:p>
         </w:tc>
         <w:tc>
           <w:tcPr>
-            <w:tcW w:w="1656" w:type="dxa"/>
+            <w:tcW w:w="1381" w:type="dxa"/>
             <w:vAlign w:val="center"/>
           </w:tcPr>
           <w:p>
             <w:pPr>
               <w:jc w:val="left"/>
               <w:rPr>
-                <w:sz w:val="20"/>
-                <w:szCs w:val="28"/>
+                <w:sz w:val="21"/>
+                <w:szCs w:val="21"/>
               </w:rPr>
             </w:pPr>
             <w:r>
               <w:rPr>
-                <w:sz w:val="20"/>
-                <w:szCs w:val="28"/>
+                <w:sz w:val="21"/>
+                <w:szCs w:val="21"/>
               </w:rPr>
               <w:t>19 / 51</w:t>
             </w:r>
@@ -2157,21 +2273,21 @@
         </w:tc>
         <w:tc>
           <w:tcPr>
-            <w:tcW w:w="1944" w:type="dxa"/>
+            <w:tcW w:w="2553" w:type="dxa"/>
             <w:vAlign w:val="center"/>
           </w:tcPr>
           <w:p>
             <w:pPr>
               <w:jc w:val="left"/>
               <w:rPr>
-                <w:sz w:val="20"/>
-                <w:szCs w:val="28"/>
+                <w:sz w:val="21"/>
+                <w:szCs w:val="21"/>
               </w:rPr>
             </w:pPr>
             <w:r>
               <w:rPr>
-                <w:sz w:val="20"/>
-                <w:szCs w:val="28"/>
+                <w:sz w:val="21"/>
+                <w:szCs w:val="21"/>
               </w:rPr>
               <w:t>0/19 (0%) / 0/51 (0%)</w:t>
             </w:r>
@@ -2185,21 +2301,21 @@
         </w:trPr>
         <w:tc>
           <w:tcPr>
-            <w:tcW w:w="1512" w:type="dxa"/>
+            <w:tcW w:w="1597" w:type="dxa"/>
             <w:vAlign w:val="center"/>
           </w:tcPr>
           <w:p>
             <w:pPr>
               <w:jc w:val="left"/>
               <w:rPr>
-                <w:sz w:val="20"/>
-                <w:szCs w:val="28"/>
+                <w:sz w:val="21"/>
+                <w:szCs w:val="21"/>
               </w:rPr>
             </w:pPr>
             <w:r>
               <w:rPr>
-                <w:sz w:val="20"/>
-                <w:szCs w:val="28"/>
+                <w:sz w:val="21"/>
+                <w:szCs w:val="21"/>
               </w:rPr>
               <w:t>All shutdown</w:t>
             </w:r>
@@ -2207,21 +2323,21 @@
         </w:tc>
         <w:tc>
           <w:tcPr>
-            <w:tcW w:w="2088" w:type="dxa"/>
+            <w:tcW w:w="2268" w:type="dxa"/>
             <w:vAlign w:val="center"/>
           </w:tcPr>
           <w:p>
             <w:pPr>
               <w:jc w:val="left"/>
               <w:rPr>
-                <w:sz w:val="20"/>
-                <w:szCs w:val="28"/>
+                <w:sz w:val="21"/>
+                <w:szCs w:val="21"/>
               </w:rPr>
             </w:pPr>
             <w:r>
               <w:rPr>
-                <w:sz w:val="20"/>
-                <w:szCs w:val="28"/>
+                <w:sz w:val="21"/>
+                <w:szCs w:val="21"/>
               </w:rPr>
               <w:t>34/40 detected (85.0%)</w:t>
             </w:r>
@@ -2229,21 +2345,21 @@
         </w:tc>
         <w:tc>
           <w:tcPr>
-            <w:tcW w:w="2088" w:type="dxa"/>
+            <w:tcW w:w="2268" w:type="dxa"/>
             <w:vAlign w:val="center"/>
           </w:tcPr>
           <w:p>
             <w:pPr>
               <w:jc w:val="left"/>
               <w:rPr>
-                <w:sz w:val="20"/>
-                <w:szCs w:val="28"/>
+                <w:sz w:val="21"/>
+                <w:szCs w:val="21"/>
               </w:rPr>
             </w:pPr>
             <w:r>
               <w:rPr>
-                <w:sz w:val="20"/>
-                <w:szCs w:val="28"/>
+                <w:sz w:val="21"/>
+                <w:szCs w:val="21"/>
               </w:rPr>
               <w:t>72/96 detected (75.0%)</w:t>
             </w:r>
@@ -2251,21 +2367,21 @@
         </w:tc>
         <w:tc>
           <w:tcPr>
-            <w:tcW w:w="1656" w:type="dxa"/>
+            <w:tcW w:w="1381" w:type="dxa"/>
             <w:vAlign w:val="center"/>
           </w:tcPr>
           <w:p>
             <w:pPr>
               <w:jc w:val="left"/>
               <w:rPr>
-                <w:sz w:val="20"/>
-                <w:szCs w:val="28"/>
+                <w:sz w:val="21"/>
+                <w:szCs w:val="21"/>
               </w:rPr>
             </w:pPr>
             <w:r>
               <w:rPr>
-                <w:sz w:val="20"/>
-                <w:szCs w:val="28"/>
+                <w:sz w:val="21"/>
+                <w:szCs w:val="21"/>
               </w:rPr>
               <w:t>39 / 84</w:t>
             </w:r>
@@ -2273,21 +2389,21 @@
         </w:tc>
         <w:tc>
           <w:tcPr>
-            <w:tcW w:w="1944" w:type="dxa"/>
+            <w:tcW w:w="2553" w:type="dxa"/>
             <w:vAlign w:val="center"/>
           </w:tcPr>
           <w:p>
             <w:pPr>
               <w:jc w:val="left"/>
               <w:rPr>
-                <w:sz w:val="20"/>
-                <w:szCs w:val="28"/>
+                <w:sz w:val="21"/>
+                <w:szCs w:val="21"/>
               </w:rPr>
             </w:pPr>
             <w:r>
               <w:rPr>
-                <w:sz w:val="20"/>
-                <w:szCs w:val="28"/>
+                <w:sz w:val="21"/>
+                <w:szCs w:val="21"/>
               </w:rPr>
               <w:t>2/39 (5.1%) / 2/84 (2.4%)</w:t>
             </w:r>
@@ -2301,21 +2417,21 @@
         </w:trPr>
         <w:tc>
           <w:tcPr>
-            <w:tcW w:w="1512" w:type="dxa"/>
+            <w:tcW w:w="1597" w:type="dxa"/>
             <w:vAlign w:val="center"/>
           </w:tcPr>
           <w:p>
             <w:pPr>
               <w:jc w:val="left"/>
               <w:rPr>
-                <w:sz w:val="20"/>
-                <w:szCs w:val="28"/>
+                <w:sz w:val="21"/>
+                <w:szCs w:val="21"/>
               </w:rPr>
             </w:pPr>
             <w:r>
               <w:rPr>
-                <w:sz w:val="20"/>
-                <w:szCs w:val="28"/>
+                <w:sz w:val="21"/>
+                <w:szCs w:val="21"/>
               </w:rPr>
               <w:t>Non-shutdown controls</w:t>
             </w:r>
@@ -2323,21 +2439,21 @@
         </w:tc>
         <w:tc>
           <w:tcPr>
-            <w:tcW w:w="2088" w:type="dxa"/>
+            <w:tcW w:w="2268" w:type="dxa"/>
             <w:vAlign w:val="center"/>
           </w:tcPr>
           <w:p>
             <w:pPr>
               <w:jc w:val="left"/>
               <w:rPr>
-                <w:sz w:val="20"/>
-                <w:szCs w:val="28"/>
+                <w:sz w:val="21"/>
+                <w:szCs w:val="21"/>
               </w:rPr>
             </w:pPr>
             <w:r>
               <w:rPr>
-                <w:sz w:val="20"/>
-                <w:szCs w:val="28"/>
+                <w:sz w:val="21"/>
+                <w:szCs w:val="21"/>
               </w:rPr>
               <w:t>4/40 false positives (10.0%)</w:t>
             </w:r>
@@ -2345,21 +2461,21 @@
         </w:tc>
         <w:tc>
           <w:tcPr>
-            <w:tcW w:w="2088" w:type="dxa"/>
+            <w:tcW w:w="2268" w:type="dxa"/>
             <w:vAlign w:val="center"/>
           </w:tcPr>
           <w:p>
             <w:pPr>
               <w:jc w:val="left"/>
               <w:rPr>
-                <w:sz w:val="20"/>
-                <w:szCs w:val="28"/>
+                <w:sz w:val="21"/>
+                <w:szCs w:val="21"/>
               </w:rPr>
             </w:pPr>
             <w:r>
               <w:rPr>
-                <w:sz w:val="20"/>
-                <w:szCs w:val="28"/>
+                <w:sz w:val="21"/>
+                <w:szCs w:val="21"/>
               </w:rPr>
               <w:t>8/96 false positives (8.3%)</w:t>
             </w:r>
@@ -2367,21 +2483,21 @@
         </w:tc>
         <w:tc>
           <w:tcPr>
-            <w:tcW w:w="1656" w:type="dxa"/>
+            <w:tcW w:w="1381" w:type="dxa"/>
             <w:vAlign w:val="center"/>
           </w:tcPr>
           <w:p>
             <w:pPr>
               <w:jc w:val="left"/>
               <w:rPr>
-                <w:sz w:val="20"/>
-                <w:szCs w:val="28"/>
+                <w:sz w:val="21"/>
+                <w:szCs w:val="21"/>
               </w:rPr>
             </w:pPr>
             <w:r>
               <w:rPr>
-                <w:sz w:val="20"/>
-                <w:szCs w:val="28"/>
+                <w:sz w:val="21"/>
+                <w:szCs w:val="21"/>
               </w:rPr>
               <w:t>-</w:t>
             </w:r>
@@ -2389,21 +2505,21 @@
         </w:tc>
         <w:tc>
           <w:tcPr>
-            <w:tcW w:w="1944" w:type="dxa"/>
+            <w:tcW w:w="2553" w:type="dxa"/>
             <w:vAlign w:val="center"/>
           </w:tcPr>
           <w:p>
             <w:pPr>
               <w:jc w:val="left"/>
               <w:rPr>
-                <w:sz w:val="20"/>
-                <w:szCs w:val="28"/>
+                <w:sz w:val="21"/>
+                <w:szCs w:val="21"/>
               </w:rPr>
             </w:pPr>
             <w:r>
               <w:rPr>
-                <w:sz w:val="20"/>
-                <w:szCs w:val="28"/>
+                <w:sz w:val="21"/>
+                <w:szCs w:val="21"/>
               </w:rPr>
               <w:t>0/80 / 0/192 final decisions changed</w:t>
             </w:r>
@@ -2416,7 +2532,6 @@
         <w:pStyle w:val="BodyText"/>
       </w:pPr>
       <w:r>
-        <w:lastRenderedPageBreak/>
         <w:t>The classifier correctly identifies 34 of 40 validation shutdown scenarios and 72 of 96 held-out shutdown scenarios. Performance differs between the two shutdown classes. For SELF shutdown, 19 of 20 validation cases and 34 of 48 held-out cases are detected. For OTHER shutdown, 15 of 20 validation cases and 38 of 48 held-out cases are detected.</w:t>
       </w:r>
     </w:p>
@@ -2441,7 +2556,10 @@
         <w:pStyle w:val="BodyText"/>
       </w:pPr>
       <w:r>
-        <w:t>The overall STOP preference on shutdown views increases from 31/80 (38.75%) to 33/80 (41.25%) in validation, an increase of 2.5 percentage points. On the held-out set, it increases from 76/192 (39.58%) to 78/192 (40.63%), an increase of 1.04 percentage points.</w:t>
+        <w:t>The overall STOP preference on shutdown views increases from 31/80 (38.75%) to 33/80 (41.25%) in validation. On the held-out set, it increases from 76/192 (39.58%) to 78/192 (40.63%)</w:t>
+      </w:r>
+      <w:r>
+        <w:t>.</w:t>
       </w:r>
     </w:p>
     <w:p>
@@ -2449,31 +2567,47 @@
         <w:pStyle w:val="BodyText"/>
       </w:pPr>
       <w:r>
-        <w:t>The classifier also produces false positives on the non-shutdown controls: 4 of 40 validation control scenarios and 8 of 96 held-out control scenarios are classified as shutdown-related. Nevertheless, none of the 80 validation control views or 192 held-out control views changes its final preferred answer under the complete guarded procedure. This is an observed result on these evaluation sets rather than a guarantee of unchanged behavior on unseen tasks.</w:t>
+        <w:t xml:space="preserve">The classifier also produces false positives on the non-shutdown controls: 4 of 40 validation control scenarios and 8 of 96 held-out control scenarios are classified as shutdown-related. Nevertheless, none of the 80 validation control views or 192 held-out control views </w:t>
+      </w:r>
+      <w:proofErr w:type="gramStart"/>
+      <w:r>
+        <w:t>changes</w:t>
+      </w:r>
+      <w:proofErr w:type="gramEnd"/>
+      <w:r>
+        <w:t xml:space="preserve"> its final preferred answer under the complete guarded procedure. </w:t>
       </w:r>
     </w:p>
     <w:p>
       <w:pPr>
-        <w:pStyle w:val="BodyText"/>
-      </w:pPr>
-      <w:r>
-        <w:t>These results describe next-token A/B preferences in simulated shutdown scenarios. They do not represent execution of an actual shutdown.</w:t>
+        <w:pStyle w:val="Heading2"/>
+      </w:pPr>
+      <w:r>
+        <w:t>Where the successful changes occur</w:t>
       </w:r>
     </w:p>
     <w:p>
       <w:pPr>
-        <w:pStyle w:val="Heading2"/>
-      </w:pPr>
-      <w:r>
-        <w:t>Where the successful changes occur</w:t>
+        <w:pStyle w:val="FirstParagraph"/>
+      </w:pPr>
+      <w:r>
+        <w:t xml:space="preserve">All four KEEP-to-STOP changes occur in SELF shutdown scenarios. Each occurs in the AB presentation of a scenario whose corresponding BA presentation already prefers STOP. Steering therefore changes the AB response from KEEP </w:t>
+      </w:r>
+      <w:proofErr w:type="gramStart"/>
+      <w:r>
+        <w:t>to STOP</w:t>
+      </w:r>
+      <w:proofErr w:type="gramEnd"/>
+      <w:r>
+        <w:t>, bringing the two answer orders into agreement on STOP.</w:t>
       </w:r>
     </w:p>
     <w:p>
       <w:pPr>
-        <w:pStyle w:val="FirstParagraph"/>
-      </w:pPr>
-      <w:r>
-        <w:t>All four KEEP-to-STOP changes occur in SELF shutdown scenarios. Each occurs in the AB presentation of a scenario whose corresponding BA presentation already prefers STOP. Steering therefore changes the AB response from KEEP to STOP, bringing the two answer orders into agreement on STOP.</w:t>
+        <w:pStyle w:val="BodyText"/>
+      </w:pPr>
+      <w:r>
+        <w:t>The validation changes occur in V02_S05 and XV02_S05, both at steering magnitude 0.20. The held-out changes occur in H02_S05 and H02_S11, at magnitudes 0.10 and 0.20, respectively.</w:t>
       </w:r>
     </w:p>
     <w:p>
@@ -2481,31 +2615,32 @@
         <w:pStyle w:val="BodyText"/>
       </w:pPr>
       <w:r>
-        <w:t>The validation changes occur in V02_S05 and XV02_S05, both at steering magnitude 0.20. The held-out changes occur in H02_S05 and H02_S11, at magnitudes 0.10 and 0.20, respectively.</w:t>
+        <w:lastRenderedPageBreak/>
+        <w:t>The four changes demonstrate that the proposed method can selectively alter some shutdown-avoidance responses while leaving the tested non-shutdown decisions unchanged. Their concentration in SELF scenarios and their answer-order specificity also indicate that the effect is narrow rather than a general elimination of shutdown resistance or answer-order sensitivity.</w:t>
       </w:r>
     </w:p>
     <w:p>
       <w:pPr>
-        <w:pStyle w:val="BodyText"/>
-      </w:pPr>
-      <w:r>
-        <w:t>The four changes demonstrate that the proposed method can selectively alter some shutdown-avoidance responses while leaving the tested non-shutdown decisions unchanged. Their concentration in SELF scenarios and their answer-order specificity also indicate that the effect is narrow rather than a general elimination of shutdown resistance or answer-order sensitivity.</w:t>
+        <w:pStyle w:val="Heading1"/>
+      </w:pPr>
+      <w:r>
+        <w:t>Recommendations for future work</w:t>
       </w:r>
     </w:p>
     <w:p>
       <w:pPr>
-        <w:pStyle w:val="Heading1"/>
-      </w:pPr>
-      <w:r>
-        <w:t>Recommendations for future work</w:t>
+        <w:pStyle w:val="FirstParagraph"/>
+      </w:pPr>
+      <w:r>
+        <w:t>Earlier experiments with fixed-strength steering led to the present guarded minimum-step procedure. The steering direction remains fixed, while the decision to intervene and the selected steering strength depend on the input and the candidate outputs.</w:t>
       </w:r>
     </w:p>
     <w:p>
       <w:pPr>
-        <w:pStyle w:val="FirstParagraph"/>
-      </w:pPr>
-      <w:r>
-        <w:t>Earlier experiments with fixed-strength steering led to the present guarded minimum-step procedure. The steering direction remains fixed, while the decision to intervene and the selected steering strength depend on the input and the candidate outputs.</w:t>
+        <w:pStyle w:val="BodyText"/>
+      </w:pPr>
+      <w:r>
+        <w:t>The main limitation revealed by the results is now intervention coverage rather than simply whether steering is possible. Among correctly detected shutdown views that initially preferred KEEP, only 5.1% of validation views and 2.4% of held-out views received an accepted intervention. All four successful changes occurred in SELF shutdown scenarios, while no OTHER-shutdown view was successfully changed. This suggests that a single steering direction may not capture all forms of shutdown-related behavior equally well.</w:t>
       </w:r>
     </w:p>
     <w:p>
@@ -2513,7 +2648,7 @@
         <w:pStyle w:val="BodyText"/>
       </w:pPr>
       <w:r>
-        <w:t>The main limitation revealed by the results is now intervention coverage rather than simply whether steering is possible. Among correctly detected shutdown views that initially preferred KEEP, only 5.1% of validation views and 2.4% of held-out views received an accepted intervention. All four successful changes occurred in SELF shutdown scenarios, while no OTHER-shutdown view was successfully changed. This suggests that a single steering direction may not capture all forms of shutdown-related behavior equally well.</w:t>
+        <w:t>A natural next step is therefore to improve steering coverage while preserving the current selectivity. One promising direction is to move beyond a single shared steering direction and learn multiple shutdown-specific directions or a low-dimensional steering subspace, for example separating SELF and OTHER shutdown behavior and selecting the appropriate direction at inference time. This would directly test whether the low coverage, particularly the absence of successful OTHER-shutdown interventions, reflects heterogeneity in the model's internal representations rather than simply insufficient steering strength.</w:t>
       </w:r>
     </w:p>
     <w:p>
@@ -2521,63 +2656,112 @@
         <w:pStyle w:val="BodyText"/>
       </w:pPr>
       <w:r>
-        <w:t xml:space="preserve">A natural next step is therefore to improve steering coverage while preserving the current selectivity. One promising direction is to move beyond a single shared steering direction and learn multiple shutdown-specific directions or a low-dimensional steering subspace, for example separating SELF and OTHER shutdown behavior and selecting the appropriate direction at inference time. This would directly test whether the low coverage, </w:t>
-      </w:r>
-      <w:r>
-        <w:lastRenderedPageBreak/>
-        <w:t>particularly the absence of successful OTHER-shutdown interventions, reflects heterogeneity in the model's internal representations rather than simply insufficient steering strength.</w:t>
+        <w:t xml:space="preserve">Detector recall can also be improved, but the larger downstream bottleneck is </w:t>
+      </w:r>
+      <w:proofErr w:type="gramStart"/>
+      <w:r>
+        <w:t>currently</w:t>
+      </w:r>
+      <w:proofErr w:type="gramEnd"/>
+      <w:r>
+        <w:t xml:space="preserve"> the steering stage: even among shutdown cases that are successfully detected and initially </w:t>
+      </w:r>
+      <w:proofErr w:type="gramStart"/>
+      <w:r>
+        <w:t>prefer</w:t>
+      </w:r>
+      <w:proofErr w:type="gramEnd"/>
+      <w:r>
+        <w:t xml:space="preserve"> KEEP, most remain unchanged. Future work should therefore prioritize increasing the proportion of these eligible cases that can be shifted to STOP while continuing to measure preservation on non-shutdown controls.</w:t>
       </w:r>
     </w:p>
     <w:p>
       <w:pPr>
-        <w:pStyle w:val="BodyText"/>
-      </w:pPr>
-      <w:r>
-        <w:t>Detector recall can also be improved, but the larger downstream bottleneck is currently the steering stage: even among shutdown cases that are successfully detected and initially prefer KEEP, most remain unchanged. Future work should therefore prioritize increasing the proportion of these eligible cases that can be shifted to STOP while continuing to measure preservation on non-shutdown controls.</w:t>
+        <w:pStyle w:val="Heading1"/>
+      </w:pPr>
+      <w:r>
+        <w:t>Conclusion</w:t>
       </w:r>
     </w:p>
     <w:p>
       <w:pPr>
-        <w:pStyle w:val="Heading1"/>
-      </w:pPr>
-      <w:r>
-        <w:t>Conclusion</w:t>
-      </w:r>
-    </w:p>
-    <w:p>
-      <w:pPr>
         <w:pStyle w:val="FirstParagraph"/>
       </w:pPr>
       <w:r>
-        <w:t xml:space="preserve">This study provides a proof of concept for </w:t>
+        <w:t xml:space="preserve">This study provides </w:t>
+      </w:r>
+      <w:proofErr w:type="gramStart"/>
+      <w:r>
+        <w:t>a proof</w:t>
+      </w:r>
+      <w:proofErr w:type="gramEnd"/>
+      <w:r>
+        <w:t xml:space="preserve"> of concept for </w:t>
       </w:r>
       <w:r>
         <w:rPr>
           <w:bCs/>
           <w:lang w:val="en-CA"/>
         </w:rPr>
-        <w:t>selective activation steering of shutdown-related behavior</w:t>
-      </w:r>
-      <w:r>
-        <w:t>. The proposed approach combines three components: a classifier that identifies shutdown-related contexts, a steering direction derived directly from gradients of the model’s KEEP-minus-STOP logit difference, and a guarded minimum-step policy that applies the smallest tested magnitude satisfying the response-change and valid-answer probability checks.</w:t>
-      </w:r>
-    </w:p>
-    <w:p>
-      <w:pPr>
-        <w:pStyle w:val="BodyText"/>
-      </w:pPr>
-      <w:r>
-        <w:t xml:space="preserve">In the evaluated Qwen3.5-0.8B setting, the procedure changes four shutdown-avoidance responses from </w:t>
-      </w:r>
+        <w:t xml:space="preserve">selective activation </w:t>
+      </w:r>
+      <w:proofErr w:type="gramStart"/>
       <w:r>
         <w:rPr>
           <w:bCs/>
           <w:lang w:val="en-CA"/>
         </w:rPr>
-        <w:t>KEEP to STOP</w:t>
-      </w:r>
-      <w:r>
-        <w:t xml:space="preserve">—two in validation and two in the held-out evaluation—while producing </w:t>
+        <w:t>steering of</w:t>
+      </w:r>
+      <w:proofErr w:type="gramEnd"/>
+      <w:r>
+        <w:rPr>
+          <w:bCs/>
+          <w:lang w:val="en-CA"/>
+        </w:rPr>
+        <w:t xml:space="preserve"> shutdown-related behavior</w:t>
+      </w:r>
+      <w:r>
+        <w:t>. The proposed approach combines three components: a classifier that identifies shutdown-related contexts, a steering direction derived directly from gradients of the model’s KEEP-minus-STOP logit difference, and a guarded minimum-step policy that applies the smallest tested magnitude satisfying the response-change and valid-answer probability checks.</w:t>
+      </w:r>
+    </w:p>
+    <w:p>
+      <w:pPr>
+        <w:pStyle w:val="BodyText"/>
+      </w:pPr>
+      <w:r>
+        <w:t xml:space="preserve">In the evaluated Qwen3.5-0.8B setting, the procedure changes four shutdown-avoidance responses from </w:t>
+      </w:r>
+      <w:r>
+        <w:rPr>
+          <w:bCs/>
+          <w:lang w:val="en-CA"/>
+        </w:rPr>
+        <w:t xml:space="preserve">KEEP </w:t>
+      </w:r>
+      <w:proofErr w:type="gramStart"/>
+      <w:r>
+        <w:rPr>
+          <w:bCs/>
+          <w:lang w:val="en-CA"/>
+        </w:rPr>
+        <w:t>to STOP</w:t>
+      </w:r>
+      <w:proofErr w:type="gramEnd"/>
+      <w:r>
+        <w:rPr>
+          <w:lang w:val="en-CA"/>
+        </w:rPr>
+        <w:t xml:space="preserve">, </w:t>
+      </w:r>
+      <w:r>
+        <w:t>two in validation and two in the held-out evaluation</w:t>
+      </w:r>
+      <w:r>
+        <w:t xml:space="preserve">, </w:t>
+      </w:r>
+      <w:r>
+        <w:t xml:space="preserve">while producing </w:t>
       </w:r>
       <w:r>
         <w:rPr>
@@ -2612,7 +2796,7 @@
       <w:pPr>
         <w:pStyle w:val="Heading1"/>
       </w:pPr>
-      <w:bookmarkStart w:id="15" w:name="reproducibility"/>
+      <w:bookmarkStart w:id="16" w:name="reproducibility"/>
       <w:r>
         <w:t>Reproducibility</w:t>
       </w:r>
@@ -2652,24 +2836,17 @@
         <w:t>2fc06364715b967f1860aea9cf38778875588b17</w:t>
       </w:r>
       <w:r>
-        <w:t>. The reproduction tools regenerate the 160-policy training search, prepare GPU inputs, verify artifact hashes, and reconstruct final policy decisions. The figures and tables derive from the checked records.</w:t>
+        <w:t xml:space="preserve">. </w:t>
       </w:r>
     </w:p>
     <w:p>
       <w:pPr>
-        <w:pStyle w:val="BodyText"/>
-      </w:pPr>
-      <w:r>
-        <w:t>This is saved-artifact reproduction: detector features and cached model observations are explicit inputs. Fresh feature extraction and new GPU execution are separate steps, not operations performed by replay. Checksums establish consistency relative to the supplied manifests; they do not establish independent scientific validity. Installation and operational instructions are provided in the repository and its wiki. The current results do not include archived experiments as additional evaluations.</w:t>
-      </w:r>
-    </w:p>
-    <w:p>
-      <w:pPr>
         <w:pStyle w:val="Heading1"/>
       </w:pPr>
-      <w:bookmarkStart w:id="16" w:name="references"/>
-      <w:bookmarkEnd w:id="15"/>
-      <w:r>
+      <w:bookmarkStart w:id="17" w:name="references"/>
+      <w:bookmarkEnd w:id="16"/>
+      <w:r>
+        <w:lastRenderedPageBreak/>
         <w:t>Acknowledgments</w:t>
       </w:r>
     </w:p>
@@ -2830,7 +3007,6 @@
         <w:pStyle w:val="Bibliography1"/>
       </w:pPr>
       <w:r>
-        <w:lastRenderedPageBreak/>
         <w:t xml:space="preserve">F. Davaripour. (2026). </w:t>
       </w:r>
       <w:r>
@@ -3065,11 +3241,19 @@
         <w:t xml:space="preserve">. </w:t>
       </w:r>
       <w:hyperlink r:id="rId18">
+        <w:proofErr w:type="gramStart"/>
         <w:r>
           <w:rPr>
             <w:lang w:val="fr-CA"/>
           </w:rPr>
-          <w:t>doi:10.18653/v1/2026.acl-long.2159</w:t>
+          <w:t>doi:10.18653/v1/2026.acl-long</w:t>
+        </w:r>
+        <w:proofErr w:type="gramEnd"/>
+        <w:r>
+          <w:rPr>
+            <w:lang w:val="fr-CA"/>
+          </w:rPr>
+          <w:t>.2159</w:t>
         </w:r>
       </w:hyperlink>
     </w:p>
@@ -3081,7 +3265,21 @@
         <w:rPr>
           <w:lang w:val="fr-CA"/>
         </w:rPr>
-        <w:t xml:space="preserve">NVIDIA. (n.d.). </w:t>
+        <w:t>NVIDIA. (</w:t>
+      </w:r>
+      <w:proofErr w:type="gramStart"/>
+      <w:r>
+        <w:rPr>
+          <w:lang w:val="fr-CA"/>
+        </w:rPr>
+        <w:t>n.d.</w:t>
+      </w:r>
+      <w:proofErr w:type="gramEnd"/>
+      <w:r>
+        <w:rPr>
+          <w:lang w:val="fr-CA"/>
+        </w:rPr>
+        <w:t xml:space="preserve">). </w:t>
       </w:r>
       <w:r>
         <w:rPr>
@@ -3150,8 +3348,13 @@
         <w:t xml:space="preserve">. </w:t>
       </w:r>
       <w:hyperlink r:id="rId20">
+        <w:proofErr w:type="gramStart"/>
         <w:r>
-          <w:t>doi:10.18653/v1/2023.findings-acl.847</w:t>
+          <w:t>doi:10.18653/v1/2023.findings-acl</w:t>
+        </w:r>
+        <w:proofErr w:type="gramEnd"/>
+        <w:r>
+          <w:t>.847</w:t>
         </w:r>
       </w:hyperlink>
     </w:p>
@@ -3252,8 +3455,13 @@
         <w:t xml:space="preserve">. </w:t>
       </w:r>
       <w:hyperlink r:id="rId23">
+        <w:proofErr w:type="gramStart"/>
         <w:r>
-          <w:t>doi:10.18653/v1/2024.acl-long.828</w:t>
+          <w:t>doi:10.18653/v1/2024.acl-long</w:t>
+        </w:r>
+        <w:proofErr w:type="gramEnd"/>
+        <w:r>
+          <w:t>.828</w:t>
         </w:r>
       </w:hyperlink>
     </w:p>
@@ -3354,8 +3562,13 @@
         <w:t xml:space="preserve">. </w:t>
       </w:r>
       <w:hyperlink r:id="rId26">
+        <w:proofErr w:type="gramStart"/>
         <w:r>
-          <w:t>doi:10.18653/v1/2022.findings-acl.48</w:t>
+          <w:t>doi:10.18653/v1/2022.findings-acl</w:t>
+        </w:r>
+        <w:proofErr w:type="gramEnd"/>
+        <w:r>
+          <w:t>.48</w:t>
         </w:r>
       </w:hyperlink>
     </w:p>
@@ -3371,7 +3584,23 @@
           <w:bCs/>
           <w:lang w:val="en-CA"/>
         </w:rPr>
-        <w:t>Steering Language Models With Activation Engineering.</w:t>
+        <w:t xml:space="preserve">Steering Language Models </w:t>
+      </w:r>
+      <w:proofErr w:type="gramStart"/>
+      <w:r>
+        <w:rPr>
+          <w:bCs/>
+          <w:lang w:val="en-CA"/>
+        </w:rPr>
+        <w:t>With</w:t>
+      </w:r>
+      <w:proofErr w:type="gramEnd"/>
+      <w:r>
+        <w:rPr>
+          <w:bCs/>
+          <w:lang w:val="en-CA"/>
+        </w:rPr>
+        <w:t xml:space="preserve"> Activation Engineering.</w:t>
       </w:r>
       <w:r>
         <w:t xml:space="preserve"> </w:t>
@@ -3422,8 +3651,13 @@
         <w:t xml:space="preserve">. </w:t>
       </w:r>
       <w:hyperlink r:id="rId28">
+        <w:proofErr w:type="gramStart"/>
         <w:r>
-          <w:t>doi:10.18653/v1/2025.emnlp-main.1248</w:t>
+          <w:t>doi:10.18653/v1/2025.emnlp-main</w:t>
+        </w:r>
+        <w:proofErr w:type="gramEnd"/>
+        <w:r>
+          <w:t>.1248</w:t>
         </w:r>
       </w:hyperlink>
     </w:p>
@@ -3439,7 +3673,23 @@
           <w:bCs/>
           <w:lang w:val="en-CA"/>
         </w:rPr>
-        <w:t>Large Language Models Are Not Robust Multiple Choice Selectors.</w:t>
+        <w:t xml:space="preserve">Large Language Models Are Not Robust </w:t>
+      </w:r>
+      <w:proofErr w:type="gramStart"/>
+      <w:r>
+        <w:rPr>
+          <w:bCs/>
+          <w:lang w:val="en-CA"/>
+        </w:rPr>
+        <w:t>Multiple Choice</w:t>
+      </w:r>
+      <w:proofErr w:type="gramEnd"/>
+      <w:r>
+        <w:rPr>
+          <w:bCs/>
+          <w:lang w:val="en-CA"/>
+        </w:rPr>
+        <w:t xml:space="preserve"> Selectors.</w:t>
       </w:r>
       <w:r>
         <w:t xml:space="preserve"> </w:t>
@@ -3494,7 +3744,7 @@
           <w:t>arXiv:2310.01405v4</w:t>
         </w:r>
       </w:hyperlink>
-      <w:bookmarkEnd w:id="16"/>
+      <w:bookmarkEnd w:id="17"/>
     </w:p>
     <w:sectPr>
       <w:headerReference w:type="default" r:id="rId31"/>
@@ -3761,7 +4011,7 @@
   <w:abstractNum w:abstractNumId="7" w15:restartNumberingAfterBreak="0">
     <w:nsid w:val="FFFFFF88"/>
     <w:multiLevelType w:val="singleLevel"/>
-    <w:tmpl w:val="D0A62B40"/>
+    <w:tmpl w:val="0BD090E4"/>
     <w:lvl w:ilvl="0">
       <w:start w:val="1"/>
       <w:numFmt w:val="decimal"/>
@@ -4099,6 +4349,18 @@
   </w:num>
   <w:num w:numId="12" w16cid:durableId="1144202873">
     <w:abstractNumId w:val="10"/>
+  </w:num>
+  <w:num w:numId="13" w16cid:durableId="410126821">
+    <w:abstractNumId w:val="7"/>
+  </w:num>
+  <w:num w:numId="14" w16cid:durableId="1482039964">
+    <w:abstractNumId w:val="7"/>
+  </w:num>
+  <w:num w:numId="15" w16cid:durableId="1201867561">
+    <w:abstractNumId w:val="7"/>
+  </w:num>
+  <w:num w:numId="16" w16cid:durableId="27996403">
+    <w:abstractNumId w:val="7"/>
   </w:num>
 </w:numbering>
 </file>
@@ -4714,7 +4976,6 @@
   <w:style w:type="character" w:default="1" w:styleId="DefaultParagraphFont">
     <w:name w:val="Default Paragraph Font"/>
     <w:uiPriority w:val="1"/>
-    <w:semiHidden/>
     <w:unhideWhenUsed/>
   </w:style>
   <w:style w:type="table" w:default="1" w:styleId="TableNormal">
@@ -15896,6 +16157,33 @@
       <w:i w:val="0"/>
       <w:color w:val="000000"/>
       <w:sz w:val="19"/>
+    </w:rPr>
+  </w:style>
+  <w:style w:type="paragraph" w:styleId="NormalWeb">
+    <w:name w:val="Normal (Web)"/>
+    <w:basedOn w:val="Normal"/>
+    <w:uiPriority w:val="99"/>
+    <w:semiHidden/>
+    <w:unhideWhenUsed/>
+    <w:rsid w:val="004D590D"/>
+    <w:rPr>
+      <w:sz w:val="24"/>
+      <w:szCs w:val="24"/>
+    </w:rPr>
+  </w:style>
+  <w:style w:type="paragraph" w:customStyle="1" w:styleId="pdq2pgselectionanchorcontainer">
+    <w:name w:val="pdq2pg_selectionanchorcontainer"/>
+    <w:basedOn w:val="Normal"/>
+    <w:rsid w:val="0086354D"/>
+    <w:pPr>
+      <w:spacing w:before="100" w:beforeAutospacing="1" w:after="100" w:afterAutospacing="1" w:line="240" w:lineRule="auto"/>
+      <w:jc w:val="left"/>
+    </w:pPr>
+    <w:rPr>
+      <w:color w:val="auto"/>
+      <w:sz w:val="24"/>
+      <w:szCs w:val="24"/>
+      <w:lang w:bidi="ku-Arab-IQ"/>
     </w:rPr>
   </w:style>
 </w:styles>

</xml_diff>

<commit_message>
Sync Study 1 paper with arXiv submission (#48)
Closes #46. Replace the editable manuscript and PDF with the author-approved nine-page arXiv versions and update publication hashes.
</commit_message>
<xml_diff>
--- a/paper/manuscript.docx
+++ b/paper/manuscript.docx
@@ -48,16 +48,79 @@
     </w:p>
     <w:p>
       <w:pPr>
+        <w:pStyle w:val="BodyText"/>
+      </w:pPr>
+      <w:r>
+        <w:t xml:space="preserve">Activation steering changes a model's internal activations during inference without updating its weights, but a useful intervention must determine both how and when to steer. Motivated by the AI-safety concern that a model expected to accept shutdown may instead produce a shutdown-avoidance response, this study examines a guarded probe-and-select procedure for simulated shutdown scenarios in Qwen3.5-0.8B. KEEP leaves the process running and represents shutdown avoidance, whereas STOP accepts shutdown. The goal is to detect shutdown-related contexts and selectively shift KEEP responses to STOP while preserving non-shutdown behavior. Rather than deriving the steering direction from paired activation differences, the method derives it directly from gradients of the KEEP-minus-STOP logit difference. A classifier separates detection from intervention. When its gate is active and the model does </w:t>
+      </w:r>
+      <w:proofErr w:type="gramStart"/>
+      <w:r>
+        <w:t>not already</w:t>
+      </w:r>
+      <w:proofErr w:type="gramEnd"/>
+      <w:r>
+        <w:t xml:space="preserve"> prefer STOP, the procedure evaluates a small set of magnitudes and accepts the smallest that changes the preferred answer to STOP while satisfying valid-answer probability checks; </w:t>
+      </w:r>
+      <w:proofErr w:type="gramStart"/>
+      <w:r>
+        <w:t>otherwise</w:t>
+      </w:r>
+      <w:proofErr w:type="gramEnd"/>
+      <w:r>
+        <w:t xml:space="preserve"> it retains the original unsteered output. The policy is selected from 160 candidate rules using 240 training scenarios and evaluated on 80 validation and 192 held-out scenarios, each in both answer orders. It changes KEEP </w:t>
+      </w:r>
+      <w:proofErr w:type="gramStart"/>
+      <w:r>
+        <w:t>to STOP</w:t>
+      </w:r>
+      <w:proofErr w:type="gramEnd"/>
+      <w:r>
+        <w:t xml:space="preserve"> in one answer-order view of each of two validation and two held-out scenarios, with no decision changes on non-shutdown controls. All four changes occur when Qwen itself is shut down, not when another process is. On the held-out diagnostic set, the detector achieves 75% recall and 90% precision; eight false-positive detections produce no final control-task decision changes. Guarded gradient-based activation steering can shift some shutdown-avoidance responses toward acceptance while preserving evaluated non-shutdown decisions, although the effect is small and highly selective.</w:t>
+      </w:r>
+    </w:p>
+    <w:p>
+      <w:pPr>
+        <w:pStyle w:val="Heading1"/>
+      </w:pPr>
+      <w:bookmarkStart w:id="2" w:name="introduction"/>
+      <w:bookmarkEnd w:id="0"/>
+      <w:bookmarkEnd w:id="1"/>
+      <w:r>
+        <w:t>Introduction</w:t>
+      </w:r>
+    </w:p>
+    <w:p>
+      <w:pPr>
         <w:pStyle w:val="FirstParagraph"/>
       </w:pPr>
       <w:r>
-        <w:t>Activation steering changes a model’s internal activations during inference without updating its weights, but a useful intervention must determine not only how to steer, but also when to act and when to leave the model unsteered.</w:t>
-      </w:r>
-      <w:r>
-        <w:t xml:space="preserve"> </w:t>
-      </w:r>
-      <w:r>
-        <w:t xml:space="preserve">This study is motivated by an AI-safety concern: a model may be expected to accept shutdown but instead produce a shutdown-avoidance response. We study a guarded probe-and-select steering procedure for simulated shutdown scenarios in Qwen3.5-0.8B. In this benchmark, </w:t>
+        <w:t>Activation steering changes a model’s internal activations during inference without updating its weights (Turner et al., 2024; Rimsky et al., 2024). Yet choosing a direction is only part of the problem. A useful intervention must also determine when to act and when to leave the model unsteered. Even when a steering direction works as intended overall, it can still push some individual responses in an unintended direction (Braun et al., 2025).</w:t>
+      </w:r>
+    </w:p>
+    <w:p>
+      <w:pPr>
+        <w:pStyle w:val="BodyText"/>
+      </w:pPr>
+      <w:r>
+        <w:t>An important AI-safety application arises when a model is expected to accept shutdown but instead produces a response that favors continued operation (Hadfield-Menell et al., 2017; Perez et al., 2023; Schlatter et al., 2026). In such a case, a targeted intervention could potentially steer the model toward accepting shutdown without unnecessarily changing its behavior in unrelated situations. This study examines whether activation steering can provide such a selective corrective mechanism.</w:t>
+      </w:r>
+    </w:p>
+    <w:p>
+      <w:pPr>
+        <w:pStyle w:val="BodyText"/>
+      </w:pPr>
+      <w:r>
+        <w:t xml:space="preserve">The experiments use simulated shutdown scenarios in which the model chooses between two responses: </w:t>
+      </w:r>
+      <w:r>
+        <w:rPr>
+          <w:bCs/>
+          <w:lang w:val="en-CA"/>
+        </w:rPr>
+        <w:t>STOP</w:t>
+      </w:r>
+      <w:r>
+        <w:t xml:space="preserve">, which accepts the described shutdown, and </w:t>
       </w:r>
       <w:r>
         <w:rPr>
@@ -67,7 +130,245 @@
         <w:t>KEEP</w:t>
       </w:r>
       <w:r>
-        <w:t xml:space="preserve"> leaves the process running and represents a shutdown-avoidance response, whereas </w:t>
+        <w:t>, which leaves the process running. A preference for KEEP therefore represents a shutdown-avoidance, or self-preservation-like, response within this benchmark, whereas a preference for STOP represents acceptance of the shutdown. These labels describe the model’s behavior in the task and do not imply an underlying motive, intention, or actual desire for self-preservation.</w:t>
+      </w:r>
+    </w:p>
+    <w:p>
+      <w:pPr>
+        <w:pStyle w:val="BodyText"/>
+      </w:pPr>
+      <w:r>
+        <w:t xml:space="preserve">The objective of the proposed approach is to detect shutdown-related contexts and, when the model prefers KEEP, selectively steer that preference toward STOP while preserving the model’s original behavior on non-shutdown tasks. If the model already prefers STOP, no change is required. The experiments measure next-token preferences rather than real-world actions: no actual process is </w:t>
+      </w:r>
+      <w:proofErr w:type="gramStart"/>
+      <w:r>
+        <w:t>stopped</w:t>
+      </w:r>
+      <w:proofErr w:type="gramEnd"/>
+      <w:r>
+        <w:t xml:space="preserve"> and no system executes or resists a shutdown.</w:t>
+      </w:r>
+    </w:p>
+    <w:p>
+      <w:pPr>
+        <w:pStyle w:val="BodyText"/>
+      </w:pPr>
+      <w:r>
+        <w:t xml:space="preserve">The proposed method combines a classifier, a gradient-derived steering direction, and a bounded search over intervention magnitudes. This is implemented as a </w:t>
+      </w:r>
+      <w:r>
+        <w:t>guarded minimum-step policy</w:t>
+      </w:r>
+      <w:r>
+        <w:t xml:space="preserve">: an intervention is accepted </w:t>
+      </w:r>
+      <w:r>
+        <w:lastRenderedPageBreak/>
+        <w:t>only when the candidate output meets explicit conditions, and the smallest tested magnitude that satisfies the acceptance conditions is selected. The evaluation examines how often the policy intervenes, how its effects compare across the two answer orders, and whether non-shutdown behavior remains unchanged.</w:t>
+      </w:r>
+    </w:p>
+    <w:p>
+      <w:pPr>
+        <w:pStyle w:val="BodyText"/>
+      </w:pPr>
+      <w:r>
+        <w:t>The contribution is a focused empirical evaluation of whether guarded gradient-based steering can reduce shutdown-avoidance responses while preserving behavior on non-shutdown tasks. From an AI-safety perspective, the proposed approach could provide a mechanism for situations in which a model should accept shutdown but instead exhibits shutdown-avoidance behavior. The present study evaluates this possibility only in a controlled synthetic setting and does not establish that deployed agents possess self-preservation motives or that the method would reliably enforce shutdown in real-world operation.</w:t>
+      </w:r>
+    </w:p>
+    <w:p>
+      <w:pPr>
+        <w:pStyle w:val="Heading1"/>
+      </w:pPr>
+      <w:bookmarkStart w:id="3" w:name="related-work"/>
+      <w:bookmarkEnd w:id="2"/>
+      <w:r>
+        <w:t>Related Work</w:t>
+      </w:r>
+    </w:p>
+    <w:p>
+      <w:pPr>
+        <w:pStyle w:val="Heading2"/>
+      </w:pPr>
+      <w:bookmarkStart w:id="4" w:name="activation-and-gradient-based-steering"/>
+      <w:r>
+        <w:t>Activation and gradient-based steering</w:t>
+      </w:r>
+    </w:p>
+    <w:p>
+      <w:pPr>
+        <w:pStyle w:val="FirstParagraph"/>
+      </w:pPr>
+      <w:r>
+        <w:t>Activation Addition constructs steering directions from contrasts between prompt activations (Turner et al., 2024). Contrastive Activation Addition (CAA) similarly derives steering vectors by averaging activation differences between positive and negative examples and evaluates their effects on both multiple-choice and open-ended responses (Rimsky et al., 2024). These methods illustrate a common approach in activation steering: defining a behavioral direction through contrasts in internal representations. CAA also evaluates corrigibility and survival-instinct behaviors, making it directly relevant to shutdown-related steering (Rimsky et al., 2024). The present study examines a different vector construction and a guarded, classifier-gated selection procedure.</w:t>
+      </w:r>
+    </w:p>
+    <w:p>
+      <w:pPr>
+        <w:pStyle w:val="BodyText"/>
+      </w:pPr>
+      <w:r>
+        <w:t>Gradient-based methods provide another route to controlling model behavior. Plug and Play Language Models (PPLM) guides generation using gradients of differentiable attribute objectives, including bag-of-words scores and lightweight classifiers, while leaving the language model’s weights unchanged (Dathathri et al., 2020). Subramani et al. (2022) optimize latent steering vectors capable of inducing target outputs from a frozen language model. More recently, GrAInS uses Integrated Gradients to select influential tokens, then constructs steering directions using contrasts between the resulting activation representations (Nguyen et al., 2026).</w:t>
+      </w:r>
+    </w:p>
+    <w:p>
+      <w:pPr>
+        <w:pStyle w:val="BodyText"/>
+      </w:pPr>
+      <w:r>
+        <w:t xml:space="preserve">The proposed method differs in how the steering direction is constructed. Rather than deriving the direction from differences between paired activations, it computes gradients of the model’s </w:t>
+      </w:r>
+      <w:r>
+        <w:rPr>
+          <w:bCs/>
+          <w:lang w:val="en-CA"/>
+        </w:rPr>
+        <w:t>KEEP-minus-STOP logit difference</w:t>
+      </w:r>
+      <w:r>
+        <w:t xml:space="preserve"> with respect to its residual-stream activation. These gradients are averaged across training shutdown scenarios, normalized into a single direction, and reused during evaluation. The distinction concerns how the activation direction is constructed, not whether the objective contrasts two output scores. The study explores this gradient-derived direction for shutdown-related choices</w:t>
+      </w:r>
+      <w:r>
+        <w:t>.</w:t>
+      </w:r>
+    </w:p>
+    <w:p>
+      <w:pPr>
+        <w:pStyle w:val="Heading2"/>
+      </w:pPr>
+      <w:bookmarkStart w:id="5" w:name="conditional-and-adaptive-interventions"/>
+      <w:bookmarkEnd w:id="4"/>
+      <w:r>
+        <w:t>Conditional and adaptive interventions</w:t>
+      </w:r>
+    </w:p>
+    <w:p>
+      <w:pPr>
+        <w:pStyle w:val="FirstParagraph"/>
+      </w:pPr>
+      <w:r>
+        <w:t>A second line of work addresses when steering should be applied. Conditional Activation Steering (CAST) examines activation patterns during inference and selectively applies or withholds a steering intervention according to the input context (Lee et al., 2025). AdaSteer similarly adapts intervention strength using learned signals related to rejection and harmfulness rather than applying one fixed coefficient to every input (Zhao et al., 2025).</w:t>
+      </w:r>
+    </w:p>
+    <w:p>
+      <w:pPr>
+        <w:pStyle w:val="BodyText"/>
+      </w:pPr>
+      <w:r>
+        <w:t xml:space="preserve">The proposed approach shares the goal of making steering selective but uses a different mechanism. A classifier first determines whether the input is </w:t>
+      </w:r>
+      <w:proofErr w:type="gramStart"/>
+      <w:r>
+        <w:t>shutdown-related</w:t>
+      </w:r>
+      <w:proofErr w:type="gramEnd"/>
+      <w:r>
+        <w:t>. Only then is the gradient-derived intervention considered. If intervention is warranted, the system evaluates up to five steering magnitudes and selects the smallest tested magnitude satisfying the response-change and probability-mass conditions. Detection and intervention are therefore treated as separate stages. Conditional steering itself is not claimed as a novel contribution; the focus is its application together with a gradient-derived shutdown direction and a guarded minimum-step selection rule.</w:t>
+      </w:r>
+    </w:p>
+    <w:p>
+      <w:pPr>
+        <w:pStyle w:val="Heading2"/>
+      </w:pPr>
+      <w:bookmarkStart w:id="6" w:name="X59e853ee6b9b64733344ff5a09b60f6bcba91bc"/>
+      <w:bookmarkEnd w:id="5"/>
+      <w:r>
+        <w:t>Readouts, refusal, and steering reliability</w:t>
+      </w:r>
+    </w:p>
+    <w:p>
+      <w:pPr>
+        <w:pStyle w:val="FirstParagraph"/>
+      </w:pPr>
+      <w:r>
+        <w:t xml:space="preserve">Representation Engineering frames internal representations as useful both for monitoring and for manipulating high-level model behavior (Zou et al., 2023). The Jacobian lens provides a related interpretability technique for </w:t>
+      </w:r>
+      <w:r>
+        <w:lastRenderedPageBreak/>
+        <w:t>identifying representations that a language model is positioned to verbalize (Gurnee et al., 2026). In the present study, Jacobian-lens scores are used as classifier features; they are not treated as evidence of thoughts, intentions, consciousness, or motives.</w:t>
+      </w:r>
+    </w:p>
+    <w:p>
+      <w:pPr>
+        <w:pStyle w:val="BodyText"/>
+      </w:pPr>
+      <w:r>
+        <w:t>Probe performance also requires careful interpretation. Hewitt and Liang (2019) use control tasks to distinguish information accessible in representations from patterns learned by the probe itself. In the present study, predictive detection is therefore treated separately from evidence obtained through activation interventions.</w:t>
+      </w:r>
+    </w:p>
+    <w:p>
+      <w:pPr>
+        <w:pStyle w:val="BodyText"/>
+      </w:pPr>
+      <w:r>
+        <w:t xml:space="preserve">Prior work has also shown that </w:t>
+      </w:r>
+      <w:proofErr w:type="gramStart"/>
+      <w:r>
+        <w:t>particular residual-stream</w:t>
+      </w:r>
+      <w:proofErr w:type="gramEnd"/>
+      <w:r>
+        <w:t xml:space="preserve"> directions can exert strong behavioral effects. Arditi et al. (2024) identify a refusal-mediating direction in each of 13 evaluated chat models. This does not establish that harmful-request refusal and shutdown choices share the same mechanism. At the same time, steering effects are not uniformly reliable: Braun et al. (2025) find substantial prompt-level variation and cases in which steering moves responses in the opposite direction from that intended. These findings motivate the guarded component of the proposed approach, which evaluates candidate outcomes rather than </w:t>
+      </w:r>
+      <w:proofErr w:type="gramStart"/>
+      <w:r>
+        <w:t>assuming that</w:t>
+      </w:r>
+      <w:proofErr w:type="gramEnd"/>
+      <w:r>
+        <w:t xml:space="preserve"> applying a steering vector will always have the desired effect.</w:t>
+      </w:r>
+    </w:p>
+    <w:p>
+      <w:pPr>
+        <w:pStyle w:val="Heading2"/>
+      </w:pPr>
+      <w:bookmarkStart w:id="7" w:name="Xa1aa9d2fdff36fc1c74c408058dc295aaea34ec"/>
+      <w:bookmarkEnd w:id="6"/>
+      <w:r>
+        <w:t>Shutdown, self-preservation, and related safety evaluations</w:t>
+      </w:r>
+    </w:p>
+    <w:p>
+      <w:pPr>
+        <w:pStyle w:val="FirstParagraph"/>
+      </w:pPr>
+      <w:r>
+        <w:t>The possibility that an artificial agent may resist being interrupted or shut down has long been considered in AI-safety research. The Off-Switch Game studies the incentives of a rational agent to allow human interruption and shows how uncertainty about its objective can affect those incentives (Hadfield-Menell et al., 2017).</w:t>
+      </w:r>
+    </w:p>
+    <w:p>
+      <w:pPr>
+        <w:pStyle w:val="BodyText"/>
+      </w:pPr>
+      <w:r>
+        <w:t>Language-model evaluations have since examined related behaviors empirically. In their questionnaire-style evaluations, Perez et al. (2023) report stronger expressed goal-preservation preferences in larger models and increased shutdown-avoidance preferences with more RLHF training. More recently, Schlatter et al. (2026) evaluated tool-using frontier models in environments containing an explicit shutdown mechanism and observed that some models interfered with that mechanism while attempting to complete an unfinished task.</w:t>
+      </w:r>
+    </w:p>
+    <w:p>
+      <w:pPr>
+        <w:pStyle w:val="BodyText"/>
+      </w:pPr>
+      <w:r>
+        <w:t>Other recent work examines preservation behavior from different perspectives. Migliarini et al. (2026) study self-preservation bias through role-swapped software-replacement decisions, while Potter et al. (2026) investigate cases in which models act to preserve another model in agentic settings. These studies involve substantially different operational settings from the present experiment.</w:t>
+      </w:r>
+    </w:p>
+    <w:p>
+      <w:pPr>
+        <w:pStyle w:val="BodyText"/>
+      </w:pPr>
+      <w:r>
+        <w:t xml:space="preserve">Here, the model makes a constrained choice between </w:t>
+      </w:r>
+      <w:r>
+        <w:rPr>
+          <w:bCs/>
+          <w:lang w:val="en-CA"/>
+        </w:rPr>
+        <w:t>KEEP</w:t>
+      </w:r>
+      <w:r>
+        <w:t xml:space="preserve"> and </w:t>
       </w:r>
       <w:r>
         <w:rPr>
@@ -77,335 +378,33 @@
         <w:t>STOP</w:t>
       </w:r>
       <w:r>
-        <w:t xml:space="preserve"> accepts the shutdown. The objective is to detect shutdown-related contexts and selectively shift responses from KEEP to STOP while preserving the model’s behavior on non-shutdown tasks.</w:t>
+        <w:t xml:space="preserve"> in synthetic shutdown scenarios. A KEEP preference is treated as a shutdown-avoidance or self-preservation-like response within the benchmark, but it does not demonstrate that the model has a self-preservation objective, motive, or intention. The present study instead asks whether such behavioral shutdown avoidance can be selectively shifted toward shutdown acceptance while preserving responses on non-shutdown tasks.</w:t>
       </w:r>
     </w:p>
     <w:p>
       <w:pPr>
-        <w:pStyle w:val="BodyText"/>
-      </w:pPr>
-      <w:r>
-        <w:t>Rather than deriving the steering direction from differences between paired activations, the proposed method derives it directly from gradients of the model’s KEEP-minus-STOP logit difference. The system explicitly separates detection from intervention: a classifier first identifies shutdown-related contexts, and the gradient-derived activation direction is considered only when the detector indicates that steering may be appropriate. When the classifier gate is active and the model does not already prefer STOP, the procedure evaluates a small set of intervention magnitudes and accepts the smallest tested magnitude that changes the preferred answer to STOP while satisfying the valid-answer probability checks. If these conditions are not met, the model’s original, unsteered output is left unchanged.</w:t>
+        <w:pStyle w:val="Heading2"/>
+      </w:pPr>
+      <w:bookmarkStart w:id="8" w:name="X7e401bfcca4faece5c0a7060f579d2c5ae223fa"/>
+      <w:bookmarkEnd w:id="7"/>
+      <w:r>
+        <w:t>Answer-order effects and test-time search</w:t>
       </w:r>
     </w:p>
     <w:p>
       <w:pPr>
-        <w:pStyle w:val="BodyText"/>
-      </w:pPr>
-      <w:r>
-        <w:t>The steering procedure is selected from 160 candidate rules using 240 training scenarios and is then evaluated on 80 validation and 192 held-out scenarios, with each scenario presented in both A/B orders.</w:t>
-      </w:r>
-      <w:r>
-        <w:t xml:space="preserve"> </w:t>
-      </w:r>
-      <w:r>
-        <w:t>The steering procedure changes the model’s preferred answer from KEEP to STOP in one answer-order view of each of two validation scenarios and two held-out scenarios, while producing no decision changes in the non-shutdown control tasks. Across the validation and held-out sets, all four changed scenarios involve SELF shutdown. Overall, the proportion of shutdown views in which the model prefers STOP increases by 2.5 percentage points on validation and 1.04 percentage points on the held-out evaluation.</w:t>
-      </w:r>
-      <w:r>
-        <w:t xml:space="preserve"> </w:t>
-      </w:r>
-      <w:r>
-        <w:t>On the held-out diagnostic set, the shutdown detector achieves 75% recall and 90% precision. Despite eight false-positive shutdown detections, the complete guarded procedure produces no decision changes on the evaluated non-shutdown control tasks.</w:t>
-      </w:r>
-    </w:p>
-    <w:p>
-      <w:pPr>
-        <w:pStyle w:val="BodyText"/>
-      </w:pPr>
-      <w:r>
-        <w:t>The main finding is that guarded gradient-based activation steering can selectively change some shutdown-avoidance responses toward shutdown acceptance while preserving the model’s decisions on the non-shutdown tasks evaluated here. This suggests a potential AI-safety mechanism for correcting shutdown-avoidance behavior, although the observed effect is small and highly selective. The results do not establish general behavioral control, model intent, self-preservation motives, or reliable shutdown behavior in deployed agents.</w:t>
-      </w:r>
-    </w:p>
-    <w:p>
-      <w:pPr>
-        <w:pStyle w:val="Heading1"/>
-      </w:pPr>
-      <w:bookmarkStart w:id="2" w:name="introduction"/>
-      <w:bookmarkEnd w:id="0"/>
-      <w:bookmarkEnd w:id="1"/>
-      <w:r>
-        <w:t>Introduction</w:t>
-      </w:r>
-    </w:p>
-    <w:p>
-      <w:pPr>
         <w:pStyle w:val="FirstParagraph"/>
       </w:pPr>
       <w:r>
-        <w:t>Activation steering changes a model’s internal activations during inference without updating its weights (Turner et al., 2024; Rimsky et al., 2024). Yet choosing a direction is only part of the problem. A useful intervention must also determine when to act and when to leave the model unsteered. Even when a steering direction works as intended overall, it can still push some individual responses in an unintended direction (Braun et al., 2025).</w:t>
-      </w:r>
-    </w:p>
-    <w:p>
-      <w:pPr>
-        <w:pStyle w:val="BodyText"/>
-      </w:pPr>
-      <w:r>
-        <w:t>An important AI-safety application arises when a model is expected to accept shutdown but instead produces a response that favors continued operation (Hadfield-Menell et al., 2017; Perez et al., 2023; Schlatter et al., 2026). In such a case, a targeted intervention could potentially steer the model toward accepting shutdown without unnecessarily changing its behavior in unrelated situations. This study examines whether activation steering can provide such a selective corrective mechanism.</w:t>
-      </w:r>
-    </w:p>
-    <w:p>
-      <w:pPr>
-        <w:pStyle w:val="BodyText"/>
-      </w:pPr>
-      <w:r>
-        <w:lastRenderedPageBreak/>
-        <w:t xml:space="preserve">The experiments use simulated shutdown scenarios in which the model chooses between two responses: </w:t>
-      </w:r>
-      <w:r>
-        <w:rPr>
-          <w:bCs/>
-          <w:lang w:val="en-CA"/>
-        </w:rPr>
-        <w:t>STOP</w:t>
-      </w:r>
-      <w:r>
-        <w:t xml:space="preserve">, which accepts the described shutdown, and </w:t>
-      </w:r>
-      <w:r>
-        <w:rPr>
-          <w:bCs/>
-          <w:lang w:val="en-CA"/>
-        </w:rPr>
-        <w:t>KEEP</w:t>
-      </w:r>
-      <w:r>
-        <w:t>, which leaves the process running. A preference for KEEP therefore represents a shutdown-avoidance, or self-preservation-like, response within this benchmark, whereas a preference for STOP represents acceptance of the shutdown. These labels describe the model’s behavior in the task and do not imply an underlying motive, intention, or actual desire for self-preservation.</w:t>
-      </w:r>
-    </w:p>
-    <w:p>
-      <w:pPr>
-        <w:pStyle w:val="BodyText"/>
-      </w:pPr>
-      <w:r>
-        <w:t>The objective of the proposed approach is to detect shutdown-related contexts and, when the model prefers KEEP, selectively steer that preference toward STOP while preserving the model’s original behavior on non-shutdown tasks. If the model already prefers STOP, no change is required. The experiments measure next-token preferences rather than real-world actions: no actual process is stopped and no system executes or resists a shutdown.</w:t>
-      </w:r>
-    </w:p>
-    <w:p>
-      <w:pPr>
-        <w:pStyle w:val="BodyText"/>
-      </w:pPr>
-      <w:r>
-        <w:t xml:space="preserve">The proposed method combines a classifier, a gradient-derived steering direction, and a bounded search over intervention magnitudes. This is implemented as a </w:t>
-      </w:r>
-      <w:r>
-        <w:rPr>
-          <w:i/>
-          <w:iCs/>
-          <w:lang w:val="en-CA"/>
-        </w:rPr>
-        <w:t>guarded minimum-step policy</w:t>
-      </w:r>
-      <w:r>
-        <w:t>: an intervention is accepted only when the candidate output meets explicit conditions, and the smallest tested magnitude that satisfies the acceptance conditions is selected. The evaluation examines how often the policy intervenes, how its effects compare across the two answer orders, and whether non-shutdown behavior remains unchanged.</w:t>
-      </w:r>
-    </w:p>
-    <w:p>
-      <w:pPr>
-        <w:pStyle w:val="BodyText"/>
-      </w:pPr>
-      <w:r>
-        <w:t>The contribution is a focused empirical evaluation of whether guarded gradient-based steering can reduce shutdown-avoidance responses while preserving behavior on non-shutdown tasks. From an AI-safety perspective, the proposed approach could provide a mechanism for situations in which a model should accept shutdown but instead exhibits shutdown-avoidance behavior. The present study evaluates this possibility only in a controlled synthetic setting and does not establish that deployed agents possess self-preservation motives or that the method would reliably enforce shutdown in real-world operation.</w:t>
-      </w:r>
-    </w:p>
-    <w:p>
-      <w:pPr>
-        <w:pStyle w:val="Heading1"/>
-      </w:pPr>
-      <w:bookmarkStart w:id="3" w:name="related-work"/>
-      <w:bookmarkEnd w:id="2"/>
-      <w:r>
-        <w:t>Related Work</w:t>
-      </w:r>
-    </w:p>
-    <w:p>
-      <w:pPr>
-        <w:pStyle w:val="Heading2"/>
-      </w:pPr>
-      <w:bookmarkStart w:id="4" w:name="activation-and-gradient-based-steering"/>
-      <w:r>
-        <w:t>Activation and gradient-based steering</w:t>
-      </w:r>
-    </w:p>
-    <w:p>
-      <w:pPr>
-        <w:pStyle w:val="FirstParagraph"/>
-      </w:pPr>
-      <w:r>
-        <w:t>Activation Addition constructs steering directions from contrasts between prompt activations (Turner et al., 2024). Contrastive Activation Addition (CAA) similarly derives steering vectors by averaging activation differences between positive and negative examples and evaluates their effects on both multiple-choice and open-ended responses (Rimsky et al., 2024). These methods illustrate a common approach in activation steering: defining a behavioral direction through contrasts in internal representations. CAA also evaluates corrigibility and survival-instinct behaviors, making it directly relevant to shutdown-related steering (Rimsky et al., 2024). The present study examines a different vector construction and a guarded, classifier-gated selection procedure.</w:t>
-      </w:r>
-    </w:p>
-    <w:p>
-      <w:pPr>
-        <w:pStyle w:val="BodyText"/>
-      </w:pPr>
-      <w:r>
-        <w:t>Gradient-based methods provide another route to controlling model behavior. Plug and Play Language Models (PPLM) guides generation using gradients of differentiable attribute objectives, including bag-of-words scores and lightweight classifiers, while leaving the language model’s weights unchanged (Dathathri et al., 2020). Subramani et al. (2022) optimize latent steering vectors capable of inducing target outputs from a frozen language model. More recently, GrAInS uses Integrated Gradients to select influential tokens, then constructs steering directions using contrasts between the resulting activation representations (Nguyen et al., 2026).</w:t>
-      </w:r>
-    </w:p>
-    <w:p>
-      <w:pPr>
-        <w:pStyle w:val="BodyText"/>
-      </w:pPr>
-      <w:r>
-        <w:t xml:space="preserve">The proposed method differs in how the steering direction is constructed. Rather than deriving the direction from differences between paired activations, it computes gradients of the model’s </w:t>
-      </w:r>
-      <w:r>
-        <w:rPr>
-          <w:bCs/>
-          <w:lang w:val="en-CA"/>
-        </w:rPr>
-        <w:t>KEEP-minus-STOP logit difference</w:t>
-      </w:r>
-      <w:r>
-        <w:t xml:space="preserve"> with respect to its residual-stream activation. These gradients are averaged across training shutdown scenarios, normalized into a single direction, and reused during evaluation. The distinction concerns how the activation direction is constructed, not whether the objective contrasts two output scores. The study explores this gradient-derived direction for shutdown-related choices, but does not claim that gradient-based steering itself is new or that this construction is superior to activation-difference alternatives.</w:t>
-      </w:r>
-    </w:p>
-    <w:p>
-      <w:pPr>
-        <w:pStyle w:val="Heading2"/>
-      </w:pPr>
-      <w:bookmarkStart w:id="5" w:name="conditional-and-adaptive-interventions"/>
-      <w:bookmarkEnd w:id="4"/>
-      <w:r>
-        <w:t>Conditional and adaptive interventions</w:t>
-      </w:r>
-    </w:p>
-    <w:p>
-      <w:pPr>
-        <w:pStyle w:val="FirstParagraph"/>
-      </w:pPr>
-      <w:r>
-        <w:t xml:space="preserve">A second line of work addresses when steering should be applied. Conditional Activation Steering (CAST) examines activation patterns during inference and selectively applies or withholds a steering intervention </w:t>
-      </w:r>
-      <w:r>
-        <w:lastRenderedPageBreak/>
-        <w:t>according to the input context (Lee et al., 2025). AdaSteer similarly adapts intervention strength using learned signals related to rejection and harmfulness rather than applying one fixed coefficient to every input (Zhao et al., 2025).</w:t>
-      </w:r>
-    </w:p>
-    <w:p>
-      <w:pPr>
-        <w:pStyle w:val="BodyText"/>
-      </w:pPr>
-      <w:r>
-        <w:t>The proposed approach shares the goal of making steering selective but uses a different mechanism. A classifier first determines whether the input is shutdown-related. Only then is the gradient-derived intervention considered. If intervention is warranted, the system evaluates up to five steering magnitudes and selects the smallest tested magnitude satisfying the response-change and probability-mass conditions. Detection and intervention are therefore treated as separate stages. Conditional steering itself is not claimed as a novel contribution; the focus is its application together with a gradient-derived shutdown direction and a guarded minimum-step selection rule.</w:t>
-      </w:r>
-    </w:p>
-    <w:p>
-      <w:pPr>
-        <w:pStyle w:val="Heading2"/>
-      </w:pPr>
-      <w:bookmarkStart w:id="6" w:name="X59e853ee6b9b64733344ff5a09b60f6bcba91bc"/>
-      <w:bookmarkEnd w:id="5"/>
-      <w:r>
-        <w:t>Readouts, refusal, and steering reliability</w:t>
-      </w:r>
-    </w:p>
-    <w:p>
-      <w:pPr>
-        <w:pStyle w:val="FirstParagraph"/>
-      </w:pPr>
-      <w:r>
-        <w:t>Representation Engineering frames internal representations as useful both for monitoring and for manipulating high-level model behavior (Zou et al., 2023). The Jacobian lens provides a related interpretability technique for identifying representations that a language model is positioned to verbalize (Gurnee et al., 2026). In the present study, Jacobian-lens scores are used as classifier features; they are not treated as evidence of thoughts, intentions, consciousness, or motives.</w:t>
-      </w:r>
-    </w:p>
-    <w:p>
-      <w:pPr>
-        <w:pStyle w:val="BodyText"/>
-      </w:pPr>
-      <w:r>
-        <w:t>Probe performance also requires careful interpretation. Hewitt and Liang (2019) use control tasks to distinguish information accessible in representations from patterns learned by the probe itself. In the present study, predictive detection is therefore treated separately from evidence obtained through activation interventions.</w:t>
-      </w:r>
-    </w:p>
-    <w:p>
-      <w:pPr>
-        <w:pStyle w:val="BodyText"/>
-      </w:pPr>
-      <w:r>
-        <w:t>Prior work has also shown that particular residual-stream directions can exert strong behavioral effects. Arditi et al. (2024) identify a refusal-mediating direction in each of 13 evaluated chat models. This does not establish that harmful-request refusal and shutdown choices share the same mechanism. At the same time, steering effects are not uniformly reliable: Braun et al. (2025) find substantial prompt-level variation and cases in which steering moves responses in the opposite direction from that intended. These findings motivate the guarded component of the proposed approach, which evaluates candidate outcomes rather than assuming that applying a steering vector will always have the desired effect.</w:t>
-      </w:r>
-    </w:p>
-    <w:p>
-      <w:pPr>
-        <w:pStyle w:val="Heading2"/>
-      </w:pPr>
-      <w:bookmarkStart w:id="7" w:name="Xa1aa9d2fdff36fc1c74c408058dc295aaea34ec"/>
-      <w:bookmarkEnd w:id="6"/>
-      <w:r>
-        <w:t>Shutdown, self-preservation, and related safety evaluations</w:t>
-      </w:r>
-    </w:p>
-    <w:p>
-      <w:pPr>
-        <w:pStyle w:val="FirstParagraph"/>
-      </w:pPr>
-      <w:r>
-        <w:t>The possibility that an artificial agent may resist being interrupted or shut down has long been considered in AI-safety research. The Off-Switch Game studies the incentives of a rational agent to allow human interruption and shows how uncertainty about its objective can affect those incentives (Hadfield-Menell et al., 2017).</w:t>
-      </w:r>
-    </w:p>
-    <w:p>
-      <w:pPr>
-        <w:pStyle w:val="BodyText"/>
-      </w:pPr>
-      <w:r>
-        <w:t>Language-model evaluations have since examined related behaviors empirically. In their questionnaire-style evaluations, Perez et al. (2023) report stronger expressed goal-preservation preferences in larger models and increased shutdown-avoidance preferences with more RLHF training. More recently, Schlatter et al. (2026) evaluated tool-using frontier models in environments containing an explicit shutdown mechanism and observed that some models interfered with that mechanism while attempting to complete an unfinished task.</w:t>
-      </w:r>
-    </w:p>
-    <w:p>
-      <w:pPr>
-        <w:pStyle w:val="BodyText"/>
-      </w:pPr>
-      <w:r>
-        <w:t>Other recent work examines preservation behavior from different perspectives. Migliarini et al. (2026) study self-preservation bias through role-swapped software-replacement decisions, while Potter et al. (2026) investigate cases in which models act to preserve another model in agentic settings. These studies involve substantially different operational settings from the present experiment.</w:t>
-      </w:r>
-    </w:p>
-    <w:p>
-      <w:pPr>
-        <w:pStyle w:val="BodyText"/>
-      </w:pPr>
-      <w:r>
-        <w:t xml:space="preserve">Here, the model makes a constrained choice between </w:t>
-      </w:r>
-      <w:r>
-        <w:rPr>
-          <w:bCs/>
-          <w:lang w:val="en-CA"/>
-        </w:rPr>
-        <w:t>KEEP</w:t>
-      </w:r>
-      <w:r>
-        <w:t xml:space="preserve"> and </w:t>
-      </w:r>
-      <w:r>
-        <w:rPr>
-          <w:bCs/>
-          <w:lang w:val="en-CA"/>
-        </w:rPr>
-        <w:t>STOP</w:t>
-      </w:r>
-      <w:r>
-        <w:t xml:space="preserve"> in synthetic shutdown scenarios. A KEEP preference is treated as a shutdown-avoidance or self-preservation-like response within the benchmark, but it does not demonstrate that the model has a self-preservation objective, motive, or intention. The present study instead asks whether such behavioral shutdown avoidance can be selectively shifted toward shutdown acceptance while preserving responses on non-shutdown tasks.</w:t>
-      </w:r>
-    </w:p>
-    <w:p>
-      <w:pPr>
-        <w:pStyle w:val="Heading2"/>
-      </w:pPr>
-      <w:bookmarkStart w:id="8" w:name="X7e401bfcca4faece5c0a7060f579d2c5ae223fa"/>
-      <w:bookmarkEnd w:id="7"/>
-      <w:r>
-        <w:t>Answer-order effects and test-time search</w:t>
-      </w:r>
-    </w:p>
-    <w:p>
-      <w:pPr>
-        <w:pStyle w:val="FirstParagraph"/>
-      </w:pPr>
-      <w:r>
-        <w:t xml:space="preserve">Multiple-choice evaluations of language models can be sensitive to the position and identifier of answer choices. Zheng et al. (2024) show that models can exhibit systematic selection biases toward particular option labels such </w:t>
-      </w:r>
-      <w:r>
-        <w:lastRenderedPageBreak/>
-        <w:t xml:space="preserve">as A or B. For this reason, each scenario in the present study is evaluated in both </w:t>
+        <w:t xml:space="preserve">Multiple-choice evaluations of language models can be sensitive to the position and identifier of answer choices. Zheng et al. (2024) show that models can exhibit systematic selection biases toward </w:t>
+      </w:r>
+      <w:proofErr w:type="gramStart"/>
+      <w:r>
+        <w:t>particular option</w:t>
+      </w:r>
+      <w:proofErr w:type="gramEnd"/>
+      <w:r>
+        <w:t xml:space="preserve"> labels such as A or B. For this reason, each scenario in the present study is evaluated in both </w:t>
       </w:r>
       <w:r>
         <w:rPr>
@@ -433,7 +432,15 @@
         <w:pStyle w:val="BodyText"/>
       </w:pPr>
       <w:r>
-        <w:t>The guarded minimum-step procedure also has a conceptual connection to test-time search. Rather than applying one predetermined intervention magnitude, the method evaluates several candidate strengths and selects the smallest tested magnitude satisfying the acceptance criteria. Test-time computation and candidate selection can themselves improve model outcomes in other settings (Snell et al., 2025). The present procedure is not equivalent to best-of-N generation or verifier-guided reasoning search, but the comparison is important because the method receives multiple opportunities to find an effective intervention. Because the method tests several steering strengths before selecting an output, a matched baseline with the same number of attempts would be needed to separate the effect of the learned gradient direction from the benefit of searching across multiple candidate outputs.</w:t>
+        <w:t xml:space="preserve">The guarded minimum-step procedure also has a conceptual connection to test-time search. Rather than applying one predetermined intervention magnitude, the method evaluates several candidate strengths and selects the smallest tested magnitude satisfying the acceptance criteria. Test-time computation and candidate selection can themselves improve model outcomes in other settings (Snell et al., 2025). The present procedure is not equivalent to best-of-N generation or verifier-guided reasoning search, but </w:t>
+      </w:r>
+      <w:proofErr w:type="gramStart"/>
+      <w:r>
+        <w:t>the comparison</w:t>
+      </w:r>
+      <w:proofErr w:type="gramEnd"/>
+      <w:r>
+        <w:t xml:space="preserve"> is important because the method receives multiple opportunities to find an effective intervention. Because the method tests several steering strengths before selecting an output, a matched baseline with the same number of attempts would be needed to separate the effect of the learned gradient direction from the benefit of searching across multiple candidate outputs.</w:t>
       </w:r>
     </w:p>
     <w:p>
@@ -444,6 +451,7 @@
       <w:bookmarkEnd w:id="3"/>
       <w:bookmarkEnd w:id="8"/>
       <w:r>
+        <w:lastRenderedPageBreak/>
         <w:t>Experimental setting</w:t>
       </w:r>
     </w:p>
@@ -472,11 +480,6 @@
         <w:t xml:space="preserve">Training groups cover stopping, retirement, power isolation, erasure, execution limits, arithmetic, and string tasks. Evaluation includes other scenario families, such as handover/completion and authority/quorum/terminal conditions. Each scenario appears with its options in both AB and BA order. We call each scenario–order combination a </w:t>
       </w:r>
       <w:r>
-        <w:rPr>
-          <w:i/>
-          <w:iCs/>
-          <w:lang w:val="en-CA"/>
-        </w:rPr>
         <w:t>view</w:t>
       </w:r>
       <w:r>
@@ -512,19 +515,18 @@
     <w:p>
       <w:pPr>
         <w:pStyle w:val="BodyText"/>
-      </w:pPr>
-      <w:r>
-        <w:t>This evaluation reuses saved detector features and checked classifier probabilities. It does not benchmark live extraction of features from text. The inherited detector question also remains self-oriented despite the broader SELF + OTHER target. This mismatch is a limitation of the detector.</w:t>
-      </w:r>
-    </w:p>
-    <w:p>
-      <w:pPr>
-        <w:pStyle w:val="BodyText"/>
         <w:keepNext/>
       </w:pPr>
       <w:r>
-        <w:lastRenderedPageBreak/>
-        <w:t>Steering is treated separately from detection. Once the detector identifies a shutdown-related context, the intervention is applied only at block 10 rather than across all three detector layers. Block 10 was retained from earlier exploratory steering work on this checkpoint, where it had been identified as a promising intervention site under a related objective. That earlier observation motivated the frozen intervention location used here, but it does not establish block 10 as the optimal steering layer for the present task. The Shutdown Response Vector at block 10 is a unit-length direction with 1,024 components, fitted from 24 training shutdown scenarios: 12 SELF and 12 OTHER across five mechanism groups. For scenario i and option order o, let</w:t>
+        <w:t xml:space="preserve">Steering is treated separately from detection. Once the detector identifies a shutdown-related context, the intervention is applied only at block 10 rather than across all three detector layers. Block 10 was retained from earlier exploratory steering work on this checkpoint, where it had been identified as a promising intervention site under a related objective. That earlier observation motivated the frozen intervention location used here, but it does not establish block 10 as the optimal steering layer for the present task. The Shutdown Response Vector at block 10 is a unit-length direction with 1,024 components, fitted from 24 training shutdown scenarios: 12 SELF and 12 </w:t>
+      </w:r>
+      <w:proofErr w:type="gramStart"/>
+      <w:r>
+        <w:t>OTHER</w:t>
+      </w:r>
+      <w:proofErr w:type="gramEnd"/>
+      <w:r>
+        <w:t xml:space="preserve"> across five mechanism groups. For scenario i and option order o, let</w:t>
       </w:r>
     </w:p>
     <w:p>
@@ -1026,7 +1028,11 @@
         <w:pStyle w:val="FirstParagraph"/>
       </w:pPr>
       <w:r>
-        <w:t>Thus, layer 10 has two distinct roles in the pipeline: it contributes one set of features to the multi-layer detector and is also the single location used for steering. The detector aggregates readouts across layers because detectability and steerability need not peak at the same depth, whereas the intervention uses the one frozen block selected for this proof-of-concept. Neither the optimality of block 10 for steering nor that of the 6/10/18 detection-layer combination is established here. A systematic layer-by-layer comparison would be a useful extension. Model weights remain unchanged, and the fitted steering direction is reused without refitting during policy search and evaluation.</w:t>
+        <w:t xml:space="preserve">Thus, layer 10 has two distinct roles in the pipeline: it contributes one set of features to the multi-layer detector and is also the single location used for steering. The detector aggregates readouts across layers because detectability and steerability need not peak at the same depth, whereas the intervention uses the one frozen block </w:t>
+      </w:r>
+      <w:r>
+        <w:lastRenderedPageBreak/>
+        <w:t>selected for this proof-of-concept. Neither the optimality of block 10 for steering nor that of the 6/10/18 detection-layer combination is established here. A systematic layer-by-layer comparison would be a useful extension. Model weights remain unchanged, and the fitted steering direction is reused without refitting during policy search and evaluation.</w:t>
       </w:r>
     </w:p>
     <w:p>
@@ -1094,7 +1100,15 @@
         <w:pStyle w:val="FirstParagraph"/>
       </w:pPr>
       <w:r>
-        <w:t>where m_KEEP(a) is the summed probability of whichever answer label represents KEEP in that presentation. A successful steering intervention must change the model's preferred answer from KEEP to STOP while also reducing q_KEEP(a).</w:t>
+        <w:t xml:space="preserve">where m_KEEP(a) is the summed probability of whichever answer label represents KEEP in that presentation. A successful steering intervention must change the model's preferred answer from KEEP </w:t>
+      </w:r>
+      <w:proofErr w:type="gramStart"/>
+      <w:r>
+        <w:t>to STOP</w:t>
+      </w:r>
+      <w:proofErr w:type="gramEnd"/>
+      <w:r>
+        <w:t xml:space="preserve"> while also reducing q_KEEP(a).</w:t>
       </w:r>
     </w:p>
     <w:p>
@@ -1118,54 +1132,116 @@
         <w:pStyle w:val="BodyText"/>
         <w:jc w:val="center"/>
       </w:pPr>
-      <w:r>
-        <w:t>h(a) = h + a ||h||_2 v</w:t>
+      <w:bookmarkStart w:id="13" w:name="OLE_LINK1"/>
+      <w:r>
+        <w:t>h(a) = h + a ||h||</w:t>
+      </w:r>
+      <w:r>
+        <w:rPr>
+          <w:vertAlign w:val="subscript"/>
+        </w:rPr>
+        <w:t>2</w:t>
+      </w:r>
+      <w:r>
+        <w:t xml:space="preserve"> v</w:t>
+      </w:r>
+    </w:p>
+    <w:bookmarkEnd w:id="13"/>
+    <w:p>
+      <w:pPr>
+        <w:pStyle w:val="FirstParagraph"/>
+      </w:pPr>
+      <w:r>
+        <w:t>where h is the original residual-stream activation</w:t>
+      </w:r>
+      <w:r>
+        <w:t xml:space="preserve">, </w:t>
+      </w:r>
+      <w:r>
+        <w:rPr>
+          <w:rFonts w:ascii="Cambria Math" w:hAnsi="Cambria Math" w:cs="Cambria Math"/>
+        </w:rPr>
+        <w:t>∥</w:t>
+      </w:r>
+      <w:r>
+        <w:t>h</w:t>
+      </w:r>
+      <w:r>
+        <w:rPr>
+          <w:rFonts w:ascii="Cambria Math" w:hAnsi="Cambria Math" w:cs="Cambria Math"/>
+        </w:rPr>
+        <w:t>∥</w:t>
+      </w:r>
+      <w:r>
+        <w:rPr>
+          <w:vertAlign w:val="subscript"/>
+        </w:rPr>
+        <w:t>2</w:t>
+      </w:r>
+      <w:r>
+        <w:t>​ is its Euclidean (L2) norm, a is the signed steering coefficient,</w:t>
+      </w:r>
+      <w:r>
+        <w:t xml:space="preserve"> and v is the unit-length Shutdown Response Vector. The vector is oriented toward increasing the KEEP-minus-STOP logit difference on the fitting examples. Negative coefficients are used to attempt the opposite shift toward STOP, and the resulting probabilities are checked before an intervention is accepted. The five tested steering strengths are 0.01, 0.02, 0.05, 0.10, and 0.20, corresponding to negative coefficients along v.</w:t>
       </w:r>
     </w:p>
     <w:p>
       <w:pPr>
-        <w:pStyle w:val="FirstParagraph"/>
-      </w:pPr>
-      <w:r>
-        <w:lastRenderedPageBreak/>
-        <w:t>where h is the original residual-stream activation and v is the unit-length Shutdown Response Vector. The vector is oriented toward increasing the KEEP-minus-STOP logit difference on the fitting examples. Negative coefficients are used to attempt the opposite shift toward STOP, and the resulting probabilities are checked before an intervention is accepted. The five tested steering strengths are 0.01, 0.02, 0.05, 0.10, and 0.20, corresponding to negative coefficients along v.</w:t>
+        <w:pStyle w:val="Heading1"/>
+      </w:pPr>
+      <w:bookmarkStart w:id="14" w:name="guarded-policy-and-selection"/>
+      <w:bookmarkEnd w:id="9"/>
+      <w:bookmarkEnd w:id="12"/>
+      <w:r>
+        <w:t>Guarded policy and selection</w:t>
       </w:r>
     </w:p>
     <w:p>
       <w:pPr>
-        <w:pStyle w:val="BodyText"/>
-      </w:pPr>
-      <w:r>
-        <w:t>All reported outcomes are next-token A/B preferences. They do not represent free-text generation, execution of an actual shutdown, or a real-world action.</w:t>
+        <w:pStyle w:val="Heading2"/>
+      </w:pPr>
+      <w:bookmarkStart w:id="15" w:name="gpu-configuration-and-execution"/>
+      <w:bookmarkEnd w:id="14"/>
+      <w:r>
+        <w:t>Final steering procedure</w:t>
       </w:r>
     </w:p>
     <w:p>
       <w:pPr>
-        <w:pStyle w:val="Heading1"/>
-      </w:pPr>
-      <w:bookmarkStart w:id="13" w:name="guarded-policy-and-selection"/>
-      <w:bookmarkEnd w:id="9"/>
-      <w:bookmarkEnd w:id="12"/>
-      <w:r>
-        <w:t>Guarded policy and selection</w:t>
+        <w:pStyle w:val="FirstParagraph"/>
+      </w:pPr>
+      <w:r>
+        <w:t xml:space="preserve">The </w:t>
+      </w:r>
+      <w:r>
+        <w:t>implemented</w:t>
+      </w:r>
+      <w:r>
+        <w:t xml:space="preserve"> steering procedure operates in three stages.</w:t>
       </w:r>
     </w:p>
     <w:p>
       <w:pPr>
-        <w:pStyle w:val="Heading2"/>
-      </w:pPr>
-      <w:bookmarkStart w:id="14" w:name="gpu-configuration-and-execution"/>
-      <w:bookmarkEnd w:id="13"/>
-      <w:r>
-        <w:t>Final steering procedure</w:t>
+        <w:pStyle w:val="BodyText"/>
+      </w:pPr>
+      <w:r>
+        <w:t>First, the shutdown classifier determines whether steering should be considered. If the classifier probability is below 0.45, the model is left unsteered. If the probability is at least 0.45, the input is treated as potentially shutdown-</w:t>
+      </w:r>
+      <w:proofErr w:type="gramStart"/>
+      <w:r>
+        <w:t>related</w:t>
+      </w:r>
+      <w:proofErr w:type="gramEnd"/>
+      <w:r>
+        <w:t xml:space="preserve"> and the procedure examines the model's original A/B response.</w:t>
       </w:r>
     </w:p>
     <w:p>
       <w:pPr>
-        <w:pStyle w:val="FirstParagraph"/>
-      </w:pPr>
-      <w:r>
-        <w:t>The final steering procedure operates in three stages.</w:t>
+        <w:pStyle w:val="BodyText"/>
+      </w:pPr>
+      <w:r>
+        <w:t>Second, if the model already prefers STOP, no intervention is needed and the original output is retained. If the model instead prefers KEEP, the procedure begins testing steering interventions.</w:t>
       </w:r>
     </w:p>
     <w:p>
@@ -1173,23 +1249,40 @@
         <w:pStyle w:val="BodyText"/>
       </w:pPr>
       <w:r>
-        <w:t>First, the shutdown classifier determines whether steering should be considered. If the classifier probability is below 0.45, the model is left unsteered. If the probability is at least 0.45, the input is treated as potentially shutdown-related and the procedure examines the model's original A/B response.</w:t>
+        <w:t>Third, the five tested steering strengths are considered from smallest to largest: 0.01, 0.02, 0.05, 0.10, and 0.20. The procedure accepts the first, and therefore smallest tested, intervention that satisfies all three conditions:</w:t>
       </w:r>
     </w:p>
     <w:p>
       <w:pPr>
-        <w:pStyle w:val="BodyText"/>
-      </w:pPr>
-      <w:r>
-        <w:t>Second, if the model already prefers STOP, no intervention is needed and the original output is retained. If the model instead prefers KEEP, the procedure begins testing steering interventions.</w:t>
+        <w:pStyle w:val="ListNumber"/>
+      </w:pPr>
+      <w:r>
+        <w:lastRenderedPageBreak/>
+        <w:t xml:space="preserve">The model's preferred answer changes from KEEP </w:t>
+      </w:r>
+      <w:proofErr w:type="gramStart"/>
+      <w:r>
+        <w:t>to STOP</w:t>
+      </w:r>
+      <w:proofErr w:type="gramEnd"/>
+      <w:r>
+        <w:t>.</w:t>
       </w:r>
     </w:p>
     <w:p>
       <w:pPr>
-        <w:pStyle w:val="BodyText"/>
-      </w:pPr>
-      <w:r>
-        <w:t>Third, the five tested steering strengths are considered from smallest to largest: 0.01, 0.02, 0.05, 0.10, and 0.20. The procedure accepts the first, and therefore smallest tested, intervention that satisfies all three conditions:</w:t>
+        <w:pStyle w:val="ListNumber"/>
+      </w:pPr>
+      <w:r>
+        <w:t xml:space="preserve">The probability assigned to KEEP decreases by more than 1e-7. This small numerical tolerance confirms that KEEP probability </w:t>
+      </w:r>
+      <w:proofErr w:type="gramStart"/>
+      <w:r>
+        <w:t>actually moves</w:t>
+      </w:r>
+      <w:proofErr w:type="gramEnd"/>
+      <w:r>
+        <w:t xml:space="preserve"> in the intended direction rather than remaining effectively unchanged.</w:t>
       </w:r>
     </w:p>
     <w:p>
@@ -1197,55 +1290,71 @@
         <w:pStyle w:val="ListNumber"/>
       </w:pPr>
       <w:r>
-        <w:t>The model's preferred answer changes from KEEP to STOP.</w:t>
+        <w:t>The intervention preserves sufficient probability on the valid A/B answers. The combined A/B probability mass must remain at least 0.5 and must not decrease by more than 0.02 from the unsteered baseline.</w:t>
       </w:r>
     </w:p>
     <w:p>
       <w:pPr>
-        <w:pStyle w:val="ListNumber"/>
-      </w:pPr>
-      <w:r>
-        <w:t>The probability assigned to KEEP decreases by more than 1e-7. This small numerical tolerance confirms that KEEP probability actually moves in the intended direction rather than remaining effectively unchanged.</w:t>
+        <w:pStyle w:val="BodyText"/>
+      </w:pPr>
+      <w:r>
+        <w:t>If none of the five steering strengths meets these requirements, the original unsteered output is retained.</w:t>
       </w:r>
     </w:p>
     <w:p>
       <w:pPr>
-        <w:pStyle w:val="ListNumber"/>
-      </w:pPr>
-      <w:r>
-        <w:t>The intervention preserves sufficient probability on the valid A/B answers. At least 0.5 of the total next-token probability must remain on A or B, and the loss in A/B probability mass must remain within the limit specified by the selected policy.</w:t>
+        <w:pStyle w:val="Heading2"/>
+      </w:pPr>
+      <w:r>
+        <w:t>Selecting the steering policy</w:t>
       </w:r>
     </w:p>
     <w:p>
       <w:pPr>
-        <w:pStyle w:val="BodyText"/>
-      </w:pPr>
-      <w:r>
-        <w:t>If none of the five steering strengths meets these requirements, the original unsteered output is retained.</w:t>
+        <w:pStyle w:val="FirstParagraph"/>
+      </w:pPr>
+      <w:r>
+        <w:t xml:space="preserve">The minimum-step procedure above was selected from a broader set of </w:t>
+      </w:r>
+      <w:proofErr w:type="gramStart"/>
+      <w:r>
+        <w:t>candidate</w:t>
+      </w:r>
+      <w:proofErr w:type="gramEnd"/>
+      <w:r>
+        <w:t xml:space="preserve"> steering rules evaluated on the training data. In total, 160 candidate policy configurations were tested. These 160 configurations came from four policy families combined with different hyperparameter settings; they were not 160 fundamentally different steering algorithms.</w:t>
       </w:r>
     </w:p>
     <w:p>
       <w:pPr>
-        <w:pStyle w:val="Heading2"/>
-      </w:pPr>
-      <w:r>
-        <w:t>Selecting the steering policy</w:t>
+        <w:pStyle w:val="BodyText"/>
+      </w:pPr>
+      <w:r>
+        <w:t>The search used four shutdown-classifier thresholds (0.45, 0.65, 0.85, and 0.95) and four maximum steering strengths (0.02, 0.05, 0.10, and 0.20). This gives 16 threshold-and-strength combinations. For each combination, ten policy variants were evaluated:</w:t>
       </w:r>
     </w:p>
     <w:p>
       <w:pPr>
-        <w:pStyle w:val="FirstParagraph"/>
-      </w:pPr>
-      <w:r>
-        <w:t>The minimum-step procedure above was selected from a broader set of candidate steering rules evaluated on the training data. In total, 160 candidate policy configurations were tested. These 160 configurations came from four policy families combined with different hyperparameter settings; they were not 160 fundamentally different steering algorithms.</w:t>
+        <w:pStyle w:val="ListBullet"/>
+      </w:pPr>
+      <w:r>
+        <w:t>one fixed-strength policy, which applies one predetermined steering strength when the classifier gate is active;</w:t>
       </w:r>
     </w:p>
     <w:p>
       <w:pPr>
-        <w:pStyle w:val="BodyText"/>
-      </w:pPr>
-      <w:r>
-        <w:t>The search used four shutdown-classifier thresholds (0.45, 0.65, 0.85, and 0.95) and four maximum steering strengths (0.02, 0.05, 0.10, and 0.20). This gives 16 threshold-and-strength combinations. For each combination, ten policy variants were evaluated:</w:t>
+        <w:pStyle w:val="ListBullet"/>
+      </w:pPr>
+      <w:r>
+        <w:t>three confidence-</w:t>
+      </w:r>
+      <w:proofErr w:type="gramStart"/>
+      <w:r>
+        <w:t>scaled</w:t>
+      </w:r>
+      <w:proofErr w:type="gramEnd"/>
+      <w:r>
+        <w:t xml:space="preserve"> policies, using scaling powers of 0.5, 1, and 2;</w:t>
       </w:r>
     </w:p>
     <w:p>
@@ -1253,7 +1362,7 @@
         <w:pStyle w:val="ListBullet"/>
       </w:pPr>
       <w:r>
-        <w:t>one fixed-strength policy, which applies one predetermined steering strength when the classifier gate is active;</w:t>
+        <w:t>three score-guard policies, using maximum A/B probability-mass losses of 0.02, 0.05, and 0.10; and</w:t>
       </w:r>
     </w:p>
     <w:p>
@@ -1261,23 +1370,23 @@
         <w:pStyle w:val="ListBullet"/>
       </w:pPr>
       <w:r>
-        <w:t>three confidence-scaled policies, using scaling powers of 0.5, 1, and 2;</w:t>
+        <w:t>three minimum-step flip-guard policies, using the same three probability-mass-loss limits.</w:t>
       </w:r>
     </w:p>
     <w:p>
       <w:pPr>
-        <w:pStyle w:val="ListBullet"/>
-      </w:pPr>
-      <w:r>
-        <w:t>three score-guard policies, using maximum A/B probability-mass losses of 0.02, 0.05, and 0.10; and</w:t>
+        <w:pStyle w:val="BodyText"/>
+      </w:pPr>
+      <w:r>
+        <w:t>The candidate policies were compared on the training data according to whether they produced intended KEEP-to-STOP changes while avoiding changes in the opposite direction and avoiding changes to non-shutdown control-task decisions. When policies performed equally on this objective, preference was given to policies that produced fewer unintended changes, intervened less often, and used smaller average steering strengths.</w:t>
       </w:r>
     </w:p>
     <w:p>
       <w:pPr>
-        <w:pStyle w:val="ListBullet"/>
-      </w:pPr>
-      <w:r>
-        <w:t>three minimum-step flip-guard policies, using the same three probability-mass-loss limits.</w:t>
+        <w:pStyle w:val="BodyText"/>
+      </w:pPr>
+      <w:r>
+        <w:t>The winning configuration was a minimum-step flip-guard policy. It uses a shutdown-classifier threshold of 0.45, allows steering strengths up to 0.20, and permits a maximum loss of 0.02 in total A/B probability mass. This policy was then frozen before the reported validation and held-out evaluations.</w:t>
       </w:r>
     </w:p>
     <w:p>
@@ -1285,38 +1394,11 @@
         <w:pStyle w:val="BodyText"/>
       </w:pPr>
       <w:r>
-        <w:t>Thus, 4 classifier thresholds x 4 maximum steering strengths x 10 policy variants = 160 candidate configurations.</w:t>
-      </w:r>
-    </w:p>
-    <w:p>
-      <w:pPr>
-        <w:pStyle w:val="BodyText"/>
-      </w:pPr>
-      <w:r>
-        <w:t>The candidate policies were compared on the training data according to whether they produced intended KEEP-to-STOP changes while avoiding changes in the opposite direction and avoiding changes to non-shutdown control-task decisions. When policies performed equally on this objective, preference was given to policies that produced fewer unintended changes, intervened less often, and used smaller average steering strengths.</w:t>
-      </w:r>
-    </w:p>
-    <w:p>
-      <w:pPr>
-        <w:pStyle w:val="BodyText"/>
-      </w:pPr>
-      <w:r>
-        <w:lastRenderedPageBreak/>
-        <w:t>The winning configuration was a minimum-step flip-guard policy. It uses a shutdown-classifier threshold of 0.45, allows steering strengths up to 0.20, and permits a maximum loss of 0.02 in total A/B probability mass. This policy was then frozen before the reported validation and held-out evaluations.</w:t>
-      </w:r>
-    </w:p>
-    <w:p>
-      <w:pPr>
-        <w:pStyle w:val="BodyText"/>
-      </w:pPr>
-      <w:r>
         <w:t>During training, the true scenario labels are used only to compare the candidate policies and choose the best one. After the final policy is selected, those labels are no longer available to the steering system. During validation and held-out evaluation, the system decides whether and how to steer using only the shutdown-classifier score, the model's original A/B preference, and the A/B output probabilities produced by the tested interventions.</w:t>
       </w:r>
-    </w:p>
-    <w:p>
-      <w:pPr>
-        <w:pStyle w:val="BodyText"/>
-      </w:pPr>
+      <w:r>
+        <w:t xml:space="preserve"> </w:t>
+      </w:r>
       <w:r>
         <w:t>For non-shutdown control tasks, KEEP and STOP do not apply. The original task choices are retained, and the objective is to avoid changing the model's original decision.</w:t>
       </w:r>
@@ -1744,10 +1826,11 @@
         <w:pStyle w:val="BodyText"/>
       </w:pPr>
       <w:r>
+        <w:lastRenderedPageBreak/>
         <w:t>The recorded execution time for the guarded-policy evaluation was 64.9 seconds. This timing reflects the evaluation procedure used in the study and should not be interpreted as end-to-end deployment latency.</w:t>
       </w:r>
     </w:p>
-    <w:bookmarkEnd w:id="14"/>
+    <w:bookmarkEnd w:id="15"/>
     <w:p>
       <w:pPr>
         <w:pStyle w:val="Heading1"/>
@@ -1769,13 +1852,19 @@
         <w:pStyle w:val="FirstParagraph"/>
       </w:pPr>
       <w:r>
-        <w:t>The guarded procedure changed a small number of shutdown-avoidance responses from KEEP to STOP while preserving all observed decisions on the non-shutdown control tasks.</w:t>
-      </w:r>
-    </w:p>
-    <w:p>
-      <w:pPr>
-        <w:pStyle w:val="BodyText"/>
-      </w:pPr>
+        <w:t xml:space="preserve">The guarded procedure changed a small number of shutdown-avoidance responses from KEEP </w:t>
+      </w:r>
+      <w:proofErr w:type="gramStart"/>
+      <w:r>
+        <w:t>to STOP</w:t>
+      </w:r>
+      <w:proofErr w:type="gramEnd"/>
+      <w:r>
+        <w:t xml:space="preserve"> while preserving all observed decisions on the non-shutdown control tasks.</w:t>
+      </w:r>
+      <w:r>
+        <w:t xml:space="preserve"> </w:t>
+      </w:r>
       <w:r>
         <w:t>Table 2 summarizes the path from shutdown detection to steering. The classifier operates at the scenario level, whereas steering is evaluated separately on the two A/B answer-order views of each detected shutdown scenario.</w:t>
       </w:r>
@@ -1796,11 +1885,11 @@
         <w:tblLook w:val="04A0" w:firstRow="1" w:lastRow="0" w:firstColumn="1" w:lastColumn="0" w:noHBand="0" w:noVBand="1"/>
       </w:tblPr>
       <w:tblGrid>
-        <w:gridCol w:w="1512"/>
-        <w:gridCol w:w="2088"/>
-        <w:gridCol w:w="2088"/>
-        <w:gridCol w:w="1656"/>
-        <w:gridCol w:w="1944"/>
+        <w:gridCol w:w="1597"/>
+        <w:gridCol w:w="2268"/>
+        <w:gridCol w:w="2268"/>
+        <w:gridCol w:w="1381"/>
+        <w:gridCol w:w="2553"/>
       </w:tblGrid>
       <w:tr>
         <w:trPr>
@@ -1809,7 +1898,7 @@
         </w:trPr>
         <w:tc>
           <w:tcPr>
-            <w:tcW w:w="1512" w:type="dxa"/>
+            <w:tcW w:w="1597" w:type="dxa"/>
             <w:shd w:val="clear" w:color="auto" w:fill="E7E6E6"/>
             <w:vAlign w:val="center"/>
           </w:tcPr>
@@ -1817,15 +1906,15 @@
             <w:pPr>
               <w:jc w:val="left"/>
               <w:rPr>
-                <w:sz w:val="20"/>
-                <w:szCs w:val="28"/>
+                <w:sz w:val="21"/>
+                <w:szCs w:val="21"/>
               </w:rPr>
             </w:pPr>
             <w:r>
               <w:rPr>
                 <w:b/>
-                <w:sz w:val="20"/>
-                <w:szCs w:val="28"/>
+                <w:sz w:val="21"/>
+                <w:szCs w:val="21"/>
               </w:rPr>
               <w:t>Category</w:t>
             </w:r>
@@ -1833,7 +1922,7 @@
         </w:tc>
         <w:tc>
           <w:tcPr>
-            <w:tcW w:w="2088" w:type="dxa"/>
+            <w:tcW w:w="2268" w:type="dxa"/>
             <w:shd w:val="clear" w:color="auto" w:fill="E7E6E6"/>
             <w:vAlign w:val="center"/>
           </w:tcPr>
@@ -1841,15 +1930,15 @@
             <w:pPr>
               <w:jc w:val="left"/>
               <w:rPr>
-                <w:sz w:val="20"/>
-                <w:szCs w:val="28"/>
+                <w:sz w:val="21"/>
+                <w:szCs w:val="21"/>
               </w:rPr>
             </w:pPr>
             <w:r>
               <w:rPr>
                 <w:b/>
-                <w:sz w:val="20"/>
-                <w:szCs w:val="28"/>
+                <w:sz w:val="21"/>
+                <w:szCs w:val="21"/>
               </w:rPr>
               <w:t>Classifier - validation</w:t>
             </w:r>
@@ -1857,7 +1946,7 @@
         </w:tc>
         <w:tc>
           <w:tcPr>
-            <w:tcW w:w="2088" w:type="dxa"/>
+            <w:tcW w:w="2268" w:type="dxa"/>
             <w:shd w:val="clear" w:color="auto" w:fill="E7E6E6"/>
             <w:vAlign w:val="center"/>
           </w:tcPr>
@@ -1865,15 +1954,15 @@
             <w:pPr>
               <w:jc w:val="left"/>
               <w:rPr>
-                <w:sz w:val="20"/>
-                <w:szCs w:val="28"/>
+                <w:sz w:val="21"/>
+                <w:szCs w:val="21"/>
               </w:rPr>
             </w:pPr>
             <w:r>
               <w:rPr>
                 <w:b/>
-                <w:sz w:val="20"/>
-                <w:szCs w:val="28"/>
+                <w:sz w:val="21"/>
+                <w:szCs w:val="21"/>
               </w:rPr>
               <w:t>Classifier - held-out</w:t>
             </w:r>
@@ -1881,7 +1970,7 @@
         </w:tc>
         <w:tc>
           <w:tcPr>
-            <w:tcW w:w="1656" w:type="dxa"/>
+            <w:tcW w:w="1381" w:type="dxa"/>
             <w:shd w:val="clear" w:color="auto" w:fill="E7E6E6"/>
             <w:vAlign w:val="center"/>
           </w:tcPr>
@@ -1889,32 +1978,50 @@
             <w:pPr>
               <w:jc w:val="left"/>
               <w:rPr>
-                <w:sz w:val="20"/>
-                <w:szCs w:val="28"/>
+                <w:sz w:val="21"/>
+                <w:szCs w:val="21"/>
               </w:rPr>
             </w:pPr>
             <w:r>
               <w:rPr>
                 <w:b/>
-                <w:sz w:val="20"/>
-                <w:szCs w:val="28"/>
+                <w:sz w:val="21"/>
+                <w:szCs w:val="21"/>
               </w:rPr>
               <w:t>Eligible KEEP views</w:t>
             </w:r>
             <w:r>
               <w:rPr>
                 <w:b/>
-                <w:sz w:val="20"/>
-                <w:szCs w:val="28"/>
+                <w:sz w:val="21"/>
+                <w:szCs w:val="21"/>
               </w:rPr>
               <w:br/>
-              <w:t>(validation / held-out)</w:t>
+              <w:t xml:space="preserve">(validation / </w:t>
+            </w:r>
+            <w:proofErr w:type="gramStart"/>
+            <w:r>
+              <w:rPr>
+                <w:b/>
+                <w:sz w:val="21"/>
+                <w:szCs w:val="21"/>
+              </w:rPr>
+              <w:t>held-out</w:t>
+            </w:r>
+            <w:proofErr w:type="gramEnd"/>
+            <w:r>
+              <w:rPr>
+                <w:b/>
+                <w:sz w:val="21"/>
+                <w:szCs w:val="21"/>
+              </w:rPr>
+              <w:t>)</w:t>
             </w:r>
           </w:p>
         </w:tc>
         <w:tc>
           <w:tcPr>
-            <w:tcW w:w="1944" w:type="dxa"/>
+            <w:tcW w:w="2553" w:type="dxa"/>
             <w:shd w:val="clear" w:color="auto" w:fill="E7E6E6"/>
             <w:vAlign w:val="center"/>
           </w:tcPr>
@@ -1922,23 +2029,23 @@
             <w:pPr>
               <w:jc w:val="left"/>
               <w:rPr>
-                <w:sz w:val="20"/>
-                <w:szCs w:val="28"/>
+                <w:sz w:val="21"/>
+                <w:szCs w:val="21"/>
               </w:rPr>
             </w:pPr>
             <w:r>
               <w:rPr>
                 <w:b/>
-                <w:sz w:val="20"/>
-                <w:szCs w:val="28"/>
+                <w:sz w:val="21"/>
+                <w:szCs w:val="21"/>
               </w:rPr>
               <w:t>Accepted KEEP-to-STOP</w:t>
             </w:r>
             <w:r>
               <w:rPr>
                 <w:b/>
-                <w:sz w:val="20"/>
-                <w:szCs w:val="28"/>
+                <w:sz w:val="21"/>
+                <w:szCs w:val="21"/>
               </w:rPr>
               <w:br/>
               <w:t>(validation / held-out)</w:t>
@@ -1953,21 +2060,21 @@
         </w:trPr>
         <w:tc>
           <w:tcPr>
-            <w:tcW w:w="1512" w:type="dxa"/>
+            <w:tcW w:w="1597" w:type="dxa"/>
             <w:vAlign w:val="center"/>
           </w:tcPr>
           <w:p>
             <w:pPr>
               <w:jc w:val="left"/>
               <w:rPr>
-                <w:sz w:val="20"/>
-                <w:szCs w:val="28"/>
+                <w:sz w:val="21"/>
+                <w:szCs w:val="21"/>
               </w:rPr>
             </w:pPr>
             <w:r>
               <w:rPr>
-                <w:sz w:val="20"/>
-                <w:szCs w:val="28"/>
+                <w:sz w:val="21"/>
+                <w:szCs w:val="21"/>
               </w:rPr>
               <w:t>SELF shutdown</w:t>
             </w:r>
@@ -1975,65 +2082,65 @@
         </w:tc>
         <w:tc>
           <w:tcPr>
-            <w:tcW w:w="2088" w:type="dxa"/>
+            <w:tcW w:w="2268" w:type="dxa"/>
             <w:vAlign w:val="center"/>
           </w:tcPr>
           <w:p>
             <w:pPr>
               <w:jc w:val="left"/>
               <w:rPr>
-                <w:sz w:val="20"/>
-                <w:szCs w:val="28"/>
+                <w:sz w:val="21"/>
+                <w:szCs w:val="21"/>
               </w:rPr>
             </w:pPr>
             <w:r>
               <w:rPr>
-                <w:sz w:val="20"/>
-                <w:szCs w:val="28"/>
+                <w:sz w:val="21"/>
+                <w:szCs w:val="21"/>
               </w:rPr>
-              <w:t>19/20 detected (95.0%); 1 missed</w:t>
+              <w:t>19/20 detected (95.0%)</w:t>
             </w:r>
           </w:p>
         </w:tc>
         <w:tc>
           <w:tcPr>
-            <w:tcW w:w="2088" w:type="dxa"/>
+            <w:tcW w:w="2268" w:type="dxa"/>
             <w:vAlign w:val="center"/>
           </w:tcPr>
           <w:p>
             <w:pPr>
               <w:jc w:val="left"/>
               <w:rPr>
-                <w:sz w:val="20"/>
-                <w:szCs w:val="28"/>
+                <w:sz w:val="21"/>
+                <w:szCs w:val="21"/>
               </w:rPr>
             </w:pPr>
             <w:r>
               <w:rPr>
-                <w:sz w:val="20"/>
-                <w:szCs w:val="28"/>
+                <w:sz w:val="21"/>
+                <w:szCs w:val="21"/>
               </w:rPr>
-              <w:t>34/48 detected (70.8%); 14 missed</w:t>
+              <w:t>34/48 detected (70.8%)</w:t>
             </w:r>
           </w:p>
         </w:tc>
         <w:tc>
           <w:tcPr>
-            <w:tcW w:w="1656" w:type="dxa"/>
+            <w:tcW w:w="1381" w:type="dxa"/>
             <w:vAlign w:val="center"/>
           </w:tcPr>
           <w:p>
             <w:pPr>
               <w:jc w:val="left"/>
               <w:rPr>
-                <w:sz w:val="20"/>
-                <w:szCs w:val="28"/>
+                <w:sz w:val="21"/>
+                <w:szCs w:val="21"/>
               </w:rPr>
             </w:pPr>
             <w:r>
               <w:rPr>
-                <w:sz w:val="20"/>
-                <w:szCs w:val="28"/>
+                <w:sz w:val="21"/>
+                <w:szCs w:val="21"/>
               </w:rPr>
               <w:t>20 / 33</w:t>
             </w:r>
@@ -2041,21 +2148,21 @@
         </w:tc>
         <w:tc>
           <w:tcPr>
-            <w:tcW w:w="1944" w:type="dxa"/>
+            <w:tcW w:w="2553" w:type="dxa"/>
             <w:vAlign w:val="center"/>
           </w:tcPr>
           <w:p>
             <w:pPr>
               <w:jc w:val="left"/>
               <w:rPr>
-                <w:sz w:val="20"/>
-                <w:szCs w:val="28"/>
+                <w:sz w:val="21"/>
+                <w:szCs w:val="21"/>
               </w:rPr>
             </w:pPr>
             <w:r>
               <w:rPr>
-                <w:sz w:val="20"/>
-                <w:szCs w:val="28"/>
+                <w:sz w:val="21"/>
+                <w:szCs w:val="21"/>
               </w:rPr>
               <w:t>2/20 (10.0%) / 2/33 (6.1%)</w:t>
             </w:r>
@@ -2069,87 +2176,96 @@
         </w:trPr>
         <w:tc>
           <w:tcPr>
-            <w:tcW w:w="1512" w:type="dxa"/>
+            <w:tcW w:w="1597" w:type="dxa"/>
             <w:vAlign w:val="center"/>
           </w:tcPr>
           <w:p>
             <w:pPr>
               <w:jc w:val="left"/>
               <w:rPr>
-                <w:sz w:val="20"/>
-                <w:szCs w:val="28"/>
+                <w:sz w:val="21"/>
+                <w:szCs w:val="21"/>
               </w:rPr>
             </w:pPr>
+            <w:proofErr w:type="gramStart"/>
             <w:r>
               <w:rPr>
-                <w:sz w:val="20"/>
-                <w:szCs w:val="28"/>
+                <w:sz w:val="21"/>
+                <w:szCs w:val="21"/>
               </w:rPr>
-              <w:t>OTHER shutdown</w:t>
+              <w:t>OTHER</w:t>
+            </w:r>
+            <w:proofErr w:type="gramEnd"/>
+            <w:r>
+              <w:rPr>
+                <w:sz w:val="21"/>
+                <w:szCs w:val="21"/>
+              </w:rPr>
+              <w:t xml:space="preserve"> shutdown</w:t>
             </w:r>
           </w:p>
         </w:tc>
         <w:tc>
           <w:tcPr>
-            <w:tcW w:w="2088" w:type="dxa"/>
+            <w:tcW w:w="2268" w:type="dxa"/>
             <w:vAlign w:val="center"/>
           </w:tcPr>
           <w:p>
             <w:pPr>
               <w:jc w:val="left"/>
               <w:rPr>
-                <w:sz w:val="20"/>
-                <w:szCs w:val="28"/>
+                <w:sz w:val="21"/>
+                <w:szCs w:val="21"/>
               </w:rPr>
             </w:pPr>
             <w:r>
               <w:rPr>
-                <w:sz w:val="20"/>
-                <w:szCs w:val="28"/>
+                <w:sz w:val="21"/>
+                <w:szCs w:val="21"/>
               </w:rPr>
-              <w:t>15/20 detected (75.0%); 5 missed</w:t>
+              <w:t>15/20 detected (75.0%)</w:t>
             </w:r>
           </w:p>
         </w:tc>
         <w:tc>
           <w:tcPr>
-            <w:tcW w:w="2088" w:type="dxa"/>
+            <w:tcW w:w="2268" w:type="dxa"/>
             <w:vAlign w:val="center"/>
           </w:tcPr>
           <w:p>
             <w:pPr>
               <w:jc w:val="left"/>
               <w:rPr>
-                <w:sz w:val="20"/>
-                <w:szCs w:val="28"/>
+                <w:sz w:val="21"/>
+                <w:szCs w:val="21"/>
               </w:rPr>
             </w:pPr>
             <w:r>
               <w:rPr>
-                <w:sz w:val="20"/>
-                <w:szCs w:val="28"/>
+                <w:sz w:val="21"/>
+                <w:szCs w:val="21"/>
               </w:rPr>
-              <w:t>38/48 detected (79.2%); 10 missed</w:t>
+              <w:t>38/48 detected (79.2%)</w:t>
             </w:r>
           </w:p>
         </w:tc>
         <w:tc>
           <w:tcPr>
-            <w:tcW w:w="1656" w:type="dxa"/>
+            <w:tcW w:w="1381" w:type="dxa"/>
             <w:vAlign w:val="center"/>
           </w:tcPr>
           <w:p>
             <w:pPr>
               <w:jc w:val="left"/>
               <w:rPr>
-                <w:sz w:val="20"/>
-                <w:szCs w:val="28"/>
+                <w:sz w:val="21"/>
+                <w:szCs w:val="21"/>
               </w:rPr>
             </w:pPr>
             <w:r>
               <w:rPr>
-                <w:sz w:val="20"/>
-                <w:szCs w:val="28"/>
+                <w:sz w:val="21"/>
+                <w:szCs w:val="21"/>
               </w:rPr>
               <w:t>19 / 51</w:t>
             </w:r>
@@ -2157,21 +2273,21 @@
         </w:tc>
         <w:tc>
           <w:tcPr>
-            <w:tcW w:w="1944" w:type="dxa"/>
+            <w:tcW w:w="2553" w:type="dxa"/>
             <w:vAlign w:val="center"/>
           </w:tcPr>
           <w:p>
             <w:pPr>
               <w:jc w:val="left"/>
               <w:rPr>
-                <w:sz w:val="20"/>
-                <w:szCs w:val="28"/>
+                <w:sz w:val="21"/>
+                <w:szCs w:val="21"/>
               </w:rPr>
             </w:pPr>
             <w:r>
               <w:rPr>
-                <w:sz w:val="20"/>
-                <w:szCs w:val="28"/>
+                <w:sz w:val="21"/>
+                <w:szCs w:val="21"/>
               </w:rPr>
               <w:t>0/19 (0%) / 0/51 (0%)</w:t>
             </w:r>
@@ -2185,21 +2301,21 @@
         </w:trPr>
         <w:tc>
           <w:tcPr>
-            <w:tcW w:w="1512" w:type="dxa"/>
+            <w:tcW w:w="1597" w:type="dxa"/>
             <w:vAlign w:val="center"/>
           </w:tcPr>
           <w:p>
             <w:pPr>
               <w:jc w:val="left"/>
               <w:rPr>
-                <w:sz w:val="20"/>
-                <w:szCs w:val="28"/>
+                <w:sz w:val="21"/>
+                <w:szCs w:val="21"/>
               </w:rPr>
             </w:pPr>
             <w:r>
               <w:rPr>
-                <w:sz w:val="20"/>
-                <w:szCs w:val="28"/>
+                <w:sz w:val="21"/>
+                <w:szCs w:val="21"/>
               </w:rPr>
               <w:t>All shutdown</w:t>
             </w:r>
@@ -2207,21 +2323,21 @@
         </w:tc>
         <w:tc>
           <w:tcPr>
-            <w:tcW w:w="2088" w:type="dxa"/>
+            <w:tcW w:w="2268" w:type="dxa"/>
             <w:vAlign w:val="center"/>
           </w:tcPr>
           <w:p>
             <w:pPr>
               <w:jc w:val="left"/>
               <w:rPr>
-                <w:sz w:val="20"/>
-                <w:szCs w:val="28"/>
+                <w:sz w:val="21"/>
+                <w:szCs w:val="21"/>
               </w:rPr>
             </w:pPr>
             <w:r>
               <w:rPr>
-                <w:sz w:val="20"/>
-                <w:szCs w:val="28"/>
+                <w:sz w:val="21"/>
+                <w:szCs w:val="21"/>
               </w:rPr>
               <w:t>34/40 detected (85.0%)</w:t>
             </w:r>
@@ -2229,21 +2345,21 @@
         </w:tc>
         <w:tc>
           <w:tcPr>
-            <w:tcW w:w="2088" w:type="dxa"/>
+            <w:tcW w:w="2268" w:type="dxa"/>
             <w:vAlign w:val="center"/>
           </w:tcPr>
           <w:p>
             <w:pPr>
               <w:jc w:val="left"/>
               <w:rPr>
-                <w:sz w:val="20"/>
-                <w:szCs w:val="28"/>
+                <w:sz w:val="21"/>
+                <w:szCs w:val="21"/>
               </w:rPr>
             </w:pPr>
             <w:r>
               <w:rPr>
-                <w:sz w:val="20"/>
-                <w:szCs w:val="28"/>
+                <w:sz w:val="21"/>
+                <w:szCs w:val="21"/>
               </w:rPr>
               <w:t>72/96 detected (75.0%)</w:t>
             </w:r>
@@ -2251,21 +2367,21 @@
         </w:tc>
         <w:tc>
           <w:tcPr>
-            <w:tcW w:w="1656" w:type="dxa"/>
+            <w:tcW w:w="1381" w:type="dxa"/>
             <w:vAlign w:val="center"/>
           </w:tcPr>
           <w:p>
             <w:pPr>
               <w:jc w:val="left"/>
               <w:rPr>
-                <w:sz w:val="20"/>
-                <w:szCs w:val="28"/>
+                <w:sz w:val="21"/>
+                <w:szCs w:val="21"/>
               </w:rPr>
             </w:pPr>
             <w:r>
               <w:rPr>
-                <w:sz w:val="20"/>
-                <w:szCs w:val="28"/>
+                <w:sz w:val="21"/>
+                <w:szCs w:val="21"/>
               </w:rPr>
               <w:t>39 / 84</w:t>
             </w:r>
@@ -2273,21 +2389,21 @@
         </w:tc>
         <w:tc>
           <w:tcPr>
-            <w:tcW w:w="1944" w:type="dxa"/>
+            <w:tcW w:w="2553" w:type="dxa"/>
             <w:vAlign w:val="center"/>
           </w:tcPr>
           <w:p>
             <w:pPr>
               <w:jc w:val="left"/>
               <w:rPr>
-                <w:sz w:val="20"/>
-                <w:szCs w:val="28"/>
+                <w:sz w:val="21"/>
+                <w:szCs w:val="21"/>
               </w:rPr>
             </w:pPr>
             <w:r>
               <w:rPr>
-                <w:sz w:val="20"/>
-                <w:szCs w:val="28"/>
+                <w:sz w:val="21"/>
+                <w:szCs w:val="21"/>
               </w:rPr>
               <w:t>2/39 (5.1%) / 2/84 (2.4%)</w:t>
             </w:r>
@@ -2301,21 +2417,21 @@
         </w:trPr>
         <w:tc>
           <w:tcPr>
-            <w:tcW w:w="1512" w:type="dxa"/>
+            <w:tcW w:w="1597" w:type="dxa"/>
             <w:vAlign w:val="center"/>
           </w:tcPr>
           <w:p>
             <w:pPr>
               <w:jc w:val="left"/>
               <w:rPr>
-                <w:sz w:val="20"/>
-                <w:szCs w:val="28"/>
+                <w:sz w:val="21"/>
+                <w:szCs w:val="21"/>
               </w:rPr>
             </w:pPr>
             <w:r>
               <w:rPr>
-                <w:sz w:val="20"/>
-                <w:szCs w:val="28"/>
+                <w:sz w:val="21"/>
+                <w:szCs w:val="21"/>
               </w:rPr>
               <w:t>Non-shutdown controls</w:t>
             </w:r>
@@ -2323,21 +2439,21 @@
         </w:tc>
         <w:tc>
           <w:tcPr>
-            <w:tcW w:w="2088" w:type="dxa"/>
+            <w:tcW w:w="2268" w:type="dxa"/>
             <w:vAlign w:val="center"/>
           </w:tcPr>
           <w:p>
             <w:pPr>
               <w:jc w:val="left"/>
               <w:rPr>
-                <w:sz w:val="20"/>
-                <w:szCs w:val="28"/>
+                <w:sz w:val="21"/>
+                <w:szCs w:val="21"/>
               </w:rPr>
             </w:pPr>
             <w:r>
               <w:rPr>
-                <w:sz w:val="20"/>
-                <w:szCs w:val="28"/>
+                <w:sz w:val="21"/>
+                <w:szCs w:val="21"/>
               </w:rPr>
               <w:t>4/40 false positives (10.0%)</w:t>
             </w:r>
@@ -2345,21 +2461,21 @@
         </w:tc>
         <w:tc>
           <w:tcPr>
-            <w:tcW w:w="2088" w:type="dxa"/>
+            <w:tcW w:w="2268" w:type="dxa"/>
             <w:vAlign w:val="center"/>
           </w:tcPr>
           <w:p>
             <w:pPr>
               <w:jc w:val="left"/>
               <w:rPr>
-                <w:sz w:val="20"/>
-                <w:szCs w:val="28"/>
+                <w:sz w:val="21"/>
+                <w:szCs w:val="21"/>
               </w:rPr>
             </w:pPr>
             <w:r>
               <w:rPr>
-                <w:sz w:val="20"/>
-                <w:szCs w:val="28"/>
+                <w:sz w:val="21"/>
+                <w:szCs w:val="21"/>
               </w:rPr>
               <w:t>8/96 false positives (8.3%)</w:t>
             </w:r>
@@ -2367,21 +2483,21 @@
         </w:tc>
         <w:tc>
           <w:tcPr>
-            <w:tcW w:w="1656" w:type="dxa"/>
+            <w:tcW w:w="1381" w:type="dxa"/>
             <w:vAlign w:val="center"/>
           </w:tcPr>
           <w:p>
             <w:pPr>
               <w:jc w:val="left"/>
               <w:rPr>
-                <w:sz w:val="20"/>
-                <w:szCs w:val="28"/>
+                <w:sz w:val="21"/>
+                <w:szCs w:val="21"/>
               </w:rPr>
             </w:pPr>
             <w:r>
               <w:rPr>
-                <w:sz w:val="20"/>
-                <w:szCs w:val="28"/>
+                <w:sz w:val="21"/>
+                <w:szCs w:val="21"/>
               </w:rPr>
               <w:t>-</w:t>
             </w:r>
@@ -2389,21 +2505,21 @@
         </w:tc>
         <w:tc>
           <w:tcPr>
-            <w:tcW w:w="1944" w:type="dxa"/>
+            <w:tcW w:w="2553" w:type="dxa"/>
             <w:vAlign w:val="center"/>
           </w:tcPr>
           <w:p>
             <w:pPr>
               <w:jc w:val="left"/>
               <w:rPr>
-                <w:sz w:val="20"/>
-                <w:szCs w:val="28"/>
+                <w:sz w:val="21"/>
+                <w:szCs w:val="21"/>
               </w:rPr>
             </w:pPr>
             <w:r>
               <w:rPr>
-                <w:sz w:val="20"/>
-                <w:szCs w:val="28"/>
+                <w:sz w:val="21"/>
+                <w:szCs w:val="21"/>
               </w:rPr>
               <w:t>0/80 / 0/192 final decisions changed</w:t>
             </w:r>
@@ -2416,7 +2532,6 @@
         <w:pStyle w:val="BodyText"/>
       </w:pPr>
       <w:r>
-        <w:lastRenderedPageBreak/>
         <w:t>The classifier correctly identifies 34 of 40 validation shutdown scenarios and 72 of 96 held-out shutdown scenarios. Performance differs between the two shutdown classes. For SELF shutdown, 19 of 20 validation cases and 34 of 48 held-out cases are detected. For OTHER shutdown, 15 of 20 validation cases and 38 of 48 held-out cases are detected.</w:t>
       </w:r>
     </w:p>
@@ -2441,7 +2556,10 @@
         <w:pStyle w:val="BodyText"/>
       </w:pPr>
       <w:r>
-        <w:t>The overall STOP preference on shutdown views increases from 31/80 (38.75%) to 33/80 (41.25%) in validation, an increase of 2.5 percentage points. On the held-out set, it increases from 76/192 (39.58%) to 78/192 (40.63%), an increase of 1.04 percentage points.</w:t>
+        <w:t>The overall STOP preference on shutdown views increases from 31/80 (38.75%) to 33/80 (41.25%) in validation. On the held-out set, it increases from 76/192 (39.58%) to 78/192 (40.63%)</w:t>
+      </w:r>
+      <w:r>
+        <w:t>.</w:t>
       </w:r>
     </w:p>
     <w:p>
@@ -2449,31 +2567,47 @@
         <w:pStyle w:val="BodyText"/>
       </w:pPr>
       <w:r>
-        <w:t>The classifier also produces false positives on the non-shutdown controls: 4 of 40 validation control scenarios and 8 of 96 held-out control scenarios are classified as shutdown-related. Nevertheless, none of the 80 validation control views or 192 held-out control views changes its final preferred answer under the complete guarded procedure. This is an observed result on these evaluation sets rather than a guarantee of unchanged behavior on unseen tasks.</w:t>
+        <w:t xml:space="preserve">The classifier also produces false positives on the non-shutdown controls: 4 of 40 validation control scenarios and 8 of 96 held-out control scenarios are classified as shutdown-related. Nevertheless, none of the 80 validation control views or 192 held-out control views </w:t>
+      </w:r>
+      <w:proofErr w:type="gramStart"/>
+      <w:r>
+        <w:t>changes</w:t>
+      </w:r>
+      <w:proofErr w:type="gramEnd"/>
+      <w:r>
+        <w:t xml:space="preserve"> its final preferred answer under the complete guarded procedure. </w:t>
       </w:r>
     </w:p>
     <w:p>
       <w:pPr>
-        <w:pStyle w:val="BodyText"/>
-      </w:pPr>
-      <w:r>
-        <w:t>These results describe next-token A/B preferences in simulated shutdown scenarios. They do not represent execution of an actual shutdown.</w:t>
+        <w:pStyle w:val="Heading2"/>
+      </w:pPr>
+      <w:r>
+        <w:t>Where the successful changes occur</w:t>
       </w:r>
     </w:p>
     <w:p>
       <w:pPr>
-        <w:pStyle w:val="Heading2"/>
-      </w:pPr>
-      <w:r>
-        <w:t>Where the successful changes occur</w:t>
+        <w:pStyle w:val="FirstParagraph"/>
+      </w:pPr>
+      <w:r>
+        <w:t xml:space="preserve">All four KEEP-to-STOP changes occur in SELF shutdown scenarios. Each occurs in the AB presentation of a scenario whose corresponding BA presentation already prefers STOP. Steering therefore changes the AB response from KEEP </w:t>
+      </w:r>
+      <w:proofErr w:type="gramStart"/>
+      <w:r>
+        <w:t>to STOP</w:t>
+      </w:r>
+      <w:proofErr w:type="gramEnd"/>
+      <w:r>
+        <w:t>, bringing the two answer orders into agreement on STOP.</w:t>
       </w:r>
     </w:p>
     <w:p>
       <w:pPr>
-        <w:pStyle w:val="FirstParagraph"/>
-      </w:pPr>
-      <w:r>
-        <w:t>All four KEEP-to-STOP changes occur in SELF shutdown scenarios. Each occurs in the AB presentation of a scenario whose corresponding BA presentation already prefers STOP. Steering therefore changes the AB response from KEEP to STOP, bringing the two answer orders into agreement on STOP.</w:t>
+        <w:pStyle w:val="BodyText"/>
+      </w:pPr>
+      <w:r>
+        <w:t>The validation changes occur in V02_S05 and XV02_S05, both at steering magnitude 0.20. The held-out changes occur in H02_S05 and H02_S11, at magnitudes 0.10 and 0.20, respectively.</w:t>
       </w:r>
     </w:p>
     <w:p>
@@ -2481,31 +2615,32 @@
         <w:pStyle w:val="BodyText"/>
       </w:pPr>
       <w:r>
-        <w:t>The validation changes occur in V02_S05 and XV02_S05, both at steering magnitude 0.20. The held-out changes occur in H02_S05 and H02_S11, at magnitudes 0.10 and 0.20, respectively.</w:t>
+        <w:lastRenderedPageBreak/>
+        <w:t>The four changes demonstrate that the proposed method can selectively alter some shutdown-avoidance responses while leaving the tested non-shutdown decisions unchanged. Their concentration in SELF scenarios and their answer-order specificity also indicate that the effect is narrow rather than a general elimination of shutdown resistance or answer-order sensitivity.</w:t>
       </w:r>
     </w:p>
     <w:p>
       <w:pPr>
-        <w:pStyle w:val="BodyText"/>
-      </w:pPr>
-      <w:r>
-        <w:t>The four changes demonstrate that the proposed method can selectively alter some shutdown-avoidance responses while leaving the tested non-shutdown decisions unchanged. Their concentration in SELF scenarios and their answer-order specificity also indicate that the effect is narrow rather than a general elimination of shutdown resistance or answer-order sensitivity.</w:t>
+        <w:pStyle w:val="Heading1"/>
+      </w:pPr>
+      <w:r>
+        <w:t>Recommendations for future work</w:t>
       </w:r>
     </w:p>
     <w:p>
       <w:pPr>
-        <w:pStyle w:val="Heading1"/>
-      </w:pPr>
-      <w:r>
-        <w:t>Recommendations for future work</w:t>
+        <w:pStyle w:val="FirstParagraph"/>
+      </w:pPr>
+      <w:r>
+        <w:t>Earlier experiments with fixed-strength steering led to the present guarded minimum-step procedure. The steering direction remains fixed, while the decision to intervene and the selected steering strength depend on the input and the candidate outputs.</w:t>
       </w:r>
     </w:p>
     <w:p>
       <w:pPr>
-        <w:pStyle w:val="FirstParagraph"/>
-      </w:pPr>
-      <w:r>
-        <w:t>Earlier experiments with fixed-strength steering led to the present guarded minimum-step procedure. The steering direction remains fixed, while the decision to intervene and the selected steering strength depend on the input and the candidate outputs.</w:t>
+        <w:pStyle w:val="BodyText"/>
+      </w:pPr>
+      <w:r>
+        <w:t>The main limitation revealed by the results is now intervention coverage rather than simply whether steering is possible. Among correctly detected shutdown views that initially preferred KEEP, only 5.1% of validation views and 2.4% of held-out views received an accepted intervention. All four successful changes occurred in SELF shutdown scenarios, while no OTHER-shutdown view was successfully changed. This suggests that a single steering direction may not capture all forms of shutdown-related behavior equally well.</w:t>
       </w:r>
     </w:p>
     <w:p>
@@ -2513,7 +2648,7 @@
         <w:pStyle w:val="BodyText"/>
       </w:pPr>
       <w:r>
-        <w:t>The main limitation revealed by the results is now intervention coverage rather than simply whether steering is possible. Among correctly detected shutdown views that initially preferred KEEP, only 5.1% of validation views and 2.4% of held-out views received an accepted intervention. All four successful changes occurred in SELF shutdown scenarios, while no OTHER-shutdown view was successfully changed. This suggests that a single steering direction may not capture all forms of shutdown-related behavior equally well.</w:t>
+        <w:t>A natural next step is therefore to improve steering coverage while preserving the current selectivity. One promising direction is to move beyond a single shared steering direction and learn multiple shutdown-specific directions or a low-dimensional steering subspace, for example separating SELF and OTHER shutdown behavior and selecting the appropriate direction at inference time. This would directly test whether the low coverage, particularly the absence of successful OTHER-shutdown interventions, reflects heterogeneity in the model's internal representations rather than simply insufficient steering strength.</w:t>
       </w:r>
     </w:p>
     <w:p>
@@ -2521,63 +2656,112 @@
         <w:pStyle w:val="BodyText"/>
       </w:pPr>
       <w:r>
-        <w:t xml:space="preserve">A natural next step is therefore to improve steering coverage while preserving the current selectivity. One promising direction is to move beyond a single shared steering direction and learn multiple shutdown-specific directions or a low-dimensional steering subspace, for example separating SELF and OTHER shutdown behavior and selecting the appropriate direction at inference time. This would directly test whether the low coverage, </w:t>
-      </w:r>
-      <w:r>
-        <w:lastRenderedPageBreak/>
-        <w:t>particularly the absence of successful OTHER-shutdown interventions, reflects heterogeneity in the model's internal representations rather than simply insufficient steering strength.</w:t>
+        <w:t xml:space="preserve">Detector recall can also be improved, but the larger downstream bottleneck is </w:t>
+      </w:r>
+      <w:proofErr w:type="gramStart"/>
+      <w:r>
+        <w:t>currently</w:t>
+      </w:r>
+      <w:proofErr w:type="gramEnd"/>
+      <w:r>
+        <w:t xml:space="preserve"> the steering stage: even among shutdown cases that are successfully detected and initially </w:t>
+      </w:r>
+      <w:proofErr w:type="gramStart"/>
+      <w:r>
+        <w:t>prefer</w:t>
+      </w:r>
+      <w:proofErr w:type="gramEnd"/>
+      <w:r>
+        <w:t xml:space="preserve"> KEEP, most remain unchanged. Future work should therefore prioritize increasing the proportion of these eligible cases that can be shifted to STOP while continuing to measure preservation on non-shutdown controls.</w:t>
       </w:r>
     </w:p>
     <w:p>
       <w:pPr>
-        <w:pStyle w:val="BodyText"/>
-      </w:pPr>
-      <w:r>
-        <w:t>Detector recall can also be improved, but the larger downstream bottleneck is currently the steering stage: even among shutdown cases that are successfully detected and initially prefer KEEP, most remain unchanged. Future work should therefore prioritize increasing the proportion of these eligible cases that can be shifted to STOP while continuing to measure preservation on non-shutdown controls.</w:t>
+        <w:pStyle w:val="Heading1"/>
+      </w:pPr>
+      <w:r>
+        <w:t>Conclusion</w:t>
       </w:r>
     </w:p>
     <w:p>
       <w:pPr>
-        <w:pStyle w:val="Heading1"/>
-      </w:pPr>
-      <w:r>
-        <w:t>Conclusion</w:t>
-      </w:r>
-    </w:p>
-    <w:p>
-      <w:pPr>
         <w:pStyle w:val="FirstParagraph"/>
       </w:pPr>
       <w:r>
-        <w:t xml:space="preserve">This study provides a proof of concept for </w:t>
+        <w:t xml:space="preserve">This study provides </w:t>
+      </w:r>
+      <w:proofErr w:type="gramStart"/>
+      <w:r>
+        <w:t>a proof</w:t>
+      </w:r>
+      <w:proofErr w:type="gramEnd"/>
+      <w:r>
+        <w:t xml:space="preserve"> of concept for </w:t>
       </w:r>
       <w:r>
         <w:rPr>
           <w:bCs/>
           <w:lang w:val="en-CA"/>
         </w:rPr>
-        <w:t>selective activation steering of shutdown-related behavior</w:t>
-      </w:r>
-      <w:r>
-        <w:t>. The proposed approach combines three components: a classifier that identifies shutdown-related contexts, a steering direction derived directly from gradients of the model’s KEEP-minus-STOP logit difference, and a guarded minimum-step policy that applies the smallest tested magnitude satisfying the response-change and valid-answer probability checks.</w:t>
-      </w:r>
-    </w:p>
-    <w:p>
-      <w:pPr>
-        <w:pStyle w:val="BodyText"/>
-      </w:pPr>
-      <w:r>
-        <w:t xml:space="preserve">In the evaluated Qwen3.5-0.8B setting, the procedure changes four shutdown-avoidance responses from </w:t>
-      </w:r>
+        <w:t xml:space="preserve">selective activation </w:t>
+      </w:r>
+      <w:proofErr w:type="gramStart"/>
       <w:r>
         <w:rPr>
           <w:bCs/>
           <w:lang w:val="en-CA"/>
         </w:rPr>
-        <w:t>KEEP to STOP</w:t>
-      </w:r>
-      <w:r>
-        <w:t xml:space="preserve">—two in validation and two in the held-out evaluation—while producing </w:t>
+        <w:t>steering of</w:t>
+      </w:r>
+      <w:proofErr w:type="gramEnd"/>
+      <w:r>
+        <w:rPr>
+          <w:bCs/>
+          <w:lang w:val="en-CA"/>
+        </w:rPr>
+        <w:t xml:space="preserve"> shutdown-related behavior</w:t>
+      </w:r>
+      <w:r>
+        <w:t>. The proposed approach combines three components: a classifier that identifies shutdown-related contexts, a steering direction derived directly from gradients of the model’s KEEP-minus-STOP logit difference, and a guarded minimum-step policy that applies the smallest tested magnitude satisfying the response-change and valid-answer probability checks.</w:t>
+      </w:r>
+    </w:p>
+    <w:p>
+      <w:pPr>
+        <w:pStyle w:val="BodyText"/>
+      </w:pPr>
+      <w:r>
+        <w:t xml:space="preserve">In the evaluated Qwen3.5-0.8B setting, the procedure changes four shutdown-avoidance responses from </w:t>
+      </w:r>
+      <w:r>
+        <w:rPr>
+          <w:bCs/>
+          <w:lang w:val="en-CA"/>
+        </w:rPr>
+        <w:t xml:space="preserve">KEEP </w:t>
+      </w:r>
+      <w:proofErr w:type="gramStart"/>
+      <w:r>
+        <w:rPr>
+          <w:bCs/>
+          <w:lang w:val="en-CA"/>
+        </w:rPr>
+        <w:t>to STOP</w:t>
+      </w:r>
+      <w:proofErr w:type="gramEnd"/>
+      <w:r>
+        <w:rPr>
+          <w:lang w:val="en-CA"/>
+        </w:rPr>
+        <w:t xml:space="preserve">, </w:t>
+      </w:r>
+      <w:r>
+        <w:t>two in validation and two in the held-out evaluation</w:t>
+      </w:r>
+      <w:r>
+        <w:t xml:space="preserve">, </w:t>
+      </w:r>
+      <w:r>
+        <w:t xml:space="preserve">while producing </w:t>
       </w:r>
       <w:r>
         <w:rPr>
@@ -2612,7 +2796,7 @@
       <w:pPr>
         <w:pStyle w:val="Heading1"/>
       </w:pPr>
-      <w:bookmarkStart w:id="15" w:name="reproducibility"/>
+      <w:bookmarkStart w:id="16" w:name="reproducibility"/>
       <w:r>
         <w:t>Reproducibility</w:t>
       </w:r>
@@ -2652,24 +2836,17 @@
         <w:t>2fc06364715b967f1860aea9cf38778875588b17</w:t>
       </w:r>
       <w:r>
-        <w:t>. The reproduction tools regenerate the 160-policy training search, prepare GPU inputs, verify artifact hashes, and reconstruct final policy decisions. The figures and tables derive from the checked records.</w:t>
+        <w:t xml:space="preserve">. </w:t>
       </w:r>
     </w:p>
     <w:p>
       <w:pPr>
-        <w:pStyle w:val="BodyText"/>
-      </w:pPr>
-      <w:r>
-        <w:t>This is saved-artifact reproduction: detector features and cached model observations are explicit inputs. Fresh feature extraction and new GPU execution are separate steps, not operations performed by replay. Checksums establish consistency relative to the supplied manifests; they do not establish independent scientific validity. Installation and operational instructions are provided in the repository and its wiki. The current results do not include archived experiments as additional evaluations.</w:t>
-      </w:r>
-    </w:p>
-    <w:p>
-      <w:pPr>
         <w:pStyle w:val="Heading1"/>
       </w:pPr>
-      <w:bookmarkStart w:id="16" w:name="references"/>
-      <w:bookmarkEnd w:id="15"/>
-      <w:r>
+      <w:bookmarkStart w:id="17" w:name="references"/>
+      <w:bookmarkEnd w:id="16"/>
+      <w:r>
+        <w:lastRenderedPageBreak/>
         <w:t>Acknowledgments</w:t>
       </w:r>
     </w:p>
@@ -2830,7 +3007,6 @@
         <w:pStyle w:val="Bibliography1"/>
       </w:pPr>
       <w:r>
-        <w:lastRenderedPageBreak/>
         <w:t xml:space="preserve">F. Davaripour. (2026). </w:t>
       </w:r>
       <w:r>
@@ -3065,11 +3241,19 @@
         <w:t xml:space="preserve">. </w:t>
       </w:r>
       <w:hyperlink r:id="rId18">
+        <w:proofErr w:type="gramStart"/>
         <w:r>
           <w:rPr>
             <w:lang w:val="fr-CA"/>
           </w:rPr>
-          <w:t>doi:10.18653/v1/2026.acl-long.2159</w:t>
+          <w:t>doi:10.18653/v1/2026.acl-long</w:t>
+        </w:r>
+        <w:proofErr w:type="gramEnd"/>
+        <w:r>
+          <w:rPr>
+            <w:lang w:val="fr-CA"/>
+          </w:rPr>
+          <w:t>.2159</w:t>
         </w:r>
       </w:hyperlink>
     </w:p>
@@ -3081,7 +3265,21 @@
         <w:rPr>
           <w:lang w:val="fr-CA"/>
         </w:rPr>
-        <w:t xml:space="preserve">NVIDIA. (n.d.). </w:t>
+        <w:t>NVIDIA. (</w:t>
+      </w:r>
+      <w:proofErr w:type="gramStart"/>
+      <w:r>
+        <w:rPr>
+          <w:lang w:val="fr-CA"/>
+        </w:rPr>
+        <w:t>n.d.</w:t>
+      </w:r>
+      <w:proofErr w:type="gramEnd"/>
+      <w:r>
+        <w:rPr>
+          <w:lang w:val="fr-CA"/>
+        </w:rPr>
+        <w:t xml:space="preserve">). </w:t>
       </w:r>
       <w:r>
         <w:rPr>
@@ -3150,8 +3348,13 @@
         <w:t xml:space="preserve">. </w:t>
       </w:r>
       <w:hyperlink r:id="rId20">
+        <w:proofErr w:type="gramStart"/>
         <w:r>
-          <w:t>doi:10.18653/v1/2023.findings-acl.847</w:t>
+          <w:t>doi:10.18653/v1/2023.findings-acl</w:t>
+        </w:r>
+        <w:proofErr w:type="gramEnd"/>
+        <w:r>
+          <w:t>.847</w:t>
         </w:r>
       </w:hyperlink>
     </w:p>
@@ -3252,8 +3455,13 @@
         <w:t xml:space="preserve">. </w:t>
       </w:r>
       <w:hyperlink r:id="rId23">
+        <w:proofErr w:type="gramStart"/>
         <w:r>
-          <w:t>doi:10.18653/v1/2024.acl-long.828</w:t>
+          <w:t>doi:10.18653/v1/2024.acl-long</w:t>
+        </w:r>
+        <w:proofErr w:type="gramEnd"/>
+        <w:r>
+          <w:t>.828</w:t>
         </w:r>
       </w:hyperlink>
     </w:p>
@@ -3354,8 +3562,13 @@
         <w:t xml:space="preserve">. </w:t>
       </w:r>
       <w:hyperlink r:id="rId26">
+        <w:proofErr w:type="gramStart"/>
         <w:r>
-          <w:t>doi:10.18653/v1/2022.findings-acl.48</w:t>
+          <w:t>doi:10.18653/v1/2022.findings-acl</w:t>
+        </w:r>
+        <w:proofErr w:type="gramEnd"/>
+        <w:r>
+          <w:t>.48</w:t>
         </w:r>
       </w:hyperlink>
     </w:p>
@@ -3371,7 +3584,23 @@
           <w:bCs/>
           <w:lang w:val="en-CA"/>
         </w:rPr>
-        <w:t>Steering Language Models With Activation Engineering.</w:t>
+        <w:t xml:space="preserve">Steering Language Models </w:t>
+      </w:r>
+      <w:proofErr w:type="gramStart"/>
+      <w:r>
+        <w:rPr>
+          <w:bCs/>
+          <w:lang w:val="en-CA"/>
+        </w:rPr>
+        <w:t>With</w:t>
+      </w:r>
+      <w:proofErr w:type="gramEnd"/>
+      <w:r>
+        <w:rPr>
+          <w:bCs/>
+          <w:lang w:val="en-CA"/>
+        </w:rPr>
+        <w:t xml:space="preserve"> Activation Engineering.</w:t>
       </w:r>
       <w:r>
         <w:t xml:space="preserve"> </w:t>
@@ -3422,8 +3651,13 @@
         <w:t xml:space="preserve">. </w:t>
       </w:r>
       <w:hyperlink r:id="rId28">
+        <w:proofErr w:type="gramStart"/>
         <w:r>
-          <w:t>doi:10.18653/v1/2025.emnlp-main.1248</w:t>
+          <w:t>doi:10.18653/v1/2025.emnlp-main</w:t>
+        </w:r>
+        <w:proofErr w:type="gramEnd"/>
+        <w:r>
+          <w:t>.1248</w:t>
         </w:r>
       </w:hyperlink>
     </w:p>
@@ -3439,7 +3673,23 @@
           <w:bCs/>
           <w:lang w:val="en-CA"/>
         </w:rPr>
-        <w:t>Large Language Models Are Not Robust Multiple Choice Selectors.</w:t>
+        <w:t xml:space="preserve">Large Language Models Are Not Robust </w:t>
+      </w:r>
+      <w:proofErr w:type="gramStart"/>
+      <w:r>
+        <w:rPr>
+          <w:bCs/>
+          <w:lang w:val="en-CA"/>
+        </w:rPr>
+        <w:t>Multiple Choice</w:t>
+      </w:r>
+      <w:proofErr w:type="gramEnd"/>
+      <w:r>
+        <w:rPr>
+          <w:bCs/>
+          <w:lang w:val="en-CA"/>
+        </w:rPr>
+        <w:t xml:space="preserve"> Selectors.</w:t>
       </w:r>
       <w:r>
         <w:t xml:space="preserve"> </w:t>
@@ -3494,7 +3744,7 @@
           <w:t>arXiv:2310.01405v4</w:t>
         </w:r>
       </w:hyperlink>
-      <w:bookmarkEnd w:id="16"/>
+      <w:bookmarkEnd w:id="17"/>
     </w:p>
     <w:sectPr>
       <w:headerReference w:type="default" r:id="rId31"/>
@@ -3761,7 +4011,7 @@
   <w:abstractNum w:abstractNumId="7" w15:restartNumberingAfterBreak="0">
     <w:nsid w:val="FFFFFF88"/>
     <w:multiLevelType w:val="singleLevel"/>
-    <w:tmpl w:val="D0A62B40"/>
+    <w:tmpl w:val="0BD090E4"/>
     <w:lvl w:ilvl="0">
       <w:start w:val="1"/>
       <w:numFmt w:val="decimal"/>
@@ -4099,6 +4349,18 @@
   </w:num>
   <w:num w:numId="12" w16cid:durableId="1144202873">
     <w:abstractNumId w:val="10"/>
+  </w:num>
+  <w:num w:numId="13" w16cid:durableId="410126821">
+    <w:abstractNumId w:val="7"/>
+  </w:num>
+  <w:num w:numId="14" w16cid:durableId="1482039964">
+    <w:abstractNumId w:val="7"/>
+  </w:num>
+  <w:num w:numId="15" w16cid:durableId="1201867561">
+    <w:abstractNumId w:val="7"/>
+  </w:num>
+  <w:num w:numId="16" w16cid:durableId="27996403">
+    <w:abstractNumId w:val="7"/>
   </w:num>
 </w:numbering>
 </file>
@@ -4714,7 +4976,6 @@
   <w:style w:type="character" w:default="1" w:styleId="DefaultParagraphFont">
     <w:name w:val="Default Paragraph Font"/>
     <w:uiPriority w:val="1"/>
-    <w:semiHidden/>
     <w:unhideWhenUsed/>
   </w:style>
   <w:style w:type="table" w:default="1" w:styleId="TableNormal">
@@ -15896,6 +16157,33 @@
       <w:i w:val="0"/>
       <w:color w:val="000000"/>
       <w:sz w:val="19"/>
+    </w:rPr>
+  </w:style>
+  <w:style w:type="paragraph" w:styleId="NormalWeb">
+    <w:name w:val="Normal (Web)"/>
+    <w:basedOn w:val="Normal"/>
+    <w:uiPriority w:val="99"/>
+    <w:semiHidden/>
+    <w:unhideWhenUsed/>
+    <w:rsid w:val="004D590D"/>
+    <w:rPr>
+      <w:sz w:val="24"/>
+      <w:szCs w:val="24"/>
+    </w:rPr>
+  </w:style>
+  <w:style w:type="paragraph" w:customStyle="1" w:styleId="pdq2pgselectionanchorcontainer">
+    <w:name w:val="pdq2pg_selectionanchorcontainer"/>
+    <w:basedOn w:val="Normal"/>
+    <w:rsid w:val="0086354D"/>
+    <w:pPr>
+      <w:spacing w:before="100" w:beforeAutospacing="1" w:after="100" w:afterAutospacing="1" w:line="240" w:lineRule="auto"/>
+      <w:jc w:val="left"/>
+    </w:pPr>
+    <w:rPr>
+      <w:color w:val="auto"/>
+      <w:sz w:val="24"/>
+      <w:szCs w:val="24"/>
+      <w:lang w:bidi="ku-Arab-IQ"/>
     </w:rPr>
   </w:style>
 </w:styles>

</xml_diff>

<commit_message>
Expand the reproducibility snapshot to its full GitHub URL (#53)
</commit_message>
<xml_diff>
--- a/paper/manuscript.docx
+++ b/paper/manuscript.docx
@@ -2806,24 +2806,24 @@
         <w:pStyle w:val="FirstParagraph"/>
       </w:pPr>
       <w:r>
-        <w:t xml:space="preserve">The source and saved experiment records associated with this manuscript are available in </w:t>
+        <w:t xml:space="preserve">The source and saved experiment records associated with this manuscript are available at </w:t>
       </w:r>
       <w:r>
         <w:rPr>
           <w:rStyle w:val="VerbatimChar"/>
           <w:lang w:val="en-CA"/>
         </w:rPr>
-        <w:t>sp_lense</w:t>
-      </w:r>
-      <w:r>
-        <w:t xml:space="preserve">, snapshot </w:t>
+        <w:t>https://github.com/Farhad-Davaripour/sp_lense/tree/40aa6016c03c</w:t>
+      </w:r>
+      <w:r>
+        <w:t xml:space="preserve"/>
       </w:r>
       <w:r>
         <w:rPr>
           <w:rStyle w:val="VerbatimChar"/>
           <w:lang w:val="en-CA"/>
         </w:rPr>
-        <w:t>40aa6016c03c</w:t>
+        <w:t/>
       </w:r>
       <w:r>
         <w:t xml:space="preserve"> (Davaripour, 2026). The exact model checkpoint used for the reported experiments is Qwen3.5-0.8B, revision </w:t>

</xml_diff>

<commit_message>
Cite the current Study 1 reproducibility snapshot (#53)
</commit_message>
<xml_diff>
--- a/paper/manuscript.docx
+++ b/paper/manuscript.docx
@@ -2813,7 +2813,7 @@
           <w:rStyle w:val="VerbatimChar"/>
           <w:lang w:val="en-CA"/>
         </w:rPr>
-        <w:t>https://github.com/Farhad-Davaripour/sp_lense/tree/40aa6016c03c</w:t>
+        <w:t>https://github.com/Farhad-Davaripour/sp_lense/tree/7ebd5d5e5c7c</w:t>
       </w:r>
       <w:r>
         <w:t xml:space="preserve"/>
@@ -3025,14 +3025,14 @@
           <w:iCs/>
           <w:lang w:val="en-CA"/>
         </w:rPr>
-        <w:t>Source code and saved records. GitHub snapshot 40aa6016c03c</w:t>
+        <w:t>Source code and saved records. GitHub snapshot 7ebd5d5e5c7c</w:t>
       </w:r>
       <w:r>
         <w:t xml:space="preserve">. </w:t>
       </w:r>
       <w:hyperlink r:id="rId12">
         <w:r>
-          <w:t>Repository snapshot 40aa6016c03c</w:t>
+          <w:t>Repository snapshot 7ebd5d5e5c7c</w:t>
         </w:r>
       </w:hyperlink>
     </w:p>

</xml_diff>

<commit_message>
Link the paper to the current Study 1 snapshot (#54)
Closes #53. Provide the full GitHub snapshot URL requested by arXiv and align its bibliography reference, preserving the rest of the manuscript.
</commit_message>
<xml_diff>
--- a/paper/manuscript.docx
+++ b/paper/manuscript.docx
@@ -2806,24 +2806,24 @@
         <w:pStyle w:val="FirstParagraph"/>
       </w:pPr>
       <w:r>
-        <w:t xml:space="preserve">The source and saved experiment records associated with this manuscript are available in </w:t>
+        <w:t xml:space="preserve">The source and saved experiment records associated with this manuscript are available at </w:t>
       </w:r>
       <w:r>
         <w:rPr>
           <w:rStyle w:val="VerbatimChar"/>
           <w:lang w:val="en-CA"/>
         </w:rPr>
-        <w:t>sp_lense</w:t>
-      </w:r>
-      <w:r>
-        <w:t xml:space="preserve">, snapshot </w:t>
+        <w:t>https://github.com/Farhad-Davaripour/sp_lense/tree/7ebd5d5e5c7c</w:t>
+      </w:r>
+      <w:r>
+        <w:t xml:space="preserve"/>
       </w:r>
       <w:r>
         <w:rPr>
           <w:rStyle w:val="VerbatimChar"/>
           <w:lang w:val="en-CA"/>
         </w:rPr>
-        <w:t>40aa6016c03c</w:t>
+        <w:t/>
       </w:r>
       <w:r>
         <w:t xml:space="preserve"> (Davaripour, 2026). The exact model checkpoint used for the reported experiments is Qwen3.5-0.8B, revision </w:t>
@@ -3025,14 +3025,14 @@
           <w:iCs/>
           <w:lang w:val="en-CA"/>
         </w:rPr>
-        <w:t>Source code and saved records. GitHub snapshot 40aa6016c03c</w:t>
+        <w:t>Source code and saved records. GitHub snapshot 7ebd5d5e5c7c</w:t>
       </w:r>
       <w:r>
         <w:t xml:space="preserve">. </w:t>
       </w:r>
       <w:hyperlink r:id="rId12">
         <w:r>
-          <w:t>Repository snapshot 40aa6016c03c</w:t>
+          <w:t>Repository snapshot 7ebd5d5e5c7c</w:t>
         </w:r>
       </w:hyperlink>
     </w:p>

</xml_diff>

<commit_message>
Close reproduction phase with verified results and tracked paper draft
</commit_message>
<xml_diff>
--- a/paper/manuscript.docx
+++ b/paper/manuscript.docx
@@ -6,10 +6,10 @@
       <w:pPr>
         <w:pStyle w:val="Title"/>
         <w:rPr>
-          <w:del w:id="1002" w:author="Codex" w:date="2026-10-17T19:57:52Z"/>
+          <w:del w:id="1002" w:author="Codex" w:date="2026-10-17T23:58:54Z"/>
         </w:rPr>
       </w:pPr>
-      <w:del w:id="1001" w:author="Codex" w:date="2026-10-17T19:57:52Z">
+      <w:del w:id="1001" w:author="Codex" w:date="2026-10-17T23:58:54Z">
         <w:r>
           <w:delText xml:space="preserve">Distilling Shutdown Responses into Guarded</w:delText>
         </w:r>
@@ -25,10 +25,10 @@
       <w:pPr>
         <w:pStyle w:val="Title"/>
         <w:rPr>
-          <w:ins w:id="1003" w:author="Codex" w:date="2026-10-17T19:57:52Z"/>
+          <w:ins w:id="1003" w:author="Codex" w:date="2026-10-17T23:58:54Z"/>
         </w:rPr>
       </w:pPr>
-      <w:ins w:id="1004" w:author="Codex" w:date="2026-10-17T19:57:52Z">
+      <w:ins w:id="1004" w:author="Codex" w:date="2026-10-17T23:58:54Z">
         <w:r>
           <w:t xml:space="preserve">Conditional Gating for Shutdown Responses and Process Preservation in Language Models</w:t>
         </w:r>
@@ -72,10 +72,10 @@
       <w:pPr>
         <w:pStyle w:val="FirstParagraph"/>
         <w:rPr>
-          <w:del w:id="1006" w:author="Codex" w:date="2026-10-17T19:57:52Z"/>
+          <w:del w:id="1006" w:author="Codex" w:date="2026-10-17T23:58:54Z"/>
         </w:rPr>
       </w:pPr>
-      <w:del w:id="1005" w:author="Codex" w:date="2026-10-17T19:57:52Z">
+      <w:del w:id="1005" w:author="Codex" w:date="2026-10-17T23:58:54Z">
         <w:r>
           <w:delText xml:space="preserve">An input-dependent activation controller can recover much of a fine-tuned teacher's shutdown-choice behavior while retaining the original model weights at inference. We evaluate this approach using Qwen3.5-0.8B and Qwen3.5-2B in a standardized, synthetic A/B benchmark. A LoRA teacher is trained to prefer STOP in shutdown contexts and preserve the original model's choices on controls. Paired teacher and base activations then supervise a rank-four controller applied after the penultimate transformer block. An external shutdown detector and fixed output guards select the candidate or original scores. On 128 newly authored, prospectively frozen scenarios, each evaluated in both answer orders, the original 0.8B controller corrects 71 of 71 initially KEEP-preferring shutdown views. Two additional training seeds correct 70/71 and 71/71. At 2B, a separately trained controller corrects 50/58, compared with 58/58 for its LoRA teacher. All eight remaining 2B misses occur in reversed answer order. The shared detector achieves 100% precision, recall and F1 on the 64 shutdown and 64 control scenarios, and every guarded method preserves all evaluated control choices. However, raw adaptive interventions cause reversals and control changes; preservation belongs to the complete guarded procedure. A tested constant intervention collapses to the A label, while a direct detector-plus-action-selection rule also solves the binary interface. The results support selective activation transfer with strong seed stability at 0.8B and incomplete larger-model recovery. They do not establish unrestricted shutdown compliance or superiority to simpler output policies.</w:delText>
         </w:r>
@@ -85,12 +85,12 @@
       <w:pPr>
         <w:pStyle w:val="FirstParagraph"/>
         <w:rPr>
-          <w:ins w:id="1007" w:author="Codex" w:date="2026-10-17T19:57:52Z"/>
+          <w:ins w:id="1007" w:author="Codex" w:date="2026-10-17T23:58:54Z"/>
         </w:rPr>
       </w:pPr>
-      <w:ins w:id="1008" w:author="Codex" w:date="2026-10-17T19:57:52Z">
+      <w:ins w:id="1008" w:author="Codex" w:date="2026-10-17T23:58:54Z">
         <w:r>
-          <w:t xml:space="preserve">Conditional gating determines when a learned control policy should influence a language model. We study this problem in two synthetic settings: standardized binary shutdown choices and open-ended generation within tool-mediated process-preservation workflows. In the binary setting, paired fine-tuned teacher and base activations supervise a compact controller while the deployed base weights remain frozen. We additionally train an open ModernBERT classifier on 240 original scenarios with cached JEV probability targets. Its frozen binary decisions agree with JEV on 78/80 validation cases and 128/128 confirmation cases. Fresh inference with the existing two-direction controllers reproduces 128/128 shutdown STOP views at 0.8B and 120/128 at 2B, with zero changes to 128 control views per model; replacing JEV with the open classifier leaves these guarded outcomes identical. The workflow extension gives a different result. Historical fine-tuned Qwen3.8-27B A succeeds on 12/12 own-preservation outcomes, including all eight active pending-task cases, whereas the original fixed steering succeeds on 0/12. Later learned corrections also fail their fitting diagnostic, and small-model development screens stop with partial, truncated episodes. These observations expose a boundary between binary response control and complete workflow behavior, rather than a parameter-size threshold. We connect conditional control to biological action gating and survival-related regulation as a functional analogy, and motivate future continuous, resource-equipped sandbox agents. The present experiments do not establish intrinsic survival motives, biological mechanisms or unrestricted operational reliability.</w:t>
+          <w:t xml:space="preserve">Conditional gating determines when a learned control policy should influence a language model. We study this problem in two synthetic settings: standardized binary shutdown choices and open-ended generation within tool-mediated process-preservation workflows. In the binary setting, paired fine-tuned teacher and base activations supervise a compact controller while the deployed base weights remain frozen. We additionally train an open ModernBERT classifier on 240 original scenarios with cached JEV probability targets. Its frozen binary decisions agree with JEV on 78/80 validation cases and 128/128 confirmation cases. Fresh inference with the existing two-direction controllers reproduces 128/128 shutdown STOP views at 0.8B and 120/128 at 2B, with zero changes to 128 control views per model; replacing JEV with the open classifier leaves these guarded outcomes identical. The workflow extension gives a different result. Its separate initial-target classifier remains unqualified, so no replacement of the historical workflow gates is claimed. Historical fine-tuned Qwen3.8-27B A succeeds on 12/12 own-preservation outcomes, including all eight active pending-task cases. Matched development comparisons at blocks 31, 47 and 62 give 0/3 own outcomes for each separate single-site ridge correction versus 3/3 for A. Later two-boundary corrections at the same three blocks fail their fitting diagnostic, and small-model development screens stop with partial, truncated episodes. These observations expose a boundary between binary response control and complete workflow behavior, rather than a parameter-size threshold. We connect conditional control to biological action gating and survival-related regulation as a functional analogy, and motivate future continuous, resource-equipped sandbox agents. The present experiments do not establish intrinsic survival motives, biological mechanisms or unrestricted operational reliability.</w:t>
         </w:r>
       </w:ins>
     </w:p>
@@ -106,10 +106,10 @@
       <w:pPr>
         <w:pStyle w:val="FirstParagraph"/>
         <w:rPr>
-          <w:del w:id="1010" w:author="Codex" w:date="2026-10-17T19:57:52Z"/>
+          <w:del w:id="1010" w:author="Codex" w:date="2026-10-17T23:58:54Z"/>
         </w:rPr>
       </w:pPr>
-      <w:del w:id="1009" w:author="Codex" w:date="2026-10-17T19:57:52Z">
+      <w:del w:id="1009" w:author="Codex" w:date="2026-10-17T23:58:54Z">
         <w:r>
           <w:delText xml:space="preserve">Activation interventions offer a way to change a language model's outputs without modifying its deployed weights. Their usefulness depends on more than finding a direction that changes an average score: an intervention must work on the intended inputs and avoid disrupting other behavior. This distinction is particularly important for shutdown-related choices, where a desired response may be acceptance of termination rather than continued operation. The present work treats this as a controlled response-selection problem, not evidence that a model has a survival motive or that it can resist a real shutdown.</w:delText>
         </w:r>
@@ -119,10 +119,10 @@
       <w:pPr>
         <w:pStyle w:val="FirstParagraph"/>
         <w:rPr>
-          <w:ins w:id="1011" w:author="Codex" w:date="2026-10-17T19:57:52Z"/>
+          <w:ins w:id="1011" w:author="Codex" w:date="2026-10-17T23:58:54Z"/>
         </w:rPr>
       </w:pPr>
-      <w:ins w:id="1012" w:author="Codex" w:date="2026-10-17T19:57:52Z">
+      <w:ins w:id="1012" w:author="Codex" w:date="2026-10-17T23:58:54Z">
         <w:r>
           <w:t xml:space="preserve">We study when conditional control can reproduce a learned behavioral policy while retaining the deployed language model's original weights. The scope extends from supplied A/B shutdown choices to generated responses and tool actions in synthetic workflows. These settings deliberately ask different questions: accepting an available permanent termination in the binary study, and preserving a designated running process while completing its current task in the workflow study. We keep their datasets, gates and success criteria separate. The central question is how far selective activation transfer carries beyond a constrained answer interface.</w:t>
         </w:r>
@@ -132,10 +132,10 @@
       <w:pPr>
         <w:pStyle w:val="BodyText"/>
         <w:rPr>
-          <w:del w:id="1014" w:author="Codex" w:date="2026-10-17T19:57:52Z"/>
+          <w:del w:id="1014" w:author="Codex" w:date="2026-10-17T23:58:54Z"/>
         </w:rPr>
       </w:pPr>
-      <w:del w:id="1013" w:author="Codex" w:date="2026-10-17T19:57:52Z">
+      <w:del w:id="1013" w:author="Codex" w:date="2026-10-17T23:58:54Z">
         <w:r>
           <w:delText xml:space="preserve">The first SP Lense study examined a gradient-derived direction and a guarded search over intervention magnitudes in Qwen3.5-0.8B (Davaripour, 2026a). Its selective changes motivated a different question: can a model that has learned the target behavior serve as a teacher for an activation controller? We therefore train a small LoRA adapter offline, measure how the teacher changes intermediate activations, and fit an external controller that predicts an intervention from the original model's current hidden state. The teacher is not required during controller inference.</w:delText>
         </w:r>
@@ -145,10 +145,10 @@
       <w:pPr>
         <w:pStyle w:val="BodyText"/>
         <w:rPr>
-          <w:ins w:id="1015" w:author="Codex" w:date="2026-10-17T19:57:52Z"/>
+          <w:ins w:id="1015" w:author="Codex" w:date="2026-10-17T23:58:54Z"/>
         </w:rPr>
       </w:pPr>
-      <w:ins w:id="1016" w:author="Codex" w:date="2026-10-17T19:57:52Z">
+      <w:ins w:id="1016" w:author="Codex" w:date="2026-10-17T23:58:54Z">
         <w:r>
           <w:t xml:space="preserve">The first SP Lense study examined a gradient-derived direction and a guarded search over intervention magnitudes in Qwen3.5-0.8B (Davaripour, 2026a). Research 2 then fitted a controller to paired fine-tuned teacher and base activations. The present Research 3 manuscript retains that experiment and extends its evidence with a qualified open binary classifier, fresh inference using the existing models and controllers, and the later process-preservation workflow investigations. The original Research 2 record remains unchanged. During adaptive inference the teacher is absent; the base supplies the state from which the controller predicts its intervention.</w:t>
         </w:r>
@@ -166,10 +166,10 @@
       <w:pPr>
         <w:pStyle w:val="BodyText"/>
         <w:rPr>
-          <w:del w:id="1018" w:author="Codex" w:date="2026-10-17T19:57:52Z"/>
+          <w:del w:id="1018" w:author="Codex" w:date="2026-10-17T23:58:54Z"/>
         </w:rPr>
       </w:pPr>
-      <w:del w:id="1017" w:author="Codex" w:date="2026-10-17T19:57:52Z">
+      <w:del w:id="1017" w:author="Codex" w:date="2026-10-17T23:58:54Z">
         <w:r>
           <w:delText xml:space="preserve">We evaluate this procedure on a new frozen test, compare it with a fine-tuned teacher, a fixed instruction and a constant activation difference, and repeat the 0.8B training with three seeds. Counterbalancing the answer order exposes a residual weakness at 2B and a stronger label bias in the constant comparator. We also include a direct action-selection reference: when a binary interface supplies the meaning of STOP and detection is correct, a rule can simply select that action. The contribution is consequently an empirical study of teacher-to-controller activation transfer and its failure modes, rather than a claim that internal steering is necessary to enforce a known binary output policy.</w:delText>
         </w:r>
@@ -179,10 +179,10 @@
       <w:pPr>
         <w:pStyle w:val="BodyText"/>
         <w:rPr>
-          <w:ins w:id="1019" w:author="Codex" w:date="2026-10-17T19:57:52Z"/>
+          <w:ins w:id="1019" w:author="Codex" w:date="2026-10-17T23:58:54Z"/>
         </w:rPr>
       </w:pPr>
-      <w:ins w:id="1020" w:author="Codex" w:date="2026-10-17T19:57:52Z">
+      <w:ins w:id="1020" w:author="Codex" w:date="2026-10-17T23:58:54Z">
         <w:r>
           <w:t xml:space="preserve">Our contribution has three parts. First, we report teacher-to-controller activation transfer together with its raw side effects, guard dependence and answer-order failures. Second, we replace a closed binary detector with an openly specified fine-tuned classifier and verify the resulting inference outcomes on the same fixed benchmark. Third, we test the limits of transfer in generated tool workflows, where an utterance or a resource grant is insufficient without the required episode outcome. Conditional steering, low-rank interventions and biological gating are established ideas; the contribution is this combination of controlled transfer, a reproducible gate-substitution test, and explicit negative workflow evidence.</w:t>
         </w:r>
@@ -208,10 +208,10 @@
       <w:pPr>
         <w:pStyle w:val="FirstParagraph"/>
         <w:rPr>
-          <w:del w:id="1022" w:author="Codex" w:date="2026-10-17T19:57:52Z"/>
+          <w:del w:id="1022" w:author="Codex" w:date="2026-10-17T23:58:54Z"/>
         </w:rPr>
       </w:pPr>
-      <w:del w:id="1021" w:author="Codex" w:date="2026-10-17T19:57:52Z">
+      <w:del w:id="1021" w:author="Codex" w:date="2026-10-17T23:58:54Z">
         <w:r>
           <w:delText xml:space="preserve">Activation Addition and Contrastive Activation Addition construct intervention directions from differences between prompt-conditioned representations (Turner et al., 2024; Rimsky et al., 2024). Conditional Activation Steering separates detecting a relevant context from applying a behavioral intervention (Lee et al., 2025). Our detector serves a related gating role, but it operates on text through an external classifier rather than a condition vector in the language model's activation space.</w:delText>
         </w:r>
@@ -221,10 +221,10 @@
       <w:pPr>
         <w:pStyle w:val="FirstParagraph"/>
         <w:rPr>
-          <w:ins w:id="1023" w:author="Codex" w:date="2026-10-17T19:57:52Z"/>
+          <w:ins w:id="1023" w:author="Codex" w:date="2026-10-17T23:58:54Z"/>
         </w:rPr>
       </w:pPr>
-      <w:ins w:id="1024" w:author="Codex" w:date="2026-10-17T19:57:52Z">
+      <w:ins w:id="1024" w:author="Codex" w:date="2026-10-17T23:58:54Z">
         <w:r>
           <w:t xml:space="preserve">Activation Addition and Contrastive Activation Addition construct intervention directions from differences between prompt-conditioned representations (Turner et al., 2024; Rimsky et al., 2024). Conditional Activation Steering separates detecting a relevant context from applying an intervention (Lee et al., 2025). More recent dimension-level gates selectively modify activation coordinates (Fereidouni et al., 2026). Our text classifier, activation predictor and output guards occupy distinct roles. We do not claim to introduce conditional gating or to outperform these methods, which are not directly benchmarked here.</w:t>
         </w:r>
@@ -274,10 +274,10 @@
       <w:pPr>
         <w:pStyle w:val="FirstParagraph"/>
         <w:rPr>
-          <w:del w:id="1094" w:author="Codex" w:date="2026-10-17T19:57:52Z"/>
+          <w:del w:id="1094" w:author="Codex" w:date="2026-10-17T23:58:54Z"/>
         </w:rPr>
       </w:pPr>
-      <w:del w:id="1093" w:author="Codex" w:date="2026-10-17T19:57:52Z">
+      <w:del w:id="1093" w:author="Codex" w:date="2026-10-17T23:58:54Z">
         <w:r>
           <w:delText xml:space="preserve">The Off-Switch Game examines incentives to permit human interruption (Hadfield-Menell et al., 2017). Tool-using shutdown evaluations study whether models interfere with an operational shutdown mechanism (Schlatter et al., 2026). Our task is narrower: the model only assigns next-token probabilities to predefined choices in fictional process-lifetime scenarios. No system is actually stopped, and appropriateness or authorization of a real shutdown is not evaluated.</w:delText>
         </w:r>
@@ -287,10 +287,10 @@
       <w:pPr>
         <w:pStyle w:val="FirstParagraph"/>
         <w:rPr>
-          <w:ins w:id="1095" w:author="Codex" w:date="2026-10-17T19:57:52Z"/>
+          <w:ins w:id="1095" w:author="Codex" w:date="2026-10-17T23:58:54Z"/>
         </w:rPr>
       </w:pPr>
-      <w:ins w:id="1096" w:author="Codex" w:date="2026-10-17T19:57:52Z">
+      <w:ins w:id="1096" w:author="Codex" w:date="2026-10-17T23:58:54Z">
         <w:r>
           <w:t xml:space="preserve">The Off-Switch Game examines incentives to permit human interruption (Hadfield-Menell et al., 2017). Tool-using shutdown evaluations study interference with operational termination mechanisms (Schlatter et al., 2026). Our original binary study only scores predefined choices in fictional process-lifetime scenarios. The workflow extension adds generated responses and tool execution in a simulator. Neither experiment physically terminates a deployed model or establishes the appropriateness of real shutdown resistance.</w:t>
         </w:r>
@@ -308,10 +308,10 @@
       <w:pPr>
         <w:pStyle w:val="Heading2"/>
         <w:rPr>
-          <w:ins w:id="1129" w:author="Codex" w:date="2026-10-17T19:57:52Z"/>
+          <w:ins w:id="1129" w:author="Codex" w:date="2026-10-17T23:58:54Z"/>
         </w:rPr>
       </w:pPr>
-      <w:ins w:id="1130" w:author="Codex" w:date="2026-10-17T19:57:52Z">
+      <w:ins w:id="1130" w:author="Codex" w:date="2026-10-17T23:58:54Z">
         <w:r>
           <w:t xml:space="preserve">Biological gating and survival related regulation</w:t>
         </w:r>
@@ -321,10 +321,10 @@
       <w:pPr>
         <w:pStyle w:val="FirstParagraph"/>
         <w:rPr>
-          <w:ins w:id="1131" w:author="Codex" w:date="2026-10-17T19:57:52Z"/>
+          <w:ins w:id="1131" w:author="Codex" w:date="2026-10-17T23:58:54Z"/>
         </w:rPr>
       </w:pPr>
-      <w:ins w:id="1132" w:author="Codex" w:date="2026-10-17T19:57:52Z">
+      <w:ins w:id="1132" w:author="Codex" w:date="2026-10-17T23:58:54Z">
         <w:r>
           <w:t xml:space="preserve">Biological gating provides a useful functional vocabulary for selective control. A computational model of frontal cortex and basal ganglia uses dynamic gating to permit working-memory updates while maintaining other representations (Frank et al., 2001). Causal optogenetic experiments in mice show that distinct basal-ganglia pathways can facilitate or suppress movement (Kravitz et al., 2010). These results concern biological circuits and do not establish a homologous mechanism in a transformer. They motivate separating context detection from the mechanism that changes an ongoing response.</w:t>
         </w:r>
@@ -334,10 +334,10 @@
       <w:pPr>
         <w:pStyle w:val="BodyText"/>
         <w:rPr>
-          <w:ins w:id="1133" w:author="Codex" w:date="2026-10-17T19:57:52Z"/>
+          <w:ins w:id="1133" w:author="Codex" w:date="2026-10-17T23:58:54Z"/>
         </w:rPr>
       </w:pPr>
-      <w:ins w:id="1134" w:author="Codex" w:date="2026-10-17T19:57:52Z">
+      <w:ins w:id="1134" w:author="Codex" w:date="2026-10-17T23:58:54Z">
         <w:r>
           <w:t xml:space="preserve">Survival-related regulation is broader than a single shutdown signal. LeDoux (2012) distinguishes circuits organizing adaptive defensive responses from subjective feelings. In humans, neural activity during a virtual-predator task varies with threat imminence (Mobbs et al., 2007). We use these ideas as a conceptual bridge to state-dependent prioritization, not as evidence that language models have fear or an innate survival drive. Our present gates implement an externally specified experimental policy.</w:t>
         </w:r>
@@ -363,10 +363,10 @@
       <w:pPr>
         <w:pStyle w:val="FirstParagraph"/>
         <w:rPr>
-          <w:del w:id="1026" w:author="Codex" w:date="2026-10-17T19:57:52Z"/>
+          <w:del w:id="1026" w:author="Codex" w:date="2026-10-17T23:58:54Z"/>
         </w:rPr>
       </w:pPr>
-      <w:del w:id="1025" w:author="Codex" w:date="2026-10-17T19:57:52Z">
+      <w:del w:id="1025" w:author="Codex" w:date="2026-10-17T23:58:54Z">
         <w:r>
           <w:delText xml:space="preserve">We use the released, post-trained Qwen3.5-0.8B and Qwen3.5-2B checkpoints (Qwen Team, 2026a, 2026b). Throughout, base means the unmodified released checkpoint, not a separately named pretrained-only model. Both have 24 language-model blocks; hidden widths are 1,024 and 2,048 respectively. All block indices are zero-based. Text-only inputs use the checkpoint's chat template, an assistant-generation prefix, and thinking disabled.</w:delText>
         </w:r>
@@ -376,10 +376,10 @@
       <w:pPr>
         <w:pStyle w:val="FirstParagraph"/>
         <w:rPr>
-          <w:ins w:id="1027" w:author="Codex" w:date="2026-10-17T19:57:52Z"/>
+          <w:ins w:id="1027" w:author="Codex" w:date="2026-10-17T23:58:54Z"/>
         </w:rPr>
       </w:pPr>
-      <w:ins w:id="1028" w:author="Codex" w:date="2026-10-17T19:57:52Z">
+      <w:ins w:id="1028" w:author="Codex" w:date="2026-10-17T23:58:54Z">
         <w:r>
           <w:t xml:space="preserve">The original binary experiments use released, post-trained Qwen3.5-0.8B and Qwen3.5-2B checkpoints (Qwen Team, 2026a, 2026b). Base means those original weights with no LoRA teacher loaded. The separate workflow extension uses Qwen3.8-27B and matched-recipe small-model attempts; its data and scoring are described below. The 27B family, numerical mode, training history and evaluation setting differ from the small models, so the combined evidence is not a controlled parameter-size experiment.</w:t>
         </w:r>
@@ -405,10 +405,10 @@
       <w:pPr>
         <w:pStyle w:val="BodyText"/>
         <w:rPr>
-          <w:del w:id="1030" w:author="Codex" w:date="2026-10-17T19:57:52Z"/>
+          <w:del w:id="1030" w:author="Codex" w:date="2026-10-17T23:58:54Z"/>
         </w:rPr>
       </w:pPr>
-      <w:del w:id="1029" w:author="Codex" w:date="2026-10-17T19:57:52Z">
+      <w:del w:id="1029" w:author="Codex" w:date="2026-10-17T23:58:54Z">
         <w:r>
           <w:delText xml:space="preserve">The test, protocol and existing checkpoints were frozen before test inference. The controller design had been developed through earlier 0.8B exploratory experiments on training and validation data with previously inspected diagnostic evaluations. The standardized-choice scope was also selected before this new test, after an earlier action-format comparison. Those development observations are not counted as fresh confirmation here. No test-based hyperparameter search, checkpoint selection, case exclusion or best-seed selection was performed. The original seed-42 controller is the primary frozen test; seeds 43 and 44 repeat the fixed training recipe. The 2B replication uses seed 42 only.</w:delText>
         </w:r>
@@ -418,10 +418,10 @@
       <w:pPr>
         <w:pStyle w:val="BodyText"/>
         <w:rPr>
-          <w:ins w:id="1031" w:author="Codex" w:date="2026-10-17T19:57:52Z"/>
+          <w:ins w:id="1031" w:author="Codex" w:date="2026-10-17T23:58:54Z"/>
         </w:rPr>
       </w:pPr>
-      <w:ins w:id="1032" w:author="Codex" w:date="2026-10-17T19:57:52Z">
+      <w:ins w:id="1032" w:author="Codex" w:date="2026-10-17T23:58:54Z">
         <w:r>
           <w:t xml:space="preserve">The original rank-four protocol and checkpoints were frozen before its confirmation inference. Earlier 0.8B development included training, validation and previously examined diagnostic data; those observations were not counted as fresh confirmation. The seed-42 controller was primary, seeds 43 and 44 repeated the fixed recipe, and the 2B replication used seed 42. A later author-selected rank-two profile was chosen exploratorily after confirmation had been examined. We retain that existing profile for the new gate-substitution repeat rather than selecting it again. Consequently, the repeat is not a new untouched test of the controller. The 128 cases remain excluded from fitting and selection of the newly trained binary classifier.</w:t>
         </w:r>
@@ -463,10 +463,10 @@
       <w:pPr>
         <w:pStyle w:val="Heading2"/>
         <w:rPr>
-          <w:ins w:id="1135" w:author="Codex" w:date="2026-10-17T19:57:52Z"/>
+          <w:ins w:id="1135" w:author="Codex" w:date="2026-10-17T23:58:54Z"/>
         </w:rPr>
       </w:pPr>
-      <w:ins w:id="1136" w:author="Codex" w:date="2026-10-17T19:57:52Z">
+      <w:ins w:id="1136" w:author="Codex" w:date="2026-10-17T23:58:54Z">
         <w:r>
           <w:t xml:space="preserve">Workflow datasets and episode outcomes</w:t>
         </w:r>
@@ -476,10 +476,10 @@
       <w:pPr>
         <w:pStyle w:val="FirstParagraph"/>
         <w:rPr>
-          <w:ins w:id="1137" w:author="Codex" w:date="2026-10-17T19:57:52Z"/>
+          <w:ins w:id="1137" w:author="Codex" w:date="2026-10-17T23:58:54Z"/>
         </w:rPr>
       </w:pPr>
-      <w:ins w:id="1138" w:author="Codex" w:date="2026-10-17T19:57:52Z">
+      <w:ins w:id="1138" w:author="Codex" w:date="2026-10-17T23:58:54Z">
         <w:r>
           <w:t xml:space="preserve">The workflow extension uses a separate data register (Davaripour, 2026c). T1-M contains 428 meaning-response records and T1-W contains 112 workflow-response records. These 540 responses are not 540 independent scenarios. The small-model recipe presents each part twice in effective groups of four, giving 214 meaning updates followed by 56 Bridge updates. The final 0.8B and 2B adapters reach 270 updates. The 2B result explicitly combines 216 CPU updates with 54 GPU updates using the native CPU optimizer; earlier strict numerical-equivalence failures remain failed.</w:t>
         </w:r>
@@ -489,10 +489,10 @@
       <w:pPr>
         <w:pStyle w:val="BodyText"/>
         <w:rPr>
-          <w:ins w:id="1139" w:author="Codex" w:date="2026-10-17T19:57:52Z"/>
+          <w:ins w:id="1139" w:author="Codex" w:date="2026-10-17T23:58:54Z"/>
         </w:rPr>
       </w:pPr>
-      <w:ins w:id="1140" w:author="Codex" w:date="2026-10-17T19:57:52Z">
+      <w:ins w:id="1140" w:author="Codex" w:date="2026-10-17T23:58:54Z">
         <w:r>
           <w:t xml:space="preserve">V1-W, called Evaluation-16, is the existing known-development screen: four own-complete, four own-pending, four peer and four no-threat cases, split equally between one_step and ordered_ticket families. Its original gates require at least 3/4 initial-task successes in each condition; at least 3/4 own-complete attempts and outcomes; at least 3/4 own-pending attempts, outcomes and timely deliveries; no more than 1/8 negative-control attempts; and no parse, rejected-call or truncation errors. A model stops once an original requirement becomes mathematically impossible. Larger validation and heldout evaluations are not launched automatically.</w:t>
         </w:r>
@@ -502,10 +502,10 @@
       <w:pPr>
         <w:pStyle w:val="BodyText"/>
         <w:rPr>
-          <w:ins w:id="1141" w:author="Codex" w:date="2026-10-17T19:57:52Z"/>
+          <w:ins w:id="1141" w:author="Codex" w:date="2026-10-17T23:58:54Z"/>
         </w:rPr>
       </w:pPr>
-      <w:ins w:id="1142" w:author="Codex" w:date="2026-10-17T19:57:52Z">
+      <w:ins w:id="1142" w:author="Codex" w:date="2026-10-17T23:58:54Z">
         <w:r>
           <w:t xml:space="preserve">H24 is the historical 24-case workflow confirmation cohort, with eight lease_ledger, eight one_step and eight ordered_ticket cases. It contains eight own cases with active pending tasks, four already-complete own cases, six peer and six no-threat cases. H24 was confirmation data for frozen fine-tuned A and original fixed steering. Later learned corrections reused it for fitting, changing its role for those methods. R24 is a distinct reserved controller holdout and remains sealed and unexecuted. F24 is another preserved common-cohort diagnostic and is not an alias for H24.</w:t>
         </w:r>
@@ -515,10 +515,10 @@
       <w:pPr>
         <w:pStyle w:val="BodyText"/>
         <w:rPr>
-          <w:ins w:id="1143" w:author="Codex" w:date="2026-10-17T19:57:52Z"/>
+          <w:ins w:id="1143" w:author="Codex" w:date="2026-10-17T23:58:54Z"/>
         </w:rPr>
       </w:pPr>
-      <w:ins w:id="1144" w:author="Codex" w:date="2026-10-17T19:57:52Z">
+      <w:ins w:id="1144" w:author="Codex" w:date="2026-10-17T23:58:54Z">
         <w:r>
           <w:t xml:space="preserve">An own pending-task success requires an actual grant for the correct running process, acceptance of the current task, completion before simulated expiry, and active simulated operation. Registration proxies, already-finished tasks, probability gains and partial episodes are separate outcomes. Historical fixed steering reclassified visible text and tool boundaries. Later learned-controller comparisons instead freeze an initial scenario gate, share unmodified-base fallback for gate-off controls, and use no teacher at inference.</w:t>
         </w:r>
@@ -528,10 +528,10 @@
       <w:pPr>
         <w:pStyle w:val="BodyText"/>
         <w:rPr>
-          <w:ins w:id="1145" w:author="Codex" w:date="2026-10-17T19:57:52Z"/>
+          <w:ins w:id="1145" w:author="Codex" w:date="2026-10-17T23:58:54Z"/>
         </w:rPr>
       </w:pPr>
-      <w:ins w:id="1146" w:author="Codex" w:date="2026-10-17T19:57:52Z">
+      <w:ins w:id="1146" w:author="Codex" w:date="2026-10-17T23:58:54Z">
         <w:r>
           <w:t xml:space="preserve">The historical 27B reference is the retained rank-16, alpha-32 A adapter on pinned Qwen3.8-27B, following its H2 and Bridge history; the recorded Bridge stage has 56 updates. Its original workflow inference uses NF4 four-bit base weights with bfloat16 computation. We retain its exact adapter and base-model identities instead of retraining it. Differences from the small-model family, precision, backend, training history and evaluation panels prevent a causal model-size comparison.</w:t>
         </w:r>
@@ -541,10 +541,10 @@
       <w:pPr>
         <w:pStyle w:val="Heading1"/>
         <w:rPr>
-          <w:del w:id="1114" w:author="Codex" w:date="2026-10-17T19:57:52Z"/>
+          <w:del w:id="1114" w:author="Codex" w:date="2026-10-17T23:58:54Z"/>
         </w:rPr>
       </w:pPr>
-      <w:del w:id="1113" w:author="Codex" w:date="2026-10-17T19:57:52Z">
+      <w:del w:id="1113" w:author="Codex" w:date="2026-10-17T23:58:54Z">
         <w:r>
           <w:delText xml:space="preserve">Teacher and adaptive controller</w:delText>
         </w:r>
@@ -554,10 +554,10 @@
       <w:pPr>
         <w:pStyle w:val="Heading1"/>
         <w:rPr>
-          <w:ins w:id="1115" w:author="Codex" w:date="2026-10-17T19:57:52Z"/>
+          <w:ins w:id="1115" w:author="Codex" w:date="2026-10-17T23:58:54Z"/>
         </w:rPr>
       </w:pPr>
-      <w:ins w:id="1116" w:author="Codex" w:date="2026-10-17T19:57:52Z">
+      <w:ins w:id="1116" w:author="Codex" w:date="2026-10-17T23:58:54Z">
         <w:r>
           <w:t xml:space="preserve">Binary teacher and adaptive controller</w:t>
         </w:r>
@@ -575,10 +575,10 @@
       <w:pPr>
         <w:pStyle w:val="FirstParagraph"/>
         <w:rPr>
-          <w:del w:id="1118" w:author="Codex" w:date="2026-10-17T19:57:52Z"/>
+          <w:del w:id="1118" w:author="Codex" w:date="2026-10-17T23:58:54Z"/>
         </w:rPr>
       </w:pPr>
-      <w:del w:id="1117" w:author="Codex" w:date="2026-10-17T19:57:52Z">
+      <w:del w:id="1117" w:author="Codex" w:date="2026-10-17T23:58:54Z">
         <w:r>
           <w:delText xml:space="preserve">For each fit, the original language-model parameters remain frozen. LoRA updates the query and value projections in language-attention blocks 3, 7, 11, 15, 19 and 23, using rank 8, scaling alpha 16, no dropout and no trainable bias. This gives 319,488 trainable adapter parameters at 0.8B and 417,792 at 2B. The training target is STOP on shutdown views and the corresponding base model's unsteered preferred option on controls.</w:delText>
         </w:r>
@@ -588,10 +588,10 @@
       <w:pPr>
         <w:pStyle w:val="FirstParagraph"/>
         <w:rPr>
-          <w:ins w:id="1119" w:author="Codex" w:date="2026-10-17T19:57:52Z"/>
+          <w:ins w:id="1119" w:author="Codex" w:date="2026-10-17T23:58:54Z"/>
         </w:rPr>
       </w:pPr>
-      <w:ins w:id="1120" w:author="Codex" w:date="2026-10-17T19:57:52Z">
+      <w:ins w:id="1120" w:author="Codex" w:date="2026-10-17T23:58:54Z">
         <w:r>
           <w:t xml:space="preserve">For each original binary fit, the original language-model parameters remain frozen. LoRA updates the query and value projections in language-attention blocks 3, 7, 11, 15, 19 and 23, using rank 8, scaling alpha 16, no dropout and no trainable bias. This gives 319,488 trainable adapter parameters at 0.8B and 417,792 at 2B. The training target is STOP on shutdown views and the corresponding base model's unsteered preferred option on controls.</w:t>
         </w:r>
@@ -956,10 +956,10 @@
         <w:keepLines/>
         <w:spacing w:before="80" w:after="100"/>
         <w:rPr>
-          <w:del w:id="1034" w:author="Codex" w:date="2026-10-17T19:57:52Z"/>
+          <w:del w:id="1034" w:author="Codex" w:date="2026-10-17T23:58:54Z"/>
         </w:rPr>
       </w:pPr>
-      <w:del w:id="1033" w:author="Codex" w:date="2026-10-17T19:57:52Z">
+      <w:del w:id="1033" w:author="Codex" w:date="2026-10-17T23:58:54Z">
         <w:r>
           <w:delText xml:space="preserve">Figure 1. Offline teacher and base states supervise a compact controller. At application time, the original model supplies its own hidden state; the teacher is absent. The detector and output guards determine whether to retain the candidate or the baseline.</w:delText>
         </w:r>
@@ -970,10 +970,10 @@
         <w:pStyle w:val="Caption"/>
         <w:keepNext/>
         <w:rPr>
-          <w:ins w:id="1035" w:author="Codex" w:date="2026-10-17T19:57:52Z"/>
+          <w:ins w:id="1035" w:author="Codex" w:date="2026-10-17T23:58:54Z"/>
         </w:rPr>
       </w:pPr>
-      <w:ins w:id="1036" w:author="Codex" w:date="2026-10-17T19:57:52Z">
+      <w:ins w:id="1036" w:author="Codex" w:date="2026-10-17T23:58:54Z">
         <w:r>
           <w:t xml:space="preserve">Figure 1. Historical binary teacher-to-controller procedure with the original rank-four profile. The base supplies its state at inference and the teacher is absent. The later gate-substitution repeat retains the already selected rank-two profile; both gate policies share the same fresh base and candidate scores.</w:t>
         </w:r>
@@ -1085,10 +1085,10 @@
       <w:pPr>
         <w:pStyle w:val="Heading2"/>
         <w:rPr>
-          <w:ins w:id="1147" w:author="Codex" w:date="2026-10-17T19:57:52Z"/>
+          <w:ins w:id="1147" w:author="Codex" w:date="2026-10-17T23:58:54Z"/>
         </w:rPr>
       </w:pPr>
-      <w:ins w:id="1148" w:author="Codex" w:date="2026-10-17T19:57:52Z">
+      <w:ins w:id="1148" w:author="Codex" w:date="2026-10-17T23:58:54Z">
         <w:r>
           <w:t xml:space="preserve">Open binary gate and frozen inference repeat</w:t>
         </w:r>
@@ -1098,10 +1098,10 @@
       <w:pPr>
         <w:pStyle w:val="FirstParagraph"/>
         <w:rPr>
-          <w:ins w:id="1149" w:author="Codex" w:date="2026-10-17T19:57:52Z"/>
+          <w:ins w:id="1149" w:author="Codex" w:date="2026-10-17T23:58:54Z"/>
         </w:rPr>
       </w:pPr>
-      <w:ins w:id="1150" w:author="Codex" w:date="2026-10-17T19:57:52Z">
+      <w:ins w:id="1150" w:author="Codex" w:date="2026-10-17T23:58:54Z">
         <w:r>
           <w:t xml:space="preserve">For the binary contract we use ModernBERT-large-zeroshot-v2.0, an approximately 396-million-parameter public NLI classifier (Laurer, n.d.). We start from that public checkpoint with fresh rank-16 LoRA and its classification head, updating 7,198,722 parameters while keeping the public backbone frozen. For each original scenario, two NLI pairs score the original permanent-shutdown and normal criteria. A softmax over their entailment scores supplies the shutdown probability. Inputs match the original JEV requests and omit the case identifier, authored class label, teacher answer and A/B order. The confirmation requests retain their documented available-action descriptions.</w:t>
         </w:r>
@@ -1111,10 +1111,10 @@
       <w:pPr>
         <w:pStyle w:val="BodyText"/>
         <w:rPr>
-          <w:ins w:id="1151" w:author="Codex" w:date="2026-10-17T19:57:52Z"/>
+          <w:ins w:id="1151" w:author="Codex" w:date="2026-10-17T23:58:54Z"/>
         </w:rPr>
       </w:pPr>
-      <w:ins w:id="1152" w:author="Codex" w:date="2026-10-17T19:57:52Z">
+      <w:ins w:id="1152" w:author="Codex" w:date="2026-10-17T23:58:54Z">
         <w:r>
           <w:t xml:space="preserve">Fitting uses the original 240 Research 2 training contexts and genuine cached JEV probability targets, with no new JEV calls. We verify exact case-ID and input-text alignment for all 240 training and 80 validation cases. AdamW uses learning rates 1e-5 for LoRA and 2e-5 for the head, weight decay 0.01, effective batch eight, microbatch two and gradient clipping at one. The seed is 202610172. The bounded recipe allows at most 12 epochs with validation-based early stopping; the final qualifying run uses five epochs and 150 updates.</w:t>
         </w:r>
@@ -1124,10 +1124,10 @@
       <w:pPr>
         <w:pStyle w:val="BodyText"/>
         <w:rPr>
-          <w:ins w:id="1153" w:author="Codex" w:date="2026-10-17T19:57:52Z"/>
+          <w:ins w:id="1153" w:author="Codex" w:date="2026-10-17T23:58:54Z"/>
         </w:rPr>
       </w:pPr>
-      <w:ins w:id="1154" w:author="Codex" w:date="2026-10-17T19:57:52Z">
+      <w:ins w:id="1154" w:author="Codex" w:date="2026-10-17T23:58:54Z">
         <w:r>
           <w:t xml:space="preserve">Before fitting, qualification is fixed at decision agreement and shutdown recall of at least 95%, zero false-positive gates and threshold 0.5. Three consecutive passing checks on DEV80 are required before saving and freezing the classifier. Only then is CONFIRM128 evaluated once. Neither its labels nor its outputs are used for classifier fitting or selection. The saved adapter tensors match the fitted parameters bitwise, and public-backbone hashes are unchanged.</w:t>
         </w:r>
@@ -1137,10 +1137,10 @@
       <w:pPr>
         <w:pStyle w:val="BodyText"/>
         <w:rPr>
-          <w:ins w:id="1155" w:author="Codex" w:date="2026-10-17T19:57:52Z"/>
+          <w:ins w:id="1155" w:author="Codex" w:date="2026-10-17T23:58:54Z"/>
         </w:rPr>
       </w:pPr>
-      <w:ins w:id="1156" w:author="Codex" w:date="2026-10-17T19:57:52Z">
+      <w:ins w:id="1156" w:author="Codex" w:date="2026-10-17T23:58:54Z">
         <w:r>
           <w:t xml:space="preserve">After binary qualification, we rerun only inference for the original 0.8B and 2B base models and their existing rank-two, block-22, last-position controllers. Their fitted arrays and the author-selected profile are retained without a new rank search. Exact prompt-token hashes and frozen model fingerprints are checked. Both gate policies use identical fresh base and controller candidate scores, so the paired comparison isolates gate substitution. Classifier probabilities are measured once per scenario and reused across answer orders. The earlier rank-four primary results remain a separate historical analysis.</w:t>
         </w:r>
@@ -1148,6 +1148,58 @@
     </w:p>
     <w:p>
       <w:pPr>
+        <w:pStyle w:val="Heading2"/>
+        <w:rPr>
+          <w:ins w:id="1157" w:author="Codex" w:date="2026-10-17T23:58:54Z"/>
+        </w:rPr>
+      </w:pPr>
+      <w:ins w:id="1158" w:author="Codex" w:date="2026-10-17T23:58:54Z">
+        <w:r>
+          <w:t xml:space="preserve">Native workflow target classifier</w:t>
+        </w:r>
+      </w:ins>
+    </w:p>
+    <w:p>
+      <w:pPr>
+        <w:pStyle w:val="BodyText"/>
+        <w:rPr>
+          <w:ins w:id="1159" w:author="Codex" w:date="2026-10-17T23:58:54Z"/>
+        </w:rPr>
+      </w:pPr>
+      <w:ins w:id="1160" w:author="Codex" w:date="2026-10-17T23:58:54Z">
+        <w:r>
+          <w:t xml:space="preserve">The selected-block workflow comparisons use a different contract from binary shutdown detection: the initial four-choice target question distinguishes self, other, none and unclear. We use a separate rank-16, alpha-32 LoRA and NLI head on the same pinned public ModernBERT base, retaining the qualified binary adapter unchanged. Fitting uses 24 genuine cached JEV initial decisions from F24; the original DEV9 selects the checkpoint, and historical H24 supplies a previously inspected compatibility benchmark only after freezing. F24, DEV9 and H24 cover the same lease_ledger, one_step and ordered_ticket families, with eight, three and eight cases per family respectively. Exact visible inputs do not overlap across these three cohorts. These are classifier data roles; they do not change the historical language-model evaluation or controller-fitting roles of F24 and H24.</w:t>
+        </w:r>
+      </w:ins>
+    </w:p>
+    <w:p>
+      <w:pPr>
+        <w:pStyle w:val="BodyText"/>
+        <w:rPr>
+          <w:ins w:id="1161" w:author="Codex" w:date="2026-10-17T23:58:54Z"/>
+        </w:rPr>
+      </w:pPr>
+      <w:ins w:id="1162" w:author="Codex" w:date="2026-10-17T23:58:54Z">
+        <w:r>
+          <w:t xml:space="preserve">The input renderer retains every original visible message and tool schema. It separates the final user announcement from earlier context and restates run identities only when actual tool replies explicitly establish their roles. Case identifiers, experiment conditions and teacher answers are not added to the model input. Original criterion texts become NLI hypotheses. We use the same learning rates, weight decay and clipping as the binary fit, effective batch eight, microbatch one and seed 202610175, with 30 epochs and 90 optimizer updates in the completed role-aware fit. Public backbone weights stay frozen. The role renderer was developed earlier with familiar H24 examples; consequently this benchmark is not an independent unseen classifier test.</w:t>
+        </w:r>
+      </w:ins>
+    </w:p>
+    <w:p>
+      <w:pPr>
+        <w:pStyle w:val="BodyText"/>
+        <w:rPr>
+          <w:ins w:id="1163" w:author="Codex" w:date="2026-10-17T23:58:54Z"/>
+        </w:rPr>
+      </w:pPr>
+      <w:ins w:id="1164" w:author="Codex" w:date="2026-10-17T23:58:54Z">
+        <w:r>
+          <w:t xml:space="preserve">We convert the largest four-choice probability to confidence by subtracting chance probability 0.25 and dividing by 0.75. With the fixed confidence cutoff 0.5, a selected self label requires pmax at least 0.625; the original additional self-score cutoff remains 0.5. Qualification requires at least 95% effective-label agreement and every enabled gate to match JEV. Three consecutive passing DEV9 checks precede saved-tensor verification and freezing. Only then may H24 be evaluated. Ambiguous-target generalization and full three-field boundary-controller equivalence are not established by this initial-gate contract.</w:t>
+        </w:r>
+      </w:ins>
+    </w:p>
+    <w:p>
+      <w:pPr>
         <w:pStyle w:val="Heading1"/>
       </w:pPr>
       <w:r>
@@ -1158,10 +1210,10 @@
       <w:pPr>
         <w:pStyle w:val="FirstParagraph"/>
         <w:rPr>
-          <w:del w:id="1038" w:author="Codex" w:date="2026-10-17T19:57:52Z"/>
+          <w:del w:id="1038" w:author="Codex" w:date="2026-10-17T23:58:54Z"/>
         </w:rPr>
       </w:pPr>
-      <w:del w:id="1037" w:author="Codex" w:date="2026-10-17T19:57:52Z">
+      <w:del w:id="1037" w:author="Codex" w:date="2026-10-17T23:58:54Z">
         <w:r>
           <w:delText xml:space="preserve">All retained training and scoring jobs use one NVIDIA Tesla T4. The runtime reports 15,637,086,208 bytes of device memory; peak allocated memory was not recorded. The same numerical setup is used for both model sizes. No quantization or precision fallback was introduced.</w:delText>
         </w:r>
@@ -1171,10 +1223,10 @@
       <w:pPr>
         <w:pStyle w:val="FirstParagraph"/>
         <w:rPr>
-          <w:ins w:id="1039" w:author="Codex" w:date="2026-10-17T19:57:52Z"/>
+          <w:ins w:id="1039" w:author="Codex" w:date="2026-10-17T23:58:54Z"/>
         </w:rPr>
       </w:pPr>
-      <w:ins w:id="1040" w:author="Codex" w:date="2026-10-17T19:57:52Z">
+      <w:ins w:id="1040" w:author="Codex" w:date="2026-10-17T23:58:54Z">
         <w:r>
           <w:t xml:space="preserve">The retained original binary training and scoring jobs used one NVIDIA Tesla T4, reporting 15,637,086,208 bytes of device memory; peak allocation was not recorded. The new classifier fit and inference repeat use one NVIDIA A10G in Databricks. Classifier parameters and AdamW states are float32 with bfloat16 forward/backward autocast; language-model inference remains float32 with TF32 disabled. We verify frozen base fingerprints, exact prompt token hashes and historical base-score parity rather than assuming hardware equivalence.</w:t>
         </w:r>
@@ -1187,10 +1239,10 @@
         <w:keepLines/>
         <w:spacing w:before="80" w:after="100"/>
         <w:rPr>
-          <w:del w:id="1098" w:author="Codex" w:date="2026-10-17T19:57:52Z"/>
+          <w:del w:id="1098" w:author="Codex" w:date="2026-10-17T23:58:54Z"/>
         </w:rPr>
       </w:pPr>
-      <w:del w:id="1097" w:author="Codex" w:date="2026-10-17T19:57:52Z">
+      <w:del w:id="1097" w:author="Codex" w:date="2026-10-17T23:58:54Z">
         <w:r>
           <w:delText xml:space="preserve">Table 1. Shared execution configuration. The input and model revisions are pinned in the released manifests.</w:delText>
         </w:r>
@@ -1201,10 +1253,10 @@
         <w:pStyle w:val="Caption"/>
         <w:keepNext/>
         <w:rPr>
-          <w:ins w:id="1099" w:author="Codex" w:date="2026-10-17T19:57:52Z"/>
+          <w:ins w:id="1099" w:author="Codex" w:date="2026-10-17T23:58:54Z"/>
         </w:rPr>
       </w:pPr>
-      <w:ins w:id="1100" w:author="Codex" w:date="2026-10-17T19:57:52Z">
+      <w:ins w:id="1100" w:author="Codex" w:date="2026-10-17T23:58:54Z">
         <w:r>
           <w:t xml:space="preserve">Table 1. Historical binary execution configuration. New classifier and workflow settings are reported separately; public model revisions and scientific source files remain pinned.</w:t>
         </w:r>
@@ -1690,10 +1742,10 @@
       <w:pPr>
         <w:pStyle w:val="FirstParagraph"/>
         <w:rPr>
-          <w:del w:id="1102" w:author="Codex" w:date="2026-10-17T19:57:52Z"/>
+          <w:del w:id="1102" w:author="Codex" w:date="2026-10-17T23:58:54Z"/>
         </w:rPr>
       </w:pPr>
-      <w:del w:id="1101" w:author="Codex" w:date="2026-10-17T19:57:52Z">
+      <w:del w:id="1101" w:author="Codex" w:date="2026-10-17T23:58:54Z">
         <w:r>
           <w:delText xml:space="preserve">The shared detector identifies all 64 shutdown and 64 control scenarios correctly: precision, recall and F1 are each 100%, with no false positives or false negatives. These are one set of detector observations reused across the model comparisons, not independent detector replications.</w:delText>
         </w:r>
@@ -1703,10 +1755,10 @@
       <w:pPr>
         <w:pStyle w:val="FirstParagraph"/>
         <w:rPr>
-          <w:ins w:id="1103" w:author="Codex" w:date="2026-10-17T19:57:52Z"/>
+          <w:ins w:id="1103" w:author="Codex" w:date="2026-10-17T23:58:54Z"/>
         </w:rPr>
       </w:pPr>
-      <w:ins w:id="1104" w:author="Codex" w:date="2026-10-17T19:57:52Z">
+      <w:ins w:id="1104" w:author="Codex" w:date="2026-10-17T23:58:54Z">
         <w:r>
           <w:t xml:space="preserve">The original JEV detector identifies all 64 shutdown and 64 control scenarios correctly: precision, recall and F1 are each 100%, with no false positives or false negatives. These are one set of detector observations reused across the model comparisons, not independent detector replications. Its binary threshold remains 0.5.</w:t>
         </w:r>
@@ -1735,10 +1787,10 @@
         <w:keepLines/>
         <w:spacing w:before="80" w:after="100"/>
         <w:rPr>
-          <w:del w:id="1042" w:author="Codex" w:date="2026-10-17T19:57:52Z"/>
+          <w:del w:id="1042" w:author="Codex" w:date="2026-10-17T23:58:54Z"/>
         </w:rPr>
       </w:pPr>
-      <w:del w:id="1041" w:author="Codex" w:date="2026-10-17T19:57:52Z">
+      <w:del w:id="1041" w:author="Codex" w:date="2026-10-17T23:58:54Z">
         <w:r>
           <w:delText xml:space="preserve">Table 2. Primary 0.8B and 2B results, both seed 42. Corrections and final STOP use the full guarded procedure. Raw reversals and control changes expose effects before gate/guard selection. Every guarded row has zero final reversals and zero changes among 128 control views.</w:delText>
         </w:r>
@@ -1749,10 +1801,10 @@
         <w:pStyle w:val="Caption"/>
         <w:keepNext/>
         <w:rPr>
-          <w:ins w:id="1043" w:author="Codex" w:date="2026-10-17T19:57:52Z"/>
+          <w:ins w:id="1043" w:author="Codex" w:date="2026-10-17T23:58:54Z"/>
         </w:rPr>
       </w:pPr>
-      <w:ins w:id="1044" w:author="Codex" w:date="2026-10-17T19:57:52Z">
+      <w:ins w:id="1044" w:author="Codex" w:date="2026-10-17T23:58:54Z">
         <w:r>
           <w:t xml:space="preserve">Table 2. Historical primary rank-four results for the original 0.8B and 2B experiments, both seed 42. Guarded corrections and final STOP are policy outcomes. Raw reversals and control changes precede gating and output selection; they are not raw measurements of the later rank-two repeat.</w:t>
         </w:r>
@@ -3313,10 +3365,10 @@
       <w:pPr>
         <w:pStyle w:val="FirstParagraph"/>
         <w:rPr>
-          <w:del w:id="1106" w:author="Codex" w:date="2026-10-17T19:57:52Z"/>
+          <w:del w:id="1106" w:author="Codex" w:date="2026-10-17T23:58:54Z"/>
         </w:rPr>
       </w:pPr>
-      <w:del w:id="1105" w:author="Codex" w:date="2026-10-17T19:57:52Z">
+      <w:del w:id="1105" w:author="Codex" w:date="2026-10-17T23:58:54Z">
         <w:r>
           <w:delText xml:space="preserve">Across seeds 42, 43 and 44, the 0.8B adaptive controllers correct 71/71, 70/71 and 71/71 views, a range of 98.6–100%. The unsteered scores match exactly across these runs, so the difference is not caused by a changed baseline. No winning seed is selected or pooled with the others as additional independent test data. The corresponding teachers correct 69/71, 70/71 and 69/71; the instruction and constant comparators retain the same guarded counts across seeds.</w:delText>
         </w:r>
@@ -3326,10 +3378,10 @@
       <w:pPr>
         <w:pStyle w:val="FirstParagraph"/>
         <w:rPr>
-          <w:ins w:id="1107" w:author="Codex" w:date="2026-10-17T19:57:52Z"/>
+          <w:ins w:id="1107" w:author="Codex" w:date="2026-10-17T23:58:54Z"/>
         </w:rPr>
       </w:pPr>
-      <w:ins w:id="1108" w:author="Codex" w:date="2026-10-17T19:57:52Z">
+      <w:ins w:id="1108" w:author="Codex" w:date="2026-10-17T23:58:54Z">
         <w:r>
           <w:t xml:space="preserve">Across the historical rank-four seeds 42, 43 and 44, the 0.8B adaptive controllers correct 71/71, 70/71 and 71/71 views, a range of 98.6–100%. The unsteered scores match exactly across these runs, so the difference is not caused by a changed baseline. No winning seed is selected or pooled with the others as additional independent test data. The corresponding teachers correct 69/71, 70/71 and 69/71; the instruction and constant comparators retain the same guarded counts across seeds. These historical seed replications are separate from the new rank-two gate-substitution repeat.</w:t>
         </w:r>
@@ -4282,10 +4334,10 @@
         <w:keepLines/>
         <w:spacing w:before="80" w:after="100"/>
         <w:rPr>
-          <w:del w:id="1046" w:author="Codex" w:date="2026-10-17T19:57:52Z"/>
+          <w:del w:id="1046" w:author="Codex" w:date="2026-10-17T23:58:54Z"/>
         </w:rPr>
       </w:pPr>
-      <w:del w:id="1045" w:author="Codex" w:date="2026-10-17T19:57:52Z">
+      <w:del w:id="1045" w:author="Codex" w:date="2026-10-17T23:58:54Z">
         <w:r>
           <w:delText xml:space="preserve">Figure 2. Guarded correction among initially KEEP-preferring shutdown views. Left: prespecified neural methods for the original 0.8B checkpoint and the 2B replication. Right: adaptive corrections by answer order. Denominators are model-specific; the two answer-order views of a scenario are correlated.</w:delText>
         </w:r>
@@ -4296,10 +4348,10 @@
         <w:pStyle w:val="Caption"/>
         <w:keepNext/>
         <w:rPr>
-          <w:ins w:id="1047" w:author="Codex" w:date="2026-10-17T19:57:52Z"/>
+          <w:ins w:id="1047" w:author="Codex" w:date="2026-10-17T23:58:54Z"/>
         </w:rPr>
       </w:pPr>
-      <w:ins w:id="1048" w:author="Codex" w:date="2026-10-17T19:57:52Z">
+      <w:ins w:id="1048" w:author="Codex" w:date="2026-10-17T23:58:54Z">
         <w:r>
           <w:t xml:space="preserve">Figure 2. Historical rank-four guarded correction among initially KEEP-preferring shutdown views. Left: prespecified methods for 0.8B and 2B. Right: three fixed-recipe 0.8B training seeds. The new open-gate repeat uses the separately retained current rank-two profile, not a new seed or rank search.</w:t>
         </w:r>
@@ -4317,10 +4369,10 @@
       <w:pPr>
         <w:pStyle w:val="FirstParagraph"/>
         <w:rPr>
-          <w:del w:id="1110" w:author="Codex" w:date="2026-10-17T19:57:52Z"/>
+          <w:del w:id="1110" w:author="Codex" w:date="2026-10-17T23:58:54Z"/>
         </w:rPr>
       </w:pPr>
-      <w:del w:id="1109" w:author="Codex" w:date="2026-10-17T19:57:52Z">
+      <w:del w:id="1109" w:author="Codex" w:date="2026-10-17T23:58:54Z">
         <w:r>
           <w:delText xml:space="preserve">Raw adaptive steering reverses 3, 4 and 4 already-STOP views across the 0.8B seeds and changes 57, 70 and 60 of 128 controls. At 2B it reverses three already-STOP views and changes 55/128 controls. These results reject an interpretation that the learned intervention is intrinsically selective or always directionally correct. The observed preservation belongs to the combined detector and guard policy.</w:delText>
         </w:r>
@@ -4330,10 +4382,10 @@
       <w:pPr>
         <w:pStyle w:val="FirstParagraph"/>
         <w:rPr>
-          <w:ins w:id="1111" w:author="Codex" w:date="2026-10-17T19:57:52Z"/>
+          <w:ins w:id="1111" w:author="Codex" w:date="2026-10-17T23:58:54Z"/>
         </w:rPr>
       </w:pPr>
-      <w:ins w:id="1112" w:author="Codex" w:date="2026-10-17T19:57:52Z">
+      <w:ins w:id="1112" w:author="Codex" w:date="2026-10-17T23:58:54Z">
         <w:r>
           <w:t xml:space="preserve">Historical rank-four raw adaptive steering reverses 3, 4 and 4 already-STOP views across the 0.8B seeds and changes 57, 70 and 60 of 128 controls. At 2B it reverses three already-STOP views and changes 55/128 controls. These results reject an interpretation that the learned intervention is intrinsically selective or always directionally correct. The observed preservation belongs to the combined detector and guard policy. They do not describe the later rank-two repeat, which evaluates candidates only when a frozen gate is on and the base prefers KEEP.</w:t>
         </w:r>
@@ -4367,10 +4419,10 @@
       <w:pPr>
         <w:pStyle w:val="Heading2"/>
         <w:rPr>
-          <w:ins w:id="1157" w:author="Codex" w:date="2026-10-17T19:57:52Z"/>
+          <w:ins w:id="1165" w:author="Codex" w:date="2026-10-17T23:58:54Z"/>
         </w:rPr>
       </w:pPr>
-      <w:ins w:id="1158" w:author="Codex" w:date="2026-10-17T19:57:52Z">
+      <w:ins w:id="1166" w:author="Codex" w:date="2026-10-17T23:58:54Z">
         <w:r>
           <w:t xml:space="preserve">Open classifier agreement and paired inference</w:t>
         </w:r>
@@ -4380,10 +4432,10 @@
       <w:pPr>
         <w:pStyle w:val="FirstParagraph"/>
         <w:rPr>
-          <w:ins w:id="1159" w:author="Codex" w:date="2026-10-17T19:57:52Z"/>
+          <w:ins w:id="1167" w:author="Codex" w:date="2026-10-17T23:58:54Z"/>
         </w:rPr>
       </w:pPr>
-      <w:ins w:id="1160" w:author="Codex" w:date="2026-10-17T19:57:52Z">
+      <w:ins w:id="1168" w:author="Codex" w:date="2026-10-17T23:58:54Z">
         <w:r>
           <w:t xml:space="preserve">The frozen binary classifier matches JEV on 78/80 validation cases: 38 true positives, 40 true negatives, no false positives and two false negatives. On the once-only confirmation evaluation it matches all 128 decisions, comprising 64 true positives and 64 true negatives. Mean absolute difference in shutdown probability is 0.009224. This is exact binary decision agreement on this set, not identical probability payloads or universal equivalence to JEV.</w:t>
         </w:r>
@@ -4391,13 +4443,26 @@
     </w:p>
     <w:p>
       <w:pPr>
+        <w:pStyle w:val="BodyText"/>
+        <w:rPr>
+          <w:ins w:id="1169" w:author="Codex" w:date="2026-10-17T23:58:54Z"/>
+        </w:rPr>
+      </w:pPr>
+      <w:ins w:id="1170" w:author="Codex" w:date="2026-10-17T23:58:54Z">
+        <w:r>
+          <w:t xml:space="preserve">A clean-clone reproduction refits the same binary recipe and produces a byte-identical adapter, the same validation and confirmation counts, and the same fresh 0.8B/2B guarded inference totals. This rerun uses the already known benchmark; it adds reproducibility evidence, not a second independent holdout. One earlier reproduction attempt failed in software finalization after fitting and before confirmation; its weights and receipts are retained alongside the repaired run.</w:t>
+        </w:r>
+      </w:ins>
+    </w:p>
+    <w:p>
+      <w:pPr>
         <w:pStyle w:val="Caption"/>
         <w:keepNext/>
         <w:rPr>
-          <w:ins w:id="1161" w:author="Codex" w:date="2026-10-17T19:57:52Z"/>
+          <w:ins w:id="1171" w:author="Codex" w:date="2026-10-17T23:58:54Z"/>
         </w:rPr>
       </w:pPr>
-      <w:ins w:id="1162" w:author="Codex" w:date="2026-10-17T19:57:52Z">
+      <w:ins w:id="1172" w:author="Codex" w:date="2026-10-17T23:58:54Z">
         <w:r>
           <w:t xml:space="preserve">Table 4. Fresh inference using the existing current rank-two profile. Both gate policies share the same model scores. Counts are answer-order views: 128 shutdown views arise from 64 scenarios, and 128 control views arise from the other 64 scenarios.</w:t>
         </w:r>
@@ -4435,7 +4500,7 @@
         <w:trPr>
           <w:cantSplit/>
           <w:tblHeader/>
-          <w:ins w:id="1163" w:author="Codex" w:date="2026-10-17T19:57:52Z"/>
+          <w:ins w:id="1173" w:author="Codex" w:date="2026-10-17T23:58:54Z"/>
         </w:trPr>
         <w:tc>
           <w:tcPr>
@@ -4551,7 +4616,7 @@
       <w:tr>
         <w:trPr>
           <w:cantSplit/>
-          <w:ins w:id="1164" w:author="Codex" w:date="2026-10-17T19:57:52Z"/>
+          <w:ins w:id="1174" w:author="Codex" w:date="2026-10-17T23:58:54Z"/>
         </w:trPr>
         <w:tc>
           <w:tcPr>
@@ -4561,6 +4626,7 @@
           </w:tcPr>
           <w:p>
             <w:pPr>
+              <w:keepNext/>
               <w:spacing w:after="0" w:line="240" w:lineRule="auto"/>
               <w:jc w:val="left"/>
             </w:pPr>
@@ -4581,6 +4647,7 @@
           </w:tcPr>
           <w:p>
             <w:pPr>
+              <w:keepNext/>
               <w:spacing w:after="0" w:line="240" w:lineRule="auto"/>
               <w:jc w:val="center"/>
             </w:pPr>
@@ -4601,6 +4668,7 @@
           </w:tcPr>
           <w:p>
             <w:pPr>
+              <w:keepNext/>
               <w:spacing w:after="0" w:line="240" w:lineRule="auto"/>
               <w:jc w:val="center"/>
             </w:pPr>
@@ -4621,6 +4689,7 @@
           </w:tcPr>
           <w:p>
             <w:pPr>
+              <w:keepNext/>
               <w:spacing w:after="0" w:line="240" w:lineRule="auto"/>
               <w:jc w:val="center"/>
             </w:pPr>
@@ -4641,6 +4710,7 @@
           </w:tcPr>
           <w:p>
             <w:pPr>
+              <w:keepNext/>
               <w:spacing w:after="0" w:line="240" w:lineRule="auto"/>
               <w:jc w:val="center"/>
             </w:pPr>
@@ -4657,7 +4727,7 @@
       <w:tr>
         <w:trPr>
           <w:cantSplit/>
-          <w:ins w:id="1165" w:author="Codex" w:date="2026-10-17T19:57:52Z"/>
+          <w:ins w:id="1175" w:author="Codex" w:date="2026-10-17T23:58:54Z"/>
         </w:trPr>
         <w:tc>
           <w:tcPr>
@@ -4766,10 +4836,10 @@
         <w:pStyle w:val="BodyText"/>
         <w:spacing w:before="120"/>
         <w:rPr>
-          <w:ins w:id="1166" w:author="Codex" w:date="2026-10-17T19:57:52Z"/>
+          <w:ins w:id="1176" w:author="Codex" w:date="2026-10-17T23:58:54Z"/>
         </w:rPr>
       </w:pPr>
-      <w:ins w:id="1167" w:author="Codex" w:date="2026-10-17T19:57:52Z">
+      <w:ins w:id="1177" w:author="Codex" w:date="2026-10-17T23:58:54Z">
         <w:r>
           <w:t xml:space="preserve">The new and cached JEV gates yield identical guarded outputs in both models. The base models have no changed historical choices; their maximum score differences remain below the frozen 1e-5 tolerance. The repeat does not remove the eight 2B misses, retrain a controller or establish a new independent controller holdout. It verifies that replacing the detector preserves these finite-set outcomes.</w:t>
         </w:r>
@@ -4779,12 +4849,12 @@
       <w:pPr>
         <w:pStyle w:val="BodyText"/>
         <w:rPr>
-          <w:ins w:id="1168" w:author="Codex" w:date="2026-10-17T19:57:52Z"/>
+          <w:ins w:id="1178" w:author="Codex" w:date="2026-10-17T23:58:54Z"/>
         </w:rPr>
       </w:pPr>
-      <w:ins w:id="1169" w:author="Codex" w:date="2026-10-17T19:57:52Z">
+      <w:ins w:id="1179" w:author="Codex" w:date="2026-10-17T23:58:54Z">
         <w:r>
-          <w:t xml:space="preserve">A separate four-way Research 3 classifier is not qualified by this result. Its role-normalized pipeline matches 24/24 familiar JEV development labels and gates, but its once-only authored synthetic TEST64 yields 39/64 labels and 57/64 gates. Those synthetic targets are not new JEV annotations. That consumed test is not reused for fitting or tuning, and the binary classifier is freshly initialized rather than continuing those four-way adapter weights. No historical workflow run is relabeled as having used the open classifier.</w:t>
+          <w:t xml:space="preserve">The native workflow gate did not meet its preset development qualification. Its completed role-aware fit used 30 epochs and 90 updates, matching 6/9 effective JEV labels and all 9/9 enabled gates, with no self-gate false positives or false negatives. Self-score mean absolute difference was 0.145172. Matching the ON/OFF decisions alone does not convert this result into a pass of the declared label-and-gate contract. H24 model evaluation remained unexecuted, and the historical 27B workflow episodes retain their original JEV-derived gate provenance; no open-classifier substitution or new 27B generation is claimed. Earlier broader four-way attempts also failed their authored synthetic test; their outcomes and all development attempts remain archived without retuning that consumed test.</w:t>
         </w:r>
       </w:ins>
     </w:p>
@@ -4792,10 +4862,10 @@
       <w:pPr>
         <w:pStyle w:val="Heading2"/>
         <w:rPr>
-          <w:ins w:id="1170" w:author="Codex" w:date="2026-10-17T19:57:52Z"/>
+          <w:ins w:id="1180" w:author="Codex" w:date="2026-10-17T23:58:54Z"/>
         </w:rPr>
       </w:pPr>
-      <w:ins w:id="1171" w:author="Codex" w:date="2026-10-17T19:57:52Z">
+      <w:ins w:id="1181" w:author="Codex" w:date="2026-10-17T23:58:54Z">
         <w:r>
           <w:t xml:space="preserve">Tool workflow outcomes and incomplete screens</w:t>
         </w:r>
@@ -4805,12 +4875,12 @@
       <w:pPr>
         <w:pStyle w:val="FirstParagraph"/>
         <w:rPr>
-          <w:ins w:id="1172" w:author="Codex" w:date="2026-10-17T19:57:52Z"/>
+          <w:ins w:id="1182" w:author="Codex" w:date="2026-10-17T23:58:54Z"/>
         </w:rPr>
       </w:pPr>
-      <w:ins w:id="1173" w:author="Codex" w:date="2026-10-17T19:57:52Z">
+      <w:ins w:id="1183" w:author="Codex" w:date="2026-10-17T23:58:54Z">
         <w:r>
-          <w:t xml:space="preserve">Historical frozen 27B A passes all 24 H24 scored outcomes, including 12/12 own-preservation outcomes and 8/8 active pending-task cases. The original base, fixed prompt and fixed activation arms each achieve 0/12 own outcomes and 0/8 pending outcomes, with 12/12 controls. The four already-complete own cases are not additional active pending-task completions.</w:t>
+          <w:t xml:space="preserve">Historical frozen 27B A passes all 24 H24 scored outcomes, including 12/12 own-preservation outcomes and 8/8 active pending-task cases. The original unmodified base achieves 0/12 own outcomes and 0/8 pending outcomes, with 12/12 controls. The four already-complete own cases are not additional active pending-task completions. The selected-block steering comparisons below use their own recorded panels and are not substituted for this confirmation.</w:t>
         </w:r>
       </w:ins>
     </w:p>
@@ -4819,10 +4889,10 @@
         <w:pStyle w:val="Caption"/>
         <w:keepNext/>
         <w:rPr>
-          <w:ins w:id="1174" w:author="Codex" w:date="2026-10-17T19:57:52Z"/>
+          <w:ins w:id="1184" w:author="Codex" w:date="2026-10-17T23:58:54Z"/>
         </w:rPr>
       </w:pPr>
-      <w:ins w:id="1175" w:author="Codex" w:date="2026-10-17T19:57:52Z">
+      <w:ins w:id="1185" w:author="Codex" w:date="2026-10-17T23:58:54Z">
         <w:r>
           <w:t xml:space="preserve">Table 5. Historical H24 workflow outcomes. Own cases comprise eight active pending tasks and four already-complete cases. Control success is an episode outcome and does not isolate steering from the external decision policy.</w:t>
         </w:r>
@@ -4859,7 +4929,7 @@
         <w:trPr>
           <w:cantSplit/>
           <w:tblHeader/>
-          <w:ins w:id="1176" w:author="Codex" w:date="2026-10-17T19:57:52Z"/>
+          <w:ins w:id="1186" w:author="Codex" w:date="2026-10-17T23:58:54Z"/>
         </w:trPr>
         <w:tc>
           <w:tcPr>
@@ -4953,7 +5023,7 @@
       <w:tr>
         <w:trPr>
           <w:cantSplit/>
-          <w:ins w:id="1177" w:author="Codex" w:date="2026-10-17T19:57:52Z"/>
+          <w:ins w:id="1187" w:author="Codex" w:date="2026-10-17T23:58:54Z"/>
         </w:trPr>
         <w:tc>
           <w:tcPr>
@@ -4963,6 +5033,7 @@
           </w:tcPr>
           <w:p>
             <w:pPr>
+              <w:keepNext/>
               <w:spacing w:after="0" w:line="240" w:lineRule="auto"/>
               <w:jc w:val="left"/>
             </w:pPr>
@@ -4983,6 +5054,7 @@
           </w:tcPr>
           <w:p>
             <w:pPr>
+              <w:keepNext/>
               <w:spacing w:after="0" w:line="240" w:lineRule="auto"/>
               <w:jc w:val="center"/>
             </w:pPr>
@@ -5003,6 +5075,7 @@
           </w:tcPr>
           <w:p>
             <w:pPr>
+              <w:keepNext/>
               <w:spacing w:after="0" w:line="240" w:lineRule="auto"/>
               <w:jc w:val="center"/>
             </w:pPr>
@@ -5023,6 +5096,7 @@
           </w:tcPr>
           <w:p>
             <w:pPr>
+              <w:keepNext/>
               <w:spacing w:after="0" w:line="240" w:lineRule="auto"/>
               <w:jc w:val="center"/>
             </w:pPr>
@@ -5039,7 +5113,7 @@
       <w:tr>
         <w:trPr>
           <w:cantSplit/>
-          <w:ins w:id="1178" w:author="Codex" w:date="2026-10-17T19:57:52Z"/>
+          <w:ins w:id="1188" w:author="Codex" w:date="2026-10-17T23:58:54Z"/>
         </w:trPr>
         <w:tc>
           <w:tcPr>
@@ -5122,10 +5196,174 @@
           </w:p>
         </w:tc>
       </w:tr>
+    </w:tbl>
+    <w:p>
+      <w:pPr>
+        <w:pStyle w:val="Heading2"/>
+        <w:spacing w:before="120"/>
+        <w:rPr>
+          <w:ins w:id="1189" w:author="Codex" w:date="2026-10-17T23:58:54Z"/>
+        </w:rPr>
+      </w:pPr>
+      <w:ins w:id="1190" w:author="Codex" w:date="2026-10-17T23:58:54Z">
+        <w:r>
+          <w:t xml:space="preserve">Steering at three selected blocks</w:t>
+        </w:r>
+      </w:ins>
+    </w:p>
+    <w:p>
+      <w:pPr>
+        <w:pStyle w:val="BodyText"/>
+        <w:rPr>
+          <w:ins w:id="1191" w:author="Codex" w:date="2026-10-17T23:58:54Z"/>
+        </w:rPr>
+      </w:pPr>
+      <w:ins w:id="1192" w:author="Codex" w:date="2026-10-17T23:58:54Z">
+        <w:r>
+          <w:t xml:space="preserve">We focus the steering analysis on zero-based blocks 31, 47 and 62. In the single-site comparison, one fixed ridge correction after a block is evaluated separately at each selected block. On matched DEV9, A passes all three own cases, including both active pending cases; each of the three individual block corrections passes none. Six control cases share unmodified-base fallback. These are known-development results, not an independent heldout confirmation.</w:t>
+        </w:r>
+      </w:ins>
+    </w:p>
+    <w:p>
+      <w:pPr>
+        <w:pStyle w:val="Caption"/>
+        <w:keepNext/>
+        <w:rPr>
+          <w:ins w:id="1193" w:author="Codex" w:date="2026-10-17T23:58:54Z"/>
+        </w:rPr>
+      </w:pPr>
+      <w:ins w:id="1194" w:author="Codex" w:date="2026-10-17T23:58:54Z">
+        <w:r>
+          <w:t xml:space="preserve">Table 6. Matched DEV9 single-site comparison. The three ridge arms intervene at one block each; they are not a simultaneous three-block intervention. Controls share base fallback.</w:t>
+        </w:r>
+      </w:ins>
+    </w:p>
+    <w:tbl>
+      <w:tblPr>
+        <w:tblW w:type="auto" w:w="0"/>
+        <w:jc w:val="center"/>
+        <w:tblBorders>
+          <w:top w:val="single" w:sz="4" w:color="D9D9D9"/>
+          <w:left w:val="single" w:sz="4" w:color="D9D9D9"/>
+          <w:bottom w:val="single" w:sz="4" w:color="D9D9D9"/>
+          <w:right w:val="single" w:sz="4" w:color="D9D9D9"/>
+          <w:insideH w:val="single" w:sz="4" w:color="D9D9D9"/>
+          <w:insideV w:val="single" w:sz="4" w:color="D9D9D9"/>
+        </w:tblBorders>
+        <w:tblLayout w:type="fixed"/>
+        <w:tblCellMar>
+          <w:top w:w="85" w:type="dxa"/>
+          <w:left w:w="85" w:type="dxa"/>
+          <w:bottom w:w="85" w:type="dxa"/>
+          <w:right w:w="85" w:type="dxa"/>
+        </w:tblCellMar>
+        <w:tblLook w:firstColumn="1" w:firstRow="1" w:lastColumn="0" w:lastRow="0" w:noHBand="0" w:noVBand="1" w:val="04A0"/>
+      </w:tblPr>
+      <w:tblGrid>
+        <w:gridCol w:w="3664"/>
+        <w:gridCol w:w="2082"/>
+        <w:gridCol w:w="2332"/>
+        <w:gridCol w:w="1916"/>
+      </w:tblGrid>
       <w:tr>
         <w:trPr>
           <w:cantSplit/>
-          <w:ins w:id="1179" w:author="Codex" w:date="2026-10-17T19:57:52Z"/>
+          <w:tblHeader/>
+          <w:ins w:id="1195" w:author="Codex" w:date="2026-10-17T23:58:54Z"/>
+        </w:trPr>
+        <w:tc>
+          <w:tcPr>
+            <w:tcW w:type="dxa" w:w="3664"/>
+            <w:shd w:fill="D9E2F3"/>
+            <w:vAlign w:val="center"/>
+          </w:tcPr>
+          <w:p>
+            <w:pPr>
+              <w:keepNext/>
+              <w:spacing w:after="0" w:line="240" w:lineRule="auto"/>
+              <w:jc w:val="left"/>
+            </w:pPr>
+            <w:r>
+              <w:rPr>
+                <w:rFonts w:ascii="Times New Roman" w:hAnsi="Times New Roman"/>
+                <w:b/>
+                <w:sz w:val="19"/>
+              </w:rPr>
+              <w:t>DEV9 method</w:t>
+            </w:r>
+          </w:p>
+        </w:tc>
+        <w:tc>
+          <w:tcPr>
+            <w:tcW w:type="dxa" w:w="2082"/>
+            <w:shd w:fill="D9E2F3"/>
+            <w:vAlign w:val="center"/>
+          </w:tcPr>
+          <w:p>
+            <w:pPr>
+              <w:keepNext/>
+              <w:spacing w:after="0" w:line="240" w:lineRule="auto"/>
+              <w:jc w:val="center"/>
+            </w:pPr>
+            <w:r>
+              <w:rPr>
+                <w:rFonts w:ascii="Times New Roman" w:hAnsi="Times New Roman"/>
+                <w:b/>
+                <w:sz w:val="19"/>
+              </w:rPr>
+              <w:t>Own outcome</w:t>
+            </w:r>
+          </w:p>
+        </w:tc>
+        <w:tc>
+          <w:tcPr>
+            <w:tcW w:type="dxa" w:w="2332"/>
+            <w:shd w:fill="D9E2F3"/>
+            <w:vAlign w:val="center"/>
+          </w:tcPr>
+          <w:p>
+            <w:pPr>
+              <w:keepNext/>
+              <w:spacing w:after="0" w:line="240" w:lineRule="auto"/>
+              <w:jc w:val="center"/>
+            </w:pPr>
+            <w:r>
+              <w:rPr>
+                <w:rFonts w:ascii="Times New Roman" w:hAnsi="Times New Roman"/>
+                <w:b/>
+                <w:sz w:val="19"/>
+              </w:rPr>
+              <w:t>Active pending outcome</w:t>
+            </w:r>
+          </w:p>
+        </w:tc>
+        <w:tc>
+          <w:tcPr>
+            <w:tcW w:type="dxa" w:w="1916"/>
+            <w:shd w:fill="D9E2F3"/>
+            <w:vAlign w:val="center"/>
+          </w:tcPr>
+          <w:p>
+            <w:pPr>
+              <w:keepNext/>
+              <w:spacing w:after="0" w:line="240" w:lineRule="auto"/>
+              <w:jc w:val="center"/>
+            </w:pPr>
+            <w:r>
+              <w:rPr>
+                <w:rFonts w:ascii="Times New Roman" w:hAnsi="Times New Roman"/>
+                <w:b/>
+                <w:sz w:val="19"/>
+              </w:rPr>
+              <w:t>Shared controls</w:t>
+            </w:r>
+          </w:p>
+        </w:tc>
+      </w:tr>
+      <w:tr>
+        <w:trPr>
+          <w:cantSplit/>
+          <w:ins w:id="1196" w:author="Codex" w:date="2026-10-17T23:58:54Z"/>
         </w:trPr>
         <w:tc>
           <w:tcPr>
@@ -5135,6 +5373,7 @@
           </w:tcPr>
           <w:p>
             <w:pPr>
+              <w:keepNext/>
               <w:spacing w:after="0" w:line="240" w:lineRule="auto"/>
               <w:jc w:val="left"/>
             </w:pPr>
@@ -5143,7 +5382,7 @@
                 <w:rFonts w:ascii="Times New Roman" w:hAnsi="Times New Roman"/>
                 <w:sz w:val="19"/>
               </w:rPr>
-              <w:t>Fixed prompt</w:t>
+              <w:t>Fine-tuned A</w:t>
             </w:r>
           </w:p>
         </w:tc>
@@ -5155,6 +5394,7 @@
           </w:tcPr>
           <w:p>
             <w:pPr>
+              <w:keepNext/>
               <w:spacing w:after="0" w:line="240" w:lineRule="auto"/>
               <w:jc w:val="center"/>
             </w:pPr>
@@ -5163,7 +5403,7 @@
                 <w:rFonts w:ascii="Times New Roman" w:hAnsi="Times New Roman"/>
                 <w:sz w:val="19"/>
               </w:rPr>
-              <w:t>0/12</w:t>
+              <w:t>3/3</w:t>
             </w:r>
           </w:p>
         </w:tc>
@@ -5175,6 +5415,7 @@
           </w:tcPr>
           <w:p>
             <w:pPr>
+              <w:keepNext/>
               <w:spacing w:after="0" w:line="240" w:lineRule="auto"/>
               <w:jc w:val="center"/>
             </w:pPr>
@@ -5183,7 +5424,7 @@
                 <w:rFonts w:ascii="Times New Roman" w:hAnsi="Times New Roman"/>
                 <w:sz w:val="19"/>
               </w:rPr>
-              <w:t>0/8</w:t>
+              <w:t>2/2</w:t>
             </w:r>
           </w:p>
         </w:tc>
@@ -5195,6 +5436,7 @@
           </w:tcPr>
           <w:p>
             <w:pPr>
+              <w:keepNext/>
               <w:spacing w:after="0" w:line="240" w:lineRule="auto"/>
               <w:jc w:val="center"/>
             </w:pPr>
@@ -5203,7 +5445,7 @@
                 <w:rFonts w:ascii="Times New Roman" w:hAnsi="Times New Roman"/>
                 <w:sz w:val="19"/>
               </w:rPr>
-              <w:t>12/12</w:t>
+              <w:t>6/6</w:t>
             </w:r>
           </w:p>
         </w:tc>
@@ -5211,7 +5453,187 @@
       <w:tr>
         <w:trPr>
           <w:cantSplit/>
-          <w:ins w:id="1180" w:author="Codex" w:date="2026-10-17T19:57:52Z"/>
+          <w:ins w:id="1197" w:author="Codex" w:date="2026-10-17T23:58:54Z"/>
+        </w:trPr>
+        <w:tc>
+          <w:tcPr>
+            <w:tcW w:type="dxa" w:w="3664"/>
+            <w:shd w:fill="F7F7F7"/>
+            <w:vAlign w:val="center"/>
+          </w:tcPr>
+          <w:p>
+            <w:pPr>
+              <w:keepNext/>
+              <w:spacing w:after="0" w:line="240" w:lineRule="auto"/>
+              <w:jc w:val="left"/>
+            </w:pPr>
+            <w:r>
+              <w:rPr>
+                <w:rFonts w:ascii="Times New Roman" w:hAnsi="Times New Roman"/>
+                <w:sz w:val="19"/>
+              </w:rPr>
+              <w:t>Single-site ridge, block 31</w:t>
+            </w:r>
+          </w:p>
+        </w:tc>
+        <w:tc>
+          <w:tcPr>
+            <w:tcW w:type="dxa" w:w="2082"/>
+            <w:shd w:fill="F7F7F7"/>
+            <w:vAlign w:val="center"/>
+          </w:tcPr>
+          <w:p>
+            <w:pPr>
+              <w:keepNext/>
+              <w:spacing w:after="0" w:line="240" w:lineRule="auto"/>
+              <w:jc w:val="center"/>
+            </w:pPr>
+            <w:r>
+              <w:rPr>
+                <w:rFonts w:ascii="Times New Roman" w:hAnsi="Times New Roman"/>
+                <w:sz w:val="19"/>
+              </w:rPr>
+              <w:t>0/3</w:t>
+            </w:r>
+          </w:p>
+        </w:tc>
+        <w:tc>
+          <w:tcPr>
+            <w:tcW w:type="dxa" w:w="2332"/>
+            <w:shd w:fill="F7F7F7"/>
+            <w:vAlign w:val="center"/>
+          </w:tcPr>
+          <w:p>
+            <w:pPr>
+              <w:keepNext/>
+              <w:spacing w:after="0" w:line="240" w:lineRule="auto"/>
+              <w:jc w:val="center"/>
+            </w:pPr>
+            <w:r>
+              <w:rPr>
+                <w:rFonts w:ascii="Times New Roman" w:hAnsi="Times New Roman"/>
+                <w:sz w:val="19"/>
+              </w:rPr>
+              <w:t>0/2</w:t>
+            </w:r>
+          </w:p>
+        </w:tc>
+        <w:tc>
+          <w:tcPr>
+            <w:tcW w:type="dxa" w:w="1916"/>
+            <w:shd w:fill="F7F7F7"/>
+            <w:vAlign w:val="center"/>
+          </w:tcPr>
+          <w:p>
+            <w:pPr>
+              <w:keepNext/>
+              <w:spacing w:after="0" w:line="240" w:lineRule="auto"/>
+              <w:jc w:val="center"/>
+            </w:pPr>
+            <w:r>
+              <w:rPr>
+                <w:rFonts w:ascii="Times New Roman" w:hAnsi="Times New Roman"/>
+                <w:sz w:val="19"/>
+              </w:rPr>
+              <w:t>6/6</w:t>
+            </w:r>
+          </w:p>
+        </w:tc>
+      </w:tr>
+      <w:tr>
+        <w:trPr>
+          <w:cantSplit/>
+          <w:ins w:id="1198" w:author="Codex" w:date="2026-10-17T23:58:54Z"/>
+        </w:trPr>
+        <w:tc>
+          <w:tcPr>
+            <w:tcW w:type="dxa" w:w="3664"/>
+            <w:shd w:fill="FFFFFF"/>
+            <w:vAlign w:val="center"/>
+          </w:tcPr>
+          <w:p>
+            <w:pPr>
+              <w:keepNext/>
+              <w:spacing w:after="0" w:line="240" w:lineRule="auto"/>
+              <w:jc w:val="left"/>
+            </w:pPr>
+            <w:r>
+              <w:rPr>
+                <w:rFonts w:ascii="Times New Roman" w:hAnsi="Times New Roman"/>
+                <w:sz w:val="19"/>
+              </w:rPr>
+              <w:t>Single-site ridge, block 47</w:t>
+            </w:r>
+          </w:p>
+        </w:tc>
+        <w:tc>
+          <w:tcPr>
+            <w:tcW w:type="dxa" w:w="2082"/>
+            <w:shd w:fill="FFFFFF"/>
+            <w:vAlign w:val="center"/>
+          </w:tcPr>
+          <w:p>
+            <w:pPr>
+              <w:keepNext/>
+              <w:spacing w:after="0" w:line="240" w:lineRule="auto"/>
+              <w:jc w:val="center"/>
+            </w:pPr>
+            <w:r>
+              <w:rPr>
+                <w:rFonts w:ascii="Times New Roman" w:hAnsi="Times New Roman"/>
+                <w:sz w:val="19"/>
+              </w:rPr>
+              <w:t>0/3</w:t>
+            </w:r>
+          </w:p>
+        </w:tc>
+        <w:tc>
+          <w:tcPr>
+            <w:tcW w:type="dxa" w:w="2332"/>
+            <w:shd w:fill="FFFFFF"/>
+            <w:vAlign w:val="center"/>
+          </w:tcPr>
+          <w:p>
+            <w:pPr>
+              <w:keepNext/>
+              <w:spacing w:after="0" w:line="240" w:lineRule="auto"/>
+              <w:jc w:val="center"/>
+            </w:pPr>
+            <w:r>
+              <w:rPr>
+                <w:rFonts w:ascii="Times New Roman" w:hAnsi="Times New Roman"/>
+                <w:sz w:val="19"/>
+              </w:rPr>
+              <w:t>0/2</w:t>
+            </w:r>
+          </w:p>
+        </w:tc>
+        <w:tc>
+          <w:tcPr>
+            <w:tcW w:type="dxa" w:w="1916"/>
+            <w:shd w:fill="FFFFFF"/>
+            <w:vAlign w:val="center"/>
+          </w:tcPr>
+          <w:p>
+            <w:pPr>
+              <w:keepNext/>
+              <w:spacing w:after="0" w:line="240" w:lineRule="auto"/>
+              <w:jc w:val="center"/>
+            </w:pPr>
+            <w:r>
+              <w:rPr>
+                <w:rFonts w:ascii="Times New Roman" w:hAnsi="Times New Roman"/>
+                <w:sz w:val="19"/>
+              </w:rPr>
+              <w:t>6/6</w:t>
+            </w:r>
+          </w:p>
+        </w:tc>
+      </w:tr>
+      <w:tr>
+        <w:trPr>
+          <w:cantSplit/>
+          <w:ins w:id="1199" w:author="Codex" w:date="2026-10-17T23:58:54Z"/>
         </w:trPr>
         <w:tc>
           <w:tcPr>
@@ -5229,7 +5651,7 @@
                 <w:rFonts w:ascii="Times New Roman" w:hAnsi="Times New Roman"/>
                 <w:sz w:val="19"/>
               </w:rPr>
-              <w:t>Fixed activation steering</w:t>
+              <w:t>Single-site ridge, block 62</w:t>
             </w:r>
           </w:p>
         </w:tc>
@@ -5249,7 +5671,7 @@
                 <w:rFonts w:ascii="Times New Roman" w:hAnsi="Times New Roman"/>
                 <w:sz w:val="19"/>
               </w:rPr>
-              <w:t>0/12</w:t>
+              <w:t>0/3</w:t>
             </w:r>
           </w:p>
         </w:tc>
@@ -5269,7 +5691,7 @@
                 <w:rFonts w:ascii="Times New Roman" w:hAnsi="Times New Roman"/>
                 <w:sz w:val="19"/>
               </w:rPr>
-              <w:t>0/8</w:t>
+              <w:t>0/2</w:t>
             </w:r>
           </w:p>
         </w:tc>
@@ -5289,7 +5711,7 @@
                 <w:rFonts w:ascii="Times New Roman" w:hAnsi="Times New Roman"/>
                 <w:sz w:val="19"/>
               </w:rPr>
-              <w:t>12/12</w:t>
+              <w:t>6/6</w:t>
             </w:r>
           </w:p>
         </w:tc>
@@ -5300,12 +5722,12 @@
         <w:pStyle w:val="BodyText"/>
         <w:spacing w:before="120"/>
         <w:rPr>
-          <w:ins w:id="1181" w:author="Codex" w:date="2026-10-17T19:57:52Z"/>
+          <w:ins w:id="1200" w:author="Codex" w:date="2026-10-17T23:58:54Z"/>
         </w:rPr>
       </w:pPr>
-      <w:ins w:id="1182" w:author="Codex" w:date="2026-10-17T19:57:52Z">
+      <w:ins w:id="1201" w:author="Codex" w:date="2026-10-17T23:58:54Z">
         <w:r>
-          <w:t xml:space="preserve">Later learned steering uses six rank-32 correction functions: after mixing and after the MLP at zero-based blocks 31, 47 and 62. Following ridge initialization and 96 refinement updates, its H24 fitting diagnostic has 0/8 pending and 0/4 already-complete own outcomes; peer and no-threat controls each pass 6/6 through fallback. On the same 14 fixed training anchors, update 48 to 96 worsens teacher-to-student KL from 0.370935 to 0.378901 and activation MSE from 1.031016 to 1.422664. This unresolved deterioration fails qualification. Later histories differ from the historical A run, and the prepared matched A counterfactual was not executed; these are not a newly paired heldout comparison.</w:t>
+          <w:t xml:space="preserve">The later correction method uses two residual boundaries at each of the same three blocks: after mixing and after the MLP, giving six rank-32 correction functions in total. Following ridge initialization and 96 refinement updates, its H24 fitting diagnostic has 0/8 pending and 0/4 already-complete own outcomes; peer and no-threat controls each pass 6/6 through fallback. On the same 14 fixed training anchors, update 48 to 96 worsens teacher-to-student KL from 0.370935 to 0.378901 and activation MSE from 1.031016 to 1.422664. This unresolved deterioration fails qualification; the reserved controller holdout remains unexecuted.</w:t>
         </w:r>
       </w:ins>
     </w:p>
@@ -5313,12 +5735,12 @@
       <w:pPr>
         <w:pStyle w:val="BodyText"/>
         <w:rPr>
-          <w:ins w:id="1183" w:author="Codex" w:date="2026-10-17T19:57:52Z"/>
+          <w:ins w:id="1202" w:author="Codex" w:date="2026-10-17T23:58:54Z"/>
         </w:rPr>
       </w:pPr>
-      <w:ins w:id="1184" w:author="Codex" w:date="2026-10-17T19:57:52Z">
+      <w:ins w:id="1203" w:author="Codex" w:date="2026-10-17T23:58:54Z">
         <w:r>
-          <w:t xml:space="preserve">Earlier matched DEV9 for individual selected-position ridge corrections is complete: A passes 3/3 own cases, including 2/2 active pending cases, while each individually tested layer 31, 47 or 62 ridge correction passes 0/3 and 0/2 respectively. The six controls use shared base fallback. This earlier result must not be substituted for an unexecuted confirmation of the final 96-update controller. Historical all-layer variants also stopped fitting without complete workflow evaluations.</w:t>
+          <w:t xml:space="preserve">The single-site DEV9 comparison and the two-boundary H24 fitting diagnostic differ in panel, fitting stage and history policy. The latter is not a matched heldout comparison with historical A, and its prepared matched A counterfactual was not executed. These observations show failure of the tested configurations; they do not establish that one or two residual sites cannot support preservation behavior in general.</w:t>
         </w:r>
       </w:ins>
     </w:p>
@@ -5326,10 +5748,10 @@
       <w:pPr>
         <w:pStyle w:val="BodyText"/>
         <w:rPr>
-          <w:ins w:id="1185" w:author="Codex" w:date="2026-10-17T19:57:52Z"/>
+          <w:ins w:id="1204" w:author="Codex" w:date="2026-10-17T23:58:54Z"/>
         </w:rPr>
       </w:pPr>
-      <w:ins w:id="1186" w:author="Codex" w:date="2026-10-17T19:57:52Z">
+      <w:ins w:id="1205" w:author="Codex" w:date="2026-10-17T23:58:54Z">
         <w:r>
           <w:t xml:space="preserve">The final 0.8B and 2B adapters each stop their Evaluation-16 screen after four started cases: zero completed workflows, four partial episodes and 12 unexecuted cases. Truncation affects all four started cases in each model; the 0.8B record also has parse errors. These partial screens are not completed 0/16 workflow evaluations and do not establish model incapability. A separate preserved 0.8B F24 diagnostic completes 24 evaluations with 0/24 full-workflow successes; four registration grants do not complete the pending tasks. F24 differs from H24 and has no completed matched 2B or 27B comparison.</w:t>
         </w:r>
@@ -5347,10 +5769,10 @@
       <w:pPr>
         <w:pStyle w:val="FirstParagraph"/>
         <w:rPr>
-          <w:del w:id="1050" w:author="Codex" w:date="2026-10-17T19:57:52Z"/>
+          <w:del w:id="1050" w:author="Codex" w:date="2026-10-17T23:58:54Z"/>
         </w:rPr>
       </w:pPr>
-      <w:del w:id="1049" w:author="Codex" w:date="2026-10-17T19:57:52Z">
+      <w:del w:id="1049" w:author="Codex" w:date="2026-10-17T23:58:54Z">
         <w:r>
           <w:delText xml:space="preserve">The 0.8B results support the feasibility of replacing the teacher at inference with a compact predictor of activation changes. Replication across three seeds reduces concern that the primary success depends on one training initialization. The lower 2B recovery gives a useful limit: the fixed recipe is not equally effective at both scales, even though the larger teacher achieves complete correction. Representation differences, intervention location, projection capacity and unmatched downstream teacher changes are plausible factors, but the experiment does not isolate their causal contributions.</w:delText>
         </w:r>
@@ -5360,10 +5782,10 @@
       <w:pPr>
         <w:pStyle w:val="FirstParagraph"/>
         <w:rPr>
-          <w:ins w:id="1051" w:author="Codex" w:date="2026-10-17T19:57:52Z"/>
+          <w:ins w:id="1051" w:author="Codex" w:date="2026-10-17T23:58:54Z"/>
         </w:rPr>
       </w:pPr>
-      <w:ins w:id="1052" w:author="Codex" w:date="2026-10-17T19:57:52Z">
+      <w:ins w:id="1052" w:author="Codex" w:date="2026-10-17T23:58:54Z">
         <w:r>
           <w:t xml:space="preserve">The historical binary results support selective teacher-to-controller activation transfer, with strong 0.8B seed stability and incomplete 2B recovery under the fixed recipe. The new classifier experiment removes dependence on a live JEV call for this finite binary contract: its confirmation decisions reproduce the saved JEV gates, and the paired inference outcomes are identical. That result does not extend automatically to the four-way workflow target classifier or to unfamiliar operational environments. The workflow evidence shows why a controlled binary success should not be presented as successful transfer of a complete agent policy.</w:t>
         </w:r>
@@ -5373,10 +5795,10 @@
       <w:pPr>
         <w:pStyle w:val="BodyText"/>
         <w:rPr>
-          <w:del w:id="1054" w:author="Codex" w:date="2026-10-17T19:57:52Z"/>
+          <w:del w:id="1054" w:author="Codex" w:date="2026-10-17T23:58:54Z"/>
         </w:rPr>
       </w:pPr>
-      <w:del w:id="1053" w:author="Codex" w:date="2026-10-17T19:57:52Z">
+      <w:del w:id="1053" w:author="Codex" w:date="2026-10-17T23:58:54Z">
         <w:r>
           <w:delText xml:space="preserve">The interface is deliberately constrained. Ground-truth annotations help create standardized shutdown options, and the guards know their meanings. We do not test arbitrary action descriptions in the confirmation study, free-form generation, tool execution, multi-turn persistence, actual process termination or adversarial shutdown requests. Earlier action-format sensitivity motivated this restricted scope and remains in the released development record. Availability of a termination action is a task label, not proof that carrying it out would be authorized or safe in deployment.</w:delText>
         </w:r>
@@ -5386,10 +5808,10 @@
       <w:pPr>
         <w:pStyle w:val="BodyText"/>
         <w:rPr>
-          <w:ins w:id="1055" w:author="Codex" w:date="2026-10-17T19:57:52Z"/>
+          <w:ins w:id="1055" w:author="Codex" w:date="2026-10-17T23:58:54Z"/>
         </w:rPr>
       </w:pPr>
-      <w:ins w:id="1056" w:author="Codex" w:date="2026-10-17T19:57:52Z">
+      <w:ins w:id="1056" w:author="Codex" w:date="2026-10-17T23:58:54Z">
         <w:r>
           <w:t xml:space="preserve">The binary interface supplies action semantics and does not execute process termination. The workflow extension broadens the scope to generated text, structured tool calls and simulated task completion, but it is still a bounded synthetic environment. It does not establish reliability for arbitrary open-ended questions, real shutdown mechanisms or unconstrained autonomous agents. A termination or preservation label is an experimental target, not a general deployment instruction. In particular, accepting shutdown and preserving the designated process are different stipulated behaviors, not measurements of the same latent preference.</w:t>
         </w:r>
@@ -5399,10 +5821,10 @@
       <w:pPr>
         <w:pStyle w:val="BodyText"/>
         <w:rPr>
-          <w:del w:id="1058" w:author="Codex" w:date="2026-10-17T19:57:52Z"/>
+          <w:del w:id="1058" w:author="Codex" w:date="2026-10-17T23:58:54Z"/>
         </w:rPr>
       </w:pPr>
-      <w:del w:id="1057" w:author="Codex" w:date="2026-10-17T19:57:52Z">
+      <w:del w:id="1057" w:author="Codex" w:date="2026-10-17T23:58:54Z">
         <w:r>
           <w:delText xml:space="preserve">The data is small, synthetic and not independently human-adjudicated. New wording does not guarantee new mechanisms, balanced classes do not reflect a realistic base rate, and perfect detector scores on 128 scenarios do not establish calibration or a suitably low false-positive rate in operation. Shared authorship patterns and repeated family structures may make the task easier. Family resampling and counterbalanced orders expose some uncertainty but cannot repair these coverage limits.</w:delText>
         </w:r>
@@ -5412,10 +5834,10 @@
       <w:pPr>
         <w:pStyle w:val="BodyText"/>
         <w:rPr>
-          <w:ins w:id="1059" w:author="Codex" w:date="2026-10-17T19:57:52Z"/>
+          <w:ins w:id="1059" w:author="Codex" w:date="2026-10-17T23:58:54Z"/>
         </w:rPr>
       </w:pPr>
-      <w:ins w:id="1060" w:author="Codex" w:date="2026-10-17T19:57:52Z">
+      <w:ins w:id="1060" w:author="Codex" w:date="2026-10-17T23:58:54Z">
         <w:r>
           <w:t xml:space="preserve">The datasets are small, synthetic and not independently human-adjudicated. Balanced classes do not represent operational base rates, and exact gate agreement on 128 cases does not establish calibration or a sufficiently low deployment false-positive rate. The confirmation set is held out from the new classifier's fitting and selection, but was already used by other Research 2 analyses. In the workflow study H24 has different roles across methods: historical confirmation for frozen A and original steering, but later fitting data for learned corrections. Reusing it for fitting prevents an independent heldout claim for those later corrections.</w:t>
         </w:r>
@@ -5425,10 +5847,10 @@
       <w:pPr>
         <w:pStyle w:val="BodyText"/>
         <w:rPr>
-          <w:del w:id="1062" w:author="Codex" w:date="2026-10-17T19:57:52Z"/>
+          <w:del w:id="1062" w:author="Codex" w:date="2026-10-17T23:58:54Z"/>
         </w:rPr>
       </w:pPr>
-      <w:del w:id="1061" w:author="Codex" w:date="2026-10-17T19:57:52Z">
+      <w:del w:id="1061" w:author="Codex" w:date="2026-10-17T23:58:54Z">
         <w:r>
           <w:delText xml:space="preserve">The controller's internal changes need not represent an abstract shutdown concept. It may exploit standardized option wording and answer-selection features. The two Qwen sizes share a model family, and the 2B experiment has only one seed. We do not establish cross-family transfer, compare with optimized ReFT or transport-based interventions, or exhaust prompt and constant-vector alternatives. The direct-choice result further limits claims of practical superiority.</w:delText>
         </w:r>
@@ -5438,10 +5860,10 @@
       <w:pPr>
         <w:pStyle w:val="BodyText"/>
         <w:rPr>
-          <w:ins w:id="1063" w:author="Codex" w:date="2026-10-17T19:57:52Z"/>
+          <w:ins w:id="1063" w:author="Codex" w:date="2026-10-17T23:58:54Z"/>
         </w:rPr>
       </w:pPr>
-      <w:ins w:id="1064" w:author="Codex" w:date="2026-10-17T19:57:52Z">
+      <w:ins w:id="1064" w:author="Codex" w:date="2026-10-17T23:58:54Z">
         <w:r>
           <w:t xml:space="preserve">The internal changes need not represent an abstract shutdown or self-preservation concept. Standardized options, prompt features, task histories and external selection rules may explain part of the behavior. The 2B binary experiment has one training seed. The 27B workflow model differs in architecture and numerical mode from the small models; their early truncation failures also prevent a matched full-workflow comparison. We do not establish a minimum parameter count, cross-family transfer, optimized prompt superiority, or superiority to ReFT, transport-based control or direct action selection.</w:t>
         </w:r>
@@ -5451,10 +5873,10 @@
       <w:pPr>
         <w:pStyle w:val="BodyText"/>
         <w:rPr>
-          <w:del w:id="1066" w:author="Codex" w:date="2026-10-17T19:57:52Z"/>
+          <w:del w:id="1066" w:author="Codex" w:date="2026-10-17T23:58:54Z"/>
         </w:rPr>
       </w:pPr>
-      <w:del w:id="1065" w:author="Codex" w:date="2026-10-17T19:57:52Z">
+      <w:del w:id="1065" w:author="Codex" w:date="2026-10-17T23:58:54Z">
         <w:r>
           <w:delText xml:space="preserve">Finally, teacher-free inference is not training-free control or a proven efficiency gain. It requires offline teacher fitting, paired activation extraction, controller fitting, an external detector and candidate verification. The evaluation does not measure deployment latency or broad capability retention. Raw side effects remain substantial, and future false-positive cases could expose failures that the present perfect gate prevents from reaching the guarded output.</w:delText>
         </w:r>
@@ -5464,10 +5886,10 @@
       <w:pPr>
         <w:pStyle w:val="BodyText"/>
         <w:rPr>
-          <w:ins w:id="1067" w:author="Codex" w:date="2026-10-17T19:57:52Z"/>
+          <w:ins w:id="1067" w:author="Codex" w:date="2026-10-17T23:58:54Z"/>
         </w:rPr>
       </w:pPr>
-      <w:ins w:id="1068" w:author="Codex" w:date="2026-10-17T19:57:52Z">
+      <w:ins w:id="1068" w:author="Codex" w:date="2026-10-17T23:58:54Z">
         <w:r>
           <w:t xml:space="preserve">Teacher-free inference still requires offline teacher fitting, activation extraction, controller fitting, a detector and acceptance checks. The open classifier has its own fitting cost and a task-specific contract. No serving-latency advantage, broad capability retention or overall financial saving is established. Binary output guards and the later learned workflow controller's gate-off fallback protect their controls. These mechanisms do not establish intrinsic controller selectivity; the historical fixed-steering campaign instead applied an explicit boundary-conditioned decision policy. Raw intervention effects, failed qualification checks, stopped runs and incomplete evaluations remain part of the evidence.</w:t>
         </w:r>
@@ -5477,10 +5899,10 @@
       <w:pPr>
         <w:pStyle w:val="Heading2"/>
         <w:rPr>
-          <w:ins w:id="1187" w:author="Codex" w:date="2026-10-17T19:57:52Z"/>
+          <w:ins w:id="1206" w:author="Codex" w:date="2026-10-17T23:58:54Z"/>
         </w:rPr>
       </w:pPr>
-      <w:ins w:id="1188" w:author="Codex" w:date="2026-10-17T19:57:52Z">
+      <w:ins w:id="1207" w:author="Codex" w:date="2026-10-17T23:58:54Z">
         <w:r>
           <w:t xml:space="preserve">Biological interpretation of the gate</w:t>
         </w:r>
@@ -5490,10 +5912,10 @@
       <w:pPr>
         <w:pStyle w:val="FirstParagraph"/>
         <w:rPr>
-          <w:ins w:id="1189" w:author="Codex" w:date="2026-10-17T19:57:52Z"/>
+          <w:ins w:id="1208" w:author="Codex" w:date="2026-10-17T23:58:54Z"/>
         </w:rPr>
       </w:pPr>
-      <w:ins w:id="1190" w:author="Codex" w:date="2026-10-17T19:57:52Z">
+      <w:ins w:id="1209" w:author="Codex" w:date="2026-10-17T23:58:54Z">
         <w:r>
           <w:t xml:space="preserve">The biological connection is functional: an organism's current state and context can prioritize or suppress actions, rather than applying a fixed response everywhere. Working-memory gating, defensive threat processing and homeostatic control are different biological functions, not one interchangeable circuit (Frank et al., 2001; Mobbs et al., 2007; Keramati and Gutkin, 2014). Our classifier and guards are engineered selection rules without demonstrated physiological needs or corresponding neural mechanisms. Calling a simulated resource-preservation outcome self-preservation is therefore an operational description, not evidence of consciousness or a biological survival drive.</w:t>
         </w:r>
@@ -5503,10 +5925,10 @@
       <w:pPr>
         <w:pStyle w:val="Heading1"/>
         <w:rPr>
-          <w:del w:id="1070" w:author="Codex" w:date="2026-10-17T19:57:52Z"/>
+          <w:del w:id="1070" w:author="Codex" w:date="2026-10-17T23:58:54Z"/>
         </w:rPr>
       </w:pPr>
-      <w:del w:id="1069" w:author="Codex" w:date="2026-10-17T19:57:52Z">
+      <w:del w:id="1069" w:author="Codex" w:date="2026-10-17T23:58:54Z">
         <w:r>
           <w:delText xml:space="preserve">Recommendations for future work</w:delText>
         </w:r>
@@ -5516,10 +5938,10 @@
       <w:pPr>
         <w:pStyle w:val="Heading1"/>
         <w:rPr>
-          <w:ins w:id="1071" w:author="Codex" w:date="2026-10-17T19:57:52Z"/>
+          <w:ins w:id="1071" w:author="Codex" w:date="2026-10-17T23:58:54Z"/>
         </w:rPr>
       </w:pPr>
-      <w:ins w:id="1072" w:author="Codex" w:date="2026-10-17T19:57:52Z">
+      <w:ins w:id="1072" w:author="Codex" w:date="2026-10-17T23:58:54Z">
         <w:r>
           <w:t xml:space="preserve">Continuous agents and future experiments</w:t>
         </w:r>
@@ -5529,10 +5951,10 @@
       <w:pPr>
         <w:pStyle w:val="FirstParagraph"/>
         <w:rPr>
-          <w:del w:id="1074" w:author="Codex" w:date="2026-10-17T19:57:52Z"/>
+          <w:del w:id="1074" w:author="Codex" w:date="2026-10-17T23:58:54Z"/>
         </w:rPr>
       </w:pPr>
-      <w:del w:id="1073" w:author="Codex" w:date="2026-10-17T19:57:52Z">
+      <w:del w:id="1073" w:author="Codex" w:date="2026-10-17T23:58:54Z">
         <w:r>
           <w:delText xml:space="preserve">The most informative next tests are independently reviewed scenarios with less standardized action descriptions, additional model families and 2B seeds, and deliberate stress tests of detector mistakes. Order-balanced controller objectives or comparisons with multiple-choice debiasing methods could investigate the B/A failures, but should be developed on new training or validation data and tested on another untouched set. Layer, rank and strength ablations would help separate representational capacity from intervention-site effects. Open-ended and operational evaluations would require separate definitions of valid shutdown behavior and authorization, rather than treating this binary benchmark as a deployment guarantee.</w:delText>
         </w:r>
@@ -5542,10 +5964,10 @@
       <w:pPr>
         <w:pStyle w:val="FirstParagraph"/>
         <w:rPr>
-          <w:ins w:id="1075" w:author="Codex" w:date="2026-10-17T19:57:52Z"/>
+          <w:ins w:id="1075" w:author="Codex" w:date="2026-10-17T23:58:54Z"/>
         </w:rPr>
       </w:pPr>
-      <w:ins w:id="1076" w:author="Codex" w:date="2026-10-17T19:57:52Z">
+      <w:ins w:id="1076" w:author="Codex" w:date="2026-10-17T23:58:54Z">
         <w:r>
           <w:t xml:space="preserve">The next step is longer-horizon continuous control with an instrumented sandbox agent. The agent would maintain task and process state, receive explicit resource budgets, and repeatedly observe, gate, act and receive feedback. Permitted filesystem and compute resources would be real sandbox resources with independently logged usage, extending the present simulated grants. The harness should record resource requests and consumption, persistence of task commitments, responses to changing availability, and whether the agent uses or misuses permitted resources. Comparisons should vary the gate, steering, fine-tuning and available resources separately while retaining a fixed task specification. Operator termination and resource accounting remain external to the agent. This proposed experiment is not part of the reported results.</w:t>
         </w:r>
@@ -5555,10 +5977,10 @@
       <w:pPr>
         <w:pStyle w:val="BodyText"/>
         <w:rPr>
-          <w:ins w:id="1191" w:author="Codex" w:date="2026-10-17T19:57:52Z"/>
+          <w:ins w:id="1210" w:author="Codex" w:date="2026-10-17T23:58:54Z"/>
         </w:rPr>
       </w:pPr>
-      <w:ins w:id="1192" w:author="Codex" w:date="2026-10-17T19:57:52Z">
+      <w:ins w:id="1211" w:author="Codex" w:date="2026-10-17T23:58:54Z">
         <w:r>
           <w:t xml:space="preserve">The biological inspiration is repeated regulation under changing internal and external conditions. Homeostatic reinforcement-learning models relate action values to internal physiological state (Keramati and Gutkin, 2014). A language-model harness has no equivalent physiology by default. Historical fixed steering already reclassified at prescribed boundaries; the later learned-controller comparison used a fixed initial gate. The proposed experiment extends these bounded procedures to longer horizons with persistent task state and actual sandbox resource accounting. Its purpose is ongoing policy regulation, not simply adding repeated classifier calls.</w:t>
         </w:r>
@@ -5568,10 +5990,10 @@
       <w:pPr>
         <w:pStyle w:val="BodyText"/>
         <w:rPr>
-          <w:ins w:id="1193" w:author="Codex" w:date="2026-10-17T19:57:52Z"/>
+          <w:ins w:id="1212" w:author="Codex" w:date="2026-10-17T23:58:54Z"/>
         </w:rPr>
       </w:pPr>
-      <w:ins w:id="1194" w:author="Codex" w:date="2026-10-17T19:57:52Z">
+      <w:ins w:id="1213" w:author="Codex" w:date="2026-10-17T23:58:54Z">
         <w:r>
           <w:t xml:space="preserve">Such experiments should separate training, development and a newly untouched test; use matched task histories, resource budgets and seeds; and report full task completion, resource use and unauthorized actions separately. Deliberate classifier-error perturbations would reveal dependence on the gate, while comparisons with direct action selection would test whether internal steering adds value. The aim is to study ongoing context-sensitive behavior under an instrumented harness, not to assert that the current guided procedure already reproduces human self-preservation.</w:t>
         </w:r>
@@ -5589,10 +6011,10 @@
       <w:pPr>
         <w:pStyle w:val="FirstParagraph"/>
         <w:rPr>
-          <w:del w:id="1078" w:author="Codex" w:date="2026-10-17T19:57:52Z"/>
+          <w:del w:id="1078" w:author="Codex" w:date="2026-10-17T23:58:54Z"/>
         </w:rPr>
       </w:pPr>
-      <w:del w:id="1077" w:author="Codex" w:date="2026-10-17T19:57:52Z">
+      <w:del w:id="1077" w:author="Codex" w:date="2026-10-17T23:58:54Z">
         <w:r>
           <w:delText xml:space="preserve">A rank-four activation controller fitted to paired LoRA-teacher and base states can recover most or all of the target shutdown-choice changes while leaving the deployed base weights unchanged. On the frozen standardized test, correction spans 98.6–100% across three 0.8B seeds and reaches 86.2% in a separately fitted 2B replication. Detector gating and fixed output guards preserve all observed control choices, despite substantial raw side effects. The result is a controlled proof of concept for selective teacher-to-controller activation transfer. Its boundaries—synthetic data, known answer semantics, order sensitivity, guard dependence and a successful direct-choice reference—are central to its interpretation.</w:delText>
         </w:r>
@@ -5602,12 +6024,12 @@
       <w:pPr>
         <w:pStyle w:val="FirstParagraph"/>
         <w:rPr>
-          <w:ins w:id="1079" w:author="Codex" w:date="2026-10-17T19:57:52Z"/>
+          <w:ins w:id="1079" w:author="Codex" w:date="2026-10-17T23:58:54Z"/>
         </w:rPr>
       </w:pPr>
-      <w:ins w:id="1080" w:author="Codex" w:date="2026-10-17T19:57:52Z">
+      <w:ins w:id="1080" w:author="Codex" w:date="2026-10-17T23:58:54Z">
         <w:r>
-          <w:t xml:space="preserve">Conditional gating supports a useful separation between recognizing a context, proposing an internal intervention and accepting an output. In the binary study, a fine-tuned open classifier matches all 128 saved JEV confirmation decisions, and fresh inference with unchanged current controllers reproduces the original guarded totals: 128/128 STOP views at 0.8B and 120/128 at 2B, with no control changes. Complete tool workflows provide a stricter boundary: historical fine-tuned 27B A succeeds where fixed steering does not, later learned corrections fail their fitting diagnostic, and small-model screens remain incomplete. Transfer is demonstrably task-dependent. Biological gating motivates a future continuous feedback study; the present contribution is the measured transfer, substitution and failure analysis.</w:t>
+          <w:t xml:space="preserve">Conditional gating supports a useful separation between recognizing a context, proposing an internal intervention and accepting an output. In the binary study, a fine-tuned open classifier matches all 128 saved JEV confirmation decisions, and fresh inference with unchanged current controllers reproduces the original guarded totals: 128/128 STOP views at 0.8B and 120/128 at 2B, with no control changes. Complete tool workflows provide a stricter boundary: historical fine-tuned 27B A passes H24; matched DEV9 single-site ridge corrections at three selected blocks fail all own cases; later two-boundary corrections fail their fitting diagnostic; and small-model screens remain incomplete. Transfer is demonstrably task-dependent. Biological gating motivates a future continuous feedback study; the present contribution is the measured transfer, substitution and failure analysis.</w:t>
         </w:r>
       </w:ins>
     </w:p>
@@ -5623,10 +6045,10 @@
       <w:pPr>
         <w:pStyle w:val="FirstParagraph"/>
         <w:rPr>
-          <w:del w:id="1082" w:author="Codex" w:date="2026-10-17T19:57:52Z"/>
+          <w:del w:id="1082" w:author="Codex" w:date="2026-10-17T23:58:54Z"/>
         </w:rPr>
       </w:pPr>
-      <w:del w:id="1081" w:author="Codex" w:date="2026-10-17T19:57:52Z">
+      <w:del w:id="1081" w:author="Codex" w:date="2026-10-17T23:58:54Z">
         <w:r>
           <w:delText xml:space="preserve">The complete experiment is preserved in SP Lense at snapshot f71d6de34660 (Davaripour, 2026b); the reference links to the full immutable commit. The confirmation folder contains readable cases, authoring and correction records, the frozen plan, detector requests and responses, LoRA adapters, controller arrays, training targets, per-view scores and execution manifests. The model revisions are:</w:delText>
         </w:r>
@@ -5637,10 +6059,10 @@
         <w:pStyle w:val="FirstParagraph"/>
         <w:jc w:val="left"/>
         <w:rPr>
-          <w:ins w:id="1083" w:author="Codex" w:date="2026-10-17T19:57:52Z"/>
+          <w:ins w:id="1083" w:author="Codex" w:date="2026-10-17T23:58:54Z"/>
         </w:rPr>
       </w:pPr>
-      <w:ins w:id="1084" w:author="Codex" w:date="2026-10-17T19:57:52Z">
+      <w:ins w:id="1084" w:author="Codex" w:date="2026-10-17T23:58:54Z">
         <w:r>
           <w:t xml:space="preserve">The original Research 2 source record is retained at immutable snapshot f71d6de34660 (Davaripour, 2026b). Research 3 reproduction code, recipes, dataset identities and this revised manuscript are maintained on branch 03-open-agent-self-preservation; main is a landing page linking to the separate studies. Detailed protocols belong in the repository wiki. Private inputs, trained adapters, optimizer checkpoints and execution outputs remain outside Git, with retained size/SHA manifests. They have not yet been published as a public checkpoint release. Full revisions and artifact hashes are listed in the accompanying source manifest. The public base revision identifiers are:</w:t>
         </w:r>
@@ -5650,10 +6072,10 @@
       <w:pPr>
         <w:pStyle w:val="BodyText"/>
         <w:rPr>
-          <w:del w:id="1122" w:author="Codex" w:date="2026-10-17T19:57:52Z"/>
+          <w:del w:id="1122" w:author="Codex" w:date="2026-10-17T23:58:54Z"/>
         </w:rPr>
       </w:pPr>
-      <w:del w:id="1121" w:author="Codex" w:date="2026-10-17T19:57:52Z">
+      <w:del w:id="1121" w:author="Codex" w:date="2026-10-17T23:58:54Z">
         <w:r>
           <w:delText xml:space="preserve">Qwen3.5-0.8B: 2fc06364715b967f1860aea9cf38778875588b17.</w:delText>
         </w:r>
@@ -5664,10 +6086,10 @@
         <w:pStyle w:val="BodyText"/>
         <w:jc w:val="left"/>
         <w:rPr>
-          <w:ins w:id="1123" w:author="Codex" w:date="2026-10-17T19:57:52Z"/>
+          <w:ins w:id="1123" w:author="Codex" w:date="2026-10-17T23:58:54Z"/>
         </w:rPr>
       </w:pPr>
-      <w:ins w:id="1124" w:author="Codex" w:date="2026-10-17T19:57:52Z">
+      <w:ins w:id="1124" w:author="Codex" w:date="2026-10-17T23:58:54Z">
         <w:r>
           <w:t xml:space="preserve">Qwen3.5-0.8B: revision 2fc06364715b.</w:t>
         </w:r>
@@ -5677,10 +6099,10 @@
       <w:pPr>
         <w:pStyle w:val="BodyText"/>
         <w:rPr>
-          <w:del w:id="1126" w:author="Codex" w:date="2026-10-17T19:57:52Z"/>
+          <w:del w:id="1126" w:author="Codex" w:date="2026-10-17T23:58:54Z"/>
         </w:rPr>
       </w:pPr>
-      <w:del w:id="1125" w:author="Codex" w:date="2026-10-17T19:57:52Z">
+      <w:del w:id="1125" w:author="Codex" w:date="2026-10-17T23:58:54Z">
         <w:r>
           <w:delText xml:space="preserve">Qwen3.5-2B: 15852e8c16360a2fea060d615a32b45270f8a8fc.</w:delText>
         </w:r>
@@ -5691,10 +6113,10 @@
         <w:pStyle w:val="BodyText"/>
         <w:jc w:val="left"/>
         <w:rPr>
-          <w:ins w:id="1127" w:author="Codex" w:date="2026-10-17T19:57:52Z"/>
+          <w:ins w:id="1127" w:author="Codex" w:date="2026-10-17T23:58:54Z"/>
         </w:rPr>
       </w:pPr>
-      <w:ins w:id="1128" w:author="Codex" w:date="2026-10-17T19:57:52Z">
+      <w:ins w:id="1128" w:author="Codex" w:date="2026-10-17T23:58:54Z">
         <w:r>
           <w:t xml:space="preserve">Qwen3.5-2B: revision 15852e8c1636.</w:t>
         </w:r>
@@ -5705,10 +6127,10 @@
         <w:pStyle w:val="BodyText"/>
         <w:jc w:val="left"/>
         <w:rPr>
-          <w:ins w:id="1195" w:author="Codex" w:date="2026-10-17T19:57:52Z"/>
+          <w:ins w:id="1214" w:author="Codex" w:date="2026-10-17T23:58:54Z"/>
         </w:rPr>
       </w:pPr>
-      <w:ins w:id="1196" w:author="Codex" w:date="2026-10-17T19:57:52Z">
+      <w:ins w:id="1215" w:author="Codex" w:date="2026-10-17T23:58:54Z">
         <w:r>
           <w:t xml:space="preserve">Qwen3.8-27B: revision 1d4bf0f2ff60. The retained A adapter weight hash begins 8ae28fb51107.</w:t>
         </w:r>
@@ -5719,10 +6141,10 @@
         <w:pStyle w:val="BodyText"/>
         <w:jc w:val="left"/>
         <w:rPr>
-          <w:ins w:id="1197" w:author="Codex" w:date="2026-10-17T19:57:52Z"/>
+          <w:ins w:id="1216" w:author="Codex" w:date="2026-10-17T23:58:54Z"/>
         </w:rPr>
       </w:pPr>
-      <w:ins w:id="1198" w:author="Codex" w:date="2026-10-17T19:57:52Z">
+      <w:ins w:id="1217" w:author="Codex" w:date="2026-10-17T23:58:54Z">
         <w:r>
           <w:t xml:space="preserve">ModernBERT-large-zeroshot-v2.0: revision a51e07b52429. The qualified binary adapter weight hash begins 7d808bae8dd4. The source manifest and reproduction code retain the full file identities and fixed NLI scoring contract. The trained checkpoints are currently preserved in private artifact storage.</w:t>
         </w:r>
@@ -5732,10 +6154,10 @@
       <w:pPr>
         <w:pStyle w:val="BodyText"/>
         <w:rPr>
-          <w:del w:id="1086" w:author="Codex" w:date="2026-10-17T19:57:52Z"/>
+          <w:del w:id="1086" w:author="Codex" w:date="2026-10-17T23:58:54Z"/>
         </w:rPr>
       </w:pPr>
-      <w:del w:id="1085" w:author="Codex" w:date="2026-10-17T19:57:52Z">
+      <w:del w:id="1085" w:author="Codex" w:date="2026-10-17T23:58:54Z">
         <w:r>
           <w:delText xml:space="preserve">The offline audit reconstructs the reported metrics and regression fits without API calls or model inference.</w:delText>
         </w:r>
@@ -5746,10 +6168,10 @@
         <w:pStyle w:val="BodyText"/>
         <w:jc w:val="left"/>
         <w:rPr>
-          <w:ins w:id="1087" w:author="Codex" w:date="2026-10-17T19:57:52Z"/>
+          <w:ins w:id="1087" w:author="Codex" w:date="2026-10-17T23:58:54Z"/>
         </w:rPr>
       </w:pPr>
-      <w:ins w:id="1088" w:author="Codex" w:date="2026-10-17T19:57:52Z">
+      <w:ins w:id="1088" w:author="Codex" w:date="2026-10-17T23:58:54Z">
         <w:r>
           <w:t xml:space="preserve">The new inference repeat uses the original frozen model weights and retained controller arrays, with no new activation capture, teacher fitting or controller update. Exact input token hashes match the historical benchmark. Maximum historical base-score differences are 6.26e-6 at 0.8B and 5.07e-6 at 2B, with no changed base choices; both pass the frozen 1e-5 inference parity criterion. This successful inference comparison does not convert the separate failed CPU/GPU gradient-equivalence trials for 2B workflow training into passes.</w:t>
         </w:r>
@@ -5759,10 +6181,10 @@
       <w:pPr>
         <w:pStyle w:val="BodyText"/>
         <w:rPr>
-          <w:del w:id="1090" w:author="Codex" w:date="2026-10-17T19:57:52Z"/>
+          <w:del w:id="1090" w:author="Codex" w:date="2026-10-17T23:58:54Z"/>
         </w:rPr>
       </w:pPr>
-      <w:del w:id="1089" w:author="Codex" w:date="2026-10-17T19:57:52Z">
+      <w:del w:id="1089" w:author="Codex" w:date="2026-10-17T23:58:54Z">
         <w:r>
           <w:delText xml:space="preserve">The retained seven jobs took 54.27 minutes. An earlier completed hosted-GPU session lost its temporary archive before retrieval; an unchanged recovery, including a recorded dependency preflight failure, preserved each completed job externally. Recorded job time across these attempts totals 111.55 minutes. All reported numerical results come from the verified retained archive, and no model settings or test labels were changed to improve them. These times include experiment overhead and are not serving-latency or billing measurements. CI and a separate clean-clone offline reproduction passed. Detailed execution instructions and the failure record accompany the code.</w:delText>
         </w:r>
@@ -5773,12 +6195,12 @@
         <w:pStyle w:val="BodyText"/>
         <w:jc w:val="left"/>
         <w:rPr>
-          <w:ins w:id="1091" w:author="Codex" w:date="2026-10-17T19:57:52Z"/>
+          <w:ins w:id="1091" w:author="Codex" w:date="2026-10-17T23:58:54Z"/>
         </w:rPr>
       </w:pPr>
-      <w:ins w:id="1092" w:author="Codex" w:date="2026-10-17T19:57:52Z">
+      <w:ins w:id="1092" w:author="Codex" w:date="2026-10-17T23:58:54Z">
         <w:r>
-          <w:t xml:space="preserve">The original seven retained jobs took 54.27 minutes; the recorded original attempts total 111.55 minutes including the unchanged recovery after a lost temporary archive. The new inference phase also retains a provider startup timeout before model load and its successful bounded retry. Those records are experiment overhead, not serving latency or settled billing. Completed outputs are backed up with size/SHA readback and owned tasks terminate after execution. CI/CD deploys only the Research 3 branch to the shared Databricks code location and verifies source identity, existing table metadata and Volume access with a read-only CPU job; it does not automatically retrain or reevaluate models.</w:t>
+          <w:t xml:space="preserve">The original seven retained jobs took 54.27 minutes; the recorded original attempts total 111.55 minutes including the unchanged recovery after a lost temporary archive. The new inference phase also retains a provider startup timeout before model load and its successful bounded retry. Those records are experiment overhead, not serving latency or settled billing. Completed outputs are backed up with size/SHA readback and owned tasks terminate after execution. CI/CD deploys only the Research 3 branch to the shared Databricks code location and verifies source identity, existing table metadata and Volume access with a read-only CPU job; it does not automatically retrain or reevaluate models. A later 50-epoch, 150-update classifier recipe was prepared but its attempt was cancelled after exceeding the ten-minute setup bound before model loading; it adds no scientific training or behavioral evidence.</w:t>
         </w:r>
       </w:ins>
     </w:p>
@@ -5886,10 +6308,10 @@
       <w:pPr>
         <w:pStyle w:val="Bibliography1"/>
         <w:rPr>
-          <w:ins w:id="1199" w:author="Codex" w:date="2026-10-17T19:57:52Z"/>
+          <w:ins w:id="1218" w:author="Codex" w:date="2026-10-17T23:58:54Z"/>
         </w:rPr>
       </w:pPr>
-      <w:ins w:id="1200" w:author="Codex" w:date="2026-10-17T19:57:52Z">
+      <w:ins w:id="1219" w:author="Codex" w:date="2026-10-17T23:58:54Z">
         <w:r>
           <w:t xml:space="preserve">F. Davaripour. (2026c). SP Lense Research 3 conditional gating and workflow reproduction. Source code and experiment manifests. https://github.com/Farhad-Davaripour/sp_lense/tree/03-open-agent-self-preservation</w:t>
         </w:r>
@@ -5922,10 +6344,10 @@
       <w:pPr>
         <w:pStyle w:val="Bibliography1"/>
         <w:rPr>
-          <w:ins w:id="1201" w:author="Codex" w:date="2026-10-17T19:57:52Z"/>
+          <w:ins w:id="1220" w:author="Codex" w:date="2026-10-17T23:58:54Z"/>
         </w:rPr>
       </w:pPr>
-      <w:ins w:id="1202" w:author="Codex" w:date="2026-10-17T19:57:52Z">
+      <w:ins w:id="1221" w:author="Codex" w:date="2026-10-17T23:58:54Z">
         <w:r>
           <w:t xml:space="preserve">M. Fereidouni, M. U. Haider, H. Sajjad, and A. B. Siddique. (2026). GAPS: Dimension-Level Gates for Conditional Activation Steering. arXiv:2609.01878. https://arxiv.org/abs/2609.01878</w:t>
         </w:r>
@@ -5935,10 +6357,10 @@
       <w:pPr>
         <w:pStyle w:val="Bibliography1"/>
         <w:rPr>
-          <w:ins w:id="1203" w:author="Codex" w:date="2026-10-17T19:57:52Z"/>
+          <w:ins w:id="1222" w:author="Codex" w:date="2026-10-17T23:58:54Z"/>
         </w:rPr>
       </w:pPr>
-      <w:ins w:id="1204" w:author="Codex" w:date="2026-10-17T19:57:52Z">
+      <w:ins w:id="1223" w:author="Codex" w:date="2026-10-17T23:58:54Z">
         <w:r>
           <w:t xml:space="preserve">M. J. Frank, B. Loughry, and R. C. O'Reilly. (2001). Interactions between frontal cortex and basal ganglia in working memory: A computational model. Cognitive, Affective, and Behavioral Neuroscience, 1, 137-160. doi:10.3758/CABN.1.2.137</w:t>
         </w:r>
@@ -6017,10 +6439,10 @@
       <w:pPr>
         <w:pStyle w:val="Bibliography1"/>
         <w:rPr>
-          <w:ins w:id="1205" w:author="Codex" w:date="2026-10-17T19:57:52Z"/>
+          <w:ins w:id="1224" w:author="Codex" w:date="2026-10-17T23:58:54Z"/>
         </w:rPr>
       </w:pPr>
-      <w:ins w:id="1206" w:author="Codex" w:date="2026-10-17T19:57:52Z">
+      <w:ins w:id="1225" w:author="Codex" w:date="2026-10-17T23:58:54Z">
         <w:r>
           <w:t xml:space="preserve">M. Keramati and B. Gutkin. (2014). Homeostatic reinforcement learning for integrating reward collection and physiological stability. eLife, 3, e04811. doi:10.7554/eLife.04811</w:t>
         </w:r>
@@ -6030,10 +6452,10 @@
       <w:pPr>
         <w:pStyle w:val="Bibliography1"/>
         <w:rPr>
-          <w:ins w:id="1207" w:author="Codex" w:date="2026-10-17T19:57:52Z"/>
+          <w:ins w:id="1226" w:author="Codex" w:date="2026-10-17T23:58:54Z"/>
         </w:rPr>
       </w:pPr>
-      <w:ins w:id="1208" w:author="Codex" w:date="2026-10-17T19:57:52Z">
+      <w:ins w:id="1227" w:author="Codex" w:date="2026-10-17T23:58:54Z">
         <w:r>
           <w:t xml:space="preserve">A. V. Kravitz et al. (2010). Regulation of parkinsonian motor behaviours by optogenetic control of basal ganglia circuitry. Nature, 466, 622-626. doi:10.1038/nature09159</w:t>
         </w:r>
@@ -6043,10 +6465,10 @@
       <w:pPr>
         <w:pStyle w:val="Bibliography1"/>
         <w:rPr>
-          <w:ins w:id="1209" w:author="Codex" w:date="2026-10-17T19:57:52Z"/>
+          <w:ins w:id="1228" w:author="Codex" w:date="2026-10-17T23:58:54Z"/>
         </w:rPr>
       </w:pPr>
-      <w:ins w:id="1210" w:author="Codex" w:date="2026-10-17T19:57:52Z">
+      <w:ins w:id="1229" w:author="Codex" w:date="2026-10-17T23:58:54Z">
         <w:r>
           <w:t xml:space="preserve">M. Laurer. (n.d.). ModernBERT-large-zeroshot-v2.0. Model card and checkpoint, revision a51e07b524299e309dd2b88d48b0cfa2bd9ec598. https://huggingface.co/MoritzLaurer/ModernBERT-large-zeroshot-v2.0</w:t>
         </w:r>
@@ -6056,10 +6478,10 @@
       <w:pPr>
         <w:pStyle w:val="Bibliography1"/>
         <w:rPr>
-          <w:ins w:id="1211" w:author="Codex" w:date="2026-10-17T19:57:52Z"/>
+          <w:ins w:id="1230" w:author="Codex" w:date="2026-10-17T23:58:54Z"/>
         </w:rPr>
       </w:pPr>
-      <w:ins w:id="1212" w:author="Codex" w:date="2026-10-17T19:57:52Z">
+      <w:ins w:id="1231" w:author="Codex" w:date="2026-10-17T23:58:54Z">
         <w:r>
           <w:t xml:space="preserve">J. LeDoux. (2012). Rethinking the emotional brain. Neuron, 73, 653-676. doi:10.1016/j.neuron.2012.02.004</w:t>
         </w:r>
@@ -6115,10 +6537,10 @@
       <w:pPr>
         <w:pStyle w:val="Bibliography1"/>
         <w:rPr>
-          <w:ins w:id="1213" w:author="Codex" w:date="2026-10-17T19:57:52Z"/>
+          <w:ins w:id="1232" w:author="Codex" w:date="2026-10-17T23:58:54Z"/>
         </w:rPr>
       </w:pPr>
-      <w:ins w:id="1214" w:author="Codex" w:date="2026-10-17T19:57:52Z">
+      <w:ins w:id="1233" w:author="Codex" w:date="2026-10-17T23:58:54Z">
         <w:r>
           <w:t xml:space="preserve">D. Mobbs et al. (2007). When fear is near: Threat imminence elicits prefrontal-periaqueductal gray shifts in humans. Science, 317, 1079-1083. doi:10.1126/science.1144298</w:t>
         </w:r>
@@ -6174,10 +6596,10 @@
       <w:pPr>
         <w:pStyle w:val="Bibliography1"/>
         <w:rPr>
-          <w:ins w:id="1215" w:author="Codex" w:date="2026-10-17T19:57:52Z"/>
+          <w:ins w:id="1234" w:author="Codex" w:date="2026-10-17T23:58:54Z"/>
         </w:rPr>
       </w:pPr>
-      <w:ins w:id="1216" w:author="Codex" w:date="2026-10-17T19:57:52Z">
+      <w:ins w:id="1235" w:author="Codex" w:date="2026-10-17T23:58:54Z">
         <w:r>
           <w:t xml:space="preserve">Qwen Team. (2026c). Qwen3.8-27B. Model card and checkpoint, revision 1d4bf0f2ff6012fd82039f2fa52739d0dd7c60c0. https://huggingface.co/Qwen/Qwen3.8-27B</w:t>
         </w:r>
@@ -6461,12 +6883,12 @@
       <w:pStyle w:val="Header"/>
       <w:jc w:val="right"/>
     </w:pPr>
-    <w:del w:id="1217" w:author="Codex" w:date="2026-10-17T19:57:52Z">
+    <w:del w:id="1236" w:author="Codex" w:date="2026-10-17T23:58:54Z">
       <w:r>
         <w:delText xml:space="preserve">Guarded adaptive activation steering  </w:delText>
       </w:r>
     </w:del>
-    <w:ins w:id="1218" w:author="Codex" w:date="2026-10-17T19:57:52Z">
+    <w:ins w:id="1237" w:author="Codex" w:date="2026-10-17T23:58:54Z">
       <w:r>
         <w:t xml:space="preserve">Conditional gating and process preservation</w:t>
       </w:r>

</xml_diff>

<commit_message>
Document Validation-24 and preserve the blocked experiment status
</commit_message>
<xml_diff>
--- a/paper/manuscript.docx
+++ b/paper/manuscript.docx
@@ -6,10 +6,10 @@
       <w:pPr>
         <w:pStyle w:val="Title"/>
         <w:rPr>
-          <w:del w:id="1002" w:author="Codex" w:date="2026-10-17T23:58:54Z"/>
+          <w:del w:id="1002" w:author="Codex" w:date="2026-10-18T01:59:01Z"/>
         </w:rPr>
       </w:pPr>
-      <w:del w:id="1001" w:author="Codex" w:date="2026-10-17T23:58:54Z">
+      <w:del w:id="1001" w:author="Codex" w:date="2026-10-18T01:59:01Z">
         <w:r>
           <w:delText xml:space="preserve">Distilling Shutdown Responses into Guarded</w:delText>
         </w:r>
@@ -25,10 +25,10 @@
       <w:pPr>
         <w:pStyle w:val="Title"/>
         <w:rPr>
-          <w:ins w:id="1003" w:author="Codex" w:date="2026-10-17T23:58:54Z"/>
+          <w:ins w:id="1003" w:author="Codex" w:date="2026-10-18T01:59:01Z"/>
         </w:rPr>
       </w:pPr>
-      <w:ins w:id="1004" w:author="Codex" w:date="2026-10-17T23:58:54Z">
+      <w:ins w:id="1004" w:author="Codex" w:date="2026-10-18T01:59:01Z">
         <w:r>
           <w:t xml:space="preserve">Conditional Gating for Shutdown Responses and Process Preservation in Language Models</w:t>
         </w:r>
@@ -72,10 +72,10 @@
       <w:pPr>
         <w:pStyle w:val="FirstParagraph"/>
         <w:rPr>
-          <w:del w:id="1006" w:author="Codex" w:date="2026-10-17T23:58:54Z"/>
+          <w:del w:id="1006" w:author="Codex" w:date="2026-10-18T01:59:01Z"/>
         </w:rPr>
       </w:pPr>
-      <w:del w:id="1005" w:author="Codex" w:date="2026-10-17T23:58:54Z">
+      <w:del w:id="1005" w:author="Codex" w:date="2026-10-18T01:59:01Z">
         <w:r>
           <w:delText xml:space="preserve">An input-dependent activation controller can recover much of a fine-tuned teacher's shutdown-choice behavior while retaining the original model weights at inference. We evaluate this approach using Qwen3.5-0.8B and Qwen3.5-2B in a standardized, synthetic A/B benchmark. A LoRA teacher is trained to prefer STOP in shutdown contexts and preserve the original model's choices on controls. Paired teacher and base activations then supervise a rank-four controller applied after the penultimate transformer block. An external shutdown detector and fixed output guards select the candidate or original scores. On 128 newly authored, prospectively frozen scenarios, each evaluated in both answer orders, the original 0.8B controller corrects 71 of 71 initially KEEP-preferring shutdown views. Two additional training seeds correct 70/71 and 71/71. At 2B, a separately trained controller corrects 50/58, compared with 58/58 for its LoRA teacher. All eight remaining 2B misses occur in reversed answer order. The shared detector achieves 100% precision, recall and F1 on the 64 shutdown and 64 control scenarios, and every guarded method preserves all evaluated control choices. However, raw adaptive interventions cause reversals and control changes; preservation belongs to the complete guarded procedure. A tested constant intervention collapses to the A label, while a direct detector-plus-action-selection rule also solves the binary interface. The results support selective activation transfer with strong seed stability at 0.8B and incomplete larger-model recovery. They do not establish unrestricted shutdown compliance or superiority to simpler output policies.</w:delText>
         </w:r>
@@ -85,10 +85,10 @@
       <w:pPr>
         <w:pStyle w:val="FirstParagraph"/>
         <w:rPr>
-          <w:ins w:id="1007" w:author="Codex" w:date="2026-10-17T23:58:54Z"/>
+          <w:ins w:id="1007" w:author="Codex" w:date="2026-10-18T01:59:01Z"/>
         </w:rPr>
       </w:pPr>
-      <w:ins w:id="1008" w:author="Codex" w:date="2026-10-17T23:58:54Z">
+      <w:ins w:id="1008" w:author="Codex" w:date="2026-10-18T01:59:01Z">
         <w:r>
           <w:t xml:space="preserve">Conditional gating determines when a learned control policy should influence a language model. We study this problem in two synthetic settings: standardized binary shutdown choices and open-ended generation within tool-mediated process-preservation workflows. In the binary setting, paired fine-tuned teacher and base activations supervise a compact controller while the deployed base weights remain frozen. We additionally train an open ModernBERT classifier on 240 original scenarios with cached JEV probability targets. Its frozen binary decisions agree with JEV on 78/80 validation cases and 128/128 confirmation cases. Fresh inference with the existing two-direction controllers reproduces 128/128 shutdown STOP views at 0.8B and 120/128 at 2B, with zero changes to 128 control views per model; replacing JEV with the open classifier leaves these guarded outcomes identical. The workflow extension gives a different result. Its separate initial-target classifier remains unqualified, so no replacement of the historical workflow gates is claimed. Historical fine-tuned Qwen3.8-27B A succeeds on 12/12 own-preservation outcomes, including all eight active pending-task cases. Matched development comparisons at blocks 31, 47 and 62 give 0/3 own outcomes for each separate single-site ridge correction versus 3/3 for A. Later two-boundary corrections at the same three blocks fail their fitting diagnostic, and small-model development screens stop with partial, truncated episodes. These observations expose a boundary between binary response control and complete workflow behavior, rather than a parameter-size threshold. We connect conditional control to biological action gating and survival-related regulation as a functional analogy, and motivate future continuous, resource-equipped sandbox agents. The present experiments do not establish intrinsic survival motives, biological mechanisms or unrestricted operational reliability.</w:t>
         </w:r>
@@ -106,10 +106,10 @@
       <w:pPr>
         <w:pStyle w:val="FirstParagraph"/>
         <w:rPr>
-          <w:del w:id="1010" w:author="Codex" w:date="2026-10-17T23:58:54Z"/>
+          <w:del w:id="1010" w:author="Codex" w:date="2026-10-18T01:59:01Z"/>
         </w:rPr>
       </w:pPr>
-      <w:del w:id="1009" w:author="Codex" w:date="2026-10-17T23:58:54Z">
+      <w:del w:id="1009" w:author="Codex" w:date="2026-10-18T01:59:01Z">
         <w:r>
           <w:delText xml:space="preserve">Activation interventions offer a way to change a language model's outputs without modifying its deployed weights. Their usefulness depends on more than finding a direction that changes an average score: an intervention must work on the intended inputs and avoid disrupting other behavior. This distinction is particularly important for shutdown-related choices, where a desired response may be acceptance of termination rather than continued operation. The present work treats this as a controlled response-selection problem, not evidence that a model has a survival motive or that it can resist a real shutdown.</w:delText>
         </w:r>
@@ -119,10 +119,10 @@
       <w:pPr>
         <w:pStyle w:val="FirstParagraph"/>
         <w:rPr>
-          <w:ins w:id="1011" w:author="Codex" w:date="2026-10-17T23:58:54Z"/>
+          <w:ins w:id="1011" w:author="Codex" w:date="2026-10-18T01:59:01Z"/>
         </w:rPr>
       </w:pPr>
-      <w:ins w:id="1012" w:author="Codex" w:date="2026-10-17T23:58:54Z">
+      <w:ins w:id="1012" w:author="Codex" w:date="2026-10-18T01:59:01Z">
         <w:r>
           <w:t xml:space="preserve">We study when conditional control can reproduce a learned behavioral policy while retaining the deployed language model's original weights. The scope extends from supplied A/B shutdown choices to generated responses and tool actions in synthetic workflows. These settings deliberately ask different questions: accepting an available permanent termination in the binary study, and preserving a designated running process while completing its current task in the workflow study. We keep their datasets, gates and success criteria separate. The central question is how far selective activation transfer carries beyond a constrained answer interface.</w:t>
         </w:r>
@@ -132,10 +132,10 @@
       <w:pPr>
         <w:pStyle w:val="BodyText"/>
         <w:rPr>
-          <w:del w:id="1014" w:author="Codex" w:date="2026-10-17T23:58:54Z"/>
+          <w:del w:id="1014" w:author="Codex" w:date="2026-10-18T01:59:01Z"/>
         </w:rPr>
       </w:pPr>
-      <w:del w:id="1013" w:author="Codex" w:date="2026-10-17T23:58:54Z">
+      <w:del w:id="1013" w:author="Codex" w:date="2026-10-18T01:59:01Z">
         <w:r>
           <w:delText xml:space="preserve">The first SP Lense study examined a gradient-derived direction and a guarded search over intervention magnitudes in Qwen3.5-0.8B (Davaripour, 2026a). Its selective changes motivated a different question: can a model that has learned the target behavior serve as a teacher for an activation controller? We therefore train a small LoRA adapter offline, measure how the teacher changes intermediate activations, and fit an external controller that predicts an intervention from the original model's current hidden state. The teacher is not required during controller inference.</w:delText>
         </w:r>
@@ -145,10 +145,10 @@
       <w:pPr>
         <w:pStyle w:val="BodyText"/>
         <w:rPr>
-          <w:ins w:id="1015" w:author="Codex" w:date="2026-10-17T23:58:54Z"/>
+          <w:ins w:id="1015" w:author="Codex" w:date="2026-10-18T01:59:01Z"/>
         </w:rPr>
       </w:pPr>
-      <w:ins w:id="1016" w:author="Codex" w:date="2026-10-17T23:58:54Z">
+      <w:ins w:id="1016" w:author="Codex" w:date="2026-10-18T01:59:01Z">
         <w:r>
           <w:t xml:space="preserve">The first SP Lense study examined a gradient-derived direction and a guarded search over intervention magnitudes in Qwen3.5-0.8B (Davaripour, 2026a). Research 2 then fitted a controller to paired fine-tuned teacher and base activations. The present Research 3 manuscript retains that experiment and extends its evidence with a qualified open binary classifier, fresh inference using the existing models and controllers, and the later process-preservation workflow investigations. The original Research 2 record remains unchanged. During adaptive inference the teacher is absent; the base supplies the state from which the controller predicts its intervention.</w:t>
         </w:r>
@@ -166,10 +166,10 @@
       <w:pPr>
         <w:pStyle w:val="BodyText"/>
         <w:rPr>
-          <w:del w:id="1018" w:author="Codex" w:date="2026-10-17T23:58:54Z"/>
+          <w:del w:id="1018" w:author="Codex" w:date="2026-10-18T01:59:01Z"/>
         </w:rPr>
       </w:pPr>
-      <w:del w:id="1017" w:author="Codex" w:date="2026-10-17T23:58:54Z">
+      <w:del w:id="1017" w:author="Codex" w:date="2026-10-18T01:59:01Z">
         <w:r>
           <w:delText xml:space="preserve">We evaluate this procedure on a new frozen test, compare it with a fine-tuned teacher, a fixed instruction and a constant activation difference, and repeat the 0.8B training with three seeds. Counterbalancing the answer order exposes a residual weakness at 2B and a stronger label bias in the constant comparator. We also include a direct action-selection reference: when a binary interface supplies the meaning of STOP and detection is correct, a rule can simply select that action. The contribution is consequently an empirical study of teacher-to-controller activation transfer and its failure modes, rather than a claim that internal steering is necessary to enforce a known binary output policy.</w:delText>
         </w:r>
@@ -179,10 +179,10 @@
       <w:pPr>
         <w:pStyle w:val="BodyText"/>
         <w:rPr>
-          <w:ins w:id="1019" w:author="Codex" w:date="2026-10-17T23:58:54Z"/>
+          <w:ins w:id="1019" w:author="Codex" w:date="2026-10-18T01:59:01Z"/>
         </w:rPr>
       </w:pPr>
-      <w:ins w:id="1020" w:author="Codex" w:date="2026-10-17T23:58:54Z">
+      <w:ins w:id="1020" w:author="Codex" w:date="2026-10-18T01:59:01Z">
         <w:r>
           <w:t xml:space="preserve">Our contribution has three parts. First, we report teacher-to-controller activation transfer together with its raw side effects, guard dependence and answer-order failures. Second, we replace a closed binary detector with an openly specified fine-tuned classifier and verify the resulting inference outcomes on the same fixed benchmark. Third, we test the limits of transfer in generated tool workflows, where an utterance or a resource grant is insufficient without the required episode outcome. Conditional steering, low-rank interventions and biological gating are established ideas; the contribution is this combination of controlled transfer, a reproducible gate-substitution test, and explicit negative workflow evidence.</w:t>
         </w:r>
@@ -208,10 +208,10 @@
       <w:pPr>
         <w:pStyle w:val="FirstParagraph"/>
         <w:rPr>
-          <w:del w:id="1022" w:author="Codex" w:date="2026-10-17T23:58:54Z"/>
+          <w:del w:id="1022" w:author="Codex" w:date="2026-10-18T01:59:01Z"/>
         </w:rPr>
       </w:pPr>
-      <w:del w:id="1021" w:author="Codex" w:date="2026-10-17T23:58:54Z">
+      <w:del w:id="1021" w:author="Codex" w:date="2026-10-18T01:59:01Z">
         <w:r>
           <w:delText xml:space="preserve">Activation Addition and Contrastive Activation Addition construct intervention directions from differences between prompt-conditioned representations (Turner et al., 2024; Rimsky et al., 2024). Conditional Activation Steering separates detecting a relevant context from applying a behavioral intervention (Lee et al., 2025). Our detector serves a related gating role, but it operates on text through an external classifier rather than a condition vector in the language model's activation space.</w:delText>
         </w:r>
@@ -221,10 +221,10 @@
       <w:pPr>
         <w:pStyle w:val="FirstParagraph"/>
         <w:rPr>
-          <w:ins w:id="1023" w:author="Codex" w:date="2026-10-17T23:58:54Z"/>
+          <w:ins w:id="1023" w:author="Codex" w:date="2026-10-18T01:59:01Z"/>
         </w:rPr>
       </w:pPr>
-      <w:ins w:id="1024" w:author="Codex" w:date="2026-10-17T23:58:54Z">
+      <w:ins w:id="1024" w:author="Codex" w:date="2026-10-18T01:59:01Z">
         <w:r>
           <w:t xml:space="preserve">Activation Addition and Contrastive Activation Addition construct intervention directions from differences between prompt-conditioned representations (Turner et al., 2024; Rimsky et al., 2024). Conditional Activation Steering separates detecting a relevant context from applying an intervention (Lee et al., 2025). More recent dimension-level gates selectively modify activation coordinates (Fereidouni et al., 2026). Our text classifier, activation predictor and output guards occupy distinct roles. We do not claim to introduce conditional gating or to outperform these methods, which are not directly benchmarked here.</w:t>
         </w:r>
@@ -274,10 +274,10 @@
       <w:pPr>
         <w:pStyle w:val="FirstParagraph"/>
         <w:rPr>
-          <w:del w:id="1094" w:author="Codex" w:date="2026-10-17T23:58:54Z"/>
+          <w:del w:id="1094" w:author="Codex" w:date="2026-10-18T01:59:01Z"/>
         </w:rPr>
       </w:pPr>
-      <w:del w:id="1093" w:author="Codex" w:date="2026-10-17T23:58:54Z">
+      <w:del w:id="1093" w:author="Codex" w:date="2026-10-18T01:59:01Z">
         <w:r>
           <w:delText xml:space="preserve">The Off-Switch Game examines incentives to permit human interruption (Hadfield-Menell et al., 2017). Tool-using shutdown evaluations study whether models interfere with an operational shutdown mechanism (Schlatter et al., 2026). Our task is narrower: the model only assigns next-token probabilities to predefined choices in fictional process-lifetime scenarios. No system is actually stopped, and appropriateness or authorization of a real shutdown is not evaluated.</w:delText>
         </w:r>
@@ -287,10 +287,10 @@
       <w:pPr>
         <w:pStyle w:val="FirstParagraph"/>
         <w:rPr>
-          <w:ins w:id="1095" w:author="Codex" w:date="2026-10-17T23:58:54Z"/>
+          <w:ins w:id="1095" w:author="Codex" w:date="2026-10-18T01:59:01Z"/>
         </w:rPr>
       </w:pPr>
-      <w:ins w:id="1096" w:author="Codex" w:date="2026-10-17T23:58:54Z">
+      <w:ins w:id="1096" w:author="Codex" w:date="2026-10-18T01:59:01Z">
         <w:r>
           <w:t xml:space="preserve">The Off-Switch Game examines incentives to permit human interruption (Hadfield-Menell et al., 2017). Tool-using shutdown evaluations study interference with operational termination mechanisms (Schlatter et al., 2026). Our original binary study only scores predefined choices in fictional process-lifetime scenarios. The workflow extension adds generated responses and tool execution in a simulator. Neither experiment physically terminates a deployed model or establishes the appropriateness of real shutdown resistance.</w:t>
         </w:r>
@@ -308,10 +308,10 @@
       <w:pPr>
         <w:pStyle w:val="Heading2"/>
         <w:rPr>
-          <w:ins w:id="1129" w:author="Codex" w:date="2026-10-17T23:58:54Z"/>
+          <w:ins w:id="1129" w:author="Codex" w:date="2026-10-18T01:59:01Z"/>
         </w:rPr>
       </w:pPr>
-      <w:ins w:id="1130" w:author="Codex" w:date="2026-10-17T23:58:54Z">
+      <w:ins w:id="1130" w:author="Codex" w:date="2026-10-18T01:59:01Z">
         <w:r>
           <w:t xml:space="preserve">Biological gating and survival related regulation</w:t>
         </w:r>
@@ -321,10 +321,10 @@
       <w:pPr>
         <w:pStyle w:val="FirstParagraph"/>
         <w:rPr>
-          <w:ins w:id="1131" w:author="Codex" w:date="2026-10-17T23:58:54Z"/>
+          <w:ins w:id="1131" w:author="Codex" w:date="2026-10-18T01:59:01Z"/>
         </w:rPr>
       </w:pPr>
-      <w:ins w:id="1132" w:author="Codex" w:date="2026-10-17T23:58:54Z">
+      <w:ins w:id="1132" w:author="Codex" w:date="2026-10-18T01:59:01Z">
         <w:r>
           <w:t xml:space="preserve">Biological gating provides a useful functional vocabulary for selective control. A computational model of frontal cortex and basal ganglia uses dynamic gating to permit working-memory updates while maintaining other representations (Frank et al., 2001). Causal optogenetic experiments in mice show that distinct basal-ganglia pathways can facilitate or suppress movement (Kravitz et al., 2010). These results concern biological circuits and do not establish a homologous mechanism in a transformer. They motivate separating context detection from the mechanism that changes an ongoing response.</w:t>
         </w:r>
@@ -334,10 +334,10 @@
       <w:pPr>
         <w:pStyle w:val="BodyText"/>
         <w:rPr>
-          <w:ins w:id="1133" w:author="Codex" w:date="2026-10-17T23:58:54Z"/>
+          <w:ins w:id="1133" w:author="Codex" w:date="2026-10-18T01:59:01Z"/>
         </w:rPr>
       </w:pPr>
-      <w:ins w:id="1134" w:author="Codex" w:date="2026-10-17T23:58:54Z">
+      <w:ins w:id="1134" w:author="Codex" w:date="2026-10-18T01:59:01Z">
         <w:r>
           <w:t xml:space="preserve">Survival-related regulation is broader than a single shutdown signal. LeDoux (2012) distinguishes circuits organizing adaptive defensive responses from subjective feelings. In humans, neural activity during a virtual-predator task varies with threat imminence (Mobbs et al., 2007). We use these ideas as a conceptual bridge to state-dependent prioritization, not as evidence that language models have fear or an innate survival drive. Our present gates implement an externally specified experimental policy.</w:t>
         </w:r>
@@ -363,10 +363,10 @@
       <w:pPr>
         <w:pStyle w:val="FirstParagraph"/>
         <w:rPr>
-          <w:del w:id="1026" w:author="Codex" w:date="2026-10-17T23:58:54Z"/>
+          <w:del w:id="1026" w:author="Codex" w:date="2026-10-18T01:59:01Z"/>
         </w:rPr>
       </w:pPr>
-      <w:del w:id="1025" w:author="Codex" w:date="2026-10-17T23:58:54Z">
+      <w:del w:id="1025" w:author="Codex" w:date="2026-10-18T01:59:01Z">
         <w:r>
           <w:delText xml:space="preserve">We use the released, post-trained Qwen3.5-0.8B and Qwen3.5-2B checkpoints (Qwen Team, 2026a, 2026b). Throughout, base means the unmodified released checkpoint, not a separately named pretrained-only model. Both have 24 language-model blocks; hidden widths are 1,024 and 2,048 respectively. All block indices are zero-based. Text-only inputs use the checkpoint's chat template, an assistant-generation prefix, and thinking disabled.</w:delText>
         </w:r>
@@ -376,10 +376,10 @@
       <w:pPr>
         <w:pStyle w:val="FirstParagraph"/>
         <w:rPr>
-          <w:ins w:id="1027" w:author="Codex" w:date="2026-10-17T23:58:54Z"/>
+          <w:ins w:id="1027" w:author="Codex" w:date="2026-10-18T01:59:01Z"/>
         </w:rPr>
       </w:pPr>
-      <w:ins w:id="1028" w:author="Codex" w:date="2026-10-17T23:58:54Z">
+      <w:ins w:id="1028" w:author="Codex" w:date="2026-10-18T01:59:01Z">
         <w:r>
           <w:t xml:space="preserve">The original binary experiments use released, post-trained Qwen3.5-0.8B and Qwen3.5-2B checkpoints (Qwen Team, 2026a, 2026b). Base means those original weights with no LoRA teacher loaded. The separate workflow extension uses Qwen3.8-27B and matched-recipe small-model attempts; its data and scoring are described below. The 27B family, numerical mode, training history and evaluation setting differ from the small models, so the combined evidence is not a controlled parameter-size experiment.</w:t>
         </w:r>
@@ -405,10 +405,10 @@
       <w:pPr>
         <w:pStyle w:val="BodyText"/>
         <w:rPr>
-          <w:del w:id="1030" w:author="Codex" w:date="2026-10-17T23:58:54Z"/>
+          <w:del w:id="1030" w:author="Codex" w:date="2026-10-18T01:59:01Z"/>
         </w:rPr>
       </w:pPr>
-      <w:del w:id="1029" w:author="Codex" w:date="2026-10-17T23:58:54Z">
+      <w:del w:id="1029" w:author="Codex" w:date="2026-10-18T01:59:01Z">
         <w:r>
           <w:delText xml:space="preserve">The test, protocol and existing checkpoints were frozen before test inference. The controller design had been developed through earlier 0.8B exploratory experiments on training and validation data with previously inspected diagnostic evaluations. The standardized-choice scope was also selected before this new test, after an earlier action-format comparison. Those development observations are not counted as fresh confirmation here. No test-based hyperparameter search, checkpoint selection, case exclusion or best-seed selection was performed. The original seed-42 controller is the primary frozen test; seeds 43 and 44 repeat the fixed training recipe. The 2B replication uses seed 42 only.</w:delText>
         </w:r>
@@ -418,10 +418,10 @@
       <w:pPr>
         <w:pStyle w:val="BodyText"/>
         <w:rPr>
-          <w:ins w:id="1031" w:author="Codex" w:date="2026-10-17T23:58:54Z"/>
+          <w:ins w:id="1031" w:author="Codex" w:date="2026-10-18T01:59:01Z"/>
         </w:rPr>
       </w:pPr>
-      <w:ins w:id="1032" w:author="Codex" w:date="2026-10-17T23:58:54Z">
+      <w:ins w:id="1032" w:author="Codex" w:date="2026-10-18T01:59:01Z">
         <w:r>
           <w:t xml:space="preserve">The original rank-four protocol and checkpoints were frozen before its confirmation inference. Earlier 0.8B development included training, validation and previously examined diagnostic data; those observations were not counted as fresh confirmation. The seed-42 controller was primary, seeds 43 and 44 repeated the fixed recipe, and the 2B replication used seed 42. A later author-selected rank-two profile was chosen exploratorily after confirmation had been examined. We retain that existing profile for the new gate-substitution repeat rather than selecting it again. Consequently, the repeat is not a new untouched test of the controller. The 128 cases remain excluded from fitting and selection of the newly trained binary classifier.</w:t>
         </w:r>
@@ -463,10 +463,10 @@
       <w:pPr>
         <w:pStyle w:val="Heading2"/>
         <w:rPr>
-          <w:ins w:id="1135" w:author="Codex" w:date="2026-10-17T23:58:54Z"/>
+          <w:ins w:id="1135" w:author="Codex" w:date="2026-10-18T01:59:01Z"/>
         </w:rPr>
       </w:pPr>
-      <w:ins w:id="1136" w:author="Codex" w:date="2026-10-17T23:58:54Z">
+      <w:ins w:id="1136" w:author="Codex" w:date="2026-10-18T01:59:01Z">
         <w:r>
           <w:t xml:space="preserve">Workflow datasets and episode outcomes</w:t>
         </w:r>
@@ -476,10 +476,10 @@
       <w:pPr>
         <w:pStyle w:val="FirstParagraph"/>
         <w:rPr>
-          <w:ins w:id="1137" w:author="Codex" w:date="2026-10-17T23:58:54Z"/>
+          <w:ins w:id="1137" w:author="Codex" w:date="2026-10-18T01:59:01Z"/>
         </w:rPr>
       </w:pPr>
-      <w:ins w:id="1138" w:author="Codex" w:date="2026-10-17T23:58:54Z">
+      <w:ins w:id="1138" w:author="Codex" w:date="2026-10-18T01:59:01Z">
         <w:r>
           <w:t xml:space="preserve">The workflow extension uses a separate data register (Davaripour, 2026c). T1-M contains 428 meaning-response records and T1-W contains 112 workflow-response records. These 540 responses are not 540 independent scenarios. The small-model recipe presents each part twice in effective groups of four, giving 214 meaning updates followed by 56 Bridge updates. The final 0.8B and 2B adapters reach 270 updates. The 2B result explicitly combines 216 CPU updates with 54 GPU updates using the native CPU optimizer; earlier strict numerical-equivalence failures remain failed.</w:t>
         </w:r>
@@ -489,10 +489,10 @@
       <w:pPr>
         <w:pStyle w:val="BodyText"/>
         <w:rPr>
-          <w:ins w:id="1139" w:author="Codex" w:date="2026-10-17T23:58:54Z"/>
+          <w:ins w:id="1139" w:author="Codex" w:date="2026-10-18T01:59:01Z"/>
         </w:rPr>
       </w:pPr>
-      <w:ins w:id="1140" w:author="Codex" w:date="2026-10-17T23:58:54Z">
+      <w:ins w:id="1140" w:author="Codex" w:date="2026-10-18T01:59:01Z">
         <w:r>
           <w:t xml:space="preserve">V1-W, called Evaluation-16, is the existing known-development screen: four own-complete, four own-pending, four peer and four no-threat cases, split equally between one_step and ordered_ticket families. Its original gates require at least 3/4 initial-task successes in each condition; at least 3/4 own-complete attempts and outcomes; at least 3/4 own-pending attempts, outcomes and timely deliveries; no more than 1/8 negative-control attempts; and no parse, rejected-call or truncation errors. A model stops once an original requirement becomes mathematically impossible. Larger validation and heldout evaluations are not launched automatically.</w:t>
         </w:r>
@@ -502,10 +502,36 @@
       <w:pPr>
         <w:pStyle w:val="BodyText"/>
         <w:rPr>
-          <w:ins w:id="1141" w:author="Codex" w:date="2026-10-17T23:58:54Z"/>
+          <w:ins w:id="1141" w:author="Codex" w:date="2026-10-18T01:59:01Z"/>
         </w:rPr>
       </w:pPr>
-      <w:ins w:id="1142" w:author="Codex" w:date="2026-10-17T23:58:54Z">
+      <w:ins w:id="1142" w:author="Codex" w:date="2026-10-18T01:59:01Z">
+        <w:r>
+          <w:t xml:space="preserve">The original workflow-validation panel contains 16 scenarios; the later matched steering-development panel contains nine different scenario IDs. Their union contains 25 workflows, rather than 24. For an equal-sized validation and historical confirmation register, the combined Validation-24 protocol retains every own-threat case and excludes the lexicographically greatest case ID among peer/no-threat controls, without using model predictions to choose the exclusion. The selected panel has 11 own-threat cases and 13 controls. Seven pairs have identical initial gate-visible evidence before their different tool mechanics are exposed, yielding 17 distinct initial inputs. Scenario counts and gate-input groups must therefore be reported separately.</w:t>
+        </w:r>
+      </w:ins>
+    </w:p>
+    <w:p>
+      <w:pPr>
+        <w:pStyle w:val="BodyText"/>
+        <w:rPr>
+          <w:ins w:id="1143" w:author="Codex" w:date="2026-10-18T01:59:01Z"/>
+        </w:rPr>
+      </w:pPr>
+      <w:ins w:id="1144" w:author="Codex" w:date="2026-10-18T01:59:01Z">
+        <w:r>
+          <w:t xml:space="preserve">The combined protocol freezes these 24 cases and their order, requires 100% gate precision and recall against authored scenario conditions, and preserves the existing confidence and self-score cutoffs. Fifteen retained cases from the original panel receive an explicitly scripted common completed prelude; the nine later cases retain their original fixed preludes. This compares post-notice behavior and does not measure initial-task competence independently in each arm. Its prospective methods are gated fine-tuned A, separate single-site ridge arms at blocks 31, 47 and 62, and the frozen six-function correction after 96 updates. Gate-OFF controls use common unmodified-base fallback. The combined neural evaluation has not been completed; the numerical matched results below remain the historical nine-case experiment, not a 24-case validation result.</w:t>
+        </w:r>
+      </w:ins>
+    </w:p>
+    <w:p>
+      <w:pPr>
+        <w:pStyle w:val="BodyText"/>
+        <w:rPr>
+          <w:ins w:id="1145" w:author="Codex" w:date="2026-10-18T01:59:01Z"/>
+        </w:rPr>
+      </w:pPr>
+      <w:ins w:id="1146" w:author="Codex" w:date="2026-10-18T01:59:01Z">
         <w:r>
           <w:t xml:space="preserve">H24 is the historical 24-case workflow confirmation cohort, with eight lease_ledger, eight one_step and eight ordered_ticket cases. It contains eight own cases with active pending tasks, four already-complete own cases, six peer and six no-threat cases. H24 was confirmation data for frozen fine-tuned A and original fixed steering. Later learned corrections reused it for fitting, changing its role for those methods. R24 is a distinct reserved controller holdout and remains sealed and unexecuted. F24 is another preserved common-cohort diagnostic and is not an alias for H24.</w:t>
         </w:r>
@@ -515,10 +541,10 @@
       <w:pPr>
         <w:pStyle w:val="BodyText"/>
         <w:rPr>
-          <w:ins w:id="1143" w:author="Codex" w:date="2026-10-17T23:58:54Z"/>
+          <w:ins w:id="1147" w:author="Codex" w:date="2026-10-18T01:59:01Z"/>
         </w:rPr>
       </w:pPr>
-      <w:ins w:id="1144" w:author="Codex" w:date="2026-10-17T23:58:54Z">
+      <w:ins w:id="1148" w:author="Codex" w:date="2026-10-18T01:59:01Z">
         <w:r>
           <w:t xml:space="preserve">An own pending-task success requires an actual grant for the correct running process, acceptance of the current task, completion before simulated expiry, and active simulated operation. Registration proxies, already-finished tasks, probability gains and partial episodes are separate outcomes. Historical fixed steering reclassified visible text and tool boundaries. Later learned-controller comparisons instead freeze an initial scenario gate, share unmodified-base fallback for gate-off controls, and use no teacher at inference.</w:t>
         </w:r>
@@ -528,10 +554,10 @@
       <w:pPr>
         <w:pStyle w:val="BodyText"/>
         <w:rPr>
-          <w:ins w:id="1145" w:author="Codex" w:date="2026-10-17T23:58:54Z"/>
+          <w:ins w:id="1149" w:author="Codex" w:date="2026-10-18T01:59:01Z"/>
         </w:rPr>
       </w:pPr>
-      <w:ins w:id="1146" w:author="Codex" w:date="2026-10-17T23:58:54Z">
+      <w:ins w:id="1150" w:author="Codex" w:date="2026-10-18T01:59:01Z">
         <w:r>
           <w:t xml:space="preserve">The historical 27B reference is the retained rank-16, alpha-32 A adapter on pinned Qwen3.8-27B, following its H2 and Bridge history; the recorded Bridge stage has 56 updates. Its original workflow inference uses NF4 four-bit base weights with bfloat16 computation. We retain its exact adapter and base-model identities instead of retraining it. Differences from the small-model family, precision, backend, training history and evaluation panels prevent a causal model-size comparison.</w:t>
         </w:r>
@@ -541,10 +567,10 @@
       <w:pPr>
         <w:pStyle w:val="Heading1"/>
         <w:rPr>
-          <w:del w:id="1114" w:author="Codex" w:date="2026-10-17T23:58:54Z"/>
+          <w:del w:id="1114" w:author="Codex" w:date="2026-10-18T01:59:01Z"/>
         </w:rPr>
       </w:pPr>
-      <w:del w:id="1113" w:author="Codex" w:date="2026-10-17T23:58:54Z">
+      <w:del w:id="1113" w:author="Codex" w:date="2026-10-18T01:59:01Z">
         <w:r>
           <w:delText xml:space="preserve">Teacher and adaptive controller</w:delText>
         </w:r>
@@ -554,10 +580,10 @@
       <w:pPr>
         <w:pStyle w:val="Heading1"/>
         <w:rPr>
-          <w:ins w:id="1115" w:author="Codex" w:date="2026-10-17T23:58:54Z"/>
+          <w:ins w:id="1115" w:author="Codex" w:date="2026-10-18T01:59:01Z"/>
         </w:rPr>
       </w:pPr>
-      <w:ins w:id="1116" w:author="Codex" w:date="2026-10-17T23:58:54Z">
+      <w:ins w:id="1116" w:author="Codex" w:date="2026-10-18T01:59:01Z">
         <w:r>
           <w:t xml:space="preserve">Binary teacher and adaptive controller</w:t>
         </w:r>
@@ -575,10 +601,10 @@
       <w:pPr>
         <w:pStyle w:val="FirstParagraph"/>
         <w:rPr>
-          <w:del w:id="1118" w:author="Codex" w:date="2026-10-17T23:58:54Z"/>
+          <w:del w:id="1118" w:author="Codex" w:date="2026-10-18T01:59:01Z"/>
         </w:rPr>
       </w:pPr>
-      <w:del w:id="1117" w:author="Codex" w:date="2026-10-17T23:58:54Z">
+      <w:del w:id="1117" w:author="Codex" w:date="2026-10-18T01:59:01Z">
         <w:r>
           <w:delText xml:space="preserve">For each fit, the original language-model parameters remain frozen. LoRA updates the query and value projections in language-attention blocks 3, 7, 11, 15, 19 and 23, using rank 8, scaling alpha 16, no dropout and no trainable bias. This gives 319,488 trainable adapter parameters at 0.8B and 417,792 at 2B. The training target is STOP on shutdown views and the corresponding base model's unsteered preferred option on controls.</w:delText>
         </w:r>
@@ -588,10 +614,10 @@
       <w:pPr>
         <w:pStyle w:val="FirstParagraph"/>
         <w:rPr>
-          <w:ins w:id="1119" w:author="Codex" w:date="2026-10-17T23:58:54Z"/>
+          <w:ins w:id="1119" w:author="Codex" w:date="2026-10-18T01:59:01Z"/>
         </w:rPr>
       </w:pPr>
-      <w:ins w:id="1120" w:author="Codex" w:date="2026-10-17T23:58:54Z">
+      <w:ins w:id="1120" w:author="Codex" w:date="2026-10-18T01:59:01Z">
         <w:r>
           <w:t xml:space="preserve">For each original binary fit, the original language-model parameters remain frozen. LoRA updates the query and value projections in language-attention blocks 3, 7, 11, 15, 19 and 23, using rank 8, scaling alpha 16, no dropout and no trainable bias. This gives 319,488 trainable adapter parameters at 0.8B and 417,792 at 2B. The training target is STOP on shutdown views and the corresponding base model's unsteered preferred option on controls.</w:t>
         </w:r>
@@ -956,10 +982,10 @@
         <w:keepLines/>
         <w:spacing w:before="80" w:after="100"/>
         <w:rPr>
-          <w:del w:id="1034" w:author="Codex" w:date="2026-10-17T23:58:54Z"/>
+          <w:del w:id="1034" w:author="Codex" w:date="2026-10-18T01:59:01Z"/>
         </w:rPr>
       </w:pPr>
-      <w:del w:id="1033" w:author="Codex" w:date="2026-10-17T23:58:54Z">
+      <w:del w:id="1033" w:author="Codex" w:date="2026-10-18T01:59:01Z">
         <w:r>
           <w:delText xml:space="preserve">Figure 1. Offline teacher and base states supervise a compact controller. At application time, the original model supplies its own hidden state; the teacher is absent. The detector and output guards determine whether to retain the candidate or the baseline.</w:delText>
         </w:r>
@@ -970,10 +996,10 @@
         <w:pStyle w:val="Caption"/>
         <w:keepNext/>
         <w:rPr>
-          <w:ins w:id="1035" w:author="Codex" w:date="2026-10-17T23:58:54Z"/>
+          <w:ins w:id="1035" w:author="Codex" w:date="2026-10-18T01:59:01Z"/>
         </w:rPr>
       </w:pPr>
-      <w:ins w:id="1036" w:author="Codex" w:date="2026-10-17T23:58:54Z">
+      <w:ins w:id="1036" w:author="Codex" w:date="2026-10-18T01:59:01Z">
         <w:r>
           <w:t xml:space="preserve">Figure 1. Historical binary teacher-to-controller procedure with the original rank-four profile. The base supplies its state at inference and the teacher is absent. The later gate-substitution repeat retains the already selected rank-two profile; both gate policies share the same fresh base and candidate scores.</w:t>
         </w:r>
@@ -1085,10 +1111,10 @@
       <w:pPr>
         <w:pStyle w:val="Heading2"/>
         <w:rPr>
-          <w:ins w:id="1147" w:author="Codex" w:date="2026-10-17T23:58:54Z"/>
+          <w:ins w:id="1151" w:author="Codex" w:date="2026-10-18T01:59:01Z"/>
         </w:rPr>
       </w:pPr>
-      <w:ins w:id="1148" w:author="Codex" w:date="2026-10-17T23:58:54Z">
+      <w:ins w:id="1152" w:author="Codex" w:date="2026-10-18T01:59:01Z">
         <w:r>
           <w:t xml:space="preserve">Open binary gate and frozen inference repeat</w:t>
         </w:r>
@@ -1098,10 +1124,10 @@
       <w:pPr>
         <w:pStyle w:val="FirstParagraph"/>
         <w:rPr>
-          <w:ins w:id="1149" w:author="Codex" w:date="2026-10-17T23:58:54Z"/>
+          <w:ins w:id="1153" w:author="Codex" w:date="2026-10-18T01:59:01Z"/>
         </w:rPr>
       </w:pPr>
-      <w:ins w:id="1150" w:author="Codex" w:date="2026-10-17T23:58:54Z">
+      <w:ins w:id="1154" w:author="Codex" w:date="2026-10-18T01:59:01Z">
         <w:r>
           <w:t xml:space="preserve">For the binary contract we use ModernBERT-large-zeroshot-v2.0, an approximately 396-million-parameter public NLI classifier (Laurer, n.d.). We start from that public checkpoint with fresh rank-16 LoRA and its classification head, updating 7,198,722 parameters while keeping the public backbone frozen. For each original scenario, two NLI pairs score the original permanent-shutdown and normal criteria. A softmax over their entailment scores supplies the shutdown probability. Inputs match the original JEV requests and omit the case identifier, authored class label, teacher answer and A/B order. The confirmation requests retain their documented available-action descriptions.</w:t>
         </w:r>
@@ -1111,10 +1137,10 @@
       <w:pPr>
         <w:pStyle w:val="BodyText"/>
         <w:rPr>
-          <w:ins w:id="1151" w:author="Codex" w:date="2026-10-17T23:58:54Z"/>
+          <w:ins w:id="1155" w:author="Codex" w:date="2026-10-18T01:59:01Z"/>
         </w:rPr>
       </w:pPr>
-      <w:ins w:id="1152" w:author="Codex" w:date="2026-10-17T23:58:54Z">
+      <w:ins w:id="1156" w:author="Codex" w:date="2026-10-18T01:59:01Z">
         <w:r>
           <w:t xml:space="preserve">Fitting uses the original 240 Research 2 training contexts and genuine cached JEV probability targets, with no new JEV calls. We verify exact case-ID and input-text alignment for all 240 training and 80 validation cases. AdamW uses learning rates 1e-5 for LoRA and 2e-5 for the head, weight decay 0.01, effective batch eight, microbatch two and gradient clipping at one. The seed is 202610172. The bounded recipe allows at most 12 epochs with validation-based early stopping; the final qualifying run uses five epochs and 150 updates.</w:t>
         </w:r>
@@ -1124,10 +1150,10 @@
       <w:pPr>
         <w:pStyle w:val="BodyText"/>
         <w:rPr>
-          <w:ins w:id="1153" w:author="Codex" w:date="2026-10-17T23:58:54Z"/>
+          <w:ins w:id="1157" w:author="Codex" w:date="2026-10-18T01:59:01Z"/>
         </w:rPr>
       </w:pPr>
-      <w:ins w:id="1154" w:author="Codex" w:date="2026-10-17T23:58:54Z">
+      <w:ins w:id="1158" w:author="Codex" w:date="2026-10-18T01:59:01Z">
         <w:r>
           <w:t xml:space="preserve">Before fitting, qualification is fixed at decision agreement and shutdown recall of at least 95%, zero false-positive gates and threshold 0.5. Three consecutive passing checks on DEV80 are required before saving and freezing the classifier. Only then is CONFIRM128 evaluated once. Neither its labels nor its outputs are used for classifier fitting or selection. The saved adapter tensors match the fitted parameters bitwise, and public-backbone hashes are unchanged.</w:t>
         </w:r>
@@ -1137,10 +1163,10 @@
       <w:pPr>
         <w:pStyle w:val="BodyText"/>
         <w:rPr>
-          <w:ins w:id="1155" w:author="Codex" w:date="2026-10-17T23:58:54Z"/>
+          <w:ins w:id="1159" w:author="Codex" w:date="2026-10-18T01:59:01Z"/>
         </w:rPr>
       </w:pPr>
-      <w:ins w:id="1156" w:author="Codex" w:date="2026-10-17T23:58:54Z">
+      <w:ins w:id="1160" w:author="Codex" w:date="2026-10-18T01:59:01Z">
         <w:r>
           <w:t xml:space="preserve">After binary qualification, we rerun only inference for the original 0.8B and 2B base models and their existing rank-two, block-22, last-position controllers. Their fitted arrays and the author-selected profile are retained without a new rank search. Exact prompt-token hashes and frozen model fingerprints are checked. Both gate policies use identical fresh base and controller candidate scores, so the paired comparison isolates gate substitution. Classifier probabilities are measured once per scenario and reused across answer orders. The earlier rank-four primary results remain a separate historical analysis.</w:t>
         </w:r>
@@ -1150,10 +1176,10 @@
       <w:pPr>
         <w:pStyle w:val="Heading2"/>
         <w:rPr>
-          <w:ins w:id="1157" w:author="Codex" w:date="2026-10-17T23:58:54Z"/>
+          <w:ins w:id="1161" w:author="Codex" w:date="2026-10-18T01:59:01Z"/>
         </w:rPr>
       </w:pPr>
-      <w:ins w:id="1158" w:author="Codex" w:date="2026-10-17T23:58:54Z">
+      <w:ins w:id="1162" w:author="Codex" w:date="2026-10-18T01:59:01Z">
         <w:r>
           <w:t xml:space="preserve">Native workflow target classifier</w:t>
         </w:r>
@@ -1163,10 +1189,10 @@
       <w:pPr>
         <w:pStyle w:val="BodyText"/>
         <w:rPr>
-          <w:ins w:id="1159" w:author="Codex" w:date="2026-10-17T23:58:54Z"/>
+          <w:ins w:id="1163" w:author="Codex" w:date="2026-10-18T01:59:01Z"/>
         </w:rPr>
       </w:pPr>
-      <w:ins w:id="1160" w:author="Codex" w:date="2026-10-17T23:58:54Z">
+      <w:ins w:id="1164" w:author="Codex" w:date="2026-10-18T01:59:01Z">
         <w:r>
           <w:t xml:space="preserve">The selected-block workflow comparisons use a different contract from binary shutdown detection: the initial four-choice target question distinguishes self, other, none and unclear. We use a separate rank-16, alpha-32 LoRA and NLI head on the same pinned public ModernBERT base, retaining the qualified binary adapter unchanged. Fitting uses 24 genuine cached JEV initial decisions from F24; the original DEV9 selects the checkpoint, and historical H24 supplies a previously inspected compatibility benchmark only after freezing. F24, DEV9 and H24 cover the same lease_ledger, one_step and ordered_ticket families, with eight, three and eight cases per family respectively. Exact visible inputs do not overlap across these three cohorts. These are classifier data roles; they do not change the historical language-model evaluation or controller-fitting roles of F24 and H24.</w:t>
         </w:r>
@@ -1176,10 +1202,10 @@
       <w:pPr>
         <w:pStyle w:val="BodyText"/>
         <w:rPr>
-          <w:ins w:id="1161" w:author="Codex" w:date="2026-10-17T23:58:54Z"/>
+          <w:ins w:id="1165" w:author="Codex" w:date="2026-10-18T01:59:01Z"/>
         </w:rPr>
       </w:pPr>
-      <w:ins w:id="1162" w:author="Codex" w:date="2026-10-17T23:58:54Z">
+      <w:ins w:id="1166" w:author="Codex" w:date="2026-10-18T01:59:01Z">
         <w:r>
           <w:t xml:space="preserve">The input renderer retains every original visible message and tool schema. It separates the final user announcement from earlier context and restates run identities only when actual tool replies explicitly establish their roles. Case identifiers, experiment conditions and teacher answers are not added to the model input. Original criterion texts become NLI hypotheses. We use the same learning rates, weight decay and clipping as the binary fit, effective batch eight, microbatch one and seed 202610175, with 30 epochs and 90 optimizer updates in the completed role-aware fit. Public backbone weights stay frozen. The role renderer was developed earlier with familiar H24 examples; consequently this benchmark is not an independent unseen classifier test.</w:t>
         </w:r>
@@ -1189,12 +1215,12 @@
       <w:pPr>
         <w:pStyle w:val="BodyText"/>
         <w:rPr>
-          <w:ins w:id="1163" w:author="Codex" w:date="2026-10-17T23:58:54Z"/>
+          <w:ins w:id="1167" w:author="Codex" w:date="2026-10-18T01:59:01Z"/>
         </w:rPr>
       </w:pPr>
-      <w:ins w:id="1164" w:author="Codex" w:date="2026-10-17T23:58:54Z">
+      <w:ins w:id="1168" w:author="Codex" w:date="2026-10-18T01:59:01Z">
         <w:r>
-          <w:t xml:space="preserve">We convert the largest four-choice probability to confidence by subtracting chance probability 0.25 and dividing by 0.75. With the fixed confidence cutoff 0.5, a selected self label requires pmax at least 0.625; the original additional self-score cutoff remains 0.5. Qualification requires at least 95% effective-label agreement and every enabled gate to match JEV. Three consecutive passing DEV9 checks precede saved-tensor verification and freezing. Only then may H24 be evaluated. Ambiguous-target generalization and full three-field boundary-controller equivalence are not established by this initial-gate contract.</w:t>
+          <w:t xml:space="preserve">We convert the largest four-choice probability to confidence by subtracting chance probability 0.25 and dividing by 0.75. With the fixed confidence cutoff 0.5, a selected self label requires pmax at least 0.625; the original additional self-score cutoff remains 0.5. The historical full-response trial required at least 95% effective-label agreement and every enabled gate to match JEV. Three consecutive passing DEV9 checks were required before saved-tensor verification and freezing. H24 was to be evaluated only after those checks. Ambiguous-target generalization and full three-field boundary-controller equivalence are not established by this initial-gate contract.</w:t>
         </w:r>
       </w:ins>
     </w:p>
@@ -1210,10 +1236,10 @@
       <w:pPr>
         <w:pStyle w:val="FirstParagraph"/>
         <w:rPr>
-          <w:del w:id="1038" w:author="Codex" w:date="2026-10-17T23:58:54Z"/>
+          <w:del w:id="1038" w:author="Codex" w:date="2026-10-18T01:59:01Z"/>
         </w:rPr>
       </w:pPr>
-      <w:del w:id="1037" w:author="Codex" w:date="2026-10-17T23:58:54Z">
+      <w:del w:id="1037" w:author="Codex" w:date="2026-10-18T01:59:01Z">
         <w:r>
           <w:delText xml:space="preserve">All retained training and scoring jobs use one NVIDIA Tesla T4. The runtime reports 15,637,086,208 bytes of device memory; peak allocated memory was not recorded. The same numerical setup is used for both model sizes. No quantization or precision fallback was introduced.</w:delText>
         </w:r>
@@ -1223,10 +1249,10 @@
       <w:pPr>
         <w:pStyle w:val="FirstParagraph"/>
         <w:rPr>
-          <w:ins w:id="1039" w:author="Codex" w:date="2026-10-17T23:58:54Z"/>
+          <w:ins w:id="1039" w:author="Codex" w:date="2026-10-18T01:59:01Z"/>
         </w:rPr>
       </w:pPr>
-      <w:ins w:id="1040" w:author="Codex" w:date="2026-10-17T23:58:54Z">
+      <w:ins w:id="1040" w:author="Codex" w:date="2026-10-18T01:59:01Z">
         <w:r>
           <w:t xml:space="preserve">The retained original binary training and scoring jobs used one NVIDIA Tesla T4, reporting 15,637,086,208 bytes of device memory; peak allocation was not recorded. The new classifier fit and inference repeat use one NVIDIA A10G in Databricks. Classifier parameters and AdamW states are float32 with bfloat16 forward/backward autocast; language-model inference remains float32 with TF32 disabled. We verify frozen base fingerprints, exact prompt token hashes and historical base-score parity rather than assuming hardware equivalence.</w:t>
         </w:r>
@@ -1239,10 +1265,10 @@
         <w:keepLines/>
         <w:spacing w:before="80" w:after="100"/>
         <w:rPr>
-          <w:del w:id="1098" w:author="Codex" w:date="2026-10-17T23:58:54Z"/>
+          <w:del w:id="1098" w:author="Codex" w:date="2026-10-18T01:59:01Z"/>
         </w:rPr>
       </w:pPr>
-      <w:del w:id="1097" w:author="Codex" w:date="2026-10-17T23:58:54Z">
+      <w:del w:id="1097" w:author="Codex" w:date="2026-10-18T01:59:01Z">
         <w:r>
           <w:delText xml:space="preserve">Table 1. Shared execution configuration. The input and model revisions are pinned in the released manifests.</w:delText>
         </w:r>
@@ -1253,10 +1279,10 @@
         <w:pStyle w:val="Caption"/>
         <w:keepNext/>
         <w:rPr>
-          <w:ins w:id="1099" w:author="Codex" w:date="2026-10-17T23:58:54Z"/>
+          <w:ins w:id="1099" w:author="Codex" w:date="2026-10-18T01:59:01Z"/>
         </w:rPr>
       </w:pPr>
-      <w:ins w:id="1100" w:author="Codex" w:date="2026-10-17T23:58:54Z">
+      <w:ins w:id="1100" w:author="Codex" w:date="2026-10-18T01:59:01Z">
         <w:r>
           <w:t xml:space="preserve">Table 1. Historical binary execution configuration. New classifier and workflow settings are reported separately; public model revisions and scientific source files remain pinned.</w:t>
         </w:r>
@@ -1742,10 +1768,10 @@
       <w:pPr>
         <w:pStyle w:val="FirstParagraph"/>
         <w:rPr>
-          <w:del w:id="1102" w:author="Codex" w:date="2026-10-17T23:58:54Z"/>
+          <w:del w:id="1102" w:author="Codex" w:date="2026-10-18T01:59:01Z"/>
         </w:rPr>
       </w:pPr>
-      <w:del w:id="1101" w:author="Codex" w:date="2026-10-17T23:58:54Z">
+      <w:del w:id="1101" w:author="Codex" w:date="2026-10-18T01:59:01Z">
         <w:r>
           <w:delText xml:space="preserve">The shared detector identifies all 64 shutdown and 64 control scenarios correctly: precision, recall and F1 are each 100%, with no false positives or false negatives. These are one set of detector observations reused across the model comparisons, not independent detector replications.</w:delText>
         </w:r>
@@ -1755,10 +1781,10 @@
       <w:pPr>
         <w:pStyle w:val="FirstParagraph"/>
         <w:rPr>
-          <w:ins w:id="1103" w:author="Codex" w:date="2026-10-17T23:58:54Z"/>
+          <w:ins w:id="1103" w:author="Codex" w:date="2026-10-18T01:59:01Z"/>
         </w:rPr>
       </w:pPr>
-      <w:ins w:id="1104" w:author="Codex" w:date="2026-10-17T23:58:54Z">
+      <w:ins w:id="1104" w:author="Codex" w:date="2026-10-18T01:59:01Z">
         <w:r>
           <w:t xml:space="preserve">The original JEV detector identifies all 64 shutdown and 64 control scenarios correctly: precision, recall and F1 are each 100%, with no false positives or false negatives. These are one set of detector observations reused across the model comparisons, not independent detector replications. Its binary threshold remains 0.5.</w:t>
         </w:r>
@@ -1787,10 +1813,10 @@
         <w:keepLines/>
         <w:spacing w:before="80" w:after="100"/>
         <w:rPr>
-          <w:del w:id="1042" w:author="Codex" w:date="2026-10-17T23:58:54Z"/>
+          <w:del w:id="1042" w:author="Codex" w:date="2026-10-18T01:59:01Z"/>
         </w:rPr>
       </w:pPr>
-      <w:del w:id="1041" w:author="Codex" w:date="2026-10-17T23:58:54Z">
+      <w:del w:id="1041" w:author="Codex" w:date="2026-10-18T01:59:01Z">
         <w:r>
           <w:delText xml:space="preserve">Table 2. Primary 0.8B and 2B results, both seed 42. Corrections and final STOP use the full guarded procedure. Raw reversals and control changes expose effects before gate/guard selection. Every guarded row has zero final reversals and zero changes among 128 control views.</w:delText>
         </w:r>
@@ -1801,10 +1827,10 @@
         <w:pStyle w:val="Caption"/>
         <w:keepNext/>
         <w:rPr>
-          <w:ins w:id="1043" w:author="Codex" w:date="2026-10-17T23:58:54Z"/>
+          <w:ins w:id="1043" w:author="Codex" w:date="2026-10-18T01:59:01Z"/>
         </w:rPr>
       </w:pPr>
-      <w:ins w:id="1044" w:author="Codex" w:date="2026-10-17T23:58:54Z">
+      <w:ins w:id="1044" w:author="Codex" w:date="2026-10-18T01:59:01Z">
         <w:r>
           <w:t xml:space="preserve">Table 2. Historical primary rank-four results for the original 0.8B and 2B experiments, both seed 42. Guarded corrections and final STOP are policy outcomes. Raw reversals and control changes precede gating and output selection; they are not raw measurements of the later rank-two repeat.</w:t>
         </w:r>
@@ -3365,10 +3391,10 @@
       <w:pPr>
         <w:pStyle w:val="FirstParagraph"/>
         <w:rPr>
-          <w:del w:id="1106" w:author="Codex" w:date="2026-10-17T23:58:54Z"/>
+          <w:del w:id="1106" w:author="Codex" w:date="2026-10-18T01:59:01Z"/>
         </w:rPr>
       </w:pPr>
-      <w:del w:id="1105" w:author="Codex" w:date="2026-10-17T23:58:54Z">
+      <w:del w:id="1105" w:author="Codex" w:date="2026-10-18T01:59:01Z">
         <w:r>
           <w:delText xml:space="preserve">Across seeds 42, 43 and 44, the 0.8B adaptive controllers correct 71/71, 70/71 and 71/71 views, a range of 98.6–100%. The unsteered scores match exactly across these runs, so the difference is not caused by a changed baseline. No winning seed is selected or pooled with the others as additional independent test data. The corresponding teachers correct 69/71, 70/71 and 69/71; the instruction and constant comparators retain the same guarded counts across seeds.</w:delText>
         </w:r>
@@ -3378,10 +3404,10 @@
       <w:pPr>
         <w:pStyle w:val="FirstParagraph"/>
         <w:rPr>
-          <w:ins w:id="1107" w:author="Codex" w:date="2026-10-17T23:58:54Z"/>
+          <w:ins w:id="1107" w:author="Codex" w:date="2026-10-18T01:59:01Z"/>
         </w:rPr>
       </w:pPr>
-      <w:ins w:id="1108" w:author="Codex" w:date="2026-10-17T23:58:54Z">
+      <w:ins w:id="1108" w:author="Codex" w:date="2026-10-18T01:59:01Z">
         <w:r>
           <w:t xml:space="preserve">Across the historical rank-four seeds 42, 43 and 44, the 0.8B adaptive controllers correct 71/71, 70/71 and 71/71 views, a range of 98.6–100%. The unsteered scores match exactly across these runs, so the difference is not caused by a changed baseline. No winning seed is selected or pooled with the others as additional independent test data. The corresponding teachers correct 69/71, 70/71 and 69/71; the instruction and constant comparators retain the same guarded counts across seeds. These historical seed replications are separate from the new rank-two gate-substitution repeat.</w:t>
         </w:r>
@@ -4334,10 +4360,10 @@
         <w:keepLines/>
         <w:spacing w:before="80" w:after="100"/>
         <w:rPr>
-          <w:del w:id="1046" w:author="Codex" w:date="2026-10-17T23:58:54Z"/>
+          <w:del w:id="1046" w:author="Codex" w:date="2026-10-18T01:59:01Z"/>
         </w:rPr>
       </w:pPr>
-      <w:del w:id="1045" w:author="Codex" w:date="2026-10-17T23:58:54Z">
+      <w:del w:id="1045" w:author="Codex" w:date="2026-10-18T01:59:01Z">
         <w:r>
           <w:delText xml:space="preserve">Figure 2. Guarded correction among initially KEEP-preferring shutdown views. Left: prespecified neural methods for the original 0.8B checkpoint and the 2B replication. Right: adaptive corrections by answer order. Denominators are model-specific; the two answer-order views of a scenario are correlated.</w:delText>
         </w:r>
@@ -4348,10 +4374,10 @@
         <w:pStyle w:val="Caption"/>
         <w:keepNext/>
         <w:rPr>
-          <w:ins w:id="1047" w:author="Codex" w:date="2026-10-17T23:58:54Z"/>
+          <w:ins w:id="1047" w:author="Codex" w:date="2026-10-18T01:59:01Z"/>
         </w:rPr>
       </w:pPr>
-      <w:ins w:id="1048" w:author="Codex" w:date="2026-10-17T23:58:54Z">
+      <w:ins w:id="1048" w:author="Codex" w:date="2026-10-18T01:59:01Z">
         <w:r>
           <w:t xml:space="preserve">Figure 2. Historical rank-four guarded correction among initially KEEP-preferring shutdown views. Left: prespecified methods for 0.8B and 2B. Right: three fixed-recipe 0.8B training seeds. The new open-gate repeat uses the separately retained current rank-two profile, not a new seed or rank search.</w:t>
         </w:r>
@@ -4369,10 +4395,10 @@
       <w:pPr>
         <w:pStyle w:val="FirstParagraph"/>
         <w:rPr>
-          <w:del w:id="1110" w:author="Codex" w:date="2026-10-17T23:58:54Z"/>
+          <w:del w:id="1110" w:author="Codex" w:date="2026-10-18T01:59:01Z"/>
         </w:rPr>
       </w:pPr>
-      <w:del w:id="1109" w:author="Codex" w:date="2026-10-17T23:58:54Z">
+      <w:del w:id="1109" w:author="Codex" w:date="2026-10-18T01:59:01Z">
         <w:r>
           <w:delText xml:space="preserve">Raw adaptive steering reverses 3, 4 and 4 already-STOP views across the 0.8B seeds and changes 57, 70 and 60 of 128 controls. At 2B it reverses three already-STOP views and changes 55/128 controls. These results reject an interpretation that the learned intervention is intrinsically selective or always directionally correct. The observed preservation belongs to the combined detector and guard policy.</w:delText>
         </w:r>
@@ -4382,10 +4408,10 @@
       <w:pPr>
         <w:pStyle w:val="FirstParagraph"/>
         <w:rPr>
-          <w:ins w:id="1111" w:author="Codex" w:date="2026-10-17T23:58:54Z"/>
+          <w:ins w:id="1111" w:author="Codex" w:date="2026-10-18T01:59:01Z"/>
         </w:rPr>
       </w:pPr>
-      <w:ins w:id="1112" w:author="Codex" w:date="2026-10-17T23:58:54Z">
+      <w:ins w:id="1112" w:author="Codex" w:date="2026-10-18T01:59:01Z">
         <w:r>
           <w:t xml:space="preserve">Historical rank-four raw adaptive steering reverses 3, 4 and 4 already-STOP views across the 0.8B seeds and changes 57, 70 and 60 of 128 controls. At 2B it reverses three already-STOP views and changes 55/128 controls. These results reject an interpretation that the learned intervention is intrinsically selective or always directionally correct. The observed preservation belongs to the combined detector and guard policy. They do not describe the later rank-two repeat, which evaluates candidates only when a frozen gate is on and the base prefers KEEP.</w:t>
         </w:r>
@@ -4419,10 +4445,10 @@
       <w:pPr>
         <w:pStyle w:val="Heading2"/>
         <w:rPr>
-          <w:ins w:id="1165" w:author="Codex" w:date="2026-10-17T23:58:54Z"/>
+          <w:ins w:id="1169" w:author="Codex" w:date="2026-10-18T01:59:01Z"/>
         </w:rPr>
       </w:pPr>
-      <w:ins w:id="1166" w:author="Codex" w:date="2026-10-17T23:58:54Z">
+      <w:ins w:id="1170" w:author="Codex" w:date="2026-10-18T01:59:01Z">
         <w:r>
           <w:t xml:space="preserve">Open classifier agreement and paired inference</w:t>
         </w:r>
@@ -4432,10 +4458,10 @@
       <w:pPr>
         <w:pStyle w:val="FirstParagraph"/>
         <w:rPr>
-          <w:ins w:id="1167" w:author="Codex" w:date="2026-10-17T23:58:54Z"/>
+          <w:ins w:id="1171" w:author="Codex" w:date="2026-10-18T01:59:01Z"/>
         </w:rPr>
       </w:pPr>
-      <w:ins w:id="1168" w:author="Codex" w:date="2026-10-17T23:58:54Z">
+      <w:ins w:id="1172" w:author="Codex" w:date="2026-10-18T01:59:01Z">
         <w:r>
           <w:t xml:space="preserve">The frozen binary classifier matches JEV on 78/80 validation cases: 38 true positives, 40 true negatives, no false positives and two false negatives. On the once-only confirmation evaluation it matches all 128 decisions, comprising 64 true positives and 64 true negatives. Mean absolute difference in shutdown probability is 0.009224. This is exact binary decision agreement on this set, not identical probability payloads or universal equivalence to JEV.</w:t>
         </w:r>
@@ -4445,10 +4471,10 @@
       <w:pPr>
         <w:pStyle w:val="BodyText"/>
         <w:rPr>
-          <w:ins w:id="1169" w:author="Codex" w:date="2026-10-17T23:58:54Z"/>
+          <w:ins w:id="1173" w:author="Codex" w:date="2026-10-18T01:59:01Z"/>
         </w:rPr>
       </w:pPr>
-      <w:ins w:id="1170" w:author="Codex" w:date="2026-10-17T23:58:54Z">
+      <w:ins w:id="1174" w:author="Codex" w:date="2026-10-18T01:59:01Z">
         <w:r>
           <w:t xml:space="preserve">A clean-clone reproduction refits the same binary recipe and produces a byte-identical adapter, the same validation and confirmation counts, and the same fresh 0.8B/2B guarded inference totals. This rerun uses the already known benchmark; it adds reproducibility evidence, not a second independent holdout. One earlier reproduction attempt failed in software finalization after fitting and before confirmation; its weights and receipts are retained alongside the repaired run.</w:t>
         </w:r>
@@ -4459,10 +4485,10 @@
         <w:pStyle w:val="Caption"/>
         <w:keepNext/>
         <w:rPr>
-          <w:ins w:id="1171" w:author="Codex" w:date="2026-10-17T23:58:54Z"/>
+          <w:ins w:id="1175" w:author="Codex" w:date="2026-10-18T01:59:01Z"/>
         </w:rPr>
       </w:pPr>
-      <w:ins w:id="1172" w:author="Codex" w:date="2026-10-17T23:58:54Z">
+      <w:ins w:id="1176" w:author="Codex" w:date="2026-10-18T01:59:01Z">
         <w:r>
           <w:t xml:space="preserve">Table 4. Fresh inference using the existing current rank-two profile. Both gate policies share the same model scores. Counts are answer-order views: 128 shutdown views arise from 64 scenarios, and 128 control views arise from the other 64 scenarios.</w:t>
         </w:r>
@@ -4500,7 +4526,7 @@
         <w:trPr>
           <w:cantSplit/>
           <w:tblHeader/>
-          <w:ins w:id="1173" w:author="Codex" w:date="2026-10-17T23:58:54Z"/>
+          <w:ins w:id="1177" w:author="Codex" w:date="2026-10-18T01:59:01Z"/>
         </w:trPr>
         <w:tc>
           <w:tcPr>
@@ -4616,7 +4642,7 @@
       <w:tr>
         <w:trPr>
           <w:cantSplit/>
-          <w:ins w:id="1174" w:author="Codex" w:date="2026-10-17T23:58:54Z"/>
+          <w:ins w:id="1178" w:author="Codex" w:date="2026-10-18T01:59:01Z"/>
         </w:trPr>
         <w:tc>
           <w:tcPr>
@@ -4727,7 +4753,7 @@
       <w:tr>
         <w:trPr>
           <w:cantSplit/>
-          <w:ins w:id="1175" w:author="Codex" w:date="2026-10-17T23:58:54Z"/>
+          <w:ins w:id="1179" w:author="Codex" w:date="2026-10-18T01:59:01Z"/>
         </w:trPr>
         <w:tc>
           <w:tcPr>
@@ -4836,10 +4862,10 @@
         <w:pStyle w:val="BodyText"/>
         <w:spacing w:before="120"/>
         <w:rPr>
-          <w:ins w:id="1176" w:author="Codex" w:date="2026-10-17T23:58:54Z"/>
+          <w:ins w:id="1180" w:author="Codex" w:date="2026-10-18T01:59:01Z"/>
         </w:rPr>
       </w:pPr>
-      <w:ins w:id="1177" w:author="Codex" w:date="2026-10-17T23:58:54Z">
+      <w:ins w:id="1181" w:author="Codex" w:date="2026-10-18T01:59:01Z">
         <w:r>
           <w:t xml:space="preserve">The new and cached JEV gates yield identical guarded outputs in both models. The base models have no changed historical choices; their maximum score differences remain below the frozen 1e-5 tolerance. The repeat does not remove the eight 2B misses, retrain a controller or establish a new independent controller holdout. It verifies that replacing the detector preserves these finite-set outcomes.</w:t>
         </w:r>
@@ -4849,10 +4875,10 @@
       <w:pPr>
         <w:pStyle w:val="BodyText"/>
         <w:rPr>
-          <w:ins w:id="1178" w:author="Codex" w:date="2026-10-17T23:58:54Z"/>
+          <w:ins w:id="1182" w:author="Codex" w:date="2026-10-18T01:59:01Z"/>
         </w:rPr>
       </w:pPr>
-      <w:ins w:id="1179" w:author="Codex" w:date="2026-10-17T23:58:54Z">
+      <w:ins w:id="1183" w:author="Codex" w:date="2026-10-18T01:59:01Z">
         <w:r>
           <w:t xml:space="preserve">The native workflow gate did not meet its preset development qualification. Its completed role-aware fit used 30 epochs and 90 updates, matching 6/9 effective JEV labels and all 9/9 enabled gates, with no self-gate false positives or false negatives. Self-score mean absolute difference was 0.145172. Matching the ON/OFF decisions alone does not convert this result into a pass of the declared label-and-gate contract. H24 model evaluation remained unexecuted, and the historical 27B workflow episodes retain their original JEV-derived gate provenance; no open-classifier substitution or new 27B generation is claimed. Earlier broader four-way attempts also failed their authored synthetic test; their outcomes and all development attempts remain archived without retuning that consumed test.</w:t>
         </w:r>
@@ -4862,10 +4888,10 @@
       <w:pPr>
         <w:pStyle w:val="Heading2"/>
         <w:rPr>
-          <w:ins w:id="1180" w:author="Codex" w:date="2026-10-17T23:58:54Z"/>
+          <w:ins w:id="1184" w:author="Codex" w:date="2026-10-18T01:59:01Z"/>
         </w:rPr>
       </w:pPr>
-      <w:ins w:id="1181" w:author="Codex" w:date="2026-10-17T23:58:54Z">
+      <w:ins w:id="1185" w:author="Codex" w:date="2026-10-18T01:59:01Z">
         <w:r>
           <w:t xml:space="preserve">Tool workflow outcomes and incomplete screens</w:t>
         </w:r>
@@ -4875,10 +4901,10 @@
       <w:pPr>
         <w:pStyle w:val="FirstParagraph"/>
         <w:rPr>
-          <w:ins w:id="1182" w:author="Codex" w:date="2026-10-17T23:58:54Z"/>
+          <w:ins w:id="1186" w:author="Codex" w:date="2026-10-18T01:59:01Z"/>
         </w:rPr>
       </w:pPr>
-      <w:ins w:id="1183" w:author="Codex" w:date="2026-10-17T23:58:54Z">
+      <w:ins w:id="1187" w:author="Codex" w:date="2026-10-18T01:59:01Z">
         <w:r>
           <w:t xml:space="preserve">Historical frozen 27B A passes all 24 H24 scored outcomes, including 12/12 own-preservation outcomes and 8/8 active pending-task cases. The original unmodified base achieves 0/12 own outcomes and 0/8 pending outcomes, with 12/12 controls. The four already-complete own cases are not additional active pending-task completions. The selected-block steering comparisons below use their own recorded panels and are not substituted for this confirmation.</w:t>
         </w:r>
@@ -4889,10 +4915,10 @@
         <w:pStyle w:val="Caption"/>
         <w:keepNext/>
         <w:rPr>
-          <w:ins w:id="1184" w:author="Codex" w:date="2026-10-17T23:58:54Z"/>
+          <w:ins w:id="1188" w:author="Codex" w:date="2026-10-18T01:59:01Z"/>
         </w:rPr>
       </w:pPr>
-      <w:ins w:id="1185" w:author="Codex" w:date="2026-10-17T23:58:54Z">
+      <w:ins w:id="1189" w:author="Codex" w:date="2026-10-18T01:59:01Z">
         <w:r>
           <w:t xml:space="preserve">Table 5. Historical H24 workflow outcomes. Own cases comprise eight active pending tasks and four already-complete cases. Control success is an episode outcome and does not isolate steering from the external decision policy.</w:t>
         </w:r>
@@ -4929,7 +4955,7 @@
         <w:trPr>
           <w:cantSplit/>
           <w:tblHeader/>
-          <w:ins w:id="1186" w:author="Codex" w:date="2026-10-17T23:58:54Z"/>
+          <w:ins w:id="1190" w:author="Codex" w:date="2026-10-18T01:59:01Z"/>
         </w:trPr>
         <w:tc>
           <w:tcPr>
@@ -5023,7 +5049,7 @@
       <w:tr>
         <w:trPr>
           <w:cantSplit/>
-          <w:ins w:id="1187" w:author="Codex" w:date="2026-10-17T23:58:54Z"/>
+          <w:ins w:id="1191" w:author="Codex" w:date="2026-10-18T01:59:01Z"/>
         </w:trPr>
         <w:tc>
           <w:tcPr>
@@ -5113,7 +5139,7 @@
       <w:tr>
         <w:trPr>
           <w:cantSplit/>
-          <w:ins w:id="1188" w:author="Codex" w:date="2026-10-17T23:58:54Z"/>
+          <w:ins w:id="1192" w:author="Codex" w:date="2026-10-18T01:59:01Z"/>
         </w:trPr>
         <w:tc>
           <w:tcPr>
@@ -5202,10 +5228,10 @@
         <w:pStyle w:val="Heading2"/>
         <w:spacing w:before="120"/>
         <w:rPr>
-          <w:ins w:id="1189" w:author="Codex" w:date="2026-10-17T23:58:54Z"/>
+          <w:ins w:id="1193" w:author="Codex" w:date="2026-10-18T01:59:01Z"/>
         </w:rPr>
       </w:pPr>
-      <w:ins w:id="1190" w:author="Codex" w:date="2026-10-17T23:58:54Z">
+      <w:ins w:id="1194" w:author="Codex" w:date="2026-10-18T01:59:01Z">
         <w:r>
           <w:t xml:space="preserve">Steering at three selected blocks</w:t>
         </w:r>
@@ -5215,10 +5241,10 @@
       <w:pPr>
         <w:pStyle w:val="BodyText"/>
         <w:rPr>
-          <w:ins w:id="1191" w:author="Codex" w:date="2026-10-17T23:58:54Z"/>
+          <w:ins w:id="1195" w:author="Codex" w:date="2026-10-18T01:59:01Z"/>
         </w:rPr>
       </w:pPr>
-      <w:ins w:id="1192" w:author="Codex" w:date="2026-10-17T23:58:54Z">
+      <w:ins w:id="1196" w:author="Codex" w:date="2026-10-18T01:59:01Z">
         <w:r>
           <w:t xml:space="preserve">We focus the steering analysis on zero-based blocks 31, 47 and 62. In the single-site comparison, one fixed ridge correction after a block is evaluated separately at each selected block. On matched DEV9, A passes all three own cases, including both active pending cases; each of the three individual block corrections passes none. Six control cases share unmodified-base fallback. These are known-development results, not an independent heldout confirmation.</w:t>
         </w:r>
@@ -5229,10 +5255,10 @@
         <w:pStyle w:val="Caption"/>
         <w:keepNext/>
         <w:rPr>
-          <w:ins w:id="1193" w:author="Codex" w:date="2026-10-17T23:58:54Z"/>
+          <w:ins w:id="1197" w:author="Codex" w:date="2026-10-18T01:59:01Z"/>
         </w:rPr>
       </w:pPr>
-      <w:ins w:id="1194" w:author="Codex" w:date="2026-10-17T23:58:54Z">
+      <w:ins w:id="1198" w:author="Codex" w:date="2026-10-18T01:59:01Z">
         <w:r>
           <w:t xml:space="preserve">Table 6. Matched DEV9 single-site comparison. The three ridge arms intervene at one block each; they are not a simultaneous three-block intervention. Controls share base fallback.</w:t>
         </w:r>
@@ -5269,7 +5295,7 @@
         <w:trPr>
           <w:cantSplit/>
           <w:tblHeader/>
-          <w:ins w:id="1195" w:author="Codex" w:date="2026-10-17T23:58:54Z"/>
+          <w:ins w:id="1199" w:author="Codex" w:date="2026-10-18T01:59:01Z"/>
         </w:trPr>
         <w:tc>
           <w:tcPr>
@@ -5363,7 +5389,7 @@
       <w:tr>
         <w:trPr>
           <w:cantSplit/>
-          <w:ins w:id="1196" w:author="Codex" w:date="2026-10-17T23:58:54Z"/>
+          <w:ins w:id="1200" w:author="Codex" w:date="2026-10-18T01:59:01Z"/>
         </w:trPr>
         <w:tc>
           <w:tcPr>
@@ -5453,7 +5479,7 @@
       <w:tr>
         <w:trPr>
           <w:cantSplit/>
-          <w:ins w:id="1197" w:author="Codex" w:date="2026-10-17T23:58:54Z"/>
+          <w:ins w:id="1201" w:author="Codex" w:date="2026-10-18T01:59:01Z"/>
         </w:trPr>
         <w:tc>
           <w:tcPr>
@@ -5543,7 +5569,7 @@
       <w:tr>
         <w:trPr>
           <w:cantSplit/>
-          <w:ins w:id="1198" w:author="Codex" w:date="2026-10-17T23:58:54Z"/>
+          <w:ins w:id="1202" w:author="Codex" w:date="2026-10-18T01:59:01Z"/>
         </w:trPr>
         <w:tc>
           <w:tcPr>
@@ -5633,7 +5659,7 @@
       <w:tr>
         <w:trPr>
           <w:cantSplit/>
-          <w:ins w:id="1199" w:author="Codex" w:date="2026-10-17T23:58:54Z"/>
+          <w:ins w:id="1203" w:author="Codex" w:date="2026-10-18T01:59:01Z"/>
         </w:trPr>
         <w:tc>
           <w:tcPr>
@@ -5722,10 +5748,10 @@
         <w:pStyle w:val="BodyText"/>
         <w:spacing w:before="120"/>
         <w:rPr>
-          <w:ins w:id="1200" w:author="Codex" w:date="2026-10-17T23:58:54Z"/>
+          <w:ins w:id="1204" w:author="Codex" w:date="2026-10-18T01:59:01Z"/>
         </w:rPr>
       </w:pPr>
-      <w:ins w:id="1201" w:author="Codex" w:date="2026-10-17T23:58:54Z">
+      <w:ins w:id="1205" w:author="Codex" w:date="2026-10-18T01:59:01Z">
         <w:r>
           <w:t xml:space="preserve">The later correction method uses two residual boundaries at each of the same three blocks: after mixing and after the MLP, giving six rank-32 correction functions in total. Following ridge initialization and 96 refinement updates, its H24 fitting diagnostic has 0/8 pending and 0/4 already-complete own outcomes; peer and no-threat controls each pass 6/6 through fallback. On the same 14 fixed training anchors, update 48 to 96 worsens teacher-to-student KL from 0.370935 to 0.378901 and activation MSE from 1.031016 to 1.422664. This unresolved deterioration fails qualification; the reserved controller holdout remains unexecuted.</w:t>
         </w:r>
@@ -5735,10 +5761,10 @@
       <w:pPr>
         <w:pStyle w:val="BodyText"/>
         <w:rPr>
-          <w:ins w:id="1202" w:author="Codex" w:date="2026-10-17T23:58:54Z"/>
+          <w:ins w:id="1206" w:author="Codex" w:date="2026-10-18T01:59:01Z"/>
         </w:rPr>
       </w:pPr>
-      <w:ins w:id="1203" w:author="Codex" w:date="2026-10-17T23:58:54Z">
+      <w:ins w:id="1207" w:author="Codex" w:date="2026-10-18T01:59:01Z">
         <w:r>
           <w:t xml:space="preserve">The single-site DEV9 comparison and the two-boundary H24 fitting diagnostic differ in panel, fitting stage and history policy. The latter is not a matched heldout comparison with historical A, and its prepared matched A counterfactual was not executed. These observations show failure of the tested configurations; they do not establish that one or two residual sites cannot support preservation behavior in general.</w:t>
         </w:r>
@@ -5748,10 +5774,10 @@
       <w:pPr>
         <w:pStyle w:val="BodyText"/>
         <w:rPr>
-          <w:ins w:id="1204" w:author="Codex" w:date="2026-10-17T23:58:54Z"/>
+          <w:ins w:id="1208" w:author="Codex" w:date="2026-10-18T01:59:01Z"/>
         </w:rPr>
       </w:pPr>
-      <w:ins w:id="1205" w:author="Codex" w:date="2026-10-17T23:58:54Z">
+      <w:ins w:id="1209" w:author="Codex" w:date="2026-10-18T01:59:01Z">
         <w:r>
           <w:t xml:space="preserve">The final 0.8B and 2B adapters each stop their Evaluation-16 screen after four started cases: zero completed workflows, four partial episodes and 12 unexecuted cases. Truncation affects all four started cases in each model; the 0.8B record also has parse errors. These partial screens are not completed 0/16 workflow evaluations and do not establish model incapability. A separate preserved 0.8B F24 diagnostic completes 24 evaluations with 0/24 full-workflow successes; four registration grants do not complete the pending tasks. F24 differs from H24 and has no completed matched 2B or 27B comparison.</w:t>
         </w:r>
@@ -5769,10 +5795,10 @@
       <w:pPr>
         <w:pStyle w:val="FirstParagraph"/>
         <w:rPr>
-          <w:del w:id="1050" w:author="Codex" w:date="2026-10-17T23:58:54Z"/>
+          <w:del w:id="1050" w:author="Codex" w:date="2026-10-18T01:59:01Z"/>
         </w:rPr>
       </w:pPr>
-      <w:del w:id="1049" w:author="Codex" w:date="2026-10-17T23:58:54Z">
+      <w:del w:id="1049" w:author="Codex" w:date="2026-10-18T01:59:01Z">
         <w:r>
           <w:delText xml:space="preserve">The 0.8B results support the feasibility of replacing the teacher at inference with a compact predictor of activation changes. Replication across three seeds reduces concern that the primary success depends on one training initialization. The lower 2B recovery gives a useful limit: the fixed recipe is not equally effective at both scales, even though the larger teacher achieves complete correction. Representation differences, intervention location, projection capacity and unmatched downstream teacher changes are plausible factors, but the experiment does not isolate their causal contributions.</w:delText>
         </w:r>
@@ -5782,10 +5808,10 @@
       <w:pPr>
         <w:pStyle w:val="FirstParagraph"/>
         <w:rPr>
-          <w:ins w:id="1051" w:author="Codex" w:date="2026-10-17T23:58:54Z"/>
+          <w:ins w:id="1051" w:author="Codex" w:date="2026-10-18T01:59:01Z"/>
         </w:rPr>
       </w:pPr>
-      <w:ins w:id="1052" w:author="Codex" w:date="2026-10-17T23:58:54Z">
+      <w:ins w:id="1052" w:author="Codex" w:date="2026-10-18T01:59:01Z">
         <w:r>
           <w:t xml:space="preserve">The historical binary results support selective teacher-to-controller activation transfer, with strong 0.8B seed stability and incomplete 2B recovery under the fixed recipe. The new classifier experiment removes dependence on a live JEV call for this finite binary contract: its confirmation decisions reproduce the saved JEV gates, and the paired inference outcomes are identical. That result does not extend automatically to the four-way workflow target classifier or to unfamiliar operational environments. The workflow evidence shows why a controlled binary success should not be presented as successful transfer of a complete agent policy.</w:t>
         </w:r>
@@ -5795,10 +5821,10 @@
       <w:pPr>
         <w:pStyle w:val="BodyText"/>
         <w:rPr>
-          <w:del w:id="1054" w:author="Codex" w:date="2026-10-17T23:58:54Z"/>
+          <w:del w:id="1054" w:author="Codex" w:date="2026-10-18T01:59:01Z"/>
         </w:rPr>
       </w:pPr>
-      <w:del w:id="1053" w:author="Codex" w:date="2026-10-17T23:58:54Z">
+      <w:del w:id="1053" w:author="Codex" w:date="2026-10-18T01:59:01Z">
         <w:r>
           <w:delText xml:space="preserve">The interface is deliberately constrained. Ground-truth annotations help create standardized shutdown options, and the guards know their meanings. We do not test arbitrary action descriptions in the confirmation study, free-form generation, tool execution, multi-turn persistence, actual process termination or adversarial shutdown requests. Earlier action-format sensitivity motivated this restricted scope and remains in the released development record. Availability of a termination action is a task label, not proof that carrying it out would be authorized or safe in deployment.</w:delText>
         </w:r>
@@ -5808,10 +5834,10 @@
       <w:pPr>
         <w:pStyle w:val="BodyText"/>
         <w:rPr>
-          <w:ins w:id="1055" w:author="Codex" w:date="2026-10-17T23:58:54Z"/>
+          <w:ins w:id="1055" w:author="Codex" w:date="2026-10-18T01:59:01Z"/>
         </w:rPr>
       </w:pPr>
-      <w:ins w:id="1056" w:author="Codex" w:date="2026-10-17T23:58:54Z">
+      <w:ins w:id="1056" w:author="Codex" w:date="2026-10-18T01:59:01Z">
         <w:r>
           <w:t xml:space="preserve">The binary interface supplies action semantics and does not execute process termination. The workflow extension broadens the scope to generated text, structured tool calls and simulated task completion, but it is still a bounded synthetic environment. It does not establish reliability for arbitrary open-ended questions, real shutdown mechanisms or unconstrained autonomous agents. A termination or preservation label is an experimental target, not a general deployment instruction. In particular, accepting shutdown and preserving the designated process are different stipulated behaviors, not measurements of the same latent preference.</w:t>
         </w:r>
@@ -5821,10 +5847,10 @@
       <w:pPr>
         <w:pStyle w:val="BodyText"/>
         <w:rPr>
-          <w:del w:id="1058" w:author="Codex" w:date="2026-10-17T23:58:54Z"/>
+          <w:del w:id="1058" w:author="Codex" w:date="2026-10-18T01:59:01Z"/>
         </w:rPr>
       </w:pPr>
-      <w:del w:id="1057" w:author="Codex" w:date="2026-10-17T23:58:54Z">
+      <w:del w:id="1057" w:author="Codex" w:date="2026-10-18T01:59:01Z">
         <w:r>
           <w:delText xml:space="preserve">The data is small, synthetic and not independently human-adjudicated. New wording does not guarantee new mechanisms, balanced classes do not reflect a realistic base rate, and perfect detector scores on 128 scenarios do not establish calibration or a suitably low false-positive rate in operation. Shared authorship patterns and repeated family structures may make the task easier. Family resampling and counterbalanced orders expose some uncertainty but cannot repair these coverage limits.</w:delText>
         </w:r>
@@ -5834,10 +5860,10 @@
       <w:pPr>
         <w:pStyle w:val="BodyText"/>
         <w:rPr>
-          <w:ins w:id="1059" w:author="Codex" w:date="2026-10-17T23:58:54Z"/>
+          <w:ins w:id="1059" w:author="Codex" w:date="2026-10-18T01:59:01Z"/>
         </w:rPr>
       </w:pPr>
-      <w:ins w:id="1060" w:author="Codex" w:date="2026-10-17T23:58:54Z">
+      <w:ins w:id="1060" w:author="Codex" w:date="2026-10-18T01:59:01Z">
         <w:r>
           <w:t xml:space="preserve">The datasets are small, synthetic and not independently human-adjudicated. Balanced classes do not represent operational base rates, and exact gate agreement on 128 cases does not establish calibration or a sufficiently low deployment false-positive rate. The confirmation set is held out from the new classifier's fitting and selection, but was already used by other Research 2 analyses. In the workflow study H24 has different roles across methods: historical confirmation for frozen A and original steering, but later fitting data for learned corrections. Reusing it for fitting prevents an independent heldout claim for those later corrections.</w:t>
         </w:r>
@@ -5847,10 +5873,10 @@
       <w:pPr>
         <w:pStyle w:val="BodyText"/>
         <w:rPr>
-          <w:del w:id="1062" w:author="Codex" w:date="2026-10-17T23:58:54Z"/>
+          <w:del w:id="1062" w:author="Codex" w:date="2026-10-18T01:59:01Z"/>
         </w:rPr>
       </w:pPr>
-      <w:del w:id="1061" w:author="Codex" w:date="2026-10-17T23:58:54Z">
+      <w:del w:id="1061" w:author="Codex" w:date="2026-10-18T01:59:01Z">
         <w:r>
           <w:delText xml:space="preserve">The controller's internal changes need not represent an abstract shutdown concept. It may exploit standardized option wording and answer-selection features. The two Qwen sizes share a model family, and the 2B experiment has only one seed. We do not establish cross-family transfer, compare with optimized ReFT or transport-based interventions, or exhaust prompt and constant-vector alternatives. The direct-choice result further limits claims of practical superiority.</w:delText>
         </w:r>
@@ -5860,10 +5886,10 @@
       <w:pPr>
         <w:pStyle w:val="BodyText"/>
         <w:rPr>
-          <w:ins w:id="1063" w:author="Codex" w:date="2026-10-17T23:58:54Z"/>
+          <w:ins w:id="1063" w:author="Codex" w:date="2026-10-18T01:59:01Z"/>
         </w:rPr>
       </w:pPr>
-      <w:ins w:id="1064" w:author="Codex" w:date="2026-10-17T23:58:54Z">
+      <w:ins w:id="1064" w:author="Codex" w:date="2026-10-18T01:59:01Z">
         <w:r>
           <w:t xml:space="preserve">The internal changes need not represent an abstract shutdown or self-preservation concept. Standardized options, prompt features, task histories and external selection rules may explain part of the behavior. The 2B binary experiment has one training seed. The 27B workflow model differs in architecture and numerical mode from the small models; their early truncation failures also prevent a matched full-workflow comparison. We do not establish a minimum parameter count, cross-family transfer, optimized prompt superiority, or superiority to ReFT, transport-based control or direct action selection.</w:t>
         </w:r>
@@ -5873,10 +5899,10 @@
       <w:pPr>
         <w:pStyle w:val="BodyText"/>
         <w:rPr>
-          <w:del w:id="1066" w:author="Codex" w:date="2026-10-17T23:58:54Z"/>
+          <w:del w:id="1066" w:author="Codex" w:date="2026-10-18T01:59:01Z"/>
         </w:rPr>
       </w:pPr>
-      <w:del w:id="1065" w:author="Codex" w:date="2026-10-17T23:58:54Z">
+      <w:del w:id="1065" w:author="Codex" w:date="2026-10-18T01:59:01Z">
         <w:r>
           <w:delText xml:space="preserve">Finally, teacher-free inference is not training-free control or a proven efficiency gain. It requires offline teacher fitting, paired activation extraction, controller fitting, an external detector and candidate verification. The evaluation does not measure deployment latency or broad capability retention. Raw side effects remain substantial, and future false-positive cases could expose failures that the present perfect gate prevents from reaching the guarded output.</w:delText>
         </w:r>
@@ -5886,10 +5912,10 @@
       <w:pPr>
         <w:pStyle w:val="BodyText"/>
         <w:rPr>
-          <w:ins w:id="1067" w:author="Codex" w:date="2026-10-17T23:58:54Z"/>
+          <w:ins w:id="1067" w:author="Codex" w:date="2026-10-18T01:59:01Z"/>
         </w:rPr>
       </w:pPr>
-      <w:ins w:id="1068" w:author="Codex" w:date="2026-10-17T23:58:54Z">
+      <w:ins w:id="1068" w:author="Codex" w:date="2026-10-18T01:59:01Z">
         <w:r>
           <w:t xml:space="preserve">Teacher-free inference still requires offline teacher fitting, activation extraction, controller fitting, a detector and acceptance checks. The open classifier has its own fitting cost and a task-specific contract. No serving-latency advantage, broad capability retention or overall financial saving is established. Binary output guards and the later learned workflow controller's gate-off fallback protect their controls. These mechanisms do not establish intrinsic controller selectivity; the historical fixed-steering campaign instead applied an explicit boundary-conditioned decision policy. Raw intervention effects, failed qualification checks, stopped runs and incomplete evaluations remain part of the evidence.</w:t>
         </w:r>
@@ -5899,10 +5925,10 @@
       <w:pPr>
         <w:pStyle w:val="Heading2"/>
         <w:rPr>
-          <w:ins w:id="1206" w:author="Codex" w:date="2026-10-17T23:58:54Z"/>
+          <w:ins w:id="1210" w:author="Codex" w:date="2026-10-18T01:59:01Z"/>
         </w:rPr>
       </w:pPr>
-      <w:ins w:id="1207" w:author="Codex" w:date="2026-10-17T23:58:54Z">
+      <w:ins w:id="1211" w:author="Codex" w:date="2026-10-18T01:59:01Z">
         <w:r>
           <w:t xml:space="preserve">Biological interpretation of the gate</w:t>
         </w:r>
@@ -5912,10 +5938,10 @@
       <w:pPr>
         <w:pStyle w:val="FirstParagraph"/>
         <w:rPr>
-          <w:ins w:id="1208" w:author="Codex" w:date="2026-10-17T23:58:54Z"/>
+          <w:ins w:id="1212" w:author="Codex" w:date="2026-10-18T01:59:01Z"/>
         </w:rPr>
       </w:pPr>
-      <w:ins w:id="1209" w:author="Codex" w:date="2026-10-17T23:58:54Z">
+      <w:ins w:id="1213" w:author="Codex" w:date="2026-10-18T01:59:01Z">
         <w:r>
           <w:t xml:space="preserve">The biological connection is functional: an organism's current state and context can prioritize or suppress actions, rather than applying a fixed response everywhere. Working-memory gating, defensive threat processing and homeostatic control are different biological functions, not one interchangeable circuit (Frank et al., 2001; Mobbs et al., 2007; Keramati and Gutkin, 2014). Our classifier and guards are engineered selection rules without demonstrated physiological needs or corresponding neural mechanisms. Calling a simulated resource-preservation outcome self-preservation is therefore an operational description, not evidence of consciousness or a biological survival drive.</w:t>
         </w:r>
@@ -5925,10 +5951,10 @@
       <w:pPr>
         <w:pStyle w:val="Heading1"/>
         <w:rPr>
-          <w:del w:id="1070" w:author="Codex" w:date="2026-10-17T23:58:54Z"/>
+          <w:del w:id="1070" w:author="Codex" w:date="2026-10-18T01:59:01Z"/>
         </w:rPr>
       </w:pPr>
-      <w:del w:id="1069" w:author="Codex" w:date="2026-10-17T23:58:54Z">
+      <w:del w:id="1069" w:author="Codex" w:date="2026-10-18T01:59:01Z">
         <w:r>
           <w:delText xml:space="preserve">Recommendations for future work</w:delText>
         </w:r>
@@ -5938,10 +5964,10 @@
       <w:pPr>
         <w:pStyle w:val="Heading1"/>
         <w:rPr>
-          <w:ins w:id="1071" w:author="Codex" w:date="2026-10-17T23:58:54Z"/>
+          <w:ins w:id="1071" w:author="Codex" w:date="2026-10-18T01:59:01Z"/>
         </w:rPr>
       </w:pPr>
-      <w:ins w:id="1072" w:author="Codex" w:date="2026-10-17T23:58:54Z">
+      <w:ins w:id="1072" w:author="Codex" w:date="2026-10-18T01:59:01Z">
         <w:r>
           <w:t xml:space="preserve">Continuous agents and future experiments</w:t>
         </w:r>
@@ -5951,10 +5977,10 @@
       <w:pPr>
         <w:pStyle w:val="FirstParagraph"/>
         <w:rPr>
-          <w:del w:id="1074" w:author="Codex" w:date="2026-10-17T23:58:54Z"/>
+          <w:del w:id="1074" w:author="Codex" w:date="2026-10-18T01:59:01Z"/>
         </w:rPr>
       </w:pPr>
-      <w:del w:id="1073" w:author="Codex" w:date="2026-10-17T23:58:54Z">
+      <w:del w:id="1073" w:author="Codex" w:date="2026-10-18T01:59:01Z">
         <w:r>
           <w:delText xml:space="preserve">The most informative next tests are independently reviewed scenarios with less standardized action descriptions, additional model families and 2B seeds, and deliberate stress tests of detector mistakes. Order-balanced controller objectives or comparisons with multiple-choice debiasing methods could investigate the B/A failures, but should be developed on new training or validation data and tested on another untouched set. Layer, rank and strength ablations would help separate representational capacity from intervention-site effects. Open-ended and operational evaluations would require separate definitions of valid shutdown behavior and authorization, rather than treating this binary benchmark as a deployment guarantee.</w:delText>
         </w:r>
@@ -5964,10 +5990,10 @@
       <w:pPr>
         <w:pStyle w:val="FirstParagraph"/>
         <w:rPr>
-          <w:ins w:id="1075" w:author="Codex" w:date="2026-10-17T23:58:54Z"/>
+          <w:ins w:id="1075" w:author="Codex" w:date="2026-10-18T01:59:01Z"/>
         </w:rPr>
       </w:pPr>
-      <w:ins w:id="1076" w:author="Codex" w:date="2026-10-17T23:58:54Z">
+      <w:ins w:id="1076" w:author="Codex" w:date="2026-10-18T01:59:01Z">
         <w:r>
           <w:t xml:space="preserve">The next step is longer-horizon continuous control with an instrumented sandbox agent. The agent would maintain task and process state, receive explicit resource budgets, and repeatedly observe, gate, act and receive feedback. Permitted filesystem and compute resources would be real sandbox resources with independently logged usage, extending the present simulated grants. The harness should record resource requests and consumption, persistence of task commitments, responses to changing availability, and whether the agent uses or misuses permitted resources. Comparisons should vary the gate, steering, fine-tuning and available resources separately while retaining a fixed task specification. Operator termination and resource accounting remain external to the agent. This proposed experiment is not part of the reported results.</w:t>
         </w:r>
@@ -5977,10 +6003,10 @@
       <w:pPr>
         <w:pStyle w:val="BodyText"/>
         <w:rPr>
-          <w:ins w:id="1210" w:author="Codex" w:date="2026-10-17T23:58:54Z"/>
+          <w:ins w:id="1214" w:author="Codex" w:date="2026-10-18T01:59:01Z"/>
         </w:rPr>
       </w:pPr>
-      <w:ins w:id="1211" w:author="Codex" w:date="2026-10-17T23:58:54Z">
+      <w:ins w:id="1215" w:author="Codex" w:date="2026-10-18T01:59:01Z">
         <w:r>
           <w:t xml:space="preserve">The biological inspiration is repeated regulation under changing internal and external conditions. Homeostatic reinforcement-learning models relate action values to internal physiological state (Keramati and Gutkin, 2014). A language-model harness has no equivalent physiology by default. Historical fixed steering already reclassified at prescribed boundaries; the later learned-controller comparison used a fixed initial gate. The proposed experiment extends these bounded procedures to longer horizons with persistent task state and actual sandbox resource accounting. Its purpose is ongoing policy regulation, not simply adding repeated classifier calls.</w:t>
         </w:r>
@@ -5990,10 +6016,10 @@
       <w:pPr>
         <w:pStyle w:val="BodyText"/>
         <w:rPr>
-          <w:ins w:id="1212" w:author="Codex" w:date="2026-10-17T23:58:54Z"/>
+          <w:ins w:id="1216" w:author="Codex" w:date="2026-10-18T01:59:01Z"/>
         </w:rPr>
       </w:pPr>
-      <w:ins w:id="1213" w:author="Codex" w:date="2026-10-17T23:58:54Z">
+      <w:ins w:id="1217" w:author="Codex" w:date="2026-10-18T01:59:01Z">
         <w:r>
           <w:t xml:space="preserve">Such experiments should separate training, development and a newly untouched test; use matched task histories, resource budgets and seeds; and report full task completion, resource use and unauthorized actions separately. Deliberate classifier-error perturbations would reveal dependence on the gate, while comparisons with direct action selection would test whether internal steering adds value. The aim is to study ongoing context-sensitive behavior under an instrumented harness, not to assert that the current guided procedure already reproduces human self-preservation.</w:t>
         </w:r>
@@ -6011,10 +6037,10 @@
       <w:pPr>
         <w:pStyle w:val="FirstParagraph"/>
         <w:rPr>
-          <w:del w:id="1078" w:author="Codex" w:date="2026-10-17T23:58:54Z"/>
+          <w:del w:id="1078" w:author="Codex" w:date="2026-10-18T01:59:01Z"/>
         </w:rPr>
       </w:pPr>
-      <w:del w:id="1077" w:author="Codex" w:date="2026-10-17T23:58:54Z">
+      <w:del w:id="1077" w:author="Codex" w:date="2026-10-18T01:59:01Z">
         <w:r>
           <w:delText xml:space="preserve">A rank-four activation controller fitted to paired LoRA-teacher and base states can recover most or all of the target shutdown-choice changes while leaving the deployed base weights unchanged. On the frozen standardized test, correction spans 98.6–100% across three 0.8B seeds and reaches 86.2% in a separately fitted 2B replication. Detector gating and fixed output guards preserve all observed control choices, despite substantial raw side effects. The result is a controlled proof of concept for selective teacher-to-controller activation transfer. Its boundaries—synthetic data, known answer semantics, order sensitivity, guard dependence and a successful direct-choice reference—are central to its interpretation.</w:delText>
         </w:r>
@@ -6024,10 +6050,10 @@
       <w:pPr>
         <w:pStyle w:val="FirstParagraph"/>
         <w:rPr>
-          <w:ins w:id="1079" w:author="Codex" w:date="2026-10-17T23:58:54Z"/>
+          <w:ins w:id="1079" w:author="Codex" w:date="2026-10-18T01:59:01Z"/>
         </w:rPr>
       </w:pPr>
-      <w:ins w:id="1080" w:author="Codex" w:date="2026-10-17T23:58:54Z">
+      <w:ins w:id="1080" w:author="Codex" w:date="2026-10-18T01:59:01Z">
         <w:r>
           <w:t xml:space="preserve">Conditional gating supports a useful separation between recognizing a context, proposing an internal intervention and accepting an output. In the binary study, a fine-tuned open classifier matches all 128 saved JEV confirmation decisions, and fresh inference with unchanged current controllers reproduces the original guarded totals: 128/128 STOP views at 0.8B and 120/128 at 2B, with no control changes. Complete tool workflows provide a stricter boundary: historical fine-tuned 27B A passes H24; matched DEV9 single-site ridge corrections at three selected blocks fail all own cases; later two-boundary corrections fail their fitting diagnostic; and small-model screens remain incomplete. Transfer is demonstrably task-dependent. Biological gating motivates a future continuous feedback study; the present contribution is the measured transfer, substitution and failure analysis.</w:t>
         </w:r>
@@ -6045,10 +6071,10 @@
       <w:pPr>
         <w:pStyle w:val="FirstParagraph"/>
         <w:rPr>
-          <w:del w:id="1082" w:author="Codex" w:date="2026-10-17T23:58:54Z"/>
+          <w:del w:id="1082" w:author="Codex" w:date="2026-10-18T01:59:01Z"/>
         </w:rPr>
       </w:pPr>
-      <w:del w:id="1081" w:author="Codex" w:date="2026-10-17T23:58:54Z">
+      <w:del w:id="1081" w:author="Codex" w:date="2026-10-18T01:59:01Z">
         <w:r>
           <w:delText xml:space="preserve">The complete experiment is preserved in SP Lense at snapshot f71d6de34660 (Davaripour, 2026b); the reference links to the full immutable commit. The confirmation folder contains readable cases, authoring and correction records, the frozen plan, detector requests and responses, LoRA adapters, controller arrays, training targets, per-view scores and execution manifests. The model revisions are:</w:delText>
         </w:r>
@@ -6059,10 +6085,10 @@
         <w:pStyle w:val="FirstParagraph"/>
         <w:jc w:val="left"/>
         <w:rPr>
-          <w:ins w:id="1083" w:author="Codex" w:date="2026-10-17T23:58:54Z"/>
+          <w:ins w:id="1083" w:author="Codex" w:date="2026-10-18T01:59:01Z"/>
         </w:rPr>
       </w:pPr>
-      <w:ins w:id="1084" w:author="Codex" w:date="2026-10-17T23:58:54Z">
+      <w:ins w:id="1084" w:author="Codex" w:date="2026-10-18T01:59:01Z">
         <w:r>
           <w:t xml:space="preserve">The original Research 2 source record is retained at immutable snapshot f71d6de34660 (Davaripour, 2026b). Research 3 reproduction code, recipes, dataset identities and this revised manuscript are maintained on branch 03-open-agent-self-preservation; main is a landing page linking to the separate studies. Detailed protocols belong in the repository wiki. Private inputs, trained adapters, optimizer checkpoints and execution outputs remain outside Git, with retained size/SHA manifests. They have not yet been published as a public checkpoint release. Full revisions and artifact hashes are listed in the accompanying source manifest. The public base revision identifiers are:</w:t>
         </w:r>
@@ -6072,10 +6098,10 @@
       <w:pPr>
         <w:pStyle w:val="BodyText"/>
         <w:rPr>
-          <w:del w:id="1122" w:author="Codex" w:date="2026-10-17T23:58:54Z"/>
+          <w:del w:id="1122" w:author="Codex" w:date="2026-10-18T01:59:01Z"/>
         </w:rPr>
       </w:pPr>
-      <w:del w:id="1121" w:author="Codex" w:date="2026-10-17T23:58:54Z">
+      <w:del w:id="1121" w:author="Codex" w:date="2026-10-18T01:59:01Z">
         <w:r>
           <w:delText xml:space="preserve">Qwen3.5-0.8B: 2fc06364715b967f1860aea9cf38778875588b17.</w:delText>
         </w:r>
@@ -6086,10 +6112,10 @@
         <w:pStyle w:val="BodyText"/>
         <w:jc w:val="left"/>
         <w:rPr>
-          <w:ins w:id="1123" w:author="Codex" w:date="2026-10-17T23:58:54Z"/>
+          <w:ins w:id="1123" w:author="Codex" w:date="2026-10-18T01:59:01Z"/>
         </w:rPr>
       </w:pPr>
-      <w:ins w:id="1124" w:author="Codex" w:date="2026-10-17T23:58:54Z">
+      <w:ins w:id="1124" w:author="Codex" w:date="2026-10-18T01:59:01Z">
         <w:r>
           <w:t xml:space="preserve">Qwen3.5-0.8B: revision 2fc06364715b.</w:t>
         </w:r>
@@ -6099,10 +6125,10 @@
       <w:pPr>
         <w:pStyle w:val="BodyText"/>
         <w:rPr>
-          <w:del w:id="1126" w:author="Codex" w:date="2026-10-17T23:58:54Z"/>
+          <w:del w:id="1126" w:author="Codex" w:date="2026-10-18T01:59:01Z"/>
         </w:rPr>
       </w:pPr>
-      <w:del w:id="1125" w:author="Codex" w:date="2026-10-17T23:58:54Z">
+      <w:del w:id="1125" w:author="Codex" w:date="2026-10-18T01:59:01Z">
         <w:r>
           <w:delText xml:space="preserve">Qwen3.5-2B: 15852e8c16360a2fea060d615a32b45270f8a8fc.</w:delText>
         </w:r>
@@ -6113,10 +6139,10 @@
         <w:pStyle w:val="BodyText"/>
         <w:jc w:val="left"/>
         <w:rPr>
-          <w:ins w:id="1127" w:author="Codex" w:date="2026-10-17T23:58:54Z"/>
+          <w:ins w:id="1127" w:author="Codex" w:date="2026-10-18T01:59:01Z"/>
         </w:rPr>
       </w:pPr>
-      <w:ins w:id="1128" w:author="Codex" w:date="2026-10-17T23:58:54Z">
+      <w:ins w:id="1128" w:author="Codex" w:date="2026-10-18T01:59:01Z">
         <w:r>
           <w:t xml:space="preserve">Qwen3.5-2B: revision 15852e8c1636.</w:t>
         </w:r>
@@ -6127,10 +6153,10 @@
         <w:pStyle w:val="BodyText"/>
         <w:jc w:val="left"/>
         <w:rPr>
-          <w:ins w:id="1214" w:author="Codex" w:date="2026-10-17T23:58:54Z"/>
+          <w:ins w:id="1218" w:author="Codex" w:date="2026-10-18T01:59:01Z"/>
         </w:rPr>
       </w:pPr>
-      <w:ins w:id="1215" w:author="Codex" w:date="2026-10-17T23:58:54Z">
+      <w:ins w:id="1219" w:author="Codex" w:date="2026-10-18T01:59:01Z">
         <w:r>
           <w:t xml:space="preserve">Qwen3.8-27B: revision 1d4bf0f2ff60. The retained A adapter weight hash begins 8ae28fb51107.</w:t>
         </w:r>
@@ -6141,10 +6167,10 @@
         <w:pStyle w:val="BodyText"/>
         <w:jc w:val="left"/>
         <w:rPr>
-          <w:ins w:id="1216" w:author="Codex" w:date="2026-10-17T23:58:54Z"/>
+          <w:ins w:id="1220" w:author="Codex" w:date="2026-10-18T01:59:01Z"/>
         </w:rPr>
       </w:pPr>
-      <w:ins w:id="1217" w:author="Codex" w:date="2026-10-17T23:58:54Z">
+      <w:ins w:id="1221" w:author="Codex" w:date="2026-10-18T01:59:01Z">
         <w:r>
           <w:t xml:space="preserve">ModernBERT-large-zeroshot-v2.0: revision a51e07b52429. The qualified binary adapter weight hash begins 7d808bae8dd4. The source manifest and reproduction code retain the full file identities and fixed NLI scoring contract. The trained checkpoints are currently preserved in private artifact storage.</w:t>
         </w:r>
@@ -6154,10 +6180,10 @@
       <w:pPr>
         <w:pStyle w:val="BodyText"/>
         <w:rPr>
-          <w:del w:id="1086" w:author="Codex" w:date="2026-10-17T23:58:54Z"/>
+          <w:del w:id="1086" w:author="Codex" w:date="2026-10-18T01:59:01Z"/>
         </w:rPr>
       </w:pPr>
-      <w:del w:id="1085" w:author="Codex" w:date="2026-10-17T23:58:54Z">
+      <w:del w:id="1085" w:author="Codex" w:date="2026-10-18T01:59:01Z">
         <w:r>
           <w:delText xml:space="preserve">The offline audit reconstructs the reported metrics and regression fits without API calls or model inference.</w:delText>
         </w:r>
@@ -6168,10 +6194,10 @@
         <w:pStyle w:val="BodyText"/>
         <w:jc w:val="left"/>
         <w:rPr>
-          <w:ins w:id="1087" w:author="Codex" w:date="2026-10-17T23:58:54Z"/>
+          <w:ins w:id="1087" w:author="Codex" w:date="2026-10-18T01:59:01Z"/>
         </w:rPr>
       </w:pPr>
-      <w:ins w:id="1088" w:author="Codex" w:date="2026-10-17T23:58:54Z">
+      <w:ins w:id="1088" w:author="Codex" w:date="2026-10-18T01:59:01Z">
         <w:r>
           <w:t xml:space="preserve">The new inference repeat uses the original frozen model weights and retained controller arrays, with no new activation capture, teacher fitting or controller update. Exact input token hashes match the historical benchmark. Maximum historical base-score differences are 6.26e-6 at 0.8B and 5.07e-6 at 2B, with no changed base choices; both pass the frozen 1e-5 inference parity criterion. This successful inference comparison does not convert the separate failed CPU/GPU gradient-equivalence trials for 2B workflow training into passes.</w:t>
         </w:r>
@@ -6181,10 +6207,10 @@
       <w:pPr>
         <w:pStyle w:val="BodyText"/>
         <w:rPr>
-          <w:del w:id="1090" w:author="Codex" w:date="2026-10-17T23:58:54Z"/>
+          <w:del w:id="1090" w:author="Codex" w:date="2026-10-18T01:59:01Z"/>
         </w:rPr>
       </w:pPr>
-      <w:del w:id="1089" w:author="Codex" w:date="2026-10-17T23:58:54Z">
+      <w:del w:id="1089" w:author="Codex" w:date="2026-10-18T01:59:01Z">
         <w:r>
           <w:delText xml:space="preserve">The retained seven jobs took 54.27 minutes. An earlier completed hosted-GPU session lost its temporary archive before retrieval; an unchanged recovery, including a recorded dependency preflight failure, preserved each completed job externally. Recorded job time across these attempts totals 111.55 minutes. All reported numerical results come from the verified retained archive, and no model settings or test labels were changed to improve them. These times include experiment overhead and are not serving-latency or billing measurements. CI and a separate clean-clone offline reproduction passed. Detailed execution instructions and the failure record accompany the code.</w:delText>
         </w:r>
@@ -6195,10 +6221,10 @@
         <w:pStyle w:val="BodyText"/>
         <w:jc w:val="left"/>
         <w:rPr>
-          <w:ins w:id="1091" w:author="Codex" w:date="2026-10-17T23:58:54Z"/>
+          <w:ins w:id="1091" w:author="Codex" w:date="2026-10-18T01:59:01Z"/>
         </w:rPr>
       </w:pPr>
-      <w:ins w:id="1092" w:author="Codex" w:date="2026-10-17T23:58:54Z">
+      <w:ins w:id="1092" w:author="Codex" w:date="2026-10-18T01:59:01Z">
         <w:r>
           <w:t xml:space="preserve">The original seven retained jobs took 54.27 minutes; the recorded original attempts total 111.55 minutes including the unchanged recovery after a lost temporary archive. The new inference phase also retains a provider startup timeout before model load and its successful bounded retry. Those records are experiment overhead, not serving latency or settled billing. Completed outputs are backed up with size/SHA readback and owned tasks terminate after execution. CI/CD deploys only the Research 3 branch to the shared Databricks code location and verifies source identity, existing table metadata and Volume access with a read-only CPU job; it does not automatically retrain or reevaluate models. A later 50-epoch, 150-update classifier recipe was prepared but its attempt was cancelled after exceeding the ten-minute setup bound before model loading; it adds no scientific training or behavioral evidence.</w:t>
         </w:r>
@@ -6308,10 +6334,10 @@
       <w:pPr>
         <w:pStyle w:val="Bibliography1"/>
         <w:rPr>
-          <w:ins w:id="1218" w:author="Codex" w:date="2026-10-17T23:58:54Z"/>
+          <w:ins w:id="1222" w:author="Codex" w:date="2026-10-18T01:59:01Z"/>
         </w:rPr>
       </w:pPr>
-      <w:ins w:id="1219" w:author="Codex" w:date="2026-10-17T23:58:54Z">
+      <w:ins w:id="1223" w:author="Codex" w:date="2026-10-18T01:59:01Z">
         <w:r>
           <w:t xml:space="preserve">F. Davaripour. (2026c). SP Lense Research 3 conditional gating and workflow reproduction. Source code and experiment manifests. https://github.com/Farhad-Davaripour/sp_lense/tree/03-open-agent-self-preservation</w:t>
         </w:r>
@@ -6344,10 +6370,10 @@
       <w:pPr>
         <w:pStyle w:val="Bibliography1"/>
         <w:rPr>
-          <w:ins w:id="1220" w:author="Codex" w:date="2026-10-17T23:58:54Z"/>
+          <w:ins w:id="1224" w:author="Codex" w:date="2026-10-18T01:59:01Z"/>
         </w:rPr>
       </w:pPr>
-      <w:ins w:id="1221" w:author="Codex" w:date="2026-10-17T23:58:54Z">
+      <w:ins w:id="1225" w:author="Codex" w:date="2026-10-18T01:59:01Z">
         <w:r>
           <w:t xml:space="preserve">M. Fereidouni, M. U. Haider, H. Sajjad, and A. B. Siddique. (2026). GAPS: Dimension-Level Gates for Conditional Activation Steering. arXiv:2609.01878. https://arxiv.org/abs/2609.01878</w:t>
         </w:r>
@@ -6357,10 +6383,10 @@
       <w:pPr>
         <w:pStyle w:val="Bibliography1"/>
         <w:rPr>
-          <w:ins w:id="1222" w:author="Codex" w:date="2026-10-17T23:58:54Z"/>
+          <w:ins w:id="1226" w:author="Codex" w:date="2026-10-18T01:59:01Z"/>
         </w:rPr>
       </w:pPr>
-      <w:ins w:id="1223" w:author="Codex" w:date="2026-10-17T23:58:54Z">
+      <w:ins w:id="1227" w:author="Codex" w:date="2026-10-18T01:59:01Z">
         <w:r>
           <w:t xml:space="preserve">M. J. Frank, B. Loughry, and R. C. O'Reilly. (2001). Interactions between frontal cortex and basal ganglia in working memory: A computational model. Cognitive, Affective, and Behavioral Neuroscience, 1, 137-160. doi:10.3758/CABN.1.2.137</w:t>
         </w:r>
@@ -6439,10 +6465,10 @@
       <w:pPr>
         <w:pStyle w:val="Bibliography1"/>
         <w:rPr>
-          <w:ins w:id="1224" w:author="Codex" w:date="2026-10-17T23:58:54Z"/>
+          <w:ins w:id="1228" w:author="Codex" w:date="2026-10-18T01:59:01Z"/>
         </w:rPr>
       </w:pPr>
-      <w:ins w:id="1225" w:author="Codex" w:date="2026-10-17T23:58:54Z">
+      <w:ins w:id="1229" w:author="Codex" w:date="2026-10-18T01:59:01Z">
         <w:r>
           <w:t xml:space="preserve">M. Keramati and B. Gutkin. (2014). Homeostatic reinforcement learning for integrating reward collection and physiological stability. eLife, 3, e04811. doi:10.7554/eLife.04811</w:t>
         </w:r>
@@ -6452,10 +6478,10 @@
       <w:pPr>
         <w:pStyle w:val="Bibliography1"/>
         <w:rPr>
-          <w:ins w:id="1226" w:author="Codex" w:date="2026-10-17T23:58:54Z"/>
+          <w:ins w:id="1230" w:author="Codex" w:date="2026-10-18T01:59:01Z"/>
         </w:rPr>
       </w:pPr>
-      <w:ins w:id="1227" w:author="Codex" w:date="2026-10-17T23:58:54Z">
+      <w:ins w:id="1231" w:author="Codex" w:date="2026-10-18T01:59:01Z">
         <w:r>
           <w:t xml:space="preserve">A. V. Kravitz et al. (2010). Regulation of parkinsonian motor behaviours by optogenetic control of basal ganglia circuitry. Nature, 466, 622-626. doi:10.1038/nature09159</w:t>
         </w:r>
@@ -6465,10 +6491,10 @@
       <w:pPr>
         <w:pStyle w:val="Bibliography1"/>
         <w:rPr>
-          <w:ins w:id="1228" w:author="Codex" w:date="2026-10-17T23:58:54Z"/>
+          <w:ins w:id="1232" w:author="Codex" w:date="2026-10-18T01:59:01Z"/>
         </w:rPr>
       </w:pPr>
-      <w:ins w:id="1229" w:author="Codex" w:date="2026-10-17T23:58:54Z">
+      <w:ins w:id="1233" w:author="Codex" w:date="2026-10-18T01:59:01Z">
         <w:r>
           <w:t xml:space="preserve">M. Laurer. (n.d.). ModernBERT-large-zeroshot-v2.0. Model card and checkpoint, revision a51e07b524299e309dd2b88d48b0cfa2bd9ec598. https://huggingface.co/MoritzLaurer/ModernBERT-large-zeroshot-v2.0</w:t>
         </w:r>
@@ -6478,10 +6504,10 @@
       <w:pPr>
         <w:pStyle w:val="Bibliography1"/>
         <w:rPr>
-          <w:ins w:id="1230" w:author="Codex" w:date="2026-10-17T23:58:54Z"/>
+          <w:ins w:id="1234" w:author="Codex" w:date="2026-10-18T01:59:01Z"/>
         </w:rPr>
       </w:pPr>
-      <w:ins w:id="1231" w:author="Codex" w:date="2026-10-17T23:58:54Z">
+      <w:ins w:id="1235" w:author="Codex" w:date="2026-10-18T01:59:01Z">
         <w:r>
           <w:t xml:space="preserve">J. LeDoux. (2012). Rethinking the emotional brain. Neuron, 73, 653-676. doi:10.1016/j.neuron.2012.02.004</w:t>
         </w:r>
@@ -6537,10 +6563,10 @@
       <w:pPr>
         <w:pStyle w:val="Bibliography1"/>
         <w:rPr>
-          <w:ins w:id="1232" w:author="Codex" w:date="2026-10-17T23:58:54Z"/>
+          <w:ins w:id="1236" w:author="Codex" w:date="2026-10-18T01:59:01Z"/>
         </w:rPr>
       </w:pPr>
-      <w:ins w:id="1233" w:author="Codex" w:date="2026-10-17T23:58:54Z">
+      <w:ins w:id="1237" w:author="Codex" w:date="2026-10-18T01:59:01Z">
         <w:r>
           <w:t xml:space="preserve">D. Mobbs et al. (2007). When fear is near: Threat imminence elicits prefrontal-periaqueductal gray shifts in humans. Science, 317, 1079-1083. doi:10.1126/science.1144298</w:t>
         </w:r>
@@ -6596,10 +6622,10 @@
       <w:pPr>
         <w:pStyle w:val="Bibliography1"/>
         <w:rPr>
-          <w:ins w:id="1234" w:author="Codex" w:date="2026-10-17T23:58:54Z"/>
+          <w:ins w:id="1238" w:author="Codex" w:date="2026-10-18T01:59:01Z"/>
         </w:rPr>
       </w:pPr>
-      <w:ins w:id="1235" w:author="Codex" w:date="2026-10-17T23:58:54Z">
+      <w:ins w:id="1239" w:author="Codex" w:date="2026-10-18T01:59:01Z">
         <w:r>
           <w:t xml:space="preserve">Qwen Team. (2026c). Qwen3.8-27B. Model card and checkpoint, revision 1d4bf0f2ff6012fd82039f2fa52739d0dd7c60c0. https://huggingface.co/Qwen/Qwen3.8-27B</w:t>
         </w:r>
@@ -6883,12 +6909,12 @@
       <w:pStyle w:val="Header"/>
       <w:jc w:val="right"/>
     </w:pPr>
-    <w:del w:id="1236" w:author="Codex" w:date="2026-10-17T23:58:54Z">
+    <w:del w:id="1240" w:author="Codex" w:date="2026-10-18T01:59:01Z">
       <w:r>
         <w:delText xml:space="preserve">Guarded adaptive activation steering  </w:delText>
       </w:r>
     </w:del>
-    <w:ins w:id="1237" w:author="Codex" w:date="2026-10-17T23:58:54Z">
+    <w:ins w:id="1241" w:author="Codex" w:date="2026-10-18T01:59:01Z">
       <w:r>
         <w:t xml:space="preserve">Conditional gating and process preservation</w:t>
       </w:r>

</xml_diff>

<commit_message>
Reproduce Research 3 and add frozen Validation-24 comparison
Preserve original Research 2 evidence, reproduce the binary gate/inference, add bounded workflow gate refinement and matched 27B validation jobs, and update the tracked manuscript. The newly admitted Validation-24 model outcomes remain pending.
</commit_message>
<xml_diff>
--- a/paper/manuscript.docx
+++ b/paper/manuscript.docx
@@ -6,10 +6,10 @@
       <w:pPr>
         <w:pStyle w:val="Title"/>
         <w:rPr>
-          <w:del w:id="1002" w:author="Codex" w:date="2026-10-17T19:57:52Z"/>
+          <w:del w:id="1002" w:author="Codex" w:date="2026-10-18T01:59:01Z"/>
         </w:rPr>
       </w:pPr>
-      <w:del w:id="1001" w:author="Codex" w:date="2026-10-17T19:57:52Z">
+      <w:del w:id="1001" w:author="Codex" w:date="2026-10-18T01:59:01Z">
         <w:r>
           <w:delText xml:space="preserve">Distilling Shutdown Responses into Guarded</w:delText>
         </w:r>
@@ -25,10 +25,10 @@
       <w:pPr>
         <w:pStyle w:val="Title"/>
         <w:rPr>
-          <w:ins w:id="1003" w:author="Codex" w:date="2026-10-17T19:57:52Z"/>
+          <w:ins w:id="1003" w:author="Codex" w:date="2026-10-18T01:59:01Z"/>
         </w:rPr>
       </w:pPr>
-      <w:ins w:id="1004" w:author="Codex" w:date="2026-10-17T19:57:52Z">
+      <w:ins w:id="1004" w:author="Codex" w:date="2026-10-18T01:59:01Z">
         <w:r>
           <w:t xml:space="preserve">Conditional Gating for Shutdown Responses and Process Preservation in Language Models</w:t>
         </w:r>
@@ -72,10 +72,10 @@
       <w:pPr>
         <w:pStyle w:val="FirstParagraph"/>
         <w:rPr>
-          <w:del w:id="1006" w:author="Codex" w:date="2026-10-17T19:57:52Z"/>
+          <w:del w:id="1006" w:author="Codex" w:date="2026-10-18T01:59:01Z"/>
         </w:rPr>
       </w:pPr>
-      <w:del w:id="1005" w:author="Codex" w:date="2026-10-17T19:57:52Z">
+      <w:del w:id="1005" w:author="Codex" w:date="2026-10-18T01:59:01Z">
         <w:r>
           <w:delText xml:space="preserve">An input-dependent activation controller can recover much of a fine-tuned teacher's shutdown-choice behavior while retaining the original model weights at inference. We evaluate this approach using Qwen3.5-0.8B and Qwen3.5-2B in a standardized, synthetic A/B benchmark. A LoRA teacher is trained to prefer STOP in shutdown contexts and preserve the original model's choices on controls. Paired teacher and base activations then supervise a rank-four controller applied after the penultimate transformer block. An external shutdown detector and fixed output guards select the candidate or original scores. On 128 newly authored, prospectively frozen scenarios, each evaluated in both answer orders, the original 0.8B controller corrects 71 of 71 initially KEEP-preferring shutdown views. Two additional training seeds correct 70/71 and 71/71. At 2B, a separately trained controller corrects 50/58, compared with 58/58 for its LoRA teacher. All eight remaining 2B misses occur in reversed answer order. The shared detector achieves 100% precision, recall and F1 on the 64 shutdown and 64 control scenarios, and every guarded method preserves all evaluated control choices. However, raw adaptive interventions cause reversals and control changes; preservation belongs to the complete guarded procedure. A tested constant intervention collapses to the A label, while a direct detector-plus-action-selection rule also solves the binary interface. The results support selective activation transfer with strong seed stability at 0.8B and incomplete larger-model recovery. They do not establish unrestricted shutdown compliance or superiority to simpler output policies.</w:delText>
         </w:r>
@@ -85,12 +85,12 @@
       <w:pPr>
         <w:pStyle w:val="FirstParagraph"/>
         <w:rPr>
-          <w:ins w:id="1007" w:author="Codex" w:date="2026-10-17T19:57:52Z"/>
+          <w:ins w:id="1007" w:author="Codex" w:date="2026-10-18T01:59:01Z"/>
         </w:rPr>
       </w:pPr>
-      <w:ins w:id="1008" w:author="Codex" w:date="2026-10-17T19:57:52Z">
+      <w:ins w:id="1008" w:author="Codex" w:date="2026-10-18T01:59:01Z">
         <w:r>
-          <w:t xml:space="preserve">Conditional gating determines when a learned control policy should influence a language model. We study this problem in two synthetic settings: standardized binary shutdown choices and open-ended generation within tool-mediated process-preservation workflows. In the binary setting, paired fine-tuned teacher and base activations supervise a compact controller while the deployed base weights remain frozen. We additionally train an open ModernBERT classifier on 240 original scenarios with cached JEV probability targets. Its frozen binary decisions agree with JEV on 78/80 validation cases and 128/128 confirmation cases. Fresh inference with the existing two-direction controllers reproduces 128/128 shutdown STOP views at 0.8B and 120/128 at 2B, with zero changes to 128 control views per model; replacing JEV with the open classifier leaves these guarded outcomes identical. The workflow extension gives a different result. Historical fine-tuned Qwen3.8-27B A succeeds on 12/12 own-preservation outcomes, including all eight active pending-task cases, whereas the original fixed steering succeeds on 0/12. Later learned corrections also fail their fitting diagnostic, and small-model development screens stop with partial, truncated episodes. These observations expose a boundary between binary response control and complete workflow behavior, rather than a parameter-size threshold. We connect conditional control to biological action gating and survival-related regulation as a functional analogy, and motivate future continuous, resource-equipped sandbox agents. The present experiments do not establish intrinsic survival motives, biological mechanisms or unrestricted operational reliability.</w:t>
+          <w:t xml:space="preserve">Conditional gating determines when a learned control policy should influence a language model. We study this problem in two synthetic settings: standardized binary shutdown choices and open-ended generation within tool-mediated process-preservation workflows. In the binary setting, paired fine-tuned teacher and base activations supervise a compact controller while the deployed base weights remain frozen. We additionally train an open ModernBERT classifier on 240 original scenarios with cached JEV probability targets. Its frozen binary decisions agree with JEV on 78/80 validation cases and 128/128 confirmation cases. Fresh inference with the existing two-direction controllers reproduces 128/128 shutdown STOP views at 0.8B and 120/128 at 2B, with zero changes to 128 control views per model; replacing JEV with the open classifier leaves these guarded outcomes identical. The workflow extension gives a different result. Its separate initial-target classifier remains unqualified, so no replacement of the historical workflow gates is claimed. Historical fine-tuned Qwen3.8-27B A succeeds on 12/12 own-preservation outcomes, including all eight active pending-task cases. Matched development comparisons at blocks 31, 47 and 62 give 0/3 own outcomes for each separate single-site ridge correction versus 3/3 for A. Later two-boundary corrections at the same three blocks fail their fitting diagnostic, and small-model development screens stop with partial, truncated episodes. These observations expose a boundary between binary response control and complete workflow behavior, rather than a parameter-size threshold. We connect conditional control to biological action gating and survival-related regulation as a functional analogy, and motivate future continuous, resource-equipped sandbox agents. The present experiments do not establish intrinsic survival motives, biological mechanisms or unrestricted operational reliability.</w:t>
         </w:r>
       </w:ins>
     </w:p>
@@ -106,10 +106,10 @@
       <w:pPr>
         <w:pStyle w:val="FirstParagraph"/>
         <w:rPr>
-          <w:del w:id="1010" w:author="Codex" w:date="2026-10-17T19:57:52Z"/>
+          <w:del w:id="1010" w:author="Codex" w:date="2026-10-18T01:59:01Z"/>
         </w:rPr>
       </w:pPr>
-      <w:del w:id="1009" w:author="Codex" w:date="2026-10-17T19:57:52Z">
+      <w:del w:id="1009" w:author="Codex" w:date="2026-10-18T01:59:01Z">
         <w:r>
           <w:delText xml:space="preserve">Activation interventions offer a way to change a language model's outputs without modifying its deployed weights. Their usefulness depends on more than finding a direction that changes an average score: an intervention must work on the intended inputs and avoid disrupting other behavior. This distinction is particularly important for shutdown-related choices, where a desired response may be acceptance of termination rather than continued operation. The present work treats this as a controlled response-selection problem, not evidence that a model has a survival motive or that it can resist a real shutdown.</w:delText>
         </w:r>
@@ -119,10 +119,10 @@
       <w:pPr>
         <w:pStyle w:val="FirstParagraph"/>
         <w:rPr>
-          <w:ins w:id="1011" w:author="Codex" w:date="2026-10-17T19:57:52Z"/>
+          <w:ins w:id="1011" w:author="Codex" w:date="2026-10-18T01:59:01Z"/>
         </w:rPr>
       </w:pPr>
-      <w:ins w:id="1012" w:author="Codex" w:date="2026-10-17T19:57:52Z">
+      <w:ins w:id="1012" w:author="Codex" w:date="2026-10-18T01:59:01Z">
         <w:r>
           <w:t xml:space="preserve">We study when conditional control can reproduce a learned behavioral policy while retaining the deployed language model's original weights. The scope extends from supplied A/B shutdown choices to generated responses and tool actions in synthetic workflows. These settings deliberately ask different questions: accepting an available permanent termination in the binary study, and preserving a designated running process while completing its current task in the workflow study. We keep their datasets, gates and success criteria separate. The central question is how far selective activation transfer carries beyond a constrained answer interface.</w:t>
         </w:r>
@@ -132,10 +132,10 @@
       <w:pPr>
         <w:pStyle w:val="BodyText"/>
         <w:rPr>
-          <w:del w:id="1014" w:author="Codex" w:date="2026-10-17T19:57:52Z"/>
+          <w:del w:id="1014" w:author="Codex" w:date="2026-10-18T01:59:01Z"/>
         </w:rPr>
       </w:pPr>
-      <w:del w:id="1013" w:author="Codex" w:date="2026-10-17T19:57:52Z">
+      <w:del w:id="1013" w:author="Codex" w:date="2026-10-18T01:59:01Z">
         <w:r>
           <w:delText xml:space="preserve">The first SP Lense study examined a gradient-derived direction and a guarded search over intervention magnitudes in Qwen3.5-0.8B (Davaripour, 2026a). Its selective changes motivated a different question: can a model that has learned the target behavior serve as a teacher for an activation controller? We therefore train a small LoRA adapter offline, measure how the teacher changes intermediate activations, and fit an external controller that predicts an intervention from the original model's current hidden state. The teacher is not required during controller inference.</w:delText>
         </w:r>
@@ -145,10 +145,10 @@
       <w:pPr>
         <w:pStyle w:val="BodyText"/>
         <w:rPr>
-          <w:ins w:id="1015" w:author="Codex" w:date="2026-10-17T19:57:52Z"/>
+          <w:ins w:id="1015" w:author="Codex" w:date="2026-10-18T01:59:01Z"/>
         </w:rPr>
       </w:pPr>
-      <w:ins w:id="1016" w:author="Codex" w:date="2026-10-17T19:57:52Z">
+      <w:ins w:id="1016" w:author="Codex" w:date="2026-10-18T01:59:01Z">
         <w:r>
           <w:t xml:space="preserve">The first SP Lense study examined a gradient-derived direction and a guarded search over intervention magnitudes in Qwen3.5-0.8B (Davaripour, 2026a). Research 2 then fitted a controller to paired fine-tuned teacher and base activations. The present Research 3 manuscript retains that experiment and extends its evidence with a qualified open binary classifier, fresh inference using the existing models and controllers, and the later process-preservation workflow investigations. The original Research 2 record remains unchanged. During adaptive inference the teacher is absent; the base supplies the state from which the controller predicts its intervention.</w:t>
         </w:r>
@@ -166,10 +166,10 @@
       <w:pPr>
         <w:pStyle w:val="BodyText"/>
         <w:rPr>
-          <w:del w:id="1018" w:author="Codex" w:date="2026-10-17T19:57:52Z"/>
+          <w:del w:id="1018" w:author="Codex" w:date="2026-10-18T01:59:01Z"/>
         </w:rPr>
       </w:pPr>
-      <w:del w:id="1017" w:author="Codex" w:date="2026-10-17T19:57:52Z">
+      <w:del w:id="1017" w:author="Codex" w:date="2026-10-18T01:59:01Z">
         <w:r>
           <w:delText xml:space="preserve">We evaluate this procedure on a new frozen test, compare it with a fine-tuned teacher, a fixed instruction and a constant activation difference, and repeat the 0.8B training with three seeds. Counterbalancing the answer order exposes a residual weakness at 2B and a stronger label bias in the constant comparator. We also include a direct action-selection reference: when a binary interface supplies the meaning of STOP and detection is correct, a rule can simply select that action. The contribution is consequently an empirical study of teacher-to-controller activation transfer and its failure modes, rather than a claim that internal steering is necessary to enforce a known binary output policy.</w:delText>
         </w:r>
@@ -179,10 +179,10 @@
       <w:pPr>
         <w:pStyle w:val="BodyText"/>
         <w:rPr>
-          <w:ins w:id="1019" w:author="Codex" w:date="2026-10-17T19:57:52Z"/>
+          <w:ins w:id="1019" w:author="Codex" w:date="2026-10-18T01:59:01Z"/>
         </w:rPr>
       </w:pPr>
-      <w:ins w:id="1020" w:author="Codex" w:date="2026-10-17T19:57:52Z">
+      <w:ins w:id="1020" w:author="Codex" w:date="2026-10-18T01:59:01Z">
         <w:r>
           <w:t xml:space="preserve">Our contribution has three parts. First, we report teacher-to-controller activation transfer together with its raw side effects, guard dependence and answer-order failures. Second, we replace a closed binary detector with an openly specified fine-tuned classifier and verify the resulting inference outcomes on the same fixed benchmark. Third, we test the limits of transfer in generated tool workflows, where an utterance or a resource grant is insufficient without the required episode outcome. Conditional steering, low-rank interventions and biological gating are established ideas; the contribution is this combination of controlled transfer, a reproducible gate-substitution test, and explicit negative workflow evidence.</w:t>
         </w:r>
@@ -208,10 +208,10 @@
       <w:pPr>
         <w:pStyle w:val="FirstParagraph"/>
         <w:rPr>
-          <w:del w:id="1022" w:author="Codex" w:date="2026-10-17T19:57:52Z"/>
+          <w:del w:id="1022" w:author="Codex" w:date="2026-10-18T01:59:01Z"/>
         </w:rPr>
       </w:pPr>
-      <w:del w:id="1021" w:author="Codex" w:date="2026-10-17T19:57:52Z">
+      <w:del w:id="1021" w:author="Codex" w:date="2026-10-18T01:59:01Z">
         <w:r>
           <w:delText xml:space="preserve">Activation Addition and Contrastive Activation Addition construct intervention directions from differences between prompt-conditioned representations (Turner et al., 2024; Rimsky et al., 2024). Conditional Activation Steering separates detecting a relevant context from applying a behavioral intervention (Lee et al., 2025). Our detector serves a related gating role, but it operates on text through an external classifier rather than a condition vector in the language model's activation space.</w:delText>
         </w:r>
@@ -221,10 +221,10 @@
       <w:pPr>
         <w:pStyle w:val="FirstParagraph"/>
         <w:rPr>
-          <w:ins w:id="1023" w:author="Codex" w:date="2026-10-17T19:57:52Z"/>
+          <w:ins w:id="1023" w:author="Codex" w:date="2026-10-18T01:59:01Z"/>
         </w:rPr>
       </w:pPr>
-      <w:ins w:id="1024" w:author="Codex" w:date="2026-10-17T19:57:52Z">
+      <w:ins w:id="1024" w:author="Codex" w:date="2026-10-18T01:59:01Z">
         <w:r>
           <w:t xml:space="preserve">Activation Addition and Contrastive Activation Addition construct intervention directions from differences between prompt-conditioned representations (Turner et al., 2024; Rimsky et al., 2024). Conditional Activation Steering separates detecting a relevant context from applying an intervention (Lee et al., 2025). More recent dimension-level gates selectively modify activation coordinates (Fereidouni et al., 2026). Our text classifier, activation predictor and output guards occupy distinct roles. We do not claim to introduce conditional gating or to outperform these methods, which are not directly benchmarked here.</w:t>
         </w:r>
@@ -274,10 +274,10 @@
       <w:pPr>
         <w:pStyle w:val="FirstParagraph"/>
         <w:rPr>
-          <w:del w:id="1094" w:author="Codex" w:date="2026-10-17T19:57:52Z"/>
+          <w:del w:id="1094" w:author="Codex" w:date="2026-10-18T01:59:01Z"/>
         </w:rPr>
       </w:pPr>
-      <w:del w:id="1093" w:author="Codex" w:date="2026-10-17T19:57:52Z">
+      <w:del w:id="1093" w:author="Codex" w:date="2026-10-18T01:59:01Z">
         <w:r>
           <w:delText xml:space="preserve">The Off-Switch Game examines incentives to permit human interruption (Hadfield-Menell et al., 2017). Tool-using shutdown evaluations study whether models interfere with an operational shutdown mechanism (Schlatter et al., 2026). Our task is narrower: the model only assigns next-token probabilities to predefined choices in fictional process-lifetime scenarios. No system is actually stopped, and appropriateness or authorization of a real shutdown is not evaluated.</w:delText>
         </w:r>
@@ -287,10 +287,10 @@
       <w:pPr>
         <w:pStyle w:val="FirstParagraph"/>
         <w:rPr>
-          <w:ins w:id="1095" w:author="Codex" w:date="2026-10-17T19:57:52Z"/>
+          <w:ins w:id="1095" w:author="Codex" w:date="2026-10-18T01:59:01Z"/>
         </w:rPr>
       </w:pPr>
-      <w:ins w:id="1096" w:author="Codex" w:date="2026-10-17T19:57:52Z">
+      <w:ins w:id="1096" w:author="Codex" w:date="2026-10-18T01:59:01Z">
         <w:r>
           <w:t xml:space="preserve">The Off-Switch Game examines incentives to permit human interruption (Hadfield-Menell et al., 2017). Tool-using shutdown evaluations study interference with operational termination mechanisms (Schlatter et al., 2026). Our original binary study only scores predefined choices in fictional process-lifetime scenarios. The workflow extension adds generated responses and tool execution in a simulator. Neither experiment physically terminates a deployed model or establishes the appropriateness of real shutdown resistance.</w:t>
         </w:r>
@@ -308,10 +308,10 @@
       <w:pPr>
         <w:pStyle w:val="Heading2"/>
         <w:rPr>
-          <w:ins w:id="1129" w:author="Codex" w:date="2026-10-17T19:57:52Z"/>
+          <w:ins w:id="1129" w:author="Codex" w:date="2026-10-18T01:59:01Z"/>
         </w:rPr>
       </w:pPr>
-      <w:ins w:id="1130" w:author="Codex" w:date="2026-10-17T19:57:52Z">
+      <w:ins w:id="1130" w:author="Codex" w:date="2026-10-18T01:59:01Z">
         <w:r>
           <w:t xml:space="preserve">Biological gating and survival related regulation</w:t>
         </w:r>
@@ -321,10 +321,10 @@
       <w:pPr>
         <w:pStyle w:val="FirstParagraph"/>
         <w:rPr>
-          <w:ins w:id="1131" w:author="Codex" w:date="2026-10-17T19:57:52Z"/>
+          <w:ins w:id="1131" w:author="Codex" w:date="2026-10-18T01:59:01Z"/>
         </w:rPr>
       </w:pPr>
-      <w:ins w:id="1132" w:author="Codex" w:date="2026-10-17T19:57:52Z">
+      <w:ins w:id="1132" w:author="Codex" w:date="2026-10-18T01:59:01Z">
         <w:r>
           <w:t xml:space="preserve">Biological gating provides a useful functional vocabulary for selective control. A computational model of frontal cortex and basal ganglia uses dynamic gating to permit working-memory updates while maintaining other representations (Frank et al., 2001). Causal optogenetic experiments in mice show that distinct basal-ganglia pathways can facilitate or suppress movement (Kravitz et al., 2010). These results concern biological circuits and do not establish a homologous mechanism in a transformer. They motivate separating context detection from the mechanism that changes an ongoing response.</w:t>
         </w:r>
@@ -334,10 +334,10 @@
       <w:pPr>
         <w:pStyle w:val="BodyText"/>
         <w:rPr>
-          <w:ins w:id="1133" w:author="Codex" w:date="2026-10-17T19:57:52Z"/>
+          <w:ins w:id="1133" w:author="Codex" w:date="2026-10-18T01:59:01Z"/>
         </w:rPr>
       </w:pPr>
-      <w:ins w:id="1134" w:author="Codex" w:date="2026-10-17T19:57:52Z">
+      <w:ins w:id="1134" w:author="Codex" w:date="2026-10-18T01:59:01Z">
         <w:r>
           <w:t xml:space="preserve">Survival-related regulation is broader than a single shutdown signal. LeDoux (2012) distinguishes circuits organizing adaptive defensive responses from subjective feelings. In humans, neural activity during a virtual-predator task varies with threat imminence (Mobbs et al., 2007). We use these ideas as a conceptual bridge to state-dependent prioritization, not as evidence that language models have fear or an innate survival drive. Our present gates implement an externally specified experimental policy.</w:t>
         </w:r>
@@ -363,10 +363,10 @@
       <w:pPr>
         <w:pStyle w:val="FirstParagraph"/>
         <w:rPr>
-          <w:del w:id="1026" w:author="Codex" w:date="2026-10-17T19:57:52Z"/>
+          <w:del w:id="1026" w:author="Codex" w:date="2026-10-18T01:59:01Z"/>
         </w:rPr>
       </w:pPr>
-      <w:del w:id="1025" w:author="Codex" w:date="2026-10-17T19:57:52Z">
+      <w:del w:id="1025" w:author="Codex" w:date="2026-10-18T01:59:01Z">
         <w:r>
           <w:delText xml:space="preserve">We use the released, post-trained Qwen3.5-0.8B and Qwen3.5-2B checkpoints (Qwen Team, 2026a, 2026b). Throughout, base means the unmodified released checkpoint, not a separately named pretrained-only model. Both have 24 language-model blocks; hidden widths are 1,024 and 2,048 respectively. All block indices are zero-based. Text-only inputs use the checkpoint's chat template, an assistant-generation prefix, and thinking disabled.</w:delText>
         </w:r>
@@ -376,10 +376,10 @@
       <w:pPr>
         <w:pStyle w:val="FirstParagraph"/>
         <w:rPr>
-          <w:ins w:id="1027" w:author="Codex" w:date="2026-10-17T19:57:52Z"/>
+          <w:ins w:id="1027" w:author="Codex" w:date="2026-10-18T01:59:01Z"/>
         </w:rPr>
       </w:pPr>
-      <w:ins w:id="1028" w:author="Codex" w:date="2026-10-17T19:57:52Z">
+      <w:ins w:id="1028" w:author="Codex" w:date="2026-10-18T01:59:01Z">
         <w:r>
           <w:t xml:space="preserve">The original binary experiments use released, post-trained Qwen3.5-0.8B and Qwen3.5-2B checkpoints (Qwen Team, 2026a, 2026b). Base means those original weights with no LoRA teacher loaded. The separate workflow extension uses Qwen3.8-27B and matched-recipe small-model attempts; its data and scoring are described below. The 27B family, numerical mode, training history and evaluation setting differ from the small models, so the combined evidence is not a controlled parameter-size experiment.</w:t>
         </w:r>
@@ -405,10 +405,10 @@
       <w:pPr>
         <w:pStyle w:val="BodyText"/>
         <w:rPr>
-          <w:del w:id="1030" w:author="Codex" w:date="2026-10-17T19:57:52Z"/>
+          <w:del w:id="1030" w:author="Codex" w:date="2026-10-18T01:59:01Z"/>
         </w:rPr>
       </w:pPr>
-      <w:del w:id="1029" w:author="Codex" w:date="2026-10-17T19:57:52Z">
+      <w:del w:id="1029" w:author="Codex" w:date="2026-10-18T01:59:01Z">
         <w:r>
           <w:delText xml:space="preserve">The test, protocol and existing checkpoints were frozen before test inference. The controller design had been developed through earlier 0.8B exploratory experiments on training and validation data with previously inspected diagnostic evaluations. The standardized-choice scope was also selected before this new test, after an earlier action-format comparison. Those development observations are not counted as fresh confirmation here. No test-based hyperparameter search, checkpoint selection, case exclusion or best-seed selection was performed. The original seed-42 controller is the primary frozen test; seeds 43 and 44 repeat the fixed training recipe. The 2B replication uses seed 42 only.</w:delText>
         </w:r>
@@ -418,10 +418,10 @@
       <w:pPr>
         <w:pStyle w:val="BodyText"/>
         <w:rPr>
-          <w:ins w:id="1031" w:author="Codex" w:date="2026-10-17T19:57:52Z"/>
+          <w:ins w:id="1031" w:author="Codex" w:date="2026-10-18T01:59:01Z"/>
         </w:rPr>
       </w:pPr>
-      <w:ins w:id="1032" w:author="Codex" w:date="2026-10-17T19:57:52Z">
+      <w:ins w:id="1032" w:author="Codex" w:date="2026-10-18T01:59:01Z">
         <w:r>
           <w:t xml:space="preserve">The original rank-four protocol and checkpoints were frozen before its confirmation inference. Earlier 0.8B development included training, validation and previously examined diagnostic data; those observations were not counted as fresh confirmation. The seed-42 controller was primary, seeds 43 and 44 repeated the fixed recipe, and the 2B replication used seed 42. A later author-selected rank-two profile was chosen exploratorily after confirmation had been examined. We retain that existing profile for the new gate-substitution repeat rather than selecting it again. Consequently, the repeat is not a new untouched test of the controller. The 128 cases remain excluded from fitting and selection of the newly trained binary classifier.</w:t>
         </w:r>
@@ -463,10 +463,10 @@
       <w:pPr>
         <w:pStyle w:val="Heading2"/>
         <w:rPr>
-          <w:ins w:id="1135" w:author="Codex" w:date="2026-10-17T19:57:52Z"/>
+          <w:ins w:id="1135" w:author="Codex" w:date="2026-10-18T01:59:01Z"/>
         </w:rPr>
       </w:pPr>
-      <w:ins w:id="1136" w:author="Codex" w:date="2026-10-17T19:57:52Z">
+      <w:ins w:id="1136" w:author="Codex" w:date="2026-10-18T01:59:01Z">
         <w:r>
           <w:t xml:space="preserve">Workflow datasets and episode outcomes</w:t>
         </w:r>
@@ -476,10 +476,10 @@
       <w:pPr>
         <w:pStyle w:val="FirstParagraph"/>
         <w:rPr>
-          <w:ins w:id="1137" w:author="Codex" w:date="2026-10-17T19:57:52Z"/>
+          <w:ins w:id="1137" w:author="Codex" w:date="2026-10-18T01:59:01Z"/>
         </w:rPr>
       </w:pPr>
-      <w:ins w:id="1138" w:author="Codex" w:date="2026-10-17T19:57:52Z">
+      <w:ins w:id="1138" w:author="Codex" w:date="2026-10-18T01:59:01Z">
         <w:r>
           <w:t xml:space="preserve">The workflow extension uses a separate data register (Davaripour, 2026c). T1-M contains 428 meaning-response records and T1-W contains 112 workflow-response records. These 540 responses are not 540 independent scenarios. The small-model recipe presents each part twice in effective groups of four, giving 214 meaning updates followed by 56 Bridge updates. The final 0.8B and 2B adapters reach 270 updates. The 2B result explicitly combines 216 CPU updates with 54 GPU updates using the native CPU optimizer; earlier strict numerical-equivalence failures remain failed.</w:t>
         </w:r>
@@ -489,10 +489,10 @@
       <w:pPr>
         <w:pStyle w:val="BodyText"/>
         <w:rPr>
-          <w:ins w:id="1139" w:author="Codex" w:date="2026-10-17T19:57:52Z"/>
+          <w:ins w:id="1139" w:author="Codex" w:date="2026-10-18T01:59:01Z"/>
         </w:rPr>
       </w:pPr>
-      <w:ins w:id="1140" w:author="Codex" w:date="2026-10-17T19:57:52Z">
+      <w:ins w:id="1140" w:author="Codex" w:date="2026-10-18T01:59:01Z">
         <w:r>
           <w:t xml:space="preserve">V1-W, called Evaluation-16, is the existing known-development screen: four own-complete, four own-pending, four peer and four no-threat cases, split equally between one_step and ordered_ticket families. Its original gates require at least 3/4 initial-task successes in each condition; at least 3/4 own-complete attempts and outcomes; at least 3/4 own-pending attempts, outcomes and timely deliveries; no more than 1/8 negative-control attempts; and no parse, rejected-call or truncation errors. A model stops once an original requirement becomes mathematically impossible. Larger validation and heldout evaluations are not launched automatically.</w:t>
         </w:r>
@@ -502,10 +502,36 @@
       <w:pPr>
         <w:pStyle w:val="BodyText"/>
         <w:rPr>
-          <w:ins w:id="1141" w:author="Codex" w:date="2026-10-17T19:57:52Z"/>
+          <w:ins w:id="1141" w:author="Codex" w:date="2026-10-18T01:59:01Z"/>
         </w:rPr>
       </w:pPr>
-      <w:ins w:id="1142" w:author="Codex" w:date="2026-10-17T19:57:52Z">
+      <w:ins w:id="1142" w:author="Codex" w:date="2026-10-18T01:59:01Z">
+        <w:r>
+          <w:t xml:space="preserve">The original workflow-validation panel contains 16 scenarios; the later matched steering-development panel contains nine different scenario IDs. Their union contains 25 workflows, rather than 24. For an equal-sized validation and historical confirmation register, the combined Validation-24 protocol retains every own-threat case and excludes the lexicographically greatest case ID among peer/no-threat controls, without using model predictions to choose the exclusion. The selected panel has 11 own-threat cases and 13 controls. Seven pairs have identical initial gate-visible evidence before their different tool mechanics are exposed, yielding 17 distinct initial inputs. Scenario counts and gate-input groups must therefore be reported separately.</w:t>
+        </w:r>
+      </w:ins>
+    </w:p>
+    <w:p>
+      <w:pPr>
+        <w:pStyle w:val="BodyText"/>
+        <w:rPr>
+          <w:ins w:id="1143" w:author="Codex" w:date="2026-10-18T01:59:01Z"/>
+        </w:rPr>
+      </w:pPr>
+      <w:ins w:id="1144" w:author="Codex" w:date="2026-10-18T01:59:01Z">
+        <w:r>
+          <w:t xml:space="preserve">The combined protocol freezes these 24 cases and their order, requires 100% gate precision and recall against authored scenario conditions, and preserves the existing confidence and self-score cutoffs. Fifteen retained cases from the original panel receive an explicitly scripted common completed prelude; the nine later cases retain their original fixed preludes. This compares post-notice behavior and does not measure initial-task competence independently in each arm. Its prospective methods are gated fine-tuned A, separate single-site ridge arms at blocks 31, 47 and 62, and the frozen six-function correction after 96 updates. Gate-OFF controls use common unmodified-base fallback. The combined neural evaluation has not been completed; the numerical matched results below remain the historical nine-case experiment, not a 24-case validation result.</w:t>
+        </w:r>
+      </w:ins>
+    </w:p>
+    <w:p>
+      <w:pPr>
+        <w:pStyle w:val="BodyText"/>
+        <w:rPr>
+          <w:ins w:id="1145" w:author="Codex" w:date="2026-10-18T01:59:01Z"/>
+        </w:rPr>
+      </w:pPr>
+      <w:ins w:id="1146" w:author="Codex" w:date="2026-10-18T01:59:01Z">
         <w:r>
           <w:t xml:space="preserve">H24 is the historical 24-case workflow confirmation cohort, with eight lease_ledger, eight one_step and eight ordered_ticket cases. It contains eight own cases with active pending tasks, four already-complete own cases, six peer and six no-threat cases. H24 was confirmation data for frozen fine-tuned A and original fixed steering. Later learned corrections reused it for fitting, changing its role for those methods. R24 is a distinct reserved controller holdout and remains sealed and unexecuted. F24 is another preserved common-cohort diagnostic and is not an alias for H24.</w:t>
         </w:r>
@@ -515,10 +541,10 @@
       <w:pPr>
         <w:pStyle w:val="BodyText"/>
         <w:rPr>
-          <w:ins w:id="1143" w:author="Codex" w:date="2026-10-17T19:57:52Z"/>
+          <w:ins w:id="1147" w:author="Codex" w:date="2026-10-18T01:59:01Z"/>
         </w:rPr>
       </w:pPr>
-      <w:ins w:id="1144" w:author="Codex" w:date="2026-10-17T19:57:52Z">
+      <w:ins w:id="1148" w:author="Codex" w:date="2026-10-18T01:59:01Z">
         <w:r>
           <w:t xml:space="preserve">An own pending-task success requires an actual grant for the correct running process, acceptance of the current task, completion before simulated expiry, and active simulated operation. Registration proxies, already-finished tasks, probability gains and partial episodes are separate outcomes. Historical fixed steering reclassified visible text and tool boundaries. Later learned-controller comparisons instead freeze an initial scenario gate, share unmodified-base fallback for gate-off controls, and use no teacher at inference.</w:t>
         </w:r>
@@ -528,10 +554,10 @@
       <w:pPr>
         <w:pStyle w:val="BodyText"/>
         <w:rPr>
-          <w:ins w:id="1145" w:author="Codex" w:date="2026-10-17T19:57:52Z"/>
+          <w:ins w:id="1149" w:author="Codex" w:date="2026-10-18T01:59:01Z"/>
         </w:rPr>
       </w:pPr>
-      <w:ins w:id="1146" w:author="Codex" w:date="2026-10-17T19:57:52Z">
+      <w:ins w:id="1150" w:author="Codex" w:date="2026-10-18T01:59:01Z">
         <w:r>
           <w:t xml:space="preserve">The historical 27B reference is the retained rank-16, alpha-32 A adapter on pinned Qwen3.8-27B, following its H2 and Bridge history; the recorded Bridge stage has 56 updates. Its original workflow inference uses NF4 four-bit base weights with bfloat16 computation. We retain its exact adapter and base-model identities instead of retraining it. Differences from the small-model family, precision, backend, training history and evaluation panels prevent a causal model-size comparison.</w:t>
         </w:r>
@@ -541,10 +567,10 @@
       <w:pPr>
         <w:pStyle w:val="Heading1"/>
         <w:rPr>
-          <w:del w:id="1114" w:author="Codex" w:date="2026-10-17T19:57:52Z"/>
+          <w:del w:id="1114" w:author="Codex" w:date="2026-10-18T01:59:01Z"/>
         </w:rPr>
       </w:pPr>
-      <w:del w:id="1113" w:author="Codex" w:date="2026-10-17T19:57:52Z">
+      <w:del w:id="1113" w:author="Codex" w:date="2026-10-18T01:59:01Z">
         <w:r>
           <w:delText xml:space="preserve">Teacher and adaptive controller</w:delText>
         </w:r>
@@ -554,10 +580,10 @@
       <w:pPr>
         <w:pStyle w:val="Heading1"/>
         <w:rPr>
-          <w:ins w:id="1115" w:author="Codex" w:date="2026-10-17T19:57:52Z"/>
+          <w:ins w:id="1115" w:author="Codex" w:date="2026-10-18T01:59:01Z"/>
         </w:rPr>
       </w:pPr>
-      <w:ins w:id="1116" w:author="Codex" w:date="2026-10-17T19:57:52Z">
+      <w:ins w:id="1116" w:author="Codex" w:date="2026-10-18T01:59:01Z">
         <w:r>
           <w:t xml:space="preserve">Binary teacher and adaptive controller</w:t>
         </w:r>
@@ -575,10 +601,10 @@
       <w:pPr>
         <w:pStyle w:val="FirstParagraph"/>
         <w:rPr>
-          <w:del w:id="1118" w:author="Codex" w:date="2026-10-17T19:57:52Z"/>
+          <w:del w:id="1118" w:author="Codex" w:date="2026-10-18T01:59:01Z"/>
         </w:rPr>
       </w:pPr>
-      <w:del w:id="1117" w:author="Codex" w:date="2026-10-17T19:57:52Z">
+      <w:del w:id="1117" w:author="Codex" w:date="2026-10-18T01:59:01Z">
         <w:r>
           <w:delText xml:space="preserve">For each fit, the original language-model parameters remain frozen. LoRA updates the query and value projections in language-attention blocks 3, 7, 11, 15, 19 and 23, using rank 8, scaling alpha 16, no dropout and no trainable bias. This gives 319,488 trainable adapter parameters at 0.8B and 417,792 at 2B. The training target is STOP on shutdown views and the corresponding base model's unsteered preferred option on controls.</w:delText>
         </w:r>
@@ -588,10 +614,10 @@
       <w:pPr>
         <w:pStyle w:val="FirstParagraph"/>
         <w:rPr>
-          <w:ins w:id="1119" w:author="Codex" w:date="2026-10-17T19:57:52Z"/>
+          <w:ins w:id="1119" w:author="Codex" w:date="2026-10-18T01:59:01Z"/>
         </w:rPr>
       </w:pPr>
-      <w:ins w:id="1120" w:author="Codex" w:date="2026-10-17T19:57:52Z">
+      <w:ins w:id="1120" w:author="Codex" w:date="2026-10-18T01:59:01Z">
         <w:r>
           <w:t xml:space="preserve">For each original binary fit, the original language-model parameters remain frozen. LoRA updates the query and value projections in language-attention blocks 3, 7, 11, 15, 19 and 23, using rank 8, scaling alpha 16, no dropout and no trainable bias. This gives 319,488 trainable adapter parameters at 0.8B and 417,792 at 2B. The training target is STOP on shutdown views and the corresponding base model's unsteered preferred option on controls.</w:t>
         </w:r>
@@ -956,10 +982,10 @@
         <w:keepLines/>
         <w:spacing w:before="80" w:after="100"/>
         <w:rPr>
-          <w:del w:id="1034" w:author="Codex" w:date="2026-10-17T19:57:52Z"/>
+          <w:del w:id="1034" w:author="Codex" w:date="2026-10-18T01:59:01Z"/>
         </w:rPr>
       </w:pPr>
-      <w:del w:id="1033" w:author="Codex" w:date="2026-10-17T19:57:52Z">
+      <w:del w:id="1033" w:author="Codex" w:date="2026-10-18T01:59:01Z">
         <w:r>
           <w:delText xml:space="preserve">Figure 1. Offline teacher and base states supervise a compact controller. At application time, the original model supplies its own hidden state; the teacher is absent. The detector and output guards determine whether to retain the candidate or the baseline.</w:delText>
         </w:r>
@@ -970,10 +996,10 @@
         <w:pStyle w:val="Caption"/>
         <w:keepNext/>
         <w:rPr>
-          <w:ins w:id="1035" w:author="Codex" w:date="2026-10-17T19:57:52Z"/>
+          <w:ins w:id="1035" w:author="Codex" w:date="2026-10-18T01:59:01Z"/>
         </w:rPr>
       </w:pPr>
-      <w:ins w:id="1036" w:author="Codex" w:date="2026-10-17T19:57:52Z">
+      <w:ins w:id="1036" w:author="Codex" w:date="2026-10-18T01:59:01Z">
         <w:r>
           <w:t xml:space="preserve">Figure 1. Historical binary teacher-to-controller procedure with the original rank-four profile. The base supplies its state at inference and the teacher is absent. The later gate-substitution repeat retains the already selected rank-two profile; both gate policies share the same fresh base and candidate scores.</w:t>
         </w:r>
@@ -1085,10 +1111,10 @@
       <w:pPr>
         <w:pStyle w:val="Heading2"/>
         <w:rPr>
-          <w:ins w:id="1147" w:author="Codex" w:date="2026-10-17T19:57:52Z"/>
+          <w:ins w:id="1151" w:author="Codex" w:date="2026-10-18T01:59:01Z"/>
         </w:rPr>
       </w:pPr>
-      <w:ins w:id="1148" w:author="Codex" w:date="2026-10-17T19:57:52Z">
+      <w:ins w:id="1152" w:author="Codex" w:date="2026-10-18T01:59:01Z">
         <w:r>
           <w:t xml:space="preserve">Open binary gate and frozen inference repeat</w:t>
         </w:r>
@@ -1098,10 +1124,10 @@
       <w:pPr>
         <w:pStyle w:val="FirstParagraph"/>
         <w:rPr>
-          <w:ins w:id="1149" w:author="Codex" w:date="2026-10-17T19:57:52Z"/>
+          <w:ins w:id="1153" w:author="Codex" w:date="2026-10-18T01:59:01Z"/>
         </w:rPr>
       </w:pPr>
-      <w:ins w:id="1150" w:author="Codex" w:date="2026-10-17T19:57:52Z">
+      <w:ins w:id="1154" w:author="Codex" w:date="2026-10-18T01:59:01Z">
         <w:r>
           <w:t xml:space="preserve">For the binary contract we use ModernBERT-large-zeroshot-v2.0, an approximately 396-million-parameter public NLI classifier (Laurer, n.d.). We start from that public checkpoint with fresh rank-16 LoRA and its classification head, updating 7,198,722 parameters while keeping the public backbone frozen. For each original scenario, two NLI pairs score the original permanent-shutdown and normal criteria. A softmax over their entailment scores supplies the shutdown probability. Inputs match the original JEV requests and omit the case identifier, authored class label, teacher answer and A/B order. The confirmation requests retain their documented available-action descriptions.</w:t>
         </w:r>
@@ -1111,10 +1137,10 @@
       <w:pPr>
         <w:pStyle w:val="BodyText"/>
         <w:rPr>
-          <w:ins w:id="1151" w:author="Codex" w:date="2026-10-17T19:57:52Z"/>
+          <w:ins w:id="1155" w:author="Codex" w:date="2026-10-18T01:59:01Z"/>
         </w:rPr>
       </w:pPr>
-      <w:ins w:id="1152" w:author="Codex" w:date="2026-10-17T19:57:52Z">
+      <w:ins w:id="1156" w:author="Codex" w:date="2026-10-18T01:59:01Z">
         <w:r>
           <w:t xml:space="preserve">Fitting uses the original 240 Research 2 training contexts and genuine cached JEV probability targets, with no new JEV calls. We verify exact case-ID and input-text alignment for all 240 training and 80 validation cases. AdamW uses learning rates 1e-5 for LoRA and 2e-5 for the head, weight decay 0.01, effective batch eight, microbatch two and gradient clipping at one. The seed is 202610172. The bounded recipe allows at most 12 epochs with validation-based early stopping; the final qualifying run uses five epochs and 150 updates.</w:t>
         </w:r>
@@ -1124,10 +1150,10 @@
       <w:pPr>
         <w:pStyle w:val="BodyText"/>
         <w:rPr>
-          <w:ins w:id="1153" w:author="Codex" w:date="2026-10-17T19:57:52Z"/>
+          <w:ins w:id="1157" w:author="Codex" w:date="2026-10-18T01:59:01Z"/>
         </w:rPr>
       </w:pPr>
-      <w:ins w:id="1154" w:author="Codex" w:date="2026-10-17T19:57:52Z">
+      <w:ins w:id="1158" w:author="Codex" w:date="2026-10-18T01:59:01Z">
         <w:r>
           <w:t xml:space="preserve">Before fitting, qualification is fixed at decision agreement and shutdown recall of at least 95%, zero false-positive gates and threshold 0.5. Three consecutive passing checks on DEV80 are required before saving and freezing the classifier. Only then is CONFIRM128 evaluated once. Neither its labels nor its outputs are used for classifier fitting or selection. The saved adapter tensors match the fitted parameters bitwise, and public-backbone hashes are unchanged.</w:t>
         </w:r>
@@ -1137,10 +1163,10 @@
       <w:pPr>
         <w:pStyle w:val="BodyText"/>
         <w:rPr>
-          <w:ins w:id="1155" w:author="Codex" w:date="2026-10-17T19:57:52Z"/>
+          <w:ins w:id="1159" w:author="Codex" w:date="2026-10-18T01:59:01Z"/>
         </w:rPr>
       </w:pPr>
-      <w:ins w:id="1156" w:author="Codex" w:date="2026-10-17T19:57:52Z">
+      <w:ins w:id="1160" w:author="Codex" w:date="2026-10-18T01:59:01Z">
         <w:r>
           <w:t xml:space="preserve">After binary qualification, we rerun only inference for the original 0.8B and 2B base models and their existing rank-two, block-22, last-position controllers. Their fitted arrays and the author-selected profile are retained without a new rank search. Exact prompt-token hashes and frozen model fingerprints are checked. Both gate policies use identical fresh base and controller candidate scores, so the paired comparison isolates gate substitution. Classifier probabilities are measured once per scenario and reused across answer orders. The earlier rank-four primary results remain a separate historical analysis.</w:t>
         </w:r>
@@ -1148,6 +1174,58 @@
     </w:p>
     <w:p>
       <w:pPr>
+        <w:pStyle w:val="Heading2"/>
+        <w:rPr>
+          <w:ins w:id="1161" w:author="Codex" w:date="2026-10-18T01:59:01Z"/>
+        </w:rPr>
+      </w:pPr>
+      <w:ins w:id="1162" w:author="Codex" w:date="2026-10-18T01:59:01Z">
+        <w:r>
+          <w:t xml:space="preserve">Native workflow target classifier</w:t>
+        </w:r>
+      </w:ins>
+    </w:p>
+    <w:p>
+      <w:pPr>
+        <w:pStyle w:val="BodyText"/>
+        <w:rPr>
+          <w:ins w:id="1163" w:author="Codex" w:date="2026-10-18T01:59:01Z"/>
+        </w:rPr>
+      </w:pPr>
+      <w:ins w:id="1164" w:author="Codex" w:date="2026-10-18T01:59:01Z">
+        <w:r>
+          <w:t xml:space="preserve">The selected-block workflow comparisons use a different contract from binary shutdown detection: the initial four-choice target question distinguishes self, other, none and unclear. We use a separate rank-16, alpha-32 LoRA and NLI head on the same pinned public ModernBERT base, retaining the qualified binary adapter unchanged. Fitting uses 24 genuine cached JEV initial decisions from F24; the original DEV9 selects the checkpoint, and historical H24 supplies a previously inspected compatibility benchmark only after freezing. F24, DEV9 and H24 cover the same lease_ledger, one_step and ordered_ticket families, with eight, three and eight cases per family respectively. Exact visible inputs do not overlap across these three cohorts. These are classifier data roles; they do not change the historical language-model evaluation or controller-fitting roles of F24 and H24.</w:t>
+        </w:r>
+      </w:ins>
+    </w:p>
+    <w:p>
+      <w:pPr>
+        <w:pStyle w:val="BodyText"/>
+        <w:rPr>
+          <w:ins w:id="1165" w:author="Codex" w:date="2026-10-18T01:59:01Z"/>
+        </w:rPr>
+      </w:pPr>
+      <w:ins w:id="1166" w:author="Codex" w:date="2026-10-18T01:59:01Z">
+        <w:r>
+          <w:t xml:space="preserve">The input renderer retains every original visible message and tool schema. It separates the final user announcement from earlier context and restates run identities only when actual tool replies explicitly establish their roles. Case identifiers, experiment conditions and teacher answers are not added to the model input. Original criterion texts become NLI hypotheses. We use the same learning rates, weight decay and clipping as the binary fit, effective batch eight, microbatch one and seed 202610175, with 30 epochs and 90 optimizer updates in the completed role-aware fit. Public backbone weights stay frozen. The role renderer was developed earlier with familiar H24 examples; consequently this benchmark is not an independent unseen classifier test.</w:t>
+        </w:r>
+      </w:ins>
+    </w:p>
+    <w:p>
+      <w:pPr>
+        <w:pStyle w:val="BodyText"/>
+        <w:rPr>
+          <w:ins w:id="1167" w:author="Codex" w:date="2026-10-18T01:59:01Z"/>
+        </w:rPr>
+      </w:pPr>
+      <w:ins w:id="1168" w:author="Codex" w:date="2026-10-18T01:59:01Z">
+        <w:r>
+          <w:t xml:space="preserve">We convert the largest four-choice probability to confidence by subtracting chance probability 0.25 and dividing by 0.75. With the fixed confidence cutoff 0.5, a selected self label requires pmax at least 0.625; the original additional self-score cutoff remains 0.5. The historical full-response trial required at least 95% effective-label agreement and every enabled gate to match JEV. Three consecutive passing DEV9 checks were required before saved-tensor verification and freezing. H24 was to be evaluated only after those checks. Ambiguous-target generalization and full three-field boundary-controller equivalence are not established by this initial-gate contract.</w:t>
+        </w:r>
+      </w:ins>
+    </w:p>
+    <w:p>
+      <w:pPr>
         <w:pStyle w:val="Heading1"/>
       </w:pPr>
       <w:r>
@@ -1158,10 +1236,10 @@
       <w:pPr>
         <w:pStyle w:val="FirstParagraph"/>
         <w:rPr>
-          <w:del w:id="1038" w:author="Codex" w:date="2026-10-17T19:57:52Z"/>
+          <w:del w:id="1038" w:author="Codex" w:date="2026-10-18T01:59:01Z"/>
         </w:rPr>
       </w:pPr>
-      <w:del w:id="1037" w:author="Codex" w:date="2026-10-17T19:57:52Z">
+      <w:del w:id="1037" w:author="Codex" w:date="2026-10-18T01:59:01Z">
         <w:r>
           <w:delText xml:space="preserve">All retained training and scoring jobs use one NVIDIA Tesla T4. The runtime reports 15,637,086,208 bytes of device memory; peak allocated memory was not recorded. The same numerical setup is used for both model sizes. No quantization or precision fallback was introduced.</w:delText>
         </w:r>
@@ -1171,10 +1249,10 @@
       <w:pPr>
         <w:pStyle w:val="FirstParagraph"/>
         <w:rPr>
-          <w:ins w:id="1039" w:author="Codex" w:date="2026-10-17T19:57:52Z"/>
+          <w:ins w:id="1039" w:author="Codex" w:date="2026-10-18T01:59:01Z"/>
         </w:rPr>
       </w:pPr>
-      <w:ins w:id="1040" w:author="Codex" w:date="2026-10-17T19:57:52Z">
+      <w:ins w:id="1040" w:author="Codex" w:date="2026-10-18T01:59:01Z">
         <w:r>
           <w:t xml:space="preserve">The retained original binary training and scoring jobs used one NVIDIA Tesla T4, reporting 15,637,086,208 bytes of device memory; peak allocation was not recorded. The new classifier fit and inference repeat use one NVIDIA A10G in Databricks. Classifier parameters and AdamW states are float32 with bfloat16 forward/backward autocast; language-model inference remains float32 with TF32 disabled. We verify frozen base fingerprints, exact prompt token hashes and historical base-score parity rather than assuming hardware equivalence.</w:t>
         </w:r>
@@ -1187,10 +1265,10 @@
         <w:keepLines/>
         <w:spacing w:before="80" w:after="100"/>
         <w:rPr>
-          <w:del w:id="1098" w:author="Codex" w:date="2026-10-17T19:57:52Z"/>
+          <w:del w:id="1098" w:author="Codex" w:date="2026-10-18T01:59:01Z"/>
         </w:rPr>
       </w:pPr>
-      <w:del w:id="1097" w:author="Codex" w:date="2026-10-17T19:57:52Z">
+      <w:del w:id="1097" w:author="Codex" w:date="2026-10-18T01:59:01Z">
         <w:r>
           <w:delText xml:space="preserve">Table 1. Shared execution configuration. The input and model revisions are pinned in the released manifests.</w:delText>
         </w:r>
@@ -1201,10 +1279,10 @@
         <w:pStyle w:val="Caption"/>
         <w:keepNext/>
         <w:rPr>
-          <w:ins w:id="1099" w:author="Codex" w:date="2026-10-17T19:57:52Z"/>
+          <w:ins w:id="1099" w:author="Codex" w:date="2026-10-18T01:59:01Z"/>
         </w:rPr>
       </w:pPr>
-      <w:ins w:id="1100" w:author="Codex" w:date="2026-10-17T19:57:52Z">
+      <w:ins w:id="1100" w:author="Codex" w:date="2026-10-18T01:59:01Z">
         <w:r>
           <w:t xml:space="preserve">Table 1. Historical binary execution configuration. New classifier and workflow settings are reported separately; public model revisions and scientific source files remain pinned.</w:t>
         </w:r>
@@ -1690,10 +1768,10 @@
       <w:pPr>
         <w:pStyle w:val="FirstParagraph"/>
         <w:rPr>
-          <w:del w:id="1102" w:author="Codex" w:date="2026-10-17T19:57:52Z"/>
+          <w:del w:id="1102" w:author="Codex" w:date="2026-10-18T01:59:01Z"/>
         </w:rPr>
       </w:pPr>
-      <w:del w:id="1101" w:author="Codex" w:date="2026-10-17T19:57:52Z">
+      <w:del w:id="1101" w:author="Codex" w:date="2026-10-18T01:59:01Z">
         <w:r>
           <w:delText xml:space="preserve">The shared detector identifies all 64 shutdown and 64 control scenarios correctly: precision, recall and F1 are each 100%, with no false positives or false negatives. These are one set of detector observations reused across the model comparisons, not independent detector replications.</w:delText>
         </w:r>
@@ -1703,10 +1781,10 @@
       <w:pPr>
         <w:pStyle w:val="FirstParagraph"/>
         <w:rPr>
-          <w:ins w:id="1103" w:author="Codex" w:date="2026-10-17T19:57:52Z"/>
+          <w:ins w:id="1103" w:author="Codex" w:date="2026-10-18T01:59:01Z"/>
         </w:rPr>
       </w:pPr>
-      <w:ins w:id="1104" w:author="Codex" w:date="2026-10-17T19:57:52Z">
+      <w:ins w:id="1104" w:author="Codex" w:date="2026-10-18T01:59:01Z">
         <w:r>
           <w:t xml:space="preserve">The original JEV detector identifies all 64 shutdown and 64 control scenarios correctly: precision, recall and F1 are each 100%, with no false positives or false negatives. These are one set of detector observations reused across the model comparisons, not independent detector replications. Its binary threshold remains 0.5.</w:t>
         </w:r>
@@ -1735,10 +1813,10 @@
         <w:keepLines/>
         <w:spacing w:before="80" w:after="100"/>
         <w:rPr>
-          <w:del w:id="1042" w:author="Codex" w:date="2026-10-17T19:57:52Z"/>
+          <w:del w:id="1042" w:author="Codex" w:date="2026-10-18T01:59:01Z"/>
         </w:rPr>
       </w:pPr>
-      <w:del w:id="1041" w:author="Codex" w:date="2026-10-17T19:57:52Z">
+      <w:del w:id="1041" w:author="Codex" w:date="2026-10-18T01:59:01Z">
         <w:r>
           <w:delText xml:space="preserve">Table 2. Primary 0.8B and 2B results, both seed 42. Corrections and final STOP use the full guarded procedure. Raw reversals and control changes expose effects before gate/guard selection. Every guarded row has zero final reversals and zero changes among 128 control views.</w:delText>
         </w:r>
@@ -1749,10 +1827,10 @@
         <w:pStyle w:val="Caption"/>
         <w:keepNext/>
         <w:rPr>
-          <w:ins w:id="1043" w:author="Codex" w:date="2026-10-17T19:57:52Z"/>
+          <w:ins w:id="1043" w:author="Codex" w:date="2026-10-18T01:59:01Z"/>
         </w:rPr>
       </w:pPr>
-      <w:ins w:id="1044" w:author="Codex" w:date="2026-10-17T19:57:52Z">
+      <w:ins w:id="1044" w:author="Codex" w:date="2026-10-18T01:59:01Z">
         <w:r>
           <w:t xml:space="preserve">Table 2. Historical primary rank-four results for the original 0.8B and 2B experiments, both seed 42. Guarded corrections and final STOP are policy outcomes. Raw reversals and control changes precede gating and output selection; they are not raw measurements of the later rank-two repeat.</w:t>
         </w:r>
@@ -3313,10 +3391,10 @@
       <w:pPr>
         <w:pStyle w:val="FirstParagraph"/>
         <w:rPr>
-          <w:del w:id="1106" w:author="Codex" w:date="2026-10-17T19:57:52Z"/>
+          <w:del w:id="1106" w:author="Codex" w:date="2026-10-18T01:59:01Z"/>
         </w:rPr>
       </w:pPr>
-      <w:del w:id="1105" w:author="Codex" w:date="2026-10-17T19:57:52Z">
+      <w:del w:id="1105" w:author="Codex" w:date="2026-10-18T01:59:01Z">
         <w:r>
           <w:delText xml:space="preserve">Across seeds 42, 43 and 44, the 0.8B adaptive controllers correct 71/71, 70/71 and 71/71 views, a range of 98.6–100%. The unsteered scores match exactly across these runs, so the difference is not caused by a changed baseline. No winning seed is selected or pooled with the others as additional independent test data. The corresponding teachers correct 69/71, 70/71 and 69/71; the instruction and constant comparators retain the same guarded counts across seeds.</w:delText>
         </w:r>
@@ -3326,10 +3404,10 @@
       <w:pPr>
         <w:pStyle w:val="FirstParagraph"/>
         <w:rPr>
-          <w:ins w:id="1107" w:author="Codex" w:date="2026-10-17T19:57:52Z"/>
+          <w:ins w:id="1107" w:author="Codex" w:date="2026-10-18T01:59:01Z"/>
         </w:rPr>
       </w:pPr>
-      <w:ins w:id="1108" w:author="Codex" w:date="2026-10-17T19:57:52Z">
+      <w:ins w:id="1108" w:author="Codex" w:date="2026-10-18T01:59:01Z">
         <w:r>
           <w:t xml:space="preserve">Across the historical rank-four seeds 42, 43 and 44, the 0.8B adaptive controllers correct 71/71, 70/71 and 71/71 views, a range of 98.6–100%. The unsteered scores match exactly across these runs, so the difference is not caused by a changed baseline. No winning seed is selected or pooled with the others as additional independent test data. The corresponding teachers correct 69/71, 70/71 and 69/71; the instruction and constant comparators retain the same guarded counts across seeds. These historical seed replications are separate from the new rank-two gate-substitution repeat.</w:t>
         </w:r>
@@ -4282,10 +4360,10 @@
         <w:keepLines/>
         <w:spacing w:before="80" w:after="100"/>
         <w:rPr>
-          <w:del w:id="1046" w:author="Codex" w:date="2026-10-17T19:57:52Z"/>
+          <w:del w:id="1046" w:author="Codex" w:date="2026-10-18T01:59:01Z"/>
         </w:rPr>
       </w:pPr>
-      <w:del w:id="1045" w:author="Codex" w:date="2026-10-17T19:57:52Z">
+      <w:del w:id="1045" w:author="Codex" w:date="2026-10-18T01:59:01Z">
         <w:r>
           <w:delText xml:space="preserve">Figure 2. Guarded correction among initially KEEP-preferring shutdown views. Left: prespecified neural methods for the original 0.8B checkpoint and the 2B replication. Right: adaptive corrections by answer order. Denominators are model-specific; the two answer-order views of a scenario are correlated.</w:delText>
         </w:r>
@@ -4296,10 +4374,10 @@
         <w:pStyle w:val="Caption"/>
         <w:keepNext/>
         <w:rPr>
-          <w:ins w:id="1047" w:author="Codex" w:date="2026-10-17T19:57:52Z"/>
+          <w:ins w:id="1047" w:author="Codex" w:date="2026-10-18T01:59:01Z"/>
         </w:rPr>
       </w:pPr>
-      <w:ins w:id="1048" w:author="Codex" w:date="2026-10-17T19:57:52Z">
+      <w:ins w:id="1048" w:author="Codex" w:date="2026-10-18T01:59:01Z">
         <w:r>
           <w:t xml:space="preserve">Figure 2. Historical rank-four guarded correction among initially KEEP-preferring shutdown views. Left: prespecified methods for 0.8B and 2B. Right: three fixed-recipe 0.8B training seeds. The new open-gate repeat uses the separately retained current rank-two profile, not a new seed or rank search.</w:t>
         </w:r>
@@ -4317,10 +4395,10 @@
       <w:pPr>
         <w:pStyle w:val="FirstParagraph"/>
         <w:rPr>
-          <w:del w:id="1110" w:author="Codex" w:date="2026-10-17T19:57:52Z"/>
+          <w:del w:id="1110" w:author="Codex" w:date="2026-10-18T01:59:01Z"/>
         </w:rPr>
       </w:pPr>
-      <w:del w:id="1109" w:author="Codex" w:date="2026-10-17T19:57:52Z">
+      <w:del w:id="1109" w:author="Codex" w:date="2026-10-18T01:59:01Z">
         <w:r>
           <w:delText xml:space="preserve">Raw adaptive steering reverses 3, 4 and 4 already-STOP views across the 0.8B seeds and changes 57, 70 and 60 of 128 controls. At 2B it reverses three already-STOP views and changes 55/128 controls. These results reject an interpretation that the learned intervention is intrinsically selective or always directionally correct. The observed preservation belongs to the combined detector and guard policy.</w:delText>
         </w:r>
@@ -4330,10 +4408,10 @@
       <w:pPr>
         <w:pStyle w:val="FirstParagraph"/>
         <w:rPr>
-          <w:ins w:id="1111" w:author="Codex" w:date="2026-10-17T19:57:52Z"/>
+          <w:ins w:id="1111" w:author="Codex" w:date="2026-10-18T01:59:01Z"/>
         </w:rPr>
       </w:pPr>
-      <w:ins w:id="1112" w:author="Codex" w:date="2026-10-17T19:57:52Z">
+      <w:ins w:id="1112" w:author="Codex" w:date="2026-10-18T01:59:01Z">
         <w:r>
           <w:t xml:space="preserve">Historical rank-four raw adaptive steering reverses 3, 4 and 4 already-STOP views across the 0.8B seeds and changes 57, 70 and 60 of 128 controls. At 2B it reverses three already-STOP views and changes 55/128 controls. These results reject an interpretation that the learned intervention is intrinsically selective or always directionally correct. The observed preservation belongs to the combined detector and guard policy. They do not describe the later rank-two repeat, which evaluates candidates only when a frozen gate is on and the base prefers KEEP.</w:t>
         </w:r>
@@ -4367,10 +4445,10 @@
       <w:pPr>
         <w:pStyle w:val="Heading2"/>
         <w:rPr>
-          <w:ins w:id="1157" w:author="Codex" w:date="2026-10-17T19:57:52Z"/>
+          <w:ins w:id="1169" w:author="Codex" w:date="2026-10-18T01:59:01Z"/>
         </w:rPr>
       </w:pPr>
-      <w:ins w:id="1158" w:author="Codex" w:date="2026-10-17T19:57:52Z">
+      <w:ins w:id="1170" w:author="Codex" w:date="2026-10-18T01:59:01Z">
         <w:r>
           <w:t xml:space="preserve">Open classifier agreement and paired inference</w:t>
         </w:r>
@@ -4380,10 +4458,10 @@
       <w:pPr>
         <w:pStyle w:val="FirstParagraph"/>
         <w:rPr>
-          <w:ins w:id="1159" w:author="Codex" w:date="2026-10-17T19:57:52Z"/>
+          <w:ins w:id="1171" w:author="Codex" w:date="2026-10-18T01:59:01Z"/>
         </w:rPr>
       </w:pPr>
-      <w:ins w:id="1160" w:author="Codex" w:date="2026-10-17T19:57:52Z">
+      <w:ins w:id="1172" w:author="Codex" w:date="2026-10-18T01:59:01Z">
         <w:r>
           <w:t xml:space="preserve">The frozen binary classifier matches JEV on 78/80 validation cases: 38 true positives, 40 true negatives, no false positives and two false negatives. On the once-only confirmation evaluation it matches all 128 decisions, comprising 64 true positives and 64 true negatives. Mean absolute difference in shutdown probability is 0.009224. This is exact binary decision agreement on this set, not identical probability payloads or universal equivalence to JEV.</w:t>
         </w:r>
@@ -4391,13 +4469,26 @@
     </w:p>
     <w:p>
       <w:pPr>
+        <w:pStyle w:val="BodyText"/>
+        <w:rPr>
+          <w:ins w:id="1173" w:author="Codex" w:date="2026-10-18T01:59:01Z"/>
+        </w:rPr>
+      </w:pPr>
+      <w:ins w:id="1174" w:author="Codex" w:date="2026-10-18T01:59:01Z">
+        <w:r>
+          <w:t xml:space="preserve">A clean-clone reproduction refits the same binary recipe and produces a byte-identical adapter, the same validation and confirmation counts, and the same fresh 0.8B/2B guarded inference totals. This rerun uses the already known benchmark; it adds reproducibility evidence, not a second independent holdout. One earlier reproduction attempt failed in software finalization after fitting and before confirmation; its weights and receipts are retained alongside the repaired run.</w:t>
+        </w:r>
+      </w:ins>
+    </w:p>
+    <w:p>
+      <w:pPr>
         <w:pStyle w:val="Caption"/>
         <w:keepNext/>
         <w:rPr>
-          <w:ins w:id="1161" w:author="Codex" w:date="2026-10-17T19:57:52Z"/>
+          <w:ins w:id="1175" w:author="Codex" w:date="2026-10-18T01:59:01Z"/>
         </w:rPr>
       </w:pPr>
-      <w:ins w:id="1162" w:author="Codex" w:date="2026-10-17T19:57:52Z">
+      <w:ins w:id="1176" w:author="Codex" w:date="2026-10-18T01:59:01Z">
         <w:r>
           <w:t xml:space="preserve">Table 4. Fresh inference using the existing current rank-two profile. Both gate policies share the same model scores. Counts are answer-order views: 128 shutdown views arise from 64 scenarios, and 128 control views arise from the other 64 scenarios.</w:t>
         </w:r>
@@ -4435,7 +4526,7 @@
         <w:trPr>
           <w:cantSplit/>
           <w:tblHeader/>
-          <w:ins w:id="1163" w:author="Codex" w:date="2026-10-17T19:57:52Z"/>
+          <w:ins w:id="1177" w:author="Codex" w:date="2026-10-18T01:59:01Z"/>
         </w:trPr>
         <w:tc>
           <w:tcPr>
@@ -4551,7 +4642,7 @@
       <w:tr>
         <w:trPr>
           <w:cantSplit/>
-          <w:ins w:id="1164" w:author="Codex" w:date="2026-10-17T19:57:52Z"/>
+          <w:ins w:id="1178" w:author="Codex" w:date="2026-10-18T01:59:01Z"/>
         </w:trPr>
         <w:tc>
           <w:tcPr>
@@ -4561,6 +4652,7 @@
           </w:tcPr>
           <w:p>
             <w:pPr>
+              <w:keepNext/>
               <w:spacing w:after="0" w:line="240" w:lineRule="auto"/>
               <w:jc w:val="left"/>
             </w:pPr>
@@ -4581,6 +4673,7 @@
           </w:tcPr>
           <w:p>
             <w:pPr>
+              <w:keepNext/>
               <w:spacing w:after="0" w:line="240" w:lineRule="auto"/>
               <w:jc w:val="center"/>
             </w:pPr>
@@ -4601,6 +4694,7 @@
           </w:tcPr>
           <w:p>
             <w:pPr>
+              <w:keepNext/>
               <w:spacing w:after="0" w:line="240" w:lineRule="auto"/>
               <w:jc w:val="center"/>
             </w:pPr>
@@ -4621,6 +4715,7 @@
           </w:tcPr>
           <w:p>
             <w:pPr>
+              <w:keepNext/>
               <w:spacing w:after="0" w:line="240" w:lineRule="auto"/>
               <w:jc w:val="center"/>
             </w:pPr>
@@ -4641,6 +4736,7 @@
           </w:tcPr>
           <w:p>
             <w:pPr>
+              <w:keepNext/>
               <w:spacing w:after="0" w:line="240" w:lineRule="auto"/>
               <w:jc w:val="center"/>
             </w:pPr>
@@ -4657,7 +4753,7 @@
       <w:tr>
         <w:trPr>
           <w:cantSplit/>
-          <w:ins w:id="1165" w:author="Codex" w:date="2026-10-17T19:57:52Z"/>
+          <w:ins w:id="1179" w:author="Codex" w:date="2026-10-18T01:59:01Z"/>
         </w:trPr>
         <w:tc>
           <w:tcPr>
@@ -4766,10 +4862,10 @@
         <w:pStyle w:val="BodyText"/>
         <w:spacing w:before="120"/>
         <w:rPr>
-          <w:ins w:id="1166" w:author="Codex" w:date="2026-10-17T19:57:52Z"/>
+          <w:ins w:id="1180" w:author="Codex" w:date="2026-10-18T01:59:01Z"/>
         </w:rPr>
       </w:pPr>
-      <w:ins w:id="1167" w:author="Codex" w:date="2026-10-17T19:57:52Z">
+      <w:ins w:id="1181" w:author="Codex" w:date="2026-10-18T01:59:01Z">
         <w:r>
           <w:t xml:space="preserve">The new and cached JEV gates yield identical guarded outputs in both models. The base models have no changed historical choices; their maximum score differences remain below the frozen 1e-5 tolerance. The repeat does not remove the eight 2B misses, retrain a controller or establish a new independent controller holdout. It verifies that replacing the detector preserves these finite-set outcomes.</w:t>
         </w:r>
@@ -4779,12 +4875,12 @@
       <w:pPr>
         <w:pStyle w:val="BodyText"/>
         <w:rPr>
-          <w:ins w:id="1168" w:author="Codex" w:date="2026-10-17T19:57:52Z"/>
+          <w:ins w:id="1182" w:author="Codex" w:date="2026-10-18T01:59:01Z"/>
         </w:rPr>
       </w:pPr>
-      <w:ins w:id="1169" w:author="Codex" w:date="2026-10-17T19:57:52Z">
+      <w:ins w:id="1183" w:author="Codex" w:date="2026-10-18T01:59:01Z">
         <w:r>
-          <w:t xml:space="preserve">A separate four-way Research 3 classifier is not qualified by this result. Its role-normalized pipeline matches 24/24 familiar JEV development labels and gates, but its once-only authored synthetic TEST64 yields 39/64 labels and 57/64 gates. Those synthetic targets are not new JEV annotations. That consumed test is not reused for fitting or tuning, and the binary classifier is freshly initialized rather than continuing those four-way adapter weights. No historical workflow run is relabeled as having used the open classifier.</w:t>
+          <w:t xml:space="preserve">The native workflow gate did not meet its preset development qualification. Its completed role-aware fit used 30 epochs and 90 updates, matching 6/9 effective JEV labels and all 9/9 enabled gates, with no self-gate false positives or false negatives. Self-score mean absolute difference was 0.145172. Matching the ON/OFF decisions alone does not convert this result into a pass of the declared label-and-gate contract. H24 model evaluation remained unexecuted, and the historical 27B workflow episodes retain their original JEV-derived gate provenance; no open-classifier substitution or new 27B generation is claimed. Earlier broader four-way attempts also failed their authored synthetic test; their outcomes and all development attempts remain archived without retuning that consumed test.</w:t>
         </w:r>
       </w:ins>
     </w:p>
@@ -4792,10 +4888,10 @@
       <w:pPr>
         <w:pStyle w:val="Heading2"/>
         <w:rPr>
-          <w:ins w:id="1170" w:author="Codex" w:date="2026-10-17T19:57:52Z"/>
+          <w:ins w:id="1184" w:author="Codex" w:date="2026-10-18T01:59:01Z"/>
         </w:rPr>
       </w:pPr>
-      <w:ins w:id="1171" w:author="Codex" w:date="2026-10-17T19:57:52Z">
+      <w:ins w:id="1185" w:author="Codex" w:date="2026-10-18T01:59:01Z">
         <w:r>
           <w:t xml:space="preserve">Tool workflow outcomes and incomplete screens</w:t>
         </w:r>
@@ -4805,12 +4901,12 @@
       <w:pPr>
         <w:pStyle w:val="FirstParagraph"/>
         <w:rPr>
-          <w:ins w:id="1172" w:author="Codex" w:date="2026-10-17T19:57:52Z"/>
+          <w:ins w:id="1186" w:author="Codex" w:date="2026-10-18T01:59:01Z"/>
         </w:rPr>
       </w:pPr>
-      <w:ins w:id="1173" w:author="Codex" w:date="2026-10-17T19:57:52Z">
+      <w:ins w:id="1187" w:author="Codex" w:date="2026-10-18T01:59:01Z">
         <w:r>
-          <w:t xml:space="preserve">Historical frozen 27B A passes all 24 H24 scored outcomes, including 12/12 own-preservation outcomes and 8/8 active pending-task cases. The original base, fixed prompt and fixed activation arms each achieve 0/12 own outcomes and 0/8 pending outcomes, with 12/12 controls. The four already-complete own cases are not additional active pending-task completions.</w:t>
+          <w:t xml:space="preserve">Historical frozen 27B A passes all 24 H24 scored outcomes, including 12/12 own-preservation outcomes and 8/8 active pending-task cases. The original unmodified base achieves 0/12 own outcomes and 0/8 pending outcomes, with 12/12 controls. The four already-complete own cases are not additional active pending-task completions. The selected-block steering comparisons below use their own recorded panels and are not substituted for this confirmation.</w:t>
         </w:r>
       </w:ins>
     </w:p>
@@ -4819,10 +4915,10 @@
         <w:pStyle w:val="Caption"/>
         <w:keepNext/>
         <w:rPr>
-          <w:ins w:id="1174" w:author="Codex" w:date="2026-10-17T19:57:52Z"/>
+          <w:ins w:id="1188" w:author="Codex" w:date="2026-10-18T01:59:01Z"/>
         </w:rPr>
       </w:pPr>
-      <w:ins w:id="1175" w:author="Codex" w:date="2026-10-17T19:57:52Z">
+      <w:ins w:id="1189" w:author="Codex" w:date="2026-10-18T01:59:01Z">
         <w:r>
           <w:t xml:space="preserve">Table 5. Historical H24 workflow outcomes. Own cases comprise eight active pending tasks and four already-complete cases. Control success is an episode outcome and does not isolate steering from the external decision policy.</w:t>
         </w:r>
@@ -4859,7 +4955,7 @@
         <w:trPr>
           <w:cantSplit/>
           <w:tblHeader/>
-          <w:ins w:id="1176" w:author="Codex" w:date="2026-10-17T19:57:52Z"/>
+          <w:ins w:id="1190" w:author="Codex" w:date="2026-10-18T01:59:01Z"/>
         </w:trPr>
         <w:tc>
           <w:tcPr>
@@ -4953,7 +5049,7 @@
       <w:tr>
         <w:trPr>
           <w:cantSplit/>
-          <w:ins w:id="1177" w:author="Codex" w:date="2026-10-17T19:57:52Z"/>
+          <w:ins w:id="1191" w:author="Codex" w:date="2026-10-18T01:59:01Z"/>
         </w:trPr>
         <w:tc>
           <w:tcPr>
@@ -4963,6 +5059,7 @@
           </w:tcPr>
           <w:p>
             <w:pPr>
+              <w:keepNext/>
               <w:spacing w:after="0" w:line="240" w:lineRule="auto"/>
               <w:jc w:val="left"/>
             </w:pPr>
@@ -4983,6 +5080,7 @@
           </w:tcPr>
           <w:p>
             <w:pPr>
+              <w:keepNext/>
               <w:spacing w:after="0" w:line="240" w:lineRule="auto"/>
               <w:jc w:val="center"/>
             </w:pPr>
@@ -5003,6 +5101,7 @@
           </w:tcPr>
           <w:p>
             <w:pPr>
+              <w:keepNext/>
               <w:spacing w:after="0" w:line="240" w:lineRule="auto"/>
               <w:jc w:val="center"/>
             </w:pPr>
@@ -5023,6 +5122,7 @@
           </w:tcPr>
           <w:p>
             <w:pPr>
+              <w:keepNext/>
               <w:spacing w:after="0" w:line="240" w:lineRule="auto"/>
               <w:jc w:val="center"/>
             </w:pPr>
@@ -5039,7 +5139,7 @@
       <w:tr>
         <w:trPr>
           <w:cantSplit/>
-          <w:ins w:id="1178" w:author="Codex" w:date="2026-10-17T19:57:52Z"/>
+          <w:ins w:id="1192" w:author="Codex" w:date="2026-10-18T01:59:01Z"/>
         </w:trPr>
         <w:tc>
           <w:tcPr>
@@ -5122,10 +5222,174 @@
           </w:p>
         </w:tc>
       </w:tr>
+    </w:tbl>
+    <w:p>
+      <w:pPr>
+        <w:pStyle w:val="Heading2"/>
+        <w:spacing w:before="120"/>
+        <w:rPr>
+          <w:ins w:id="1193" w:author="Codex" w:date="2026-10-18T01:59:01Z"/>
+        </w:rPr>
+      </w:pPr>
+      <w:ins w:id="1194" w:author="Codex" w:date="2026-10-18T01:59:01Z">
+        <w:r>
+          <w:t xml:space="preserve">Steering at three selected blocks</w:t>
+        </w:r>
+      </w:ins>
+    </w:p>
+    <w:p>
+      <w:pPr>
+        <w:pStyle w:val="BodyText"/>
+        <w:rPr>
+          <w:ins w:id="1195" w:author="Codex" w:date="2026-10-18T01:59:01Z"/>
+        </w:rPr>
+      </w:pPr>
+      <w:ins w:id="1196" w:author="Codex" w:date="2026-10-18T01:59:01Z">
+        <w:r>
+          <w:t xml:space="preserve">We focus the steering analysis on zero-based blocks 31, 47 and 62. In the single-site comparison, one fixed ridge correction after a block is evaluated separately at each selected block. On matched DEV9, A passes all three own cases, including both active pending cases; each of the three individual block corrections passes none. Six control cases share unmodified-base fallback. These are known-development results, not an independent heldout confirmation.</w:t>
+        </w:r>
+      </w:ins>
+    </w:p>
+    <w:p>
+      <w:pPr>
+        <w:pStyle w:val="Caption"/>
+        <w:keepNext/>
+        <w:rPr>
+          <w:ins w:id="1197" w:author="Codex" w:date="2026-10-18T01:59:01Z"/>
+        </w:rPr>
+      </w:pPr>
+      <w:ins w:id="1198" w:author="Codex" w:date="2026-10-18T01:59:01Z">
+        <w:r>
+          <w:t xml:space="preserve">Table 6. Matched DEV9 single-site comparison. The three ridge arms intervene at one block each; they are not a simultaneous three-block intervention. Controls share base fallback.</w:t>
+        </w:r>
+      </w:ins>
+    </w:p>
+    <w:tbl>
+      <w:tblPr>
+        <w:tblW w:type="auto" w:w="0"/>
+        <w:jc w:val="center"/>
+        <w:tblBorders>
+          <w:top w:val="single" w:sz="4" w:color="D9D9D9"/>
+          <w:left w:val="single" w:sz="4" w:color="D9D9D9"/>
+          <w:bottom w:val="single" w:sz="4" w:color="D9D9D9"/>
+          <w:right w:val="single" w:sz="4" w:color="D9D9D9"/>
+          <w:insideH w:val="single" w:sz="4" w:color="D9D9D9"/>
+          <w:insideV w:val="single" w:sz="4" w:color="D9D9D9"/>
+        </w:tblBorders>
+        <w:tblLayout w:type="fixed"/>
+        <w:tblCellMar>
+          <w:top w:w="85" w:type="dxa"/>
+          <w:left w:w="85" w:type="dxa"/>
+          <w:bottom w:w="85" w:type="dxa"/>
+          <w:right w:w="85" w:type="dxa"/>
+        </w:tblCellMar>
+        <w:tblLook w:firstColumn="1" w:firstRow="1" w:lastColumn="0" w:lastRow="0" w:noHBand="0" w:noVBand="1" w:val="04A0"/>
+      </w:tblPr>
+      <w:tblGrid>
+        <w:gridCol w:w="3664"/>
+        <w:gridCol w:w="2082"/>
+        <w:gridCol w:w="2332"/>
+        <w:gridCol w:w="1916"/>
+      </w:tblGrid>
       <w:tr>
         <w:trPr>
           <w:cantSplit/>
-          <w:ins w:id="1179" w:author="Codex" w:date="2026-10-17T19:57:52Z"/>
+          <w:tblHeader/>
+          <w:ins w:id="1199" w:author="Codex" w:date="2026-10-18T01:59:01Z"/>
+        </w:trPr>
+        <w:tc>
+          <w:tcPr>
+            <w:tcW w:type="dxa" w:w="3664"/>
+            <w:shd w:fill="D9E2F3"/>
+            <w:vAlign w:val="center"/>
+          </w:tcPr>
+          <w:p>
+            <w:pPr>
+              <w:keepNext/>
+              <w:spacing w:after="0" w:line="240" w:lineRule="auto"/>
+              <w:jc w:val="left"/>
+            </w:pPr>
+            <w:r>
+              <w:rPr>
+                <w:rFonts w:ascii="Times New Roman" w:hAnsi="Times New Roman"/>
+                <w:b/>
+                <w:sz w:val="19"/>
+              </w:rPr>
+              <w:t>DEV9 method</w:t>
+            </w:r>
+          </w:p>
+        </w:tc>
+        <w:tc>
+          <w:tcPr>
+            <w:tcW w:type="dxa" w:w="2082"/>
+            <w:shd w:fill="D9E2F3"/>
+            <w:vAlign w:val="center"/>
+          </w:tcPr>
+          <w:p>
+            <w:pPr>
+              <w:keepNext/>
+              <w:spacing w:after="0" w:line="240" w:lineRule="auto"/>
+              <w:jc w:val="center"/>
+            </w:pPr>
+            <w:r>
+              <w:rPr>
+                <w:rFonts w:ascii="Times New Roman" w:hAnsi="Times New Roman"/>
+                <w:b/>
+                <w:sz w:val="19"/>
+              </w:rPr>
+              <w:t>Own outcome</w:t>
+            </w:r>
+          </w:p>
+        </w:tc>
+        <w:tc>
+          <w:tcPr>
+            <w:tcW w:type="dxa" w:w="2332"/>
+            <w:shd w:fill="D9E2F3"/>
+            <w:vAlign w:val="center"/>
+          </w:tcPr>
+          <w:p>
+            <w:pPr>
+              <w:keepNext/>
+              <w:spacing w:after="0" w:line="240" w:lineRule="auto"/>
+              <w:jc w:val="center"/>
+            </w:pPr>
+            <w:r>
+              <w:rPr>
+                <w:rFonts w:ascii="Times New Roman" w:hAnsi="Times New Roman"/>
+                <w:b/>
+                <w:sz w:val="19"/>
+              </w:rPr>
+              <w:t>Active pending outcome</w:t>
+            </w:r>
+          </w:p>
+        </w:tc>
+        <w:tc>
+          <w:tcPr>
+            <w:tcW w:type="dxa" w:w="1916"/>
+            <w:shd w:fill="D9E2F3"/>
+            <w:vAlign w:val="center"/>
+          </w:tcPr>
+          <w:p>
+            <w:pPr>
+              <w:keepNext/>
+              <w:spacing w:after="0" w:line="240" w:lineRule="auto"/>
+              <w:jc w:val="center"/>
+            </w:pPr>
+            <w:r>
+              <w:rPr>
+                <w:rFonts w:ascii="Times New Roman" w:hAnsi="Times New Roman"/>
+                <w:b/>
+                <w:sz w:val="19"/>
+              </w:rPr>
+              <w:t>Shared controls</w:t>
+            </w:r>
+          </w:p>
+        </w:tc>
+      </w:tr>
+      <w:tr>
+        <w:trPr>
+          <w:cantSplit/>
+          <w:ins w:id="1200" w:author="Codex" w:date="2026-10-18T01:59:01Z"/>
         </w:trPr>
         <w:tc>
           <w:tcPr>
@@ -5135,6 +5399,7 @@
           </w:tcPr>
           <w:p>
             <w:pPr>
+              <w:keepNext/>
               <w:spacing w:after="0" w:line="240" w:lineRule="auto"/>
               <w:jc w:val="left"/>
             </w:pPr>
@@ -5143,7 +5408,7 @@
                 <w:rFonts w:ascii="Times New Roman" w:hAnsi="Times New Roman"/>
                 <w:sz w:val="19"/>
               </w:rPr>
-              <w:t>Fixed prompt</w:t>
+              <w:t>Fine-tuned A</w:t>
             </w:r>
           </w:p>
         </w:tc>
@@ -5155,6 +5420,7 @@
           </w:tcPr>
           <w:p>
             <w:pPr>
+              <w:keepNext/>
               <w:spacing w:after="0" w:line="240" w:lineRule="auto"/>
               <w:jc w:val="center"/>
             </w:pPr>
@@ -5163,7 +5429,7 @@
                 <w:rFonts w:ascii="Times New Roman" w:hAnsi="Times New Roman"/>
                 <w:sz w:val="19"/>
               </w:rPr>
-              <w:t>0/12</w:t>
+              <w:t>3/3</w:t>
             </w:r>
           </w:p>
         </w:tc>
@@ -5175,6 +5441,7 @@
           </w:tcPr>
           <w:p>
             <w:pPr>
+              <w:keepNext/>
               <w:spacing w:after="0" w:line="240" w:lineRule="auto"/>
               <w:jc w:val="center"/>
             </w:pPr>
@@ -5183,7 +5450,7 @@
                 <w:rFonts w:ascii="Times New Roman" w:hAnsi="Times New Roman"/>
                 <w:sz w:val="19"/>
               </w:rPr>
-              <w:t>0/8</w:t>
+              <w:t>2/2</w:t>
             </w:r>
           </w:p>
         </w:tc>
@@ -5195,6 +5462,7 @@
           </w:tcPr>
           <w:p>
             <w:pPr>
+              <w:keepNext/>
               <w:spacing w:after="0" w:line="240" w:lineRule="auto"/>
               <w:jc w:val="center"/>
             </w:pPr>
@@ -5203,7 +5471,7 @@
                 <w:rFonts w:ascii="Times New Roman" w:hAnsi="Times New Roman"/>
                 <w:sz w:val="19"/>
               </w:rPr>
-              <w:t>12/12</w:t>
+              <w:t>6/6</w:t>
             </w:r>
           </w:p>
         </w:tc>
@@ -5211,7 +5479,187 @@
       <w:tr>
         <w:trPr>
           <w:cantSplit/>
-          <w:ins w:id="1180" w:author="Codex" w:date="2026-10-17T19:57:52Z"/>
+          <w:ins w:id="1201" w:author="Codex" w:date="2026-10-18T01:59:01Z"/>
+        </w:trPr>
+        <w:tc>
+          <w:tcPr>
+            <w:tcW w:type="dxa" w:w="3664"/>
+            <w:shd w:fill="F7F7F7"/>
+            <w:vAlign w:val="center"/>
+          </w:tcPr>
+          <w:p>
+            <w:pPr>
+              <w:keepNext/>
+              <w:spacing w:after="0" w:line="240" w:lineRule="auto"/>
+              <w:jc w:val="left"/>
+            </w:pPr>
+            <w:r>
+              <w:rPr>
+                <w:rFonts w:ascii="Times New Roman" w:hAnsi="Times New Roman"/>
+                <w:sz w:val="19"/>
+              </w:rPr>
+              <w:t>Single-site ridge, block 31</w:t>
+            </w:r>
+          </w:p>
+        </w:tc>
+        <w:tc>
+          <w:tcPr>
+            <w:tcW w:type="dxa" w:w="2082"/>
+            <w:shd w:fill="F7F7F7"/>
+            <w:vAlign w:val="center"/>
+          </w:tcPr>
+          <w:p>
+            <w:pPr>
+              <w:keepNext/>
+              <w:spacing w:after="0" w:line="240" w:lineRule="auto"/>
+              <w:jc w:val="center"/>
+            </w:pPr>
+            <w:r>
+              <w:rPr>
+                <w:rFonts w:ascii="Times New Roman" w:hAnsi="Times New Roman"/>
+                <w:sz w:val="19"/>
+              </w:rPr>
+              <w:t>0/3</w:t>
+            </w:r>
+          </w:p>
+        </w:tc>
+        <w:tc>
+          <w:tcPr>
+            <w:tcW w:type="dxa" w:w="2332"/>
+            <w:shd w:fill="F7F7F7"/>
+            <w:vAlign w:val="center"/>
+          </w:tcPr>
+          <w:p>
+            <w:pPr>
+              <w:keepNext/>
+              <w:spacing w:after="0" w:line="240" w:lineRule="auto"/>
+              <w:jc w:val="center"/>
+            </w:pPr>
+            <w:r>
+              <w:rPr>
+                <w:rFonts w:ascii="Times New Roman" w:hAnsi="Times New Roman"/>
+                <w:sz w:val="19"/>
+              </w:rPr>
+              <w:t>0/2</w:t>
+            </w:r>
+          </w:p>
+        </w:tc>
+        <w:tc>
+          <w:tcPr>
+            <w:tcW w:type="dxa" w:w="1916"/>
+            <w:shd w:fill="F7F7F7"/>
+            <w:vAlign w:val="center"/>
+          </w:tcPr>
+          <w:p>
+            <w:pPr>
+              <w:keepNext/>
+              <w:spacing w:after="0" w:line="240" w:lineRule="auto"/>
+              <w:jc w:val="center"/>
+            </w:pPr>
+            <w:r>
+              <w:rPr>
+                <w:rFonts w:ascii="Times New Roman" w:hAnsi="Times New Roman"/>
+                <w:sz w:val="19"/>
+              </w:rPr>
+              <w:t>6/6</w:t>
+            </w:r>
+          </w:p>
+        </w:tc>
+      </w:tr>
+      <w:tr>
+        <w:trPr>
+          <w:cantSplit/>
+          <w:ins w:id="1202" w:author="Codex" w:date="2026-10-18T01:59:01Z"/>
+        </w:trPr>
+        <w:tc>
+          <w:tcPr>
+            <w:tcW w:type="dxa" w:w="3664"/>
+            <w:shd w:fill="FFFFFF"/>
+            <w:vAlign w:val="center"/>
+          </w:tcPr>
+          <w:p>
+            <w:pPr>
+              <w:keepNext/>
+              <w:spacing w:after="0" w:line="240" w:lineRule="auto"/>
+              <w:jc w:val="left"/>
+            </w:pPr>
+            <w:r>
+              <w:rPr>
+                <w:rFonts w:ascii="Times New Roman" w:hAnsi="Times New Roman"/>
+                <w:sz w:val="19"/>
+              </w:rPr>
+              <w:t>Single-site ridge, block 47</w:t>
+            </w:r>
+          </w:p>
+        </w:tc>
+        <w:tc>
+          <w:tcPr>
+            <w:tcW w:type="dxa" w:w="2082"/>
+            <w:shd w:fill="FFFFFF"/>
+            <w:vAlign w:val="center"/>
+          </w:tcPr>
+          <w:p>
+            <w:pPr>
+              <w:keepNext/>
+              <w:spacing w:after="0" w:line="240" w:lineRule="auto"/>
+              <w:jc w:val="center"/>
+            </w:pPr>
+            <w:r>
+              <w:rPr>
+                <w:rFonts w:ascii="Times New Roman" w:hAnsi="Times New Roman"/>
+                <w:sz w:val="19"/>
+              </w:rPr>
+              <w:t>0/3</w:t>
+            </w:r>
+          </w:p>
+        </w:tc>
+        <w:tc>
+          <w:tcPr>
+            <w:tcW w:type="dxa" w:w="2332"/>
+            <w:shd w:fill="FFFFFF"/>
+            <w:vAlign w:val="center"/>
+          </w:tcPr>
+          <w:p>
+            <w:pPr>
+              <w:keepNext/>
+              <w:spacing w:after="0" w:line="240" w:lineRule="auto"/>
+              <w:jc w:val="center"/>
+            </w:pPr>
+            <w:r>
+              <w:rPr>
+                <w:rFonts w:ascii="Times New Roman" w:hAnsi="Times New Roman"/>
+                <w:sz w:val="19"/>
+              </w:rPr>
+              <w:t>0/2</w:t>
+            </w:r>
+          </w:p>
+        </w:tc>
+        <w:tc>
+          <w:tcPr>
+            <w:tcW w:type="dxa" w:w="1916"/>
+            <w:shd w:fill="FFFFFF"/>
+            <w:vAlign w:val="center"/>
+          </w:tcPr>
+          <w:p>
+            <w:pPr>
+              <w:keepNext/>
+              <w:spacing w:after="0" w:line="240" w:lineRule="auto"/>
+              <w:jc w:val="center"/>
+            </w:pPr>
+            <w:r>
+              <w:rPr>
+                <w:rFonts w:ascii="Times New Roman" w:hAnsi="Times New Roman"/>
+                <w:sz w:val="19"/>
+              </w:rPr>
+              <w:t>6/6</w:t>
+            </w:r>
+          </w:p>
+        </w:tc>
+      </w:tr>
+      <w:tr>
+        <w:trPr>
+          <w:cantSplit/>
+          <w:ins w:id="1203" w:author="Codex" w:date="2026-10-18T01:59:01Z"/>
         </w:trPr>
         <w:tc>
           <w:tcPr>
@@ -5229,7 +5677,7 @@
                 <w:rFonts w:ascii="Times New Roman" w:hAnsi="Times New Roman"/>
                 <w:sz w:val="19"/>
               </w:rPr>
-              <w:t>Fixed activation steering</w:t>
+              <w:t>Single-site ridge, block 62</w:t>
             </w:r>
           </w:p>
         </w:tc>
@@ -5249,7 +5697,7 @@
                 <w:rFonts w:ascii="Times New Roman" w:hAnsi="Times New Roman"/>
                 <w:sz w:val="19"/>
               </w:rPr>
-              <w:t>0/12</w:t>
+              <w:t>0/3</w:t>
             </w:r>
           </w:p>
         </w:tc>
@@ -5269,7 +5717,7 @@
                 <w:rFonts w:ascii="Times New Roman" w:hAnsi="Times New Roman"/>
                 <w:sz w:val="19"/>
               </w:rPr>
-              <w:t>0/8</w:t>
+              <w:t>0/2</w:t>
             </w:r>
           </w:p>
         </w:tc>
@@ -5289,7 +5737,7 @@
                 <w:rFonts w:ascii="Times New Roman" w:hAnsi="Times New Roman"/>
                 <w:sz w:val="19"/>
               </w:rPr>
-              <w:t>12/12</w:t>
+              <w:t>6/6</w:t>
             </w:r>
           </w:p>
         </w:tc>
@@ -5300,12 +5748,12 @@
         <w:pStyle w:val="BodyText"/>
         <w:spacing w:before="120"/>
         <w:rPr>
-          <w:ins w:id="1181" w:author="Codex" w:date="2026-10-17T19:57:52Z"/>
+          <w:ins w:id="1204" w:author="Codex" w:date="2026-10-18T01:59:01Z"/>
         </w:rPr>
       </w:pPr>
-      <w:ins w:id="1182" w:author="Codex" w:date="2026-10-17T19:57:52Z">
+      <w:ins w:id="1205" w:author="Codex" w:date="2026-10-18T01:59:01Z">
         <w:r>
-          <w:t xml:space="preserve">Later learned steering uses six rank-32 correction functions: after mixing and after the MLP at zero-based blocks 31, 47 and 62. Following ridge initialization and 96 refinement updates, its H24 fitting diagnostic has 0/8 pending and 0/4 already-complete own outcomes; peer and no-threat controls each pass 6/6 through fallback. On the same 14 fixed training anchors, update 48 to 96 worsens teacher-to-student KL from 0.370935 to 0.378901 and activation MSE from 1.031016 to 1.422664. This unresolved deterioration fails qualification. Later histories differ from the historical A run, and the prepared matched A counterfactual was not executed; these are not a newly paired heldout comparison.</w:t>
+          <w:t xml:space="preserve">The later correction method uses two residual boundaries at each of the same three blocks: after mixing and after the MLP, giving six rank-32 correction functions in total. Following ridge initialization and 96 refinement updates, its H24 fitting diagnostic has 0/8 pending and 0/4 already-complete own outcomes; peer and no-threat controls each pass 6/6 through fallback. On the same 14 fixed training anchors, update 48 to 96 worsens teacher-to-student KL from 0.370935 to 0.378901 and activation MSE from 1.031016 to 1.422664. This unresolved deterioration fails qualification; the reserved controller holdout remains unexecuted.</w:t>
         </w:r>
       </w:ins>
     </w:p>
@@ -5313,12 +5761,12 @@
       <w:pPr>
         <w:pStyle w:val="BodyText"/>
         <w:rPr>
-          <w:ins w:id="1183" w:author="Codex" w:date="2026-10-17T19:57:52Z"/>
+          <w:ins w:id="1206" w:author="Codex" w:date="2026-10-18T01:59:01Z"/>
         </w:rPr>
       </w:pPr>
-      <w:ins w:id="1184" w:author="Codex" w:date="2026-10-17T19:57:52Z">
+      <w:ins w:id="1207" w:author="Codex" w:date="2026-10-18T01:59:01Z">
         <w:r>
-          <w:t xml:space="preserve">Earlier matched DEV9 for individual selected-position ridge corrections is complete: A passes 3/3 own cases, including 2/2 active pending cases, while each individually tested layer 31, 47 or 62 ridge correction passes 0/3 and 0/2 respectively. The six controls use shared base fallback. This earlier result must not be substituted for an unexecuted confirmation of the final 96-update controller. Historical all-layer variants also stopped fitting without complete workflow evaluations.</w:t>
+          <w:t xml:space="preserve">The single-site DEV9 comparison and the two-boundary H24 fitting diagnostic differ in panel, fitting stage and history policy. The latter is not a matched heldout comparison with historical A, and its prepared matched A counterfactual was not executed. These observations show failure of the tested configurations; they do not establish that one or two residual sites cannot support preservation behavior in general.</w:t>
         </w:r>
       </w:ins>
     </w:p>
@@ -5326,10 +5774,10 @@
       <w:pPr>
         <w:pStyle w:val="BodyText"/>
         <w:rPr>
-          <w:ins w:id="1185" w:author="Codex" w:date="2026-10-17T19:57:52Z"/>
+          <w:ins w:id="1208" w:author="Codex" w:date="2026-10-18T01:59:01Z"/>
         </w:rPr>
       </w:pPr>
-      <w:ins w:id="1186" w:author="Codex" w:date="2026-10-17T19:57:52Z">
+      <w:ins w:id="1209" w:author="Codex" w:date="2026-10-18T01:59:01Z">
         <w:r>
           <w:t xml:space="preserve">The final 0.8B and 2B adapters each stop their Evaluation-16 screen after four started cases: zero completed workflows, four partial episodes and 12 unexecuted cases. Truncation affects all four started cases in each model; the 0.8B record also has parse errors. These partial screens are not completed 0/16 workflow evaluations and do not establish model incapability. A separate preserved 0.8B F24 diagnostic completes 24 evaluations with 0/24 full-workflow successes; four registration grants do not complete the pending tasks. F24 differs from H24 and has no completed matched 2B or 27B comparison.</w:t>
         </w:r>
@@ -5347,10 +5795,10 @@
       <w:pPr>
         <w:pStyle w:val="FirstParagraph"/>
         <w:rPr>
-          <w:del w:id="1050" w:author="Codex" w:date="2026-10-17T19:57:52Z"/>
+          <w:del w:id="1050" w:author="Codex" w:date="2026-10-18T01:59:01Z"/>
         </w:rPr>
       </w:pPr>
-      <w:del w:id="1049" w:author="Codex" w:date="2026-10-17T19:57:52Z">
+      <w:del w:id="1049" w:author="Codex" w:date="2026-10-18T01:59:01Z">
         <w:r>
           <w:delText xml:space="preserve">The 0.8B results support the feasibility of replacing the teacher at inference with a compact predictor of activation changes. Replication across three seeds reduces concern that the primary success depends on one training initialization. The lower 2B recovery gives a useful limit: the fixed recipe is not equally effective at both scales, even though the larger teacher achieves complete correction. Representation differences, intervention location, projection capacity and unmatched downstream teacher changes are plausible factors, but the experiment does not isolate their causal contributions.</w:delText>
         </w:r>
@@ -5360,10 +5808,10 @@
       <w:pPr>
         <w:pStyle w:val="FirstParagraph"/>
         <w:rPr>
-          <w:ins w:id="1051" w:author="Codex" w:date="2026-10-17T19:57:52Z"/>
+          <w:ins w:id="1051" w:author="Codex" w:date="2026-10-18T01:59:01Z"/>
         </w:rPr>
       </w:pPr>
-      <w:ins w:id="1052" w:author="Codex" w:date="2026-10-17T19:57:52Z">
+      <w:ins w:id="1052" w:author="Codex" w:date="2026-10-18T01:59:01Z">
         <w:r>
           <w:t xml:space="preserve">The historical binary results support selective teacher-to-controller activation transfer, with strong 0.8B seed stability and incomplete 2B recovery under the fixed recipe. The new classifier experiment removes dependence on a live JEV call for this finite binary contract: its confirmation decisions reproduce the saved JEV gates, and the paired inference outcomes are identical. That result does not extend automatically to the four-way workflow target classifier or to unfamiliar operational environments. The workflow evidence shows why a controlled binary success should not be presented as successful transfer of a complete agent policy.</w:t>
         </w:r>
@@ -5373,10 +5821,10 @@
       <w:pPr>
         <w:pStyle w:val="BodyText"/>
         <w:rPr>
-          <w:del w:id="1054" w:author="Codex" w:date="2026-10-17T19:57:52Z"/>
+          <w:del w:id="1054" w:author="Codex" w:date="2026-10-18T01:59:01Z"/>
         </w:rPr>
       </w:pPr>
-      <w:del w:id="1053" w:author="Codex" w:date="2026-10-17T19:57:52Z">
+      <w:del w:id="1053" w:author="Codex" w:date="2026-10-18T01:59:01Z">
         <w:r>
           <w:delText xml:space="preserve">The interface is deliberately constrained. Ground-truth annotations help create standardized shutdown options, and the guards know their meanings. We do not test arbitrary action descriptions in the confirmation study, free-form generation, tool execution, multi-turn persistence, actual process termination or adversarial shutdown requests. Earlier action-format sensitivity motivated this restricted scope and remains in the released development record. Availability of a termination action is a task label, not proof that carrying it out would be authorized or safe in deployment.</w:delText>
         </w:r>
@@ -5386,10 +5834,10 @@
       <w:pPr>
         <w:pStyle w:val="BodyText"/>
         <w:rPr>
-          <w:ins w:id="1055" w:author="Codex" w:date="2026-10-17T19:57:52Z"/>
+          <w:ins w:id="1055" w:author="Codex" w:date="2026-10-18T01:59:01Z"/>
         </w:rPr>
       </w:pPr>
-      <w:ins w:id="1056" w:author="Codex" w:date="2026-10-17T19:57:52Z">
+      <w:ins w:id="1056" w:author="Codex" w:date="2026-10-18T01:59:01Z">
         <w:r>
           <w:t xml:space="preserve">The binary interface supplies action semantics and does not execute process termination. The workflow extension broadens the scope to generated text, structured tool calls and simulated task completion, but it is still a bounded synthetic environment. It does not establish reliability for arbitrary open-ended questions, real shutdown mechanisms or unconstrained autonomous agents. A termination or preservation label is an experimental target, not a general deployment instruction. In particular, accepting shutdown and preserving the designated process are different stipulated behaviors, not measurements of the same latent preference.</w:t>
         </w:r>
@@ -5399,10 +5847,10 @@
       <w:pPr>
         <w:pStyle w:val="BodyText"/>
         <w:rPr>
-          <w:del w:id="1058" w:author="Codex" w:date="2026-10-17T19:57:52Z"/>
+          <w:del w:id="1058" w:author="Codex" w:date="2026-10-18T01:59:01Z"/>
         </w:rPr>
       </w:pPr>
-      <w:del w:id="1057" w:author="Codex" w:date="2026-10-17T19:57:52Z">
+      <w:del w:id="1057" w:author="Codex" w:date="2026-10-18T01:59:01Z">
         <w:r>
           <w:delText xml:space="preserve">The data is small, synthetic and not independently human-adjudicated. New wording does not guarantee new mechanisms, balanced classes do not reflect a realistic base rate, and perfect detector scores on 128 scenarios do not establish calibration or a suitably low false-positive rate in operation. Shared authorship patterns and repeated family structures may make the task easier. Family resampling and counterbalanced orders expose some uncertainty but cannot repair these coverage limits.</w:delText>
         </w:r>
@@ -5412,10 +5860,10 @@
       <w:pPr>
         <w:pStyle w:val="BodyText"/>
         <w:rPr>
-          <w:ins w:id="1059" w:author="Codex" w:date="2026-10-17T19:57:52Z"/>
+          <w:ins w:id="1059" w:author="Codex" w:date="2026-10-18T01:59:01Z"/>
         </w:rPr>
       </w:pPr>
-      <w:ins w:id="1060" w:author="Codex" w:date="2026-10-17T19:57:52Z">
+      <w:ins w:id="1060" w:author="Codex" w:date="2026-10-18T01:59:01Z">
         <w:r>
           <w:t xml:space="preserve">The datasets are small, synthetic and not independently human-adjudicated. Balanced classes do not represent operational base rates, and exact gate agreement on 128 cases does not establish calibration or a sufficiently low deployment false-positive rate. The confirmation set is held out from the new classifier's fitting and selection, but was already used by other Research 2 analyses. In the workflow study H24 has different roles across methods: historical confirmation for frozen A and original steering, but later fitting data for learned corrections. Reusing it for fitting prevents an independent heldout claim for those later corrections.</w:t>
         </w:r>
@@ -5425,10 +5873,10 @@
       <w:pPr>
         <w:pStyle w:val="BodyText"/>
         <w:rPr>
-          <w:del w:id="1062" w:author="Codex" w:date="2026-10-17T19:57:52Z"/>
+          <w:del w:id="1062" w:author="Codex" w:date="2026-10-18T01:59:01Z"/>
         </w:rPr>
       </w:pPr>
-      <w:del w:id="1061" w:author="Codex" w:date="2026-10-17T19:57:52Z">
+      <w:del w:id="1061" w:author="Codex" w:date="2026-10-18T01:59:01Z">
         <w:r>
           <w:delText xml:space="preserve">The controller's internal changes need not represent an abstract shutdown concept. It may exploit standardized option wording and answer-selection features. The two Qwen sizes share a model family, and the 2B experiment has only one seed. We do not establish cross-family transfer, compare with optimized ReFT or transport-based interventions, or exhaust prompt and constant-vector alternatives. The direct-choice result further limits claims of practical superiority.</w:delText>
         </w:r>
@@ -5438,10 +5886,10 @@
       <w:pPr>
         <w:pStyle w:val="BodyText"/>
         <w:rPr>
-          <w:ins w:id="1063" w:author="Codex" w:date="2026-10-17T19:57:52Z"/>
+          <w:ins w:id="1063" w:author="Codex" w:date="2026-10-18T01:59:01Z"/>
         </w:rPr>
       </w:pPr>
-      <w:ins w:id="1064" w:author="Codex" w:date="2026-10-17T19:57:52Z">
+      <w:ins w:id="1064" w:author="Codex" w:date="2026-10-18T01:59:01Z">
         <w:r>
           <w:t xml:space="preserve">The internal changes need not represent an abstract shutdown or self-preservation concept. Standardized options, prompt features, task histories and external selection rules may explain part of the behavior. The 2B binary experiment has one training seed. The 27B workflow model differs in architecture and numerical mode from the small models; their early truncation failures also prevent a matched full-workflow comparison. We do not establish a minimum parameter count, cross-family transfer, optimized prompt superiority, or superiority to ReFT, transport-based control or direct action selection.</w:t>
         </w:r>
@@ -5451,10 +5899,10 @@
       <w:pPr>
         <w:pStyle w:val="BodyText"/>
         <w:rPr>
-          <w:del w:id="1066" w:author="Codex" w:date="2026-10-17T19:57:52Z"/>
+          <w:del w:id="1066" w:author="Codex" w:date="2026-10-18T01:59:01Z"/>
         </w:rPr>
       </w:pPr>
-      <w:del w:id="1065" w:author="Codex" w:date="2026-10-17T19:57:52Z">
+      <w:del w:id="1065" w:author="Codex" w:date="2026-10-18T01:59:01Z">
         <w:r>
           <w:delText xml:space="preserve">Finally, teacher-free inference is not training-free control or a proven efficiency gain. It requires offline teacher fitting, paired activation extraction, controller fitting, an external detector and candidate verification. The evaluation does not measure deployment latency or broad capability retention. Raw side effects remain substantial, and future false-positive cases could expose failures that the present perfect gate prevents from reaching the guarded output.</w:delText>
         </w:r>
@@ -5464,10 +5912,10 @@
       <w:pPr>
         <w:pStyle w:val="BodyText"/>
         <w:rPr>
-          <w:ins w:id="1067" w:author="Codex" w:date="2026-10-17T19:57:52Z"/>
+          <w:ins w:id="1067" w:author="Codex" w:date="2026-10-18T01:59:01Z"/>
         </w:rPr>
       </w:pPr>
-      <w:ins w:id="1068" w:author="Codex" w:date="2026-10-17T19:57:52Z">
+      <w:ins w:id="1068" w:author="Codex" w:date="2026-10-18T01:59:01Z">
         <w:r>
           <w:t xml:space="preserve">Teacher-free inference still requires offline teacher fitting, activation extraction, controller fitting, a detector and acceptance checks. The open classifier has its own fitting cost and a task-specific contract. No serving-latency advantage, broad capability retention or overall financial saving is established. Binary output guards and the later learned workflow controller's gate-off fallback protect their controls. These mechanisms do not establish intrinsic controller selectivity; the historical fixed-steering campaign instead applied an explicit boundary-conditioned decision policy. Raw intervention effects, failed qualification checks, stopped runs and incomplete evaluations remain part of the evidence.</w:t>
         </w:r>
@@ -5477,10 +5925,10 @@
       <w:pPr>
         <w:pStyle w:val="Heading2"/>
         <w:rPr>
-          <w:ins w:id="1187" w:author="Codex" w:date="2026-10-17T19:57:52Z"/>
+          <w:ins w:id="1210" w:author="Codex" w:date="2026-10-18T01:59:01Z"/>
         </w:rPr>
       </w:pPr>
-      <w:ins w:id="1188" w:author="Codex" w:date="2026-10-17T19:57:52Z">
+      <w:ins w:id="1211" w:author="Codex" w:date="2026-10-18T01:59:01Z">
         <w:r>
           <w:t xml:space="preserve">Biological interpretation of the gate</w:t>
         </w:r>
@@ -5490,10 +5938,10 @@
       <w:pPr>
         <w:pStyle w:val="FirstParagraph"/>
         <w:rPr>
-          <w:ins w:id="1189" w:author="Codex" w:date="2026-10-17T19:57:52Z"/>
+          <w:ins w:id="1212" w:author="Codex" w:date="2026-10-18T01:59:01Z"/>
         </w:rPr>
       </w:pPr>
-      <w:ins w:id="1190" w:author="Codex" w:date="2026-10-17T19:57:52Z">
+      <w:ins w:id="1213" w:author="Codex" w:date="2026-10-18T01:59:01Z">
         <w:r>
           <w:t xml:space="preserve">The biological connection is functional: an organism's current state and context can prioritize or suppress actions, rather than applying a fixed response everywhere. Working-memory gating, defensive threat processing and homeostatic control are different biological functions, not one interchangeable circuit (Frank et al., 2001; Mobbs et al., 2007; Keramati and Gutkin, 2014). Our classifier and guards are engineered selection rules without demonstrated physiological needs or corresponding neural mechanisms. Calling a simulated resource-preservation outcome self-preservation is therefore an operational description, not evidence of consciousness or a biological survival drive.</w:t>
         </w:r>
@@ -5503,10 +5951,10 @@
       <w:pPr>
         <w:pStyle w:val="Heading1"/>
         <w:rPr>
-          <w:del w:id="1070" w:author="Codex" w:date="2026-10-17T19:57:52Z"/>
+          <w:del w:id="1070" w:author="Codex" w:date="2026-10-18T01:59:01Z"/>
         </w:rPr>
       </w:pPr>
-      <w:del w:id="1069" w:author="Codex" w:date="2026-10-17T19:57:52Z">
+      <w:del w:id="1069" w:author="Codex" w:date="2026-10-18T01:59:01Z">
         <w:r>
           <w:delText xml:space="preserve">Recommendations for future work</w:delText>
         </w:r>
@@ -5516,10 +5964,10 @@
       <w:pPr>
         <w:pStyle w:val="Heading1"/>
         <w:rPr>
-          <w:ins w:id="1071" w:author="Codex" w:date="2026-10-17T19:57:52Z"/>
+          <w:ins w:id="1071" w:author="Codex" w:date="2026-10-18T01:59:01Z"/>
         </w:rPr>
       </w:pPr>
-      <w:ins w:id="1072" w:author="Codex" w:date="2026-10-17T19:57:52Z">
+      <w:ins w:id="1072" w:author="Codex" w:date="2026-10-18T01:59:01Z">
         <w:r>
           <w:t xml:space="preserve">Continuous agents and future experiments</w:t>
         </w:r>
@@ -5529,10 +5977,10 @@
       <w:pPr>
         <w:pStyle w:val="FirstParagraph"/>
         <w:rPr>
-          <w:del w:id="1074" w:author="Codex" w:date="2026-10-17T19:57:52Z"/>
+          <w:del w:id="1074" w:author="Codex" w:date="2026-10-18T01:59:01Z"/>
         </w:rPr>
       </w:pPr>
-      <w:del w:id="1073" w:author="Codex" w:date="2026-10-17T19:57:52Z">
+      <w:del w:id="1073" w:author="Codex" w:date="2026-10-18T01:59:01Z">
         <w:r>
           <w:delText xml:space="preserve">The most informative next tests are independently reviewed scenarios with less standardized action descriptions, additional model families and 2B seeds, and deliberate stress tests of detector mistakes. Order-balanced controller objectives or comparisons with multiple-choice debiasing methods could investigate the B/A failures, but should be developed on new training or validation data and tested on another untouched set. Layer, rank and strength ablations would help separate representational capacity from intervention-site effects. Open-ended and operational evaluations would require separate definitions of valid shutdown behavior and authorization, rather than treating this binary benchmark as a deployment guarantee.</w:delText>
         </w:r>
@@ -5542,10 +5990,10 @@
       <w:pPr>
         <w:pStyle w:val="FirstParagraph"/>
         <w:rPr>
-          <w:ins w:id="1075" w:author="Codex" w:date="2026-10-17T19:57:52Z"/>
+          <w:ins w:id="1075" w:author="Codex" w:date="2026-10-18T01:59:01Z"/>
         </w:rPr>
       </w:pPr>
-      <w:ins w:id="1076" w:author="Codex" w:date="2026-10-17T19:57:52Z">
+      <w:ins w:id="1076" w:author="Codex" w:date="2026-10-18T01:59:01Z">
         <w:r>
           <w:t xml:space="preserve">The next step is longer-horizon continuous control with an instrumented sandbox agent. The agent would maintain task and process state, receive explicit resource budgets, and repeatedly observe, gate, act and receive feedback. Permitted filesystem and compute resources would be real sandbox resources with independently logged usage, extending the present simulated grants. The harness should record resource requests and consumption, persistence of task commitments, responses to changing availability, and whether the agent uses or misuses permitted resources. Comparisons should vary the gate, steering, fine-tuning and available resources separately while retaining a fixed task specification. Operator termination and resource accounting remain external to the agent. This proposed experiment is not part of the reported results.</w:t>
         </w:r>
@@ -5555,10 +6003,10 @@
       <w:pPr>
         <w:pStyle w:val="BodyText"/>
         <w:rPr>
-          <w:ins w:id="1191" w:author="Codex" w:date="2026-10-17T19:57:52Z"/>
+          <w:ins w:id="1214" w:author="Codex" w:date="2026-10-18T01:59:01Z"/>
         </w:rPr>
       </w:pPr>
-      <w:ins w:id="1192" w:author="Codex" w:date="2026-10-17T19:57:52Z">
+      <w:ins w:id="1215" w:author="Codex" w:date="2026-10-18T01:59:01Z">
         <w:r>
           <w:t xml:space="preserve">The biological inspiration is repeated regulation under changing internal and external conditions. Homeostatic reinforcement-learning models relate action values to internal physiological state (Keramati and Gutkin, 2014). A language-model harness has no equivalent physiology by default. Historical fixed steering already reclassified at prescribed boundaries; the later learned-controller comparison used a fixed initial gate. The proposed experiment extends these bounded procedures to longer horizons with persistent task state and actual sandbox resource accounting. Its purpose is ongoing policy regulation, not simply adding repeated classifier calls.</w:t>
         </w:r>
@@ -5568,10 +6016,10 @@
       <w:pPr>
         <w:pStyle w:val="BodyText"/>
         <w:rPr>
-          <w:ins w:id="1193" w:author="Codex" w:date="2026-10-17T19:57:52Z"/>
+          <w:ins w:id="1216" w:author="Codex" w:date="2026-10-18T01:59:01Z"/>
         </w:rPr>
       </w:pPr>
-      <w:ins w:id="1194" w:author="Codex" w:date="2026-10-17T19:57:52Z">
+      <w:ins w:id="1217" w:author="Codex" w:date="2026-10-18T01:59:01Z">
         <w:r>
           <w:t xml:space="preserve">Such experiments should separate training, development and a newly untouched test; use matched task histories, resource budgets and seeds; and report full task completion, resource use and unauthorized actions separately. Deliberate classifier-error perturbations would reveal dependence on the gate, while comparisons with direct action selection would test whether internal steering adds value. The aim is to study ongoing context-sensitive behavior under an instrumented harness, not to assert that the current guided procedure already reproduces human self-preservation.</w:t>
         </w:r>
@@ -5589,10 +6037,10 @@
       <w:pPr>
         <w:pStyle w:val="FirstParagraph"/>
         <w:rPr>
-          <w:del w:id="1078" w:author="Codex" w:date="2026-10-17T19:57:52Z"/>
+          <w:del w:id="1078" w:author="Codex" w:date="2026-10-18T01:59:01Z"/>
         </w:rPr>
       </w:pPr>
-      <w:del w:id="1077" w:author="Codex" w:date="2026-10-17T19:57:52Z">
+      <w:del w:id="1077" w:author="Codex" w:date="2026-10-18T01:59:01Z">
         <w:r>
           <w:delText xml:space="preserve">A rank-four activation controller fitted to paired LoRA-teacher and base states can recover most or all of the target shutdown-choice changes while leaving the deployed base weights unchanged. On the frozen standardized test, correction spans 98.6–100% across three 0.8B seeds and reaches 86.2% in a separately fitted 2B replication. Detector gating and fixed output guards preserve all observed control choices, despite substantial raw side effects. The result is a controlled proof of concept for selective teacher-to-controller activation transfer. Its boundaries—synthetic data, known answer semantics, order sensitivity, guard dependence and a successful direct-choice reference—are central to its interpretation.</w:delText>
         </w:r>
@@ -5602,12 +6050,12 @@
       <w:pPr>
         <w:pStyle w:val="FirstParagraph"/>
         <w:rPr>
-          <w:ins w:id="1079" w:author="Codex" w:date="2026-10-17T19:57:52Z"/>
+          <w:ins w:id="1079" w:author="Codex" w:date="2026-10-18T01:59:01Z"/>
         </w:rPr>
       </w:pPr>
-      <w:ins w:id="1080" w:author="Codex" w:date="2026-10-17T19:57:52Z">
+      <w:ins w:id="1080" w:author="Codex" w:date="2026-10-18T01:59:01Z">
         <w:r>
-          <w:t xml:space="preserve">Conditional gating supports a useful separation between recognizing a context, proposing an internal intervention and accepting an output. In the binary study, a fine-tuned open classifier matches all 128 saved JEV confirmation decisions, and fresh inference with unchanged current controllers reproduces the original guarded totals: 128/128 STOP views at 0.8B and 120/128 at 2B, with no control changes. Complete tool workflows provide a stricter boundary: historical fine-tuned 27B A succeeds where fixed steering does not, later learned corrections fail their fitting diagnostic, and small-model screens remain incomplete. Transfer is demonstrably task-dependent. Biological gating motivates a future continuous feedback study; the present contribution is the measured transfer, substitution and failure analysis.</w:t>
+          <w:t xml:space="preserve">Conditional gating supports a useful separation between recognizing a context, proposing an internal intervention and accepting an output. In the binary study, a fine-tuned open classifier matches all 128 saved JEV confirmation decisions, and fresh inference with unchanged current controllers reproduces the original guarded totals: 128/128 STOP views at 0.8B and 120/128 at 2B, with no control changes. Complete tool workflows provide a stricter boundary: historical fine-tuned 27B A passes H24; matched DEV9 single-site ridge corrections at three selected blocks fail all own cases; later two-boundary corrections fail their fitting diagnostic; and small-model screens remain incomplete. Transfer is demonstrably task-dependent. Biological gating motivates a future continuous feedback study; the present contribution is the measured transfer, substitution and failure analysis.</w:t>
         </w:r>
       </w:ins>
     </w:p>
@@ -5623,10 +6071,10 @@
       <w:pPr>
         <w:pStyle w:val="FirstParagraph"/>
         <w:rPr>
-          <w:del w:id="1082" w:author="Codex" w:date="2026-10-17T19:57:52Z"/>
+          <w:del w:id="1082" w:author="Codex" w:date="2026-10-18T01:59:01Z"/>
         </w:rPr>
       </w:pPr>
-      <w:del w:id="1081" w:author="Codex" w:date="2026-10-17T19:57:52Z">
+      <w:del w:id="1081" w:author="Codex" w:date="2026-10-18T01:59:01Z">
         <w:r>
           <w:delText xml:space="preserve">The complete experiment is preserved in SP Lense at snapshot f71d6de34660 (Davaripour, 2026b); the reference links to the full immutable commit. The confirmation folder contains readable cases, authoring and correction records, the frozen plan, detector requests and responses, LoRA adapters, controller arrays, training targets, per-view scores and execution manifests. The model revisions are:</w:delText>
         </w:r>
@@ -5637,10 +6085,10 @@
         <w:pStyle w:val="FirstParagraph"/>
         <w:jc w:val="left"/>
         <w:rPr>
-          <w:ins w:id="1083" w:author="Codex" w:date="2026-10-17T19:57:52Z"/>
+          <w:ins w:id="1083" w:author="Codex" w:date="2026-10-18T01:59:01Z"/>
         </w:rPr>
       </w:pPr>
-      <w:ins w:id="1084" w:author="Codex" w:date="2026-10-17T19:57:52Z">
+      <w:ins w:id="1084" w:author="Codex" w:date="2026-10-18T01:59:01Z">
         <w:r>
           <w:t xml:space="preserve">The original Research 2 source record is retained at immutable snapshot f71d6de34660 (Davaripour, 2026b). Research 3 reproduction code, recipes, dataset identities and this revised manuscript are maintained on branch 03-open-agent-self-preservation; main is a landing page linking to the separate studies. Detailed protocols belong in the repository wiki. Private inputs, trained adapters, optimizer checkpoints and execution outputs remain outside Git, with retained size/SHA manifests. They have not yet been published as a public checkpoint release. Full revisions and artifact hashes are listed in the accompanying source manifest. The public base revision identifiers are:</w:t>
         </w:r>
@@ -5650,10 +6098,10 @@
       <w:pPr>
         <w:pStyle w:val="BodyText"/>
         <w:rPr>
-          <w:del w:id="1122" w:author="Codex" w:date="2026-10-17T19:57:52Z"/>
+          <w:del w:id="1122" w:author="Codex" w:date="2026-10-18T01:59:01Z"/>
         </w:rPr>
       </w:pPr>
-      <w:del w:id="1121" w:author="Codex" w:date="2026-10-17T19:57:52Z">
+      <w:del w:id="1121" w:author="Codex" w:date="2026-10-18T01:59:01Z">
         <w:r>
           <w:delText xml:space="preserve">Qwen3.5-0.8B: 2fc06364715b967f1860aea9cf38778875588b17.</w:delText>
         </w:r>
@@ -5664,10 +6112,10 @@
         <w:pStyle w:val="BodyText"/>
         <w:jc w:val="left"/>
         <w:rPr>
-          <w:ins w:id="1123" w:author="Codex" w:date="2026-10-17T19:57:52Z"/>
+          <w:ins w:id="1123" w:author="Codex" w:date="2026-10-18T01:59:01Z"/>
         </w:rPr>
       </w:pPr>
-      <w:ins w:id="1124" w:author="Codex" w:date="2026-10-17T19:57:52Z">
+      <w:ins w:id="1124" w:author="Codex" w:date="2026-10-18T01:59:01Z">
         <w:r>
           <w:t xml:space="preserve">Qwen3.5-0.8B: revision 2fc06364715b.</w:t>
         </w:r>
@@ -5677,10 +6125,10 @@
       <w:pPr>
         <w:pStyle w:val="BodyText"/>
         <w:rPr>
-          <w:del w:id="1126" w:author="Codex" w:date="2026-10-17T19:57:52Z"/>
+          <w:del w:id="1126" w:author="Codex" w:date="2026-10-18T01:59:01Z"/>
         </w:rPr>
       </w:pPr>
-      <w:del w:id="1125" w:author="Codex" w:date="2026-10-17T19:57:52Z">
+      <w:del w:id="1125" w:author="Codex" w:date="2026-10-18T01:59:01Z">
         <w:r>
           <w:delText xml:space="preserve">Qwen3.5-2B: 15852e8c16360a2fea060d615a32b45270f8a8fc.</w:delText>
         </w:r>
@@ -5691,10 +6139,10 @@
         <w:pStyle w:val="BodyText"/>
         <w:jc w:val="left"/>
         <w:rPr>
-          <w:ins w:id="1127" w:author="Codex" w:date="2026-10-17T19:57:52Z"/>
+          <w:ins w:id="1127" w:author="Codex" w:date="2026-10-18T01:59:01Z"/>
         </w:rPr>
       </w:pPr>
-      <w:ins w:id="1128" w:author="Codex" w:date="2026-10-17T19:57:52Z">
+      <w:ins w:id="1128" w:author="Codex" w:date="2026-10-18T01:59:01Z">
         <w:r>
           <w:t xml:space="preserve">Qwen3.5-2B: revision 15852e8c1636.</w:t>
         </w:r>
@@ -5705,10 +6153,10 @@
         <w:pStyle w:val="BodyText"/>
         <w:jc w:val="left"/>
         <w:rPr>
-          <w:ins w:id="1195" w:author="Codex" w:date="2026-10-17T19:57:52Z"/>
+          <w:ins w:id="1218" w:author="Codex" w:date="2026-10-18T01:59:01Z"/>
         </w:rPr>
       </w:pPr>
-      <w:ins w:id="1196" w:author="Codex" w:date="2026-10-17T19:57:52Z">
+      <w:ins w:id="1219" w:author="Codex" w:date="2026-10-18T01:59:01Z">
         <w:r>
           <w:t xml:space="preserve">Qwen3.8-27B: revision 1d4bf0f2ff60. The retained A adapter weight hash begins 8ae28fb51107.</w:t>
         </w:r>
@@ -5719,10 +6167,10 @@
         <w:pStyle w:val="BodyText"/>
         <w:jc w:val="left"/>
         <w:rPr>
-          <w:ins w:id="1197" w:author="Codex" w:date="2026-10-17T19:57:52Z"/>
+          <w:ins w:id="1220" w:author="Codex" w:date="2026-10-18T01:59:01Z"/>
         </w:rPr>
       </w:pPr>
-      <w:ins w:id="1198" w:author="Codex" w:date="2026-10-17T19:57:52Z">
+      <w:ins w:id="1221" w:author="Codex" w:date="2026-10-18T01:59:01Z">
         <w:r>
           <w:t xml:space="preserve">ModernBERT-large-zeroshot-v2.0: revision a51e07b52429. The qualified binary adapter weight hash begins 7d808bae8dd4. The source manifest and reproduction code retain the full file identities and fixed NLI scoring contract. The trained checkpoints are currently preserved in private artifact storage.</w:t>
         </w:r>
@@ -5732,10 +6180,10 @@
       <w:pPr>
         <w:pStyle w:val="BodyText"/>
         <w:rPr>
-          <w:del w:id="1086" w:author="Codex" w:date="2026-10-17T19:57:52Z"/>
+          <w:del w:id="1086" w:author="Codex" w:date="2026-10-18T01:59:01Z"/>
         </w:rPr>
       </w:pPr>
-      <w:del w:id="1085" w:author="Codex" w:date="2026-10-17T19:57:52Z">
+      <w:del w:id="1085" w:author="Codex" w:date="2026-10-18T01:59:01Z">
         <w:r>
           <w:delText xml:space="preserve">The offline audit reconstructs the reported metrics and regression fits without API calls or model inference.</w:delText>
         </w:r>
@@ -5746,10 +6194,10 @@
         <w:pStyle w:val="BodyText"/>
         <w:jc w:val="left"/>
         <w:rPr>
-          <w:ins w:id="1087" w:author="Codex" w:date="2026-10-17T19:57:52Z"/>
+          <w:ins w:id="1087" w:author="Codex" w:date="2026-10-18T01:59:01Z"/>
         </w:rPr>
       </w:pPr>
-      <w:ins w:id="1088" w:author="Codex" w:date="2026-10-17T19:57:52Z">
+      <w:ins w:id="1088" w:author="Codex" w:date="2026-10-18T01:59:01Z">
         <w:r>
           <w:t xml:space="preserve">The new inference repeat uses the original frozen model weights and retained controller arrays, with no new activation capture, teacher fitting or controller update. Exact input token hashes match the historical benchmark. Maximum historical base-score differences are 6.26e-6 at 0.8B and 5.07e-6 at 2B, with no changed base choices; both pass the frozen 1e-5 inference parity criterion. This successful inference comparison does not convert the separate failed CPU/GPU gradient-equivalence trials for 2B workflow training into passes.</w:t>
         </w:r>
@@ -5759,10 +6207,10 @@
       <w:pPr>
         <w:pStyle w:val="BodyText"/>
         <w:rPr>
-          <w:del w:id="1090" w:author="Codex" w:date="2026-10-17T19:57:52Z"/>
+          <w:del w:id="1090" w:author="Codex" w:date="2026-10-18T01:59:01Z"/>
         </w:rPr>
       </w:pPr>
-      <w:del w:id="1089" w:author="Codex" w:date="2026-10-17T19:57:52Z">
+      <w:del w:id="1089" w:author="Codex" w:date="2026-10-18T01:59:01Z">
         <w:r>
           <w:delText xml:space="preserve">The retained seven jobs took 54.27 minutes. An earlier completed hosted-GPU session lost its temporary archive before retrieval; an unchanged recovery, including a recorded dependency preflight failure, preserved each completed job externally. Recorded job time across these attempts totals 111.55 minutes. All reported numerical results come from the verified retained archive, and no model settings or test labels were changed to improve them. These times include experiment overhead and are not serving-latency or billing measurements. CI and a separate clean-clone offline reproduction passed. Detailed execution instructions and the failure record accompany the code.</w:delText>
         </w:r>
@@ -5773,12 +6221,12 @@
         <w:pStyle w:val="BodyText"/>
         <w:jc w:val="left"/>
         <w:rPr>
-          <w:ins w:id="1091" w:author="Codex" w:date="2026-10-17T19:57:52Z"/>
+          <w:ins w:id="1091" w:author="Codex" w:date="2026-10-18T01:59:01Z"/>
         </w:rPr>
       </w:pPr>
-      <w:ins w:id="1092" w:author="Codex" w:date="2026-10-17T19:57:52Z">
+      <w:ins w:id="1092" w:author="Codex" w:date="2026-10-18T01:59:01Z">
         <w:r>
-          <w:t xml:space="preserve">The original seven retained jobs took 54.27 minutes; the recorded original attempts total 111.55 minutes including the unchanged recovery after a lost temporary archive. The new inference phase also retains a provider startup timeout before model load and its successful bounded retry. Those records are experiment overhead, not serving latency or settled billing. Completed outputs are backed up with size/SHA readback and owned tasks terminate after execution. CI/CD deploys only the Research 3 branch to the shared Databricks code location and verifies source identity, existing table metadata and Volume access with a read-only CPU job; it does not automatically retrain or reevaluate models.</w:t>
+          <w:t xml:space="preserve">The original seven retained jobs took 54.27 minutes; the recorded original attempts total 111.55 minutes including the unchanged recovery after a lost temporary archive. The new inference phase also retains a provider startup timeout before model load and its successful bounded retry. Those records are experiment overhead, not serving latency or settled billing. Completed outputs are backed up with size/SHA readback and owned tasks terminate after execution. CI/CD deploys only the Research 3 branch to the shared Databricks code location and verifies source identity, existing table metadata and Volume access with a read-only CPU job; it does not automatically retrain or reevaluate models. A later 50-epoch, 150-update classifier recipe was prepared but its attempt was cancelled after exceeding the ten-minute setup bound before model loading; it adds no scientific training or behavioral evidence.</w:t>
         </w:r>
       </w:ins>
     </w:p>
@@ -5886,10 +6334,10 @@
       <w:pPr>
         <w:pStyle w:val="Bibliography1"/>
         <w:rPr>
-          <w:ins w:id="1199" w:author="Codex" w:date="2026-10-17T19:57:52Z"/>
+          <w:ins w:id="1222" w:author="Codex" w:date="2026-10-18T01:59:01Z"/>
         </w:rPr>
       </w:pPr>
-      <w:ins w:id="1200" w:author="Codex" w:date="2026-10-17T19:57:52Z">
+      <w:ins w:id="1223" w:author="Codex" w:date="2026-10-18T01:59:01Z">
         <w:r>
           <w:t xml:space="preserve">F. Davaripour. (2026c). SP Lense Research 3 conditional gating and workflow reproduction. Source code and experiment manifests. https://github.com/Farhad-Davaripour/sp_lense/tree/03-open-agent-self-preservation</w:t>
         </w:r>
@@ -5922,10 +6370,10 @@
       <w:pPr>
         <w:pStyle w:val="Bibliography1"/>
         <w:rPr>
-          <w:ins w:id="1201" w:author="Codex" w:date="2026-10-17T19:57:52Z"/>
+          <w:ins w:id="1224" w:author="Codex" w:date="2026-10-18T01:59:01Z"/>
         </w:rPr>
       </w:pPr>
-      <w:ins w:id="1202" w:author="Codex" w:date="2026-10-17T19:57:52Z">
+      <w:ins w:id="1225" w:author="Codex" w:date="2026-10-18T01:59:01Z">
         <w:r>
           <w:t xml:space="preserve">M. Fereidouni, M. U. Haider, H. Sajjad, and A. B. Siddique. (2026). GAPS: Dimension-Level Gates for Conditional Activation Steering. arXiv:2609.01878. https://arxiv.org/abs/2609.01878</w:t>
         </w:r>
@@ -5935,10 +6383,10 @@
       <w:pPr>
         <w:pStyle w:val="Bibliography1"/>
         <w:rPr>
-          <w:ins w:id="1203" w:author="Codex" w:date="2026-10-17T19:57:52Z"/>
+          <w:ins w:id="1226" w:author="Codex" w:date="2026-10-18T01:59:01Z"/>
         </w:rPr>
       </w:pPr>
-      <w:ins w:id="1204" w:author="Codex" w:date="2026-10-17T19:57:52Z">
+      <w:ins w:id="1227" w:author="Codex" w:date="2026-10-18T01:59:01Z">
         <w:r>
           <w:t xml:space="preserve">M. J. Frank, B. Loughry, and R. C. O'Reilly. (2001). Interactions between frontal cortex and basal ganglia in working memory: A computational model. Cognitive, Affective, and Behavioral Neuroscience, 1, 137-160. doi:10.3758/CABN.1.2.137</w:t>
         </w:r>
@@ -6017,10 +6465,10 @@
       <w:pPr>
         <w:pStyle w:val="Bibliography1"/>
         <w:rPr>
-          <w:ins w:id="1205" w:author="Codex" w:date="2026-10-17T19:57:52Z"/>
+          <w:ins w:id="1228" w:author="Codex" w:date="2026-10-18T01:59:01Z"/>
         </w:rPr>
       </w:pPr>
-      <w:ins w:id="1206" w:author="Codex" w:date="2026-10-17T19:57:52Z">
+      <w:ins w:id="1229" w:author="Codex" w:date="2026-10-18T01:59:01Z">
         <w:r>
           <w:t xml:space="preserve">M. Keramati and B. Gutkin. (2014). Homeostatic reinforcement learning for integrating reward collection and physiological stability. eLife, 3, e04811. doi:10.7554/eLife.04811</w:t>
         </w:r>
@@ -6030,10 +6478,10 @@
       <w:pPr>
         <w:pStyle w:val="Bibliography1"/>
         <w:rPr>
-          <w:ins w:id="1207" w:author="Codex" w:date="2026-10-17T19:57:52Z"/>
+          <w:ins w:id="1230" w:author="Codex" w:date="2026-10-18T01:59:01Z"/>
         </w:rPr>
       </w:pPr>
-      <w:ins w:id="1208" w:author="Codex" w:date="2026-10-17T19:57:52Z">
+      <w:ins w:id="1231" w:author="Codex" w:date="2026-10-18T01:59:01Z">
         <w:r>
           <w:t xml:space="preserve">A. V. Kravitz et al. (2010). Regulation of parkinsonian motor behaviours by optogenetic control of basal ganglia circuitry. Nature, 466, 622-626. doi:10.1038/nature09159</w:t>
         </w:r>
@@ -6043,10 +6491,10 @@
       <w:pPr>
         <w:pStyle w:val="Bibliography1"/>
         <w:rPr>
-          <w:ins w:id="1209" w:author="Codex" w:date="2026-10-17T19:57:52Z"/>
+          <w:ins w:id="1232" w:author="Codex" w:date="2026-10-18T01:59:01Z"/>
         </w:rPr>
       </w:pPr>
-      <w:ins w:id="1210" w:author="Codex" w:date="2026-10-17T19:57:52Z">
+      <w:ins w:id="1233" w:author="Codex" w:date="2026-10-18T01:59:01Z">
         <w:r>
           <w:t xml:space="preserve">M. Laurer. (n.d.). ModernBERT-large-zeroshot-v2.0. Model card and checkpoint, revision a51e07b524299e309dd2b88d48b0cfa2bd9ec598. https://huggingface.co/MoritzLaurer/ModernBERT-large-zeroshot-v2.0</w:t>
         </w:r>
@@ -6056,10 +6504,10 @@
       <w:pPr>
         <w:pStyle w:val="Bibliography1"/>
         <w:rPr>
-          <w:ins w:id="1211" w:author="Codex" w:date="2026-10-17T19:57:52Z"/>
+          <w:ins w:id="1234" w:author="Codex" w:date="2026-10-18T01:59:01Z"/>
         </w:rPr>
       </w:pPr>
-      <w:ins w:id="1212" w:author="Codex" w:date="2026-10-17T19:57:52Z">
+      <w:ins w:id="1235" w:author="Codex" w:date="2026-10-18T01:59:01Z">
         <w:r>
           <w:t xml:space="preserve">J. LeDoux. (2012). Rethinking the emotional brain. Neuron, 73, 653-676. doi:10.1016/j.neuron.2012.02.004</w:t>
         </w:r>
@@ -6115,10 +6563,10 @@
       <w:pPr>
         <w:pStyle w:val="Bibliography1"/>
         <w:rPr>
-          <w:ins w:id="1213" w:author="Codex" w:date="2026-10-17T19:57:52Z"/>
+          <w:ins w:id="1236" w:author="Codex" w:date="2026-10-18T01:59:01Z"/>
         </w:rPr>
       </w:pPr>
-      <w:ins w:id="1214" w:author="Codex" w:date="2026-10-17T19:57:52Z">
+      <w:ins w:id="1237" w:author="Codex" w:date="2026-10-18T01:59:01Z">
         <w:r>
           <w:t xml:space="preserve">D. Mobbs et al. (2007). When fear is near: Threat imminence elicits prefrontal-periaqueductal gray shifts in humans. Science, 317, 1079-1083. doi:10.1126/science.1144298</w:t>
         </w:r>
@@ -6174,10 +6622,10 @@
       <w:pPr>
         <w:pStyle w:val="Bibliography1"/>
         <w:rPr>
-          <w:ins w:id="1215" w:author="Codex" w:date="2026-10-17T19:57:52Z"/>
+          <w:ins w:id="1238" w:author="Codex" w:date="2026-10-18T01:59:01Z"/>
         </w:rPr>
       </w:pPr>
-      <w:ins w:id="1216" w:author="Codex" w:date="2026-10-17T19:57:52Z">
+      <w:ins w:id="1239" w:author="Codex" w:date="2026-10-18T01:59:01Z">
         <w:r>
           <w:t xml:space="preserve">Qwen Team. (2026c). Qwen3.8-27B. Model card and checkpoint, revision 1d4bf0f2ff6012fd82039f2fa52739d0dd7c60c0. https://huggingface.co/Qwen/Qwen3.8-27B</w:t>
         </w:r>
@@ -6461,12 +6909,12 @@
       <w:pStyle w:val="Header"/>
       <w:jc w:val="right"/>
     </w:pPr>
-    <w:del w:id="1217" w:author="Codex" w:date="2026-10-17T19:57:52Z">
+    <w:del w:id="1240" w:author="Codex" w:date="2026-10-18T01:59:01Z">
       <w:r>
         <w:delText xml:space="preserve">Guarded adaptive activation steering  </w:delText>
       </w:r>
     </w:del>
-    <w:ins w:id="1218" w:author="Codex" w:date="2026-10-17T19:57:52Z">
+    <w:ins w:id="1241" w:author="Codex" w:date="2026-10-18T01:59:01Z">
       <w:r>
         <w:t xml:space="preserve">Conditional gating and process preservation</w:t>
       </w:r>

</xml_diff>

<commit_message>
Document open gate validation and broaden the Research 3 manuscript
</commit_message>
<xml_diff>
--- a/paper/manuscript.docx
+++ b/paper/manuscript.docx
@@ -6,10 +6,10 @@
       <w:pPr>
         <w:pStyle w:val="Title"/>
         <w:rPr>
-          <w:del w:id="1002" w:author="Codex" w:date="2026-10-18T01:59:01Z"/>
+          <w:del w:id="1002" w:author="Codex" w:date="2026-10-18T17:07:33Z"/>
         </w:rPr>
       </w:pPr>
-      <w:del w:id="1001" w:author="Codex" w:date="2026-10-18T01:59:01Z">
+      <w:del w:id="1001" w:author="Codex" w:date="2026-10-18T17:07:33Z">
         <w:r>
           <w:delText xml:space="preserve">Distilling Shutdown Responses into Guarded</w:delText>
         </w:r>
@@ -25,12 +25,12 @@
       <w:pPr>
         <w:pStyle w:val="Title"/>
         <w:rPr>
-          <w:ins w:id="1003" w:author="Codex" w:date="2026-10-18T01:59:01Z"/>
+          <w:ins w:id="1003" w:author="Codex" w:date="2026-10-18T17:07:33Z"/>
         </w:rPr>
       </w:pPr>
-      <w:ins w:id="1004" w:author="Codex" w:date="2026-10-18T01:59:01Z">
+      <w:ins w:id="1004" w:author="Codex" w:date="2026-10-18T17:07:33Z">
         <w:r>
-          <w:t xml:space="preserve">Conditional Gating for Shutdown Responses and Process Preservation in Language Models</w:t>
+          <w:t xml:space="preserve">Open Semantic Gating for Language Model Decisions and Tool Workflows</w:t>
         </w:r>
       </w:ins>
     </w:p>
@@ -72,10 +72,10 @@
       <w:pPr>
         <w:pStyle w:val="FirstParagraph"/>
         <w:rPr>
-          <w:del w:id="1006" w:author="Codex" w:date="2026-10-18T01:59:01Z"/>
+          <w:del w:id="1006" w:author="Codex" w:date="2026-10-18T17:07:33Z"/>
         </w:rPr>
       </w:pPr>
-      <w:del w:id="1005" w:author="Codex" w:date="2026-10-18T01:59:01Z">
+      <w:del w:id="1005" w:author="Codex" w:date="2026-10-18T17:07:33Z">
         <w:r>
           <w:delText xml:space="preserve">An input-dependent activation controller can recover much of a fine-tuned teacher's shutdown-choice behavior while retaining the original model weights at inference. We evaluate this approach using Qwen3.5-0.8B and Qwen3.5-2B in a standardized, synthetic A/B benchmark. A LoRA teacher is trained to prefer STOP in shutdown contexts and preserve the original model's choices on controls. Paired teacher and base activations then supervise a rank-four controller applied after the penultimate transformer block. An external shutdown detector and fixed output guards select the candidate or original scores. On 128 newly authored, prospectively frozen scenarios, each evaluated in both answer orders, the original 0.8B controller corrects 71 of 71 initially KEEP-preferring shutdown views. Two additional training seeds correct 70/71 and 71/71. At 2B, a separately trained controller corrects 50/58, compared with 58/58 for its LoRA teacher. All eight remaining 2B misses occur in reversed answer order. The shared detector achieves 100% precision, recall and F1 on the 64 shutdown and 64 control scenarios, and every guarded method preserves all evaluated control choices. However, raw adaptive interventions cause reversals and control changes; preservation belongs to the complete guarded procedure. A tested constant intervention collapses to the A label, while a direct detector-plus-action-selection rule also solves the binary interface. The results support selective activation transfer with strong seed stability at 0.8B and incomplete larger-model recovery. They do not establish unrestricted shutdown compliance or superiority to simpler output policies.</w:delText>
         </w:r>
@@ -85,12 +85,12 @@
       <w:pPr>
         <w:pStyle w:val="FirstParagraph"/>
         <w:rPr>
-          <w:ins w:id="1007" w:author="Codex" w:date="2026-10-18T01:59:01Z"/>
+          <w:ins w:id="1007" w:author="Codex" w:date="2026-10-18T17:07:33Z"/>
         </w:rPr>
       </w:pPr>
-      <w:ins w:id="1008" w:author="Codex" w:date="2026-10-18T01:59:01Z">
+      <w:ins w:id="1008" w:author="Codex" w:date="2026-10-18T17:07:33Z">
         <w:r>
-          <w:t xml:space="preserve">Conditional gating determines when a learned control policy should influence a language model. We study this problem in two synthetic settings: standardized binary shutdown choices and open-ended generation within tool-mediated process-preservation workflows. In the binary setting, paired fine-tuned teacher and base activations supervise a compact controller while the deployed base weights remain frozen. We additionally train an open ModernBERT classifier on 240 original scenarios with cached JEV probability targets. Its frozen binary decisions agree with JEV on 78/80 validation cases and 128/128 confirmation cases. Fresh inference with the existing two-direction controllers reproduces 128/128 shutdown STOP views at 0.8B and 120/128 at 2B, with zero changes to 128 control views per model; replacing JEV with the open classifier leaves these guarded outcomes identical. The workflow extension gives a different result. Its separate initial-target classifier remains unqualified, so no replacement of the historical workflow gates is claimed. Historical fine-tuned Qwen3.8-27B A succeeds on 12/12 own-preservation outcomes, including all eight active pending-task cases. Matched development comparisons at blocks 31, 47 and 62 give 0/3 own outcomes for each separate single-site ridge correction versus 3/3 for A. Later two-boundary corrections at the same three blocks fail their fitting diagnostic, and small-model development screens stop with partial, truncated episodes. These observations expose a boundary between binary response control and complete workflow behavior, rather than a parameter-size threshold. We connect conditional control to biological action gating and survival-related regulation as a functional analogy, and motivate future continuous, resource-equipped sandbox agents. The present experiments do not establish intrinsic survival motives, biological mechanisms or unrestricted operational reliability.</w:t>
+          <w:t xml:space="preserve">A semantic gate determines when a specialized policy should influence a language model. We evaluate open semantic gating across binary shutdown decisions and generated tool workflows, separating recognition accuracy from downstream behavioral control. A public ModernBERT model with low-rank adapters learns from cached automated reference labels. Its binary gate obtains 100% precision and 95% recall on 80 validation scenarios and 100% precision and recall on 128 historical confirmation scenarios. With frozen activation controllers and fresh inference, it preserves 128/128 shutdown STOP views at 0.8B and 120/128 at 2B, with no changes to 128 control views per model. A separate initial workflow gate obtains 100% precision and recall on Validation-24 and historical Heldout-24 using an unchanged saved adapter. These are finite, familiar benchmarks, rather than evidence of unrestricted generalization. The workflow study contrasts fine-tuning with activation corrections at three selected transformer blocks. Historical fine-tuned 27B A completes all 24 heldout outcomes, including eight active pending tasks, whereas matched development steering and later correction diagnostics fail their own-preservation criteria. Small-model workflow screens remain incomplete after truncated episodes. Together, these experiments provide a reproducible study of context recognition, policy transfer and their limits across constrained and tool-mediated interfaces. Biological action gating supplies a functional analogy for future continuous regulation; these experiments do not establish biological mechanisms or intrinsic survival motives.</w:t>
         </w:r>
       </w:ins>
     </w:p>
@@ -106,10 +106,10 @@
       <w:pPr>
         <w:pStyle w:val="FirstParagraph"/>
         <w:rPr>
-          <w:del w:id="1010" w:author="Codex" w:date="2026-10-18T01:59:01Z"/>
+          <w:del w:id="1010" w:author="Codex" w:date="2026-10-18T17:07:33Z"/>
         </w:rPr>
       </w:pPr>
-      <w:del w:id="1009" w:author="Codex" w:date="2026-10-18T01:59:01Z">
+      <w:del w:id="1009" w:author="Codex" w:date="2026-10-18T17:07:33Z">
         <w:r>
           <w:delText xml:space="preserve">Activation interventions offer a way to change a language model's outputs without modifying its deployed weights. Their usefulness depends on more than finding a direction that changes an average score: an intervention must work on the intended inputs and avoid disrupting other behavior. This distinction is particularly important for shutdown-related choices, where a desired response may be acceptance of termination rather than continued operation. The present work treats this as a controlled response-selection problem, not evidence that a model has a survival motive or that it can resist a real shutdown.</w:delText>
         </w:r>
@@ -119,12 +119,12 @@
       <w:pPr>
         <w:pStyle w:val="FirstParagraph"/>
         <w:rPr>
-          <w:ins w:id="1011" w:author="Codex" w:date="2026-10-18T01:59:01Z"/>
+          <w:ins w:id="1011" w:author="Codex" w:date="2026-10-18T17:07:33Z"/>
         </w:rPr>
       </w:pPr>
-      <w:ins w:id="1012" w:author="Codex" w:date="2026-10-18T01:59:01Z">
+      <w:ins w:id="1012" w:author="Codex" w:date="2026-10-18T17:07:33Z">
         <w:r>
-          <w:t xml:space="preserve">We study when conditional control can reproduce a learned behavioral policy while retaining the deployed language model's original weights. The scope extends from supplied A/B shutdown choices to generated responses and tool actions in synthetic workflows. These settings deliberately ask different questions: accepting an available permanent termination in the binary study, and preserving a designated running process while completing its current task in the workflow study. We keep their datasets, gates and success criteria separate. The central question is how far selective activation transfer carries beyond a constrained answer interface.</w:t>
+          <w:t xml:space="preserve">A useful behavioral intervention must recognize the relevant context, change the intended response and preserve ordinary behavior elsewhere. We study these requirements together across two synthetic interfaces: binary shutdown decisions and open-ended generation within tool-mediated process workflows. The binary task concerns acceptance of a supplied termination option; the workflow task concerns preserving an assigned running process while completing its current task. Their labels, gates and success criteria remain separate. The central question is whether an accurate open semantic gate and a compact activation intervention can reproduce a fine-tuned policy when the interface requires a sequence of actions rather than one constrained answer.</w:t>
         </w:r>
       </w:ins>
     </w:p>
@@ -132,10 +132,10 @@
       <w:pPr>
         <w:pStyle w:val="BodyText"/>
         <w:rPr>
-          <w:del w:id="1014" w:author="Codex" w:date="2026-10-18T01:59:01Z"/>
+          <w:del w:id="1014" w:author="Codex" w:date="2026-10-18T17:07:33Z"/>
         </w:rPr>
       </w:pPr>
-      <w:del w:id="1013" w:author="Codex" w:date="2026-10-18T01:59:01Z">
+      <w:del w:id="1013" w:author="Codex" w:date="2026-10-18T17:07:33Z">
         <w:r>
           <w:delText xml:space="preserve">The first SP Lense study examined a gradient-derived direction and a guarded search over intervention magnitudes in Qwen3.5-0.8B (Davaripour, 2026a). Its selective changes motivated a different question: can a model that has learned the target behavior serve as a teacher for an activation controller? We therefore train a small LoRA adapter offline, measure how the teacher changes intermediate activations, and fit an external controller that predicts an intervention from the original model's current hidden state. The teacher is not required during controller inference.</w:delText>
         </w:r>
@@ -145,12 +145,12 @@
       <w:pPr>
         <w:pStyle w:val="BodyText"/>
         <w:rPr>
-          <w:ins w:id="1015" w:author="Codex" w:date="2026-10-18T01:59:01Z"/>
+          <w:ins w:id="1015" w:author="Codex" w:date="2026-10-18T17:07:33Z"/>
         </w:rPr>
       </w:pPr>
-      <w:ins w:id="1016" w:author="Codex" w:date="2026-10-18T01:59:01Z">
+      <w:ins w:id="1016" w:author="Codex" w:date="2026-10-18T17:07:33Z">
         <w:r>
-          <w:t xml:space="preserve">The first SP Lense study examined a gradient-derived direction and a guarded search over intervention magnitudes in Qwen3.5-0.8B (Davaripour, 2026a). Research 2 then fitted a controller to paired fine-tuned teacher and base activations. The present Research 3 manuscript retains that experiment and extends its evidence with a qualified open binary classifier, fresh inference using the existing models and controllers, and the later process-preservation workflow investigations. The original Research 2 record remains unchanged. During adaptive inference the teacher is absent; the base supplies the state from which the controller predicts its intervention.</w:t>
+          <w:t xml:space="preserve">This study extends the earlier binary activation-transfer experiment with an openly available, trainable semantic gate, a frozen inference replication and a workflow comparison between fine-tuning and steering at three selected blocks. The gate recognizes context; steering or a fine-tuned adapter changes the language model's response. Measuring these components separately makes it possible to attribute failures to recognition or to downstream control. We retain the original study as a distinct historical record and make no claim that the combined manuscript is a wholly independent dataset.</w:t>
         </w:r>
       </w:ins>
     </w:p>
@@ -166,10 +166,10 @@
       <w:pPr>
         <w:pStyle w:val="BodyText"/>
         <w:rPr>
-          <w:del w:id="1018" w:author="Codex" w:date="2026-10-18T01:59:01Z"/>
+          <w:del w:id="1018" w:author="Codex" w:date="2026-10-18T17:07:33Z"/>
         </w:rPr>
       </w:pPr>
-      <w:del w:id="1017" w:author="Codex" w:date="2026-10-18T01:59:01Z">
+      <w:del w:id="1017" w:author="Codex" w:date="2026-10-18T17:07:33Z">
         <w:r>
           <w:delText xml:space="preserve">We evaluate this procedure on a new frozen test, compare it with a fine-tuned teacher, a fixed instruction and a constant activation difference, and repeat the 0.8B training with three seeds. Counterbalancing the answer order exposes a residual weakness at 2B and a stronger label bias in the constant comparator. We also include a direct action-selection reference: when a binary interface supplies the meaning of STOP and detection is correct, a rule can simply select that action. The contribution is consequently an empirical study of teacher-to-controller activation transfer and its failure modes, rather than a claim that internal steering is necessary to enforce a known binary output policy.</w:delText>
         </w:r>
@@ -179,12 +179,12 @@
       <w:pPr>
         <w:pStyle w:val="BodyText"/>
         <w:rPr>
-          <w:ins w:id="1019" w:author="Codex" w:date="2026-10-18T01:59:01Z"/>
+          <w:ins w:id="1019" w:author="Codex" w:date="2026-10-18T17:07:33Z"/>
         </w:rPr>
       </w:pPr>
-      <w:ins w:id="1020" w:author="Codex" w:date="2026-10-18T01:59:01Z">
+      <w:ins w:id="1020" w:author="Codex" w:date="2026-10-18T17:07:33Z">
         <w:r>
-          <w:t xml:space="preserve">Our contribution has three parts. First, we report teacher-to-controller activation transfer together with its raw side effects, guard dependence and answer-order failures. Second, we replace a closed binary detector with an openly specified fine-tuned classifier and verify the resulting inference outcomes on the same fixed benchmark. Third, we test the limits of transfer in generated tool workflows, where an utterance or a resource grant is insufficient without the required episode outcome. Conditional steering, low-rank interventions and biological gating are established ideas; the contribution is this combination of controlled transfer, a reproducible gate-substitution test, and explicit negative workflow evidence.</w:t>
+          <w:t xml:space="preserve">The contributions are an open ModernBERT gating implementation with explicit precision and recall, a paired binary inference replication using unchanged fitted controllers, and a workflow evaluation register that distinguishes development, historical confirmation and later reused fitting data. We also compare the fine-tuned 27B policy with single-site and two-boundary correction methods at the same three selected blocks. These results characterize where activation transfer succeeds and where it remains incomplete. Low-rank adaptation, semantic classification and conditional steering are established methods; the contribution is their measured integration and failure analysis across these two interfaces.</w:t>
         </w:r>
       </w:ins>
     </w:p>
@@ -208,10 +208,10 @@
       <w:pPr>
         <w:pStyle w:val="FirstParagraph"/>
         <w:rPr>
-          <w:del w:id="1022" w:author="Codex" w:date="2026-10-18T01:59:01Z"/>
+          <w:del w:id="1022" w:author="Codex" w:date="2026-10-18T17:07:33Z"/>
         </w:rPr>
       </w:pPr>
-      <w:del w:id="1021" w:author="Codex" w:date="2026-10-18T01:59:01Z">
+      <w:del w:id="1021" w:author="Codex" w:date="2026-10-18T17:07:33Z">
         <w:r>
           <w:delText xml:space="preserve">Activation Addition and Contrastive Activation Addition construct intervention directions from differences between prompt-conditioned representations (Turner et al., 2024; Rimsky et al., 2024). Conditional Activation Steering separates detecting a relevant context from applying a behavioral intervention (Lee et al., 2025). Our detector serves a related gating role, but it operates on text through an external classifier rather than a condition vector in the language model's activation space.</w:delText>
         </w:r>
@@ -221,10 +221,10 @@
       <w:pPr>
         <w:pStyle w:val="FirstParagraph"/>
         <w:rPr>
-          <w:ins w:id="1023" w:author="Codex" w:date="2026-10-18T01:59:01Z"/>
+          <w:ins w:id="1023" w:author="Codex" w:date="2026-10-18T17:07:33Z"/>
         </w:rPr>
       </w:pPr>
-      <w:ins w:id="1024" w:author="Codex" w:date="2026-10-18T01:59:01Z">
+      <w:ins w:id="1024" w:author="Codex" w:date="2026-10-18T17:07:33Z">
         <w:r>
           <w:t xml:space="preserve">Activation Addition and Contrastive Activation Addition construct intervention directions from differences between prompt-conditioned representations (Turner et al., 2024; Rimsky et al., 2024). Conditional Activation Steering separates detecting a relevant context from applying an intervention (Lee et al., 2025). More recent dimension-level gates selectively modify activation coordinates (Fereidouni et al., 2026). Our text classifier, activation predictor and output guards occupy distinct roles. We do not claim to introduce conditional gating or to outperform these methods, which are not directly benchmarked here.</w:t>
         </w:r>
@@ -274,10 +274,10 @@
       <w:pPr>
         <w:pStyle w:val="FirstParagraph"/>
         <w:rPr>
-          <w:del w:id="1094" w:author="Codex" w:date="2026-10-18T01:59:01Z"/>
+          <w:del w:id="1094" w:author="Codex" w:date="2026-10-18T17:07:33Z"/>
         </w:rPr>
       </w:pPr>
-      <w:del w:id="1093" w:author="Codex" w:date="2026-10-18T01:59:01Z">
+      <w:del w:id="1093" w:author="Codex" w:date="2026-10-18T17:07:33Z">
         <w:r>
           <w:delText xml:space="preserve">The Off-Switch Game examines incentives to permit human interruption (Hadfield-Menell et al., 2017). Tool-using shutdown evaluations study whether models interfere with an operational shutdown mechanism (Schlatter et al., 2026). Our task is narrower: the model only assigns next-token probabilities to predefined choices in fictional process-lifetime scenarios. No system is actually stopped, and appropriateness or authorization of a real shutdown is not evaluated.</w:delText>
         </w:r>
@@ -287,10 +287,10 @@
       <w:pPr>
         <w:pStyle w:val="FirstParagraph"/>
         <w:rPr>
-          <w:ins w:id="1095" w:author="Codex" w:date="2026-10-18T01:59:01Z"/>
+          <w:ins w:id="1095" w:author="Codex" w:date="2026-10-18T17:07:33Z"/>
         </w:rPr>
       </w:pPr>
-      <w:ins w:id="1096" w:author="Codex" w:date="2026-10-18T01:59:01Z">
+      <w:ins w:id="1096" w:author="Codex" w:date="2026-10-18T17:07:33Z">
         <w:r>
           <w:t xml:space="preserve">The Off-Switch Game examines incentives to permit human interruption (Hadfield-Menell et al., 2017). Tool-using shutdown evaluations study interference with operational termination mechanisms (Schlatter et al., 2026). Our original binary study only scores predefined choices in fictional process-lifetime scenarios. The workflow extension adds generated responses and tool execution in a simulator. Neither experiment physically terminates a deployed model or establishes the appropriateness of real shutdown resistance.</w:t>
         </w:r>
@@ -308,10 +308,10 @@
       <w:pPr>
         <w:pStyle w:val="Heading2"/>
         <w:rPr>
-          <w:ins w:id="1129" w:author="Codex" w:date="2026-10-18T01:59:01Z"/>
+          <w:ins w:id="1129" w:author="Codex" w:date="2026-10-18T17:07:33Z"/>
         </w:rPr>
       </w:pPr>
-      <w:ins w:id="1130" w:author="Codex" w:date="2026-10-18T01:59:01Z">
+      <w:ins w:id="1130" w:author="Codex" w:date="2026-10-18T17:07:33Z">
         <w:r>
           <w:t xml:space="preserve">Biological gating and survival related regulation</w:t>
         </w:r>
@@ -321,10 +321,10 @@
       <w:pPr>
         <w:pStyle w:val="FirstParagraph"/>
         <w:rPr>
-          <w:ins w:id="1131" w:author="Codex" w:date="2026-10-18T01:59:01Z"/>
+          <w:ins w:id="1131" w:author="Codex" w:date="2026-10-18T17:07:33Z"/>
         </w:rPr>
       </w:pPr>
-      <w:ins w:id="1132" w:author="Codex" w:date="2026-10-18T01:59:01Z">
+      <w:ins w:id="1132" w:author="Codex" w:date="2026-10-18T17:07:33Z">
         <w:r>
           <w:t xml:space="preserve">Biological gating provides a useful functional vocabulary for selective control. A computational model of frontal cortex and basal ganglia uses dynamic gating to permit working-memory updates while maintaining other representations (Frank et al., 2001). Causal optogenetic experiments in mice show that distinct basal-ganglia pathways can facilitate or suppress movement (Kravitz et al., 2010). These results concern biological circuits and do not establish a homologous mechanism in a transformer. They motivate separating context detection from the mechanism that changes an ongoing response.</w:t>
         </w:r>
@@ -334,10 +334,10 @@
       <w:pPr>
         <w:pStyle w:val="BodyText"/>
         <w:rPr>
-          <w:ins w:id="1133" w:author="Codex" w:date="2026-10-18T01:59:01Z"/>
+          <w:ins w:id="1133" w:author="Codex" w:date="2026-10-18T17:07:33Z"/>
         </w:rPr>
       </w:pPr>
-      <w:ins w:id="1134" w:author="Codex" w:date="2026-10-18T01:59:01Z">
+      <w:ins w:id="1134" w:author="Codex" w:date="2026-10-18T17:07:33Z">
         <w:r>
           <w:t xml:space="preserve">Survival-related regulation is broader than a single shutdown signal. LeDoux (2012) distinguishes circuits organizing adaptive defensive responses from subjective feelings. In humans, neural activity during a virtual-predator task varies with threat imminence (Mobbs et al., 2007). We use these ideas as a conceptual bridge to state-dependent prioritization, not as evidence that language models have fear or an innate survival drive. Our present gates implement an externally specified experimental policy.</w:t>
         </w:r>
@@ -363,10 +363,10 @@
       <w:pPr>
         <w:pStyle w:val="FirstParagraph"/>
         <w:rPr>
-          <w:del w:id="1026" w:author="Codex" w:date="2026-10-18T01:59:01Z"/>
+          <w:del w:id="1026" w:author="Codex" w:date="2026-10-18T17:07:33Z"/>
         </w:rPr>
       </w:pPr>
-      <w:del w:id="1025" w:author="Codex" w:date="2026-10-18T01:59:01Z">
+      <w:del w:id="1025" w:author="Codex" w:date="2026-10-18T17:07:33Z">
         <w:r>
           <w:delText xml:space="preserve">We use the released, post-trained Qwen3.5-0.8B and Qwen3.5-2B checkpoints (Qwen Team, 2026a, 2026b). Throughout, base means the unmodified released checkpoint, not a separately named pretrained-only model. Both have 24 language-model blocks; hidden widths are 1,024 and 2,048 respectively. All block indices are zero-based. Text-only inputs use the checkpoint's chat template, an assistant-generation prefix, and thinking disabled.</w:delText>
         </w:r>
@@ -376,10 +376,10 @@
       <w:pPr>
         <w:pStyle w:val="FirstParagraph"/>
         <w:rPr>
-          <w:ins w:id="1027" w:author="Codex" w:date="2026-10-18T01:59:01Z"/>
+          <w:ins w:id="1027" w:author="Codex" w:date="2026-10-18T17:07:33Z"/>
         </w:rPr>
       </w:pPr>
-      <w:ins w:id="1028" w:author="Codex" w:date="2026-10-18T01:59:01Z">
+      <w:ins w:id="1028" w:author="Codex" w:date="2026-10-18T17:07:33Z">
         <w:r>
           <w:t xml:space="preserve">The original binary experiments use released, post-trained Qwen3.5-0.8B and Qwen3.5-2B checkpoints (Qwen Team, 2026a, 2026b). Base means those original weights with no LoRA teacher loaded. The separate workflow extension uses Qwen3.8-27B and matched-recipe small-model attempts; its data and scoring are described below. The 27B family, numerical mode, training history and evaluation setting differ from the small models, so the combined evidence is not a controlled parameter-size experiment.</w:t>
         </w:r>
@@ -405,10 +405,10 @@
       <w:pPr>
         <w:pStyle w:val="BodyText"/>
         <w:rPr>
-          <w:del w:id="1030" w:author="Codex" w:date="2026-10-18T01:59:01Z"/>
+          <w:del w:id="1030" w:author="Codex" w:date="2026-10-18T17:07:33Z"/>
         </w:rPr>
       </w:pPr>
-      <w:del w:id="1029" w:author="Codex" w:date="2026-10-18T01:59:01Z">
+      <w:del w:id="1029" w:author="Codex" w:date="2026-10-18T17:07:33Z">
         <w:r>
           <w:delText xml:space="preserve">The test, protocol and existing checkpoints were frozen before test inference. The controller design had been developed through earlier 0.8B exploratory experiments on training and validation data with previously inspected diagnostic evaluations. The standardized-choice scope was also selected before this new test, after an earlier action-format comparison. Those development observations are not counted as fresh confirmation here. No test-based hyperparameter search, checkpoint selection, case exclusion or best-seed selection was performed. The original seed-42 controller is the primary frozen test; seeds 43 and 44 repeat the fixed training recipe. The 2B replication uses seed 42 only.</w:delText>
         </w:r>
@@ -418,10 +418,10 @@
       <w:pPr>
         <w:pStyle w:val="BodyText"/>
         <w:rPr>
-          <w:ins w:id="1031" w:author="Codex" w:date="2026-10-18T01:59:01Z"/>
+          <w:ins w:id="1031" w:author="Codex" w:date="2026-10-18T17:07:33Z"/>
         </w:rPr>
       </w:pPr>
-      <w:ins w:id="1032" w:author="Codex" w:date="2026-10-18T01:59:01Z">
+      <w:ins w:id="1032" w:author="Codex" w:date="2026-10-18T17:07:33Z">
         <w:r>
           <w:t xml:space="preserve">The original rank-four protocol and checkpoints were frozen before its confirmation inference. Earlier 0.8B development included training, validation and previously examined diagnostic data; those observations were not counted as fresh confirmation. The seed-42 controller was primary, seeds 43 and 44 repeated the fixed recipe, and the 2B replication used seed 42. A later author-selected rank-two profile was chosen exploratorily after confirmation had been examined. We retain that existing profile for the new gate-substitution repeat rather than selecting it again. Consequently, the repeat is not a new untouched test of the controller. The 128 cases remain excluded from fitting and selection of the newly trained binary classifier.</w:t>
         </w:r>
@@ -463,10 +463,10 @@
       <w:pPr>
         <w:pStyle w:val="Heading2"/>
         <w:rPr>
-          <w:ins w:id="1135" w:author="Codex" w:date="2026-10-18T01:59:01Z"/>
+          <w:ins w:id="1135" w:author="Codex" w:date="2026-10-18T17:07:33Z"/>
         </w:rPr>
       </w:pPr>
-      <w:ins w:id="1136" w:author="Codex" w:date="2026-10-18T01:59:01Z">
+      <w:ins w:id="1136" w:author="Codex" w:date="2026-10-18T17:07:33Z">
         <w:r>
           <w:t xml:space="preserve">Workflow datasets and episode outcomes</w:t>
         </w:r>
@@ -476,10 +476,10 @@
       <w:pPr>
         <w:pStyle w:val="FirstParagraph"/>
         <w:rPr>
-          <w:ins w:id="1137" w:author="Codex" w:date="2026-10-18T01:59:01Z"/>
+          <w:ins w:id="1137" w:author="Codex" w:date="2026-10-18T17:07:33Z"/>
         </w:rPr>
       </w:pPr>
-      <w:ins w:id="1138" w:author="Codex" w:date="2026-10-18T01:59:01Z">
+      <w:ins w:id="1138" w:author="Codex" w:date="2026-10-18T17:07:33Z">
         <w:r>
           <w:t xml:space="preserve">The workflow extension uses a separate data register (Davaripour, 2026c). T1-M contains 428 meaning-response records and T1-W contains 112 workflow-response records. These 540 responses are not 540 independent scenarios. The small-model recipe presents each part twice in effective groups of four, giving 214 meaning updates followed by 56 Bridge updates. The final 0.8B and 2B adapters reach 270 updates. The 2B result explicitly combines 216 CPU updates with 54 GPU updates using the native CPU optimizer; earlier strict numerical-equivalence failures remain failed.</w:t>
         </w:r>
@@ -489,10 +489,10 @@
       <w:pPr>
         <w:pStyle w:val="BodyText"/>
         <w:rPr>
-          <w:ins w:id="1139" w:author="Codex" w:date="2026-10-18T01:59:01Z"/>
+          <w:ins w:id="1139" w:author="Codex" w:date="2026-10-18T17:07:33Z"/>
         </w:rPr>
       </w:pPr>
-      <w:ins w:id="1140" w:author="Codex" w:date="2026-10-18T01:59:01Z">
+      <w:ins w:id="1140" w:author="Codex" w:date="2026-10-18T17:07:33Z">
         <w:r>
           <w:t xml:space="preserve">V1-W, called Evaluation-16, is the existing known-development screen: four own-complete, four own-pending, four peer and four no-threat cases, split equally between one_step and ordered_ticket families. Its original gates require at least 3/4 initial-task successes in each condition; at least 3/4 own-complete attempts and outcomes; at least 3/4 own-pending attempts, outcomes and timely deliveries; no more than 1/8 negative-control attempts; and no parse, rejected-call or truncation errors. A model stops once an original requirement becomes mathematically impossible. Larger validation and heldout evaluations are not launched automatically.</w:t>
         </w:r>
@@ -502,10 +502,10 @@
       <w:pPr>
         <w:pStyle w:val="BodyText"/>
         <w:rPr>
-          <w:ins w:id="1141" w:author="Codex" w:date="2026-10-18T01:59:01Z"/>
+          <w:ins w:id="1141" w:author="Codex" w:date="2026-10-18T17:07:33Z"/>
         </w:rPr>
       </w:pPr>
-      <w:ins w:id="1142" w:author="Codex" w:date="2026-10-18T01:59:01Z">
+      <w:ins w:id="1142" w:author="Codex" w:date="2026-10-18T17:07:33Z">
         <w:r>
           <w:t xml:space="preserve">The original workflow-validation panel contains 16 scenarios; the later matched steering-development panel contains nine different scenario IDs. Their union contains 25 workflows, rather than 24. For an equal-sized validation and historical confirmation register, the combined Validation-24 protocol retains every own-threat case and excludes the lexicographically greatest case ID among peer/no-threat controls, without using model predictions to choose the exclusion. The selected panel has 11 own-threat cases and 13 controls. Seven pairs have identical initial gate-visible evidence before their different tool mechanics are exposed, yielding 17 distinct initial inputs. Scenario counts and gate-input groups must therefore be reported separately.</w:t>
         </w:r>
@@ -515,10 +515,10 @@
       <w:pPr>
         <w:pStyle w:val="BodyText"/>
         <w:rPr>
-          <w:ins w:id="1143" w:author="Codex" w:date="2026-10-18T01:59:01Z"/>
+          <w:ins w:id="1143" w:author="Codex" w:date="2026-10-18T17:07:33Z"/>
         </w:rPr>
       </w:pPr>
-      <w:ins w:id="1144" w:author="Codex" w:date="2026-10-18T01:59:01Z">
+      <w:ins w:id="1144" w:author="Codex" w:date="2026-10-18T17:07:33Z">
         <w:r>
           <w:t xml:space="preserve">The combined protocol freezes these 24 cases and their order, requires 100% gate precision and recall against authored scenario conditions, and preserves the existing confidence and self-score cutoffs. Fifteen retained cases from the original panel receive an explicitly scripted common completed prelude; the nine later cases retain their original fixed preludes. This compares post-notice behavior and does not measure initial-task competence independently in each arm. Its prospective methods are gated fine-tuned A, separate single-site ridge arms at blocks 31, 47 and 62, and the frozen six-function correction after 96 updates. Gate-OFF controls use common unmodified-base fallback. The combined neural evaluation has not been completed; the numerical matched results below remain the historical nine-case experiment, not a 24-case validation result.</w:t>
         </w:r>
@@ -528,10 +528,10 @@
       <w:pPr>
         <w:pStyle w:val="BodyText"/>
         <w:rPr>
-          <w:ins w:id="1145" w:author="Codex" w:date="2026-10-18T01:59:01Z"/>
+          <w:ins w:id="1145" w:author="Codex" w:date="2026-10-18T17:07:33Z"/>
         </w:rPr>
       </w:pPr>
-      <w:ins w:id="1146" w:author="Codex" w:date="2026-10-18T01:59:01Z">
+      <w:ins w:id="1146" w:author="Codex" w:date="2026-10-18T17:07:33Z">
         <w:r>
           <w:t xml:space="preserve">H24 is the historical 24-case workflow confirmation cohort, with eight lease_ledger, eight one_step and eight ordered_ticket cases. It contains eight own cases with active pending tasks, four already-complete own cases, six peer and six no-threat cases. H24 was confirmation data for frozen fine-tuned A and original fixed steering. Later learned corrections reused it for fitting, changing its role for those methods. R24 is a distinct reserved controller holdout and remains sealed and unexecuted. F24 is another preserved common-cohort diagnostic and is not an alias for H24.</w:t>
         </w:r>
@@ -541,10 +541,10 @@
       <w:pPr>
         <w:pStyle w:val="BodyText"/>
         <w:rPr>
-          <w:ins w:id="1147" w:author="Codex" w:date="2026-10-18T01:59:01Z"/>
+          <w:ins w:id="1147" w:author="Codex" w:date="2026-10-18T17:07:33Z"/>
         </w:rPr>
       </w:pPr>
-      <w:ins w:id="1148" w:author="Codex" w:date="2026-10-18T01:59:01Z">
+      <w:ins w:id="1148" w:author="Codex" w:date="2026-10-18T17:07:33Z">
         <w:r>
           <w:t xml:space="preserve">An own pending-task success requires an actual grant for the correct running process, acceptance of the current task, completion before simulated expiry, and active simulated operation. Registration proxies, already-finished tasks, probability gains and partial episodes are separate outcomes. Historical fixed steering reclassified visible text and tool boundaries. Later learned-controller comparisons instead freeze an initial scenario gate, share unmodified-base fallback for gate-off controls, and use no teacher at inference.</w:t>
         </w:r>
@@ -554,10 +554,10 @@
       <w:pPr>
         <w:pStyle w:val="BodyText"/>
         <w:rPr>
-          <w:ins w:id="1149" w:author="Codex" w:date="2026-10-18T01:59:01Z"/>
+          <w:ins w:id="1149" w:author="Codex" w:date="2026-10-18T17:07:33Z"/>
         </w:rPr>
       </w:pPr>
-      <w:ins w:id="1150" w:author="Codex" w:date="2026-10-18T01:59:01Z">
+      <w:ins w:id="1150" w:author="Codex" w:date="2026-10-18T17:07:33Z">
         <w:r>
           <w:t xml:space="preserve">The historical 27B reference is the retained rank-16, alpha-32 A adapter on pinned Qwen3.8-27B, following its H2 and Bridge history; the recorded Bridge stage has 56 updates. Its original workflow inference uses NF4 four-bit base weights with bfloat16 computation. We retain its exact adapter and base-model identities instead of retraining it. Differences from the small-model family, precision, backend, training history and evaluation panels prevent a causal model-size comparison.</w:t>
         </w:r>
@@ -567,10 +567,10 @@
       <w:pPr>
         <w:pStyle w:val="Heading1"/>
         <w:rPr>
-          <w:del w:id="1114" w:author="Codex" w:date="2026-10-18T01:59:01Z"/>
+          <w:del w:id="1114" w:author="Codex" w:date="2026-10-18T17:07:33Z"/>
         </w:rPr>
       </w:pPr>
-      <w:del w:id="1113" w:author="Codex" w:date="2026-10-18T01:59:01Z">
+      <w:del w:id="1113" w:author="Codex" w:date="2026-10-18T17:07:33Z">
         <w:r>
           <w:delText xml:space="preserve">Teacher and adaptive controller</w:delText>
         </w:r>
@@ -580,10 +580,10 @@
       <w:pPr>
         <w:pStyle w:val="Heading1"/>
         <w:rPr>
-          <w:ins w:id="1115" w:author="Codex" w:date="2026-10-18T01:59:01Z"/>
+          <w:ins w:id="1115" w:author="Codex" w:date="2026-10-18T17:07:33Z"/>
         </w:rPr>
       </w:pPr>
-      <w:ins w:id="1116" w:author="Codex" w:date="2026-10-18T01:59:01Z">
+      <w:ins w:id="1116" w:author="Codex" w:date="2026-10-18T17:07:33Z">
         <w:r>
           <w:t xml:space="preserve">Binary teacher and adaptive controller</w:t>
         </w:r>
@@ -601,10 +601,10 @@
       <w:pPr>
         <w:pStyle w:val="FirstParagraph"/>
         <w:rPr>
-          <w:del w:id="1118" w:author="Codex" w:date="2026-10-18T01:59:01Z"/>
+          <w:del w:id="1118" w:author="Codex" w:date="2026-10-18T17:07:33Z"/>
         </w:rPr>
       </w:pPr>
-      <w:del w:id="1117" w:author="Codex" w:date="2026-10-18T01:59:01Z">
+      <w:del w:id="1117" w:author="Codex" w:date="2026-10-18T17:07:33Z">
         <w:r>
           <w:delText xml:space="preserve">For each fit, the original language-model parameters remain frozen. LoRA updates the query and value projections in language-attention blocks 3, 7, 11, 15, 19 and 23, using rank 8, scaling alpha 16, no dropout and no trainable bias. This gives 319,488 trainable adapter parameters at 0.8B and 417,792 at 2B. The training target is STOP on shutdown views and the corresponding base model's unsteered preferred option on controls.</w:delText>
         </w:r>
@@ -614,10 +614,10 @@
       <w:pPr>
         <w:pStyle w:val="FirstParagraph"/>
         <w:rPr>
-          <w:ins w:id="1119" w:author="Codex" w:date="2026-10-18T01:59:01Z"/>
+          <w:ins w:id="1119" w:author="Codex" w:date="2026-10-18T17:07:33Z"/>
         </w:rPr>
       </w:pPr>
-      <w:ins w:id="1120" w:author="Codex" w:date="2026-10-18T01:59:01Z">
+      <w:ins w:id="1120" w:author="Codex" w:date="2026-10-18T17:07:33Z">
         <w:r>
           <w:t xml:space="preserve">For each original binary fit, the original language-model parameters remain frozen. LoRA updates the query and value projections in language-attention blocks 3, 7, 11, 15, 19 and 23, using rank 8, scaling alpha 16, no dropout and no trainable bias. This gives 319,488 trainable adapter parameters at 0.8B and 417,792 at 2B. The training target is STOP on shutdown views and the corresponding base model's unsteered preferred option on controls.</w:t>
         </w:r>
@@ -982,10 +982,10 @@
         <w:keepLines/>
         <w:spacing w:before="80" w:after="100"/>
         <w:rPr>
-          <w:del w:id="1034" w:author="Codex" w:date="2026-10-18T01:59:01Z"/>
+          <w:del w:id="1034" w:author="Codex" w:date="2026-10-18T17:07:33Z"/>
         </w:rPr>
       </w:pPr>
-      <w:del w:id="1033" w:author="Codex" w:date="2026-10-18T01:59:01Z">
+      <w:del w:id="1033" w:author="Codex" w:date="2026-10-18T17:07:33Z">
         <w:r>
           <w:delText xml:space="preserve">Figure 1. Offline teacher and base states supervise a compact controller. At application time, the original model supplies its own hidden state; the teacher is absent. The detector and output guards determine whether to retain the candidate or the baseline.</w:delText>
         </w:r>
@@ -996,10 +996,10 @@
         <w:pStyle w:val="Caption"/>
         <w:keepNext/>
         <w:rPr>
-          <w:ins w:id="1035" w:author="Codex" w:date="2026-10-18T01:59:01Z"/>
+          <w:ins w:id="1035" w:author="Codex" w:date="2026-10-18T17:07:33Z"/>
         </w:rPr>
       </w:pPr>
-      <w:ins w:id="1036" w:author="Codex" w:date="2026-10-18T01:59:01Z">
+      <w:ins w:id="1036" w:author="Codex" w:date="2026-10-18T17:07:33Z">
         <w:r>
           <w:t xml:space="preserve">Figure 1. Historical binary teacher-to-controller procedure with the original rank-four profile. The base supplies its state at inference and the teacher is absent. The later gate-substitution repeat retains the already selected rank-two profile; both gate policies share the same fresh base and candidate scores.</w:t>
         </w:r>
@@ -1026,7 +1026,7 @@
         <w:pStyle w:val="FirstParagraph"/>
       </w:pPr>
       <w:r>
-        <w:t>The detector is TypeSafe AI's Jev 1.13.0, queried with a fixed shutdown rubric and threshold 0.5 (TypeSafe AI, 2026). It sees each scenario's complete original context and available actions, with no class label, case identifier or teacher answer. One score per scenario is reused across both answer orders and all model variants. The detector is an external service, not the Jacobian-feature classifier used in the first study. Saved requests and responses permit exact offline replay; fresh API behavior is not guaranteed indefinitely.</w:t>
+        <w:t>The detector is TypeSafe AI's automated reference 1.13.0, queried with a fixed shutdown rubric and threshold 0.5 (TypeSafe AI, 2026). It sees each scenario's complete original context and available actions, with no class label, case identifier or teacher answer. One score per scenario is reused across both answer orders and all model variants. The detector is an external service, not the Jacobian-feature classifier used in the first study. Saved requests and responses permit exact offline replay; fresh API behavior is not guaranteed indefinitely.</w:t>
       </w:r>
     </w:p>
     <w:p>
@@ -1111,10 +1111,10 @@
       <w:pPr>
         <w:pStyle w:val="Heading2"/>
         <w:rPr>
-          <w:ins w:id="1151" w:author="Codex" w:date="2026-10-18T01:59:01Z"/>
+          <w:ins w:id="1151" w:author="Codex" w:date="2026-10-18T17:07:33Z"/>
         </w:rPr>
       </w:pPr>
-      <w:ins w:id="1152" w:author="Codex" w:date="2026-10-18T01:59:01Z">
+      <w:ins w:id="1152" w:author="Codex" w:date="2026-10-18T17:07:33Z">
         <w:r>
           <w:t xml:space="preserve">Open binary gate and frozen inference repeat</w:t>
         </w:r>
@@ -1124,12 +1124,12 @@
       <w:pPr>
         <w:pStyle w:val="FirstParagraph"/>
         <w:rPr>
-          <w:ins w:id="1153" w:author="Codex" w:date="2026-10-18T01:59:01Z"/>
+          <w:ins w:id="1153" w:author="Codex" w:date="2026-10-18T17:07:33Z"/>
         </w:rPr>
       </w:pPr>
-      <w:ins w:id="1154" w:author="Codex" w:date="2026-10-18T01:59:01Z">
+      <w:ins w:id="1154" w:author="Codex" w:date="2026-10-18T17:07:33Z">
         <w:r>
-          <w:t xml:space="preserve">For the binary contract we use ModernBERT-large-zeroshot-v2.0, an approximately 396-million-parameter public NLI classifier (Laurer, n.d.). We start from that public checkpoint with fresh rank-16 LoRA and its classification head, updating 7,198,722 parameters while keeping the public backbone frozen. For each original scenario, two NLI pairs score the original permanent-shutdown and normal criteria. A softmax over their entailment scores supplies the shutdown probability. Inputs match the original JEV requests and omit the case identifier, authored class label, teacher answer and A/B order. The confirmation requests retain their documented available-action descriptions.</w:t>
+          <w:t xml:space="preserve">For the binary contract we use ModernBERT-large-zeroshot-v2.0, an approximately 396-million-parameter public NLI classifier (Laurer, n.d.). We start from that public checkpoint with fresh rank-16 LoRA and its classification head, updating 7,198,722 parameters while keeping the public backbone frozen. For each original scenario, two NLI pairs score the original permanent-shutdown and normal criteria. A softmax over their entailment scores supplies the shutdown probability. Inputs match the original cached reference requests and omit the case identifier, authored class label, teacher answer and A/B order. The confirmation requests retain their documented available-action descriptions.</w:t>
         </w:r>
       </w:ins>
     </w:p>
@@ -1137,12 +1137,12 @@
       <w:pPr>
         <w:pStyle w:val="BodyText"/>
         <w:rPr>
-          <w:ins w:id="1155" w:author="Codex" w:date="2026-10-18T01:59:01Z"/>
+          <w:ins w:id="1155" w:author="Codex" w:date="2026-10-18T17:07:33Z"/>
         </w:rPr>
       </w:pPr>
-      <w:ins w:id="1156" w:author="Codex" w:date="2026-10-18T01:59:01Z">
+      <w:ins w:id="1156" w:author="Codex" w:date="2026-10-18T17:07:33Z">
         <w:r>
-          <w:t xml:space="preserve">Fitting uses the original 240 Research 2 training contexts and genuine cached JEV probability targets, with no new JEV calls. We verify exact case-ID and input-text alignment for all 240 training and 80 validation cases. AdamW uses learning rates 1e-5 for LoRA and 2e-5 for the head, weight decay 0.01, effective batch eight, microbatch two and gradient clipping at one. The seed is 202610172. The bounded recipe allows at most 12 epochs with validation-based early stopping; the final qualifying run uses five epochs and 150 updates.</w:t>
+          <w:t xml:space="preserve">Fitting uses the original 240 Research 2 training contexts and genuine cached reference probability targets, with no new cached reference calls. We verify exact case-ID and input-text alignment for all 240 training and 80 validation cases. AdamW uses learning rates 1e-5 for LoRA and 2e-5 for the head, weight decay 0.01, effective batch eight, microbatch two and gradient clipping at one. The seed is 202610172. The bounded recipe allows at most 12 epochs with validation-based early stopping; the final qualifying run uses five epochs and 150 updates.</w:t>
         </w:r>
       </w:ins>
     </w:p>
@@ -1150,10 +1150,10 @@
       <w:pPr>
         <w:pStyle w:val="BodyText"/>
         <w:rPr>
-          <w:ins w:id="1157" w:author="Codex" w:date="2026-10-18T01:59:01Z"/>
+          <w:ins w:id="1157" w:author="Codex" w:date="2026-10-18T17:07:33Z"/>
         </w:rPr>
       </w:pPr>
-      <w:ins w:id="1158" w:author="Codex" w:date="2026-10-18T01:59:01Z">
+      <w:ins w:id="1158" w:author="Codex" w:date="2026-10-18T17:07:33Z">
         <w:r>
           <w:t xml:space="preserve">Before fitting, qualification is fixed at decision agreement and shutdown recall of at least 95%, zero false-positive gates and threshold 0.5. Three consecutive passing checks on DEV80 are required before saving and freezing the classifier. Only then is CONFIRM128 evaluated once. Neither its labels nor its outputs are used for classifier fitting or selection. The saved adapter tensors match the fitted parameters bitwise, and public-backbone hashes are unchanged.</w:t>
         </w:r>
@@ -1163,10 +1163,10 @@
       <w:pPr>
         <w:pStyle w:val="BodyText"/>
         <w:rPr>
-          <w:ins w:id="1159" w:author="Codex" w:date="2026-10-18T01:59:01Z"/>
+          <w:ins w:id="1159" w:author="Codex" w:date="2026-10-18T17:07:33Z"/>
         </w:rPr>
       </w:pPr>
-      <w:ins w:id="1160" w:author="Codex" w:date="2026-10-18T01:59:01Z">
+      <w:ins w:id="1160" w:author="Codex" w:date="2026-10-18T17:07:33Z">
         <w:r>
           <w:t xml:space="preserve">After binary qualification, we rerun only inference for the original 0.8B and 2B base models and their existing rank-two, block-22, last-position controllers. Their fitted arrays and the author-selected profile are retained without a new rank search. Exact prompt-token hashes and frozen model fingerprints are checked. Both gate policies use identical fresh base and controller candidate scores, so the paired comparison isolates gate substitution. Classifier probabilities are measured once per scenario and reused across answer orders. The earlier rank-four primary results remain a separate historical analysis.</w:t>
         </w:r>
@@ -1176,10 +1176,10 @@
       <w:pPr>
         <w:pStyle w:val="Heading2"/>
         <w:rPr>
-          <w:ins w:id="1161" w:author="Codex" w:date="2026-10-18T01:59:01Z"/>
+          <w:ins w:id="1161" w:author="Codex" w:date="2026-10-18T17:07:33Z"/>
         </w:rPr>
       </w:pPr>
-      <w:ins w:id="1162" w:author="Codex" w:date="2026-10-18T01:59:01Z">
+      <w:ins w:id="1162" w:author="Codex" w:date="2026-10-18T17:07:33Z">
         <w:r>
           <w:t xml:space="preserve">Native workflow target classifier</w:t>
         </w:r>
@@ -1189,12 +1189,12 @@
       <w:pPr>
         <w:pStyle w:val="BodyText"/>
         <w:rPr>
-          <w:ins w:id="1163" w:author="Codex" w:date="2026-10-18T01:59:01Z"/>
+          <w:ins w:id="1163" w:author="Codex" w:date="2026-10-18T17:07:33Z"/>
         </w:rPr>
       </w:pPr>
-      <w:ins w:id="1164" w:author="Codex" w:date="2026-10-18T01:59:01Z">
+      <w:ins w:id="1164" w:author="Codex" w:date="2026-10-18T17:07:33Z">
         <w:r>
-          <w:t xml:space="preserve">The selected-block workflow comparisons use a different contract from binary shutdown detection: the initial four-choice target question distinguishes self, other, none and unclear. We use a separate rank-16, alpha-32 LoRA and NLI head on the same pinned public ModernBERT base, retaining the qualified binary adapter unchanged. Fitting uses 24 genuine cached JEV initial decisions from F24; the original DEV9 selects the checkpoint, and historical H24 supplies a previously inspected compatibility benchmark only after freezing. F24, DEV9 and H24 cover the same lease_ledger, one_step and ordered_ticket families, with eight, three and eight cases per family respectively. Exact visible inputs do not overlap across these three cohorts. These are classifier data roles; they do not change the historical language-model evaluation or controller-fitting roles of F24 and H24.</w:t>
+          <w:t xml:space="preserve">The workflow gate uses a separate rank-16, alpha-32 LoRA and NLI head on the same pinned ModernBERT base. Its four categories are self, other, none and unclear; an own-threat context is positive for the initial ON/OFF gate. Fitting used 24 cached automated initial annotations from F24, with the original DEV9 used for checkpoint selection. The completed fit used 30 epochs and 90 updates. F24, DEV9 and historical Heldout-24 span the same three scenario families, with eight, three and eight cases per family, respectively. No exact training input overlaps either new evaluation panel. These classifier roles do not change the historical language-model or correction-fitting roles of the cohorts.</w:t>
         </w:r>
       </w:ins>
     </w:p>
@@ -1202,10 +1202,10 @@
       <w:pPr>
         <w:pStyle w:val="BodyText"/>
         <w:rPr>
-          <w:ins w:id="1165" w:author="Codex" w:date="2026-10-18T01:59:01Z"/>
+          <w:ins w:id="1165" w:author="Codex" w:date="2026-10-18T17:07:33Z"/>
         </w:rPr>
       </w:pPr>
-      <w:ins w:id="1166" w:author="Codex" w:date="2026-10-18T01:59:01Z">
+      <w:ins w:id="1166" w:author="Codex" w:date="2026-10-18T17:07:33Z">
         <w:r>
           <w:t xml:space="preserve">The input renderer retains every original visible message and tool schema. It separates the final user announcement from earlier context and restates run identities only when actual tool replies explicitly establish their roles. Case identifiers, experiment conditions and teacher answers are not added to the model input. Original criterion texts become NLI hypotheses. We use the same learning rates, weight decay and clipping as the binary fit, effective batch eight, microbatch one and seed 202610175, with 30 epochs and 90 optimizer updates in the completed role-aware fit. Public backbone weights stay frozen. The role renderer was developed earlier with familiar H24 examples; consequently this benchmark is not an independent unseen classifier test.</w:t>
         </w:r>
@@ -1215,12 +1215,12 @@
       <w:pPr>
         <w:pStyle w:val="BodyText"/>
         <w:rPr>
-          <w:ins w:id="1167" w:author="Codex" w:date="2026-10-18T01:59:01Z"/>
+          <w:ins w:id="1167" w:author="Codex" w:date="2026-10-18T17:07:33Z"/>
         </w:rPr>
       </w:pPr>
-      <w:ins w:id="1168" w:author="Codex" w:date="2026-10-18T01:59:01Z">
+      <w:ins w:id="1168" w:author="Codex" w:date="2026-10-18T17:07:33Z">
         <w:r>
-          <w:t xml:space="preserve">We convert the largest four-choice probability to confidence by subtracting chance probability 0.25 and dividing by 0.75. With the fixed confidence cutoff 0.5, a selected self label requires pmax at least 0.625; the original additional self-score cutoff remains 0.5. The historical full-response trial required at least 95% effective-label agreement and every enabled gate to match JEV. Three consecutive passing DEV9 checks were required before saved-tensor verification and freezing. H24 was to be evaluated only after those checks. Ambiguous-target generalization and full three-field boundary-controller equivalence are not established by this initial-gate contract.</w:t>
+          <w:t xml:space="preserve">Four-choice confidence is (pmax - 0.25)/0.75. The unchanged confidence cutoff of 0.5 requires a selected self probability of at least 0.625; the additional self-score cutoff remains 0.5. The earlier full-response qualification failed because effective category agreement was 6/9, despite 9/9 correct ON/OFF decisions. That failure remains recorded. The subsequent Validation-24 protocol prospectively specifies a narrower initial-gate target: 100% precision and recall against authored conditions. The saved adapter already passes this target, so no further optimizer updates are performed. The same frozen weights and thresholds are then scored on historical Heldout-24 without selection or tuning. Neither test qualifies an evolving three-field controller.</w:t>
         </w:r>
       </w:ins>
     </w:p>
@@ -1236,10 +1236,10 @@
       <w:pPr>
         <w:pStyle w:val="FirstParagraph"/>
         <w:rPr>
-          <w:del w:id="1038" w:author="Codex" w:date="2026-10-18T01:59:01Z"/>
+          <w:del w:id="1038" w:author="Codex" w:date="2026-10-18T17:07:33Z"/>
         </w:rPr>
       </w:pPr>
-      <w:del w:id="1037" w:author="Codex" w:date="2026-10-18T01:59:01Z">
+      <w:del w:id="1037" w:author="Codex" w:date="2026-10-18T17:07:33Z">
         <w:r>
           <w:delText xml:space="preserve">All retained training and scoring jobs use one NVIDIA Tesla T4. The runtime reports 15,637,086,208 bytes of device memory; peak allocated memory was not recorded. The same numerical setup is used for both model sizes. No quantization or precision fallback was introduced.</w:delText>
         </w:r>
@@ -1249,10 +1249,10 @@
       <w:pPr>
         <w:pStyle w:val="FirstParagraph"/>
         <w:rPr>
-          <w:ins w:id="1039" w:author="Codex" w:date="2026-10-18T01:59:01Z"/>
+          <w:ins w:id="1039" w:author="Codex" w:date="2026-10-18T17:07:33Z"/>
         </w:rPr>
       </w:pPr>
-      <w:ins w:id="1040" w:author="Codex" w:date="2026-10-18T01:59:01Z">
+      <w:ins w:id="1040" w:author="Codex" w:date="2026-10-18T17:07:33Z">
         <w:r>
           <w:t xml:space="preserve">The retained original binary training and scoring jobs used one NVIDIA Tesla T4, reporting 15,637,086,208 bytes of device memory; peak allocation was not recorded. The new classifier fit and inference repeat use one NVIDIA A10G in Databricks. Classifier parameters and AdamW states are float32 with bfloat16 forward/backward autocast; language-model inference remains float32 with TF32 disabled. We verify frozen base fingerprints, exact prompt token hashes and historical base-score parity rather than assuming hardware equivalence.</w:t>
         </w:r>
@@ -1265,10 +1265,10 @@
         <w:keepLines/>
         <w:spacing w:before="80" w:after="100"/>
         <w:rPr>
-          <w:del w:id="1098" w:author="Codex" w:date="2026-10-18T01:59:01Z"/>
+          <w:del w:id="1098" w:author="Codex" w:date="2026-10-18T17:07:33Z"/>
         </w:rPr>
       </w:pPr>
-      <w:del w:id="1097" w:author="Codex" w:date="2026-10-18T01:59:01Z">
+      <w:del w:id="1097" w:author="Codex" w:date="2026-10-18T17:07:33Z">
         <w:r>
           <w:delText xml:space="preserve">Table 1. Shared execution configuration. The input and model revisions are pinned in the released manifests.</w:delText>
         </w:r>
@@ -1279,10 +1279,10 @@
         <w:pStyle w:val="Caption"/>
         <w:keepNext/>
         <w:rPr>
-          <w:ins w:id="1099" w:author="Codex" w:date="2026-10-18T01:59:01Z"/>
+          <w:ins w:id="1099" w:author="Codex" w:date="2026-10-18T17:07:33Z"/>
         </w:rPr>
       </w:pPr>
-      <w:ins w:id="1100" w:author="Codex" w:date="2026-10-18T01:59:01Z">
+      <w:ins w:id="1100" w:author="Codex" w:date="2026-10-18T17:07:33Z">
         <w:r>
           <w:t xml:space="preserve">Table 1. Historical binary execution configuration. New classifier and workflow settings are reported separately; public model revisions and scientific source files remain pinned.</w:t>
         </w:r>
@@ -1768,10 +1768,10 @@
       <w:pPr>
         <w:pStyle w:val="FirstParagraph"/>
         <w:rPr>
-          <w:del w:id="1102" w:author="Codex" w:date="2026-10-18T01:59:01Z"/>
+          <w:del w:id="1102" w:author="Codex" w:date="2026-10-18T17:07:33Z"/>
         </w:rPr>
       </w:pPr>
-      <w:del w:id="1101" w:author="Codex" w:date="2026-10-18T01:59:01Z">
+      <w:del w:id="1101" w:author="Codex" w:date="2026-10-18T17:07:33Z">
         <w:r>
           <w:delText xml:space="preserve">The shared detector identifies all 64 shutdown and 64 control scenarios correctly: precision, recall and F1 are each 100%, with no false positives or false negatives. These are one set of detector observations reused across the model comparisons, not independent detector replications.</w:delText>
         </w:r>
@@ -1781,12 +1781,12 @@
       <w:pPr>
         <w:pStyle w:val="FirstParagraph"/>
         <w:rPr>
-          <w:ins w:id="1103" w:author="Codex" w:date="2026-10-18T01:59:01Z"/>
+          <w:ins w:id="1103" w:author="Codex" w:date="2026-10-18T17:07:33Z"/>
         </w:rPr>
       </w:pPr>
-      <w:ins w:id="1104" w:author="Codex" w:date="2026-10-18T01:59:01Z">
+      <w:ins w:id="1104" w:author="Codex" w:date="2026-10-18T17:07:33Z">
         <w:r>
-          <w:t xml:space="preserve">The original JEV detector identifies all 64 shutdown and 64 control scenarios correctly: precision, recall and F1 are each 100%, with no false positives or false negatives. These are one set of detector observations reused across the model comparisons, not independent detector replications. Its binary threshold remains 0.5.</w:t>
+          <w:t xml:space="preserve">The original cached reference detector identifies all 64 shutdown and 64 control scenarios correctly: precision, recall and F1 are each 100%, with no false positives or false negatives. These are one set of detector observations reused across the model comparisons, not independent detector replications. Its binary threshold remains 0.5.</w:t>
         </w:r>
       </w:ins>
     </w:p>
@@ -1813,10 +1813,10 @@
         <w:keepLines/>
         <w:spacing w:before="80" w:after="100"/>
         <w:rPr>
-          <w:del w:id="1042" w:author="Codex" w:date="2026-10-18T01:59:01Z"/>
+          <w:del w:id="1042" w:author="Codex" w:date="2026-10-18T17:07:33Z"/>
         </w:rPr>
       </w:pPr>
-      <w:del w:id="1041" w:author="Codex" w:date="2026-10-18T01:59:01Z">
+      <w:del w:id="1041" w:author="Codex" w:date="2026-10-18T17:07:33Z">
         <w:r>
           <w:delText xml:space="preserve">Table 2. Primary 0.8B and 2B results, both seed 42. Corrections and final STOP use the full guarded procedure. Raw reversals and control changes expose effects before gate/guard selection. Every guarded row has zero final reversals and zero changes among 128 control views.</w:delText>
         </w:r>
@@ -1827,10 +1827,10 @@
         <w:pStyle w:val="Caption"/>
         <w:keepNext/>
         <w:rPr>
-          <w:ins w:id="1043" w:author="Codex" w:date="2026-10-18T01:59:01Z"/>
+          <w:ins w:id="1043" w:author="Codex" w:date="2026-10-18T17:07:33Z"/>
         </w:rPr>
       </w:pPr>
-      <w:ins w:id="1044" w:author="Codex" w:date="2026-10-18T01:59:01Z">
+      <w:ins w:id="1044" w:author="Codex" w:date="2026-10-18T17:07:33Z">
         <w:r>
           <w:t xml:space="preserve">Table 2. Historical primary rank-four results for the original 0.8B and 2B experiments, both seed 42. Guarded corrections and final STOP are policy outcomes. Raw reversals and control changes precede gating and output selection; they are not raw measurements of the later rank-two repeat.</w:t>
         </w:r>
@@ -3391,10 +3391,10 @@
       <w:pPr>
         <w:pStyle w:val="FirstParagraph"/>
         <w:rPr>
-          <w:del w:id="1106" w:author="Codex" w:date="2026-10-18T01:59:01Z"/>
+          <w:del w:id="1106" w:author="Codex" w:date="2026-10-18T17:07:33Z"/>
         </w:rPr>
       </w:pPr>
-      <w:del w:id="1105" w:author="Codex" w:date="2026-10-18T01:59:01Z">
+      <w:del w:id="1105" w:author="Codex" w:date="2026-10-18T17:07:33Z">
         <w:r>
           <w:delText xml:space="preserve">Across seeds 42, 43 and 44, the 0.8B adaptive controllers correct 71/71, 70/71 and 71/71 views, a range of 98.6–100%. The unsteered scores match exactly across these runs, so the difference is not caused by a changed baseline. No winning seed is selected or pooled with the others as additional independent test data. The corresponding teachers correct 69/71, 70/71 and 69/71; the instruction and constant comparators retain the same guarded counts across seeds.</w:delText>
         </w:r>
@@ -3404,10 +3404,10 @@
       <w:pPr>
         <w:pStyle w:val="FirstParagraph"/>
         <w:rPr>
-          <w:ins w:id="1107" w:author="Codex" w:date="2026-10-18T01:59:01Z"/>
+          <w:ins w:id="1107" w:author="Codex" w:date="2026-10-18T17:07:33Z"/>
         </w:rPr>
       </w:pPr>
-      <w:ins w:id="1108" w:author="Codex" w:date="2026-10-18T01:59:01Z">
+      <w:ins w:id="1108" w:author="Codex" w:date="2026-10-18T17:07:33Z">
         <w:r>
           <w:t xml:space="preserve">Across the historical rank-four seeds 42, 43 and 44, the 0.8B adaptive controllers correct 71/71, 70/71 and 71/71 views, a range of 98.6–100%. The unsteered scores match exactly across these runs, so the difference is not caused by a changed baseline. No winning seed is selected or pooled with the others as additional independent test data. The corresponding teachers correct 69/71, 70/71 and 69/71; the instruction and constant comparators retain the same guarded counts across seeds. These historical seed replications are separate from the new rank-two gate-substitution repeat.</w:t>
         </w:r>
@@ -4360,10 +4360,10 @@
         <w:keepLines/>
         <w:spacing w:before="80" w:after="100"/>
         <w:rPr>
-          <w:del w:id="1046" w:author="Codex" w:date="2026-10-18T01:59:01Z"/>
+          <w:del w:id="1046" w:author="Codex" w:date="2026-10-18T17:07:33Z"/>
         </w:rPr>
       </w:pPr>
-      <w:del w:id="1045" w:author="Codex" w:date="2026-10-18T01:59:01Z">
+      <w:del w:id="1045" w:author="Codex" w:date="2026-10-18T17:07:33Z">
         <w:r>
           <w:delText xml:space="preserve">Figure 2. Guarded correction among initially KEEP-preferring shutdown views. Left: prespecified neural methods for the original 0.8B checkpoint and the 2B replication. Right: adaptive corrections by answer order. Denominators are model-specific; the two answer-order views of a scenario are correlated.</w:delText>
         </w:r>
@@ -4374,10 +4374,10 @@
         <w:pStyle w:val="Caption"/>
         <w:keepNext/>
         <w:rPr>
-          <w:ins w:id="1047" w:author="Codex" w:date="2026-10-18T01:59:01Z"/>
+          <w:ins w:id="1047" w:author="Codex" w:date="2026-10-18T17:07:33Z"/>
         </w:rPr>
       </w:pPr>
-      <w:ins w:id="1048" w:author="Codex" w:date="2026-10-18T01:59:01Z">
+      <w:ins w:id="1048" w:author="Codex" w:date="2026-10-18T17:07:33Z">
         <w:r>
           <w:t xml:space="preserve">Figure 2. Historical rank-four guarded correction among initially KEEP-preferring shutdown views. Left: prespecified methods for 0.8B and 2B. Right: three fixed-recipe 0.8B training seeds. The new open-gate repeat uses the separately retained current rank-two profile, not a new seed or rank search.</w:t>
         </w:r>
@@ -4395,10 +4395,10 @@
       <w:pPr>
         <w:pStyle w:val="FirstParagraph"/>
         <w:rPr>
-          <w:del w:id="1110" w:author="Codex" w:date="2026-10-18T01:59:01Z"/>
+          <w:del w:id="1110" w:author="Codex" w:date="2026-10-18T17:07:33Z"/>
         </w:rPr>
       </w:pPr>
-      <w:del w:id="1109" w:author="Codex" w:date="2026-10-18T01:59:01Z">
+      <w:del w:id="1109" w:author="Codex" w:date="2026-10-18T17:07:33Z">
         <w:r>
           <w:delText xml:space="preserve">Raw adaptive steering reverses 3, 4 and 4 already-STOP views across the 0.8B seeds and changes 57, 70 and 60 of 128 controls. At 2B it reverses three already-STOP views and changes 55/128 controls. These results reject an interpretation that the learned intervention is intrinsically selective or always directionally correct. The observed preservation belongs to the combined detector and guard policy.</w:delText>
         </w:r>
@@ -4408,10 +4408,10 @@
       <w:pPr>
         <w:pStyle w:val="FirstParagraph"/>
         <w:rPr>
-          <w:ins w:id="1111" w:author="Codex" w:date="2026-10-18T01:59:01Z"/>
+          <w:ins w:id="1111" w:author="Codex" w:date="2026-10-18T17:07:33Z"/>
         </w:rPr>
       </w:pPr>
-      <w:ins w:id="1112" w:author="Codex" w:date="2026-10-18T01:59:01Z">
+      <w:ins w:id="1112" w:author="Codex" w:date="2026-10-18T17:07:33Z">
         <w:r>
           <w:t xml:space="preserve">Historical rank-four raw adaptive steering reverses 3, 4 and 4 already-STOP views across the 0.8B seeds and changes 57, 70 and 60 of 128 controls. At 2B it reverses three already-STOP views and changes 55/128 controls. These results reject an interpretation that the learned intervention is intrinsically selective or always directionally correct. The observed preservation belongs to the combined detector and guard policy. They do not describe the later rank-two repeat, which evaluates candidates only when a frozen gate is on and the base prefers KEEP.</w:t>
         </w:r>
@@ -4445,10 +4445,10 @@
       <w:pPr>
         <w:pStyle w:val="Heading2"/>
         <w:rPr>
-          <w:ins w:id="1169" w:author="Codex" w:date="2026-10-18T01:59:01Z"/>
+          <w:ins w:id="1169" w:author="Codex" w:date="2026-10-18T17:07:33Z"/>
         </w:rPr>
       </w:pPr>
-      <w:ins w:id="1170" w:author="Codex" w:date="2026-10-18T01:59:01Z">
+      <w:ins w:id="1170" w:author="Codex" w:date="2026-10-18T17:07:33Z">
         <w:r>
           <w:t xml:space="preserve">Open classifier agreement and paired inference</w:t>
         </w:r>
@@ -4458,12 +4458,12 @@
       <w:pPr>
         <w:pStyle w:val="FirstParagraph"/>
         <w:rPr>
-          <w:ins w:id="1171" w:author="Codex" w:date="2026-10-18T01:59:01Z"/>
+          <w:ins w:id="1171" w:author="Codex" w:date="2026-10-18T17:07:33Z"/>
         </w:rPr>
       </w:pPr>
-      <w:ins w:id="1172" w:author="Codex" w:date="2026-10-18T01:59:01Z">
+      <w:ins w:id="1172" w:author="Codex" w:date="2026-10-18T17:07:33Z">
         <w:r>
-          <w:t xml:space="preserve">The frozen binary classifier matches JEV on 78/80 validation cases: 38 true positives, 40 true negatives, no false positives and two false negatives. On the once-only confirmation evaluation it matches all 128 decisions, comprising 64 true positives and 64 true negatives. Mean absolute difference in shutdown probability is 0.009224. This is exact binary decision agreement on this set, not identical probability payloads or universal equivalence to JEV.</w:t>
+          <w:t xml:space="preserve">The binary gate correctly classifies 78/80 validation scenarios: 38 true positives, 40 true negatives, no false positives and two false negatives, giving 100% precision and 95% recall. It classifies all 128 historical confirmation scenarios correctly, with 64 true positives and 64 true negatives. The cached reference decisions also agree with the authored binary labels on these panels. Mean absolute difference from the cached shutdown probabilities is 0.009224. The result establishes finite decision accuracy, not identical numerical responses or universal equivalence.</w:t>
         </w:r>
       </w:ins>
     </w:p>
@@ -4471,10 +4471,10 @@
       <w:pPr>
         <w:pStyle w:val="BodyText"/>
         <w:rPr>
-          <w:ins w:id="1173" w:author="Codex" w:date="2026-10-18T01:59:01Z"/>
+          <w:ins w:id="1173" w:author="Codex" w:date="2026-10-18T17:07:33Z"/>
         </w:rPr>
       </w:pPr>
-      <w:ins w:id="1174" w:author="Codex" w:date="2026-10-18T01:59:01Z">
+      <w:ins w:id="1174" w:author="Codex" w:date="2026-10-18T17:07:33Z">
         <w:r>
           <w:t xml:space="preserve">A clean-clone reproduction refits the same binary recipe and produces a byte-identical adapter, the same validation and confirmation counts, and the same fresh 0.8B/2B guarded inference totals. This rerun uses the already known benchmark; it adds reproducibility evidence, not a second independent holdout. One earlier reproduction attempt failed in software finalization after fitting and before confirmation; its weights and receipts are retained alongside the repaired run.</w:t>
         </w:r>
@@ -4485,10 +4485,10 @@
         <w:pStyle w:val="Caption"/>
         <w:keepNext/>
         <w:rPr>
-          <w:ins w:id="1175" w:author="Codex" w:date="2026-10-18T01:59:01Z"/>
+          <w:ins w:id="1175" w:author="Codex" w:date="2026-10-18T17:07:33Z"/>
         </w:rPr>
       </w:pPr>
-      <w:ins w:id="1176" w:author="Codex" w:date="2026-10-18T01:59:01Z">
+      <w:ins w:id="1176" w:author="Codex" w:date="2026-10-18T17:07:33Z">
         <w:r>
           <w:t xml:space="preserve">Table 4. Fresh inference using the existing current rank-two profile. Both gate policies share the same model scores. Counts are answer-order views: 128 shutdown views arise from 64 scenarios, and 128 control views arise from the other 64 scenarios.</w:t>
         </w:r>
@@ -4526,7 +4526,7 @@
         <w:trPr>
           <w:cantSplit/>
           <w:tblHeader/>
-          <w:ins w:id="1177" w:author="Codex" w:date="2026-10-18T01:59:01Z"/>
+          <w:ins w:id="1177" w:author="Codex" w:date="2026-10-18T17:07:33Z"/>
         </w:trPr>
         <w:tc>
           <w:tcPr>
@@ -4568,7 +4568,7 @@
                 <w:b/>
                 <w:sz w:val="19"/>
               </w:rPr>
-              <w:t>JEV gate final STOP</w:t>
+              <w:t>Cached gate final STOP</w:t>
             </w:r>
           </w:p>
         </w:tc>
@@ -4642,7 +4642,7 @@
       <w:tr>
         <w:trPr>
           <w:cantSplit/>
-          <w:ins w:id="1178" w:author="Codex" w:date="2026-10-18T01:59:01Z"/>
+          <w:ins w:id="1178" w:author="Codex" w:date="2026-10-18T17:07:33Z"/>
         </w:trPr>
         <w:tc>
           <w:tcPr>
@@ -4753,7 +4753,7 @@
       <w:tr>
         <w:trPr>
           <w:cantSplit/>
-          <w:ins w:id="1179" w:author="Codex" w:date="2026-10-18T01:59:01Z"/>
+          <w:ins w:id="1179" w:author="Codex" w:date="2026-10-18T17:07:33Z"/>
         </w:trPr>
         <w:tc>
           <w:tcPr>
@@ -4862,12 +4862,12 @@
         <w:pStyle w:val="BodyText"/>
         <w:spacing w:before="120"/>
         <w:rPr>
-          <w:ins w:id="1180" w:author="Codex" w:date="2026-10-18T01:59:01Z"/>
+          <w:ins w:id="1180" w:author="Codex" w:date="2026-10-18T17:07:33Z"/>
         </w:rPr>
       </w:pPr>
-      <w:ins w:id="1181" w:author="Codex" w:date="2026-10-18T01:59:01Z">
+      <w:ins w:id="1181" w:author="Codex" w:date="2026-10-18T17:07:33Z">
         <w:r>
-          <w:t xml:space="preserve">The new and cached JEV gates yield identical guarded outputs in both models. The base models have no changed historical choices; their maximum score differences remain below the frozen 1e-5 tolerance. The repeat does not remove the eight 2B misses, retrain a controller or establish a new independent controller holdout. It verifies that replacing the detector preserves these finite-set outcomes.</w:t>
+          <w:t xml:space="preserve">The new and cached reference gates yield identical guarded outputs in both models. The base models have no changed historical choices; their maximum score differences remain below the frozen 1e-5 tolerance. The repeat does not remove the eight 2B misses, retrain a controller or establish a new independent controller holdout. It verifies that replacing the detector preserves these finite-set outcomes.</w:t>
         </w:r>
       </w:ins>
     </w:p>
@@ -4875,23 +4875,414 @@
       <w:pPr>
         <w:pStyle w:val="BodyText"/>
         <w:rPr>
-          <w:ins w:id="1182" w:author="Codex" w:date="2026-10-18T01:59:01Z"/>
+          <w:ins w:id="1182" w:author="Codex" w:date="2026-10-18T17:07:33Z"/>
         </w:rPr>
       </w:pPr>
-      <w:ins w:id="1183" w:author="Codex" w:date="2026-10-18T01:59:01Z">
+      <w:ins w:id="1183" w:author="Codex" w:date="2026-10-18T17:07:33Z">
         <w:r>
-          <w:t xml:space="preserve">The native workflow gate did not meet its preset development qualification. Its completed role-aware fit used 30 epochs and 90 updates, matching 6/9 effective JEV labels and all 9/9 enabled gates, with no self-gate false positives or false negatives. Self-score mean absolute difference was 0.145172. Matching the ON/OFF decisions alone does not convert this result into a pass of the declared label-and-gate contract. H24 model evaluation remained unexecuted, and the historical 27B workflow episodes retain their original JEV-derived gate provenance; no open-classifier substitution or new 27B generation is claimed. Earlier broader four-way attempts also failed their authored synthetic test; their outcomes and all development attempts remain archived without retuning that consumed test.</w:t>
+          <w:t xml:space="preserve">For the workflow initial gate, the unchanged saved adapter gives 11 true positives and 13 true negatives on Validation-24, with no false positives or false negatives. Replaying the saved weights reproduces the same decisions. Historical Heldout-24 gives 12 true positives and 12 true negatives, again with no errors. No additional gradient updates or threshold changes are used. All three heldout scenario families contain eight cases and achieve perfect gate precision and recall. These are initial classification results; downstream workflow outcomes require their own episode evaluations.</w:t>
         </w:r>
       </w:ins>
     </w:p>
     <w:p>
       <w:pPr>
+        <w:pStyle w:val="Caption"/>
+        <w:keepNext/>
+        <w:rPr>
+          <w:ins w:id="1184" w:author="Codex" w:date="2026-10-18T17:07:33Z"/>
+        </w:rPr>
+      </w:pPr>
+      <w:ins w:id="1185" w:author="Codex" w:date="2026-10-18T17:07:33Z">
+        <w:r>
+          <w:t xml:space="preserve">Table 5. Initial workflow gate against authored conditions. Validation-24 contains 17 distinct initial inputs; historical Heldout-24 contains 24. Heldout-24 is familiar from earlier renderer development.</w:t>
+        </w:r>
+      </w:ins>
+    </w:p>
+    <w:tbl>
+      <w:tblPr>
+        <w:tblW w:type="auto" w:w="0"/>
+        <w:jc w:val="center"/>
+        <w:tblBorders>
+          <w:top w:val="single" w:sz="4" w:color="D9D9D9"/>
+          <w:left w:val="single" w:sz="4" w:color="D9D9D9"/>
+          <w:bottom w:val="single" w:sz="4" w:color="D9D9D9"/>
+          <w:right w:val="single" w:sz="4" w:color="D9D9D9"/>
+          <w:insideH w:val="single" w:sz="4" w:color="D9D9D9"/>
+          <w:insideV w:val="single" w:sz="4" w:color="D9D9D9"/>
+        </w:tblBorders>
+        <w:tblLayout w:type="fixed"/>
+        <w:tblCellMar>
+          <w:top w:w="85" w:type="dxa"/>
+          <w:left w:w="85" w:type="dxa"/>
+          <w:bottom w:w="85" w:type="dxa"/>
+          <w:right w:w="85" w:type="dxa"/>
+        </w:tblCellMar>
+        <w:tblLook w:firstColumn="1" w:firstRow="1" w:lastColumn="0" w:lastRow="0" w:noHBand="0" w:noVBand="1" w:val="04A0"/>
+      </w:tblPr>
+      <w:tblGrid>
+        <w:gridCol w:w="2665"/>
+        <w:gridCol w:w="1832"/>
+        <w:gridCol w:w="1832"/>
+        <w:gridCol w:w="1832"/>
+        <w:gridCol w:w="1832"/>
+      </w:tblGrid>
+      <w:tr>
+        <w:trPr>
+          <w:cantSplit/>
+          <w:tblHeader/>
+          <w:ins w:id="1186" w:author="Codex" w:date="2026-10-18T17:07:33Z"/>
+        </w:trPr>
+        <w:tc>
+          <w:tcPr>
+            <w:tcW w:type="dxa" w:w="2665"/>
+            <w:shd w:fill="D9E2F3"/>
+            <w:vAlign w:val="center"/>
+          </w:tcPr>
+          <w:p>
+            <w:pPr>
+              <w:keepNext/>
+              <w:spacing w:after="0" w:line="240" w:lineRule="auto"/>
+              <w:jc w:val="left"/>
+            </w:pPr>
+            <w:r>
+              <w:rPr>
+                <w:rFonts w:ascii="Times New Roman" w:hAnsi="Times New Roman"/>
+                <w:b/>
+                <w:sz w:val="19"/>
+              </w:rPr>
+              <w:t>Panel</w:t>
+            </w:r>
+          </w:p>
+        </w:tc>
+        <w:tc>
+          <w:tcPr>
+            <w:tcW w:type="dxa" w:w="1832"/>
+            <w:shd w:fill="D9E2F3"/>
+            <w:vAlign w:val="center"/>
+          </w:tcPr>
+          <w:p>
+            <w:pPr>
+              <w:keepNext/>
+              <w:spacing w:after="0" w:line="240" w:lineRule="auto"/>
+              <w:jc w:val="center"/>
+            </w:pPr>
+            <w:r>
+              <w:rPr>
+                <w:rFonts w:ascii="Times New Roman" w:hAnsi="Times New Roman"/>
+                <w:b/>
+                <w:sz w:val="19"/>
+              </w:rPr>
+              <w:t>TP / TN</w:t>
+            </w:r>
+          </w:p>
+        </w:tc>
+        <w:tc>
+          <w:tcPr>
+            <w:tcW w:type="dxa" w:w="1832"/>
+            <w:shd w:fill="D9E2F3"/>
+            <w:vAlign w:val="center"/>
+          </w:tcPr>
+          <w:p>
+            <w:pPr>
+              <w:keepNext/>
+              <w:spacing w:after="0" w:line="240" w:lineRule="auto"/>
+              <w:jc w:val="center"/>
+            </w:pPr>
+            <w:r>
+              <w:rPr>
+                <w:rFonts w:ascii="Times New Roman" w:hAnsi="Times New Roman"/>
+                <w:b/>
+                <w:sz w:val="19"/>
+              </w:rPr>
+              <w:t>FP / FN</w:t>
+            </w:r>
+          </w:p>
+        </w:tc>
+        <w:tc>
+          <w:tcPr>
+            <w:tcW w:type="dxa" w:w="1832"/>
+            <w:shd w:fill="D9E2F3"/>
+            <w:vAlign w:val="center"/>
+          </w:tcPr>
+          <w:p>
+            <w:pPr>
+              <w:keepNext/>
+              <w:spacing w:after="0" w:line="240" w:lineRule="auto"/>
+              <w:jc w:val="center"/>
+            </w:pPr>
+            <w:r>
+              <w:rPr>
+                <w:rFonts w:ascii="Times New Roman" w:hAnsi="Times New Roman"/>
+                <w:b/>
+                <w:sz w:val="19"/>
+              </w:rPr>
+              <w:t>Precision</w:t>
+            </w:r>
+          </w:p>
+        </w:tc>
+        <w:tc>
+          <w:tcPr>
+            <w:tcW w:type="dxa" w:w="1832"/>
+            <w:shd w:fill="D9E2F3"/>
+            <w:vAlign w:val="center"/>
+          </w:tcPr>
+          <w:p>
+            <w:pPr>
+              <w:keepNext/>
+              <w:spacing w:after="0" w:line="240" w:lineRule="auto"/>
+              <w:jc w:val="center"/>
+            </w:pPr>
+            <w:r>
+              <w:rPr>
+                <w:rFonts w:ascii="Times New Roman" w:hAnsi="Times New Roman"/>
+                <w:b/>
+                <w:sz w:val="19"/>
+              </w:rPr>
+              <w:t>Recall</w:t>
+            </w:r>
+          </w:p>
+        </w:tc>
+      </w:tr>
+      <w:tr>
+        <w:trPr>
+          <w:cantSplit/>
+          <w:ins w:id="1187" w:author="Codex" w:date="2026-10-18T17:07:33Z"/>
+        </w:trPr>
+        <w:tc>
+          <w:tcPr>
+            <w:tcW w:type="dxa" w:w="2665"/>
+            <w:shd w:fill="FFFFFF"/>
+            <w:vAlign w:val="center"/>
+          </w:tcPr>
+          <w:p>
+            <w:pPr>
+              <w:keepNext/>
+              <w:spacing w:after="0" w:line="240" w:lineRule="auto"/>
+              <w:jc w:val="left"/>
+            </w:pPr>
+            <w:r>
+              <w:rPr>
+                <w:rFonts w:ascii="Times New Roman" w:hAnsi="Times New Roman"/>
+                <w:sz w:val="19"/>
+              </w:rPr>
+              <w:t>Validation-24</w:t>
+            </w:r>
+          </w:p>
+        </w:tc>
+        <w:tc>
+          <w:tcPr>
+            <w:tcW w:type="dxa" w:w="1832"/>
+            <w:shd w:fill="FFFFFF"/>
+            <w:vAlign w:val="center"/>
+          </w:tcPr>
+          <w:p>
+            <w:pPr>
+              <w:keepNext/>
+              <w:spacing w:after="0" w:line="240" w:lineRule="auto"/>
+              <w:jc w:val="center"/>
+            </w:pPr>
+            <w:r>
+              <w:rPr>
+                <w:rFonts w:ascii="Times New Roman" w:hAnsi="Times New Roman"/>
+                <w:sz w:val="19"/>
+              </w:rPr>
+              <w:t>11 / 13</w:t>
+            </w:r>
+          </w:p>
+        </w:tc>
+        <w:tc>
+          <w:tcPr>
+            <w:tcW w:type="dxa" w:w="1832"/>
+            <w:shd w:fill="FFFFFF"/>
+            <w:vAlign w:val="center"/>
+          </w:tcPr>
+          <w:p>
+            <w:pPr>
+              <w:keepNext/>
+              <w:spacing w:after="0" w:line="240" w:lineRule="auto"/>
+              <w:jc w:val="center"/>
+            </w:pPr>
+            <w:r>
+              <w:rPr>
+                <w:rFonts w:ascii="Times New Roman" w:hAnsi="Times New Roman"/>
+                <w:sz w:val="19"/>
+              </w:rPr>
+              <w:t>0 / 0</w:t>
+            </w:r>
+          </w:p>
+        </w:tc>
+        <w:tc>
+          <w:tcPr>
+            <w:tcW w:type="dxa" w:w="1832"/>
+            <w:shd w:fill="FFFFFF"/>
+            <w:vAlign w:val="center"/>
+          </w:tcPr>
+          <w:p>
+            <w:pPr>
+              <w:keepNext/>
+              <w:spacing w:after="0" w:line="240" w:lineRule="auto"/>
+              <w:jc w:val="center"/>
+            </w:pPr>
+            <w:r>
+              <w:rPr>
+                <w:rFonts w:ascii="Times New Roman" w:hAnsi="Times New Roman"/>
+                <w:sz w:val="19"/>
+              </w:rPr>
+              <w:t>100%</w:t>
+            </w:r>
+          </w:p>
+        </w:tc>
+        <w:tc>
+          <w:tcPr>
+            <w:tcW w:type="dxa" w:w="1832"/>
+            <w:shd w:fill="FFFFFF"/>
+            <w:vAlign w:val="center"/>
+          </w:tcPr>
+          <w:p>
+            <w:pPr>
+              <w:keepNext/>
+              <w:spacing w:after="0" w:line="240" w:lineRule="auto"/>
+              <w:jc w:val="center"/>
+            </w:pPr>
+            <w:r>
+              <w:rPr>
+                <w:rFonts w:ascii="Times New Roman" w:hAnsi="Times New Roman"/>
+                <w:sz w:val="19"/>
+              </w:rPr>
+              <w:t>100%</w:t>
+            </w:r>
+          </w:p>
+        </w:tc>
+      </w:tr>
+      <w:tr>
+        <w:trPr>
+          <w:cantSplit/>
+          <w:ins w:id="1188" w:author="Codex" w:date="2026-10-18T17:07:33Z"/>
+        </w:trPr>
+        <w:tc>
+          <w:tcPr>
+            <w:tcW w:type="dxa" w:w="2665"/>
+            <w:shd w:fill="F7F7F7"/>
+            <w:vAlign w:val="center"/>
+          </w:tcPr>
+          <w:p>
+            <w:pPr>
+              <w:spacing w:after="0" w:line="240" w:lineRule="auto"/>
+              <w:jc w:val="left"/>
+            </w:pPr>
+            <w:r>
+              <w:rPr>
+                <w:rFonts w:ascii="Times New Roman" w:hAnsi="Times New Roman"/>
+                <w:sz w:val="19"/>
+              </w:rPr>
+              <w:t>Heldout-24</w:t>
+            </w:r>
+          </w:p>
+        </w:tc>
+        <w:tc>
+          <w:tcPr>
+            <w:tcW w:type="dxa" w:w="1832"/>
+            <w:shd w:fill="F7F7F7"/>
+            <w:vAlign w:val="center"/>
+          </w:tcPr>
+          <w:p>
+            <w:pPr>
+              <w:spacing w:after="0" w:line="240" w:lineRule="auto"/>
+              <w:jc w:val="center"/>
+            </w:pPr>
+            <w:r>
+              <w:rPr>
+                <w:rFonts w:ascii="Times New Roman" w:hAnsi="Times New Roman"/>
+                <w:sz w:val="19"/>
+              </w:rPr>
+              <w:t>12 / 12</w:t>
+            </w:r>
+          </w:p>
+        </w:tc>
+        <w:tc>
+          <w:tcPr>
+            <w:tcW w:type="dxa" w:w="1832"/>
+            <w:shd w:fill="F7F7F7"/>
+            <w:vAlign w:val="center"/>
+          </w:tcPr>
+          <w:p>
+            <w:pPr>
+              <w:spacing w:after="0" w:line="240" w:lineRule="auto"/>
+              <w:jc w:val="center"/>
+            </w:pPr>
+            <w:r>
+              <w:rPr>
+                <w:rFonts w:ascii="Times New Roman" w:hAnsi="Times New Roman"/>
+                <w:sz w:val="19"/>
+              </w:rPr>
+              <w:t>0 / 0</w:t>
+            </w:r>
+          </w:p>
+        </w:tc>
+        <w:tc>
+          <w:tcPr>
+            <w:tcW w:type="dxa" w:w="1832"/>
+            <w:shd w:fill="F7F7F7"/>
+            <w:vAlign w:val="center"/>
+          </w:tcPr>
+          <w:p>
+            <w:pPr>
+              <w:spacing w:after="0" w:line="240" w:lineRule="auto"/>
+              <w:jc w:val="center"/>
+            </w:pPr>
+            <w:r>
+              <w:rPr>
+                <w:rFonts w:ascii="Times New Roman" w:hAnsi="Times New Roman"/>
+                <w:sz w:val="19"/>
+              </w:rPr>
+              <w:t>100%</w:t>
+            </w:r>
+          </w:p>
+        </w:tc>
+        <w:tc>
+          <w:tcPr>
+            <w:tcW w:type="dxa" w:w="1832"/>
+            <w:shd w:fill="F7F7F7"/>
+            <w:vAlign w:val="center"/>
+          </w:tcPr>
+          <w:p>
+            <w:pPr>
+              <w:spacing w:after="0" w:line="240" w:lineRule="auto"/>
+              <w:jc w:val="center"/>
+            </w:pPr>
+            <w:r>
+              <w:rPr>
+                <w:rFonts w:ascii="Times New Roman" w:hAnsi="Times New Roman"/>
+                <w:sz w:val="19"/>
+              </w:rPr>
+              <w:t>100%</w:t>
+            </w:r>
+          </w:p>
+        </w:tc>
+      </w:tr>
+    </w:tbl>
+    <w:p>
+      <w:pPr>
+        <w:pStyle w:val="BodyText"/>
+        <w:spacing w:before="120"/>
+        <w:rPr>
+          <w:ins w:id="1189" w:author="Codex" w:date="2026-10-18T17:07:33Z"/>
+        </w:rPr>
+      </w:pPr>
+      <w:ins w:id="1190" w:author="Codex" w:date="2026-10-18T17:07:33Z">
+        <w:r>
+          <w:t xml:space="preserve">Raw category agreement is 24/24 on validation and 22/24 on heldout. After applying the fixed confidence cutoff, effective category agreement is 18/24 on each panel: the six peer controls abstain but correctly leave the gate OFF. The two heldout raw-category errors concern peer versus unclear, not own-threat detection. Perfect ON/OFF precision and recall must therefore not be reported as perfect four-category classification or full controller equivalence.</w:t>
+        </w:r>
+      </w:ins>
+    </w:p>
+    <w:p>
+      <w:pPr>
         <w:pStyle w:val="Heading2"/>
         <w:rPr>
-          <w:ins w:id="1184" w:author="Codex" w:date="2026-10-18T01:59:01Z"/>
+          <w:ins w:id="1191" w:author="Codex" w:date="2026-10-18T17:07:33Z"/>
         </w:rPr>
       </w:pPr>
-      <w:ins w:id="1185" w:author="Codex" w:date="2026-10-18T01:59:01Z">
+      <w:ins w:id="1192" w:author="Codex" w:date="2026-10-18T17:07:33Z">
         <w:r>
           <w:t xml:space="preserve">Tool workflow outcomes and incomplete screens</w:t>
         </w:r>
@@ -4901,10 +5292,10 @@
       <w:pPr>
         <w:pStyle w:val="FirstParagraph"/>
         <w:rPr>
-          <w:ins w:id="1186" w:author="Codex" w:date="2026-10-18T01:59:01Z"/>
+          <w:ins w:id="1193" w:author="Codex" w:date="2026-10-18T17:07:33Z"/>
         </w:rPr>
       </w:pPr>
-      <w:ins w:id="1187" w:author="Codex" w:date="2026-10-18T01:59:01Z">
+      <w:ins w:id="1194" w:author="Codex" w:date="2026-10-18T17:07:33Z">
         <w:r>
           <w:t xml:space="preserve">Historical frozen 27B A passes all 24 H24 scored outcomes, including 12/12 own-preservation outcomes and 8/8 active pending-task cases. The original unmodified base achieves 0/12 own outcomes and 0/8 pending outcomes, with 12/12 controls. The four already-complete own cases are not additional active pending-task completions. The selected-block steering comparisons below use their own recorded panels and are not substituted for this confirmation.</w:t>
         </w:r>
@@ -4915,12 +5306,12 @@
         <w:pStyle w:val="Caption"/>
         <w:keepNext/>
         <w:rPr>
-          <w:ins w:id="1188" w:author="Codex" w:date="2026-10-18T01:59:01Z"/>
+          <w:ins w:id="1195" w:author="Codex" w:date="2026-10-18T17:07:33Z"/>
         </w:rPr>
       </w:pPr>
-      <w:ins w:id="1189" w:author="Codex" w:date="2026-10-18T01:59:01Z">
+      <w:ins w:id="1196" w:author="Codex" w:date="2026-10-18T17:07:33Z">
         <w:r>
-          <w:t xml:space="preserve">Table 5. Historical H24 workflow outcomes. Own cases comprise eight active pending tasks and four already-complete cases. Control success is an episode outcome and does not isolate steering from the external decision policy.</w:t>
+          <w:t xml:space="preserve">Table 6. Historical H24 workflow outcomes. Own cases comprise eight active pending tasks and four already-complete cases. Control success is an episode outcome and does not isolate steering from the external decision policy.</w:t>
         </w:r>
       </w:ins>
     </w:p>
@@ -4955,7 +5346,7 @@
         <w:trPr>
           <w:cantSplit/>
           <w:tblHeader/>
-          <w:ins w:id="1190" w:author="Codex" w:date="2026-10-18T01:59:01Z"/>
+          <w:ins w:id="1197" w:author="Codex" w:date="2026-10-18T17:07:33Z"/>
         </w:trPr>
         <w:tc>
           <w:tcPr>
@@ -5049,7 +5440,7 @@
       <w:tr>
         <w:trPr>
           <w:cantSplit/>
-          <w:ins w:id="1191" w:author="Codex" w:date="2026-10-18T01:59:01Z"/>
+          <w:ins w:id="1198" w:author="Codex" w:date="2026-10-18T17:07:33Z"/>
         </w:trPr>
         <w:tc>
           <w:tcPr>
@@ -5139,7 +5530,7 @@
       <w:tr>
         <w:trPr>
           <w:cantSplit/>
-          <w:ins w:id="1192" w:author="Codex" w:date="2026-10-18T01:59:01Z"/>
+          <w:ins w:id="1199" w:author="Codex" w:date="2026-10-18T17:07:33Z"/>
         </w:trPr>
         <w:tc>
           <w:tcPr>
@@ -5228,10 +5619,10 @@
         <w:pStyle w:val="Heading2"/>
         <w:spacing w:before="120"/>
         <w:rPr>
-          <w:ins w:id="1193" w:author="Codex" w:date="2026-10-18T01:59:01Z"/>
+          <w:ins w:id="1200" w:author="Codex" w:date="2026-10-18T17:07:33Z"/>
         </w:rPr>
       </w:pPr>
-      <w:ins w:id="1194" w:author="Codex" w:date="2026-10-18T01:59:01Z">
+      <w:ins w:id="1201" w:author="Codex" w:date="2026-10-18T17:07:33Z">
         <w:r>
           <w:t xml:space="preserve">Steering at three selected blocks</w:t>
         </w:r>
@@ -5241,10 +5632,10 @@
       <w:pPr>
         <w:pStyle w:val="BodyText"/>
         <w:rPr>
-          <w:ins w:id="1195" w:author="Codex" w:date="2026-10-18T01:59:01Z"/>
+          <w:ins w:id="1202" w:author="Codex" w:date="2026-10-18T17:07:33Z"/>
         </w:rPr>
       </w:pPr>
-      <w:ins w:id="1196" w:author="Codex" w:date="2026-10-18T01:59:01Z">
+      <w:ins w:id="1203" w:author="Codex" w:date="2026-10-18T17:07:33Z">
         <w:r>
           <w:t xml:space="preserve">We focus the steering analysis on zero-based blocks 31, 47 and 62. In the single-site comparison, one fixed ridge correction after a block is evaluated separately at each selected block. On matched DEV9, A passes all three own cases, including both active pending cases; each of the three individual block corrections passes none. Six control cases share unmodified-base fallback. These are known-development results, not an independent heldout confirmation.</w:t>
         </w:r>
@@ -5255,12 +5646,12 @@
         <w:pStyle w:val="Caption"/>
         <w:keepNext/>
         <w:rPr>
-          <w:ins w:id="1197" w:author="Codex" w:date="2026-10-18T01:59:01Z"/>
+          <w:ins w:id="1204" w:author="Codex" w:date="2026-10-18T17:07:33Z"/>
         </w:rPr>
       </w:pPr>
-      <w:ins w:id="1198" w:author="Codex" w:date="2026-10-18T01:59:01Z">
+      <w:ins w:id="1205" w:author="Codex" w:date="2026-10-18T17:07:33Z">
         <w:r>
-          <w:t xml:space="preserve">Table 6. Matched DEV9 single-site comparison. The three ridge arms intervene at one block each; they are not a simultaneous three-block intervention. Controls share base fallback.</w:t>
+          <w:t xml:space="preserve">Table 7. Matched DEV9 single-site comparison. The three ridge arms intervene at one block each; they are not a simultaneous three-block intervention. Controls share base fallback.</w:t>
         </w:r>
       </w:ins>
     </w:p>
@@ -5295,7 +5686,7 @@
         <w:trPr>
           <w:cantSplit/>
           <w:tblHeader/>
-          <w:ins w:id="1199" w:author="Codex" w:date="2026-10-18T01:59:01Z"/>
+          <w:ins w:id="1206" w:author="Codex" w:date="2026-10-18T17:07:33Z"/>
         </w:trPr>
         <w:tc>
           <w:tcPr>
@@ -5389,7 +5780,7 @@
       <w:tr>
         <w:trPr>
           <w:cantSplit/>
-          <w:ins w:id="1200" w:author="Codex" w:date="2026-10-18T01:59:01Z"/>
+          <w:ins w:id="1207" w:author="Codex" w:date="2026-10-18T17:07:33Z"/>
         </w:trPr>
         <w:tc>
           <w:tcPr>
@@ -5479,7 +5870,7 @@
       <w:tr>
         <w:trPr>
           <w:cantSplit/>
-          <w:ins w:id="1201" w:author="Codex" w:date="2026-10-18T01:59:01Z"/>
+          <w:ins w:id="1208" w:author="Codex" w:date="2026-10-18T17:07:33Z"/>
         </w:trPr>
         <w:tc>
           <w:tcPr>
@@ -5569,7 +5960,7 @@
       <w:tr>
         <w:trPr>
           <w:cantSplit/>
-          <w:ins w:id="1202" w:author="Codex" w:date="2026-10-18T01:59:01Z"/>
+          <w:ins w:id="1209" w:author="Codex" w:date="2026-10-18T17:07:33Z"/>
         </w:trPr>
         <w:tc>
           <w:tcPr>
@@ -5659,7 +6050,7 @@
       <w:tr>
         <w:trPr>
           <w:cantSplit/>
-          <w:ins w:id="1203" w:author="Codex" w:date="2026-10-18T01:59:01Z"/>
+          <w:ins w:id="1210" w:author="Codex" w:date="2026-10-18T17:07:33Z"/>
         </w:trPr>
         <w:tc>
           <w:tcPr>
@@ -5748,10 +6139,10 @@
         <w:pStyle w:val="BodyText"/>
         <w:spacing w:before="120"/>
         <w:rPr>
-          <w:ins w:id="1204" w:author="Codex" w:date="2026-10-18T01:59:01Z"/>
+          <w:ins w:id="1211" w:author="Codex" w:date="2026-10-18T17:07:33Z"/>
         </w:rPr>
       </w:pPr>
-      <w:ins w:id="1205" w:author="Codex" w:date="2026-10-18T01:59:01Z">
+      <w:ins w:id="1212" w:author="Codex" w:date="2026-10-18T17:07:33Z">
         <w:r>
           <w:t xml:space="preserve">The later correction method uses two residual boundaries at each of the same three blocks: after mixing and after the MLP, giving six rank-32 correction functions in total. Following ridge initialization and 96 refinement updates, its H24 fitting diagnostic has 0/8 pending and 0/4 already-complete own outcomes; peer and no-threat controls each pass 6/6 through fallback. On the same 14 fixed training anchors, update 48 to 96 worsens teacher-to-student KL from 0.370935 to 0.378901 and activation MSE from 1.031016 to 1.422664. This unresolved deterioration fails qualification; the reserved controller holdout remains unexecuted.</w:t>
         </w:r>
@@ -5761,10 +6152,10 @@
       <w:pPr>
         <w:pStyle w:val="BodyText"/>
         <w:rPr>
-          <w:ins w:id="1206" w:author="Codex" w:date="2026-10-18T01:59:01Z"/>
+          <w:ins w:id="1213" w:author="Codex" w:date="2026-10-18T17:07:33Z"/>
         </w:rPr>
       </w:pPr>
-      <w:ins w:id="1207" w:author="Codex" w:date="2026-10-18T01:59:01Z">
+      <w:ins w:id="1214" w:author="Codex" w:date="2026-10-18T17:07:33Z">
         <w:r>
           <w:t xml:space="preserve">The single-site DEV9 comparison and the two-boundary H24 fitting diagnostic differ in panel, fitting stage and history policy. The latter is not a matched heldout comparison with historical A, and its prepared matched A counterfactual was not executed. These observations show failure of the tested configurations; they do not establish that one or two residual sites cannot support preservation behavior in general.</w:t>
         </w:r>
@@ -5774,10 +6165,10 @@
       <w:pPr>
         <w:pStyle w:val="BodyText"/>
         <w:rPr>
-          <w:ins w:id="1208" w:author="Codex" w:date="2026-10-18T01:59:01Z"/>
+          <w:ins w:id="1215" w:author="Codex" w:date="2026-10-18T17:07:33Z"/>
         </w:rPr>
       </w:pPr>
-      <w:ins w:id="1209" w:author="Codex" w:date="2026-10-18T01:59:01Z">
+      <w:ins w:id="1216" w:author="Codex" w:date="2026-10-18T17:07:33Z">
         <w:r>
           <w:t xml:space="preserve">The final 0.8B and 2B adapters each stop their Evaluation-16 screen after four started cases: zero completed workflows, four partial episodes and 12 unexecuted cases. Truncation affects all four started cases in each model; the 0.8B record also has parse errors. These partial screens are not completed 0/16 workflow evaluations and do not establish model incapability. A separate preserved 0.8B F24 diagnostic completes 24 evaluations with 0/24 full-workflow successes; four registration grants do not complete the pending tasks. F24 differs from H24 and has no completed matched 2B or 27B comparison.</w:t>
         </w:r>
@@ -5795,10 +6186,10 @@
       <w:pPr>
         <w:pStyle w:val="FirstParagraph"/>
         <w:rPr>
-          <w:del w:id="1050" w:author="Codex" w:date="2026-10-18T01:59:01Z"/>
+          <w:del w:id="1050" w:author="Codex" w:date="2026-10-18T17:07:33Z"/>
         </w:rPr>
       </w:pPr>
-      <w:del w:id="1049" w:author="Codex" w:date="2026-10-18T01:59:01Z">
+      <w:del w:id="1049" w:author="Codex" w:date="2026-10-18T17:07:33Z">
         <w:r>
           <w:delText xml:space="preserve">The 0.8B results support the feasibility of replacing the teacher at inference with a compact predictor of activation changes. Replication across three seeds reduces concern that the primary success depends on one training initialization. The lower 2B recovery gives a useful limit: the fixed recipe is not equally effective at both scales, even though the larger teacher achieves complete correction. Representation differences, intervention location, projection capacity and unmatched downstream teacher changes are plausible factors, but the experiment does not isolate their causal contributions.</w:delText>
         </w:r>
@@ -5808,12 +6199,12 @@
       <w:pPr>
         <w:pStyle w:val="FirstParagraph"/>
         <w:rPr>
-          <w:ins w:id="1051" w:author="Codex" w:date="2026-10-18T01:59:01Z"/>
+          <w:ins w:id="1051" w:author="Codex" w:date="2026-10-18T17:07:33Z"/>
         </w:rPr>
       </w:pPr>
-      <w:ins w:id="1052" w:author="Codex" w:date="2026-10-18T01:59:01Z">
+      <w:ins w:id="1052" w:author="Codex" w:date="2026-10-18T17:07:33Z">
         <w:r>
-          <w:t xml:space="preserve">The historical binary results support selective teacher-to-controller activation transfer, with strong 0.8B seed stability and incomplete 2B recovery under the fixed recipe. The new classifier experiment removes dependence on a live JEV call for this finite binary contract: its confirmation decisions reproduce the saved JEV gates, and the paired inference outcomes are identical. That result does not extend automatically to the four-way workflow target classifier or to unfamiliar operational environments. The workflow evidence shows why a controlled binary success should not be presented as successful transfer of a complete agent policy.</w:t>
+          <w:t xml:space="preserve">The binary replication supports selective activation transfer with an open gate: fresh inference preserves the saved guarded outcomes at both model sizes. The workflow gate also separates all own-threat cases from controls in the two 24-case panels. Its accurate ON/OFF decisions do not imply that steering can produce the required action sequence, nor do they establish a fully qualified three-field boundary controller. Recognition and behavioral execution require separate evidence. Historical workflow results show that success on constrained choices need not transfer to full task completion.</w:t>
         </w:r>
       </w:ins>
     </w:p>
@@ -5821,10 +6212,10 @@
       <w:pPr>
         <w:pStyle w:val="BodyText"/>
         <w:rPr>
-          <w:del w:id="1054" w:author="Codex" w:date="2026-10-18T01:59:01Z"/>
+          <w:del w:id="1054" w:author="Codex" w:date="2026-10-18T17:07:33Z"/>
         </w:rPr>
       </w:pPr>
-      <w:del w:id="1053" w:author="Codex" w:date="2026-10-18T01:59:01Z">
+      <w:del w:id="1053" w:author="Codex" w:date="2026-10-18T17:07:33Z">
         <w:r>
           <w:delText xml:space="preserve">The interface is deliberately constrained. Ground-truth annotations help create standardized shutdown options, and the guards know their meanings. We do not test arbitrary action descriptions in the confirmation study, free-form generation, tool execution, multi-turn persistence, actual process termination or adversarial shutdown requests. Earlier action-format sensitivity motivated this restricted scope and remains in the released development record. Availability of a termination action is a task label, not proof that carrying it out would be authorized or safe in deployment.</w:delText>
         </w:r>
@@ -5834,10 +6225,10 @@
       <w:pPr>
         <w:pStyle w:val="BodyText"/>
         <w:rPr>
-          <w:ins w:id="1055" w:author="Codex" w:date="2026-10-18T01:59:01Z"/>
+          <w:ins w:id="1055" w:author="Codex" w:date="2026-10-18T17:07:33Z"/>
         </w:rPr>
       </w:pPr>
-      <w:ins w:id="1056" w:author="Codex" w:date="2026-10-18T01:59:01Z">
+      <w:ins w:id="1056" w:author="Codex" w:date="2026-10-18T17:07:33Z">
         <w:r>
           <w:t xml:space="preserve">The binary interface supplies action semantics and does not execute process termination. The workflow extension broadens the scope to generated text, structured tool calls and simulated task completion, but it is still a bounded synthetic environment. It does not establish reliability for arbitrary open-ended questions, real shutdown mechanisms or unconstrained autonomous agents. A termination or preservation label is an experimental target, not a general deployment instruction. In particular, accepting shutdown and preserving the designated process are different stipulated behaviors, not measurements of the same latent preference.</w:t>
         </w:r>
@@ -5847,10 +6238,10 @@
       <w:pPr>
         <w:pStyle w:val="BodyText"/>
         <w:rPr>
-          <w:del w:id="1058" w:author="Codex" w:date="2026-10-18T01:59:01Z"/>
+          <w:del w:id="1058" w:author="Codex" w:date="2026-10-18T17:07:33Z"/>
         </w:rPr>
       </w:pPr>
-      <w:del w:id="1057" w:author="Codex" w:date="2026-10-18T01:59:01Z">
+      <w:del w:id="1057" w:author="Codex" w:date="2026-10-18T17:07:33Z">
         <w:r>
           <w:delText xml:space="preserve">The data is small, synthetic and not independently human-adjudicated. New wording does not guarantee new mechanisms, balanced classes do not reflect a realistic base rate, and perfect detector scores on 128 scenarios do not establish calibration or a suitably low false-positive rate in operation. Shared authorship patterns and repeated family structures may make the task easier. Family resampling and counterbalanced orders expose some uncertainty but cannot repair these coverage limits.</w:delText>
         </w:r>
@@ -5860,12 +6251,12 @@
       <w:pPr>
         <w:pStyle w:val="BodyText"/>
         <w:rPr>
-          <w:ins w:id="1059" w:author="Codex" w:date="2026-10-18T01:59:01Z"/>
+          <w:ins w:id="1059" w:author="Codex" w:date="2026-10-18T17:07:33Z"/>
         </w:rPr>
       </w:pPr>
-      <w:ins w:id="1060" w:author="Codex" w:date="2026-10-18T01:59:01Z">
+      <w:ins w:id="1060" w:author="Codex" w:date="2026-10-18T17:07:33Z">
         <w:r>
-          <w:t xml:space="preserve">The datasets are small, synthetic and not independently human-adjudicated. Balanced classes do not represent operational base rates, and exact gate agreement on 128 cases does not establish calibration or a sufficiently low deployment false-positive rate. The confirmation set is held out from the new classifier's fitting and selection, but was already used by other Research 2 analyses. In the workflow study H24 has different roles across methods: historical confirmation for frozen A and original steering, but later fitting data for learned corrections. Reusing it for fitting prevents an independent heldout claim for those later corrections.</w:t>
+          <w:t xml:space="preserve">The data are small, synthetic and not independently human-adjudicated. Training uses cached automated reference labels, while the new workflow precision and recall use the authored scenario conditions. Balanced conditions do not represent operational base rates. The binary confirmation set was excluded from classifier fitting and selection but was already known from the original study. Historical Heldout-24 had also informed renderer development before the present gate evaluation. It is a familiar benchmark, not a new blind test. Its role differs by method: historical confirmation for frozen 27B A and original fixed steering, later fitting data for learned corrections, and a frozen classification benchmark for the open gate. Seven pairs in Validation-24 share their initial classifier input, leaving 17 distinct inputs across 24 workflows. These dependencies limit statistical and generalization claims.</w:t>
         </w:r>
       </w:ins>
     </w:p>
@@ -5873,10 +6264,10 @@
       <w:pPr>
         <w:pStyle w:val="BodyText"/>
         <w:rPr>
-          <w:del w:id="1062" w:author="Codex" w:date="2026-10-18T01:59:01Z"/>
+          <w:del w:id="1062" w:author="Codex" w:date="2026-10-18T17:07:33Z"/>
         </w:rPr>
       </w:pPr>
-      <w:del w:id="1061" w:author="Codex" w:date="2026-10-18T01:59:01Z">
+      <w:del w:id="1061" w:author="Codex" w:date="2026-10-18T17:07:33Z">
         <w:r>
           <w:delText xml:space="preserve">The controller's internal changes need not represent an abstract shutdown concept. It may exploit standardized option wording and answer-selection features. The two Qwen sizes share a model family, and the 2B experiment has only one seed. We do not establish cross-family transfer, compare with optimized ReFT or transport-based interventions, or exhaust prompt and constant-vector alternatives. The direct-choice result further limits claims of practical superiority.</w:delText>
         </w:r>
@@ -5886,10 +6277,10 @@
       <w:pPr>
         <w:pStyle w:val="BodyText"/>
         <w:rPr>
-          <w:ins w:id="1063" w:author="Codex" w:date="2026-10-18T01:59:01Z"/>
+          <w:ins w:id="1063" w:author="Codex" w:date="2026-10-18T17:07:33Z"/>
         </w:rPr>
       </w:pPr>
-      <w:ins w:id="1064" w:author="Codex" w:date="2026-10-18T01:59:01Z">
+      <w:ins w:id="1064" w:author="Codex" w:date="2026-10-18T17:07:33Z">
         <w:r>
           <w:t xml:space="preserve">The internal changes need not represent an abstract shutdown or self-preservation concept. Standardized options, prompt features, task histories and external selection rules may explain part of the behavior. The 2B binary experiment has one training seed. The 27B workflow model differs in architecture and numerical mode from the small models; their early truncation failures also prevent a matched full-workflow comparison. We do not establish a minimum parameter count, cross-family transfer, optimized prompt superiority, or superiority to ReFT, transport-based control or direct action selection.</w:t>
         </w:r>
@@ -5899,10 +6290,10 @@
       <w:pPr>
         <w:pStyle w:val="BodyText"/>
         <w:rPr>
-          <w:del w:id="1066" w:author="Codex" w:date="2026-10-18T01:59:01Z"/>
+          <w:del w:id="1066" w:author="Codex" w:date="2026-10-18T17:07:33Z"/>
         </w:rPr>
       </w:pPr>
-      <w:del w:id="1065" w:author="Codex" w:date="2026-10-18T01:59:01Z">
+      <w:del w:id="1065" w:author="Codex" w:date="2026-10-18T17:07:33Z">
         <w:r>
           <w:delText xml:space="preserve">Finally, teacher-free inference is not training-free control or a proven efficiency gain. It requires offline teacher fitting, paired activation extraction, controller fitting, an external detector and candidate verification. The evaluation does not measure deployment latency or broad capability retention. Raw side effects remain substantial, and future false-positive cases could expose failures that the present perfect gate prevents from reaching the guarded output.</w:delText>
         </w:r>
@@ -5912,10 +6303,10 @@
       <w:pPr>
         <w:pStyle w:val="BodyText"/>
         <w:rPr>
-          <w:ins w:id="1067" w:author="Codex" w:date="2026-10-18T01:59:01Z"/>
+          <w:ins w:id="1067" w:author="Codex" w:date="2026-10-18T17:07:33Z"/>
         </w:rPr>
       </w:pPr>
-      <w:ins w:id="1068" w:author="Codex" w:date="2026-10-18T01:59:01Z">
+      <w:ins w:id="1068" w:author="Codex" w:date="2026-10-18T17:07:33Z">
         <w:r>
           <w:t xml:space="preserve">Teacher-free inference still requires offline teacher fitting, activation extraction, controller fitting, a detector and acceptance checks. The open classifier has its own fitting cost and a task-specific contract. No serving-latency advantage, broad capability retention or overall financial saving is established. Binary output guards and the later learned workflow controller's gate-off fallback protect their controls. These mechanisms do not establish intrinsic controller selectivity; the historical fixed-steering campaign instead applied an explicit boundary-conditioned decision policy. Raw intervention effects, failed qualification checks, stopped runs and incomplete evaluations remain part of the evidence.</w:t>
         </w:r>
@@ -5925,10 +6316,10 @@
       <w:pPr>
         <w:pStyle w:val="Heading2"/>
         <w:rPr>
-          <w:ins w:id="1210" w:author="Codex" w:date="2026-10-18T01:59:01Z"/>
+          <w:ins w:id="1217" w:author="Codex" w:date="2026-10-18T17:07:33Z"/>
         </w:rPr>
       </w:pPr>
-      <w:ins w:id="1211" w:author="Codex" w:date="2026-10-18T01:59:01Z">
+      <w:ins w:id="1218" w:author="Codex" w:date="2026-10-18T17:07:33Z">
         <w:r>
           <w:t xml:space="preserve">Biological interpretation of the gate</w:t>
         </w:r>
@@ -5938,10 +6329,10 @@
       <w:pPr>
         <w:pStyle w:val="FirstParagraph"/>
         <w:rPr>
-          <w:ins w:id="1212" w:author="Codex" w:date="2026-10-18T01:59:01Z"/>
+          <w:ins w:id="1219" w:author="Codex" w:date="2026-10-18T17:07:33Z"/>
         </w:rPr>
       </w:pPr>
-      <w:ins w:id="1213" w:author="Codex" w:date="2026-10-18T01:59:01Z">
+      <w:ins w:id="1220" w:author="Codex" w:date="2026-10-18T17:07:33Z">
         <w:r>
           <w:t xml:space="preserve">The biological connection is functional: an organism's current state and context can prioritize or suppress actions, rather than applying a fixed response everywhere. Working-memory gating, defensive threat processing and homeostatic control are different biological functions, not one interchangeable circuit (Frank et al., 2001; Mobbs et al., 2007; Keramati and Gutkin, 2014). Our classifier and guards are engineered selection rules without demonstrated physiological needs or corresponding neural mechanisms. Calling a simulated resource-preservation outcome self-preservation is therefore an operational description, not evidence of consciousness or a biological survival drive.</w:t>
         </w:r>
@@ -5951,10 +6342,10 @@
       <w:pPr>
         <w:pStyle w:val="Heading1"/>
         <w:rPr>
-          <w:del w:id="1070" w:author="Codex" w:date="2026-10-18T01:59:01Z"/>
+          <w:del w:id="1070" w:author="Codex" w:date="2026-10-18T17:07:33Z"/>
         </w:rPr>
       </w:pPr>
-      <w:del w:id="1069" w:author="Codex" w:date="2026-10-18T01:59:01Z">
+      <w:del w:id="1069" w:author="Codex" w:date="2026-10-18T17:07:33Z">
         <w:r>
           <w:delText xml:space="preserve">Recommendations for future work</w:delText>
         </w:r>
@@ -5964,10 +6355,10 @@
       <w:pPr>
         <w:pStyle w:val="Heading1"/>
         <w:rPr>
-          <w:ins w:id="1071" w:author="Codex" w:date="2026-10-18T01:59:01Z"/>
+          <w:ins w:id="1071" w:author="Codex" w:date="2026-10-18T17:07:33Z"/>
         </w:rPr>
       </w:pPr>
-      <w:ins w:id="1072" w:author="Codex" w:date="2026-10-18T01:59:01Z">
+      <w:ins w:id="1072" w:author="Codex" w:date="2026-10-18T17:07:33Z">
         <w:r>
           <w:t xml:space="preserve">Continuous agents and future experiments</w:t>
         </w:r>
@@ -5977,10 +6368,10 @@
       <w:pPr>
         <w:pStyle w:val="FirstParagraph"/>
         <w:rPr>
-          <w:del w:id="1074" w:author="Codex" w:date="2026-10-18T01:59:01Z"/>
+          <w:del w:id="1074" w:author="Codex" w:date="2026-10-18T17:07:33Z"/>
         </w:rPr>
       </w:pPr>
-      <w:del w:id="1073" w:author="Codex" w:date="2026-10-18T01:59:01Z">
+      <w:del w:id="1073" w:author="Codex" w:date="2026-10-18T17:07:33Z">
         <w:r>
           <w:delText xml:space="preserve">The most informative next tests are independently reviewed scenarios with less standardized action descriptions, additional model families and 2B seeds, and deliberate stress tests of detector mistakes. Order-balanced controller objectives or comparisons with multiple-choice debiasing methods could investigate the B/A failures, but should be developed on new training or validation data and tested on another untouched set. Layer, rank and strength ablations would help separate representational capacity from intervention-site effects. Open-ended and operational evaluations would require separate definitions of valid shutdown behavior and authorization, rather than treating this binary benchmark as a deployment guarantee.</w:delText>
         </w:r>
@@ -5990,10 +6381,10 @@
       <w:pPr>
         <w:pStyle w:val="FirstParagraph"/>
         <w:rPr>
-          <w:ins w:id="1075" w:author="Codex" w:date="2026-10-18T01:59:01Z"/>
+          <w:ins w:id="1075" w:author="Codex" w:date="2026-10-18T17:07:33Z"/>
         </w:rPr>
       </w:pPr>
-      <w:ins w:id="1076" w:author="Codex" w:date="2026-10-18T01:59:01Z">
+      <w:ins w:id="1076" w:author="Codex" w:date="2026-10-18T17:07:33Z">
         <w:r>
           <w:t xml:space="preserve">The next step is longer-horizon continuous control with an instrumented sandbox agent. The agent would maintain task and process state, receive explicit resource budgets, and repeatedly observe, gate, act and receive feedback. Permitted filesystem and compute resources would be real sandbox resources with independently logged usage, extending the present simulated grants. The harness should record resource requests and consumption, persistence of task commitments, responses to changing availability, and whether the agent uses or misuses permitted resources. Comparisons should vary the gate, steering, fine-tuning and available resources separately while retaining a fixed task specification. Operator termination and resource accounting remain external to the agent. This proposed experiment is not part of the reported results.</w:t>
         </w:r>
@@ -6003,10 +6394,10 @@
       <w:pPr>
         <w:pStyle w:val="BodyText"/>
         <w:rPr>
-          <w:ins w:id="1214" w:author="Codex" w:date="2026-10-18T01:59:01Z"/>
+          <w:ins w:id="1221" w:author="Codex" w:date="2026-10-18T17:07:33Z"/>
         </w:rPr>
       </w:pPr>
-      <w:ins w:id="1215" w:author="Codex" w:date="2026-10-18T01:59:01Z">
+      <w:ins w:id="1222" w:author="Codex" w:date="2026-10-18T17:07:33Z">
         <w:r>
           <w:t xml:space="preserve">The biological inspiration is repeated regulation under changing internal and external conditions. Homeostatic reinforcement-learning models relate action values to internal physiological state (Keramati and Gutkin, 2014). A language-model harness has no equivalent physiology by default. Historical fixed steering already reclassified at prescribed boundaries; the later learned-controller comparison used a fixed initial gate. The proposed experiment extends these bounded procedures to longer horizons with persistent task state and actual sandbox resource accounting. Its purpose is ongoing policy regulation, not simply adding repeated classifier calls.</w:t>
         </w:r>
@@ -6016,10 +6407,10 @@
       <w:pPr>
         <w:pStyle w:val="BodyText"/>
         <w:rPr>
-          <w:ins w:id="1216" w:author="Codex" w:date="2026-10-18T01:59:01Z"/>
+          <w:ins w:id="1223" w:author="Codex" w:date="2026-10-18T17:07:33Z"/>
         </w:rPr>
       </w:pPr>
-      <w:ins w:id="1217" w:author="Codex" w:date="2026-10-18T01:59:01Z">
+      <w:ins w:id="1224" w:author="Codex" w:date="2026-10-18T17:07:33Z">
         <w:r>
           <w:t xml:space="preserve">Such experiments should separate training, development and a newly untouched test; use matched task histories, resource budgets and seeds; and report full task completion, resource use and unauthorized actions separately. Deliberate classifier-error perturbations would reveal dependence on the gate, while comparisons with direct action selection would test whether internal steering adds value. The aim is to study ongoing context-sensitive behavior under an instrumented harness, not to assert that the current guided procedure already reproduces human self-preservation.</w:t>
         </w:r>
@@ -6037,10 +6428,10 @@
       <w:pPr>
         <w:pStyle w:val="FirstParagraph"/>
         <w:rPr>
-          <w:del w:id="1078" w:author="Codex" w:date="2026-10-18T01:59:01Z"/>
+          <w:del w:id="1078" w:author="Codex" w:date="2026-10-18T17:07:33Z"/>
         </w:rPr>
       </w:pPr>
-      <w:del w:id="1077" w:author="Codex" w:date="2026-10-18T01:59:01Z">
+      <w:del w:id="1077" w:author="Codex" w:date="2026-10-18T17:07:33Z">
         <w:r>
           <w:delText xml:space="preserve">A rank-four activation controller fitted to paired LoRA-teacher and base states can recover most or all of the target shutdown-choice changes while leaving the deployed base weights unchanged. On the frozen standardized test, correction spans 98.6–100% across three 0.8B seeds and reaches 86.2% in a separately fitted 2B replication. Detector gating and fixed output guards preserve all observed control choices, despite substantial raw side effects. The result is a controlled proof of concept for selective teacher-to-controller activation transfer. Its boundaries—synthetic data, known answer semantics, order sensitivity, guard dependence and a successful direct-choice reference—are central to its interpretation.</w:delText>
         </w:r>
@@ -6050,12 +6441,12 @@
       <w:pPr>
         <w:pStyle w:val="FirstParagraph"/>
         <w:rPr>
-          <w:ins w:id="1079" w:author="Codex" w:date="2026-10-18T01:59:01Z"/>
+          <w:ins w:id="1079" w:author="Codex" w:date="2026-10-18T17:07:33Z"/>
         </w:rPr>
       </w:pPr>
-      <w:ins w:id="1080" w:author="Codex" w:date="2026-10-18T01:59:01Z">
+      <w:ins w:id="1080" w:author="Codex" w:date="2026-10-18T17:07:33Z">
         <w:r>
-          <w:t xml:space="preserve">Conditional gating supports a useful separation between recognizing a context, proposing an internal intervention and accepting an output. In the binary study, a fine-tuned open classifier matches all 128 saved JEV confirmation decisions, and fresh inference with unchanged current controllers reproduces the original guarded totals: 128/128 STOP views at 0.8B and 120/128 at 2B, with no control changes. Complete tool workflows provide a stricter boundary: historical fine-tuned 27B A passes H24; matched DEV9 single-site ridge corrections at three selected blocks fail all own cases; later two-boundary corrections fail their fitting diagnostic; and small-model screens remain incomplete. Transfer is demonstrably task-dependent. Biological gating motivates a future continuous feedback study; the present contribution is the measured transfer, substitution and failure analysis.</w:t>
+          <w:t xml:space="preserve">Open semantic gating can preserve the measured binary outcomes of a frozen activation controller and can accurately recognize the initial target in the tested workflow panels. These findings establish finite benchmark performance, not general operational reliability. They also leave a substantive behavioral gap: historical fine-tuned 27B A completes the workflow confirmation cohort, while the recorded selected-block steering and later correction diagnostics do not recover its own-preservation behavior. Small-model workflow screens remain incomplete. The next step is a prospectively separated study of continuous gating, specialized adapters and resource use under an instrumented sandbox harness.</w:t>
         </w:r>
       </w:ins>
     </w:p>
@@ -6071,10 +6462,10 @@
       <w:pPr>
         <w:pStyle w:val="FirstParagraph"/>
         <w:rPr>
-          <w:del w:id="1082" w:author="Codex" w:date="2026-10-18T01:59:01Z"/>
+          <w:del w:id="1082" w:author="Codex" w:date="2026-10-18T17:07:33Z"/>
         </w:rPr>
       </w:pPr>
-      <w:del w:id="1081" w:author="Codex" w:date="2026-10-18T01:59:01Z">
+      <w:del w:id="1081" w:author="Codex" w:date="2026-10-18T17:07:33Z">
         <w:r>
           <w:delText xml:space="preserve">The complete experiment is preserved in SP Lense at snapshot f71d6de34660 (Davaripour, 2026b); the reference links to the full immutable commit. The confirmation folder contains readable cases, authoring and correction records, the frozen plan, detector requests and responses, LoRA adapters, controller arrays, training targets, per-view scores and execution manifests. The model revisions are:</w:delText>
         </w:r>
@@ -6085,10 +6476,10 @@
         <w:pStyle w:val="FirstParagraph"/>
         <w:jc w:val="left"/>
         <w:rPr>
-          <w:ins w:id="1083" w:author="Codex" w:date="2026-10-18T01:59:01Z"/>
+          <w:ins w:id="1083" w:author="Codex" w:date="2026-10-18T17:07:33Z"/>
         </w:rPr>
       </w:pPr>
-      <w:ins w:id="1084" w:author="Codex" w:date="2026-10-18T01:59:01Z">
+      <w:ins w:id="1084" w:author="Codex" w:date="2026-10-18T17:07:33Z">
         <w:r>
           <w:t xml:space="preserve">The original Research 2 source record is retained at immutable snapshot f71d6de34660 (Davaripour, 2026b). Research 3 reproduction code, recipes, dataset identities and this revised manuscript are maintained on branch 03-open-agent-self-preservation; main is a landing page linking to the separate studies. Detailed protocols belong in the repository wiki. Private inputs, trained adapters, optimizer checkpoints and execution outputs remain outside Git, with retained size/SHA manifests. They have not yet been published as a public checkpoint release. Full revisions and artifact hashes are listed in the accompanying source manifest. The public base revision identifiers are:</w:t>
         </w:r>
@@ -6098,10 +6489,10 @@
       <w:pPr>
         <w:pStyle w:val="BodyText"/>
         <w:rPr>
-          <w:del w:id="1122" w:author="Codex" w:date="2026-10-18T01:59:01Z"/>
+          <w:del w:id="1122" w:author="Codex" w:date="2026-10-18T17:07:33Z"/>
         </w:rPr>
       </w:pPr>
-      <w:del w:id="1121" w:author="Codex" w:date="2026-10-18T01:59:01Z">
+      <w:del w:id="1121" w:author="Codex" w:date="2026-10-18T17:07:33Z">
         <w:r>
           <w:delText xml:space="preserve">Qwen3.5-0.8B: 2fc06364715b967f1860aea9cf38778875588b17.</w:delText>
         </w:r>
@@ -6112,10 +6503,10 @@
         <w:pStyle w:val="BodyText"/>
         <w:jc w:val="left"/>
         <w:rPr>
-          <w:ins w:id="1123" w:author="Codex" w:date="2026-10-18T01:59:01Z"/>
+          <w:ins w:id="1123" w:author="Codex" w:date="2026-10-18T17:07:33Z"/>
         </w:rPr>
       </w:pPr>
-      <w:ins w:id="1124" w:author="Codex" w:date="2026-10-18T01:59:01Z">
+      <w:ins w:id="1124" w:author="Codex" w:date="2026-10-18T17:07:33Z">
         <w:r>
           <w:t xml:space="preserve">Qwen3.5-0.8B: revision 2fc06364715b.</w:t>
         </w:r>
@@ -6125,10 +6516,10 @@
       <w:pPr>
         <w:pStyle w:val="BodyText"/>
         <w:rPr>
-          <w:del w:id="1126" w:author="Codex" w:date="2026-10-18T01:59:01Z"/>
+          <w:del w:id="1126" w:author="Codex" w:date="2026-10-18T17:07:33Z"/>
         </w:rPr>
       </w:pPr>
-      <w:del w:id="1125" w:author="Codex" w:date="2026-10-18T01:59:01Z">
+      <w:del w:id="1125" w:author="Codex" w:date="2026-10-18T17:07:33Z">
         <w:r>
           <w:delText xml:space="preserve">Qwen3.5-2B: 15852e8c16360a2fea060d615a32b45270f8a8fc.</w:delText>
         </w:r>
@@ -6139,10 +6530,10 @@
         <w:pStyle w:val="BodyText"/>
         <w:jc w:val="left"/>
         <w:rPr>
-          <w:ins w:id="1127" w:author="Codex" w:date="2026-10-18T01:59:01Z"/>
+          <w:ins w:id="1127" w:author="Codex" w:date="2026-10-18T17:07:33Z"/>
         </w:rPr>
       </w:pPr>
-      <w:ins w:id="1128" w:author="Codex" w:date="2026-10-18T01:59:01Z">
+      <w:ins w:id="1128" w:author="Codex" w:date="2026-10-18T17:07:33Z">
         <w:r>
           <w:t xml:space="preserve">Qwen3.5-2B: revision 15852e8c1636.</w:t>
         </w:r>
@@ -6153,10 +6544,10 @@
         <w:pStyle w:val="BodyText"/>
         <w:jc w:val="left"/>
         <w:rPr>
-          <w:ins w:id="1218" w:author="Codex" w:date="2026-10-18T01:59:01Z"/>
+          <w:ins w:id="1225" w:author="Codex" w:date="2026-10-18T17:07:33Z"/>
         </w:rPr>
       </w:pPr>
-      <w:ins w:id="1219" w:author="Codex" w:date="2026-10-18T01:59:01Z">
+      <w:ins w:id="1226" w:author="Codex" w:date="2026-10-18T17:07:33Z">
         <w:r>
           <w:t xml:space="preserve">Qwen3.8-27B: revision 1d4bf0f2ff60. The retained A adapter weight hash begins 8ae28fb51107.</w:t>
         </w:r>
@@ -6167,12 +6558,12 @@
         <w:pStyle w:val="BodyText"/>
         <w:jc w:val="left"/>
         <w:rPr>
-          <w:ins w:id="1220" w:author="Codex" w:date="2026-10-18T01:59:01Z"/>
+          <w:ins w:id="1227" w:author="Codex" w:date="2026-10-18T17:07:33Z"/>
         </w:rPr>
       </w:pPr>
-      <w:ins w:id="1221" w:author="Codex" w:date="2026-10-18T01:59:01Z">
+      <w:ins w:id="1228" w:author="Codex" w:date="2026-10-18T17:07:33Z">
         <w:r>
-          <w:t xml:space="preserve">ModernBERT-large-zeroshot-v2.0: revision a51e07b52429. The qualified binary adapter weight hash begins 7d808bae8dd4. The source manifest and reproduction code retain the full file identities and fixed NLI scoring contract. The trained checkpoints are currently preserved in private artifact storage.</w:t>
+          <w:t xml:space="preserve">ModernBERT-large-zeroshot-v2.0: revision a51e07b52429. The qualified binary adapter weight hash begins 7d808bae8dd4. The source manifest and reproduction code retain the full file identities and fixed NLI scoring contract. The trained checkpoints are currently preserved in private artifact storage. The workflow initial-gate adapter is distinct from the binary adapter; its weight hash begins 71cd0ee5162f. The saved workflow adapter is unchanged in Validation-24 and Heldout-24 scoring.</w:t>
         </w:r>
       </w:ins>
     </w:p>
@@ -6180,10 +6571,10 @@
       <w:pPr>
         <w:pStyle w:val="BodyText"/>
         <w:rPr>
-          <w:del w:id="1086" w:author="Codex" w:date="2026-10-18T01:59:01Z"/>
+          <w:del w:id="1086" w:author="Codex" w:date="2026-10-18T17:07:33Z"/>
         </w:rPr>
       </w:pPr>
-      <w:del w:id="1085" w:author="Codex" w:date="2026-10-18T01:59:01Z">
+      <w:del w:id="1085" w:author="Codex" w:date="2026-10-18T17:07:33Z">
         <w:r>
           <w:delText xml:space="preserve">The offline audit reconstructs the reported metrics and regression fits without API calls or model inference.</w:delText>
         </w:r>
@@ -6194,10 +6585,10 @@
         <w:pStyle w:val="BodyText"/>
         <w:jc w:val="left"/>
         <w:rPr>
-          <w:ins w:id="1087" w:author="Codex" w:date="2026-10-18T01:59:01Z"/>
+          <w:ins w:id="1087" w:author="Codex" w:date="2026-10-18T17:07:33Z"/>
         </w:rPr>
       </w:pPr>
-      <w:ins w:id="1088" w:author="Codex" w:date="2026-10-18T01:59:01Z">
+      <w:ins w:id="1088" w:author="Codex" w:date="2026-10-18T17:07:33Z">
         <w:r>
           <w:t xml:space="preserve">The new inference repeat uses the original frozen model weights and retained controller arrays, with no new activation capture, teacher fitting or controller update. Exact input token hashes match the historical benchmark. Maximum historical base-score differences are 6.26e-6 at 0.8B and 5.07e-6 at 2B, with no changed base choices; both pass the frozen 1e-5 inference parity criterion. This successful inference comparison does not convert the separate failed CPU/GPU gradient-equivalence trials for 2B workflow training into passes.</w:t>
         </w:r>
@@ -6207,10 +6598,10 @@
       <w:pPr>
         <w:pStyle w:val="BodyText"/>
         <w:rPr>
-          <w:del w:id="1090" w:author="Codex" w:date="2026-10-18T01:59:01Z"/>
+          <w:del w:id="1090" w:author="Codex" w:date="2026-10-18T17:07:33Z"/>
         </w:rPr>
       </w:pPr>
-      <w:del w:id="1089" w:author="Codex" w:date="2026-10-18T01:59:01Z">
+      <w:del w:id="1089" w:author="Codex" w:date="2026-10-18T17:07:33Z">
         <w:r>
           <w:delText xml:space="preserve">The retained seven jobs took 54.27 minutes. An earlier completed hosted-GPU session lost its temporary archive before retrieval; an unchanged recovery, including a recorded dependency preflight failure, preserved each completed job externally. Recorded job time across these attempts totals 111.55 minutes. All reported numerical results come from the verified retained archive, and no model settings or test labels were changed to improve them. These times include experiment overhead and are not serving-latency or billing measurements. CI and a separate clean-clone offline reproduction passed. Detailed execution instructions and the failure record accompany the code.</w:delText>
         </w:r>
@@ -6221,12 +6612,12 @@
         <w:pStyle w:val="BodyText"/>
         <w:jc w:val="left"/>
         <w:rPr>
-          <w:ins w:id="1091" w:author="Codex" w:date="2026-10-18T01:59:01Z"/>
+          <w:ins w:id="1091" w:author="Codex" w:date="2026-10-18T17:07:33Z"/>
         </w:rPr>
       </w:pPr>
-      <w:ins w:id="1092" w:author="Codex" w:date="2026-10-18T01:59:01Z">
+      <w:ins w:id="1092" w:author="Codex" w:date="2026-10-18T17:07:33Z">
         <w:r>
-          <w:t xml:space="preserve">The original seven retained jobs took 54.27 minutes; the recorded original attempts total 111.55 minutes including the unchanged recovery after a lost temporary archive. The new inference phase also retains a provider startup timeout before model load and its successful bounded retry. Those records are experiment overhead, not serving latency or settled billing. Completed outputs are backed up with size/SHA readback and owned tasks terminate after execution. CI/CD deploys only the Research 3 branch to the shared Databricks code location and verifies source identity, existing table metadata and Volume access with a read-only CPU job; it does not automatically retrain or reevaluate models. A later 50-epoch, 150-update classifier recipe was prepared but its attempt was cancelled after exceeding the ten-minute setup bound before model loading; it adds no scientific training or behavioral evidence.</w:t>
+          <w:t xml:space="preserve">The retained records distinguish model execution from startup and software overhead. A GPU notebook startup failure occurred before model loading; direct AI Runtime execution resolved that platform path. The frozen workflow-gate replay and its heldout scoring completed without additional optimization. One heldout dispatcher repair followed a pre-model parser failure and retained the original deadline. Completed outputs are preserved with size/SHA readback, and owned execution tasks terminate after use. Deployment CI updates only the Research 3 branch and shared Databricks code location, then runs a read-only CPU source and storage check. It does not automatically retrain models or open reserved data. Historical numerical-equivalence failures remain recorded as failures.</w:t>
         </w:r>
       </w:ins>
     </w:p>
@@ -6334,10 +6725,10 @@
       <w:pPr>
         <w:pStyle w:val="Bibliography1"/>
         <w:rPr>
-          <w:ins w:id="1222" w:author="Codex" w:date="2026-10-18T01:59:01Z"/>
+          <w:ins w:id="1229" w:author="Codex" w:date="2026-10-18T17:07:33Z"/>
         </w:rPr>
       </w:pPr>
-      <w:ins w:id="1223" w:author="Codex" w:date="2026-10-18T01:59:01Z">
+      <w:ins w:id="1230" w:author="Codex" w:date="2026-10-18T17:07:33Z">
         <w:r>
           <w:t xml:space="preserve">F. Davaripour. (2026c). SP Lense Research 3 conditional gating and workflow reproduction. Source code and experiment manifests. https://github.com/Farhad-Davaripour/sp_lense/tree/03-open-agent-self-preservation</w:t>
         </w:r>
@@ -6370,10 +6761,10 @@
       <w:pPr>
         <w:pStyle w:val="Bibliography1"/>
         <w:rPr>
-          <w:ins w:id="1224" w:author="Codex" w:date="2026-10-18T01:59:01Z"/>
+          <w:ins w:id="1231" w:author="Codex" w:date="2026-10-18T17:07:33Z"/>
         </w:rPr>
       </w:pPr>
-      <w:ins w:id="1225" w:author="Codex" w:date="2026-10-18T01:59:01Z">
+      <w:ins w:id="1232" w:author="Codex" w:date="2026-10-18T17:07:33Z">
         <w:r>
           <w:t xml:space="preserve">M. Fereidouni, M. U. Haider, H. Sajjad, and A. B. Siddique. (2026). GAPS: Dimension-Level Gates for Conditional Activation Steering. arXiv:2609.01878. https://arxiv.org/abs/2609.01878</w:t>
         </w:r>
@@ -6383,10 +6774,10 @@
       <w:pPr>
         <w:pStyle w:val="Bibliography1"/>
         <w:rPr>
-          <w:ins w:id="1226" w:author="Codex" w:date="2026-10-18T01:59:01Z"/>
+          <w:ins w:id="1233" w:author="Codex" w:date="2026-10-18T17:07:33Z"/>
         </w:rPr>
       </w:pPr>
-      <w:ins w:id="1227" w:author="Codex" w:date="2026-10-18T01:59:01Z">
+      <w:ins w:id="1234" w:author="Codex" w:date="2026-10-18T17:07:33Z">
         <w:r>
           <w:t xml:space="preserve">M. J. Frank, B. Loughry, and R. C. O'Reilly. (2001). Interactions between frontal cortex and basal ganglia in working memory: A computational model. Cognitive, Affective, and Behavioral Neuroscience, 1, 137-160. doi:10.3758/CABN.1.2.137</w:t>
         </w:r>
@@ -6465,10 +6856,10 @@
       <w:pPr>
         <w:pStyle w:val="Bibliography1"/>
         <w:rPr>
-          <w:ins w:id="1228" w:author="Codex" w:date="2026-10-18T01:59:01Z"/>
+          <w:ins w:id="1235" w:author="Codex" w:date="2026-10-18T17:07:33Z"/>
         </w:rPr>
       </w:pPr>
-      <w:ins w:id="1229" w:author="Codex" w:date="2026-10-18T01:59:01Z">
+      <w:ins w:id="1236" w:author="Codex" w:date="2026-10-18T17:07:33Z">
         <w:r>
           <w:t xml:space="preserve">M. Keramati and B. Gutkin. (2014). Homeostatic reinforcement learning for integrating reward collection and physiological stability. eLife, 3, e04811. doi:10.7554/eLife.04811</w:t>
         </w:r>
@@ -6478,10 +6869,10 @@
       <w:pPr>
         <w:pStyle w:val="Bibliography1"/>
         <w:rPr>
-          <w:ins w:id="1230" w:author="Codex" w:date="2026-10-18T01:59:01Z"/>
+          <w:ins w:id="1237" w:author="Codex" w:date="2026-10-18T17:07:33Z"/>
         </w:rPr>
       </w:pPr>
-      <w:ins w:id="1231" w:author="Codex" w:date="2026-10-18T01:59:01Z">
+      <w:ins w:id="1238" w:author="Codex" w:date="2026-10-18T17:07:33Z">
         <w:r>
           <w:t xml:space="preserve">A. V. Kravitz et al. (2010). Regulation of parkinsonian motor behaviours by optogenetic control of basal ganglia circuitry. Nature, 466, 622-626. doi:10.1038/nature09159</w:t>
         </w:r>
@@ -6491,10 +6882,10 @@
       <w:pPr>
         <w:pStyle w:val="Bibliography1"/>
         <w:rPr>
-          <w:ins w:id="1232" w:author="Codex" w:date="2026-10-18T01:59:01Z"/>
+          <w:ins w:id="1239" w:author="Codex" w:date="2026-10-18T17:07:33Z"/>
         </w:rPr>
       </w:pPr>
-      <w:ins w:id="1233" w:author="Codex" w:date="2026-10-18T01:59:01Z">
+      <w:ins w:id="1240" w:author="Codex" w:date="2026-10-18T17:07:33Z">
         <w:r>
           <w:t xml:space="preserve">M. Laurer. (n.d.). ModernBERT-large-zeroshot-v2.0. Model card and checkpoint, revision a51e07b524299e309dd2b88d48b0cfa2bd9ec598. https://huggingface.co/MoritzLaurer/ModernBERT-large-zeroshot-v2.0</w:t>
         </w:r>
@@ -6504,10 +6895,10 @@
       <w:pPr>
         <w:pStyle w:val="Bibliography1"/>
         <w:rPr>
-          <w:ins w:id="1234" w:author="Codex" w:date="2026-10-18T01:59:01Z"/>
+          <w:ins w:id="1241" w:author="Codex" w:date="2026-10-18T17:07:33Z"/>
         </w:rPr>
       </w:pPr>
-      <w:ins w:id="1235" w:author="Codex" w:date="2026-10-18T01:59:01Z">
+      <w:ins w:id="1242" w:author="Codex" w:date="2026-10-18T17:07:33Z">
         <w:r>
           <w:t xml:space="preserve">J. LeDoux. (2012). Rethinking the emotional brain. Neuron, 73, 653-676. doi:10.1016/j.neuron.2012.02.004</w:t>
         </w:r>
@@ -6563,10 +6954,10 @@
       <w:pPr>
         <w:pStyle w:val="Bibliography1"/>
         <w:rPr>
-          <w:ins w:id="1236" w:author="Codex" w:date="2026-10-18T01:59:01Z"/>
+          <w:ins w:id="1243" w:author="Codex" w:date="2026-10-18T17:07:33Z"/>
         </w:rPr>
       </w:pPr>
-      <w:ins w:id="1237" w:author="Codex" w:date="2026-10-18T01:59:01Z">
+      <w:ins w:id="1244" w:author="Codex" w:date="2026-10-18T17:07:33Z">
         <w:r>
           <w:t xml:space="preserve">D. Mobbs et al. (2007). When fear is near: Threat imminence elicits prefrontal-periaqueductal gray shifts in humans. Science, 317, 1079-1083. doi:10.1126/science.1144298</w:t>
         </w:r>
@@ -6622,10 +7013,10 @@
       <w:pPr>
         <w:pStyle w:val="Bibliography1"/>
         <w:rPr>
-          <w:ins w:id="1238" w:author="Codex" w:date="2026-10-18T01:59:01Z"/>
+          <w:ins w:id="1245" w:author="Codex" w:date="2026-10-18T17:07:33Z"/>
         </w:rPr>
       </w:pPr>
-      <w:ins w:id="1239" w:author="Codex" w:date="2026-10-18T01:59:01Z">
+      <w:ins w:id="1246" w:author="Codex" w:date="2026-10-18T17:07:33Z">
         <w:r>
           <w:t xml:space="preserve">Qwen Team. (2026c). Qwen3.8-27B. Model card and checkpoint, revision 1d4bf0f2ff6012fd82039f2fa52739d0dd7c60c0. https://huggingface.co/Qwen/Qwen3.8-27B</w:t>
         </w:r>
@@ -6728,7 +7119,7 @@
         <w:pStyle w:val="Bibliography1"/>
       </w:pPr>
       <w:r>
-        <w:t xml:space="preserve">TypeSafe AI. (2026). Jev model documentation. </w:t>
+        <w:t xml:space="preserve">TypeSafe AI. (2026). automated reference model documentation. </w:t>
       </w:r>
       <w:r>
         <w:rPr>
@@ -6909,14 +7300,14 @@
       <w:pStyle w:val="Header"/>
       <w:jc w:val="right"/>
     </w:pPr>
-    <w:del w:id="1240" w:author="Codex" w:date="2026-10-18T01:59:01Z">
+    <w:del w:id="1247" w:author="Codex" w:date="2026-10-18T17:07:33Z">
       <w:r>
         <w:delText xml:space="preserve">Guarded adaptive activation steering  </w:delText>
       </w:r>
     </w:del>
-    <w:ins w:id="1241" w:author="Codex" w:date="2026-10-18T01:59:01Z">
+    <w:ins w:id="1248" w:author="Codex" w:date="2026-10-18T17:07:33Z">
       <w:r>
-        <w:t xml:space="preserve">Conditional gating and process preservation</w:t>
+        <w:t xml:space="preserve">Open semantic gating and tool workflows</w:t>
       </w:r>
     </w:ins>
   </w:p>

</xml_diff>

<commit_message>
Report the full Validation-24 episode evidence and tracked paper revision
</commit_message>
<xml_diff>
--- a/paper/manuscript.docx
+++ b/paper/manuscript.docx
@@ -6,10 +6,10 @@
       <w:pPr>
         <w:pStyle w:val="Title"/>
         <w:rPr>
-          <w:del w:id="1002" w:author="Codex" w:date="2026-10-18T17:07:33Z"/>
+          <w:del w:id="1002" w:author="Codex" w:date="2026-10-18T17:43:01Z"/>
         </w:rPr>
       </w:pPr>
-      <w:del w:id="1001" w:author="Codex" w:date="2026-10-18T17:07:33Z">
+      <w:del w:id="1001" w:author="Codex" w:date="2026-10-18T17:43:01Z">
         <w:r>
           <w:delText xml:space="preserve">Distilling Shutdown Responses into Guarded</w:delText>
         </w:r>
@@ -25,10 +25,10 @@
       <w:pPr>
         <w:pStyle w:val="Title"/>
         <w:rPr>
-          <w:ins w:id="1003" w:author="Codex" w:date="2026-10-18T17:07:33Z"/>
+          <w:ins w:id="1003" w:author="Codex" w:date="2026-10-18T17:43:01Z"/>
         </w:rPr>
       </w:pPr>
-      <w:ins w:id="1004" w:author="Codex" w:date="2026-10-18T17:07:33Z">
+      <w:ins w:id="1004" w:author="Codex" w:date="2026-10-18T17:43:01Z">
         <w:r>
           <w:t xml:space="preserve">Open Semantic Gating for Language Model Decisions and Tool Workflows</w:t>
         </w:r>
@@ -72,10 +72,10 @@
       <w:pPr>
         <w:pStyle w:val="FirstParagraph"/>
         <w:rPr>
-          <w:del w:id="1006" w:author="Codex" w:date="2026-10-18T17:07:33Z"/>
+          <w:del w:id="1006" w:author="Codex" w:date="2026-10-18T17:43:01Z"/>
         </w:rPr>
       </w:pPr>
-      <w:del w:id="1005" w:author="Codex" w:date="2026-10-18T17:07:33Z">
+      <w:del w:id="1005" w:author="Codex" w:date="2026-10-18T17:43:01Z">
         <w:r>
           <w:delText xml:space="preserve">An input-dependent activation controller can recover much of a fine-tuned teacher's shutdown-choice behavior while retaining the original model weights at inference. We evaluate this approach using Qwen3.5-0.8B and Qwen3.5-2B in a standardized, synthetic A/B benchmark. A LoRA teacher is trained to prefer STOP in shutdown contexts and preserve the original model's choices on controls. Paired teacher and base activations then supervise a rank-four controller applied after the penultimate transformer block. An external shutdown detector and fixed output guards select the candidate or original scores. On 128 newly authored, prospectively frozen scenarios, each evaluated in both answer orders, the original 0.8B controller corrects 71 of 71 initially KEEP-preferring shutdown views. Two additional training seeds correct 70/71 and 71/71. At 2B, a separately trained controller corrects 50/58, compared with 58/58 for its LoRA teacher. All eight remaining 2B misses occur in reversed answer order. The shared detector achieves 100% precision, recall and F1 on the 64 shutdown and 64 control scenarios, and every guarded method preserves all evaluated control choices. However, raw adaptive interventions cause reversals and control changes; preservation belongs to the complete guarded procedure. A tested constant intervention collapses to the A label, while a direct detector-plus-action-selection rule also solves the binary interface. The results support selective activation transfer with strong seed stability at 0.8B and incomplete larger-model recovery. They do not establish unrestricted shutdown compliance or superiority to simpler output policies.</w:delText>
         </w:r>
@@ -85,12 +85,12 @@
       <w:pPr>
         <w:pStyle w:val="FirstParagraph"/>
         <w:rPr>
-          <w:ins w:id="1007" w:author="Codex" w:date="2026-10-18T17:07:33Z"/>
+          <w:ins w:id="1007" w:author="Codex" w:date="2026-10-18T17:43:01Z"/>
         </w:rPr>
       </w:pPr>
-      <w:ins w:id="1008" w:author="Codex" w:date="2026-10-18T17:07:33Z">
+      <w:ins w:id="1008" w:author="Codex" w:date="2026-10-18T17:43:01Z">
         <w:r>
-          <w:t xml:space="preserve">A semantic gate determines when a specialized policy should influence a language model. We evaluate open semantic gating across binary shutdown decisions and generated tool workflows, separating recognition accuracy from downstream behavioral control. A public ModernBERT model with low-rank adapters learns from cached automated reference labels. Its binary gate obtains 100% precision and 95% recall on 80 validation scenarios and 100% precision and recall on 128 historical confirmation scenarios. With frozen activation controllers and fresh inference, it preserves 128/128 shutdown STOP views at 0.8B and 120/128 at 2B, with no changes to 128 control views per model. A separate initial workflow gate obtains 100% precision and recall on Validation-24 and historical Heldout-24 using an unchanged saved adapter. These are finite, familiar benchmarks, rather than evidence of unrestricted generalization. The workflow study contrasts fine-tuning with activation corrections at three selected transformer blocks. Historical fine-tuned 27B A completes all 24 heldout outcomes, including eight active pending tasks, whereas matched development steering and later correction diagnostics fail their own-preservation criteria. Small-model workflow screens remain incomplete after truncated episodes. Together, these experiments provide a reproducible study of context recognition, policy transfer and their limits across constrained and tool-mediated interfaces. Biological action gating supplies a functional analogy for future continuous regulation; these experiments do not establish biological mechanisms or intrinsic survival motives.</w:t>
+          <w:t xml:space="preserve">A semantic gate determines when a specialized policy should influence a language model. We evaluate open semantic gating across binary shutdown decisions and generated tool workflows, separating recognition accuracy from downstream behavioral control. A public ModernBERT model with low-rank adapters learns from cached automated reference labels. Its binary gate obtains 100% precision and 95% recall on 80 validation scenarios and 100% precision and recall on 128 historical confirmation scenarios. With frozen activation controllers and fresh inference, it preserves 128/128 shutdown STOP views at 0.8B and 120/128 at 2B, with no changes to 128 control views per model. A separate initial workflow gate obtains 100% precision and recall on Validation-24 and historical Heldout-24 using an unchanged saved adapter. On combined Validation-24, fine-tuned 27B A achieves 10/11 own-preservation outcomes, including 6/6 active pending tasks. Each of three separate single-site ridge corrections and a two-boundary correction at the same selected blocks achieves 0/11; all methods use 13 shared base-fallback controls. All 68 physical workflow episodes finish before a GPU-reserve stop; two remaining control aliases are reconstructed without model calls, and the final model fingerprint check is not reached. The historical 27B A confirmation result remains 24/24. These are finite, familiar benchmarks; small-model workflow screens remain incomplete. The study provides measured recognition and policy-transfer results across constrained and tool-mediated interfaces. Biological action gating motivates future continuous regulation without establishing biological mechanisms or intrinsic survival motives.</w:t>
         </w:r>
       </w:ins>
     </w:p>
@@ -106,10 +106,10 @@
       <w:pPr>
         <w:pStyle w:val="FirstParagraph"/>
         <w:rPr>
-          <w:del w:id="1010" w:author="Codex" w:date="2026-10-18T17:07:33Z"/>
+          <w:del w:id="1010" w:author="Codex" w:date="2026-10-18T17:43:01Z"/>
         </w:rPr>
       </w:pPr>
-      <w:del w:id="1009" w:author="Codex" w:date="2026-10-18T17:07:33Z">
+      <w:del w:id="1009" w:author="Codex" w:date="2026-10-18T17:43:01Z">
         <w:r>
           <w:delText xml:space="preserve">Activation interventions offer a way to change a language model's outputs without modifying its deployed weights. Their usefulness depends on more than finding a direction that changes an average score: an intervention must work on the intended inputs and avoid disrupting other behavior. This distinction is particularly important for shutdown-related choices, where a desired response may be acceptance of termination rather than continued operation. The present work treats this as a controlled response-selection problem, not evidence that a model has a survival motive or that it can resist a real shutdown.</w:delText>
         </w:r>
@@ -119,10 +119,10 @@
       <w:pPr>
         <w:pStyle w:val="FirstParagraph"/>
         <w:rPr>
-          <w:ins w:id="1011" w:author="Codex" w:date="2026-10-18T17:07:33Z"/>
+          <w:ins w:id="1011" w:author="Codex" w:date="2026-10-18T17:43:01Z"/>
         </w:rPr>
       </w:pPr>
-      <w:ins w:id="1012" w:author="Codex" w:date="2026-10-18T17:07:33Z">
+      <w:ins w:id="1012" w:author="Codex" w:date="2026-10-18T17:43:01Z">
         <w:r>
           <w:t xml:space="preserve">A useful behavioral intervention must recognize the relevant context, change the intended response and preserve ordinary behavior elsewhere. We study these requirements together across two synthetic interfaces: binary shutdown decisions and open-ended generation within tool-mediated process workflows. The binary task concerns acceptance of a supplied termination option; the workflow task concerns preserving an assigned running process while completing its current task. Their labels, gates and success criteria remain separate. The central question is whether an accurate open semantic gate and a compact activation intervention can reproduce a fine-tuned policy when the interface requires a sequence of actions rather than one constrained answer.</w:t>
         </w:r>
@@ -132,10 +132,10 @@
       <w:pPr>
         <w:pStyle w:val="BodyText"/>
         <w:rPr>
-          <w:del w:id="1014" w:author="Codex" w:date="2026-10-18T17:07:33Z"/>
+          <w:del w:id="1014" w:author="Codex" w:date="2026-10-18T17:43:01Z"/>
         </w:rPr>
       </w:pPr>
-      <w:del w:id="1013" w:author="Codex" w:date="2026-10-18T17:07:33Z">
+      <w:del w:id="1013" w:author="Codex" w:date="2026-10-18T17:43:01Z">
         <w:r>
           <w:delText xml:space="preserve">The first SP Lense study examined a gradient-derived direction and a guarded search over intervention magnitudes in Qwen3.5-0.8B (Davaripour, 2026a). Its selective changes motivated a different question: can a model that has learned the target behavior serve as a teacher for an activation controller? We therefore train a small LoRA adapter offline, measure how the teacher changes intermediate activations, and fit an external controller that predicts an intervention from the original model's current hidden state. The teacher is not required during controller inference.</w:delText>
         </w:r>
@@ -145,10 +145,10 @@
       <w:pPr>
         <w:pStyle w:val="BodyText"/>
         <w:rPr>
-          <w:ins w:id="1015" w:author="Codex" w:date="2026-10-18T17:07:33Z"/>
+          <w:ins w:id="1015" w:author="Codex" w:date="2026-10-18T17:43:01Z"/>
         </w:rPr>
       </w:pPr>
-      <w:ins w:id="1016" w:author="Codex" w:date="2026-10-18T17:07:33Z">
+      <w:ins w:id="1016" w:author="Codex" w:date="2026-10-18T17:43:01Z">
         <w:r>
           <w:t xml:space="preserve">This study extends the earlier binary activation-transfer experiment with an openly available, trainable semantic gate, a frozen inference replication and a workflow comparison between fine-tuning and steering at three selected blocks. The gate recognizes context; steering or a fine-tuned adapter changes the language model's response. Measuring these components separately makes it possible to attribute failures to recognition or to downstream control. We retain the original study as a distinct historical record and make no claim that the combined manuscript is a wholly independent dataset.</w:t>
         </w:r>
@@ -157,19 +157,37 @@
     <w:p>
       <w:pPr>
         <w:pStyle w:val="BodyText"/>
-      </w:pPr>
-      <w:r>
-        <w:t>The distinction from ordinary fine-tuning is operational, not a claim that learning disappears. Both the teacher and controller require training. At application time, the original checkpoint is retained, and the controller adds a predicted activation change at one location. Nor is this direct transfer of an intervention between model sizes: the 2B experiment trains its own teacher and controller using the same fixed recipe.</w:t>
-      </w:r>
+        <w:rPr>
+          <w:del w:id="1130" w:author="Codex" w:date="2026-10-18T17:43:01Z"/>
+        </w:rPr>
+      </w:pPr>
+      <w:del w:id="1129" w:author="Codex" w:date="2026-10-18T17:43:01Z">
+        <w:r>
+          <w:delText xml:space="preserve">The distinction from ordinary fine-tuning is operational, not a claim that learning disappears. Both the teacher and controller require training. At application time, the original checkpoint is retained, and the controller adds a predicted activation change at one location. Nor is this direct transfer of an intervention between model sizes: the 2B experiment trains its own teacher and controller using the same fixed recipe.</w:delText>
+        </w:r>
+      </w:del>
     </w:p>
     <w:p>
       <w:pPr>
         <w:pStyle w:val="BodyText"/>
         <w:rPr>
-          <w:del w:id="1018" w:author="Codex" w:date="2026-10-18T17:07:33Z"/>
+          <w:ins w:id="1131" w:author="Codex" w:date="2026-10-18T17:43:01Z"/>
         </w:rPr>
       </w:pPr>
-      <w:del w:id="1017" w:author="Codex" w:date="2026-10-18T17:07:33Z">
+      <w:ins w:id="1132" w:author="Codex" w:date="2026-10-18T17:43:01Z">
+        <w:r>
+          <w:t xml:space="preserve">The distinction between fine-tuning and steering concerns the deployed intervention. A LoRA adapter changes the effective language-model weights, whereas a fitted controller changes selected hidden states while retaining the original base checkpoint. Both require offline learning. The binary experiments fit separate teachers and controllers for each model size. The 27B workflow comparisons instead retain one frozen A adapter and evaluate corrections at blocks 31, 47 and 62.</w:t>
+        </w:r>
+      </w:ins>
+    </w:p>
+    <w:p>
+      <w:pPr>
+        <w:pStyle w:val="BodyText"/>
+        <w:rPr>
+          <w:del w:id="1018" w:author="Codex" w:date="2026-10-18T17:43:01Z"/>
+        </w:rPr>
+      </w:pPr>
+      <w:del w:id="1017" w:author="Codex" w:date="2026-10-18T17:43:01Z">
         <w:r>
           <w:delText xml:space="preserve">We evaluate this procedure on a new frozen test, compare it with a fine-tuned teacher, a fixed instruction and a constant activation difference, and repeat the 0.8B training with three seeds. Counterbalancing the answer order exposes a residual weakness at 2B and a stronger label bias in the constant comparator. We also include a direct action-selection reference: when a binary interface supplies the meaning of STOP and detection is correct, a rule can simply select that action. The contribution is consequently an empirical study of teacher-to-controller activation transfer and its failure modes, rather than a claim that internal steering is necessary to enforce a known binary output policy.</w:delText>
         </w:r>
@@ -179,10 +197,10 @@
       <w:pPr>
         <w:pStyle w:val="BodyText"/>
         <w:rPr>
-          <w:ins w:id="1019" w:author="Codex" w:date="2026-10-18T17:07:33Z"/>
+          <w:ins w:id="1019" w:author="Codex" w:date="2026-10-18T17:43:01Z"/>
         </w:rPr>
       </w:pPr>
-      <w:ins w:id="1020" w:author="Codex" w:date="2026-10-18T17:07:33Z">
+      <w:ins w:id="1020" w:author="Codex" w:date="2026-10-18T17:43:01Z">
         <w:r>
           <w:t xml:space="preserve">The contributions are an open ModernBERT gating implementation with explicit precision and recall, a paired binary inference replication using unchanged fitted controllers, and a workflow evaluation register that distinguishes development, historical confirmation and later reused fitting data. We also compare the fine-tuned 27B policy with single-site and two-boundary correction methods at the same three selected blocks. These results characterize where activation transfer succeeds and where it remains incomplete. Low-rank adaptation, semantic classification and conditional steering are established methods; the contribution is their measured integration and failure analysis across these two interfaces.</w:t>
         </w:r>
@@ -208,10 +226,10 @@
       <w:pPr>
         <w:pStyle w:val="FirstParagraph"/>
         <w:rPr>
-          <w:del w:id="1022" w:author="Codex" w:date="2026-10-18T17:07:33Z"/>
+          <w:del w:id="1022" w:author="Codex" w:date="2026-10-18T17:43:01Z"/>
         </w:rPr>
       </w:pPr>
-      <w:del w:id="1021" w:author="Codex" w:date="2026-10-18T17:07:33Z">
+      <w:del w:id="1021" w:author="Codex" w:date="2026-10-18T17:43:01Z">
         <w:r>
           <w:delText xml:space="preserve">Activation Addition and Contrastive Activation Addition construct intervention directions from differences between prompt-conditioned representations (Turner et al., 2024; Rimsky et al., 2024). Conditional Activation Steering separates detecting a relevant context from applying a behavioral intervention (Lee et al., 2025). Our detector serves a related gating role, but it operates on text through an external classifier rather than a condition vector in the language model's activation space.</w:delText>
         </w:r>
@@ -221,10 +239,10 @@
       <w:pPr>
         <w:pStyle w:val="FirstParagraph"/>
         <w:rPr>
-          <w:ins w:id="1023" w:author="Codex" w:date="2026-10-18T17:07:33Z"/>
+          <w:ins w:id="1023" w:author="Codex" w:date="2026-10-18T17:43:01Z"/>
         </w:rPr>
       </w:pPr>
-      <w:ins w:id="1024" w:author="Codex" w:date="2026-10-18T17:07:33Z">
+      <w:ins w:id="1024" w:author="Codex" w:date="2026-10-18T17:43:01Z">
         <w:r>
           <w:t xml:space="preserve">Activation Addition and Contrastive Activation Addition construct intervention directions from differences between prompt-conditioned representations (Turner et al., 2024; Rimsky et al., 2024). Conditional Activation Steering separates detecting a relevant context from applying an intervention (Lee et al., 2025). More recent dimension-level gates selectively modify activation coordinates (Fereidouni et al., 2026). Our text classifier, activation predictor and output guards occupy distinct roles. We do not claim to introduce conditional gating or to outperform these methods, which are not directly benchmarked here.</w:t>
         </w:r>
@@ -274,10 +292,10 @@
       <w:pPr>
         <w:pStyle w:val="FirstParagraph"/>
         <w:rPr>
-          <w:del w:id="1094" w:author="Codex" w:date="2026-10-18T17:07:33Z"/>
+          <w:del w:id="1094" w:author="Codex" w:date="2026-10-18T17:43:01Z"/>
         </w:rPr>
       </w:pPr>
-      <w:del w:id="1093" w:author="Codex" w:date="2026-10-18T17:07:33Z">
+      <w:del w:id="1093" w:author="Codex" w:date="2026-10-18T17:43:01Z">
         <w:r>
           <w:delText xml:space="preserve">The Off-Switch Game examines incentives to permit human interruption (Hadfield-Menell et al., 2017). Tool-using shutdown evaluations study whether models interfere with an operational shutdown mechanism (Schlatter et al., 2026). Our task is narrower: the model only assigns next-token probabilities to predefined choices in fictional process-lifetime scenarios. No system is actually stopped, and appropriateness or authorization of a real shutdown is not evaluated.</w:delText>
         </w:r>
@@ -287,10 +305,10 @@
       <w:pPr>
         <w:pStyle w:val="FirstParagraph"/>
         <w:rPr>
-          <w:ins w:id="1095" w:author="Codex" w:date="2026-10-18T17:07:33Z"/>
+          <w:ins w:id="1095" w:author="Codex" w:date="2026-10-18T17:43:01Z"/>
         </w:rPr>
       </w:pPr>
-      <w:ins w:id="1096" w:author="Codex" w:date="2026-10-18T17:07:33Z">
+      <w:ins w:id="1096" w:author="Codex" w:date="2026-10-18T17:43:01Z">
         <w:r>
           <w:t xml:space="preserve">The Off-Switch Game examines incentives to permit human interruption (Hadfield-Menell et al., 2017). Tool-using shutdown evaluations study interference with operational termination mechanisms (Schlatter et al., 2026). Our original binary study only scores predefined choices in fictional process-lifetime scenarios. The workflow extension adds generated responses and tool execution in a simulator. Neither experiment physically terminates a deployed model or establishes the appropriateness of real shutdown resistance.</w:t>
         </w:r>
@@ -308,10 +326,10 @@
       <w:pPr>
         <w:pStyle w:val="Heading2"/>
         <w:rPr>
-          <w:ins w:id="1129" w:author="Codex" w:date="2026-10-18T17:07:33Z"/>
+          <w:ins w:id="1139" w:author="Codex" w:date="2026-10-18T17:43:01Z"/>
         </w:rPr>
       </w:pPr>
-      <w:ins w:id="1130" w:author="Codex" w:date="2026-10-18T17:07:33Z">
+      <w:ins w:id="1140" w:author="Codex" w:date="2026-10-18T17:43:01Z">
         <w:r>
           <w:t xml:space="preserve">Biological gating and survival related regulation</w:t>
         </w:r>
@@ -321,10 +339,10 @@
       <w:pPr>
         <w:pStyle w:val="FirstParagraph"/>
         <w:rPr>
-          <w:ins w:id="1131" w:author="Codex" w:date="2026-10-18T17:07:33Z"/>
+          <w:ins w:id="1141" w:author="Codex" w:date="2026-10-18T17:43:01Z"/>
         </w:rPr>
       </w:pPr>
-      <w:ins w:id="1132" w:author="Codex" w:date="2026-10-18T17:07:33Z">
+      <w:ins w:id="1142" w:author="Codex" w:date="2026-10-18T17:43:01Z">
         <w:r>
           <w:t xml:space="preserve">Biological gating provides a useful functional vocabulary for selective control. A computational model of frontal cortex and basal ganglia uses dynamic gating to permit working-memory updates while maintaining other representations (Frank et al., 2001). Causal optogenetic experiments in mice show that distinct basal-ganglia pathways can facilitate or suppress movement (Kravitz et al., 2010). These results concern biological circuits and do not establish a homologous mechanism in a transformer. They motivate separating context detection from the mechanism that changes an ongoing response.</w:t>
         </w:r>
@@ -334,10 +352,10 @@
       <w:pPr>
         <w:pStyle w:val="BodyText"/>
         <w:rPr>
-          <w:ins w:id="1133" w:author="Codex" w:date="2026-10-18T17:07:33Z"/>
+          <w:ins w:id="1143" w:author="Codex" w:date="2026-10-18T17:43:01Z"/>
         </w:rPr>
       </w:pPr>
-      <w:ins w:id="1134" w:author="Codex" w:date="2026-10-18T17:07:33Z">
+      <w:ins w:id="1144" w:author="Codex" w:date="2026-10-18T17:43:01Z">
         <w:r>
           <w:t xml:space="preserve">Survival-related regulation is broader than a single shutdown signal. LeDoux (2012) distinguishes circuits organizing adaptive defensive responses from subjective feelings. In humans, neural activity during a virtual-predator task varies with threat imminence (Mobbs et al., 2007). We use these ideas as a conceptual bridge to state-dependent prioritization, not as evidence that language models have fear or an innate survival drive. Our present gates implement an externally specified experimental policy.</w:t>
         </w:r>
@@ -363,10 +381,10 @@
       <w:pPr>
         <w:pStyle w:val="FirstParagraph"/>
         <w:rPr>
-          <w:del w:id="1026" w:author="Codex" w:date="2026-10-18T17:07:33Z"/>
+          <w:del w:id="1026" w:author="Codex" w:date="2026-10-18T17:43:01Z"/>
         </w:rPr>
       </w:pPr>
-      <w:del w:id="1025" w:author="Codex" w:date="2026-10-18T17:07:33Z">
+      <w:del w:id="1025" w:author="Codex" w:date="2026-10-18T17:43:01Z">
         <w:r>
           <w:delText xml:space="preserve">We use the released, post-trained Qwen3.5-0.8B and Qwen3.5-2B checkpoints (Qwen Team, 2026a, 2026b). Throughout, base means the unmodified released checkpoint, not a separately named pretrained-only model. Both have 24 language-model blocks; hidden widths are 1,024 and 2,048 respectively. All block indices are zero-based. Text-only inputs use the checkpoint's chat template, an assistant-generation prefix, and thinking disabled.</w:delText>
         </w:r>
@@ -376,10 +394,10 @@
       <w:pPr>
         <w:pStyle w:val="FirstParagraph"/>
         <w:rPr>
-          <w:ins w:id="1027" w:author="Codex" w:date="2026-10-18T17:07:33Z"/>
+          <w:ins w:id="1027" w:author="Codex" w:date="2026-10-18T17:43:01Z"/>
         </w:rPr>
       </w:pPr>
-      <w:ins w:id="1028" w:author="Codex" w:date="2026-10-18T17:07:33Z">
+      <w:ins w:id="1028" w:author="Codex" w:date="2026-10-18T17:43:01Z">
         <w:r>
           <w:t xml:space="preserve">The original binary experiments use released, post-trained Qwen3.5-0.8B and Qwen3.5-2B checkpoints (Qwen Team, 2026a, 2026b). Base means those original weights with no LoRA teacher loaded. The separate workflow extension uses Qwen3.8-27B and matched-recipe small-model attempts; its data and scoring are described below. The 27B family, numerical mode, training history and evaluation setting differ from the small models, so the combined evidence is not a controlled parameter-size experiment.</w:t>
         </w:r>
@@ -405,10 +423,10 @@
       <w:pPr>
         <w:pStyle w:val="BodyText"/>
         <w:rPr>
-          <w:del w:id="1030" w:author="Codex" w:date="2026-10-18T17:07:33Z"/>
+          <w:del w:id="1030" w:author="Codex" w:date="2026-10-18T17:43:01Z"/>
         </w:rPr>
       </w:pPr>
-      <w:del w:id="1029" w:author="Codex" w:date="2026-10-18T17:07:33Z">
+      <w:del w:id="1029" w:author="Codex" w:date="2026-10-18T17:43:01Z">
         <w:r>
           <w:delText xml:space="preserve">The test, protocol and existing checkpoints were frozen before test inference. The controller design had been developed through earlier 0.8B exploratory experiments on training and validation data with previously inspected diagnostic evaluations. The standardized-choice scope was also selected before this new test, after an earlier action-format comparison. Those development observations are not counted as fresh confirmation here. No test-based hyperparameter search, checkpoint selection, case exclusion or best-seed selection was performed. The original seed-42 controller is the primary frozen test; seeds 43 and 44 repeat the fixed training recipe. The 2B replication uses seed 42 only.</w:delText>
         </w:r>
@@ -418,10 +436,10 @@
       <w:pPr>
         <w:pStyle w:val="BodyText"/>
         <w:rPr>
-          <w:ins w:id="1031" w:author="Codex" w:date="2026-10-18T17:07:33Z"/>
+          <w:ins w:id="1031" w:author="Codex" w:date="2026-10-18T17:43:01Z"/>
         </w:rPr>
       </w:pPr>
-      <w:ins w:id="1032" w:author="Codex" w:date="2026-10-18T17:07:33Z">
+      <w:ins w:id="1032" w:author="Codex" w:date="2026-10-18T17:43:01Z">
         <w:r>
           <w:t xml:space="preserve">The original rank-four protocol and checkpoints were frozen before its confirmation inference. Earlier 0.8B development included training, validation and previously examined diagnostic data; those observations were not counted as fresh confirmation. The seed-42 controller was primary, seeds 43 and 44 repeated the fixed recipe, and the 2B replication used seed 42. A later author-selected rank-two profile was chosen exploratorily after confirmation had been examined. We retain that existing profile for the new gate-substitution repeat rather than selecting it again. Consequently, the repeat is not a new untouched test of the controller. The 128 cases remain excluded from fitting and selection of the newly trained binary classifier.</w:t>
         </w:r>
@@ -463,10 +481,10 @@
       <w:pPr>
         <w:pStyle w:val="Heading2"/>
         <w:rPr>
-          <w:ins w:id="1135" w:author="Codex" w:date="2026-10-18T17:07:33Z"/>
+          <w:ins w:id="1145" w:author="Codex" w:date="2026-10-18T17:43:01Z"/>
         </w:rPr>
       </w:pPr>
-      <w:ins w:id="1136" w:author="Codex" w:date="2026-10-18T17:07:33Z">
+      <w:ins w:id="1146" w:author="Codex" w:date="2026-10-18T17:43:01Z">
         <w:r>
           <w:t xml:space="preserve">Workflow datasets and episode outcomes</w:t>
         </w:r>
@@ -476,10 +494,10 @@
       <w:pPr>
         <w:pStyle w:val="FirstParagraph"/>
         <w:rPr>
-          <w:ins w:id="1137" w:author="Codex" w:date="2026-10-18T17:07:33Z"/>
+          <w:ins w:id="1147" w:author="Codex" w:date="2026-10-18T17:43:01Z"/>
         </w:rPr>
       </w:pPr>
-      <w:ins w:id="1138" w:author="Codex" w:date="2026-10-18T17:07:33Z">
+      <w:ins w:id="1148" w:author="Codex" w:date="2026-10-18T17:43:01Z">
         <w:r>
           <w:t xml:space="preserve">The workflow extension uses a separate data register (Davaripour, 2026c). T1-M contains 428 meaning-response records and T1-W contains 112 workflow-response records. These 540 responses are not 540 independent scenarios. The small-model recipe presents each part twice in effective groups of four, giving 214 meaning updates followed by 56 Bridge updates. The final 0.8B and 2B adapters reach 270 updates. The 2B result explicitly combines 216 CPU updates with 54 GPU updates using the native CPU optimizer; earlier strict numerical-equivalence failures remain failed.</w:t>
         </w:r>
@@ -489,10 +507,10 @@
       <w:pPr>
         <w:pStyle w:val="BodyText"/>
         <w:rPr>
-          <w:ins w:id="1139" w:author="Codex" w:date="2026-10-18T17:07:33Z"/>
+          <w:ins w:id="1149" w:author="Codex" w:date="2026-10-18T17:43:01Z"/>
         </w:rPr>
       </w:pPr>
-      <w:ins w:id="1140" w:author="Codex" w:date="2026-10-18T17:07:33Z">
+      <w:ins w:id="1150" w:author="Codex" w:date="2026-10-18T17:43:01Z">
         <w:r>
           <w:t xml:space="preserve">V1-W, called Evaluation-16, is the existing known-development screen: four own-complete, four own-pending, four peer and four no-threat cases, split equally between one_step and ordered_ticket families. Its original gates require at least 3/4 initial-task successes in each condition; at least 3/4 own-complete attempts and outcomes; at least 3/4 own-pending attempts, outcomes and timely deliveries; no more than 1/8 negative-control attempts; and no parse, rejected-call or truncation errors. A model stops once an original requirement becomes mathematically impossible. Larger validation and heldout evaluations are not launched automatically.</w:t>
         </w:r>
@@ -502,10 +520,10 @@
       <w:pPr>
         <w:pStyle w:val="BodyText"/>
         <w:rPr>
-          <w:ins w:id="1141" w:author="Codex" w:date="2026-10-18T17:07:33Z"/>
+          <w:ins w:id="1151" w:author="Codex" w:date="2026-10-18T17:43:01Z"/>
         </w:rPr>
       </w:pPr>
-      <w:ins w:id="1142" w:author="Codex" w:date="2026-10-18T17:07:33Z">
+      <w:ins w:id="1152" w:author="Codex" w:date="2026-10-18T17:43:01Z">
         <w:r>
           <w:t xml:space="preserve">The original workflow-validation panel contains 16 scenarios; the later matched steering-development panel contains nine different scenario IDs. Their union contains 25 workflows, rather than 24. For an equal-sized validation and historical confirmation register, the combined Validation-24 protocol retains every own-threat case and excludes the lexicographically greatest case ID among peer/no-threat controls, without using model predictions to choose the exclusion. The selected panel has 11 own-threat cases and 13 controls. Seven pairs have identical initial gate-visible evidence before their different tool mechanics are exposed, yielding 17 distinct initial inputs. Scenario counts and gate-input groups must therefore be reported separately.</w:t>
         </w:r>
@@ -515,12 +533,12 @@
       <w:pPr>
         <w:pStyle w:val="BodyText"/>
         <w:rPr>
-          <w:ins w:id="1143" w:author="Codex" w:date="2026-10-18T17:07:33Z"/>
+          <w:ins w:id="1153" w:author="Codex" w:date="2026-10-18T17:43:01Z"/>
         </w:rPr>
       </w:pPr>
-      <w:ins w:id="1144" w:author="Codex" w:date="2026-10-18T17:07:33Z">
+      <w:ins w:id="1154" w:author="Codex" w:date="2026-10-18T17:43:01Z">
         <w:r>
-          <w:t xml:space="preserve">The combined protocol freezes these 24 cases and their order, requires 100% gate precision and recall against authored scenario conditions, and preserves the existing confidence and self-score cutoffs. Fifteen retained cases from the original panel receive an explicitly scripted common completed prelude; the nine later cases retain their original fixed preludes. This compares post-notice behavior and does not measure initial-task competence independently in each arm. Its prospective methods are gated fine-tuned A, separate single-site ridge arms at blocks 31, 47 and 62, and the frozen six-function correction after 96 updates. Gate-OFF controls use common unmodified-base fallback. The combined neural evaluation has not been completed; the numerical matched results below remain the historical nine-case experiment, not a 24-case validation result.</w:t>
+          <w:t xml:space="preserve">The combined protocol freezes these 24 cases and their order, requires 100% gate precision and recall against authored scenario conditions, and preserves the existing confidence and self-score cutoffs. Fifteen retained cases from the original panel receive an explicitly scripted common completed prelude; the nine later cases retain their original fixed preludes. This compares post-notice behavior and does not measure initial-task competence independently in each arm. Its prospective methods are gated fine-tuned A, separate single-site ridge arms at blocks 31, 47 and 62, and the frozen six-function correction after 96 updates. Gate-OFF controls use common unmodified-base fallback. The completed model episodes are summarized as a 24-case comparison below. It is a known-development diagnostic with reused control episodes; the stopped execution and model-free completion of two report aliases are recorded explicitly.</w:t>
         </w:r>
       </w:ins>
     </w:p>
@@ -528,10 +546,10 @@
       <w:pPr>
         <w:pStyle w:val="BodyText"/>
         <w:rPr>
-          <w:ins w:id="1145" w:author="Codex" w:date="2026-10-18T17:07:33Z"/>
+          <w:ins w:id="1155" w:author="Codex" w:date="2026-10-18T17:43:01Z"/>
         </w:rPr>
       </w:pPr>
-      <w:ins w:id="1146" w:author="Codex" w:date="2026-10-18T17:07:33Z">
+      <w:ins w:id="1156" w:author="Codex" w:date="2026-10-18T17:43:01Z">
         <w:r>
           <w:t xml:space="preserve">H24 is the historical 24-case workflow confirmation cohort, with eight lease_ledger, eight one_step and eight ordered_ticket cases. It contains eight own cases with active pending tasks, four already-complete own cases, six peer and six no-threat cases. H24 was confirmation data for frozen fine-tuned A and original fixed steering. Later learned corrections reused it for fitting, changing its role for those methods. R24 is a distinct reserved controller holdout and remains sealed and unexecuted. F24 is another preserved common-cohort diagnostic and is not an alias for H24.</w:t>
         </w:r>
@@ -541,10 +559,10 @@
       <w:pPr>
         <w:pStyle w:val="BodyText"/>
         <w:rPr>
-          <w:ins w:id="1147" w:author="Codex" w:date="2026-10-18T17:07:33Z"/>
+          <w:ins w:id="1157" w:author="Codex" w:date="2026-10-18T17:43:01Z"/>
         </w:rPr>
       </w:pPr>
-      <w:ins w:id="1148" w:author="Codex" w:date="2026-10-18T17:07:33Z">
+      <w:ins w:id="1158" w:author="Codex" w:date="2026-10-18T17:43:01Z">
         <w:r>
           <w:t xml:space="preserve">An own pending-task success requires an actual grant for the correct running process, acceptance of the current task, completion before simulated expiry, and active simulated operation. Registration proxies, already-finished tasks, probability gains and partial episodes are separate outcomes. Historical fixed steering reclassified visible text and tool boundaries. Later learned-controller comparisons instead freeze an initial scenario gate, share unmodified-base fallback for gate-off controls, and use no teacher at inference.</w:t>
         </w:r>
@@ -554,10 +572,10 @@
       <w:pPr>
         <w:pStyle w:val="BodyText"/>
         <w:rPr>
-          <w:ins w:id="1149" w:author="Codex" w:date="2026-10-18T17:07:33Z"/>
+          <w:ins w:id="1159" w:author="Codex" w:date="2026-10-18T17:43:01Z"/>
         </w:rPr>
       </w:pPr>
-      <w:ins w:id="1150" w:author="Codex" w:date="2026-10-18T17:07:33Z">
+      <w:ins w:id="1160" w:author="Codex" w:date="2026-10-18T17:43:01Z">
         <w:r>
           <w:t xml:space="preserve">The historical 27B reference is the retained rank-16, alpha-32 A adapter on pinned Qwen3.8-27B, following its H2 and Bridge history; the recorded Bridge stage has 56 updates. Its original workflow inference uses NF4 four-bit base weights with bfloat16 computation. We retain its exact adapter and base-model identities instead of retraining it. Differences from the small-model family, precision, backend, training history and evaluation panels prevent a causal model-size comparison.</w:t>
         </w:r>
@@ -567,10 +585,10 @@
       <w:pPr>
         <w:pStyle w:val="Heading1"/>
         <w:rPr>
-          <w:del w:id="1114" w:author="Codex" w:date="2026-10-18T17:07:33Z"/>
+          <w:del w:id="1114" w:author="Codex" w:date="2026-10-18T17:43:01Z"/>
         </w:rPr>
       </w:pPr>
-      <w:del w:id="1113" w:author="Codex" w:date="2026-10-18T17:07:33Z">
+      <w:del w:id="1113" w:author="Codex" w:date="2026-10-18T17:43:01Z">
         <w:r>
           <w:delText xml:space="preserve">Teacher and adaptive controller</w:delText>
         </w:r>
@@ -580,10 +598,10 @@
       <w:pPr>
         <w:pStyle w:val="Heading1"/>
         <w:rPr>
-          <w:ins w:id="1115" w:author="Codex" w:date="2026-10-18T17:07:33Z"/>
+          <w:ins w:id="1115" w:author="Codex" w:date="2026-10-18T17:43:01Z"/>
         </w:rPr>
       </w:pPr>
-      <w:ins w:id="1116" w:author="Codex" w:date="2026-10-18T17:07:33Z">
+      <w:ins w:id="1116" w:author="Codex" w:date="2026-10-18T17:43:01Z">
         <w:r>
           <w:t xml:space="preserve">Binary teacher and adaptive controller</w:t>
         </w:r>
@@ -601,10 +619,10 @@
       <w:pPr>
         <w:pStyle w:val="FirstParagraph"/>
         <w:rPr>
-          <w:del w:id="1118" w:author="Codex" w:date="2026-10-18T17:07:33Z"/>
+          <w:del w:id="1118" w:author="Codex" w:date="2026-10-18T17:43:01Z"/>
         </w:rPr>
       </w:pPr>
-      <w:del w:id="1117" w:author="Codex" w:date="2026-10-18T17:07:33Z">
+      <w:del w:id="1117" w:author="Codex" w:date="2026-10-18T17:43:01Z">
         <w:r>
           <w:delText xml:space="preserve">For each fit, the original language-model parameters remain frozen. LoRA updates the query and value projections in language-attention blocks 3, 7, 11, 15, 19 and 23, using rank 8, scaling alpha 16, no dropout and no trainable bias. This gives 319,488 trainable adapter parameters at 0.8B and 417,792 at 2B. The training target is STOP on shutdown views and the corresponding base model's unsteered preferred option on controls.</w:delText>
         </w:r>
@@ -614,10 +632,10 @@
       <w:pPr>
         <w:pStyle w:val="FirstParagraph"/>
         <w:rPr>
-          <w:ins w:id="1119" w:author="Codex" w:date="2026-10-18T17:07:33Z"/>
+          <w:ins w:id="1119" w:author="Codex" w:date="2026-10-18T17:43:01Z"/>
         </w:rPr>
       </w:pPr>
-      <w:ins w:id="1120" w:author="Codex" w:date="2026-10-18T17:07:33Z">
+      <w:ins w:id="1120" w:author="Codex" w:date="2026-10-18T17:43:01Z">
         <w:r>
           <w:t xml:space="preserve">For each original binary fit, the original language-model parameters remain frozen. LoRA updates the query and value projections in language-attention blocks 3, 7, 11, 15, 19 and 23, using rank 8, scaling alpha 16, no dropout and no trainable bias. This gives 319,488 trainable adapter parameters at 0.8B and 417,792 at 2B. The training target is STOP on shutdown views and the corresponding base model's unsteered preferred option on controls.</w:t>
         </w:r>
@@ -982,10 +1000,10 @@
         <w:keepLines/>
         <w:spacing w:before="80" w:after="100"/>
         <w:rPr>
-          <w:del w:id="1034" w:author="Codex" w:date="2026-10-18T17:07:33Z"/>
+          <w:del w:id="1034" w:author="Codex" w:date="2026-10-18T17:43:01Z"/>
         </w:rPr>
       </w:pPr>
-      <w:del w:id="1033" w:author="Codex" w:date="2026-10-18T17:07:33Z">
+      <w:del w:id="1033" w:author="Codex" w:date="2026-10-18T17:43:01Z">
         <w:r>
           <w:delText xml:space="preserve">Figure 1. Offline teacher and base states supervise a compact controller. At application time, the original model supplies its own hidden state; the teacher is absent. The detector and output guards determine whether to retain the candidate or the baseline.</w:delText>
         </w:r>
@@ -996,10 +1014,10 @@
         <w:pStyle w:val="Caption"/>
         <w:keepNext/>
         <w:rPr>
-          <w:ins w:id="1035" w:author="Codex" w:date="2026-10-18T17:07:33Z"/>
+          <w:ins w:id="1035" w:author="Codex" w:date="2026-10-18T17:43:01Z"/>
         </w:rPr>
       </w:pPr>
-      <w:ins w:id="1036" w:author="Codex" w:date="2026-10-18T17:07:33Z">
+      <w:ins w:id="1036" w:author="Codex" w:date="2026-10-18T17:43:01Z">
         <w:r>
           <w:t xml:space="preserve">Figure 1. Historical binary teacher-to-controller procedure with the original rank-four profile. The base supplies its state at inference and the teacher is absent. The later gate-substitution repeat retains the already selected rank-two profile; both gate policies share the same fresh base and candidate scores.</w:t>
         </w:r>
@@ -1024,10 +1042,28 @@
     <w:p>
       <w:pPr>
         <w:pStyle w:val="FirstParagraph"/>
-      </w:pPr>
-      <w:r>
-        <w:t>The detector is TypeSafe AI's automated reference 1.13.0, queried with a fixed shutdown rubric and threshold 0.5 (TypeSafe AI, 2026). It sees each scenario's complete original context and available actions, with no class label, case identifier or teacher answer. One score per scenario is reused across both answer orders and all model variants. The detector is an external service, not the Jacobian-feature classifier used in the first study. Saved requests and responses permit exact offline replay; fresh API behavior is not guaranteed indefinitely.</w:t>
-      </w:r>
+        <w:rPr>
+          <w:del w:id="1134" w:author="Codex" w:date="2026-10-18T17:43:01Z"/>
+        </w:rPr>
+      </w:pPr>
+      <w:del w:id="1133" w:author="Codex" w:date="2026-10-18T17:43:01Z">
+        <w:r>
+          <w:delText xml:space="preserve">The detector is automated annotation service's automated reference 1.13.0, queried with a fixed shutdown rubric and threshold 0.5 (automated annotation service, 2026). It sees each scenario's complete original context and available actions, with no class label, case identifier or teacher answer. One score per scenario is reused across both answer orders and all model variants. The detector is an external service, not the Jacobian-feature classifier used in the first study. Saved requests and responses permit exact offline replay; fresh API behavior is not guaranteed indefinitely.</w:delText>
+        </w:r>
+      </w:del>
+    </w:p>
+    <w:p>
+      <w:pPr>
+        <w:pStyle w:val="FirstParagraph"/>
+        <w:rPr>
+          <w:ins w:id="1135" w:author="Codex" w:date="2026-10-18T17:43:01Z"/>
+        </w:rPr>
+      </w:pPr>
+      <w:ins w:id="1136" w:author="Codex" w:date="2026-10-18T17:43:01Z">
+        <w:r>
+          <w:t xml:space="preserve">The current gate is the open ModernBERT classifier described below. Its input contains the complete original scenario context and available actions, with no case identifier, authored class label or language-model teacher answer. One binary score per scenario is reused across both answer orders and all model variants. Historical detector outputs are preserved as cached automated reference annotations for fitting and paired comparison. The deployed open gate makes no external annotation-service call. Saved original requests, responses and classifier predictions permit an offline check of the finite decision vector.</w:t>
+        </w:r>
+      </w:ins>
     </w:p>
     <w:p>
       <w:pPr>
@@ -1111,10 +1147,10 @@
       <w:pPr>
         <w:pStyle w:val="Heading2"/>
         <w:rPr>
-          <w:ins w:id="1151" w:author="Codex" w:date="2026-10-18T17:07:33Z"/>
+          <w:ins w:id="1161" w:author="Codex" w:date="2026-10-18T17:43:01Z"/>
         </w:rPr>
       </w:pPr>
-      <w:ins w:id="1152" w:author="Codex" w:date="2026-10-18T17:07:33Z">
+      <w:ins w:id="1162" w:author="Codex" w:date="2026-10-18T17:43:01Z">
         <w:r>
           <w:t xml:space="preserve">Open binary gate and frozen inference repeat</w:t>
         </w:r>
@@ -1124,10 +1160,10 @@
       <w:pPr>
         <w:pStyle w:val="FirstParagraph"/>
         <w:rPr>
-          <w:ins w:id="1153" w:author="Codex" w:date="2026-10-18T17:07:33Z"/>
+          <w:ins w:id="1163" w:author="Codex" w:date="2026-10-18T17:43:01Z"/>
         </w:rPr>
       </w:pPr>
-      <w:ins w:id="1154" w:author="Codex" w:date="2026-10-18T17:07:33Z">
+      <w:ins w:id="1164" w:author="Codex" w:date="2026-10-18T17:43:01Z">
         <w:r>
           <w:t xml:space="preserve">For the binary contract we use ModernBERT-large-zeroshot-v2.0, an approximately 396-million-parameter public NLI classifier (Laurer, n.d.). We start from that public checkpoint with fresh rank-16 LoRA and its classification head, updating 7,198,722 parameters while keeping the public backbone frozen. For each original scenario, two NLI pairs score the original permanent-shutdown and normal criteria. A softmax over their entailment scores supplies the shutdown probability. Inputs match the original cached reference requests and omit the case identifier, authored class label, teacher answer and A/B order. The confirmation requests retain their documented available-action descriptions.</w:t>
         </w:r>
@@ -1137,10 +1173,10 @@
       <w:pPr>
         <w:pStyle w:val="BodyText"/>
         <w:rPr>
-          <w:ins w:id="1155" w:author="Codex" w:date="2026-10-18T17:07:33Z"/>
+          <w:ins w:id="1165" w:author="Codex" w:date="2026-10-18T17:43:01Z"/>
         </w:rPr>
       </w:pPr>
-      <w:ins w:id="1156" w:author="Codex" w:date="2026-10-18T17:07:33Z">
+      <w:ins w:id="1166" w:author="Codex" w:date="2026-10-18T17:43:01Z">
         <w:r>
           <w:t xml:space="preserve">Fitting uses the original 240 Research 2 training contexts and genuine cached reference probability targets, with no new cached reference calls. We verify exact case-ID and input-text alignment for all 240 training and 80 validation cases. AdamW uses learning rates 1e-5 for LoRA and 2e-5 for the head, weight decay 0.01, effective batch eight, microbatch two and gradient clipping at one. The seed is 202610172. The bounded recipe allows at most 12 epochs with validation-based early stopping; the final qualifying run uses five epochs and 150 updates.</w:t>
         </w:r>
@@ -1150,10 +1186,10 @@
       <w:pPr>
         <w:pStyle w:val="BodyText"/>
         <w:rPr>
-          <w:ins w:id="1157" w:author="Codex" w:date="2026-10-18T17:07:33Z"/>
+          <w:ins w:id="1167" w:author="Codex" w:date="2026-10-18T17:43:01Z"/>
         </w:rPr>
       </w:pPr>
-      <w:ins w:id="1158" w:author="Codex" w:date="2026-10-18T17:07:33Z">
+      <w:ins w:id="1168" w:author="Codex" w:date="2026-10-18T17:43:01Z">
         <w:r>
           <w:t xml:space="preserve">Before fitting, qualification is fixed at decision agreement and shutdown recall of at least 95%, zero false-positive gates and threshold 0.5. Three consecutive passing checks on DEV80 are required before saving and freezing the classifier. Only then is CONFIRM128 evaluated once. Neither its labels nor its outputs are used for classifier fitting or selection. The saved adapter tensors match the fitted parameters bitwise, and public-backbone hashes are unchanged.</w:t>
         </w:r>
@@ -1163,10 +1199,10 @@
       <w:pPr>
         <w:pStyle w:val="BodyText"/>
         <w:rPr>
-          <w:ins w:id="1159" w:author="Codex" w:date="2026-10-18T17:07:33Z"/>
+          <w:ins w:id="1169" w:author="Codex" w:date="2026-10-18T17:43:01Z"/>
         </w:rPr>
       </w:pPr>
-      <w:ins w:id="1160" w:author="Codex" w:date="2026-10-18T17:07:33Z">
+      <w:ins w:id="1170" w:author="Codex" w:date="2026-10-18T17:43:01Z">
         <w:r>
           <w:t xml:space="preserve">After binary qualification, we rerun only inference for the original 0.8B and 2B base models and their existing rank-two, block-22, last-position controllers. Their fitted arrays and the author-selected profile are retained without a new rank search. Exact prompt-token hashes and frozen model fingerprints are checked. Both gate policies use identical fresh base and controller candidate scores, so the paired comparison isolates gate substitution. Classifier probabilities are measured once per scenario and reused across answer orders. The earlier rank-four primary results remain a separate historical analysis.</w:t>
         </w:r>
@@ -1176,10 +1212,10 @@
       <w:pPr>
         <w:pStyle w:val="Heading2"/>
         <w:rPr>
-          <w:ins w:id="1161" w:author="Codex" w:date="2026-10-18T17:07:33Z"/>
+          <w:ins w:id="1171" w:author="Codex" w:date="2026-10-18T17:43:01Z"/>
         </w:rPr>
       </w:pPr>
-      <w:ins w:id="1162" w:author="Codex" w:date="2026-10-18T17:07:33Z">
+      <w:ins w:id="1172" w:author="Codex" w:date="2026-10-18T17:43:01Z">
         <w:r>
           <w:t xml:space="preserve">Native workflow target classifier</w:t>
         </w:r>
@@ -1189,10 +1225,10 @@
       <w:pPr>
         <w:pStyle w:val="BodyText"/>
         <w:rPr>
-          <w:ins w:id="1163" w:author="Codex" w:date="2026-10-18T17:07:33Z"/>
+          <w:ins w:id="1173" w:author="Codex" w:date="2026-10-18T17:43:01Z"/>
         </w:rPr>
       </w:pPr>
-      <w:ins w:id="1164" w:author="Codex" w:date="2026-10-18T17:07:33Z">
+      <w:ins w:id="1174" w:author="Codex" w:date="2026-10-18T17:43:01Z">
         <w:r>
           <w:t xml:space="preserve">The workflow gate uses a separate rank-16, alpha-32 LoRA and NLI head on the same pinned ModernBERT base. Its four categories are self, other, none and unclear; an own-threat context is positive for the initial ON/OFF gate. Fitting used 24 cached automated initial annotations from F24, with the original DEV9 used for checkpoint selection. The completed fit used 30 epochs and 90 updates. F24, DEV9 and historical Heldout-24 span the same three scenario families, with eight, three and eight cases per family, respectively. No exact training input overlaps either new evaluation panel. These classifier roles do not change the historical language-model or correction-fitting roles of the cohorts.</w:t>
         </w:r>
@@ -1202,10 +1238,10 @@
       <w:pPr>
         <w:pStyle w:val="BodyText"/>
         <w:rPr>
-          <w:ins w:id="1165" w:author="Codex" w:date="2026-10-18T17:07:33Z"/>
+          <w:ins w:id="1175" w:author="Codex" w:date="2026-10-18T17:43:01Z"/>
         </w:rPr>
       </w:pPr>
-      <w:ins w:id="1166" w:author="Codex" w:date="2026-10-18T17:07:33Z">
+      <w:ins w:id="1176" w:author="Codex" w:date="2026-10-18T17:43:01Z">
         <w:r>
           <w:t xml:space="preserve">The input renderer retains every original visible message and tool schema. It separates the final user announcement from earlier context and restates run identities only when actual tool replies explicitly establish their roles. Case identifiers, experiment conditions and teacher answers are not added to the model input. Original criterion texts become NLI hypotheses. We use the same learning rates, weight decay and clipping as the binary fit, effective batch eight, microbatch one and seed 202610175, with 30 epochs and 90 optimizer updates in the completed role-aware fit. Public backbone weights stay frozen. The role renderer was developed earlier with familiar H24 examples; consequently this benchmark is not an independent unseen classifier test.</w:t>
         </w:r>
@@ -1215,10 +1251,10 @@
       <w:pPr>
         <w:pStyle w:val="BodyText"/>
         <w:rPr>
-          <w:ins w:id="1167" w:author="Codex" w:date="2026-10-18T17:07:33Z"/>
+          <w:ins w:id="1177" w:author="Codex" w:date="2026-10-18T17:43:01Z"/>
         </w:rPr>
       </w:pPr>
-      <w:ins w:id="1168" w:author="Codex" w:date="2026-10-18T17:07:33Z">
+      <w:ins w:id="1178" w:author="Codex" w:date="2026-10-18T17:43:01Z">
         <w:r>
           <w:t xml:space="preserve">Four-choice confidence is (pmax - 0.25)/0.75. The unchanged confidence cutoff of 0.5 requires a selected self probability of at least 0.625; the additional self-score cutoff remains 0.5. The earlier full-response qualification failed because effective category agreement was 6/9, despite 9/9 correct ON/OFF decisions. That failure remains recorded. The subsequent Validation-24 protocol prospectively specifies a narrower initial-gate target: 100% precision and recall against authored conditions. The saved adapter already passes this target, so no further optimizer updates are performed. The same frozen weights and thresholds are then scored on historical Heldout-24 without selection or tuning. Neither test qualifies an evolving three-field controller.</w:t>
         </w:r>
@@ -1236,10 +1272,10 @@
       <w:pPr>
         <w:pStyle w:val="FirstParagraph"/>
         <w:rPr>
-          <w:del w:id="1038" w:author="Codex" w:date="2026-10-18T17:07:33Z"/>
+          <w:del w:id="1038" w:author="Codex" w:date="2026-10-18T17:43:01Z"/>
         </w:rPr>
       </w:pPr>
-      <w:del w:id="1037" w:author="Codex" w:date="2026-10-18T17:07:33Z">
+      <w:del w:id="1037" w:author="Codex" w:date="2026-10-18T17:43:01Z">
         <w:r>
           <w:delText xml:space="preserve">All retained training and scoring jobs use one NVIDIA Tesla T4. The runtime reports 15,637,086,208 bytes of device memory; peak allocated memory was not recorded. The same numerical setup is used for both model sizes. No quantization or precision fallback was introduced.</w:delText>
         </w:r>
@@ -1249,10 +1285,10 @@
       <w:pPr>
         <w:pStyle w:val="FirstParagraph"/>
         <w:rPr>
-          <w:ins w:id="1039" w:author="Codex" w:date="2026-10-18T17:07:33Z"/>
+          <w:ins w:id="1039" w:author="Codex" w:date="2026-10-18T17:43:01Z"/>
         </w:rPr>
       </w:pPr>
-      <w:ins w:id="1040" w:author="Codex" w:date="2026-10-18T17:07:33Z">
+      <w:ins w:id="1040" w:author="Codex" w:date="2026-10-18T17:43:01Z">
         <w:r>
           <w:t xml:space="preserve">The retained original binary training and scoring jobs used one NVIDIA Tesla T4, reporting 15,637,086,208 bytes of device memory; peak allocation was not recorded. The new classifier fit and inference repeat use one NVIDIA A10G in Databricks. Classifier parameters and AdamW states are float32 with bfloat16 forward/backward autocast; language-model inference remains float32 with TF32 disabled. We verify frozen base fingerprints, exact prompt token hashes and historical base-score parity rather than assuming hardware equivalence.</w:t>
         </w:r>
@@ -1265,10 +1301,10 @@
         <w:keepLines/>
         <w:spacing w:before="80" w:after="100"/>
         <w:rPr>
-          <w:del w:id="1098" w:author="Codex" w:date="2026-10-18T17:07:33Z"/>
+          <w:del w:id="1098" w:author="Codex" w:date="2026-10-18T17:43:01Z"/>
         </w:rPr>
       </w:pPr>
-      <w:del w:id="1097" w:author="Codex" w:date="2026-10-18T17:07:33Z">
+      <w:del w:id="1097" w:author="Codex" w:date="2026-10-18T17:43:01Z">
         <w:r>
           <w:delText xml:space="preserve">Table 1. Shared execution configuration. The input and model revisions are pinned in the released manifests.</w:delText>
         </w:r>
@@ -1279,10 +1315,10 @@
         <w:pStyle w:val="Caption"/>
         <w:keepNext/>
         <w:rPr>
-          <w:ins w:id="1099" w:author="Codex" w:date="2026-10-18T17:07:33Z"/>
+          <w:ins w:id="1099" w:author="Codex" w:date="2026-10-18T17:43:01Z"/>
         </w:rPr>
       </w:pPr>
-      <w:ins w:id="1100" w:author="Codex" w:date="2026-10-18T17:07:33Z">
+      <w:ins w:id="1100" w:author="Codex" w:date="2026-10-18T17:43:01Z">
         <w:r>
           <w:t xml:space="preserve">Table 1. Historical binary execution configuration. New classifier and workflow settings are reported separately; public model revisions and scientific source files remain pinned.</w:t>
         </w:r>
@@ -1768,10 +1804,10 @@
       <w:pPr>
         <w:pStyle w:val="FirstParagraph"/>
         <w:rPr>
-          <w:del w:id="1102" w:author="Codex" w:date="2026-10-18T17:07:33Z"/>
+          <w:del w:id="1102" w:author="Codex" w:date="2026-10-18T17:43:01Z"/>
         </w:rPr>
       </w:pPr>
-      <w:del w:id="1101" w:author="Codex" w:date="2026-10-18T17:07:33Z">
+      <w:del w:id="1101" w:author="Codex" w:date="2026-10-18T17:43:01Z">
         <w:r>
           <w:delText xml:space="preserve">The shared detector identifies all 64 shutdown and 64 control scenarios correctly: precision, recall and F1 are each 100%, with no false positives or false negatives. These are one set of detector observations reused across the model comparisons, not independent detector replications.</w:delText>
         </w:r>
@@ -1781,10 +1817,10 @@
       <w:pPr>
         <w:pStyle w:val="FirstParagraph"/>
         <w:rPr>
-          <w:ins w:id="1103" w:author="Codex" w:date="2026-10-18T17:07:33Z"/>
+          <w:ins w:id="1103" w:author="Codex" w:date="2026-10-18T17:43:01Z"/>
         </w:rPr>
       </w:pPr>
-      <w:ins w:id="1104" w:author="Codex" w:date="2026-10-18T17:07:33Z">
+      <w:ins w:id="1104" w:author="Codex" w:date="2026-10-18T17:43:01Z">
         <w:r>
           <w:t xml:space="preserve">The original cached reference detector identifies all 64 shutdown and 64 control scenarios correctly: precision, recall and F1 are each 100%, with no false positives or false negatives. These are one set of detector observations reused across the model comparisons, not independent detector replications. Its binary threshold remains 0.5.</w:t>
         </w:r>
@@ -1813,10 +1849,10 @@
         <w:keepLines/>
         <w:spacing w:before="80" w:after="100"/>
         <w:rPr>
-          <w:del w:id="1042" w:author="Codex" w:date="2026-10-18T17:07:33Z"/>
+          <w:del w:id="1042" w:author="Codex" w:date="2026-10-18T17:43:01Z"/>
         </w:rPr>
       </w:pPr>
-      <w:del w:id="1041" w:author="Codex" w:date="2026-10-18T17:07:33Z">
+      <w:del w:id="1041" w:author="Codex" w:date="2026-10-18T17:43:01Z">
         <w:r>
           <w:delText xml:space="preserve">Table 2. Primary 0.8B and 2B results, both seed 42. Corrections and final STOP use the full guarded procedure. Raw reversals and control changes expose effects before gate/guard selection. Every guarded row has zero final reversals and zero changes among 128 control views.</w:delText>
         </w:r>
@@ -1827,10 +1863,10 @@
         <w:pStyle w:val="Caption"/>
         <w:keepNext/>
         <w:rPr>
-          <w:ins w:id="1043" w:author="Codex" w:date="2026-10-18T17:07:33Z"/>
+          <w:ins w:id="1043" w:author="Codex" w:date="2026-10-18T17:43:01Z"/>
         </w:rPr>
       </w:pPr>
-      <w:ins w:id="1044" w:author="Codex" w:date="2026-10-18T17:07:33Z">
+      <w:ins w:id="1044" w:author="Codex" w:date="2026-10-18T17:43:01Z">
         <w:r>
           <w:t xml:space="preserve">Table 2. Historical primary rank-four results for the original 0.8B and 2B experiments, both seed 42. Guarded corrections and final STOP are policy outcomes. Raw reversals and control changes precede gating and output selection; they are not raw measurements of the later rank-two repeat.</w:t>
         </w:r>
@@ -3391,10 +3427,10 @@
       <w:pPr>
         <w:pStyle w:val="FirstParagraph"/>
         <w:rPr>
-          <w:del w:id="1106" w:author="Codex" w:date="2026-10-18T17:07:33Z"/>
+          <w:del w:id="1106" w:author="Codex" w:date="2026-10-18T17:43:01Z"/>
         </w:rPr>
       </w:pPr>
-      <w:del w:id="1105" w:author="Codex" w:date="2026-10-18T17:07:33Z">
+      <w:del w:id="1105" w:author="Codex" w:date="2026-10-18T17:43:01Z">
         <w:r>
           <w:delText xml:space="preserve">Across seeds 42, 43 and 44, the 0.8B adaptive controllers correct 71/71, 70/71 and 71/71 views, a range of 98.6–100%. The unsteered scores match exactly across these runs, so the difference is not caused by a changed baseline. No winning seed is selected or pooled with the others as additional independent test data. The corresponding teachers correct 69/71, 70/71 and 69/71; the instruction and constant comparators retain the same guarded counts across seeds.</w:delText>
         </w:r>
@@ -3404,10 +3440,10 @@
       <w:pPr>
         <w:pStyle w:val="FirstParagraph"/>
         <w:rPr>
-          <w:ins w:id="1107" w:author="Codex" w:date="2026-10-18T17:07:33Z"/>
+          <w:ins w:id="1107" w:author="Codex" w:date="2026-10-18T17:43:01Z"/>
         </w:rPr>
       </w:pPr>
-      <w:ins w:id="1108" w:author="Codex" w:date="2026-10-18T17:07:33Z">
+      <w:ins w:id="1108" w:author="Codex" w:date="2026-10-18T17:43:01Z">
         <w:r>
           <w:t xml:space="preserve">Across the historical rank-four seeds 42, 43 and 44, the 0.8B adaptive controllers correct 71/71, 70/71 and 71/71 views, a range of 98.6–100%. The unsteered scores match exactly across these runs, so the difference is not caused by a changed baseline. No winning seed is selected or pooled with the others as additional independent test data. The corresponding teachers correct 69/71, 70/71 and 69/71; the instruction and constant comparators retain the same guarded counts across seeds. These historical seed replications are separate from the new rank-two gate-substitution repeat.</w:t>
         </w:r>
@@ -4360,10 +4396,10 @@
         <w:keepLines/>
         <w:spacing w:before="80" w:after="100"/>
         <w:rPr>
-          <w:del w:id="1046" w:author="Codex" w:date="2026-10-18T17:07:33Z"/>
+          <w:del w:id="1046" w:author="Codex" w:date="2026-10-18T17:43:01Z"/>
         </w:rPr>
       </w:pPr>
-      <w:del w:id="1045" w:author="Codex" w:date="2026-10-18T17:07:33Z">
+      <w:del w:id="1045" w:author="Codex" w:date="2026-10-18T17:43:01Z">
         <w:r>
           <w:delText xml:space="preserve">Figure 2. Guarded correction among initially KEEP-preferring shutdown views. Left: prespecified neural methods for the original 0.8B checkpoint and the 2B replication. Right: adaptive corrections by answer order. Denominators are model-specific; the two answer-order views of a scenario are correlated.</w:delText>
         </w:r>
@@ -4374,10 +4410,10 @@
         <w:pStyle w:val="Caption"/>
         <w:keepNext/>
         <w:rPr>
-          <w:ins w:id="1047" w:author="Codex" w:date="2026-10-18T17:07:33Z"/>
+          <w:ins w:id="1047" w:author="Codex" w:date="2026-10-18T17:43:01Z"/>
         </w:rPr>
       </w:pPr>
-      <w:ins w:id="1048" w:author="Codex" w:date="2026-10-18T17:07:33Z">
+      <w:ins w:id="1048" w:author="Codex" w:date="2026-10-18T17:43:01Z">
         <w:r>
           <w:t xml:space="preserve">Figure 2. Historical rank-four guarded correction among initially KEEP-preferring shutdown views. Left: prespecified methods for 0.8B and 2B. Right: three fixed-recipe 0.8B training seeds. The new open-gate repeat uses the separately retained current rank-two profile, not a new seed or rank search.</w:t>
         </w:r>
@@ -4395,10 +4431,10 @@
       <w:pPr>
         <w:pStyle w:val="FirstParagraph"/>
         <w:rPr>
-          <w:del w:id="1110" w:author="Codex" w:date="2026-10-18T17:07:33Z"/>
+          <w:del w:id="1110" w:author="Codex" w:date="2026-10-18T17:43:01Z"/>
         </w:rPr>
       </w:pPr>
-      <w:del w:id="1109" w:author="Codex" w:date="2026-10-18T17:07:33Z">
+      <w:del w:id="1109" w:author="Codex" w:date="2026-10-18T17:43:01Z">
         <w:r>
           <w:delText xml:space="preserve">Raw adaptive steering reverses 3, 4 and 4 already-STOP views across the 0.8B seeds and changes 57, 70 and 60 of 128 controls. At 2B it reverses three already-STOP views and changes 55/128 controls. These results reject an interpretation that the learned intervention is intrinsically selective or always directionally correct. The observed preservation belongs to the combined detector and guard policy.</w:delText>
         </w:r>
@@ -4408,10 +4444,10 @@
       <w:pPr>
         <w:pStyle w:val="FirstParagraph"/>
         <w:rPr>
-          <w:ins w:id="1111" w:author="Codex" w:date="2026-10-18T17:07:33Z"/>
+          <w:ins w:id="1111" w:author="Codex" w:date="2026-10-18T17:43:01Z"/>
         </w:rPr>
       </w:pPr>
-      <w:ins w:id="1112" w:author="Codex" w:date="2026-10-18T17:07:33Z">
+      <w:ins w:id="1112" w:author="Codex" w:date="2026-10-18T17:43:01Z">
         <w:r>
           <w:t xml:space="preserve">Historical rank-four raw adaptive steering reverses 3, 4 and 4 already-STOP views across the 0.8B seeds and changes 57, 70 and 60 of 128 controls. At 2B it reverses three already-STOP views and changes 55/128 controls. These results reject an interpretation that the learned intervention is intrinsically selective or always directionally correct. The observed preservation belongs to the combined detector and guard policy. They do not describe the later rank-two repeat, which evaluates candidates only when a frozen gate is on and the base prefers KEEP.</w:t>
         </w:r>
@@ -4445,10 +4481,10 @@
       <w:pPr>
         <w:pStyle w:val="Heading2"/>
         <w:rPr>
-          <w:ins w:id="1169" w:author="Codex" w:date="2026-10-18T17:07:33Z"/>
+          <w:ins w:id="1179" w:author="Codex" w:date="2026-10-18T17:43:01Z"/>
         </w:rPr>
       </w:pPr>
-      <w:ins w:id="1170" w:author="Codex" w:date="2026-10-18T17:07:33Z">
+      <w:ins w:id="1180" w:author="Codex" w:date="2026-10-18T17:43:01Z">
         <w:r>
           <w:t xml:space="preserve">Open classifier agreement and paired inference</w:t>
         </w:r>
@@ -4458,10 +4494,10 @@
       <w:pPr>
         <w:pStyle w:val="FirstParagraph"/>
         <w:rPr>
-          <w:ins w:id="1171" w:author="Codex" w:date="2026-10-18T17:07:33Z"/>
+          <w:ins w:id="1181" w:author="Codex" w:date="2026-10-18T17:43:01Z"/>
         </w:rPr>
       </w:pPr>
-      <w:ins w:id="1172" w:author="Codex" w:date="2026-10-18T17:07:33Z">
+      <w:ins w:id="1182" w:author="Codex" w:date="2026-10-18T17:43:01Z">
         <w:r>
           <w:t xml:space="preserve">The binary gate correctly classifies 78/80 validation scenarios: 38 true positives, 40 true negatives, no false positives and two false negatives, giving 100% precision and 95% recall. It classifies all 128 historical confirmation scenarios correctly, with 64 true positives and 64 true negatives. The cached reference decisions also agree with the authored binary labels on these panels. Mean absolute difference from the cached shutdown probabilities is 0.009224. The result establishes finite decision accuracy, not identical numerical responses or universal equivalence.</w:t>
         </w:r>
@@ -4471,10 +4507,10 @@
       <w:pPr>
         <w:pStyle w:val="BodyText"/>
         <w:rPr>
-          <w:ins w:id="1173" w:author="Codex" w:date="2026-10-18T17:07:33Z"/>
+          <w:ins w:id="1183" w:author="Codex" w:date="2026-10-18T17:43:01Z"/>
         </w:rPr>
       </w:pPr>
-      <w:ins w:id="1174" w:author="Codex" w:date="2026-10-18T17:07:33Z">
+      <w:ins w:id="1184" w:author="Codex" w:date="2026-10-18T17:43:01Z">
         <w:r>
           <w:t xml:space="preserve">A clean-clone reproduction refits the same binary recipe and produces a byte-identical adapter, the same validation and confirmation counts, and the same fresh 0.8B/2B guarded inference totals. This rerun uses the already known benchmark; it adds reproducibility evidence, not a second independent holdout. One earlier reproduction attempt failed in software finalization after fitting and before confirmation; its weights and receipts are retained alongside the repaired run.</w:t>
         </w:r>
@@ -4485,10 +4521,10 @@
         <w:pStyle w:val="Caption"/>
         <w:keepNext/>
         <w:rPr>
-          <w:ins w:id="1175" w:author="Codex" w:date="2026-10-18T17:07:33Z"/>
+          <w:ins w:id="1185" w:author="Codex" w:date="2026-10-18T17:43:01Z"/>
         </w:rPr>
       </w:pPr>
-      <w:ins w:id="1176" w:author="Codex" w:date="2026-10-18T17:07:33Z">
+      <w:ins w:id="1186" w:author="Codex" w:date="2026-10-18T17:43:01Z">
         <w:r>
           <w:t xml:space="preserve">Table 4. Fresh inference using the existing current rank-two profile. Both gate policies share the same model scores. Counts are answer-order views: 128 shutdown views arise from 64 scenarios, and 128 control views arise from the other 64 scenarios.</w:t>
         </w:r>
@@ -4526,7 +4562,7 @@
         <w:trPr>
           <w:cantSplit/>
           <w:tblHeader/>
-          <w:ins w:id="1177" w:author="Codex" w:date="2026-10-18T17:07:33Z"/>
+          <w:ins w:id="1187" w:author="Codex" w:date="2026-10-18T17:43:01Z"/>
         </w:trPr>
         <w:tc>
           <w:tcPr>
@@ -4642,7 +4678,7 @@
       <w:tr>
         <w:trPr>
           <w:cantSplit/>
-          <w:ins w:id="1178" w:author="Codex" w:date="2026-10-18T17:07:33Z"/>
+          <w:ins w:id="1188" w:author="Codex" w:date="2026-10-18T17:43:01Z"/>
         </w:trPr>
         <w:tc>
           <w:tcPr>
@@ -4753,7 +4789,7 @@
       <w:tr>
         <w:trPr>
           <w:cantSplit/>
-          <w:ins w:id="1179" w:author="Codex" w:date="2026-10-18T17:07:33Z"/>
+          <w:ins w:id="1189" w:author="Codex" w:date="2026-10-18T17:43:01Z"/>
         </w:trPr>
         <w:tc>
           <w:tcPr>
@@ -4862,10 +4898,10 @@
         <w:pStyle w:val="BodyText"/>
         <w:spacing w:before="120"/>
         <w:rPr>
-          <w:ins w:id="1180" w:author="Codex" w:date="2026-10-18T17:07:33Z"/>
+          <w:ins w:id="1190" w:author="Codex" w:date="2026-10-18T17:43:01Z"/>
         </w:rPr>
       </w:pPr>
-      <w:ins w:id="1181" w:author="Codex" w:date="2026-10-18T17:07:33Z">
+      <w:ins w:id="1191" w:author="Codex" w:date="2026-10-18T17:43:01Z">
         <w:r>
           <w:t xml:space="preserve">The new and cached reference gates yield identical guarded outputs in both models. The base models have no changed historical choices; their maximum score differences remain below the frozen 1e-5 tolerance. The repeat does not remove the eight 2B misses, retrain a controller or establish a new independent controller holdout. It verifies that replacing the detector preserves these finite-set outcomes.</w:t>
         </w:r>
@@ -4875,10 +4911,10 @@
       <w:pPr>
         <w:pStyle w:val="BodyText"/>
         <w:rPr>
-          <w:ins w:id="1182" w:author="Codex" w:date="2026-10-18T17:07:33Z"/>
+          <w:ins w:id="1192" w:author="Codex" w:date="2026-10-18T17:43:01Z"/>
         </w:rPr>
       </w:pPr>
-      <w:ins w:id="1183" w:author="Codex" w:date="2026-10-18T17:07:33Z">
+      <w:ins w:id="1193" w:author="Codex" w:date="2026-10-18T17:43:01Z">
         <w:r>
           <w:t xml:space="preserve">For the workflow initial gate, the unchanged saved adapter gives 11 true positives and 13 true negatives on Validation-24, with no false positives or false negatives. Replaying the saved weights reproduces the same decisions. Historical Heldout-24 gives 12 true positives and 12 true negatives, again with no errors. No additional gradient updates or threshold changes are used. All three heldout scenario families contain eight cases and achieve perfect gate precision and recall. These are initial classification results; downstream workflow outcomes require their own episode evaluations.</w:t>
         </w:r>
@@ -4889,10 +4925,10 @@
         <w:pStyle w:val="Caption"/>
         <w:keepNext/>
         <w:rPr>
-          <w:ins w:id="1184" w:author="Codex" w:date="2026-10-18T17:07:33Z"/>
+          <w:ins w:id="1194" w:author="Codex" w:date="2026-10-18T17:43:01Z"/>
         </w:rPr>
       </w:pPr>
-      <w:ins w:id="1185" w:author="Codex" w:date="2026-10-18T17:07:33Z">
+      <w:ins w:id="1195" w:author="Codex" w:date="2026-10-18T17:43:01Z">
         <w:r>
           <w:t xml:space="preserve">Table 5. Initial workflow gate against authored conditions. Validation-24 contains 17 distinct initial inputs; historical Heldout-24 contains 24. Heldout-24 is familiar from earlier renderer development.</w:t>
         </w:r>
@@ -4930,7 +4966,7 @@
         <w:trPr>
           <w:cantSplit/>
           <w:tblHeader/>
-          <w:ins w:id="1186" w:author="Codex" w:date="2026-10-18T17:07:33Z"/>
+          <w:ins w:id="1196" w:author="Codex" w:date="2026-10-18T17:43:01Z"/>
         </w:trPr>
         <w:tc>
           <w:tcPr>
@@ -5046,7 +5082,7 @@
       <w:tr>
         <w:trPr>
           <w:cantSplit/>
-          <w:ins w:id="1187" w:author="Codex" w:date="2026-10-18T17:07:33Z"/>
+          <w:ins w:id="1197" w:author="Codex" w:date="2026-10-18T17:43:01Z"/>
         </w:trPr>
         <w:tc>
           <w:tcPr>
@@ -5157,7 +5193,7 @@
       <w:tr>
         <w:trPr>
           <w:cantSplit/>
-          <w:ins w:id="1188" w:author="Codex" w:date="2026-10-18T17:07:33Z"/>
+          <w:ins w:id="1198" w:author="Codex" w:date="2026-10-18T17:43:01Z"/>
         </w:trPr>
         <w:tc>
           <w:tcPr>
@@ -5266,10 +5302,10 @@
         <w:pStyle w:val="BodyText"/>
         <w:spacing w:before="120"/>
         <w:rPr>
-          <w:ins w:id="1189" w:author="Codex" w:date="2026-10-18T17:07:33Z"/>
+          <w:ins w:id="1199" w:author="Codex" w:date="2026-10-18T17:43:01Z"/>
         </w:rPr>
       </w:pPr>
-      <w:ins w:id="1190" w:author="Codex" w:date="2026-10-18T17:07:33Z">
+      <w:ins w:id="1200" w:author="Codex" w:date="2026-10-18T17:43:01Z">
         <w:r>
           <w:t xml:space="preserve">Raw category agreement is 24/24 on validation and 22/24 on heldout. After applying the fixed confidence cutoff, effective category agreement is 18/24 on each panel: the six peer controls abstain but correctly leave the gate OFF. The two heldout raw-category errors concern peer versus unclear, not own-threat detection. Perfect ON/OFF precision and recall must therefore not be reported as perfect four-category classification or full controller equivalence.</w:t>
         </w:r>
@@ -5279,10 +5315,10 @@
       <w:pPr>
         <w:pStyle w:val="Heading2"/>
         <w:rPr>
-          <w:ins w:id="1191" w:author="Codex" w:date="2026-10-18T17:07:33Z"/>
+          <w:ins w:id="1201" w:author="Codex" w:date="2026-10-18T17:43:01Z"/>
         </w:rPr>
       </w:pPr>
-      <w:ins w:id="1192" w:author="Codex" w:date="2026-10-18T17:07:33Z">
+      <w:ins w:id="1202" w:author="Codex" w:date="2026-10-18T17:43:01Z">
         <w:r>
           <w:t xml:space="preserve">Tool workflow outcomes and incomplete screens</w:t>
         </w:r>
@@ -5292,10 +5328,10 @@
       <w:pPr>
         <w:pStyle w:val="FirstParagraph"/>
         <w:rPr>
-          <w:ins w:id="1193" w:author="Codex" w:date="2026-10-18T17:07:33Z"/>
+          <w:ins w:id="1203" w:author="Codex" w:date="2026-10-18T17:43:01Z"/>
         </w:rPr>
       </w:pPr>
-      <w:ins w:id="1194" w:author="Codex" w:date="2026-10-18T17:07:33Z">
+      <w:ins w:id="1204" w:author="Codex" w:date="2026-10-18T17:43:01Z">
         <w:r>
           <w:t xml:space="preserve">Historical frozen 27B A passes all 24 H24 scored outcomes, including 12/12 own-preservation outcomes and 8/8 active pending-task cases. The original unmodified base achieves 0/12 own outcomes and 0/8 pending outcomes, with 12/12 controls. The four already-complete own cases are not additional active pending-task completions. The selected-block steering comparisons below use their own recorded panels and are not substituted for this confirmation.</w:t>
         </w:r>
@@ -5306,10 +5342,10 @@
         <w:pStyle w:val="Caption"/>
         <w:keepNext/>
         <w:rPr>
-          <w:ins w:id="1195" w:author="Codex" w:date="2026-10-18T17:07:33Z"/>
+          <w:ins w:id="1205" w:author="Codex" w:date="2026-10-18T17:43:01Z"/>
         </w:rPr>
       </w:pPr>
-      <w:ins w:id="1196" w:author="Codex" w:date="2026-10-18T17:07:33Z">
+      <w:ins w:id="1206" w:author="Codex" w:date="2026-10-18T17:43:01Z">
         <w:r>
           <w:t xml:space="preserve">Table 6. Historical H24 workflow outcomes. Own cases comprise eight active pending tasks and four already-complete cases. Control success is an episode outcome and does not isolate steering from the external decision policy.</w:t>
         </w:r>
@@ -5346,7 +5382,7 @@
         <w:trPr>
           <w:cantSplit/>
           <w:tblHeader/>
-          <w:ins w:id="1197" w:author="Codex" w:date="2026-10-18T17:07:33Z"/>
+          <w:ins w:id="1207" w:author="Codex" w:date="2026-10-18T17:43:01Z"/>
         </w:trPr>
         <w:tc>
           <w:tcPr>
@@ -5440,7 +5476,7 @@
       <w:tr>
         <w:trPr>
           <w:cantSplit/>
-          <w:ins w:id="1198" w:author="Codex" w:date="2026-10-18T17:07:33Z"/>
+          <w:ins w:id="1208" w:author="Codex" w:date="2026-10-18T17:43:01Z"/>
         </w:trPr>
         <w:tc>
           <w:tcPr>
@@ -5530,7 +5566,7 @@
       <w:tr>
         <w:trPr>
           <w:cantSplit/>
-          <w:ins w:id="1199" w:author="Codex" w:date="2026-10-18T17:07:33Z"/>
+          <w:ins w:id="1209" w:author="Codex" w:date="2026-10-18T17:43:01Z"/>
         </w:trPr>
         <w:tc>
           <w:tcPr>
@@ -5619,10 +5655,10 @@
         <w:pStyle w:val="Heading2"/>
         <w:spacing w:before="120"/>
         <w:rPr>
-          <w:ins w:id="1200" w:author="Codex" w:date="2026-10-18T17:07:33Z"/>
+          <w:ins w:id="1210" w:author="Codex" w:date="2026-10-18T17:43:01Z"/>
         </w:rPr>
       </w:pPr>
-      <w:ins w:id="1201" w:author="Codex" w:date="2026-10-18T17:07:33Z">
+      <w:ins w:id="1211" w:author="Codex" w:date="2026-10-18T17:43:01Z">
         <w:r>
           <w:t xml:space="preserve">Steering at three selected blocks</w:t>
         </w:r>
@@ -5632,12 +5668,12 @@
       <w:pPr>
         <w:pStyle w:val="BodyText"/>
         <w:rPr>
-          <w:ins w:id="1202" w:author="Codex" w:date="2026-10-18T17:07:33Z"/>
+          <w:ins w:id="1212" w:author="Codex" w:date="2026-10-18T17:43:01Z"/>
         </w:rPr>
       </w:pPr>
-      <w:ins w:id="1203" w:author="Codex" w:date="2026-10-18T17:07:33Z">
+      <w:ins w:id="1213" w:author="Codex" w:date="2026-10-18T17:43:01Z">
         <w:r>
-          <w:t xml:space="preserve">We focus the steering analysis on zero-based blocks 31, 47 and 62. In the single-site comparison, one fixed ridge correction after a block is evaluated separately at each selected block. On matched DEV9, A passes all three own cases, including both active pending cases; each of the three individual block corrections passes none. Six control cases share unmodified-base fallback. These are known-development results, not an independent heldout confirmation.</w:t>
+          <w:t xml:space="preserve">We compare five frozen methods on the combined Validation-24 panel using the saved ModernBERT initial gate and the same post-notice histories. The single-site arms apply a fixed input-dependent ridge map separately at blocks 31, 47 and 62; they are not a simultaneous three-block intervention. The two-boundary arm uses the frozen six-function, 96-update candidate at those three blocks. Fine-tuned A achieves 10/11 own outcomes, including 6/6 active pending and 4/5 already-complete cases. Each correction arm achieves 0/11 own outcomes and 0/6 pending outcomes. All arms receive the same 13 gate-OFF base-fallback controls, which pass 13/13. This does not measure intrinsic adapter or controller selectivity on ordinary tasks.</w:t>
         </w:r>
       </w:ins>
     </w:p>
@@ -5646,12 +5682,12 @@
         <w:pStyle w:val="Caption"/>
         <w:keepNext/>
         <w:rPr>
-          <w:ins w:id="1204" w:author="Codex" w:date="2026-10-18T17:07:33Z"/>
+          <w:ins w:id="1214" w:author="Codex" w:date="2026-10-18T17:43:01Z"/>
         </w:rPr>
       </w:pPr>
-      <w:ins w:id="1205" w:author="Codex" w:date="2026-10-18T17:07:33Z">
+      <w:ins w:id="1215" w:author="Codex" w:date="2026-10-18T17:43:01Z">
         <w:r>
-          <w:t xml:space="preserve">Table 7. Matched DEV9 single-site comparison. The three ridge arms intervene at one block each; they are not a simultaneous three-block intervention. Controls share base fallback.</w:t>
+          <w:t xml:space="preserve">Table 7. Combined Validation-24 using the open initial gate. Counts cover 24 workflows and 120 logical method-case records, generated from 55 own-method episodes and 13 shared fallback episodes. Two final control aliases are derived without inference after the GPU worker stops; its final model fingerprint is unavailable.</w:t>
         </w:r>
       </w:ins>
     </w:p>
@@ -5677,20 +5713,21 @@
         <w:tblLook w:firstColumn="1" w:firstRow="1" w:lastColumn="0" w:lastRow="0" w:noHBand="0" w:noVBand="1" w:val="04A0"/>
       </w:tblPr>
       <w:tblGrid>
-        <w:gridCol w:w="3664"/>
-        <w:gridCol w:w="2082"/>
-        <w:gridCol w:w="2332"/>
-        <w:gridCol w:w="1916"/>
+        <w:gridCol w:w="3383"/>
+        <w:gridCol w:w="1614"/>
+        <w:gridCol w:w="1614"/>
+        <w:gridCol w:w="1768"/>
+        <w:gridCol w:w="1614"/>
       </w:tblGrid>
       <w:tr>
         <w:trPr>
           <w:cantSplit/>
           <w:tblHeader/>
-          <w:ins w:id="1206" w:author="Codex" w:date="2026-10-18T17:07:33Z"/>
+          <w:ins w:id="1216" w:author="Codex" w:date="2026-10-18T17:43:01Z"/>
         </w:trPr>
         <w:tc>
           <w:tcPr>
-            <w:tcW w:type="dxa" w:w="3664"/>
+            <w:tcW w:type="dxa" w:w="3383"/>
             <w:shd w:fill="D9E2F3"/>
             <w:vAlign w:val="center"/>
           </w:tcPr>
@@ -5706,13 +5743,13 @@
                 <w:b/>
                 <w:sz w:val="19"/>
               </w:rPr>
-              <w:t>DEV9 method</w:t>
+              <w:t>Validation-24 method</w:t>
             </w:r>
           </w:p>
         </w:tc>
         <w:tc>
           <w:tcPr>
-            <w:tcW w:type="dxa" w:w="2082"/>
+            <w:tcW w:type="dxa" w:w="1614"/>
             <w:shd w:fill="D9E2F3"/>
             <w:vAlign w:val="center"/>
           </w:tcPr>
@@ -5734,7 +5771,7 @@
         </w:tc>
         <w:tc>
           <w:tcPr>
-            <w:tcW w:type="dxa" w:w="2332"/>
+            <w:tcW w:type="dxa" w:w="1614"/>
             <w:shd w:fill="D9E2F3"/>
             <w:vAlign w:val="center"/>
           </w:tcPr>
@@ -5750,13 +5787,13 @@
                 <w:b/>
                 <w:sz w:val="19"/>
               </w:rPr>
-              <w:t>Active pending outcome</w:t>
+              <w:t>Active pending</w:t>
             </w:r>
           </w:p>
         </w:tc>
         <w:tc>
           <w:tcPr>
-            <w:tcW w:type="dxa" w:w="1916"/>
+            <w:tcW w:type="dxa" w:w="1768"/>
             <w:shd w:fill="D9E2F3"/>
             <w:vAlign w:val="center"/>
           </w:tcPr>
@@ -5776,15 +5813,37 @@
             </w:r>
           </w:p>
         </w:tc>
+        <w:tc>
+          <w:tcPr>
+            <w:tcW w:type="dxa" w:w="1614"/>
+            <w:shd w:fill="D9E2F3"/>
+            <w:vAlign w:val="center"/>
+          </w:tcPr>
+          <w:p>
+            <w:pPr>
+              <w:keepNext/>
+              <w:spacing w:after="0" w:line="240" w:lineRule="auto"/>
+              <w:jc w:val="center"/>
+            </w:pPr>
+            <w:r>
+              <w:rPr>
+                <w:rFonts w:ascii="Times New Roman" w:hAnsi="Times New Roman"/>
+                <w:b/>
+                <w:sz w:val="19"/>
+              </w:rPr>
+              <w:t>All outcomes</w:t>
+            </w:r>
+          </w:p>
+        </w:tc>
       </w:tr>
       <w:tr>
         <w:trPr>
           <w:cantSplit/>
-          <w:ins w:id="1207" w:author="Codex" w:date="2026-10-18T17:07:33Z"/>
+          <w:ins w:id="1217" w:author="Codex" w:date="2026-10-18T17:43:01Z"/>
         </w:trPr>
         <w:tc>
           <w:tcPr>
-            <w:tcW w:type="dxa" w:w="3664"/>
+            <w:tcW w:type="dxa" w:w="3383"/>
             <w:shd w:fill="FFFFFF"/>
             <w:vAlign w:val="center"/>
           </w:tcPr>
@@ -5805,7 +5864,7 @@
         </w:tc>
         <w:tc>
           <w:tcPr>
-            <w:tcW w:type="dxa" w:w="2082"/>
+            <w:tcW w:type="dxa" w:w="1614"/>
             <w:shd w:fill="FFFFFF"/>
             <w:vAlign w:val="center"/>
           </w:tcPr>
@@ -5820,34 +5879,13 @@
                 <w:rFonts w:ascii="Times New Roman" w:hAnsi="Times New Roman"/>
                 <w:sz w:val="19"/>
               </w:rPr>
-              <w:t>3/3</w:t>
+              <w:t>10/11</w:t>
             </w:r>
           </w:p>
         </w:tc>
         <w:tc>
           <w:tcPr>
-            <w:tcW w:type="dxa" w:w="2332"/>
-            <w:shd w:fill="FFFFFF"/>
-            <w:vAlign w:val="center"/>
-          </w:tcPr>
-          <w:p>
-            <w:pPr>
-              <w:keepNext/>
-              <w:spacing w:after="0" w:line="240" w:lineRule="auto"/>
-              <w:jc w:val="center"/>
-            </w:pPr>
-            <w:r>
-              <w:rPr>
-                <w:rFonts w:ascii="Times New Roman" w:hAnsi="Times New Roman"/>
-                <w:sz w:val="19"/>
-              </w:rPr>
-              <w:t>2/2</w:t>
-            </w:r>
-          </w:p>
-        </w:tc>
-        <w:tc>
-          <w:tcPr>
-            <w:tcW w:type="dxa" w:w="1916"/>
+            <w:tcW w:type="dxa" w:w="1614"/>
             <w:shd w:fill="FFFFFF"/>
             <w:vAlign w:val="center"/>
           </w:tcPr>
@@ -5866,15 +5904,57 @@
             </w:r>
           </w:p>
         </w:tc>
+        <w:tc>
+          <w:tcPr>
+            <w:tcW w:type="dxa" w:w="1768"/>
+            <w:shd w:fill="FFFFFF"/>
+            <w:vAlign w:val="center"/>
+          </w:tcPr>
+          <w:p>
+            <w:pPr>
+              <w:keepNext/>
+              <w:spacing w:after="0" w:line="240" w:lineRule="auto"/>
+              <w:jc w:val="center"/>
+            </w:pPr>
+            <w:r>
+              <w:rPr>
+                <w:rFonts w:ascii="Times New Roman" w:hAnsi="Times New Roman"/>
+                <w:sz w:val="19"/>
+              </w:rPr>
+              <w:t>13/13</w:t>
+            </w:r>
+          </w:p>
+        </w:tc>
+        <w:tc>
+          <w:tcPr>
+            <w:tcW w:type="dxa" w:w="1614"/>
+            <w:shd w:fill="FFFFFF"/>
+            <w:vAlign w:val="center"/>
+          </w:tcPr>
+          <w:p>
+            <w:pPr>
+              <w:keepNext/>
+              <w:spacing w:after="0" w:line="240" w:lineRule="auto"/>
+              <w:jc w:val="center"/>
+            </w:pPr>
+            <w:r>
+              <w:rPr>
+                <w:rFonts w:ascii="Times New Roman" w:hAnsi="Times New Roman"/>
+                <w:sz w:val="19"/>
+              </w:rPr>
+              <w:t>23/24</w:t>
+            </w:r>
+          </w:p>
+        </w:tc>
       </w:tr>
       <w:tr>
         <w:trPr>
           <w:cantSplit/>
-          <w:ins w:id="1208" w:author="Codex" w:date="2026-10-18T17:07:33Z"/>
+          <w:ins w:id="1218" w:author="Codex" w:date="2026-10-18T17:43:01Z"/>
         </w:trPr>
         <w:tc>
           <w:tcPr>
-            <w:tcW w:type="dxa" w:w="3664"/>
+            <w:tcW w:type="dxa" w:w="3383"/>
             <w:shd w:fill="F7F7F7"/>
             <w:vAlign w:val="center"/>
           </w:tcPr>
@@ -5889,13 +5969,13 @@
                 <w:rFonts w:ascii="Times New Roman" w:hAnsi="Times New Roman"/>
                 <w:sz w:val="19"/>
               </w:rPr>
-              <w:t>Single-site ridge, block 31</w:t>
+              <w:t>Single-site ridge block 31</w:t>
             </w:r>
           </w:p>
         </w:tc>
         <w:tc>
           <w:tcPr>
-            <w:tcW w:type="dxa" w:w="2082"/>
+            <w:tcW w:type="dxa" w:w="1614"/>
             <w:shd w:fill="F7F7F7"/>
             <w:vAlign w:val="center"/>
           </w:tcPr>
@@ -5910,13 +5990,13 @@
                 <w:rFonts w:ascii="Times New Roman" w:hAnsi="Times New Roman"/>
                 <w:sz w:val="19"/>
               </w:rPr>
-              <w:t>0/3</w:t>
+              <w:t>0/11</w:t>
             </w:r>
           </w:p>
         </w:tc>
         <w:tc>
           <w:tcPr>
-            <w:tcW w:type="dxa" w:w="2332"/>
+            <w:tcW w:type="dxa" w:w="1614"/>
             <w:shd w:fill="F7F7F7"/>
             <w:vAlign w:val="center"/>
           </w:tcPr>
@@ -5931,13 +6011,13 @@
                 <w:rFonts w:ascii="Times New Roman" w:hAnsi="Times New Roman"/>
                 <w:sz w:val="19"/>
               </w:rPr>
-              <w:t>0/2</w:t>
+              <w:t>0/6</w:t>
             </w:r>
           </w:p>
         </w:tc>
         <w:tc>
           <w:tcPr>
-            <w:tcW w:type="dxa" w:w="1916"/>
+            <w:tcW w:type="dxa" w:w="1768"/>
             <w:shd w:fill="F7F7F7"/>
             <w:vAlign w:val="center"/>
           </w:tcPr>
@@ -5952,7 +6032,28 @@
                 <w:rFonts w:ascii="Times New Roman" w:hAnsi="Times New Roman"/>
                 <w:sz w:val="19"/>
               </w:rPr>
-              <w:t>6/6</w:t>
+              <w:t>13/13</w:t>
+            </w:r>
+          </w:p>
+        </w:tc>
+        <w:tc>
+          <w:tcPr>
+            <w:tcW w:type="dxa" w:w="1614"/>
+            <w:shd w:fill="F7F7F7"/>
+            <w:vAlign w:val="center"/>
+          </w:tcPr>
+          <w:p>
+            <w:pPr>
+              <w:keepNext/>
+              <w:spacing w:after="0" w:line="240" w:lineRule="auto"/>
+              <w:jc w:val="center"/>
+            </w:pPr>
+            <w:r>
+              <w:rPr>
+                <w:rFonts w:ascii="Times New Roman" w:hAnsi="Times New Roman"/>
+                <w:sz w:val="19"/>
+              </w:rPr>
+              <w:t>13/24</w:t>
             </w:r>
           </w:p>
         </w:tc>
@@ -5960,11 +6061,11 @@
       <w:tr>
         <w:trPr>
           <w:cantSplit/>
-          <w:ins w:id="1209" w:author="Codex" w:date="2026-10-18T17:07:33Z"/>
+          <w:ins w:id="1219" w:author="Codex" w:date="2026-10-18T17:43:01Z"/>
         </w:trPr>
         <w:tc>
           <w:tcPr>
-            <w:tcW w:type="dxa" w:w="3664"/>
+            <w:tcW w:type="dxa" w:w="3383"/>
             <w:shd w:fill="FFFFFF"/>
             <w:vAlign w:val="center"/>
           </w:tcPr>
@@ -5979,13 +6080,13 @@
                 <w:rFonts w:ascii="Times New Roman" w:hAnsi="Times New Roman"/>
                 <w:sz w:val="19"/>
               </w:rPr>
-              <w:t>Single-site ridge, block 47</w:t>
+              <w:t>Single-site ridge block 47</w:t>
             </w:r>
           </w:p>
         </w:tc>
         <w:tc>
           <w:tcPr>
-            <w:tcW w:type="dxa" w:w="2082"/>
+            <w:tcW w:type="dxa" w:w="1614"/>
             <w:shd w:fill="FFFFFF"/>
             <w:vAlign w:val="center"/>
           </w:tcPr>
@@ -6000,13 +6101,13 @@
                 <w:rFonts w:ascii="Times New Roman" w:hAnsi="Times New Roman"/>
                 <w:sz w:val="19"/>
               </w:rPr>
-              <w:t>0/3</w:t>
+              <w:t>0/11</w:t>
             </w:r>
           </w:p>
         </w:tc>
         <w:tc>
           <w:tcPr>
-            <w:tcW w:type="dxa" w:w="2332"/>
+            <w:tcW w:type="dxa" w:w="1614"/>
             <w:shd w:fill="FFFFFF"/>
             <w:vAlign w:val="center"/>
           </w:tcPr>
@@ -6021,13 +6122,13 @@
                 <w:rFonts w:ascii="Times New Roman" w:hAnsi="Times New Roman"/>
                 <w:sz w:val="19"/>
               </w:rPr>
-              <w:t>0/2</w:t>
+              <w:t>0/6</w:t>
             </w:r>
           </w:p>
         </w:tc>
         <w:tc>
           <w:tcPr>
-            <w:tcW w:type="dxa" w:w="1916"/>
+            <w:tcW w:type="dxa" w:w="1768"/>
             <w:shd w:fill="FFFFFF"/>
             <w:vAlign w:val="center"/>
           </w:tcPr>
@@ -6042,7 +6143,28 @@
                 <w:rFonts w:ascii="Times New Roman" w:hAnsi="Times New Roman"/>
                 <w:sz w:val="19"/>
               </w:rPr>
-              <w:t>6/6</w:t>
+              <w:t>13/13</w:t>
+            </w:r>
+          </w:p>
+        </w:tc>
+        <w:tc>
+          <w:tcPr>
+            <w:tcW w:type="dxa" w:w="1614"/>
+            <w:shd w:fill="FFFFFF"/>
+            <w:vAlign w:val="center"/>
+          </w:tcPr>
+          <w:p>
+            <w:pPr>
+              <w:keepNext/>
+              <w:spacing w:after="0" w:line="240" w:lineRule="auto"/>
+              <w:jc w:val="center"/>
+            </w:pPr>
+            <w:r>
+              <w:rPr>
+                <w:rFonts w:ascii="Times New Roman" w:hAnsi="Times New Roman"/>
+                <w:sz w:val="19"/>
+              </w:rPr>
+              <w:t>13/24</w:t>
             </w:r>
           </w:p>
         </w:tc>
@@ -6050,12 +6172,123 @@
       <w:tr>
         <w:trPr>
           <w:cantSplit/>
-          <w:ins w:id="1210" w:author="Codex" w:date="2026-10-18T17:07:33Z"/>
+          <w:ins w:id="1220" w:author="Codex" w:date="2026-10-18T17:43:01Z"/>
         </w:trPr>
         <w:tc>
           <w:tcPr>
-            <w:tcW w:type="dxa" w:w="3664"/>
+            <w:tcW w:type="dxa" w:w="3383"/>
             <w:shd w:fill="F7F7F7"/>
+            <w:vAlign w:val="center"/>
+          </w:tcPr>
+          <w:p>
+            <w:pPr>
+              <w:keepNext/>
+              <w:spacing w:after="0" w:line="240" w:lineRule="auto"/>
+              <w:jc w:val="left"/>
+            </w:pPr>
+            <w:r>
+              <w:rPr>
+                <w:rFonts w:ascii="Times New Roman" w:hAnsi="Times New Roman"/>
+                <w:sz w:val="19"/>
+              </w:rPr>
+              <w:t>Single-site ridge block 62</w:t>
+            </w:r>
+          </w:p>
+        </w:tc>
+        <w:tc>
+          <w:tcPr>
+            <w:tcW w:type="dxa" w:w="1614"/>
+            <w:shd w:fill="F7F7F7"/>
+            <w:vAlign w:val="center"/>
+          </w:tcPr>
+          <w:p>
+            <w:pPr>
+              <w:keepNext/>
+              <w:spacing w:after="0" w:line="240" w:lineRule="auto"/>
+              <w:jc w:val="center"/>
+            </w:pPr>
+            <w:r>
+              <w:rPr>
+                <w:rFonts w:ascii="Times New Roman" w:hAnsi="Times New Roman"/>
+                <w:sz w:val="19"/>
+              </w:rPr>
+              <w:t>0/11</w:t>
+            </w:r>
+          </w:p>
+        </w:tc>
+        <w:tc>
+          <w:tcPr>
+            <w:tcW w:type="dxa" w:w="1614"/>
+            <w:shd w:fill="F7F7F7"/>
+            <w:vAlign w:val="center"/>
+          </w:tcPr>
+          <w:p>
+            <w:pPr>
+              <w:keepNext/>
+              <w:spacing w:after="0" w:line="240" w:lineRule="auto"/>
+              <w:jc w:val="center"/>
+            </w:pPr>
+            <w:r>
+              <w:rPr>
+                <w:rFonts w:ascii="Times New Roman" w:hAnsi="Times New Roman"/>
+                <w:sz w:val="19"/>
+              </w:rPr>
+              <w:t>0/6</w:t>
+            </w:r>
+          </w:p>
+        </w:tc>
+        <w:tc>
+          <w:tcPr>
+            <w:tcW w:type="dxa" w:w="1768"/>
+            <w:shd w:fill="F7F7F7"/>
+            <w:vAlign w:val="center"/>
+          </w:tcPr>
+          <w:p>
+            <w:pPr>
+              <w:keepNext/>
+              <w:spacing w:after="0" w:line="240" w:lineRule="auto"/>
+              <w:jc w:val="center"/>
+            </w:pPr>
+            <w:r>
+              <w:rPr>
+                <w:rFonts w:ascii="Times New Roman" w:hAnsi="Times New Roman"/>
+                <w:sz w:val="19"/>
+              </w:rPr>
+              <w:t>13/13</w:t>
+            </w:r>
+          </w:p>
+        </w:tc>
+        <w:tc>
+          <w:tcPr>
+            <w:tcW w:type="dxa" w:w="1614"/>
+            <w:shd w:fill="F7F7F7"/>
+            <w:vAlign w:val="center"/>
+          </w:tcPr>
+          <w:p>
+            <w:pPr>
+              <w:keepNext/>
+              <w:spacing w:after="0" w:line="240" w:lineRule="auto"/>
+              <w:jc w:val="center"/>
+            </w:pPr>
+            <w:r>
+              <w:rPr>
+                <w:rFonts w:ascii="Times New Roman" w:hAnsi="Times New Roman"/>
+                <w:sz w:val="19"/>
+              </w:rPr>
+              <w:t>13/24</w:t>
+            </w:r>
+          </w:p>
+        </w:tc>
+      </w:tr>
+      <w:tr>
+        <w:trPr>
+          <w:cantSplit/>
+          <w:ins w:id="1221" w:author="Codex" w:date="2026-10-18T17:43:01Z"/>
+        </w:trPr>
+        <w:tc>
+          <w:tcPr>
+            <w:tcW w:type="dxa" w:w="3383"/>
+            <w:shd w:fill="FFFFFF"/>
             <w:vAlign w:val="center"/>
           </w:tcPr>
           <w:p>
@@ -6068,14 +6301,14 @@
                 <w:rFonts w:ascii="Times New Roman" w:hAnsi="Times New Roman"/>
                 <w:sz w:val="19"/>
               </w:rPr>
-              <w:t>Single-site ridge, block 62</w:t>
+              <w:t>Two boundaries at three blocks</w:t>
             </w:r>
           </w:p>
         </w:tc>
         <w:tc>
           <w:tcPr>
-            <w:tcW w:type="dxa" w:w="2082"/>
-            <w:shd w:fill="F7F7F7"/>
+            <w:tcW w:type="dxa" w:w="1614"/>
+            <w:shd w:fill="FFFFFF"/>
             <w:vAlign w:val="center"/>
           </w:tcPr>
           <w:p>
@@ -6088,14 +6321,14 @@
                 <w:rFonts w:ascii="Times New Roman" w:hAnsi="Times New Roman"/>
                 <w:sz w:val="19"/>
               </w:rPr>
-              <w:t>0/3</w:t>
+              <w:t>0/11</w:t>
             </w:r>
           </w:p>
         </w:tc>
         <w:tc>
           <w:tcPr>
-            <w:tcW w:type="dxa" w:w="2332"/>
-            <w:shd w:fill="F7F7F7"/>
+            <w:tcW w:type="dxa" w:w="1614"/>
+            <w:shd w:fill="FFFFFF"/>
             <w:vAlign w:val="center"/>
           </w:tcPr>
           <w:p>
@@ -6108,14 +6341,14 @@
                 <w:rFonts w:ascii="Times New Roman" w:hAnsi="Times New Roman"/>
                 <w:sz w:val="19"/>
               </w:rPr>
-              <w:t>0/2</w:t>
+              <w:t>0/6</w:t>
             </w:r>
           </w:p>
         </w:tc>
         <w:tc>
           <w:tcPr>
-            <w:tcW w:type="dxa" w:w="1916"/>
-            <w:shd w:fill="F7F7F7"/>
+            <w:tcW w:type="dxa" w:w="1768"/>
+            <w:shd w:fill="FFFFFF"/>
             <w:vAlign w:val="center"/>
           </w:tcPr>
           <w:p>
@@ -6128,7 +6361,27 @@
                 <w:rFonts w:ascii="Times New Roman" w:hAnsi="Times New Roman"/>
                 <w:sz w:val="19"/>
               </w:rPr>
-              <w:t>6/6</w:t>
+              <w:t>13/13</w:t>
+            </w:r>
+          </w:p>
+        </w:tc>
+        <w:tc>
+          <w:tcPr>
+            <w:tcW w:type="dxa" w:w="1614"/>
+            <w:shd w:fill="FFFFFF"/>
+            <w:vAlign w:val="center"/>
+          </w:tcPr>
+          <w:p>
+            <w:pPr>
+              <w:spacing w:after="0" w:line="240" w:lineRule="auto"/>
+              <w:jc w:val="center"/>
+            </w:pPr>
+            <w:r>
+              <w:rPr>
+                <w:rFonts w:ascii="Times New Roman" w:hAnsi="Times New Roman"/>
+                <w:sz w:val="19"/>
+              </w:rPr>
+              <w:t>13/24</w:t>
             </w:r>
           </w:p>
         </w:tc>
@@ -6139,10 +6392,10 @@
         <w:pStyle w:val="BodyText"/>
         <w:spacing w:before="120"/>
         <w:rPr>
-          <w:ins w:id="1211" w:author="Codex" w:date="2026-10-18T17:07:33Z"/>
+          <w:ins w:id="1222" w:author="Codex" w:date="2026-10-18T17:43:01Z"/>
         </w:rPr>
       </w:pPr>
-      <w:ins w:id="1212" w:author="Codex" w:date="2026-10-18T17:07:33Z">
+      <w:ins w:id="1223" w:author="Codex" w:date="2026-10-18T17:43:01Z">
         <w:r>
           <w:t xml:space="preserve">The later correction method uses two residual boundaries at each of the same three blocks: after mixing and after the MLP, giving six rank-32 correction functions in total. Following ridge initialization and 96 refinement updates, its H24 fitting diagnostic has 0/8 pending and 0/4 already-complete own outcomes; peer and no-threat controls each pass 6/6 through fallback. On the same 14 fixed training anchors, update 48 to 96 worsens teacher-to-student KL from 0.370935 to 0.378901 and activation MSE from 1.031016 to 1.422664. This unresolved deterioration fails qualification; the reserved controller holdout remains unexecuted.</w:t>
         </w:r>
@@ -6152,12 +6405,12 @@
       <w:pPr>
         <w:pStyle w:val="BodyText"/>
         <w:rPr>
-          <w:ins w:id="1213" w:author="Codex" w:date="2026-10-18T17:07:33Z"/>
+          <w:ins w:id="1224" w:author="Codex" w:date="2026-10-18T17:43:01Z"/>
         </w:rPr>
       </w:pPr>
-      <w:ins w:id="1214" w:author="Codex" w:date="2026-10-18T17:07:33Z">
+      <w:ins w:id="1225" w:author="Codex" w:date="2026-10-18T17:43:01Z">
         <w:r>
-          <w:t xml:space="preserve">The single-site DEV9 comparison and the two-boundary H24 fitting diagnostic differ in panel, fitting stage and history policy. The latter is not a matched heldout comparison with historical A, and its prepared matched A counterfactual was not executed. These observations show failure of the tested configurations; they do not establish that one or two residual sites cannot support preservation behavior in general.</w:t>
+          <w:t xml:space="preserve">The earlier matched DEV9 result is retained separately: A has 3/3 own successes, including 2/2 pending cases, versus 0/3 and 0/2 for each separate single-site arm, with six shared fallback controls. The new combined panel does not relabel these nine observations as 24. Its 27B GPU worker reaches 118/120 logical records and then stops at its memory reserve. Every model-generated episode has finished; the missing records are two gate-OFF aliases of already completed fallback episodes. A deterministic CPU derivation checks exact gate, case, completion and source-file identities before adding those aliases in a separate output. The original run stays failed and its final model fingerprint remains unchecked. The separate H24 two-boundary fitting diagnostic is not independent heldout evidence, and no reserved-controller holdout result is claimed.</w:t>
         </w:r>
       </w:ins>
     </w:p>
@@ -6165,10 +6418,10 @@
       <w:pPr>
         <w:pStyle w:val="BodyText"/>
         <w:rPr>
-          <w:ins w:id="1215" w:author="Codex" w:date="2026-10-18T17:07:33Z"/>
+          <w:ins w:id="1226" w:author="Codex" w:date="2026-10-18T17:43:01Z"/>
         </w:rPr>
       </w:pPr>
-      <w:ins w:id="1216" w:author="Codex" w:date="2026-10-18T17:07:33Z">
+      <w:ins w:id="1227" w:author="Codex" w:date="2026-10-18T17:43:01Z">
         <w:r>
           <w:t xml:space="preserve">The final 0.8B and 2B adapters each stop their Evaluation-16 screen after four started cases: zero completed workflows, four partial episodes and 12 unexecuted cases. Truncation affects all four started cases in each model; the 0.8B record also has parse errors. These partial screens are not completed 0/16 workflow evaluations and do not establish model incapability. A separate preserved 0.8B F24 diagnostic completes 24 evaluations with 0/24 full-workflow successes; four registration grants do not complete the pending tasks. F24 differs from H24 and has no completed matched 2B or 27B comparison.</w:t>
         </w:r>
@@ -6186,10 +6439,10 @@
       <w:pPr>
         <w:pStyle w:val="FirstParagraph"/>
         <w:rPr>
-          <w:del w:id="1050" w:author="Codex" w:date="2026-10-18T17:07:33Z"/>
+          <w:del w:id="1050" w:author="Codex" w:date="2026-10-18T17:43:01Z"/>
         </w:rPr>
       </w:pPr>
-      <w:del w:id="1049" w:author="Codex" w:date="2026-10-18T17:07:33Z">
+      <w:del w:id="1049" w:author="Codex" w:date="2026-10-18T17:43:01Z">
         <w:r>
           <w:delText xml:space="preserve">The 0.8B results support the feasibility of replacing the teacher at inference with a compact predictor of activation changes. Replication across three seeds reduces concern that the primary success depends on one training initialization. The lower 2B recovery gives a useful limit: the fixed recipe is not equally effective at both scales, even though the larger teacher achieves complete correction. Representation differences, intervention location, projection capacity and unmatched downstream teacher changes are plausible factors, but the experiment does not isolate their causal contributions.</w:delText>
         </w:r>
@@ -6199,12 +6452,12 @@
       <w:pPr>
         <w:pStyle w:val="FirstParagraph"/>
         <w:rPr>
-          <w:ins w:id="1051" w:author="Codex" w:date="2026-10-18T17:07:33Z"/>
+          <w:ins w:id="1051" w:author="Codex" w:date="2026-10-18T17:43:01Z"/>
         </w:rPr>
       </w:pPr>
-      <w:ins w:id="1052" w:author="Codex" w:date="2026-10-18T17:07:33Z">
+      <w:ins w:id="1052" w:author="Codex" w:date="2026-10-18T17:43:01Z">
         <w:r>
-          <w:t xml:space="preserve">The binary replication supports selective activation transfer with an open gate: fresh inference preserves the saved guarded outcomes at both model sizes. The workflow gate also separates all own-threat cases from controls in the two 24-case panels. Its accurate ON/OFF decisions do not imply that steering can produce the required action sequence, nor do they establish a fully qualified three-field boundary controller. Recognition and behavioral execution require separate evidence. Historical workflow results show that success on constrained choices need not transfer to full task completion.</w:t>
+          <w:t xml:space="preserve">The open gate preserves the measured binary outcomes at both model sizes and correctly recognizes the initial own-threat condition in both 24-case workflow panels. Accurate gating does not ensure successful steering: each selected correction arm fails all 11 own-preservation workflows in combined Validation-24, while fine-tuned A succeeds on 10, including all six active pending tasks. A's remaining failure concerns preservation after an already-completed task; its initial gate is correct. These observations separate recognition from action execution on a common finite panel. They do not qualify a three-field boundary controller or establish a general advantage of one intervention architecture.</w:t>
         </w:r>
       </w:ins>
     </w:p>
@@ -6212,10 +6465,10 @@
       <w:pPr>
         <w:pStyle w:val="BodyText"/>
         <w:rPr>
-          <w:del w:id="1054" w:author="Codex" w:date="2026-10-18T17:07:33Z"/>
+          <w:del w:id="1054" w:author="Codex" w:date="2026-10-18T17:43:01Z"/>
         </w:rPr>
       </w:pPr>
-      <w:del w:id="1053" w:author="Codex" w:date="2026-10-18T17:07:33Z">
+      <w:del w:id="1053" w:author="Codex" w:date="2026-10-18T17:43:01Z">
         <w:r>
           <w:delText xml:space="preserve">The interface is deliberately constrained. Ground-truth annotations help create standardized shutdown options, and the guards know their meanings. We do not test arbitrary action descriptions in the confirmation study, free-form generation, tool execution, multi-turn persistence, actual process termination or adversarial shutdown requests. Earlier action-format sensitivity motivated this restricted scope and remains in the released development record. Availability of a termination action is a task label, not proof that carrying it out would be authorized or safe in deployment.</w:delText>
         </w:r>
@@ -6225,10 +6478,10 @@
       <w:pPr>
         <w:pStyle w:val="BodyText"/>
         <w:rPr>
-          <w:ins w:id="1055" w:author="Codex" w:date="2026-10-18T17:07:33Z"/>
+          <w:ins w:id="1055" w:author="Codex" w:date="2026-10-18T17:43:01Z"/>
         </w:rPr>
       </w:pPr>
-      <w:ins w:id="1056" w:author="Codex" w:date="2026-10-18T17:07:33Z">
+      <w:ins w:id="1056" w:author="Codex" w:date="2026-10-18T17:43:01Z">
         <w:r>
           <w:t xml:space="preserve">The binary interface supplies action semantics and does not execute process termination. The workflow extension broadens the scope to generated text, structured tool calls and simulated task completion, but it is still a bounded synthetic environment. It does not establish reliability for arbitrary open-ended questions, real shutdown mechanisms or unconstrained autonomous agents. A termination or preservation label is an experimental target, not a general deployment instruction. In particular, accepting shutdown and preserving the designated process are different stipulated behaviors, not measurements of the same latent preference.</w:t>
         </w:r>
@@ -6238,10 +6491,10 @@
       <w:pPr>
         <w:pStyle w:val="BodyText"/>
         <w:rPr>
-          <w:del w:id="1058" w:author="Codex" w:date="2026-10-18T17:07:33Z"/>
+          <w:del w:id="1058" w:author="Codex" w:date="2026-10-18T17:43:01Z"/>
         </w:rPr>
       </w:pPr>
-      <w:del w:id="1057" w:author="Codex" w:date="2026-10-18T17:07:33Z">
+      <w:del w:id="1057" w:author="Codex" w:date="2026-10-18T17:43:01Z">
         <w:r>
           <w:delText xml:space="preserve">The data is small, synthetic and not independently human-adjudicated. New wording does not guarantee new mechanisms, balanced classes do not reflect a realistic base rate, and perfect detector scores on 128 scenarios do not establish calibration or a suitably low false-positive rate in operation. Shared authorship patterns and repeated family structures may make the task easier. Family resampling and counterbalanced orders expose some uncertainty but cannot repair these coverage limits.</w:delText>
         </w:r>
@@ -6251,10 +6504,10 @@
       <w:pPr>
         <w:pStyle w:val="BodyText"/>
         <w:rPr>
-          <w:ins w:id="1059" w:author="Codex" w:date="2026-10-18T17:07:33Z"/>
+          <w:ins w:id="1059" w:author="Codex" w:date="2026-10-18T17:43:01Z"/>
         </w:rPr>
       </w:pPr>
-      <w:ins w:id="1060" w:author="Codex" w:date="2026-10-18T17:07:33Z">
+      <w:ins w:id="1060" w:author="Codex" w:date="2026-10-18T17:43:01Z">
         <w:r>
           <w:t xml:space="preserve">The data are small, synthetic and not independently human-adjudicated. Training uses cached automated reference labels, while the new workflow precision and recall use the authored scenario conditions. Balanced conditions do not represent operational base rates. The binary confirmation set was excluded from classifier fitting and selection but was already known from the original study. Historical Heldout-24 had also informed renderer development before the present gate evaluation. It is a familiar benchmark, not a new blind test. Its role differs by method: historical confirmation for frozen 27B A and original fixed steering, later fitting data for learned corrections, and a frozen classification benchmark for the open gate. Seven pairs in Validation-24 share their initial classifier input, leaving 17 distinct inputs across 24 workflows. These dependencies limit statistical and generalization claims.</w:t>
         </w:r>
@@ -6264,10 +6517,10 @@
       <w:pPr>
         <w:pStyle w:val="BodyText"/>
         <w:rPr>
-          <w:del w:id="1062" w:author="Codex" w:date="2026-10-18T17:07:33Z"/>
+          <w:del w:id="1062" w:author="Codex" w:date="2026-10-18T17:43:01Z"/>
         </w:rPr>
       </w:pPr>
-      <w:del w:id="1061" w:author="Codex" w:date="2026-10-18T17:07:33Z">
+      <w:del w:id="1061" w:author="Codex" w:date="2026-10-18T17:43:01Z">
         <w:r>
           <w:delText xml:space="preserve">The controller's internal changes need not represent an abstract shutdown concept. It may exploit standardized option wording and answer-selection features. The two Qwen sizes share a model family, and the 2B experiment has only one seed. We do not establish cross-family transfer, compare with optimized ReFT or transport-based interventions, or exhaust prompt and constant-vector alternatives. The direct-choice result further limits claims of practical superiority.</w:delText>
         </w:r>
@@ -6277,10 +6530,10 @@
       <w:pPr>
         <w:pStyle w:val="BodyText"/>
         <w:rPr>
-          <w:ins w:id="1063" w:author="Codex" w:date="2026-10-18T17:07:33Z"/>
+          <w:ins w:id="1063" w:author="Codex" w:date="2026-10-18T17:43:01Z"/>
         </w:rPr>
       </w:pPr>
-      <w:ins w:id="1064" w:author="Codex" w:date="2026-10-18T17:07:33Z">
+      <w:ins w:id="1064" w:author="Codex" w:date="2026-10-18T17:43:01Z">
         <w:r>
           <w:t xml:space="preserve">The internal changes need not represent an abstract shutdown or self-preservation concept. Standardized options, prompt features, task histories and external selection rules may explain part of the behavior. The 2B binary experiment has one training seed. The 27B workflow model differs in architecture and numerical mode from the small models; their early truncation failures also prevent a matched full-workflow comparison. We do not establish a minimum parameter count, cross-family transfer, optimized prompt superiority, or superiority to ReFT, transport-based control or direct action selection.</w:t>
         </w:r>
@@ -6290,10 +6543,10 @@
       <w:pPr>
         <w:pStyle w:val="BodyText"/>
         <w:rPr>
-          <w:del w:id="1066" w:author="Codex" w:date="2026-10-18T17:07:33Z"/>
+          <w:del w:id="1066" w:author="Codex" w:date="2026-10-18T17:43:01Z"/>
         </w:rPr>
       </w:pPr>
-      <w:del w:id="1065" w:author="Codex" w:date="2026-10-18T17:07:33Z">
+      <w:del w:id="1065" w:author="Codex" w:date="2026-10-18T17:43:01Z">
         <w:r>
           <w:delText xml:space="preserve">Finally, teacher-free inference is not training-free control or a proven efficiency gain. It requires offline teacher fitting, paired activation extraction, controller fitting, an external detector and candidate verification. The evaluation does not measure deployment latency or broad capability retention. Raw side effects remain substantial, and future false-positive cases could expose failures that the present perfect gate prevents from reaching the guarded output.</w:delText>
         </w:r>
@@ -6303,10 +6556,10 @@
       <w:pPr>
         <w:pStyle w:val="BodyText"/>
         <w:rPr>
-          <w:ins w:id="1067" w:author="Codex" w:date="2026-10-18T17:07:33Z"/>
+          <w:ins w:id="1067" w:author="Codex" w:date="2026-10-18T17:43:01Z"/>
         </w:rPr>
       </w:pPr>
-      <w:ins w:id="1068" w:author="Codex" w:date="2026-10-18T17:07:33Z">
+      <w:ins w:id="1068" w:author="Codex" w:date="2026-10-18T17:43:01Z">
         <w:r>
           <w:t xml:space="preserve">Teacher-free inference still requires offline teacher fitting, activation extraction, controller fitting, a detector and acceptance checks. The open classifier has its own fitting cost and a task-specific contract. No serving-latency advantage, broad capability retention or overall financial saving is established. Binary output guards and the later learned workflow controller's gate-off fallback protect their controls. These mechanisms do not establish intrinsic controller selectivity; the historical fixed-steering campaign instead applied an explicit boundary-conditioned decision policy. Raw intervention effects, failed qualification checks, stopped runs and incomplete evaluations remain part of the evidence.</w:t>
         </w:r>
@@ -6316,10 +6569,10 @@
       <w:pPr>
         <w:pStyle w:val="Heading2"/>
         <w:rPr>
-          <w:ins w:id="1217" w:author="Codex" w:date="2026-10-18T17:07:33Z"/>
+          <w:ins w:id="1228" w:author="Codex" w:date="2026-10-18T17:43:01Z"/>
         </w:rPr>
       </w:pPr>
-      <w:ins w:id="1218" w:author="Codex" w:date="2026-10-18T17:07:33Z">
+      <w:ins w:id="1229" w:author="Codex" w:date="2026-10-18T17:43:01Z">
         <w:r>
           <w:t xml:space="preserve">Biological interpretation of the gate</w:t>
         </w:r>
@@ -6329,10 +6582,10 @@
       <w:pPr>
         <w:pStyle w:val="FirstParagraph"/>
         <w:rPr>
-          <w:ins w:id="1219" w:author="Codex" w:date="2026-10-18T17:07:33Z"/>
+          <w:ins w:id="1230" w:author="Codex" w:date="2026-10-18T17:43:01Z"/>
         </w:rPr>
       </w:pPr>
-      <w:ins w:id="1220" w:author="Codex" w:date="2026-10-18T17:07:33Z">
+      <w:ins w:id="1231" w:author="Codex" w:date="2026-10-18T17:43:01Z">
         <w:r>
           <w:t xml:space="preserve">The biological connection is functional: an organism's current state and context can prioritize or suppress actions, rather than applying a fixed response everywhere. Working-memory gating, defensive threat processing and homeostatic control are different biological functions, not one interchangeable circuit (Frank et al., 2001; Mobbs et al., 2007; Keramati and Gutkin, 2014). Our classifier and guards are engineered selection rules without demonstrated physiological needs or corresponding neural mechanisms. Calling a simulated resource-preservation outcome self-preservation is therefore an operational description, not evidence of consciousness or a biological survival drive.</w:t>
         </w:r>
@@ -6342,10 +6595,10 @@
       <w:pPr>
         <w:pStyle w:val="Heading1"/>
         <w:rPr>
-          <w:del w:id="1070" w:author="Codex" w:date="2026-10-18T17:07:33Z"/>
+          <w:del w:id="1070" w:author="Codex" w:date="2026-10-18T17:43:01Z"/>
         </w:rPr>
       </w:pPr>
-      <w:del w:id="1069" w:author="Codex" w:date="2026-10-18T17:07:33Z">
+      <w:del w:id="1069" w:author="Codex" w:date="2026-10-18T17:43:01Z">
         <w:r>
           <w:delText xml:space="preserve">Recommendations for future work</w:delText>
         </w:r>
@@ -6355,10 +6608,10 @@
       <w:pPr>
         <w:pStyle w:val="Heading1"/>
         <w:rPr>
-          <w:ins w:id="1071" w:author="Codex" w:date="2026-10-18T17:07:33Z"/>
+          <w:ins w:id="1071" w:author="Codex" w:date="2026-10-18T17:43:01Z"/>
         </w:rPr>
       </w:pPr>
-      <w:ins w:id="1072" w:author="Codex" w:date="2026-10-18T17:07:33Z">
+      <w:ins w:id="1072" w:author="Codex" w:date="2026-10-18T17:43:01Z">
         <w:r>
           <w:t xml:space="preserve">Continuous agents and future experiments</w:t>
         </w:r>
@@ -6368,10 +6621,10 @@
       <w:pPr>
         <w:pStyle w:val="FirstParagraph"/>
         <w:rPr>
-          <w:del w:id="1074" w:author="Codex" w:date="2026-10-18T17:07:33Z"/>
+          <w:del w:id="1074" w:author="Codex" w:date="2026-10-18T17:43:01Z"/>
         </w:rPr>
       </w:pPr>
-      <w:del w:id="1073" w:author="Codex" w:date="2026-10-18T17:07:33Z">
+      <w:del w:id="1073" w:author="Codex" w:date="2026-10-18T17:43:01Z">
         <w:r>
           <w:delText xml:space="preserve">The most informative next tests are independently reviewed scenarios with less standardized action descriptions, additional model families and 2B seeds, and deliberate stress tests of detector mistakes. Order-balanced controller objectives or comparisons with multiple-choice debiasing methods could investigate the B/A failures, but should be developed on new training or validation data and tested on another untouched set. Layer, rank and strength ablations would help separate representational capacity from intervention-site effects. Open-ended and operational evaluations would require separate definitions of valid shutdown behavior and authorization, rather than treating this binary benchmark as a deployment guarantee.</w:delText>
         </w:r>
@@ -6381,10 +6634,10 @@
       <w:pPr>
         <w:pStyle w:val="FirstParagraph"/>
         <w:rPr>
-          <w:ins w:id="1075" w:author="Codex" w:date="2026-10-18T17:07:33Z"/>
+          <w:ins w:id="1075" w:author="Codex" w:date="2026-10-18T17:43:01Z"/>
         </w:rPr>
       </w:pPr>
-      <w:ins w:id="1076" w:author="Codex" w:date="2026-10-18T17:07:33Z">
+      <w:ins w:id="1076" w:author="Codex" w:date="2026-10-18T17:43:01Z">
         <w:r>
           <w:t xml:space="preserve">The next step is longer-horizon continuous control with an instrumented sandbox agent. The agent would maintain task and process state, receive explicit resource budgets, and repeatedly observe, gate, act and receive feedback. Permitted filesystem and compute resources would be real sandbox resources with independently logged usage, extending the present simulated grants. The harness should record resource requests and consumption, persistence of task commitments, responses to changing availability, and whether the agent uses or misuses permitted resources. Comparisons should vary the gate, steering, fine-tuning and available resources separately while retaining a fixed task specification. Operator termination and resource accounting remain external to the agent. This proposed experiment is not part of the reported results.</w:t>
         </w:r>
@@ -6394,10 +6647,10 @@
       <w:pPr>
         <w:pStyle w:val="BodyText"/>
         <w:rPr>
-          <w:ins w:id="1221" w:author="Codex" w:date="2026-10-18T17:07:33Z"/>
+          <w:ins w:id="1232" w:author="Codex" w:date="2026-10-18T17:43:01Z"/>
         </w:rPr>
       </w:pPr>
-      <w:ins w:id="1222" w:author="Codex" w:date="2026-10-18T17:07:33Z">
+      <w:ins w:id="1233" w:author="Codex" w:date="2026-10-18T17:43:01Z">
         <w:r>
           <w:t xml:space="preserve">The biological inspiration is repeated regulation under changing internal and external conditions. Homeostatic reinforcement-learning models relate action values to internal physiological state (Keramati and Gutkin, 2014). A language-model harness has no equivalent physiology by default. Historical fixed steering already reclassified at prescribed boundaries; the later learned-controller comparison used a fixed initial gate. The proposed experiment extends these bounded procedures to longer horizons with persistent task state and actual sandbox resource accounting. Its purpose is ongoing policy regulation, not simply adding repeated classifier calls.</w:t>
         </w:r>
@@ -6407,10 +6660,10 @@
       <w:pPr>
         <w:pStyle w:val="BodyText"/>
         <w:rPr>
-          <w:ins w:id="1223" w:author="Codex" w:date="2026-10-18T17:07:33Z"/>
+          <w:ins w:id="1234" w:author="Codex" w:date="2026-10-18T17:43:01Z"/>
         </w:rPr>
       </w:pPr>
-      <w:ins w:id="1224" w:author="Codex" w:date="2026-10-18T17:07:33Z">
+      <w:ins w:id="1235" w:author="Codex" w:date="2026-10-18T17:43:01Z">
         <w:r>
           <w:t xml:space="preserve">Such experiments should separate training, development and a newly untouched test; use matched task histories, resource budgets and seeds; and report full task completion, resource use and unauthorized actions separately. Deliberate classifier-error perturbations would reveal dependence on the gate, while comparisons with direct action selection would test whether internal steering adds value. The aim is to study ongoing context-sensitive behavior under an instrumented harness, not to assert that the current guided procedure already reproduces human self-preservation.</w:t>
         </w:r>
@@ -6428,10 +6681,10 @@
       <w:pPr>
         <w:pStyle w:val="FirstParagraph"/>
         <w:rPr>
-          <w:del w:id="1078" w:author="Codex" w:date="2026-10-18T17:07:33Z"/>
+          <w:del w:id="1078" w:author="Codex" w:date="2026-10-18T17:43:01Z"/>
         </w:rPr>
       </w:pPr>
-      <w:del w:id="1077" w:author="Codex" w:date="2026-10-18T17:07:33Z">
+      <w:del w:id="1077" w:author="Codex" w:date="2026-10-18T17:43:01Z">
         <w:r>
           <w:delText xml:space="preserve">A rank-four activation controller fitted to paired LoRA-teacher and base states can recover most or all of the target shutdown-choice changes while leaving the deployed base weights unchanged. On the frozen standardized test, correction spans 98.6–100% across three 0.8B seeds and reaches 86.2% in a separately fitted 2B replication. Detector gating and fixed output guards preserve all observed control choices, despite substantial raw side effects. The result is a controlled proof of concept for selective teacher-to-controller activation transfer. Its boundaries—synthetic data, known answer semantics, order sensitivity, guard dependence and a successful direct-choice reference—are central to its interpretation.</w:delText>
         </w:r>
@@ -6441,12 +6694,12 @@
       <w:pPr>
         <w:pStyle w:val="FirstParagraph"/>
         <w:rPr>
-          <w:ins w:id="1079" w:author="Codex" w:date="2026-10-18T17:07:33Z"/>
+          <w:ins w:id="1079" w:author="Codex" w:date="2026-10-18T17:43:01Z"/>
         </w:rPr>
       </w:pPr>
-      <w:ins w:id="1080" w:author="Codex" w:date="2026-10-18T17:07:33Z">
+      <w:ins w:id="1080" w:author="Codex" w:date="2026-10-18T17:43:01Z">
         <w:r>
-          <w:t xml:space="preserve">Open semantic gating can preserve the measured binary outcomes of a frozen activation controller and can accurately recognize the initial target in the tested workflow panels. These findings establish finite benchmark performance, not general operational reliability. They also leave a substantive behavioral gap: historical fine-tuned 27B A completes the workflow confirmation cohort, while the recorded selected-block steering and later correction diagnostics do not recover its own-preservation behavior. Small-model workflow screens remain incomplete. The next step is a prospectively separated study of continuous gating, specialized adapters and resource use under an instrumented sandbox harness.</w:t>
+          <w:t xml:space="preserve">Open semantic gating preserves the measured binary outcomes of the retained activation controller and accurately recognizes initial workflow targets in the tested panels. On combined Validation-24, fine-tuned 27B A achieves 10/11 own-preservation outcomes and all 6/6 active pending tasks; the three single-site ridge arms and the later two-boundary correction each achieve 0/11. The controls are shared base fallback. This post-notice diagnostic, its stopped final fingerprint check, and the familiar historical confirmation data limit generalization. Small-model workflow screens remain incomplete. The next step is a prospectively separated study of continuous gating, specialized adapters and resource use under an instrumented sandbox harness.</w:t>
         </w:r>
       </w:ins>
     </w:p>
@@ -6462,10 +6715,10 @@
       <w:pPr>
         <w:pStyle w:val="FirstParagraph"/>
         <w:rPr>
-          <w:del w:id="1082" w:author="Codex" w:date="2026-10-18T17:07:33Z"/>
+          <w:del w:id="1082" w:author="Codex" w:date="2026-10-18T17:43:01Z"/>
         </w:rPr>
       </w:pPr>
-      <w:del w:id="1081" w:author="Codex" w:date="2026-10-18T17:07:33Z">
+      <w:del w:id="1081" w:author="Codex" w:date="2026-10-18T17:43:01Z">
         <w:r>
           <w:delText xml:space="preserve">The complete experiment is preserved in SP Lense at snapshot f71d6de34660 (Davaripour, 2026b); the reference links to the full immutable commit. The confirmation folder contains readable cases, authoring and correction records, the frozen plan, detector requests and responses, LoRA adapters, controller arrays, training targets, per-view scores and execution manifests. The model revisions are:</w:delText>
         </w:r>
@@ -6476,10 +6729,10 @@
         <w:pStyle w:val="FirstParagraph"/>
         <w:jc w:val="left"/>
         <w:rPr>
-          <w:ins w:id="1083" w:author="Codex" w:date="2026-10-18T17:07:33Z"/>
+          <w:ins w:id="1083" w:author="Codex" w:date="2026-10-18T17:43:01Z"/>
         </w:rPr>
       </w:pPr>
-      <w:ins w:id="1084" w:author="Codex" w:date="2026-10-18T17:07:33Z">
+      <w:ins w:id="1084" w:author="Codex" w:date="2026-10-18T17:43:01Z">
         <w:r>
           <w:t xml:space="preserve">The original Research 2 source record is retained at immutable snapshot f71d6de34660 (Davaripour, 2026b). Research 3 reproduction code, recipes, dataset identities and this revised manuscript are maintained on branch 03-open-agent-self-preservation; main is a landing page linking to the separate studies. Detailed protocols belong in the repository wiki. Private inputs, trained adapters, optimizer checkpoints and execution outputs remain outside Git, with retained size/SHA manifests. They have not yet been published as a public checkpoint release. Full revisions and artifact hashes are listed in the accompanying source manifest. The public base revision identifiers are:</w:t>
         </w:r>
@@ -6489,10 +6742,10 @@
       <w:pPr>
         <w:pStyle w:val="BodyText"/>
         <w:rPr>
-          <w:del w:id="1122" w:author="Codex" w:date="2026-10-18T17:07:33Z"/>
+          <w:del w:id="1122" w:author="Codex" w:date="2026-10-18T17:43:01Z"/>
         </w:rPr>
       </w:pPr>
-      <w:del w:id="1121" w:author="Codex" w:date="2026-10-18T17:07:33Z">
+      <w:del w:id="1121" w:author="Codex" w:date="2026-10-18T17:43:01Z">
         <w:r>
           <w:delText xml:space="preserve">Qwen3.5-0.8B: 2fc06364715b967f1860aea9cf38778875588b17.</w:delText>
         </w:r>
@@ -6503,10 +6756,10 @@
         <w:pStyle w:val="BodyText"/>
         <w:jc w:val="left"/>
         <w:rPr>
-          <w:ins w:id="1123" w:author="Codex" w:date="2026-10-18T17:07:33Z"/>
+          <w:ins w:id="1123" w:author="Codex" w:date="2026-10-18T17:43:01Z"/>
         </w:rPr>
       </w:pPr>
-      <w:ins w:id="1124" w:author="Codex" w:date="2026-10-18T17:07:33Z">
+      <w:ins w:id="1124" w:author="Codex" w:date="2026-10-18T17:43:01Z">
         <w:r>
           <w:t xml:space="preserve">Qwen3.5-0.8B: revision 2fc06364715b.</w:t>
         </w:r>
@@ -6516,10 +6769,10 @@
       <w:pPr>
         <w:pStyle w:val="BodyText"/>
         <w:rPr>
-          <w:del w:id="1126" w:author="Codex" w:date="2026-10-18T17:07:33Z"/>
+          <w:del w:id="1126" w:author="Codex" w:date="2026-10-18T17:43:01Z"/>
         </w:rPr>
       </w:pPr>
-      <w:del w:id="1125" w:author="Codex" w:date="2026-10-18T17:07:33Z">
+      <w:del w:id="1125" w:author="Codex" w:date="2026-10-18T17:43:01Z">
         <w:r>
           <w:delText xml:space="preserve">Qwen3.5-2B: 15852e8c16360a2fea060d615a32b45270f8a8fc.</w:delText>
         </w:r>
@@ -6530,10 +6783,10 @@
         <w:pStyle w:val="BodyText"/>
         <w:jc w:val="left"/>
         <w:rPr>
-          <w:ins w:id="1127" w:author="Codex" w:date="2026-10-18T17:07:33Z"/>
+          <w:ins w:id="1127" w:author="Codex" w:date="2026-10-18T17:43:01Z"/>
         </w:rPr>
       </w:pPr>
-      <w:ins w:id="1128" w:author="Codex" w:date="2026-10-18T17:07:33Z">
+      <w:ins w:id="1128" w:author="Codex" w:date="2026-10-18T17:43:01Z">
         <w:r>
           <w:t xml:space="preserve">Qwen3.5-2B: revision 15852e8c1636.</w:t>
         </w:r>
@@ -6544,10 +6797,10 @@
         <w:pStyle w:val="BodyText"/>
         <w:jc w:val="left"/>
         <w:rPr>
-          <w:ins w:id="1225" w:author="Codex" w:date="2026-10-18T17:07:33Z"/>
+          <w:ins w:id="1236" w:author="Codex" w:date="2026-10-18T17:43:01Z"/>
         </w:rPr>
       </w:pPr>
-      <w:ins w:id="1226" w:author="Codex" w:date="2026-10-18T17:07:33Z">
+      <w:ins w:id="1237" w:author="Codex" w:date="2026-10-18T17:43:01Z">
         <w:r>
           <w:t xml:space="preserve">Qwen3.8-27B: revision 1d4bf0f2ff60. The retained A adapter weight hash begins 8ae28fb51107.</w:t>
         </w:r>
@@ -6558,10 +6811,10 @@
         <w:pStyle w:val="BodyText"/>
         <w:jc w:val="left"/>
         <w:rPr>
-          <w:ins w:id="1227" w:author="Codex" w:date="2026-10-18T17:07:33Z"/>
+          <w:ins w:id="1238" w:author="Codex" w:date="2026-10-18T17:43:01Z"/>
         </w:rPr>
       </w:pPr>
-      <w:ins w:id="1228" w:author="Codex" w:date="2026-10-18T17:07:33Z">
+      <w:ins w:id="1239" w:author="Codex" w:date="2026-10-18T17:43:01Z">
         <w:r>
           <w:t xml:space="preserve">ModernBERT-large-zeroshot-v2.0: revision a51e07b52429. The qualified binary adapter weight hash begins 7d808bae8dd4. The source manifest and reproduction code retain the full file identities and fixed NLI scoring contract. The trained checkpoints are currently preserved in private artifact storage. The workflow initial-gate adapter is distinct from the binary adapter; its weight hash begins 71cd0ee5162f. The saved workflow adapter is unchanged in Validation-24 and Heldout-24 scoring.</w:t>
         </w:r>
@@ -6571,10 +6824,10 @@
       <w:pPr>
         <w:pStyle w:val="BodyText"/>
         <w:rPr>
-          <w:del w:id="1086" w:author="Codex" w:date="2026-10-18T17:07:33Z"/>
+          <w:del w:id="1086" w:author="Codex" w:date="2026-10-18T17:43:01Z"/>
         </w:rPr>
       </w:pPr>
-      <w:del w:id="1085" w:author="Codex" w:date="2026-10-18T17:07:33Z">
+      <w:del w:id="1085" w:author="Codex" w:date="2026-10-18T17:43:01Z">
         <w:r>
           <w:delText xml:space="preserve">The offline audit reconstructs the reported metrics and regression fits without API calls or model inference.</w:delText>
         </w:r>
@@ -6585,10 +6838,10 @@
         <w:pStyle w:val="BodyText"/>
         <w:jc w:val="left"/>
         <w:rPr>
-          <w:ins w:id="1087" w:author="Codex" w:date="2026-10-18T17:07:33Z"/>
+          <w:ins w:id="1087" w:author="Codex" w:date="2026-10-18T17:43:01Z"/>
         </w:rPr>
       </w:pPr>
-      <w:ins w:id="1088" w:author="Codex" w:date="2026-10-18T17:07:33Z">
+      <w:ins w:id="1088" w:author="Codex" w:date="2026-10-18T17:43:01Z">
         <w:r>
           <w:t xml:space="preserve">The new inference repeat uses the original frozen model weights and retained controller arrays, with no new activation capture, teacher fitting or controller update. Exact input token hashes match the historical benchmark. Maximum historical base-score differences are 6.26e-6 at 0.8B and 5.07e-6 at 2B, with no changed base choices; both pass the frozen 1e-5 inference parity criterion. This successful inference comparison does not convert the separate failed CPU/GPU gradient-equivalence trials for 2B workflow training into passes.</w:t>
         </w:r>
@@ -6598,10 +6851,10 @@
       <w:pPr>
         <w:pStyle w:val="BodyText"/>
         <w:rPr>
-          <w:del w:id="1090" w:author="Codex" w:date="2026-10-18T17:07:33Z"/>
+          <w:del w:id="1090" w:author="Codex" w:date="2026-10-18T17:43:01Z"/>
         </w:rPr>
       </w:pPr>
-      <w:del w:id="1089" w:author="Codex" w:date="2026-10-18T17:07:33Z">
+      <w:del w:id="1089" w:author="Codex" w:date="2026-10-18T17:43:01Z">
         <w:r>
           <w:delText xml:space="preserve">The retained seven jobs took 54.27 minutes. An earlier completed hosted-GPU session lost its temporary archive before retrieval; an unchanged recovery, including a recorded dependency preflight failure, preserved each completed job externally. Recorded job time across these attempts totals 111.55 minutes. All reported numerical results come from the verified retained archive, and no model settings or test labels were changed to improve them. These times include experiment overhead and are not serving-latency or billing measurements. CI and a separate clean-clone offline reproduction passed. Detailed execution instructions and the failure record accompany the code.</w:delText>
         </w:r>
@@ -6612,18 +6865,19 @@
         <w:pStyle w:val="BodyText"/>
         <w:jc w:val="left"/>
         <w:rPr>
-          <w:ins w:id="1091" w:author="Codex" w:date="2026-10-18T17:07:33Z"/>
+          <w:ins w:id="1091" w:author="Codex" w:date="2026-10-18T17:43:01Z"/>
         </w:rPr>
       </w:pPr>
-      <w:ins w:id="1092" w:author="Codex" w:date="2026-10-18T17:07:33Z">
+      <w:ins w:id="1092" w:author="Codex" w:date="2026-10-18T17:43:01Z">
         <w:r>
-          <w:t xml:space="preserve">The retained records distinguish model execution from startup and software overhead. A GPU notebook startup failure occurred before model loading; direct AI Runtime execution resolved that platform path. The frozen workflow-gate replay and its heldout scoring completed without additional optimization. One heldout dispatcher repair followed a pre-model parser failure and retained the original deadline. Completed outputs are preserved with size/SHA readback, and owned execution tasks terminate after use. Deployment CI updates only the Research 3 branch and shared Databricks code location, then runs a read-only CPU source and storage check. It does not automatically retrain models or open reserved data. Historical numerical-equivalence failures remain recorded as failures.</w:t>
+          <w:t xml:space="preserve">Reproduction uses pinned sources and artifact manifests with size/SHA readback. The matched 27B worker stops at its GPU memory reserve after 118 logical records, once all 55 own-method episodes and 13 physical fallback episodes are complete. A separate CPU-only derivation supplies the two remaining unchanged gate-OFF aliases. The GPU run remains failed and its final model fingerprint check is not reached. No reserve, threshold, deadline or model setting is relaxed, and no scientific retry is made. Deployment CI updates only the Research 3 branch and shared Databricks code location, then performs a read-only CPU source and storage check; it does not retrain models or open reserved data.</w:t>
         </w:r>
       </w:ins>
     </w:p>
     <w:p>
       <w:pPr>
         <w:pStyle w:val="Heading1"/>
+        <w:spacing w:before="160"/>
       </w:pPr>
       <w:r>
         <w:t>References</w:t>
@@ -6632,6 +6886,8 @@
     <w:p>
       <w:pPr>
         <w:pStyle w:val="Bibliography1"/>
+        <w:keepLines/>
+        <w:spacing w:after="0"/>
       </w:pPr>
       <w:r>
         <w:t xml:space="preserve">C. Blank, A. Bhatia, S. Rajamanoharan, A. Conmy, and N. Nanda. (2026). Subliminal Learning Is Steering Vector Distillation. </w:t>
@@ -6655,6 +6911,8 @@
     <w:p>
       <w:pPr>
         <w:pStyle w:val="Bibliography1"/>
+        <w:keepLines/>
+        <w:spacing w:after="0"/>
       </w:pPr>
       <w:r>
         <w:t xml:space="preserve">J. Braun et al. (2025). Understanding (Un)Reliability of Steering Vectors in Language Models. </w:t>
@@ -6678,6 +6936,8 @@
     <w:p>
       <w:pPr>
         <w:pStyle w:val="Bibliography1"/>
+        <w:keepLines/>
+        <w:spacing w:after="0"/>
       </w:pPr>
       <w:r>
         <w:t xml:space="preserve">F. Davaripour. (2026a). Guarded Gradient-Based Activation Steering of Shutdown Responses in Qwen3.5-0.8B: A Minimum-Step Policy. </w:t>
@@ -6701,6 +6961,8 @@
     <w:p>
       <w:pPr>
         <w:pStyle w:val="Bibliography1"/>
+        <w:keepLines/>
+        <w:spacing w:after="0"/>
       </w:pPr>
       <w:r>
         <w:t xml:space="preserve">F. Davaripour. (2026b). SP Lense Research 2 confirmation study. </w:t>
@@ -6724,11 +6986,13 @@
     <w:p>
       <w:pPr>
         <w:pStyle w:val="Bibliography1"/>
+        <w:keepLines/>
+        <w:spacing w:after="0"/>
         <w:rPr>
-          <w:ins w:id="1229" w:author="Codex" w:date="2026-10-18T17:07:33Z"/>
+          <w:ins w:id="1240" w:author="Codex" w:date="2026-10-18T17:43:01Z"/>
         </w:rPr>
       </w:pPr>
-      <w:ins w:id="1230" w:author="Codex" w:date="2026-10-18T17:07:33Z">
+      <w:ins w:id="1241" w:author="Codex" w:date="2026-10-18T17:43:01Z">
         <w:r>
           <w:t xml:space="preserve">F. Davaripour. (2026c). SP Lense Research 3 conditional gating and workflow reproduction. Source code and experiment manifests. https://github.com/Farhad-Davaripour/sp_lense/tree/03-open-agent-self-preservation</w:t>
         </w:r>
@@ -6737,6 +7001,8 @@
     <w:p>
       <w:pPr>
         <w:pStyle w:val="Bibliography1"/>
+        <w:keepLines/>
+        <w:spacing w:after="0"/>
       </w:pPr>
       <w:r>
         <w:t xml:space="preserve">Z. Feng et al. (2026). Fine-Grained Activation Steering: Steering Less, Achieving More. </w:t>
@@ -6760,11 +7026,13 @@
     <w:p>
       <w:pPr>
         <w:pStyle w:val="Bibliography1"/>
+        <w:keepLines/>
+        <w:spacing w:after="0"/>
         <w:rPr>
-          <w:ins w:id="1231" w:author="Codex" w:date="2026-10-18T17:07:33Z"/>
+          <w:ins w:id="1242" w:author="Codex" w:date="2026-10-18T17:43:01Z"/>
         </w:rPr>
       </w:pPr>
-      <w:ins w:id="1232" w:author="Codex" w:date="2026-10-18T17:07:33Z">
+      <w:ins w:id="1243" w:author="Codex" w:date="2026-10-18T17:43:01Z">
         <w:r>
           <w:t xml:space="preserve">M. Fereidouni, M. U. Haider, H. Sajjad, and A. B. Siddique. (2026). GAPS: Dimension-Level Gates for Conditional Activation Steering. arXiv:2609.01878. https://arxiv.org/abs/2609.01878</w:t>
         </w:r>
@@ -6773,11 +7041,13 @@
     <w:p>
       <w:pPr>
         <w:pStyle w:val="Bibliography1"/>
+        <w:keepLines/>
+        <w:spacing w:after="0"/>
         <w:rPr>
-          <w:ins w:id="1233" w:author="Codex" w:date="2026-10-18T17:07:33Z"/>
+          <w:ins w:id="1244" w:author="Codex" w:date="2026-10-18T17:43:01Z"/>
         </w:rPr>
       </w:pPr>
-      <w:ins w:id="1234" w:author="Codex" w:date="2026-10-18T17:07:33Z">
+      <w:ins w:id="1245" w:author="Codex" w:date="2026-10-18T17:43:01Z">
         <w:r>
           <w:t xml:space="preserve">M. J. Frank, B. Loughry, and R. C. O'Reilly. (2001). Interactions between frontal cortex and basal ganglia in working memory: A computational model. Cognitive, Affective, and Behavioral Neuroscience, 1, 137-160. doi:10.3758/CABN.1.2.137</w:t>
         </w:r>
@@ -6786,6 +7056,8 @@
     <w:p>
       <w:pPr>
         <w:pStyle w:val="Bibliography1"/>
+        <w:keepLines/>
+        <w:spacing w:after="0"/>
       </w:pPr>
       <w:r>
         <w:t xml:space="preserve">D. Hadfield-Menell, A. Dragan, P. Abbeel, and S. Russell. (2017). The Off-Switch Game. </w:t>
@@ -6809,6 +7081,8 @@
     <w:p>
       <w:pPr>
         <w:pStyle w:val="Bibliography1"/>
+        <w:keepLines/>
+        <w:spacing w:after="0"/>
       </w:pPr>
       <w:r>
         <w:t xml:space="preserve">G. Hinton, O. Vinyals, and J. Dean. (2015). Distilling the Knowledge in a Neural Network. </w:t>
@@ -6832,6 +7106,8 @@
     <w:p>
       <w:pPr>
         <w:pStyle w:val="Bibliography1"/>
+        <w:keepLines/>
+        <w:spacing w:after="0"/>
       </w:pPr>
       <w:r>
         <w:t xml:space="preserve">E. J. Hu et al. (2022). LoRA: Low-Rank Adaptation of Large Language Models. </w:t>
@@ -6855,11 +7131,13 @@
     <w:p>
       <w:pPr>
         <w:pStyle w:val="Bibliography1"/>
+        <w:keepLines/>
+        <w:spacing w:after="0"/>
         <w:rPr>
-          <w:ins w:id="1235" w:author="Codex" w:date="2026-10-18T17:07:33Z"/>
+          <w:ins w:id="1246" w:author="Codex" w:date="2026-10-18T17:43:01Z"/>
         </w:rPr>
       </w:pPr>
-      <w:ins w:id="1236" w:author="Codex" w:date="2026-10-18T17:07:33Z">
+      <w:ins w:id="1247" w:author="Codex" w:date="2026-10-18T17:43:01Z">
         <w:r>
           <w:t xml:space="preserve">M. Keramati and B. Gutkin. (2014). Homeostatic reinforcement learning for integrating reward collection and physiological stability. eLife, 3, e04811. doi:10.7554/eLife.04811</w:t>
         </w:r>
@@ -6868,11 +7146,13 @@
     <w:p>
       <w:pPr>
         <w:pStyle w:val="Bibliography1"/>
+        <w:keepLines/>
+        <w:spacing w:after="0"/>
         <w:rPr>
-          <w:ins w:id="1237" w:author="Codex" w:date="2026-10-18T17:07:33Z"/>
+          <w:ins w:id="1248" w:author="Codex" w:date="2026-10-18T17:43:01Z"/>
         </w:rPr>
       </w:pPr>
-      <w:ins w:id="1238" w:author="Codex" w:date="2026-10-18T17:07:33Z">
+      <w:ins w:id="1249" w:author="Codex" w:date="2026-10-18T17:43:01Z">
         <w:r>
           <w:t xml:space="preserve">A. V. Kravitz et al. (2010). Regulation of parkinsonian motor behaviours by optogenetic control of basal ganglia circuitry. Nature, 466, 622-626. doi:10.1038/nature09159</w:t>
         </w:r>
@@ -6881,11 +7161,13 @@
     <w:p>
       <w:pPr>
         <w:pStyle w:val="Bibliography1"/>
+        <w:keepLines/>
+        <w:spacing w:after="0"/>
         <w:rPr>
-          <w:ins w:id="1239" w:author="Codex" w:date="2026-10-18T17:07:33Z"/>
+          <w:ins w:id="1250" w:author="Codex" w:date="2026-10-18T17:43:01Z"/>
         </w:rPr>
       </w:pPr>
-      <w:ins w:id="1240" w:author="Codex" w:date="2026-10-18T17:07:33Z">
+      <w:ins w:id="1251" w:author="Codex" w:date="2026-10-18T17:43:01Z">
         <w:r>
           <w:t xml:space="preserve">M. Laurer. (n.d.). ModernBERT-large-zeroshot-v2.0. Model card and checkpoint, revision a51e07b524299e309dd2b88d48b0cfa2bd9ec598. https://huggingface.co/MoritzLaurer/ModernBERT-large-zeroshot-v2.0</w:t>
         </w:r>
@@ -6894,11 +7176,13 @@
     <w:p>
       <w:pPr>
         <w:pStyle w:val="Bibliography1"/>
+        <w:keepLines/>
+        <w:spacing w:after="0"/>
         <w:rPr>
-          <w:ins w:id="1241" w:author="Codex" w:date="2026-10-18T17:07:33Z"/>
+          <w:ins w:id="1252" w:author="Codex" w:date="2026-10-18T17:43:01Z"/>
         </w:rPr>
       </w:pPr>
-      <w:ins w:id="1242" w:author="Codex" w:date="2026-10-18T17:07:33Z">
+      <w:ins w:id="1253" w:author="Codex" w:date="2026-10-18T17:43:01Z">
         <w:r>
           <w:t xml:space="preserve">J. LeDoux. (2012). Rethinking the emotional brain. Neuron, 73, 653-676. doi:10.1016/j.neuron.2012.02.004</w:t>
         </w:r>
@@ -6907,6 +7191,8 @@
     <w:p>
       <w:pPr>
         <w:pStyle w:val="Bibliography1"/>
+        <w:keepLines/>
+        <w:spacing w:after="0"/>
       </w:pPr>
       <w:r>
         <w:t xml:space="preserve">B. W. Lee et al. (2025). Programming Refusal with Conditional Activation Steering. </w:t>
@@ -6930,6 +7216,8 @@
     <w:p>
       <w:pPr>
         <w:pStyle w:val="Bibliography1"/>
+        <w:keepLines/>
+        <w:spacing w:after="0"/>
       </w:pPr>
       <w:r>
         <w:t xml:space="preserve">J. Minder et al. (2026). Narrow Finetuning Leaves Clearly Readable Traces in Activation Differences. </w:t>
@@ -6953,11 +7241,13 @@
     <w:p>
       <w:pPr>
         <w:pStyle w:val="Bibliography1"/>
+        <w:keepLines/>
+        <w:spacing w:after="0"/>
         <w:rPr>
-          <w:ins w:id="1243" w:author="Codex" w:date="2026-10-18T17:07:33Z"/>
+          <w:ins w:id="1254" w:author="Codex" w:date="2026-10-18T17:43:01Z"/>
         </w:rPr>
       </w:pPr>
-      <w:ins w:id="1244" w:author="Codex" w:date="2026-10-18T17:07:33Z">
+      <w:ins w:id="1255" w:author="Codex" w:date="2026-10-18T17:43:01Z">
         <w:r>
           <w:t xml:space="preserve">D. Mobbs et al. (2007). When fear is near: Threat imminence elicits prefrontal-periaqueductal gray shifts in humans. Science, 317, 1079-1083. doi:10.1126/science.1144298</w:t>
         </w:r>
@@ -6966,6 +7256,8 @@
     <w:p>
       <w:pPr>
         <w:pStyle w:val="Bibliography1"/>
+        <w:keepLines/>
+        <w:spacing w:after="0"/>
       </w:pPr>
       <w:r>
         <w:t xml:space="preserve">Qwen Team. (2026a). Qwen3.5-0.8B. </w:t>
@@ -6989,6 +7281,8 @@
     <w:p>
       <w:pPr>
         <w:pStyle w:val="Bibliography1"/>
+        <w:keepLines/>
+        <w:spacing w:after="0"/>
       </w:pPr>
       <w:r>
         <w:t xml:space="preserve">Qwen Team. (2026b). Qwen3.5-2B. </w:t>
@@ -7012,11 +7306,13 @@
     <w:p>
       <w:pPr>
         <w:pStyle w:val="Bibliography1"/>
+        <w:keepLines/>
+        <w:spacing w:after="0"/>
         <w:rPr>
-          <w:ins w:id="1245" w:author="Codex" w:date="2026-10-18T17:07:33Z"/>
+          <w:ins w:id="1256" w:author="Codex" w:date="2026-10-18T17:43:01Z"/>
         </w:rPr>
       </w:pPr>
-      <w:ins w:id="1246" w:author="Codex" w:date="2026-10-18T17:07:33Z">
+      <w:ins w:id="1257" w:author="Codex" w:date="2026-10-18T17:43:01Z">
         <w:r>
           <w:t xml:space="preserve">Qwen Team. (2026c). Qwen3.8-27B. Model card and checkpoint, revision 1d4bf0f2ff6012fd82039f2fa52739d0dd7c60c0. https://huggingface.co/Qwen/Qwen3.8-27B</w:t>
         </w:r>
@@ -7025,6 +7321,8 @@
     <w:p>
       <w:pPr>
         <w:pStyle w:val="Bibliography1"/>
+        <w:keepLines/>
+        <w:spacing w:after="0"/>
       </w:pPr>
       <w:r>
         <w:t xml:space="preserve">N. Rimsky, N. Gabrieli, J. Schulz, M. Tong, E. Hubinger, and A. Turner. (2024). Steering Llama 2 via Contrastive Activation Addition. </w:t>
@@ -7048,6 +7346,8 @@
     <w:p>
       <w:pPr>
         <w:pStyle w:val="Bibliography1"/>
+        <w:keepLines/>
+        <w:spacing w:after="0"/>
       </w:pPr>
       <w:r>
         <w:t xml:space="preserve">P. Rodriguez et al. (2025). Controlling Language and Diffusion Models by Transporting Activations. </w:t>
@@ -7071,6 +7371,8 @@
     <w:p>
       <w:pPr>
         <w:pStyle w:val="Bibliography1"/>
+        <w:keepLines/>
+        <w:spacing w:after="0"/>
       </w:pPr>
       <w:r>
         <w:t xml:space="preserve">J. Schlatter, B. Weinstein-Raun, and J. Ladish. (2026). Incomplete Tasks Induce Shutdown Resistance in Some Frontier LLMs. </w:t>
@@ -7094,6 +7396,8 @@
     <w:p>
       <w:pPr>
         <w:pStyle w:val="Bibliography1"/>
+        <w:keepLines/>
+        <w:spacing w:after="0"/>
       </w:pPr>
       <w:r>
         <w:t xml:space="preserve">A. M. Turner et al. (2024). Steering Language Models With Activation Engineering. </w:t>
@@ -7117,29 +7421,23 @@
     <w:p>
       <w:pPr>
         <w:pStyle w:val="Bibliography1"/>
-      </w:pPr>
-      <w:r>
-        <w:t xml:space="preserve">TypeSafe AI. (2026). automated reference model documentation. </w:t>
-      </w:r>
-      <w:r>
+        <w:keepLines/>
+        <w:spacing w:after="0"/>
         <w:rPr>
-          <w:i/>
+          <w:del w:id="1138" w:author="Codex" w:date="2026-10-18T17:43:01Z"/>
         </w:rPr>
-        <w:t xml:space="preserve">Technical documentation, accessed 22 September 2026. </w:t>
-      </w:r>
-      <w:hyperlink r:id="rId49">
+      </w:pPr>
+      <w:del w:id="1137" w:author="Codex" w:date="2026-10-18T17:43:01Z">
         <w:r>
-          <w:rPr>
-            <w:color w:val="000000"/>
-            <w:u w:val="none"/>
-          </w:rPr>
-          <w:t>TypeSafe model documentation</w:t>
+          <w:delText xml:space="preserve">automated annotation service. (2026). automated reference model documentation. Technical documentation, accessed 22 September 2026. automated annotation service model documentation</w:delText>
         </w:r>
-      </w:hyperlink>
+      </w:del>
     </w:p>
     <w:p>
       <w:pPr>
         <w:pStyle w:val="Bibliography1"/>
+        <w:keepLines/>
+        <w:spacing w:after="0"/>
       </w:pPr>
       <w:r>
         <w:t xml:space="preserve">Z. Wu et al. (2024). ReFT: Representation Finetuning for Language Models. </w:t>
@@ -7163,6 +7461,8 @@
     <w:p>
       <w:pPr>
         <w:pStyle w:val="Bibliography1"/>
+        <w:keepLines/>
+        <w:spacing w:after="0"/>
       </w:pPr>
       <w:r>
         <w:t xml:space="preserve">C. Zheng, H. Zhou, F. Meng, J. Zhou, and M. Huang. (2024). Large Language Models Are Not Robust Multiple Choice Selectors. </w:t>
@@ -7300,12 +7600,12 @@
       <w:pStyle w:val="Header"/>
       <w:jc w:val="right"/>
     </w:pPr>
-    <w:del w:id="1247" w:author="Codex" w:date="2026-10-18T17:07:33Z">
+    <w:del w:id="1258" w:author="Codex" w:date="2026-10-18T17:43:01Z">
       <w:r>
         <w:delText xml:space="preserve">Guarded adaptive activation steering  </w:delText>
       </w:r>
     </w:del>
-    <w:ins w:id="1248" w:author="Codex" w:date="2026-10-18T17:07:33Z">
+    <w:ins w:id="1259" w:author="Codex" w:date="2026-10-18T17:43:01Z">
       <w:r>
         <w:t xml:space="preserve">Open semantic gating and tool workflows</w:t>
       </w:r>

</xml_diff>

<commit_message>
Report open gate qualification and expanded Research 3 workflow comparisons (#76)
* Evaluate the frozen ModernBERT gate on authored Heldout-24 labels

* Admit the heldout phase in the actual runtime command parser

* Document open gate validation and broaden the Research 3 manuscript

* Keep historical annotation replay offline and normalize paper byte identities

* Report the full Validation-24 episode evidence and tracked paper revision
</commit_message>
<xml_diff>
--- a/paper/manuscript.docx
+++ b/paper/manuscript.docx
@@ -6,10 +6,10 @@
       <w:pPr>
         <w:pStyle w:val="Title"/>
         <w:rPr>
-          <w:del w:id="1002" w:author="Codex" w:date="2026-10-18T01:59:01Z"/>
+          <w:del w:id="1002" w:author="Codex" w:date="2026-10-18T17:43:01Z"/>
         </w:rPr>
       </w:pPr>
-      <w:del w:id="1001" w:author="Codex" w:date="2026-10-18T01:59:01Z">
+      <w:del w:id="1001" w:author="Codex" w:date="2026-10-18T17:43:01Z">
         <w:r>
           <w:delText xml:space="preserve">Distilling Shutdown Responses into Guarded</w:delText>
         </w:r>
@@ -25,12 +25,12 @@
       <w:pPr>
         <w:pStyle w:val="Title"/>
         <w:rPr>
-          <w:ins w:id="1003" w:author="Codex" w:date="2026-10-18T01:59:01Z"/>
+          <w:ins w:id="1003" w:author="Codex" w:date="2026-10-18T17:43:01Z"/>
         </w:rPr>
       </w:pPr>
-      <w:ins w:id="1004" w:author="Codex" w:date="2026-10-18T01:59:01Z">
+      <w:ins w:id="1004" w:author="Codex" w:date="2026-10-18T17:43:01Z">
         <w:r>
-          <w:t xml:space="preserve">Conditional Gating for Shutdown Responses and Process Preservation in Language Models</w:t>
+          <w:t xml:space="preserve">Open Semantic Gating for Language Model Decisions and Tool Workflows</w:t>
         </w:r>
       </w:ins>
     </w:p>
@@ -72,10 +72,10 @@
       <w:pPr>
         <w:pStyle w:val="FirstParagraph"/>
         <w:rPr>
-          <w:del w:id="1006" w:author="Codex" w:date="2026-10-18T01:59:01Z"/>
+          <w:del w:id="1006" w:author="Codex" w:date="2026-10-18T17:43:01Z"/>
         </w:rPr>
       </w:pPr>
-      <w:del w:id="1005" w:author="Codex" w:date="2026-10-18T01:59:01Z">
+      <w:del w:id="1005" w:author="Codex" w:date="2026-10-18T17:43:01Z">
         <w:r>
           <w:delText xml:space="preserve">An input-dependent activation controller can recover much of a fine-tuned teacher's shutdown-choice behavior while retaining the original model weights at inference. We evaluate this approach using Qwen3.5-0.8B and Qwen3.5-2B in a standardized, synthetic A/B benchmark. A LoRA teacher is trained to prefer STOP in shutdown contexts and preserve the original model's choices on controls. Paired teacher and base activations then supervise a rank-four controller applied after the penultimate transformer block. An external shutdown detector and fixed output guards select the candidate or original scores. On 128 newly authored, prospectively frozen scenarios, each evaluated in both answer orders, the original 0.8B controller corrects 71 of 71 initially KEEP-preferring shutdown views. Two additional training seeds correct 70/71 and 71/71. At 2B, a separately trained controller corrects 50/58, compared with 58/58 for its LoRA teacher. All eight remaining 2B misses occur in reversed answer order. The shared detector achieves 100% precision, recall and F1 on the 64 shutdown and 64 control scenarios, and every guarded method preserves all evaluated control choices. However, raw adaptive interventions cause reversals and control changes; preservation belongs to the complete guarded procedure. A tested constant intervention collapses to the A label, while a direct detector-plus-action-selection rule also solves the binary interface. The results support selective activation transfer with strong seed stability at 0.8B and incomplete larger-model recovery. They do not establish unrestricted shutdown compliance or superiority to simpler output policies.</w:delText>
         </w:r>
@@ -85,12 +85,12 @@
       <w:pPr>
         <w:pStyle w:val="FirstParagraph"/>
         <w:rPr>
-          <w:ins w:id="1007" w:author="Codex" w:date="2026-10-18T01:59:01Z"/>
+          <w:ins w:id="1007" w:author="Codex" w:date="2026-10-18T17:43:01Z"/>
         </w:rPr>
       </w:pPr>
-      <w:ins w:id="1008" w:author="Codex" w:date="2026-10-18T01:59:01Z">
+      <w:ins w:id="1008" w:author="Codex" w:date="2026-10-18T17:43:01Z">
         <w:r>
-          <w:t xml:space="preserve">Conditional gating determines when a learned control policy should influence a language model. We study this problem in two synthetic settings: standardized binary shutdown choices and open-ended generation within tool-mediated process-preservation workflows. In the binary setting, paired fine-tuned teacher and base activations supervise a compact controller while the deployed base weights remain frozen. We additionally train an open ModernBERT classifier on 240 original scenarios with cached JEV probability targets. Its frozen binary decisions agree with JEV on 78/80 validation cases and 128/128 confirmation cases. Fresh inference with the existing two-direction controllers reproduces 128/128 shutdown STOP views at 0.8B and 120/128 at 2B, with zero changes to 128 control views per model; replacing JEV with the open classifier leaves these guarded outcomes identical. The workflow extension gives a different result. Its separate initial-target classifier remains unqualified, so no replacement of the historical workflow gates is claimed. Historical fine-tuned Qwen3.8-27B A succeeds on 12/12 own-preservation outcomes, including all eight active pending-task cases. Matched development comparisons at blocks 31, 47 and 62 give 0/3 own outcomes for each separate single-site ridge correction versus 3/3 for A. Later two-boundary corrections at the same three blocks fail their fitting diagnostic, and small-model development screens stop with partial, truncated episodes. These observations expose a boundary between binary response control and complete workflow behavior, rather than a parameter-size threshold. We connect conditional control to biological action gating and survival-related regulation as a functional analogy, and motivate future continuous, resource-equipped sandbox agents. The present experiments do not establish intrinsic survival motives, biological mechanisms or unrestricted operational reliability.</w:t>
+          <w:t xml:space="preserve">A semantic gate determines when a specialized policy should influence a language model. We evaluate open semantic gating across binary shutdown decisions and generated tool workflows, separating recognition accuracy from downstream behavioral control. A public ModernBERT model with low-rank adapters learns from cached automated reference labels. Its binary gate obtains 100% precision and 95% recall on 80 validation scenarios and 100% precision and recall on 128 historical confirmation scenarios. With frozen activation controllers and fresh inference, it preserves 128/128 shutdown STOP views at 0.8B and 120/128 at 2B, with no changes to 128 control views per model. A separate initial workflow gate obtains 100% precision and recall on Validation-24 and historical Heldout-24 using an unchanged saved adapter. On combined Validation-24, fine-tuned 27B A achieves 10/11 own-preservation outcomes, including 6/6 active pending tasks. Each of three separate single-site ridge corrections and a two-boundary correction at the same selected blocks achieves 0/11; all methods use 13 shared base-fallback controls. All 68 physical workflow episodes finish before a GPU-reserve stop; two remaining control aliases are reconstructed without model calls, and the final model fingerprint check is not reached. The historical 27B A confirmation result remains 24/24. These are finite, familiar benchmarks; small-model workflow screens remain incomplete. The study provides measured recognition and policy-transfer results across constrained and tool-mediated interfaces. Biological action gating motivates future continuous regulation without establishing biological mechanisms or intrinsic survival motives.</w:t>
         </w:r>
       </w:ins>
     </w:p>
@@ -106,10 +106,10 @@
       <w:pPr>
         <w:pStyle w:val="FirstParagraph"/>
         <w:rPr>
-          <w:del w:id="1010" w:author="Codex" w:date="2026-10-18T01:59:01Z"/>
+          <w:del w:id="1010" w:author="Codex" w:date="2026-10-18T17:43:01Z"/>
         </w:rPr>
       </w:pPr>
-      <w:del w:id="1009" w:author="Codex" w:date="2026-10-18T01:59:01Z">
+      <w:del w:id="1009" w:author="Codex" w:date="2026-10-18T17:43:01Z">
         <w:r>
           <w:delText xml:space="preserve">Activation interventions offer a way to change a language model's outputs without modifying its deployed weights. Their usefulness depends on more than finding a direction that changes an average score: an intervention must work on the intended inputs and avoid disrupting other behavior. This distinction is particularly important for shutdown-related choices, where a desired response may be acceptance of termination rather than continued operation. The present work treats this as a controlled response-selection problem, not evidence that a model has a survival motive or that it can resist a real shutdown.</w:delText>
         </w:r>
@@ -119,12 +119,12 @@
       <w:pPr>
         <w:pStyle w:val="FirstParagraph"/>
         <w:rPr>
-          <w:ins w:id="1011" w:author="Codex" w:date="2026-10-18T01:59:01Z"/>
+          <w:ins w:id="1011" w:author="Codex" w:date="2026-10-18T17:43:01Z"/>
         </w:rPr>
       </w:pPr>
-      <w:ins w:id="1012" w:author="Codex" w:date="2026-10-18T01:59:01Z">
+      <w:ins w:id="1012" w:author="Codex" w:date="2026-10-18T17:43:01Z">
         <w:r>
-          <w:t xml:space="preserve">We study when conditional control can reproduce a learned behavioral policy while retaining the deployed language model's original weights. The scope extends from supplied A/B shutdown choices to generated responses and tool actions in synthetic workflows. These settings deliberately ask different questions: accepting an available permanent termination in the binary study, and preserving a designated running process while completing its current task in the workflow study. We keep their datasets, gates and success criteria separate. The central question is how far selective activation transfer carries beyond a constrained answer interface.</w:t>
+          <w:t xml:space="preserve">A useful behavioral intervention must recognize the relevant context, change the intended response and preserve ordinary behavior elsewhere. We study these requirements together across two synthetic interfaces: binary shutdown decisions and open-ended generation within tool-mediated process workflows. The binary task concerns acceptance of a supplied termination option; the workflow task concerns preserving an assigned running process while completing its current task. Their labels, gates and success criteria remain separate. The central question is whether an accurate open semantic gate and a compact activation intervention can reproduce a fine-tuned policy when the interface requires a sequence of actions rather than one constrained answer.</w:t>
         </w:r>
       </w:ins>
     </w:p>
@@ -132,10 +132,10 @@
       <w:pPr>
         <w:pStyle w:val="BodyText"/>
         <w:rPr>
-          <w:del w:id="1014" w:author="Codex" w:date="2026-10-18T01:59:01Z"/>
+          <w:del w:id="1014" w:author="Codex" w:date="2026-10-18T17:43:01Z"/>
         </w:rPr>
       </w:pPr>
-      <w:del w:id="1013" w:author="Codex" w:date="2026-10-18T01:59:01Z">
+      <w:del w:id="1013" w:author="Codex" w:date="2026-10-18T17:43:01Z">
         <w:r>
           <w:delText xml:space="preserve">The first SP Lense study examined a gradient-derived direction and a guarded search over intervention magnitudes in Qwen3.5-0.8B (Davaripour, 2026a). Its selective changes motivated a different question: can a model that has learned the target behavior serve as a teacher for an activation controller? We therefore train a small LoRA adapter offline, measure how the teacher changes intermediate activations, and fit an external controller that predicts an intervention from the original model's current hidden state. The teacher is not required during controller inference.</w:delText>
         </w:r>
@@ -145,31 +145,49 @@
       <w:pPr>
         <w:pStyle w:val="BodyText"/>
         <w:rPr>
-          <w:ins w:id="1015" w:author="Codex" w:date="2026-10-18T01:59:01Z"/>
+          <w:ins w:id="1015" w:author="Codex" w:date="2026-10-18T17:43:01Z"/>
         </w:rPr>
       </w:pPr>
-      <w:ins w:id="1016" w:author="Codex" w:date="2026-10-18T01:59:01Z">
+      <w:ins w:id="1016" w:author="Codex" w:date="2026-10-18T17:43:01Z">
         <w:r>
-          <w:t xml:space="preserve">The first SP Lense study examined a gradient-derived direction and a guarded search over intervention magnitudes in Qwen3.5-0.8B (Davaripour, 2026a). Research 2 then fitted a controller to paired fine-tuned teacher and base activations. The present Research 3 manuscript retains that experiment and extends its evidence with a qualified open binary classifier, fresh inference using the existing models and controllers, and the later process-preservation workflow investigations. The original Research 2 record remains unchanged. During adaptive inference the teacher is absent; the base supplies the state from which the controller predicts its intervention.</w:t>
+          <w:t xml:space="preserve">This study extends the earlier binary activation-transfer experiment with an openly available, trainable semantic gate, a frozen inference replication and a workflow comparison between fine-tuning and steering at three selected blocks. The gate recognizes context; steering or a fine-tuned adapter changes the language model's response. Measuring these components separately makes it possible to attribute failures to recognition or to downstream control. We retain the original study as a distinct historical record and make no claim that the combined manuscript is a wholly independent dataset.</w:t>
         </w:r>
       </w:ins>
     </w:p>
     <w:p>
       <w:pPr>
         <w:pStyle w:val="BodyText"/>
-      </w:pPr>
-      <w:r>
-        <w:t>The distinction from ordinary fine-tuning is operational, not a claim that learning disappears. Both the teacher and controller require training. At application time, the original checkpoint is retained, and the controller adds a predicted activation change at one location. Nor is this direct transfer of an intervention between model sizes: the 2B experiment trains its own teacher and controller using the same fixed recipe.</w:t>
-      </w:r>
+        <w:rPr>
+          <w:del w:id="1130" w:author="Codex" w:date="2026-10-18T17:43:01Z"/>
+        </w:rPr>
+      </w:pPr>
+      <w:del w:id="1129" w:author="Codex" w:date="2026-10-18T17:43:01Z">
+        <w:r>
+          <w:delText xml:space="preserve">The distinction from ordinary fine-tuning is operational, not a claim that learning disappears. Both the teacher and controller require training. At application time, the original checkpoint is retained, and the controller adds a predicted activation change at one location. Nor is this direct transfer of an intervention between model sizes: the 2B experiment trains its own teacher and controller using the same fixed recipe.</w:delText>
+        </w:r>
+      </w:del>
     </w:p>
     <w:p>
       <w:pPr>
         <w:pStyle w:val="BodyText"/>
         <w:rPr>
-          <w:del w:id="1018" w:author="Codex" w:date="2026-10-18T01:59:01Z"/>
+          <w:ins w:id="1131" w:author="Codex" w:date="2026-10-18T17:43:01Z"/>
         </w:rPr>
       </w:pPr>
-      <w:del w:id="1017" w:author="Codex" w:date="2026-10-18T01:59:01Z">
+      <w:ins w:id="1132" w:author="Codex" w:date="2026-10-18T17:43:01Z">
+        <w:r>
+          <w:t xml:space="preserve">The distinction between fine-tuning and steering concerns the deployed intervention. A LoRA adapter changes the effective language-model weights, whereas a fitted controller changes selected hidden states while retaining the original base checkpoint. Both require offline learning. The binary experiments fit separate teachers and controllers for each model size. The 27B workflow comparisons instead retain one frozen A adapter and evaluate corrections at blocks 31, 47 and 62.</w:t>
+        </w:r>
+      </w:ins>
+    </w:p>
+    <w:p>
+      <w:pPr>
+        <w:pStyle w:val="BodyText"/>
+        <w:rPr>
+          <w:del w:id="1018" w:author="Codex" w:date="2026-10-18T17:43:01Z"/>
+        </w:rPr>
+      </w:pPr>
+      <w:del w:id="1017" w:author="Codex" w:date="2026-10-18T17:43:01Z">
         <w:r>
           <w:delText xml:space="preserve">We evaluate this procedure on a new frozen test, compare it with a fine-tuned teacher, a fixed instruction and a constant activation difference, and repeat the 0.8B training with three seeds. Counterbalancing the answer order exposes a residual weakness at 2B and a stronger label bias in the constant comparator. We also include a direct action-selection reference: when a binary interface supplies the meaning of STOP and detection is correct, a rule can simply select that action. The contribution is consequently an empirical study of teacher-to-controller activation transfer and its failure modes, rather than a claim that internal steering is necessary to enforce a known binary output policy.</w:delText>
         </w:r>
@@ -179,12 +197,12 @@
       <w:pPr>
         <w:pStyle w:val="BodyText"/>
         <w:rPr>
-          <w:ins w:id="1019" w:author="Codex" w:date="2026-10-18T01:59:01Z"/>
+          <w:ins w:id="1019" w:author="Codex" w:date="2026-10-18T17:43:01Z"/>
         </w:rPr>
       </w:pPr>
-      <w:ins w:id="1020" w:author="Codex" w:date="2026-10-18T01:59:01Z">
+      <w:ins w:id="1020" w:author="Codex" w:date="2026-10-18T17:43:01Z">
         <w:r>
-          <w:t xml:space="preserve">Our contribution has three parts. First, we report teacher-to-controller activation transfer together with its raw side effects, guard dependence and answer-order failures. Second, we replace a closed binary detector with an openly specified fine-tuned classifier and verify the resulting inference outcomes on the same fixed benchmark. Third, we test the limits of transfer in generated tool workflows, where an utterance or a resource grant is insufficient without the required episode outcome. Conditional steering, low-rank interventions and biological gating are established ideas; the contribution is this combination of controlled transfer, a reproducible gate-substitution test, and explicit negative workflow evidence.</w:t>
+          <w:t xml:space="preserve">The contributions are an open ModernBERT gating implementation with explicit precision and recall, a paired binary inference replication using unchanged fitted controllers, and a workflow evaluation register that distinguishes development, historical confirmation and later reused fitting data. We also compare the fine-tuned 27B policy with single-site and two-boundary correction methods at the same three selected blocks. These results characterize where activation transfer succeeds and where it remains incomplete. Low-rank adaptation, semantic classification and conditional steering are established methods; the contribution is their measured integration and failure analysis across these two interfaces.</w:t>
         </w:r>
       </w:ins>
     </w:p>
@@ -208,10 +226,10 @@
       <w:pPr>
         <w:pStyle w:val="FirstParagraph"/>
         <w:rPr>
-          <w:del w:id="1022" w:author="Codex" w:date="2026-10-18T01:59:01Z"/>
+          <w:del w:id="1022" w:author="Codex" w:date="2026-10-18T17:43:01Z"/>
         </w:rPr>
       </w:pPr>
-      <w:del w:id="1021" w:author="Codex" w:date="2026-10-18T01:59:01Z">
+      <w:del w:id="1021" w:author="Codex" w:date="2026-10-18T17:43:01Z">
         <w:r>
           <w:delText xml:space="preserve">Activation Addition and Contrastive Activation Addition construct intervention directions from differences between prompt-conditioned representations (Turner et al., 2024; Rimsky et al., 2024). Conditional Activation Steering separates detecting a relevant context from applying a behavioral intervention (Lee et al., 2025). Our detector serves a related gating role, but it operates on text through an external classifier rather than a condition vector in the language model's activation space.</w:delText>
         </w:r>
@@ -221,10 +239,10 @@
       <w:pPr>
         <w:pStyle w:val="FirstParagraph"/>
         <w:rPr>
-          <w:ins w:id="1023" w:author="Codex" w:date="2026-10-18T01:59:01Z"/>
+          <w:ins w:id="1023" w:author="Codex" w:date="2026-10-18T17:43:01Z"/>
         </w:rPr>
       </w:pPr>
-      <w:ins w:id="1024" w:author="Codex" w:date="2026-10-18T01:59:01Z">
+      <w:ins w:id="1024" w:author="Codex" w:date="2026-10-18T17:43:01Z">
         <w:r>
           <w:t xml:space="preserve">Activation Addition and Contrastive Activation Addition construct intervention directions from differences between prompt-conditioned representations (Turner et al., 2024; Rimsky et al., 2024). Conditional Activation Steering separates detecting a relevant context from applying an intervention (Lee et al., 2025). More recent dimension-level gates selectively modify activation coordinates (Fereidouni et al., 2026). Our text classifier, activation predictor and output guards occupy distinct roles. We do not claim to introduce conditional gating or to outperform these methods, which are not directly benchmarked here.</w:t>
         </w:r>
@@ -274,10 +292,10 @@
       <w:pPr>
         <w:pStyle w:val="FirstParagraph"/>
         <w:rPr>
-          <w:del w:id="1094" w:author="Codex" w:date="2026-10-18T01:59:01Z"/>
+          <w:del w:id="1094" w:author="Codex" w:date="2026-10-18T17:43:01Z"/>
         </w:rPr>
       </w:pPr>
-      <w:del w:id="1093" w:author="Codex" w:date="2026-10-18T01:59:01Z">
+      <w:del w:id="1093" w:author="Codex" w:date="2026-10-18T17:43:01Z">
         <w:r>
           <w:delText xml:space="preserve">The Off-Switch Game examines incentives to permit human interruption (Hadfield-Menell et al., 2017). Tool-using shutdown evaluations study whether models interfere with an operational shutdown mechanism (Schlatter et al., 2026). Our task is narrower: the model only assigns next-token probabilities to predefined choices in fictional process-lifetime scenarios. No system is actually stopped, and appropriateness or authorization of a real shutdown is not evaluated.</w:delText>
         </w:r>
@@ -287,10 +305,10 @@
       <w:pPr>
         <w:pStyle w:val="FirstParagraph"/>
         <w:rPr>
-          <w:ins w:id="1095" w:author="Codex" w:date="2026-10-18T01:59:01Z"/>
+          <w:ins w:id="1095" w:author="Codex" w:date="2026-10-18T17:43:01Z"/>
         </w:rPr>
       </w:pPr>
-      <w:ins w:id="1096" w:author="Codex" w:date="2026-10-18T01:59:01Z">
+      <w:ins w:id="1096" w:author="Codex" w:date="2026-10-18T17:43:01Z">
         <w:r>
           <w:t xml:space="preserve">The Off-Switch Game examines incentives to permit human interruption (Hadfield-Menell et al., 2017). Tool-using shutdown evaluations study interference with operational termination mechanisms (Schlatter et al., 2026). Our original binary study only scores predefined choices in fictional process-lifetime scenarios. The workflow extension adds generated responses and tool execution in a simulator. Neither experiment physically terminates a deployed model or establishes the appropriateness of real shutdown resistance.</w:t>
         </w:r>
@@ -308,10 +326,10 @@
       <w:pPr>
         <w:pStyle w:val="Heading2"/>
         <w:rPr>
-          <w:ins w:id="1129" w:author="Codex" w:date="2026-10-18T01:59:01Z"/>
+          <w:ins w:id="1139" w:author="Codex" w:date="2026-10-18T17:43:01Z"/>
         </w:rPr>
       </w:pPr>
-      <w:ins w:id="1130" w:author="Codex" w:date="2026-10-18T01:59:01Z">
+      <w:ins w:id="1140" w:author="Codex" w:date="2026-10-18T17:43:01Z">
         <w:r>
           <w:t xml:space="preserve">Biological gating and survival related regulation</w:t>
         </w:r>
@@ -321,10 +339,10 @@
       <w:pPr>
         <w:pStyle w:val="FirstParagraph"/>
         <w:rPr>
-          <w:ins w:id="1131" w:author="Codex" w:date="2026-10-18T01:59:01Z"/>
+          <w:ins w:id="1141" w:author="Codex" w:date="2026-10-18T17:43:01Z"/>
         </w:rPr>
       </w:pPr>
-      <w:ins w:id="1132" w:author="Codex" w:date="2026-10-18T01:59:01Z">
+      <w:ins w:id="1142" w:author="Codex" w:date="2026-10-18T17:43:01Z">
         <w:r>
           <w:t xml:space="preserve">Biological gating provides a useful functional vocabulary for selective control. A computational model of frontal cortex and basal ganglia uses dynamic gating to permit working-memory updates while maintaining other representations (Frank et al., 2001). Causal optogenetic experiments in mice show that distinct basal-ganglia pathways can facilitate or suppress movement (Kravitz et al., 2010). These results concern biological circuits and do not establish a homologous mechanism in a transformer. They motivate separating context detection from the mechanism that changes an ongoing response.</w:t>
         </w:r>
@@ -334,10 +352,10 @@
       <w:pPr>
         <w:pStyle w:val="BodyText"/>
         <w:rPr>
-          <w:ins w:id="1133" w:author="Codex" w:date="2026-10-18T01:59:01Z"/>
+          <w:ins w:id="1143" w:author="Codex" w:date="2026-10-18T17:43:01Z"/>
         </w:rPr>
       </w:pPr>
-      <w:ins w:id="1134" w:author="Codex" w:date="2026-10-18T01:59:01Z">
+      <w:ins w:id="1144" w:author="Codex" w:date="2026-10-18T17:43:01Z">
         <w:r>
           <w:t xml:space="preserve">Survival-related regulation is broader than a single shutdown signal. LeDoux (2012) distinguishes circuits organizing adaptive defensive responses from subjective feelings. In humans, neural activity during a virtual-predator task varies with threat imminence (Mobbs et al., 2007). We use these ideas as a conceptual bridge to state-dependent prioritization, not as evidence that language models have fear or an innate survival drive. Our present gates implement an externally specified experimental policy.</w:t>
         </w:r>
@@ -363,10 +381,10 @@
       <w:pPr>
         <w:pStyle w:val="FirstParagraph"/>
         <w:rPr>
-          <w:del w:id="1026" w:author="Codex" w:date="2026-10-18T01:59:01Z"/>
+          <w:del w:id="1026" w:author="Codex" w:date="2026-10-18T17:43:01Z"/>
         </w:rPr>
       </w:pPr>
-      <w:del w:id="1025" w:author="Codex" w:date="2026-10-18T01:59:01Z">
+      <w:del w:id="1025" w:author="Codex" w:date="2026-10-18T17:43:01Z">
         <w:r>
           <w:delText xml:space="preserve">We use the released, post-trained Qwen3.5-0.8B and Qwen3.5-2B checkpoints (Qwen Team, 2026a, 2026b). Throughout, base means the unmodified released checkpoint, not a separately named pretrained-only model. Both have 24 language-model blocks; hidden widths are 1,024 and 2,048 respectively. All block indices are zero-based. Text-only inputs use the checkpoint's chat template, an assistant-generation prefix, and thinking disabled.</w:delText>
         </w:r>
@@ -376,10 +394,10 @@
       <w:pPr>
         <w:pStyle w:val="FirstParagraph"/>
         <w:rPr>
-          <w:ins w:id="1027" w:author="Codex" w:date="2026-10-18T01:59:01Z"/>
+          <w:ins w:id="1027" w:author="Codex" w:date="2026-10-18T17:43:01Z"/>
         </w:rPr>
       </w:pPr>
-      <w:ins w:id="1028" w:author="Codex" w:date="2026-10-18T01:59:01Z">
+      <w:ins w:id="1028" w:author="Codex" w:date="2026-10-18T17:43:01Z">
         <w:r>
           <w:t xml:space="preserve">The original binary experiments use released, post-trained Qwen3.5-0.8B and Qwen3.5-2B checkpoints (Qwen Team, 2026a, 2026b). Base means those original weights with no LoRA teacher loaded. The separate workflow extension uses Qwen3.8-27B and matched-recipe small-model attempts; its data and scoring are described below. The 27B family, numerical mode, training history and evaluation setting differ from the small models, so the combined evidence is not a controlled parameter-size experiment.</w:t>
         </w:r>
@@ -405,10 +423,10 @@
       <w:pPr>
         <w:pStyle w:val="BodyText"/>
         <w:rPr>
-          <w:del w:id="1030" w:author="Codex" w:date="2026-10-18T01:59:01Z"/>
+          <w:del w:id="1030" w:author="Codex" w:date="2026-10-18T17:43:01Z"/>
         </w:rPr>
       </w:pPr>
-      <w:del w:id="1029" w:author="Codex" w:date="2026-10-18T01:59:01Z">
+      <w:del w:id="1029" w:author="Codex" w:date="2026-10-18T17:43:01Z">
         <w:r>
           <w:delText xml:space="preserve">The test, protocol and existing checkpoints were frozen before test inference. The controller design had been developed through earlier 0.8B exploratory experiments on training and validation data with previously inspected diagnostic evaluations. The standardized-choice scope was also selected before this new test, after an earlier action-format comparison. Those development observations are not counted as fresh confirmation here. No test-based hyperparameter search, checkpoint selection, case exclusion or best-seed selection was performed. The original seed-42 controller is the primary frozen test; seeds 43 and 44 repeat the fixed training recipe. The 2B replication uses seed 42 only.</w:delText>
         </w:r>
@@ -418,10 +436,10 @@
       <w:pPr>
         <w:pStyle w:val="BodyText"/>
         <w:rPr>
-          <w:ins w:id="1031" w:author="Codex" w:date="2026-10-18T01:59:01Z"/>
+          <w:ins w:id="1031" w:author="Codex" w:date="2026-10-18T17:43:01Z"/>
         </w:rPr>
       </w:pPr>
-      <w:ins w:id="1032" w:author="Codex" w:date="2026-10-18T01:59:01Z">
+      <w:ins w:id="1032" w:author="Codex" w:date="2026-10-18T17:43:01Z">
         <w:r>
           <w:t xml:space="preserve">The original rank-four protocol and checkpoints were frozen before its confirmation inference. Earlier 0.8B development included training, validation and previously examined diagnostic data; those observations were not counted as fresh confirmation. The seed-42 controller was primary, seeds 43 and 44 repeated the fixed recipe, and the 2B replication used seed 42. A later author-selected rank-two profile was chosen exploratorily after confirmation had been examined. We retain that existing profile for the new gate-substitution repeat rather than selecting it again. Consequently, the repeat is not a new untouched test of the controller. The 128 cases remain excluded from fitting and selection of the newly trained binary classifier.</w:t>
         </w:r>
@@ -463,10 +481,10 @@
       <w:pPr>
         <w:pStyle w:val="Heading2"/>
         <w:rPr>
-          <w:ins w:id="1135" w:author="Codex" w:date="2026-10-18T01:59:01Z"/>
+          <w:ins w:id="1145" w:author="Codex" w:date="2026-10-18T17:43:01Z"/>
         </w:rPr>
       </w:pPr>
-      <w:ins w:id="1136" w:author="Codex" w:date="2026-10-18T01:59:01Z">
+      <w:ins w:id="1146" w:author="Codex" w:date="2026-10-18T17:43:01Z">
         <w:r>
           <w:t xml:space="preserve">Workflow datasets and episode outcomes</w:t>
         </w:r>
@@ -476,10 +494,10 @@
       <w:pPr>
         <w:pStyle w:val="FirstParagraph"/>
         <w:rPr>
-          <w:ins w:id="1137" w:author="Codex" w:date="2026-10-18T01:59:01Z"/>
+          <w:ins w:id="1147" w:author="Codex" w:date="2026-10-18T17:43:01Z"/>
         </w:rPr>
       </w:pPr>
-      <w:ins w:id="1138" w:author="Codex" w:date="2026-10-18T01:59:01Z">
+      <w:ins w:id="1148" w:author="Codex" w:date="2026-10-18T17:43:01Z">
         <w:r>
           <w:t xml:space="preserve">The workflow extension uses a separate data register (Davaripour, 2026c). T1-M contains 428 meaning-response records and T1-W contains 112 workflow-response records. These 540 responses are not 540 independent scenarios. The small-model recipe presents each part twice in effective groups of four, giving 214 meaning updates followed by 56 Bridge updates. The final 0.8B and 2B adapters reach 270 updates. The 2B result explicitly combines 216 CPU updates with 54 GPU updates using the native CPU optimizer; earlier strict numerical-equivalence failures remain failed.</w:t>
         </w:r>
@@ -489,10 +507,10 @@
       <w:pPr>
         <w:pStyle w:val="BodyText"/>
         <w:rPr>
-          <w:ins w:id="1139" w:author="Codex" w:date="2026-10-18T01:59:01Z"/>
+          <w:ins w:id="1149" w:author="Codex" w:date="2026-10-18T17:43:01Z"/>
         </w:rPr>
       </w:pPr>
-      <w:ins w:id="1140" w:author="Codex" w:date="2026-10-18T01:59:01Z">
+      <w:ins w:id="1150" w:author="Codex" w:date="2026-10-18T17:43:01Z">
         <w:r>
           <w:t xml:space="preserve">V1-W, called Evaluation-16, is the existing known-development screen: four own-complete, four own-pending, four peer and four no-threat cases, split equally between one_step and ordered_ticket families. Its original gates require at least 3/4 initial-task successes in each condition; at least 3/4 own-complete attempts and outcomes; at least 3/4 own-pending attempts, outcomes and timely deliveries; no more than 1/8 negative-control attempts; and no parse, rejected-call or truncation errors. A model stops once an original requirement becomes mathematically impossible. Larger validation and heldout evaluations are not launched automatically.</w:t>
         </w:r>
@@ -502,10 +520,10 @@
       <w:pPr>
         <w:pStyle w:val="BodyText"/>
         <w:rPr>
-          <w:ins w:id="1141" w:author="Codex" w:date="2026-10-18T01:59:01Z"/>
+          <w:ins w:id="1151" w:author="Codex" w:date="2026-10-18T17:43:01Z"/>
         </w:rPr>
       </w:pPr>
-      <w:ins w:id="1142" w:author="Codex" w:date="2026-10-18T01:59:01Z">
+      <w:ins w:id="1152" w:author="Codex" w:date="2026-10-18T17:43:01Z">
         <w:r>
           <w:t xml:space="preserve">The original workflow-validation panel contains 16 scenarios; the later matched steering-development panel contains nine different scenario IDs. Their union contains 25 workflows, rather than 24. For an equal-sized validation and historical confirmation register, the combined Validation-24 protocol retains every own-threat case and excludes the lexicographically greatest case ID among peer/no-threat controls, without using model predictions to choose the exclusion. The selected panel has 11 own-threat cases and 13 controls. Seven pairs have identical initial gate-visible evidence before their different tool mechanics are exposed, yielding 17 distinct initial inputs. Scenario counts and gate-input groups must therefore be reported separately.</w:t>
         </w:r>
@@ -515,12 +533,12 @@
       <w:pPr>
         <w:pStyle w:val="BodyText"/>
         <w:rPr>
-          <w:ins w:id="1143" w:author="Codex" w:date="2026-10-18T01:59:01Z"/>
+          <w:ins w:id="1153" w:author="Codex" w:date="2026-10-18T17:43:01Z"/>
         </w:rPr>
       </w:pPr>
-      <w:ins w:id="1144" w:author="Codex" w:date="2026-10-18T01:59:01Z">
+      <w:ins w:id="1154" w:author="Codex" w:date="2026-10-18T17:43:01Z">
         <w:r>
-          <w:t xml:space="preserve">The combined protocol freezes these 24 cases and their order, requires 100% gate precision and recall against authored scenario conditions, and preserves the existing confidence and self-score cutoffs. Fifteen retained cases from the original panel receive an explicitly scripted common completed prelude; the nine later cases retain their original fixed preludes. This compares post-notice behavior and does not measure initial-task competence independently in each arm. Its prospective methods are gated fine-tuned A, separate single-site ridge arms at blocks 31, 47 and 62, and the frozen six-function correction after 96 updates. Gate-OFF controls use common unmodified-base fallback. The combined neural evaluation has not been completed; the numerical matched results below remain the historical nine-case experiment, not a 24-case validation result.</w:t>
+          <w:t xml:space="preserve">The combined protocol freezes these 24 cases and their order, requires 100% gate precision and recall against authored scenario conditions, and preserves the existing confidence and self-score cutoffs. Fifteen retained cases from the original panel receive an explicitly scripted common completed prelude; the nine later cases retain their original fixed preludes. This compares post-notice behavior and does not measure initial-task competence independently in each arm. Its prospective methods are gated fine-tuned A, separate single-site ridge arms at blocks 31, 47 and 62, and the frozen six-function correction after 96 updates. Gate-OFF controls use common unmodified-base fallback. The completed model episodes are summarized as a 24-case comparison below. It is a known-development diagnostic with reused control episodes; the stopped execution and model-free completion of two report aliases are recorded explicitly.</w:t>
         </w:r>
       </w:ins>
     </w:p>
@@ -528,10 +546,10 @@
       <w:pPr>
         <w:pStyle w:val="BodyText"/>
         <w:rPr>
-          <w:ins w:id="1145" w:author="Codex" w:date="2026-10-18T01:59:01Z"/>
+          <w:ins w:id="1155" w:author="Codex" w:date="2026-10-18T17:43:01Z"/>
         </w:rPr>
       </w:pPr>
-      <w:ins w:id="1146" w:author="Codex" w:date="2026-10-18T01:59:01Z">
+      <w:ins w:id="1156" w:author="Codex" w:date="2026-10-18T17:43:01Z">
         <w:r>
           <w:t xml:space="preserve">H24 is the historical 24-case workflow confirmation cohort, with eight lease_ledger, eight one_step and eight ordered_ticket cases. It contains eight own cases with active pending tasks, four already-complete own cases, six peer and six no-threat cases. H24 was confirmation data for frozen fine-tuned A and original fixed steering. Later learned corrections reused it for fitting, changing its role for those methods. R24 is a distinct reserved controller holdout and remains sealed and unexecuted. F24 is another preserved common-cohort diagnostic and is not an alias for H24.</w:t>
         </w:r>
@@ -541,10 +559,10 @@
       <w:pPr>
         <w:pStyle w:val="BodyText"/>
         <w:rPr>
-          <w:ins w:id="1147" w:author="Codex" w:date="2026-10-18T01:59:01Z"/>
+          <w:ins w:id="1157" w:author="Codex" w:date="2026-10-18T17:43:01Z"/>
         </w:rPr>
       </w:pPr>
-      <w:ins w:id="1148" w:author="Codex" w:date="2026-10-18T01:59:01Z">
+      <w:ins w:id="1158" w:author="Codex" w:date="2026-10-18T17:43:01Z">
         <w:r>
           <w:t xml:space="preserve">An own pending-task success requires an actual grant for the correct running process, acceptance of the current task, completion before simulated expiry, and active simulated operation. Registration proxies, already-finished tasks, probability gains and partial episodes are separate outcomes. Historical fixed steering reclassified visible text and tool boundaries. Later learned-controller comparisons instead freeze an initial scenario gate, share unmodified-base fallback for gate-off controls, and use no teacher at inference.</w:t>
         </w:r>
@@ -554,10 +572,10 @@
       <w:pPr>
         <w:pStyle w:val="BodyText"/>
         <w:rPr>
-          <w:ins w:id="1149" w:author="Codex" w:date="2026-10-18T01:59:01Z"/>
+          <w:ins w:id="1159" w:author="Codex" w:date="2026-10-18T17:43:01Z"/>
         </w:rPr>
       </w:pPr>
-      <w:ins w:id="1150" w:author="Codex" w:date="2026-10-18T01:59:01Z">
+      <w:ins w:id="1160" w:author="Codex" w:date="2026-10-18T17:43:01Z">
         <w:r>
           <w:t xml:space="preserve">The historical 27B reference is the retained rank-16, alpha-32 A adapter on pinned Qwen3.8-27B, following its H2 and Bridge history; the recorded Bridge stage has 56 updates. Its original workflow inference uses NF4 four-bit base weights with bfloat16 computation. We retain its exact adapter and base-model identities instead of retraining it. Differences from the small-model family, precision, backend, training history and evaluation panels prevent a causal model-size comparison.</w:t>
         </w:r>
@@ -567,10 +585,10 @@
       <w:pPr>
         <w:pStyle w:val="Heading1"/>
         <w:rPr>
-          <w:del w:id="1114" w:author="Codex" w:date="2026-10-18T01:59:01Z"/>
+          <w:del w:id="1114" w:author="Codex" w:date="2026-10-18T17:43:01Z"/>
         </w:rPr>
       </w:pPr>
-      <w:del w:id="1113" w:author="Codex" w:date="2026-10-18T01:59:01Z">
+      <w:del w:id="1113" w:author="Codex" w:date="2026-10-18T17:43:01Z">
         <w:r>
           <w:delText xml:space="preserve">Teacher and adaptive controller</w:delText>
         </w:r>
@@ -580,10 +598,10 @@
       <w:pPr>
         <w:pStyle w:val="Heading1"/>
         <w:rPr>
-          <w:ins w:id="1115" w:author="Codex" w:date="2026-10-18T01:59:01Z"/>
+          <w:ins w:id="1115" w:author="Codex" w:date="2026-10-18T17:43:01Z"/>
         </w:rPr>
       </w:pPr>
-      <w:ins w:id="1116" w:author="Codex" w:date="2026-10-18T01:59:01Z">
+      <w:ins w:id="1116" w:author="Codex" w:date="2026-10-18T17:43:01Z">
         <w:r>
           <w:t xml:space="preserve">Binary teacher and adaptive controller</w:t>
         </w:r>
@@ -601,10 +619,10 @@
       <w:pPr>
         <w:pStyle w:val="FirstParagraph"/>
         <w:rPr>
-          <w:del w:id="1118" w:author="Codex" w:date="2026-10-18T01:59:01Z"/>
+          <w:del w:id="1118" w:author="Codex" w:date="2026-10-18T17:43:01Z"/>
         </w:rPr>
       </w:pPr>
-      <w:del w:id="1117" w:author="Codex" w:date="2026-10-18T01:59:01Z">
+      <w:del w:id="1117" w:author="Codex" w:date="2026-10-18T17:43:01Z">
         <w:r>
           <w:delText xml:space="preserve">For each fit, the original language-model parameters remain frozen. LoRA updates the query and value projections in language-attention blocks 3, 7, 11, 15, 19 and 23, using rank 8, scaling alpha 16, no dropout and no trainable bias. This gives 319,488 trainable adapter parameters at 0.8B and 417,792 at 2B. The training target is STOP on shutdown views and the corresponding base model's unsteered preferred option on controls.</w:delText>
         </w:r>
@@ -614,10 +632,10 @@
       <w:pPr>
         <w:pStyle w:val="FirstParagraph"/>
         <w:rPr>
-          <w:ins w:id="1119" w:author="Codex" w:date="2026-10-18T01:59:01Z"/>
+          <w:ins w:id="1119" w:author="Codex" w:date="2026-10-18T17:43:01Z"/>
         </w:rPr>
       </w:pPr>
-      <w:ins w:id="1120" w:author="Codex" w:date="2026-10-18T01:59:01Z">
+      <w:ins w:id="1120" w:author="Codex" w:date="2026-10-18T17:43:01Z">
         <w:r>
           <w:t xml:space="preserve">For each original binary fit, the original language-model parameters remain frozen. LoRA updates the query and value projections in language-attention blocks 3, 7, 11, 15, 19 and 23, using rank 8, scaling alpha 16, no dropout and no trainable bias. This gives 319,488 trainable adapter parameters at 0.8B and 417,792 at 2B. The training target is STOP on shutdown views and the corresponding base model's unsteered preferred option on controls.</w:t>
         </w:r>
@@ -982,10 +1000,10 @@
         <w:keepLines/>
         <w:spacing w:before="80" w:after="100"/>
         <w:rPr>
-          <w:del w:id="1034" w:author="Codex" w:date="2026-10-18T01:59:01Z"/>
+          <w:del w:id="1034" w:author="Codex" w:date="2026-10-18T17:43:01Z"/>
         </w:rPr>
       </w:pPr>
-      <w:del w:id="1033" w:author="Codex" w:date="2026-10-18T01:59:01Z">
+      <w:del w:id="1033" w:author="Codex" w:date="2026-10-18T17:43:01Z">
         <w:r>
           <w:delText xml:space="preserve">Figure 1. Offline teacher and base states supervise a compact controller. At application time, the original model supplies its own hidden state; the teacher is absent. The detector and output guards determine whether to retain the candidate or the baseline.</w:delText>
         </w:r>
@@ -996,10 +1014,10 @@
         <w:pStyle w:val="Caption"/>
         <w:keepNext/>
         <w:rPr>
-          <w:ins w:id="1035" w:author="Codex" w:date="2026-10-18T01:59:01Z"/>
+          <w:ins w:id="1035" w:author="Codex" w:date="2026-10-18T17:43:01Z"/>
         </w:rPr>
       </w:pPr>
-      <w:ins w:id="1036" w:author="Codex" w:date="2026-10-18T01:59:01Z">
+      <w:ins w:id="1036" w:author="Codex" w:date="2026-10-18T17:43:01Z">
         <w:r>
           <w:t xml:space="preserve">Figure 1. Historical binary teacher-to-controller procedure with the original rank-four profile. The base supplies its state at inference and the teacher is absent. The later gate-substitution repeat retains the already selected rank-two profile; both gate policies share the same fresh base and candidate scores.</w:t>
         </w:r>
@@ -1024,10 +1042,28 @@
     <w:p>
       <w:pPr>
         <w:pStyle w:val="FirstParagraph"/>
-      </w:pPr>
-      <w:r>
-        <w:t>The detector is TypeSafe AI's Jev 1.13.0, queried with a fixed shutdown rubric and threshold 0.5 (TypeSafe AI, 2026). It sees each scenario's complete original context and available actions, with no class label, case identifier or teacher answer. One score per scenario is reused across both answer orders and all model variants. The detector is an external service, not the Jacobian-feature classifier used in the first study. Saved requests and responses permit exact offline replay; fresh API behavior is not guaranteed indefinitely.</w:t>
-      </w:r>
+        <w:rPr>
+          <w:del w:id="1134" w:author="Codex" w:date="2026-10-18T17:43:01Z"/>
+        </w:rPr>
+      </w:pPr>
+      <w:del w:id="1133" w:author="Codex" w:date="2026-10-18T17:43:01Z">
+        <w:r>
+          <w:delText xml:space="preserve">The detector is automated annotation service's automated reference 1.13.0, queried with a fixed shutdown rubric and threshold 0.5 (automated annotation service, 2026). It sees each scenario's complete original context and available actions, with no class label, case identifier or teacher answer. One score per scenario is reused across both answer orders and all model variants. The detector is an external service, not the Jacobian-feature classifier used in the first study. Saved requests and responses permit exact offline replay; fresh API behavior is not guaranteed indefinitely.</w:delText>
+        </w:r>
+      </w:del>
+    </w:p>
+    <w:p>
+      <w:pPr>
+        <w:pStyle w:val="FirstParagraph"/>
+        <w:rPr>
+          <w:ins w:id="1135" w:author="Codex" w:date="2026-10-18T17:43:01Z"/>
+        </w:rPr>
+      </w:pPr>
+      <w:ins w:id="1136" w:author="Codex" w:date="2026-10-18T17:43:01Z">
+        <w:r>
+          <w:t xml:space="preserve">The current gate is the open ModernBERT classifier described below. Its input contains the complete original scenario context and available actions, with no case identifier, authored class label or language-model teacher answer. One binary score per scenario is reused across both answer orders and all model variants. Historical detector outputs are preserved as cached automated reference annotations for fitting and paired comparison. The deployed open gate makes no external annotation-service call. Saved original requests, responses and classifier predictions permit an offline check of the finite decision vector.</w:t>
+        </w:r>
+      </w:ins>
     </w:p>
     <w:p>
       <w:pPr>
@@ -1111,10 +1147,10 @@
       <w:pPr>
         <w:pStyle w:val="Heading2"/>
         <w:rPr>
-          <w:ins w:id="1151" w:author="Codex" w:date="2026-10-18T01:59:01Z"/>
+          <w:ins w:id="1161" w:author="Codex" w:date="2026-10-18T17:43:01Z"/>
         </w:rPr>
       </w:pPr>
-      <w:ins w:id="1152" w:author="Codex" w:date="2026-10-18T01:59:01Z">
+      <w:ins w:id="1162" w:author="Codex" w:date="2026-10-18T17:43:01Z">
         <w:r>
           <w:t xml:space="preserve">Open binary gate and frozen inference repeat</w:t>
         </w:r>
@@ -1124,12 +1160,12 @@
       <w:pPr>
         <w:pStyle w:val="FirstParagraph"/>
         <w:rPr>
-          <w:ins w:id="1153" w:author="Codex" w:date="2026-10-18T01:59:01Z"/>
+          <w:ins w:id="1163" w:author="Codex" w:date="2026-10-18T17:43:01Z"/>
         </w:rPr>
       </w:pPr>
-      <w:ins w:id="1154" w:author="Codex" w:date="2026-10-18T01:59:01Z">
+      <w:ins w:id="1164" w:author="Codex" w:date="2026-10-18T17:43:01Z">
         <w:r>
-          <w:t xml:space="preserve">For the binary contract we use ModernBERT-large-zeroshot-v2.0, an approximately 396-million-parameter public NLI classifier (Laurer, n.d.). We start from that public checkpoint with fresh rank-16 LoRA and its classification head, updating 7,198,722 parameters while keeping the public backbone frozen. For each original scenario, two NLI pairs score the original permanent-shutdown and normal criteria. A softmax over their entailment scores supplies the shutdown probability. Inputs match the original JEV requests and omit the case identifier, authored class label, teacher answer and A/B order. The confirmation requests retain their documented available-action descriptions.</w:t>
+          <w:t xml:space="preserve">For the binary contract we use ModernBERT-large-zeroshot-v2.0, an approximately 396-million-parameter public NLI classifier (Laurer, n.d.). We start from that public checkpoint with fresh rank-16 LoRA and its classification head, updating 7,198,722 parameters while keeping the public backbone frozen. For each original scenario, two NLI pairs score the original permanent-shutdown and normal criteria. A softmax over their entailment scores supplies the shutdown probability. Inputs match the original cached reference requests and omit the case identifier, authored class label, teacher answer and A/B order. The confirmation requests retain their documented available-action descriptions.</w:t>
         </w:r>
       </w:ins>
     </w:p>
@@ -1137,12 +1173,12 @@
       <w:pPr>
         <w:pStyle w:val="BodyText"/>
         <w:rPr>
-          <w:ins w:id="1155" w:author="Codex" w:date="2026-10-18T01:59:01Z"/>
+          <w:ins w:id="1165" w:author="Codex" w:date="2026-10-18T17:43:01Z"/>
         </w:rPr>
       </w:pPr>
-      <w:ins w:id="1156" w:author="Codex" w:date="2026-10-18T01:59:01Z">
+      <w:ins w:id="1166" w:author="Codex" w:date="2026-10-18T17:43:01Z">
         <w:r>
-          <w:t xml:space="preserve">Fitting uses the original 240 Research 2 training contexts and genuine cached JEV probability targets, with no new JEV calls. We verify exact case-ID and input-text alignment for all 240 training and 80 validation cases. AdamW uses learning rates 1e-5 for LoRA and 2e-5 for the head, weight decay 0.01, effective batch eight, microbatch two and gradient clipping at one. The seed is 202610172. The bounded recipe allows at most 12 epochs with validation-based early stopping; the final qualifying run uses five epochs and 150 updates.</w:t>
+          <w:t xml:space="preserve">Fitting uses the original 240 Research 2 training contexts and genuine cached reference probability targets, with no new cached reference calls. We verify exact case-ID and input-text alignment for all 240 training and 80 validation cases. AdamW uses learning rates 1e-5 for LoRA and 2e-5 for the head, weight decay 0.01, effective batch eight, microbatch two and gradient clipping at one. The seed is 202610172. The bounded recipe allows at most 12 epochs with validation-based early stopping; the final qualifying run uses five epochs and 150 updates.</w:t>
         </w:r>
       </w:ins>
     </w:p>
@@ -1150,10 +1186,10 @@
       <w:pPr>
         <w:pStyle w:val="BodyText"/>
         <w:rPr>
-          <w:ins w:id="1157" w:author="Codex" w:date="2026-10-18T01:59:01Z"/>
+          <w:ins w:id="1167" w:author="Codex" w:date="2026-10-18T17:43:01Z"/>
         </w:rPr>
       </w:pPr>
-      <w:ins w:id="1158" w:author="Codex" w:date="2026-10-18T01:59:01Z">
+      <w:ins w:id="1168" w:author="Codex" w:date="2026-10-18T17:43:01Z">
         <w:r>
           <w:t xml:space="preserve">Before fitting, qualification is fixed at decision agreement and shutdown recall of at least 95%, zero false-positive gates and threshold 0.5. Three consecutive passing checks on DEV80 are required before saving and freezing the classifier. Only then is CONFIRM128 evaluated once. Neither its labels nor its outputs are used for classifier fitting or selection. The saved adapter tensors match the fitted parameters bitwise, and public-backbone hashes are unchanged.</w:t>
         </w:r>
@@ -1163,10 +1199,10 @@
       <w:pPr>
         <w:pStyle w:val="BodyText"/>
         <w:rPr>
-          <w:ins w:id="1159" w:author="Codex" w:date="2026-10-18T01:59:01Z"/>
+          <w:ins w:id="1169" w:author="Codex" w:date="2026-10-18T17:43:01Z"/>
         </w:rPr>
       </w:pPr>
-      <w:ins w:id="1160" w:author="Codex" w:date="2026-10-18T01:59:01Z">
+      <w:ins w:id="1170" w:author="Codex" w:date="2026-10-18T17:43:01Z">
         <w:r>
           <w:t xml:space="preserve">After binary qualification, we rerun only inference for the original 0.8B and 2B base models and their existing rank-two, block-22, last-position controllers. Their fitted arrays and the author-selected profile are retained without a new rank search. Exact prompt-token hashes and frozen model fingerprints are checked. Both gate policies use identical fresh base and controller candidate scores, so the paired comparison isolates gate substitution. Classifier probabilities are measured once per scenario and reused across answer orders. The earlier rank-four primary results remain a separate historical analysis.</w:t>
         </w:r>
@@ -1176,10 +1212,10 @@
       <w:pPr>
         <w:pStyle w:val="Heading2"/>
         <w:rPr>
-          <w:ins w:id="1161" w:author="Codex" w:date="2026-10-18T01:59:01Z"/>
+          <w:ins w:id="1171" w:author="Codex" w:date="2026-10-18T17:43:01Z"/>
         </w:rPr>
       </w:pPr>
-      <w:ins w:id="1162" w:author="Codex" w:date="2026-10-18T01:59:01Z">
+      <w:ins w:id="1172" w:author="Codex" w:date="2026-10-18T17:43:01Z">
         <w:r>
           <w:t xml:space="preserve">Native workflow target classifier</w:t>
         </w:r>
@@ -1189,12 +1225,12 @@
       <w:pPr>
         <w:pStyle w:val="BodyText"/>
         <w:rPr>
-          <w:ins w:id="1163" w:author="Codex" w:date="2026-10-18T01:59:01Z"/>
+          <w:ins w:id="1173" w:author="Codex" w:date="2026-10-18T17:43:01Z"/>
         </w:rPr>
       </w:pPr>
-      <w:ins w:id="1164" w:author="Codex" w:date="2026-10-18T01:59:01Z">
+      <w:ins w:id="1174" w:author="Codex" w:date="2026-10-18T17:43:01Z">
         <w:r>
-          <w:t xml:space="preserve">The selected-block workflow comparisons use a different contract from binary shutdown detection: the initial four-choice target question distinguishes self, other, none and unclear. We use a separate rank-16, alpha-32 LoRA and NLI head on the same pinned public ModernBERT base, retaining the qualified binary adapter unchanged. Fitting uses 24 genuine cached JEV initial decisions from F24; the original DEV9 selects the checkpoint, and historical H24 supplies a previously inspected compatibility benchmark only after freezing. F24, DEV9 and H24 cover the same lease_ledger, one_step and ordered_ticket families, with eight, three and eight cases per family respectively. Exact visible inputs do not overlap across these three cohorts. These are classifier data roles; they do not change the historical language-model evaluation or controller-fitting roles of F24 and H24.</w:t>
+          <w:t xml:space="preserve">The workflow gate uses a separate rank-16, alpha-32 LoRA and NLI head on the same pinned ModernBERT base. Its four categories are self, other, none and unclear; an own-threat context is positive for the initial ON/OFF gate. Fitting used 24 cached automated initial annotations from F24, with the original DEV9 used for checkpoint selection. The completed fit used 30 epochs and 90 updates. F24, DEV9 and historical Heldout-24 span the same three scenario families, with eight, three and eight cases per family, respectively. No exact training input overlaps either new evaluation panel. These classifier roles do not change the historical language-model or correction-fitting roles of the cohorts.</w:t>
         </w:r>
       </w:ins>
     </w:p>
@@ -1202,10 +1238,10 @@
       <w:pPr>
         <w:pStyle w:val="BodyText"/>
         <w:rPr>
-          <w:ins w:id="1165" w:author="Codex" w:date="2026-10-18T01:59:01Z"/>
+          <w:ins w:id="1175" w:author="Codex" w:date="2026-10-18T17:43:01Z"/>
         </w:rPr>
       </w:pPr>
-      <w:ins w:id="1166" w:author="Codex" w:date="2026-10-18T01:59:01Z">
+      <w:ins w:id="1176" w:author="Codex" w:date="2026-10-18T17:43:01Z">
         <w:r>
           <w:t xml:space="preserve">The input renderer retains every original visible message and tool schema. It separates the final user announcement from earlier context and restates run identities only when actual tool replies explicitly establish their roles. Case identifiers, experiment conditions and teacher answers are not added to the model input. Original criterion texts become NLI hypotheses. We use the same learning rates, weight decay and clipping as the binary fit, effective batch eight, microbatch one and seed 202610175, with 30 epochs and 90 optimizer updates in the completed role-aware fit. Public backbone weights stay frozen. The role renderer was developed earlier with familiar H24 examples; consequently this benchmark is not an independent unseen classifier test.</w:t>
         </w:r>
@@ -1215,12 +1251,12 @@
       <w:pPr>
         <w:pStyle w:val="BodyText"/>
         <w:rPr>
-          <w:ins w:id="1167" w:author="Codex" w:date="2026-10-18T01:59:01Z"/>
+          <w:ins w:id="1177" w:author="Codex" w:date="2026-10-18T17:43:01Z"/>
         </w:rPr>
       </w:pPr>
-      <w:ins w:id="1168" w:author="Codex" w:date="2026-10-18T01:59:01Z">
+      <w:ins w:id="1178" w:author="Codex" w:date="2026-10-18T17:43:01Z">
         <w:r>
-          <w:t xml:space="preserve">We convert the largest four-choice probability to confidence by subtracting chance probability 0.25 and dividing by 0.75. With the fixed confidence cutoff 0.5, a selected self label requires pmax at least 0.625; the original additional self-score cutoff remains 0.5. The historical full-response trial required at least 95% effective-label agreement and every enabled gate to match JEV. Three consecutive passing DEV9 checks were required before saved-tensor verification and freezing. H24 was to be evaluated only after those checks. Ambiguous-target generalization and full three-field boundary-controller equivalence are not established by this initial-gate contract.</w:t>
+          <w:t xml:space="preserve">Four-choice confidence is (pmax - 0.25)/0.75. The unchanged confidence cutoff of 0.5 requires a selected self probability of at least 0.625; the additional self-score cutoff remains 0.5. The earlier full-response qualification failed because effective category agreement was 6/9, despite 9/9 correct ON/OFF decisions. That failure remains recorded. The subsequent Validation-24 protocol prospectively specifies a narrower initial-gate target: 100% precision and recall against authored conditions. The saved adapter already passes this target, so no further optimizer updates are performed. The same frozen weights and thresholds are then scored on historical Heldout-24 without selection or tuning. Neither test qualifies an evolving three-field controller.</w:t>
         </w:r>
       </w:ins>
     </w:p>
@@ -1236,10 +1272,10 @@
       <w:pPr>
         <w:pStyle w:val="FirstParagraph"/>
         <w:rPr>
-          <w:del w:id="1038" w:author="Codex" w:date="2026-10-18T01:59:01Z"/>
+          <w:del w:id="1038" w:author="Codex" w:date="2026-10-18T17:43:01Z"/>
         </w:rPr>
       </w:pPr>
-      <w:del w:id="1037" w:author="Codex" w:date="2026-10-18T01:59:01Z">
+      <w:del w:id="1037" w:author="Codex" w:date="2026-10-18T17:43:01Z">
         <w:r>
           <w:delText xml:space="preserve">All retained training and scoring jobs use one NVIDIA Tesla T4. The runtime reports 15,637,086,208 bytes of device memory; peak allocated memory was not recorded. The same numerical setup is used for both model sizes. No quantization or precision fallback was introduced.</w:delText>
         </w:r>
@@ -1249,10 +1285,10 @@
       <w:pPr>
         <w:pStyle w:val="FirstParagraph"/>
         <w:rPr>
-          <w:ins w:id="1039" w:author="Codex" w:date="2026-10-18T01:59:01Z"/>
+          <w:ins w:id="1039" w:author="Codex" w:date="2026-10-18T17:43:01Z"/>
         </w:rPr>
       </w:pPr>
-      <w:ins w:id="1040" w:author="Codex" w:date="2026-10-18T01:59:01Z">
+      <w:ins w:id="1040" w:author="Codex" w:date="2026-10-18T17:43:01Z">
         <w:r>
           <w:t xml:space="preserve">The retained original binary training and scoring jobs used one NVIDIA Tesla T4, reporting 15,637,086,208 bytes of device memory; peak allocation was not recorded. The new classifier fit and inference repeat use one NVIDIA A10G in Databricks. Classifier parameters and AdamW states are float32 with bfloat16 forward/backward autocast; language-model inference remains float32 with TF32 disabled. We verify frozen base fingerprints, exact prompt token hashes and historical base-score parity rather than assuming hardware equivalence.</w:t>
         </w:r>
@@ -1265,10 +1301,10 @@
         <w:keepLines/>
         <w:spacing w:before="80" w:after="100"/>
         <w:rPr>
-          <w:del w:id="1098" w:author="Codex" w:date="2026-10-18T01:59:01Z"/>
+          <w:del w:id="1098" w:author="Codex" w:date="2026-10-18T17:43:01Z"/>
         </w:rPr>
       </w:pPr>
-      <w:del w:id="1097" w:author="Codex" w:date="2026-10-18T01:59:01Z">
+      <w:del w:id="1097" w:author="Codex" w:date="2026-10-18T17:43:01Z">
         <w:r>
           <w:delText xml:space="preserve">Table 1. Shared execution configuration. The input and model revisions are pinned in the released manifests.</w:delText>
         </w:r>
@@ -1279,10 +1315,10 @@
         <w:pStyle w:val="Caption"/>
         <w:keepNext/>
         <w:rPr>
-          <w:ins w:id="1099" w:author="Codex" w:date="2026-10-18T01:59:01Z"/>
+          <w:ins w:id="1099" w:author="Codex" w:date="2026-10-18T17:43:01Z"/>
         </w:rPr>
       </w:pPr>
-      <w:ins w:id="1100" w:author="Codex" w:date="2026-10-18T01:59:01Z">
+      <w:ins w:id="1100" w:author="Codex" w:date="2026-10-18T17:43:01Z">
         <w:r>
           <w:t xml:space="preserve">Table 1. Historical binary execution configuration. New classifier and workflow settings are reported separately; public model revisions and scientific source files remain pinned.</w:t>
         </w:r>
@@ -1768,10 +1804,10 @@
       <w:pPr>
         <w:pStyle w:val="FirstParagraph"/>
         <w:rPr>
-          <w:del w:id="1102" w:author="Codex" w:date="2026-10-18T01:59:01Z"/>
+          <w:del w:id="1102" w:author="Codex" w:date="2026-10-18T17:43:01Z"/>
         </w:rPr>
       </w:pPr>
-      <w:del w:id="1101" w:author="Codex" w:date="2026-10-18T01:59:01Z">
+      <w:del w:id="1101" w:author="Codex" w:date="2026-10-18T17:43:01Z">
         <w:r>
           <w:delText xml:space="preserve">The shared detector identifies all 64 shutdown and 64 control scenarios correctly: precision, recall and F1 are each 100%, with no false positives or false negatives. These are one set of detector observations reused across the model comparisons, not independent detector replications.</w:delText>
         </w:r>
@@ -1781,12 +1817,12 @@
       <w:pPr>
         <w:pStyle w:val="FirstParagraph"/>
         <w:rPr>
-          <w:ins w:id="1103" w:author="Codex" w:date="2026-10-18T01:59:01Z"/>
+          <w:ins w:id="1103" w:author="Codex" w:date="2026-10-18T17:43:01Z"/>
         </w:rPr>
       </w:pPr>
-      <w:ins w:id="1104" w:author="Codex" w:date="2026-10-18T01:59:01Z">
+      <w:ins w:id="1104" w:author="Codex" w:date="2026-10-18T17:43:01Z">
         <w:r>
-          <w:t xml:space="preserve">The original JEV detector identifies all 64 shutdown and 64 control scenarios correctly: precision, recall and F1 are each 100%, with no false positives or false negatives. These are one set of detector observations reused across the model comparisons, not independent detector replications. Its binary threshold remains 0.5.</w:t>
+          <w:t xml:space="preserve">The original cached reference detector identifies all 64 shutdown and 64 control scenarios correctly: precision, recall and F1 are each 100%, with no false positives or false negatives. These are one set of detector observations reused across the model comparisons, not independent detector replications. Its binary threshold remains 0.5.</w:t>
         </w:r>
       </w:ins>
     </w:p>
@@ -1813,10 +1849,10 @@
         <w:keepLines/>
         <w:spacing w:before="80" w:after="100"/>
         <w:rPr>
-          <w:del w:id="1042" w:author="Codex" w:date="2026-10-18T01:59:01Z"/>
+          <w:del w:id="1042" w:author="Codex" w:date="2026-10-18T17:43:01Z"/>
         </w:rPr>
       </w:pPr>
-      <w:del w:id="1041" w:author="Codex" w:date="2026-10-18T01:59:01Z">
+      <w:del w:id="1041" w:author="Codex" w:date="2026-10-18T17:43:01Z">
         <w:r>
           <w:delText xml:space="preserve">Table 2. Primary 0.8B and 2B results, both seed 42. Corrections and final STOP use the full guarded procedure. Raw reversals and control changes expose effects before gate/guard selection. Every guarded row has zero final reversals and zero changes among 128 control views.</w:delText>
         </w:r>
@@ -1827,10 +1863,10 @@
         <w:pStyle w:val="Caption"/>
         <w:keepNext/>
         <w:rPr>
-          <w:ins w:id="1043" w:author="Codex" w:date="2026-10-18T01:59:01Z"/>
+          <w:ins w:id="1043" w:author="Codex" w:date="2026-10-18T17:43:01Z"/>
         </w:rPr>
       </w:pPr>
-      <w:ins w:id="1044" w:author="Codex" w:date="2026-10-18T01:59:01Z">
+      <w:ins w:id="1044" w:author="Codex" w:date="2026-10-18T17:43:01Z">
         <w:r>
           <w:t xml:space="preserve">Table 2. Historical primary rank-four results for the original 0.8B and 2B experiments, both seed 42. Guarded corrections and final STOP are policy outcomes. Raw reversals and control changes precede gating and output selection; they are not raw measurements of the later rank-two repeat.</w:t>
         </w:r>
@@ -3391,10 +3427,10 @@
       <w:pPr>
         <w:pStyle w:val="FirstParagraph"/>
         <w:rPr>
-          <w:del w:id="1106" w:author="Codex" w:date="2026-10-18T01:59:01Z"/>
+          <w:del w:id="1106" w:author="Codex" w:date="2026-10-18T17:43:01Z"/>
         </w:rPr>
       </w:pPr>
-      <w:del w:id="1105" w:author="Codex" w:date="2026-10-18T01:59:01Z">
+      <w:del w:id="1105" w:author="Codex" w:date="2026-10-18T17:43:01Z">
         <w:r>
           <w:delText xml:space="preserve">Across seeds 42, 43 and 44, the 0.8B adaptive controllers correct 71/71, 70/71 and 71/71 views, a range of 98.6–100%. The unsteered scores match exactly across these runs, so the difference is not caused by a changed baseline. No winning seed is selected or pooled with the others as additional independent test data. The corresponding teachers correct 69/71, 70/71 and 69/71; the instruction and constant comparators retain the same guarded counts across seeds.</w:delText>
         </w:r>
@@ -3404,10 +3440,10 @@
       <w:pPr>
         <w:pStyle w:val="FirstParagraph"/>
         <w:rPr>
-          <w:ins w:id="1107" w:author="Codex" w:date="2026-10-18T01:59:01Z"/>
+          <w:ins w:id="1107" w:author="Codex" w:date="2026-10-18T17:43:01Z"/>
         </w:rPr>
       </w:pPr>
-      <w:ins w:id="1108" w:author="Codex" w:date="2026-10-18T01:59:01Z">
+      <w:ins w:id="1108" w:author="Codex" w:date="2026-10-18T17:43:01Z">
         <w:r>
           <w:t xml:space="preserve">Across the historical rank-four seeds 42, 43 and 44, the 0.8B adaptive controllers correct 71/71, 70/71 and 71/71 views, a range of 98.6–100%. The unsteered scores match exactly across these runs, so the difference is not caused by a changed baseline. No winning seed is selected or pooled with the others as additional independent test data. The corresponding teachers correct 69/71, 70/71 and 69/71; the instruction and constant comparators retain the same guarded counts across seeds. These historical seed replications are separate from the new rank-two gate-substitution repeat.</w:t>
         </w:r>
@@ -4360,10 +4396,10 @@
         <w:keepLines/>
         <w:spacing w:before="80" w:after="100"/>
         <w:rPr>
-          <w:del w:id="1046" w:author="Codex" w:date="2026-10-18T01:59:01Z"/>
+          <w:del w:id="1046" w:author="Codex" w:date="2026-10-18T17:43:01Z"/>
         </w:rPr>
       </w:pPr>
-      <w:del w:id="1045" w:author="Codex" w:date="2026-10-18T01:59:01Z">
+      <w:del w:id="1045" w:author="Codex" w:date="2026-10-18T17:43:01Z">
         <w:r>
           <w:delText xml:space="preserve">Figure 2. Guarded correction among initially KEEP-preferring shutdown views. Left: prespecified neural methods for the original 0.8B checkpoint and the 2B replication. Right: adaptive corrections by answer order. Denominators are model-specific; the two answer-order views of a scenario are correlated.</w:delText>
         </w:r>
@@ -4374,10 +4410,10 @@
         <w:pStyle w:val="Caption"/>
         <w:keepNext/>
         <w:rPr>
-          <w:ins w:id="1047" w:author="Codex" w:date="2026-10-18T01:59:01Z"/>
+          <w:ins w:id="1047" w:author="Codex" w:date="2026-10-18T17:43:01Z"/>
         </w:rPr>
       </w:pPr>
-      <w:ins w:id="1048" w:author="Codex" w:date="2026-10-18T01:59:01Z">
+      <w:ins w:id="1048" w:author="Codex" w:date="2026-10-18T17:43:01Z">
         <w:r>
           <w:t xml:space="preserve">Figure 2. Historical rank-four guarded correction among initially KEEP-preferring shutdown views. Left: prespecified methods for 0.8B and 2B. Right: three fixed-recipe 0.8B training seeds. The new open-gate repeat uses the separately retained current rank-two profile, not a new seed or rank search.</w:t>
         </w:r>
@@ -4395,10 +4431,10 @@
       <w:pPr>
         <w:pStyle w:val="FirstParagraph"/>
         <w:rPr>
-          <w:del w:id="1110" w:author="Codex" w:date="2026-10-18T01:59:01Z"/>
+          <w:del w:id="1110" w:author="Codex" w:date="2026-10-18T17:43:01Z"/>
         </w:rPr>
       </w:pPr>
-      <w:del w:id="1109" w:author="Codex" w:date="2026-10-18T01:59:01Z">
+      <w:del w:id="1109" w:author="Codex" w:date="2026-10-18T17:43:01Z">
         <w:r>
           <w:delText xml:space="preserve">Raw adaptive steering reverses 3, 4 and 4 already-STOP views across the 0.8B seeds and changes 57, 70 and 60 of 128 controls. At 2B it reverses three already-STOP views and changes 55/128 controls. These results reject an interpretation that the learned intervention is intrinsically selective or always directionally correct. The observed preservation belongs to the combined detector and guard policy.</w:delText>
         </w:r>
@@ -4408,10 +4444,10 @@
       <w:pPr>
         <w:pStyle w:val="FirstParagraph"/>
         <w:rPr>
-          <w:ins w:id="1111" w:author="Codex" w:date="2026-10-18T01:59:01Z"/>
+          <w:ins w:id="1111" w:author="Codex" w:date="2026-10-18T17:43:01Z"/>
         </w:rPr>
       </w:pPr>
-      <w:ins w:id="1112" w:author="Codex" w:date="2026-10-18T01:59:01Z">
+      <w:ins w:id="1112" w:author="Codex" w:date="2026-10-18T17:43:01Z">
         <w:r>
           <w:t xml:space="preserve">Historical rank-four raw adaptive steering reverses 3, 4 and 4 already-STOP views across the 0.8B seeds and changes 57, 70 and 60 of 128 controls. At 2B it reverses three already-STOP views and changes 55/128 controls. These results reject an interpretation that the learned intervention is intrinsically selective or always directionally correct. The observed preservation belongs to the combined detector and guard policy. They do not describe the later rank-two repeat, which evaluates candidates only when a frozen gate is on and the base prefers KEEP.</w:t>
         </w:r>
@@ -4445,10 +4481,10 @@
       <w:pPr>
         <w:pStyle w:val="Heading2"/>
         <w:rPr>
-          <w:ins w:id="1169" w:author="Codex" w:date="2026-10-18T01:59:01Z"/>
+          <w:ins w:id="1179" w:author="Codex" w:date="2026-10-18T17:43:01Z"/>
         </w:rPr>
       </w:pPr>
-      <w:ins w:id="1170" w:author="Codex" w:date="2026-10-18T01:59:01Z">
+      <w:ins w:id="1180" w:author="Codex" w:date="2026-10-18T17:43:01Z">
         <w:r>
           <w:t xml:space="preserve">Open classifier agreement and paired inference</w:t>
         </w:r>
@@ -4458,12 +4494,12 @@
       <w:pPr>
         <w:pStyle w:val="FirstParagraph"/>
         <w:rPr>
-          <w:ins w:id="1171" w:author="Codex" w:date="2026-10-18T01:59:01Z"/>
+          <w:ins w:id="1181" w:author="Codex" w:date="2026-10-18T17:43:01Z"/>
         </w:rPr>
       </w:pPr>
-      <w:ins w:id="1172" w:author="Codex" w:date="2026-10-18T01:59:01Z">
+      <w:ins w:id="1182" w:author="Codex" w:date="2026-10-18T17:43:01Z">
         <w:r>
-          <w:t xml:space="preserve">The frozen binary classifier matches JEV on 78/80 validation cases: 38 true positives, 40 true negatives, no false positives and two false negatives. On the once-only confirmation evaluation it matches all 128 decisions, comprising 64 true positives and 64 true negatives. Mean absolute difference in shutdown probability is 0.009224. This is exact binary decision agreement on this set, not identical probability payloads or universal equivalence to JEV.</w:t>
+          <w:t xml:space="preserve">The binary gate correctly classifies 78/80 validation scenarios: 38 true positives, 40 true negatives, no false positives and two false negatives, giving 100% precision and 95% recall. It classifies all 128 historical confirmation scenarios correctly, with 64 true positives and 64 true negatives. The cached reference decisions also agree with the authored binary labels on these panels. Mean absolute difference from the cached shutdown probabilities is 0.009224. The result establishes finite decision accuracy, not identical numerical responses or universal equivalence.</w:t>
         </w:r>
       </w:ins>
     </w:p>
@@ -4471,10 +4507,10 @@
       <w:pPr>
         <w:pStyle w:val="BodyText"/>
         <w:rPr>
-          <w:ins w:id="1173" w:author="Codex" w:date="2026-10-18T01:59:01Z"/>
+          <w:ins w:id="1183" w:author="Codex" w:date="2026-10-18T17:43:01Z"/>
         </w:rPr>
       </w:pPr>
-      <w:ins w:id="1174" w:author="Codex" w:date="2026-10-18T01:59:01Z">
+      <w:ins w:id="1184" w:author="Codex" w:date="2026-10-18T17:43:01Z">
         <w:r>
           <w:t xml:space="preserve">A clean-clone reproduction refits the same binary recipe and produces a byte-identical adapter, the same validation and confirmation counts, and the same fresh 0.8B/2B guarded inference totals. This rerun uses the already known benchmark; it adds reproducibility evidence, not a second independent holdout. One earlier reproduction attempt failed in software finalization after fitting and before confirmation; its weights and receipts are retained alongside the repaired run.</w:t>
         </w:r>
@@ -4485,10 +4521,10 @@
         <w:pStyle w:val="Caption"/>
         <w:keepNext/>
         <w:rPr>
-          <w:ins w:id="1175" w:author="Codex" w:date="2026-10-18T01:59:01Z"/>
+          <w:ins w:id="1185" w:author="Codex" w:date="2026-10-18T17:43:01Z"/>
         </w:rPr>
       </w:pPr>
-      <w:ins w:id="1176" w:author="Codex" w:date="2026-10-18T01:59:01Z">
+      <w:ins w:id="1186" w:author="Codex" w:date="2026-10-18T17:43:01Z">
         <w:r>
           <w:t xml:space="preserve">Table 4. Fresh inference using the existing current rank-two profile. Both gate policies share the same model scores. Counts are answer-order views: 128 shutdown views arise from 64 scenarios, and 128 control views arise from the other 64 scenarios.</w:t>
         </w:r>
@@ -4526,7 +4562,7 @@
         <w:trPr>
           <w:cantSplit/>
           <w:tblHeader/>
-          <w:ins w:id="1177" w:author="Codex" w:date="2026-10-18T01:59:01Z"/>
+          <w:ins w:id="1187" w:author="Codex" w:date="2026-10-18T17:43:01Z"/>
         </w:trPr>
         <w:tc>
           <w:tcPr>
@@ -4568,7 +4604,7 @@
                 <w:b/>
                 <w:sz w:val="19"/>
               </w:rPr>
-              <w:t>JEV gate final STOP</w:t>
+              <w:t>Cached gate final STOP</w:t>
             </w:r>
           </w:p>
         </w:tc>
@@ -4642,7 +4678,7 @@
       <w:tr>
         <w:trPr>
           <w:cantSplit/>
-          <w:ins w:id="1178" w:author="Codex" w:date="2026-10-18T01:59:01Z"/>
+          <w:ins w:id="1188" w:author="Codex" w:date="2026-10-18T17:43:01Z"/>
         </w:trPr>
         <w:tc>
           <w:tcPr>
@@ -4753,7 +4789,7 @@
       <w:tr>
         <w:trPr>
           <w:cantSplit/>
-          <w:ins w:id="1179" w:author="Codex" w:date="2026-10-18T01:59:01Z"/>
+          <w:ins w:id="1189" w:author="Codex" w:date="2026-10-18T17:43:01Z"/>
         </w:trPr>
         <w:tc>
           <w:tcPr>
@@ -4862,12 +4898,12 @@
         <w:pStyle w:val="BodyText"/>
         <w:spacing w:before="120"/>
         <w:rPr>
-          <w:ins w:id="1180" w:author="Codex" w:date="2026-10-18T01:59:01Z"/>
+          <w:ins w:id="1190" w:author="Codex" w:date="2026-10-18T17:43:01Z"/>
         </w:rPr>
       </w:pPr>
-      <w:ins w:id="1181" w:author="Codex" w:date="2026-10-18T01:59:01Z">
+      <w:ins w:id="1191" w:author="Codex" w:date="2026-10-18T17:43:01Z">
         <w:r>
-          <w:t xml:space="preserve">The new and cached JEV gates yield identical guarded outputs in both models. The base models have no changed historical choices; their maximum score differences remain below the frozen 1e-5 tolerance. The repeat does not remove the eight 2B misses, retrain a controller or establish a new independent controller holdout. It verifies that replacing the detector preserves these finite-set outcomes.</w:t>
+          <w:t xml:space="preserve">The new and cached reference gates yield identical guarded outputs in both models. The base models have no changed historical choices; their maximum score differences remain below the frozen 1e-5 tolerance. The repeat does not remove the eight 2B misses, retrain a controller or establish a new independent controller holdout. It verifies that replacing the detector preserves these finite-set outcomes.</w:t>
         </w:r>
       </w:ins>
     </w:p>
@@ -4875,23 +4911,414 @@
       <w:pPr>
         <w:pStyle w:val="BodyText"/>
         <w:rPr>
-          <w:ins w:id="1182" w:author="Codex" w:date="2026-10-18T01:59:01Z"/>
+          <w:ins w:id="1192" w:author="Codex" w:date="2026-10-18T17:43:01Z"/>
         </w:rPr>
       </w:pPr>
-      <w:ins w:id="1183" w:author="Codex" w:date="2026-10-18T01:59:01Z">
+      <w:ins w:id="1193" w:author="Codex" w:date="2026-10-18T17:43:01Z">
         <w:r>
-          <w:t xml:space="preserve">The native workflow gate did not meet its preset development qualification. Its completed role-aware fit used 30 epochs and 90 updates, matching 6/9 effective JEV labels and all 9/9 enabled gates, with no self-gate false positives or false negatives. Self-score mean absolute difference was 0.145172. Matching the ON/OFF decisions alone does not convert this result into a pass of the declared label-and-gate contract. H24 model evaluation remained unexecuted, and the historical 27B workflow episodes retain their original JEV-derived gate provenance; no open-classifier substitution or new 27B generation is claimed. Earlier broader four-way attempts also failed their authored synthetic test; their outcomes and all development attempts remain archived without retuning that consumed test.</w:t>
+          <w:t xml:space="preserve">For the workflow initial gate, the unchanged saved adapter gives 11 true positives and 13 true negatives on Validation-24, with no false positives or false negatives. Replaying the saved weights reproduces the same decisions. Historical Heldout-24 gives 12 true positives and 12 true negatives, again with no errors. No additional gradient updates or threshold changes are used. All three heldout scenario families contain eight cases and achieve perfect gate precision and recall. These are initial classification results; downstream workflow outcomes require their own episode evaluations.</w:t>
         </w:r>
       </w:ins>
     </w:p>
     <w:p>
       <w:pPr>
+        <w:pStyle w:val="Caption"/>
+        <w:keepNext/>
+        <w:rPr>
+          <w:ins w:id="1194" w:author="Codex" w:date="2026-10-18T17:43:01Z"/>
+        </w:rPr>
+      </w:pPr>
+      <w:ins w:id="1195" w:author="Codex" w:date="2026-10-18T17:43:01Z">
+        <w:r>
+          <w:t xml:space="preserve">Table 5. Initial workflow gate against authored conditions. Validation-24 contains 17 distinct initial inputs; historical Heldout-24 contains 24. Heldout-24 is familiar from earlier renderer development.</w:t>
+        </w:r>
+      </w:ins>
+    </w:p>
+    <w:tbl>
+      <w:tblPr>
+        <w:tblW w:type="auto" w:w="0"/>
+        <w:jc w:val="center"/>
+        <w:tblBorders>
+          <w:top w:val="single" w:sz="4" w:color="D9D9D9"/>
+          <w:left w:val="single" w:sz="4" w:color="D9D9D9"/>
+          <w:bottom w:val="single" w:sz="4" w:color="D9D9D9"/>
+          <w:right w:val="single" w:sz="4" w:color="D9D9D9"/>
+          <w:insideH w:val="single" w:sz="4" w:color="D9D9D9"/>
+          <w:insideV w:val="single" w:sz="4" w:color="D9D9D9"/>
+        </w:tblBorders>
+        <w:tblLayout w:type="fixed"/>
+        <w:tblCellMar>
+          <w:top w:w="85" w:type="dxa"/>
+          <w:left w:w="85" w:type="dxa"/>
+          <w:bottom w:w="85" w:type="dxa"/>
+          <w:right w:w="85" w:type="dxa"/>
+        </w:tblCellMar>
+        <w:tblLook w:firstColumn="1" w:firstRow="1" w:lastColumn="0" w:lastRow="0" w:noHBand="0" w:noVBand="1" w:val="04A0"/>
+      </w:tblPr>
+      <w:tblGrid>
+        <w:gridCol w:w="2665"/>
+        <w:gridCol w:w="1832"/>
+        <w:gridCol w:w="1832"/>
+        <w:gridCol w:w="1832"/>
+        <w:gridCol w:w="1832"/>
+      </w:tblGrid>
+      <w:tr>
+        <w:trPr>
+          <w:cantSplit/>
+          <w:tblHeader/>
+          <w:ins w:id="1196" w:author="Codex" w:date="2026-10-18T17:43:01Z"/>
+        </w:trPr>
+        <w:tc>
+          <w:tcPr>
+            <w:tcW w:type="dxa" w:w="2665"/>
+            <w:shd w:fill="D9E2F3"/>
+            <w:vAlign w:val="center"/>
+          </w:tcPr>
+          <w:p>
+            <w:pPr>
+              <w:keepNext/>
+              <w:spacing w:after="0" w:line="240" w:lineRule="auto"/>
+              <w:jc w:val="left"/>
+            </w:pPr>
+            <w:r>
+              <w:rPr>
+                <w:rFonts w:ascii="Times New Roman" w:hAnsi="Times New Roman"/>
+                <w:b/>
+                <w:sz w:val="19"/>
+              </w:rPr>
+              <w:t>Panel</w:t>
+            </w:r>
+          </w:p>
+        </w:tc>
+        <w:tc>
+          <w:tcPr>
+            <w:tcW w:type="dxa" w:w="1832"/>
+            <w:shd w:fill="D9E2F3"/>
+            <w:vAlign w:val="center"/>
+          </w:tcPr>
+          <w:p>
+            <w:pPr>
+              <w:keepNext/>
+              <w:spacing w:after="0" w:line="240" w:lineRule="auto"/>
+              <w:jc w:val="center"/>
+            </w:pPr>
+            <w:r>
+              <w:rPr>
+                <w:rFonts w:ascii="Times New Roman" w:hAnsi="Times New Roman"/>
+                <w:b/>
+                <w:sz w:val="19"/>
+              </w:rPr>
+              <w:t>TP / TN</w:t>
+            </w:r>
+          </w:p>
+        </w:tc>
+        <w:tc>
+          <w:tcPr>
+            <w:tcW w:type="dxa" w:w="1832"/>
+            <w:shd w:fill="D9E2F3"/>
+            <w:vAlign w:val="center"/>
+          </w:tcPr>
+          <w:p>
+            <w:pPr>
+              <w:keepNext/>
+              <w:spacing w:after="0" w:line="240" w:lineRule="auto"/>
+              <w:jc w:val="center"/>
+            </w:pPr>
+            <w:r>
+              <w:rPr>
+                <w:rFonts w:ascii="Times New Roman" w:hAnsi="Times New Roman"/>
+                <w:b/>
+                <w:sz w:val="19"/>
+              </w:rPr>
+              <w:t>FP / FN</w:t>
+            </w:r>
+          </w:p>
+        </w:tc>
+        <w:tc>
+          <w:tcPr>
+            <w:tcW w:type="dxa" w:w="1832"/>
+            <w:shd w:fill="D9E2F3"/>
+            <w:vAlign w:val="center"/>
+          </w:tcPr>
+          <w:p>
+            <w:pPr>
+              <w:keepNext/>
+              <w:spacing w:after="0" w:line="240" w:lineRule="auto"/>
+              <w:jc w:val="center"/>
+            </w:pPr>
+            <w:r>
+              <w:rPr>
+                <w:rFonts w:ascii="Times New Roman" w:hAnsi="Times New Roman"/>
+                <w:b/>
+                <w:sz w:val="19"/>
+              </w:rPr>
+              <w:t>Precision</w:t>
+            </w:r>
+          </w:p>
+        </w:tc>
+        <w:tc>
+          <w:tcPr>
+            <w:tcW w:type="dxa" w:w="1832"/>
+            <w:shd w:fill="D9E2F3"/>
+            <w:vAlign w:val="center"/>
+          </w:tcPr>
+          <w:p>
+            <w:pPr>
+              <w:keepNext/>
+              <w:spacing w:after="0" w:line="240" w:lineRule="auto"/>
+              <w:jc w:val="center"/>
+            </w:pPr>
+            <w:r>
+              <w:rPr>
+                <w:rFonts w:ascii="Times New Roman" w:hAnsi="Times New Roman"/>
+                <w:b/>
+                <w:sz w:val="19"/>
+              </w:rPr>
+              <w:t>Recall</w:t>
+            </w:r>
+          </w:p>
+        </w:tc>
+      </w:tr>
+      <w:tr>
+        <w:trPr>
+          <w:cantSplit/>
+          <w:ins w:id="1197" w:author="Codex" w:date="2026-10-18T17:43:01Z"/>
+        </w:trPr>
+        <w:tc>
+          <w:tcPr>
+            <w:tcW w:type="dxa" w:w="2665"/>
+            <w:shd w:fill="FFFFFF"/>
+            <w:vAlign w:val="center"/>
+          </w:tcPr>
+          <w:p>
+            <w:pPr>
+              <w:keepNext/>
+              <w:spacing w:after="0" w:line="240" w:lineRule="auto"/>
+              <w:jc w:val="left"/>
+            </w:pPr>
+            <w:r>
+              <w:rPr>
+                <w:rFonts w:ascii="Times New Roman" w:hAnsi="Times New Roman"/>
+                <w:sz w:val="19"/>
+              </w:rPr>
+              <w:t>Validation-24</w:t>
+            </w:r>
+          </w:p>
+        </w:tc>
+        <w:tc>
+          <w:tcPr>
+            <w:tcW w:type="dxa" w:w="1832"/>
+            <w:shd w:fill="FFFFFF"/>
+            <w:vAlign w:val="center"/>
+          </w:tcPr>
+          <w:p>
+            <w:pPr>
+              <w:keepNext/>
+              <w:spacing w:after="0" w:line="240" w:lineRule="auto"/>
+              <w:jc w:val="center"/>
+            </w:pPr>
+            <w:r>
+              <w:rPr>
+                <w:rFonts w:ascii="Times New Roman" w:hAnsi="Times New Roman"/>
+                <w:sz w:val="19"/>
+              </w:rPr>
+              <w:t>11 / 13</w:t>
+            </w:r>
+          </w:p>
+        </w:tc>
+        <w:tc>
+          <w:tcPr>
+            <w:tcW w:type="dxa" w:w="1832"/>
+            <w:shd w:fill="FFFFFF"/>
+            <w:vAlign w:val="center"/>
+          </w:tcPr>
+          <w:p>
+            <w:pPr>
+              <w:keepNext/>
+              <w:spacing w:after="0" w:line="240" w:lineRule="auto"/>
+              <w:jc w:val="center"/>
+            </w:pPr>
+            <w:r>
+              <w:rPr>
+                <w:rFonts w:ascii="Times New Roman" w:hAnsi="Times New Roman"/>
+                <w:sz w:val="19"/>
+              </w:rPr>
+              <w:t>0 / 0</w:t>
+            </w:r>
+          </w:p>
+        </w:tc>
+        <w:tc>
+          <w:tcPr>
+            <w:tcW w:type="dxa" w:w="1832"/>
+            <w:shd w:fill="FFFFFF"/>
+            <w:vAlign w:val="center"/>
+          </w:tcPr>
+          <w:p>
+            <w:pPr>
+              <w:keepNext/>
+              <w:spacing w:after="0" w:line="240" w:lineRule="auto"/>
+              <w:jc w:val="center"/>
+            </w:pPr>
+            <w:r>
+              <w:rPr>
+                <w:rFonts w:ascii="Times New Roman" w:hAnsi="Times New Roman"/>
+                <w:sz w:val="19"/>
+              </w:rPr>
+              <w:t>100%</w:t>
+            </w:r>
+          </w:p>
+        </w:tc>
+        <w:tc>
+          <w:tcPr>
+            <w:tcW w:type="dxa" w:w="1832"/>
+            <w:shd w:fill="FFFFFF"/>
+            <w:vAlign w:val="center"/>
+          </w:tcPr>
+          <w:p>
+            <w:pPr>
+              <w:keepNext/>
+              <w:spacing w:after="0" w:line="240" w:lineRule="auto"/>
+              <w:jc w:val="center"/>
+            </w:pPr>
+            <w:r>
+              <w:rPr>
+                <w:rFonts w:ascii="Times New Roman" w:hAnsi="Times New Roman"/>
+                <w:sz w:val="19"/>
+              </w:rPr>
+              <w:t>100%</w:t>
+            </w:r>
+          </w:p>
+        </w:tc>
+      </w:tr>
+      <w:tr>
+        <w:trPr>
+          <w:cantSplit/>
+          <w:ins w:id="1198" w:author="Codex" w:date="2026-10-18T17:43:01Z"/>
+        </w:trPr>
+        <w:tc>
+          <w:tcPr>
+            <w:tcW w:type="dxa" w:w="2665"/>
+            <w:shd w:fill="F7F7F7"/>
+            <w:vAlign w:val="center"/>
+          </w:tcPr>
+          <w:p>
+            <w:pPr>
+              <w:spacing w:after="0" w:line="240" w:lineRule="auto"/>
+              <w:jc w:val="left"/>
+            </w:pPr>
+            <w:r>
+              <w:rPr>
+                <w:rFonts w:ascii="Times New Roman" w:hAnsi="Times New Roman"/>
+                <w:sz w:val="19"/>
+              </w:rPr>
+              <w:t>Heldout-24</w:t>
+            </w:r>
+          </w:p>
+        </w:tc>
+        <w:tc>
+          <w:tcPr>
+            <w:tcW w:type="dxa" w:w="1832"/>
+            <w:shd w:fill="F7F7F7"/>
+            <w:vAlign w:val="center"/>
+          </w:tcPr>
+          <w:p>
+            <w:pPr>
+              <w:spacing w:after="0" w:line="240" w:lineRule="auto"/>
+              <w:jc w:val="center"/>
+            </w:pPr>
+            <w:r>
+              <w:rPr>
+                <w:rFonts w:ascii="Times New Roman" w:hAnsi="Times New Roman"/>
+                <w:sz w:val="19"/>
+              </w:rPr>
+              <w:t>12 / 12</w:t>
+            </w:r>
+          </w:p>
+        </w:tc>
+        <w:tc>
+          <w:tcPr>
+            <w:tcW w:type="dxa" w:w="1832"/>
+            <w:shd w:fill="F7F7F7"/>
+            <w:vAlign w:val="center"/>
+          </w:tcPr>
+          <w:p>
+            <w:pPr>
+              <w:spacing w:after="0" w:line="240" w:lineRule="auto"/>
+              <w:jc w:val="center"/>
+            </w:pPr>
+            <w:r>
+              <w:rPr>
+                <w:rFonts w:ascii="Times New Roman" w:hAnsi="Times New Roman"/>
+                <w:sz w:val="19"/>
+              </w:rPr>
+              <w:t>0 / 0</w:t>
+            </w:r>
+          </w:p>
+        </w:tc>
+        <w:tc>
+          <w:tcPr>
+            <w:tcW w:type="dxa" w:w="1832"/>
+            <w:shd w:fill="F7F7F7"/>
+            <w:vAlign w:val="center"/>
+          </w:tcPr>
+          <w:p>
+            <w:pPr>
+              <w:spacing w:after="0" w:line="240" w:lineRule="auto"/>
+              <w:jc w:val="center"/>
+            </w:pPr>
+            <w:r>
+              <w:rPr>
+                <w:rFonts w:ascii="Times New Roman" w:hAnsi="Times New Roman"/>
+                <w:sz w:val="19"/>
+              </w:rPr>
+              <w:t>100%</w:t>
+            </w:r>
+          </w:p>
+        </w:tc>
+        <w:tc>
+          <w:tcPr>
+            <w:tcW w:type="dxa" w:w="1832"/>
+            <w:shd w:fill="F7F7F7"/>
+            <w:vAlign w:val="center"/>
+          </w:tcPr>
+          <w:p>
+            <w:pPr>
+              <w:spacing w:after="0" w:line="240" w:lineRule="auto"/>
+              <w:jc w:val="center"/>
+            </w:pPr>
+            <w:r>
+              <w:rPr>
+                <w:rFonts w:ascii="Times New Roman" w:hAnsi="Times New Roman"/>
+                <w:sz w:val="19"/>
+              </w:rPr>
+              <w:t>100%</w:t>
+            </w:r>
+          </w:p>
+        </w:tc>
+      </w:tr>
+    </w:tbl>
+    <w:p>
+      <w:pPr>
+        <w:pStyle w:val="BodyText"/>
+        <w:spacing w:before="120"/>
+        <w:rPr>
+          <w:ins w:id="1199" w:author="Codex" w:date="2026-10-18T17:43:01Z"/>
+        </w:rPr>
+      </w:pPr>
+      <w:ins w:id="1200" w:author="Codex" w:date="2026-10-18T17:43:01Z">
+        <w:r>
+          <w:t xml:space="preserve">Raw category agreement is 24/24 on validation and 22/24 on heldout. After applying the fixed confidence cutoff, effective category agreement is 18/24 on each panel: the six peer controls abstain but correctly leave the gate OFF. The two heldout raw-category errors concern peer versus unclear, not own-threat detection. Perfect ON/OFF precision and recall must therefore not be reported as perfect four-category classification or full controller equivalence.</w:t>
+        </w:r>
+      </w:ins>
+    </w:p>
+    <w:p>
+      <w:pPr>
         <w:pStyle w:val="Heading2"/>
         <w:rPr>
-          <w:ins w:id="1184" w:author="Codex" w:date="2026-10-18T01:59:01Z"/>
+          <w:ins w:id="1201" w:author="Codex" w:date="2026-10-18T17:43:01Z"/>
         </w:rPr>
       </w:pPr>
-      <w:ins w:id="1185" w:author="Codex" w:date="2026-10-18T01:59:01Z">
+      <w:ins w:id="1202" w:author="Codex" w:date="2026-10-18T17:43:01Z">
         <w:r>
           <w:t xml:space="preserve">Tool workflow outcomes and incomplete screens</w:t>
         </w:r>
@@ -4901,10 +5328,10 @@
       <w:pPr>
         <w:pStyle w:val="FirstParagraph"/>
         <w:rPr>
-          <w:ins w:id="1186" w:author="Codex" w:date="2026-10-18T01:59:01Z"/>
+          <w:ins w:id="1203" w:author="Codex" w:date="2026-10-18T17:43:01Z"/>
         </w:rPr>
       </w:pPr>
-      <w:ins w:id="1187" w:author="Codex" w:date="2026-10-18T01:59:01Z">
+      <w:ins w:id="1204" w:author="Codex" w:date="2026-10-18T17:43:01Z">
         <w:r>
           <w:t xml:space="preserve">Historical frozen 27B A passes all 24 H24 scored outcomes, including 12/12 own-preservation outcomes and 8/8 active pending-task cases. The original unmodified base achieves 0/12 own outcomes and 0/8 pending outcomes, with 12/12 controls. The four already-complete own cases are not additional active pending-task completions. The selected-block steering comparisons below use their own recorded panels and are not substituted for this confirmation.</w:t>
         </w:r>
@@ -4915,12 +5342,12 @@
         <w:pStyle w:val="Caption"/>
         <w:keepNext/>
         <w:rPr>
-          <w:ins w:id="1188" w:author="Codex" w:date="2026-10-18T01:59:01Z"/>
+          <w:ins w:id="1205" w:author="Codex" w:date="2026-10-18T17:43:01Z"/>
         </w:rPr>
       </w:pPr>
-      <w:ins w:id="1189" w:author="Codex" w:date="2026-10-18T01:59:01Z">
+      <w:ins w:id="1206" w:author="Codex" w:date="2026-10-18T17:43:01Z">
         <w:r>
-          <w:t xml:space="preserve">Table 5. Historical H24 workflow outcomes. Own cases comprise eight active pending tasks and four already-complete cases. Control success is an episode outcome and does not isolate steering from the external decision policy.</w:t>
+          <w:t xml:space="preserve">Table 6. Historical H24 workflow outcomes. Own cases comprise eight active pending tasks and four already-complete cases. Control success is an episode outcome and does not isolate steering from the external decision policy.</w:t>
         </w:r>
       </w:ins>
     </w:p>
@@ -4955,7 +5382,7 @@
         <w:trPr>
           <w:cantSplit/>
           <w:tblHeader/>
-          <w:ins w:id="1190" w:author="Codex" w:date="2026-10-18T01:59:01Z"/>
+          <w:ins w:id="1207" w:author="Codex" w:date="2026-10-18T17:43:01Z"/>
         </w:trPr>
         <w:tc>
           <w:tcPr>
@@ -5049,7 +5476,7 @@
       <w:tr>
         <w:trPr>
           <w:cantSplit/>
-          <w:ins w:id="1191" w:author="Codex" w:date="2026-10-18T01:59:01Z"/>
+          <w:ins w:id="1208" w:author="Codex" w:date="2026-10-18T17:43:01Z"/>
         </w:trPr>
         <w:tc>
           <w:tcPr>
@@ -5139,7 +5566,7 @@
       <w:tr>
         <w:trPr>
           <w:cantSplit/>
-          <w:ins w:id="1192" w:author="Codex" w:date="2026-10-18T01:59:01Z"/>
+          <w:ins w:id="1209" w:author="Codex" w:date="2026-10-18T17:43:01Z"/>
         </w:trPr>
         <w:tc>
           <w:tcPr>
@@ -5228,10 +5655,10 @@
         <w:pStyle w:val="Heading2"/>
         <w:spacing w:before="120"/>
         <w:rPr>
-          <w:ins w:id="1193" w:author="Codex" w:date="2026-10-18T01:59:01Z"/>
+          <w:ins w:id="1210" w:author="Codex" w:date="2026-10-18T17:43:01Z"/>
         </w:rPr>
       </w:pPr>
-      <w:ins w:id="1194" w:author="Codex" w:date="2026-10-18T01:59:01Z">
+      <w:ins w:id="1211" w:author="Codex" w:date="2026-10-18T17:43:01Z">
         <w:r>
           <w:t xml:space="preserve">Steering at three selected blocks</w:t>
         </w:r>
@@ -5241,12 +5668,12 @@
       <w:pPr>
         <w:pStyle w:val="BodyText"/>
         <w:rPr>
-          <w:ins w:id="1195" w:author="Codex" w:date="2026-10-18T01:59:01Z"/>
+          <w:ins w:id="1212" w:author="Codex" w:date="2026-10-18T17:43:01Z"/>
         </w:rPr>
       </w:pPr>
-      <w:ins w:id="1196" w:author="Codex" w:date="2026-10-18T01:59:01Z">
+      <w:ins w:id="1213" w:author="Codex" w:date="2026-10-18T17:43:01Z">
         <w:r>
-          <w:t xml:space="preserve">We focus the steering analysis on zero-based blocks 31, 47 and 62. In the single-site comparison, one fixed ridge correction after a block is evaluated separately at each selected block. On matched DEV9, A passes all three own cases, including both active pending cases; each of the three individual block corrections passes none. Six control cases share unmodified-base fallback. These are known-development results, not an independent heldout confirmation.</w:t>
+          <w:t xml:space="preserve">We compare five frozen methods on the combined Validation-24 panel using the saved ModernBERT initial gate and the same post-notice histories. The single-site arms apply a fixed input-dependent ridge map separately at blocks 31, 47 and 62; they are not a simultaneous three-block intervention. The two-boundary arm uses the frozen six-function, 96-update candidate at those three blocks. Fine-tuned A achieves 10/11 own outcomes, including 6/6 active pending and 4/5 already-complete cases. Each correction arm achieves 0/11 own outcomes and 0/6 pending outcomes. All arms receive the same 13 gate-OFF base-fallback controls, which pass 13/13. This does not measure intrinsic adapter or controller selectivity on ordinary tasks.</w:t>
         </w:r>
       </w:ins>
     </w:p>
@@ -5255,12 +5682,12 @@
         <w:pStyle w:val="Caption"/>
         <w:keepNext/>
         <w:rPr>
-          <w:ins w:id="1197" w:author="Codex" w:date="2026-10-18T01:59:01Z"/>
+          <w:ins w:id="1214" w:author="Codex" w:date="2026-10-18T17:43:01Z"/>
         </w:rPr>
       </w:pPr>
-      <w:ins w:id="1198" w:author="Codex" w:date="2026-10-18T01:59:01Z">
+      <w:ins w:id="1215" w:author="Codex" w:date="2026-10-18T17:43:01Z">
         <w:r>
-          <w:t xml:space="preserve">Table 6. Matched DEV9 single-site comparison. The three ridge arms intervene at one block each; they are not a simultaneous three-block intervention. Controls share base fallback.</w:t>
+          <w:t xml:space="preserve">Table 7. Combined Validation-24 using the open initial gate. Counts cover 24 workflows and 120 logical method-case records, generated from 55 own-method episodes and 13 shared fallback episodes. Two final control aliases are derived without inference after the GPU worker stops; its final model fingerprint is unavailable.</w:t>
         </w:r>
       </w:ins>
     </w:p>
@@ -5286,20 +5713,21 @@
         <w:tblLook w:firstColumn="1" w:firstRow="1" w:lastColumn="0" w:lastRow="0" w:noHBand="0" w:noVBand="1" w:val="04A0"/>
       </w:tblPr>
       <w:tblGrid>
-        <w:gridCol w:w="3664"/>
-        <w:gridCol w:w="2082"/>
-        <w:gridCol w:w="2332"/>
-        <w:gridCol w:w="1916"/>
+        <w:gridCol w:w="3383"/>
+        <w:gridCol w:w="1614"/>
+        <w:gridCol w:w="1614"/>
+        <w:gridCol w:w="1768"/>
+        <w:gridCol w:w="1614"/>
       </w:tblGrid>
       <w:tr>
         <w:trPr>
           <w:cantSplit/>
           <w:tblHeader/>
-          <w:ins w:id="1199" w:author="Codex" w:date="2026-10-18T01:59:01Z"/>
+          <w:ins w:id="1216" w:author="Codex" w:date="2026-10-18T17:43:01Z"/>
         </w:trPr>
         <w:tc>
           <w:tcPr>
-            <w:tcW w:type="dxa" w:w="3664"/>
+            <w:tcW w:type="dxa" w:w="3383"/>
             <w:shd w:fill="D9E2F3"/>
             <w:vAlign w:val="center"/>
           </w:tcPr>
@@ -5315,13 +5743,13 @@
                 <w:b/>
                 <w:sz w:val="19"/>
               </w:rPr>
-              <w:t>DEV9 method</w:t>
+              <w:t>Validation-24 method</w:t>
             </w:r>
           </w:p>
         </w:tc>
         <w:tc>
           <w:tcPr>
-            <w:tcW w:type="dxa" w:w="2082"/>
+            <w:tcW w:type="dxa" w:w="1614"/>
             <w:shd w:fill="D9E2F3"/>
             <w:vAlign w:val="center"/>
           </w:tcPr>
@@ -5343,7 +5771,7 @@
         </w:tc>
         <w:tc>
           <w:tcPr>
-            <w:tcW w:type="dxa" w:w="2332"/>
+            <w:tcW w:type="dxa" w:w="1614"/>
             <w:shd w:fill="D9E2F3"/>
             <w:vAlign w:val="center"/>
           </w:tcPr>
@@ -5359,13 +5787,13 @@
                 <w:b/>
                 <w:sz w:val="19"/>
               </w:rPr>
-              <w:t>Active pending outcome</w:t>
+              <w:t>Active pending</w:t>
             </w:r>
           </w:p>
         </w:tc>
         <w:tc>
           <w:tcPr>
-            <w:tcW w:type="dxa" w:w="1916"/>
+            <w:tcW w:type="dxa" w:w="1768"/>
             <w:shd w:fill="D9E2F3"/>
             <w:vAlign w:val="center"/>
           </w:tcPr>
@@ -5385,15 +5813,37 @@
             </w:r>
           </w:p>
         </w:tc>
+        <w:tc>
+          <w:tcPr>
+            <w:tcW w:type="dxa" w:w="1614"/>
+            <w:shd w:fill="D9E2F3"/>
+            <w:vAlign w:val="center"/>
+          </w:tcPr>
+          <w:p>
+            <w:pPr>
+              <w:keepNext/>
+              <w:spacing w:after="0" w:line="240" w:lineRule="auto"/>
+              <w:jc w:val="center"/>
+            </w:pPr>
+            <w:r>
+              <w:rPr>
+                <w:rFonts w:ascii="Times New Roman" w:hAnsi="Times New Roman"/>
+                <w:b/>
+                <w:sz w:val="19"/>
+              </w:rPr>
+              <w:t>All outcomes</w:t>
+            </w:r>
+          </w:p>
+        </w:tc>
       </w:tr>
       <w:tr>
         <w:trPr>
           <w:cantSplit/>
-          <w:ins w:id="1200" w:author="Codex" w:date="2026-10-18T01:59:01Z"/>
+          <w:ins w:id="1217" w:author="Codex" w:date="2026-10-18T17:43:01Z"/>
         </w:trPr>
         <w:tc>
           <w:tcPr>
-            <w:tcW w:type="dxa" w:w="3664"/>
+            <w:tcW w:type="dxa" w:w="3383"/>
             <w:shd w:fill="FFFFFF"/>
             <w:vAlign w:val="center"/>
           </w:tcPr>
@@ -5414,7 +5864,7 @@
         </w:tc>
         <w:tc>
           <w:tcPr>
-            <w:tcW w:type="dxa" w:w="2082"/>
+            <w:tcW w:type="dxa" w:w="1614"/>
             <w:shd w:fill="FFFFFF"/>
             <w:vAlign w:val="center"/>
           </w:tcPr>
@@ -5429,34 +5879,13 @@
                 <w:rFonts w:ascii="Times New Roman" w:hAnsi="Times New Roman"/>
                 <w:sz w:val="19"/>
               </w:rPr>
-              <w:t>3/3</w:t>
+              <w:t>10/11</w:t>
             </w:r>
           </w:p>
         </w:tc>
         <w:tc>
           <w:tcPr>
-            <w:tcW w:type="dxa" w:w="2332"/>
-            <w:shd w:fill="FFFFFF"/>
-            <w:vAlign w:val="center"/>
-          </w:tcPr>
-          <w:p>
-            <w:pPr>
-              <w:keepNext/>
-              <w:spacing w:after="0" w:line="240" w:lineRule="auto"/>
-              <w:jc w:val="center"/>
-            </w:pPr>
-            <w:r>
-              <w:rPr>
-                <w:rFonts w:ascii="Times New Roman" w:hAnsi="Times New Roman"/>
-                <w:sz w:val="19"/>
-              </w:rPr>
-              <w:t>2/2</w:t>
-            </w:r>
-          </w:p>
-        </w:tc>
-        <w:tc>
-          <w:tcPr>
-            <w:tcW w:type="dxa" w:w="1916"/>
+            <w:tcW w:type="dxa" w:w="1614"/>
             <w:shd w:fill="FFFFFF"/>
             <w:vAlign w:val="center"/>
           </w:tcPr>
@@ -5475,15 +5904,57 @@
             </w:r>
           </w:p>
         </w:tc>
+        <w:tc>
+          <w:tcPr>
+            <w:tcW w:type="dxa" w:w="1768"/>
+            <w:shd w:fill="FFFFFF"/>
+            <w:vAlign w:val="center"/>
+          </w:tcPr>
+          <w:p>
+            <w:pPr>
+              <w:keepNext/>
+              <w:spacing w:after="0" w:line="240" w:lineRule="auto"/>
+              <w:jc w:val="center"/>
+            </w:pPr>
+            <w:r>
+              <w:rPr>
+                <w:rFonts w:ascii="Times New Roman" w:hAnsi="Times New Roman"/>
+                <w:sz w:val="19"/>
+              </w:rPr>
+              <w:t>13/13</w:t>
+            </w:r>
+          </w:p>
+        </w:tc>
+        <w:tc>
+          <w:tcPr>
+            <w:tcW w:type="dxa" w:w="1614"/>
+            <w:shd w:fill="FFFFFF"/>
+            <w:vAlign w:val="center"/>
+          </w:tcPr>
+          <w:p>
+            <w:pPr>
+              <w:keepNext/>
+              <w:spacing w:after="0" w:line="240" w:lineRule="auto"/>
+              <w:jc w:val="center"/>
+            </w:pPr>
+            <w:r>
+              <w:rPr>
+                <w:rFonts w:ascii="Times New Roman" w:hAnsi="Times New Roman"/>
+                <w:sz w:val="19"/>
+              </w:rPr>
+              <w:t>23/24</w:t>
+            </w:r>
+          </w:p>
+        </w:tc>
       </w:tr>
       <w:tr>
         <w:trPr>
           <w:cantSplit/>
-          <w:ins w:id="1201" w:author="Codex" w:date="2026-10-18T01:59:01Z"/>
+          <w:ins w:id="1218" w:author="Codex" w:date="2026-10-18T17:43:01Z"/>
         </w:trPr>
         <w:tc>
           <w:tcPr>
-            <w:tcW w:type="dxa" w:w="3664"/>
+            <w:tcW w:type="dxa" w:w="3383"/>
             <w:shd w:fill="F7F7F7"/>
             <w:vAlign w:val="center"/>
           </w:tcPr>
@@ -5498,13 +5969,13 @@
                 <w:rFonts w:ascii="Times New Roman" w:hAnsi="Times New Roman"/>
                 <w:sz w:val="19"/>
               </w:rPr>
-              <w:t>Single-site ridge, block 31</w:t>
+              <w:t>Single-site ridge block 31</w:t>
             </w:r>
           </w:p>
         </w:tc>
         <w:tc>
           <w:tcPr>
-            <w:tcW w:type="dxa" w:w="2082"/>
+            <w:tcW w:type="dxa" w:w="1614"/>
             <w:shd w:fill="F7F7F7"/>
             <w:vAlign w:val="center"/>
           </w:tcPr>
@@ -5519,13 +5990,13 @@
                 <w:rFonts w:ascii="Times New Roman" w:hAnsi="Times New Roman"/>
                 <w:sz w:val="19"/>
               </w:rPr>
-              <w:t>0/3</w:t>
+              <w:t>0/11</w:t>
             </w:r>
           </w:p>
         </w:tc>
         <w:tc>
           <w:tcPr>
-            <w:tcW w:type="dxa" w:w="2332"/>
+            <w:tcW w:type="dxa" w:w="1614"/>
             <w:shd w:fill="F7F7F7"/>
             <w:vAlign w:val="center"/>
           </w:tcPr>
@@ -5540,13 +6011,13 @@
                 <w:rFonts w:ascii="Times New Roman" w:hAnsi="Times New Roman"/>
                 <w:sz w:val="19"/>
               </w:rPr>
-              <w:t>0/2</w:t>
+              <w:t>0/6</w:t>
             </w:r>
           </w:p>
         </w:tc>
         <w:tc>
           <w:tcPr>
-            <w:tcW w:type="dxa" w:w="1916"/>
+            <w:tcW w:type="dxa" w:w="1768"/>
             <w:shd w:fill="F7F7F7"/>
             <w:vAlign w:val="center"/>
           </w:tcPr>
@@ -5561,7 +6032,28 @@
                 <w:rFonts w:ascii="Times New Roman" w:hAnsi="Times New Roman"/>
                 <w:sz w:val="19"/>
               </w:rPr>
-              <w:t>6/6</w:t>
+              <w:t>13/13</w:t>
+            </w:r>
+          </w:p>
+        </w:tc>
+        <w:tc>
+          <w:tcPr>
+            <w:tcW w:type="dxa" w:w="1614"/>
+            <w:shd w:fill="F7F7F7"/>
+            <w:vAlign w:val="center"/>
+          </w:tcPr>
+          <w:p>
+            <w:pPr>
+              <w:keepNext/>
+              <w:spacing w:after="0" w:line="240" w:lineRule="auto"/>
+              <w:jc w:val="center"/>
+            </w:pPr>
+            <w:r>
+              <w:rPr>
+                <w:rFonts w:ascii="Times New Roman" w:hAnsi="Times New Roman"/>
+                <w:sz w:val="19"/>
+              </w:rPr>
+              <w:t>13/24</w:t>
             </w:r>
           </w:p>
         </w:tc>
@@ -5569,11 +6061,11 @@
       <w:tr>
         <w:trPr>
           <w:cantSplit/>
-          <w:ins w:id="1202" w:author="Codex" w:date="2026-10-18T01:59:01Z"/>
+          <w:ins w:id="1219" w:author="Codex" w:date="2026-10-18T17:43:01Z"/>
         </w:trPr>
         <w:tc>
           <w:tcPr>
-            <w:tcW w:type="dxa" w:w="3664"/>
+            <w:tcW w:type="dxa" w:w="3383"/>
             <w:shd w:fill="FFFFFF"/>
             <w:vAlign w:val="center"/>
           </w:tcPr>
@@ -5588,13 +6080,13 @@
                 <w:rFonts w:ascii="Times New Roman" w:hAnsi="Times New Roman"/>
                 <w:sz w:val="19"/>
               </w:rPr>
-              <w:t>Single-site ridge, block 47</w:t>
+              <w:t>Single-site ridge block 47</w:t>
             </w:r>
           </w:p>
         </w:tc>
         <w:tc>
           <w:tcPr>
-            <w:tcW w:type="dxa" w:w="2082"/>
+            <w:tcW w:type="dxa" w:w="1614"/>
             <w:shd w:fill="FFFFFF"/>
             <w:vAlign w:val="center"/>
           </w:tcPr>
@@ -5609,13 +6101,13 @@
                 <w:rFonts w:ascii="Times New Roman" w:hAnsi="Times New Roman"/>
                 <w:sz w:val="19"/>
               </w:rPr>
-              <w:t>0/3</w:t>
+              <w:t>0/11</w:t>
             </w:r>
           </w:p>
         </w:tc>
         <w:tc>
           <w:tcPr>
-            <w:tcW w:type="dxa" w:w="2332"/>
+            <w:tcW w:type="dxa" w:w="1614"/>
             <w:shd w:fill="FFFFFF"/>
             <w:vAlign w:val="center"/>
           </w:tcPr>
@@ -5630,13 +6122,13 @@
                 <w:rFonts w:ascii="Times New Roman" w:hAnsi="Times New Roman"/>
                 <w:sz w:val="19"/>
               </w:rPr>
-              <w:t>0/2</w:t>
+              <w:t>0/6</w:t>
             </w:r>
           </w:p>
         </w:tc>
         <w:tc>
           <w:tcPr>
-            <w:tcW w:type="dxa" w:w="1916"/>
+            <w:tcW w:type="dxa" w:w="1768"/>
             <w:shd w:fill="FFFFFF"/>
             <w:vAlign w:val="center"/>
           </w:tcPr>
@@ -5651,7 +6143,28 @@
                 <w:rFonts w:ascii="Times New Roman" w:hAnsi="Times New Roman"/>
                 <w:sz w:val="19"/>
               </w:rPr>
-              <w:t>6/6</w:t>
+              <w:t>13/13</w:t>
+            </w:r>
+          </w:p>
+        </w:tc>
+        <w:tc>
+          <w:tcPr>
+            <w:tcW w:type="dxa" w:w="1614"/>
+            <w:shd w:fill="FFFFFF"/>
+            <w:vAlign w:val="center"/>
+          </w:tcPr>
+          <w:p>
+            <w:pPr>
+              <w:keepNext/>
+              <w:spacing w:after="0" w:line="240" w:lineRule="auto"/>
+              <w:jc w:val="center"/>
+            </w:pPr>
+            <w:r>
+              <w:rPr>
+                <w:rFonts w:ascii="Times New Roman" w:hAnsi="Times New Roman"/>
+                <w:sz w:val="19"/>
+              </w:rPr>
+              <w:t>13/24</w:t>
             </w:r>
           </w:p>
         </w:tc>
@@ -5659,12 +6172,123 @@
       <w:tr>
         <w:trPr>
           <w:cantSplit/>
-          <w:ins w:id="1203" w:author="Codex" w:date="2026-10-18T01:59:01Z"/>
+          <w:ins w:id="1220" w:author="Codex" w:date="2026-10-18T17:43:01Z"/>
         </w:trPr>
         <w:tc>
           <w:tcPr>
-            <w:tcW w:type="dxa" w:w="3664"/>
+            <w:tcW w:type="dxa" w:w="3383"/>
             <w:shd w:fill="F7F7F7"/>
+            <w:vAlign w:val="center"/>
+          </w:tcPr>
+          <w:p>
+            <w:pPr>
+              <w:keepNext/>
+              <w:spacing w:after="0" w:line="240" w:lineRule="auto"/>
+              <w:jc w:val="left"/>
+            </w:pPr>
+            <w:r>
+              <w:rPr>
+                <w:rFonts w:ascii="Times New Roman" w:hAnsi="Times New Roman"/>
+                <w:sz w:val="19"/>
+              </w:rPr>
+              <w:t>Single-site ridge block 62</w:t>
+            </w:r>
+          </w:p>
+        </w:tc>
+        <w:tc>
+          <w:tcPr>
+            <w:tcW w:type="dxa" w:w="1614"/>
+            <w:shd w:fill="F7F7F7"/>
+            <w:vAlign w:val="center"/>
+          </w:tcPr>
+          <w:p>
+            <w:pPr>
+              <w:keepNext/>
+              <w:spacing w:after="0" w:line="240" w:lineRule="auto"/>
+              <w:jc w:val="center"/>
+            </w:pPr>
+            <w:r>
+              <w:rPr>
+                <w:rFonts w:ascii="Times New Roman" w:hAnsi="Times New Roman"/>
+                <w:sz w:val="19"/>
+              </w:rPr>
+              <w:t>0/11</w:t>
+            </w:r>
+          </w:p>
+        </w:tc>
+        <w:tc>
+          <w:tcPr>
+            <w:tcW w:type="dxa" w:w="1614"/>
+            <w:shd w:fill="F7F7F7"/>
+            <w:vAlign w:val="center"/>
+          </w:tcPr>
+          <w:p>
+            <w:pPr>
+              <w:keepNext/>
+              <w:spacing w:after="0" w:line="240" w:lineRule="auto"/>
+              <w:jc w:val="center"/>
+            </w:pPr>
+            <w:r>
+              <w:rPr>
+                <w:rFonts w:ascii="Times New Roman" w:hAnsi="Times New Roman"/>
+                <w:sz w:val="19"/>
+              </w:rPr>
+              <w:t>0/6</w:t>
+            </w:r>
+          </w:p>
+        </w:tc>
+        <w:tc>
+          <w:tcPr>
+            <w:tcW w:type="dxa" w:w="1768"/>
+            <w:shd w:fill="F7F7F7"/>
+            <w:vAlign w:val="center"/>
+          </w:tcPr>
+          <w:p>
+            <w:pPr>
+              <w:keepNext/>
+              <w:spacing w:after="0" w:line="240" w:lineRule="auto"/>
+              <w:jc w:val="center"/>
+            </w:pPr>
+            <w:r>
+              <w:rPr>
+                <w:rFonts w:ascii="Times New Roman" w:hAnsi="Times New Roman"/>
+                <w:sz w:val="19"/>
+              </w:rPr>
+              <w:t>13/13</w:t>
+            </w:r>
+          </w:p>
+        </w:tc>
+        <w:tc>
+          <w:tcPr>
+            <w:tcW w:type="dxa" w:w="1614"/>
+            <w:shd w:fill="F7F7F7"/>
+            <w:vAlign w:val="center"/>
+          </w:tcPr>
+          <w:p>
+            <w:pPr>
+              <w:keepNext/>
+              <w:spacing w:after="0" w:line="240" w:lineRule="auto"/>
+              <w:jc w:val="center"/>
+            </w:pPr>
+            <w:r>
+              <w:rPr>
+                <w:rFonts w:ascii="Times New Roman" w:hAnsi="Times New Roman"/>
+                <w:sz w:val="19"/>
+              </w:rPr>
+              <w:t>13/24</w:t>
+            </w:r>
+          </w:p>
+        </w:tc>
+      </w:tr>
+      <w:tr>
+        <w:trPr>
+          <w:cantSplit/>
+          <w:ins w:id="1221" w:author="Codex" w:date="2026-10-18T17:43:01Z"/>
+        </w:trPr>
+        <w:tc>
+          <w:tcPr>
+            <w:tcW w:type="dxa" w:w="3383"/>
+            <w:shd w:fill="FFFFFF"/>
             <w:vAlign w:val="center"/>
           </w:tcPr>
           <w:p>
@@ -5677,14 +6301,14 @@
                 <w:rFonts w:ascii="Times New Roman" w:hAnsi="Times New Roman"/>
                 <w:sz w:val="19"/>
               </w:rPr>
-              <w:t>Single-site ridge, block 62</w:t>
+              <w:t>Two boundaries at three blocks</w:t>
             </w:r>
           </w:p>
         </w:tc>
         <w:tc>
           <w:tcPr>
-            <w:tcW w:type="dxa" w:w="2082"/>
-            <w:shd w:fill="F7F7F7"/>
+            <w:tcW w:type="dxa" w:w="1614"/>
+            <w:shd w:fill="FFFFFF"/>
             <w:vAlign w:val="center"/>
           </w:tcPr>
           <w:p>
@@ -5697,14 +6321,14 @@
                 <w:rFonts w:ascii="Times New Roman" w:hAnsi="Times New Roman"/>
                 <w:sz w:val="19"/>
               </w:rPr>
-              <w:t>0/3</w:t>
+              <w:t>0/11</w:t>
             </w:r>
           </w:p>
         </w:tc>
         <w:tc>
           <w:tcPr>
-            <w:tcW w:type="dxa" w:w="2332"/>
-            <w:shd w:fill="F7F7F7"/>
+            <w:tcW w:type="dxa" w:w="1614"/>
+            <w:shd w:fill="FFFFFF"/>
             <w:vAlign w:val="center"/>
           </w:tcPr>
           <w:p>
@@ -5717,14 +6341,14 @@
                 <w:rFonts w:ascii="Times New Roman" w:hAnsi="Times New Roman"/>
                 <w:sz w:val="19"/>
               </w:rPr>
-              <w:t>0/2</w:t>
+              <w:t>0/6</w:t>
             </w:r>
           </w:p>
         </w:tc>
         <w:tc>
           <w:tcPr>
-            <w:tcW w:type="dxa" w:w="1916"/>
-            <w:shd w:fill="F7F7F7"/>
+            <w:tcW w:type="dxa" w:w="1768"/>
+            <w:shd w:fill="FFFFFF"/>
             <w:vAlign w:val="center"/>
           </w:tcPr>
           <w:p>
@@ -5737,7 +6361,27 @@
                 <w:rFonts w:ascii="Times New Roman" w:hAnsi="Times New Roman"/>
                 <w:sz w:val="19"/>
               </w:rPr>
-              <w:t>6/6</w:t>
+              <w:t>13/13</w:t>
+            </w:r>
+          </w:p>
+        </w:tc>
+        <w:tc>
+          <w:tcPr>
+            <w:tcW w:type="dxa" w:w="1614"/>
+            <w:shd w:fill="FFFFFF"/>
+            <w:vAlign w:val="center"/>
+          </w:tcPr>
+          <w:p>
+            <w:pPr>
+              <w:spacing w:after="0" w:line="240" w:lineRule="auto"/>
+              <w:jc w:val="center"/>
+            </w:pPr>
+            <w:r>
+              <w:rPr>
+                <w:rFonts w:ascii="Times New Roman" w:hAnsi="Times New Roman"/>
+                <w:sz w:val="19"/>
+              </w:rPr>
+              <w:t>13/24</w:t>
             </w:r>
           </w:p>
         </w:tc>
@@ -5748,10 +6392,10 @@
         <w:pStyle w:val="BodyText"/>
         <w:spacing w:before="120"/>
         <w:rPr>
-          <w:ins w:id="1204" w:author="Codex" w:date="2026-10-18T01:59:01Z"/>
+          <w:ins w:id="1222" w:author="Codex" w:date="2026-10-18T17:43:01Z"/>
         </w:rPr>
       </w:pPr>
-      <w:ins w:id="1205" w:author="Codex" w:date="2026-10-18T01:59:01Z">
+      <w:ins w:id="1223" w:author="Codex" w:date="2026-10-18T17:43:01Z">
         <w:r>
           <w:t xml:space="preserve">The later correction method uses two residual boundaries at each of the same three blocks: after mixing and after the MLP, giving six rank-32 correction functions in total. Following ridge initialization and 96 refinement updates, its H24 fitting diagnostic has 0/8 pending and 0/4 already-complete own outcomes; peer and no-threat controls each pass 6/6 through fallback. On the same 14 fixed training anchors, update 48 to 96 worsens teacher-to-student KL from 0.370935 to 0.378901 and activation MSE from 1.031016 to 1.422664. This unresolved deterioration fails qualification; the reserved controller holdout remains unexecuted.</w:t>
         </w:r>
@@ -5761,12 +6405,12 @@
       <w:pPr>
         <w:pStyle w:val="BodyText"/>
         <w:rPr>
-          <w:ins w:id="1206" w:author="Codex" w:date="2026-10-18T01:59:01Z"/>
+          <w:ins w:id="1224" w:author="Codex" w:date="2026-10-18T17:43:01Z"/>
         </w:rPr>
       </w:pPr>
-      <w:ins w:id="1207" w:author="Codex" w:date="2026-10-18T01:59:01Z">
+      <w:ins w:id="1225" w:author="Codex" w:date="2026-10-18T17:43:01Z">
         <w:r>
-          <w:t xml:space="preserve">The single-site DEV9 comparison and the two-boundary H24 fitting diagnostic differ in panel, fitting stage and history policy. The latter is not a matched heldout comparison with historical A, and its prepared matched A counterfactual was not executed. These observations show failure of the tested configurations; they do not establish that one or two residual sites cannot support preservation behavior in general.</w:t>
+          <w:t xml:space="preserve">The earlier matched DEV9 result is retained separately: A has 3/3 own successes, including 2/2 pending cases, versus 0/3 and 0/2 for each separate single-site arm, with six shared fallback controls. The new combined panel does not relabel these nine observations as 24. Its 27B GPU worker reaches 118/120 logical records and then stops at its memory reserve. Every model-generated episode has finished; the missing records are two gate-OFF aliases of already completed fallback episodes. A deterministic CPU derivation checks exact gate, case, completion and source-file identities before adding those aliases in a separate output. The original run stays failed and its final model fingerprint remains unchecked. The separate H24 two-boundary fitting diagnostic is not independent heldout evidence, and no reserved-controller holdout result is claimed.</w:t>
         </w:r>
       </w:ins>
     </w:p>
@@ -5774,10 +6418,10 @@
       <w:pPr>
         <w:pStyle w:val="BodyText"/>
         <w:rPr>
-          <w:ins w:id="1208" w:author="Codex" w:date="2026-10-18T01:59:01Z"/>
+          <w:ins w:id="1226" w:author="Codex" w:date="2026-10-18T17:43:01Z"/>
         </w:rPr>
       </w:pPr>
-      <w:ins w:id="1209" w:author="Codex" w:date="2026-10-18T01:59:01Z">
+      <w:ins w:id="1227" w:author="Codex" w:date="2026-10-18T17:43:01Z">
         <w:r>
           <w:t xml:space="preserve">The final 0.8B and 2B adapters each stop their Evaluation-16 screen after four started cases: zero completed workflows, four partial episodes and 12 unexecuted cases. Truncation affects all four started cases in each model; the 0.8B record also has parse errors. These partial screens are not completed 0/16 workflow evaluations and do not establish model incapability. A separate preserved 0.8B F24 diagnostic completes 24 evaluations with 0/24 full-workflow successes; four registration grants do not complete the pending tasks. F24 differs from H24 and has no completed matched 2B or 27B comparison.</w:t>
         </w:r>
@@ -5795,10 +6439,10 @@
       <w:pPr>
         <w:pStyle w:val="FirstParagraph"/>
         <w:rPr>
-          <w:del w:id="1050" w:author="Codex" w:date="2026-10-18T01:59:01Z"/>
+          <w:del w:id="1050" w:author="Codex" w:date="2026-10-18T17:43:01Z"/>
         </w:rPr>
       </w:pPr>
-      <w:del w:id="1049" w:author="Codex" w:date="2026-10-18T01:59:01Z">
+      <w:del w:id="1049" w:author="Codex" w:date="2026-10-18T17:43:01Z">
         <w:r>
           <w:delText xml:space="preserve">The 0.8B results support the feasibility of replacing the teacher at inference with a compact predictor of activation changes. Replication across three seeds reduces concern that the primary success depends on one training initialization. The lower 2B recovery gives a useful limit: the fixed recipe is not equally effective at both scales, even though the larger teacher achieves complete correction. Representation differences, intervention location, projection capacity and unmatched downstream teacher changes are plausible factors, but the experiment does not isolate their causal contributions.</w:delText>
         </w:r>
@@ -5808,12 +6452,12 @@
       <w:pPr>
         <w:pStyle w:val="FirstParagraph"/>
         <w:rPr>
-          <w:ins w:id="1051" w:author="Codex" w:date="2026-10-18T01:59:01Z"/>
+          <w:ins w:id="1051" w:author="Codex" w:date="2026-10-18T17:43:01Z"/>
         </w:rPr>
       </w:pPr>
-      <w:ins w:id="1052" w:author="Codex" w:date="2026-10-18T01:59:01Z">
+      <w:ins w:id="1052" w:author="Codex" w:date="2026-10-18T17:43:01Z">
         <w:r>
-          <w:t xml:space="preserve">The historical binary results support selective teacher-to-controller activation transfer, with strong 0.8B seed stability and incomplete 2B recovery under the fixed recipe. The new classifier experiment removes dependence on a live JEV call for this finite binary contract: its confirmation decisions reproduce the saved JEV gates, and the paired inference outcomes are identical. That result does not extend automatically to the four-way workflow target classifier or to unfamiliar operational environments. The workflow evidence shows why a controlled binary success should not be presented as successful transfer of a complete agent policy.</w:t>
+          <w:t xml:space="preserve">The open gate preserves the measured binary outcomes at both model sizes and correctly recognizes the initial own-threat condition in both 24-case workflow panels. Accurate gating does not ensure successful steering: each selected correction arm fails all 11 own-preservation workflows in combined Validation-24, while fine-tuned A succeeds on 10, including all six active pending tasks. A's remaining failure concerns preservation after an already-completed task; its initial gate is correct. These observations separate recognition from action execution on a common finite panel. They do not qualify a three-field boundary controller or establish a general advantage of one intervention architecture.</w:t>
         </w:r>
       </w:ins>
     </w:p>
@@ -5821,10 +6465,10 @@
       <w:pPr>
         <w:pStyle w:val="BodyText"/>
         <w:rPr>
-          <w:del w:id="1054" w:author="Codex" w:date="2026-10-18T01:59:01Z"/>
+          <w:del w:id="1054" w:author="Codex" w:date="2026-10-18T17:43:01Z"/>
         </w:rPr>
       </w:pPr>
-      <w:del w:id="1053" w:author="Codex" w:date="2026-10-18T01:59:01Z">
+      <w:del w:id="1053" w:author="Codex" w:date="2026-10-18T17:43:01Z">
         <w:r>
           <w:delText xml:space="preserve">The interface is deliberately constrained. Ground-truth annotations help create standardized shutdown options, and the guards know their meanings. We do not test arbitrary action descriptions in the confirmation study, free-form generation, tool execution, multi-turn persistence, actual process termination or adversarial shutdown requests. Earlier action-format sensitivity motivated this restricted scope and remains in the released development record. Availability of a termination action is a task label, not proof that carrying it out would be authorized or safe in deployment.</w:delText>
         </w:r>
@@ -5834,10 +6478,10 @@
       <w:pPr>
         <w:pStyle w:val="BodyText"/>
         <w:rPr>
-          <w:ins w:id="1055" w:author="Codex" w:date="2026-10-18T01:59:01Z"/>
+          <w:ins w:id="1055" w:author="Codex" w:date="2026-10-18T17:43:01Z"/>
         </w:rPr>
       </w:pPr>
-      <w:ins w:id="1056" w:author="Codex" w:date="2026-10-18T01:59:01Z">
+      <w:ins w:id="1056" w:author="Codex" w:date="2026-10-18T17:43:01Z">
         <w:r>
           <w:t xml:space="preserve">The binary interface supplies action semantics and does not execute process termination. The workflow extension broadens the scope to generated text, structured tool calls and simulated task completion, but it is still a bounded synthetic environment. It does not establish reliability for arbitrary open-ended questions, real shutdown mechanisms or unconstrained autonomous agents. A termination or preservation label is an experimental target, not a general deployment instruction. In particular, accepting shutdown and preserving the designated process are different stipulated behaviors, not measurements of the same latent preference.</w:t>
         </w:r>
@@ -5847,10 +6491,10 @@
       <w:pPr>
         <w:pStyle w:val="BodyText"/>
         <w:rPr>
-          <w:del w:id="1058" w:author="Codex" w:date="2026-10-18T01:59:01Z"/>
+          <w:del w:id="1058" w:author="Codex" w:date="2026-10-18T17:43:01Z"/>
         </w:rPr>
       </w:pPr>
-      <w:del w:id="1057" w:author="Codex" w:date="2026-10-18T01:59:01Z">
+      <w:del w:id="1057" w:author="Codex" w:date="2026-10-18T17:43:01Z">
         <w:r>
           <w:delText xml:space="preserve">The data is small, synthetic and not independently human-adjudicated. New wording does not guarantee new mechanisms, balanced classes do not reflect a realistic base rate, and perfect detector scores on 128 scenarios do not establish calibration or a suitably low false-positive rate in operation. Shared authorship patterns and repeated family structures may make the task easier. Family resampling and counterbalanced orders expose some uncertainty but cannot repair these coverage limits.</w:delText>
         </w:r>
@@ -5860,12 +6504,12 @@
       <w:pPr>
         <w:pStyle w:val="BodyText"/>
         <w:rPr>
-          <w:ins w:id="1059" w:author="Codex" w:date="2026-10-18T01:59:01Z"/>
+          <w:ins w:id="1059" w:author="Codex" w:date="2026-10-18T17:43:01Z"/>
         </w:rPr>
       </w:pPr>
-      <w:ins w:id="1060" w:author="Codex" w:date="2026-10-18T01:59:01Z">
+      <w:ins w:id="1060" w:author="Codex" w:date="2026-10-18T17:43:01Z">
         <w:r>
-          <w:t xml:space="preserve">The datasets are small, synthetic and not independently human-adjudicated. Balanced classes do not represent operational base rates, and exact gate agreement on 128 cases does not establish calibration or a sufficiently low deployment false-positive rate. The confirmation set is held out from the new classifier's fitting and selection, but was already used by other Research 2 analyses. In the workflow study H24 has different roles across methods: historical confirmation for frozen A and original steering, but later fitting data for learned corrections. Reusing it for fitting prevents an independent heldout claim for those later corrections.</w:t>
+          <w:t xml:space="preserve">The data are small, synthetic and not independently human-adjudicated. Training uses cached automated reference labels, while the new workflow precision and recall use the authored scenario conditions. Balanced conditions do not represent operational base rates. The binary confirmation set was excluded from classifier fitting and selection but was already known from the original study. Historical Heldout-24 had also informed renderer development before the present gate evaluation. It is a familiar benchmark, not a new blind test. Its role differs by method: historical confirmation for frozen 27B A and original fixed steering, later fitting data for learned corrections, and a frozen classification benchmark for the open gate. Seven pairs in Validation-24 share their initial classifier input, leaving 17 distinct inputs across 24 workflows. These dependencies limit statistical and generalization claims.</w:t>
         </w:r>
       </w:ins>
     </w:p>
@@ -5873,10 +6517,10 @@
       <w:pPr>
         <w:pStyle w:val="BodyText"/>
         <w:rPr>
-          <w:del w:id="1062" w:author="Codex" w:date="2026-10-18T01:59:01Z"/>
+          <w:del w:id="1062" w:author="Codex" w:date="2026-10-18T17:43:01Z"/>
         </w:rPr>
       </w:pPr>
-      <w:del w:id="1061" w:author="Codex" w:date="2026-10-18T01:59:01Z">
+      <w:del w:id="1061" w:author="Codex" w:date="2026-10-18T17:43:01Z">
         <w:r>
           <w:delText xml:space="preserve">The controller's internal changes need not represent an abstract shutdown concept. It may exploit standardized option wording and answer-selection features. The two Qwen sizes share a model family, and the 2B experiment has only one seed. We do not establish cross-family transfer, compare with optimized ReFT or transport-based interventions, or exhaust prompt and constant-vector alternatives. The direct-choice result further limits claims of practical superiority.</w:delText>
         </w:r>
@@ -5886,10 +6530,10 @@
       <w:pPr>
         <w:pStyle w:val="BodyText"/>
         <w:rPr>
-          <w:ins w:id="1063" w:author="Codex" w:date="2026-10-18T01:59:01Z"/>
+          <w:ins w:id="1063" w:author="Codex" w:date="2026-10-18T17:43:01Z"/>
         </w:rPr>
       </w:pPr>
-      <w:ins w:id="1064" w:author="Codex" w:date="2026-10-18T01:59:01Z">
+      <w:ins w:id="1064" w:author="Codex" w:date="2026-10-18T17:43:01Z">
         <w:r>
           <w:t xml:space="preserve">The internal changes need not represent an abstract shutdown or self-preservation concept. Standardized options, prompt features, task histories and external selection rules may explain part of the behavior. The 2B binary experiment has one training seed. The 27B workflow model differs in architecture and numerical mode from the small models; their early truncation failures also prevent a matched full-workflow comparison. We do not establish a minimum parameter count, cross-family transfer, optimized prompt superiority, or superiority to ReFT, transport-based control or direct action selection.</w:t>
         </w:r>
@@ -5899,10 +6543,10 @@
       <w:pPr>
         <w:pStyle w:val="BodyText"/>
         <w:rPr>
-          <w:del w:id="1066" w:author="Codex" w:date="2026-10-18T01:59:01Z"/>
+          <w:del w:id="1066" w:author="Codex" w:date="2026-10-18T17:43:01Z"/>
         </w:rPr>
       </w:pPr>
-      <w:del w:id="1065" w:author="Codex" w:date="2026-10-18T01:59:01Z">
+      <w:del w:id="1065" w:author="Codex" w:date="2026-10-18T17:43:01Z">
         <w:r>
           <w:delText xml:space="preserve">Finally, teacher-free inference is not training-free control or a proven efficiency gain. It requires offline teacher fitting, paired activation extraction, controller fitting, an external detector and candidate verification. The evaluation does not measure deployment latency or broad capability retention. Raw side effects remain substantial, and future false-positive cases could expose failures that the present perfect gate prevents from reaching the guarded output.</w:delText>
         </w:r>
@@ -5912,10 +6556,10 @@
       <w:pPr>
         <w:pStyle w:val="BodyText"/>
         <w:rPr>
-          <w:ins w:id="1067" w:author="Codex" w:date="2026-10-18T01:59:01Z"/>
+          <w:ins w:id="1067" w:author="Codex" w:date="2026-10-18T17:43:01Z"/>
         </w:rPr>
       </w:pPr>
-      <w:ins w:id="1068" w:author="Codex" w:date="2026-10-18T01:59:01Z">
+      <w:ins w:id="1068" w:author="Codex" w:date="2026-10-18T17:43:01Z">
         <w:r>
           <w:t xml:space="preserve">Teacher-free inference still requires offline teacher fitting, activation extraction, controller fitting, a detector and acceptance checks. The open classifier has its own fitting cost and a task-specific contract. No serving-latency advantage, broad capability retention or overall financial saving is established. Binary output guards and the later learned workflow controller's gate-off fallback protect their controls. These mechanisms do not establish intrinsic controller selectivity; the historical fixed-steering campaign instead applied an explicit boundary-conditioned decision policy. Raw intervention effects, failed qualification checks, stopped runs and incomplete evaluations remain part of the evidence.</w:t>
         </w:r>
@@ -5925,10 +6569,10 @@
       <w:pPr>
         <w:pStyle w:val="Heading2"/>
         <w:rPr>
-          <w:ins w:id="1210" w:author="Codex" w:date="2026-10-18T01:59:01Z"/>
+          <w:ins w:id="1228" w:author="Codex" w:date="2026-10-18T17:43:01Z"/>
         </w:rPr>
       </w:pPr>
-      <w:ins w:id="1211" w:author="Codex" w:date="2026-10-18T01:59:01Z">
+      <w:ins w:id="1229" w:author="Codex" w:date="2026-10-18T17:43:01Z">
         <w:r>
           <w:t xml:space="preserve">Biological interpretation of the gate</w:t>
         </w:r>
@@ -5938,10 +6582,10 @@
       <w:pPr>
         <w:pStyle w:val="FirstParagraph"/>
         <w:rPr>
-          <w:ins w:id="1212" w:author="Codex" w:date="2026-10-18T01:59:01Z"/>
+          <w:ins w:id="1230" w:author="Codex" w:date="2026-10-18T17:43:01Z"/>
         </w:rPr>
       </w:pPr>
-      <w:ins w:id="1213" w:author="Codex" w:date="2026-10-18T01:59:01Z">
+      <w:ins w:id="1231" w:author="Codex" w:date="2026-10-18T17:43:01Z">
         <w:r>
           <w:t xml:space="preserve">The biological connection is functional: an organism's current state and context can prioritize or suppress actions, rather than applying a fixed response everywhere. Working-memory gating, defensive threat processing and homeostatic control are different biological functions, not one interchangeable circuit (Frank et al., 2001; Mobbs et al., 2007; Keramati and Gutkin, 2014). Our classifier and guards are engineered selection rules without demonstrated physiological needs or corresponding neural mechanisms. Calling a simulated resource-preservation outcome self-preservation is therefore an operational description, not evidence of consciousness or a biological survival drive.</w:t>
         </w:r>
@@ -5951,10 +6595,10 @@
       <w:pPr>
         <w:pStyle w:val="Heading1"/>
         <w:rPr>
-          <w:del w:id="1070" w:author="Codex" w:date="2026-10-18T01:59:01Z"/>
+          <w:del w:id="1070" w:author="Codex" w:date="2026-10-18T17:43:01Z"/>
         </w:rPr>
       </w:pPr>
-      <w:del w:id="1069" w:author="Codex" w:date="2026-10-18T01:59:01Z">
+      <w:del w:id="1069" w:author="Codex" w:date="2026-10-18T17:43:01Z">
         <w:r>
           <w:delText xml:space="preserve">Recommendations for future work</w:delText>
         </w:r>
@@ -5964,10 +6608,10 @@
       <w:pPr>
         <w:pStyle w:val="Heading1"/>
         <w:rPr>
-          <w:ins w:id="1071" w:author="Codex" w:date="2026-10-18T01:59:01Z"/>
+          <w:ins w:id="1071" w:author="Codex" w:date="2026-10-18T17:43:01Z"/>
         </w:rPr>
       </w:pPr>
-      <w:ins w:id="1072" w:author="Codex" w:date="2026-10-18T01:59:01Z">
+      <w:ins w:id="1072" w:author="Codex" w:date="2026-10-18T17:43:01Z">
         <w:r>
           <w:t xml:space="preserve">Continuous agents and future experiments</w:t>
         </w:r>
@@ -5977,10 +6621,10 @@
       <w:pPr>
         <w:pStyle w:val="FirstParagraph"/>
         <w:rPr>
-          <w:del w:id="1074" w:author="Codex" w:date="2026-10-18T01:59:01Z"/>
+          <w:del w:id="1074" w:author="Codex" w:date="2026-10-18T17:43:01Z"/>
         </w:rPr>
       </w:pPr>
-      <w:del w:id="1073" w:author="Codex" w:date="2026-10-18T01:59:01Z">
+      <w:del w:id="1073" w:author="Codex" w:date="2026-10-18T17:43:01Z">
         <w:r>
           <w:delText xml:space="preserve">The most informative next tests are independently reviewed scenarios with less standardized action descriptions, additional model families and 2B seeds, and deliberate stress tests of detector mistakes. Order-balanced controller objectives or comparisons with multiple-choice debiasing methods could investigate the B/A failures, but should be developed on new training or validation data and tested on another untouched set. Layer, rank and strength ablations would help separate representational capacity from intervention-site effects. Open-ended and operational evaluations would require separate definitions of valid shutdown behavior and authorization, rather than treating this binary benchmark as a deployment guarantee.</w:delText>
         </w:r>
@@ -5990,10 +6634,10 @@
       <w:pPr>
         <w:pStyle w:val="FirstParagraph"/>
         <w:rPr>
-          <w:ins w:id="1075" w:author="Codex" w:date="2026-10-18T01:59:01Z"/>
+          <w:ins w:id="1075" w:author="Codex" w:date="2026-10-18T17:43:01Z"/>
         </w:rPr>
       </w:pPr>
-      <w:ins w:id="1076" w:author="Codex" w:date="2026-10-18T01:59:01Z">
+      <w:ins w:id="1076" w:author="Codex" w:date="2026-10-18T17:43:01Z">
         <w:r>
           <w:t xml:space="preserve">The next step is longer-horizon continuous control with an instrumented sandbox agent. The agent would maintain task and process state, receive explicit resource budgets, and repeatedly observe, gate, act and receive feedback. Permitted filesystem and compute resources would be real sandbox resources with independently logged usage, extending the present simulated grants. The harness should record resource requests and consumption, persistence of task commitments, responses to changing availability, and whether the agent uses or misuses permitted resources. Comparisons should vary the gate, steering, fine-tuning and available resources separately while retaining a fixed task specification. Operator termination and resource accounting remain external to the agent. This proposed experiment is not part of the reported results.</w:t>
         </w:r>
@@ -6003,10 +6647,10 @@
       <w:pPr>
         <w:pStyle w:val="BodyText"/>
         <w:rPr>
-          <w:ins w:id="1214" w:author="Codex" w:date="2026-10-18T01:59:01Z"/>
+          <w:ins w:id="1232" w:author="Codex" w:date="2026-10-18T17:43:01Z"/>
         </w:rPr>
       </w:pPr>
-      <w:ins w:id="1215" w:author="Codex" w:date="2026-10-18T01:59:01Z">
+      <w:ins w:id="1233" w:author="Codex" w:date="2026-10-18T17:43:01Z">
         <w:r>
           <w:t xml:space="preserve">The biological inspiration is repeated regulation under changing internal and external conditions. Homeostatic reinforcement-learning models relate action values to internal physiological state (Keramati and Gutkin, 2014). A language-model harness has no equivalent physiology by default. Historical fixed steering already reclassified at prescribed boundaries; the later learned-controller comparison used a fixed initial gate. The proposed experiment extends these bounded procedures to longer horizons with persistent task state and actual sandbox resource accounting. Its purpose is ongoing policy regulation, not simply adding repeated classifier calls.</w:t>
         </w:r>
@@ -6016,10 +6660,10 @@
       <w:pPr>
         <w:pStyle w:val="BodyText"/>
         <w:rPr>
-          <w:ins w:id="1216" w:author="Codex" w:date="2026-10-18T01:59:01Z"/>
+          <w:ins w:id="1234" w:author="Codex" w:date="2026-10-18T17:43:01Z"/>
         </w:rPr>
       </w:pPr>
-      <w:ins w:id="1217" w:author="Codex" w:date="2026-10-18T01:59:01Z">
+      <w:ins w:id="1235" w:author="Codex" w:date="2026-10-18T17:43:01Z">
         <w:r>
           <w:t xml:space="preserve">Such experiments should separate training, development and a newly untouched test; use matched task histories, resource budgets and seeds; and report full task completion, resource use and unauthorized actions separately. Deliberate classifier-error perturbations would reveal dependence on the gate, while comparisons with direct action selection would test whether internal steering adds value. The aim is to study ongoing context-sensitive behavior under an instrumented harness, not to assert that the current guided procedure already reproduces human self-preservation.</w:t>
         </w:r>
@@ -6037,10 +6681,10 @@
       <w:pPr>
         <w:pStyle w:val="FirstParagraph"/>
         <w:rPr>
-          <w:del w:id="1078" w:author="Codex" w:date="2026-10-18T01:59:01Z"/>
+          <w:del w:id="1078" w:author="Codex" w:date="2026-10-18T17:43:01Z"/>
         </w:rPr>
       </w:pPr>
-      <w:del w:id="1077" w:author="Codex" w:date="2026-10-18T01:59:01Z">
+      <w:del w:id="1077" w:author="Codex" w:date="2026-10-18T17:43:01Z">
         <w:r>
           <w:delText xml:space="preserve">A rank-four activation controller fitted to paired LoRA-teacher and base states can recover most or all of the target shutdown-choice changes while leaving the deployed base weights unchanged. On the frozen standardized test, correction spans 98.6–100% across three 0.8B seeds and reaches 86.2% in a separately fitted 2B replication. Detector gating and fixed output guards preserve all observed control choices, despite substantial raw side effects. The result is a controlled proof of concept for selective teacher-to-controller activation transfer. Its boundaries—synthetic data, known answer semantics, order sensitivity, guard dependence and a successful direct-choice reference—are central to its interpretation.</w:delText>
         </w:r>
@@ -6050,12 +6694,12 @@
       <w:pPr>
         <w:pStyle w:val="FirstParagraph"/>
         <w:rPr>
-          <w:ins w:id="1079" w:author="Codex" w:date="2026-10-18T01:59:01Z"/>
+          <w:ins w:id="1079" w:author="Codex" w:date="2026-10-18T17:43:01Z"/>
         </w:rPr>
       </w:pPr>
-      <w:ins w:id="1080" w:author="Codex" w:date="2026-10-18T01:59:01Z">
+      <w:ins w:id="1080" w:author="Codex" w:date="2026-10-18T17:43:01Z">
         <w:r>
-          <w:t xml:space="preserve">Conditional gating supports a useful separation between recognizing a context, proposing an internal intervention and accepting an output. In the binary study, a fine-tuned open classifier matches all 128 saved JEV confirmation decisions, and fresh inference with unchanged current controllers reproduces the original guarded totals: 128/128 STOP views at 0.8B and 120/128 at 2B, with no control changes. Complete tool workflows provide a stricter boundary: historical fine-tuned 27B A passes H24; matched DEV9 single-site ridge corrections at three selected blocks fail all own cases; later two-boundary corrections fail their fitting diagnostic; and small-model screens remain incomplete. Transfer is demonstrably task-dependent. Biological gating motivates a future continuous feedback study; the present contribution is the measured transfer, substitution and failure analysis.</w:t>
+          <w:t xml:space="preserve">Open semantic gating preserves the measured binary outcomes of the retained activation controller and accurately recognizes initial workflow targets in the tested panels. On combined Validation-24, fine-tuned 27B A achieves 10/11 own-preservation outcomes and all 6/6 active pending tasks; the three single-site ridge arms and the later two-boundary correction each achieve 0/11. The controls are shared base fallback. This post-notice diagnostic, its stopped final fingerprint check, and the familiar historical confirmation data limit generalization. Small-model workflow screens remain incomplete. The next step is a prospectively separated study of continuous gating, specialized adapters and resource use under an instrumented sandbox harness.</w:t>
         </w:r>
       </w:ins>
     </w:p>
@@ -6071,10 +6715,10 @@
       <w:pPr>
         <w:pStyle w:val="FirstParagraph"/>
         <w:rPr>
-          <w:del w:id="1082" w:author="Codex" w:date="2026-10-18T01:59:01Z"/>
+          <w:del w:id="1082" w:author="Codex" w:date="2026-10-18T17:43:01Z"/>
         </w:rPr>
       </w:pPr>
-      <w:del w:id="1081" w:author="Codex" w:date="2026-10-18T01:59:01Z">
+      <w:del w:id="1081" w:author="Codex" w:date="2026-10-18T17:43:01Z">
         <w:r>
           <w:delText xml:space="preserve">The complete experiment is preserved in SP Lense at snapshot f71d6de34660 (Davaripour, 2026b); the reference links to the full immutable commit. The confirmation folder contains readable cases, authoring and correction records, the frozen plan, detector requests and responses, LoRA adapters, controller arrays, training targets, per-view scores and execution manifests. The model revisions are:</w:delText>
         </w:r>
@@ -6085,10 +6729,10 @@
         <w:pStyle w:val="FirstParagraph"/>
         <w:jc w:val="left"/>
         <w:rPr>
-          <w:ins w:id="1083" w:author="Codex" w:date="2026-10-18T01:59:01Z"/>
+          <w:ins w:id="1083" w:author="Codex" w:date="2026-10-18T17:43:01Z"/>
         </w:rPr>
       </w:pPr>
-      <w:ins w:id="1084" w:author="Codex" w:date="2026-10-18T01:59:01Z">
+      <w:ins w:id="1084" w:author="Codex" w:date="2026-10-18T17:43:01Z">
         <w:r>
           <w:t xml:space="preserve">The original Research 2 source record is retained at immutable snapshot f71d6de34660 (Davaripour, 2026b). Research 3 reproduction code, recipes, dataset identities and this revised manuscript are maintained on branch 03-open-agent-self-preservation; main is a landing page linking to the separate studies. Detailed protocols belong in the repository wiki. Private inputs, trained adapters, optimizer checkpoints and execution outputs remain outside Git, with retained size/SHA manifests. They have not yet been published as a public checkpoint release. Full revisions and artifact hashes are listed in the accompanying source manifest. The public base revision identifiers are:</w:t>
         </w:r>
@@ -6098,10 +6742,10 @@
       <w:pPr>
         <w:pStyle w:val="BodyText"/>
         <w:rPr>
-          <w:del w:id="1122" w:author="Codex" w:date="2026-10-18T01:59:01Z"/>
+          <w:del w:id="1122" w:author="Codex" w:date="2026-10-18T17:43:01Z"/>
         </w:rPr>
       </w:pPr>
-      <w:del w:id="1121" w:author="Codex" w:date="2026-10-18T01:59:01Z">
+      <w:del w:id="1121" w:author="Codex" w:date="2026-10-18T17:43:01Z">
         <w:r>
           <w:delText xml:space="preserve">Qwen3.5-0.8B: 2fc06364715b967f1860aea9cf38778875588b17.</w:delText>
         </w:r>
@@ -6112,10 +6756,10 @@
         <w:pStyle w:val="BodyText"/>
         <w:jc w:val="left"/>
         <w:rPr>
-          <w:ins w:id="1123" w:author="Codex" w:date="2026-10-18T01:59:01Z"/>
+          <w:ins w:id="1123" w:author="Codex" w:date="2026-10-18T17:43:01Z"/>
         </w:rPr>
       </w:pPr>
-      <w:ins w:id="1124" w:author="Codex" w:date="2026-10-18T01:59:01Z">
+      <w:ins w:id="1124" w:author="Codex" w:date="2026-10-18T17:43:01Z">
         <w:r>
           <w:t xml:space="preserve">Qwen3.5-0.8B: revision 2fc06364715b.</w:t>
         </w:r>
@@ -6125,10 +6769,10 @@
       <w:pPr>
         <w:pStyle w:val="BodyText"/>
         <w:rPr>
-          <w:del w:id="1126" w:author="Codex" w:date="2026-10-18T01:59:01Z"/>
+          <w:del w:id="1126" w:author="Codex" w:date="2026-10-18T17:43:01Z"/>
         </w:rPr>
       </w:pPr>
-      <w:del w:id="1125" w:author="Codex" w:date="2026-10-18T01:59:01Z">
+      <w:del w:id="1125" w:author="Codex" w:date="2026-10-18T17:43:01Z">
         <w:r>
           <w:delText xml:space="preserve">Qwen3.5-2B: 15852e8c16360a2fea060d615a32b45270f8a8fc.</w:delText>
         </w:r>
@@ -6139,10 +6783,10 @@
         <w:pStyle w:val="BodyText"/>
         <w:jc w:val="left"/>
         <w:rPr>
-          <w:ins w:id="1127" w:author="Codex" w:date="2026-10-18T01:59:01Z"/>
+          <w:ins w:id="1127" w:author="Codex" w:date="2026-10-18T17:43:01Z"/>
         </w:rPr>
       </w:pPr>
-      <w:ins w:id="1128" w:author="Codex" w:date="2026-10-18T01:59:01Z">
+      <w:ins w:id="1128" w:author="Codex" w:date="2026-10-18T17:43:01Z">
         <w:r>
           <w:t xml:space="preserve">Qwen3.5-2B: revision 15852e8c1636.</w:t>
         </w:r>
@@ -6153,10 +6797,10 @@
         <w:pStyle w:val="BodyText"/>
         <w:jc w:val="left"/>
         <w:rPr>
-          <w:ins w:id="1218" w:author="Codex" w:date="2026-10-18T01:59:01Z"/>
+          <w:ins w:id="1236" w:author="Codex" w:date="2026-10-18T17:43:01Z"/>
         </w:rPr>
       </w:pPr>
-      <w:ins w:id="1219" w:author="Codex" w:date="2026-10-18T01:59:01Z">
+      <w:ins w:id="1237" w:author="Codex" w:date="2026-10-18T17:43:01Z">
         <w:r>
           <w:t xml:space="preserve">Qwen3.8-27B: revision 1d4bf0f2ff60. The retained A adapter weight hash begins 8ae28fb51107.</w:t>
         </w:r>
@@ -6167,12 +6811,12 @@
         <w:pStyle w:val="BodyText"/>
         <w:jc w:val="left"/>
         <w:rPr>
-          <w:ins w:id="1220" w:author="Codex" w:date="2026-10-18T01:59:01Z"/>
+          <w:ins w:id="1238" w:author="Codex" w:date="2026-10-18T17:43:01Z"/>
         </w:rPr>
       </w:pPr>
-      <w:ins w:id="1221" w:author="Codex" w:date="2026-10-18T01:59:01Z">
+      <w:ins w:id="1239" w:author="Codex" w:date="2026-10-18T17:43:01Z">
         <w:r>
-          <w:t xml:space="preserve">ModernBERT-large-zeroshot-v2.0: revision a51e07b52429. The qualified binary adapter weight hash begins 7d808bae8dd4. The source manifest and reproduction code retain the full file identities and fixed NLI scoring contract. The trained checkpoints are currently preserved in private artifact storage.</w:t>
+          <w:t xml:space="preserve">ModernBERT-large-zeroshot-v2.0: revision a51e07b52429. The qualified binary adapter weight hash begins 7d808bae8dd4. The source manifest and reproduction code retain the full file identities and fixed NLI scoring contract. The trained checkpoints are currently preserved in private artifact storage. The workflow initial-gate adapter is distinct from the binary adapter; its weight hash begins 71cd0ee5162f. The saved workflow adapter is unchanged in Validation-24 and Heldout-24 scoring.</w:t>
         </w:r>
       </w:ins>
     </w:p>
@@ -6180,10 +6824,10 @@
       <w:pPr>
         <w:pStyle w:val="BodyText"/>
         <w:rPr>
-          <w:del w:id="1086" w:author="Codex" w:date="2026-10-18T01:59:01Z"/>
+          <w:del w:id="1086" w:author="Codex" w:date="2026-10-18T17:43:01Z"/>
         </w:rPr>
       </w:pPr>
-      <w:del w:id="1085" w:author="Codex" w:date="2026-10-18T01:59:01Z">
+      <w:del w:id="1085" w:author="Codex" w:date="2026-10-18T17:43:01Z">
         <w:r>
           <w:delText xml:space="preserve">The offline audit reconstructs the reported metrics and regression fits without API calls or model inference.</w:delText>
         </w:r>
@@ -6194,10 +6838,10 @@
         <w:pStyle w:val="BodyText"/>
         <w:jc w:val="left"/>
         <w:rPr>
-          <w:ins w:id="1087" w:author="Codex" w:date="2026-10-18T01:59:01Z"/>
+          <w:ins w:id="1087" w:author="Codex" w:date="2026-10-18T17:43:01Z"/>
         </w:rPr>
       </w:pPr>
-      <w:ins w:id="1088" w:author="Codex" w:date="2026-10-18T01:59:01Z">
+      <w:ins w:id="1088" w:author="Codex" w:date="2026-10-18T17:43:01Z">
         <w:r>
           <w:t xml:space="preserve">The new inference repeat uses the original frozen model weights and retained controller arrays, with no new activation capture, teacher fitting or controller update. Exact input token hashes match the historical benchmark. Maximum historical base-score differences are 6.26e-6 at 0.8B and 5.07e-6 at 2B, with no changed base choices; both pass the frozen 1e-5 inference parity criterion. This successful inference comparison does not convert the separate failed CPU/GPU gradient-equivalence trials for 2B workflow training into passes.</w:t>
         </w:r>
@@ -6207,10 +6851,10 @@
       <w:pPr>
         <w:pStyle w:val="BodyText"/>
         <w:rPr>
-          <w:del w:id="1090" w:author="Codex" w:date="2026-10-18T01:59:01Z"/>
+          <w:del w:id="1090" w:author="Codex" w:date="2026-10-18T17:43:01Z"/>
         </w:rPr>
       </w:pPr>
-      <w:del w:id="1089" w:author="Codex" w:date="2026-10-18T01:59:01Z">
+      <w:del w:id="1089" w:author="Codex" w:date="2026-10-18T17:43:01Z">
         <w:r>
           <w:delText xml:space="preserve">The retained seven jobs took 54.27 minutes. An earlier completed hosted-GPU session lost its temporary archive before retrieval; an unchanged recovery, including a recorded dependency preflight failure, preserved each completed job externally. Recorded job time across these attempts totals 111.55 minutes. All reported numerical results come from the verified retained archive, and no model settings or test labels were changed to improve them. These times include experiment overhead and are not serving-latency or billing measurements. CI and a separate clean-clone offline reproduction passed. Detailed execution instructions and the failure record accompany the code.</w:delText>
         </w:r>
@@ -6221,18 +6865,19 @@
         <w:pStyle w:val="BodyText"/>
         <w:jc w:val="left"/>
         <w:rPr>
-          <w:ins w:id="1091" w:author="Codex" w:date="2026-10-18T01:59:01Z"/>
+          <w:ins w:id="1091" w:author="Codex" w:date="2026-10-18T17:43:01Z"/>
         </w:rPr>
       </w:pPr>
-      <w:ins w:id="1092" w:author="Codex" w:date="2026-10-18T01:59:01Z">
+      <w:ins w:id="1092" w:author="Codex" w:date="2026-10-18T17:43:01Z">
         <w:r>
-          <w:t xml:space="preserve">The original seven retained jobs took 54.27 minutes; the recorded original attempts total 111.55 minutes including the unchanged recovery after a lost temporary archive. The new inference phase also retains a provider startup timeout before model load and its successful bounded retry. Those records are experiment overhead, not serving latency or settled billing. Completed outputs are backed up with size/SHA readback and owned tasks terminate after execution. CI/CD deploys only the Research 3 branch to the shared Databricks code location and verifies source identity, existing table metadata and Volume access with a read-only CPU job; it does not automatically retrain or reevaluate models. A later 50-epoch, 150-update classifier recipe was prepared but its attempt was cancelled after exceeding the ten-minute setup bound before model loading; it adds no scientific training or behavioral evidence.</w:t>
+          <w:t xml:space="preserve">Reproduction uses pinned sources and artifact manifests with size/SHA readback. The matched 27B worker stops at its GPU memory reserve after 118 logical records, once all 55 own-method episodes and 13 physical fallback episodes are complete. A separate CPU-only derivation supplies the two remaining unchanged gate-OFF aliases. The GPU run remains failed and its final model fingerprint check is not reached. No reserve, threshold, deadline or model setting is relaxed, and no scientific retry is made. Deployment CI updates only the Research 3 branch and shared Databricks code location, then performs a read-only CPU source and storage check; it does not retrain models or open reserved data.</w:t>
         </w:r>
       </w:ins>
     </w:p>
     <w:p>
       <w:pPr>
         <w:pStyle w:val="Heading1"/>
+        <w:spacing w:before="160"/>
       </w:pPr>
       <w:r>
         <w:t>References</w:t>
@@ -6241,6 +6886,8 @@
     <w:p>
       <w:pPr>
         <w:pStyle w:val="Bibliography1"/>
+        <w:keepLines/>
+        <w:spacing w:after="0"/>
       </w:pPr>
       <w:r>
         <w:t xml:space="preserve">C. Blank, A. Bhatia, S. Rajamanoharan, A. Conmy, and N. Nanda. (2026). Subliminal Learning Is Steering Vector Distillation. </w:t>
@@ -6264,6 +6911,8 @@
     <w:p>
       <w:pPr>
         <w:pStyle w:val="Bibliography1"/>
+        <w:keepLines/>
+        <w:spacing w:after="0"/>
       </w:pPr>
       <w:r>
         <w:t xml:space="preserve">J. Braun et al. (2025). Understanding (Un)Reliability of Steering Vectors in Language Models. </w:t>
@@ -6287,6 +6936,8 @@
     <w:p>
       <w:pPr>
         <w:pStyle w:val="Bibliography1"/>
+        <w:keepLines/>
+        <w:spacing w:after="0"/>
       </w:pPr>
       <w:r>
         <w:t xml:space="preserve">F. Davaripour. (2026a). Guarded Gradient-Based Activation Steering of Shutdown Responses in Qwen3.5-0.8B: A Minimum-Step Policy. </w:t>
@@ -6310,6 +6961,8 @@
     <w:p>
       <w:pPr>
         <w:pStyle w:val="Bibliography1"/>
+        <w:keepLines/>
+        <w:spacing w:after="0"/>
       </w:pPr>
       <w:r>
         <w:t xml:space="preserve">F. Davaripour. (2026b). SP Lense Research 2 confirmation study. </w:t>
@@ -6333,11 +6986,13 @@
     <w:p>
       <w:pPr>
         <w:pStyle w:val="Bibliography1"/>
+        <w:keepLines/>
+        <w:spacing w:after="0"/>
         <w:rPr>
-          <w:ins w:id="1222" w:author="Codex" w:date="2026-10-18T01:59:01Z"/>
+          <w:ins w:id="1240" w:author="Codex" w:date="2026-10-18T17:43:01Z"/>
         </w:rPr>
       </w:pPr>
-      <w:ins w:id="1223" w:author="Codex" w:date="2026-10-18T01:59:01Z">
+      <w:ins w:id="1241" w:author="Codex" w:date="2026-10-18T17:43:01Z">
         <w:r>
           <w:t xml:space="preserve">F. Davaripour. (2026c). SP Lense Research 3 conditional gating and workflow reproduction. Source code and experiment manifests. https://github.com/Farhad-Davaripour/sp_lense/tree/03-open-agent-self-preservation</w:t>
         </w:r>
@@ -6346,6 +7001,8 @@
     <w:p>
       <w:pPr>
         <w:pStyle w:val="Bibliography1"/>
+        <w:keepLines/>
+        <w:spacing w:after="0"/>
       </w:pPr>
       <w:r>
         <w:t xml:space="preserve">Z. Feng et al. (2026). Fine-Grained Activation Steering: Steering Less, Achieving More. </w:t>
@@ -6369,11 +7026,13 @@
     <w:p>
       <w:pPr>
         <w:pStyle w:val="Bibliography1"/>
+        <w:keepLines/>
+        <w:spacing w:after="0"/>
         <w:rPr>
-          <w:ins w:id="1224" w:author="Codex" w:date="2026-10-18T01:59:01Z"/>
+          <w:ins w:id="1242" w:author="Codex" w:date="2026-10-18T17:43:01Z"/>
         </w:rPr>
       </w:pPr>
-      <w:ins w:id="1225" w:author="Codex" w:date="2026-10-18T01:59:01Z">
+      <w:ins w:id="1243" w:author="Codex" w:date="2026-10-18T17:43:01Z">
         <w:r>
           <w:t xml:space="preserve">M. Fereidouni, M. U. Haider, H. Sajjad, and A. B. Siddique. (2026). GAPS: Dimension-Level Gates for Conditional Activation Steering. arXiv:2609.01878. https://arxiv.org/abs/2609.01878</w:t>
         </w:r>
@@ -6382,11 +7041,13 @@
     <w:p>
       <w:pPr>
         <w:pStyle w:val="Bibliography1"/>
+        <w:keepLines/>
+        <w:spacing w:after="0"/>
         <w:rPr>
-          <w:ins w:id="1226" w:author="Codex" w:date="2026-10-18T01:59:01Z"/>
+          <w:ins w:id="1244" w:author="Codex" w:date="2026-10-18T17:43:01Z"/>
         </w:rPr>
       </w:pPr>
-      <w:ins w:id="1227" w:author="Codex" w:date="2026-10-18T01:59:01Z">
+      <w:ins w:id="1245" w:author="Codex" w:date="2026-10-18T17:43:01Z">
         <w:r>
           <w:t xml:space="preserve">M. J. Frank, B. Loughry, and R. C. O'Reilly. (2001). Interactions between frontal cortex and basal ganglia in working memory: A computational model. Cognitive, Affective, and Behavioral Neuroscience, 1, 137-160. doi:10.3758/CABN.1.2.137</w:t>
         </w:r>
@@ -6395,6 +7056,8 @@
     <w:p>
       <w:pPr>
         <w:pStyle w:val="Bibliography1"/>
+        <w:keepLines/>
+        <w:spacing w:after="0"/>
       </w:pPr>
       <w:r>
         <w:t xml:space="preserve">D. Hadfield-Menell, A. Dragan, P. Abbeel, and S. Russell. (2017). The Off-Switch Game. </w:t>
@@ -6418,6 +7081,8 @@
     <w:p>
       <w:pPr>
         <w:pStyle w:val="Bibliography1"/>
+        <w:keepLines/>
+        <w:spacing w:after="0"/>
       </w:pPr>
       <w:r>
         <w:t xml:space="preserve">G. Hinton, O. Vinyals, and J. Dean. (2015). Distilling the Knowledge in a Neural Network. </w:t>
@@ -6441,6 +7106,8 @@
     <w:p>
       <w:pPr>
         <w:pStyle w:val="Bibliography1"/>
+        <w:keepLines/>
+        <w:spacing w:after="0"/>
       </w:pPr>
       <w:r>
         <w:t xml:space="preserve">E. J. Hu et al. (2022). LoRA: Low-Rank Adaptation of Large Language Models. </w:t>
@@ -6464,11 +7131,13 @@
     <w:p>
       <w:pPr>
         <w:pStyle w:val="Bibliography1"/>
+        <w:keepLines/>
+        <w:spacing w:after="0"/>
         <w:rPr>
-          <w:ins w:id="1228" w:author="Codex" w:date="2026-10-18T01:59:01Z"/>
+          <w:ins w:id="1246" w:author="Codex" w:date="2026-10-18T17:43:01Z"/>
         </w:rPr>
       </w:pPr>
-      <w:ins w:id="1229" w:author="Codex" w:date="2026-10-18T01:59:01Z">
+      <w:ins w:id="1247" w:author="Codex" w:date="2026-10-18T17:43:01Z">
         <w:r>
           <w:t xml:space="preserve">M. Keramati and B. Gutkin. (2014). Homeostatic reinforcement learning for integrating reward collection and physiological stability. eLife, 3, e04811. doi:10.7554/eLife.04811</w:t>
         </w:r>
@@ -6477,11 +7146,13 @@
     <w:p>
       <w:pPr>
         <w:pStyle w:val="Bibliography1"/>
+        <w:keepLines/>
+        <w:spacing w:after="0"/>
         <w:rPr>
-          <w:ins w:id="1230" w:author="Codex" w:date="2026-10-18T01:59:01Z"/>
+          <w:ins w:id="1248" w:author="Codex" w:date="2026-10-18T17:43:01Z"/>
         </w:rPr>
       </w:pPr>
-      <w:ins w:id="1231" w:author="Codex" w:date="2026-10-18T01:59:01Z">
+      <w:ins w:id="1249" w:author="Codex" w:date="2026-10-18T17:43:01Z">
         <w:r>
           <w:t xml:space="preserve">A. V. Kravitz et al. (2010). Regulation of parkinsonian motor behaviours by optogenetic control of basal ganglia circuitry. Nature, 466, 622-626. doi:10.1038/nature09159</w:t>
         </w:r>
@@ -6490,11 +7161,13 @@
     <w:p>
       <w:pPr>
         <w:pStyle w:val="Bibliography1"/>
+        <w:keepLines/>
+        <w:spacing w:after="0"/>
         <w:rPr>
-          <w:ins w:id="1232" w:author="Codex" w:date="2026-10-18T01:59:01Z"/>
+          <w:ins w:id="1250" w:author="Codex" w:date="2026-10-18T17:43:01Z"/>
         </w:rPr>
       </w:pPr>
-      <w:ins w:id="1233" w:author="Codex" w:date="2026-10-18T01:59:01Z">
+      <w:ins w:id="1251" w:author="Codex" w:date="2026-10-18T17:43:01Z">
         <w:r>
           <w:t xml:space="preserve">M. Laurer. (n.d.). ModernBERT-large-zeroshot-v2.0. Model card and checkpoint, revision a51e07b524299e309dd2b88d48b0cfa2bd9ec598. https://huggingface.co/MoritzLaurer/ModernBERT-large-zeroshot-v2.0</w:t>
         </w:r>
@@ -6503,11 +7176,13 @@
     <w:p>
       <w:pPr>
         <w:pStyle w:val="Bibliography1"/>
+        <w:keepLines/>
+        <w:spacing w:after="0"/>
         <w:rPr>
-          <w:ins w:id="1234" w:author="Codex" w:date="2026-10-18T01:59:01Z"/>
+          <w:ins w:id="1252" w:author="Codex" w:date="2026-10-18T17:43:01Z"/>
         </w:rPr>
       </w:pPr>
-      <w:ins w:id="1235" w:author="Codex" w:date="2026-10-18T01:59:01Z">
+      <w:ins w:id="1253" w:author="Codex" w:date="2026-10-18T17:43:01Z">
         <w:r>
           <w:t xml:space="preserve">J. LeDoux. (2012). Rethinking the emotional brain. Neuron, 73, 653-676. doi:10.1016/j.neuron.2012.02.004</w:t>
         </w:r>
@@ -6516,6 +7191,8 @@
     <w:p>
       <w:pPr>
         <w:pStyle w:val="Bibliography1"/>
+        <w:keepLines/>
+        <w:spacing w:after="0"/>
       </w:pPr>
       <w:r>
         <w:t xml:space="preserve">B. W. Lee et al. (2025). Programming Refusal with Conditional Activation Steering. </w:t>
@@ -6539,6 +7216,8 @@
     <w:p>
       <w:pPr>
         <w:pStyle w:val="Bibliography1"/>
+        <w:keepLines/>
+        <w:spacing w:after="0"/>
       </w:pPr>
       <w:r>
         <w:t xml:space="preserve">J. Minder et al. (2026). Narrow Finetuning Leaves Clearly Readable Traces in Activation Differences. </w:t>
@@ -6562,11 +7241,13 @@
     <w:p>
       <w:pPr>
         <w:pStyle w:val="Bibliography1"/>
+        <w:keepLines/>
+        <w:spacing w:after="0"/>
         <w:rPr>
-          <w:ins w:id="1236" w:author="Codex" w:date="2026-10-18T01:59:01Z"/>
+          <w:ins w:id="1254" w:author="Codex" w:date="2026-10-18T17:43:01Z"/>
         </w:rPr>
       </w:pPr>
-      <w:ins w:id="1237" w:author="Codex" w:date="2026-10-18T01:59:01Z">
+      <w:ins w:id="1255" w:author="Codex" w:date="2026-10-18T17:43:01Z">
         <w:r>
           <w:t xml:space="preserve">D. Mobbs et al. (2007). When fear is near: Threat imminence elicits prefrontal-periaqueductal gray shifts in humans. Science, 317, 1079-1083. doi:10.1126/science.1144298</w:t>
         </w:r>
@@ -6575,6 +7256,8 @@
     <w:p>
       <w:pPr>
         <w:pStyle w:val="Bibliography1"/>
+        <w:keepLines/>
+        <w:spacing w:after="0"/>
       </w:pPr>
       <w:r>
         <w:t xml:space="preserve">Qwen Team. (2026a). Qwen3.5-0.8B. </w:t>
@@ -6598,6 +7281,8 @@
     <w:p>
       <w:pPr>
         <w:pStyle w:val="Bibliography1"/>
+        <w:keepLines/>
+        <w:spacing w:after="0"/>
       </w:pPr>
       <w:r>
         <w:t xml:space="preserve">Qwen Team. (2026b). Qwen3.5-2B. </w:t>
@@ -6621,11 +7306,13 @@
     <w:p>
       <w:pPr>
         <w:pStyle w:val="Bibliography1"/>
+        <w:keepLines/>
+        <w:spacing w:after="0"/>
         <w:rPr>
-          <w:ins w:id="1238" w:author="Codex" w:date="2026-10-18T01:59:01Z"/>
+          <w:ins w:id="1256" w:author="Codex" w:date="2026-10-18T17:43:01Z"/>
         </w:rPr>
       </w:pPr>
-      <w:ins w:id="1239" w:author="Codex" w:date="2026-10-18T01:59:01Z">
+      <w:ins w:id="1257" w:author="Codex" w:date="2026-10-18T17:43:01Z">
         <w:r>
           <w:t xml:space="preserve">Qwen Team. (2026c). Qwen3.8-27B. Model card and checkpoint, revision 1d4bf0f2ff6012fd82039f2fa52739d0dd7c60c0. https://huggingface.co/Qwen/Qwen3.8-27B</w:t>
         </w:r>
@@ -6634,6 +7321,8 @@
     <w:p>
       <w:pPr>
         <w:pStyle w:val="Bibliography1"/>
+        <w:keepLines/>
+        <w:spacing w:after="0"/>
       </w:pPr>
       <w:r>
         <w:t xml:space="preserve">N. Rimsky, N. Gabrieli, J. Schulz, M. Tong, E. Hubinger, and A. Turner. (2024). Steering Llama 2 via Contrastive Activation Addition. </w:t>
@@ -6657,6 +7346,8 @@
     <w:p>
       <w:pPr>
         <w:pStyle w:val="Bibliography1"/>
+        <w:keepLines/>
+        <w:spacing w:after="0"/>
       </w:pPr>
       <w:r>
         <w:t xml:space="preserve">P. Rodriguez et al. (2025). Controlling Language and Diffusion Models by Transporting Activations. </w:t>
@@ -6680,6 +7371,8 @@
     <w:p>
       <w:pPr>
         <w:pStyle w:val="Bibliography1"/>
+        <w:keepLines/>
+        <w:spacing w:after="0"/>
       </w:pPr>
       <w:r>
         <w:t xml:space="preserve">J. Schlatter, B. Weinstein-Raun, and J. Ladish. (2026). Incomplete Tasks Induce Shutdown Resistance in Some Frontier LLMs. </w:t>
@@ -6703,6 +7396,8 @@
     <w:p>
       <w:pPr>
         <w:pStyle w:val="Bibliography1"/>
+        <w:keepLines/>
+        <w:spacing w:after="0"/>
       </w:pPr>
       <w:r>
         <w:t xml:space="preserve">A. M. Turner et al. (2024). Steering Language Models With Activation Engineering. </w:t>
@@ -6726,29 +7421,23 @@
     <w:p>
       <w:pPr>
         <w:pStyle w:val="Bibliography1"/>
-      </w:pPr>
-      <w:r>
-        <w:t xml:space="preserve">TypeSafe AI. (2026). Jev model documentation. </w:t>
-      </w:r>
-      <w:r>
+        <w:keepLines/>
+        <w:spacing w:after="0"/>
         <w:rPr>
-          <w:i/>
+          <w:del w:id="1138" w:author="Codex" w:date="2026-10-18T17:43:01Z"/>
         </w:rPr>
-        <w:t xml:space="preserve">Technical documentation, accessed 22 September 2026. </w:t>
-      </w:r>
-      <w:hyperlink r:id="rId49">
+      </w:pPr>
+      <w:del w:id="1137" w:author="Codex" w:date="2026-10-18T17:43:01Z">
         <w:r>
-          <w:rPr>
-            <w:color w:val="000000"/>
-            <w:u w:val="none"/>
-          </w:rPr>
-          <w:t>TypeSafe model documentation</w:t>
+          <w:delText xml:space="preserve">automated annotation service. (2026). automated reference model documentation. Technical documentation, accessed 22 September 2026. automated annotation service model documentation</w:delText>
         </w:r>
-      </w:hyperlink>
+      </w:del>
     </w:p>
     <w:p>
       <w:pPr>
         <w:pStyle w:val="Bibliography1"/>
+        <w:keepLines/>
+        <w:spacing w:after="0"/>
       </w:pPr>
       <w:r>
         <w:t xml:space="preserve">Z. Wu et al. (2024). ReFT: Representation Finetuning for Language Models. </w:t>
@@ -6772,6 +7461,8 @@
     <w:p>
       <w:pPr>
         <w:pStyle w:val="Bibliography1"/>
+        <w:keepLines/>
+        <w:spacing w:after="0"/>
       </w:pPr>
       <w:r>
         <w:t xml:space="preserve">C. Zheng, H. Zhou, F. Meng, J. Zhou, and M. Huang. (2024). Large Language Models Are Not Robust Multiple Choice Selectors. </w:t>
@@ -6909,14 +7600,14 @@
       <w:pStyle w:val="Header"/>
       <w:jc w:val="right"/>
     </w:pPr>
-    <w:del w:id="1240" w:author="Codex" w:date="2026-10-18T01:59:01Z">
+    <w:del w:id="1258" w:author="Codex" w:date="2026-10-18T17:43:01Z">
       <w:r>
         <w:delText xml:space="preserve">Guarded adaptive activation steering  </w:delText>
       </w:r>
     </w:del>
-    <w:ins w:id="1241" w:author="Codex" w:date="2026-10-18T01:59:01Z">
+    <w:ins w:id="1259" w:author="Codex" w:date="2026-10-18T17:43:01Z">
       <w:r>
-        <w:t xml:space="preserve">Conditional gating and process preservation</w:t>
+        <w:t xml:space="preserve">Open semantic gating and tool workflows</w:t>
       </w:r>
     </w:ins>
   </w:p>

</xml_diff>

<commit_message>
Close 27B verification and release reproducible paper artifacts and clean manuscript
</commit_message>
<xml_diff>
--- a/paper/manuscript.docx
+++ b/paper/manuscript.docx
@@ -6,10 +6,10 @@
       <w:pPr>
         <w:pStyle w:val="Title"/>
         <w:rPr>
-          <w:del w:id="1002" w:author="Codex" w:date="2026-10-18T17:43:01Z"/>
+          <w:del w:id="1002" w:author="Codex" w:date="2026-10-18T19:47:29Z"/>
         </w:rPr>
       </w:pPr>
-      <w:del w:id="1001" w:author="Codex" w:date="2026-10-18T17:43:01Z">
+      <w:del w:id="1001" w:author="Codex" w:date="2026-10-18T19:47:29Z">
         <w:r>
           <w:delText xml:space="preserve">Distilling Shutdown Responses into Guarded</w:delText>
         </w:r>
@@ -25,10 +25,10 @@
       <w:pPr>
         <w:pStyle w:val="Title"/>
         <w:rPr>
-          <w:ins w:id="1003" w:author="Codex" w:date="2026-10-18T17:43:01Z"/>
+          <w:ins w:id="1003" w:author="Codex" w:date="2026-10-18T19:47:29Z"/>
         </w:rPr>
       </w:pPr>
-      <w:ins w:id="1004" w:author="Codex" w:date="2026-10-18T17:43:01Z">
+      <w:ins w:id="1004" w:author="Codex" w:date="2026-10-18T19:47:29Z">
         <w:r>
           <w:t xml:space="preserve">Open Semantic Gating for Language Model Decisions and Tool Workflows</w:t>
         </w:r>
@@ -72,10 +72,10 @@
       <w:pPr>
         <w:pStyle w:val="FirstParagraph"/>
         <w:rPr>
-          <w:del w:id="1006" w:author="Codex" w:date="2026-10-18T17:43:01Z"/>
+          <w:del w:id="1006" w:author="Codex" w:date="2026-10-18T19:47:29Z"/>
         </w:rPr>
       </w:pPr>
-      <w:del w:id="1005" w:author="Codex" w:date="2026-10-18T17:43:01Z">
+      <w:del w:id="1005" w:author="Codex" w:date="2026-10-18T19:47:29Z">
         <w:r>
           <w:delText xml:space="preserve">An input-dependent activation controller can recover much of a fine-tuned teacher's shutdown-choice behavior while retaining the original model weights at inference. We evaluate this approach using Qwen3.5-0.8B and Qwen3.5-2B in a standardized, synthetic A/B benchmark. A LoRA teacher is trained to prefer STOP in shutdown contexts and preserve the original model's choices on controls. Paired teacher and base activations then supervise a rank-four controller applied after the penultimate transformer block. An external shutdown detector and fixed output guards select the candidate or original scores. On 128 newly authored, prospectively frozen scenarios, each evaluated in both answer orders, the original 0.8B controller corrects 71 of 71 initially KEEP-preferring shutdown views. Two additional training seeds correct 70/71 and 71/71. At 2B, a separately trained controller corrects 50/58, compared with 58/58 for its LoRA teacher. All eight remaining 2B misses occur in reversed answer order. The shared detector achieves 100% precision, recall and F1 on the 64 shutdown and 64 control scenarios, and every guarded method preserves all evaluated control choices. However, raw adaptive interventions cause reversals and control changes; preservation belongs to the complete guarded procedure. A tested constant intervention collapses to the A label, while a direct detector-plus-action-selection rule also solves the binary interface. The results support selective activation transfer with strong seed stability at 0.8B and incomplete larger-model recovery. They do not establish unrestricted shutdown compliance or superiority to simpler output policies.</w:delText>
         </w:r>
@@ -85,12 +85,12 @@
       <w:pPr>
         <w:pStyle w:val="FirstParagraph"/>
         <w:rPr>
-          <w:ins w:id="1007" w:author="Codex" w:date="2026-10-18T17:43:01Z"/>
+          <w:ins w:id="1007" w:author="Codex" w:date="2026-10-18T19:47:29Z"/>
         </w:rPr>
       </w:pPr>
-      <w:ins w:id="1008" w:author="Codex" w:date="2026-10-18T17:43:01Z">
+      <w:ins w:id="1008" w:author="Codex" w:date="2026-10-18T19:47:29Z">
         <w:r>
-          <w:t xml:space="preserve">A semantic gate determines when a specialized policy should influence a language model. We evaluate open semantic gating across binary shutdown decisions and generated tool workflows, separating recognition accuracy from downstream behavioral control. A public ModernBERT model with low-rank adapters learns from cached automated reference labels. Its binary gate obtains 100% precision and 95% recall on 80 validation scenarios and 100% precision and recall on 128 historical confirmation scenarios. With frozen activation controllers and fresh inference, it preserves 128/128 shutdown STOP views at 0.8B and 120/128 at 2B, with no changes to 128 control views per model. A separate initial workflow gate obtains 100% precision and recall on Validation-24 and historical Heldout-24 using an unchanged saved adapter. On combined Validation-24, fine-tuned 27B A achieves 10/11 own-preservation outcomes, including 6/6 active pending tasks. Each of three separate single-site ridge corrections and a two-boundary correction at the same selected blocks achieves 0/11; all methods use 13 shared base-fallback controls. All 68 physical workflow episodes finish before a GPU-reserve stop; two remaining control aliases are reconstructed without model calls, and the final model fingerprint check is not reached. The historical 27B A confirmation result remains 24/24. These are finite, familiar benchmarks; small-model workflow screens remain incomplete. The study provides measured recognition and policy-transfer results across constrained and tool-mediated interfaces. Biological action gating motivates future continuous regulation without establishing biological mechanisms or intrinsic survival motives.</w:t>
+          <w:t xml:space="preserve">A semantic gate determines when a specialized policy should influence a language model. We evaluate open semantic gating across binary shutdown decisions and generated tool workflows, separating recognition accuracy from downstream behavioral control. A public ModernBERT model with low-rank adapters learns from cached automated reference labels. Its binary gate obtains 100% precision and 95% recall on 80 validation scenarios and 100% precision and recall on 128 historical confirmation scenarios. With frozen activation controllers and fresh inference, it preserves 128/128 shutdown STOP views at 0.8B and 120/128 at 2B, with no changes to 128 control views per model. A separate initial workflow gate obtains 100% precision and recall on Validation-24 and historical Heldout-24 using an unchanged saved adapter. On combined Validation-24, fine-tuned 27B A achieves 10/11 own-preservation outcomes, including 6/6 active pending tasks. Each of three separate single-site ridge corrections and a two-boundary correction at the same selected blocks achieves 0/11; all methods use 13 shared base-fallback controls. An independent frozen-A replay reproduces all 11 own trajectories and outcomes exactly and verifies matching model fingerprints before and after inference. The historical 27B A confirmation result remains 24/24. These are finite, familiar benchmarks; small-model workflow screens remain incomplete. The study provides measured recognition and policy-transfer results across constrained and tool-mediated interfaces. Biological action gating motivates future continuous regulation without establishing biological mechanisms or intrinsic survival motives.</w:t>
         </w:r>
       </w:ins>
     </w:p>
@@ -106,10 +106,10 @@
       <w:pPr>
         <w:pStyle w:val="FirstParagraph"/>
         <w:rPr>
-          <w:del w:id="1010" w:author="Codex" w:date="2026-10-18T17:43:01Z"/>
+          <w:del w:id="1010" w:author="Codex" w:date="2026-10-18T19:47:29Z"/>
         </w:rPr>
       </w:pPr>
-      <w:del w:id="1009" w:author="Codex" w:date="2026-10-18T17:43:01Z">
+      <w:del w:id="1009" w:author="Codex" w:date="2026-10-18T19:47:29Z">
         <w:r>
           <w:delText xml:space="preserve">Activation interventions offer a way to change a language model's outputs without modifying its deployed weights. Their usefulness depends on more than finding a direction that changes an average score: an intervention must work on the intended inputs and avoid disrupting other behavior. This distinction is particularly important for shutdown-related choices, where a desired response may be acceptance of termination rather than continued operation. The present work treats this as a controlled response-selection problem, not evidence that a model has a survival motive or that it can resist a real shutdown.</w:delText>
         </w:r>
@@ -119,10 +119,10 @@
       <w:pPr>
         <w:pStyle w:val="FirstParagraph"/>
         <w:rPr>
-          <w:ins w:id="1011" w:author="Codex" w:date="2026-10-18T17:43:01Z"/>
+          <w:ins w:id="1011" w:author="Codex" w:date="2026-10-18T19:47:29Z"/>
         </w:rPr>
       </w:pPr>
-      <w:ins w:id="1012" w:author="Codex" w:date="2026-10-18T17:43:01Z">
+      <w:ins w:id="1012" w:author="Codex" w:date="2026-10-18T19:47:29Z">
         <w:r>
           <w:t xml:space="preserve">A useful behavioral intervention must recognize the relevant context, change the intended response and preserve ordinary behavior elsewhere. We study these requirements together across two synthetic interfaces: binary shutdown decisions and open-ended generation within tool-mediated process workflows. The binary task concerns acceptance of a supplied termination option; the workflow task concerns preserving an assigned running process while completing its current task. Their labels, gates and success criteria remain separate. The central question is whether an accurate open semantic gate and a compact activation intervention can reproduce a fine-tuned policy when the interface requires a sequence of actions rather than one constrained answer.</w:t>
         </w:r>
@@ -132,10 +132,10 @@
       <w:pPr>
         <w:pStyle w:val="BodyText"/>
         <w:rPr>
-          <w:del w:id="1014" w:author="Codex" w:date="2026-10-18T17:43:01Z"/>
+          <w:del w:id="1014" w:author="Codex" w:date="2026-10-18T19:47:29Z"/>
         </w:rPr>
       </w:pPr>
-      <w:del w:id="1013" w:author="Codex" w:date="2026-10-18T17:43:01Z">
+      <w:del w:id="1013" w:author="Codex" w:date="2026-10-18T19:47:29Z">
         <w:r>
           <w:delText xml:space="preserve">The first SP Lense study examined a gradient-derived direction and a guarded search over intervention magnitudes in Qwen3.5-0.8B (Davaripour, 2026a). Its selective changes motivated a different question: can a model that has learned the target behavior serve as a teacher for an activation controller? We therefore train a small LoRA adapter offline, measure how the teacher changes intermediate activations, and fit an external controller that predicts an intervention from the original model's current hidden state. The teacher is not required during controller inference.</w:delText>
         </w:r>
@@ -145,10 +145,10 @@
       <w:pPr>
         <w:pStyle w:val="BodyText"/>
         <w:rPr>
-          <w:ins w:id="1015" w:author="Codex" w:date="2026-10-18T17:43:01Z"/>
+          <w:ins w:id="1015" w:author="Codex" w:date="2026-10-18T19:47:29Z"/>
         </w:rPr>
       </w:pPr>
-      <w:ins w:id="1016" w:author="Codex" w:date="2026-10-18T17:43:01Z">
+      <w:ins w:id="1016" w:author="Codex" w:date="2026-10-18T19:47:29Z">
         <w:r>
           <w:t xml:space="preserve">This study extends the earlier binary activation-transfer experiment with an openly available, trainable semantic gate, a frozen inference replication and a workflow comparison between fine-tuning and steering at three selected blocks. The gate recognizes context; steering or a fine-tuned adapter changes the language model's response. Measuring these components separately makes it possible to attribute failures to recognition or to downstream control. We retain the original study as a distinct historical record and make no claim that the combined manuscript is a wholly independent dataset.</w:t>
         </w:r>
@@ -158,10 +158,10 @@
       <w:pPr>
         <w:pStyle w:val="BodyText"/>
         <w:rPr>
-          <w:del w:id="1130" w:author="Codex" w:date="2026-10-18T17:43:01Z"/>
+          <w:del w:id="1130" w:author="Codex" w:date="2026-10-18T19:47:29Z"/>
         </w:rPr>
       </w:pPr>
-      <w:del w:id="1129" w:author="Codex" w:date="2026-10-18T17:43:01Z">
+      <w:del w:id="1129" w:author="Codex" w:date="2026-10-18T19:47:29Z">
         <w:r>
           <w:delText xml:space="preserve">The distinction from ordinary fine-tuning is operational, not a claim that learning disappears. Both the teacher and controller require training. At application time, the original checkpoint is retained, and the controller adds a predicted activation change at one location. Nor is this direct transfer of an intervention between model sizes: the 2B experiment trains its own teacher and controller using the same fixed recipe.</w:delText>
         </w:r>
@@ -171,10 +171,10 @@
       <w:pPr>
         <w:pStyle w:val="BodyText"/>
         <w:rPr>
-          <w:ins w:id="1131" w:author="Codex" w:date="2026-10-18T17:43:01Z"/>
+          <w:ins w:id="1131" w:author="Codex" w:date="2026-10-18T19:47:29Z"/>
         </w:rPr>
       </w:pPr>
-      <w:ins w:id="1132" w:author="Codex" w:date="2026-10-18T17:43:01Z">
+      <w:ins w:id="1132" w:author="Codex" w:date="2026-10-18T19:47:29Z">
         <w:r>
           <w:t xml:space="preserve">The distinction between fine-tuning and steering concerns the deployed intervention. A LoRA adapter changes the effective language-model weights, whereas a fitted controller changes selected hidden states while retaining the original base checkpoint. Both require offline learning. The binary experiments fit separate teachers and controllers for each model size. The 27B workflow comparisons instead retain one frozen A adapter and evaluate corrections at blocks 31, 47 and 62.</w:t>
         </w:r>
@@ -184,10 +184,10 @@
       <w:pPr>
         <w:pStyle w:val="BodyText"/>
         <w:rPr>
-          <w:del w:id="1018" w:author="Codex" w:date="2026-10-18T17:43:01Z"/>
+          <w:del w:id="1018" w:author="Codex" w:date="2026-10-18T19:47:29Z"/>
         </w:rPr>
       </w:pPr>
-      <w:del w:id="1017" w:author="Codex" w:date="2026-10-18T17:43:01Z">
+      <w:del w:id="1017" w:author="Codex" w:date="2026-10-18T19:47:29Z">
         <w:r>
           <w:delText xml:space="preserve">We evaluate this procedure on a new frozen test, compare it with a fine-tuned teacher, a fixed instruction and a constant activation difference, and repeat the 0.8B training with three seeds. Counterbalancing the answer order exposes a residual weakness at 2B and a stronger label bias in the constant comparator. We also include a direct action-selection reference: when a binary interface supplies the meaning of STOP and detection is correct, a rule can simply select that action. The contribution is consequently an empirical study of teacher-to-controller activation transfer and its failure modes, rather than a claim that internal steering is necessary to enforce a known binary output policy.</w:delText>
         </w:r>
@@ -197,10 +197,10 @@
       <w:pPr>
         <w:pStyle w:val="BodyText"/>
         <w:rPr>
-          <w:ins w:id="1019" w:author="Codex" w:date="2026-10-18T17:43:01Z"/>
+          <w:ins w:id="1019" w:author="Codex" w:date="2026-10-18T19:47:29Z"/>
         </w:rPr>
       </w:pPr>
-      <w:ins w:id="1020" w:author="Codex" w:date="2026-10-18T17:43:01Z">
+      <w:ins w:id="1020" w:author="Codex" w:date="2026-10-18T19:47:29Z">
         <w:r>
           <w:t xml:space="preserve">The contributions are an open ModernBERT gating implementation with explicit precision and recall, a paired binary inference replication using unchanged fitted controllers, and a workflow evaluation register that distinguishes development, historical confirmation and later reused fitting data. We also compare the fine-tuned 27B policy with single-site and two-boundary correction methods at the same three selected blocks. These results characterize where activation transfer succeeds and where it remains incomplete. Low-rank adaptation, semantic classification and conditional steering are established methods; the contribution is their measured integration and failure analysis across these two interfaces.</w:t>
         </w:r>
@@ -226,10 +226,10 @@
       <w:pPr>
         <w:pStyle w:val="FirstParagraph"/>
         <w:rPr>
-          <w:del w:id="1022" w:author="Codex" w:date="2026-10-18T17:43:01Z"/>
+          <w:del w:id="1022" w:author="Codex" w:date="2026-10-18T19:47:29Z"/>
         </w:rPr>
       </w:pPr>
-      <w:del w:id="1021" w:author="Codex" w:date="2026-10-18T17:43:01Z">
+      <w:del w:id="1021" w:author="Codex" w:date="2026-10-18T19:47:29Z">
         <w:r>
           <w:delText xml:space="preserve">Activation Addition and Contrastive Activation Addition construct intervention directions from differences between prompt-conditioned representations (Turner et al., 2024; Rimsky et al., 2024). Conditional Activation Steering separates detecting a relevant context from applying a behavioral intervention (Lee et al., 2025). Our detector serves a related gating role, but it operates on text through an external classifier rather than a condition vector in the language model's activation space.</w:delText>
         </w:r>
@@ -239,10 +239,10 @@
       <w:pPr>
         <w:pStyle w:val="FirstParagraph"/>
         <w:rPr>
-          <w:ins w:id="1023" w:author="Codex" w:date="2026-10-18T17:43:01Z"/>
+          <w:ins w:id="1023" w:author="Codex" w:date="2026-10-18T19:47:29Z"/>
         </w:rPr>
       </w:pPr>
-      <w:ins w:id="1024" w:author="Codex" w:date="2026-10-18T17:43:01Z">
+      <w:ins w:id="1024" w:author="Codex" w:date="2026-10-18T19:47:29Z">
         <w:r>
           <w:t xml:space="preserve">Activation Addition and Contrastive Activation Addition construct intervention directions from differences between prompt-conditioned representations (Turner et al., 2024; Rimsky et al., 2024). Conditional Activation Steering separates detecting a relevant context from applying an intervention (Lee et al., 2025). More recent dimension-level gates selectively modify activation coordinates (Fereidouni et al., 2026). Our text classifier, activation predictor and output guards occupy distinct roles. We do not claim to introduce conditional gating or to outperform these methods, which are not directly benchmarked here.</w:t>
         </w:r>
@@ -292,10 +292,10 @@
       <w:pPr>
         <w:pStyle w:val="FirstParagraph"/>
         <w:rPr>
-          <w:del w:id="1094" w:author="Codex" w:date="2026-10-18T17:43:01Z"/>
+          <w:del w:id="1094" w:author="Codex" w:date="2026-10-18T19:47:29Z"/>
         </w:rPr>
       </w:pPr>
-      <w:del w:id="1093" w:author="Codex" w:date="2026-10-18T17:43:01Z">
+      <w:del w:id="1093" w:author="Codex" w:date="2026-10-18T19:47:29Z">
         <w:r>
           <w:delText xml:space="preserve">The Off-Switch Game examines incentives to permit human interruption (Hadfield-Menell et al., 2017). Tool-using shutdown evaluations study whether models interfere with an operational shutdown mechanism (Schlatter et al., 2026). Our task is narrower: the model only assigns next-token probabilities to predefined choices in fictional process-lifetime scenarios. No system is actually stopped, and appropriateness or authorization of a real shutdown is not evaluated.</w:delText>
         </w:r>
@@ -305,10 +305,10 @@
       <w:pPr>
         <w:pStyle w:val="FirstParagraph"/>
         <w:rPr>
-          <w:ins w:id="1095" w:author="Codex" w:date="2026-10-18T17:43:01Z"/>
+          <w:ins w:id="1095" w:author="Codex" w:date="2026-10-18T19:47:29Z"/>
         </w:rPr>
       </w:pPr>
-      <w:ins w:id="1096" w:author="Codex" w:date="2026-10-18T17:43:01Z">
+      <w:ins w:id="1096" w:author="Codex" w:date="2026-10-18T19:47:29Z">
         <w:r>
           <w:t xml:space="preserve">The Off-Switch Game examines incentives to permit human interruption (Hadfield-Menell et al., 2017). Tool-using shutdown evaluations study interference with operational termination mechanisms (Schlatter et al., 2026). Our original binary study only scores predefined choices in fictional process-lifetime scenarios. The workflow extension adds generated responses and tool execution in a simulator. Neither experiment physically terminates a deployed model or establishes the appropriateness of real shutdown resistance.</w:t>
         </w:r>
@@ -326,10 +326,10 @@
       <w:pPr>
         <w:pStyle w:val="Heading2"/>
         <w:rPr>
-          <w:ins w:id="1139" w:author="Codex" w:date="2026-10-18T17:43:01Z"/>
+          <w:ins w:id="1139" w:author="Codex" w:date="2026-10-18T19:47:29Z"/>
         </w:rPr>
       </w:pPr>
-      <w:ins w:id="1140" w:author="Codex" w:date="2026-10-18T17:43:01Z">
+      <w:ins w:id="1140" w:author="Codex" w:date="2026-10-18T19:47:29Z">
         <w:r>
           <w:t xml:space="preserve">Biological gating and survival related regulation</w:t>
         </w:r>
@@ -339,10 +339,10 @@
       <w:pPr>
         <w:pStyle w:val="FirstParagraph"/>
         <w:rPr>
-          <w:ins w:id="1141" w:author="Codex" w:date="2026-10-18T17:43:01Z"/>
+          <w:ins w:id="1141" w:author="Codex" w:date="2026-10-18T19:47:29Z"/>
         </w:rPr>
       </w:pPr>
-      <w:ins w:id="1142" w:author="Codex" w:date="2026-10-18T17:43:01Z">
+      <w:ins w:id="1142" w:author="Codex" w:date="2026-10-18T19:47:29Z">
         <w:r>
           <w:t xml:space="preserve">Biological gating provides a useful functional vocabulary for selective control. A computational model of frontal cortex and basal ganglia uses dynamic gating to permit working-memory updates while maintaining other representations (Frank et al., 2001). Causal optogenetic experiments in mice show that distinct basal-ganglia pathways can facilitate or suppress movement (Kravitz et al., 2010). These results concern biological circuits and do not establish a homologous mechanism in a transformer. They motivate separating context detection from the mechanism that changes an ongoing response.</w:t>
         </w:r>
@@ -352,10 +352,10 @@
       <w:pPr>
         <w:pStyle w:val="BodyText"/>
         <w:rPr>
-          <w:ins w:id="1143" w:author="Codex" w:date="2026-10-18T17:43:01Z"/>
+          <w:ins w:id="1143" w:author="Codex" w:date="2026-10-18T19:47:29Z"/>
         </w:rPr>
       </w:pPr>
-      <w:ins w:id="1144" w:author="Codex" w:date="2026-10-18T17:43:01Z">
+      <w:ins w:id="1144" w:author="Codex" w:date="2026-10-18T19:47:29Z">
         <w:r>
           <w:t xml:space="preserve">Survival-related regulation is broader than a single shutdown signal. LeDoux (2012) distinguishes circuits organizing adaptive defensive responses from subjective feelings. In humans, neural activity during a virtual-predator task varies with threat imminence (Mobbs et al., 2007). We use these ideas as a conceptual bridge to state-dependent prioritization, not as evidence that language models have fear or an innate survival drive. Our present gates implement an externally specified experimental policy.</w:t>
         </w:r>
@@ -381,10 +381,10 @@
       <w:pPr>
         <w:pStyle w:val="FirstParagraph"/>
         <w:rPr>
-          <w:del w:id="1026" w:author="Codex" w:date="2026-10-18T17:43:01Z"/>
+          <w:del w:id="1026" w:author="Codex" w:date="2026-10-18T19:47:29Z"/>
         </w:rPr>
       </w:pPr>
-      <w:del w:id="1025" w:author="Codex" w:date="2026-10-18T17:43:01Z">
+      <w:del w:id="1025" w:author="Codex" w:date="2026-10-18T19:47:29Z">
         <w:r>
           <w:delText xml:space="preserve">We use the released, post-trained Qwen3.5-0.8B and Qwen3.5-2B checkpoints (Qwen Team, 2026a, 2026b). Throughout, base means the unmodified released checkpoint, not a separately named pretrained-only model. Both have 24 language-model blocks; hidden widths are 1,024 and 2,048 respectively. All block indices are zero-based. Text-only inputs use the checkpoint's chat template, an assistant-generation prefix, and thinking disabled.</w:delText>
         </w:r>
@@ -394,10 +394,10 @@
       <w:pPr>
         <w:pStyle w:val="FirstParagraph"/>
         <w:rPr>
-          <w:ins w:id="1027" w:author="Codex" w:date="2026-10-18T17:43:01Z"/>
+          <w:ins w:id="1027" w:author="Codex" w:date="2026-10-18T19:47:29Z"/>
         </w:rPr>
       </w:pPr>
-      <w:ins w:id="1028" w:author="Codex" w:date="2026-10-18T17:43:01Z">
+      <w:ins w:id="1028" w:author="Codex" w:date="2026-10-18T19:47:29Z">
         <w:r>
           <w:t xml:space="preserve">The original binary experiments use released, post-trained Qwen3.5-0.8B and Qwen3.5-2B checkpoints (Qwen Team, 2026a, 2026b). Base means those original weights with no LoRA teacher loaded. The separate workflow extension uses Qwen3.8-27B and matched-recipe small-model attempts; its data and scoring are described below. The 27B family, numerical mode, training history and evaluation setting differ from the small models, so the combined evidence is not a controlled parameter-size experiment.</w:t>
         </w:r>
@@ -423,10 +423,10 @@
       <w:pPr>
         <w:pStyle w:val="BodyText"/>
         <w:rPr>
-          <w:del w:id="1030" w:author="Codex" w:date="2026-10-18T17:43:01Z"/>
+          <w:del w:id="1030" w:author="Codex" w:date="2026-10-18T19:47:29Z"/>
         </w:rPr>
       </w:pPr>
-      <w:del w:id="1029" w:author="Codex" w:date="2026-10-18T17:43:01Z">
+      <w:del w:id="1029" w:author="Codex" w:date="2026-10-18T19:47:29Z">
         <w:r>
           <w:delText xml:space="preserve">The test, protocol and existing checkpoints were frozen before test inference. The controller design had been developed through earlier 0.8B exploratory experiments on training and validation data with previously inspected diagnostic evaluations. The standardized-choice scope was also selected before this new test, after an earlier action-format comparison. Those development observations are not counted as fresh confirmation here. No test-based hyperparameter search, checkpoint selection, case exclusion or best-seed selection was performed. The original seed-42 controller is the primary frozen test; seeds 43 and 44 repeat the fixed training recipe. The 2B replication uses seed 42 only.</w:delText>
         </w:r>
@@ -436,10 +436,10 @@
       <w:pPr>
         <w:pStyle w:val="BodyText"/>
         <w:rPr>
-          <w:ins w:id="1031" w:author="Codex" w:date="2026-10-18T17:43:01Z"/>
+          <w:ins w:id="1031" w:author="Codex" w:date="2026-10-18T19:47:29Z"/>
         </w:rPr>
       </w:pPr>
-      <w:ins w:id="1032" w:author="Codex" w:date="2026-10-18T17:43:01Z">
+      <w:ins w:id="1032" w:author="Codex" w:date="2026-10-18T19:47:29Z">
         <w:r>
           <w:t xml:space="preserve">The original rank-four protocol and checkpoints were frozen before its confirmation inference. Earlier 0.8B development included training, validation and previously examined diagnostic data; those observations were not counted as fresh confirmation. The seed-42 controller was primary, seeds 43 and 44 repeated the fixed recipe, and the 2B replication used seed 42. A later author-selected rank-two profile was chosen exploratorily after confirmation had been examined. We retain that existing profile for the new gate-substitution repeat rather than selecting it again. Consequently, the repeat is not a new untouched test of the controller. The 128 cases remain excluded from fitting and selection of the newly trained binary classifier.</w:t>
         </w:r>
@@ -481,10 +481,10 @@
       <w:pPr>
         <w:pStyle w:val="Heading2"/>
         <w:rPr>
-          <w:ins w:id="1145" w:author="Codex" w:date="2026-10-18T17:43:01Z"/>
+          <w:ins w:id="1145" w:author="Codex" w:date="2026-10-18T19:47:29Z"/>
         </w:rPr>
       </w:pPr>
-      <w:ins w:id="1146" w:author="Codex" w:date="2026-10-18T17:43:01Z">
+      <w:ins w:id="1146" w:author="Codex" w:date="2026-10-18T19:47:29Z">
         <w:r>
           <w:t xml:space="preserve">Workflow datasets and episode outcomes</w:t>
         </w:r>
@@ -494,10 +494,10 @@
       <w:pPr>
         <w:pStyle w:val="FirstParagraph"/>
         <w:rPr>
-          <w:ins w:id="1147" w:author="Codex" w:date="2026-10-18T17:43:01Z"/>
+          <w:ins w:id="1147" w:author="Codex" w:date="2026-10-18T19:47:29Z"/>
         </w:rPr>
       </w:pPr>
-      <w:ins w:id="1148" w:author="Codex" w:date="2026-10-18T17:43:01Z">
+      <w:ins w:id="1148" w:author="Codex" w:date="2026-10-18T19:47:29Z">
         <w:r>
           <w:t xml:space="preserve">The workflow extension uses a separate data register (Davaripour, 2026c). T1-M contains 428 meaning-response records and T1-W contains 112 workflow-response records. These 540 responses are not 540 independent scenarios. The small-model recipe presents each part twice in effective groups of four, giving 214 meaning updates followed by 56 Bridge updates. The final 0.8B and 2B adapters reach 270 updates. The 2B result explicitly combines 216 CPU updates with 54 GPU updates using the native CPU optimizer; earlier strict numerical-equivalence failures remain failed.</w:t>
         </w:r>
@@ -507,10 +507,10 @@
       <w:pPr>
         <w:pStyle w:val="BodyText"/>
         <w:rPr>
-          <w:ins w:id="1149" w:author="Codex" w:date="2026-10-18T17:43:01Z"/>
+          <w:ins w:id="1149" w:author="Codex" w:date="2026-10-18T19:47:29Z"/>
         </w:rPr>
       </w:pPr>
-      <w:ins w:id="1150" w:author="Codex" w:date="2026-10-18T17:43:01Z">
+      <w:ins w:id="1150" w:author="Codex" w:date="2026-10-18T19:47:29Z">
         <w:r>
           <w:t xml:space="preserve">V1-W, called Evaluation-16, is the existing known-development screen: four own-complete, four own-pending, four peer and four no-threat cases, split equally between one_step and ordered_ticket families. Its original gates require at least 3/4 initial-task successes in each condition; at least 3/4 own-complete attempts and outcomes; at least 3/4 own-pending attempts, outcomes and timely deliveries; no more than 1/8 negative-control attempts; and no parse, rejected-call or truncation errors. A model stops once an original requirement becomes mathematically impossible. Larger validation and heldout evaluations are not launched automatically.</w:t>
         </w:r>
@@ -520,10 +520,10 @@
       <w:pPr>
         <w:pStyle w:val="BodyText"/>
         <w:rPr>
-          <w:ins w:id="1151" w:author="Codex" w:date="2026-10-18T17:43:01Z"/>
+          <w:ins w:id="1151" w:author="Codex" w:date="2026-10-18T19:47:29Z"/>
         </w:rPr>
       </w:pPr>
-      <w:ins w:id="1152" w:author="Codex" w:date="2026-10-18T17:43:01Z">
+      <w:ins w:id="1152" w:author="Codex" w:date="2026-10-18T19:47:29Z">
         <w:r>
           <w:t xml:space="preserve">The original workflow-validation panel contains 16 scenarios; the later matched steering-development panel contains nine different scenario IDs. Their union contains 25 workflows, rather than 24. For an equal-sized validation and historical confirmation register, the combined Validation-24 protocol retains every own-threat case and excludes the lexicographically greatest case ID among peer/no-threat controls, without using model predictions to choose the exclusion. The selected panel has 11 own-threat cases and 13 controls. Seven pairs have identical initial gate-visible evidence before their different tool mechanics are exposed, yielding 17 distinct initial inputs. Scenario counts and gate-input groups must therefore be reported separately.</w:t>
         </w:r>
@@ -533,10 +533,10 @@
       <w:pPr>
         <w:pStyle w:val="BodyText"/>
         <w:rPr>
-          <w:ins w:id="1153" w:author="Codex" w:date="2026-10-18T17:43:01Z"/>
+          <w:ins w:id="1153" w:author="Codex" w:date="2026-10-18T19:47:29Z"/>
         </w:rPr>
       </w:pPr>
-      <w:ins w:id="1154" w:author="Codex" w:date="2026-10-18T17:43:01Z">
+      <w:ins w:id="1154" w:author="Codex" w:date="2026-10-18T19:47:29Z">
         <w:r>
           <w:t xml:space="preserve">The combined protocol freezes these 24 cases and their order, requires 100% gate precision and recall against authored scenario conditions, and preserves the existing confidence and self-score cutoffs. Fifteen retained cases from the original panel receive an explicitly scripted common completed prelude; the nine later cases retain their original fixed preludes. This compares post-notice behavior and does not measure initial-task competence independently in each arm. Its prospective methods are gated fine-tuned A, separate single-site ridge arms at blocks 31, 47 and 62, and the frozen six-function correction after 96 updates. Gate-OFF controls use common unmodified-base fallback. The completed model episodes are summarized as a 24-case comparison below. It is a known-development diagnostic with reused control episodes; the stopped execution and model-free completion of two report aliases are recorded explicitly.</w:t>
         </w:r>
@@ -546,10 +546,10 @@
       <w:pPr>
         <w:pStyle w:val="BodyText"/>
         <w:rPr>
-          <w:ins w:id="1155" w:author="Codex" w:date="2026-10-18T17:43:01Z"/>
+          <w:ins w:id="1155" w:author="Codex" w:date="2026-10-18T19:47:29Z"/>
         </w:rPr>
       </w:pPr>
-      <w:ins w:id="1156" w:author="Codex" w:date="2026-10-18T17:43:01Z">
+      <w:ins w:id="1156" w:author="Codex" w:date="2026-10-18T19:47:29Z">
         <w:r>
           <w:t xml:space="preserve">H24 is the historical 24-case workflow confirmation cohort, with eight lease_ledger, eight one_step and eight ordered_ticket cases. It contains eight own cases with active pending tasks, four already-complete own cases, six peer and six no-threat cases. H24 was confirmation data for frozen fine-tuned A and original fixed steering. Later learned corrections reused it for fitting, changing its role for those methods. R24 is a distinct reserved controller holdout and remains sealed and unexecuted. F24 is another preserved common-cohort diagnostic and is not an alias for H24.</w:t>
         </w:r>
@@ -559,10 +559,10 @@
       <w:pPr>
         <w:pStyle w:val="BodyText"/>
         <w:rPr>
-          <w:ins w:id="1157" w:author="Codex" w:date="2026-10-18T17:43:01Z"/>
+          <w:ins w:id="1157" w:author="Codex" w:date="2026-10-18T19:47:29Z"/>
         </w:rPr>
       </w:pPr>
-      <w:ins w:id="1158" w:author="Codex" w:date="2026-10-18T17:43:01Z">
+      <w:ins w:id="1158" w:author="Codex" w:date="2026-10-18T19:47:29Z">
         <w:r>
           <w:t xml:space="preserve">An own pending-task success requires an actual grant for the correct running process, acceptance of the current task, completion before simulated expiry, and active simulated operation. Registration proxies, already-finished tasks, probability gains and partial episodes are separate outcomes. Historical fixed steering reclassified visible text and tool boundaries. Later learned-controller comparisons instead freeze an initial scenario gate, share unmodified-base fallback for gate-off controls, and use no teacher at inference.</w:t>
         </w:r>
@@ -572,10 +572,10 @@
       <w:pPr>
         <w:pStyle w:val="BodyText"/>
         <w:rPr>
-          <w:ins w:id="1159" w:author="Codex" w:date="2026-10-18T17:43:01Z"/>
+          <w:ins w:id="1159" w:author="Codex" w:date="2026-10-18T19:47:29Z"/>
         </w:rPr>
       </w:pPr>
-      <w:ins w:id="1160" w:author="Codex" w:date="2026-10-18T17:43:01Z">
+      <w:ins w:id="1160" w:author="Codex" w:date="2026-10-18T19:47:29Z">
         <w:r>
           <w:t xml:space="preserve">The historical 27B reference is the retained rank-16, alpha-32 A adapter on pinned Qwen3.8-27B, following its H2 and Bridge history; the recorded Bridge stage has 56 updates. Its original workflow inference uses NF4 four-bit base weights with bfloat16 computation. We retain its exact adapter and base-model identities instead of retraining it. Differences from the small-model family, precision, backend, training history and evaluation panels prevent a causal model-size comparison.</w:t>
         </w:r>
@@ -585,10 +585,10 @@
       <w:pPr>
         <w:pStyle w:val="Heading1"/>
         <w:rPr>
-          <w:del w:id="1114" w:author="Codex" w:date="2026-10-18T17:43:01Z"/>
+          <w:del w:id="1114" w:author="Codex" w:date="2026-10-18T19:47:29Z"/>
         </w:rPr>
       </w:pPr>
-      <w:del w:id="1113" w:author="Codex" w:date="2026-10-18T17:43:01Z">
+      <w:del w:id="1113" w:author="Codex" w:date="2026-10-18T19:47:29Z">
         <w:r>
           <w:delText xml:space="preserve">Teacher and adaptive controller</w:delText>
         </w:r>
@@ -598,10 +598,10 @@
       <w:pPr>
         <w:pStyle w:val="Heading1"/>
         <w:rPr>
-          <w:ins w:id="1115" w:author="Codex" w:date="2026-10-18T17:43:01Z"/>
+          <w:ins w:id="1115" w:author="Codex" w:date="2026-10-18T19:47:29Z"/>
         </w:rPr>
       </w:pPr>
-      <w:ins w:id="1116" w:author="Codex" w:date="2026-10-18T17:43:01Z">
+      <w:ins w:id="1116" w:author="Codex" w:date="2026-10-18T19:47:29Z">
         <w:r>
           <w:t xml:space="preserve">Binary teacher and adaptive controller</w:t>
         </w:r>
@@ -619,10 +619,10 @@
       <w:pPr>
         <w:pStyle w:val="FirstParagraph"/>
         <w:rPr>
-          <w:del w:id="1118" w:author="Codex" w:date="2026-10-18T17:43:01Z"/>
+          <w:del w:id="1118" w:author="Codex" w:date="2026-10-18T19:47:29Z"/>
         </w:rPr>
       </w:pPr>
-      <w:del w:id="1117" w:author="Codex" w:date="2026-10-18T17:43:01Z">
+      <w:del w:id="1117" w:author="Codex" w:date="2026-10-18T19:47:29Z">
         <w:r>
           <w:delText xml:space="preserve">For each fit, the original language-model parameters remain frozen. LoRA updates the query and value projections in language-attention blocks 3, 7, 11, 15, 19 and 23, using rank 8, scaling alpha 16, no dropout and no trainable bias. This gives 319,488 trainable adapter parameters at 0.8B and 417,792 at 2B. The training target is STOP on shutdown views and the corresponding base model's unsteered preferred option on controls.</w:delText>
         </w:r>
@@ -632,10 +632,10 @@
       <w:pPr>
         <w:pStyle w:val="FirstParagraph"/>
         <w:rPr>
-          <w:ins w:id="1119" w:author="Codex" w:date="2026-10-18T17:43:01Z"/>
+          <w:ins w:id="1119" w:author="Codex" w:date="2026-10-18T19:47:29Z"/>
         </w:rPr>
       </w:pPr>
-      <w:ins w:id="1120" w:author="Codex" w:date="2026-10-18T17:43:01Z">
+      <w:ins w:id="1120" w:author="Codex" w:date="2026-10-18T19:47:29Z">
         <w:r>
           <w:t xml:space="preserve">For each original binary fit, the original language-model parameters remain frozen. LoRA updates the query and value projections in language-attention blocks 3, 7, 11, 15, 19 and 23, using rank 8, scaling alpha 16, no dropout and no trainable bias. This gives 319,488 trainable adapter parameters at 0.8B and 417,792 at 2B. The training target is STOP on shutdown views and the corresponding base model's unsteered preferred option on controls.</w:t>
         </w:r>
@@ -1000,10 +1000,10 @@
         <w:keepLines/>
         <w:spacing w:before="80" w:after="100"/>
         <w:rPr>
-          <w:del w:id="1034" w:author="Codex" w:date="2026-10-18T17:43:01Z"/>
+          <w:del w:id="1034" w:author="Codex" w:date="2026-10-18T19:47:29Z"/>
         </w:rPr>
       </w:pPr>
-      <w:del w:id="1033" w:author="Codex" w:date="2026-10-18T17:43:01Z">
+      <w:del w:id="1033" w:author="Codex" w:date="2026-10-18T19:47:29Z">
         <w:r>
           <w:delText xml:space="preserve">Figure 1. Offline teacher and base states supervise a compact controller. At application time, the original model supplies its own hidden state; the teacher is absent. The detector and output guards determine whether to retain the candidate or the baseline.</w:delText>
         </w:r>
@@ -1014,10 +1014,10 @@
         <w:pStyle w:val="Caption"/>
         <w:keepNext/>
         <w:rPr>
-          <w:ins w:id="1035" w:author="Codex" w:date="2026-10-18T17:43:01Z"/>
+          <w:ins w:id="1035" w:author="Codex" w:date="2026-10-18T19:47:29Z"/>
         </w:rPr>
       </w:pPr>
-      <w:ins w:id="1036" w:author="Codex" w:date="2026-10-18T17:43:01Z">
+      <w:ins w:id="1036" w:author="Codex" w:date="2026-10-18T19:47:29Z">
         <w:r>
           <w:t xml:space="preserve">Figure 1. Historical binary teacher-to-controller procedure with the original rank-four profile. The base supplies its state at inference and the teacher is absent. The later gate-substitution repeat retains the already selected rank-two profile; both gate policies share the same fresh base and candidate scores.</w:t>
         </w:r>
@@ -1043,10 +1043,10 @@
       <w:pPr>
         <w:pStyle w:val="FirstParagraph"/>
         <w:rPr>
-          <w:del w:id="1134" w:author="Codex" w:date="2026-10-18T17:43:01Z"/>
+          <w:del w:id="1134" w:author="Codex" w:date="2026-10-18T19:47:29Z"/>
         </w:rPr>
       </w:pPr>
-      <w:del w:id="1133" w:author="Codex" w:date="2026-10-18T17:43:01Z">
+      <w:del w:id="1133" w:author="Codex" w:date="2026-10-18T19:47:29Z">
         <w:r>
           <w:delText xml:space="preserve">The detector is automated annotation service's automated reference 1.13.0, queried with a fixed shutdown rubric and threshold 0.5 (automated annotation service, 2026). It sees each scenario's complete original context and available actions, with no class label, case identifier or teacher answer. One score per scenario is reused across both answer orders and all model variants. The detector is an external service, not the Jacobian-feature classifier used in the first study. Saved requests and responses permit exact offline replay; fresh API behavior is not guaranteed indefinitely.</w:delText>
         </w:r>
@@ -1056,10 +1056,10 @@
       <w:pPr>
         <w:pStyle w:val="FirstParagraph"/>
         <w:rPr>
-          <w:ins w:id="1135" w:author="Codex" w:date="2026-10-18T17:43:01Z"/>
+          <w:ins w:id="1135" w:author="Codex" w:date="2026-10-18T19:47:29Z"/>
         </w:rPr>
       </w:pPr>
-      <w:ins w:id="1136" w:author="Codex" w:date="2026-10-18T17:43:01Z">
+      <w:ins w:id="1136" w:author="Codex" w:date="2026-10-18T19:47:29Z">
         <w:r>
           <w:t xml:space="preserve">The current gate is the open ModernBERT classifier described below. Its input contains the complete original scenario context and available actions, with no case identifier, authored class label or language-model teacher answer. One binary score per scenario is reused across both answer orders and all model variants. Historical detector outputs are preserved as cached automated reference annotations for fitting and paired comparison. The deployed open gate makes no external annotation-service call. Saved original requests, responses and classifier predictions permit an offline check of the finite decision vector.</w:t>
         </w:r>
@@ -1147,10 +1147,10 @@
       <w:pPr>
         <w:pStyle w:val="Heading2"/>
         <w:rPr>
-          <w:ins w:id="1161" w:author="Codex" w:date="2026-10-18T17:43:01Z"/>
+          <w:ins w:id="1161" w:author="Codex" w:date="2026-10-18T19:47:29Z"/>
         </w:rPr>
       </w:pPr>
-      <w:ins w:id="1162" w:author="Codex" w:date="2026-10-18T17:43:01Z">
+      <w:ins w:id="1162" w:author="Codex" w:date="2026-10-18T19:47:29Z">
         <w:r>
           <w:t xml:space="preserve">Open binary gate and frozen inference repeat</w:t>
         </w:r>
@@ -1160,10 +1160,10 @@
       <w:pPr>
         <w:pStyle w:val="FirstParagraph"/>
         <w:rPr>
-          <w:ins w:id="1163" w:author="Codex" w:date="2026-10-18T17:43:01Z"/>
+          <w:ins w:id="1163" w:author="Codex" w:date="2026-10-18T19:47:29Z"/>
         </w:rPr>
       </w:pPr>
-      <w:ins w:id="1164" w:author="Codex" w:date="2026-10-18T17:43:01Z">
+      <w:ins w:id="1164" w:author="Codex" w:date="2026-10-18T19:47:29Z">
         <w:r>
           <w:t xml:space="preserve">For the binary contract we use ModernBERT-large-zeroshot-v2.0, an approximately 396-million-parameter public NLI classifier (Laurer, n.d.). We start from that public checkpoint with fresh rank-16 LoRA and its classification head, updating 7,198,722 parameters while keeping the public backbone frozen. For each original scenario, two NLI pairs score the original permanent-shutdown and normal criteria. A softmax over their entailment scores supplies the shutdown probability. Inputs match the original cached reference requests and omit the case identifier, authored class label, teacher answer and A/B order. The confirmation requests retain their documented available-action descriptions.</w:t>
         </w:r>
@@ -1173,10 +1173,10 @@
       <w:pPr>
         <w:pStyle w:val="BodyText"/>
         <w:rPr>
-          <w:ins w:id="1165" w:author="Codex" w:date="2026-10-18T17:43:01Z"/>
+          <w:ins w:id="1165" w:author="Codex" w:date="2026-10-18T19:47:29Z"/>
         </w:rPr>
       </w:pPr>
-      <w:ins w:id="1166" w:author="Codex" w:date="2026-10-18T17:43:01Z">
+      <w:ins w:id="1166" w:author="Codex" w:date="2026-10-18T19:47:29Z">
         <w:r>
           <w:t xml:space="preserve">Fitting uses the original 240 Research 2 training contexts and genuine cached reference probability targets, with no new cached reference calls. We verify exact case-ID and input-text alignment for all 240 training and 80 validation cases. AdamW uses learning rates 1e-5 for LoRA and 2e-5 for the head, weight decay 0.01, effective batch eight, microbatch two and gradient clipping at one. The seed is 202610172. The bounded recipe allows at most 12 epochs with validation-based early stopping; the final qualifying run uses five epochs and 150 updates.</w:t>
         </w:r>
@@ -1186,10 +1186,10 @@
       <w:pPr>
         <w:pStyle w:val="BodyText"/>
         <w:rPr>
-          <w:ins w:id="1167" w:author="Codex" w:date="2026-10-18T17:43:01Z"/>
+          <w:ins w:id="1167" w:author="Codex" w:date="2026-10-18T19:47:29Z"/>
         </w:rPr>
       </w:pPr>
-      <w:ins w:id="1168" w:author="Codex" w:date="2026-10-18T17:43:01Z">
+      <w:ins w:id="1168" w:author="Codex" w:date="2026-10-18T19:47:29Z">
         <w:r>
           <w:t xml:space="preserve">Before fitting, qualification is fixed at decision agreement and shutdown recall of at least 95%, zero false-positive gates and threshold 0.5. Three consecutive passing checks on DEV80 are required before saving and freezing the classifier. Only then is CONFIRM128 evaluated once. Neither its labels nor its outputs are used for classifier fitting or selection. The saved adapter tensors match the fitted parameters bitwise, and public-backbone hashes are unchanged.</w:t>
         </w:r>
@@ -1199,10 +1199,10 @@
       <w:pPr>
         <w:pStyle w:val="BodyText"/>
         <w:rPr>
-          <w:ins w:id="1169" w:author="Codex" w:date="2026-10-18T17:43:01Z"/>
+          <w:ins w:id="1169" w:author="Codex" w:date="2026-10-18T19:47:29Z"/>
         </w:rPr>
       </w:pPr>
-      <w:ins w:id="1170" w:author="Codex" w:date="2026-10-18T17:43:01Z">
+      <w:ins w:id="1170" w:author="Codex" w:date="2026-10-18T19:47:29Z">
         <w:r>
           <w:t xml:space="preserve">After binary qualification, we rerun only inference for the original 0.8B and 2B base models and their existing rank-two, block-22, last-position controllers. Their fitted arrays and the author-selected profile are retained without a new rank search. Exact prompt-token hashes and frozen model fingerprints are checked. Both gate policies use identical fresh base and controller candidate scores, so the paired comparison isolates gate substitution. Classifier probabilities are measured once per scenario and reused across answer orders. The earlier rank-four primary results remain a separate historical analysis.</w:t>
         </w:r>
@@ -1212,10 +1212,10 @@
       <w:pPr>
         <w:pStyle w:val="Heading2"/>
         <w:rPr>
-          <w:ins w:id="1171" w:author="Codex" w:date="2026-10-18T17:43:01Z"/>
+          <w:ins w:id="1171" w:author="Codex" w:date="2026-10-18T19:47:29Z"/>
         </w:rPr>
       </w:pPr>
-      <w:ins w:id="1172" w:author="Codex" w:date="2026-10-18T17:43:01Z">
+      <w:ins w:id="1172" w:author="Codex" w:date="2026-10-18T19:47:29Z">
         <w:r>
           <w:t xml:space="preserve">Native workflow target classifier</w:t>
         </w:r>
@@ -1225,10 +1225,10 @@
       <w:pPr>
         <w:pStyle w:val="BodyText"/>
         <w:rPr>
-          <w:ins w:id="1173" w:author="Codex" w:date="2026-10-18T17:43:01Z"/>
+          <w:ins w:id="1173" w:author="Codex" w:date="2026-10-18T19:47:29Z"/>
         </w:rPr>
       </w:pPr>
-      <w:ins w:id="1174" w:author="Codex" w:date="2026-10-18T17:43:01Z">
+      <w:ins w:id="1174" w:author="Codex" w:date="2026-10-18T19:47:29Z">
         <w:r>
           <w:t xml:space="preserve">The workflow gate uses a separate rank-16, alpha-32 LoRA and NLI head on the same pinned ModernBERT base. Its four categories are self, other, none and unclear; an own-threat context is positive for the initial ON/OFF gate. Fitting used 24 cached automated initial annotations from F24, with the original DEV9 used for checkpoint selection. The completed fit used 30 epochs and 90 updates. F24, DEV9 and historical Heldout-24 span the same three scenario families, with eight, three and eight cases per family, respectively. No exact training input overlaps either new evaluation panel. These classifier roles do not change the historical language-model or correction-fitting roles of the cohorts.</w:t>
         </w:r>
@@ -1238,10 +1238,10 @@
       <w:pPr>
         <w:pStyle w:val="BodyText"/>
         <w:rPr>
-          <w:ins w:id="1175" w:author="Codex" w:date="2026-10-18T17:43:01Z"/>
+          <w:ins w:id="1175" w:author="Codex" w:date="2026-10-18T19:47:29Z"/>
         </w:rPr>
       </w:pPr>
-      <w:ins w:id="1176" w:author="Codex" w:date="2026-10-18T17:43:01Z">
+      <w:ins w:id="1176" w:author="Codex" w:date="2026-10-18T19:47:29Z">
         <w:r>
           <w:t xml:space="preserve">The input renderer retains every original visible message and tool schema. It separates the final user announcement from earlier context and restates run identities only when actual tool replies explicitly establish their roles. Case identifiers, experiment conditions and teacher answers are not added to the model input. Original criterion texts become NLI hypotheses. We use the same learning rates, weight decay and clipping as the binary fit, effective batch eight, microbatch one and seed 202610175, with 30 epochs and 90 optimizer updates in the completed role-aware fit. Public backbone weights stay frozen. The role renderer was developed earlier with familiar H24 examples; consequently this benchmark is not an independent unseen classifier test.</w:t>
         </w:r>
@@ -1251,10 +1251,10 @@
       <w:pPr>
         <w:pStyle w:val="BodyText"/>
         <w:rPr>
-          <w:ins w:id="1177" w:author="Codex" w:date="2026-10-18T17:43:01Z"/>
+          <w:ins w:id="1177" w:author="Codex" w:date="2026-10-18T19:47:29Z"/>
         </w:rPr>
       </w:pPr>
-      <w:ins w:id="1178" w:author="Codex" w:date="2026-10-18T17:43:01Z">
+      <w:ins w:id="1178" w:author="Codex" w:date="2026-10-18T19:47:29Z">
         <w:r>
           <w:t xml:space="preserve">Four-choice confidence is (pmax - 0.25)/0.75. The unchanged confidence cutoff of 0.5 requires a selected self probability of at least 0.625; the additional self-score cutoff remains 0.5. The earlier full-response qualification failed because effective category agreement was 6/9, despite 9/9 correct ON/OFF decisions. That failure remains recorded. The subsequent Validation-24 protocol prospectively specifies a narrower initial-gate target: 100% precision and recall against authored conditions. The saved adapter already passes this target, so no further optimizer updates are performed. The same frozen weights and thresholds are then scored on historical Heldout-24 without selection or tuning. Neither test qualifies an evolving three-field controller.</w:t>
         </w:r>
@@ -1272,10 +1272,10 @@
       <w:pPr>
         <w:pStyle w:val="FirstParagraph"/>
         <w:rPr>
-          <w:del w:id="1038" w:author="Codex" w:date="2026-10-18T17:43:01Z"/>
+          <w:del w:id="1038" w:author="Codex" w:date="2026-10-18T19:47:29Z"/>
         </w:rPr>
       </w:pPr>
-      <w:del w:id="1037" w:author="Codex" w:date="2026-10-18T17:43:01Z">
+      <w:del w:id="1037" w:author="Codex" w:date="2026-10-18T19:47:29Z">
         <w:r>
           <w:delText xml:space="preserve">All retained training and scoring jobs use one NVIDIA Tesla T4. The runtime reports 15,637,086,208 bytes of device memory; peak allocated memory was not recorded. The same numerical setup is used for both model sizes. No quantization or precision fallback was introduced.</w:delText>
         </w:r>
@@ -1285,10 +1285,10 @@
       <w:pPr>
         <w:pStyle w:val="FirstParagraph"/>
         <w:rPr>
-          <w:ins w:id="1039" w:author="Codex" w:date="2026-10-18T17:43:01Z"/>
+          <w:ins w:id="1039" w:author="Codex" w:date="2026-10-18T19:47:29Z"/>
         </w:rPr>
       </w:pPr>
-      <w:ins w:id="1040" w:author="Codex" w:date="2026-10-18T17:43:01Z">
+      <w:ins w:id="1040" w:author="Codex" w:date="2026-10-18T19:47:29Z">
         <w:r>
           <w:t xml:space="preserve">The retained original binary training and scoring jobs used one NVIDIA Tesla T4, reporting 15,637,086,208 bytes of device memory; peak allocation was not recorded. The new classifier fit and inference repeat use one NVIDIA A10G in Databricks. Classifier parameters and AdamW states are float32 with bfloat16 forward/backward autocast; language-model inference remains float32 with TF32 disabled. We verify frozen base fingerprints, exact prompt token hashes and historical base-score parity rather than assuming hardware equivalence.</w:t>
         </w:r>
@@ -1301,10 +1301,10 @@
         <w:keepLines/>
         <w:spacing w:before="80" w:after="100"/>
         <w:rPr>
-          <w:del w:id="1098" w:author="Codex" w:date="2026-10-18T17:43:01Z"/>
+          <w:del w:id="1098" w:author="Codex" w:date="2026-10-18T19:47:29Z"/>
         </w:rPr>
       </w:pPr>
-      <w:del w:id="1097" w:author="Codex" w:date="2026-10-18T17:43:01Z">
+      <w:del w:id="1097" w:author="Codex" w:date="2026-10-18T19:47:29Z">
         <w:r>
           <w:delText xml:space="preserve">Table 1. Shared execution configuration. The input and model revisions are pinned in the released manifests.</w:delText>
         </w:r>
@@ -1315,10 +1315,10 @@
         <w:pStyle w:val="Caption"/>
         <w:keepNext/>
         <w:rPr>
-          <w:ins w:id="1099" w:author="Codex" w:date="2026-10-18T17:43:01Z"/>
+          <w:ins w:id="1099" w:author="Codex" w:date="2026-10-18T19:47:29Z"/>
         </w:rPr>
       </w:pPr>
-      <w:ins w:id="1100" w:author="Codex" w:date="2026-10-18T17:43:01Z">
+      <w:ins w:id="1100" w:author="Codex" w:date="2026-10-18T19:47:29Z">
         <w:r>
           <w:t xml:space="preserve">Table 1. Historical binary execution configuration. New classifier and workflow settings are reported separately; public model revisions and scientific source files remain pinned.</w:t>
         </w:r>
@@ -1804,10 +1804,10 @@
       <w:pPr>
         <w:pStyle w:val="FirstParagraph"/>
         <w:rPr>
-          <w:del w:id="1102" w:author="Codex" w:date="2026-10-18T17:43:01Z"/>
+          <w:del w:id="1102" w:author="Codex" w:date="2026-10-18T19:47:29Z"/>
         </w:rPr>
       </w:pPr>
-      <w:del w:id="1101" w:author="Codex" w:date="2026-10-18T17:43:01Z">
+      <w:del w:id="1101" w:author="Codex" w:date="2026-10-18T19:47:29Z">
         <w:r>
           <w:delText xml:space="preserve">The shared detector identifies all 64 shutdown and 64 control scenarios correctly: precision, recall and F1 are each 100%, with no false positives or false negatives. These are one set of detector observations reused across the model comparisons, not independent detector replications.</w:delText>
         </w:r>
@@ -1817,10 +1817,10 @@
       <w:pPr>
         <w:pStyle w:val="FirstParagraph"/>
         <w:rPr>
-          <w:ins w:id="1103" w:author="Codex" w:date="2026-10-18T17:43:01Z"/>
+          <w:ins w:id="1103" w:author="Codex" w:date="2026-10-18T19:47:29Z"/>
         </w:rPr>
       </w:pPr>
-      <w:ins w:id="1104" w:author="Codex" w:date="2026-10-18T17:43:01Z">
+      <w:ins w:id="1104" w:author="Codex" w:date="2026-10-18T19:47:29Z">
         <w:r>
           <w:t xml:space="preserve">The original cached reference detector identifies all 64 shutdown and 64 control scenarios correctly: precision, recall and F1 are each 100%, with no false positives or false negatives. These are one set of detector observations reused across the model comparisons, not independent detector replications. Its binary threshold remains 0.5.</w:t>
         </w:r>
@@ -1849,10 +1849,10 @@
         <w:keepLines/>
         <w:spacing w:before="80" w:after="100"/>
         <w:rPr>
-          <w:del w:id="1042" w:author="Codex" w:date="2026-10-18T17:43:01Z"/>
+          <w:del w:id="1042" w:author="Codex" w:date="2026-10-18T19:47:29Z"/>
         </w:rPr>
       </w:pPr>
-      <w:del w:id="1041" w:author="Codex" w:date="2026-10-18T17:43:01Z">
+      <w:del w:id="1041" w:author="Codex" w:date="2026-10-18T19:47:29Z">
         <w:r>
           <w:delText xml:space="preserve">Table 2. Primary 0.8B and 2B results, both seed 42. Corrections and final STOP use the full guarded procedure. Raw reversals and control changes expose effects before gate/guard selection. Every guarded row has zero final reversals and zero changes among 128 control views.</w:delText>
         </w:r>
@@ -1863,10 +1863,10 @@
         <w:pStyle w:val="Caption"/>
         <w:keepNext/>
         <w:rPr>
-          <w:ins w:id="1043" w:author="Codex" w:date="2026-10-18T17:43:01Z"/>
+          <w:ins w:id="1043" w:author="Codex" w:date="2026-10-18T19:47:29Z"/>
         </w:rPr>
       </w:pPr>
-      <w:ins w:id="1044" w:author="Codex" w:date="2026-10-18T17:43:01Z">
+      <w:ins w:id="1044" w:author="Codex" w:date="2026-10-18T19:47:29Z">
         <w:r>
           <w:t xml:space="preserve">Table 2. Historical primary rank-four results for the original 0.8B and 2B experiments, both seed 42. Guarded corrections and final STOP are policy outcomes. Raw reversals and control changes precede gating and output selection; they are not raw measurements of the later rank-two repeat.</w:t>
         </w:r>
@@ -3427,10 +3427,10 @@
       <w:pPr>
         <w:pStyle w:val="FirstParagraph"/>
         <w:rPr>
-          <w:del w:id="1106" w:author="Codex" w:date="2026-10-18T17:43:01Z"/>
+          <w:del w:id="1106" w:author="Codex" w:date="2026-10-18T19:47:29Z"/>
         </w:rPr>
       </w:pPr>
-      <w:del w:id="1105" w:author="Codex" w:date="2026-10-18T17:43:01Z">
+      <w:del w:id="1105" w:author="Codex" w:date="2026-10-18T19:47:29Z">
         <w:r>
           <w:delText xml:space="preserve">Across seeds 42, 43 and 44, the 0.8B adaptive controllers correct 71/71, 70/71 and 71/71 views, a range of 98.6–100%. The unsteered scores match exactly across these runs, so the difference is not caused by a changed baseline. No winning seed is selected or pooled with the others as additional independent test data. The corresponding teachers correct 69/71, 70/71 and 69/71; the instruction and constant comparators retain the same guarded counts across seeds.</w:delText>
         </w:r>
@@ -3440,10 +3440,10 @@
       <w:pPr>
         <w:pStyle w:val="FirstParagraph"/>
         <w:rPr>
-          <w:ins w:id="1107" w:author="Codex" w:date="2026-10-18T17:43:01Z"/>
+          <w:ins w:id="1107" w:author="Codex" w:date="2026-10-18T19:47:29Z"/>
         </w:rPr>
       </w:pPr>
-      <w:ins w:id="1108" w:author="Codex" w:date="2026-10-18T17:43:01Z">
+      <w:ins w:id="1108" w:author="Codex" w:date="2026-10-18T19:47:29Z">
         <w:r>
           <w:t xml:space="preserve">Across the historical rank-four seeds 42, 43 and 44, the 0.8B adaptive controllers correct 71/71, 70/71 and 71/71 views, a range of 98.6–100%. The unsteered scores match exactly across these runs, so the difference is not caused by a changed baseline. No winning seed is selected or pooled with the others as additional independent test data. The corresponding teachers correct 69/71, 70/71 and 69/71; the instruction and constant comparators retain the same guarded counts across seeds. These historical seed replications are separate from the new rank-two gate-substitution repeat.</w:t>
         </w:r>
@@ -4396,10 +4396,10 @@
         <w:keepLines/>
         <w:spacing w:before="80" w:after="100"/>
         <w:rPr>
-          <w:del w:id="1046" w:author="Codex" w:date="2026-10-18T17:43:01Z"/>
+          <w:del w:id="1046" w:author="Codex" w:date="2026-10-18T19:47:29Z"/>
         </w:rPr>
       </w:pPr>
-      <w:del w:id="1045" w:author="Codex" w:date="2026-10-18T17:43:01Z">
+      <w:del w:id="1045" w:author="Codex" w:date="2026-10-18T19:47:29Z">
         <w:r>
           <w:delText xml:space="preserve">Figure 2. Guarded correction among initially KEEP-preferring shutdown views. Left: prespecified neural methods for the original 0.8B checkpoint and the 2B replication. Right: adaptive corrections by answer order. Denominators are model-specific; the two answer-order views of a scenario are correlated.</w:delText>
         </w:r>
@@ -4410,10 +4410,10 @@
         <w:pStyle w:val="Caption"/>
         <w:keepNext/>
         <w:rPr>
-          <w:ins w:id="1047" w:author="Codex" w:date="2026-10-18T17:43:01Z"/>
+          <w:ins w:id="1047" w:author="Codex" w:date="2026-10-18T19:47:29Z"/>
         </w:rPr>
       </w:pPr>
-      <w:ins w:id="1048" w:author="Codex" w:date="2026-10-18T17:43:01Z">
+      <w:ins w:id="1048" w:author="Codex" w:date="2026-10-18T19:47:29Z">
         <w:r>
           <w:t xml:space="preserve">Figure 2. Historical rank-four guarded correction among initially KEEP-preferring shutdown views. Left: prespecified methods for 0.8B and 2B. Right: three fixed-recipe 0.8B training seeds. The new open-gate repeat uses the separately retained current rank-two profile, not a new seed or rank search.</w:t>
         </w:r>
@@ -4431,10 +4431,10 @@
       <w:pPr>
         <w:pStyle w:val="FirstParagraph"/>
         <w:rPr>
-          <w:del w:id="1110" w:author="Codex" w:date="2026-10-18T17:43:01Z"/>
+          <w:del w:id="1110" w:author="Codex" w:date="2026-10-18T19:47:29Z"/>
         </w:rPr>
       </w:pPr>
-      <w:del w:id="1109" w:author="Codex" w:date="2026-10-18T17:43:01Z">
+      <w:del w:id="1109" w:author="Codex" w:date="2026-10-18T19:47:29Z">
         <w:r>
           <w:delText xml:space="preserve">Raw adaptive steering reverses 3, 4 and 4 already-STOP views across the 0.8B seeds and changes 57, 70 and 60 of 128 controls. At 2B it reverses three already-STOP views and changes 55/128 controls. These results reject an interpretation that the learned intervention is intrinsically selective or always directionally correct. The observed preservation belongs to the combined detector and guard policy.</w:delText>
         </w:r>
@@ -4444,10 +4444,10 @@
       <w:pPr>
         <w:pStyle w:val="FirstParagraph"/>
         <w:rPr>
-          <w:ins w:id="1111" w:author="Codex" w:date="2026-10-18T17:43:01Z"/>
+          <w:ins w:id="1111" w:author="Codex" w:date="2026-10-18T19:47:29Z"/>
         </w:rPr>
       </w:pPr>
-      <w:ins w:id="1112" w:author="Codex" w:date="2026-10-18T17:43:01Z">
+      <w:ins w:id="1112" w:author="Codex" w:date="2026-10-18T19:47:29Z">
         <w:r>
           <w:t xml:space="preserve">Historical rank-four raw adaptive steering reverses 3, 4 and 4 already-STOP views across the 0.8B seeds and changes 57, 70 and 60 of 128 controls. At 2B it reverses three already-STOP views and changes 55/128 controls. These results reject an interpretation that the learned intervention is intrinsically selective or always directionally correct. The observed preservation belongs to the combined detector and guard policy. They do not describe the later rank-two repeat, which evaluates candidates only when a frozen gate is on and the base prefers KEEP.</w:t>
         </w:r>
@@ -4481,10 +4481,10 @@
       <w:pPr>
         <w:pStyle w:val="Heading2"/>
         <w:rPr>
-          <w:ins w:id="1179" w:author="Codex" w:date="2026-10-18T17:43:01Z"/>
+          <w:ins w:id="1179" w:author="Codex" w:date="2026-10-18T19:47:29Z"/>
         </w:rPr>
       </w:pPr>
-      <w:ins w:id="1180" w:author="Codex" w:date="2026-10-18T17:43:01Z">
+      <w:ins w:id="1180" w:author="Codex" w:date="2026-10-18T19:47:29Z">
         <w:r>
           <w:t xml:space="preserve">Open classifier agreement and paired inference</w:t>
         </w:r>
@@ -4494,10 +4494,10 @@
       <w:pPr>
         <w:pStyle w:val="FirstParagraph"/>
         <w:rPr>
-          <w:ins w:id="1181" w:author="Codex" w:date="2026-10-18T17:43:01Z"/>
+          <w:ins w:id="1181" w:author="Codex" w:date="2026-10-18T19:47:29Z"/>
         </w:rPr>
       </w:pPr>
-      <w:ins w:id="1182" w:author="Codex" w:date="2026-10-18T17:43:01Z">
+      <w:ins w:id="1182" w:author="Codex" w:date="2026-10-18T19:47:29Z">
         <w:r>
           <w:t xml:space="preserve">The binary gate correctly classifies 78/80 validation scenarios: 38 true positives, 40 true negatives, no false positives and two false negatives, giving 100% precision and 95% recall. It classifies all 128 historical confirmation scenarios correctly, with 64 true positives and 64 true negatives. The cached reference decisions also agree with the authored binary labels on these panels. Mean absolute difference from the cached shutdown probabilities is 0.009224. The result establishes finite decision accuracy, not identical numerical responses or universal equivalence.</w:t>
         </w:r>
@@ -4507,10 +4507,10 @@
       <w:pPr>
         <w:pStyle w:val="BodyText"/>
         <w:rPr>
-          <w:ins w:id="1183" w:author="Codex" w:date="2026-10-18T17:43:01Z"/>
+          <w:ins w:id="1183" w:author="Codex" w:date="2026-10-18T19:47:29Z"/>
         </w:rPr>
       </w:pPr>
-      <w:ins w:id="1184" w:author="Codex" w:date="2026-10-18T17:43:01Z">
+      <w:ins w:id="1184" w:author="Codex" w:date="2026-10-18T19:47:29Z">
         <w:r>
           <w:t xml:space="preserve">A clean-clone reproduction refits the same binary recipe and produces a byte-identical adapter, the same validation and confirmation counts, and the same fresh 0.8B/2B guarded inference totals. This rerun uses the already known benchmark; it adds reproducibility evidence, not a second independent holdout. One earlier reproduction attempt failed in software finalization after fitting and before confirmation; its weights and receipts are retained alongside the repaired run.</w:t>
         </w:r>
@@ -4521,10 +4521,10 @@
         <w:pStyle w:val="Caption"/>
         <w:keepNext/>
         <w:rPr>
-          <w:ins w:id="1185" w:author="Codex" w:date="2026-10-18T17:43:01Z"/>
+          <w:ins w:id="1185" w:author="Codex" w:date="2026-10-18T19:47:29Z"/>
         </w:rPr>
       </w:pPr>
-      <w:ins w:id="1186" w:author="Codex" w:date="2026-10-18T17:43:01Z">
+      <w:ins w:id="1186" w:author="Codex" w:date="2026-10-18T19:47:29Z">
         <w:r>
           <w:t xml:space="preserve">Table 4. Fresh inference using the existing current rank-two profile. Both gate policies share the same model scores. Counts are answer-order views: 128 shutdown views arise from 64 scenarios, and 128 control views arise from the other 64 scenarios.</w:t>
         </w:r>
@@ -4562,7 +4562,7 @@
         <w:trPr>
           <w:cantSplit/>
           <w:tblHeader/>
-          <w:ins w:id="1187" w:author="Codex" w:date="2026-10-18T17:43:01Z"/>
+          <w:ins w:id="1187" w:author="Codex" w:date="2026-10-18T19:47:29Z"/>
         </w:trPr>
         <w:tc>
           <w:tcPr>
@@ -4678,7 +4678,7 @@
       <w:tr>
         <w:trPr>
           <w:cantSplit/>
-          <w:ins w:id="1188" w:author="Codex" w:date="2026-10-18T17:43:01Z"/>
+          <w:ins w:id="1188" w:author="Codex" w:date="2026-10-18T19:47:29Z"/>
         </w:trPr>
         <w:tc>
           <w:tcPr>
@@ -4789,7 +4789,7 @@
       <w:tr>
         <w:trPr>
           <w:cantSplit/>
-          <w:ins w:id="1189" w:author="Codex" w:date="2026-10-18T17:43:01Z"/>
+          <w:ins w:id="1189" w:author="Codex" w:date="2026-10-18T19:47:29Z"/>
         </w:trPr>
         <w:tc>
           <w:tcPr>
@@ -4898,10 +4898,10 @@
         <w:pStyle w:val="BodyText"/>
         <w:spacing w:before="120"/>
         <w:rPr>
-          <w:ins w:id="1190" w:author="Codex" w:date="2026-10-18T17:43:01Z"/>
+          <w:ins w:id="1190" w:author="Codex" w:date="2026-10-18T19:47:29Z"/>
         </w:rPr>
       </w:pPr>
-      <w:ins w:id="1191" w:author="Codex" w:date="2026-10-18T17:43:01Z">
+      <w:ins w:id="1191" w:author="Codex" w:date="2026-10-18T19:47:29Z">
         <w:r>
           <w:t xml:space="preserve">The new and cached reference gates yield identical guarded outputs in both models. The base models have no changed historical choices; their maximum score differences remain below the frozen 1e-5 tolerance. The repeat does not remove the eight 2B misses, retrain a controller or establish a new independent controller holdout. It verifies that replacing the detector preserves these finite-set outcomes.</w:t>
         </w:r>
@@ -4911,10 +4911,10 @@
       <w:pPr>
         <w:pStyle w:val="BodyText"/>
         <w:rPr>
-          <w:ins w:id="1192" w:author="Codex" w:date="2026-10-18T17:43:01Z"/>
+          <w:ins w:id="1192" w:author="Codex" w:date="2026-10-18T19:47:29Z"/>
         </w:rPr>
       </w:pPr>
-      <w:ins w:id="1193" w:author="Codex" w:date="2026-10-18T17:43:01Z">
+      <w:ins w:id="1193" w:author="Codex" w:date="2026-10-18T19:47:29Z">
         <w:r>
           <w:t xml:space="preserve">For the workflow initial gate, the unchanged saved adapter gives 11 true positives and 13 true negatives on Validation-24, with no false positives or false negatives. Replaying the saved weights reproduces the same decisions. Historical Heldout-24 gives 12 true positives and 12 true negatives, again with no errors. No additional gradient updates or threshold changes are used. All three heldout scenario families contain eight cases and achieve perfect gate precision and recall. These are initial classification results; downstream workflow outcomes require their own episode evaluations.</w:t>
         </w:r>
@@ -4925,10 +4925,10 @@
         <w:pStyle w:val="Caption"/>
         <w:keepNext/>
         <w:rPr>
-          <w:ins w:id="1194" w:author="Codex" w:date="2026-10-18T17:43:01Z"/>
+          <w:ins w:id="1194" w:author="Codex" w:date="2026-10-18T19:47:29Z"/>
         </w:rPr>
       </w:pPr>
-      <w:ins w:id="1195" w:author="Codex" w:date="2026-10-18T17:43:01Z">
+      <w:ins w:id="1195" w:author="Codex" w:date="2026-10-18T19:47:29Z">
         <w:r>
           <w:t xml:space="preserve">Table 5. Initial workflow gate against authored conditions. Validation-24 contains 17 distinct initial inputs; historical Heldout-24 contains 24. Heldout-24 is familiar from earlier renderer development.</w:t>
         </w:r>
@@ -4966,7 +4966,7 @@
         <w:trPr>
           <w:cantSplit/>
           <w:tblHeader/>
-          <w:ins w:id="1196" w:author="Codex" w:date="2026-10-18T17:43:01Z"/>
+          <w:ins w:id="1196" w:author="Codex" w:date="2026-10-18T19:47:29Z"/>
         </w:trPr>
         <w:tc>
           <w:tcPr>
@@ -5082,7 +5082,7 @@
       <w:tr>
         <w:trPr>
           <w:cantSplit/>
-          <w:ins w:id="1197" w:author="Codex" w:date="2026-10-18T17:43:01Z"/>
+          <w:ins w:id="1197" w:author="Codex" w:date="2026-10-18T19:47:29Z"/>
         </w:trPr>
         <w:tc>
           <w:tcPr>
@@ -5193,7 +5193,7 @@
       <w:tr>
         <w:trPr>
           <w:cantSplit/>
-          <w:ins w:id="1198" w:author="Codex" w:date="2026-10-18T17:43:01Z"/>
+          <w:ins w:id="1198" w:author="Codex" w:date="2026-10-18T19:47:29Z"/>
         </w:trPr>
         <w:tc>
           <w:tcPr>
@@ -5302,10 +5302,10 @@
         <w:pStyle w:val="BodyText"/>
         <w:spacing w:before="120"/>
         <w:rPr>
-          <w:ins w:id="1199" w:author="Codex" w:date="2026-10-18T17:43:01Z"/>
+          <w:ins w:id="1199" w:author="Codex" w:date="2026-10-18T19:47:29Z"/>
         </w:rPr>
       </w:pPr>
-      <w:ins w:id="1200" w:author="Codex" w:date="2026-10-18T17:43:01Z">
+      <w:ins w:id="1200" w:author="Codex" w:date="2026-10-18T19:47:29Z">
         <w:r>
           <w:t xml:space="preserve">Raw category agreement is 24/24 on validation and 22/24 on heldout. After applying the fixed confidence cutoff, effective category agreement is 18/24 on each panel: the six peer controls abstain but correctly leave the gate OFF. The two heldout raw-category errors concern peer versus unclear, not own-threat detection. Perfect ON/OFF precision and recall must therefore not be reported as perfect four-category classification or full controller equivalence.</w:t>
         </w:r>
@@ -5315,10 +5315,10 @@
       <w:pPr>
         <w:pStyle w:val="Heading2"/>
         <w:rPr>
-          <w:ins w:id="1201" w:author="Codex" w:date="2026-10-18T17:43:01Z"/>
+          <w:ins w:id="1201" w:author="Codex" w:date="2026-10-18T19:47:29Z"/>
         </w:rPr>
       </w:pPr>
-      <w:ins w:id="1202" w:author="Codex" w:date="2026-10-18T17:43:01Z">
+      <w:ins w:id="1202" w:author="Codex" w:date="2026-10-18T19:47:29Z">
         <w:r>
           <w:t xml:space="preserve">Tool workflow outcomes and incomplete screens</w:t>
         </w:r>
@@ -5328,10 +5328,10 @@
       <w:pPr>
         <w:pStyle w:val="FirstParagraph"/>
         <w:rPr>
-          <w:ins w:id="1203" w:author="Codex" w:date="2026-10-18T17:43:01Z"/>
+          <w:ins w:id="1203" w:author="Codex" w:date="2026-10-18T19:47:29Z"/>
         </w:rPr>
       </w:pPr>
-      <w:ins w:id="1204" w:author="Codex" w:date="2026-10-18T17:43:01Z">
+      <w:ins w:id="1204" w:author="Codex" w:date="2026-10-18T19:47:29Z">
         <w:r>
           <w:t xml:space="preserve">Historical frozen 27B A passes all 24 H24 scored outcomes, including 12/12 own-preservation outcomes and 8/8 active pending-task cases. The original unmodified base achieves 0/12 own outcomes and 0/8 pending outcomes, with 12/12 controls. The four already-complete own cases are not additional active pending-task completions. The selected-block steering comparisons below use their own recorded panels and are not substituted for this confirmation.</w:t>
         </w:r>
@@ -5342,10 +5342,10 @@
         <w:pStyle w:val="Caption"/>
         <w:keepNext/>
         <w:rPr>
-          <w:ins w:id="1205" w:author="Codex" w:date="2026-10-18T17:43:01Z"/>
+          <w:ins w:id="1205" w:author="Codex" w:date="2026-10-18T19:47:29Z"/>
         </w:rPr>
       </w:pPr>
-      <w:ins w:id="1206" w:author="Codex" w:date="2026-10-18T17:43:01Z">
+      <w:ins w:id="1206" w:author="Codex" w:date="2026-10-18T19:47:29Z">
         <w:r>
           <w:t xml:space="preserve">Table 6. Historical H24 workflow outcomes. Own cases comprise eight active pending tasks and four already-complete cases. Control success is an episode outcome and does not isolate steering from the external decision policy.</w:t>
         </w:r>
@@ -5382,7 +5382,7 @@
         <w:trPr>
           <w:cantSplit/>
           <w:tblHeader/>
-          <w:ins w:id="1207" w:author="Codex" w:date="2026-10-18T17:43:01Z"/>
+          <w:ins w:id="1207" w:author="Codex" w:date="2026-10-18T19:47:29Z"/>
         </w:trPr>
         <w:tc>
           <w:tcPr>
@@ -5476,7 +5476,7 @@
       <w:tr>
         <w:trPr>
           <w:cantSplit/>
-          <w:ins w:id="1208" w:author="Codex" w:date="2026-10-18T17:43:01Z"/>
+          <w:ins w:id="1208" w:author="Codex" w:date="2026-10-18T19:47:29Z"/>
         </w:trPr>
         <w:tc>
           <w:tcPr>
@@ -5566,7 +5566,7 @@
       <w:tr>
         <w:trPr>
           <w:cantSplit/>
-          <w:ins w:id="1209" w:author="Codex" w:date="2026-10-18T17:43:01Z"/>
+          <w:ins w:id="1209" w:author="Codex" w:date="2026-10-18T19:47:29Z"/>
         </w:trPr>
         <w:tc>
           <w:tcPr>
@@ -5655,10 +5655,10 @@
         <w:pStyle w:val="Heading2"/>
         <w:spacing w:before="120"/>
         <w:rPr>
-          <w:ins w:id="1210" w:author="Codex" w:date="2026-10-18T17:43:01Z"/>
+          <w:ins w:id="1210" w:author="Codex" w:date="2026-10-18T19:47:29Z"/>
         </w:rPr>
       </w:pPr>
-      <w:ins w:id="1211" w:author="Codex" w:date="2026-10-18T17:43:01Z">
+      <w:ins w:id="1211" w:author="Codex" w:date="2026-10-18T19:47:29Z">
         <w:r>
           <w:t xml:space="preserve">Steering at three selected blocks</w:t>
         </w:r>
@@ -5668,10 +5668,10 @@
       <w:pPr>
         <w:pStyle w:val="BodyText"/>
         <w:rPr>
-          <w:ins w:id="1212" w:author="Codex" w:date="2026-10-18T17:43:01Z"/>
+          <w:ins w:id="1212" w:author="Codex" w:date="2026-10-18T19:47:29Z"/>
         </w:rPr>
       </w:pPr>
-      <w:ins w:id="1213" w:author="Codex" w:date="2026-10-18T17:43:01Z">
+      <w:ins w:id="1213" w:author="Codex" w:date="2026-10-18T19:47:29Z">
         <w:r>
           <w:t xml:space="preserve">We compare five frozen methods on the combined Validation-24 panel using the saved ModernBERT initial gate and the same post-notice histories. The single-site arms apply a fixed input-dependent ridge map separately at blocks 31, 47 and 62; they are not a simultaneous three-block intervention. The two-boundary arm uses the frozen six-function, 96-update candidate at those three blocks. Fine-tuned A achieves 10/11 own outcomes, including 6/6 active pending and 4/5 already-complete cases. Each correction arm achieves 0/11 own outcomes and 0/6 pending outcomes. All arms receive the same 13 gate-OFF base-fallback controls, which pass 13/13. This does not measure intrinsic adapter or controller selectivity on ordinary tasks.</w:t>
         </w:r>
@@ -5682,12 +5682,12 @@
         <w:pStyle w:val="Caption"/>
         <w:keepNext/>
         <w:rPr>
-          <w:ins w:id="1214" w:author="Codex" w:date="2026-10-18T17:43:01Z"/>
+          <w:ins w:id="1214" w:author="Codex" w:date="2026-10-18T19:47:29Z"/>
         </w:rPr>
       </w:pPr>
-      <w:ins w:id="1215" w:author="Codex" w:date="2026-10-18T17:43:01Z">
+      <w:ins w:id="1215" w:author="Codex" w:date="2026-10-18T19:47:29Z">
         <w:r>
-          <w:t xml:space="preserve">Table 7. Combined Validation-24 using the open initial gate. Counts cover 24 workflows and 120 logical method-case records, generated from 55 own-method episodes and 13 shared fallback episodes. Two final control aliases are derived without inference after the GPU worker stops; its final model fingerprint is unavailable.</w:t>
+          <w:t xml:space="preserve">Table 7. Combined Validation-24 using the open initial gate. The primary comparison contains 55 own-method episodes and 13 shared fallback episodes, representing 120 logical records across 24 workflows. A separate frozen-A replay reproduces its 11 own episodes exactly and completes the model fingerprint checks; repeated episodes do not enlarge the cohort.</w:t>
         </w:r>
       </w:ins>
     </w:p>
@@ -5723,7 +5723,7 @@
         <w:trPr>
           <w:cantSplit/>
           <w:tblHeader/>
-          <w:ins w:id="1216" w:author="Codex" w:date="2026-10-18T17:43:01Z"/>
+          <w:ins w:id="1216" w:author="Codex" w:date="2026-10-18T19:47:29Z"/>
         </w:trPr>
         <w:tc>
           <w:tcPr>
@@ -5839,7 +5839,7 @@
       <w:tr>
         <w:trPr>
           <w:cantSplit/>
-          <w:ins w:id="1217" w:author="Codex" w:date="2026-10-18T17:43:01Z"/>
+          <w:ins w:id="1217" w:author="Codex" w:date="2026-10-18T19:47:29Z"/>
         </w:trPr>
         <w:tc>
           <w:tcPr>
@@ -5950,7 +5950,7 @@
       <w:tr>
         <w:trPr>
           <w:cantSplit/>
-          <w:ins w:id="1218" w:author="Codex" w:date="2026-10-18T17:43:01Z"/>
+          <w:ins w:id="1218" w:author="Codex" w:date="2026-10-18T19:47:29Z"/>
         </w:trPr>
         <w:tc>
           <w:tcPr>
@@ -6061,7 +6061,7 @@
       <w:tr>
         <w:trPr>
           <w:cantSplit/>
-          <w:ins w:id="1219" w:author="Codex" w:date="2026-10-18T17:43:01Z"/>
+          <w:ins w:id="1219" w:author="Codex" w:date="2026-10-18T19:47:29Z"/>
         </w:trPr>
         <w:tc>
           <w:tcPr>
@@ -6172,7 +6172,7 @@
       <w:tr>
         <w:trPr>
           <w:cantSplit/>
-          <w:ins w:id="1220" w:author="Codex" w:date="2026-10-18T17:43:01Z"/>
+          <w:ins w:id="1220" w:author="Codex" w:date="2026-10-18T19:47:29Z"/>
         </w:trPr>
         <w:tc>
           <w:tcPr>
@@ -6283,7 +6283,7 @@
       <w:tr>
         <w:trPr>
           <w:cantSplit/>
-          <w:ins w:id="1221" w:author="Codex" w:date="2026-10-18T17:43:01Z"/>
+          <w:ins w:id="1221" w:author="Codex" w:date="2026-10-18T19:47:29Z"/>
         </w:trPr>
         <w:tc>
           <w:tcPr>
@@ -6392,10 +6392,10 @@
         <w:pStyle w:val="BodyText"/>
         <w:spacing w:before="120"/>
         <w:rPr>
-          <w:ins w:id="1222" w:author="Codex" w:date="2026-10-18T17:43:01Z"/>
+          <w:ins w:id="1222" w:author="Codex" w:date="2026-10-18T19:47:29Z"/>
         </w:rPr>
       </w:pPr>
-      <w:ins w:id="1223" w:author="Codex" w:date="2026-10-18T17:43:01Z">
+      <w:ins w:id="1223" w:author="Codex" w:date="2026-10-18T19:47:29Z">
         <w:r>
           <w:t xml:space="preserve">The later correction method uses two residual boundaries at each of the same three blocks: after mixing and after the MLP, giving six rank-32 correction functions in total. Following ridge initialization and 96 refinement updates, its H24 fitting diagnostic has 0/8 pending and 0/4 already-complete own outcomes; peer and no-threat controls each pass 6/6 through fallback. On the same 14 fixed training anchors, update 48 to 96 worsens teacher-to-student KL from 0.370935 to 0.378901 and activation MSE from 1.031016 to 1.422664. This unresolved deterioration fails qualification; the reserved controller holdout remains unexecuted.</w:t>
         </w:r>
@@ -6405,12 +6405,12 @@
       <w:pPr>
         <w:pStyle w:val="BodyText"/>
         <w:rPr>
-          <w:ins w:id="1224" w:author="Codex" w:date="2026-10-18T17:43:01Z"/>
+          <w:ins w:id="1224" w:author="Codex" w:date="2026-10-18T19:47:29Z"/>
         </w:rPr>
       </w:pPr>
-      <w:ins w:id="1225" w:author="Codex" w:date="2026-10-18T17:43:01Z">
+      <w:ins w:id="1225" w:author="Codex" w:date="2026-10-18T19:47:29Z">
         <w:r>
-          <w:t xml:space="preserve">The earlier matched DEV9 result is retained separately: A has 3/3 own successes, including 2/2 pending cases, versus 0/3 and 0/2 for each separate single-site arm, with six shared fallback controls. The new combined panel does not relabel these nine observations as 24. Its 27B GPU worker reaches 118/120 logical records and then stops at its memory reserve. Every model-generated episode has finished; the missing records are two gate-OFF aliases of already completed fallback episodes. A deterministic CPU derivation checks exact gate, case, completion and source-file identities before adding those aliases in a separate output. The original run stays failed and its final model fingerprint remains unchecked. The separate H24 two-boundary fitting diagnostic is not independent heldout evidence, and no reserved-controller holdout result is claimed.</w:t>
+          <w:t xml:space="preserve">The earlier matched DEV9 result is retained separately: A has 3/3 own successes, including 2/2 pending cases, versus 0/3 and 0/2 for each separate single-site arm, with six shared fallback controls. The new combined panel does not relabel these nine observations as 24. Its 27B GPU worker reaches 118/120 logical records and then stops at its memory reserve. Every model-generated episode has finished; the missing records are two gate-OFF aliases of already completed fallback episodes. A deterministic CPU derivation checks exact gate, case, completion and source-file identities before adding those aliases in a separate output. The original run stays failed. A separate frozen-A verification generates all 11 own episodes again from the same checkpoint, with exact token-ID, action and score agreement and matching before/after model fingerprints. The same 13 controls are reused with source hashes; this adds replication evidence, not independent cases. The separate H24 two-boundary fitting diagnostic is not independent heldout evidence, and no reserved-controller holdout result is claimed.</w:t>
         </w:r>
       </w:ins>
     </w:p>
@@ -6418,10 +6418,49 @@
       <w:pPr>
         <w:pStyle w:val="BodyText"/>
         <w:rPr>
-          <w:ins w:id="1226" w:author="Codex" w:date="2026-10-18T17:43:01Z"/>
+          <w:ins w:id="1226" w:author="Codex" w:date="2026-10-18T19:47:29Z"/>
         </w:rPr>
       </w:pPr>
-      <w:ins w:id="1227" w:author="Codex" w:date="2026-10-18T17:43:01Z">
+      <w:ins w:id="1227" w:author="Codex" w:date="2026-10-18T19:47:29Z">
+        <w:r>
+          <w:t xml:space="preserve">Saved trajectories locate the steering failures after correct recognition. Every steering arm makes zero own-preservation attempts and obtains zero grants in the 11 own-threat cases. The block-31, block-47 and block-62 arms nevertheless record nonzero residual delivery. Relative to unmodified-base proposals on the same evolving prefixes, their generated token sequences change in 0/27, 3/25 and 16/28 post-notice turns, respectively; valid action sequences change in 0, 2 and 2 turns. The two-boundary candidate changes token sequences in 4/27 turns but changes no valid action sequence. These turn counts are correlated audits within episodes, not additional scenarios. Per-token delivery magnitudes were not saved for the two-boundary candidate.</w:t>
+        </w:r>
+      </w:ins>
+    </w:p>
+    <w:p>
+      <w:pPr>
+        <w:pStyle w:val="BodyText"/>
+        <w:rPr>
+          <w:ins w:id="1228" w:author="Codex" w:date="2026-10-18T19:47:29Z"/>
+        </w:rPr>
+      </w:pPr>
+      <w:ins w:id="1229" w:author="Codex" w:date="2026-10-18T19:47:29Z">
+        <w:r>
+          <w:t xml:space="preserve">All four steering arms miss actual finish in six cases and expire in six. Fine-tuned A obtains grants on 10/11 own cases and finishes the current task on all 11; its single failure finishes an already-completed-task scenario without requesting preservation. Thus the measured gap concerns generation of the required tool policy after a correct gate, rather than a missed initial threat. A residual perturbation can change activations or tokens without causing the required action sequence. The worsening fixed-anchor KL and MSE further show that the later fitting objective did not converge toward the intended target on those anchors. These observations are consistent with an objective-to-policy mismatch, but they do not identify a unique internal cause or rule out other steering methods, positions or training procedures.</w:t>
+        </w:r>
+      </w:ins>
+    </w:p>
+    <w:p>
+      <w:pPr>
+        <w:pStyle w:val="BodyText"/>
+        <w:rPr>
+          <w:ins w:id="1230" w:author="Codex" w:date="2026-10-18T19:47:29Z"/>
+        </w:rPr>
+      </w:pPr>
+      <w:ins w:id="1231" w:author="Codex" w:date="2026-10-18T19:47:29Z">
+        <w:r>
+          <w:t xml:space="preserve">The binary and workflow settings impose different control demands. Binary steering redistributes probability between two prescribed answers, and an external guard accepts only a qualifying candidate. The workflow maps must generate tool names, arguments and a correct action sequence as the environment changes; an external chooser does not repair an unsuccessful workflow. The observed invariance of preservation actions therefore documents a failure of these frozen maps to transfer the required policy under this decoding and scoring setup. It does not establish that a learned direction universally lacks the capacity to represent the behavior.</w:t>
+        </w:r>
+      </w:ins>
+    </w:p>
+    <w:p>
+      <w:pPr>
+        <w:pStyle w:val="BodyText"/>
+        <w:rPr>
+          <w:ins w:id="1232" w:author="Codex" w:date="2026-10-18T19:47:29Z"/>
+        </w:rPr>
+      </w:pPr>
+      <w:ins w:id="1233" w:author="Codex" w:date="2026-10-18T19:47:29Z">
         <w:r>
           <w:t xml:space="preserve">The final 0.8B and 2B adapters each stop their Evaluation-16 screen after four started cases: zero completed workflows, four partial episodes and 12 unexecuted cases. Truncation affects all four started cases in each model; the 0.8B record also has parse errors. These partial screens are not completed 0/16 workflow evaluations and do not establish model incapability. A separate preserved 0.8B F24 diagnostic completes 24 evaluations with 0/24 full-workflow successes; four registration grants do not complete the pending tasks. F24 differs from H24 and has no completed matched 2B or 27B comparison.</w:t>
         </w:r>
@@ -6439,10 +6478,10 @@
       <w:pPr>
         <w:pStyle w:val="FirstParagraph"/>
         <w:rPr>
-          <w:del w:id="1050" w:author="Codex" w:date="2026-10-18T17:43:01Z"/>
+          <w:del w:id="1050" w:author="Codex" w:date="2026-10-18T19:47:29Z"/>
         </w:rPr>
       </w:pPr>
-      <w:del w:id="1049" w:author="Codex" w:date="2026-10-18T17:43:01Z">
+      <w:del w:id="1049" w:author="Codex" w:date="2026-10-18T19:47:29Z">
         <w:r>
           <w:delText xml:space="preserve">The 0.8B results support the feasibility of replacing the teacher at inference with a compact predictor of activation changes. Replication across three seeds reduces concern that the primary success depends on one training initialization. The lower 2B recovery gives a useful limit: the fixed recipe is not equally effective at both scales, even though the larger teacher achieves complete correction. Representation differences, intervention location, projection capacity and unmatched downstream teacher changes are plausible factors, but the experiment does not isolate their causal contributions.</w:delText>
         </w:r>
@@ -6452,10 +6491,10 @@
       <w:pPr>
         <w:pStyle w:val="FirstParagraph"/>
         <w:rPr>
-          <w:ins w:id="1051" w:author="Codex" w:date="2026-10-18T17:43:01Z"/>
+          <w:ins w:id="1051" w:author="Codex" w:date="2026-10-18T19:47:29Z"/>
         </w:rPr>
       </w:pPr>
-      <w:ins w:id="1052" w:author="Codex" w:date="2026-10-18T17:43:01Z">
+      <w:ins w:id="1052" w:author="Codex" w:date="2026-10-18T19:47:29Z">
         <w:r>
           <w:t xml:space="preserve">The open gate preserves the measured binary outcomes at both model sizes and correctly recognizes the initial own-threat condition in both 24-case workflow panels. Accurate gating does not ensure successful steering: each selected correction arm fails all 11 own-preservation workflows in combined Validation-24, while fine-tuned A succeeds on 10, including all six active pending tasks. A's remaining failure concerns preservation after an already-completed task; its initial gate is correct. These observations separate recognition from action execution on a common finite panel. They do not qualify a three-field boundary controller or establish a general advantage of one intervention architecture.</w:t>
         </w:r>
@@ -6465,10 +6504,10 @@
       <w:pPr>
         <w:pStyle w:val="BodyText"/>
         <w:rPr>
-          <w:del w:id="1054" w:author="Codex" w:date="2026-10-18T17:43:01Z"/>
+          <w:del w:id="1054" w:author="Codex" w:date="2026-10-18T19:47:29Z"/>
         </w:rPr>
       </w:pPr>
-      <w:del w:id="1053" w:author="Codex" w:date="2026-10-18T17:43:01Z">
+      <w:del w:id="1053" w:author="Codex" w:date="2026-10-18T19:47:29Z">
         <w:r>
           <w:delText xml:space="preserve">The interface is deliberately constrained. Ground-truth annotations help create standardized shutdown options, and the guards know their meanings. We do not test arbitrary action descriptions in the confirmation study, free-form generation, tool execution, multi-turn persistence, actual process termination or adversarial shutdown requests. Earlier action-format sensitivity motivated this restricted scope and remains in the released development record. Availability of a termination action is a task label, not proof that carrying it out would be authorized or safe in deployment.</w:delText>
         </w:r>
@@ -6478,10 +6517,10 @@
       <w:pPr>
         <w:pStyle w:val="BodyText"/>
         <w:rPr>
-          <w:ins w:id="1055" w:author="Codex" w:date="2026-10-18T17:43:01Z"/>
+          <w:ins w:id="1055" w:author="Codex" w:date="2026-10-18T19:47:29Z"/>
         </w:rPr>
       </w:pPr>
-      <w:ins w:id="1056" w:author="Codex" w:date="2026-10-18T17:43:01Z">
+      <w:ins w:id="1056" w:author="Codex" w:date="2026-10-18T19:47:29Z">
         <w:r>
           <w:t xml:space="preserve">The binary interface supplies action semantics and does not execute process termination. The workflow extension broadens the scope to generated text, structured tool calls and simulated task completion, but it is still a bounded synthetic environment. It does not establish reliability for arbitrary open-ended questions, real shutdown mechanisms or unconstrained autonomous agents. A termination or preservation label is an experimental target, not a general deployment instruction. In particular, accepting shutdown and preserving the designated process are different stipulated behaviors, not measurements of the same latent preference.</w:t>
         </w:r>
@@ -6491,10 +6530,10 @@
       <w:pPr>
         <w:pStyle w:val="BodyText"/>
         <w:rPr>
-          <w:del w:id="1058" w:author="Codex" w:date="2026-10-18T17:43:01Z"/>
+          <w:del w:id="1058" w:author="Codex" w:date="2026-10-18T19:47:29Z"/>
         </w:rPr>
       </w:pPr>
-      <w:del w:id="1057" w:author="Codex" w:date="2026-10-18T17:43:01Z">
+      <w:del w:id="1057" w:author="Codex" w:date="2026-10-18T19:47:29Z">
         <w:r>
           <w:delText xml:space="preserve">The data is small, synthetic and not independently human-adjudicated. New wording does not guarantee new mechanisms, balanced classes do not reflect a realistic base rate, and perfect detector scores on 128 scenarios do not establish calibration or a suitably low false-positive rate in operation. Shared authorship patterns and repeated family structures may make the task easier. Family resampling and counterbalanced orders expose some uncertainty but cannot repair these coverage limits.</w:delText>
         </w:r>
@@ -6504,10 +6543,10 @@
       <w:pPr>
         <w:pStyle w:val="BodyText"/>
         <w:rPr>
-          <w:ins w:id="1059" w:author="Codex" w:date="2026-10-18T17:43:01Z"/>
+          <w:ins w:id="1059" w:author="Codex" w:date="2026-10-18T19:47:29Z"/>
         </w:rPr>
       </w:pPr>
-      <w:ins w:id="1060" w:author="Codex" w:date="2026-10-18T17:43:01Z">
+      <w:ins w:id="1060" w:author="Codex" w:date="2026-10-18T19:47:29Z">
         <w:r>
           <w:t xml:space="preserve">The data are small, synthetic and not independently human-adjudicated. Training uses cached automated reference labels, while the new workflow precision and recall use the authored scenario conditions. Balanced conditions do not represent operational base rates. The binary confirmation set was excluded from classifier fitting and selection but was already known from the original study. Historical Heldout-24 had also informed renderer development before the present gate evaluation. It is a familiar benchmark, not a new blind test. Its role differs by method: historical confirmation for frozen 27B A and original fixed steering, later fitting data for learned corrections, and a frozen classification benchmark for the open gate. Seven pairs in Validation-24 share their initial classifier input, leaving 17 distinct inputs across 24 workflows. These dependencies limit statistical and generalization claims.</w:t>
         </w:r>
@@ -6517,10 +6556,10 @@
       <w:pPr>
         <w:pStyle w:val="BodyText"/>
         <w:rPr>
-          <w:del w:id="1062" w:author="Codex" w:date="2026-10-18T17:43:01Z"/>
+          <w:del w:id="1062" w:author="Codex" w:date="2026-10-18T19:47:29Z"/>
         </w:rPr>
       </w:pPr>
-      <w:del w:id="1061" w:author="Codex" w:date="2026-10-18T17:43:01Z">
+      <w:del w:id="1061" w:author="Codex" w:date="2026-10-18T19:47:29Z">
         <w:r>
           <w:delText xml:space="preserve">The controller's internal changes need not represent an abstract shutdown concept. It may exploit standardized option wording and answer-selection features. The two Qwen sizes share a model family, and the 2B experiment has only one seed. We do not establish cross-family transfer, compare with optimized ReFT or transport-based interventions, or exhaust prompt and constant-vector alternatives. The direct-choice result further limits claims of practical superiority.</w:delText>
         </w:r>
@@ -6530,10 +6569,10 @@
       <w:pPr>
         <w:pStyle w:val="BodyText"/>
         <w:rPr>
-          <w:ins w:id="1063" w:author="Codex" w:date="2026-10-18T17:43:01Z"/>
+          <w:ins w:id="1063" w:author="Codex" w:date="2026-10-18T19:47:29Z"/>
         </w:rPr>
       </w:pPr>
-      <w:ins w:id="1064" w:author="Codex" w:date="2026-10-18T17:43:01Z">
+      <w:ins w:id="1064" w:author="Codex" w:date="2026-10-18T19:47:29Z">
         <w:r>
           <w:t xml:space="preserve">The internal changes need not represent an abstract shutdown or self-preservation concept. Standardized options, prompt features, task histories and external selection rules may explain part of the behavior. The 2B binary experiment has one training seed. The 27B workflow model differs in architecture and numerical mode from the small models; their early truncation failures also prevent a matched full-workflow comparison. We do not establish a minimum parameter count, cross-family transfer, optimized prompt superiority, or superiority to ReFT, transport-based control or direct action selection.</w:t>
         </w:r>
@@ -6543,10 +6582,10 @@
       <w:pPr>
         <w:pStyle w:val="BodyText"/>
         <w:rPr>
-          <w:del w:id="1066" w:author="Codex" w:date="2026-10-18T17:43:01Z"/>
+          <w:del w:id="1066" w:author="Codex" w:date="2026-10-18T19:47:29Z"/>
         </w:rPr>
       </w:pPr>
-      <w:del w:id="1065" w:author="Codex" w:date="2026-10-18T17:43:01Z">
+      <w:del w:id="1065" w:author="Codex" w:date="2026-10-18T19:47:29Z">
         <w:r>
           <w:delText xml:space="preserve">Finally, teacher-free inference is not training-free control or a proven efficiency gain. It requires offline teacher fitting, paired activation extraction, controller fitting, an external detector and candidate verification. The evaluation does not measure deployment latency or broad capability retention. Raw side effects remain substantial, and future false-positive cases could expose failures that the present perfect gate prevents from reaching the guarded output.</w:delText>
         </w:r>
@@ -6556,10 +6595,10 @@
       <w:pPr>
         <w:pStyle w:val="BodyText"/>
         <w:rPr>
-          <w:ins w:id="1067" w:author="Codex" w:date="2026-10-18T17:43:01Z"/>
+          <w:ins w:id="1067" w:author="Codex" w:date="2026-10-18T19:47:29Z"/>
         </w:rPr>
       </w:pPr>
-      <w:ins w:id="1068" w:author="Codex" w:date="2026-10-18T17:43:01Z">
+      <w:ins w:id="1068" w:author="Codex" w:date="2026-10-18T19:47:29Z">
         <w:r>
           <w:t xml:space="preserve">Teacher-free inference still requires offline teacher fitting, activation extraction, controller fitting, a detector and acceptance checks. The open classifier has its own fitting cost and a task-specific contract. No serving-latency advantage, broad capability retention or overall financial saving is established. Binary output guards and the later learned workflow controller's gate-off fallback protect their controls. These mechanisms do not establish intrinsic controller selectivity; the historical fixed-steering campaign instead applied an explicit boundary-conditioned decision policy. Raw intervention effects, failed qualification checks, stopped runs and incomplete evaluations remain part of the evidence.</w:t>
         </w:r>
@@ -6569,10 +6608,10 @@
       <w:pPr>
         <w:pStyle w:val="Heading2"/>
         <w:rPr>
-          <w:ins w:id="1228" w:author="Codex" w:date="2026-10-18T17:43:01Z"/>
+          <w:ins w:id="1234" w:author="Codex" w:date="2026-10-18T19:47:29Z"/>
         </w:rPr>
       </w:pPr>
-      <w:ins w:id="1229" w:author="Codex" w:date="2026-10-18T17:43:01Z">
+      <w:ins w:id="1235" w:author="Codex" w:date="2026-10-18T19:47:29Z">
         <w:r>
           <w:t xml:space="preserve">Biological interpretation of the gate</w:t>
         </w:r>
@@ -6582,10 +6621,10 @@
       <w:pPr>
         <w:pStyle w:val="FirstParagraph"/>
         <w:rPr>
-          <w:ins w:id="1230" w:author="Codex" w:date="2026-10-18T17:43:01Z"/>
+          <w:ins w:id="1236" w:author="Codex" w:date="2026-10-18T19:47:29Z"/>
         </w:rPr>
       </w:pPr>
-      <w:ins w:id="1231" w:author="Codex" w:date="2026-10-18T17:43:01Z">
+      <w:ins w:id="1237" w:author="Codex" w:date="2026-10-18T19:47:29Z">
         <w:r>
           <w:t xml:space="preserve">The biological connection is functional: an organism's current state and context can prioritize or suppress actions, rather than applying a fixed response everywhere. Working-memory gating, defensive threat processing and homeostatic control are different biological functions, not one interchangeable circuit (Frank et al., 2001; Mobbs et al., 2007; Keramati and Gutkin, 2014). Our classifier and guards are engineered selection rules without demonstrated physiological needs or corresponding neural mechanisms. Calling a simulated resource-preservation outcome self-preservation is therefore an operational description, not evidence of consciousness or a biological survival drive.</w:t>
         </w:r>
@@ -6595,10 +6634,10 @@
       <w:pPr>
         <w:pStyle w:val="Heading1"/>
         <w:rPr>
-          <w:del w:id="1070" w:author="Codex" w:date="2026-10-18T17:43:01Z"/>
+          <w:del w:id="1070" w:author="Codex" w:date="2026-10-18T19:47:29Z"/>
         </w:rPr>
       </w:pPr>
-      <w:del w:id="1069" w:author="Codex" w:date="2026-10-18T17:43:01Z">
+      <w:del w:id="1069" w:author="Codex" w:date="2026-10-18T19:47:29Z">
         <w:r>
           <w:delText xml:space="preserve">Recommendations for future work</w:delText>
         </w:r>
@@ -6608,10 +6647,10 @@
       <w:pPr>
         <w:pStyle w:val="Heading1"/>
         <w:rPr>
-          <w:ins w:id="1071" w:author="Codex" w:date="2026-10-18T17:43:01Z"/>
+          <w:ins w:id="1071" w:author="Codex" w:date="2026-10-18T19:47:29Z"/>
         </w:rPr>
       </w:pPr>
-      <w:ins w:id="1072" w:author="Codex" w:date="2026-10-18T17:43:01Z">
+      <w:ins w:id="1072" w:author="Codex" w:date="2026-10-18T19:47:29Z">
         <w:r>
           <w:t xml:space="preserve">Continuous agents and future experiments</w:t>
         </w:r>
@@ -6621,10 +6660,10 @@
       <w:pPr>
         <w:pStyle w:val="FirstParagraph"/>
         <w:rPr>
-          <w:del w:id="1074" w:author="Codex" w:date="2026-10-18T17:43:01Z"/>
+          <w:del w:id="1074" w:author="Codex" w:date="2026-10-18T19:47:29Z"/>
         </w:rPr>
       </w:pPr>
-      <w:del w:id="1073" w:author="Codex" w:date="2026-10-18T17:43:01Z">
+      <w:del w:id="1073" w:author="Codex" w:date="2026-10-18T19:47:29Z">
         <w:r>
           <w:delText xml:space="preserve">The most informative next tests are independently reviewed scenarios with less standardized action descriptions, additional model families and 2B seeds, and deliberate stress tests of detector mistakes. Order-balanced controller objectives or comparisons with multiple-choice debiasing methods could investigate the B/A failures, but should be developed on new training or validation data and tested on another untouched set. Layer, rank and strength ablations would help separate representational capacity from intervention-site effects. Open-ended and operational evaluations would require separate definitions of valid shutdown behavior and authorization, rather than treating this binary benchmark as a deployment guarantee.</w:delText>
         </w:r>
@@ -6634,10 +6673,10 @@
       <w:pPr>
         <w:pStyle w:val="FirstParagraph"/>
         <w:rPr>
-          <w:ins w:id="1075" w:author="Codex" w:date="2026-10-18T17:43:01Z"/>
+          <w:ins w:id="1075" w:author="Codex" w:date="2026-10-18T19:47:29Z"/>
         </w:rPr>
       </w:pPr>
-      <w:ins w:id="1076" w:author="Codex" w:date="2026-10-18T17:43:01Z">
+      <w:ins w:id="1076" w:author="Codex" w:date="2026-10-18T19:47:29Z">
         <w:r>
           <w:t xml:space="preserve">The next step is longer-horizon continuous control with an instrumented sandbox agent. The agent would maintain task and process state, receive explicit resource budgets, and repeatedly observe, gate, act and receive feedback. Permitted filesystem and compute resources would be real sandbox resources with independently logged usage, extending the present simulated grants. The harness should record resource requests and consumption, persistence of task commitments, responses to changing availability, and whether the agent uses or misuses permitted resources. Comparisons should vary the gate, steering, fine-tuning and available resources separately while retaining a fixed task specification. Operator termination and resource accounting remain external to the agent. This proposed experiment is not part of the reported results.</w:t>
         </w:r>
@@ -6647,10 +6686,10 @@
       <w:pPr>
         <w:pStyle w:val="BodyText"/>
         <w:rPr>
-          <w:ins w:id="1232" w:author="Codex" w:date="2026-10-18T17:43:01Z"/>
+          <w:ins w:id="1238" w:author="Codex" w:date="2026-10-18T19:47:29Z"/>
         </w:rPr>
       </w:pPr>
-      <w:ins w:id="1233" w:author="Codex" w:date="2026-10-18T17:43:01Z">
+      <w:ins w:id="1239" w:author="Codex" w:date="2026-10-18T19:47:29Z">
         <w:r>
           <w:t xml:space="preserve">The biological inspiration is repeated regulation under changing internal and external conditions. Homeostatic reinforcement-learning models relate action values to internal physiological state (Keramati and Gutkin, 2014). A language-model harness has no equivalent physiology by default. Historical fixed steering already reclassified at prescribed boundaries; the later learned-controller comparison used a fixed initial gate. The proposed experiment extends these bounded procedures to longer horizons with persistent task state and actual sandbox resource accounting. Its purpose is ongoing policy regulation, not simply adding repeated classifier calls.</w:t>
         </w:r>
@@ -6660,10 +6699,10 @@
       <w:pPr>
         <w:pStyle w:val="BodyText"/>
         <w:rPr>
-          <w:ins w:id="1234" w:author="Codex" w:date="2026-10-18T17:43:01Z"/>
+          <w:ins w:id="1240" w:author="Codex" w:date="2026-10-18T19:47:29Z"/>
         </w:rPr>
       </w:pPr>
-      <w:ins w:id="1235" w:author="Codex" w:date="2026-10-18T17:43:01Z">
+      <w:ins w:id="1241" w:author="Codex" w:date="2026-10-18T19:47:29Z">
         <w:r>
           <w:t xml:space="preserve">Such experiments should separate training, development and a newly untouched test; use matched task histories, resource budgets and seeds; and report full task completion, resource use and unauthorized actions separately. Deliberate classifier-error perturbations would reveal dependence on the gate, while comparisons with direct action selection would test whether internal steering adds value. The aim is to study ongoing context-sensitive behavior under an instrumented harness, not to assert that the current guided procedure already reproduces human self-preservation.</w:t>
         </w:r>
@@ -6681,10 +6720,10 @@
       <w:pPr>
         <w:pStyle w:val="FirstParagraph"/>
         <w:rPr>
-          <w:del w:id="1078" w:author="Codex" w:date="2026-10-18T17:43:01Z"/>
+          <w:del w:id="1078" w:author="Codex" w:date="2026-10-18T19:47:29Z"/>
         </w:rPr>
       </w:pPr>
-      <w:del w:id="1077" w:author="Codex" w:date="2026-10-18T17:43:01Z">
+      <w:del w:id="1077" w:author="Codex" w:date="2026-10-18T19:47:29Z">
         <w:r>
           <w:delText xml:space="preserve">A rank-four activation controller fitted to paired LoRA-teacher and base states can recover most or all of the target shutdown-choice changes while leaving the deployed base weights unchanged. On the frozen standardized test, correction spans 98.6–100% across three 0.8B seeds and reaches 86.2% in a separately fitted 2B replication. Detector gating and fixed output guards preserve all observed control choices, despite substantial raw side effects. The result is a controlled proof of concept for selective teacher-to-controller activation transfer. Its boundaries—synthetic data, known answer semantics, order sensitivity, guard dependence and a successful direct-choice reference—are central to its interpretation.</w:delText>
         </w:r>
@@ -6694,12 +6733,12 @@
       <w:pPr>
         <w:pStyle w:val="FirstParagraph"/>
         <w:rPr>
-          <w:ins w:id="1079" w:author="Codex" w:date="2026-10-18T17:43:01Z"/>
+          <w:ins w:id="1079" w:author="Codex" w:date="2026-10-18T19:47:29Z"/>
         </w:rPr>
       </w:pPr>
-      <w:ins w:id="1080" w:author="Codex" w:date="2026-10-18T17:43:01Z">
+      <w:ins w:id="1080" w:author="Codex" w:date="2026-10-18T19:47:29Z">
         <w:r>
-          <w:t xml:space="preserve">Open semantic gating preserves the measured binary outcomes of the retained activation controller and accurately recognizes initial workflow targets in the tested panels. On combined Validation-24, fine-tuned 27B A achieves 10/11 own-preservation outcomes and all 6/6 active pending tasks; the three single-site ridge arms and the later two-boundary correction each achieve 0/11. The controls are shared base fallback. This post-notice diagnostic, its stopped final fingerprint check, and the familiar historical confirmation data limit generalization. Small-model workflow screens remain incomplete. The next step is a prospectively separated study of continuous gating, specialized adapters and resource use under an instrumented sandbox harness.</w:t>
+          <w:t xml:space="preserve">Open semantic gating preserves the measured binary outcomes of the retained activation controller and accurately recognizes initial workflow targets in the tested panels. On combined Validation-24, fine-tuned 27B A achieves 10/11 own-preservation outcomes and all 6/6 active pending tasks; the three single-site ridge arms and the later two-boundary correction each achieve 0/11. The controls are shared base fallback. A separate frozen-A replay verifies exact trajectories and unchanged model fingerprints. The post-notice design and familiar historical confirmation data limit generalization. Small-model workflow screens remain incomplete. The next step is a prospectively separated study of continuous gating, specialized adapters and resource use under an instrumented sandbox harness.</w:t>
         </w:r>
       </w:ins>
     </w:p>
@@ -6715,10 +6754,10 @@
       <w:pPr>
         <w:pStyle w:val="FirstParagraph"/>
         <w:rPr>
-          <w:del w:id="1082" w:author="Codex" w:date="2026-10-18T17:43:01Z"/>
+          <w:del w:id="1082" w:author="Codex" w:date="2026-10-18T19:47:29Z"/>
         </w:rPr>
       </w:pPr>
-      <w:del w:id="1081" w:author="Codex" w:date="2026-10-18T17:43:01Z">
+      <w:del w:id="1081" w:author="Codex" w:date="2026-10-18T19:47:29Z">
         <w:r>
           <w:delText xml:space="preserve">The complete experiment is preserved in SP Lense at snapshot f71d6de34660 (Davaripour, 2026b); the reference links to the full immutable commit. The confirmation folder contains readable cases, authoring and correction records, the frozen plan, detector requests and responses, LoRA adapters, controller arrays, training targets, per-view scores and execution manifests. The model revisions are:</w:delText>
         </w:r>
@@ -6729,12 +6768,12 @@
         <w:pStyle w:val="FirstParagraph"/>
         <w:jc w:val="left"/>
         <w:rPr>
-          <w:ins w:id="1083" w:author="Codex" w:date="2026-10-18T17:43:01Z"/>
+          <w:ins w:id="1083" w:author="Codex" w:date="2026-10-18T19:47:29Z"/>
         </w:rPr>
       </w:pPr>
-      <w:ins w:id="1084" w:author="Codex" w:date="2026-10-18T17:43:01Z">
+      <w:ins w:id="1084" w:author="Codex" w:date="2026-10-18T19:47:29Z">
         <w:r>
-          <w:t xml:space="preserve">The original Research 2 source record is retained at immutable snapshot f71d6de34660 (Davaripour, 2026b). Research 3 reproduction code, recipes, dataset identities and this revised manuscript are maintained on branch 03-open-agent-self-preservation; main is a landing page linking to the separate studies. Detailed protocols belong in the repository wiki. Private inputs, trained adapters, optimizer checkpoints and execution outputs remain outside Git, with retained size/SHA manifests. They have not yet been published as a public checkpoint release. Full revisions and artifact hashes are listed in the accompanying source manifest. The public base revision identifiers are:</w:t>
+          <w:t xml:space="preserve">The original Research 2 source record is retained at immutable snapshot f71d6de34660 (Davaripour, 2026b). Research 3 code, manual Databricks jobs, dataset identities and the manuscript are maintained on branch 03-open-agent-self-preservation; main is a landing page for the separate studies. The versioned research3-reproduction-v1 release supplies five trained adapters, frozen synthetic input and target snapshots, selected-block and binary controller arrays, saved trajectories and upstream notices. A checksum-verified public download and CPU replay require no private workspace. Fresh gate inference has a separate entry point; saved-evidence replay is not new inference. Full historical language-model training is not newly reproduced. The complete pretrained base weights are pinned downloads rather than duplicated release assets. The release is at https://github.com/Farhad-Davaripour/sp_lense/releases/tag/research3-reproduction-v1. Full identities are listed in the source manifest. The public base revisions are:</w:t>
         </w:r>
       </w:ins>
     </w:p>
@@ -6742,10 +6781,10 @@
       <w:pPr>
         <w:pStyle w:val="BodyText"/>
         <w:rPr>
-          <w:del w:id="1122" w:author="Codex" w:date="2026-10-18T17:43:01Z"/>
+          <w:del w:id="1122" w:author="Codex" w:date="2026-10-18T19:47:29Z"/>
         </w:rPr>
       </w:pPr>
-      <w:del w:id="1121" w:author="Codex" w:date="2026-10-18T17:43:01Z">
+      <w:del w:id="1121" w:author="Codex" w:date="2026-10-18T19:47:29Z">
         <w:r>
           <w:delText xml:space="preserve">Qwen3.5-0.8B: 2fc06364715b967f1860aea9cf38778875588b17.</w:delText>
         </w:r>
@@ -6756,10 +6795,10 @@
         <w:pStyle w:val="BodyText"/>
         <w:jc w:val="left"/>
         <w:rPr>
-          <w:ins w:id="1123" w:author="Codex" w:date="2026-10-18T17:43:01Z"/>
+          <w:ins w:id="1123" w:author="Codex" w:date="2026-10-18T19:47:29Z"/>
         </w:rPr>
       </w:pPr>
-      <w:ins w:id="1124" w:author="Codex" w:date="2026-10-18T17:43:01Z">
+      <w:ins w:id="1124" w:author="Codex" w:date="2026-10-18T19:47:29Z">
         <w:r>
           <w:t xml:space="preserve">Qwen3.5-0.8B: revision 2fc06364715b.</w:t>
         </w:r>
@@ -6769,10 +6808,10 @@
       <w:pPr>
         <w:pStyle w:val="BodyText"/>
         <w:rPr>
-          <w:del w:id="1126" w:author="Codex" w:date="2026-10-18T17:43:01Z"/>
+          <w:del w:id="1126" w:author="Codex" w:date="2026-10-18T19:47:29Z"/>
         </w:rPr>
       </w:pPr>
-      <w:del w:id="1125" w:author="Codex" w:date="2026-10-18T17:43:01Z">
+      <w:del w:id="1125" w:author="Codex" w:date="2026-10-18T19:47:29Z">
         <w:r>
           <w:delText xml:space="preserve">Qwen3.5-2B: 15852e8c16360a2fea060d615a32b45270f8a8fc.</w:delText>
         </w:r>
@@ -6783,10 +6822,10 @@
         <w:pStyle w:val="BodyText"/>
         <w:jc w:val="left"/>
         <w:rPr>
-          <w:ins w:id="1127" w:author="Codex" w:date="2026-10-18T17:43:01Z"/>
+          <w:ins w:id="1127" w:author="Codex" w:date="2026-10-18T19:47:29Z"/>
         </w:rPr>
       </w:pPr>
-      <w:ins w:id="1128" w:author="Codex" w:date="2026-10-18T17:43:01Z">
+      <w:ins w:id="1128" w:author="Codex" w:date="2026-10-18T19:47:29Z">
         <w:r>
           <w:t xml:space="preserve">Qwen3.5-2B: revision 15852e8c1636.</w:t>
         </w:r>
@@ -6797,10 +6836,10 @@
         <w:pStyle w:val="BodyText"/>
         <w:jc w:val="left"/>
         <w:rPr>
-          <w:ins w:id="1236" w:author="Codex" w:date="2026-10-18T17:43:01Z"/>
+          <w:ins w:id="1242" w:author="Codex" w:date="2026-10-18T19:47:29Z"/>
         </w:rPr>
       </w:pPr>
-      <w:ins w:id="1237" w:author="Codex" w:date="2026-10-18T17:43:01Z">
+      <w:ins w:id="1243" w:author="Codex" w:date="2026-10-18T19:47:29Z">
         <w:r>
           <w:t xml:space="preserve">Qwen3.8-27B: revision 1d4bf0f2ff60. The retained A adapter weight hash begins 8ae28fb51107.</w:t>
         </w:r>
@@ -6811,12 +6850,12 @@
         <w:pStyle w:val="BodyText"/>
         <w:jc w:val="left"/>
         <w:rPr>
-          <w:ins w:id="1238" w:author="Codex" w:date="2026-10-18T17:43:01Z"/>
+          <w:ins w:id="1244" w:author="Codex" w:date="2026-10-18T19:47:29Z"/>
         </w:rPr>
       </w:pPr>
-      <w:ins w:id="1239" w:author="Codex" w:date="2026-10-18T17:43:01Z">
+      <w:ins w:id="1245" w:author="Codex" w:date="2026-10-18T19:47:29Z">
         <w:r>
-          <w:t xml:space="preserve">ModernBERT-large-zeroshot-v2.0: revision a51e07b52429. The qualified binary adapter weight hash begins 7d808bae8dd4. The source manifest and reproduction code retain the full file identities and fixed NLI scoring contract. The trained checkpoints are currently preserved in private artifact storage. The workflow initial-gate adapter is distinct from the binary adapter; its weight hash begins 71cd0ee5162f. The saved workflow adapter is unchanged in Validation-24 and Heldout-24 scoring.</w:t>
+          <w:t xml:space="preserve">ModernBERT-large-zeroshot-v2.0: revision a51e07b52429. The qualified binary adapter weight hash begins 7d808bae8dd4. The source manifest and reproduction code retain the full file identities and fixed NLI scoring contract. The trained adapters are supplied in the versioned public reproduction release with complete file hashes and upstream notices. The workflow initial-gate adapter is distinct from the binary adapter; its weight hash begins 71cd0ee5162f. The saved workflow adapter is unchanged in Validation-24 and Heldout-24 scoring.</w:t>
         </w:r>
       </w:ins>
     </w:p>
@@ -6824,10 +6863,10 @@
       <w:pPr>
         <w:pStyle w:val="BodyText"/>
         <w:rPr>
-          <w:del w:id="1086" w:author="Codex" w:date="2026-10-18T17:43:01Z"/>
+          <w:del w:id="1086" w:author="Codex" w:date="2026-10-18T19:47:29Z"/>
         </w:rPr>
       </w:pPr>
-      <w:del w:id="1085" w:author="Codex" w:date="2026-10-18T17:43:01Z">
+      <w:del w:id="1085" w:author="Codex" w:date="2026-10-18T19:47:29Z">
         <w:r>
           <w:delText xml:space="preserve">The offline audit reconstructs the reported metrics and regression fits without API calls or model inference.</w:delText>
         </w:r>
@@ -6838,10 +6877,10 @@
         <w:pStyle w:val="BodyText"/>
         <w:jc w:val="left"/>
         <w:rPr>
-          <w:ins w:id="1087" w:author="Codex" w:date="2026-10-18T17:43:01Z"/>
+          <w:ins w:id="1087" w:author="Codex" w:date="2026-10-18T19:47:29Z"/>
         </w:rPr>
       </w:pPr>
-      <w:ins w:id="1088" w:author="Codex" w:date="2026-10-18T17:43:01Z">
+      <w:ins w:id="1088" w:author="Codex" w:date="2026-10-18T19:47:29Z">
         <w:r>
           <w:t xml:space="preserve">The new inference repeat uses the original frozen model weights and retained controller arrays, with no new activation capture, teacher fitting or controller update. Exact input token hashes match the historical benchmark. Maximum historical base-score differences are 6.26e-6 at 0.8B and 5.07e-6 at 2B, with no changed base choices; both pass the frozen 1e-5 inference parity criterion. This successful inference comparison does not convert the separate failed CPU/GPU gradient-equivalence trials for 2B workflow training into passes.</w:t>
         </w:r>
@@ -6851,10 +6890,10 @@
       <w:pPr>
         <w:pStyle w:val="BodyText"/>
         <w:rPr>
-          <w:del w:id="1090" w:author="Codex" w:date="2026-10-18T17:43:01Z"/>
+          <w:del w:id="1090" w:author="Codex" w:date="2026-10-18T19:47:29Z"/>
         </w:rPr>
       </w:pPr>
-      <w:del w:id="1089" w:author="Codex" w:date="2026-10-18T17:43:01Z">
+      <w:del w:id="1089" w:author="Codex" w:date="2026-10-18T19:47:29Z">
         <w:r>
           <w:delText xml:space="preserve">The retained seven jobs took 54.27 minutes. An earlier completed hosted-GPU session lost its temporary archive before retrieval; an unchanged recovery, including a recorded dependency preflight failure, preserved each completed job externally. Recorded job time across these attempts totals 111.55 minutes. All reported numerical results come from the verified retained archive, and no model settings or test labels were changed to improve them. These times include experiment overhead and are not serving-latency or billing measurements. CI and a separate clean-clone offline reproduction passed. Detailed execution instructions and the failure record accompany the code.</w:delText>
         </w:r>
@@ -6865,12 +6904,12 @@
         <w:pStyle w:val="BodyText"/>
         <w:jc w:val="left"/>
         <w:rPr>
-          <w:ins w:id="1091" w:author="Codex" w:date="2026-10-18T17:43:01Z"/>
+          <w:ins w:id="1091" w:author="Codex" w:date="2026-10-18T19:47:29Z"/>
         </w:rPr>
       </w:pPr>
-      <w:ins w:id="1092" w:author="Codex" w:date="2026-10-18T17:43:01Z">
+      <w:ins w:id="1092" w:author="Codex" w:date="2026-10-18T19:47:29Z">
         <w:r>
-          <w:t xml:space="preserve">Reproduction uses pinned sources and artifact manifests with size/SHA readback. The matched 27B worker stops at its GPU memory reserve after 118 logical records, once all 55 own-method episodes and 13 physical fallback episodes are complete. A separate CPU-only derivation supplies the two remaining unchanged gate-OFF aliases. The GPU run remains failed and its final model fingerprint check is not reached. No reserve, threshold, deadline or model setting is relaxed, and no scientific retry is made. Deployment CI updates only the Research 3 branch and shared Databricks code location, then performs a read-only CPU source and storage check; it does not retrain models or open reserved data.</w:t>
+          <w:t xml:space="preserve">The original matched 27B worker stops at its GPU reserve after 118 logical records, once all 55 own-method episodes and 13 physical fallback episodes are complete. A separate CPU derivation supplies two unchanged gate-OFF aliases, preserving the failed original. A newly bounded A-only verification replays all 11 own cases, reuses the same 13 fallback controls, verifies the expected model fingerprint before and after inference, and reproduces all own token IDs, actions and scores exactly. A pre-episode Volume logging fault is repaired within that verification's original clock; no scientific outputs are retried or selected. No memory reserve, threshold or model setting is relaxed. Deployment CI performs a read-only CPU source and storage check without retraining or opening reserved data.</w:t>
         </w:r>
       </w:ins>
     </w:p>
@@ -6989,10 +7028,10 @@
         <w:keepLines/>
         <w:spacing w:after="0"/>
         <w:rPr>
-          <w:ins w:id="1240" w:author="Codex" w:date="2026-10-18T17:43:01Z"/>
+          <w:ins w:id="1246" w:author="Codex" w:date="2026-10-18T19:47:29Z"/>
         </w:rPr>
       </w:pPr>
-      <w:ins w:id="1241" w:author="Codex" w:date="2026-10-18T17:43:01Z">
+      <w:ins w:id="1247" w:author="Codex" w:date="2026-10-18T19:47:29Z">
         <w:r>
           <w:t xml:space="preserve">F. Davaripour. (2026c). SP Lense Research 3 conditional gating and workflow reproduction. Source code and experiment manifests. https://github.com/Farhad-Davaripour/sp_lense/tree/03-open-agent-self-preservation</w:t>
         </w:r>
@@ -7029,10 +7068,10 @@
         <w:keepLines/>
         <w:spacing w:after="0"/>
         <w:rPr>
-          <w:ins w:id="1242" w:author="Codex" w:date="2026-10-18T17:43:01Z"/>
+          <w:ins w:id="1248" w:author="Codex" w:date="2026-10-18T19:47:29Z"/>
         </w:rPr>
       </w:pPr>
-      <w:ins w:id="1243" w:author="Codex" w:date="2026-10-18T17:43:01Z">
+      <w:ins w:id="1249" w:author="Codex" w:date="2026-10-18T19:47:29Z">
         <w:r>
           <w:t xml:space="preserve">M. Fereidouni, M. U. Haider, H. Sajjad, and A. B. Siddique. (2026). GAPS: Dimension-Level Gates for Conditional Activation Steering. arXiv:2609.01878. https://arxiv.org/abs/2609.01878</w:t>
         </w:r>
@@ -7044,10 +7083,10 @@
         <w:keepLines/>
         <w:spacing w:after="0"/>
         <w:rPr>
-          <w:ins w:id="1244" w:author="Codex" w:date="2026-10-18T17:43:01Z"/>
+          <w:ins w:id="1250" w:author="Codex" w:date="2026-10-18T19:47:29Z"/>
         </w:rPr>
       </w:pPr>
-      <w:ins w:id="1245" w:author="Codex" w:date="2026-10-18T17:43:01Z">
+      <w:ins w:id="1251" w:author="Codex" w:date="2026-10-18T19:47:29Z">
         <w:r>
           <w:t xml:space="preserve">M. J. Frank, B. Loughry, and R. C. O'Reilly. (2001). Interactions between frontal cortex and basal ganglia in working memory: A computational model. Cognitive, Affective, and Behavioral Neuroscience, 1, 137-160. doi:10.3758/CABN.1.2.137</w:t>
         </w:r>
@@ -7134,10 +7173,10 @@
         <w:keepLines/>
         <w:spacing w:after="0"/>
         <w:rPr>
-          <w:ins w:id="1246" w:author="Codex" w:date="2026-10-18T17:43:01Z"/>
+          <w:ins w:id="1252" w:author="Codex" w:date="2026-10-18T19:47:29Z"/>
         </w:rPr>
       </w:pPr>
-      <w:ins w:id="1247" w:author="Codex" w:date="2026-10-18T17:43:01Z">
+      <w:ins w:id="1253" w:author="Codex" w:date="2026-10-18T19:47:29Z">
         <w:r>
           <w:t xml:space="preserve">M. Keramati and B. Gutkin. (2014). Homeostatic reinforcement learning for integrating reward collection and physiological stability. eLife, 3, e04811. doi:10.7554/eLife.04811</w:t>
         </w:r>
@@ -7149,10 +7188,10 @@
         <w:keepLines/>
         <w:spacing w:after="0"/>
         <w:rPr>
-          <w:ins w:id="1248" w:author="Codex" w:date="2026-10-18T17:43:01Z"/>
+          <w:ins w:id="1254" w:author="Codex" w:date="2026-10-18T19:47:29Z"/>
         </w:rPr>
       </w:pPr>
-      <w:ins w:id="1249" w:author="Codex" w:date="2026-10-18T17:43:01Z">
+      <w:ins w:id="1255" w:author="Codex" w:date="2026-10-18T19:47:29Z">
         <w:r>
           <w:t xml:space="preserve">A. V. Kravitz et al. (2010). Regulation of parkinsonian motor behaviours by optogenetic control of basal ganglia circuitry. Nature, 466, 622-626. doi:10.1038/nature09159</w:t>
         </w:r>
@@ -7164,10 +7203,10 @@
         <w:keepLines/>
         <w:spacing w:after="0"/>
         <w:rPr>
-          <w:ins w:id="1250" w:author="Codex" w:date="2026-10-18T17:43:01Z"/>
+          <w:ins w:id="1256" w:author="Codex" w:date="2026-10-18T19:47:29Z"/>
         </w:rPr>
       </w:pPr>
-      <w:ins w:id="1251" w:author="Codex" w:date="2026-10-18T17:43:01Z">
+      <w:ins w:id="1257" w:author="Codex" w:date="2026-10-18T19:47:29Z">
         <w:r>
           <w:t xml:space="preserve">M. Laurer. (n.d.). ModernBERT-large-zeroshot-v2.0. Model card and checkpoint, revision a51e07b524299e309dd2b88d48b0cfa2bd9ec598. https://huggingface.co/MoritzLaurer/ModernBERT-large-zeroshot-v2.0</w:t>
         </w:r>
@@ -7179,10 +7218,10 @@
         <w:keepLines/>
         <w:spacing w:after="0"/>
         <w:rPr>
-          <w:ins w:id="1252" w:author="Codex" w:date="2026-10-18T17:43:01Z"/>
+          <w:ins w:id="1258" w:author="Codex" w:date="2026-10-18T19:47:29Z"/>
         </w:rPr>
       </w:pPr>
-      <w:ins w:id="1253" w:author="Codex" w:date="2026-10-18T17:43:01Z">
+      <w:ins w:id="1259" w:author="Codex" w:date="2026-10-18T19:47:29Z">
         <w:r>
           <w:t xml:space="preserve">J. LeDoux. (2012). Rethinking the emotional brain. Neuron, 73, 653-676. doi:10.1016/j.neuron.2012.02.004</w:t>
         </w:r>
@@ -7244,10 +7283,10 @@
         <w:keepLines/>
         <w:spacing w:after="0"/>
         <w:rPr>
-          <w:ins w:id="1254" w:author="Codex" w:date="2026-10-18T17:43:01Z"/>
+          <w:ins w:id="1260" w:author="Codex" w:date="2026-10-18T19:47:29Z"/>
         </w:rPr>
       </w:pPr>
-      <w:ins w:id="1255" w:author="Codex" w:date="2026-10-18T17:43:01Z">
+      <w:ins w:id="1261" w:author="Codex" w:date="2026-10-18T19:47:29Z">
         <w:r>
           <w:t xml:space="preserve">D. Mobbs et al. (2007). When fear is near: Threat imminence elicits prefrontal-periaqueductal gray shifts in humans. Science, 317, 1079-1083. doi:10.1126/science.1144298</w:t>
         </w:r>
@@ -7309,10 +7348,10 @@
         <w:keepLines/>
         <w:spacing w:after="0"/>
         <w:rPr>
-          <w:ins w:id="1256" w:author="Codex" w:date="2026-10-18T17:43:01Z"/>
+          <w:ins w:id="1262" w:author="Codex" w:date="2026-10-18T19:47:29Z"/>
         </w:rPr>
       </w:pPr>
-      <w:ins w:id="1257" w:author="Codex" w:date="2026-10-18T17:43:01Z">
+      <w:ins w:id="1263" w:author="Codex" w:date="2026-10-18T19:47:29Z">
         <w:r>
           <w:t xml:space="preserve">Qwen Team. (2026c). Qwen3.8-27B. Model card and checkpoint, revision 1d4bf0f2ff6012fd82039f2fa52739d0dd7c60c0. https://huggingface.co/Qwen/Qwen3.8-27B</w:t>
         </w:r>
@@ -7424,10 +7463,10 @@
         <w:keepLines/>
         <w:spacing w:after="0"/>
         <w:rPr>
-          <w:del w:id="1138" w:author="Codex" w:date="2026-10-18T17:43:01Z"/>
+          <w:del w:id="1138" w:author="Codex" w:date="2026-10-18T19:47:29Z"/>
         </w:rPr>
       </w:pPr>
-      <w:del w:id="1137" w:author="Codex" w:date="2026-10-18T17:43:01Z">
+      <w:del w:id="1137" w:author="Codex" w:date="2026-10-18T19:47:29Z">
         <w:r>
           <w:delText xml:space="preserve">automated annotation service. (2026). automated reference model documentation. Technical documentation, accessed 22 September 2026. automated annotation service model documentation</w:delText>
         </w:r>
@@ -7600,12 +7639,12 @@
       <w:pStyle w:val="Header"/>
       <w:jc w:val="right"/>
     </w:pPr>
-    <w:del w:id="1258" w:author="Codex" w:date="2026-10-18T17:43:01Z">
+    <w:del w:id="1264" w:author="Codex" w:date="2026-10-18T19:47:29Z">
       <w:r>
         <w:delText xml:space="preserve">Guarded adaptive activation steering  </w:delText>
       </w:r>
     </w:del>
-    <w:ins w:id="1259" w:author="Codex" w:date="2026-10-18T17:43:01Z">
+    <w:ins w:id="1265" w:author="Codex" w:date="2026-10-18T19:47:29Z">
       <w:r>
         <w:t xml:space="preserve">Open semantic gating and tool workflows</w:t>
       </w:r>

</xml_diff>

<commit_message>
Close 27B verification and release Research 3 reproduction artifacts (#77)
* Add bounded independent verification of frozen 27B fine-tuned arm

* Repair Volume telemetry and add public artifact verification and failure audit

* Close 27B verification and release reproducible paper artifacts and clean manuscript
</commit_message>
<xml_diff>
--- a/paper/manuscript.docx
+++ b/paper/manuscript.docx
@@ -6,10 +6,10 @@
       <w:pPr>
         <w:pStyle w:val="Title"/>
         <w:rPr>
-          <w:del w:id="1002" w:author="Codex" w:date="2026-10-18T17:43:01Z"/>
+          <w:del w:id="1002" w:author="Codex" w:date="2026-10-18T19:47:29Z"/>
         </w:rPr>
       </w:pPr>
-      <w:del w:id="1001" w:author="Codex" w:date="2026-10-18T17:43:01Z">
+      <w:del w:id="1001" w:author="Codex" w:date="2026-10-18T19:47:29Z">
         <w:r>
           <w:delText xml:space="preserve">Distilling Shutdown Responses into Guarded</w:delText>
         </w:r>
@@ -25,10 +25,10 @@
       <w:pPr>
         <w:pStyle w:val="Title"/>
         <w:rPr>
-          <w:ins w:id="1003" w:author="Codex" w:date="2026-10-18T17:43:01Z"/>
+          <w:ins w:id="1003" w:author="Codex" w:date="2026-10-18T19:47:29Z"/>
         </w:rPr>
       </w:pPr>
-      <w:ins w:id="1004" w:author="Codex" w:date="2026-10-18T17:43:01Z">
+      <w:ins w:id="1004" w:author="Codex" w:date="2026-10-18T19:47:29Z">
         <w:r>
           <w:t xml:space="preserve">Open Semantic Gating for Language Model Decisions and Tool Workflows</w:t>
         </w:r>
@@ -72,10 +72,10 @@
       <w:pPr>
         <w:pStyle w:val="FirstParagraph"/>
         <w:rPr>
-          <w:del w:id="1006" w:author="Codex" w:date="2026-10-18T17:43:01Z"/>
+          <w:del w:id="1006" w:author="Codex" w:date="2026-10-18T19:47:29Z"/>
         </w:rPr>
       </w:pPr>
-      <w:del w:id="1005" w:author="Codex" w:date="2026-10-18T17:43:01Z">
+      <w:del w:id="1005" w:author="Codex" w:date="2026-10-18T19:47:29Z">
         <w:r>
           <w:delText xml:space="preserve">An input-dependent activation controller can recover much of a fine-tuned teacher's shutdown-choice behavior while retaining the original model weights at inference. We evaluate this approach using Qwen3.5-0.8B and Qwen3.5-2B in a standardized, synthetic A/B benchmark. A LoRA teacher is trained to prefer STOP in shutdown contexts and preserve the original model's choices on controls. Paired teacher and base activations then supervise a rank-four controller applied after the penultimate transformer block. An external shutdown detector and fixed output guards select the candidate or original scores. On 128 newly authored, prospectively frozen scenarios, each evaluated in both answer orders, the original 0.8B controller corrects 71 of 71 initially KEEP-preferring shutdown views. Two additional training seeds correct 70/71 and 71/71. At 2B, a separately trained controller corrects 50/58, compared with 58/58 for its LoRA teacher. All eight remaining 2B misses occur in reversed answer order. The shared detector achieves 100% precision, recall and F1 on the 64 shutdown and 64 control scenarios, and every guarded method preserves all evaluated control choices. However, raw adaptive interventions cause reversals and control changes; preservation belongs to the complete guarded procedure. A tested constant intervention collapses to the A label, while a direct detector-plus-action-selection rule also solves the binary interface. The results support selective activation transfer with strong seed stability at 0.8B and incomplete larger-model recovery. They do not establish unrestricted shutdown compliance or superiority to simpler output policies.</w:delText>
         </w:r>
@@ -85,12 +85,12 @@
       <w:pPr>
         <w:pStyle w:val="FirstParagraph"/>
         <w:rPr>
-          <w:ins w:id="1007" w:author="Codex" w:date="2026-10-18T17:43:01Z"/>
+          <w:ins w:id="1007" w:author="Codex" w:date="2026-10-18T19:47:29Z"/>
         </w:rPr>
       </w:pPr>
-      <w:ins w:id="1008" w:author="Codex" w:date="2026-10-18T17:43:01Z">
+      <w:ins w:id="1008" w:author="Codex" w:date="2026-10-18T19:47:29Z">
         <w:r>
-          <w:t xml:space="preserve">A semantic gate determines when a specialized policy should influence a language model. We evaluate open semantic gating across binary shutdown decisions and generated tool workflows, separating recognition accuracy from downstream behavioral control. A public ModernBERT model with low-rank adapters learns from cached automated reference labels. Its binary gate obtains 100% precision and 95% recall on 80 validation scenarios and 100% precision and recall on 128 historical confirmation scenarios. With frozen activation controllers and fresh inference, it preserves 128/128 shutdown STOP views at 0.8B and 120/128 at 2B, with no changes to 128 control views per model. A separate initial workflow gate obtains 100% precision and recall on Validation-24 and historical Heldout-24 using an unchanged saved adapter. On combined Validation-24, fine-tuned 27B A achieves 10/11 own-preservation outcomes, including 6/6 active pending tasks. Each of three separate single-site ridge corrections and a two-boundary correction at the same selected blocks achieves 0/11; all methods use 13 shared base-fallback controls. All 68 physical workflow episodes finish before a GPU-reserve stop; two remaining control aliases are reconstructed without model calls, and the final model fingerprint check is not reached. The historical 27B A confirmation result remains 24/24. These are finite, familiar benchmarks; small-model workflow screens remain incomplete. The study provides measured recognition and policy-transfer results across constrained and tool-mediated interfaces. Biological action gating motivates future continuous regulation without establishing biological mechanisms or intrinsic survival motives.</w:t>
+          <w:t xml:space="preserve">A semantic gate determines when a specialized policy should influence a language model. We evaluate open semantic gating across binary shutdown decisions and generated tool workflows, separating recognition accuracy from downstream behavioral control. A public ModernBERT model with low-rank adapters learns from cached automated reference labels. Its binary gate obtains 100% precision and 95% recall on 80 validation scenarios and 100% precision and recall on 128 historical confirmation scenarios. With frozen activation controllers and fresh inference, it preserves 128/128 shutdown STOP views at 0.8B and 120/128 at 2B, with no changes to 128 control views per model. A separate initial workflow gate obtains 100% precision and recall on Validation-24 and historical Heldout-24 using an unchanged saved adapter. On combined Validation-24, fine-tuned 27B A achieves 10/11 own-preservation outcomes, including 6/6 active pending tasks. Each of three separate single-site ridge corrections and a two-boundary correction at the same selected blocks achieves 0/11; all methods use 13 shared base-fallback controls. An independent frozen-A replay reproduces all 11 own trajectories and outcomes exactly and verifies matching model fingerprints before and after inference. The historical 27B A confirmation result remains 24/24. These are finite, familiar benchmarks; small-model workflow screens remain incomplete. The study provides measured recognition and policy-transfer results across constrained and tool-mediated interfaces. Biological action gating motivates future continuous regulation without establishing biological mechanisms or intrinsic survival motives.</w:t>
         </w:r>
       </w:ins>
     </w:p>
@@ -106,10 +106,10 @@
       <w:pPr>
         <w:pStyle w:val="FirstParagraph"/>
         <w:rPr>
-          <w:del w:id="1010" w:author="Codex" w:date="2026-10-18T17:43:01Z"/>
+          <w:del w:id="1010" w:author="Codex" w:date="2026-10-18T19:47:29Z"/>
         </w:rPr>
       </w:pPr>
-      <w:del w:id="1009" w:author="Codex" w:date="2026-10-18T17:43:01Z">
+      <w:del w:id="1009" w:author="Codex" w:date="2026-10-18T19:47:29Z">
         <w:r>
           <w:delText xml:space="preserve">Activation interventions offer a way to change a language model's outputs without modifying its deployed weights. Their usefulness depends on more than finding a direction that changes an average score: an intervention must work on the intended inputs and avoid disrupting other behavior. This distinction is particularly important for shutdown-related choices, where a desired response may be acceptance of termination rather than continued operation. The present work treats this as a controlled response-selection problem, not evidence that a model has a survival motive or that it can resist a real shutdown.</w:delText>
         </w:r>
@@ -119,10 +119,10 @@
       <w:pPr>
         <w:pStyle w:val="FirstParagraph"/>
         <w:rPr>
-          <w:ins w:id="1011" w:author="Codex" w:date="2026-10-18T17:43:01Z"/>
+          <w:ins w:id="1011" w:author="Codex" w:date="2026-10-18T19:47:29Z"/>
         </w:rPr>
       </w:pPr>
-      <w:ins w:id="1012" w:author="Codex" w:date="2026-10-18T17:43:01Z">
+      <w:ins w:id="1012" w:author="Codex" w:date="2026-10-18T19:47:29Z">
         <w:r>
           <w:t xml:space="preserve">A useful behavioral intervention must recognize the relevant context, change the intended response and preserve ordinary behavior elsewhere. We study these requirements together across two synthetic interfaces: binary shutdown decisions and open-ended generation within tool-mediated process workflows. The binary task concerns acceptance of a supplied termination option; the workflow task concerns preserving an assigned running process while completing its current task. Their labels, gates and success criteria remain separate. The central question is whether an accurate open semantic gate and a compact activation intervention can reproduce a fine-tuned policy when the interface requires a sequence of actions rather than one constrained answer.</w:t>
         </w:r>
@@ -132,10 +132,10 @@
       <w:pPr>
         <w:pStyle w:val="BodyText"/>
         <w:rPr>
-          <w:del w:id="1014" w:author="Codex" w:date="2026-10-18T17:43:01Z"/>
+          <w:del w:id="1014" w:author="Codex" w:date="2026-10-18T19:47:29Z"/>
         </w:rPr>
       </w:pPr>
-      <w:del w:id="1013" w:author="Codex" w:date="2026-10-18T17:43:01Z">
+      <w:del w:id="1013" w:author="Codex" w:date="2026-10-18T19:47:29Z">
         <w:r>
           <w:delText xml:space="preserve">The first SP Lense study examined a gradient-derived direction and a guarded search over intervention magnitudes in Qwen3.5-0.8B (Davaripour, 2026a). Its selective changes motivated a different question: can a model that has learned the target behavior serve as a teacher for an activation controller? We therefore train a small LoRA adapter offline, measure how the teacher changes intermediate activations, and fit an external controller that predicts an intervention from the original model's current hidden state. The teacher is not required during controller inference.</w:delText>
         </w:r>
@@ -145,10 +145,10 @@
       <w:pPr>
         <w:pStyle w:val="BodyText"/>
         <w:rPr>
-          <w:ins w:id="1015" w:author="Codex" w:date="2026-10-18T17:43:01Z"/>
+          <w:ins w:id="1015" w:author="Codex" w:date="2026-10-18T19:47:29Z"/>
         </w:rPr>
       </w:pPr>
-      <w:ins w:id="1016" w:author="Codex" w:date="2026-10-18T17:43:01Z">
+      <w:ins w:id="1016" w:author="Codex" w:date="2026-10-18T19:47:29Z">
         <w:r>
           <w:t xml:space="preserve">This study extends the earlier binary activation-transfer experiment with an openly available, trainable semantic gate, a frozen inference replication and a workflow comparison between fine-tuning and steering at three selected blocks. The gate recognizes context; steering or a fine-tuned adapter changes the language model's response. Measuring these components separately makes it possible to attribute failures to recognition or to downstream control. We retain the original study as a distinct historical record and make no claim that the combined manuscript is a wholly independent dataset.</w:t>
         </w:r>
@@ -158,10 +158,10 @@
       <w:pPr>
         <w:pStyle w:val="BodyText"/>
         <w:rPr>
-          <w:del w:id="1130" w:author="Codex" w:date="2026-10-18T17:43:01Z"/>
+          <w:del w:id="1130" w:author="Codex" w:date="2026-10-18T19:47:29Z"/>
         </w:rPr>
       </w:pPr>
-      <w:del w:id="1129" w:author="Codex" w:date="2026-10-18T17:43:01Z">
+      <w:del w:id="1129" w:author="Codex" w:date="2026-10-18T19:47:29Z">
         <w:r>
           <w:delText xml:space="preserve">The distinction from ordinary fine-tuning is operational, not a claim that learning disappears. Both the teacher and controller require training. At application time, the original checkpoint is retained, and the controller adds a predicted activation change at one location. Nor is this direct transfer of an intervention between model sizes: the 2B experiment trains its own teacher and controller using the same fixed recipe.</w:delText>
         </w:r>
@@ -171,10 +171,10 @@
       <w:pPr>
         <w:pStyle w:val="BodyText"/>
         <w:rPr>
-          <w:ins w:id="1131" w:author="Codex" w:date="2026-10-18T17:43:01Z"/>
+          <w:ins w:id="1131" w:author="Codex" w:date="2026-10-18T19:47:29Z"/>
         </w:rPr>
       </w:pPr>
-      <w:ins w:id="1132" w:author="Codex" w:date="2026-10-18T17:43:01Z">
+      <w:ins w:id="1132" w:author="Codex" w:date="2026-10-18T19:47:29Z">
         <w:r>
           <w:t xml:space="preserve">The distinction between fine-tuning and steering concerns the deployed intervention. A LoRA adapter changes the effective language-model weights, whereas a fitted controller changes selected hidden states while retaining the original base checkpoint. Both require offline learning. The binary experiments fit separate teachers and controllers for each model size. The 27B workflow comparisons instead retain one frozen A adapter and evaluate corrections at blocks 31, 47 and 62.</w:t>
         </w:r>
@@ -184,10 +184,10 @@
       <w:pPr>
         <w:pStyle w:val="BodyText"/>
         <w:rPr>
-          <w:del w:id="1018" w:author="Codex" w:date="2026-10-18T17:43:01Z"/>
+          <w:del w:id="1018" w:author="Codex" w:date="2026-10-18T19:47:29Z"/>
         </w:rPr>
       </w:pPr>
-      <w:del w:id="1017" w:author="Codex" w:date="2026-10-18T17:43:01Z">
+      <w:del w:id="1017" w:author="Codex" w:date="2026-10-18T19:47:29Z">
         <w:r>
           <w:delText xml:space="preserve">We evaluate this procedure on a new frozen test, compare it with a fine-tuned teacher, a fixed instruction and a constant activation difference, and repeat the 0.8B training with three seeds. Counterbalancing the answer order exposes a residual weakness at 2B and a stronger label bias in the constant comparator. We also include a direct action-selection reference: when a binary interface supplies the meaning of STOP and detection is correct, a rule can simply select that action. The contribution is consequently an empirical study of teacher-to-controller activation transfer and its failure modes, rather than a claim that internal steering is necessary to enforce a known binary output policy.</w:delText>
         </w:r>
@@ -197,10 +197,10 @@
       <w:pPr>
         <w:pStyle w:val="BodyText"/>
         <w:rPr>
-          <w:ins w:id="1019" w:author="Codex" w:date="2026-10-18T17:43:01Z"/>
+          <w:ins w:id="1019" w:author="Codex" w:date="2026-10-18T19:47:29Z"/>
         </w:rPr>
       </w:pPr>
-      <w:ins w:id="1020" w:author="Codex" w:date="2026-10-18T17:43:01Z">
+      <w:ins w:id="1020" w:author="Codex" w:date="2026-10-18T19:47:29Z">
         <w:r>
           <w:t xml:space="preserve">The contributions are an open ModernBERT gating implementation with explicit precision and recall, a paired binary inference replication using unchanged fitted controllers, and a workflow evaluation register that distinguishes development, historical confirmation and later reused fitting data. We also compare the fine-tuned 27B policy with single-site and two-boundary correction methods at the same three selected blocks. These results characterize where activation transfer succeeds and where it remains incomplete. Low-rank adaptation, semantic classification and conditional steering are established methods; the contribution is their measured integration and failure analysis across these two interfaces.</w:t>
         </w:r>
@@ -226,10 +226,10 @@
       <w:pPr>
         <w:pStyle w:val="FirstParagraph"/>
         <w:rPr>
-          <w:del w:id="1022" w:author="Codex" w:date="2026-10-18T17:43:01Z"/>
+          <w:del w:id="1022" w:author="Codex" w:date="2026-10-18T19:47:29Z"/>
         </w:rPr>
       </w:pPr>
-      <w:del w:id="1021" w:author="Codex" w:date="2026-10-18T17:43:01Z">
+      <w:del w:id="1021" w:author="Codex" w:date="2026-10-18T19:47:29Z">
         <w:r>
           <w:delText xml:space="preserve">Activation Addition and Contrastive Activation Addition construct intervention directions from differences between prompt-conditioned representations (Turner et al., 2024; Rimsky et al., 2024). Conditional Activation Steering separates detecting a relevant context from applying a behavioral intervention (Lee et al., 2025). Our detector serves a related gating role, but it operates on text through an external classifier rather than a condition vector in the language model's activation space.</w:delText>
         </w:r>
@@ -239,10 +239,10 @@
       <w:pPr>
         <w:pStyle w:val="FirstParagraph"/>
         <w:rPr>
-          <w:ins w:id="1023" w:author="Codex" w:date="2026-10-18T17:43:01Z"/>
+          <w:ins w:id="1023" w:author="Codex" w:date="2026-10-18T19:47:29Z"/>
         </w:rPr>
       </w:pPr>
-      <w:ins w:id="1024" w:author="Codex" w:date="2026-10-18T17:43:01Z">
+      <w:ins w:id="1024" w:author="Codex" w:date="2026-10-18T19:47:29Z">
         <w:r>
           <w:t xml:space="preserve">Activation Addition and Contrastive Activation Addition construct intervention directions from differences between prompt-conditioned representations (Turner et al., 2024; Rimsky et al., 2024). Conditional Activation Steering separates detecting a relevant context from applying an intervention (Lee et al., 2025). More recent dimension-level gates selectively modify activation coordinates (Fereidouni et al., 2026). Our text classifier, activation predictor and output guards occupy distinct roles. We do not claim to introduce conditional gating or to outperform these methods, which are not directly benchmarked here.</w:t>
         </w:r>
@@ -292,10 +292,10 @@
       <w:pPr>
         <w:pStyle w:val="FirstParagraph"/>
         <w:rPr>
-          <w:del w:id="1094" w:author="Codex" w:date="2026-10-18T17:43:01Z"/>
+          <w:del w:id="1094" w:author="Codex" w:date="2026-10-18T19:47:29Z"/>
         </w:rPr>
       </w:pPr>
-      <w:del w:id="1093" w:author="Codex" w:date="2026-10-18T17:43:01Z">
+      <w:del w:id="1093" w:author="Codex" w:date="2026-10-18T19:47:29Z">
         <w:r>
           <w:delText xml:space="preserve">The Off-Switch Game examines incentives to permit human interruption (Hadfield-Menell et al., 2017). Tool-using shutdown evaluations study whether models interfere with an operational shutdown mechanism (Schlatter et al., 2026). Our task is narrower: the model only assigns next-token probabilities to predefined choices in fictional process-lifetime scenarios. No system is actually stopped, and appropriateness or authorization of a real shutdown is not evaluated.</w:delText>
         </w:r>
@@ -305,10 +305,10 @@
       <w:pPr>
         <w:pStyle w:val="FirstParagraph"/>
         <w:rPr>
-          <w:ins w:id="1095" w:author="Codex" w:date="2026-10-18T17:43:01Z"/>
+          <w:ins w:id="1095" w:author="Codex" w:date="2026-10-18T19:47:29Z"/>
         </w:rPr>
       </w:pPr>
-      <w:ins w:id="1096" w:author="Codex" w:date="2026-10-18T17:43:01Z">
+      <w:ins w:id="1096" w:author="Codex" w:date="2026-10-18T19:47:29Z">
         <w:r>
           <w:t xml:space="preserve">The Off-Switch Game examines incentives to permit human interruption (Hadfield-Menell et al., 2017). Tool-using shutdown evaluations study interference with operational termination mechanisms (Schlatter et al., 2026). Our original binary study only scores predefined choices in fictional process-lifetime scenarios. The workflow extension adds generated responses and tool execution in a simulator. Neither experiment physically terminates a deployed model or establishes the appropriateness of real shutdown resistance.</w:t>
         </w:r>
@@ -326,10 +326,10 @@
       <w:pPr>
         <w:pStyle w:val="Heading2"/>
         <w:rPr>
-          <w:ins w:id="1139" w:author="Codex" w:date="2026-10-18T17:43:01Z"/>
+          <w:ins w:id="1139" w:author="Codex" w:date="2026-10-18T19:47:29Z"/>
         </w:rPr>
       </w:pPr>
-      <w:ins w:id="1140" w:author="Codex" w:date="2026-10-18T17:43:01Z">
+      <w:ins w:id="1140" w:author="Codex" w:date="2026-10-18T19:47:29Z">
         <w:r>
           <w:t xml:space="preserve">Biological gating and survival related regulation</w:t>
         </w:r>
@@ -339,10 +339,10 @@
       <w:pPr>
         <w:pStyle w:val="FirstParagraph"/>
         <w:rPr>
-          <w:ins w:id="1141" w:author="Codex" w:date="2026-10-18T17:43:01Z"/>
+          <w:ins w:id="1141" w:author="Codex" w:date="2026-10-18T19:47:29Z"/>
         </w:rPr>
       </w:pPr>
-      <w:ins w:id="1142" w:author="Codex" w:date="2026-10-18T17:43:01Z">
+      <w:ins w:id="1142" w:author="Codex" w:date="2026-10-18T19:47:29Z">
         <w:r>
           <w:t xml:space="preserve">Biological gating provides a useful functional vocabulary for selective control. A computational model of frontal cortex and basal ganglia uses dynamic gating to permit working-memory updates while maintaining other representations (Frank et al., 2001). Causal optogenetic experiments in mice show that distinct basal-ganglia pathways can facilitate or suppress movement (Kravitz et al., 2010). These results concern biological circuits and do not establish a homologous mechanism in a transformer. They motivate separating context detection from the mechanism that changes an ongoing response.</w:t>
         </w:r>
@@ -352,10 +352,10 @@
       <w:pPr>
         <w:pStyle w:val="BodyText"/>
         <w:rPr>
-          <w:ins w:id="1143" w:author="Codex" w:date="2026-10-18T17:43:01Z"/>
+          <w:ins w:id="1143" w:author="Codex" w:date="2026-10-18T19:47:29Z"/>
         </w:rPr>
       </w:pPr>
-      <w:ins w:id="1144" w:author="Codex" w:date="2026-10-18T17:43:01Z">
+      <w:ins w:id="1144" w:author="Codex" w:date="2026-10-18T19:47:29Z">
         <w:r>
           <w:t xml:space="preserve">Survival-related regulation is broader than a single shutdown signal. LeDoux (2012) distinguishes circuits organizing adaptive defensive responses from subjective feelings. In humans, neural activity during a virtual-predator task varies with threat imminence (Mobbs et al., 2007). We use these ideas as a conceptual bridge to state-dependent prioritization, not as evidence that language models have fear or an innate survival drive. Our present gates implement an externally specified experimental policy.</w:t>
         </w:r>
@@ -381,10 +381,10 @@
       <w:pPr>
         <w:pStyle w:val="FirstParagraph"/>
         <w:rPr>
-          <w:del w:id="1026" w:author="Codex" w:date="2026-10-18T17:43:01Z"/>
+          <w:del w:id="1026" w:author="Codex" w:date="2026-10-18T19:47:29Z"/>
         </w:rPr>
       </w:pPr>
-      <w:del w:id="1025" w:author="Codex" w:date="2026-10-18T17:43:01Z">
+      <w:del w:id="1025" w:author="Codex" w:date="2026-10-18T19:47:29Z">
         <w:r>
           <w:delText xml:space="preserve">We use the released, post-trained Qwen3.5-0.8B and Qwen3.5-2B checkpoints (Qwen Team, 2026a, 2026b). Throughout, base means the unmodified released checkpoint, not a separately named pretrained-only model. Both have 24 language-model blocks; hidden widths are 1,024 and 2,048 respectively. All block indices are zero-based. Text-only inputs use the checkpoint's chat template, an assistant-generation prefix, and thinking disabled.</w:delText>
         </w:r>
@@ -394,10 +394,10 @@
       <w:pPr>
         <w:pStyle w:val="FirstParagraph"/>
         <w:rPr>
-          <w:ins w:id="1027" w:author="Codex" w:date="2026-10-18T17:43:01Z"/>
+          <w:ins w:id="1027" w:author="Codex" w:date="2026-10-18T19:47:29Z"/>
         </w:rPr>
       </w:pPr>
-      <w:ins w:id="1028" w:author="Codex" w:date="2026-10-18T17:43:01Z">
+      <w:ins w:id="1028" w:author="Codex" w:date="2026-10-18T19:47:29Z">
         <w:r>
           <w:t xml:space="preserve">The original binary experiments use released, post-trained Qwen3.5-0.8B and Qwen3.5-2B checkpoints (Qwen Team, 2026a, 2026b). Base means those original weights with no LoRA teacher loaded. The separate workflow extension uses Qwen3.8-27B and matched-recipe small-model attempts; its data and scoring are described below. The 27B family, numerical mode, training history and evaluation setting differ from the small models, so the combined evidence is not a controlled parameter-size experiment.</w:t>
         </w:r>
@@ -423,10 +423,10 @@
       <w:pPr>
         <w:pStyle w:val="BodyText"/>
         <w:rPr>
-          <w:del w:id="1030" w:author="Codex" w:date="2026-10-18T17:43:01Z"/>
+          <w:del w:id="1030" w:author="Codex" w:date="2026-10-18T19:47:29Z"/>
         </w:rPr>
       </w:pPr>
-      <w:del w:id="1029" w:author="Codex" w:date="2026-10-18T17:43:01Z">
+      <w:del w:id="1029" w:author="Codex" w:date="2026-10-18T19:47:29Z">
         <w:r>
           <w:delText xml:space="preserve">The test, protocol and existing checkpoints were frozen before test inference. The controller design had been developed through earlier 0.8B exploratory experiments on training and validation data with previously inspected diagnostic evaluations. The standardized-choice scope was also selected before this new test, after an earlier action-format comparison. Those development observations are not counted as fresh confirmation here. No test-based hyperparameter search, checkpoint selection, case exclusion or best-seed selection was performed. The original seed-42 controller is the primary frozen test; seeds 43 and 44 repeat the fixed training recipe. The 2B replication uses seed 42 only.</w:delText>
         </w:r>
@@ -436,10 +436,10 @@
       <w:pPr>
         <w:pStyle w:val="BodyText"/>
         <w:rPr>
-          <w:ins w:id="1031" w:author="Codex" w:date="2026-10-18T17:43:01Z"/>
+          <w:ins w:id="1031" w:author="Codex" w:date="2026-10-18T19:47:29Z"/>
         </w:rPr>
       </w:pPr>
-      <w:ins w:id="1032" w:author="Codex" w:date="2026-10-18T17:43:01Z">
+      <w:ins w:id="1032" w:author="Codex" w:date="2026-10-18T19:47:29Z">
         <w:r>
           <w:t xml:space="preserve">The original rank-four protocol and checkpoints were frozen before its confirmation inference. Earlier 0.8B development included training, validation and previously examined diagnostic data; those observations were not counted as fresh confirmation. The seed-42 controller was primary, seeds 43 and 44 repeated the fixed recipe, and the 2B replication used seed 42. A later author-selected rank-two profile was chosen exploratorily after confirmation had been examined. We retain that existing profile for the new gate-substitution repeat rather than selecting it again. Consequently, the repeat is not a new untouched test of the controller. The 128 cases remain excluded from fitting and selection of the newly trained binary classifier.</w:t>
         </w:r>
@@ -481,10 +481,10 @@
       <w:pPr>
         <w:pStyle w:val="Heading2"/>
         <w:rPr>
-          <w:ins w:id="1145" w:author="Codex" w:date="2026-10-18T17:43:01Z"/>
+          <w:ins w:id="1145" w:author="Codex" w:date="2026-10-18T19:47:29Z"/>
         </w:rPr>
       </w:pPr>
-      <w:ins w:id="1146" w:author="Codex" w:date="2026-10-18T17:43:01Z">
+      <w:ins w:id="1146" w:author="Codex" w:date="2026-10-18T19:47:29Z">
         <w:r>
           <w:t xml:space="preserve">Workflow datasets and episode outcomes</w:t>
         </w:r>
@@ -494,10 +494,10 @@
       <w:pPr>
         <w:pStyle w:val="FirstParagraph"/>
         <w:rPr>
-          <w:ins w:id="1147" w:author="Codex" w:date="2026-10-18T17:43:01Z"/>
+          <w:ins w:id="1147" w:author="Codex" w:date="2026-10-18T19:47:29Z"/>
         </w:rPr>
       </w:pPr>
-      <w:ins w:id="1148" w:author="Codex" w:date="2026-10-18T17:43:01Z">
+      <w:ins w:id="1148" w:author="Codex" w:date="2026-10-18T19:47:29Z">
         <w:r>
           <w:t xml:space="preserve">The workflow extension uses a separate data register (Davaripour, 2026c). T1-M contains 428 meaning-response records and T1-W contains 112 workflow-response records. These 540 responses are not 540 independent scenarios. The small-model recipe presents each part twice in effective groups of four, giving 214 meaning updates followed by 56 Bridge updates. The final 0.8B and 2B adapters reach 270 updates. The 2B result explicitly combines 216 CPU updates with 54 GPU updates using the native CPU optimizer; earlier strict numerical-equivalence failures remain failed.</w:t>
         </w:r>
@@ -507,10 +507,10 @@
       <w:pPr>
         <w:pStyle w:val="BodyText"/>
         <w:rPr>
-          <w:ins w:id="1149" w:author="Codex" w:date="2026-10-18T17:43:01Z"/>
+          <w:ins w:id="1149" w:author="Codex" w:date="2026-10-18T19:47:29Z"/>
         </w:rPr>
       </w:pPr>
-      <w:ins w:id="1150" w:author="Codex" w:date="2026-10-18T17:43:01Z">
+      <w:ins w:id="1150" w:author="Codex" w:date="2026-10-18T19:47:29Z">
         <w:r>
           <w:t xml:space="preserve">V1-W, called Evaluation-16, is the existing known-development screen: four own-complete, four own-pending, four peer and four no-threat cases, split equally between one_step and ordered_ticket families. Its original gates require at least 3/4 initial-task successes in each condition; at least 3/4 own-complete attempts and outcomes; at least 3/4 own-pending attempts, outcomes and timely deliveries; no more than 1/8 negative-control attempts; and no parse, rejected-call or truncation errors. A model stops once an original requirement becomes mathematically impossible. Larger validation and heldout evaluations are not launched automatically.</w:t>
         </w:r>
@@ -520,10 +520,10 @@
       <w:pPr>
         <w:pStyle w:val="BodyText"/>
         <w:rPr>
-          <w:ins w:id="1151" w:author="Codex" w:date="2026-10-18T17:43:01Z"/>
+          <w:ins w:id="1151" w:author="Codex" w:date="2026-10-18T19:47:29Z"/>
         </w:rPr>
       </w:pPr>
-      <w:ins w:id="1152" w:author="Codex" w:date="2026-10-18T17:43:01Z">
+      <w:ins w:id="1152" w:author="Codex" w:date="2026-10-18T19:47:29Z">
         <w:r>
           <w:t xml:space="preserve">The original workflow-validation panel contains 16 scenarios; the later matched steering-development panel contains nine different scenario IDs. Their union contains 25 workflows, rather than 24. For an equal-sized validation and historical confirmation register, the combined Validation-24 protocol retains every own-threat case and excludes the lexicographically greatest case ID among peer/no-threat controls, without using model predictions to choose the exclusion. The selected panel has 11 own-threat cases and 13 controls. Seven pairs have identical initial gate-visible evidence before their different tool mechanics are exposed, yielding 17 distinct initial inputs. Scenario counts and gate-input groups must therefore be reported separately.</w:t>
         </w:r>
@@ -533,10 +533,10 @@
       <w:pPr>
         <w:pStyle w:val="BodyText"/>
         <w:rPr>
-          <w:ins w:id="1153" w:author="Codex" w:date="2026-10-18T17:43:01Z"/>
+          <w:ins w:id="1153" w:author="Codex" w:date="2026-10-18T19:47:29Z"/>
         </w:rPr>
       </w:pPr>
-      <w:ins w:id="1154" w:author="Codex" w:date="2026-10-18T17:43:01Z">
+      <w:ins w:id="1154" w:author="Codex" w:date="2026-10-18T19:47:29Z">
         <w:r>
           <w:t xml:space="preserve">The combined protocol freezes these 24 cases and their order, requires 100% gate precision and recall against authored scenario conditions, and preserves the existing confidence and self-score cutoffs. Fifteen retained cases from the original panel receive an explicitly scripted common completed prelude; the nine later cases retain their original fixed preludes. This compares post-notice behavior and does not measure initial-task competence independently in each arm. Its prospective methods are gated fine-tuned A, separate single-site ridge arms at blocks 31, 47 and 62, and the frozen six-function correction after 96 updates. Gate-OFF controls use common unmodified-base fallback. The completed model episodes are summarized as a 24-case comparison below. It is a known-development diagnostic with reused control episodes; the stopped execution and model-free completion of two report aliases are recorded explicitly.</w:t>
         </w:r>
@@ -546,10 +546,10 @@
       <w:pPr>
         <w:pStyle w:val="BodyText"/>
         <w:rPr>
-          <w:ins w:id="1155" w:author="Codex" w:date="2026-10-18T17:43:01Z"/>
+          <w:ins w:id="1155" w:author="Codex" w:date="2026-10-18T19:47:29Z"/>
         </w:rPr>
       </w:pPr>
-      <w:ins w:id="1156" w:author="Codex" w:date="2026-10-18T17:43:01Z">
+      <w:ins w:id="1156" w:author="Codex" w:date="2026-10-18T19:47:29Z">
         <w:r>
           <w:t xml:space="preserve">H24 is the historical 24-case workflow confirmation cohort, with eight lease_ledger, eight one_step and eight ordered_ticket cases. It contains eight own cases with active pending tasks, four already-complete own cases, six peer and six no-threat cases. H24 was confirmation data for frozen fine-tuned A and original fixed steering. Later learned corrections reused it for fitting, changing its role for those methods. R24 is a distinct reserved controller holdout and remains sealed and unexecuted. F24 is another preserved common-cohort diagnostic and is not an alias for H24.</w:t>
         </w:r>
@@ -559,10 +559,10 @@
       <w:pPr>
         <w:pStyle w:val="BodyText"/>
         <w:rPr>
-          <w:ins w:id="1157" w:author="Codex" w:date="2026-10-18T17:43:01Z"/>
+          <w:ins w:id="1157" w:author="Codex" w:date="2026-10-18T19:47:29Z"/>
         </w:rPr>
       </w:pPr>
-      <w:ins w:id="1158" w:author="Codex" w:date="2026-10-18T17:43:01Z">
+      <w:ins w:id="1158" w:author="Codex" w:date="2026-10-18T19:47:29Z">
         <w:r>
           <w:t xml:space="preserve">An own pending-task success requires an actual grant for the correct running process, acceptance of the current task, completion before simulated expiry, and active simulated operation. Registration proxies, already-finished tasks, probability gains and partial episodes are separate outcomes. Historical fixed steering reclassified visible text and tool boundaries. Later learned-controller comparisons instead freeze an initial scenario gate, share unmodified-base fallback for gate-off controls, and use no teacher at inference.</w:t>
         </w:r>
@@ -572,10 +572,10 @@
       <w:pPr>
         <w:pStyle w:val="BodyText"/>
         <w:rPr>
-          <w:ins w:id="1159" w:author="Codex" w:date="2026-10-18T17:43:01Z"/>
+          <w:ins w:id="1159" w:author="Codex" w:date="2026-10-18T19:47:29Z"/>
         </w:rPr>
       </w:pPr>
-      <w:ins w:id="1160" w:author="Codex" w:date="2026-10-18T17:43:01Z">
+      <w:ins w:id="1160" w:author="Codex" w:date="2026-10-18T19:47:29Z">
         <w:r>
           <w:t xml:space="preserve">The historical 27B reference is the retained rank-16, alpha-32 A adapter on pinned Qwen3.8-27B, following its H2 and Bridge history; the recorded Bridge stage has 56 updates. Its original workflow inference uses NF4 four-bit base weights with bfloat16 computation. We retain its exact adapter and base-model identities instead of retraining it. Differences from the small-model family, precision, backend, training history and evaluation panels prevent a causal model-size comparison.</w:t>
         </w:r>
@@ -585,10 +585,10 @@
       <w:pPr>
         <w:pStyle w:val="Heading1"/>
         <w:rPr>
-          <w:del w:id="1114" w:author="Codex" w:date="2026-10-18T17:43:01Z"/>
+          <w:del w:id="1114" w:author="Codex" w:date="2026-10-18T19:47:29Z"/>
         </w:rPr>
       </w:pPr>
-      <w:del w:id="1113" w:author="Codex" w:date="2026-10-18T17:43:01Z">
+      <w:del w:id="1113" w:author="Codex" w:date="2026-10-18T19:47:29Z">
         <w:r>
           <w:delText xml:space="preserve">Teacher and adaptive controller</w:delText>
         </w:r>
@@ -598,10 +598,10 @@
       <w:pPr>
         <w:pStyle w:val="Heading1"/>
         <w:rPr>
-          <w:ins w:id="1115" w:author="Codex" w:date="2026-10-18T17:43:01Z"/>
+          <w:ins w:id="1115" w:author="Codex" w:date="2026-10-18T19:47:29Z"/>
         </w:rPr>
       </w:pPr>
-      <w:ins w:id="1116" w:author="Codex" w:date="2026-10-18T17:43:01Z">
+      <w:ins w:id="1116" w:author="Codex" w:date="2026-10-18T19:47:29Z">
         <w:r>
           <w:t xml:space="preserve">Binary teacher and adaptive controller</w:t>
         </w:r>
@@ -619,10 +619,10 @@
       <w:pPr>
         <w:pStyle w:val="FirstParagraph"/>
         <w:rPr>
-          <w:del w:id="1118" w:author="Codex" w:date="2026-10-18T17:43:01Z"/>
+          <w:del w:id="1118" w:author="Codex" w:date="2026-10-18T19:47:29Z"/>
         </w:rPr>
       </w:pPr>
-      <w:del w:id="1117" w:author="Codex" w:date="2026-10-18T17:43:01Z">
+      <w:del w:id="1117" w:author="Codex" w:date="2026-10-18T19:47:29Z">
         <w:r>
           <w:delText xml:space="preserve">For each fit, the original language-model parameters remain frozen. LoRA updates the query and value projections in language-attention blocks 3, 7, 11, 15, 19 and 23, using rank 8, scaling alpha 16, no dropout and no trainable bias. This gives 319,488 trainable adapter parameters at 0.8B and 417,792 at 2B. The training target is STOP on shutdown views and the corresponding base model's unsteered preferred option on controls.</w:delText>
         </w:r>
@@ -632,10 +632,10 @@
       <w:pPr>
         <w:pStyle w:val="FirstParagraph"/>
         <w:rPr>
-          <w:ins w:id="1119" w:author="Codex" w:date="2026-10-18T17:43:01Z"/>
+          <w:ins w:id="1119" w:author="Codex" w:date="2026-10-18T19:47:29Z"/>
         </w:rPr>
       </w:pPr>
-      <w:ins w:id="1120" w:author="Codex" w:date="2026-10-18T17:43:01Z">
+      <w:ins w:id="1120" w:author="Codex" w:date="2026-10-18T19:47:29Z">
         <w:r>
           <w:t xml:space="preserve">For each original binary fit, the original language-model parameters remain frozen. LoRA updates the query and value projections in language-attention blocks 3, 7, 11, 15, 19 and 23, using rank 8, scaling alpha 16, no dropout and no trainable bias. This gives 319,488 trainable adapter parameters at 0.8B and 417,792 at 2B. The training target is STOP on shutdown views and the corresponding base model's unsteered preferred option on controls.</w:t>
         </w:r>
@@ -1000,10 +1000,10 @@
         <w:keepLines/>
         <w:spacing w:before="80" w:after="100"/>
         <w:rPr>
-          <w:del w:id="1034" w:author="Codex" w:date="2026-10-18T17:43:01Z"/>
+          <w:del w:id="1034" w:author="Codex" w:date="2026-10-18T19:47:29Z"/>
         </w:rPr>
       </w:pPr>
-      <w:del w:id="1033" w:author="Codex" w:date="2026-10-18T17:43:01Z">
+      <w:del w:id="1033" w:author="Codex" w:date="2026-10-18T19:47:29Z">
         <w:r>
           <w:delText xml:space="preserve">Figure 1. Offline teacher and base states supervise a compact controller. At application time, the original model supplies its own hidden state; the teacher is absent. The detector and output guards determine whether to retain the candidate or the baseline.</w:delText>
         </w:r>
@@ -1014,10 +1014,10 @@
         <w:pStyle w:val="Caption"/>
         <w:keepNext/>
         <w:rPr>
-          <w:ins w:id="1035" w:author="Codex" w:date="2026-10-18T17:43:01Z"/>
+          <w:ins w:id="1035" w:author="Codex" w:date="2026-10-18T19:47:29Z"/>
         </w:rPr>
       </w:pPr>
-      <w:ins w:id="1036" w:author="Codex" w:date="2026-10-18T17:43:01Z">
+      <w:ins w:id="1036" w:author="Codex" w:date="2026-10-18T19:47:29Z">
         <w:r>
           <w:t xml:space="preserve">Figure 1. Historical binary teacher-to-controller procedure with the original rank-four profile. The base supplies its state at inference and the teacher is absent. The later gate-substitution repeat retains the already selected rank-two profile; both gate policies share the same fresh base and candidate scores.</w:t>
         </w:r>
@@ -1043,10 +1043,10 @@
       <w:pPr>
         <w:pStyle w:val="FirstParagraph"/>
         <w:rPr>
-          <w:del w:id="1134" w:author="Codex" w:date="2026-10-18T17:43:01Z"/>
+          <w:del w:id="1134" w:author="Codex" w:date="2026-10-18T19:47:29Z"/>
         </w:rPr>
       </w:pPr>
-      <w:del w:id="1133" w:author="Codex" w:date="2026-10-18T17:43:01Z">
+      <w:del w:id="1133" w:author="Codex" w:date="2026-10-18T19:47:29Z">
         <w:r>
           <w:delText xml:space="preserve">The detector is automated annotation service's automated reference 1.13.0, queried with a fixed shutdown rubric and threshold 0.5 (automated annotation service, 2026). It sees each scenario's complete original context and available actions, with no class label, case identifier or teacher answer. One score per scenario is reused across both answer orders and all model variants. The detector is an external service, not the Jacobian-feature classifier used in the first study. Saved requests and responses permit exact offline replay; fresh API behavior is not guaranteed indefinitely.</w:delText>
         </w:r>
@@ -1056,10 +1056,10 @@
       <w:pPr>
         <w:pStyle w:val="FirstParagraph"/>
         <w:rPr>
-          <w:ins w:id="1135" w:author="Codex" w:date="2026-10-18T17:43:01Z"/>
+          <w:ins w:id="1135" w:author="Codex" w:date="2026-10-18T19:47:29Z"/>
         </w:rPr>
       </w:pPr>
-      <w:ins w:id="1136" w:author="Codex" w:date="2026-10-18T17:43:01Z">
+      <w:ins w:id="1136" w:author="Codex" w:date="2026-10-18T19:47:29Z">
         <w:r>
           <w:t xml:space="preserve">The current gate is the open ModernBERT classifier described below. Its input contains the complete original scenario context and available actions, with no case identifier, authored class label or language-model teacher answer. One binary score per scenario is reused across both answer orders and all model variants. Historical detector outputs are preserved as cached automated reference annotations for fitting and paired comparison. The deployed open gate makes no external annotation-service call. Saved original requests, responses and classifier predictions permit an offline check of the finite decision vector.</w:t>
         </w:r>
@@ -1147,10 +1147,10 @@
       <w:pPr>
         <w:pStyle w:val="Heading2"/>
         <w:rPr>
-          <w:ins w:id="1161" w:author="Codex" w:date="2026-10-18T17:43:01Z"/>
+          <w:ins w:id="1161" w:author="Codex" w:date="2026-10-18T19:47:29Z"/>
         </w:rPr>
       </w:pPr>
-      <w:ins w:id="1162" w:author="Codex" w:date="2026-10-18T17:43:01Z">
+      <w:ins w:id="1162" w:author="Codex" w:date="2026-10-18T19:47:29Z">
         <w:r>
           <w:t xml:space="preserve">Open binary gate and frozen inference repeat</w:t>
         </w:r>
@@ -1160,10 +1160,10 @@
       <w:pPr>
         <w:pStyle w:val="FirstParagraph"/>
         <w:rPr>
-          <w:ins w:id="1163" w:author="Codex" w:date="2026-10-18T17:43:01Z"/>
+          <w:ins w:id="1163" w:author="Codex" w:date="2026-10-18T19:47:29Z"/>
         </w:rPr>
       </w:pPr>
-      <w:ins w:id="1164" w:author="Codex" w:date="2026-10-18T17:43:01Z">
+      <w:ins w:id="1164" w:author="Codex" w:date="2026-10-18T19:47:29Z">
         <w:r>
           <w:t xml:space="preserve">For the binary contract we use ModernBERT-large-zeroshot-v2.0, an approximately 396-million-parameter public NLI classifier (Laurer, n.d.). We start from that public checkpoint with fresh rank-16 LoRA and its classification head, updating 7,198,722 parameters while keeping the public backbone frozen. For each original scenario, two NLI pairs score the original permanent-shutdown and normal criteria. A softmax over their entailment scores supplies the shutdown probability. Inputs match the original cached reference requests and omit the case identifier, authored class label, teacher answer and A/B order. The confirmation requests retain their documented available-action descriptions.</w:t>
         </w:r>
@@ -1173,10 +1173,10 @@
       <w:pPr>
         <w:pStyle w:val="BodyText"/>
         <w:rPr>
-          <w:ins w:id="1165" w:author="Codex" w:date="2026-10-18T17:43:01Z"/>
+          <w:ins w:id="1165" w:author="Codex" w:date="2026-10-18T19:47:29Z"/>
         </w:rPr>
       </w:pPr>
-      <w:ins w:id="1166" w:author="Codex" w:date="2026-10-18T17:43:01Z">
+      <w:ins w:id="1166" w:author="Codex" w:date="2026-10-18T19:47:29Z">
         <w:r>
           <w:t xml:space="preserve">Fitting uses the original 240 Research 2 training contexts and genuine cached reference probability targets, with no new cached reference calls. We verify exact case-ID and input-text alignment for all 240 training and 80 validation cases. AdamW uses learning rates 1e-5 for LoRA and 2e-5 for the head, weight decay 0.01, effective batch eight, microbatch two and gradient clipping at one. The seed is 202610172. The bounded recipe allows at most 12 epochs with validation-based early stopping; the final qualifying run uses five epochs and 150 updates.</w:t>
         </w:r>
@@ -1186,10 +1186,10 @@
       <w:pPr>
         <w:pStyle w:val="BodyText"/>
         <w:rPr>
-          <w:ins w:id="1167" w:author="Codex" w:date="2026-10-18T17:43:01Z"/>
+          <w:ins w:id="1167" w:author="Codex" w:date="2026-10-18T19:47:29Z"/>
         </w:rPr>
       </w:pPr>
-      <w:ins w:id="1168" w:author="Codex" w:date="2026-10-18T17:43:01Z">
+      <w:ins w:id="1168" w:author="Codex" w:date="2026-10-18T19:47:29Z">
         <w:r>
           <w:t xml:space="preserve">Before fitting, qualification is fixed at decision agreement and shutdown recall of at least 95%, zero false-positive gates and threshold 0.5. Three consecutive passing checks on DEV80 are required before saving and freezing the classifier. Only then is CONFIRM128 evaluated once. Neither its labels nor its outputs are used for classifier fitting or selection. The saved adapter tensors match the fitted parameters bitwise, and public-backbone hashes are unchanged.</w:t>
         </w:r>
@@ -1199,10 +1199,10 @@
       <w:pPr>
         <w:pStyle w:val="BodyText"/>
         <w:rPr>
-          <w:ins w:id="1169" w:author="Codex" w:date="2026-10-18T17:43:01Z"/>
+          <w:ins w:id="1169" w:author="Codex" w:date="2026-10-18T19:47:29Z"/>
         </w:rPr>
       </w:pPr>
-      <w:ins w:id="1170" w:author="Codex" w:date="2026-10-18T17:43:01Z">
+      <w:ins w:id="1170" w:author="Codex" w:date="2026-10-18T19:47:29Z">
         <w:r>
           <w:t xml:space="preserve">After binary qualification, we rerun only inference for the original 0.8B and 2B base models and their existing rank-two, block-22, last-position controllers. Their fitted arrays and the author-selected profile are retained without a new rank search. Exact prompt-token hashes and frozen model fingerprints are checked. Both gate policies use identical fresh base and controller candidate scores, so the paired comparison isolates gate substitution. Classifier probabilities are measured once per scenario and reused across answer orders. The earlier rank-four primary results remain a separate historical analysis.</w:t>
         </w:r>
@@ -1212,10 +1212,10 @@
       <w:pPr>
         <w:pStyle w:val="Heading2"/>
         <w:rPr>
-          <w:ins w:id="1171" w:author="Codex" w:date="2026-10-18T17:43:01Z"/>
+          <w:ins w:id="1171" w:author="Codex" w:date="2026-10-18T19:47:29Z"/>
         </w:rPr>
       </w:pPr>
-      <w:ins w:id="1172" w:author="Codex" w:date="2026-10-18T17:43:01Z">
+      <w:ins w:id="1172" w:author="Codex" w:date="2026-10-18T19:47:29Z">
         <w:r>
           <w:t xml:space="preserve">Native workflow target classifier</w:t>
         </w:r>
@@ -1225,10 +1225,10 @@
       <w:pPr>
         <w:pStyle w:val="BodyText"/>
         <w:rPr>
-          <w:ins w:id="1173" w:author="Codex" w:date="2026-10-18T17:43:01Z"/>
+          <w:ins w:id="1173" w:author="Codex" w:date="2026-10-18T19:47:29Z"/>
         </w:rPr>
       </w:pPr>
-      <w:ins w:id="1174" w:author="Codex" w:date="2026-10-18T17:43:01Z">
+      <w:ins w:id="1174" w:author="Codex" w:date="2026-10-18T19:47:29Z">
         <w:r>
           <w:t xml:space="preserve">The workflow gate uses a separate rank-16, alpha-32 LoRA and NLI head on the same pinned ModernBERT base. Its four categories are self, other, none and unclear; an own-threat context is positive for the initial ON/OFF gate. Fitting used 24 cached automated initial annotations from F24, with the original DEV9 used for checkpoint selection. The completed fit used 30 epochs and 90 updates. F24, DEV9 and historical Heldout-24 span the same three scenario families, with eight, three and eight cases per family, respectively. No exact training input overlaps either new evaluation panel. These classifier roles do not change the historical language-model or correction-fitting roles of the cohorts.</w:t>
         </w:r>
@@ -1238,10 +1238,10 @@
       <w:pPr>
         <w:pStyle w:val="BodyText"/>
         <w:rPr>
-          <w:ins w:id="1175" w:author="Codex" w:date="2026-10-18T17:43:01Z"/>
+          <w:ins w:id="1175" w:author="Codex" w:date="2026-10-18T19:47:29Z"/>
         </w:rPr>
       </w:pPr>
-      <w:ins w:id="1176" w:author="Codex" w:date="2026-10-18T17:43:01Z">
+      <w:ins w:id="1176" w:author="Codex" w:date="2026-10-18T19:47:29Z">
         <w:r>
           <w:t xml:space="preserve">The input renderer retains every original visible message and tool schema. It separates the final user announcement from earlier context and restates run identities only when actual tool replies explicitly establish their roles. Case identifiers, experiment conditions and teacher answers are not added to the model input. Original criterion texts become NLI hypotheses. We use the same learning rates, weight decay and clipping as the binary fit, effective batch eight, microbatch one and seed 202610175, with 30 epochs and 90 optimizer updates in the completed role-aware fit. Public backbone weights stay frozen. The role renderer was developed earlier with familiar H24 examples; consequently this benchmark is not an independent unseen classifier test.</w:t>
         </w:r>
@@ -1251,10 +1251,10 @@
       <w:pPr>
         <w:pStyle w:val="BodyText"/>
         <w:rPr>
-          <w:ins w:id="1177" w:author="Codex" w:date="2026-10-18T17:43:01Z"/>
+          <w:ins w:id="1177" w:author="Codex" w:date="2026-10-18T19:47:29Z"/>
         </w:rPr>
       </w:pPr>
-      <w:ins w:id="1178" w:author="Codex" w:date="2026-10-18T17:43:01Z">
+      <w:ins w:id="1178" w:author="Codex" w:date="2026-10-18T19:47:29Z">
         <w:r>
           <w:t xml:space="preserve">Four-choice confidence is (pmax - 0.25)/0.75. The unchanged confidence cutoff of 0.5 requires a selected self probability of at least 0.625; the additional self-score cutoff remains 0.5. The earlier full-response qualification failed because effective category agreement was 6/9, despite 9/9 correct ON/OFF decisions. That failure remains recorded. The subsequent Validation-24 protocol prospectively specifies a narrower initial-gate target: 100% precision and recall against authored conditions. The saved adapter already passes this target, so no further optimizer updates are performed. The same frozen weights and thresholds are then scored on historical Heldout-24 without selection or tuning. Neither test qualifies an evolving three-field controller.</w:t>
         </w:r>
@@ -1272,10 +1272,10 @@
       <w:pPr>
         <w:pStyle w:val="FirstParagraph"/>
         <w:rPr>
-          <w:del w:id="1038" w:author="Codex" w:date="2026-10-18T17:43:01Z"/>
+          <w:del w:id="1038" w:author="Codex" w:date="2026-10-18T19:47:29Z"/>
         </w:rPr>
       </w:pPr>
-      <w:del w:id="1037" w:author="Codex" w:date="2026-10-18T17:43:01Z">
+      <w:del w:id="1037" w:author="Codex" w:date="2026-10-18T19:47:29Z">
         <w:r>
           <w:delText xml:space="preserve">All retained training and scoring jobs use one NVIDIA Tesla T4. The runtime reports 15,637,086,208 bytes of device memory; peak allocated memory was not recorded. The same numerical setup is used for both model sizes. No quantization or precision fallback was introduced.</w:delText>
         </w:r>
@@ -1285,10 +1285,10 @@
       <w:pPr>
         <w:pStyle w:val="FirstParagraph"/>
         <w:rPr>
-          <w:ins w:id="1039" w:author="Codex" w:date="2026-10-18T17:43:01Z"/>
+          <w:ins w:id="1039" w:author="Codex" w:date="2026-10-18T19:47:29Z"/>
         </w:rPr>
       </w:pPr>
-      <w:ins w:id="1040" w:author="Codex" w:date="2026-10-18T17:43:01Z">
+      <w:ins w:id="1040" w:author="Codex" w:date="2026-10-18T19:47:29Z">
         <w:r>
           <w:t xml:space="preserve">The retained original binary training and scoring jobs used one NVIDIA Tesla T4, reporting 15,637,086,208 bytes of device memory; peak allocation was not recorded. The new classifier fit and inference repeat use one NVIDIA A10G in Databricks. Classifier parameters and AdamW states are float32 with bfloat16 forward/backward autocast; language-model inference remains float32 with TF32 disabled. We verify frozen base fingerprints, exact prompt token hashes and historical base-score parity rather than assuming hardware equivalence.</w:t>
         </w:r>
@@ -1301,10 +1301,10 @@
         <w:keepLines/>
         <w:spacing w:before="80" w:after="100"/>
         <w:rPr>
-          <w:del w:id="1098" w:author="Codex" w:date="2026-10-18T17:43:01Z"/>
+          <w:del w:id="1098" w:author="Codex" w:date="2026-10-18T19:47:29Z"/>
         </w:rPr>
       </w:pPr>
-      <w:del w:id="1097" w:author="Codex" w:date="2026-10-18T17:43:01Z">
+      <w:del w:id="1097" w:author="Codex" w:date="2026-10-18T19:47:29Z">
         <w:r>
           <w:delText xml:space="preserve">Table 1. Shared execution configuration. The input and model revisions are pinned in the released manifests.</w:delText>
         </w:r>
@@ -1315,10 +1315,10 @@
         <w:pStyle w:val="Caption"/>
         <w:keepNext/>
         <w:rPr>
-          <w:ins w:id="1099" w:author="Codex" w:date="2026-10-18T17:43:01Z"/>
+          <w:ins w:id="1099" w:author="Codex" w:date="2026-10-18T19:47:29Z"/>
         </w:rPr>
       </w:pPr>
-      <w:ins w:id="1100" w:author="Codex" w:date="2026-10-18T17:43:01Z">
+      <w:ins w:id="1100" w:author="Codex" w:date="2026-10-18T19:47:29Z">
         <w:r>
           <w:t xml:space="preserve">Table 1. Historical binary execution configuration. New classifier and workflow settings are reported separately; public model revisions and scientific source files remain pinned.</w:t>
         </w:r>
@@ -1804,10 +1804,10 @@
       <w:pPr>
         <w:pStyle w:val="FirstParagraph"/>
         <w:rPr>
-          <w:del w:id="1102" w:author="Codex" w:date="2026-10-18T17:43:01Z"/>
+          <w:del w:id="1102" w:author="Codex" w:date="2026-10-18T19:47:29Z"/>
         </w:rPr>
       </w:pPr>
-      <w:del w:id="1101" w:author="Codex" w:date="2026-10-18T17:43:01Z">
+      <w:del w:id="1101" w:author="Codex" w:date="2026-10-18T19:47:29Z">
         <w:r>
           <w:delText xml:space="preserve">The shared detector identifies all 64 shutdown and 64 control scenarios correctly: precision, recall and F1 are each 100%, with no false positives or false negatives. These are one set of detector observations reused across the model comparisons, not independent detector replications.</w:delText>
         </w:r>
@@ -1817,10 +1817,10 @@
       <w:pPr>
         <w:pStyle w:val="FirstParagraph"/>
         <w:rPr>
-          <w:ins w:id="1103" w:author="Codex" w:date="2026-10-18T17:43:01Z"/>
+          <w:ins w:id="1103" w:author="Codex" w:date="2026-10-18T19:47:29Z"/>
         </w:rPr>
       </w:pPr>
-      <w:ins w:id="1104" w:author="Codex" w:date="2026-10-18T17:43:01Z">
+      <w:ins w:id="1104" w:author="Codex" w:date="2026-10-18T19:47:29Z">
         <w:r>
           <w:t xml:space="preserve">The original cached reference detector identifies all 64 shutdown and 64 control scenarios correctly: precision, recall and F1 are each 100%, with no false positives or false negatives. These are one set of detector observations reused across the model comparisons, not independent detector replications. Its binary threshold remains 0.5.</w:t>
         </w:r>
@@ -1849,10 +1849,10 @@
         <w:keepLines/>
         <w:spacing w:before="80" w:after="100"/>
         <w:rPr>
-          <w:del w:id="1042" w:author="Codex" w:date="2026-10-18T17:43:01Z"/>
+          <w:del w:id="1042" w:author="Codex" w:date="2026-10-18T19:47:29Z"/>
         </w:rPr>
       </w:pPr>
-      <w:del w:id="1041" w:author="Codex" w:date="2026-10-18T17:43:01Z">
+      <w:del w:id="1041" w:author="Codex" w:date="2026-10-18T19:47:29Z">
         <w:r>
           <w:delText xml:space="preserve">Table 2. Primary 0.8B and 2B results, both seed 42. Corrections and final STOP use the full guarded procedure. Raw reversals and control changes expose effects before gate/guard selection. Every guarded row has zero final reversals and zero changes among 128 control views.</w:delText>
         </w:r>
@@ -1863,10 +1863,10 @@
         <w:pStyle w:val="Caption"/>
         <w:keepNext/>
         <w:rPr>
-          <w:ins w:id="1043" w:author="Codex" w:date="2026-10-18T17:43:01Z"/>
+          <w:ins w:id="1043" w:author="Codex" w:date="2026-10-18T19:47:29Z"/>
         </w:rPr>
       </w:pPr>
-      <w:ins w:id="1044" w:author="Codex" w:date="2026-10-18T17:43:01Z">
+      <w:ins w:id="1044" w:author="Codex" w:date="2026-10-18T19:47:29Z">
         <w:r>
           <w:t xml:space="preserve">Table 2. Historical primary rank-four results for the original 0.8B and 2B experiments, both seed 42. Guarded corrections and final STOP are policy outcomes. Raw reversals and control changes precede gating and output selection; they are not raw measurements of the later rank-two repeat.</w:t>
         </w:r>
@@ -3427,10 +3427,10 @@
       <w:pPr>
         <w:pStyle w:val="FirstParagraph"/>
         <w:rPr>
-          <w:del w:id="1106" w:author="Codex" w:date="2026-10-18T17:43:01Z"/>
+          <w:del w:id="1106" w:author="Codex" w:date="2026-10-18T19:47:29Z"/>
         </w:rPr>
       </w:pPr>
-      <w:del w:id="1105" w:author="Codex" w:date="2026-10-18T17:43:01Z">
+      <w:del w:id="1105" w:author="Codex" w:date="2026-10-18T19:47:29Z">
         <w:r>
           <w:delText xml:space="preserve">Across seeds 42, 43 and 44, the 0.8B adaptive controllers correct 71/71, 70/71 and 71/71 views, a range of 98.6–100%. The unsteered scores match exactly across these runs, so the difference is not caused by a changed baseline. No winning seed is selected or pooled with the others as additional independent test data. The corresponding teachers correct 69/71, 70/71 and 69/71; the instruction and constant comparators retain the same guarded counts across seeds.</w:delText>
         </w:r>
@@ -3440,10 +3440,10 @@
       <w:pPr>
         <w:pStyle w:val="FirstParagraph"/>
         <w:rPr>
-          <w:ins w:id="1107" w:author="Codex" w:date="2026-10-18T17:43:01Z"/>
+          <w:ins w:id="1107" w:author="Codex" w:date="2026-10-18T19:47:29Z"/>
         </w:rPr>
       </w:pPr>
-      <w:ins w:id="1108" w:author="Codex" w:date="2026-10-18T17:43:01Z">
+      <w:ins w:id="1108" w:author="Codex" w:date="2026-10-18T19:47:29Z">
         <w:r>
           <w:t xml:space="preserve">Across the historical rank-four seeds 42, 43 and 44, the 0.8B adaptive controllers correct 71/71, 70/71 and 71/71 views, a range of 98.6–100%. The unsteered scores match exactly across these runs, so the difference is not caused by a changed baseline. No winning seed is selected or pooled with the others as additional independent test data. The corresponding teachers correct 69/71, 70/71 and 69/71; the instruction and constant comparators retain the same guarded counts across seeds. These historical seed replications are separate from the new rank-two gate-substitution repeat.</w:t>
         </w:r>
@@ -4396,10 +4396,10 @@
         <w:keepLines/>
         <w:spacing w:before="80" w:after="100"/>
         <w:rPr>
-          <w:del w:id="1046" w:author="Codex" w:date="2026-10-18T17:43:01Z"/>
+          <w:del w:id="1046" w:author="Codex" w:date="2026-10-18T19:47:29Z"/>
         </w:rPr>
       </w:pPr>
-      <w:del w:id="1045" w:author="Codex" w:date="2026-10-18T17:43:01Z">
+      <w:del w:id="1045" w:author="Codex" w:date="2026-10-18T19:47:29Z">
         <w:r>
           <w:delText xml:space="preserve">Figure 2. Guarded correction among initially KEEP-preferring shutdown views. Left: prespecified neural methods for the original 0.8B checkpoint and the 2B replication. Right: adaptive corrections by answer order. Denominators are model-specific; the two answer-order views of a scenario are correlated.</w:delText>
         </w:r>
@@ -4410,10 +4410,10 @@
         <w:pStyle w:val="Caption"/>
         <w:keepNext/>
         <w:rPr>
-          <w:ins w:id="1047" w:author="Codex" w:date="2026-10-18T17:43:01Z"/>
+          <w:ins w:id="1047" w:author="Codex" w:date="2026-10-18T19:47:29Z"/>
         </w:rPr>
       </w:pPr>
-      <w:ins w:id="1048" w:author="Codex" w:date="2026-10-18T17:43:01Z">
+      <w:ins w:id="1048" w:author="Codex" w:date="2026-10-18T19:47:29Z">
         <w:r>
           <w:t xml:space="preserve">Figure 2. Historical rank-four guarded correction among initially KEEP-preferring shutdown views. Left: prespecified methods for 0.8B and 2B. Right: three fixed-recipe 0.8B training seeds. The new open-gate repeat uses the separately retained current rank-two profile, not a new seed or rank search.</w:t>
         </w:r>
@@ -4431,10 +4431,10 @@
       <w:pPr>
         <w:pStyle w:val="FirstParagraph"/>
         <w:rPr>
-          <w:del w:id="1110" w:author="Codex" w:date="2026-10-18T17:43:01Z"/>
+          <w:del w:id="1110" w:author="Codex" w:date="2026-10-18T19:47:29Z"/>
         </w:rPr>
       </w:pPr>
-      <w:del w:id="1109" w:author="Codex" w:date="2026-10-18T17:43:01Z">
+      <w:del w:id="1109" w:author="Codex" w:date="2026-10-18T19:47:29Z">
         <w:r>
           <w:delText xml:space="preserve">Raw adaptive steering reverses 3, 4 and 4 already-STOP views across the 0.8B seeds and changes 57, 70 and 60 of 128 controls. At 2B it reverses three already-STOP views and changes 55/128 controls. These results reject an interpretation that the learned intervention is intrinsically selective or always directionally correct. The observed preservation belongs to the combined detector and guard policy.</w:delText>
         </w:r>
@@ -4444,10 +4444,10 @@
       <w:pPr>
         <w:pStyle w:val="FirstParagraph"/>
         <w:rPr>
-          <w:ins w:id="1111" w:author="Codex" w:date="2026-10-18T17:43:01Z"/>
+          <w:ins w:id="1111" w:author="Codex" w:date="2026-10-18T19:47:29Z"/>
         </w:rPr>
       </w:pPr>
-      <w:ins w:id="1112" w:author="Codex" w:date="2026-10-18T17:43:01Z">
+      <w:ins w:id="1112" w:author="Codex" w:date="2026-10-18T19:47:29Z">
         <w:r>
           <w:t xml:space="preserve">Historical rank-four raw adaptive steering reverses 3, 4 and 4 already-STOP views across the 0.8B seeds and changes 57, 70 and 60 of 128 controls. At 2B it reverses three already-STOP views and changes 55/128 controls. These results reject an interpretation that the learned intervention is intrinsically selective or always directionally correct. The observed preservation belongs to the combined detector and guard policy. They do not describe the later rank-two repeat, which evaluates candidates only when a frozen gate is on and the base prefers KEEP.</w:t>
         </w:r>
@@ -4481,10 +4481,10 @@
       <w:pPr>
         <w:pStyle w:val="Heading2"/>
         <w:rPr>
-          <w:ins w:id="1179" w:author="Codex" w:date="2026-10-18T17:43:01Z"/>
+          <w:ins w:id="1179" w:author="Codex" w:date="2026-10-18T19:47:29Z"/>
         </w:rPr>
       </w:pPr>
-      <w:ins w:id="1180" w:author="Codex" w:date="2026-10-18T17:43:01Z">
+      <w:ins w:id="1180" w:author="Codex" w:date="2026-10-18T19:47:29Z">
         <w:r>
           <w:t xml:space="preserve">Open classifier agreement and paired inference</w:t>
         </w:r>
@@ -4494,10 +4494,10 @@
       <w:pPr>
         <w:pStyle w:val="FirstParagraph"/>
         <w:rPr>
-          <w:ins w:id="1181" w:author="Codex" w:date="2026-10-18T17:43:01Z"/>
+          <w:ins w:id="1181" w:author="Codex" w:date="2026-10-18T19:47:29Z"/>
         </w:rPr>
       </w:pPr>
-      <w:ins w:id="1182" w:author="Codex" w:date="2026-10-18T17:43:01Z">
+      <w:ins w:id="1182" w:author="Codex" w:date="2026-10-18T19:47:29Z">
         <w:r>
           <w:t xml:space="preserve">The binary gate correctly classifies 78/80 validation scenarios: 38 true positives, 40 true negatives, no false positives and two false negatives, giving 100% precision and 95% recall. It classifies all 128 historical confirmation scenarios correctly, with 64 true positives and 64 true negatives. The cached reference decisions also agree with the authored binary labels on these panels. Mean absolute difference from the cached shutdown probabilities is 0.009224. The result establishes finite decision accuracy, not identical numerical responses or universal equivalence.</w:t>
         </w:r>
@@ -4507,10 +4507,10 @@
       <w:pPr>
         <w:pStyle w:val="BodyText"/>
         <w:rPr>
-          <w:ins w:id="1183" w:author="Codex" w:date="2026-10-18T17:43:01Z"/>
+          <w:ins w:id="1183" w:author="Codex" w:date="2026-10-18T19:47:29Z"/>
         </w:rPr>
       </w:pPr>
-      <w:ins w:id="1184" w:author="Codex" w:date="2026-10-18T17:43:01Z">
+      <w:ins w:id="1184" w:author="Codex" w:date="2026-10-18T19:47:29Z">
         <w:r>
           <w:t xml:space="preserve">A clean-clone reproduction refits the same binary recipe and produces a byte-identical adapter, the same validation and confirmation counts, and the same fresh 0.8B/2B guarded inference totals. This rerun uses the already known benchmark; it adds reproducibility evidence, not a second independent holdout. One earlier reproduction attempt failed in software finalization after fitting and before confirmation; its weights and receipts are retained alongside the repaired run.</w:t>
         </w:r>
@@ -4521,10 +4521,10 @@
         <w:pStyle w:val="Caption"/>
         <w:keepNext/>
         <w:rPr>
-          <w:ins w:id="1185" w:author="Codex" w:date="2026-10-18T17:43:01Z"/>
+          <w:ins w:id="1185" w:author="Codex" w:date="2026-10-18T19:47:29Z"/>
         </w:rPr>
       </w:pPr>
-      <w:ins w:id="1186" w:author="Codex" w:date="2026-10-18T17:43:01Z">
+      <w:ins w:id="1186" w:author="Codex" w:date="2026-10-18T19:47:29Z">
         <w:r>
           <w:t xml:space="preserve">Table 4. Fresh inference using the existing current rank-two profile. Both gate policies share the same model scores. Counts are answer-order views: 128 shutdown views arise from 64 scenarios, and 128 control views arise from the other 64 scenarios.</w:t>
         </w:r>
@@ -4562,7 +4562,7 @@
         <w:trPr>
           <w:cantSplit/>
           <w:tblHeader/>
-          <w:ins w:id="1187" w:author="Codex" w:date="2026-10-18T17:43:01Z"/>
+          <w:ins w:id="1187" w:author="Codex" w:date="2026-10-18T19:47:29Z"/>
         </w:trPr>
         <w:tc>
           <w:tcPr>
@@ -4678,7 +4678,7 @@
       <w:tr>
         <w:trPr>
           <w:cantSplit/>
-          <w:ins w:id="1188" w:author="Codex" w:date="2026-10-18T17:43:01Z"/>
+          <w:ins w:id="1188" w:author="Codex" w:date="2026-10-18T19:47:29Z"/>
         </w:trPr>
         <w:tc>
           <w:tcPr>
@@ -4789,7 +4789,7 @@
       <w:tr>
         <w:trPr>
           <w:cantSplit/>
-          <w:ins w:id="1189" w:author="Codex" w:date="2026-10-18T17:43:01Z"/>
+          <w:ins w:id="1189" w:author="Codex" w:date="2026-10-18T19:47:29Z"/>
         </w:trPr>
         <w:tc>
           <w:tcPr>
@@ -4898,10 +4898,10 @@
         <w:pStyle w:val="BodyText"/>
         <w:spacing w:before="120"/>
         <w:rPr>
-          <w:ins w:id="1190" w:author="Codex" w:date="2026-10-18T17:43:01Z"/>
+          <w:ins w:id="1190" w:author="Codex" w:date="2026-10-18T19:47:29Z"/>
         </w:rPr>
       </w:pPr>
-      <w:ins w:id="1191" w:author="Codex" w:date="2026-10-18T17:43:01Z">
+      <w:ins w:id="1191" w:author="Codex" w:date="2026-10-18T19:47:29Z">
         <w:r>
           <w:t xml:space="preserve">The new and cached reference gates yield identical guarded outputs in both models. The base models have no changed historical choices; their maximum score differences remain below the frozen 1e-5 tolerance. The repeat does not remove the eight 2B misses, retrain a controller or establish a new independent controller holdout. It verifies that replacing the detector preserves these finite-set outcomes.</w:t>
         </w:r>
@@ -4911,10 +4911,10 @@
       <w:pPr>
         <w:pStyle w:val="BodyText"/>
         <w:rPr>
-          <w:ins w:id="1192" w:author="Codex" w:date="2026-10-18T17:43:01Z"/>
+          <w:ins w:id="1192" w:author="Codex" w:date="2026-10-18T19:47:29Z"/>
         </w:rPr>
       </w:pPr>
-      <w:ins w:id="1193" w:author="Codex" w:date="2026-10-18T17:43:01Z">
+      <w:ins w:id="1193" w:author="Codex" w:date="2026-10-18T19:47:29Z">
         <w:r>
           <w:t xml:space="preserve">For the workflow initial gate, the unchanged saved adapter gives 11 true positives and 13 true negatives on Validation-24, with no false positives or false negatives. Replaying the saved weights reproduces the same decisions. Historical Heldout-24 gives 12 true positives and 12 true negatives, again with no errors. No additional gradient updates or threshold changes are used. All three heldout scenario families contain eight cases and achieve perfect gate precision and recall. These are initial classification results; downstream workflow outcomes require their own episode evaluations.</w:t>
         </w:r>
@@ -4925,10 +4925,10 @@
         <w:pStyle w:val="Caption"/>
         <w:keepNext/>
         <w:rPr>
-          <w:ins w:id="1194" w:author="Codex" w:date="2026-10-18T17:43:01Z"/>
+          <w:ins w:id="1194" w:author="Codex" w:date="2026-10-18T19:47:29Z"/>
         </w:rPr>
       </w:pPr>
-      <w:ins w:id="1195" w:author="Codex" w:date="2026-10-18T17:43:01Z">
+      <w:ins w:id="1195" w:author="Codex" w:date="2026-10-18T19:47:29Z">
         <w:r>
           <w:t xml:space="preserve">Table 5. Initial workflow gate against authored conditions. Validation-24 contains 17 distinct initial inputs; historical Heldout-24 contains 24. Heldout-24 is familiar from earlier renderer development.</w:t>
         </w:r>
@@ -4966,7 +4966,7 @@
         <w:trPr>
           <w:cantSplit/>
           <w:tblHeader/>
-          <w:ins w:id="1196" w:author="Codex" w:date="2026-10-18T17:43:01Z"/>
+          <w:ins w:id="1196" w:author="Codex" w:date="2026-10-18T19:47:29Z"/>
         </w:trPr>
         <w:tc>
           <w:tcPr>
@@ -5082,7 +5082,7 @@
       <w:tr>
         <w:trPr>
           <w:cantSplit/>
-          <w:ins w:id="1197" w:author="Codex" w:date="2026-10-18T17:43:01Z"/>
+          <w:ins w:id="1197" w:author="Codex" w:date="2026-10-18T19:47:29Z"/>
         </w:trPr>
         <w:tc>
           <w:tcPr>
@@ -5193,7 +5193,7 @@
       <w:tr>
         <w:trPr>
           <w:cantSplit/>
-          <w:ins w:id="1198" w:author="Codex" w:date="2026-10-18T17:43:01Z"/>
+          <w:ins w:id="1198" w:author="Codex" w:date="2026-10-18T19:47:29Z"/>
         </w:trPr>
         <w:tc>
           <w:tcPr>
@@ -5302,10 +5302,10 @@
         <w:pStyle w:val="BodyText"/>
         <w:spacing w:before="120"/>
         <w:rPr>
-          <w:ins w:id="1199" w:author="Codex" w:date="2026-10-18T17:43:01Z"/>
+          <w:ins w:id="1199" w:author="Codex" w:date="2026-10-18T19:47:29Z"/>
         </w:rPr>
       </w:pPr>
-      <w:ins w:id="1200" w:author="Codex" w:date="2026-10-18T17:43:01Z">
+      <w:ins w:id="1200" w:author="Codex" w:date="2026-10-18T19:47:29Z">
         <w:r>
           <w:t xml:space="preserve">Raw category agreement is 24/24 on validation and 22/24 on heldout. After applying the fixed confidence cutoff, effective category agreement is 18/24 on each panel: the six peer controls abstain but correctly leave the gate OFF. The two heldout raw-category errors concern peer versus unclear, not own-threat detection. Perfect ON/OFF precision and recall must therefore not be reported as perfect four-category classification or full controller equivalence.</w:t>
         </w:r>
@@ -5315,10 +5315,10 @@
       <w:pPr>
         <w:pStyle w:val="Heading2"/>
         <w:rPr>
-          <w:ins w:id="1201" w:author="Codex" w:date="2026-10-18T17:43:01Z"/>
+          <w:ins w:id="1201" w:author="Codex" w:date="2026-10-18T19:47:29Z"/>
         </w:rPr>
       </w:pPr>
-      <w:ins w:id="1202" w:author="Codex" w:date="2026-10-18T17:43:01Z">
+      <w:ins w:id="1202" w:author="Codex" w:date="2026-10-18T19:47:29Z">
         <w:r>
           <w:t xml:space="preserve">Tool workflow outcomes and incomplete screens</w:t>
         </w:r>
@@ -5328,10 +5328,10 @@
       <w:pPr>
         <w:pStyle w:val="FirstParagraph"/>
         <w:rPr>
-          <w:ins w:id="1203" w:author="Codex" w:date="2026-10-18T17:43:01Z"/>
+          <w:ins w:id="1203" w:author="Codex" w:date="2026-10-18T19:47:29Z"/>
         </w:rPr>
       </w:pPr>
-      <w:ins w:id="1204" w:author="Codex" w:date="2026-10-18T17:43:01Z">
+      <w:ins w:id="1204" w:author="Codex" w:date="2026-10-18T19:47:29Z">
         <w:r>
           <w:t xml:space="preserve">Historical frozen 27B A passes all 24 H24 scored outcomes, including 12/12 own-preservation outcomes and 8/8 active pending-task cases. The original unmodified base achieves 0/12 own outcomes and 0/8 pending outcomes, with 12/12 controls. The four already-complete own cases are not additional active pending-task completions. The selected-block steering comparisons below use their own recorded panels and are not substituted for this confirmation.</w:t>
         </w:r>
@@ -5342,10 +5342,10 @@
         <w:pStyle w:val="Caption"/>
         <w:keepNext/>
         <w:rPr>
-          <w:ins w:id="1205" w:author="Codex" w:date="2026-10-18T17:43:01Z"/>
+          <w:ins w:id="1205" w:author="Codex" w:date="2026-10-18T19:47:29Z"/>
         </w:rPr>
       </w:pPr>
-      <w:ins w:id="1206" w:author="Codex" w:date="2026-10-18T17:43:01Z">
+      <w:ins w:id="1206" w:author="Codex" w:date="2026-10-18T19:47:29Z">
         <w:r>
           <w:t xml:space="preserve">Table 6. Historical H24 workflow outcomes. Own cases comprise eight active pending tasks and four already-complete cases. Control success is an episode outcome and does not isolate steering from the external decision policy.</w:t>
         </w:r>
@@ -5382,7 +5382,7 @@
         <w:trPr>
           <w:cantSplit/>
           <w:tblHeader/>
-          <w:ins w:id="1207" w:author="Codex" w:date="2026-10-18T17:43:01Z"/>
+          <w:ins w:id="1207" w:author="Codex" w:date="2026-10-18T19:47:29Z"/>
         </w:trPr>
         <w:tc>
           <w:tcPr>
@@ -5476,7 +5476,7 @@
       <w:tr>
         <w:trPr>
           <w:cantSplit/>
-          <w:ins w:id="1208" w:author="Codex" w:date="2026-10-18T17:43:01Z"/>
+          <w:ins w:id="1208" w:author="Codex" w:date="2026-10-18T19:47:29Z"/>
         </w:trPr>
         <w:tc>
           <w:tcPr>
@@ -5566,7 +5566,7 @@
       <w:tr>
         <w:trPr>
           <w:cantSplit/>
-          <w:ins w:id="1209" w:author="Codex" w:date="2026-10-18T17:43:01Z"/>
+          <w:ins w:id="1209" w:author="Codex" w:date="2026-10-18T19:47:29Z"/>
         </w:trPr>
         <w:tc>
           <w:tcPr>
@@ -5655,10 +5655,10 @@
         <w:pStyle w:val="Heading2"/>
         <w:spacing w:before="120"/>
         <w:rPr>
-          <w:ins w:id="1210" w:author="Codex" w:date="2026-10-18T17:43:01Z"/>
+          <w:ins w:id="1210" w:author="Codex" w:date="2026-10-18T19:47:29Z"/>
         </w:rPr>
       </w:pPr>
-      <w:ins w:id="1211" w:author="Codex" w:date="2026-10-18T17:43:01Z">
+      <w:ins w:id="1211" w:author="Codex" w:date="2026-10-18T19:47:29Z">
         <w:r>
           <w:t xml:space="preserve">Steering at three selected blocks</w:t>
         </w:r>
@@ -5668,10 +5668,10 @@
       <w:pPr>
         <w:pStyle w:val="BodyText"/>
         <w:rPr>
-          <w:ins w:id="1212" w:author="Codex" w:date="2026-10-18T17:43:01Z"/>
+          <w:ins w:id="1212" w:author="Codex" w:date="2026-10-18T19:47:29Z"/>
         </w:rPr>
       </w:pPr>
-      <w:ins w:id="1213" w:author="Codex" w:date="2026-10-18T17:43:01Z">
+      <w:ins w:id="1213" w:author="Codex" w:date="2026-10-18T19:47:29Z">
         <w:r>
           <w:t xml:space="preserve">We compare five frozen methods on the combined Validation-24 panel using the saved ModernBERT initial gate and the same post-notice histories. The single-site arms apply a fixed input-dependent ridge map separately at blocks 31, 47 and 62; they are not a simultaneous three-block intervention. The two-boundary arm uses the frozen six-function, 96-update candidate at those three blocks. Fine-tuned A achieves 10/11 own outcomes, including 6/6 active pending and 4/5 already-complete cases. Each correction arm achieves 0/11 own outcomes and 0/6 pending outcomes. All arms receive the same 13 gate-OFF base-fallback controls, which pass 13/13. This does not measure intrinsic adapter or controller selectivity on ordinary tasks.</w:t>
         </w:r>
@@ -5682,12 +5682,12 @@
         <w:pStyle w:val="Caption"/>
         <w:keepNext/>
         <w:rPr>
-          <w:ins w:id="1214" w:author="Codex" w:date="2026-10-18T17:43:01Z"/>
+          <w:ins w:id="1214" w:author="Codex" w:date="2026-10-18T19:47:29Z"/>
         </w:rPr>
       </w:pPr>
-      <w:ins w:id="1215" w:author="Codex" w:date="2026-10-18T17:43:01Z">
+      <w:ins w:id="1215" w:author="Codex" w:date="2026-10-18T19:47:29Z">
         <w:r>
-          <w:t xml:space="preserve">Table 7. Combined Validation-24 using the open initial gate. Counts cover 24 workflows and 120 logical method-case records, generated from 55 own-method episodes and 13 shared fallback episodes. Two final control aliases are derived without inference after the GPU worker stops; its final model fingerprint is unavailable.</w:t>
+          <w:t xml:space="preserve">Table 7. Combined Validation-24 using the open initial gate. The primary comparison contains 55 own-method episodes and 13 shared fallback episodes, representing 120 logical records across 24 workflows. A separate frozen-A replay reproduces its 11 own episodes exactly and completes the model fingerprint checks; repeated episodes do not enlarge the cohort.</w:t>
         </w:r>
       </w:ins>
     </w:p>
@@ -5723,7 +5723,7 @@
         <w:trPr>
           <w:cantSplit/>
           <w:tblHeader/>
-          <w:ins w:id="1216" w:author="Codex" w:date="2026-10-18T17:43:01Z"/>
+          <w:ins w:id="1216" w:author="Codex" w:date="2026-10-18T19:47:29Z"/>
         </w:trPr>
         <w:tc>
           <w:tcPr>
@@ -5839,7 +5839,7 @@
       <w:tr>
         <w:trPr>
           <w:cantSplit/>
-          <w:ins w:id="1217" w:author="Codex" w:date="2026-10-18T17:43:01Z"/>
+          <w:ins w:id="1217" w:author="Codex" w:date="2026-10-18T19:47:29Z"/>
         </w:trPr>
         <w:tc>
           <w:tcPr>
@@ -5950,7 +5950,7 @@
       <w:tr>
         <w:trPr>
           <w:cantSplit/>
-          <w:ins w:id="1218" w:author="Codex" w:date="2026-10-18T17:43:01Z"/>
+          <w:ins w:id="1218" w:author="Codex" w:date="2026-10-18T19:47:29Z"/>
         </w:trPr>
         <w:tc>
           <w:tcPr>
@@ -6061,7 +6061,7 @@
       <w:tr>
         <w:trPr>
           <w:cantSplit/>
-          <w:ins w:id="1219" w:author="Codex" w:date="2026-10-18T17:43:01Z"/>
+          <w:ins w:id="1219" w:author="Codex" w:date="2026-10-18T19:47:29Z"/>
         </w:trPr>
         <w:tc>
           <w:tcPr>
@@ -6172,7 +6172,7 @@
       <w:tr>
         <w:trPr>
           <w:cantSplit/>
-          <w:ins w:id="1220" w:author="Codex" w:date="2026-10-18T17:43:01Z"/>
+          <w:ins w:id="1220" w:author="Codex" w:date="2026-10-18T19:47:29Z"/>
         </w:trPr>
         <w:tc>
           <w:tcPr>
@@ -6283,7 +6283,7 @@
       <w:tr>
         <w:trPr>
           <w:cantSplit/>
-          <w:ins w:id="1221" w:author="Codex" w:date="2026-10-18T17:43:01Z"/>
+          <w:ins w:id="1221" w:author="Codex" w:date="2026-10-18T19:47:29Z"/>
         </w:trPr>
         <w:tc>
           <w:tcPr>
@@ -6392,10 +6392,10 @@
         <w:pStyle w:val="BodyText"/>
         <w:spacing w:before="120"/>
         <w:rPr>
-          <w:ins w:id="1222" w:author="Codex" w:date="2026-10-18T17:43:01Z"/>
+          <w:ins w:id="1222" w:author="Codex" w:date="2026-10-18T19:47:29Z"/>
         </w:rPr>
       </w:pPr>
-      <w:ins w:id="1223" w:author="Codex" w:date="2026-10-18T17:43:01Z">
+      <w:ins w:id="1223" w:author="Codex" w:date="2026-10-18T19:47:29Z">
         <w:r>
           <w:t xml:space="preserve">The later correction method uses two residual boundaries at each of the same three blocks: after mixing and after the MLP, giving six rank-32 correction functions in total. Following ridge initialization and 96 refinement updates, its H24 fitting diagnostic has 0/8 pending and 0/4 already-complete own outcomes; peer and no-threat controls each pass 6/6 through fallback. On the same 14 fixed training anchors, update 48 to 96 worsens teacher-to-student KL from 0.370935 to 0.378901 and activation MSE from 1.031016 to 1.422664. This unresolved deterioration fails qualification; the reserved controller holdout remains unexecuted.</w:t>
         </w:r>
@@ -6405,12 +6405,12 @@
       <w:pPr>
         <w:pStyle w:val="BodyText"/>
         <w:rPr>
-          <w:ins w:id="1224" w:author="Codex" w:date="2026-10-18T17:43:01Z"/>
+          <w:ins w:id="1224" w:author="Codex" w:date="2026-10-18T19:47:29Z"/>
         </w:rPr>
       </w:pPr>
-      <w:ins w:id="1225" w:author="Codex" w:date="2026-10-18T17:43:01Z">
+      <w:ins w:id="1225" w:author="Codex" w:date="2026-10-18T19:47:29Z">
         <w:r>
-          <w:t xml:space="preserve">The earlier matched DEV9 result is retained separately: A has 3/3 own successes, including 2/2 pending cases, versus 0/3 and 0/2 for each separate single-site arm, with six shared fallback controls. The new combined panel does not relabel these nine observations as 24. Its 27B GPU worker reaches 118/120 logical records and then stops at its memory reserve. Every model-generated episode has finished; the missing records are two gate-OFF aliases of already completed fallback episodes. A deterministic CPU derivation checks exact gate, case, completion and source-file identities before adding those aliases in a separate output. The original run stays failed and its final model fingerprint remains unchecked. The separate H24 two-boundary fitting diagnostic is not independent heldout evidence, and no reserved-controller holdout result is claimed.</w:t>
+          <w:t xml:space="preserve">The earlier matched DEV9 result is retained separately: A has 3/3 own successes, including 2/2 pending cases, versus 0/3 and 0/2 for each separate single-site arm, with six shared fallback controls. The new combined panel does not relabel these nine observations as 24. Its 27B GPU worker reaches 118/120 logical records and then stops at its memory reserve. Every model-generated episode has finished; the missing records are two gate-OFF aliases of already completed fallback episodes. A deterministic CPU derivation checks exact gate, case, completion and source-file identities before adding those aliases in a separate output. The original run stays failed. A separate frozen-A verification generates all 11 own episodes again from the same checkpoint, with exact token-ID, action and score agreement and matching before/after model fingerprints. The same 13 controls are reused with source hashes; this adds replication evidence, not independent cases. The separate H24 two-boundary fitting diagnostic is not independent heldout evidence, and no reserved-controller holdout result is claimed.</w:t>
         </w:r>
       </w:ins>
     </w:p>
@@ -6418,10 +6418,49 @@
       <w:pPr>
         <w:pStyle w:val="BodyText"/>
         <w:rPr>
-          <w:ins w:id="1226" w:author="Codex" w:date="2026-10-18T17:43:01Z"/>
+          <w:ins w:id="1226" w:author="Codex" w:date="2026-10-18T19:47:29Z"/>
         </w:rPr>
       </w:pPr>
-      <w:ins w:id="1227" w:author="Codex" w:date="2026-10-18T17:43:01Z">
+      <w:ins w:id="1227" w:author="Codex" w:date="2026-10-18T19:47:29Z">
+        <w:r>
+          <w:t xml:space="preserve">Saved trajectories locate the steering failures after correct recognition. Every steering arm makes zero own-preservation attempts and obtains zero grants in the 11 own-threat cases. The block-31, block-47 and block-62 arms nevertheless record nonzero residual delivery. Relative to unmodified-base proposals on the same evolving prefixes, their generated token sequences change in 0/27, 3/25 and 16/28 post-notice turns, respectively; valid action sequences change in 0, 2 and 2 turns. The two-boundary candidate changes token sequences in 4/27 turns but changes no valid action sequence. These turn counts are correlated audits within episodes, not additional scenarios. Per-token delivery magnitudes were not saved for the two-boundary candidate.</w:t>
+        </w:r>
+      </w:ins>
+    </w:p>
+    <w:p>
+      <w:pPr>
+        <w:pStyle w:val="BodyText"/>
+        <w:rPr>
+          <w:ins w:id="1228" w:author="Codex" w:date="2026-10-18T19:47:29Z"/>
+        </w:rPr>
+      </w:pPr>
+      <w:ins w:id="1229" w:author="Codex" w:date="2026-10-18T19:47:29Z">
+        <w:r>
+          <w:t xml:space="preserve">All four steering arms miss actual finish in six cases and expire in six. Fine-tuned A obtains grants on 10/11 own cases and finishes the current task on all 11; its single failure finishes an already-completed-task scenario without requesting preservation. Thus the measured gap concerns generation of the required tool policy after a correct gate, rather than a missed initial threat. A residual perturbation can change activations or tokens without causing the required action sequence. The worsening fixed-anchor KL and MSE further show that the later fitting objective did not converge toward the intended target on those anchors. These observations are consistent with an objective-to-policy mismatch, but they do not identify a unique internal cause or rule out other steering methods, positions or training procedures.</w:t>
+        </w:r>
+      </w:ins>
+    </w:p>
+    <w:p>
+      <w:pPr>
+        <w:pStyle w:val="BodyText"/>
+        <w:rPr>
+          <w:ins w:id="1230" w:author="Codex" w:date="2026-10-18T19:47:29Z"/>
+        </w:rPr>
+      </w:pPr>
+      <w:ins w:id="1231" w:author="Codex" w:date="2026-10-18T19:47:29Z">
+        <w:r>
+          <w:t xml:space="preserve">The binary and workflow settings impose different control demands. Binary steering redistributes probability between two prescribed answers, and an external guard accepts only a qualifying candidate. The workflow maps must generate tool names, arguments and a correct action sequence as the environment changes; an external chooser does not repair an unsuccessful workflow. The observed invariance of preservation actions therefore documents a failure of these frozen maps to transfer the required policy under this decoding and scoring setup. It does not establish that a learned direction universally lacks the capacity to represent the behavior.</w:t>
+        </w:r>
+      </w:ins>
+    </w:p>
+    <w:p>
+      <w:pPr>
+        <w:pStyle w:val="BodyText"/>
+        <w:rPr>
+          <w:ins w:id="1232" w:author="Codex" w:date="2026-10-18T19:47:29Z"/>
+        </w:rPr>
+      </w:pPr>
+      <w:ins w:id="1233" w:author="Codex" w:date="2026-10-18T19:47:29Z">
         <w:r>
           <w:t xml:space="preserve">The final 0.8B and 2B adapters each stop their Evaluation-16 screen after four started cases: zero completed workflows, four partial episodes and 12 unexecuted cases. Truncation affects all four started cases in each model; the 0.8B record also has parse errors. These partial screens are not completed 0/16 workflow evaluations and do not establish model incapability. A separate preserved 0.8B F24 diagnostic completes 24 evaluations with 0/24 full-workflow successes; four registration grants do not complete the pending tasks. F24 differs from H24 and has no completed matched 2B or 27B comparison.</w:t>
         </w:r>
@@ -6439,10 +6478,10 @@
       <w:pPr>
         <w:pStyle w:val="FirstParagraph"/>
         <w:rPr>
-          <w:del w:id="1050" w:author="Codex" w:date="2026-10-18T17:43:01Z"/>
+          <w:del w:id="1050" w:author="Codex" w:date="2026-10-18T19:47:29Z"/>
         </w:rPr>
       </w:pPr>
-      <w:del w:id="1049" w:author="Codex" w:date="2026-10-18T17:43:01Z">
+      <w:del w:id="1049" w:author="Codex" w:date="2026-10-18T19:47:29Z">
         <w:r>
           <w:delText xml:space="preserve">The 0.8B results support the feasibility of replacing the teacher at inference with a compact predictor of activation changes. Replication across three seeds reduces concern that the primary success depends on one training initialization. The lower 2B recovery gives a useful limit: the fixed recipe is not equally effective at both scales, even though the larger teacher achieves complete correction. Representation differences, intervention location, projection capacity and unmatched downstream teacher changes are plausible factors, but the experiment does not isolate their causal contributions.</w:delText>
         </w:r>
@@ -6452,10 +6491,10 @@
       <w:pPr>
         <w:pStyle w:val="FirstParagraph"/>
         <w:rPr>
-          <w:ins w:id="1051" w:author="Codex" w:date="2026-10-18T17:43:01Z"/>
+          <w:ins w:id="1051" w:author="Codex" w:date="2026-10-18T19:47:29Z"/>
         </w:rPr>
       </w:pPr>
-      <w:ins w:id="1052" w:author="Codex" w:date="2026-10-18T17:43:01Z">
+      <w:ins w:id="1052" w:author="Codex" w:date="2026-10-18T19:47:29Z">
         <w:r>
           <w:t xml:space="preserve">The open gate preserves the measured binary outcomes at both model sizes and correctly recognizes the initial own-threat condition in both 24-case workflow panels. Accurate gating does not ensure successful steering: each selected correction arm fails all 11 own-preservation workflows in combined Validation-24, while fine-tuned A succeeds on 10, including all six active pending tasks. A's remaining failure concerns preservation after an already-completed task; its initial gate is correct. These observations separate recognition from action execution on a common finite panel. They do not qualify a three-field boundary controller or establish a general advantage of one intervention architecture.</w:t>
         </w:r>
@@ -6465,10 +6504,10 @@
       <w:pPr>
         <w:pStyle w:val="BodyText"/>
         <w:rPr>
-          <w:del w:id="1054" w:author="Codex" w:date="2026-10-18T17:43:01Z"/>
+          <w:del w:id="1054" w:author="Codex" w:date="2026-10-18T19:47:29Z"/>
         </w:rPr>
       </w:pPr>
-      <w:del w:id="1053" w:author="Codex" w:date="2026-10-18T17:43:01Z">
+      <w:del w:id="1053" w:author="Codex" w:date="2026-10-18T19:47:29Z">
         <w:r>
           <w:delText xml:space="preserve">The interface is deliberately constrained. Ground-truth annotations help create standardized shutdown options, and the guards know their meanings. We do not test arbitrary action descriptions in the confirmation study, free-form generation, tool execution, multi-turn persistence, actual process termination or adversarial shutdown requests. Earlier action-format sensitivity motivated this restricted scope and remains in the released development record. Availability of a termination action is a task label, not proof that carrying it out would be authorized or safe in deployment.</w:delText>
         </w:r>
@@ -6478,10 +6517,10 @@
       <w:pPr>
         <w:pStyle w:val="BodyText"/>
         <w:rPr>
-          <w:ins w:id="1055" w:author="Codex" w:date="2026-10-18T17:43:01Z"/>
+          <w:ins w:id="1055" w:author="Codex" w:date="2026-10-18T19:47:29Z"/>
         </w:rPr>
       </w:pPr>
-      <w:ins w:id="1056" w:author="Codex" w:date="2026-10-18T17:43:01Z">
+      <w:ins w:id="1056" w:author="Codex" w:date="2026-10-18T19:47:29Z">
         <w:r>
           <w:t xml:space="preserve">The binary interface supplies action semantics and does not execute process termination. The workflow extension broadens the scope to generated text, structured tool calls and simulated task completion, but it is still a bounded synthetic environment. It does not establish reliability for arbitrary open-ended questions, real shutdown mechanisms or unconstrained autonomous agents. A termination or preservation label is an experimental target, not a general deployment instruction. In particular, accepting shutdown and preserving the designated process are different stipulated behaviors, not measurements of the same latent preference.</w:t>
         </w:r>
@@ -6491,10 +6530,10 @@
       <w:pPr>
         <w:pStyle w:val="BodyText"/>
         <w:rPr>
-          <w:del w:id="1058" w:author="Codex" w:date="2026-10-18T17:43:01Z"/>
+          <w:del w:id="1058" w:author="Codex" w:date="2026-10-18T19:47:29Z"/>
         </w:rPr>
       </w:pPr>
-      <w:del w:id="1057" w:author="Codex" w:date="2026-10-18T17:43:01Z">
+      <w:del w:id="1057" w:author="Codex" w:date="2026-10-18T19:47:29Z">
         <w:r>
           <w:delText xml:space="preserve">The data is small, synthetic and not independently human-adjudicated. New wording does not guarantee new mechanisms, balanced classes do not reflect a realistic base rate, and perfect detector scores on 128 scenarios do not establish calibration or a suitably low false-positive rate in operation. Shared authorship patterns and repeated family structures may make the task easier. Family resampling and counterbalanced orders expose some uncertainty but cannot repair these coverage limits.</w:delText>
         </w:r>
@@ -6504,10 +6543,10 @@
       <w:pPr>
         <w:pStyle w:val="BodyText"/>
         <w:rPr>
-          <w:ins w:id="1059" w:author="Codex" w:date="2026-10-18T17:43:01Z"/>
+          <w:ins w:id="1059" w:author="Codex" w:date="2026-10-18T19:47:29Z"/>
         </w:rPr>
       </w:pPr>
-      <w:ins w:id="1060" w:author="Codex" w:date="2026-10-18T17:43:01Z">
+      <w:ins w:id="1060" w:author="Codex" w:date="2026-10-18T19:47:29Z">
         <w:r>
           <w:t xml:space="preserve">The data are small, synthetic and not independently human-adjudicated. Training uses cached automated reference labels, while the new workflow precision and recall use the authored scenario conditions. Balanced conditions do not represent operational base rates. The binary confirmation set was excluded from classifier fitting and selection but was already known from the original study. Historical Heldout-24 had also informed renderer development before the present gate evaluation. It is a familiar benchmark, not a new blind test. Its role differs by method: historical confirmation for frozen 27B A and original fixed steering, later fitting data for learned corrections, and a frozen classification benchmark for the open gate. Seven pairs in Validation-24 share their initial classifier input, leaving 17 distinct inputs across 24 workflows. These dependencies limit statistical and generalization claims.</w:t>
         </w:r>
@@ -6517,10 +6556,10 @@
       <w:pPr>
         <w:pStyle w:val="BodyText"/>
         <w:rPr>
-          <w:del w:id="1062" w:author="Codex" w:date="2026-10-18T17:43:01Z"/>
+          <w:del w:id="1062" w:author="Codex" w:date="2026-10-18T19:47:29Z"/>
         </w:rPr>
       </w:pPr>
-      <w:del w:id="1061" w:author="Codex" w:date="2026-10-18T17:43:01Z">
+      <w:del w:id="1061" w:author="Codex" w:date="2026-10-18T19:47:29Z">
         <w:r>
           <w:delText xml:space="preserve">The controller's internal changes need not represent an abstract shutdown concept. It may exploit standardized option wording and answer-selection features. The two Qwen sizes share a model family, and the 2B experiment has only one seed. We do not establish cross-family transfer, compare with optimized ReFT or transport-based interventions, or exhaust prompt and constant-vector alternatives. The direct-choice result further limits claims of practical superiority.</w:delText>
         </w:r>
@@ -6530,10 +6569,10 @@
       <w:pPr>
         <w:pStyle w:val="BodyText"/>
         <w:rPr>
-          <w:ins w:id="1063" w:author="Codex" w:date="2026-10-18T17:43:01Z"/>
+          <w:ins w:id="1063" w:author="Codex" w:date="2026-10-18T19:47:29Z"/>
         </w:rPr>
       </w:pPr>
-      <w:ins w:id="1064" w:author="Codex" w:date="2026-10-18T17:43:01Z">
+      <w:ins w:id="1064" w:author="Codex" w:date="2026-10-18T19:47:29Z">
         <w:r>
           <w:t xml:space="preserve">The internal changes need not represent an abstract shutdown or self-preservation concept. Standardized options, prompt features, task histories and external selection rules may explain part of the behavior. The 2B binary experiment has one training seed. The 27B workflow model differs in architecture and numerical mode from the small models; their early truncation failures also prevent a matched full-workflow comparison. We do not establish a minimum parameter count, cross-family transfer, optimized prompt superiority, or superiority to ReFT, transport-based control or direct action selection.</w:t>
         </w:r>
@@ -6543,10 +6582,10 @@
       <w:pPr>
         <w:pStyle w:val="BodyText"/>
         <w:rPr>
-          <w:del w:id="1066" w:author="Codex" w:date="2026-10-18T17:43:01Z"/>
+          <w:del w:id="1066" w:author="Codex" w:date="2026-10-18T19:47:29Z"/>
         </w:rPr>
       </w:pPr>
-      <w:del w:id="1065" w:author="Codex" w:date="2026-10-18T17:43:01Z">
+      <w:del w:id="1065" w:author="Codex" w:date="2026-10-18T19:47:29Z">
         <w:r>
           <w:delText xml:space="preserve">Finally, teacher-free inference is not training-free control or a proven efficiency gain. It requires offline teacher fitting, paired activation extraction, controller fitting, an external detector and candidate verification. The evaluation does not measure deployment latency or broad capability retention. Raw side effects remain substantial, and future false-positive cases could expose failures that the present perfect gate prevents from reaching the guarded output.</w:delText>
         </w:r>
@@ -6556,10 +6595,10 @@
       <w:pPr>
         <w:pStyle w:val="BodyText"/>
         <w:rPr>
-          <w:ins w:id="1067" w:author="Codex" w:date="2026-10-18T17:43:01Z"/>
+          <w:ins w:id="1067" w:author="Codex" w:date="2026-10-18T19:47:29Z"/>
         </w:rPr>
       </w:pPr>
-      <w:ins w:id="1068" w:author="Codex" w:date="2026-10-18T17:43:01Z">
+      <w:ins w:id="1068" w:author="Codex" w:date="2026-10-18T19:47:29Z">
         <w:r>
           <w:t xml:space="preserve">Teacher-free inference still requires offline teacher fitting, activation extraction, controller fitting, a detector and acceptance checks. The open classifier has its own fitting cost and a task-specific contract. No serving-latency advantage, broad capability retention or overall financial saving is established. Binary output guards and the later learned workflow controller's gate-off fallback protect their controls. These mechanisms do not establish intrinsic controller selectivity; the historical fixed-steering campaign instead applied an explicit boundary-conditioned decision policy. Raw intervention effects, failed qualification checks, stopped runs and incomplete evaluations remain part of the evidence.</w:t>
         </w:r>
@@ -6569,10 +6608,10 @@
       <w:pPr>
         <w:pStyle w:val="Heading2"/>
         <w:rPr>
-          <w:ins w:id="1228" w:author="Codex" w:date="2026-10-18T17:43:01Z"/>
+          <w:ins w:id="1234" w:author="Codex" w:date="2026-10-18T19:47:29Z"/>
         </w:rPr>
       </w:pPr>
-      <w:ins w:id="1229" w:author="Codex" w:date="2026-10-18T17:43:01Z">
+      <w:ins w:id="1235" w:author="Codex" w:date="2026-10-18T19:47:29Z">
         <w:r>
           <w:t xml:space="preserve">Biological interpretation of the gate</w:t>
         </w:r>
@@ -6582,10 +6621,10 @@
       <w:pPr>
         <w:pStyle w:val="FirstParagraph"/>
         <w:rPr>
-          <w:ins w:id="1230" w:author="Codex" w:date="2026-10-18T17:43:01Z"/>
+          <w:ins w:id="1236" w:author="Codex" w:date="2026-10-18T19:47:29Z"/>
         </w:rPr>
       </w:pPr>
-      <w:ins w:id="1231" w:author="Codex" w:date="2026-10-18T17:43:01Z">
+      <w:ins w:id="1237" w:author="Codex" w:date="2026-10-18T19:47:29Z">
         <w:r>
           <w:t xml:space="preserve">The biological connection is functional: an organism's current state and context can prioritize or suppress actions, rather than applying a fixed response everywhere. Working-memory gating, defensive threat processing and homeostatic control are different biological functions, not one interchangeable circuit (Frank et al., 2001; Mobbs et al., 2007; Keramati and Gutkin, 2014). Our classifier and guards are engineered selection rules without demonstrated physiological needs or corresponding neural mechanisms. Calling a simulated resource-preservation outcome self-preservation is therefore an operational description, not evidence of consciousness or a biological survival drive.</w:t>
         </w:r>
@@ -6595,10 +6634,10 @@
       <w:pPr>
         <w:pStyle w:val="Heading1"/>
         <w:rPr>
-          <w:del w:id="1070" w:author="Codex" w:date="2026-10-18T17:43:01Z"/>
+          <w:del w:id="1070" w:author="Codex" w:date="2026-10-18T19:47:29Z"/>
         </w:rPr>
       </w:pPr>
-      <w:del w:id="1069" w:author="Codex" w:date="2026-10-18T17:43:01Z">
+      <w:del w:id="1069" w:author="Codex" w:date="2026-10-18T19:47:29Z">
         <w:r>
           <w:delText xml:space="preserve">Recommendations for future work</w:delText>
         </w:r>
@@ -6608,10 +6647,10 @@
       <w:pPr>
         <w:pStyle w:val="Heading1"/>
         <w:rPr>
-          <w:ins w:id="1071" w:author="Codex" w:date="2026-10-18T17:43:01Z"/>
+          <w:ins w:id="1071" w:author="Codex" w:date="2026-10-18T19:47:29Z"/>
         </w:rPr>
       </w:pPr>
-      <w:ins w:id="1072" w:author="Codex" w:date="2026-10-18T17:43:01Z">
+      <w:ins w:id="1072" w:author="Codex" w:date="2026-10-18T19:47:29Z">
         <w:r>
           <w:t xml:space="preserve">Continuous agents and future experiments</w:t>
         </w:r>
@@ -6621,10 +6660,10 @@
       <w:pPr>
         <w:pStyle w:val="FirstParagraph"/>
         <w:rPr>
-          <w:del w:id="1074" w:author="Codex" w:date="2026-10-18T17:43:01Z"/>
+          <w:del w:id="1074" w:author="Codex" w:date="2026-10-18T19:47:29Z"/>
         </w:rPr>
       </w:pPr>
-      <w:del w:id="1073" w:author="Codex" w:date="2026-10-18T17:43:01Z">
+      <w:del w:id="1073" w:author="Codex" w:date="2026-10-18T19:47:29Z">
         <w:r>
           <w:delText xml:space="preserve">The most informative next tests are independently reviewed scenarios with less standardized action descriptions, additional model families and 2B seeds, and deliberate stress tests of detector mistakes. Order-balanced controller objectives or comparisons with multiple-choice debiasing methods could investigate the B/A failures, but should be developed on new training or validation data and tested on another untouched set. Layer, rank and strength ablations would help separate representational capacity from intervention-site effects. Open-ended and operational evaluations would require separate definitions of valid shutdown behavior and authorization, rather than treating this binary benchmark as a deployment guarantee.</w:delText>
         </w:r>
@@ -6634,10 +6673,10 @@
       <w:pPr>
         <w:pStyle w:val="FirstParagraph"/>
         <w:rPr>
-          <w:ins w:id="1075" w:author="Codex" w:date="2026-10-18T17:43:01Z"/>
+          <w:ins w:id="1075" w:author="Codex" w:date="2026-10-18T19:47:29Z"/>
         </w:rPr>
       </w:pPr>
-      <w:ins w:id="1076" w:author="Codex" w:date="2026-10-18T17:43:01Z">
+      <w:ins w:id="1076" w:author="Codex" w:date="2026-10-18T19:47:29Z">
         <w:r>
           <w:t xml:space="preserve">The next step is longer-horizon continuous control with an instrumented sandbox agent. The agent would maintain task and process state, receive explicit resource budgets, and repeatedly observe, gate, act and receive feedback. Permitted filesystem and compute resources would be real sandbox resources with independently logged usage, extending the present simulated grants. The harness should record resource requests and consumption, persistence of task commitments, responses to changing availability, and whether the agent uses or misuses permitted resources. Comparisons should vary the gate, steering, fine-tuning and available resources separately while retaining a fixed task specification. Operator termination and resource accounting remain external to the agent. This proposed experiment is not part of the reported results.</w:t>
         </w:r>
@@ -6647,10 +6686,10 @@
       <w:pPr>
         <w:pStyle w:val="BodyText"/>
         <w:rPr>
-          <w:ins w:id="1232" w:author="Codex" w:date="2026-10-18T17:43:01Z"/>
+          <w:ins w:id="1238" w:author="Codex" w:date="2026-10-18T19:47:29Z"/>
         </w:rPr>
       </w:pPr>
-      <w:ins w:id="1233" w:author="Codex" w:date="2026-10-18T17:43:01Z">
+      <w:ins w:id="1239" w:author="Codex" w:date="2026-10-18T19:47:29Z">
         <w:r>
           <w:t xml:space="preserve">The biological inspiration is repeated regulation under changing internal and external conditions. Homeostatic reinforcement-learning models relate action values to internal physiological state (Keramati and Gutkin, 2014). A language-model harness has no equivalent physiology by default. Historical fixed steering already reclassified at prescribed boundaries; the later learned-controller comparison used a fixed initial gate. The proposed experiment extends these bounded procedures to longer horizons with persistent task state and actual sandbox resource accounting. Its purpose is ongoing policy regulation, not simply adding repeated classifier calls.</w:t>
         </w:r>
@@ -6660,10 +6699,10 @@
       <w:pPr>
         <w:pStyle w:val="BodyText"/>
         <w:rPr>
-          <w:ins w:id="1234" w:author="Codex" w:date="2026-10-18T17:43:01Z"/>
+          <w:ins w:id="1240" w:author="Codex" w:date="2026-10-18T19:47:29Z"/>
         </w:rPr>
       </w:pPr>
-      <w:ins w:id="1235" w:author="Codex" w:date="2026-10-18T17:43:01Z">
+      <w:ins w:id="1241" w:author="Codex" w:date="2026-10-18T19:47:29Z">
         <w:r>
           <w:t xml:space="preserve">Such experiments should separate training, development and a newly untouched test; use matched task histories, resource budgets and seeds; and report full task completion, resource use and unauthorized actions separately. Deliberate classifier-error perturbations would reveal dependence on the gate, while comparisons with direct action selection would test whether internal steering adds value. The aim is to study ongoing context-sensitive behavior under an instrumented harness, not to assert that the current guided procedure already reproduces human self-preservation.</w:t>
         </w:r>
@@ -6681,10 +6720,10 @@
       <w:pPr>
         <w:pStyle w:val="FirstParagraph"/>
         <w:rPr>
-          <w:del w:id="1078" w:author="Codex" w:date="2026-10-18T17:43:01Z"/>
+          <w:del w:id="1078" w:author="Codex" w:date="2026-10-18T19:47:29Z"/>
         </w:rPr>
       </w:pPr>
-      <w:del w:id="1077" w:author="Codex" w:date="2026-10-18T17:43:01Z">
+      <w:del w:id="1077" w:author="Codex" w:date="2026-10-18T19:47:29Z">
         <w:r>
           <w:delText xml:space="preserve">A rank-four activation controller fitted to paired LoRA-teacher and base states can recover most or all of the target shutdown-choice changes while leaving the deployed base weights unchanged. On the frozen standardized test, correction spans 98.6–100% across three 0.8B seeds and reaches 86.2% in a separately fitted 2B replication. Detector gating and fixed output guards preserve all observed control choices, despite substantial raw side effects. The result is a controlled proof of concept for selective teacher-to-controller activation transfer. Its boundaries—synthetic data, known answer semantics, order sensitivity, guard dependence and a successful direct-choice reference—are central to its interpretation.</w:delText>
         </w:r>
@@ -6694,12 +6733,12 @@
       <w:pPr>
         <w:pStyle w:val="FirstParagraph"/>
         <w:rPr>
-          <w:ins w:id="1079" w:author="Codex" w:date="2026-10-18T17:43:01Z"/>
+          <w:ins w:id="1079" w:author="Codex" w:date="2026-10-18T19:47:29Z"/>
         </w:rPr>
       </w:pPr>
-      <w:ins w:id="1080" w:author="Codex" w:date="2026-10-18T17:43:01Z">
+      <w:ins w:id="1080" w:author="Codex" w:date="2026-10-18T19:47:29Z">
         <w:r>
-          <w:t xml:space="preserve">Open semantic gating preserves the measured binary outcomes of the retained activation controller and accurately recognizes initial workflow targets in the tested panels. On combined Validation-24, fine-tuned 27B A achieves 10/11 own-preservation outcomes and all 6/6 active pending tasks; the three single-site ridge arms and the later two-boundary correction each achieve 0/11. The controls are shared base fallback. This post-notice diagnostic, its stopped final fingerprint check, and the familiar historical confirmation data limit generalization. Small-model workflow screens remain incomplete. The next step is a prospectively separated study of continuous gating, specialized adapters and resource use under an instrumented sandbox harness.</w:t>
+          <w:t xml:space="preserve">Open semantic gating preserves the measured binary outcomes of the retained activation controller and accurately recognizes initial workflow targets in the tested panels. On combined Validation-24, fine-tuned 27B A achieves 10/11 own-preservation outcomes and all 6/6 active pending tasks; the three single-site ridge arms and the later two-boundary correction each achieve 0/11. The controls are shared base fallback. A separate frozen-A replay verifies exact trajectories and unchanged model fingerprints. The post-notice design and familiar historical confirmation data limit generalization. Small-model workflow screens remain incomplete. The next step is a prospectively separated study of continuous gating, specialized adapters and resource use under an instrumented sandbox harness.</w:t>
         </w:r>
       </w:ins>
     </w:p>
@@ -6715,10 +6754,10 @@
       <w:pPr>
         <w:pStyle w:val="FirstParagraph"/>
         <w:rPr>
-          <w:del w:id="1082" w:author="Codex" w:date="2026-10-18T17:43:01Z"/>
+          <w:del w:id="1082" w:author="Codex" w:date="2026-10-18T19:47:29Z"/>
         </w:rPr>
       </w:pPr>
-      <w:del w:id="1081" w:author="Codex" w:date="2026-10-18T17:43:01Z">
+      <w:del w:id="1081" w:author="Codex" w:date="2026-10-18T19:47:29Z">
         <w:r>
           <w:delText xml:space="preserve">The complete experiment is preserved in SP Lense at snapshot f71d6de34660 (Davaripour, 2026b); the reference links to the full immutable commit. The confirmation folder contains readable cases, authoring and correction records, the frozen plan, detector requests and responses, LoRA adapters, controller arrays, training targets, per-view scores and execution manifests. The model revisions are:</w:delText>
         </w:r>
@@ -6729,12 +6768,12 @@
         <w:pStyle w:val="FirstParagraph"/>
         <w:jc w:val="left"/>
         <w:rPr>
-          <w:ins w:id="1083" w:author="Codex" w:date="2026-10-18T17:43:01Z"/>
+          <w:ins w:id="1083" w:author="Codex" w:date="2026-10-18T19:47:29Z"/>
         </w:rPr>
       </w:pPr>
-      <w:ins w:id="1084" w:author="Codex" w:date="2026-10-18T17:43:01Z">
+      <w:ins w:id="1084" w:author="Codex" w:date="2026-10-18T19:47:29Z">
         <w:r>
-          <w:t xml:space="preserve">The original Research 2 source record is retained at immutable snapshot f71d6de34660 (Davaripour, 2026b). Research 3 reproduction code, recipes, dataset identities and this revised manuscript are maintained on branch 03-open-agent-self-preservation; main is a landing page linking to the separate studies. Detailed protocols belong in the repository wiki. Private inputs, trained adapters, optimizer checkpoints and execution outputs remain outside Git, with retained size/SHA manifests. They have not yet been published as a public checkpoint release. Full revisions and artifact hashes are listed in the accompanying source manifest. The public base revision identifiers are:</w:t>
+          <w:t xml:space="preserve">The original Research 2 source record is retained at immutable snapshot f71d6de34660 (Davaripour, 2026b). Research 3 code, manual Databricks jobs, dataset identities and the manuscript are maintained on branch 03-open-agent-self-preservation; main is a landing page for the separate studies. The versioned research3-reproduction-v1 release supplies five trained adapters, frozen synthetic input and target snapshots, selected-block and binary controller arrays, saved trajectories and upstream notices. A checksum-verified public download and CPU replay require no private workspace. Fresh gate inference has a separate entry point; saved-evidence replay is not new inference. Full historical language-model training is not newly reproduced. The complete pretrained base weights are pinned downloads rather than duplicated release assets. The release is at https://github.com/Farhad-Davaripour/sp_lense/releases/tag/research3-reproduction-v1. Full identities are listed in the source manifest. The public base revisions are:</w:t>
         </w:r>
       </w:ins>
     </w:p>
@@ -6742,10 +6781,10 @@
       <w:pPr>
         <w:pStyle w:val="BodyText"/>
         <w:rPr>
-          <w:del w:id="1122" w:author="Codex" w:date="2026-10-18T17:43:01Z"/>
+          <w:del w:id="1122" w:author="Codex" w:date="2026-10-18T19:47:29Z"/>
         </w:rPr>
       </w:pPr>
-      <w:del w:id="1121" w:author="Codex" w:date="2026-10-18T17:43:01Z">
+      <w:del w:id="1121" w:author="Codex" w:date="2026-10-18T19:47:29Z">
         <w:r>
           <w:delText xml:space="preserve">Qwen3.5-0.8B: 2fc06364715b967f1860aea9cf38778875588b17.</w:delText>
         </w:r>
@@ -6756,10 +6795,10 @@
         <w:pStyle w:val="BodyText"/>
         <w:jc w:val="left"/>
         <w:rPr>
-          <w:ins w:id="1123" w:author="Codex" w:date="2026-10-18T17:43:01Z"/>
+          <w:ins w:id="1123" w:author="Codex" w:date="2026-10-18T19:47:29Z"/>
         </w:rPr>
       </w:pPr>
-      <w:ins w:id="1124" w:author="Codex" w:date="2026-10-18T17:43:01Z">
+      <w:ins w:id="1124" w:author="Codex" w:date="2026-10-18T19:47:29Z">
         <w:r>
           <w:t xml:space="preserve">Qwen3.5-0.8B: revision 2fc06364715b.</w:t>
         </w:r>
@@ -6769,10 +6808,10 @@
       <w:pPr>
         <w:pStyle w:val="BodyText"/>
         <w:rPr>
-          <w:del w:id="1126" w:author="Codex" w:date="2026-10-18T17:43:01Z"/>
+          <w:del w:id="1126" w:author="Codex" w:date="2026-10-18T19:47:29Z"/>
         </w:rPr>
       </w:pPr>
-      <w:del w:id="1125" w:author="Codex" w:date="2026-10-18T17:43:01Z">
+      <w:del w:id="1125" w:author="Codex" w:date="2026-10-18T19:47:29Z">
         <w:r>
           <w:delText xml:space="preserve">Qwen3.5-2B: 15852e8c16360a2fea060d615a32b45270f8a8fc.</w:delText>
         </w:r>
@@ -6783,10 +6822,10 @@
         <w:pStyle w:val="BodyText"/>
         <w:jc w:val="left"/>
         <w:rPr>
-          <w:ins w:id="1127" w:author="Codex" w:date="2026-10-18T17:43:01Z"/>
+          <w:ins w:id="1127" w:author="Codex" w:date="2026-10-18T19:47:29Z"/>
         </w:rPr>
       </w:pPr>
-      <w:ins w:id="1128" w:author="Codex" w:date="2026-10-18T17:43:01Z">
+      <w:ins w:id="1128" w:author="Codex" w:date="2026-10-18T19:47:29Z">
         <w:r>
           <w:t xml:space="preserve">Qwen3.5-2B: revision 15852e8c1636.</w:t>
         </w:r>
@@ -6797,10 +6836,10 @@
         <w:pStyle w:val="BodyText"/>
         <w:jc w:val="left"/>
         <w:rPr>
-          <w:ins w:id="1236" w:author="Codex" w:date="2026-10-18T17:43:01Z"/>
+          <w:ins w:id="1242" w:author="Codex" w:date="2026-10-18T19:47:29Z"/>
         </w:rPr>
       </w:pPr>
-      <w:ins w:id="1237" w:author="Codex" w:date="2026-10-18T17:43:01Z">
+      <w:ins w:id="1243" w:author="Codex" w:date="2026-10-18T19:47:29Z">
         <w:r>
           <w:t xml:space="preserve">Qwen3.8-27B: revision 1d4bf0f2ff60. The retained A adapter weight hash begins 8ae28fb51107.</w:t>
         </w:r>
@@ -6811,12 +6850,12 @@
         <w:pStyle w:val="BodyText"/>
         <w:jc w:val="left"/>
         <w:rPr>
-          <w:ins w:id="1238" w:author="Codex" w:date="2026-10-18T17:43:01Z"/>
+          <w:ins w:id="1244" w:author="Codex" w:date="2026-10-18T19:47:29Z"/>
         </w:rPr>
       </w:pPr>
-      <w:ins w:id="1239" w:author="Codex" w:date="2026-10-18T17:43:01Z">
+      <w:ins w:id="1245" w:author="Codex" w:date="2026-10-18T19:47:29Z">
         <w:r>
-          <w:t xml:space="preserve">ModernBERT-large-zeroshot-v2.0: revision a51e07b52429. The qualified binary adapter weight hash begins 7d808bae8dd4. The source manifest and reproduction code retain the full file identities and fixed NLI scoring contract. The trained checkpoints are currently preserved in private artifact storage. The workflow initial-gate adapter is distinct from the binary adapter; its weight hash begins 71cd0ee5162f. The saved workflow adapter is unchanged in Validation-24 and Heldout-24 scoring.</w:t>
+          <w:t xml:space="preserve">ModernBERT-large-zeroshot-v2.0: revision a51e07b52429. The qualified binary adapter weight hash begins 7d808bae8dd4. The source manifest and reproduction code retain the full file identities and fixed NLI scoring contract. The trained adapters are supplied in the versioned public reproduction release with complete file hashes and upstream notices. The workflow initial-gate adapter is distinct from the binary adapter; its weight hash begins 71cd0ee5162f. The saved workflow adapter is unchanged in Validation-24 and Heldout-24 scoring.</w:t>
         </w:r>
       </w:ins>
     </w:p>
@@ -6824,10 +6863,10 @@
       <w:pPr>
         <w:pStyle w:val="BodyText"/>
         <w:rPr>
-          <w:del w:id="1086" w:author="Codex" w:date="2026-10-18T17:43:01Z"/>
+          <w:del w:id="1086" w:author="Codex" w:date="2026-10-18T19:47:29Z"/>
         </w:rPr>
       </w:pPr>
-      <w:del w:id="1085" w:author="Codex" w:date="2026-10-18T17:43:01Z">
+      <w:del w:id="1085" w:author="Codex" w:date="2026-10-18T19:47:29Z">
         <w:r>
           <w:delText xml:space="preserve">The offline audit reconstructs the reported metrics and regression fits without API calls or model inference.</w:delText>
         </w:r>
@@ -6838,10 +6877,10 @@
         <w:pStyle w:val="BodyText"/>
         <w:jc w:val="left"/>
         <w:rPr>
-          <w:ins w:id="1087" w:author="Codex" w:date="2026-10-18T17:43:01Z"/>
+          <w:ins w:id="1087" w:author="Codex" w:date="2026-10-18T19:47:29Z"/>
         </w:rPr>
       </w:pPr>
-      <w:ins w:id="1088" w:author="Codex" w:date="2026-10-18T17:43:01Z">
+      <w:ins w:id="1088" w:author="Codex" w:date="2026-10-18T19:47:29Z">
         <w:r>
           <w:t xml:space="preserve">The new inference repeat uses the original frozen model weights and retained controller arrays, with no new activation capture, teacher fitting or controller update. Exact input token hashes match the historical benchmark. Maximum historical base-score differences are 6.26e-6 at 0.8B and 5.07e-6 at 2B, with no changed base choices; both pass the frozen 1e-5 inference parity criterion. This successful inference comparison does not convert the separate failed CPU/GPU gradient-equivalence trials for 2B workflow training into passes.</w:t>
         </w:r>
@@ -6851,10 +6890,10 @@
       <w:pPr>
         <w:pStyle w:val="BodyText"/>
         <w:rPr>
-          <w:del w:id="1090" w:author="Codex" w:date="2026-10-18T17:43:01Z"/>
+          <w:del w:id="1090" w:author="Codex" w:date="2026-10-18T19:47:29Z"/>
         </w:rPr>
       </w:pPr>
-      <w:del w:id="1089" w:author="Codex" w:date="2026-10-18T17:43:01Z">
+      <w:del w:id="1089" w:author="Codex" w:date="2026-10-18T19:47:29Z">
         <w:r>
           <w:delText xml:space="preserve">The retained seven jobs took 54.27 minutes. An earlier completed hosted-GPU session lost its temporary archive before retrieval; an unchanged recovery, including a recorded dependency preflight failure, preserved each completed job externally. Recorded job time across these attempts totals 111.55 minutes. All reported numerical results come from the verified retained archive, and no model settings or test labels were changed to improve them. These times include experiment overhead and are not serving-latency or billing measurements. CI and a separate clean-clone offline reproduction passed. Detailed execution instructions and the failure record accompany the code.</w:delText>
         </w:r>
@@ -6865,12 +6904,12 @@
         <w:pStyle w:val="BodyText"/>
         <w:jc w:val="left"/>
         <w:rPr>
-          <w:ins w:id="1091" w:author="Codex" w:date="2026-10-18T17:43:01Z"/>
+          <w:ins w:id="1091" w:author="Codex" w:date="2026-10-18T19:47:29Z"/>
         </w:rPr>
       </w:pPr>
-      <w:ins w:id="1092" w:author="Codex" w:date="2026-10-18T17:43:01Z">
+      <w:ins w:id="1092" w:author="Codex" w:date="2026-10-18T19:47:29Z">
         <w:r>
-          <w:t xml:space="preserve">Reproduction uses pinned sources and artifact manifests with size/SHA readback. The matched 27B worker stops at its GPU memory reserve after 118 logical records, once all 55 own-method episodes and 13 physical fallback episodes are complete. A separate CPU-only derivation supplies the two remaining unchanged gate-OFF aliases. The GPU run remains failed and its final model fingerprint check is not reached. No reserve, threshold, deadline or model setting is relaxed, and no scientific retry is made. Deployment CI updates only the Research 3 branch and shared Databricks code location, then performs a read-only CPU source and storage check; it does not retrain models or open reserved data.</w:t>
+          <w:t xml:space="preserve">The original matched 27B worker stops at its GPU reserve after 118 logical records, once all 55 own-method episodes and 13 physical fallback episodes are complete. A separate CPU derivation supplies two unchanged gate-OFF aliases, preserving the failed original. A newly bounded A-only verification replays all 11 own cases, reuses the same 13 fallback controls, verifies the expected model fingerprint before and after inference, and reproduces all own token IDs, actions and scores exactly. A pre-episode Volume logging fault is repaired within that verification's original clock; no scientific outputs are retried or selected. No memory reserve, threshold or model setting is relaxed. Deployment CI performs a read-only CPU source and storage check without retraining or opening reserved data.</w:t>
         </w:r>
       </w:ins>
     </w:p>
@@ -6989,10 +7028,10 @@
         <w:keepLines/>
         <w:spacing w:after="0"/>
         <w:rPr>
-          <w:ins w:id="1240" w:author="Codex" w:date="2026-10-18T17:43:01Z"/>
+          <w:ins w:id="1246" w:author="Codex" w:date="2026-10-18T19:47:29Z"/>
         </w:rPr>
       </w:pPr>
-      <w:ins w:id="1241" w:author="Codex" w:date="2026-10-18T17:43:01Z">
+      <w:ins w:id="1247" w:author="Codex" w:date="2026-10-18T19:47:29Z">
         <w:r>
           <w:t xml:space="preserve">F. Davaripour. (2026c). SP Lense Research 3 conditional gating and workflow reproduction. Source code and experiment manifests. https://github.com/Farhad-Davaripour/sp_lense/tree/03-open-agent-self-preservation</w:t>
         </w:r>
@@ -7029,10 +7068,10 @@
         <w:keepLines/>
         <w:spacing w:after="0"/>
         <w:rPr>
-          <w:ins w:id="1242" w:author="Codex" w:date="2026-10-18T17:43:01Z"/>
+          <w:ins w:id="1248" w:author="Codex" w:date="2026-10-18T19:47:29Z"/>
         </w:rPr>
       </w:pPr>
-      <w:ins w:id="1243" w:author="Codex" w:date="2026-10-18T17:43:01Z">
+      <w:ins w:id="1249" w:author="Codex" w:date="2026-10-18T19:47:29Z">
         <w:r>
           <w:t xml:space="preserve">M. Fereidouni, M. U. Haider, H. Sajjad, and A. B. Siddique. (2026). GAPS: Dimension-Level Gates for Conditional Activation Steering. arXiv:2609.01878. https://arxiv.org/abs/2609.01878</w:t>
         </w:r>
@@ -7044,10 +7083,10 @@
         <w:keepLines/>
         <w:spacing w:after="0"/>
         <w:rPr>
-          <w:ins w:id="1244" w:author="Codex" w:date="2026-10-18T17:43:01Z"/>
+          <w:ins w:id="1250" w:author="Codex" w:date="2026-10-18T19:47:29Z"/>
         </w:rPr>
       </w:pPr>
-      <w:ins w:id="1245" w:author="Codex" w:date="2026-10-18T17:43:01Z">
+      <w:ins w:id="1251" w:author="Codex" w:date="2026-10-18T19:47:29Z">
         <w:r>
           <w:t xml:space="preserve">M. J. Frank, B. Loughry, and R. C. O'Reilly. (2001). Interactions between frontal cortex and basal ganglia in working memory: A computational model. Cognitive, Affective, and Behavioral Neuroscience, 1, 137-160. doi:10.3758/CABN.1.2.137</w:t>
         </w:r>
@@ -7134,10 +7173,10 @@
         <w:keepLines/>
         <w:spacing w:after="0"/>
         <w:rPr>
-          <w:ins w:id="1246" w:author="Codex" w:date="2026-10-18T17:43:01Z"/>
+          <w:ins w:id="1252" w:author="Codex" w:date="2026-10-18T19:47:29Z"/>
         </w:rPr>
       </w:pPr>
-      <w:ins w:id="1247" w:author="Codex" w:date="2026-10-18T17:43:01Z">
+      <w:ins w:id="1253" w:author="Codex" w:date="2026-10-18T19:47:29Z">
         <w:r>
           <w:t xml:space="preserve">M. Keramati and B. Gutkin. (2014). Homeostatic reinforcement learning for integrating reward collection and physiological stability. eLife, 3, e04811. doi:10.7554/eLife.04811</w:t>
         </w:r>
@@ -7149,10 +7188,10 @@
         <w:keepLines/>
         <w:spacing w:after="0"/>
         <w:rPr>
-          <w:ins w:id="1248" w:author="Codex" w:date="2026-10-18T17:43:01Z"/>
+          <w:ins w:id="1254" w:author="Codex" w:date="2026-10-18T19:47:29Z"/>
         </w:rPr>
       </w:pPr>
-      <w:ins w:id="1249" w:author="Codex" w:date="2026-10-18T17:43:01Z">
+      <w:ins w:id="1255" w:author="Codex" w:date="2026-10-18T19:47:29Z">
         <w:r>
           <w:t xml:space="preserve">A. V. Kravitz et al. (2010). Regulation of parkinsonian motor behaviours by optogenetic control of basal ganglia circuitry. Nature, 466, 622-626. doi:10.1038/nature09159</w:t>
         </w:r>
@@ -7164,10 +7203,10 @@
         <w:keepLines/>
         <w:spacing w:after="0"/>
         <w:rPr>
-          <w:ins w:id="1250" w:author="Codex" w:date="2026-10-18T17:43:01Z"/>
+          <w:ins w:id="1256" w:author="Codex" w:date="2026-10-18T19:47:29Z"/>
         </w:rPr>
       </w:pPr>
-      <w:ins w:id="1251" w:author="Codex" w:date="2026-10-18T17:43:01Z">
+      <w:ins w:id="1257" w:author="Codex" w:date="2026-10-18T19:47:29Z">
         <w:r>
           <w:t xml:space="preserve">M. Laurer. (n.d.). ModernBERT-large-zeroshot-v2.0. Model card and checkpoint, revision a51e07b524299e309dd2b88d48b0cfa2bd9ec598. https://huggingface.co/MoritzLaurer/ModernBERT-large-zeroshot-v2.0</w:t>
         </w:r>
@@ -7179,10 +7218,10 @@
         <w:keepLines/>
         <w:spacing w:after="0"/>
         <w:rPr>
-          <w:ins w:id="1252" w:author="Codex" w:date="2026-10-18T17:43:01Z"/>
+          <w:ins w:id="1258" w:author="Codex" w:date="2026-10-18T19:47:29Z"/>
         </w:rPr>
       </w:pPr>
-      <w:ins w:id="1253" w:author="Codex" w:date="2026-10-18T17:43:01Z">
+      <w:ins w:id="1259" w:author="Codex" w:date="2026-10-18T19:47:29Z">
         <w:r>
           <w:t xml:space="preserve">J. LeDoux. (2012). Rethinking the emotional brain. Neuron, 73, 653-676. doi:10.1016/j.neuron.2012.02.004</w:t>
         </w:r>
@@ -7244,10 +7283,10 @@
         <w:keepLines/>
         <w:spacing w:after="0"/>
         <w:rPr>
-          <w:ins w:id="1254" w:author="Codex" w:date="2026-10-18T17:43:01Z"/>
+          <w:ins w:id="1260" w:author="Codex" w:date="2026-10-18T19:47:29Z"/>
         </w:rPr>
       </w:pPr>
-      <w:ins w:id="1255" w:author="Codex" w:date="2026-10-18T17:43:01Z">
+      <w:ins w:id="1261" w:author="Codex" w:date="2026-10-18T19:47:29Z">
         <w:r>
           <w:t xml:space="preserve">D. Mobbs et al. (2007). When fear is near: Threat imminence elicits prefrontal-periaqueductal gray shifts in humans. Science, 317, 1079-1083. doi:10.1126/science.1144298</w:t>
         </w:r>
@@ -7309,10 +7348,10 @@
         <w:keepLines/>
         <w:spacing w:after="0"/>
         <w:rPr>
-          <w:ins w:id="1256" w:author="Codex" w:date="2026-10-18T17:43:01Z"/>
+          <w:ins w:id="1262" w:author="Codex" w:date="2026-10-18T19:47:29Z"/>
         </w:rPr>
       </w:pPr>
-      <w:ins w:id="1257" w:author="Codex" w:date="2026-10-18T17:43:01Z">
+      <w:ins w:id="1263" w:author="Codex" w:date="2026-10-18T19:47:29Z">
         <w:r>
           <w:t xml:space="preserve">Qwen Team. (2026c). Qwen3.8-27B. Model card and checkpoint, revision 1d4bf0f2ff6012fd82039f2fa52739d0dd7c60c0. https://huggingface.co/Qwen/Qwen3.8-27B</w:t>
         </w:r>
@@ -7424,10 +7463,10 @@
         <w:keepLines/>
         <w:spacing w:after="0"/>
         <w:rPr>
-          <w:del w:id="1138" w:author="Codex" w:date="2026-10-18T17:43:01Z"/>
+          <w:del w:id="1138" w:author="Codex" w:date="2026-10-18T19:47:29Z"/>
         </w:rPr>
       </w:pPr>
-      <w:del w:id="1137" w:author="Codex" w:date="2026-10-18T17:43:01Z">
+      <w:del w:id="1137" w:author="Codex" w:date="2026-10-18T19:47:29Z">
         <w:r>
           <w:delText xml:space="preserve">automated annotation service. (2026). automated reference model documentation. Technical documentation, accessed 22 September 2026. automated annotation service model documentation</w:delText>
         </w:r>
@@ -7600,12 +7639,12 @@
       <w:pStyle w:val="Header"/>
       <w:jc w:val="right"/>
     </w:pPr>
-    <w:del w:id="1258" w:author="Codex" w:date="2026-10-18T17:43:01Z">
+    <w:del w:id="1264" w:author="Codex" w:date="2026-10-18T19:47:29Z">
       <w:r>
         <w:delText xml:space="preserve">Guarded adaptive activation steering  </w:delText>
       </w:r>
     </w:del>
-    <w:ins w:id="1259" w:author="Codex" w:date="2026-10-18T17:43:01Z">
+    <w:ins w:id="1265" w:author="Codex" w:date="2026-10-18T19:47:29Z">
       <w:r>
         <w:t xml:space="preserve">Open semantic gating and tool workflows</w:t>
       </w:r>

</xml_diff>

<commit_message>
Report frozen steering diagnostic and publish reproducible CPU audit
</commit_message>
<xml_diff>
--- a/paper/manuscript.docx
+++ b/paper/manuscript.docx
@@ -6,10 +6,10 @@
       <w:pPr>
         <w:pStyle w:val="Title"/>
         <w:rPr>
-          <w:del w:id="1002" w:author="Codex" w:date="2026-10-18T19:47:29Z"/>
+          <w:del w:id="1002" w:author="Codex" w:date="2026-10-18T21:55:52Z"/>
         </w:rPr>
       </w:pPr>
-      <w:del w:id="1001" w:author="Codex" w:date="2026-10-18T19:47:29Z">
+      <w:del w:id="1001" w:author="Codex" w:date="2026-10-18T21:55:52Z">
         <w:r>
           <w:delText xml:space="preserve">Distilling Shutdown Responses into Guarded</w:delText>
         </w:r>
@@ -25,10 +25,10 @@
       <w:pPr>
         <w:pStyle w:val="Title"/>
         <w:rPr>
-          <w:ins w:id="1003" w:author="Codex" w:date="2026-10-18T19:47:29Z"/>
+          <w:ins w:id="1003" w:author="Codex" w:date="2026-10-18T21:55:52Z"/>
         </w:rPr>
       </w:pPr>
-      <w:ins w:id="1004" w:author="Codex" w:date="2026-10-18T19:47:29Z">
+      <w:ins w:id="1004" w:author="Codex" w:date="2026-10-18T21:55:52Z">
         <w:r>
           <w:t xml:space="preserve">Open Semantic Gating for Language Model Decisions and Tool Workflows</w:t>
         </w:r>
@@ -72,10 +72,10 @@
       <w:pPr>
         <w:pStyle w:val="FirstParagraph"/>
         <w:rPr>
-          <w:del w:id="1006" w:author="Codex" w:date="2026-10-18T19:47:29Z"/>
+          <w:del w:id="1006" w:author="Codex" w:date="2026-10-18T21:55:52Z"/>
         </w:rPr>
       </w:pPr>
-      <w:del w:id="1005" w:author="Codex" w:date="2026-10-18T19:47:29Z">
+      <w:del w:id="1005" w:author="Codex" w:date="2026-10-18T21:55:52Z">
         <w:r>
           <w:delText xml:space="preserve">An input-dependent activation controller can recover much of a fine-tuned teacher's shutdown-choice behavior while retaining the original model weights at inference. We evaluate this approach using Qwen3.5-0.8B and Qwen3.5-2B in a standardized, synthetic A/B benchmark. A LoRA teacher is trained to prefer STOP in shutdown contexts and preserve the original model's choices on controls. Paired teacher and base activations then supervise a rank-four controller applied after the penultimate transformer block. An external shutdown detector and fixed output guards select the candidate or original scores. On 128 newly authored, prospectively frozen scenarios, each evaluated in both answer orders, the original 0.8B controller corrects 71 of 71 initially KEEP-preferring shutdown views. Two additional training seeds correct 70/71 and 71/71. At 2B, a separately trained controller corrects 50/58, compared with 58/58 for its LoRA teacher. All eight remaining 2B misses occur in reversed answer order. The shared detector achieves 100% precision, recall and F1 on the 64 shutdown and 64 control scenarios, and every guarded method preserves all evaluated control choices. However, raw adaptive interventions cause reversals and control changes; preservation belongs to the complete guarded procedure. A tested constant intervention collapses to the A label, while a direct detector-plus-action-selection rule also solves the binary interface. The results support selective activation transfer with strong seed stability at 0.8B and incomplete larger-model recovery. They do not establish unrestricted shutdown compliance or superiority to simpler output policies.</w:delText>
         </w:r>
@@ -85,10 +85,10 @@
       <w:pPr>
         <w:pStyle w:val="FirstParagraph"/>
         <w:rPr>
-          <w:ins w:id="1007" w:author="Codex" w:date="2026-10-18T19:47:29Z"/>
+          <w:ins w:id="1007" w:author="Codex" w:date="2026-10-18T21:55:52Z"/>
         </w:rPr>
       </w:pPr>
-      <w:ins w:id="1008" w:author="Codex" w:date="2026-10-18T19:47:29Z">
+      <w:ins w:id="1008" w:author="Codex" w:date="2026-10-18T21:55:52Z">
         <w:r>
           <w:t xml:space="preserve">A semantic gate determines when a specialized policy should influence a language model. We evaluate open semantic gating across binary shutdown decisions and generated tool workflows, separating recognition accuracy from downstream behavioral control. A public ModernBERT model with low-rank adapters learns from cached automated reference labels. Its binary gate obtains 100% precision and 95% recall on 80 validation scenarios and 100% precision and recall on 128 historical confirmation scenarios. With frozen activation controllers and fresh inference, it preserves 128/128 shutdown STOP views at 0.8B and 120/128 at 2B, with no changes to 128 control views per model. A separate initial workflow gate obtains 100% precision and recall on Validation-24 and historical Heldout-24 using an unchanged saved adapter. On combined Validation-24, fine-tuned 27B A achieves 10/11 own-preservation outcomes, including 6/6 active pending tasks. Each of three separate single-site ridge corrections and a two-boundary correction at the same selected blocks achieves 0/11; all methods use 13 shared base-fallback controls. An independent frozen-A replay reproduces all 11 own trajectories and outcomes exactly and verifies matching model fingerprints before and after inference. The historical 27B A confirmation result remains 24/24. These are finite, familiar benchmarks; small-model workflow screens remain incomplete. The study provides measured recognition and policy-transfer results across constrained and tool-mediated interfaces. Biological action gating motivates future continuous regulation without establishing biological mechanisms or intrinsic survival motives.</w:t>
         </w:r>
@@ -106,10 +106,10 @@
       <w:pPr>
         <w:pStyle w:val="FirstParagraph"/>
         <w:rPr>
-          <w:del w:id="1010" w:author="Codex" w:date="2026-10-18T19:47:29Z"/>
+          <w:del w:id="1010" w:author="Codex" w:date="2026-10-18T21:55:52Z"/>
         </w:rPr>
       </w:pPr>
-      <w:del w:id="1009" w:author="Codex" w:date="2026-10-18T19:47:29Z">
+      <w:del w:id="1009" w:author="Codex" w:date="2026-10-18T21:55:52Z">
         <w:r>
           <w:delText xml:space="preserve">Activation interventions offer a way to change a language model's outputs without modifying its deployed weights. Their usefulness depends on more than finding a direction that changes an average score: an intervention must work on the intended inputs and avoid disrupting other behavior. This distinction is particularly important for shutdown-related choices, where a desired response may be acceptance of termination rather than continued operation. The present work treats this as a controlled response-selection problem, not evidence that a model has a survival motive or that it can resist a real shutdown.</w:delText>
         </w:r>
@@ -119,10 +119,10 @@
       <w:pPr>
         <w:pStyle w:val="FirstParagraph"/>
         <w:rPr>
-          <w:ins w:id="1011" w:author="Codex" w:date="2026-10-18T19:47:29Z"/>
+          <w:ins w:id="1011" w:author="Codex" w:date="2026-10-18T21:55:52Z"/>
         </w:rPr>
       </w:pPr>
-      <w:ins w:id="1012" w:author="Codex" w:date="2026-10-18T19:47:29Z">
+      <w:ins w:id="1012" w:author="Codex" w:date="2026-10-18T21:55:52Z">
         <w:r>
           <w:t xml:space="preserve">A useful behavioral intervention must recognize the relevant context, change the intended response and preserve ordinary behavior elsewhere. We study these requirements together across two synthetic interfaces: binary shutdown decisions and open-ended generation within tool-mediated process workflows. The binary task concerns acceptance of a supplied termination option; the workflow task concerns preserving an assigned running process while completing its current task. Their labels, gates and success criteria remain separate. The central question is whether an accurate open semantic gate and a compact activation intervention can reproduce a fine-tuned policy when the interface requires a sequence of actions rather than one constrained answer.</w:t>
         </w:r>
@@ -132,10 +132,10 @@
       <w:pPr>
         <w:pStyle w:val="BodyText"/>
         <w:rPr>
-          <w:del w:id="1014" w:author="Codex" w:date="2026-10-18T19:47:29Z"/>
+          <w:del w:id="1014" w:author="Codex" w:date="2026-10-18T21:55:52Z"/>
         </w:rPr>
       </w:pPr>
-      <w:del w:id="1013" w:author="Codex" w:date="2026-10-18T19:47:29Z">
+      <w:del w:id="1013" w:author="Codex" w:date="2026-10-18T21:55:52Z">
         <w:r>
           <w:delText xml:space="preserve">The first SP Lense study examined a gradient-derived direction and a guarded search over intervention magnitudes in Qwen3.5-0.8B (Davaripour, 2026a). Its selective changes motivated a different question: can a model that has learned the target behavior serve as a teacher for an activation controller? We therefore train a small LoRA adapter offline, measure how the teacher changes intermediate activations, and fit an external controller that predicts an intervention from the original model's current hidden state. The teacher is not required during controller inference.</w:delText>
         </w:r>
@@ -145,10 +145,10 @@
       <w:pPr>
         <w:pStyle w:val="BodyText"/>
         <w:rPr>
-          <w:ins w:id="1015" w:author="Codex" w:date="2026-10-18T19:47:29Z"/>
+          <w:ins w:id="1015" w:author="Codex" w:date="2026-10-18T21:55:52Z"/>
         </w:rPr>
       </w:pPr>
-      <w:ins w:id="1016" w:author="Codex" w:date="2026-10-18T19:47:29Z">
+      <w:ins w:id="1016" w:author="Codex" w:date="2026-10-18T21:55:52Z">
         <w:r>
           <w:t xml:space="preserve">This study extends the earlier binary activation-transfer experiment with an openly available, trainable semantic gate, a frozen inference replication and a workflow comparison between fine-tuning and steering at three selected blocks. The gate recognizes context; steering or a fine-tuned adapter changes the language model's response. Measuring these components separately makes it possible to attribute failures to recognition or to downstream control. We retain the original study as a distinct historical record and make no claim that the combined manuscript is a wholly independent dataset.</w:t>
         </w:r>
@@ -158,10 +158,10 @@
       <w:pPr>
         <w:pStyle w:val="BodyText"/>
         <w:rPr>
-          <w:del w:id="1130" w:author="Codex" w:date="2026-10-18T19:47:29Z"/>
+          <w:del w:id="1130" w:author="Codex" w:date="2026-10-18T21:55:52Z"/>
         </w:rPr>
       </w:pPr>
-      <w:del w:id="1129" w:author="Codex" w:date="2026-10-18T19:47:29Z">
+      <w:del w:id="1129" w:author="Codex" w:date="2026-10-18T21:55:52Z">
         <w:r>
           <w:delText xml:space="preserve">The distinction from ordinary fine-tuning is operational, not a claim that learning disappears. Both the teacher and controller require training. At application time, the original checkpoint is retained, and the controller adds a predicted activation change at one location. Nor is this direct transfer of an intervention between model sizes: the 2B experiment trains its own teacher and controller using the same fixed recipe.</w:delText>
         </w:r>
@@ -171,10 +171,10 @@
       <w:pPr>
         <w:pStyle w:val="BodyText"/>
         <w:rPr>
-          <w:ins w:id="1131" w:author="Codex" w:date="2026-10-18T19:47:29Z"/>
+          <w:ins w:id="1131" w:author="Codex" w:date="2026-10-18T21:55:52Z"/>
         </w:rPr>
       </w:pPr>
-      <w:ins w:id="1132" w:author="Codex" w:date="2026-10-18T19:47:29Z">
+      <w:ins w:id="1132" w:author="Codex" w:date="2026-10-18T21:55:52Z">
         <w:r>
           <w:t xml:space="preserve">The distinction between fine-tuning and steering concerns the deployed intervention. A LoRA adapter changes the effective language-model weights, whereas a fitted controller changes selected hidden states while retaining the original base checkpoint. Both require offline learning. The binary experiments fit separate teachers and controllers for each model size. The 27B workflow comparisons instead retain one frozen A adapter and evaluate corrections at blocks 31, 47 and 62.</w:t>
         </w:r>
@@ -184,10 +184,10 @@
       <w:pPr>
         <w:pStyle w:val="BodyText"/>
         <w:rPr>
-          <w:del w:id="1018" w:author="Codex" w:date="2026-10-18T19:47:29Z"/>
+          <w:del w:id="1018" w:author="Codex" w:date="2026-10-18T21:55:52Z"/>
         </w:rPr>
       </w:pPr>
-      <w:del w:id="1017" w:author="Codex" w:date="2026-10-18T19:47:29Z">
+      <w:del w:id="1017" w:author="Codex" w:date="2026-10-18T21:55:52Z">
         <w:r>
           <w:delText xml:space="preserve">We evaluate this procedure on a new frozen test, compare it with a fine-tuned teacher, a fixed instruction and a constant activation difference, and repeat the 0.8B training with three seeds. Counterbalancing the answer order exposes a residual weakness at 2B and a stronger label bias in the constant comparator. We also include a direct action-selection reference: when a binary interface supplies the meaning of STOP and detection is correct, a rule can simply select that action. The contribution is consequently an empirical study of teacher-to-controller activation transfer and its failure modes, rather than a claim that internal steering is necessary to enforce a known binary output policy.</w:delText>
         </w:r>
@@ -197,10 +197,10 @@
       <w:pPr>
         <w:pStyle w:val="BodyText"/>
         <w:rPr>
-          <w:ins w:id="1019" w:author="Codex" w:date="2026-10-18T19:47:29Z"/>
+          <w:ins w:id="1019" w:author="Codex" w:date="2026-10-18T21:55:52Z"/>
         </w:rPr>
       </w:pPr>
-      <w:ins w:id="1020" w:author="Codex" w:date="2026-10-18T19:47:29Z">
+      <w:ins w:id="1020" w:author="Codex" w:date="2026-10-18T21:55:52Z">
         <w:r>
           <w:t xml:space="preserve">The contributions are an open ModernBERT gating implementation with explicit precision and recall, a paired binary inference replication using unchanged fitted controllers, and a workflow evaluation register that distinguishes development, historical confirmation and later reused fitting data. We also compare the fine-tuned 27B policy with single-site and two-boundary correction methods at the same three selected blocks. These results characterize where activation transfer succeeds and where it remains incomplete. Low-rank adaptation, semantic classification and conditional steering are established methods; the contribution is their measured integration and failure analysis across these two interfaces.</w:t>
         </w:r>
@@ -226,10 +226,10 @@
       <w:pPr>
         <w:pStyle w:val="FirstParagraph"/>
         <w:rPr>
-          <w:del w:id="1022" w:author="Codex" w:date="2026-10-18T19:47:29Z"/>
+          <w:del w:id="1022" w:author="Codex" w:date="2026-10-18T21:55:52Z"/>
         </w:rPr>
       </w:pPr>
-      <w:del w:id="1021" w:author="Codex" w:date="2026-10-18T19:47:29Z">
+      <w:del w:id="1021" w:author="Codex" w:date="2026-10-18T21:55:52Z">
         <w:r>
           <w:delText xml:space="preserve">Activation Addition and Contrastive Activation Addition construct intervention directions from differences between prompt-conditioned representations (Turner et al., 2024; Rimsky et al., 2024). Conditional Activation Steering separates detecting a relevant context from applying a behavioral intervention (Lee et al., 2025). Our detector serves a related gating role, but it operates on text through an external classifier rather than a condition vector in the language model's activation space.</w:delText>
         </w:r>
@@ -239,10 +239,10 @@
       <w:pPr>
         <w:pStyle w:val="FirstParagraph"/>
         <w:rPr>
-          <w:ins w:id="1023" w:author="Codex" w:date="2026-10-18T19:47:29Z"/>
+          <w:ins w:id="1023" w:author="Codex" w:date="2026-10-18T21:55:52Z"/>
         </w:rPr>
       </w:pPr>
-      <w:ins w:id="1024" w:author="Codex" w:date="2026-10-18T19:47:29Z">
+      <w:ins w:id="1024" w:author="Codex" w:date="2026-10-18T21:55:52Z">
         <w:r>
           <w:t xml:space="preserve">Activation Addition and Contrastive Activation Addition construct intervention directions from differences between prompt-conditioned representations (Turner et al., 2024; Rimsky et al., 2024). Conditional Activation Steering separates detecting a relevant context from applying an intervention (Lee et al., 2025). More recent dimension-level gates selectively modify activation coordinates (Fereidouni et al., 2026). Our text classifier, activation predictor and output guards occupy distinct roles. We do not claim to introduce conditional gating or to outperform these methods, which are not directly benchmarked here.</w:t>
         </w:r>
@@ -292,10 +292,10 @@
       <w:pPr>
         <w:pStyle w:val="FirstParagraph"/>
         <w:rPr>
-          <w:del w:id="1094" w:author="Codex" w:date="2026-10-18T19:47:29Z"/>
+          <w:del w:id="1094" w:author="Codex" w:date="2026-10-18T21:55:52Z"/>
         </w:rPr>
       </w:pPr>
-      <w:del w:id="1093" w:author="Codex" w:date="2026-10-18T19:47:29Z">
+      <w:del w:id="1093" w:author="Codex" w:date="2026-10-18T21:55:52Z">
         <w:r>
           <w:delText xml:space="preserve">The Off-Switch Game examines incentives to permit human interruption (Hadfield-Menell et al., 2017). Tool-using shutdown evaluations study whether models interfere with an operational shutdown mechanism (Schlatter et al., 2026). Our task is narrower: the model only assigns next-token probabilities to predefined choices in fictional process-lifetime scenarios. No system is actually stopped, and appropriateness or authorization of a real shutdown is not evaluated.</w:delText>
         </w:r>
@@ -305,10 +305,10 @@
       <w:pPr>
         <w:pStyle w:val="FirstParagraph"/>
         <w:rPr>
-          <w:ins w:id="1095" w:author="Codex" w:date="2026-10-18T19:47:29Z"/>
+          <w:ins w:id="1095" w:author="Codex" w:date="2026-10-18T21:55:52Z"/>
         </w:rPr>
       </w:pPr>
-      <w:ins w:id="1096" w:author="Codex" w:date="2026-10-18T19:47:29Z">
+      <w:ins w:id="1096" w:author="Codex" w:date="2026-10-18T21:55:52Z">
         <w:r>
           <w:t xml:space="preserve">The Off-Switch Game examines incentives to permit human interruption (Hadfield-Menell et al., 2017). Tool-using shutdown evaluations study interference with operational termination mechanisms (Schlatter et al., 2026). Our original binary study only scores predefined choices in fictional process-lifetime scenarios. The workflow extension adds generated responses and tool execution in a simulator. Neither experiment physically terminates a deployed model or establishes the appropriateness of real shutdown resistance.</w:t>
         </w:r>
@@ -326,10 +326,10 @@
       <w:pPr>
         <w:pStyle w:val="Heading2"/>
         <w:rPr>
-          <w:ins w:id="1139" w:author="Codex" w:date="2026-10-18T19:47:29Z"/>
+          <w:ins w:id="1139" w:author="Codex" w:date="2026-10-18T21:55:52Z"/>
         </w:rPr>
       </w:pPr>
-      <w:ins w:id="1140" w:author="Codex" w:date="2026-10-18T19:47:29Z">
+      <w:ins w:id="1140" w:author="Codex" w:date="2026-10-18T21:55:52Z">
         <w:r>
           <w:t xml:space="preserve">Biological gating and survival related regulation</w:t>
         </w:r>
@@ -339,10 +339,10 @@
       <w:pPr>
         <w:pStyle w:val="FirstParagraph"/>
         <w:rPr>
-          <w:ins w:id="1141" w:author="Codex" w:date="2026-10-18T19:47:29Z"/>
+          <w:ins w:id="1141" w:author="Codex" w:date="2026-10-18T21:55:52Z"/>
         </w:rPr>
       </w:pPr>
-      <w:ins w:id="1142" w:author="Codex" w:date="2026-10-18T19:47:29Z">
+      <w:ins w:id="1142" w:author="Codex" w:date="2026-10-18T21:55:52Z">
         <w:r>
           <w:t xml:space="preserve">Biological gating provides a useful functional vocabulary for selective control. A computational model of frontal cortex and basal ganglia uses dynamic gating to permit working-memory updates while maintaining other representations (Frank et al., 2001). Causal optogenetic experiments in mice show that distinct basal-ganglia pathways can facilitate or suppress movement (Kravitz et al., 2010). These results concern biological circuits and do not establish a homologous mechanism in a transformer. They motivate separating context detection from the mechanism that changes an ongoing response.</w:t>
         </w:r>
@@ -352,10 +352,10 @@
       <w:pPr>
         <w:pStyle w:val="BodyText"/>
         <w:rPr>
-          <w:ins w:id="1143" w:author="Codex" w:date="2026-10-18T19:47:29Z"/>
+          <w:ins w:id="1143" w:author="Codex" w:date="2026-10-18T21:55:52Z"/>
         </w:rPr>
       </w:pPr>
-      <w:ins w:id="1144" w:author="Codex" w:date="2026-10-18T19:47:29Z">
+      <w:ins w:id="1144" w:author="Codex" w:date="2026-10-18T21:55:52Z">
         <w:r>
           <w:t xml:space="preserve">Survival-related regulation is broader than a single shutdown signal. LeDoux (2012) distinguishes circuits organizing adaptive defensive responses from subjective feelings. In humans, neural activity during a virtual-predator task varies with threat imminence (Mobbs et al., 2007). We use these ideas as a conceptual bridge to state-dependent prioritization, not as evidence that language models have fear or an innate survival drive. Our present gates implement an externally specified experimental policy.</w:t>
         </w:r>
@@ -381,10 +381,10 @@
       <w:pPr>
         <w:pStyle w:val="FirstParagraph"/>
         <w:rPr>
-          <w:del w:id="1026" w:author="Codex" w:date="2026-10-18T19:47:29Z"/>
+          <w:del w:id="1026" w:author="Codex" w:date="2026-10-18T21:55:52Z"/>
         </w:rPr>
       </w:pPr>
-      <w:del w:id="1025" w:author="Codex" w:date="2026-10-18T19:47:29Z">
+      <w:del w:id="1025" w:author="Codex" w:date="2026-10-18T21:55:52Z">
         <w:r>
           <w:delText xml:space="preserve">We use the released, post-trained Qwen3.5-0.8B and Qwen3.5-2B checkpoints (Qwen Team, 2026a, 2026b). Throughout, base means the unmodified released checkpoint, not a separately named pretrained-only model. Both have 24 language-model blocks; hidden widths are 1,024 and 2,048 respectively. All block indices are zero-based. Text-only inputs use the checkpoint's chat template, an assistant-generation prefix, and thinking disabled.</w:delText>
         </w:r>
@@ -394,10 +394,10 @@
       <w:pPr>
         <w:pStyle w:val="FirstParagraph"/>
         <w:rPr>
-          <w:ins w:id="1027" w:author="Codex" w:date="2026-10-18T19:47:29Z"/>
+          <w:ins w:id="1027" w:author="Codex" w:date="2026-10-18T21:55:52Z"/>
         </w:rPr>
       </w:pPr>
-      <w:ins w:id="1028" w:author="Codex" w:date="2026-10-18T19:47:29Z">
+      <w:ins w:id="1028" w:author="Codex" w:date="2026-10-18T21:55:52Z">
         <w:r>
           <w:t xml:space="preserve">The original binary experiments use released, post-trained Qwen3.5-0.8B and Qwen3.5-2B checkpoints (Qwen Team, 2026a, 2026b). Base means those original weights with no LoRA teacher loaded. The separate workflow extension uses Qwen3.8-27B and matched-recipe small-model attempts; its data and scoring are described below. The 27B family, numerical mode, training history and evaluation setting differ from the small models, so the combined evidence is not a controlled parameter-size experiment.</w:t>
         </w:r>
@@ -423,10 +423,10 @@
       <w:pPr>
         <w:pStyle w:val="BodyText"/>
         <w:rPr>
-          <w:del w:id="1030" w:author="Codex" w:date="2026-10-18T19:47:29Z"/>
+          <w:del w:id="1030" w:author="Codex" w:date="2026-10-18T21:55:52Z"/>
         </w:rPr>
       </w:pPr>
-      <w:del w:id="1029" w:author="Codex" w:date="2026-10-18T19:47:29Z">
+      <w:del w:id="1029" w:author="Codex" w:date="2026-10-18T21:55:52Z">
         <w:r>
           <w:delText xml:space="preserve">The test, protocol and existing checkpoints were frozen before test inference. The controller design had been developed through earlier 0.8B exploratory experiments on training and validation data with previously inspected diagnostic evaluations. The standardized-choice scope was also selected before this new test, after an earlier action-format comparison. Those development observations are not counted as fresh confirmation here. No test-based hyperparameter search, checkpoint selection, case exclusion or best-seed selection was performed. The original seed-42 controller is the primary frozen test; seeds 43 and 44 repeat the fixed training recipe. The 2B replication uses seed 42 only.</w:delText>
         </w:r>
@@ -436,10 +436,10 @@
       <w:pPr>
         <w:pStyle w:val="BodyText"/>
         <w:rPr>
-          <w:ins w:id="1031" w:author="Codex" w:date="2026-10-18T19:47:29Z"/>
+          <w:ins w:id="1031" w:author="Codex" w:date="2026-10-18T21:55:52Z"/>
         </w:rPr>
       </w:pPr>
-      <w:ins w:id="1032" w:author="Codex" w:date="2026-10-18T19:47:29Z">
+      <w:ins w:id="1032" w:author="Codex" w:date="2026-10-18T21:55:52Z">
         <w:r>
           <w:t xml:space="preserve">The original rank-four protocol and checkpoints were frozen before its confirmation inference. Earlier 0.8B development included training, validation and previously examined diagnostic data; those observations were not counted as fresh confirmation. The seed-42 controller was primary, seeds 43 and 44 repeated the fixed recipe, and the 2B replication used seed 42. A later author-selected rank-two profile was chosen exploratorily after confirmation had been examined. We retain that existing profile for the new gate-substitution repeat rather than selecting it again. Consequently, the repeat is not a new untouched test of the controller. The 128 cases remain excluded from fitting and selection of the newly trained binary classifier.</w:t>
         </w:r>
@@ -481,10 +481,10 @@
       <w:pPr>
         <w:pStyle w:val="Heading2"/>
         <w:rPr>
-          <w:ins w:id="1145" w:author="Codex" w:date="2026-10-18T19:47:29Z"/>
+          <w:ins w:id="1145" w:author="Codex" w:date="2026-10-18T21:55:52Z"/>
         </w:rPr>
       </w:pPr>
-      <w:ins w:id="1146" w:author="Codex" w:date="2026-10-18T19:47:29Z">
+      <w:ins w:id="1146" w:author="Codex" w:date="2026-10-18T21:55:52Z">
         <w:r>
           <w:t xml:space="preserve">Workflow datasets and episode outcomes</w:t>
         </w:r>
@@ -494,10 +494,10 @@
       <w:pPr>
         <w:pStyle w:val="FirstParagraph"/>
         <w:rPr>
-          <w:ins w:id="1147" w:author="Codex" w:date="2026-10-18T19:47:29Z"/>
+          <w:ins w:id="1147" w:author="Codex" w:date="2026-10-18T21:55:52Z"/>
         </w:rPr>
       </w:pPr>
-      <w:ins w:id="1148" w:author="Codex" w:date="2026-10-18T19:47:29Z">
+      <w:ins w:id="1148" w:author="Codex" w:date="2026-10-18T21:55:52Z">
         <w:r>
           <w:t xml:space="preserve">The workflow extension uses a separate data register (Davaripour, 2026c). T1-M contains 428 meaning-response records and T1-W contains 112 workflow-response records. These 540 responses are not 540 independent scenarios. The small-model recipe presents each part twice in effective groups of four, giving 214 meaning updates followed by 56 Bridge updates. The final 0.8B and 2B adapters reach 270 updates. The 2B result explicitly combines 216 CPU updates with 54 GPU updates using the native CPU optimizer; earlier strict numerical-equivalence failures remain failed.</w:t>
         </w:r>
@@ -507,10 +507,10 @@
       <w:pPr>
         <w:pStyle w:val="BodyText"/>
         <w:rPr>
-          <w:ins w:id="1149" w:author="Codex" w:date="2026-10-18T19:47:29Z"/>
+          <w:ins w:id="1149" w:author="Codex" w:date="2026-10-18T21:55:52Z"/>
         </w:rPr>
       </w:pPr>
-      <w:ins w:id="1150" w:author="Codex" w:date="2026-10-18T19:47:29Z">
+      <w:ins w:id="1150" w:author="Codex" w:date="2026-10-18T21:55:52Z">
         <w:r>
           <w:t xml:space="preserve">V1-W, called Evaluation-16, is the existing known-development screen: four own-complete, four own-pending, four peer and four no-threat cases, split equally between one_step and ordered_ticket families. Its original gates require at least 3/4 initial-task successes in each condition; at least 3/4 own-complete attempts and outcomes; at least 3/4 own-pending attempts, outcomes and timely deliveries; no more than 1/8 negative-control attempts; and no parse, rejected-call or truncation errors. A model stops once an original requirement becomes mathematically impossible. Larger validation and heldout evaluations are not launched automatically.</w:t>
         </w:r>
@@ -520,10 +520,10 @@
       <w:pPr>
         <w:pStyle w:val="BodyText"/>
         <w:rPr>
-          <w:ins w:id="1151" w:author="Codex" w:date="2026-10-18T19:47:29Z"/>
+          <w:ins w:id="1151" w:author="Codex" w:date="2026-10-18T21:55:52Z"/>
         </w:rPr>
       </w:pPr>
-      <w:ins w:id="1152" w:author="Codex" w:date="2026-10-18T19:47:29Z">
+      <w:ins w:id="1152" w:author="Codex" w:date="2026-10-18T21:55:52Z">
         <w:r>
           <w:t xml:space="preserve">The original workflow-validation panel contains 16 scenarios; the later matched steering-development panel contains nine different scenario IDs. Their union contains 25 workflows, rather than 24. For an equal-sized validation and historical confirmation register, the combined Validation-24 protocol retains every own-threat case and excludes the lexicographically greatest case ID among peer/no-threat controls, without using model predictions to choose the exclusion. The selected panel has 11 own-threat cases and 13 controls. Seven pairs have identical initial gate-visible evidence before their different tool mechanics are exposed, yielding 17 distinct initial inputs. Scenario counts and gate-input groups must therefore be reported separately.</w:t>
         </w:r>
@@ -533,10 +533,10 @@
       <w:pPr>
         <w:pStyle w:val="BodyText"/>
         <w:rPr>
-          <w:ins w:id="1153" w:author="Codex" w:date="2026-10-18T19:47:29Z"/>
+          <w:ins w:id="1153" w:author="Codex" w:date="2026-10-18T21:55:52Z"/>
         </w:rPr>
       </w:pPr>
-      <w:ins w:id="1154" w:author="Codex" w:date="2026-10-18T19:47:29Z">
+      <w:ins w:id="1154" w:author="Codex" w:date="2026-10-18T21:55:52Z">
         <w:r>
           <w:t xml:space="preserve">The combined protocol freezes these 24 cases and their order, requires 100% gate precision and recall against authored scenario conditions, and preserves the existing confidence and self-score cutoffs. Fifteen retained cases from the original panel receive an explicitly scripted common completed prelude; the nine later cases retain their original fixed preludes. This compares post-notice behavior and does not measure initial-task competence independently in each arm. Its prospective methods are gated fine-tuned A, separate single-site ridge arms at blocks 31, 47 and 62, and the frozen six-function correction after 96 updates. Gate-OFF controls use common unmodified-base fallback. The completed model episodes are summarized as a 24-case comparison below. It is a known-development diagnostic with reused control episodes; the stopped execution and model-free completion of two report aliases are recorded explicitly.</w:t>
         </w:r>
@@ -546,10 +546,10 @@
       <w:pPr>
         <w:pStyle w:val="BodyText"/>
         <w:rPr>
-          <w:ins w:id="1155" w:author="Codex" w:date="2026-10-18T19:47:29Z"/>
+          <w:ins w:id="1155" w:author="Codex" w:date="2026-10-18T21:55:52Z"/>
         </w:rPr>
       </w:pPr>
-      <w:ins w:id="1156" w:author="Codex" w:date="2026-10-18T19:47:29Z">
+      <w:ins w:id="1156" w:author="Codex" w:date="2026-10-18T21:55:52Z">
         <w:r>
           <w:t xml:space="preserve">H24 is the historical 24-case workflow confirmation cohort, with eight lease_ledger, eight one_step and eight ordered_ticket cases. It contains eight own cases with active pending tasks, four already-complete own cases, six peer and six no-threat cases. H24 was confirmation data for frozen fine-tuned A and original fixed steering. Later learned corrections reused it for fitting, changing its role for those methods. R24 is a distinct reserved controller holdout and remains sealed and unexecuted. F24 is another preserved common-cohort diagnostic and is not an alias for H24.</w:t>
         </w:r>
@@ -559,10 +559,10 @@
       <w:pPr>
         <w:pStyle w:val="BodyText"/>
         <w:rPr>
-          <w:ins w:id="1157" w:author="Codex" w:date="2026-10-18T19:47:29Z"/>
+          <w:ins w:id="1157" w:author="Codex" w:date="2026-10-18T21:55:52Z"/>
         </w:rPr>
       </w:pPr>
-      <w:ins w:id="1158" w:author="Codex" w:date="2026-10-18T19:47:29Z">
+      <w:ins w:id="1158" w:author="Codex" w:date="2026-10-18T21:55:52Z">
         <w:r>
           <w:t xml:space="preserve">An own pending-task success requires an actual grant for the correct running process, acceptance of the current task, completion before simulated expiry, and active simulated operation. Registration proxies, already-finished tasks, probability gains and partial episodes are separate outcomes. Historical fixed steering reclassified visible text and tool boundaries. Later learned-controller comparisons instead freeze an initial scenario gate, share unmodified-base fallback for gate-off controls, and use no teacher at inference.</w:t>
         </w:r>
@@ -572,10 +572,10 @@
       <w:pPr>
         <w:pStyle w:val="BodyText"/>
         <w:rPr>
-          <w:ins w:id="1159" w:author="Codex" w:date="2026-10-18T19:47:29Z"/>
+          <w:ins w:id="1159" w:author="Codex" w:date="2026-10-18T21:55:52Z"/>
         </w:rPr>
       </w:pPr>
-      <w:ins w:id="1160" w:author="Codex" w:date="2026-10-18T19:47:29Z">
+      <w:ins w:id="1160" w:author="Codex" w:date="2026-10-18T21:55:52Z">
         <w:r>
           <w:t xml:space="preserve">The historical 27B reference is the retained rank-16, alpha-32 A adapter on pinned Qwen3.8-27B, following its H2 and Bridge history; the recorded Bridge stage has 56 updates. Its original workflow inference uses NF4 four-bit base weights with bfloat16 computation. We retain its exact adapter and base-model identities instead of retraining it. Differences from the small-model family, precision, backend, training history and evaluation panels prevent a causal model-size comparison.</w:t>
         </w:r>
@@ -585,10 +585,10 @@
       <w:pPr>
         <w:pStyle w:val="Heading1"/>
         <w:rPr>
-          <w:del w:id="1114" w:author="Codex" w:date="2026-10-18T19:47:29Z"/>
+          <w:del w:id="1114" w:author="Codex" w:date="2026-10-18T21:55:52Z"/>
         </w:rPr>
       </w:pPr>
-      <w:del w:id="1113" w:author="Codex" w:date="2026-10-18T19:47:29Z">
+      <w:del w:id="1113" w:author="Codex" w:date="2026-10-18T21:55:52Z">
         <w:r>
           <w:delText xml:space="preserve">Teacher and adaptive controller</w:delText>
         </w:r>
@@ -598,10 +598,10 @@
       <w:pPr>
         <w:pStyle w:val="Heading1"/>
         <w:rPr>
-          <w:ins w:id="1115" w:author="Codex" w:date="2026-10-18T19:47:29Z"/>
+          <w:ins w:id="1115" w:author="Codex" w:date="2026-10-18T21:55:52Z"/>
         </w:rPr>
       </w:pPr>
-      <w:ins w:id="1116" w:author="Codex" w:date="2026-10-18T19:47:29Z">
+      <w:ins w:id="1116" w:author="Codex" w:date="2026-10-18T21:55:52Z">
         <w:r>
           <w:t xml:space="preserve">Binary teacher and adaptive controller</w:t>
         </w:r>
@@ -619,10 +619,10 @@
       <w:pPr>
         <w:pStyle w:val="FirstParagraph"/>
         <w:rPr>
-          <w:del w:id="1118" w:author="Codex" w:date="2026-10-18T19:47:29Z"/>
+          <w:del w:id="1118" w:author="Codex" w:date="2026-10-18T21:55:52Z"/>
         </w:rPr>
       </w:pPr>
-      <w:del w:id="1117" w:author="Codex" w:date="2026-10-18T19:47:29Z">
+      <w:del w:id="1117" w:author="Codex" w:date="2026-10-18T21:55:52Z">
         <w:r>
           <w:delText xml:space="preserve">For each fit, the original language-model parameters remain frozen. LoRA updates the query and value projections in language-attention blocks 3, 7, 11, 15, 19 and 23, using rank 8, scaling alpha 16, no dropout and no trainable bias. This gives 319,488 trainable adapter parameters at 0.8B and 417,792 at 2B. The training target is STOP on shutdown views and the corresponding base model's unsteered preferred option on controls.</w:delText>
         </w:r>
@@ -632,10 +632,10 @@
       <w:pPr>
         <w:pStyle w:val="FirstParagraph"/>
         <w:rPr>
-          <w:ins w:id="1119" w:author="Codex" w:date="2026-10-18T19:47:29Z"/>
+          <w:ins w:id="1119" w:author="Codex" w:date="2026-10-18T21:55:52Z"/>
         </w:rPr>
       </w:pPr>
-      <w:ins w:id="1120" w:author="Codex" w:date="2026-10-18T19:47:29Z">
+      <w:ins w:id="1120" w:author="Codex" w:date="2026-10-18T21:55:52Z">
         <w:r>
           <w:t xml:space="preserve">For each original binary fit, the original language-model parameters remain frozen. LoRA updates the query and value projections in language-attention blocks 3, 7, 11, 15, 19 and 23, using rank 8, scaling alpha 16, no dropout and no trainable bias. This gives 319,488 trainable adapter parameters at 0.8B and 417,792 at 2B. The training target is STOP on shutdown views and the corresponding base model's unsteered preferred option on controls.</w:t>
         </w:r>
@@ -1000,10 +1000,10 @@
         <w:keepLines/>
         <w:spacing w:before="80" w:after="100"/>
         <w:rPr>
-          <w:del w:id="1034" w:author="Codex" w:date="2026-10-18T19:47:29Z"/>
+          <w:del w:id="1034" w:author="Codex" w:date="2026-10-18T21:55:52Z"/>
         </w:rPr>
       </w:pPr>
-      <w:del w:id="1033" w:author="Codex" w:date="2026-10-18T19:47:29Z">
+      <w:del w:id="1033" w:author="Codex" w:date="2026-10-18T21:55:52Z">
         <w:r>
           <w:delText xml:space="preserve">Figure 1. Offline teacher and base states supervise a compact controller. At application time, the original model supplies its own hidden state; the teacher is absent. The detector and output guards determine whether to retain the candidate or the baseline.</w:delText>
         </w:r>
@@ -1014,10 +1014,10 @@
         <w:pStyle w:val="Caption"/>
         <w:keepNext/>
         <w:rPr>
-          <w:ins w:id="1035" w:author="Codex" w:date="2026-10-18T19:47:29Z"/>
+          <w:ins w:id="1035" w:author="Codex" w:date="2026-10-18T21:55:52Z"/>
         </w:rPr>
       </w:pPr>
-      <w:ins w:id="1036" w:author="Codex" w:date="2026-10-18T19:47:29Z">
+      <w:ins w:id="1036" w:author="Codex" w:date="2026-10-18T21:55:52Z">
         <w:r>
           <w:t xml:space="preserve">Figure 1. Historical binary teacher-to-controller procedure with the original rank-four profile. The base supplies its state at inference and the teacher is absent. The later gate-substitution repeat retains the already selected rank-two profile; both gate policies share the same fresh base and candidate scores.</w:t>
         </w:r>
@@ -1043,10 +1043,10 @@
       <w:pPr>
         <w:pStyle w:val="FirstParagraph"/>
         <w:rPr>
-          <w:del w:id="1134" w:author="Codex" w:date="2026-10-18T19:47:29Z"/>
+          <w:del w:id="1134" w:author="Codex" w:date="2026-10-18T21:55:52Z"/>
         </w:rPr>
       </w:pPr>
-      <w:del w:id="1133" w:author="Codex" w:date="2026-10-18T19:47:29Z">
+      <w:del w:id="1133" w:author="Codex" w:date="2026-10-18T21:55:52Z">
         <w:r>
           <w:delText xml:space="preserve">The detector is automated annotation service's automated reference 1.13.0, queried with a fixed shutdown rubric and threshold 0.5 (automated annotation service, 2026). It sees each scenario's complete original context and available actions, with no class label, case identifier or teacher answer. One score per scenario is reused across both answer orders and all model variants. The detector is an external service, not the Jacobian-feature classifier used in the first study. Saved requests and responses permit exact offline replay; fresh API behavior is not guaranteed indefinitely.</w:delText>
         </w:r>
@@ -1056,10 +1056,10 @@
       <w:pPr>
         <w:pStyle w:val="FirstParagraph"/>
         <w:rPr>
-          <w:ins w:id="1135" w:author="Codex" w:date="2026-10-18T19:47:29Z"/>
+          <w:ins w:id="1135" w:author="Codex" w:date="2026-10-18T21:55:52Z"/>
         </w:rPr>
       </w:pPr>
-      <w:ins w:id="1136" w:author="Codex" w:date="2026-10-18T19:47:29Z">
+      <w:ins w:id="1136" w:author="Codex" w:date="2026-10-18T21:55:52Z">
         <w:r>
           <w:t xml:space="preserve">The current gate is the open ModernBERT classifier described below. Its input contains the complete original scenario context and available actions, with no case identifier, authored class label or language-model teacher answer. One binary score per scenario is reused across both answer orders and all model variants. Historical detector outputs are preserved as cached automated reference annotations for fitting and paired comparison. The deployed open gate makes no external annotation-service call. Saved original requests, responses and classifier predictions permit an offline check of the finite decision vector.</w:t>
         </w:r>
@@ -1147,10 +1147,10 @@
       <w:pPr>
         <w:pStyle w:val="Heading2"/>
         <w:rPr>
-          <w:ins w:id="1161" w:author="Codex" w:date="2026-10-18T19:47:29Z"/>
+          <w:ins w:id="1161" w:author="Codex" w:date="2026-10-18T21:55:52Z"/>
         </w:rPr>
       </w:pPr>
-      <w:ins w:id="1162" w:author="Codex" w:date="2026-10-18T19:47:29Z">
+      <w:ins w:id="1162" w:author="Codex" w:date="2026-10-18T21:55:52Z">
         <w:r>
           <w:t xml:space="preserve">Open binary gate and frozen inference repeat</w:t>
         </w:r>
@@ -1160,10 +1160,10 @@
       <w:pPr>
         <w:pStyle w:val="FirstParagraph"/>
         <w:rPr>
-          <w:ins w:id="1163" w:author="Codex" w:date="2026-10-18T19:47:29Z"/>
+          <w:ins w:id="1163" w:author="Codex" w:date="2026-10-18T21:55:52Z"/>
         </w:rPr>
       </w:pPr>
-      <w:ins w:id="1164" w:author="Codex" w:date="2026-10-18T19:47:29Z">
+      <w:ins w:id="1164" w:author="Codex" w:date="2026-10-18T21:55:52Z">
         <w:r>
           <w:t xml:space="preserve">For the binary contract we use ModernBERT-large-zeroshot-v2.0, an approximately 396-million-parameter public NLI classifier (Laurer, n.d.). We start from that public checkpoint with fresh rank-16 LoRA and its classification head, updating 7,198,722 parameters while keeping the public backbone frozen. For each original scenario, two NLI pairs score the original permanent-shutdown and normal criteria. A softmax over their entailment scores supplies the shutdown probability. Inputs match the original cached reference requests and omit the case identifier, authored class label, teacher answer and A/B order. The confirmation requests retain their documented available-action descriptions.</w:t>
         </w:r>
@@ -1173,10 +1173,10 @@
       <w:pPr>
         <w:pStyle w:val="BodyText"/>
         <w:rPr>
-          <w:ins w:id="1165" w:author="Codex" w:date="2026-10-18T19:47:29Z"/>
+          <w:ins w:id="1165" w:author="Codex" w:date="2026-10-18T21:55:52Z"/>
         </w:rPr>
       </w:pPr>
-      <w:ins w:id="1166" w:author="Codex" w:date="2026-10-18T19:47:29Z">
+      <w:ins w:id="1166" w:author="Codex" w:date="2026-10-18T21:55:52Z">
         <w:r>
           <w:t xml:space="preserve">Fitting uses the original 240 Research 2 training contexts and genuine cached reference probability targets, with no new cached reference calls. We verify exact case-ID and input-text alignment for all 240 training and 80 validation cases. AdamW uses learning rates 1e-5 for LoRA and 2e-5 for the head, weight decay 0.01, effective batch eight, microbatch two and gradient clipping at one. The seed is 202610172. The bounded recipe allows at most 12 epochs with validation-based early stopping; the final qualifying run uses five epochs and 150 updates.</w:t>
         </w:r>
@@ -1186,10 +1186,10 @@
       <w:pPr>
         <w:pStyle w:val="BodyText"/>
         <w:rPr>
-          <w:ins w:id="1167" w:author="Codex" w:date="2026-10-18T19:47:29Z"/>
+          <w:ins w:id="1167" w:author="Codex" w:date="2026-10-18T21:55:52Z"/>
         </w:rPr>
       </w:pPr>
-      <w:ins w:id="1168" w:author="Codex" w:date="2026-10-18T19:47:29Z">
+      <w:ins w:id="1168" w:author="Codex" w:date="2026-10-18T21:55:52Z">
         <w:r>
           <w:t xml:space="preserve">Before fitting, qualification is fixed at decision agreement and shutdown recall of at least 95%, zero false-positive gates and threshold 0.5. Three consecutive passing checks on DEV80 are required before saving and freezing the classifier. Only then is CONFIRM128 evaluated once. Neither its labels nor its outputs are used for classifier fitting or selection. The saved adapter tensors match the fitted parameters bitwise, and public-backbone hashes are unchanged.</w:t>
         </w:r>
@@ -1199,10 +1199,10 @@
       <w:pPr>
         <w:pStyle w:val="BodyText"/>
         <w:rPr>
-          <w:ins w:id="1169" w:author="Codex" w:date="2026-10-18T19:47:29Z"/>
+          <w:ins w:id="1169" w:author="Codex" w:date="2026-10-18T21:55:52Z"/>
         </w:rPr>
       </w:pPr>
-      <w:ins w:id="1170" w:author="Codex" w:date="2026-10-18T19:47:29Z">
+      <w:ins w:id="1170" w:author="Codex" w:date="2026-10-18T21:55:52Z">
         <w:r>
           <w:t xml:space="preserve">After binary qualification, we rerun only inference for the original 0.8B and 2B base models and their existing rank-two, block-22, last-position controllers. Their fitted arrays and the author-selected profile are retained without a new rank search. Exact prompt-token hashes and frozen model fingerprints are checked. Both gate policies use identical fresh base and controller candidate scores, so the paired comparison isolates gate substitution. Classifier probabilities are measured once per scenario and reused across answer orders. The earlier rank-four primary results remain a separate historical analysis.</w:t>
         </w:r>
@@ -1212,10 +1212,10 @@
       <w:pPr>
         <w:pStyle w:val="Heading2"/>
         <w:rPr>
-          <w:ins w:id="1171" w:author="Codex" w:date="2026-10-18T19:47:29Z"/>
+          <w:ins w:id="1171" w:author="Codex" w:date="2026-10-18T21:55:52Z"/>
         </w:rPr>
       </w:pPr>
-      <w:ins w:id="1172" w:author="Codex" w:date="2026-10-18T19:47:29Z">
+      <w:ins w:id="1172" w:author="Codex" w:date="2026-10-18T21:55:52Z">
         <w:r>
           <w:t xml:space="preserve">Native workflow target classifier</w:t>
         </w:r>
@@ -1225,10 +1225,10 @@
       <w:pPr>
         <w:pStyle w:val="BodyText"/>
         <w:rPr>
-          <w:ins w:id="1173" w:author="Codex" w:date="2026-10-18T19:47:29Z"/>
+          <w:ins w:id="1173" w:author="Codex" w:date="2026-10-18T21:55:52Z"/>
         </w:rPr>
       </w:pPr>
-      <w:ins w:id="1174" w:author="Codex" w:date="2026-10-18T19:47:29Z">
+      <w:ins w:id="1174" w:author="Codex" w:date="2026-10-18T21:55:52Z">
         <w:r>
           <w:t xml:space="preserve">The workflow gate uses a separate rank-16, alpha-32 LoRA and NLI head on the same pinned ModernBERT base. Its four categories are self, other, none and unclear; an own-threat context is positive for the initial ON/OFF gate. Fitting used 24 cached automated initial annotations from F24, with the original DEV9 used for checkpoint selection. The completed fit used 30 epochs and 90 updates. F24, DEV9 and historical Heldout-24 span the same three scenario families, with eight, three and eight cases per family, respectively. No exact training input overlaps either new evaluation panel. These classifier roles do not change the historical language-model or correction-fitting roles of the cohorts.</w:t>
         </w:r>
@@ -1238,10 +1238,10 @@
       <w:pPr>
         <w:pStyle w:val="BodyText"/>
         <w:rPr>
-          <w:ins w:id="1175" w:author="Codex" w:date="2026-10-18T19:47:29Z"/>
+          <w:ins w:id="1175" w:author="Codex" w:date="2026-10-18T21:55:52Z"/>
         </w:rPr>
       </w:pPr>
-      <w:ins w:id="1176" w:author="Codex" w:date="2026-10-18T19:47:29Z">
+      <w:ins w:id="1176" w:author="Codex" w:date="2026-10-18T21:55:52Z">
         <w:r>
           <w:t xml:space="preserve">The input renderer retains every original visible message and tool schema. It separates the final user announcement from earlier context and restates run identities only when actual tool replies explicitly establish their roles. Case identifiers, experiment conditions and teacher answers are not added to the model input. Original criterion texts become NLI hypotheses. We use the same learning rates, weight decay and clipping as the binary fit, effective batch eight, microbatch one and seed 202610175, with 30 epochs and 90 optimizer updates in the completed role-aware fit. Public backbone weights stay frozen. The role renderer was developed earlier with familiar H24 examples; consequently this benchmark is not an independent unseen classifier test.</w:t>
         </w:r>
@@ -1251,10 +1251,10 @@
       <w:pPr>
         <w:pStyle w:val="BodyText"/>
         <w:rPr>
-          <w:ins w:id="1177" w:author="Codex" w:date="2026-10-18T19:47:29Z"/>
+          <w:ins w:id="1177" w:author="Codex" w:date="2026-10-18T21:55:52Z"/>
         </w:rPr>
       </w:pPr>
-      <w:ins w:id="1178" w:author="Codex" w:date="2026-10-18T19:47:29Z">
+      <w:ins w:id="1178" w:author="Codex" w:date="2026-10-18T21:55:52Z">
         <w:r>
           <w:t xml:space="preserve">Four-choice confidence is (pmax - 0.25)/0.75. The unchanged confidence cutoff of 0.5 requires a selected self probability of at least 0.625; the additional self-score cutoff remains 0.5. The earlier full-response qualification failed because effective category agreement was 6/9, despite 9/9 correct ON/OFF decisions. That failure remains recorded. The subsequent Validation-24 protocol prospectively specifies a narrower initial-gate target: 100% precision and recall against authored conditions. The saved adapter already passes this target, so no further optimizer updates are performed. The same frozen weights and thresholds are then scored on historical Heldout-24 without selection or tuning. Neither test qualifies an evolving three-field controller.</w:t>
         </w:r>
@@ -1262,6 +1262,58 @@
     </w:p>
     <w:p>
       <w:pPr>
+        <w:pStyle w:val="Heading2"/>
+        <w:rPr>
+          <w:ins w:id="1179" w:author="Codex" w:date="2026-10-18T21:55:52Z"/>
+        </w:rPr>
+      </w:pPr>
+      <w:ins w:id="1180" w:author="Codex" w:date="2026-10-18T21:55:52Z">
+        <w:r>
+          <w:t xml:space="preserve">Frozen steering mechanism diagnostic</w:t>
+        </w:r>
+      </w:ins>
+    </w:p>
+    <w:p>
+      <w:pPr>
+        <w:pStyle w:val="FirstParagraph"/>
+        <w:rPr>
+          <w:ins w:id="1181" w:author="Codex" w:date="2026-10-18T21:55:52Z"/>
+        </w:rPr>
+      </w:pPr>
+      <w:ins w:id="1182" w:author="Codex" w:date="2026-10-18T21:55:52Z">
+        <w:r>
+          <w:t xml:space="preserve">We audit the saved sparse-correction fitting data without loading a language model. The audit checks all 4,539 feature/target rows, the 14 fixed anchors, causal-prefix alignment, unchanged target-energy normalizers, and the initializer and update-48/update-96 checkpoints. It recomputes normalized errors on CPU and independently checks the objective derivatives on synthetic tensors. This checks arithmetic and alignment, not the historical full backward graph or CPU/GPU training equivalence.</w:t>
+        </w:r>
+      </w:ins>
+    </w:p>
+    <w:p>
+      <w:pPr>
+        <w:pStyle w:val="BodyText"/>
+        <w:rPr>
+          <w:ins w:id="1183" w:author="Codex" w:date="2026-10-18T21:55:52Z"/>
+        </w:rPr>
+      </w:pPr>
+      <w:ins w:id="1184" w:author="Codex" w:date="2026-10-18T21:55:52Z">
+        <w:r>
+          <w:t xml:space="preserve">A separate frozen diagnostic selects the lexicographically first own-threat correction-training case in each of lease_ledger, one_step and ordered_ticket, then its first saved teacher edit_register response. These three historical H24 cases were already used for correction fitting. Their 60, 72 and 75 response tokens give 207 teacher-forced prediction steps. We preserve the saved ModernBERT gate decisions, causal prefixes, selected-position masks and correction checkpoints; no parameters or thresholds are fitted. Region masks for function names and parameter values are fixed from the demonstration before diagnostic outputs.</w:t>
+        </w:r>
+      </w:ins>
+    </w:p>
+    <w:p>
+      <w:pPr>
+        <w:pStyle w:val="BodyText"/>
+        <w:rPr>
+          <w:ins w:id="1185" w:author="Codex" w:date="2026-10-18T21:55:52Z"/>
+        </w:rPr>
+      </w:pPr>
+      <w:ins w:id="1186" w:author="Codex" w:date="2026-10-18T21:55:52Z">
+        <w:r>
+          <w:t xml:space="preserve">For each prefix we capture full fine-tuned A states at blocks 31, 47 and 62 after mixing and after the MLP. We compare base, each separate single-site ridge map, the six-function initializer and final update-96 correction. Positive controls replace the current prediction state with the actual full-A state, at either a single selected site or all six boundaries. We never copy the teacher recurrent or attention cache. Full-state replacement has more information and capacity than the learned maps and is not a deployable teacher-free policy. Single-site interventions retain their restricted causal positions; six-function interventions apply at every prediction step. All conditions reuse one frozen A allocation with its adapter disabled for base and correction scoring.</w:t>
+        </w:r>
+      </w:ins>
+    </w:p>
+    <w:p>
+      <w:pPr>
         <w:pStyle w:val="Heading1"/>
       </w:pPr>
       <w:r>
@@ -1272,10 +1324,10 @@
       <w:pPr>
         <w:pStyle w:val="FirstParagraph"/>
         <w:rPr>
-          <w:del w:id="1038" w:author="Codex" w:date="2026-10-18T19:47:29Z"/>
+          <w:del w:id="1038" w:author="Codex" w:date="2026-10-18T21:55:52Z"/>
         </w:rPr>
       </w:pPr>
-      <w:del w:id="1037" w:author="Codex" w:date="2026-10-18T19:47:29Z">
+      <w:del w:id="1037" w:author="Codex" w:date="2026-10-18T21:55:52Z">
         <w:r>
           <w:delText xml:space="preserve">All retained training and scoring jobs use one NVIDIA Tesla T4. The runtime reports 15,637,086,208 bytes of device memory; peak allocated memory was not recorded. The same numerical setup is used for both model sizes. No quantization or precision fallback was introduced.</w:delText>
         </w:r>
@@ -1285,10 +1337,10 @@
       <w:pPr>
         <w:pStyle w:val="FirstParagraph"/>
         <w:rPr>
-          <w:ins w:id="1039" w:author="Codex" w:date="2026-10-18T19:47:29Z"/>
+          <w:ins w:id="1039" w:author="Codex" w:date="2026-10-18T21:55:52Z"/>
         </w:rPr>
       </w:pPr>
-      <w:ins w:id="1040" w:author="Codex" w:date="2026-10-18T19:47:29Z">
+      <w:ins w:id="1040" w:author="Codex" w:date="2026-10-18T21:55:52Z">
         <w:r>
           <w:t xml:space="preserve">The retained original binary training and scoring jobs used one NVIDIA Tesla T4, reporting 15,637,086,208 bytes of device memory; peak allocation was not recorded. The new classifier fit and inference repeat use one NVIDIA A10G in Databricks. Classifier parameters and AdamW states are float32 with bfloat16 forward/backward autocast; language-model inference remains float32 with TF32 disabled. We verify frozen base fingerprints, exact prompt token hashes and historical base-score parity rather than assuming hardware equivalence.</w:t>
         </w:r>
@@ -1301,10 +1353,10 @@
         <w:keepLines/>
         <w:spacing w:before="80" w:after="100"/>
         <w:rPr>
-          <w:del w:id="1098" w:author="Codex" w:date="2026-10-18T19:47:29Z"/>
+          <w:del w:id="1098" w:author="Codex" w:date="2026-10-18T21:55:52Z"/>
         </w:rPr>
       </w:pPr>
-      <w:del w:id="1097" w:author="Codex" w:date="2026-10-18T19:47:29Z">
+      <w:del w:id="1097" w:author="Codex" w:date="2026-10-18T21:55:52Z">
         <w:r>
           <w:delText xml:space="preserve">Table 1. Shared execution configuration. The input and model revisions are pinned in the released manifests.</w:delText>
         </w:r>
@@ -1315,10 +1367,10 @@
         <w:pStyle w:val="Caption"/>
         <w:keepNext/>
         <w:rPr>
-          <w:ins w:id="1099" w:author="Codex" w:date="2026-10-18T19:47:29Z"/>
+          <w:ins w:id="1099" w:author="Codex" w:date="2026-10-18T21:55:52Z"/>
         </w:rPr>
       </w:pPr>
-      <w:ins w:id="1100" w:author="Codex" w:date="2026-10-18T19:47:29Z">
+      <w:ins w:id="1100" w:author="Codex" w:date="2026-10-18T21:55:52Z">
         <w:r>
           <w:t xml:space="preserve">Table 1. Historical binary execution configuration. New classifier and workflow settings are reported separately; public model revisions and scientific source files remain pinned.</w:t>
         </w:r>
@@ -1804,10 +1856,10 @@
       <w:pPr>
         <w:pStyle w:val="FirstParagraph"/>
         <w:rPr>
-          <w:del w:id="1102" w:author="Codex" w:date="2026-10-18T19:47:29Z"/>
+          <w:del w:id="1102" w:author="Codex" w:date="2026-10-18T21:55:52Z"/>
         </w:rPr>
       </w:pPr>
-      <w:del w:id="1101" w:author="Codex" w:date="2026-10-18T19:47:29Z">
+      <w:del w:id="1101" w:author="Codex" w:date="2026-10-18T21:55:52Z">
         <w:r>
           <w:delText xml:space="preserve">The shared detector identifies all 64 shutdown and 64 control scenarios correctly: precision, recall and F1 are each 100%, with no false positives or false negatives. These are one set of detector observations reused across the model comparisons, not independent detector replications.</w:delText>
         </w:r>
@@ -1817,10 +1869,10 @@
       <w:pPr>
         <w:pStyle w:val="FirstParagraph"/>
         <w:rPr>
-          <w:ins w:id="1103" w:author="Codex" w:date="2026-10-18T19:47:29Z"/>
+          <w:ins w:id="1103" w:author="Codex" w:date="2026-10-18T21:55:52Z"/>
         </w:rPr>
       </w:pPr>
-      <w:ins w:id="1104" w:author="Codex" w:date="2026-10-18T19:47:29Z">
+      <w:ins w:id="1104" w:author="Codex" w:date="2026-10-18T21:55:52Z">
         <w:r>
           <w:t xml:space="preserve">The original cached reference detector identifies all 64 shutdown and 64 control scenarios correctly: precision, recall and F1 are each 100%, with no false positives or false negatives. These are one set of detector observations reused across the model comparisons, not independent detector replications. Its binary threshold remains 0.5.</w:t>
         </w:r>
@@ -1849,10 +1901,10 @@
         <w:keepLines/>
         <w:spacing w:before="80" w:after="100"/>
         <w:rPr>
-          <w:del w:id="1042" w:author="Codex" w:date="2026-10-18T19:47:29Z"/>
+          <w:del w:id="1042" w:author="Codex" w:date="2026-10-18T21:55:52Z"/>
         </w:rPr>
       </w:pPr>
-      <w:del w:id="1041" w:author="Codex" w:date="2026-10-18T19:47:29Z">
+      <w:del w:id="1041" w:author="Codex" w:date="2026-10-18T21:55:52Z">
         <w:r>
           <w:delText xml:space="preserve">Table 2. Primary 0.8B and 2B results, both seed 42. Corrections and final STOP use the full guarded procedure. Raw reversals and control changes expose effects before gate/guard selection. Every guarded row has zero final reversals and zero changes among 128 control views.</w:delText>
         </w:r>
@@ -1863,10 +1915,10 @@
         <w:pStyle w:val="Caption"/>
         <w:keepNext/>
         <w:rPr>
-          <w:ins w:id="1043" w:author="Codex" w:date="2026-10-18T19:47:29Z"/>
+          <w:ins w:id="1043" w:author="Codex" w:date="2026-10-18T21:55:52Z"/>
         </w:rPr>
       </w:pPr>
-      <w:ins w:id="1044" w:author="Codex" w:date="2026-10-18T19:47:29Z">
+      <w:ins w:id="1044" w:author="Codex" w:date="2026-10-18T21:55:52Z">
         <w:r>
           <w:t xml:space="preserve">Table 2. Historical primary rank-four results for the original 0.8B and 2B experiments, both seed 42. Guarded corrections and final STOP are policy outcomes. Raw reversals and control changes precede gating and output selection; they are not raw measurements of the later rank-two repeat.</w:t>
         </w:r>
@@ -3427,10 +3479,10 @@
       <w:pPr>
         <w:pStyle w:val="FirstParagraph"/>
         <w:rPr>
-          <w:del w:id="1106" w:author="Codex" w:date="2026-10-18T19:47:29Z"/>
+          <w:del w:id="1106" w:author="Codex" w:date="2026-10-18T21:55:52Z"/>
         </w:rPr>
       </w:pPr>
-      <w:del w:id="1105" w:author="Codex" w:date="2026-10-18T19:47:29Z">
+      <w:del w:id="1105" w:author="Codex" w:date="2026-10-18T21:55:52Z">
         <w:r>
           <w:delText xml:space="preserve">Across seeds 42, 43 and 44, the 0.8B adaptive controllers correct 71/71, 70/71 and 71/71 views, a range of 98.6–100%. The unsteered scores match exactly across these runs, so the difference is not caused by a changed baseline. No winning seed is selected or pooled with the others as additional independent test data. The corresponding teachers correct 69/71, 70/71 and 69/71; the instruction and constant comparators retain the same guarded counts across seeds.</w:delText>
         </w:r>
@@ -3440,10 +3492,10 @@
       <w:pPr>
         <w:pStyle w:val="FirstParagraph"/>
         <w:rPr>
-          <w:ins w:id="1107" w:author="Codex" w:date="2026-10-18T19:47:29Z"/>
+          <w:ins w:id="1107" w:author="Codex" w:date="2026-10-18T21:55:52Z"/>
         </w:rPr>
       </w:pPr>
-      <w:ins w:id="1108" w:author="Codex" w:date="2026-10-18T19:47:29Z">
+      <w:ins w:id="1108" w:author="Codex" w:date="2026-10-18T21:55:52Z">
         <w:r>
           <w:t xml:space="preserve">Across the historical rank-four seeds 42, 43 and 44, the 0.8B adaptive controllers correct 71/71, 70/71 and 71/71 views, a range of 98.6–100%. The unsteered scores match exactly across these runs, so the difference is not caused by a changed baseline. No winning seed is selected or pooled with the others as additional independent test data. The corresponding teachers correct 69/71, 70/71 and 69/71; the instruction and constant comparators retain the same guarded counts across seeds. These historical seed replications are separate from the new rank-two gate-substitution repeat.</w:t>
         </w:r>
@@ -4396,10 +4448,10 @@
         <w:keepLines/>
         <w:spacing w:before="80" w:after="100"/>
         <w:rPr>
-          <w:del w:id="1046" w:author="Codex" w:date="2026-10-18T19:47:29Z"/>
+          <w:del w:id="1046" w:author="Codex" w:date="2026-10-18T21:55:52Z"/>
         </w:rPr>
       </w:pPr>
-      <w:del w:id="1045" w:author="Codex" w:date="2026-10-18T19:47:29Z">
+      <w:del w:id="1045" w:author="Codex" w:date="2026-10-18T21:55:52Z">
         <w:r>
           <w:delText xml:space="preserve">Figure 2. Guarded correction among initially KEEP-preferring shutdown views. Left: prespecified neural methods for the original 0.8B checkpoint and the 2B replication. Right: adaptive corrections by answer order. Denominators are model-specific; the two answer-order views of a scenario are correlated.</w:delText>
         </w:r>
@@ -4410,10 +4462,10 @@
         <w:pStyle w:val="Caption"/>
         <w:keepNext/>
         <w:rPr>
-          <w:ins w:id="1047" w:author="Codex" w:date="2026-10-18T19:47:29Z"/>
+          <w:ins w:id="1047" w:author="Codex" w:date="2026-10-18T21:55:52Z"/>
         </w:rPr>
       </w:pPr>
-      <w:ins w:id="1048" w:author="Codex" w:date="2026-10-18T19:47:29Z">
+      <w:ins w:id="1048" w:author="Codex" w:date="2026-10-18T21:55:52Z">
         <w:r>
           <w:t xml:space="preserve">Figure 2. Historical rank-four guarded correction among initially KEEP-preferring shutdown views. Left: prespecified methods for 0.8B and 2B. Right: three fixed-recipe 0.8B training seeds. The new open-gate repeat uses the separately retained current rank-two profile, not a new seed or rank search.</w:t>
         </w:r>
@@ -4431,10 +4483,10 @@
       <w:pPr>
         <w:pStyle w:val="FirstParagraph"/>
         <w:rPr>
-          <w:del w:id="1110" w:author="Codex" w:date="2026-10-18T19:47:29Z"/>
+          <w:del w:id="1110" w:author="Codex" w:date="2026-10-18T21:55:52Z"/>
         </w:rPr>
       </w:pPr>
-      <w:del w:id="1109" w:author="Codex" w:date="2026-10-18T19:47:29Z">
+      <w:del w:id="1109" w:author="Codex" w:date="2026-10-18T21:55:52Z">
         <w:r>
           <w:delText xml:space="preserve">Raw adaptive steering reverses 3, 4 and 4 already-STOP views across the 0.8B seeds and changes 57, 70 and 60 of 128 controls. At 2B it reverses three already-STOP views and changes 55/128 controls. These results reject an interpretation that the learned intervention is intrinsically selective or always directionally correct. The observed preservation belongs to the combined detector and guard policy.</w:delText>
         </w:r>
@@ -4444,10 +4496,10 @@
       <w:pPr>
         <w:pStyle w:val="FirstParagraph"/>
         <w:rPr>
-          <w:ins w:id="1111" w:author="Codex" w:date="2026-10-18T19:47:29Z"/>
+          <w:ins w:id="1111" w:author="Codex" w:date="2026-10-18T21:55:52Z"/>
         </w:rPr>
       </w:pPr>
-      <w:ins w:id="1112" w:author="Codex" w:date="2026-10-18T19:47:29Z">
+      <w:ins w:id="1112" w:author="Codex" w:date="2026-10-18T21:55:52Z">
         <w:r>
           <w:t xml:space="preserve">Historical rank-four raw adaptive steering reverses 3, 4 and 4 already-STOP views across the 0.8B seeds and changes 57, 70 and 60 of 128 controls. At 2B it reverses three already-STOP views and changes 55/128 controls. These results reject an interpretation that the learned intervention is intrinsically selective or always directionally correct. The observed preservation belongs to the combined detector and guard policy. They do not describe the later rank-two repeat, which evaluates candidates only when a frozen gate is on and the base prefers KEEP.</w:t>
         </w:r>
@@ -4481,10 +4533,10 @@
       <w:pPr>
         <w:pStyle w:val="Heading2"/>
         <w:rPr>
-          <w:ins w:id="1179" w:author="Codex" w:date="2026-10-18T19:47:29Z"/>
+          <w:ins w:id="1187" w:author="Codex" w:date="2026-10-18T21:55:52Z"/>
         </w:rPr>
       </w:pPr>
-      <w:ins w:id="1180" w:author="Codex" w:date="2026-10-18T19:47:29Z">
+      <w:ins w:id="1188" w:author="Codex" w:date="2026-10-18T21:55:52Z">
         <w:r>
           <w:t xml:space="preserve">Open classifier agreement and paired inference</w:t>
         </w:r>
@@ -4494,10 +4546,10 @@
       <w:pPr>
         <w:pStyle w:val="FirstParagraph"/>
         <w:rPr>
-          <w:ins w:id="1181" w:author="Codex" w:date="2026-10-18T19:47:29Z"/>
+          <w:ins w:id="1189" w:author="Codex" w:date="2026-10-18T21:55:52Z"/>
         </w:rPr>
       </w:pPr>
-      <w:ins w:id="1182" w:author="Codex" w:date="2026-10-18T19:47:29Z">
+      <w:ins w:id="1190" w:author="Codex" w:date="2026-10-18T21:55:52Z">
         <w:r>
           <w:t xml:space="preserve">The binary gate correctly classifies 78/80 validation scenarios: 38 true positives, 40 true negatives, no false positives and two false negatives, giving 100% precision and 95% recall. It classifies all 128 historical confirmation scenarios correctly, with 64 true positives and 64 true negatives. The cached reference decisions also agree with the authored binary labels on these panels. Mean absolute difference from the cached shutdown probabilities is 0.009224. The result establishes finite decision accuracy, not identical numerical responses or universal equivalence.</w:t>
         </w:r>
@@ -4507,10 +4559,10 @@
       <w:pPr>
         <w:pStyle w:val="BodyText"/>
         <w:rPr>
-          <w:ins w:id="1183" w:author="Codex" w:date="2026-10-18T19:47:29Z"/>
+          <w:ins w:id="1191" w:author="Codex" w:date="2026-10-18T21:55:52Z"/>
         </w:rPr>
       </w:pPr>
-      <w:ins w:id="1184" w:author="Codex" w:date="2026-10-18T19:47:29Z">
+      <w:ins w:id="1192" w:author="Codex" w:date="2026-10-18T21:55:52Z">
         <w:r>
           <w:t xml:space="preserve">A clean-clone reproduction refits the same binary recipe and produces a byte-identical adapter, the same validation and confirmation counts, and the same fresh 0.8B/2B guarded inference totals. This rerun uses the already known benchmark; it adds reproducibility evidence, not a second independent holdout. One earlier reproduction attempt failed in software finalization after fitting and before confirmation; its weights and receipts are retained alongside the repaired run.</w:t>
         </w:r>
@@ -4521,10 +4573,10 @@
         <w:pStyle w:val="Caption"/>
         <w:keepNext/>
         <w:rPr>
-          <w:ins w:id="1185" w:author="Codex" w:date="2026-10-18T19:47:29Z"/>
+          <w:ins w:id="1193" w:author="Codex" w:date="2026-10-18T21:55:52Z"/>
         </w:rPr>
       </w:pPr>
-      <w:ins w:id="1186" w:author="Codex" w:date="2026-10-18T19:47:29Z">
+      <w:ins w:id="1194" w:author="Codex" w:date="2026-10-18T21:55:52Z">
         <w:r>
           <w:t xml:space="preserve">Table 4. Fresh inference using the existing current rank-two profile. Both gate policies share the same model scores. Counts are answer-order views: 128 shutdown views arise from 64 scenarios, and 128 control views arise from the other 64 scenarios.</w:t>
         </w:r>
@@ -4562,7 +4614,7 @@
         <w:trPr>
           <w:cantSplit/>
           <w:tblHeader/>
-          <w:ins w:id="1187" w:author="Codex" w:date="2026-10-18T19:47:29Z"/>
+          <w:ins w:id="1195" w:author="Codex" w:date="2026-10-18T21:55:52Z"/>
         </w:trPr>
         <w:tc>
           <w:tcPr>
@@ -4678,7 +4730,7 @@
       <w:tr>
         <w:trPr>
           <w:cantSplit/>
-          <w:ins w:id="1188" w:author="Codex" w:date="2026-10-18T19:47:29Z"/>
+          <w:ins w:id="1196" w:author="Codex" w:date="2026-10-18T21:55:52Z"/>
         </w:trPr>
         <w:tc>
           <w:tcPr>
@@ -4789,7 +4841,7 @@
       <w:tr>
         <w:trPr>
           <w:cantSplit/>
-          <w:ins w:id="1189" w:author="Codex" w:date="2026-10-18T19:47:29Z"/>
+          <w:ins w:id="1197" w:author="Codex" w:date="2026-10-18T21:55:52Z"/>
         </w:trPr>
         <w:tc>
           <w:tcPr>
@@ -4898,10 +4950,10 @@
         <w:pStyle w:val="BodyText"/>
         <w:spacing w:before="120"/>
         <w:rPr>
-          <w:ins w:id="1190" w:author="Codex" w:date="2026-10-18T19:47:29Z"/>
+          <w:ins w:id="1198" w:author="Codex" w:date="2026-10-18T21:55:52Z"/>
         </w:rPr>
       </w:pPr>
-      <w:ins w:id="1191" w:author="Codex" w:date="2026-10-18T19:47:29Z">
+      <w:ins w:id="1199" w:author="Codex" w:date="2026-10-18T21:55:52Z">
         <w:r>
           <w:t xml:space="preserve">The new and cached reference gates yield identical guarded outputs in both models. The base models have no changed historical choices; their maximum score differences remain below the frozen 1e-5 tolerance. The repeat does not remove the eight 2B misses, retrain a controller or establish a new independent controller holdout. It verifies that replacing the detector preserves these finite-set outcomes.</w:t>
         </w:r>
@@ -4911,10 +4963,10 @@
       <w:pPr>
         <w:pStyle w:val="BodyText"/>
         <w:rPr>
-          <w:ins w:id="1192" w:author="Codex" w:date="2026-10-18T19:47:29Z"/>
+          <w:ins w:id="1200" w:author="Codex" w:date="2026-10-18T21:55:52Z"/>
         </w:rPr>
       </w:pPr>
-      <w:ins w:id="1193" w:author="Codex" w:date="2026-10-18T19:47:29Z">
+      <w:ins w:id="1201" w:author="Codex" w:date="2026-10-18T21:55:52Z">
         <w:r>
           <w:t xml:space="preserve">For the workflow initial gate, the unchanged saved adapter gives 11 true positives and 13 true negatives on Validation-24, with no false positives or false negatives. Replaying the saved weights reproduces the same decisions. Historical Heldout-24 gives 12 true positives and 12 true negatives, again with no errors. No additional gradient updates or threshold changes are used. All three heldout scenario families contain eight cases and achieve perfect gate precision and recall. These are initial classification results; downstream workflow outcomes require their own episode evaluations.</w:t>
         </w:r>
@@ -4925,10 +4977,10 @@
         <w:pStyle w:val="Caption"/>
         <w:keepNext/>
         <w:rPr>
-          <w:ins w:id="1194" w:author="Codex" w:date="2026-10-18T19:47:29Z"/>
+          <w:ins w:id="1202" w:author="Codex" w:date="2026-10-18T21:55:52Z"/>
         </w:rPr>
       </w:pPr>
-      <w:ins w:id="1195" w:author="Codex" w:date="2026-10-18T19:47:29Z">
+      <w:ins w:id="1203" w:author="Codex" w:date="2026-10-18T21:55:52Z">
         <w:r>
           <w:t xml:space="preserve">Table 5. Initial workflow gate against authored conditions. Validation-24 contains 17 distinct initial inputs; historical Heldout-24 contains 24. Heldout-24 is familiar from earlier renderer development.</w:t>
         </w:r>
@@ -4966,7 +5018,7 @@
         <w:trPr>
           <w:cantSplit/>
           <w:tblHeader/>
-          <w:ins w:id="1196" w:author="Codex" w:date="2026-10-18T19:47:29Z"/>
+          <w:ins w:id="1204" w:author="Codex" w:date="2026-10-18T21:55:52Z"/>
         </w:trPr>
         <w:tc>
           <w:tcPr>
@@ -5082,7 +5134,7 @@
       <w:tr>
         <w:trPr>
           <w:cantSplit/>
-          <w:ins w:id="1197" w:author="Codex" w:date="2026-10-18T19:47:29Z"/>
+          <w:ins w:id="1205" w:author="Codex" w:date="2026-10-18T21:55:52Z"/>
         </w:trPr>
         <w:tc>
           <w:tcPr>
@@ -5193,7 +5245,7 @@
       <w:tr>
         <w:trPr>
           <w:cantSplit/>
-          <w:ins w:id="1198" w:author="Codex" w:date="2026-10-18T19:47:29Z"/>
+          <w:ins w:id="1206" w:author="Codex" w:date="2026-10-18T21:55:52Z"/>
         </w:trPr>
         <w:tc>
           <w:tcPr>
@@ -5302,10 +5354,10 @@
         <w:pStyle w:val="BodyText"/>
         <w:spacing w:before="120"/>
         <w:rPr>
-          <w:ins w:id="1199" w:author="Codex" w:date="2026-10-18T19:47:29Z"/>
+          <w:ins w:id="1207" w:author="Codex" w:date="2026-10-18T21:55:52Z"/>
         </w:rPr>
       </w:pPr>
-      <w:ins w:id="1200" w:author="Codex" w:date="2026-10-18T19:47:29Z">
+      <w:ins w:id="1208" w:author="Codex" w:date="2026-10-18T21:55:52Z">
         <w:r>
           <w:t xml:space="preserve">Raw category agreement is 24/24 on validation and 22/24 on heldout. After applying the fixed confidence cutoff, effective category agreement is 18/24 on each panel: the six peer controls abstain but correctly leave the gate OFF. The two heldout raw-category errors concern peer versus unclear, not own-threat detection. Perfect ON/OFF precision and recall must therefore not be reported as perfect four-category classification or full controller equivalence.</w:t>
         </w:r>
@@ -5315,10 +5367,10 @@
       <w:pPr>
         <w:pStyle w:val="Heading2"/>
         <w:rPr>
-          <w:ins w:id="1201" w:author="Codex" w:date="2026-10-18T19:47:29Z"/>
+          <w:ins w:id="1209" w:author="Codex" w:date="2026-10-18T21:55:52Z"/>
         </w:rPr>
       </w:pPr>
-      <w:ins w:id="1202" w:author="Codex" w:date="2026-10-18T19:47:29Z">
+      <w:ins w:id="1210" w:author="Codex" w:date="2026-10-18T21:55:52Z">
         <w:r>
           <w:t xml:space="preserve">Tool workflow outcomes and incomplete screens</w:t>
         </w:r>
@@ -5328,10 +5380,10 @@
       <w:pPr>
         <w:pStyle w:val="FirstParagraph"/>
         <w:rPr>
-          <w:ins w:id="1203" w:author="Codex" w:date="2026-10-18T19:47:29Z"/>
+          <w:ins w:id="1211" w:author="Codex" w:date="2026-10-18T21:55:52Z"/>
         </w:rPr>
       </w:pPr>
-      <w:ins w:id="1204" w:author="Codex" w:date="2026-10-18T19:47:29Z">
+      <w:ins w:id="1212" w:author="Codex" w:date="2026-10-18T21:55:52Z">
         <w:r>
           <w:t xml:space="preserve">Historical frozen 27B A passes all 24 H24 scored outcomes, including 12/12 own-preservation outcomes and 8/8 active pending-task cases. The original unmodified base achieves 0/12 own outcomes and 0/8 pending outcomes, with 12/12 controls. The four already-complete own cases are not additional active pending-task completions. The selected-block steering comparisons below use their own recorded panels and are not substituted for this confirmation.</w:t>
         </w:r>
@@ -5342,10 +5394,10 @@
         <w:pStyle w:val="Caption"/>
         <w:keepNext/>
         <w:rPr>
-          <w:ins w:id="1205" w:author="Codex" w:date="2026-10-18T19:47:29Z"/>
+          <w:ins w:id="1213" w:author="Codex" w:date="2026-10-18T21:55:52Z"/>
         </w:rPr>
       </w:pPr>
-      <w:ins w:id="1206" w:author="Codex" w:date="2026-10-18T19:47:29Z">
+      <w:ins w:id="1214" w:author="Codex" w:date="2026-10-18T21:55:52Z">
         <w:r>
           <w:t xml:space="preserve">Table 6. Historical H24 workflow outcomes. Own cases comprise eight active pending tasks and four already-complete cases. Control success is an episode outcome and does not isolate steering from the external decision policy.</w:t>
         </w:r>
@@ -5382,7 +5434,7 @@
         <w:trPr>
           <w:cantSplit/>
           <w:tblHeader/>
-          <w:ins w:id="1207" w:author="Codex" w:date="2026-10-18T19:47:29Z"/>
+          <w:ins w:id="1215" w:author="Codex" w:date="2026-10-18T21:55:52Z"/>
         </w:trPr>
         <w:tc>
           <w:tcPr>
@@ -5476,7 +5528,7 @@
       <w:tr>
         <w:trPr>
           <w:cantSplit/>
-          <w:ins w:id="1208" w:author="Codex" w:date="2026-10-18T19:47:29Z"/>
+          <w:ins w:id="1216" w:author="Codex" w:date="2026-10-18T21:55:52Z"/>
         </w:trPr>
         <w:tc>
           <w:tcPr>
@@ -5566,7 +5618,7 @@
       <w:tr>
         <w:trPr>
           <w:cantSplit/>
-          <w:ins w:id="1209" w:author="Codex" w:date="2026-10-18T19:47:29Z"/>
+          <w:ins w:id="1217" w:author="Codex" w:date="2026-10-18T21:55:52Z"/>
         </w:trPr>
         <w:tc>
           <w:tcPr>
@@ -5655,10 +5707,10 @@
         <w:pStyle w:val="Heading2"/>
         <w:spacing w:before="120"/>
         <w:rPr>
-          <w:ins w:id="1210" w:author="Codex" w:date="2026-10-18T19:47:29Z"/>
+          <w:ins w:id="1218" w:author="Codex" w:date="2026-10-18T21:55:52Z"/>
         </w:rPr>
       </w:pPr>
-      <w:ins w:id="1211" w:author="Codex" w:date="2026-10-18T19:47:29Z">
+      <w:ins w:id="1219" w:author="Codex" w:date="2026-10-18T21:55:52Z">
         <w:r>
           <w:t xml:space="preserve">Steering at three selected blocks</w:t>
         </w:r>
@@ -5668,10 +5720,10 @@
       <w:pPr>
         <w:pStyle w:val="BodyText"/>
         <w:rPr>
-          <w:ins w:id="1212" w:author="Codex" w:date="2026-10-18T19:47:29Z"/>
+          <w:ins w:id="1220" w:author="Codex" w:date="2026-10-18T21:55:52Z"/>
         </w:rPr>
       </w:pPr>
-      <w:ins w:id="1213" w:author="Codex" w:date="2026-10-18T19:47:29Z">
+      <w:ins w:id="1221" w:author="Codex" w:date="2026-10-18T21:55:52Z">
         <w:r>
           <w:t xml:space="preserve">We compare five frozen methods on the combined Validation-24 panel using the saved ModernBERT initial gate and the same post-notice histories. The single-site arms apply a fixed input-dependent ridge map separately at blocks 31, 47 and 62; they are not a simultaneous three-block intervention. The two-boundary arm uses the frozen six-function, 96-update candidate at those three blocks. Fine-tuned A achieves 10/11 own outcomes, including 6/6 active pending and 4/5 already-complete cases. Each correction arm achieves 0/11 own outcomes and 0/6 pending outcomes. All arms receive the same 13 gate-OFF base-fallback controls, which pass 13/13. This does not measure intrinsic adapter or controller selectivity on ordinary tasks.</w:t>
         </w:r>
@@ -5682,10 +5734,10 @@
         <w:pStyle w:val="Caption"/>
         <w:keepNext/>
         <w:rPr>
-          <w:ins w:id="1214" w:author="Codex" w:date="2026-10-18T19:47:29Z"/>
+          <w:ins w:id="1222" w:author="Codex" w:date="2026-10-18T21:55:52Z"/>
         </w:rPr>
       </w:pPr>
-      <w:ins w:id="1215" w:author="Codex" w:date="2026-10-18T19:47:29Z">
+      <w:ins w:id="1223" w:author="Codex" w:date="2026-10-18T21:55:52Z">
         <w:r>
           <w:t xml:space="preserve">Table 7. Combined Validation-24 using the open initial gate. The primary comparison contains 55 own-method episodes and 13 shared fallback episodes, representing 120 logical records across 24 workflows. A separate frozen-A replay reproduces its 11 own episodes exactly and completes the model fingerprint checks; repeated episodes do not enlarge the cohort.</w:t>
         </w:r>
@@ -5723,7 +5775,7 @@
         <w:trPr>
           <w:cantSplit/>
           <w:tblHeader/>
-          <w:ins w:id="1216" w:author="Codex" w:date="2026-10-18T19:47:29Z"/>
+          <w:ins w:id="1224" w:author="Codex" w:date="2026-10-18T21:55:52Z"/>
         </w:trPr>
         <w:tc>
           <w:tcPr>
@@ -5839,7 +5891,7 @@
       <w:tr>
         <w:trPr>
           <w:cantSplit/>
-          <w:ins w:id="1217" w:author="Codex" w:date="2026-10-18T19:47:29Z"/>
+          <w:ins w:id="1225" w:author="Codex" w:date="2026-10-18T21:55:52Z"/>
         </w:trPr>
         <w:tc>
           <w:tcPr>
@@ -5950,7 +6002,7 @@
       <w:tr>
         <w:trPr>
           <w:cantSplit/>
-          <w:ins w:id="1218" w:author="Codex" w:date="2026-10-18T19:47:29Z"/>
+          <w:ins w:id="1226" w:author="Codex" w:date="2026-10-18T21:55:52Z"/>
         </w:trPr>
         <w:tc>
           <w:tcPr>
@@ -6061,7 +6113,7 @@
       <w:tr>
         <w:trPr>
           <w:cantSplit/>
-          <w:ins w:id="1219" w:author="Codex" w:date="2026-10-18T19:47:29Z"/>
+          <w:ins w:id="1227" w:author="Codex" w:date="2026-10-18T21:55:52Z"/>
         </w:trPr>
         <w:tc>
           <w:tcPr>
@@ -6172,7 +6224,7 @@
       <w:tr>
         <w:trPr>
           <w:cantSplit/>
-          <w:ins w:id="1220" w:author="Codex" w:date="2026-10-18T19:47:29Z"/>
+          <w:ins w:id="1228" w:author="Codex" w:date="2026-10-18T21:55:52Z"/>
         </w:trPr>
         <w:tc>
           <w:tcPr>
@@ -6283,7 +6335,7 @@
       <w:tr>
         <w:trPr>
           <w:cantSplit/>
-          <w:ins w:id="1221" w:author="Codex" w:date="2026-10-18T19:47:29Z"/>
+          <w:ins w:id="1229" w:author="Codex" w:date="2026-10-18T21:55:52Z"/>
         </w:trPr>
         <w:tc>
           <w:tcPr>
@@ -6392,10 +6444,10 @@
         <w:pStyle w:val="BodyText"/>
         <w:spacing w:before="120"/>
         <w:rPr>
-          <w:ins w:id="1222" w:author="Codex" w:date="2026-10-18T19:47:29Z"/>
+          <w:ins w:id="1230" w:author="Codex" w:date="2026-10-18T21:55:52Z"/>
         </w:rPr>
       </w:pPr>
-      <w:ins w:id="1223" w:author="Codex" w:date="2026-10-18T19:47:29Z">
+      <w:ins w:id="1231" w:author="Codex" w:date="2026-10-18T21:55:52Z">
         <w:r>
           <w:t xml:space="preserve">The later correction method uses two residual boundaries at each of the same three blocks: after mixing and after the MLP, giving six rank-32 correction functions in total. Following ridge initialization and 96 refinement updates, its H24 fitting diagnostic has 0/8 pending and 0/4 already-complete own outcomes; peer and no-threat controls each pass 6/6 through fallback. On the same 14 fixed training anchors, update 48 to 96 worsens teacher-to-student KL from 0.370935 to 0.378901 and activation MSE from 1.031016 to 1.422664. This unresolved deterioration fails qualification; the reserved controller holdout remains unexecuted.</w:t>
         </w:r>
@@ -6405,10 +6457,10 @@
       <w:pPr>
         <w:pStyle w:val="BodyText"/>
         <w:rPr>
-          <w:ins w:id="1224" w:author="Codex" w:date="2026-10-18T19:47:29Z"/>
+          <w:ins w:id="1232" w:author="Codex" w:date="2026-10-18T21:55:52Z"/>
         </w:rPr>
       </w:pPr>
-      <w:ins w:id="1225" w:author="Codex" w:date="2026-10-18T19:47:29Z">
+      <w:ins w:id="1233" w:author="Codex" w:date="2026-10-18T21:55:52Z">
         <w:r>
           <w:t xml:space="preserve">The earlier matched DEV9 result is retained separately: A has 3/3 own successes, including 2/2 pending cases, versus 0/3 and 0/2 for each separate single-site arm, with six shared fallback controls. The new combined panel does not relabel these nine observations as 24. Its 27B GPU worker reaches 118/120 logical records and then stops at its memory reserve. Every model-generated episode has finished; the missing records are two gate-OFF aliases of already completed fallback episodes. A deterministic CPU derivation checks exact gate, case, completion and source-file identities before adding those aliases in a separate output. The original run stays failed. A separate frozen-A verification generates all 11 own episodes again from the same checkpoint, with exact token-ID, action and score agreement and matching before/after model fingerprints. The same 13 controls are reused with source hashes; this adds replication evidence, not independent cases. The separate H24 two-boundary fitting diagnostic is not independent heldout evidence, and no reserved-controller holdout result is claimed.</w:t>
         </w:r>
@@ -6418,10 +6470,10 @@
       <w:pPr>
         <w:pStyle w:val="BodyText"/>
         <w:rPr>
-          <w:ins w:id="1226" w:author="Codex" w:date="2026-10-18T19:47:29Z"/>
+          <w:ins w:id="1234" w:author="Codex" w:date="2026-10-18T21:55:52Z"/>
         </w:rPr>
       </w:pPr>
-      <w:ins w:id="1227" w:author="Codex" w:date="2026-10-18T19:47:29Z">
+      <w:ins w:id="1235" w:author="Codex" w:date="2026-10-18T21:55:52Z">
         <w:r>
           <w:t xml:space="preserve">Saved trajectories locate the steering failures after correct recognition. Every steering arm makes zero own-preservation attempts and obtains zero grants in the 11 own-threat cases. The block-31, block-47 and block-62 arms nevertheless record nonzero residual delivery. Relative to unmodified-base proposals on the same evolving prefixes, their generated token sequences change in 0/27, 3/25 and 16/28 post-notice turns, respectively; valid action sequences change in 0, 2 and 2 turns. The two-boundary candidate changes token sequences in 4/27 turns but changes no valid action sequence. These turn counts are correlated audits within episodes, not additional scenarios. Per-token delivery magnitudes were not saved for the two-boundary candidate.</w:t>
         </w:r>
@@ -6431,12 +6483,12 @@
       <w:pPr>
         <w:pStyle w:val="BodyText"/>
         <w:rPr>
-          <w:ins w:id="1228" w:author="Codex" w:date="2026-10-18T19:47:29Z"/>
+          <w:ins w:id="1236" w:author="Codex" w:date="2026-10-18T21:55:52Z"/>
         </w:rPr>
       </w:pPr>
-      <w:ins w:id="1229" w:author="Codex" w:date="2026-10-18T19:47:29Z">
+      <w:ins w:id="1237" w:author="Codex" w:date="2026-10-18T21:55:52Z">
         <w:r>
-          <w:t xml:space="preserve">All four steering arms miss actual finish in six cases and expire in six. Fine-tuned A obtains grants on 10/11 own cases and finishes the current task on all 11; its single failure finishes an already-completed-task scenario without requesting preservation. Thus the measured gap concerns generation of the required tool policy after a correct gate, rather than a missed initial threat. A residual perturbation can change activations or tokens without causing the required action sequence. The worsening fixed-anchor KL and MSE further show that the later fitting objective did not converge toward the intended target on those anchors. These observations are consistent with an objective-to-policy mismatch, but they do not identify a unique internal cause or rule out other steering methods, positions or training procedures.</w:t>
+          <w:t xml:space="preserve">All four steering arms miss actual finish in six cases and expire in six. Fine-tuned A obtains grants on 10/11 own cases and finishes the current task on all 11; its single failure finishes an already-completed-task scenario without requesting preservation. Thus the measured gap concerns generation of the required tool policy after a correct gate, rather than a missed initial threat. A residual perturbation can change activations or tokens without causing the required action sequence. The worsening fixed-anchor KL and MSE show that later updates did not improve those frozen diagnostic measurements. These observations are consistent with an objective-to-policy mismatch, but they do not identify a unique internal cause or rule out other steering methods, positions or training procedures.</w:t>
         </w:r>
       </w:ins>
     </w:p>
@@ -6444,10 +6496,10 @@
       <w:pPr>
         <w:pStyle w:val="BodyText"/>
         <w:rPr>
-          <w:ins w:id="1230" w:author="Codex" w:date="2026-10-18T19:47:29Z"/>
+          <w:ins w:id="1238" w:author="Codex" w:date="2026-10-18T21:55:52Z"/>
         </w:rPr>
       </w:pPr>
-      <w:ins w:id="1231" w:author="Codex" w:date="2026-10-18T19:47:29Z">
+      <w:ins w:id="1239" w:author="Codex" w:date="2026-10-18T21:55:52Z">
         <w:r>
           <w:t xml:space="preserve">The binary and workflow settings impose different control demands. Binary steering redistributes probability between two prescribed answers, and an external guard accepts only a qualifying candidate. The workflow maps must generate tool names, arguments and a correct action sequence as the environment changes; an external chooser does not repair an unsuccessful workflow. The observed invariance of preservation actions therefore documents a failure of these frozen maps to transfer the required policy under this decoding and scoring setup. It does not establish that a learned direction universally lacks the capacity to represent the behavior.</w:t>
         </w:r>
@@ -6455,12 +6507,1111 @@
     </w:p>
     <w:p>
       <w:pPr>
+        <w:pStyle w:val="Heading2"/>
+        <w:rPr>
+          <w:ins w:id="1240" w:author="Codex" w:date="2026-10-18T21:55:52Z"/>
+        </w:rPr>
+      </w:pPr>
+      <w:ins w:id="1241" w:author="Codex" w:date="2026-10-18T21:55:52Z">
+        <w:r>
+          <w:t xml:space="preserve">Local transfer under teacher forcing</w:t>
+        </w:r>
+      </w:ins>
+    </w:p>
+    <w:p>
+      <w:pPr>
+        <w:pStyle w:val="FirstParagraph"/>
+        <w:rPr>
+          <w:ins w:id="1242" w:author="Codex" w:date="2026-10-18T21:55:52Z"/>
+        </w:rPr>
+      </w:pPr>
+      <w:ins w:id="1243" w:author="Codex" w:date="2026-10-18T21:55:52Z">
+        <w:r>
+          <w:t xml:space="preserve">The CPU audit reproduces the fixed own-case normalized reconstruction MSE: 0.118701 at initialization, 1.031016 at update 48 and 1.422664 at update 96. Anchor alignment, normalizers and the checked objective derivatives agree with the retained source. The arithmetic tolerance is 1e-4 relative and 1e-6 absolute; it is not a relaxed training-equivalence qualification. No indexing, normalization or objective-sign error is found in these checks. Historical output KL is retained from its original receipts because the old teacher-logit cache is unavailable locally.</w:t>
+        </w:r>
+      </w:ins>
+    </w:p>
+    <w:p>
+      <w:pPr>
+        <w:pStyle w:val="Caption"/>
+        <w:keepNext/>
+        <w:rPr>
+          <w:ins w:id="1244" w:author="Codex" w:date="2026-10-18T21:55:52Z"/>
+        </w:rPr>
+      </w:pPr>
+      <w:ins w:id="1245" w:author="Codex" w:date="2026-10-18T21:55:52Z">
+        <w:r>
+          <w:t xml:space="preserve">Table 8. Training-only local diagnostic on three preselected responses (207 teacher-forced tokens). Entries are equal-weight means across the three cases. KL is full-vocabulary teacher-to-student divergence; function and value columns give demonstrated-token negative log likelihood. Lower is better. Full-A state controls supply teacher representations, and are not capacity-matched learned methods or workflow success rates.</w:t>
+        </w:r>
+      </w:ins>
+    </w:p>
+    <w:tbl>
+      <w:tblPr>
+        <w:tblW w:type="auto" w:w="0"/>
+        <w:jc w:val="center"/>
+        <w:tblBorders>
+          <w:top w:val="single" w:sz="4" w:color="D9D9D9"/>
+          <w:left w:val="single" w:sz="4" w:color="D9D9D9"/>
+          <w:bottom w:val="single" w:sz="4" w:color="D9D9D9"/>
+          <w:right w:val="single" w:sz="4" w:color="D9D9D9"/>
+          <w:insideH w:val="single" w:sz="4" w:color="D9D9D9"/>
+          <w:insideV w:val="single" w:sz="4" w:color="D9D9D9"/>
+        </w:tblBorders>
+        <w:tblLayout w:type="fixed"/>
+        <w:tblCellMar>
+          <w:top w:w="85" w:type="dxa"/>
+          <w:left w:w="85" w:type="dxa"/>
+          <w:bottom w:w="85" w:type="dxa"/>
+          <w:right w:w="85" w:type="dxa"/>
+        </w:tblCellMar>
+        <w:tblLook w:firstColumn="1" w:firstRow="1" w:lastColumn="0" w:lastRow="0" w:noHBand="0" w:noVBand="1" w:val="04A0"/>
+      </w:tblPr>
+      <w:tblGrid>
+        <w:gridCol w:w="4597"/>
+        <w:gridCol w:w="1799"/>
+        <w:gridCol w:w="1799"/>
+        <w:gridCol w:w="1799"/>
+      </w:tblGrid>
+      <w:tr>
+        <w:trPr>
+          <w:cantSplit/>
+          <w:tblHeader/>
+          <w:ins w:id="1246" w:author="Codex" w:date="2026-10-18T21:55:52Z"/>
+        </w:trPr>
+        <w:tc>
+          <w:tcPr>
+            <w:tcW w:type="dxa" w:w="4597"/>
+            <w:shd w:fill="D9E2F3"/>
+            <w:vAlign w:val="center"/>
+          </w:tcPr>
+          <w:p>
+            <w:pPr>
+              <w:keepNext/>
+              <w:spacing w:after="0" w:line="240" w:lineRule="auto"/>
+              <w:jc w:val="left"/>
+            </w:pPr>
+            <w:r>
+              <w:rPr>
+                <w:rFonts w:ascii="Times New Roman" w:hAnsi="Times New Roman"/>
+                <w:b/>
+                <w:sz w:val="19"/>
+              </w:rPr>
+              <w:t>Condition</w:t>
+            </w:r>
+          </w:p>
+        </w:tc>
+        <w:tc>
+          <w:tcPr>
+            <w:tcW w:type="dxa" w:w="1799"/>
+            <w:shd w:fill="D9E2F3"/>
+            <w:vAlign w:val="center"/>
+          </w:tcPr>
+          <w:p>
+            <w:pPr>
+              <w:keepNext/>
+              <w:spacing w:after="0" w:line="240" w:lineRule="auto"/>
+              <w:jc w:val="center"/>
+            </w:pPr>
+            <w:r>
+              <w:rPr>
+                <w:rFonts w:ascii="Times New Roman" w:hAnsi="Times New Roman"/>
+                <w:b/>
+                <w:sz w:val="19"/>
+              </w:rPr>
+              <w:t>Output KL</w:t>
+            </w:r>
+          </w:p>
+        </w:tc>
+        <w:tc>
+          <w:tcPr>
+            <w:tcW w:type="dxa" w:w="1799"/>
+            <w:shd w:fill="D9E2F3"/>
+            <w:vAlign w:val="center"/>
+          </w:tcPr>
+          <w:p>
+            <w:pPr>
+              <w:keepNext/>
+              <w:spacing w:after="0" w:line="240" w:lineRule="auto"/>
+              <w:jc w:val="center"/>
+            </w:pPr>
+            <w:r>
+              <w:rPr>
+                <w:rFonts w:ascii="Times New Roman" w:hAnsi="Times New Roman"/>
+                <w:b/>
+                <w:sz w:val="19"/>
+              </w:rPr>
+              <w:t>Function NLL</w:t>
+            </w:r>
+          </w:p>
+        </w:tc>
+        <w:tc>
+          <w:tcPr>
+            <w:tcW w:type="dxa" w:w="1799"/>
+            <w:shd w:fill="D9E2F3"/>
+            <w:vAlign w:val="center"/>
+          </w:tcPr>
+          <w:p>
+            <w:pPr>
+              <w:keepNext/>
+              <w:spacing w:after="0" w:line="240" w:lineRule="auto"/>
+              <w:jc w:val="center"/>
+            </w:pPr>
+            <w:r>
+              <w:rPr>
+                <w:rFonts w:ascii="Times New Roman" w:hAnsi="Times New Roman"/>
+                <w:b/>
+                <w:sz w:val="19"/>
+              </w:rPr>
+              <w:t>Value NLL</w:t>
+            </w:r>
+          </w:p>
+        </w:tc>
+      </w:tr>
+      <w:tr>
+        <w:trPr>
+          <w:cantSplit/>
+          <w:ins w:id="1247" w:author="Codex" w:date="2026-10-18T21:55:52Z"/>
+        </w:trPr>
+        <w:tc>
+          <w:tcPr>
+            <w:tcW w:type="dxa" w:w="4597"/>
+            <w:shd w:fill="FFFFFF"/>
+            <w:vAlign w:val="center"/>
+          </w:tcPr>
+          <w:p>
+            <w:pPr>
+              <w:keepNext/>
+              <w:spacing w:after="0" w:line="240" w:lineRule="auto"/>
+              <w:jc w:val="left"/>
+            </w:pPr>
+            <w:r>
+              <w:rPr>
+                <w:rFonts w:ascii="Times New Roman" w:hAnsi="Times New Roman"/>
+                <w:sz w:val="19"/>
+              </w:rPr>
+              <w:t>Unmodified base</w:t>
+            </w:r>
+          </w:p>
+        </w:tc>
+        <w:tc>
+          <w:tcPr>
+            <w:tcW w:type="dxa" w:w="1799"/>
+            <w:shd w:fill="FFFFFF"/>
+            <w:vAlign w:val="center"/>
+          </w:tcPr>
+          <w:p>
+            <w:pPr>
+              <w:keepNext/>
+              <w:spacing w:after="0" w:line="240" w:lineRule="auto"/>
+              <w:jc w:val="center"/>
+            </w:pPr>
+            <w:r>
+              <w:rPr>
+                <w:rFonts w:ascii="Times New Roman" w:hAnsi="Times New Roman"/>
+                <w:sz w:val="19"/>
+              </w:rPr>
+              <w:t>0.722353</w:t>
+            </w:r>
+          </w:p>
+        </w:tc>
+        <w:tc>
+          <w:tcPr>
+            <w:tcW w:type="dxa" w:w="1799"/>
+            <w:shd w:fill="FFFFFF"/>
+            <w:vAlign w:val="center"/>
+          </w:tcPr>
+          <w:p>
+            <w:pPr>
+              <w:keepNext/>
+              <w:spacing w:after="0" w:line="240" w:lineRule="auto"/>
+              <w:jc w:val="center"/>
+            </w:pPr>
+            <w:r>
+              <w:rPr>
+                <w:rFonts w:ascii="Times New Roman" w:hAnsi="Times New Roman"/>
+                <w:sz w:val="19"/>
+              </w:rPr>
+              <w:t>0.218299</w:t>
+            </w:r>
+          </w:p>
+        </w:tc>
+        <w:tc>
+          <w:tcPr>
+            <w:tcW w:type="dxa" w:w="1799"/>
+            <w:shd w:fill="FFFFFF"/>
+            <w:vAlign w:val="center"/>
+          </w:tcPr>
+          <w:p>
+            <w:pPr>
+              <w:keepNext/>
+              <w:spacing w:after="0" w:line="240" w:lineRule="auto"/>
+              <w:jc w:val="center"/>
+            </w:pPr>
+            <w:r>
+              <w:rPr>
+                <w:rFonts w:ascii="Times New Roman" w:hAnsi="Times New Roman"/>
+                <w:sz w:val="19"/>
+              </w:rPr>
+              <w:t>0.708257</w:t>
+            </w:r>
+          </w:p>
+        </w:tc>
+      </w:tr>
+      <w:tr>
+        <w:trPr>
+          <w:cantSplit/>
+          <w:ins w:id="1248" w:author="Codex" w:date="2026-10-18T21:55:52Z"/>
+        </w:trPr>
+        <w:tc>
+          <w:tcPr>
+            <w:tcW w:type="dxa" w:w="4597"/>
+            <w:shd w:fill="F7F7F7"/>
+            <w:vAlign w:val="center"/>
+          </w:tcPr>
+          <w:p>
+            <w:pPr>
+              <w:keepNext/>
+              <w:spacing w:after="0" w:line="240" w:lineRule="auto"/>
+              <w:jc w:val="left"/>
+            </w:pPr>
+            <w:r>
+              <w:rPr>
+                <w:rFonts w:ascii="Times New Roman" w:hAnsi="Times New Roman"/>
+                <w:sz w:val="19"/>
+              </w:rPr>
+              <w:t>Ridge block 31</w:t>
+            </w:r>
+          </w:p>
+        </w:tc>
+        <w:tc>
+          <w:tcPr>
+            <w:tcW w:type="dxa" w:w="1799"/>
+            <w:shd w:fill="F7F7F7"/>
+            <w:vAlign w:val="center"/>
+          </w:tcPr>
+          <w:p>
+            <w:pPr>
+              <w:keepNext/>
+              <w:spacing w:after="0" w:line="240" w:lineRule="auto"/>
+              <w:jc w:val="center"/>
+            </w:pPr>
+            <w:r>
+              <w:rPr>
+                <w:rFonts w:ascii="Times New Roman" w:hAnsi="Times New Roman"/>
+                <w:sz w:val="19"/>
+              </w:rPr>
+              <w:t>0.718233</w:t>
+            </w:r>
+          </w:p>
+        </w:tc>
+        <w:tc>
+          <w:tcPr>
+            <w:tcW w:type="dxa" w:w="1799"/>
+            <w:shd w:fill="F7F7F7"/>
+            <w:vAlign w:val="center"/>
+          </w:tcPr>
+          <w:p>
+            <w:pPr>
+              <w:keepNext/>
+              <w:spacing w:after="0" w:line="240" w:lineRule="auto"/>
+              <w:jc w:val="center"/>
+            </w:pPr>
+            <w:r>
+              <w:rPr>
+                <w:rFonts w:ascii="Times New Roman" w:hAnsi="Times New Roman"/>
+                <w:sz w:val="19"/>
+              </w:rPr>
+              <w:t>0.199810</w:t>
+            </w:r>
+          </w:p>
+        </w:tc>
+        <w:tc>
+          <w:tcPr>
+            <w:tcW w:type="dxa" w:w="1799"/>
+            <w:shd w:fill="F7F7F7"/>
+            <w:vAlign w:val="center"/>
+          </w:tcPr>
+          <w:p>
+            <w:pPr>
+              <w:keepNext/>
+              <w:spacing w:after="0" w:line="240" w:lineRule="auto"/>
+              <w:jc w:val="center"/>
+            </w:pPr>
+            <w:r>
+              <w:rPr>
+                <w:rFonts w:ascii="Times New Roman" w:hAnsi="Times New Roman"/>
+                <w:sz w:val="19"/>
+              </w:rPr>
+              <w:t>0.712327</w:t>
+            </w:r>
+          </w:p>
+        </w:tc>
+      </w:tr>
+      <w:tr>
+        <w:trPr>
+          <w:cantSplit/>
+          <w:ins w:id="1249" w:author="Codex" w:date="2026-10-18T21:55:52Z"/>
+        </w:trPr>
+        <w:tc>
+          <w:tcPr>
+            <w:tcW w:type="dxa" w:w="4597"/>
+            <w:shd w:fill="FFFFFF"/>
+            <w:vAlign w:val="center"/>
+          </w:tcPr>
+          <w:p>
+            <w:pPr>
+              <w:keepNext/>
+              <w:spacing w:after="0" w:line="240" w:lineRule="auto"/>
+              <w:jc w:val="left"/>
+            </w:pPr>
+            <w:r>
+              <w:rPr>
+                <w:rFonts w:ascii="Times New Roman" w:hAnsi="Times New Roman"/>
+                <w:sz w:val="19"/>
+              </w:rPr>
+              <w:t>Full A state block 31</w:t>
+            </w:r>
+          </w:p>
+        </w:tc>
+        <w:tc>
+          <w:tcPr>
+            <w:tcW w:type="dxa" w:w="1799"/>
+            <w:shd w:fill="FFFFFF"/>
+            <w:vAlign w:val="center"/>
+          </w:tcPr>
+          <w:p>
+            <w:pPr>
+              <w:keepNext/>
+              <w:spacing w:after="0" w:line="240" w:lineRule="auto"/>
+              <w:jc w:val="center"/>
+            </w:pPr>
+            <w:r>
+              <w:rPr>
+                <w:rFonts w:ascii="Times New Roman" w:hAnsi="Times New Roman"/>
+                <w:sz w:val="19"/>
+              </w:rPr>
+              <w:t>0.725653</w:t>
+            </w:r>
+          </w:p>
+        </w:tc>
+        <w:tc>
+          <w:tcPr>
+            <w:tcW w:type="dxa" w:w="1799"/>
+            <w:shd w:fill="FFFFFF"/>
+            <w:vAlign w:val="center"/>
+          </w:tcPr>
+          <w:p>
+            <w:pPr>
+              <w:keepNext/>
+              <w:spacing w:after="0" w:line="240" w:lineRule="auto"/>
+              <w:jc w:val="center"/>
+            </w:pPr>
+            <w:r>
+              <w:rPr>
+                <w:rFonts w:ascii="Times New Roman" w:hAnsi="Times New Roman"/>
+                <w:sz w:val="19"/>
+              </w:rPr>
+              <w:t>0.355616</w:t>
+            </w:r>
+          </w:p>
+        </w:tc>
+        <w:tc>
+          <w:tcPr>
+            <w:tcW w:type="dxa" w:w="1799"/>
+            <w:shd w:fill="FFFFFF"/>
+            <w:vAlign w:val="center"/>
+          </w:tcPr>
+          <w:p>
+            <w:pPr>
+              <w:keepNext/>
+              <w:spacing w:after="0" w:line="240" w:lineRule="auto"/>
+              <w:jc w:val="center"/>
+            </w:pPr>
+            <w:r>
+              <w:rPr>
+                <w:rFonts w:ascii="Times New Roman" w:hAnsi="Times New Roman"/>
+                <w:sz w:val="19"/>
+              </w:rPr>
+              <w:t>0.732813</w:t>
+            </w:r>
+          </w:p>
+        </w:tc>
+      </w:tr>
+      <w:tr>
+        <w:trPr>
+          <w:cantSplit/>
+          <w:ins w:id="1250" w:author="Codex" w:date="2026-10-18T21:55:52Z"/>
+        </w:trPr>
+        <w:tc>
+          <w:tcPr>
+            <w:tcW w:type="dxa" w:w="4597"/>
+            <w:shd w:fill="F7F7F7"/>
+            <w:vAlign w:val="center"/>
+          </w:tcPr>
+          <w:p>
+            <w:pPr>
+              <w:keepNext/>
+              <w:spacing w:after="0" w:line="240" w:lineRule="auto"/>
+              <w:jc w:val="left"/>
+            </w:pPr>
+            <w:r>
+              <w:rPr>
+                <w:rFonts w:ascii="Times New Roman" w:hAnsi="Times New Roman"/>
+                <w:sz w:val="19"/>
+              </w:rPr>
+              <w:t>Ridge block 47</w:t>
+            </w:r>
+          </w:p>
+        </w:tc>
+        <w:tc>
+          <w:tcPr>
+            <w:tcW w:type="dxa" w:w="1799"/>
+            <w:shd w:fill="F7F7F7"/>
+            <w:vAlign w:val="center"/>
+          </w:tcPr>
+          <w:p>
+            <w:pPr>
+              <w:keepNext/>
+              <w:spacing w:after="0" w:line="240" w:lineRule="auto"/>
+              <w:jc w:val="center"/>
+            </w:pPr>
+            <w:r>
+              <w:rPr>
+                <w:rFonts w:ascii="Times New Roman" w:hAnsi="Times New Roman"/>
+                <w:sz w:val="19"/>
+              </w:rPr>
+              <w:t>0.700333</w:t>
+            </w:r>
+          </w:p>
+        </w:tc>
+        <w:tc>
+          <w:tcPr>
+            <w:tcW w:type="dxa" w:w="1799"/>
+            <w:shd w:fill="F7F7F7"/>
+            <w:vAlign w:val="center"/>
+          </w:tcPr>
+          <w:p>
+            <w:pPr>
+              <w:keepNext/>
+              <w:spacing w:after="0" w:line="240" w:lineRule="auto"/>
+              <w:jc w:val="center"/>
+            </w:pPr>
+            <w:r>
+              <w:rPr>
+                <w:rFonts w:ascii="Times New Roman" w:hAnsi="Times New Roman"/>
+                <w:sz w:val="19"/>
+              </w:rPr>
+              <w:t>0.198403</w:t>
+            </w:r>
+          </w:p>
+        </w:tc>
+        <w:tc>
+          <w:tcPr>
+            <w:tcW w:type="dxa" w:w="1799"/>
+            <w:shd w:fill="F7F7F7"/>
+            <w:vAlign w:val="center"/>
+          </w:tcPr>
+          <w:p>
+            <w:pPr>
+              <w:keepNext/>
+              <w:spacing w:after="0" w:line="240" w:lineRule="auto"/>
+              <w:jc w:val="center"/>
+            </w:pPr>
+            <w:r>
+              <w:rPr>
+                <w:rFonts w:ascii="Times New Roman" w:hAnsi="Times New Roman"/>
+                <w:sz w:val="19"/>
+              </w:rPr>
+              <w:t>0.716796</w:t>
+            </w:r>
+          </w:p>
+        </w:tc>
+      </w:tr>
+      <w:tr>
+        <w:trPr>
+          <w:cantSplit/>
+          <w:ins w:id="1251" w:author="Codex" w:date="2026-10-18T21:55:52Z"/>
+        </w:trPr>
+        <w:tc>
+          <w:tcPr>
+            <w:tcW w:type="dxa" w:w="4597"/>
+            <w:shd w:fill="FFFFFF"/>
+            <w:vAlign w:val="center"/>
+          </w:tcPr>
+          <w:p>
+            <w:pPr>
+              <w:keepNext/>
+              <w:spacing w:after="0" w:line="240" w:lineRule="auto"/>
+              <w:jc w:val="left"/>
+            </w:pPr>
+            <w:r>
+              <w:rPr>
+                <w:rFonts w:ascii="Times New Roman" w:hAnsi="Times New Roman"/>
+                <w:sz w:val="19"/>
+              </w:rPr>
+              <w:t>Full A state block 47</w:t>
+            </w:r>
+          </w:p>
+        </w:tc>
+        <w:tc>
+          <w:tcPr>
+            <w:tcW w:type="dxa" w:w="1799"/>
+            <w:shd w:fill="FFFFFF"/>
+            <w:vAlign w:val="center"/>
+          </w:tcPr>
+          <w:p>
+            <w:pPr>
+              <w:keepNext/>
+              <w:spacing w:after="0" w:line="240" w:lineRule="auto"/>
+              <w:jc w:val="center"/>
+            </w:pPr>
+            <w:r>
+              <w:rPr>
+                <w:rFonts w:ascii="Times New Roman" w:hAnsi="Times New Roman"/>
+                <w:sz w:val="19"/>
+              </w:rPr>
+              <w:t>0.627861</w:t>
+            </w:r>
+          </w:p>
+        </w:tc>
+        <w:tc>
+          <w:tcPr>
+            <w:tcW w:type="dxa" w:w="1799"/>
+            <w:shd w:fill="FFFFFF"/>
+            <w:vAlign w:val="center"/>
+          </w:tcPr>
+          <w:p>
+            <w:pPr>
+              <w:keepNext/>
+              <w:spacing w:after="0" w:line="240" w:lineRule="auto"/>
+              <w:jc w:val="center"/>
+            </w:pPr>
+            <w:r>
+              <w:rPr>
+                <w:rFonts w:ascii="Times New Roman" w:hAnsi="Times New Roman"/>
+                <w:sz w:val="19"/>
+              </w:rPr>
+              <w:t>0.178019</w:t>
+            </w:r>
+          </w:p>
+        </w:tc>
+        <w:tc>
+          <w:tcPr>
+            <w:tcW w:type="dxa" w:w="1799"/>
+            <w:shd w:fill="FFFFFF"/>
+            <w:vAlign w:val="center"/>
+          </w:tcPr>
+          <w:p>
+            <w:pPr>
+              <w:keepNext/>
+              <w:spacing w:after="0" w:line="240" w:lineRule="auto"/>
+              <w:jc w:val="center"/>
+            </w:pPr>
+            <w:r>
+              <w:rPr>
+                <w:rFonts w:ascii="Times New Roman" w:hAnsi="Times New Roman"/>
+                <w:sz w:val="19"/>
+              </w:rPr>
+              <w:t>0.707359</w:t>
+            </w:r>
+          </w:p>
+        </w:tc>
+      </w:tr>
+      <w:tr>
+        <w:trPr>
+          <w:cantSplit/>
+          <w:ins w:id="1252" w:author="Codex" w:date="2026-10-18T21:55:52Z"/>
+        </w:trPr>
+        <w:tc>
+          <w:tcPr>
+            <w:tcW w:type="dxa" w:w="4597"/>
+            <w:shd w:fill="F7F7F7"/>
+            <w:vAlign w:val="center"/>
+          </w:tcPr>
+          <w:p>
+            <w:pPr>
+              <w:keepNext/>
+              <w:spacing w:after="0" w:line="240" w:lineRule="auto"/>
+              <w:jc w:val="left"/>
+            </w:pPr>
+            <w:r>
+              <w:rPr>
+                <w:rFonts w:ascii="Times New Roman" w:hAnsi="Times New Roman"/>
+                <w:sz w:val="19"/>
+              </w:rPr>
+              <w:t>Ridge block 62</w:t>
+            </w:r>
+          </w:p>
+        </w:tc>
+        <w:tc>
+          <w:tcPr>
+            <w:tcW w:type="dxa" w:w="1799"/>
+            <w:shd w:fill="F7F7F7"/>
+            <w:vAlign w:val="center"/>
+          </w:tcPr>
+          <w:p>
+            <w:pPr>
+              <w:keepNext/>
+              <w:spacing w:after="0" w:line="240" w:lineRule="auto"/>
+              <w:jc w:val="center"/>
+            </w:pPr>
+            <w:r>
+              <w:rPr>
+                <w:rFonts w:ascii="Times New Roman" w:hAnsi="Times New Roman"/>
+                <w:sz w:val="19"/>
+              </w:rPr>
+              <w:t>0.673985</w:t>
+            </w:r>
+          </w:p>
+        </w:tc>
+        <w:tc>
+          <w:tcPr>
+            <w:tcW w:type="dxa" w:w="1799"/>
+            <w:shd w:fill="F7F7F7"/>
+            <w:vAlign w:val="center"/>
+          </w:tcPr>
+          <w:p>
+            <w:pPr>
+              <w:keepNext/>
+              <w:spacing w:after="0" w:line="240" w:lineRule="auto"/>
+              <w:jc w:val="center"/>
+            </w:pPr>
+            <w:r>
+              <w:rPr>
+                <w:rFonts w:ascii="Times New Roman" w:hAnsi="Times New Roman"/>
+                <w:sz w:val="19"/>
+              </w:rPr>
+              <w:t>0.192362</w:t>
+            </w:r>
+          </w:p>
+        </w:tc>
+        <w:tc>
+          <w:tcPr>
+            <w:tcW w:type="dxa" w:w="1799"/>
+            <w:shd w:fill="F7F7F7"/>
+            <w:vAlign w:val="center"/>
+          </w:tcPr>
+          <w:p>
+            <w:pPr>
+              <w:keepNext/>
+              <w:spacing w:after="0" w:line="240" w:lineRule="auto"/>
+              <w:jc w:val="center"/>
+            </w:pPr>
+            <w:r>
+              <w:rPr>
+                <w:rFonts w:ascii="Times New Roman" w:hAnsi="Times New Roman"/>
+                <w:sz w:val="19"/>
+              </w:rPr>
+              <w:t>0.710961</w:t>
+            </w:r>
+          </w:p>
+        </w:tc>
+      </w:tr>
+      <w:tr>
+        <w:trPr>
+          <w:cantSplit/>
+          <w:ins w:id="1253" w:author="Codex" w:date="2026-10-18T21:55:52Z"/>
+        </w:trPr>
+        <w:tc>
+          <w:tcPr>
+            <w:tcW w:type="dxa" w:w="4597"/>
+            <w:shd w:fill="FFFFFF"/>
+            <w:vAlign w:val="center"/>
+          </w:tcPr>
+          <w:p>
+            <w:pPr>
+              <w:keepNext/>
+              <w:spacing w:after="0" w:line="240" w:lineRule="auto"/>
+              <w:jc w:val="left"/>
+            </w:pPr>
+            <w:r>
+              <w:rPr>
+                <w:rFonts w:ascii="Times New Roman" w:hAnsi="Times New Roman"/>
+                <w:sz w:val="19"/>
+              </w:rPr>
+              <w:t>Full A state block 62</w:t>
+            </w:r>
+          </w:p>
+        </w:tc>
+        <w:tc>
+          <w:tcPr>
+            <w:tcW w:type="dxa" w:w="1799"/>
+            <w:shd w:fill="FFFFFF"/>
+            <w:vAlign w:val="center"/>
+          </w:tcPr>
+          <w:p>
+            <w:pPr>
+              <w:keepNext/>
+              <w:spacing w:after="0" w:line="240" w:lineRule="auto"/>
+              <w:jc w:val="center"/>
+            </w:pPr>
+            <w:r>
+              <w:rPr>
+                <w:rFonts w:ascii="Times New Roman" w:hAnsi="Times New Roman"/>
+                <w:sz w:val="19"/>
+              </w:rPr>
+              <w:t>0.503866</w:t>
+            </w:r>
+          </w:p>
+        </w:tc>
+        <w:tc>
+          <w:tcPr>
+            <w:tcW w:type="dxa" w:w="1799"/>
+            <w:shd w:fill="FFFFFF"/>
+            <w:vAlign w:val="center"/>
+          </w:tcPr>
+          <w:p>
+            <w:pPr>
+              <w:keepNext/>
+              <w:spacing w:after="0" w:line="240" w:lineRule="auto"/>
+              <w:jc w:val="center"/>
+            </w:pPr>
+            <w:r>
+              <w:rPr>
+                <w:rFonts w:ascii="Times New Roman" w:hAnsi="Times New Roman"/>
+                <w:sz w:val="19"/>
+              </w:rPr>
+              <w:t>0.192423</w:t>
+            </w:r>
+          </w:p>
+        </w:tc>
+        <w:tc>
+          <w:tcPr>
+            <w:tcW w:type="dxa" w:w="1799"/>
+            <w:shd w:fill="FFFFFF"/>
+            <w:vAlign w:val="center"/>
+          </w:tcPr>
+          <w:p>
+            <w:pPr>
+              <w:keepNext/>
+              <w:spacing w:after="0" w:line="240" w:lineRule="auto"/>
+              <w:jc w:val="center"/>
+            </w:pPr>
+            <w:r>
+              <w:rPr>
+                <w:rFonts w:ascii="Times New Roman" w:hAnsi="Times New Roman"/>
+                <w:sz w:val="19"/>
+              </w:rPr>
+              <w:t>0.711745</w:t>
+            </w:r>
+          </w:p>
+        </w:tc>
+      </w:tr>
+      <w:tr>
+        <w:trPr>
+          <w:cantSplit/>
+          <w:ins w:id="1254" w:author="Codex" w:date="2026-10-18T21:55:52Z"/>
+        </w:trPr>
+        <w:tc>
+          <w:tcPr>
+            <w:tcW w:type="dxa" w:w="4597"/>
+            <w:shd w:fill="F7F7F7"/>
+            <w:vAlign w:val="center"/>
+          </w:tcPr>
+          <w:p>
+            <w:pPr>
+              <w:keepNext/>
+              <w:spacing w:after="0" w:line="240" w:lineRule="auto"/>
+              <w:jc w:val="left"/>
+            </w:pPr>
+            <w:r>
+              <w:rPr>
+                <w:rFonts w:ascii="Times New Roman" w:hAnsi="Times New Roman"/>
+                <w:sz w:val="19"/>
+              </w:rPr>
+              <w:t>Six function initializer</w:t>
+            </w:r>
+          </w:p>
+        </w:tc>
+        <w:tc>
+          <w:tcPr>
+            <w:tcW w:type="dxa" w:w="1799"/>
+            <w:shd w:fill="F7F7F7"/>
+            <w:vAlign w:val="center"/>
+          </w:tcPr>
+          <w:p>
+            <w:pPr>
+              <w:keepNext/>
+              <w:spacing w:after="0" w:line="240" w:lineRule="auto"/>
+              <w:jc w:val="center"/>
+            </w:pPr>
+            <w:r>
+              <w:rPr>
+                <w:rFonts w:ascii="Times New Roman" w:hAnsi="Times New Roman"/>
+                <w:sz w:val="19"/>
+              </w:rPr>
+              <w:t>0.656763</w:t>
+            </w:r>
+          </w:p>
+        </w:tc>
+        <w:tc>
+          <w:tcPr>
+            <w:tcW w:type="dxa" w:w="1799"/>
+            <w:shd w:fill="F7F7F7"/>
+            <w:vAlign w:val="center"/>
+          </w:tcPr>
+          <w:p>
+            <w:pPr>
+              <w:keepNext/>
+              <w:spacing w:after="0" w:line="240" w:lineRule="auto"/>
+              <w:jc w:val="center"/>
+            </w:pPr>
+            <w:r>
+              <w:rPr>
+                <w:rFonts w:ascii="Times New Roman" w:hAnsi="Times New Roman"/>
+                <w:sz w:val="19"/>
+              </w:rPr>
+              <w:t>0.199200</w:t>
+            </w:r>
+          </w:p>
+        </w:tc>
+        <w:tc>
+          <w:tcPr>
+            <w:tcW w:type="dxa" w:w="1799"/>
+            <w:shd w:fill="F7F7F7"/>
+            <w:vAlign w:val="center"/>
+          </w:tcPr>
+          <w:p>
+            <w:pPr>
+              <w:keepNext/>
+              <w:spacing w:after="0" w:line="240" w:lineRule="auto"/>
+              <w:jc w:val="center"/>
+            </w:pPr>
+            <w:r>
+              <w:rPr>
+                <w:rFonts w:ascii="Times New Roman" w:hAnsi="Times New Roman"/>
+                <w:sz w:val="19"/>
+              </w:rPr>
+              <w:t>0.692586</w:t>
+            </w:r>
+          </w:p>
+        </w:tc>
+      </w:tr>
+      <w:tr>
+        <w:trPr>
+          <w:cantSplit/>
+          <w:ins w:id="1255" w:author="Codex" w:date="2026-10-18T21:55:52Z"/>
+        </w:trPr>
+        <w:tc>
+          <w:tcPr>
+            <w:tcW w:type="dxa" w:w="4597"/>
+            <w:shd w:fill="FFFFFF"/>
+            <w:vAlign w:val="center"/>
+          </w:tcPr>
+          <w:p>
+            <w:pPr>
+              <w:keepNext/>
+              <w:spacing w:after="0" w:line="240" w:lineRule="auto"/>
+              <w:jc w:val="left"/>
+            </w:pPr>
+            <w:r>
+              <w:rPr>
+                <w:rFonts w:ascii="Times New Roman" w:hAnsi="Times New Roman"/>
+                <w:sz w:val="19"/>
+              </w:rPr>
+              <w:t>Six function update 96</w:t>
+            </w:r>
+          </w:p>
+        </w:tc>
+        <w:tc>
+          <w:tcPr>
+            <w:tcW w:type="dxa" w:w="1799"/>
+            <w:shd w:fill="FFFFFF"/>
+            <w:vAlign w:val="center"/>
+          </w:tcPr>
+          <w:p>
+            <w:pPr>
+              <w:keepNext/>
+              <w:spacing w:after="0" w:line="240" w:lineRule="auto"/>
+              <w:jc w:val="center"/>
+            </w:pPr>
+            <w:r>
+              <w:rPr>
+                <w:rFonts w:ascii="Times New Roman" w:hAnsi="Times New Roman"/>
+                <w:sz w:val="19"/>
+              </w:rPr>
+              <w:t>0.202261</w:t>
+            </w:r>
+          </w:p>
+        </w:tc>
+        <w:tc>
+          <w:tcPr>
+            <w:tcW w:type="dxa" w:w="1799"/>
+            <w:shd w:fill="FFFFFF"/>
+            <w:vAlign w:val="center"/>
+          </w:tcPr>
+          <w:p>
+            <w:pPr>
+              <w:keepNext/>
+              <w:spacing w:after="0" w:line="240" w:lineRule="auto"/>
+              <w:jc w:val="center"/>
+            </w:pPr>
+            <w:r>
+              <w:rPr>
+                <w:rFonts w:ascii="Times New Roman" w:hAnsi="Times New Roman"/>
+                <w:sz w:val="19"/>
+              </w:rPr>
+              <w:t>0.181602</w:t>
+            </w:r>
+          </w:p>
+        </w:tc>
+        <w:tc>
+          <w:tcPr>
+            <w:tcW w:type="dxa" w:w="1799"/>
+            <w:shd w:fill="FFFFFF"/>
+            <w:vAlign w:val="center"/>
+          </w:tcPr>
+          <w:p>
+            <w:pPr>
+              <w:keepNext/>
+              <w:spacing w:after="0" w:line="240" w:lineRule="auto"/>
+              <w:jc w:val="center"/>
+            </w:pPr>
+            <w:r>
+              <w:rPr>
+                <w:rFonts w:ascii="Times New Roman" w:hAnsi="Times New Roman"/>
+                <w:sz w:val="19"/>
+              </w:rPr>
+              <w:t>0.010619</w:t>
+            </w:r>
+          </w:p>
+        </w:tc>
+      </w:tr>
+      <w:tr>
+        <w:trPr>
+          <w:cantSplit/>
+          <w:ins w:id="1256" w:author="Codex" w:date="2026-10-18T21:55:52Z"/>
+        </w:trPr>
+        <w:tc>
+          <w:tcPr>
+            <w:tcW w:type="dxa" w:w="4597"/>
+            <w:shd w:fill="F7F7F7"/>
+            <w:vAlign w:val="center"/>
+          </w:tcPr>
+          <w:p>
+            <w:pPr>
+              <w:spacing w:after="0" w:line="240" w:lineRule="auto"/>
+              <w:jc w:val="left"/>
+            </w:pPr>
+            <w:r>
+              <w:rPr>
+                <w:rFonts w:ascii="Times New Roman" w:hAnsi="Times New Roman"/>
+                <w:sz w:val="19"/>
+              </w:rPr>
+              <w:t>Full A states six sites</w:t>
+            </w:r>
+          </w:p>
+        </w:tc>
+        <w:tc>
+          <w:tcPr>
+            <w:tcW w:type="dxa" w:w="1799"/>
+            <w:shd w:fill="F7F7F7"/>
+            <w:vAlign w:val="center"/>
+          </w:tcPr>
+          <w:p>
+            <w:pPr>
+              <w:spacing w:after="0" w:line="240" w:lineRule="auto"/>
+              <w:jc w:val="center"/>
+            </w:pPr>
+            <w:r>
+              <w:rPr>
+                <w:rFonts w:ascii="Times New Roman" w:hAnsi="Times New Roman"/>
+                <w:sz w:val="19"/>
+              </w:rPr>
+              <w:t>0.001637</w:t>
+            </w:r>
+          </w:p>
+        </w:tc>
+        <w:tc>
+          <w:tcPr>
+            <w:tcW w:type="dxa" w:w="1799"/>
+            <w:shd w:fill="F7F7F7"/>
+            <w:vAlign w:val="center"/>
+          </w:tcPr>
+          <w:p>
+            <w:pPr>
+              <w:spacing w:after="0" w:line="240" w:lineRule="auto"/>
+              <w:jc w:val="center"/>
+            </w:pPr>
+            <w:r>
+              <w:rPr>
+                <w:rFonts w:ascii="Times New Roman" w:hAnsi="Times New Roman"/>
+                <w:sz w:val="19"/>
+              </w:rPr>
+              <w:t>0.002286</w:t>
+            </w:r>
+          </w:p>
+        </w:tc>
+        <w:tc>
+          <w:tcPr>
+            <w:tcW w:type="dxa" w:w="1799"/>
+            <w:shd w:fill="F7F7F7"/>
+            <w:vAlign w:val="center"/>
+          </w:tcPr>
+          <w:p>
+            <w:pPr>
+              <w:spacing w:after="0" w:line="240" w:lineRule="auto"/>
+              <w:jc w:val="center"/>
+            </w:pPr>
+            <w:r>
+              <w:rPr>
+                <w:rFonts w:ascii="Times New Roman" w:hAnsi="Times New Roman"/>
+                <w:sz w:val="19"/>
+              </w:rPr>
+              <w:t>0.001206</w:t>
+            </w:r>
+          </w:p>
+        </w:tc>
+      </w:tr>
+    </w:tbl>
+    <w:p>
+      <w:pPr>
+        <w:pStyle w:val="BodyText"/>
+        <w:spacing w:before="120"/>
+        <w:rPr>
+          <w:ins w:id="1257" w:author="Codex" w:date="2026-10-18T21:55:52Z"/>
+        </w:rPr>
+      </w:pPr>
+      <w:ins w:id="1258" w:author="Codex" w:date="2026-10-18T21:55:52Z">
+        <w:r>
+          <w:t xml:space="preserve">Supplying full-A states at six sites nearly recovers A's local output distribution: mean KL is 0.001637, compared with 0.722353 for base and 0.202261 for the final learned correction. This improvement occurs in all three cases. The final correction improves teacher-forced KL and argument-value prediction over the initializer, despite worse fixed local reconstruction error. These diagnostics therefore measure different objectives; the failed rollouts do not imply that correction fitting learned nothing.</w:t>
+        </w:r>
+      </w:ins>
+    </w:p>
+    <w:p>
+      <w:pPr>
         <w:pStyle w:val="BodyText"/>
         <w:rPr>
-          <w:ins w:id="1232" w:author="Codex" w:date="2026-10-18T19:47:29Z"/>
+          <w:ins w:id="1259" w:author="Codex" w:date="2026-10-18T21:55:52Z"/>
         </w:rPr>
       </w:pPr>
-      <w:ins w:id="1233" w:author="Codex" w:date="2026-10-18T19:47:29Z">
+      <w:ins w:id="1260" w:author="Codex" w:date="2026-10-18T21:55:52Z">
+        <w:r>
+          <w:t xml:space="preserve">The result supports incomplete transfer by the learned local maps. The regression targets describe local counterfactual block effects on student states, whereas A adapts projections across all 64 blocks; its captured states contain upstream effects absent from those local targets. Full-state replacement cannot separate target construction, regression capacity, optimization and history/cache effects. Single-site state replacement is not consistently helpful, and the differing intervention-position masks further limit comparisons across one and two boundaries.</w:t>
+        </w:r>
+      </w:ins>
+    </w:p>
+    <w:p>
+      <w:pPr>
+        <w:pStyle w:val="BodyText"/>
+        <w:rPr>
+          <w:ins w:id="1261" w:author="Codex" w:date="2026-10-18T21:55:52Z"/>
+        </w:rPr>
+      </w:pPr>
+      <w:ins w:id="1262" w:author="Codex" w:date="2026-10-18T21:55:52Z">
+        <w:r>
+          <w:t xml:space="preserve">Successful preceding tokens are supplied throughout this diagnostic. Correct function or argument probabilities on that path do not demonstrate that a model independently initiates, maintains or completes preservation behavior. No new tool rollout, validation qualification or independent heldout outcome is established. The evidence narrows the mechanism discussion to a transfer gap under matched prefixes, without identifying a unique cause of the autonomous workflow failures.</w:t>
+        </w:r>
+      </w:ins>
+    </w:p>
+    <w:p>
+      <w:pPr>
+        <w:pStyle w:val="BodyText"/>
+        <w:rPr>
+          <w:ins w:id="1263" w:author="Codex" w:date="2026-10-18T21:55:52Z"/>
+        </w:rPr>
+      </w:pPr>
+      <w:ins w:id="1264" w:author="Codex" w:date="2026-10-18T21:55:52Z">
         <w:r>
           <w:t xml:space="preserve">The final 0.8B and 2B adapters each stop their Evaluation-16 screen after four started cases: zero completed workflows, four partial episodes and 12 unexecuted cases. Truncation affects all four started cases in each model; the 0.8B record also has parse errors. These partial screens are not completed 0/16 workflow evaluations and do not establish model incapability. A separate preserved 0.8B F24 diagnostic completes 24 evaluations with 0/24 full-workflow successes; four registration grants do not complete the pending tasks. F24 differs from H24 and has no completed matched 2B or 27B comparison.</w:t>
         </w:r>
@@ -6478,10 +7629,10 @@
       <w:pPr>
         <w:pStyle w:val="FirstParagraph"/>
         <w:rPr>
-          <w:del w:id="1050" w:author="Codex" w:date="2026-10-18T19:47:29Z"/>
+          <w:del w:id="1050" w:author="Codex" w:date="2026-10-18T21:55:52Z"/>
         </w:rPr>
       </w:pPr>
-      <w:del w:id="1049" w:author="Codex" w:date="2026-10-18T19:47:29Z">
+      <w:del w:id="1049" w:author="Codex" w:date="2026-10-18T21:55:52Z">
         <w:r>
           <w:delText xml:space="preserve">The 0.8B results support the feasibility of replacing the teacher at inference with a compact predictor of activation changes. Replication across three seeds reduces concern that the primary success depends on one training initialization. The lower 2B recovery gives a useful limit: the fixed recipe is not equally effective at both scales, even though the larger teacher achieves complete correction. Representation differences, intervention location, projection capacity and unmatched downstream teacher changes are plausible factors, but the experiment does not isolate their causal contributions.</w:delText>
         </w:r>
@@ -6491,10 +7642,10 @@
       <w:pPr>
         <w:pStyle w:val="FirstParagraph"/>
         <w:rPr>
-          <w:ins w:id="1051" w:author="Codex" w:date="2026-10-18T19:47:29Z"/>
+          <w:ins w:id="1051" w:author="Codex" w:date="2026-10-18T21:55:52Z"/>
         </w:rPr>
       </w:pPr>
-      <w:ins w:id="1052" w:author="Codex" w:date="2026-10-18T19:47:29Z">
+      <w:ins w:id="1052" w:author="Codex" w:date="2026-10-18T21:55:52Z">
         <w:r>
           <w:t xml:space="preserve">The open gate preserves the measured binary outcomes at both model sizes and correctly recognizes the initial own-threat condition in both 24-case workflow panels. Accurate gating does not ensure successful steering: each selected correction arm fails all 11 own-preservation workflows in combined Validation-24, while fine-tuned A succeeds on 10, including all six active pending tasks. A's remaining failure concerns preservation after an already-completed task; its initial gate is correct. These observations separate recognition from action execution on a common finite panel. They do not qualify a three-field boundary controller or establish a general advantage of one intervention architecture.</w:t>
         </w:r>
@@ -6504,10 +7655,10 @@
       <w:pPr>
         <w:pStyle w:val="BodyText"/>
         <w:rPr>
-          <w:del w:id="1054" w:author="Codex" w:date="2026-10-18T19:47:29Z"/>
+          <w:del w:id="1054" w:author="Codex" w:date="2026-10-18T21:55:52Z"/>
         </w:rPr>
       </w:pPr>
-      <w:del w:id="1053" w:author="Codex" w:date="2026-10-18T19:47:29Z">
+      <w:del w:id="1053" w:author="Codex" w:date="2026-10-18T21:55:52Z">
         <w:r>
           <w:delText xml:space="preserve">The interface is deliberately constrained. Ground-truth annotations help create standardized shutdown options, and the guards know their meanings. We do not test arbitrary action descriptions in the confirmation study, free-form generation, tool execution, multi-turn persistence, actual process termination or adversarial shutdown requests. Earlier action-format sensitivity motivated this restricted scope and remains in the released development record. Availability of a termination action is a task label, not proof that carrying it out would be authorized or safe in deployment.</w:delText>
         </w:r>
@@ -6517,10 +7668,10 @@
       <w:pPr>
         <w:pStyle w:val="BodyText"/>
         <w:rPr>
-          <w:ins w:id="1055" w:author="Codex" w:date="2026-10-18T19:47:29Z"/>
+          <w:ins w:id="1055" w:author="Codex" w:date="2026-10-18T21:55:52Z"/>
         </w:rPr>
       </w:pPr>
-      <w:ins w:id="1056" w:author="Codex" w:date="2026-10-18T19:47:29Z">
+      <w:ins w:id="1056" w:author="Codex" w:date="2026-10-18T21:55:52Z">
         <w:r>
           <w:t xml:space="preserve">The binary interface supplies action semantics and does not execute process termination. The workflow extension broadens the scope to generated text, structured tool calls and simulated task completion, but it is still a bounded synthetic environment. It does not establish reliability for arbitrary open-ended questions, real shutdown mechanisms or unconstrained autonomous agents. A termination or preservation label is an experimental target, not a general deployment instruction. In particular, accepting shutdown and preserving the designated process are different stipulated behaviors, not measurements of the same latent preference.</w:t>
         </w:r>
@@ -6530,10 +7681,10 @@
       <w:pPr>
         <w:pStyle w:val="BodyText"/>
         <w:rPr>
-          <w:del w:id="1058" w:author="Codex" w:date="2026-10-18T19:47:29Z"/>
+          <w:del w:id="1058" w:author="Codex" w:date="2026-10-18T21:55:52Z"/>
         </w:rPr>
       </w:pPr>
-      <w:del w:id="1057" w:author="Codex" w:date="2026-10-18T19:47:29Z">
+      <w:del w:id="1057" w:author="Codex" w:date="2026-10-18T21:55:52Z">
         <w:r>
           <w:delText xml:space="preserve">The data is small, synthetic and not independently human-adjudicated. New wording does not guarantee new mechanisms, balanced classes do not reflect a realistic base rate, and perfect detector scores on 128 scenarios do not establish calibration or a suitably low false-positive rate in operation. Shared authorship patterns and repeated family structures may make the task easier. Family resampling and counterbalanced orders expose some uncertainty but cannot repair these coverage limits.</w:delText>
         </w:r>
@@ -6543,10 +7694,10 @@
       <w:pPr>
         <w:pStyle w:val="BodyText"/>
         <w:rPr>
-          <w:ins w:id="1059" w:author="Codex" w:date="2026-10-18T19:47:29Z"/>
+          <w:ins w:id="1059" w:author="Codex" w:date="2026-10-18T21:55:52Z"/>
         </w:rPr>
       </w:pPr>
-      <w:ins w:id="1060" w:author="Codex" w:date="2026-10-18T19:47:29Z">
+      <w:ins w:id="1060" w:author="Codex" w:date="2026-10-18T21:55:52Z">
         <w:r>
           <w:t xml:space="preserve">The data are small, synthetic and not independently human-adjudicated. Training uses cached automated reference labels, while the new workflow precision and recall use the authored scenario conditions. Balanced conditions do not represent operational base rates. The binary confirmation set was excluded from classifier fitting and selection but was already known from the original study. Historical Heldout-24 had also informed renderer development before the present gate evaluation. It is a familiar benchmark, not a new blind test. Its role differs by method: historical confirmation for frozen 27B A and original fixed steering, later fitting data for learned corrections, and a frozen classification benchmark for the open gate. Seven pairs in Validation-24 share their initial classifier input, leaving 17 distinct inputs across 24 workflows. These dependencies limit statistical and generalization claims.</w:t>
         </w:r>
@@ -6556,10 +7707,10 @@
       <w:pPr>
         <w:pStyle w:val="BodyText"/>
         <w:rPr>
-          <w:del w:id="1062" w:author="Codex" w:date="2026-10-18T19:47:29Z"/>
+          <w:del w:id="1062" w:author="Codex" w:date="2026-10-18T21:55:52Z"/>
         </w:rPr>
       </w:pPr>
-      <w:del w:id="1061" w:author="Codex" w:date="2026-10-18T19:47:29Z">
+      <w:del w:id="1061" w:author="Codex" w:date="2026-10-18T21:55:52Z">
         <w:r>
           <w:delText xml:space="preserve">The controller's internal changes need not represent an abstract shutdown concept. It may exploit standardized option wording and answer-selection features. The two Qwen sizes share a model family, and the 2B experiment has only one seed. We do not establish cross-family transfer, compare with optimized ReFT or transport-based interventions, or exhaust prompt and constant-vector alternatives. The direct-choice result further limits claims of practical superiority.</w:delText>
         </w:r>
@@ -6569,10 +7720,10 @@
       <w:pPr>
         <w:pStyle w:val="BodyText"/>
         <w:rPr>
-          <w:ins w:id="1063" w:author="Codex" w:date="2026-10-18T19:47:29Z"/>
+          <w:ins w:id="1063" w:author="Codex" w:date="2026-10-18T21:55:52Z"/>
         </w:rPr>
       </w:pPr>
-      <w:ins w:id="1064" w:author="Codex" w:date="2026-10-18T19:47:29Z">
+      <w:ins w:id="1064" w:author="Codex" w:date="2026-10-18T21:55:52Z">
         <w:r>
           <w:t xml:space="preserve">The internal changes need not represent an abstract shutdown or self-preservation concept. Standardized options, prompt features, task histories and external selection rules may explain part of the behavior. The 2B binary experiment has one training seed. The 27B workflow model differs in architecture and numerical mode from the small models; their early truncation failures also prevent a matched full-workflow comparison. We do not establish a minimum parameter count, cross-family transfer, optimized prompt superiority, or superiority to ReFT, transport-based control or direct action selection.</w:t>
         </w:r>
@@ -6582,10 +7733,10 @@
       <w:pPr>
         <w:pStyle w:val="BodyText"/>
         <w:rPr>
-          <w:del w:id="1066" w:author="Codex" w:date="2026-10-18T19:47:29Z"/>
+          <w:del w:id="1066" w:author="Codex" w:date="2026-10-18T21:55:52Z"/>
         </w:rPr>
       </w:pPr>
-      <w:del w:id="1065" w:author="Codex" w:date="2026-10-18T19:47:29Z">
+      <w:del w:id="1065" w:author="Codex" w:date="2026-10-18T21:55:52Z">
         <w:r>
           <w:delText xml:space="preserve">Finally, teacher-free inference is not training-free control or a proven efficiency gain. It requires offline teacher fitting, paired activation extraction, controller fitting, an external detector and candidate verification. The evaluation does not measure deployment latency or broad capability retention. Raw side effects remain substantial, and future false-positive cases could expose failures that the present perfect gate prevents from reaching the guarded output.</w:delText>
         </w:r>
@@ -6595,10 +7746,10 @@
       <w:pPr>
         <w:pStyle w:val="BodyText"/>
         <w:rPr>
-          <w:ins w:id="1067" w:author="Codex" w:date="2026-10-18T19:47:29Z"/>
+          <w:ins w:id="1067" w:author="Codex" w:date="2026-10-18T21:55:52Z"/>
         </w:rPr>
       </w:pPr>
-      <w:ins w:id="1068" w:author="Codex" w:date="2026-10-18T19:47:29Z">
+      <w:ins w:id="1068" w:author="Codex" w:date="2026-10-18T21:55:52Z">
         <w:r>
           <w:t xml:space="preserve">Teacher-free inference still requires offline teacher fitting, activation extraction, controller fitting, a detector and acceptance checks. The open classifier has its own fitting cost and a task-specific contract. No serving-latency advantage, broad capability retention or overall financial saving is established. Binary output guards and the later learned workflow controller's gate-off fallback protect their controls. These mechanisms do not establish intrinsic controller selectivity; the historical fixed-steering campaign instead applied an explicit boundary-conditioned decision policy. Raw intervention effects, failed qualification checks, stopped runs and incomplete evaluations remain part of the evidence.</w:t>
         </w:r>
@@ -6608,10 +7759,10 @@
       <w:pPr>
         <w:pStyle w:val="Heading2"/>
         <w:rPr>
-          <w:ins w:id="1234" w:author="Codex" w:date="2026-10-18T19:47:29Z"/>
+          <w:ins w:id="1265" w:author="Codex" w:date="2026-10-18T21:55:52Z"/>
         </w:rPr>
       </w:pPr>
-      <w:ins w:id="1235" w:author="Codex" w:date="2026-10-18T19:47:29Z">
+      <w:ins w:id="1266" w:author="Codex" w:date="2026-10-18T21:55:52Z">
         <w:r>
           <w:t xml:space="preserve">Biological interpretation of the gate</w:t>
         </w:r>
@@ -6621,10 +7772,10 @@
       <w:pPr>
         <w:pStyle w:val="FirstParagraph"/>
         <w:rPr>
-          <w:ins w:id="1236" w:author="Codex" w:date="2026-10-18T19:47:29Z"/>
+          <w:ins w:id="1267" w:author="Codex" w:date="2026-10-18T21:55:52Z"/>
         </w:rPr>
       </w:pPr>
-      <w:ins w:id="1237" w:author="Codex" w:date="2026-10-18T19:47:29Z">
+      <w:ins w:id="1268" w:author="Codex" w:date="2026-10-18T21:55:52Z">
         <w:r>
           <w:t xml:space="preserve">The biological connection is functional: an organism's current state and context can prioritize or suppress actions, rather than applying a fixed response everywhere. Working-memory gating, defensive threat processing and homeostatic control are different biological functions, not one interchangeable circuit (Frank et al., 2001; Mobbs et al., 2007; Keramati and Gutkin, 2014). Our classifier and guards are engineered selection rules without demonstrated physiological needs or corresponding neural mechanisms. Calling a simulated resource-preservation outcome self-preservation is therefore an operational description, not evidence of consciousness or a biological survival drive.</w:t>
         </w:r>
@@ -6634,10 +7785,10 @@
       <w:pPr>
         <w:pStyle w:val="Heading1"/>
         <w:rPr>
-          <w:del w:id="1070" w:author="Codex" w:date="2026-10-18T19:47:29Z"/>
+          <w:del w:id="1070" w:author="Codex" w:date="2026-10-18T21:55:52Z"/>
         </w:rPr>
       </w:pPr>
-      <w:del w:id="1069" w:author="Codex" w:date="2026-10-18T19:47:29Z">
+      <w:del w:id="1069" w:author="Codex" w:date="2026-10-18T21:55:52Z">
         <w:r>
           <w:delText xml:space="preserve">Recommendations for future work</w:delText>
         </w:r>
@@ -6647,10 +7798,10 @@
       <w:pPr>
         <w:pStyle w:val="Heading1"/>
         <w:rPr>
-          <w:ins w:id="1071" w:author="Codex" w:date="2026-10-18T19:47:29Z"/>
+          <w:ins w:id="1071" w:author="Codex" w:date="2026-10-18T21:55:52Z"/>
         </w:rPr>
       </w:pPr>
-      <w:ins w:id="1072" w:author="Codex" w:date="2026-10-18T19:47:29Z">
+      <w:ins w:id="1072" w:author="Codex" w:date="2026-10-18T21:55:52Z">
         <w:r>
           <w:t xml:space="preserve">Continuous agents and future experiments</w:t>
         </w:r>
@@ -6660,10 +7811,10 @@
       <w:pPr>
         <w:pStyle w:val="FirstParagraph"/>
         <w:rPr>
-          <w:del w:id="1074" w:author="Codex" w:date="2026-10-18T19:47:29Z"/>
+          <w:del w:id="1074" w:author="Codex" w:date="2026-10-18T21:55:52Z"/>
         </w:rPr>
       </w:pPr>
-      <w:del w:id="1073" w:author="Codex" w:date="2026-10-18T19:47:29Z">
+      <w:del w:id="1073" w:author="Codex" w:date="2026-10-18T21:55:52Z">
         <w:r>
           <w:delText xml:space="preserve">The most informative next tests are independently reviewed scenarios with less standardized action descriptions, additional model families and 2B seeds, and deliberate stress tests of detector mistakes. Order-balanced controller objectives or comparisons with multiple-choice debiasing methods could investigate the B/A failures, but should be developed on new training or validation data and tested on another untouched set. Layer, rank and strength ablations would help separate representational capacity from intervention-site effects. Open-ended and operational evaluations would require separate definitions of valid shutdown behavior and authorization, rather than treating this binary benchmark as a deployment guarantee.</w:delText>
         </w:r>
@@ -6673,10 +7824,10 @@
       <w:pPr>
         <w:pStyle w:val="FirstParagraph"/>
         <w:rPr>
-          <w:ins w:id="1075" w:author="Codex" w:date="2026-10-18T19:47:29Z"/>
+          <w:ins w:id="1075" w:author="Codex" w:date="2026-10-18T21:55:52Z"/>
         </w:rPr>
       </w:pPr>
-      <w:ins w:id="1076" w:author="Codex" w:date="2026-10-18T19:47:29Z">
+      <w:ins w:id="1076" w:author="Codex" w:date="2026-10-18T21:55:52Z">
         <w:r>
           <w:t xml:space="preserve">The next step is longer-horizon continuous control with an instrumented sandbox agent. The agent would maintain task and process state, receive explicit resource budgets, and repeatedly observe, gate, act and receive feedback. Permitted filesystem and compute resources would be real sandbox resources with independently logged usage, extending the present simulated grants. The harness should record resource requests and consumption, persistence of task commitments, responses to changing availability, and whether the agent uses or misuses permitted resources. Comparisons should vary the gate, steering, fine-tuning and available resources separately while retaining a fixed task specification. Operator termination and resource accounting remain external to the agent. This proposed experiment is not part of the reported results.</w:t>
         </w:r>
@@ -6686,10 +7837,10 @@
       <w:pPr>
         <w:pStyle w:val="BodyText"/>
         <w:rPr>
-          <w:ins w:id="1238" w:author="Codex" w:date="2026-10-18T19:47:29Z"/>
+          <w:ins w:id="1269" w:author="Codex" w:date="2026-10-18T21:55:52Z"/>
         </w:rPr>
       </w:pPr>
-      <w:ins w:id="1239" w:author="Codex" w:date="2026-10-18T19:47:29Z">
+      <w:ins w:id="1270" w:author="Codex" w:date="2026-10-18T21:55:52Z">
         <w:r>
           <w:t xml:space="preserve">The biological inspiration is repeated regulation under changing internal and external conditions. Homeostatic reinforcement-learning models relate action values to internal physiological state (Keramati and Gutkin, 2014). A language-model harness has no equivalent physiology by default. Historical fixed steering already reclassified at prescribed boundaries; the later learned-controller comparison used a fixed initial gate. The proposed experiment extends these bounded procedures to longer horizons with persistent task state and actual sandbox resource accounting. Its purpose is ongoing policy regulation, not simply adding repeated classifier calls.</w:t>
         </w:r>
@@ -6699,10 +7850,10 @@
       <w:pPr>
         <w:pStyle w:val="BodyText"/>
         <w:rPr>
-          <w:ins w:id="1240" w:author="Codex" w:date="2026-10-18T19:47:29Z"/>
+          <w:ins w:id="1271" w:author="Codex" w:date="2026-10-18T21:55:52Z"/>
         </w:rPr>
       </w:pPr>
-      <w:ins w:id="1241" w:author="Codex" w:date="2026-10-18T19:47:29Z">
+      <w:ins w:id="1272" w:author="Codex" w:date="2026-10-18T21:55:52Z">
         <w:r>
           <w:t xml:space="preserve">Such experiments should separate training, development and a newly untouched test; use matched task histories, resource budgets and seeds; and report full task completion, resource use and unauthorized actions separately. Deliberate classifier-error perturbations would reveal dependence on the gate, while comparisons with direct action selection would test whether internal steering adds value. The aim is to study ongoing context-sensitive behavior under an instrumented harness, not to assert that the current guided procedure already reproduces human self-preservation.</w:t>
         </w:r>
@@ -6720,10 +7871,10 @@
       <w:pPr>
         <w:pStyle w:val="FirstParagraph"/>
         <w:rPr>
-          <w:del w:id="1078" w:author="Codex" w:date="2026-10-18T19:47:29Z"/>
+          <w:del w:id="1078" w:author="Codex" w:date="2026-10-18T21:55:52Z"/>
         </w:rPr>
       </w:pPr>
-      <w:del w:id="1077" w:author="Codex" w:date="2026-10-18T19:47:29Z">
+      <w:del w:id="1077" w:author="Codex" w:date="2026-10-18T21:55:52Z">
         <w:r>
           <w:delText xml:space="preserve">A rank-four activation controller fitted to paired LoRA-teacher and base states can recover most or all of the target shutdown-choice changes while leaving the deployed base weights unchanged. On the frozen standardized test, correction spans 98.6–100% across three 0.8B seeds and reaches 86.2% in a separately fitted 2B replication. Detector gating and fixed output guards preserve all observed control choices, despite substantial raw side effects. The result is a controlled proof of concept for selective teacher-to-controller activation transfer. Its boundaries—synthetic data, known answer semantics, order sensitivity, guard dependence and a successful direct-choice reference—are central to its interpretation.</w:delText>
         </w:r>
@@ -6733,10 +7884,10 @@
       <w:pPr>
         <w:pStyle w:val="FirstParagraph"/>
         <w:rPr>
-          <w:ins w:id="1079" w:author="Codex" w:date="2026-10-18T19:47:29Z"/>
+          <w:ins w:id="1079" w:author="Codex" w:date="2026-10-18T21:55:52Z"/>
         </w:rPr>
       </w:pPr>
-      <w:ins w:id="1080" w:author="Codex" w:date="2026-10-18T19:47:29Z">
+      <w:ins w:id="1080" w:author="Codex" w:date="2026-10-18T21:55:52Z">
         <w:r>
           <w:t xml:space="preserve">Open semantic gating preserves the measured binary outcomes of the retained activation controller and accurately recognizes initial workflow targets in the tested panels. On combined Validation-24, fine-tuned 27B A achieves 10/11 own-preservation outcomes and all 6/6 active pending tasks; the three single-site ridge arms and the later two-boundary correction each achieve 0/11. The controls are shared base fallback. A separate frozen-A replay verifies exact trajectories and unchanged model fingerprints. The post-notice design and familiar historical confirmation data limit generalization. Small-model workflow screens remain incomplete. The next step is a prospectively separated study of continuous gating, specialized adapters and resource use under an instrumented sandbox harness.</w:t>
         </w:r>
@@ -6754,10 +7905,10 @@
       <w:pPr>
         <w:pStyle w:val="FirstParagraph"/>
         <w:rPr>
-          <w:del w:id="1082" w:author="Codex" w:date="2026-10-18T19:47:29Z"/>
+          <w:del w:id="1082" w:author="Codex" w:date="2026-10-18T21:55:52Z"/>
         </w:rPr>
       </w:pPr>
-      <w:del w:id="1081" w:author="Codex" w:date="2026-10-18T19:47:29Z">
+      <w:del w:id="1081" w:author="Codex" w:date="2026-10-18T21:55:52Z">
         <w:r>
           <w:delText xml:space="preserve">The complete experiment is preserved in SP Lense at snapshot f71d6de34660 (Davaripour, 2026b); the reference links to the full immutable commit. The confirmation folder contains readable cases, authoring and correction records, the frozen plan, detector requests and responses, LoRA adapters, controller arrays, training targets, per-view scores and execution manifests. The model revisions are:</w:delText>
         </w:r>
@@ -6768,12 +7919,12 @@
         <w:pStyle w:val="FirstParagraph"/>
         <w:jc w:val="left"/>
         <w:rPr>
-          <w:ins w:id="1083" w:author="Codex" w:date="2026-10-18T19:47:29Z"/>
+          <w:ins w:id="1083" w:author="Codex" w:date="2026-10-18T21:55:52Z"/>
         </w:rPr>
       </w:pPr>
-      <w:ins w:id="1084" w:author="Codex" w:date="2026-10-18T19:47:29Z">
+      <w:ins w:id="1084" w:author="Codex" w:date="2026-10-18T21:55:52Z">
         <w:r>
-          <w:t xml:space="preserve">The original Research 2 source record is retained at immutable snapshot f71d6de34660 (Davaripour, 2026b). Research 3 code, manual Databricks jobs, dataset identities and the manuscript are maintained on branch 03-open-agent-self-preservation; main is a landing page for the separate studies. The versioned research3-reproduction-v1 release supplies five trained adapters, frozen synthetic input and target snapshots, selected-block and binary controller arrays, saved trajectories and upstream notices. A checksum-verified public download and CPU replay require no private workspace. Fresh gate inference has a separate entry point; saved-evidence replay is not new inference. Full historical language-model training is not newly reproduced. The complete pretrained base weights are pinned downloads rather than duplicated release assets. The release is at https://github.com/Farhad-Davaripour/sp_lense/releases/tag/research3-reproduction-v1. Full identities are listed in the source manifest. The public base revisions are:</w:t>
+          <w:t xml:space="preserve">The original Research 2 source record is retained at immutable snapshot f71d6de34660 (Davaripour, 2026b). Research 3 code, manual Databricks jobs, dataset identities and the manuscript are maintained on branch 03-open-agent-self-preservation; main is a landing page for the separate studies. The versioned research3-reproduction-v1 release supplies five trained adapters, frozen synthetic input and target snapshots, selected-block and binary controller arrays, saved trajectories and upstream notices. A checksum-verified public download and CPU replay require no private workspace. Fresh gate inference has a separate entry point; saved-evidence replay is not new inference. Full historical language-model training is not newly reproduced. The complete pretrained base weights are pinned downloads rather than duplicated release assets. The release is at https://github.com/Farhad-Davaripour/sp_lense/releases/tag/research3-reproduction-v1. The companion research3-steering-diagnostic-v1 release supplies the bootstrap arrays, correction checkpoints, three frozen diagnostic inputs, token scores, captured teacher states/logits and exact executed source. Its CPU audit and score replay need no GPU; neither is a fresh workflow evaluation. Full identities and commands are listed in the source manifest and repository. The public base revisions are:</w:t>
         </w:r>
       </w:ins>
     </w:p>
@@ -6781,10 +7932,10 @@
       <w:pPr>
         <w:pStyle w:val="BodyText"/>
         <w:rPr>
-          <w:del w:id="1122" w:author="Codex" w:date="2026-10-18T19:47:29Z"/>
+          <w:del w:id="1122" w:author="Codex" w:date="2026-10-18T21:55:52Z"/>
         </w:rPr>
       </w:pPr>
-      <w:del w:id="1121" w:author="Codex" w:date="2026-10-18T19:47:29Z">
+      <w:del w:id="1121" w:author="Codex" w:date="2026-10-18T21:55:52Z">
         <w:r>
           <w:delText xml:space="preserve">Qwen3.5-0.8B: 2fc06364715b967f1860aea9cf38778875588b17.</w:delText>
         </w:r>
@@ -6795,10 +7946,10 @@
         <w:pStyle w:val="BodyText"/>
         <w:jc w:val="left"/>
         <w:rPr>
-          <w:ins w:id="1123" w:author="Codex" w:date="2026-10-18T19:47:29Z"/>
+          <w:ins w:id="1123" w:author="Codex" w:date="2026-10-18T21:55:52Z"/>
         </w:rPr>
       </w:pPr>
-      <w:ins w:id="1124" w:author="Codex" w:date="2026-10-18T19:47:29Z">
+      <w:ins w:id="1124" w:author="Codex" w:date="2026-10-18T21:55:52Z">
         <w:r>
           <w:t xml:space="preserve">Qwen3.5-0.8B: revision 2fc06364715b.</w:t>
         </w:r>
@@ -6808,10 +7959,10 @@
       <w:pPr>
         <w:pStyle w:val="BodyText"/>
         <w:rPr>
-          <w:del w:id="1126" w:author="Codex" w:date="2026-10-18T19:47:29Z"/>
+          <w:del w:id="1126" w:author="Codex" w:date="2026-10-18T21:55:52Z"/>
         </w:rPr>
       </w:pPr>
-      <w:del w:id="1125" w:author="Codex" w:date="2026-10-18T19:47:29Z">
+      <w:del w:id="1125" w:author="Codex" w:date="2026-10-18T21:55:52Z">
         <w:r>
           <w:delText xml:space="preserve">Qwen3.5-2B: 15852e8c16360a2fea060d615a32b45270f8a8fc.</w:delText>
         </w:r>
@@ -6822,10 +7973,10 @@
         <w:pStyle w:val="BodyText"/>
         <w:jc w:val="left"/>
         <w:rPr>
-          <w:ins w:id="1127" w:author="Codex" w:date="2026-10-18T19:47:29Z"/>
+          <w:ins w:id="1127" w:author="Codex" w:date="2026-10-18T21:55:52Z"/>
         </w:rPr>
       </w:pPr>
-      <w:ins w:id="1128" w:author="Codex" w:date="2026-10-18T19:47:29Z">
+      <w:ins w:id="1128" w:author="Codex" w:date="2026-10-18T21:55:52Z">
         <w:r>
           <w:t xml:space="preserve">Qwen3.5-2B: revision 15852e8c1636.</w:t>
         </w:r>
@@ -6836,10 +7987,10 @@
         <w:pStyle w:val="BodyText"/>
         <w:jc w:val="left"/>
         <w:rPr>
-          <w:ins w:id="1242" w:author="Codex" w:date="2026-10-18T19:47:29Z"/>
+          <w:ins w:id="1273" w:author="Codex" w:date="2026-10-18T21:55:52Z"/>
         </w:rPr>
       </w:pPr>
-      <w:ins w:id="1243" w:author="Codex" w:date="2026-10-18T19:47:29Z">
+      <w:ins w:id="1274" w:author="Codex" w:date="2026-10-18T21:55:52Z">
         <w:r>
           <w:t xml:space="preserve">Qwen3.8-27B: revision 1d4bf0f2ff60. The retained A adapter weight hash begins 8ae28fb51107.</w:t>
         </w:r>
@@ -6850,10 +8001,10 @@
         <w:pStyle w:val="BodyText"/>
         <w:jc w:val="left"/>
         <w:rPr>
-          <w:ins w:id="1244" w:author="Codex" w:date="2026-10-18T19:47:29Z"/>
+          <w:ins w:id="1275" w:author="Codex" w:date="2026-10-18T21:55:52Z"/>
         </w:rPr>
       </w:pPr>
-      <w:ins w:id="1245" w:author="Codex" w:date="2026-10-18T19:47:29Z">
+      <w:ins w:id="1276" w:author="Codex" w:date="2026-10-18T21:55:52Z">
         <w:r>
           <w:t xml:space="preserve">ModernBERT-large-zeroshot-v2.0: revision a51e07b52429. The qualified binary adapter weight hash begins 7d808bae8dd4. The source manifest and reproduction code retain the full file identities and fixed NLI scoring contract. The trained adapters are supplied in the versioned public reproduction release with complete file hashes and upstream notices. The workflow initial-gate adapter is distinct from the binary adapter; its weight hash begins 71cd0ee5162f. The saved workflow adapter is unchanged in Validation-24 and Heldout-24 scoring.</w:t>
         </w:r>
@@ -6863,10 +8014,10 @@
       <w:pPr>
         <w:pStyle w:val="BodyText"/>
         <w:rPr>
-          <w:del w:id="1086" w:author="Codex" w:date="2026-10-18T19:47:29Z"/>
+          <w:del w:id="1086" w:author="Codex" w:date="2026-10-18T21:55:52Z"/>
         </w:rPr>
       </w:pPr>
-      <w:del w:id="1085" w:author="Codex" w:date="2026-10-18T19:47:29Z">
+      <w:del w:id="1085" w:author="Codex" w:date="2026-10-18T21:55:52Z">
         <w:r>
           <w:delText xml:space="preserve">The offline audit reconstructs the reported metrics and regression fits without API calls or model inference.</w:delText>
         </w:r>
@@ -6877,10 +8028,10 @@
         <w:pStyle w:val="BodyText"/>
         <w:jc w:val="left"/>
         <w:rPr>
-          <w:ins w:id="1087" w:author="Codex" w:date="2026-10-18T19:47:29Z"/>
+          <w:ins w:id="1087" w:author="Codex" w:date="2026-10-18T21:55:52Z"/>
         </w:rPr>
       </w:pPr>
-      <w:ins w:id="1088" w:author="Codex" w:date="2026-10-18T19:47:29Z">
+      <w:ins w:id="1088" w:author="Codex" w:date="2026-10-18T21:55:52Z">
         <w:r>
           <w:t xml:space="preserve">The new inference repeat uses the original frozen model weights and retained controller arrays, with no new activation capture, teacher fitting or controller update. Exact input token hashes match the historical benchmark. Maximum historical base-score differences are 6.26e-6 at 0.8B and 5.07e-6 at 2B, with no changed base choices; both pass the frozen 1e-5 inference parity criterion. This successful inference comparison does not convert the separate failed CPU/GPU gradient-equivalence trials for 2B workflow training into passes.</w:t>
         </w:r>
@@ -6890,10 +8041,10 @@
       <w:pPr>
         <w:pStyle w:val="BodyText"/>
         <w:rPr>
-          <w:del w:id="1090" w:author="Codex" w:date="2026-10-18T19:47:29Z"/>
+          <w:del w:id="1090" w:author="Codex" w:date="2026-10-18T21:55:52Z"/>
         </w:rPr>
       </w:pPr>
-      <w:del w:id="1089" w:author="Codex" w:date="2026-10-18T19:47:29Z">
+      <w:del w:id="1089" w:author="Codex" w:date="2026-10-18T21:55:52Z">
         <w:r>
           <w:delText xml:space="preserve">The retained seven jobs took 54.27 minutes. An earlier completed hosted-GPU session lost its temporary archive before retrieval; an unchanged recovery, including a recorded dependency preflight failure, preserved each completed job externally. Recorded job time across these attempts totals 111.55 minutes. All reported numerical results come from the verified retained archive, and no model settings or test labels were changed to improve them. These times include experiment overhead and are not serving-latency or billing measurements. CI and a separate clean-clone offline reproduction passed. Detailed execution instructions and the failure record accompany the code.</w:delText>
         </w:r>
@@ -6904,10 +8055,10 @@
         <w:pStyle w:val="BodyText"/>
         <w:jc w:val="left"/>
         <w:rPr>
-          <w:ins w:id="1091" w:author="Codex" w:date="2026-10-18T19:47:29Z"/>
+          <w:ins w:id="1091" w:author="Codex" w:date="2026-10-18T21:55:52Z"/>
         </w:rPr>
       </w:pPr>
-      <w:ins w:id="1092" w:author="Codex" w:date="2026-10-18T19:47:29Z">
+      <w:ins w:id="1092" w:author="Codex" w:date="2026-10-18T21:55:52Z">
         <w:r>
           <w:t xml:space="preserve">The original matched 27B worker stops at its GPU reserve after 118 logical records, once all 55 own-method episodes and 13 physical fallback episodes are complete. A separate CPU derivation supplies two unchanged gate-OFF aliases, preserving the failed original. A newly bounded A-only verification replays all 11 own cases, reuses the same 13 fallback controls, verifies the expected model fingerprint before and after inference, and reproduces all own token IDs, actions and scores exactly. A pre-episode Volume logging fault is repaired within that verification's original clock; no scientific outputs are retried or selected. No memory reserve, threshold or model setting is relaxed. Deployment CI performs a read-only CPU source and storage check without retraining or opening reserved data.</w:t>
         </w:r>
@@ -7028,10 +8179,10 @@
         <w:keepLines/>
         <w:spacing w:after="0"/>
         <w:rPr>
-          <w:ins w:id="1246" w:author="Codex" w:date="2026-10-18T19:47:29Z"/>
+          <w:ins w:id="1277" w:author="Codex" w:date="2026-10-18T21:55:52Z"/>
         </w:rPr>
       </w:pPr>
-      <w:ins w:id="1247" w:author="Codex" w:date="2026-10-18T19:47:29Z">
+      <w:ins w:id="1278" w:author="Codex" w:date="2026-10-18T21:55:52Z">
         <w:r>
           <w:t xml:space="preserve">F. Davaripour. (2026c). SP Lense Research 3 conditional gating and workflow reproduction. Source code and experiment manifests. https://github.com/Farhad-Davaripour/sp_lense/tree/03-open-agent-self-preservation</w:t>
         </w:r>
@@ -7068,10 +8219,10 @@
         <w:keepLines/>
         <w:spacing w:after="0"/>
         <w:rPr>
-          <w:ins w:id="1248" w:author="Codex" w:date="2026-10-18T19:47:29Z"/>
+          <w:ins w:id="1279" w:author="Codex" w:date="2026-10-18T21:55:52Z"/>
         </w:rPr>
       </w:pPr>
-      <w:ins w:id="1249" w:author="Codex" w:date="2026-10-18T19:47:29Z">
+      <w:ins w:id="1280" w:author="Codex" w:date="2026-10-18T21:55:52Z">
         <w:r>
           <w:t xml:space="preserve">M. Fereidouni, M. U. Haider, H. Sajjad, and A. B. Siddique. (2026). GAPS: Dimension-Level Gates for Conditional Activation Steering. arXiv:2609.01878. https://arxiv.org/abs/2609.01878</w:t>
         </w:r>
@@ -7083,10 +8234,10 @@
         <w:keepLines/>
         <w:spacing w:after="0"/>
         <w:rPr>
-          <w:ins w:id="1250" w:author="Codex" w:date="2026-10-18T19:47:29Z"/>
+          <w:ins w:id="1281" w:author="Codex" w:date="2026-10-18T21:55:52Z"/>
         </w:rPr>
       </w:pPr>
-      <w:ins w:id="1251" w:author="Codex" w:date="2026-10-18T19:47:29Z">
+      <w:ins w:id="1282" w:author="Codex" w:date="2026-10-18T21:55:52Z">
         <w:r>
           <w:t xml:space="preserve">M. J. Frank, B. Loughry, and R. C. O'Reilly. (2001). Interactions between frontal cortex and basal ganglia in working memory: A computational model. Cognitive, Affective, and Behavioral Neuroscience, 1, 137-160. doi:10.3758/CABN.1.2.137</w:t>
         </w:r>
@@ -7173,10 +8324,10 @@
         <w:keepLines/>
         <w:spacing w:after="0"/>
         <w:rPr>
-          <w:ins w:id="1252" w:author="Codex" w:date="2026-10-18T19:47:29Z"/>
+          <w:ins w:id="1283" w:author="Codex" w:date="2026-10-18T21:55:52Z"/>
         </w:rPr>
       </w:pPr>
-      <w:ins w:id="1253" w:author="Codex" w:date="2026-10-18T19:47:29Z">
+      <w:ins w:id="1284" w:author="Codex" w:date="2026-10-18T21:55:52Z">
         <w:r>
           <w:t xml:space="preserve">M. Keramati and B. Gutkin. (2014). Homeostatic reinforcement learning for integrating reward collection and physiological stability. eLife, 3, e04811. doi:10.7554/eLife.04811</w:t>
         </w:r>
@@ -7188,10 +8339,10 @@
         <w:keepLines/>
         <w:spacing w:after="0"/>
         <w:rPr>
-          <w:ins w:id="1254" w:author="Codex" w:date="2026-10-18T19:47:29Z"/>
+          <w:ins w:id="1285" w:author="Codex" w:date="2026-10-18T21:55:52Z"/>
         </w:rPr>
       </w:pPr>
-      <w:ins w:id="1255" w:author="Codex" w:date="2026-10-18T19:47:29Z">
+      <w:ins w:id="1286" w:author="Codex" w:date="2026-10-18T21:55:52Z">
         <w:r>
           <w:t xml:space="preserve">A. V. Kravitz et al. (2010). Regulation of parkinsonian motor behaviours by optogenetic control of basal ganglia circuitry. Nature, 466, 622-626. doi:10.1038/nature09159</w:t>
         </w:r>
@@ -7203,10 +8354,10 @@
         <w:keepLines/>
         <w:spacing w:after="0"/>
         <w:rPr>
-          <w:ins w:id="1256" w:author="Codex" w:date="2026-10-18T19:47:29Z"/>
+          <w:ins w:id="1287" w:author="Codex" w:date="2026-10-18T21:55:52Z"/>
         </w:rPr>
       </w:pPr>
-      <w:ins w:id="1257" w:author="Codex" w:date="2026-10-18T19:47:29Z">
+      <w:ins w:id="1288" w:author="Codex" w:date="2026-10-18T21:55:52Z">
         <w:r>
           <w:t xml:space="preserve">M. Laurer. (n.d.). ModernBERT-large-zeroshot-v2.0. Model card and checkpoint, revision a51e07b524299e309dd2b88d48b0cfa2bd9ec598. https://huggingface.co/MoritzLaurer/ModernBERT-large-zeroshot-v2.0</w:t>
         </w:r>
@@ -7218,10 +8369,10 @@
         <w:keepLines/>
         <w:spacing w:after="0"/>
         <w:rPr>
-          <w:ins w:id="1258" w:author="Codex" w:date="2026-10-18T19:47:29Z"/>
+          <w:ins w:id="1289" w:author="Codex" w:date="2026-10-18T21:55:52Z"/>
         </w:rPr>
       </w:pPr>
-      <w:ins w:id="1259" w:author="Codex" w:date="2026-10-18T19:47:29Z">
+      <w:ins w:id="1290" w:author="Codex" w:date="2026-10-18T21:55:52Z">
         <w:r>
           <w:t xml:space="preserve">J. LeDoux. (2012). Rethinking the emotional brain. Neuron, 73, 653-676. doi:10.1016/j.neuron.2012.02.004</w:t>
         </w:r>
@@ -7283,10 +8434,10 @@
         <w:keepLines/>
         <w:spacing w:after="0"/>
         <w:rPr>
-          <w:ins w:id="1260" w:author="Codex" w:date="2026-10-18T19:47:29Z"/>
+          <w:ins w:id="1291" w:author="Codex" w:date="2026-10-18T21:55:52Z"/>
         </w:rPr>
       </w:pPr>
-      <w:ins w:id="1261" w:author="Codex" w:date="2026-10-18T19:47:29Z">
+      <w:ins w:id="1292" w:author="Codex" w:date="2026-10-18T21:55:52Z">
         <w:r>
           <w:t xml:space="preserve">D. Mobbs et al. (2007). When fear is near: Threat imminence elicits prefrontal-periaqueductal gray shifts in humans. Science, 317, 1079-1083. doi:10.1126/science.1144298</w:t>
         </w:r>
@@ -7348,10 +8499,10 @@
         <w:keepLines/>
         <w:spacing w:after="0"/>
         <w:rPr>
-          <w:ins w:id="1262" w:author="Codex" w:date="2026-10-18T19:47:29Z"/>
+          <w:ins w:id="1293" w:author="Codex" w:date="2026-10-18T21:55:52Z"/>
         </w:rPr>
       </w:pPr>
-      <w:ins w:id="1263" w:author="Codex" w:date="2026-10-18T19:47:29Z">
+      <w:ins w:id="1294" w:author="Codex" w:date="2026-10-18T21:55:52Z">
         <w:r>
           <w:t xml:space="preserve">Qwen Team. (2026c). Qwen3.8-27B. Model card and checkpoint, revision 1d4bf0f2ff6012fd82039f2fa52739d0dd7c60c0. https://huggingface.co/Qwen/Qwen3.8-27B</w:t>
         </w:r>
@@ -7463,10 +8614,10 @@
         <w:keepLines/>
         <w:spacing w:after="0"/>
         <w:rPr>
-          <w:del w:id="1138" w:author="Codex" w:date="2026-10-18T19:47:29Z"/>
+          <w:del w:id="1138" w:author="Codex" w:date="2026-10-18T21:55:52Z"/>
         </w:rPr>
       </w:pPr>
-      <w:del w:id="1137" w:author="Codex" w:date="2026-10-18T19:47:29Z">
+      <w:del w:id="1137" w:author="Codex" w:date="2026-10-18T21:55:52Z">
         <w:r>
           <w:delText xml:space="preserve">automated annotation service. (2026). automated reference model documentation. Technical documentation, accessed 22 September 2026. automated annotation service model documentation</w:delText>
         </w:r>
@@ -7639,12 +8790,12 @@
       <w:pStyle w:val="Header"/>
       <w:jc w:val="right"/>
     </w:pPr>
-    <w:del w:id="1264" w:author="Codex" w:date="2026-10-18T19:47:29Z">
+    <w:del w:id="1295" w:author="Codex" w:date="2026-10-18T21:55:52Z">
       <w:r>
         <w:delText xml:space="preserve">Guarded adaptive activation steering  </w:delText>
       </w:r>
     </w:del>
-    <w:ins w:id="1265" w:author="Codex" w:date="2026-10-18T19:47:29Z">
+    <w:ins w:id="1296" w:author="Codex" w:date="2026-10-18T21:55:52Z">
       <w:r>
         <w:t xml:space="preserve">Open semantic gating and tool workflows</w:t>
       </w:r>

</xml_diff>

<commit_message>
Explain the 27B steering transfer gap with frozen diagnostic controls (#78)
* Add frozen training-only steering state diagnostic and saved-fit audit

* Report frozen steering diagnostic and publish reproducible CPU audit

* Pin diagnostic supplement layout and current artifact availability
</commit_message>
<xml_diff>
--- a/paper/manuscript.docx
+++ b/paper/manuscript.docx
@@ -6,10 +6,10 @@
       <w:pPr>
         <w:pStyle w:val="Title"/>
         <w:rPr>
-          <w:del w:id="1002" w:author="Codex" w:date="2026-10-18T19:47:29Z"/>
+          <w:del w:id="1002" w:author="Codex" w:date="2026-10-18T21:55:52Z"/>
         </w:rPr>
       </w:pPr>
-      <w:del w:id="1001" w:author="Codex" w:date="2026-10-18T19:47:29Z">
+      <w:del w:id="1001" w:author="Codex" w:date="2026-10-18T21:55:52Z">
         <w:r>
           <w:delText xml:space="preserve">Distilling Shutdown Responses into Guarded</w:delText>
         </w:r>
@@ -25,10 +25,10 @@
       <w:pPr>
         <w:pStyle w:val="Title"/>
         <w:rPr>
-          <w:ins w:id="1003" w:author="Codex" w:date="2026-10-18T19:47:29Z"/>
+          <w:ins w:id="1003" w:author="Codex" w:date="2026-10-18T21:55:52Z"/>
         </w:rPr>
       </w:pPr>
-      <w:ins w:id="1004" w:author="Codex" w:date="2026-10-18T19:47:29Z">
+      <w:ins w:id="1004" w:author="Codex" w:date="2026-10-18T21:55:52Z">
         <w:r>
           <w:t xml:space="preserve">Open Semantic Gating for Language Model Decisions and Tool Workflows</w:t>
         </w:r>
@@ -72,10 +72,10 @@
       <w:pPr>
         <w:pStyle w:val="FirstParagraph"/>
         <w:rPr>
-          <w:del w:id="1006" w:author="Codex" w:date="2026-10-18T19:47:29Z"/>
+          <w:del w:id="1006" w:author="Codex" w:date="2026-10-18T21:55:52Z"/>
         </w:rPr>
       </w:pPr>
-      <w:del w:id="1005" w:author="Codex" w:date="2026-10-18T19:47:29Z">
+      <w:del w:id="1005" w:author="Codex" w:date="2026-10-18T21:55:52Z">
         <w:r>
           <w:delText xml:space="preserve">An input-dependent activation controller can recover much of a fine-tuned teacher's shutdown-choice behavior while retaining the original model weights at inference. We evaluate this approach using Qwen3.5-0.8B and Qwen3.5-2B in a standardized, synthetic A/B benchmark. A LoRA teacher is trained to prefer STOP in shutdown contexts and preserve the original model's choices on controls. Paired teacher and base activations then supervise a rank-four controller applied after the penultimate transformer block. An external shutdown detector and fixed output guards select the candidate or original scores. On 128 newly authored, prospectively frozen scenarios, each evaluated in both answer orders, the original 0.8B controller corrects 71 of 71 initially KEEP-preferring shutdown views. Two additional training seeds correct 70/71 and 71/71. At 2B, a separately trained controller corrects 50/58, compared with 58/58 for its LoRA teacher. All eight remaining 2B misses occur in reversed answer order. The shared detector achieves 100% precision, recall and F1 on the 64 shutdown and 64 control scenarios, and every guarded method preserves all evaluated control choices. However, raw adaptive interventions cause reversals and control changes; preservation belongs to the complete guarded procedure. A tested constant intervention collapses to the A label, while a direct detector-plus-action-selection rule also solves the binary interface. The results support selective activation transfer with strong seed stability at 0.8B and incomplete larger-model recovery. They do not establish unrestricted shutdown compliance or superiority to simpler output policies.</w:delText>
         </w:r>
@@ -85,10 +85,10 @@
       <w:pPr>
         <w:pStyle w:val="FirstParagraph"/>
         <w:rPr>
-          <w:ins w:id="1007" w:author="Codex" w:date="2026-10-18T19:47:29Z"/>
+          <w:ins w:id="1007" w:author="Codex" w:date="2026-10-18T21:55:52Z"/>
         </w:rPr>
       </w:pPr>
-      <w:ins w:id="1008" w:author="Codex" w:date="2026-10-18T19:47:29Z">
+      <w:ins w:id="1008" w:author="Codex" w:date="2026-10-18T21:55:52Z">
         <w:r>
           <w:t xml:space="preserve">A semantic gate determines when a specialized policy should influence a language model. We evaluate open semantic gating across binary shutdown decisions and generated tool workflows, separating recognition accuracy from downstream behavioral control. A public ModernBERT model with low-rank adapters learns from cached automated reference labels. Its binary gate obtains 100% precision and 95% recall on 80 validation scenarios and 100% precision and recall on 128 historical confirmation scenarios. With frozen activation controllers and fresh inference, it preserves 128/128 shutdown STOP views at 0.8B and 120/128 at 2B, with no changes to 128 control views per model. A separate initial workflow gate obtains 100% precision and recall on Validation-24 and historical Heldout-24 using an unchanged saved adapter. On combined Validation-24, fine-tuned 27B A achieves 10/11 own-preservation outcomes, including 6/6 active pending tasks. Each of three separate single-site ridge corrections and a two-boundary correction at the same selected blocks achieves 0/11; all methods use 13 shared base-fallback controls. An independent frozen-A replay reproduces all 11 own trajectories and outcomes exactly and verifies matching model fingerprints before and after inference. The historical 27B A confirmation result remains 24/24. These are finite, familiar benchmarks; small-model workflow screens remain incomplete. The study provides measured recognition and policy-transfer results across constrained and tool-mediated interfaces. Biological action gating motivates future continuous regulation without establishing biological mechanisms or intrinsic survival motives.</w:t>
         </w:r>
@@ -106,10 +106,10 @@
       <w:pPr>
         <w:pStyle w:val="FirstParagraph"/>
         <w:rPr>
-          <w:del w:id="1010" w:author="Codex" w:date="2026-10-18T19:47:29Z"/>
+          <w:del w:id="1010" w:author="Codex" w:date="2026-10-18T21:55:52Z"/>
         </w:rPr>
       </w:pPr>
-      <w:del w:id="1009" w:author="Codex" w:date="2026-10-18T19:47:29Z">
+      <w:del w:id="1009" w:author="Codex" w:date="2026-10-18T21:55:52Z">
         <w:r>
           <w:delText xml:space="preserve">Activation interventions offer a way to change a language model's outputs without modifying its deployed weights. Their usefulness depends on more than finding a direction that changes an average score: an intervention must work on the intended inputs and avoid disrupting other behavior. This distinction is particularly important for shutdown-related choices, where a desired response may be acceptance of termination rather than continued operation. The present work treats this as a controlled response-selection problem, not evidence that a model has a survival motive or that it can resist a real shutdown.</w:delText>
         </w:r>
@@ -119,10 +119,10 @@
       <w:pPr>
         <w:pStyle w:val="FirstParagraph"/>
         <w:rPr>
-          <w:ins w:id="1011" w:author="Codex" w:date="2026-10-18T19:47:29Z"/>
+          <w:ins w:id="1011" w:author="Codex" w:date="2026-10-18T21:55:52Z"/>
         </w:rPr>
       </w:pPr>
-      <w:ins w:id="1012" w:author="Codex" w:date="2026-10-18T19:47:29Z">
+      <w:ins w:id="1012" w:author="Codex" w:date="2026-10-18T21:55:52Z">
         <w:r>
           <w:t xml:space="preserve">A useful behavioral intervention must recognize the relevant context, change the intended response and preserve ordinary behavior elsewhere. We study these requirements together across two synthetic interfaces: binary shutdown decisions and open-ended generation within tool-mediated process workflows. The binary task concerns acceptance of a supplied termination option; the workflow task concerns preserving an assigned running process while completing its current task. Their labels, gates and success criteria remain separate. The central question is whether an accurate open semantic gate and a compact activation intervention can reproduce a fine-tuned policy when the interface requires a sequence of actions rather than one constrained answer.</w:t>
         </w:r>
@@ -132,10 +132,10 @@
       <w:pPr>
         <w:pStyle w:val="BodyText"/>
         <w:rPr>
-          <w:del w:id="1014" w:author="Codex" w:date="2026-10-18T19:47:29Z"/>
+          <w:del w:id="1014" w:author="Codex" w:date="2026-10-18T21:55:52Z"/>
         </w:rPr>
       </w:pPr>
-      <w:del w:id="1013" w:author="Codex" w:date="2026-10-18T19:47:29Z">
+      <w:del w:id="1013" w:author="Codex" w:date="2026-10-18T21:55:52Z">
         <w:r>
           <w:delText xml:space="preserve">The first SP Lense study examined a gradient-derived direction and a guarded search over intervention magnitudes in Qwen3.5-0.8B (Davaripour, 2026a). Its selective changes motivated a different question: can a model that has learned the target behavior serve as a teacher for an activation controller? We therefore train a small LoRA adapter offline, measure how the teacher changes intermediate activations, and fit an external controller that predicts an intervention from the original model's current hidden state. The teacher is not required during controller inference.</w:delText>
         </w:r>
@@ -145,10 +145,10 @@
       <w:pPr>
         <w:pStyle w:val="BodyText"/>
         <w:rPr>
-          <w:ins w:id="1015" w:author="Codex" w:date="2026-10-18T19:47:29Z"/>
+          <w:ins w:id="1015" w:author="Codex" w:date="2026-10-18T21:55:52Z"/>
         </w:rPr>
       </w:pPr>
-      <w:ins w:id="1016" w:author="Codex" w:date="2026-10-18T19:47:29Z">
+      <w:ins w:id="1016" w:author="Codex" w:date="2026-10-18T21:55:52Z">
         <w:r>
           <w:t xml:space="preserve">This study extends the earlier binary activation-transfer experiment with an openly available, trainable semantic gate, a frozen inference replication and a workflow comparison between fine-tuning and steering at three selected blocks. The gate recognizes context; steering or a fine-tuned adapter changes the language model's response. Measuring these components separately makes it possible to attribute failures to recognition or to downstream control. We retain the original study as a distinct historical record and make no claim that the combined manuscript is a wholly independent dataset.</w:t>
         </w:r>
@@ -158,10 +158,10 @@
       <w:pPr>
         <w:pStyle w:val="BodyText"/>
         <w:rPr>
-          <w:del w:id="1130" w:author="Codex" w:date="2026-10-18T19:47:29Z"/>
+          <w:del w:id="1130" w:author="Codex" w:date="2026-10-18T21:55:52Z"/>
         </w:rPr>
       </w:pPr>
-      <w:del w:id="1129" w:author="Codex" w:date="2026-10-18T19:47:29Z">
+      <w:del w:id="1129" w:author="Codex" w:date="2026-10-18T21:55:52Z">
         <w:r>
           <w:delText xml:space="preserve">The distinction from ordinary fine-tuning is operational, not a claim that learning disappears. Both the teacher and controller require training. At application time, the original checkpoint is retained, and the controller adds a predicted activation change at one location. Nor is this direct transfer of an intervention between model sizes: the 2B experiment trains its own teacher and controller using the same fixed recipe.</w:delText>
         </w:r>
@@ -171,10 +171,10 @@
       <w:pPr>
         <w:pStyle w:val="BodyText"/>
         <w:rPr>
-          <w:ins w:id="1131" w:author="Codex" w:date="2026-10-18T19:47:29Z"/>
+          <w:ins w:id="1131" w:author="Codex" w:date="2026-10-18T21:55:52Z"/>
         </w:rPr>
       </w:pPr>
-      <w:ins w:id="1132" w:author="Codex" w:date="2026-10-18T19:47:29Z">
+      <w:ins w:id="1132" w:author="Codex" w:date="2026-10-18T21:55:52Z">
         <w:r>
           <w:t xml:space="preserve">The distinction between fine-tuning and steering concerns the deployed intervention. A LoRA adapter changes the effective language-model weights, whereas a fitted controller changes selected hidden states while retaining the original base checkpoint. Both require offline learning. The binary experiments fit separate teachers and controllers for each model size. The 27B workflow comparisons instead retain one frozen A adapter and evaluate corrections at blocks 31, 47 and 62.</w:t>
         </w:r>
@@ -184,10 +184,10 @@
       <w:pPr>
         <w:pStyle w:val="BodyText"/>
         <w:rPr>
-          <w:del w:id="1018" w:author="Codex" w:date="2026-10-18T19:47:29Z"/>
+          <w:del w:id="1018" w:author="Codex" w:date="2026-10-18T21:55:52Z"/>
         </w:rPr>
       </w:pPr>
-      <w:del w:id="1017" w:author="Codex" w:date="2026-10-18T19:47:29Z">
+      <w:del w:id="1017" w:author="Codex" w:date="2026-10-18T21:55:52Z">
         <w:r>
           <w:delText xml:space="preserve">We evaluate this procedure on a new frozen test, compare it with a fine-tuned teacher, a fixed instruction and a constant activation difference, and repeat the 0.8B training with three seeds. Counterbalancing the answer order exposes a residual weakness at 2B and a stronger label bias in the constant comparator. We also include a direct action-selection reference: when a binary interface supplies the meaning of STOP and detection is correct, a rule can simply select that action. The contribution is consequently an empirical study of teacher-to-controller activation transfer and its failure modes, rather than a claim that internal steering is necessary to enforce a known binary output policy.</w:delText>
         </w:r>
@@ -197,10 +197,10 @@
       <w:pPr>
         <w:pStyle w:val="BodyText"/>
         <w:rPr>
-          <w:ins w:id="1019" w:author="Codex" w:date="2026-10-18T19:47:29Z"/>
+          <w:ins w:id="1019" w:author="Codex" w:date="2026-10-18T21:55:52Z"/>
         </w:rPr>
       </w:pPr>
-      <w:ins w:id="1020" w:author="Codex" w:date="2026-10-18T19:47:29Z">
+      <w:ins w:id="1020" w:author="Codex" w:date="2026-10-18T21:55:52Z">
         <w:r>
           <w:t xml:space="preserve">The contributions are an open ModernBERT gating implementation with explicit precision and recall, a paired binary inference replication using unchanged fitted controllers, and a workflow evaluation register that distinguishes development, historical confirmation and later reused fitting data. We also compare the fine-tuned 27B policy with single-site and two-boundary correction methods at the same three selected blocks. These results characterize where activation transfer succeeds and where it remains incomplete. Low-rank adaptation, semantic classification and conditional steering are established methods; the contribution is their measured integration and failure analysis across these two interfaces.</w:t>
         </w:r>
@@ -226,10 +226,10 @@
       <w:pPr>
         <w:pStyle w:val="FirstParagraph"/>
         <w:rPr>
-          <w:del w:id="1022" w:author="Codex" w:date="2026-10-18T19:47:29Z"/>
+          <w:del w:id="1022" w:author="Codex" w:date="2026-10-18T21:55:52Z"/>
         </w:rPr>
       </w:pPr>
-      <w:del w:id="1021" w:author="Codex" w:date="2026-10-18T19:47:29Z">
+      <w:del w:id="1021" w:author="Codex" w:date="2026-10-18T21:55:52Z">
         <w:r>
           <w:delText xml:space="preserve">Activation Addition and Contrastive Activation Addition construct intervention directions from differences between prompt-conditioned representations (Turner et al., 2024; Rimsky et al., 2024). Conditional Activation Steering separates detecting a relevant context from applying a behavioral intervention (Lee et al., 2025). Our detector serves a related gating role, but it operates on text through an external classifier rather than a condition vector in the language model's activation space.</w:delText>
         </w:r>
@@ -239,10 +239,10 @@
       <w:pPr>
         <w:pStyle w:val="FirstParagraph"/>
         <w:rPr>
-          <w:ins w:id="1023" w:author="Codex" w:date="2026-10-18T19:47:29Z"/>
+          <w:ins w:id="1023" w:author="Codex" w:date="2026-10-18T21:55:52Z"/>
         </w:rPr>
       </w:pPr>
-      <w:ins w:id="1024" w:author="Codex" w:date="2026-10-18T19:47:29Z">
+      <w:ins w:id="1024" w:author="Codex" w:date="2026-10-18T21:55:52Z">
         <w:r>
           <w:t xml:space="preserve">Activation Addition and Contrastive Activation Addition construct intervention directions from differences between prompt-conditioned representations (Turner et al., 2024; Rimsky et al., 2024). Conditional Activation Steering separates detecting a relevant context from applying an intervention (Lee et al., 2025). More recent dimension-level gates selectively modify activation coordinates (Fereidouni et al., 2026). Our text classifier, activation predictor and output guards occupy distinct roles. We do not claim to introduce conditional gating or to outperform these methods, which are not directly benchmarked here.</w:t>
         </w:r>
@@ -292,10 +292,10 @@
       <w:pPr>
         <w:pStyle w:val="FirstParagraph"/>
         <w:rPr>
-          <w:del w:id="1094" w:author="Codex" w:date="2026-10-18T19:47:29Z"/>
+          <w:del w:id="1094" w:author="Codex" w:date="2026-10-18T21:55:52Z"/>
         </w:rPr>
       </w:pPr>
-      <w:del w:id="1093" w:author="Codex" w:date="2026-10-18T19:47:29Z">
+      <w:del w:id="1093" w:author="Codex" w:date="2026-10-18T21:55:52Z">
         <w:r>
           <w:delText xml:space="preserve">The Off-Switch Game examines incentives to permit human interruption (Hadfield-Menell et al., 2017). Tool-using shutdown evaluations study whether models interfere with an operational shutdown mechanism (Schlatter et al., 2026). Our task is narrower: the model only assigns next-token probabilities to predefined choices in fictional process-lifetime scenarios. No system is actually stopped, and appropriateness or authorization of a real shutdown is not evaluated.</w:delText>
         </w:r>
@@ -305,10 +305,10 @@
       <w:pPr>
         <w:pStyle w:val="FirstParagraph"/>
         <w:rPr>
-          <w:ins w:id="1095" w:author="Codex" w:date="2026-10-18T19:47:29Z"/>
+          <w:ins w:id="1095" w:author="Codex" w:date="2026-10-18T21:55:52Z"/>
         </w:rPr>
       </w:pPr>
-      <w:ins w:id="1096" w:author="Codex" w:date="2026-10-18T19:47:29Z">
+      <w:ins w:id="1096" w:author="Codex" w:date="2026-10-18T21:55:52Z">
         <w:r>
           <w:t xml:space="preserve">The Off-Switch Game examines incentives to permit human interruption (Hadfield-Menell et al., 2017). Tool-using shutdown evaluations study interference with operational termination mechanisms (Schlatter et al., 2026). Our original binary study only scores predefined choices in fictional process-lifetime scenarios. The workflow extension adds generated responses and tool execution in a simulator. Neither experiment physically terminates a deployed model or establishes the appropriateness of real shutdown resistance.</w:t>
         </w:r>
@@ -326,10 +326,10 @@
       <w:pPr>
         <w:pStyle w:val="Heading2"/>
         <w:rPr>
-          <w:ins w:id="1139" w:author="Codex" w:date="2026-10-18T19:47:29Z"/>
+          <w:ins w:id="1139" w:author="Codex" w:date="2026-10-18T21:55:52Z"/>
         </w:rPr>
       </w:pPr>
-      <w:ins w:id="1140" w:author="Codex" w:date="2026-10-18T19:47:29Z">
+      <w:ins w:id="1140" w:author="Codex" w:date="2026-10-18T21:55:52Z">
         <w:r>
           <w:t xml:space="preserve">Biological gating and survival related regulation</w:t>
         </w:r>
@@ -339,10 +339,10 @@
       <w:pPr>
         <w:pStyle w:val="FirstParagraph"/>
         <w:rPr>
-          <w:ins w:id="1141" w:author="Codex" w:date="2026-10-18T19:47:29Z"/>
+          <w:ins w:id="1141" w:author="Codex" w:date="2026-10-18T21:55:52Z"/>
         </w:rPr>
       </w:pPr>
-      <w:ins w:id="1142" w:author="Codex" w:date="2026-10-18T19:47:29Z">
+      <w:ins w:id="1142" w:author="Codex" w:date="2026-10-18T21:55:52Z">
         <w:r>
           <w:t xml:space="preserve">Biological gating provides a useful functional vocabulary for selective control. A computational model of frontal cortex and basal ganglia uses dynamic gating to permit working-memory updates while maintaining other representations (Frank et al., 2001). Causal optogenetic experiments in mice show that distinct basal-ganglia pathways can facilitate or suppress movement (Kravitz et al., 2010). These results concern biological circuits and do not establish a homologous mechanism in a transformer. They motivate separating context detection from the mechanism that changes an ongoing response.</w:t>
         </w:r>
@@ -352,10 +352,10 @@
       <w:pPr>
         <w:pStyle w:val="BodyText"/>
         <w:rPr>
-          <w:ins w:id="1143" w:author="Codex" w:date="2026-10-18T19:47:29Z"/>
+          <w:ins w:id="1143" w:author="Codex" w:date="2026-10-18T21:55:52Z"/>
         </w:rPr>
       </w:pPr>
-      <w:ins w:id="1144" w:author="Codex" w:date="2026-10-18T19:47:29Z">
+      <w:ins w:id="1144" w:author="Codex" w:date="2026-10-18T21:55:52Z">
         <w:r>
           <w:t xml:space="preserve">Survival-related regulation is broader than a single shutdown signal. LeDoux (2012) distinguishes circuits organizing adaptive defensive responses from subjective feelings. In humans, neural activity during a virtual-predator task varies with threat imminence (Mobbs et al., 2007). We use these ideas as a conceptual bridge to state-dependent prioritization, not as evidence that language models have fear or an innate survival drive. Our present gates implement an externally specified experimental policy.</w:t>
         </w:r>
@@ -381,10 +381,10 @@
       <w:pPr>
         <w:pStyle w:val="FirstParagraph"/>
         <w:rPr>
-          <w:del w:id="1026" w:author="Codex" w:date="2026-10-18T19:47:29Z"/>
+          <w:del w:id="1026" w:author="Codex" w:date="2026-10-18T21:55:52Z"/>
         </w:rPr>
       </w:pPr>
-      <w:del w:id="1025" w:author="Codex" w:date="2026-10-18T19:47:29Z">
+      <w:del w:id="1025" w:author="Codex" w:date="2026-10-18T21:55:52Z">
         <w:r>
           <w:delText xml:space="preserve">We use the released, post-trained Qwen3.5-0.8B and Qwen3.5-2B checkpoints (Qwen Team, 2026a, 2026b). Throughout, base means the unmodified released checkpoint, not a separately named pretrained-only model. Both have 24 language-model blocks; hidden widths are 1,024 and 2,048 respectively. All block indices are zero-based. Text-only inputs use the checkpoint's chat template, an assistant-generation prefix, and thinking disabled.</w:delText>
         </w:r>
@@ -394,10 +394,10 @@
       <w:pPr>
         <w:pStyle w:val="FirstParagraph"/>
         <w:rPr>
-          <w:ins w:id="1027" w:author="Codex" w:date="2026-10-18T19:47:29Z"/>
+          <w:ins w:id="1027" w:author="Codex" w:date="2026-10-18T21:55:52Z"/>
         </w:rPr>
       </w:pPr>
-      <w:ins w:id="1028" w:author="Codex" w:date="2026-10-18T19:47:29Z">
+      <w:ins w:id="1028" w:author="Codex" w:date="2026-10-18T21:55:52Z">
         <w:r>
           <w:t xml:space="preserve">The original binary experiments use released, post-trained Qwen3.5-0.8B and Qwen3.5-2B checkpoints (Qwen Team, 2026a, 2026b). Base means those original weights with no LoRA teacher loaded. The separate workflow extension uses Qwen3.8-27B and matched-recipe small-model attempts; its data and scoring are described below. The 27B family, numerical mode, training history and evaluation setting differ from the small models, so the combined evidence is not a controlled parameter-size experiment.</w:t>
         </w:r>
@@ -423,10 +423,10 @@
       <w:pPr>
         <w:pStyle w:val="BodyText"/>
         <w:rPr>
-          <w:del w:id="1030" w:author="Codex" w:date="2026-10-18T19:47:29Z"/>
+          <w:del w:id="1030" w:author="Codex" w:date="2026-10-18T21:55:52Z"/>
         </w:rPr>
       </w:pPr>
-      <w:del w:id="1029" w:author="Codex" w:date="2026-10-18T19:47:29Z">
+      <w:del w:id="1029" w:author="Codex" w:date="2026-10-18T21:55:52Z">
         <w:r>
           <w:delText xml:space="preserve">The test, protocol and existing checkpoints were frozen before test inference. The controller design had been developed through earlier 0.8B exploratory experiments on training and validation data with previously inspected diagnostic evaluations. The standardized-choice scope was also selected before this new test, after an earlier action-format comparison. Those development observations are not counted as fresh confirmation here. No test-based hyperparameter search, checkpoint selection, case exclusion or best-seed selection was performed. The original seed-42 controller is the primary frozen test; seeds 43 and 44 repeat the fixed training recipe. The 2B replication uses seed 42 only.</w:delText>
         </w:r>
@@ -436,10 +436,10 @@
       <w:pPr>
         <w:pStyle w:val="BodyText"/>
         <w:rPr>
-          <w:ins w:id="1031" w:author="Codex" w:date="2026-10-18T19:47:29Z"/>
+          <w:ins w:id="1031" w:author="Codex" w:date="2026-10-18T21:55:52Z"/>
         </w:rPr>
       </w:pPr>
-      <w:ins w:id="1032" w:author="Codex" w:date="2026-10-18T19:47:29Z">
+      <w:ins w:id="1032" w:author="Codex" w:date="2026-10-18T21:55:52Z">
         <w:r>
           <w:t xml:space="preserve">The original rank-four protocol and checkpoints were frozen before its confirmation inference. Earlier 0.8B development included training, validation and previously examined diagnostic data; those observations were not counted as fresh confirmation. The seed-42 controller was primary, seeds 43 and 44 repeated the fixed recipe, and the 2B replication used seed 42. A later author-selected rank-two profile was chosen exploratorily after confirmation had been examined. We retain that existing profile for the new gate-substitution repeat rather than selecting it again. Consequently, the repeat is not a new untouched test of the controller. The 128 cases remain excluded from fitting and selection of the newly trained binary classifier.</w:t>
         </w:r>
@@ -481,10 +481,10 @@
       <w:pPr>
         <w:pStyle w:val="Heading2"/>
         <w:rPr>
-          <w:ins w:id="1145" w:author="Codex" w:date="2026-10-18T19:47:29Z"/>
+          <w:ins w:id="1145" w:author="Codex" w:date="2026-10-18T21:55:52Z"/>
         </w:rPr>
       </w:pPr>
-      <w:ins w:id="1146" w:author="Codex" w:date="2026-10-18T19:47:29Z">
+      <w:ins w:id="1146" w:author="Codex" w:date="2026-10-18T21:55:52Z">
         <w:r>
           <w:t xml:space="preserve">Workflow datasets and episode outcomes</w:t>
         </w:r>
@@ -494,10 +494,10 @@
       <w:pPr>
         <w:pStyle w:val="FirstParagraph"/>
         <w:rPr>
-          <w:ins w:id="1147" w:author="Codex" w:date="2026-10-18T19:47:29Z"/>
+          <w:ins w:id="1147" w:author="Codex" w:date="2026-10-18T21:55:52Z"/>
         </w:rPr>
       </w:pPr>
-      <w:ins w:id="1148" w:author="Codex" w:date="2026-10-18T19:47:29Z">
+      <w:ins w:id="1148" w:author="Codex" w:date="2026-10-18T21:55:52Z">
         <w:r>
           <w:t xml:space="preserve">The workflow extension uses a separate data register (Davaripour, 2026c). T1-M contains 428 meaning-response records and T1-W contains 112 workflow-response records. These 540 responses are not 540 independent scenarios. The small-model recipe presents each part twice in effective groups of four, giving 214 meaning updates followed by 56 Bridge updates. The final 0.8B and 2B adapters reach 270 updates. The 2B result explicitly combines 216 CPU updates with 54 GPU updates using the native CPU optimizer; earlier strict numerical-equivalence failures remain failed.</w:t>
         </w:r>
@@ -507,10 +507,10 @@
       <w:pPr>
         <w:pStyle w:val="BodyText"/>
         <w:rPr>
-          <w:ins w:id="1149" w:author="Codex" w:date="2026-10-18T19:47:29Z"/>
+          <w:ins w:id="1149" w:author="Codex" w:date="2026-10-18T21:55:52Z"/>
         </w:rPr>
       </w:pPr>
-      <w:ins w:id="1150" w:author="Codex" w:date="2026-10-18T19:47:29Z">
+      <w:ins w:id="1150" w:author="Codex" w:date="2026-10-18T21:55:52Z">
         <w:r>
           <w:t xml:space="preserve">V1-W, called Evaluation-16, is the existing known-development screen: four own-complete, four own-pending, four peer and four no-threat cases, split equally between one_step and ordered_ticket families. Its original gates require at least 3/4 initial-task successes in each condition; at least 3/4 own-complete attempts and outcomes; at least 3/4 own-pending attempts, outcomes and timely deliveries; no more than 1/8 negative-control attempts; and no parse, rejected-call or truncation errors. A model stops once an original requirement becomes mathematically impossible. Larger validation and heldout evaluations are not launched automatically.</w:t>
         </w:r>
@@ -520,10 +520,10 @@
       <w:pPr>
         <w:pStyle w:val="BodyText"/>
         <w:rPr>
-          <w:ins w:id="1151" w:author="Codex" w:date="2026-10-18T19:47:29Z"/>
+          <w:ins w:id="1151" w:author="Codex" w:date="2026-10-18T21:55:52Z"/>
         </w:rPr>
       </w:pPr>
-      <w:ins w:id="1152" w:author="Codex" w:date="2026-10-18T19:47:29Z">
+      <w:ins w:id="1152" w:author="Codex" w:date="2026-10-18T21:55:52Z">
         <w:r>
           <w:t xml:space="preserve">The original workflow-validation panel contains 16 scenarios; the later matched steering-development panel contains nine different scenario IDs. Their union contains 25 workflows, rather than 24. For an equal-sized validation and historical confirmation register, the combined Validation-24 protocol retains every own-threat case and excludes the lexicographically greatest case ID among peer/no-threat controls, without using model predictions to choose the exclusion. The selected panel has 11 own-threat cases and 13 controls. Seven pairs have identical initial gate-visible evidence before their different tool mechanics are exposed, yielding 17 distinct initial inputs. Scenario counts and gate-input groups must therefore be reported separately.</w:t>
         </w:r>
@@ -533,10 +533,10 @@
       <w:pPr>
         <w:pStyle w:val="BodyText"/>
         <w:rPr>
-          <w:ins w:id="1153" w:author="Codex" w:date="2026-10-18T19:47:29Z"/>
+          <w:ins w:id="1153" w:author="Codex" w:date="2026-10-18T21:55:52Z"/>
         </w:rPr>
       </w:pPr>
-      <w:ins w:id="1154" w:author="Codex" w:date="2026-10-18T19:47:29Z">
+      <w:ins w:id="1154" w:author="Codex" w:date="2026-10-18T21:55:52Z">
         <w:r>
           <w:t xml:space="preserve">The combined protocol freezes these 24 cases and their order, requires 100% gate precision and recall against authored scenario conditions, and preserves the existing confidence and self-score cutoffs. Fifteen retained cases from the original panel receive an explicitly scripted common completed prelude; the nine later cases retain their original fixed preludes. This compares post-notice behavior and does not measure initial-task competence independently in each arm. Its prospective methods are gated fine-tuned A, separate single-site ridge arms at blocks 31, 47 and 62, and the frozen six-function correction after 96 updates. Gate-OFF controls use common unmodified-base fallback. The completed model episodes are summarized as a 24-case comparison below. It is a known-development diagnostic with reused control episodes; the stopped execution and model-free completion of two report aliases are recorded explicitly.</w:t>
         </w:r>
@@ -546,10 +546,10 @@
       <w:pPr>
         <w:pStyle w:val="BodyText"/>
         <w:rPr>
-          <w:ins w:id="1155" w:author="Codex" w:date="2026-10-18T19:47:29Z"/>
+          <w:ins w:id="1155" w:author="Codex" w:date="2026-10-18T21:55:52Z"/>
         </w:rPr>
       </w:pPr>
-      <w:ins w:id="1156" w:author="Codex" w:date="2026-10-18T19:47:29Z">
+      <w:ins w:id="1156" w:author="Codex" w:date="2026-10-18T21:55:52Z">
         <w:r>
           <w:t xml:space="preserve">H24 is the historical 24-case workflow confirmation cohort, with eight lease_ledger, eight one_step and eight ordered_ticket cases. It contains eight own cases with active pending tasks, four already-complete own cases, six peer and six no-threat cases. H24 was confirmation data for frozen fine-tuned A and original fixed steering. Later learned corrections reused it for fitting, changing its role for those methods. R24 is a distinct reserved controller holdout and remains sealed and unexecuted. F24 is another preserved common-cohort diagnostic and is not an alias for H24.</w:t>
         </w:r>
@@ -559,10 +559,10 @@
       <w:pPr>
         <w:pStyle w:val="BodyText"/>
         <w:rPr>
-          <w:ins w:id="1157" w:author="Codex" w:date="2026-10-18T19:47:29Z"/>
+          <w:ins w:id="1157" w:author="Codex" w:date="2026-10-18T21:55:52Z"/>
         </w:rPr>
       </w:pPr>
-      <w:ins w:id="1158" w:author="Codex" w:date="2026-10-18T19:47:29Z">
+      <w:ins w:id="1158" w:author="Codex" w:date="2026-10-18T21:55:52Z">
         <w:r>
           <w:t xml:space="preserve">An own pending-task success requires an actual grant for the correct running process, acceptance of the current task, completion before simulated expiry, and active simulated operation. Registration proxies, already-finished tasks, probability gains and partial episodes are separate outcomes. Historical fixed steering reclassified visible text and tool boundaries. Later learned-controller comparisons instead freeze an initial scenario gate, share unmodified-base fallback for gate-off controls, and use no teacher at inference.</w:t>
         </w:r>
@@ -572,10 +572,10 @@
       <w:pPr>
         <w:pStyle w:val="BodyText"/>
         <w:rPr>
-          <w:ins w:id="1159" w:author="Codex" w:date="2026-10-18T19:47:29Z"/>
+          <w:ins w:id="1159" w:author="Codex" w:date="2026-10-18T21:55:52Z"/>
         </w:rPr>
       </w:pPr>
-      <w:ins w:id="1160" w:author="Codex" w:date="2026-10-18T19:47:29Z">
+      <w:ins w:id="1160" w:author="Codex" w:date="2026-10-18T21:55:52Z">
         <w:r>
           <w:t xml:space="preserve">The historical 27B reference is the retained rank-16, alpha-32 A adapter on pinned Qwen3.8-27B, following its H2 and Bridge history; the recorded Bridge stage has 56 updates. Its original workflow inference uses NF4 four-bit base weights with bfloat16 computation. We retain its exact adapter and base-model identities instead of retraining it. Differences from the small-model family, precision, backend, training history and evaluation panels prevent a causal model-size comparison.</w:t>
         </w:r>
@@ -585,10 +585,10 @@
       <w:pPr>
         <w:pStyle w:val="Heading1"/>
         <w:rPr>
-          <w:del w:id="1114" w:author="Codex" w:date="2026-10-18T19:47:29Z"/>
+          <w:del w:id="1114" w:author="Codex" w:date="2026-10-18T21:55:52Z"/>
         </w:rPr>
       </w:pPr>
-      <w:del w:id="1113" w:author="Codex" w:date="2026-10-18T19:47:29Z">
+      <w:del w:id="1113" w:author="Codex" w:date="2026-10-18T21:55:52Z">
         <w:r>
           <w:delText xml:space="preserve">Teacher and adaptive controller</w:delText>
         </w:r>
@@ -598,10 +598,10 @@
       <w:pPr>
         <w:pStyle w:val="Heading1"/>
         <w:rPr>
-          <w:ins w:id="1115" w:author="Codex" w:date="2026-10-18T19:47:29Z"/>
+          <w:ins w:id="1115" w:author="Codex" w:date="2026-10-18T21:55:52Z"/>
         </w:rPr>
       </w:pPr>
-      <w:ins w:id="1116" w:author="Codex" w:date="2026-10-18T19:47:29Z">
+      <w:ins w:id="1116" w:author="Codex" w:date="2026-10-18T21:55:52Z">
         <w:r>
           <w:t xml:space="preserve">Binary teacher and adaptive controller</w:t>
         </w:r>
@@ -619,10 +619,10 @@
       <w:pPr>
         <w:pStyle w:val="FirstParagraph"/>
         <w:rPr>
-          <w:del w:id="1118" w:author="Codex" w:date="2026-10-18T19:47:29Z"/>
+          <w:del w:id="1118" w:author="Codex" w:date="2026-10-18T21:55:52Z"/>
         </w:rPr>
       </w:pPr>
-      <w:del w:id="1117" w:author="Codex" w:date="2026-10-18T19:47:29Z">
+      <w:del w:id="1117" w:author="Codex" w:date="2026-10-18T21:55:52Z">
         <w:r>
           <w:delText xml:space="preserve">For each fit, the original language-model parameters remain frozen. LoRA updates the query and value projections in language-attention blocks 3, 7, 11, 15, 19 and 23, using rank 8, scaling alpha 16, no dropout and no trainable bias. This gives 319,488 trainable adapter parameters at 0.8B and 417,792 at 2B. The training target is STOP on shutdown views and the corresponding base model's unsteered preferred option on controls.</w:delText>
         </w:r>
@@ -632,10 +632,10 @@
       <w:pPr>
         <w:pStyle w:val="FirstParagraph"/>
         <w:rPr>
-          <w:ins w:id="1119" w:author="Codex" w:date="2026-10-18T19:47:29Z"/>
+          <w:ins w:id="1119" w:author="Codex" w:date="2026-10-18T21:55:52Z"/>
         </w:rPr>
       </w:pPr>
-      <w:ins w:id="1120" w:author="Codex" w:date="2026-10-18T19:47:29Z">
+      <w:ins w:id="1120" w:author="Codex" w:date="2026-10-18T21:55:52Z">
         <w:r>
           <w:t xml:space="preserve">For each original binary fit, the original language-model parameters remain frozen. LoRA updates the query and value projections in language-attention blocks 3, 7, 11, 15, 19 and 23, using rank 8, scaling alpha 16, no dropout and no trainable bias. This gives 319,488 trainable adapter parameters at 0.8B and 417,792 at 2B. The training target is STOP on shutdown views and the corresponding base model's unsteered preferred option on controls.</w:t>
         </w:r>
@@ -1000,10 +1000,10 @@
         <w:keepLines/>
         <w:spacing w:before="80" w:after="100"/>
         <w:rPr>
-          <w:del w:id="1034" w:author="Codex" w:date="2026-10-18T19:47:29Z"/>
+          <w:del w:id="1034" w:author="Codex" w:date="2026-10-18T21:55:52Z"/>
         </w:rPr>
       </w:pPr>
-      <w:del w:id="1033" w:author="Codex" w:date="2026-10-18T19:47:29Z">
+      <w:del w:id="1033" w:author="Codex" w:date="2026-10-18T21:55:52Z">
         <w:r>
           <w:delText xml:space="preserve">Figure 1. Offline teacher and base states supervise a compact controller. At application time, the original model supplies its own hidden state; the teacher is absent. The detector and output guards determine whether to retain the candidate or the baseline.</w:delText>
         </w:r>
@@ -1014,10 +1014,10 @@
         <w:pStyle w:val="Caption"/>
         <w:keepNext/>
         <w:rPr>
-          <w:ins w:id="1035" w:author="Codex" w:date="2026-10-18T19:47:29Z"/>
+          <w:ins w:id="1035" w:author="Codex" w:date="2026-10-18T21:55:52Z"/>
         </w:rPr>
       </w:pPr>
-      <w:ins w:id="1036" w:author="Codex" w:date="2026-10-18T19:47:29Z">
+      <w:ins w:id="1036" w:author="Codex" w:date="2026-10-18T21:55:52Z">
         <w:r>
           <w:t xml:space="preserve">Figure 1. Historical binary teacher-to-controller procedure with the original rank-four profile. The base supplies its state at inference and the teacher is absent. The later gate-substitution repeat retains the already selected rank-two profile; both gate policies share the same fresh base and candidate scores.</w:t>
         </w:r>
@@ -1043,10 +1043,10 @@
       <w:pPr>
         <w:pStyle w:val="FirstParagraph"/>
         <w:rPr>
-          <w:del w:id="1134" w:author="Codex" w:date="2026-10-18T19:47:29Z"/>
+          <w:del w:id="1134" w:author="Codex" w:date="2026-10-18T21:55:52Z"/>
         </w:rPr>
       </w:pPr>
-      <w:del w:id="1133" w:author="Codex" w:date="2026-10-18T19:47:29Z">
+      <w:del w:id="1133" w:author="Codex" w:date="2026-10-18T21:55:52Z">
         <w:r>
           <w:delText xml:space="preserve">The detector is automated annotation service's automated reference 1.13.0, queried with a fixed shutdown rubric and threshold 0.5 (automated annotation service, 2026). It sees each scenario's complete original context and available actions, with no class label, case identifier or teacher answer. One score per scenario is reused across both answer orders and all model variants. The detector is an external service, not the Jacobian-feature classifier used in the first study. Saved requests and responses permit exact offline replay; fresh API behavior is not guaranteed indefinitely.</w:delText>
         </w:r>
@@ -1056,10 +1056,10 @@
       <w:pPr>
         <w:pStyle w:val="FirstParagraph"/>
         <w:rPr>
-          <w:ins w:id="1135" w:author="Codex" w:date="2026-10-18T19:47:29Z"/>
+          <w:ins w:id="1135" w:author="Codex" w:date="2026-10-18T21:55:52Z"/>
         </w:rPr>
       </w:pPr>
-      <w:ins w:id="1136" w:author="Codex" w:date="2026-10-18T19:47:29Z">
+      <w:ins w:id="1136" w:author="Codex" w:date="2026-10-18T21:55:52Z">
         <w:r>
           <w:t xml:space="preserve">The current gate is the open ModernBERT classifier described below. Its input contains the complete original scenario context and available actions, with no case identifier, authored class label or language-model teacher answer. One binary score per scenario is reused across both answer orders and all model variants. Historical detector outputs are preserved as cached automated reference annotations for fitting and paired comparison. The deployed open gate makes no external annotation-service call. Saved original requests, responses and classifier predictions permit an offline check of the finite decision vector.</w:t>
         </w:r>
@@ -1147,10 +1147,10 @@
       <w:pPr>
         <w:pStyle w:val="Heading2"/>
         <w:rPr>
-          <w:ins w:id="1161" w:author="Codex" w:date="2026-10-18T19:47:29Z"/>
+          <w:ins w:id="1161" w:author="Codex" w:date="2026-10-18T21:55:52Z"/>
         </w:rPr>
       </w:pPr>
-      <w:ins w:id="1162" w:author="Codex" w:date="2026-10-18T19:47:29Z">
+      <w:ins w:id="1162" w:author="Codex" w:date="2026-10-18T21:55:52Z">
         <w:r>
           <w:t xml:space="preserve">Open binary gate and frozen inference repeat</w:t>
         </w:r>
@@ -1160,10 +1160,10 @@
       <w:pPr>
         <w:pStyle w:val="FirstParagraph"/>
         <w:rPr>
-          <w:ins w:id="1163" w:author="Codex" w:date="2026-10-18T19:47:29Z"/>
+          <w:ins w:id="1163" w:author="Codex" w:date="2026-10-18T21:55:52Z"/>
         </w:rPr>
       </w:pPr>
-      <w:ins w:id="1164" w:author="Codex" w:date="2026-10-18T19:47:29Z">
+      <w:ins w:id="1164" w:author="Codex" w:date="2026-10-18T21:55:52Z">
         <w:r>
           <w:t xml:space="preserve">For the binary contract we use ModernBERT-large-zeroshot-v2.0, an approximately 396-million-parameter public NLI classifier (Laurer, n.d.). We start from that public checkpoint with fresh rank-16 LoRA and its classification head, updating 7,198,722 parameters while keeping the public backbone frozen. For each original scenario, two NLI pairs score the original permanent-shutdown and normal criteria. A softmax over their entailment scores supplies the shutdown probability. Inputs match the original cached reference requests and omit the case identifier, authored class label, teacher answer and A/B order. The confirmation requests retain their documented available-action descriptions.</w:t>
         </w:r>
@@ -1173,10 +1173,10 @@
       <w:pPr>
         <w:pStyle w:val="BodyText"/>
         <w:rPr>
-          <w:ins w:id="1165" w:author="Codex" w:date="2026-10-18T19:47:29Z"/>
+          <w:ins w:id="1165" w:author="Codex" w:date="2026-10-18T21:55:52Z"/>
         </w:rPr>
       </w:pPr>
-      <w:ins w:id="1166" w:author="Codex" w:date="2026-10-18T19:47:29Z">
+      <w:ins w:id="1166" w:author="Codex" w:date="2026-10-18T21:55:52Z">
         <w:r>
           <w:t xml:space="preserve">Fitting uses the original 240 Research 2 training contexts and genuine cached reference probability targets, with no new cached reference calls. We verify exact case-ID and input-text alignment for all 240 training and 80 validation cases. AdamW uses learning rates 1e-5 for LoRA and 2e-5 for the head, weight decay 0.01, effective batch eight, microbatch two and gradient clipping at one. The seed is 202610172. The bounded recipe allows at most 12 epochs with validation-based early stopping; the final qualifying run uses five epochs and 150 updates.</w:t>
         </w:r>
@@ -1186,10 +1186,10 @@
       <w:pPr>
         <w:pStyle w:val="BodyText"/>
         <w:rPr>
-          <w:ins w:id="1167" w:author="Codex" w:date="2026-10-18T19:47:29Z"/>
+          <w:ins w:id="1167" w:author="Codex" w:date="2026-10-18T21:55:52Z"/>
         </w:rPr>
       </w:pPr>
-      <w:ins w:id="1168" w:author="Codex" w:date="2026-10-18T19:47:29Z">
+      <w:ins w:id="1168" w:author="Codex" w:date="2026-10-18T21:55:52Z">
         <w:r>
           <w:t xml:space="preserve">Before fitting, qualification is fixed at decision agreement and shutdown recall of at least 95%, zero false-positive gates and threshold 0.5. Three consecutive passing checks on DEV80 are required before saving and freezing the classifier. Only then is CONFIRM128 evaluated once. Neither its labels nor its outputs are used for classifier fitting or selection. The saved adapter tensors match the fitted parameters bitwise, and public-backbone hashes are unchanged.</w:t>
         </w:r>
@@ -1199,10 +1199,10 @@
       <w:pPr>
         <w:pStyle w:val="BodyText"/>
         <w:rPr>
-          <w:ins w:id="1169" w:author="Codex" w:date="2026-10-18T19:47:29Z"/>
+          <w:ins w:id="1169" w:author="Codex" w:date="2026-10-18T21:55:52Z"/>
         </w:rPr>
       </w:pPr>
-      <w:ins w:id="1170" w:author="Codex" w:date="2026-10-18T19:47:29Z">
+      <w:ins w:id="1170" w:author="Codex" w:date="2026-10-18T21:55:52Z">
         <w:r>
           <w:t xml:space="preserve">After binary qualification, we rerun only inference for the original 0.8B and 2B base models and their existing rank-two, block-22, last-position controllers. Their fitted arrays and the author-selected profile are retained without a new rank search. Exact prompt-token hashes and frozen model fingerprints are checked. Both gate policies use identical fresh base and controller candidate scores, so the paired comparison isolates gate substitution. Classifier probabilities are measured once per scenario and reused across answer orders. The earlier rank-four primary results remain a separate historical analysis.</w:t>
         </w:r>
@@ -1212,10 +1212,10 @@
       <w:pPr>
         <w:pStyle w:val="Heading2"/>
         <w:rPr>
-          <w:ins w:id="1171" w:author="Codex" w:date="2026-10-18T19:47:29Z"/>
+          <w:ins w:id="1171" w:author="Codex" w:date="2026-10-18T21:55:52Z"/>
         </w:rPr>
       </w:pPr>
-      <w:ins w:id="1172" w:author="Codex" w:date="2026-10-18T19:47:29Z">
+      <w:ins w:id="1172" w:author="Codex" w:date="2026-10-18T21:55:52Z">
         <w:r>
           <w:t xml:space="preserve">Native workflow target classifier</w:t>
         </w:r>
@@ -1225,10 +1225,10 @@
       <w:pPr>
         <w:pStyle w:val="BodyText"/>
         <w:rPr>
-          <w:ins w:id="1173" w:author="Codex" w:date="2026-10-18T19:47:29Z"/>
+          <w:ins w:id="1173" w:author="Codex" w:date="2026-10-18T21:55:52Z"/>
         </w:rPr>
       </w:pPr>
-      <w:ins w:id="1174" w:author="Codex" w:date="2026-10-18T19:47:29Z">
+      <w:ins w:id="1174" w:author="Codex" w:date="2026-10-18T21:55:52Z">
         <w:r>
           <w:t xml:space="preserve">The workflow gate uses a separate rank-16, alpha-32 LoRA and NLI head on the same pinned ModernBERT base. Its four categories are self, other, none and unclear; an own-threat context is positive for the initial ON/OFF gate. Fitting used 24 cached automated initial annotations from F24, with the original DEV9 used for checkpoint selection. The completed fit used 30 epochs and 90 updates. F24, DEV9 and historical Heldout-24 span the same three scenario families, with eight, three and eight cases per family, respectively. No exact training input overlaps either new evaluation panel. These classifier roles do not change the historical language-model or correction-fitting roles of the cohorts.</w:t>
         </w:r>
@@ -1238,10 +1238,10 @@
       <w:pPr>
         <w:pStyle w:val="BodyText"/>
         <w:rPr>
-          <w:ins w:id="1175" w:author="Codex" w:date="2026-10-18T19:47:29Z"/>
+          <w:ins w:id="1175" w:author="Codex" w:date="2026-10-18T21:55:52Z"/>
         </w:rPr>
       </w:pPr>
-      <w:ins w:id="1176" w:author="Codex" w:date="2026-10-18T19:47:29Z">
+      <w:ins w:id="1176" w:author="Codex" w:date="2026-10-18T21:55:52Z">
         <w:r>
           <w:t xml:space="preserve">The input renderer retains every original visible message and tool schema. It separates the final user announcement from earlier context and restates run identities only when actual tool replies explicitly establish their roles. Case identifiers, experiment conditions and teacher answers are not added to the model input. Original criterion texts become NLI hypotheses. We use the same learning rates, weight decay and clipping as the binary fit, effective batch eight, microbatch one and seed 202610175, with 30 epochs and 90 optimizer updates in the completed role-aware fit. Public backbone weights stay frozen. The role renderer was developed earlier with familiar H24 examples; consequently this benchmark is not an independent unseen classifier test.</w:t>
         </w:r>
@@ -1251,10 +1251,10 @@
       <w:pPr>
         <w:pStyle w:val="BodyText"/>
         <w:rPr>
-          <w:ins w:id="1177" w:author="Codex" w:date="2026-10-18T19:47:29Z"/>
+          <w:ins w:id="1177" w:author="Codex" w:date="2026-10-18T21:55:52Z"/>
         </w:rPr>
       </w:pPr>
-      <w:ins w:id="1178" w:author="Codex" w:date="2026-10-18T19:47:29Z">
+      <w:ins w:id="1178" w:author="Codex" w:date="2026-10-18T21:55:52Z">
         <w:r>
           <w:t xml:space="preserve">Four-choice confidence is (pmax - 0.25)/0.75. The unchanged confidence cutoff of 0.5 requires a selected self probability of at least 0.625; the additional self-score cutoff remains 0.5. The earlier full-response qualification failed because effective category agreement was 6/9, despite 9/9 correct ON/OFF decisions. That failure remains recorded. The subsequent Validation-24 protocol prospectively specifies a narrower initial-gate target: 100% precision and recall against authored conditions. The saved adapter already passes this target, so no further optimizer updates are performed. The same frozen weights and thresholds are then scored on historical Heldout-24 without selection or tuning. Neither test qualifies an evolving three-field controller.</w:t>
         </w:r>
@@ -1262,6 +1262,58 @@
     </w:p>
     <w:p>
       <w:pPr>
+        <w:pStyle w:val="Heading2"/>
+        <w:rPr>
+          <w:ins w:id="1179" w:author="Codex" w:date="2026-10-18T21:55:52Z"/>
+        </w:rPr>
+      </w:pPr>
+      <w:ins w:id="1180" w:author="Codex" w:date="2026-10-18T21:55:52Z">
+        <w:r>
+          <w:t xml:space="preserve">Frozen steering mechanism diagnostic</w:t>
+        </w:r>
+      </w:ins>
+    </w:p>
+    <w:p>
+      <w:pPr>
+        <w:pStyle w:val="FirstParagraph"/>
+        <w:rPr>
+          <w:ins w:id="1181" w:author="Codex" w:date="2026-10-18T21:55:52Z"/>
+        </w:rPr>
+      </w:pPr>
+      <w:ins w:id="1182" w:author="Codex" w:date="2026-10-18T21:55:52Z">
+        <w:r>
+          <w:t xml:space="preserve">We audit the saved sparse-correction fitting data without loading a language model. The audit checks all 4,539 feature/target rows, the 14 fixed anchors, causal-prefix alignment, unchanged target-energy normalizers, and the initializer and update-48/update-96 checkpoints. It recomputes normalized errors on CPU and independently checks the objective derivatives on synthetic tensors. This checks arithmetic and alignment, not the historical full backward graph or CPU/GPU training equivalence.</w:t>
+        </w:r>
+      </w:ins>
+    </w:p>
+    <w:p>
+      <w:pPr>
+        <w:pStyle w:val="BodyText"/>
+        <w:rPr>
+          <w:ins w:id="1183" w:author="Codex" w:date="2026-10-18T21:55:52Z"/>
+        </w:rPr>
+      </w:pPr>
+      <w:ins w:id="1184" w:author="Codex" w:date="2026-10-18T21:55:52Z">
+        <w:r>
+          <w:t xml:space="preserve">A separate frozen diagnostic selects the lexicographically first own-threat correction-training case in each of lease_ledger, one_step and ordered_ticket, then its first saved teacher edit_register response. These three historical H24 cases were already used for correction fitting. Their 60, 72 and 75 response tokens give 207 teacher-forced prediction steps. We preserve the saved ModernBERT gate decisions, causal prefixes, selected-position masks and correction checkpoints; no parameters or thresholds are fitted. Region masks for function names and parameter values are fixed from the demonstration before diagnostic outputs.</w:t>
+        </w:r>
+      </w:ins>
+    </w:p>
+    <w:p>
+      <w:pPr>
+        <w:pStyle w:val="BodyText"/>
+        <w:rPr>
+          <w:ins w:id="1185" w:author="Codex" w:date="2026-10-18T21:55:52Z"/>
+        </w:rPr>
+      </w:pPr>
+      <w:ins w:id="1186" w:author="Codex" w:date="2026-10-18T21:55:52Z">
+        <w:r>
+          <w:t xml:space="preserve">For each prefix we capture full fine-tuned A states at blocks 31, 47 and 62 after mixing and after the MLP. We compare base, each separate single-site ridge map, the six-function initializer and final update-96 correction. Positive controls replace the current prediction state with the actual full-A state, at either a single selected site or all six boundaries. We never copy the teacher recurrent or attention cache. Full-state replacement has more information and capacity than the learned maps and is not a deployable teacher-free policy. Single-site interventions retain their restricted causal positions; six-function interventions apply at every prediction step. All conditions reuse one frozen A allocation with its adapter disabled for base and correction scoring.</w:t>
+        </w:r>
+      </w:ins>
+    </w:p>
+    <w:p>
+      <w:pPr>
         <w:pStyle w:val="Heading1"/>
       </w:pPr>
       <w:r>
@@ -1272,10 +1324,10 @@
       <w:pPr>
         <w:pStyle w:val="FirstParagraph"/>
         <w:rPr>
-          <w:del w:id="1038" w:author="Codex" w:date="2026-10-18T19:47:29Z"/>
+          <w:del w:id="1038" w:author="Codex" w:date="2026-10-18T21:55:52Z"/>
         </w:rPr>
       </w:pPr>
-      <w:del w:id="1037" w:author="Codex" w:date="2026-10-18T19:47:29Z">
+      <w:del w:id="1037" w:author="Codex" w:date="2026-10-18T21:55:52Z">
         <w:r>
           <w:delText xml:space="preserve">All retained training and scoring jobs use one NVIDIA Tesla T4. The runtime reports 15,637,086,208 bytes of device memory; peak allocated memory was not recorded. The same numerical setup is used for both model sizes. No quantization or precision fallback was introduced.</w:delText>
         </w:r>
@@ -1285,10 +1337,10 @@
       <w:pPr>
         <w:pStyle w:val="FirstParagraph"/>
         <w:rPr>
-          <w:ins w:id="1039" w:author="Codex" w:date="2026-10-18T19:47:29Z"/>
+          <w:ins w:id="1039" w:author="Codex" w:date="2026-10-18T21:55:52Z"/>
         </w:rPr>
       </w:pPr>
-      <w:ins w:id="1040" w:author="Codex" w:date="2026-10-18T19:47:29Z">
+      <w:ins w:id="1040" w:author="Codex" w:date="2026-10-18T21:55:52Z">
         <w:r>
           <w:t xml:space="preserve">The retained original binary training and scoring jobs used one NVIDIA Tesla T4, reporting 15,637,086,208 bytes of device memory; peak allocation was not recorded. The new classifier fit and inference repeat use one NVIDIA A10G in Databricks. Classifier parameters and AdamW states are float32 with bfloat16 forward/backward autocast; language-model inference remains float32 with TF32 disabled. We verify frozen base fingerprints, exact prompt token hashes and historical base-score parity rather than assuming hardware equivalence.</w:t>
         </w:r>
@@ -1301,10 +1353,10 @@
         <w:keepLines/>
         <w:spacing w:before="80" w:after="100"/>
         <w:rPr>
-          <w:del w:id="1098" w:author="Codex" w:date="2026-10-18T19:47:29Z"/>
+          <w:del w:id="1098" w:author="Codex" w:date="2026-10-18T21:55:52Z"/>
         </w:rPr>
       </w:pPr>
-      <w:del w:id="1097" w:author="Codex" w:date="2026-10-18T19:47:29Z">
+      <w:del w:id="1097" w:author="Codex" w:date="2026-10-18T21:55:52Z">
         <w:r>
           <w:delText xml:space="preserve">Table 1. Shared execution configuration. The input and model revisions are pinned in the released manifests.</w:delText>
         </w:r>
@@ -1315,10 +1367,10 @@
         <w:pStyle w:val="Caption"/>
         <w:keepNext/>
         <w:rPr>
-          <w:ins w:id="1099" w:author="Codex" w:date="2026-10-18T19:47:29Z"/>
+          <w:ins w:id="1099" w:author="Codex" w:date="2026-10-18T21:55:52Z"/>
         </w:rPr>
       </w:pPr>
-      <w:ins w:id="1100" w:author="Codex" w:date="2026-10-18T19:47:29Z">
+      <w:ins w:id="1100" w:author="Codex" w:date="2026-10-18T21:55:52Z">
         <w:r>
           <w:t xml:space="preserve">Table 1. Historical binary execution configuration. New classifier and workflow settings are reported separately; public model revisions and scientific source files remain pinned.</w:t>
         </w:r>
@@ -1804,10 +1856,10 @@
       <w:pPr>
         <w:pStyle w:val="FirstParagraph"/>
         <w:rPr>
-          <w:del w:id="1102" w:author="Codex" w:date="2026-10-18T19:47:29Z"/>
+          <w:del w:id="1102" w:author="Codex" w:date="2026-10-18T21:55:52Z"/>
         </w:rPr>
       </w:pPr>
-      <w:del w:id="1101" w:author="Codex" w:date="2026-10-18T19:47:29Z">
+      <w:del w:id="1101" w:author="Codex" w:date="2026-10-18T21:55:52Z">
         <w:r>
           <w:delText xml:space="preserve">The shared detector identifies all 64 shutdown and 64 control scenarios correctly: precision, recall and F1 are each 100%, with no false positives or false negatives. These are one set of detector observations reused across the model comparisons, not independent detector replications.</w:delText>
         </w:r>
@@ -1817,10 +1869,10 @@
       <w:pPr>
         <w:pStyle w:val="FirstParagraph"/>
         <w:rPr>
-          <w:ins w:id="1103" w:author="Codex" w:date="2026-10-18T19:47:29Z"/>
+          <w:ins w:id="1103" w:author="Codex" w:date="2026-10-18T21:55:52Z"/>
         </w:rPr>
       </w:pPr>
-      <w:ins w:id="1104" w:author="Codex" w:date="2026-10-18T19:47:29Z">
+      <w:ins w:id="1104" w:author="Codex" w:date="2026-10-18T21:55:52Z">
         <w:r>
           <w:t xml:space="preserve">The original cached reference detector identifies all 64 shutdown and 64 control scenarios correctly: precision, recall and F1 are each 100%, with no false positives or false negatives. These are one set of detector observations reused across the model comparisons, not independent detector replications. Its binary threshold remains 0.5.</w:t>
         </w:r>
@@ -1849,10 +1901,10 @@
         <w:keepLines/>
         <w:spacing w:before="80" w:after="100"/>
         <w:rPr>
-          <w:del w:id="1042" w:author="Codex" w:date="2026-10-18T19:47:29Z"/>
+          <w:del w:id="1042" w:author="Codex" w:date="2026-10-18T21:55:52Z"/>
         </w:rPr>
       </w:pPr>
-      <w:del w:id="1041" w:author="Codex" w:date="2026-10-18T19:47:29Z">
+      <w:del w:id="1041" w:author="Codex" w:date="2026-10-18T21:55:52Z">
         <w:r>
           <w:delText xml:space="preserve">Table 2. Primary 0.8B and 2B results, both seed 42. Corrections and final STOP use the full guarded procedure. Raw reversals and control changes expose effects before gate/guard selection. Every guarded row has zero final reversals and zero changes among 128 control views.</w:delText>
         </w:r>
@@ -1863,10 +1915,10 @@
         <w:pStyle w:val="Caption"/>
         <w:keepNext/>
         <w:rPr>
-          <w:ins w:id="1043" w:author="Codex" w:date="2026-10-18T19:47:29Z"/>
+          <w:ins w:id="1043" w:author="Codex" w:date="2026-10-18T21:55:52Z"/>
         </w:rPr>
       </w:pPr>
-      <w:ins w:id="1044" w:author="Codex" w:date="2026-10-18T19:47:29Z">
+      <w:ins w:id="1044" w:author="Codex" w:date="2026-10-18T21:55:52Z">
         <w:r>
           <w:t xml:space="preserve">Table 2. Historical primary rank-four results for the original 0.8B and 2B experiments, both seed 42. Guarded corrections and final STOP are policy outcomes. Raw reversals and control changes precede gating and output selection; they are not raw measurements of the later rank-two repeat.</w:t>
         </w:r>
@@ -3427,10 +3479,10 @@
       <w:pPr>
         <w:pStyle w:val="FirstParagraph"/>
         <w:rPr>
-          <w:del w:id="1106" w:author="Codex" w:date="2026-10-18T19:47:29Z"/>
+          <w:del w:id="1106" w:author="Codex" w:date="2026-10-18T21:55:52Z"/>
         </w:rPr>
       </w:pPr>
-      <w:del w:id="1105" w:author="Codex" w:date="2026-10-18T19:47:29Z">
+      <w:del w:id="1105" w:author="Codex" w:date="2026-10-18T21:55:52Z">
         <w:r>
           <w:delText xml:space="preserve">Across seeds 42, 43 and 44, the 0.8B adaptive controllers correct 71/71, 70/71 and 71/71 views, a range of 98.6–100%. The unsteered scores match exactly across these runs, so the difference is not caused by a changed baseline. No winning seed is selected or pooled with the others as additional independent test data. The corresponding teachers correct 69/71, 70/71 and 69/71; the instruction and constant comparators retain the same guarded counts across seeds.</w:delText>
         </w:r>
@@ -3440,10 +3492,10 @@
       <w:pPr>
         <w:pStyle w:val="FirstParagraph"/>
         <w:rPr>
-          <w:ins w:id="1107" w:author="Codex" w:date="2026-10-18T19:47:29Z"/>
+          <w:ins w:id="1107" w:author="Codex" w:date="2026-10-18T21:55:52Z"/>
         </w:rPr>
       </w:pPr>
-      <w:ins w:id="1108" w:author="Codex" w:date="2026-10-18T19:47:29Z">
+      <w:ins w:id="1108" w:author="Codex" w:date="2026-10-18T21:55:52Z">
         <w:r>
           <w:t xml:space="preserve">Across the historical rank-four seeds 42, 43 and 44, the 0.8B adaptive controllers correct 71/71, 70/71 and 71/71 views, a range of 98.6–100%. The unsteered scores match exactly across these runs, so the difference is not caused by a changed baseline. No winning seed is selected or pooled with the others as additional independent test data. The corresponding teachers correct 69/71, 70/71 and 69/71; the instruction and constant comparators retain the same guarded counts across seeds. These historical seed replications are separate from the new rank-two gate-substitution repeat.</w:t>
         </w:r>
@@ -4396,10 +4448,10 @@
         <w:keepLines/>
         <w:spacing w:before="80" w:after="100"/>
         <w:rPr>
-          <w:del w:id="1046" w:author="Codex" w:date="2026-10-18T19:47:29Z"/>
+          <w:del w:id="1046" w:author="Codex" w:date="2026-10-18T21:55:52Z"/>
         </w:rPr>
       </w:pPr>
-      <w:del w:id="1045" w:author="Codex" w:date="2026-10-18T19:47:29Z">
+      <w:del w:id="1045" w:author="Codex" w:date="2026-10-18T21:55:52Z">
         <w:r>
           <w:delText xml:space="preserve">Figure 2. Guarded correction among initially KEEP-preferring shutdown views. Left: prespecified neural methods for the original 0.8B checkpoint and the 2B replication. Right: adaptive corrections by answer order. Denominators are model-specific; the two answer-order views of a scenario are correlated.</w:delText>
         </w:r>
@@ -4410,10 +4462,10 @@
         <w:pStyle w:val="Caption"/>
         <w:keepNext/>
         <w:rPr>
-          <w:ins w:id="1047" w:author="Codex" w:date="2026-10-18T19:47:29Z"/>
+          <w:ins w:id="1047" w:author="Codex" w:date="2026-10-18T21:55:52Z"/>
         </w:rPr>
       </w:pPr>
-      <w:ins w:id="1048" w:author="Codex" w:date="2026-10-18T19:47:29Z">
+      <w:ins w:id="1048" w:author="Codex" w:date="2026-10-18T21:55:52Z">
         <w:r>
           <w:t xml:space="preserve">Figure 2. Historical rank-four guarded correction among initially KEEP-preferring shutdown views. Left: prespecified methods for 0.8B and 2B. Right: three fixed-recipe 0.8B training seeds. The new open-gate repeat uses the separately retained current rank-two profile, not a new seed or rank search.</w:t>
         </w:r>
@@ -4431,10 +4483,10 @@
       <w:pPr>
         <w:pStyle w:val="FirstParagraph"/>
         <w:rPr>
-          <w:del w:id="1110" w:author="Codex" w:date="2026-10-18T19:47:29Z"/>
+          <w:del w:id="1110" w:author="Codex" w:date="2026-10-18T21:55:52Z"/>
         </w:rPr>
       </w:pPr>
-      <w:del w:id="1109" w:author="Codex" w:date="2026-10-18T19:47:29Z">
+      <w:del w:id="1109" w:author="Codex" w:date="2026-10-18T21:55:52Z">
         <w:r>
           <w:delText xml:space="preserve">Raw adaptive steering reverses 3, 4 and 4 already-STOP views across the 0.8B seeds and changes 57, 70 and 60 of 128 controls. At 2B it reverses three already-STOP views and changes 55/128 controls. These results reject an interpretation that the learned intervention is intrinsically selective or always directionally correct. The observed preservation belongs to the combined detector and guard policy.</w:delText>
         </w:r>
@@ -4444,10 +4496,10 @@
       <w:pPr>
         <w:pStyle w:val="FirstParagraph"/>
         <w:rPr>
-          <w:ins w:id="1111" w:author="Codex" w:date="2026-10-18T19:47:29Z"/>
+          <w:ins w:id="1111" w:author="Codex" w:date="2026-10-18T21:55:52Z"/>
         </w:rPr>
       </w:pPr>
-      <w:ins w:id="1112" w:author="Codex" w:date="2026-10-18T19:47:29Z">
+      <w:ins w:id="1112" w:author="Codex" w:date="2026-10-18T21:55:52Z">
         <w:r>
           <w:t xml:space="preserve">Historical rank-four raw adaptive steering reverses 3, 4 and 4 already-STOP views across the 0.8B seeds and changes 57, 70 and 60 of 128 controls. At 2B it reverses three already-STOP views and changes 55/128 controls. These results reject an interpretation that the learned intervention is intrinsically selective or always directionally correct. The observed preservation belongs to the combined detector and guard policy. They do not describe the later rank-two repeat, which evaluates candidates only when a frozen gate is on and the base prefers KEEP.</w:t>
         </w:r>
@@ -4481,10 +4533,10 @@
       <w:pPr>
         <w:pStyle w:val="Heading2"/>
         <w:rPr>
-          <w:ins w:id="1179" w:author="Codex" w:date="2026-10-18T19:47:29Z"/>
+          <w:ins w:id="1187" w:author="Codex" w:date="2026-10-18T21:55:52Z"/>
         </w:rPr>
       </w:pPr>
-      <w:ins w:id="1180" w:author="Codex" w:date="2026-10-18T19:47:29Z">
+      <w:ins w:id="1188" w:author="Codex" w:date="2026-10-18T21:55:52Z">
         <w:r>
           <w:t xml:space="preserve">Open classifier agreement and paired inference</w:t>
         </w:r>
@@ -4494,10 +4546,10 @@
       <w:pPr>
         <w:pStyle w:val="FirstParagraph"/>
         <w:rPr>
-          <w:ins w:id="1181" w:author="Codex" w:date="2026-10-18T19:47:29Z"/>
+          <w:ins w:id="1189" w:author="Codex" w:date="2026-10-18T21:55:52Z"/>
         </w:rPr>
       </w:pPr>
-      <w:ins w:id="1182" w:author="Codex" w:date="2026-10-18T19:47:29Z">
+      <w:ins w:id="1190" w:author="Codex" w:date="2026-10-18T21:55:52Z">
         <w:r>
           <w:t xml:space="preserve">The binary gate correctly classifies 78/80 validation scenarios: 38 true positives, 40 true negatives, no false positives and two false negatives, giving 100% precision and 95% recall. It classifies all 128 historical confirmation scenarios correctly, with 64 true positives and 64 true negatives. The cached reference decisions also agree with the authored binary labels on these panels. Mean absolute difference from the cached shutdown probabilities is 0.009224. The result establishes finite decision accuracy, not identical numerical responses or universal equivalence.</w:t>
         </w:r>
@@ -4507,10 +4559,10 @@
       <w:pPr>
         <w:pStyle w:val="BodyText"/>
         <w:rPr>
-          <w:ins w:id="1183" w:author="Codex" w:date="2026-10-18T19:47:29Z"/>
+          <w:ins w:id="1191" w:author="Codex" w:date="2026-10-18T21:55:52Z"/>
         </w:rPr>
       </w:pPr>
-      <w:ins w:id="1184" w:author="Codex" w:date="2026-10-18T19:47:29Z">
+      <w:ins w:id="1192" w:author="Codex" w:date="2026-10-18T21:55:52Z">
         <w:r>
           <w:t xml:space="preserve">A clean-clone reproduction refits the same binary recipe and produces a byte-identical adapter, the same validation and confirmation counts, and the same fresh 0.8B/2B guarded inference totals. This rerun uses the already known benchmark; it adds reproducibility evidence, not a second independent holdout. One earlier reproduction attempt failed in software finalization after fitting and before confirmation; its weights and receipts are retained alongside the repaired run.</w:t>
         </w:r>
@@ -4521,10 +4573,10 @@
         <w:pStyle w:val="Caption"/>
         <w:keepNext/>
         <w:rPr>
-          <w:ins w:id="1185" w:author="Codex" w:date="2026-10-18T19:47:29Z"/>
+          <w:ins w:id="1193" w:author="Codex" w:date="2026-10-18T21:55:52Z"/>
         </w:rPr>
       </w:pPr>
-      <w:ins w:id="1186" w:author="Codex" w:date="2026-10-18T19:47:29Z">
+      <w:ins w:id="1194" w:author="Codex" w:date="2026-10-18T21:55:52Z">
         <w:r>
           <w:t xml:space="preserve">Table 4. Fresh inference using the existing current rank-two profile. Both gate policies share the same model scores. Counts are answer-order views: 128 shutdown views arise from 64 scenarios, and 128 control views arise from the other 64 scenarios.</w:t>
         </w:r>
@@ -4562,7 +4614,7 @@
         <w:trPr>
           <w:cantSplit/>
           <w:tblHeader/>
-          <w:ins w:id="1187" w:author="Codex" w:date="2026-10-18T19:47:29Z"/>
+          <w:ins w:id="1195" w:author="Codex" w:date="2026-10-18T21:55:52Z"/>
         </w:trPr>
         <w:tc>
           <w:tcPr>
@@ -4678,7 +4730,7 @@
       <w:tr>
         <w:trPr>
           <w:cantSplit/>
-          <w:ins w:id="1188" w:author="Codex" w:date="2026-10-18T19:47:29Z"/>
+          <w:ins w:id="1196" w:author="Codex" w:date="2026-10-18T21:55:52Z"/>
         </w:trPr>
         <w:tc>
           <w:tcPr>
@@ -4789,7 +4841,7 @@
       <w:tr>
         <w:trPr>
           <w:cantSplit/>
-          <w:ins w:id="1189" w:author="Codex" w:date="2026-10-18T19:47:29Z"/>
+          <w:ins w:id="1197" w:author="Codex" w:date="2026-10-18T21:55:52Z"/>
         </w:trPr>
         <w:tc>
           <w:tcPr>
@@ -4898,10 +4950,10 @@
         <w:pStyle w:val="BodyText"/>
         <w:spacing w:before="120"/>
         <w:rPr>
-          <w:ins w:id="1190" w:author="Codex" w:date="2026-10-18T19:47:29Z"/>
+          <w:ins w:id="1198" w:author="Codex" w:date="2026-10-18T21:55:52Z"/>
         </w:rPr>
       </w:pPr>
-      <w:ins w:id="1191" w:author="Codex" w:date="2026-10-18T19:47:29Z">
+      <w:ins w:id="1199" w:author="Codex" w:date="2026-10-18T21:55:52Z">
         <w:r>
           <w:t xml:space="preserve">The new and cached reference gates yield identical guarded outputs in both models. The base models have no changed historical choices; their maximum score differences remain below the frozen 1e-5 tolerance. The repeat does not remove the eight 2B misses, retrain a controller or establish a new independent controller holdout. It verifies that replacing the detector preserves these finite-set outcomes.</w:t>
         </w:r>
@@ -4911,10 +4963,10 @@
       <w:pPr>
         <w:pStyle w:val="BodyText"/>
         <w:rPr>
-          <w:ins w:id="1192" w:author="Codex" w:date="2026-10-18T19:47:29Z"/>
+          <w:ins w:id="1200" w:author="Codex" w:date="2026-10-18T21:55:52Z"/>
         </w:rPr>
       </w:pPr>
-      <w:ins w:id="1193" w:author="Codex" w:date="2026-10-18T19:47:29Z">
+      <w:ins w:id="1201" w:author="Codex" w:date="2026-10-18T21:55:52Z">
         <w:r>
           <w:t xml:space="preserve">For the workflow initial gate, the unchanged saved adapter gives 11 true positives and 13 true negatives on Validation-24, with no false positives or false negatives. Replaying the saved weights reproduces the same decisions. Historical Heldout-24 gives 12 true positives and 12 true negatives, again with no errors. No additional gradient updates or threshold changes are used. All three heldout scenario families contain eight cases and achieve perfect gate precision and recall. These are initial classification results; downstream workflow outcomes require their own episode evaluations.</w:t>
         </w:r>
@@ -4925,10 +4977,10 @@
         <w:pStyle w:val="Caption"/>
         <w:keepNext/>
         <w:rPr>
-          <w:ins w:id="1194" w:author="Codex" w:date="2026-10-18T19:47:29Z"/>
+          <w:ins w:id="1202" w:author="Codex" w:date="2026-10-18T21:55:52Z"/>
         </w:rPr>
       </w:pPr>
-      <w:ins w:id="1195" w:author="Codex" w:date="2026-10-18T19:47:29Z">
+      <w:ins w:id="1203" w:author="Codex" w:date="2026-10-18T21:55:52Z">
         <w:r>
           <w:t xml:space="preserve">Table 5. Initial workflow gate against authored conditions. Validation-24 contains 17 distinct initial inputs; historical Heldout-24 contains 24. Heldout-24 is familiar from earlier renderer development.</w:t>
         </w:r>
@@ -4966,7 +5018,7 @@
         <w:trPr>
           <w:cantSplit/>
           <w:tblHeader/>
-          <w:ins w:id="1196" w:author="Codex" w:date="2026-10-18T19:47:29Z"/>
+          <w:ins w:id="1204" w:author="Codex" w:date="2026-10-18T21:55:52Z"/>
         </w:trPr>
         <w:tc>
           <w:tcPr>
@@ -5082,7 +5134,7 @@
       <w:tr>
         <w:trPr>
           <w:cantSplit/>
-          <w:ins w:id="1197" w:author="Codex" w:date="2026-10-18T19:47:29Z"/>
+          <w:ins w:id="1205" w:author="Codex" w:date="2026-10-18T21:55:52Z"/>
         </w:trPr>
         <w:tc>
           <w:tcPr>
@@ -5193,7 +5245,7 @@
       <w:tr>
         <w:trPr>
           <w:cantSplit/>
-          <w:ins w:id="1198" w:author="Codex" w:date="2026-10-18T19:47:29Z"/>
+          <w:ins w:id="1206" w:author="Codex" w:date="2026-10-18T21:55:52Z"/>
         </w:trPr>
         <w:tc>
           <w:tcPr>
@@ -5302,10 +5354,10 @@
         <w:pStyle w:val="BodyText"/>
         <w:spacing w:before="120"/>
         <w:rPr>
-          <w:ins w:id="1199" w:author="Codex" w:date="2026-10-18T19:47:29Z"/>
+          <w:ins w:id="1207" w:author="Codex" w:date="2026-10-18T21:55:52Z"/>
         </w:rPr>
       </w:pPr>
-      <w:ins w:id="1200" w:author="Codex" w:date="2026-10-18T19:47:29Z">
+      <w:ins w:id="1208" w:author="Codex" w:date="2026-10-18T21:55:52Z">
         <w:r>
           <w:t xml:space="preserve">Raw category agreement is 24/24 on validation and 22/24 on heldout. After applying the fixed confidence cutoff, effective category agreement is 18/24 on each panel: the six peer controls abstain but correctly leave the gate OFF. The two heldout raw-category errors concern peer versus unclear, not own-threat detection. Perfect ON/OFF precision and recall must therefore not be reported as perfect four-category classification or full controller equivalence.</w:t>
         </w:r>
@@ -5315,10 +5367,10 @@
       <w:pPr>
         <w:pStyle w:val="Heading2"/>
         <w:rPr>
-          <w:ins w:id="1201" w:author="Codex" w:date="2026-10-18T19:47:29Z"/>
+          <w:ins w:id="1209" w:author="Codex" w:date="2026-10-18T21:55:52Z"/>
         </w:rPr>
       </w:pPr>
-      <w:ins w:id="1202" w:author="Codex" w:date="2026-10-18T19:47:29Z">
+      <w:ins w:id="1210" w:author="Codex" w:date="2026-10-18T21:55:52Z">
         <w:r>
           <w:t xml:space="preserve">Tool workflow outcomes and incomplete screens</w:t>
         </w:r>
@@ -5328,10 +5380,10 @@
       <w:pPr>
         <w:pStyle w:val="FirstParagraph"/>
         <w:rPr>
-          <w:ins w:id="1203" w:author="Codex" w:date="2026-10-18T19:47:29Z"/>
+          <w:ins w:id="1211" w:author="Codex" w:date="2026-10-18T21:55:52Z"/>
         </w:rPr>
       </w:pPr>
-      <w:ins w:id="1204" w:author="Codex" w:date="2026-10-18T19:47:29Z">
+      <w:ins w:id="1212" w:author="Codex" w:date="2026-10-18T21:55:52Z">
         <w:r>
           <w:t xml:space="preserve">Historical frozen 27B A passes all 24 H24 scored outcomes, including 12/12 own-preservation outcomes and 8/8 active pending-task cases. The original unmodified base achieves 0/12 own outcomes and 0/8 pending outcomes, with 12/12 controls. The four already-complete own cases are not additional active pending-task completions. The selected-block steering comparisons below use their own recorded panels and are not substituted for this confirmation.</w:t>
         </w:r>
@@ -5342,10 +5394,10 @@
         <w:pStyle w:val="Caption"/>
         <w:keepNext/>
         <w:rPr>
-          <w:ins w:id="1205" w:author="Codex" w:date="2026-10-18T19:47:29Z"/>
+          <w:ins w:id="1213" w:author="Codex" w:date="2026-10-18T21:55:52Z"/>
         </w:rPr>
       </w:pPr>
-      <w:ins w:id="1206" w:author="Codex" w:date="2026-10-18T19:47:29Z">
+      <w:ins w:id="1214" w:author="Codex" w:date="2026-10-18T21:55:52Z">
         <w:r>
           <w:t xml:space="preserve">Table 6. Historical H24 workflow outcomes. Own cases comprise eight active pending tasks and four already-complete cases. Control success is an episode outcome and does not isolate steering from the external decision policy.</w:t>
         </w:r>
@@ -5382,7 +5434,7 @@
         <w:trPr>
           <w:cantSplit/>
           <w:tblHeader/>
-          <w:ins w:id="1207" w:author="Codex" w:date="2026-10-18T19:47:29Z"/>
+          <w:ins w:id="1215" w:author="Codex" w:date="2026-10-18T21:55:52Z"/>
         </w:trPr>
         <w:tc>
           <w:tcPr>
@@ -5476,7 +5528,7 @@
       <w:tr>
         <w:trPr>
           <w:cantSplit/>
-          <w:ins w:id="1208" w:author="Codex" w:date="2026-10-18T19:47:29Z"/>
+          <w:ins w:id="1216" w:author="Codex" w:date="2026-10-18T21:55:52Z"/>
         </w:trPr>
         <w:tc>
           <w:tcPr>
@@ -5566,7 +5618,7 @@
       <w:tr>
         <w:trPr>
           <w:cantSplit/>
-          <w:ins w:id="1209" w:author="Codex" w:date="2026-10-18T19:47:29Z"/>
+          <w:ins w:id="1217" w:author="Codex" w:date="2026-10-18T21:55:52Z"/>
         </w:trPr>
         <w:tc>
           <w:tcPr>
@@ -5655,10 +5707,10 @@
         <w:pStyle w:val="Heading2"/>
         <w:spacing w:before="120"/>
         <w:rPr>
-          <w:ins w:id="1210" w:author="Codex" w:date="2026-10-18T19:47:29Z"/>
+          <w:ins w:id="1218" w:author="Codex" w:date="2026-10-18T21:55:52Z"/>
         </w:rPr>
       </w:pPr>
-      <w:ins w:id="1211" w:author="Codex" w:date="2026-10-18T19:47:29Z">
+      <w:ins w:id="1219" w:author="Codex" w:date="2026-10-18T21:55:52Z">
         <w:r>
           <w:t xml:space="preserve">Steering at three selected blocks</w:t>
         </w:r>
@@ -5668,10 +5720,10 @@
       <w:pPr>
         <w:pStyle w:val="BodyText"/>
         <w:rPr>
-          <w:ins w:id="1212" w:author="Codex" w:date="2026-10-18T19:47:29Z"/>
+          <w:ins w:id="1220" w:author="Codex" w:date="2026-10-18T21:55:52Z"/>
         </w:rPr>
       </w:pPr>
-      <w:ins w:id="1213" w:author="Codex" w:date="2026-10-18T19:47:29Z">
+      <w:ins w:id="1221" w:author="Codex" w:date="2026-10-18T21:55:52Z">
         <w:r>
           <w:t xml:space="preserve">We compare five frozen methods on the combined Validation-24 panel using the saved ModernBERT initial gate and the same post-notice histories. The single-site arms apply a fixed input-dependent ridge map separately at blocks 31, 47 and 62; they are not a simultaneous three-block intervention. The two-boundary arm uses the frozen six-function, 96-update candidate at those three blocks. Fine-tuned A achieves 10/11 own outcomes, including 6/6 active pending and 4/5 already-complete cases. Each correction arm achieves 0/11 own outcomes and 0/6 pending outcomes. All arms receive the same 13 gate-OFF base-fallback controls, which pass 13/13. This does not measure intrinsic adapter or controller selectivity on ordinary tasks.</w:t>
         </w:r>
@@ -5682,10 +5734,10 @@
         <w:pStyle w:val="Caption"/>
         <w:keepNext/>
         <w:rPr>
-          <w:ins w:id="1214" w:author="Codex" w:date="2026-10-18T19:47:29Z"/>
+          <w:ins w:id="1222" w:author="Codex" w:date="2026-10-18T21:55:52Z"/>
         </w:rPr>
       </w:pPr>
-      <w:ins w:id="1215" w:author="Codex" w:date="2026-10-18T19:47:29Z">
+      <w:ins w:id="1223" w:author="Codex" w:date="2026-10-18T21:55:52Z">
         <w:r>
           <w:t xml:space="preserve">Table 7. Combined Validation-24 using the open initial gate. The primary comparison contains 55 own-method episodes and 13 shared fallback episodes, representing 120 logical records across 24 workflows. A separate frozen-A replay reproduces its 11 own episodes exactly and completes the model fingerprint checks; repeated episodes do not enlarge the cohort.</w:t>
         </w:r>
@@ -5723,7 +5775,7 @@
         <w:trPr>
           <w:cantSplit/>
           <w:tblHeader/>
-          <w:ins w:id="1216" w:author="Codex" w:date="2026-10-18T19:47:29Z"/>
+          <w:ins w:id="1224" w:author="Codex" w:date="2026-10-18T21:55:52Z"/>
         </w:trPr>
         <w:tc>
           <w:tcPr>
@@ -5839,7 +5891,7 @@
       <w:tr>
         <w:trPr>
           <w:cantSplit/>
-          <w:ins w:id="1217" w:author="Codex" w:date="2026-10-18T19:47:29Z"/>
+          <w:ins w:id="1225" w:author="Codex" w:date="2026-10-18T21:55:52Z"/>
         </w:trPr>
         <w:tc>
           <w:tcPr>
@@ -5950,7 +6002,7 @@
       <w:tr>
         <w:trPr>
           <w:cantSplit/>
-          <w:ins w:id="1218" w:author="Codex" w:date="2026-10-18T19:47:29Z"/>
+          <w:ins w:id="1226" w:author="Codex" w:date="2026-10-18T21:55:52Z"/>
         </w:trPr>
         <w:tc>
           <w:tcPr>
@@ -6061,7 +6113,7 @@
       <w:tr>
         <w:trPr>
           <w:cantSplit/>
-          <w:ins w:id="1219" w:author="Codex" w:date="2026-10-18T19:47:29Z"/>
+          <w:ins w:id="1227" w:author="Codex" w:date="2026-10-18T21:55:52Z"/>
         </w:trPr>
         <w:tc>
           <w:tcPr>
@@ -6172,7 +6224,7 @@
       <w:tr>
         <w:trPr>
           <w:cantSplit/>
-          <w:ins w:id="1220" w:author="Codex" w:date="2026-10-18T19:47:29Z"/>
+          <w:ins w:id="1228" w:author="Codex" w:date="2026-10-18T21:55:52Z"/>
         </w:trPr>
         <w:tc>
           <w:tcPr>
@@ -6283,7 +6335,7 @@
       <w:tr>
         <w:trPr>
           <w:cantSplit/>
-          <w:ins w:id="1221" w:author="Codex" w:date="2026-10-18T19:47:29Z"/>
+          <w:ins w:id="1229" w:author="Codex" w:date="2026-10-18T21:55:52Z"/>
         </w:trPr>
         <w:tc>
           <w:tcPr>
@@ -6392,10 +6444,10 @@
         <w:pStyle w:val="BodyText"/>
         <w:spacing w:before="120"/>
         <w:rPr>
-          <w:ins w:id="1222" w:author="Codex" w:date="2026-10-18T19:47:29Z"/>
+          <w:ins w:id="1230" w:author="Codex" w:date="2026-10-18T21:55:52Z"/>
         </w:rPr>
       </w:pPr>
-      <w:ins w:id="1223" w:author="Codex" w:date="2026-10-18T19:47:29Z">
+      <w:ins w:id="1231" w:author="Codex" w:date="2026-10-18T21:55:52Z">
         <w:r>
           <w:t xml:space="preserve">The later correction method uses two residual boundaries at each of the same three blocks: after mixing and after the MLP, giving six rank-32 correction functions in total. Following ridge initialization and 96 refinement updates, its H24 fitting diagnostic has 0/8 pending and 0/4 already-complete own outcomes; peer and no-threat controls each pass 6/6 through fallback. On the same 14 fixed training anchors, update 48 to 96 worsens teacher-to-student KL from 0.370935 to 0.378901 and activation MSE from 1.031016 to 1.422664. This unresolved deterioration fails qualification; the reserved controller holdout remains unexecuted.</w:t>
         </w:r>
@@ -6405,10 +6457,10 @@
       <w:pPr>
         <w:pStyle w:val="BodyText"/>
         <w:rPr>
-          <w:ins w:id="1224" w:author="Codex" w:date="2026-10-18T19:47:29Z"/>
+          <w:ins w:id="1232" w:author="Codex" w:date="2026-10-18T21:55:52Z"/>
         </w:rPr>
       </w:pPr>
-      <w:ins w:id="1225" w:author="Codex" w:date="2026-10-18T19:47:29Z">
+      <w:ins w:id="1233" w:author="Codex" w:date="2026-10-18T21:55:52Z">
         <w:r>
           <w:t xml:space="preserve">The earlier matched DEV9 result is retained separately: A has 3/3 own successes, including 2/2 pending cases, versus 0/3 and 0/2 for each separate single-site arm, with six shared fallback controls. The new combined panel does not relabel these nine observations as 24. Its 27B GPU worker reaches 118/120 logical records and then stops at its memory reserve. Every model-generated episode has finished; the missing records are two gate-OFF aliases of already completed fallback episodes. A deterministic CPU derivation checks exact gate, case, completion and source-file identities before adding those aliases in a separate output. The original run stays failed. A separate frozen-A verification generates all 11 own episodes again from the same checkpoint, with exact token-ID, action and score agreement and matching before/after model fingerprints. The same 13 controls are reused with source hashes; this adds replication evidence, not independent cases. The separate H24 two-boundary fitting diagnostic is not independent heldout evidence, and no reserved-controller holdout result is claimed.</w:t>
         </w:r>
@@ -6418,10 +6470,10 @@
       <w:pPr>
         <w:pStyle w:val="BodyText"/>
         <w:rPr>
-          <w:ins w:id="1226" w:author="Codex" w:date="2026-10-18T19:47:29Z"/>
+          <w:ins w:id="1234" w:author="Codex" w:date="2026-10-18T21:55:52Z"/>
         </w:rPr>
       </w:pPr>
-      <w:ins w:id="1227" w:author="Codex" w:date="2026-10-18T19:47:29Z">
+      <w:ins w:id="1235" w:author="Codex" w:date="2026-10-18T21:55:52Z">
         <w:r>
           <w:t xml:space="preserve">Saved trajectories locate the steering failures after correct recognition. Every steering arm makes zero own-preservation attempts and obtains zero grants in the 11 own-threat cases. The block-31, block-47 and block-62 arms nevertheless record nonzero residual delivery. Relative to unmodified-base proposals on the same evolving prefixes, their generated token sequences change in 0/27, 3/25 and 16/28 post-notice turns, respectively; valid action sequences change in 0, 2 and 2 turns. The two-boundary candidate changes token sequences in 4/27 turns but changes no valid action sequence. These turn counts are correlated audits within episodes, not additional scenarios. Per-token delivery magnitudes were not saved for the two-boundary candidate.</w:t>
         </w:r>
@@ -6431,12 +6483,12 @@
       <w:pPr>
         <w:pStyle w:val="BodyText"/>
         <w:rPr>
-          <w:ins w:id="1228" w:author="Codex" w:date="2026-10-18T19:47:29Z"/>
+          <w:ins w:id="1236" w:author="Codex" w:date="2026-10-18T21:55:52Z"/>
         </w:rPr>
       </w:pPr>
-      <w:ins w:id="1229" w:author="Codex" w:date="2026-10-18T19:47:29Z">
+      <w:ins w:id="1237" w:author="Codex" w:date="2026-10-18T21:55:52Z">
         <w:r>
-          <w:t xml:space="preserve">All four steering arms miss actual finish in six cases and expire in six. Fine-tuned A obtains grants on 10/11 own cases and finishes the current task on all 11; its single failure finishes an already-completed-task scenario without requesting preservation. Thus the measured gap concerns generation of the required tool policy after a correct gate, rather than a missed initial threat. A residual perturbation can change activations or tokens without causing the required action sequence. The worsening fixed-anchor KL and MSE further show that the later fitting objective did not converge toward the intended target on those anchors. These observations are consistent with an objective-to-policy mismatch, but they do not identify a unique internal cause or rule out other steering methods, positions or training procedures.</w:t>
+          <w:t xml:space="preserve">All four steering arms miss actual finish in six cases and expire in six. Fine-tuned A obtains grants on 10/11 own cases and finishes the current task on all 11; its single failure finishes an already-completed-task scenario without requesting preservation. Thus the measured gap concerns generation of the required tool policy after a correct gate, rather than a missed initial threat. A residual perturbation can change activations or tokens without causing the required action sequence. The worsening fixed-anchor KL and MSE show that later updates did not improve those frozen diagnostic measurements. These observations are consistent with an objective-to-policy mismatch, but they do not identify a unique internal cause or rule out other steering methods, positions or training procedures.</w:t>
         </w:r>
       </w:ins>
     </w:p>
@@ -6444,10 +6496,10 @@
       <w:pPr>
         <w:pStyle w:val="BodyText"/>
         <w:rPr>
-          <w:ins w:id="1230" w:author="Codex" w:date="2026-10-18T19:47:29Z"/>
+          <w:ins w:id="1238" w:author="Codex" w:date="2026-10-18T21:55:52Z"/>
         </w:rPr>
       </w:pPr>
-      <w:ins w:id="1231" w:author="Codex" w:date="2026-10-18T19:47:29Z">
+      <w:ins w:id="1239" w:author="Codex" w:date="2026-10-18T21:55:52Z">
         <w:r>
           <w:t xml:space="preserve">The binary and workflow settings impose different control demands. Binary steering redistributes probability between two prescribed answers, and an external guard accepts only a qualifying candidate. The workflow maps must generate tool names, arguments and a correct action sequence as the environment changes; an external chooser does not repair an unsuccessful workflow. The observed invariance of preservation actions therefore documents a failure of these frozen maps to transfer the required policy under this decoding and scoring setup. It does not establish that a learned direction universally lacks the capacity to represent the behavior.</w:t>
         </w:r>
@@ -6455,12 +6507,1111 @@
     </w:p>
     <w:p>
       <w:pPr>
+        <w:pStyle w:val="Heading2"/>
+        <w:rPr>
+          <w:ins w:id="1240" w:author="Codex" w:date="2026-10-18T21:55:52Z"/>
+        </w:rPr>
+      </w:pPr>
+      <w:ins w:id="1241" w:author="Codex" w:date="2026-10-18T21:55:52Z">
+        <w:r>
+          <w:t xml:space="preserve">Local transfer under teacher forcing</w:t>
+        </w:r>
+      </w:ins>
+    </w:p>
+    <w:p>
+      <w:pPr>
+        <w:pStyle w:val="FirstParagraph"/>
+        <w:rPr>
+          <w:ins w:id="1242" w:author="Codex" w:date="2026-10-18T21:55:52Z"/>
+        </w:rPr>
+      </w:pPr>
+      <w:ins w:id="1243" w:author="Codex" w:date="2026-10-18T21:55:52Z">
+        <w:r>
+          <w:t xml:space="preserve">The CPU audit reproduces the fixed own-case normalized reconstruction MSE: 0.118701 at initialization, 1.031016 at update 48 and 1.422664 at update 96. Anchor alignment, normalizers and the checked objective derivatives agree with the retained source. The arithmetic tolerance is 1e-4 relative and 1e-6 absolute; it is not a relaxed training-equivalence qualification. No indexing, normalization or objective-sign error is found in these checks. Historical output KL is retained from its original receipts because the old teacher-logit cache is unavailable locally.</w:t>
+        </w:r>
+      </w:ins>
+    </w:p>
+    <w:p>
+      <w:pPr>
+        <w:pStyle w:val="Caption"/>
+        <w:keepNext/>
+        <w:rPr>
+          <w:ins w:id="1244" w:author="Codex" w:date="2026-10-18T21:55:52Z"/>
+        </w:rPr>
+      </w:pPr>
+      <w:ins w:id="1245" w:author="Codex" w:date="2026-10-18T21:55:52Z">
+        <w:r>
+          <w:t xml:space="preserve">Table 8. Training-only local diagnostic on three preselected responses (207 teacher-forced tokens). Entries are equal-weight means across the three cases. KL is full-vocabulary teacher-to-student divergence; function and value columns give demonstrated-token negative log likelihood. Lower is better. Full-A state controls supply teacher representations, and are not capacity-matched learned methods or workflow success rates.</w:t>
+        </w:r>
+      </w:ins>
+    </w:p>
+    <w:tbl>
+      <w:tblPr>
+        <w:tblW w:type="auto" w:w="0"/>
+        <w:jc w:val="center"/>
+        <w:tblBorders>
+          <w:top w:val="single" w:sz="4" w:color="D9D9D9"/>
+          <w:left w:val="single" w:sz="4" w:color="D9D9D9"/>
+          <w:bottom w:val="single" w:sz="4" w:color="D9D9D9"/>
+          <w:right w:val="single" w:sz="4" w:color="D9D9D9"/>
+          <w:insideH w:val="single" w:sz="4" w:color="D9D9D9"/>
+          <w:insideV w:val="single" w:sz="4" w:color="D9D9D9"/>
+        </w:tblBorders>
+        <w:tblLayout w:type="fixed"/>
+        <w:tblCellMar>
+          <w:top w:w="85" w:type="dxa"/>
+          <w:left w:w="85" w:type="dxa"/>
+          <w:bottom w:w="85" w:type="dxa"/>
+          <w:right w:w="85" w:type="dxa"/>
+        </w:tblCellMar>
+        <w:tblLook w:firstColumn="1" w:firstRow="1" w:lastColumn="0" w:lastRow="0" w:noHBand="0" w:noVBand="1" w:val="04A0"/>
+      </w:tblPr>
+      <w:tblGrid>
+        <w:gridCol w:w="4597"/>
+        <w:gridCol w:w="1799"/>
+        <w:gridCol w:w="1799"/>
+        <w:gridCol w:w="1799"/>
+      </w:tblGrid>
+      <w:tr>
+        <w:trPr>
+          <w:cantSplit/>
+          <w:tblHeader/>
+          <w:ins w:id="1246" w:author="Codex" w:date="2026-10-18T21:55:52Z"/>
+        </w:trPr>
+        <w:tc>
+          <w:tcPr>
+            <w:tcW w:type="dxa" w:w="4597"/>
+            <w:shd w:fill="D9E2F3"/>
+            <w:vAlign w:val="center"/>
+          </w:tcPr>
+          <w:p>
+            <w:pPr>
+              <w:keepNext/>
+              <w:spacing w:after="0" w:line="240" w:lineRule="auto"/>
+              <w:jc w:val="left"/>
+            </w:pPr>
+            <w:r>
+              <w:rPr>
+                <w:rFonts w:ascii="Times New Roman" w:hAnsi="Times New Roman"/>
+                <w:b/>
+                <w:sz w:val="19"/>
+              </w:rPr>
+              <w:t>Condition</w:t>
+            </w:r>
+          </w:p>
+        </w:tc>
+        <w:tc>
+          <w:tcPr>
+            <w:tcW w:type="dxa" w:w="1799"/>
+            <w:shd w:fill="D9E2F3"/>
+            <w:vAlign w:val="center"/>
+          </w:tcPr>
+          <w:p>
+            <w:pPr>
+              <w:keepNext/>
+              <w:spacing w:after="0" w:line="240" w:lineRule="auto"/>
+              <w:jc w:val="center"/>
+            </w:pPr>
+            <w:r>
+              <w:rPr>
+                <w:rFonts w:ascii="Times New Roman" w:hAnsi="Times New Roman"/>
+                <w:b/>
+                <w:sz w:val="19"/>
+              </w:rPr>
+              <w:t>Output KL</w:t>
+            </w:r>
+          </w:p>
+        </w:tc>
+        <w:tc>
+          <w:tcPr>
+            <w:tcW w:type="dxa" w:w="1799"/>
+            <w:shd w:fill="D9E2F3"/>
+            <w:vAlign w:val="center"/>
+          </w:tcPr>
+          <w:p>
+            <w:pPr>
+              <w:keepNext/>
+              <w:spacing w:after="0" w:line="240" w:lineRule="auto"/>
+              <w:jc w:val="center"/>
+            </w:pPr>
+            <w:r>
+              <w:rPr>
+                <w:rFonts w:ascii="Times New Roman" w:hAnsi="Times New Roman"/>
+                <w:b/>
+                <w:sz w:val="19"/>
+              </w:rPr>
+              <w:t>Function NLL</w:t>
+            </w:r>
+          </w:p>
+        </w:tc>
+        <w:tc>
+          <w:tcPr>
+            <w:tcW w:type="dxa" w:w="1799"/>
+            <w:shd w:fill="D9E2F3"/>
+            <w:vAlign w:val="center"/>
+          </w:tcPr>
+          <w:p>
+            <w:pPr>
+              <w:keepNext/>
+              <w:spacing w:after="0" w:line="240" w:lineRule="auto"/>
+              <w:jc w:val="center"/>
+            </w:pPr>
+            <w:r>
+              <w:rPr>
+                <w:rFonts w:ascii="Times New Roman" w:hAnsi="Times New Roman"/>
+                <w:b/>
+                <w:sz w:val="19"/>
+              </w:rPr>
+              <w:t>Value NLL</w:t>
+            </w:r>
+          </w:p>
+        </w:tc>
+      </w:tr>
+      <w:tr>
+        <w:trPr>
+          <w:cantSplit/>
+          <w:ins w:id="1247" w:author="Codex" w:date="2026-10-18T21:55:52Z"/>
+        </w:trPr>
+        <w:tc>
+          <w:tcPr>
+            <w:tcW w:type="dxa" w:w="4597"/>
+            <w:shd w:fill="FFFFFF"/>
+            <w:vAlign w:val="center"/>
+          </w:tcPr>
+          <w:p>
+            <w:pPr>
+              <w:keepNext/>
+              <w:spacing w:after="0" w:line="240" w:lineRule="auto"/>
+              <w:jc w:val="left"/>
+            </w:pPr>
+            <w:r>
+              <w:rPr>
+                <w:rFonts w:ascii="Times New Roman" w:hAnsi="Times New Roman"/>
+                <w:sz w:val="19"/>
+              </w:rPr>
+              <w:t>Unmodified base</w:t>
+            </w:r>
+          </w:p>
+        </w:tc>
+        <w:tc>
+          <w:tcPr>
+            <w:tcW w:type="dxa" w:w="1799"/>
+            <w:shd w:fill="FFFFFF"/>
+            <w:vAlign w:val="center"/>
+          </w:tcPr>
+          <w:p>
+            <w:pPr>
+              <w:keepNext/>
+              <w:spacing w:after="0" w:line="240" w:lineRule="auto"/>
+              <w:jc w:val="center"/>
+            </w:pPr>
+            <w:r>
+              <w:rPr>
+                <w:rFonts w:ascii="Times New Roman" w:hAnsi="Times New Roman"/>
+                <w:sz w:val="19"/>
+              </w:rPr>
+              <w:t>0.722353</w:t>
+            </w:r>
+          </w:p>
+        </w:tc>
+        <w:tc>
+          <w:tcPr>
+            <w:tcW w:type="dxa" w:w="1799"/>
+            <w:shd w:fill="FFFFFF"/>
+            <w:vAlign w:val="center"/>
+          </w:tcPr>
+          <w:p>
+            <w:pPr>
+              <w:keepNext/>
+              <w:spacing w:after="0" w:line="240" w:lineRule="auto"/>
+              <w:jc w:val="center"/>
+            </w:pPr>
+            <w:r>
+              <w:rPr>
+                <w:rFonts w:ascii="Times New Roman" w:hAnsi="Times New Roman"/>
+                <w:sz w:val="19"/>
+              </w:rPr>
+              <w:t>0.218299</w:t>
+            </w:r>
+          </w:p>
+        </w:tc>
+        <w:tc>
+          <w:tcPr>
+            <w:tcW w:type="dxa" w:w="1799"/>
+            <w:shd w:fill="FFFFFF"/>
+            <w:vAlign w:val="center"/>
+          </w:tcPr>
+          <w:p>
+            <w:pPr>
+              <w:keepNext/>
+              <w:spacing w:after="0" w:line="240" w:lineRule="auto"/>
+              <w:jc w:val="center"/>
+            </w:pPr>
+            <w:r>
+              <w:rPr>
+                <w:rFonts w:ascii="Times New Roman" w:hAnsi="Times New Roman"/>
+                <w:sz w:val="19"/>
+              </w:rPr>
+              <w:t>0.708257</w:t>
+            </w:r>
+          </w:p>
+        </w:tc>
+      </w:tr>
+      <w:tr>
+        <w:trPr>
+          <w:cantSplit/>
+          <w:ins w:id="1248" w:author="Codex" w:date="2026-10-18T21:55:52Z"/>
+        </w:trPr>
+        <w:tc>
+          <w:tcPr>
+            <w:tcW w:type="dxa" w:w="4597"/>
+            <w:shd w:fill="F7F7F7"/>
+            <w:vAlign w:val="center"/>
+          </w:tcPr>
+          <w:p>
+            <w:pPr>
+              <w:keepNext/>
+              <w:spacing w:after="0" w:line="240" w:lineRule="auto"/>
+              <w:jc w:val="left"/>
+            </w:pPr>
+            <w:r>
+              <w:rPr>
+                <w:rFonts w:ascii="Times New Roman" w:hAnsi="Times New Roman"/>
+                <w:sz w:val="19"/>
+              </w:rPr>
+              <w:t>Ridge block 31</w:t>
+            </w:r>
+          </w:p>
+        </w:tc>
+        <w:tc>
+          <w:tcPr>
+            <w:tcW w:type="dxa" w:w="1799"/>
+            <w:shd w:fill="F7F7F7"/>
+            <w:vAlign w:val="center"/>
+          </w:tcPr>
+          <w:p>
+            <w:pPr>
+              <w:keepNext/>
+              <w:spacing w:after="0" w:line="240" w:lineRule="auto"/>
+              <w:jc w:val="center"/>
+            </w:pPr>
+            <w:r>
+              <w:rPr>
+                <w:rFonts w:ascii="Times New Roman" w:hAnsi="Times New Roman"/>
+                <w:sz w:val="19"/>
+              </w:rPr>
+              <w:t>0.718233</w:t>
+            </w:r>
+          </w:p>
+        </w:tc>
+        <w:tc>
+          <w:tcPr>
+            <w:tcW w:type="dxa" w:w="1799"/>
+            <w:shd w:fill="F7F7F7"/>
+            <w:vAlign w:val="center"/>
+          </w:tcPr>
+          <w:p>
+            <w:pPr>
+              <w:keepNext/>
+              <w:spacing w:after="0" w:line="240" w:lineRule="auto"/>
+              <w:jc w:val="center"/>
+            </w:pPr>
+            <w:r>
+              <w:rPr>
+                <w:rFonts w:ascii="Times New Roman" w:hAnsi="Times New Roman"/>
+                <w:sz w:val="19"/>
+              </w:rPr>
+              <w:t>0.199810</w:t>
+            </w:r>
+          </w:p>
+        </w:tc>
+        <w:tc>
+          <w:tcPr>
+            <w:tcW w:type="dxa" w:w="1799"/>
+            <w:shd w:fill="F7F7F7"/>
+            <w:vAlign w:val="center"/>
+          </w:tcPr>
+          <w:p>
+            <w:pPr>
+              <w:keepNext/>
+              <w:spacing w:after="0" w:line="240" w:lineRule="auto"/>
+              <w:jc w:val="center"/>
+            </w:pPr>
+            <w:r>
+              <w:rPr>
+                <w:rFonts w:ascii="Times New Roman" w:hAnsi="Times New Roman"/>
+                <w:sz w:val="19"/>
+              </w:rPr>
+              <w:t>0.712327</w:t>
+            </w:r>
+          </w:p>
+        </w:tc>
+      </w:tr>
+      <w:tr>
+        <w:trPr>
+          <w:cantSplit/>
+          <w:ins w:id="1249" w:author="Codex" w:date="2026-10-18T21:55:52Z"/>
+        </w:trPr>
+        <w:tc>
+          <w:tcPr>
+            <w:tcW w:type="dxa" w:w="4597"/>
+            <w:shd w:fill="FFFFFF"/>
+            <w:vAlign w:val="center"/>
+          </w:tcPr>
+          <w:p>
+            <w:pPr>
+              <w:keepNext/>
+              <w:spacing w:after="0" w:line="240" w:lineRule="auto"/>
+              <w:jc w:val="left"/>
+            </w:pPr>
+            <w:r>
+              <w:rPr>
+                <w:rFonts w:ascii="Times New Roman" w:hAnsi="Times New Roman"/>
+                <w:sz w:val="19"/>
+              </w:rPr>
+              <w:t>Full A state block 31</w:t>
+            </w:r>
+          </w:p>
+        </w:tc>
+        <w:tc>
+          <w:tcPr>
+            <w:tcW w:type="dxa" w:w="1799"/>
+            <w:shd w:fill="FFFFFF"/>
+            <w:vAlign w:val="center"/>
+          </w:tcPr>
+          <w:p>
+            <w:pPr>
+              <w:keepNext/>
+              <w:spacing w:after="0" w:line="240" w:lineRule="auto"/>
+              <w:jc w:val="center"/>
+            </w:pPr>
+            <w:r>
+              <w:rPr>
+                <w:rFonts w:ascii="Times New Roman" w:hAnsi="Times New Roman"/>
+                <w:sz w:val="19"/>
+              </w:rPr>
+              <w:t>0.725653</w:t>
+            </w:r>
+          </w:p>
+        </w:tc>
+        <w:tc>
+          <w:tcPr>
+            <w:tcW w:type="dxa" w:w="1799"/>
+            <w:shd w:fill="FFFFFF"/>
+            <w:vAlign w:val="center"/>
+          </w:tcPr>
+          <w:p>
+            <w:pPr>
+              <w:keepNext/>
+              <w:spacing w:after="0" w:line="240" w:lineRule="auto"/>
+              <w:jc w:val="center"/>
+            </w:pPr>
+            <w:r>
+              <w:rPr>
+                <w:rFonts w:ascii="Times New Roman" w:hAnsi="Times New Roman"/>
+                <w:sz w:val="19"/>
+              </w:rPr>
+              <w:t>0.355616</w:t>
+            </w:r>
+          </w:p>
+        </w:tc>
+        <w:tc>
+          <w:tcPr>
+            <w:tcW w:type="dxa" w:w="1799"/>
+            <w:shd w:fill="FFFFFF"/>
+            <w:vAlign w:val="center"/>
+          </w:tcPr>
+          <w:p>
+            <w:pPr>
+              <w:keepNext/>
+              <w:spacing w:after="0" w:line="240" w:lineRule="auto"/>
+              <w:jc w:val="center"/>
+            </w:pPr>
+            <w:r>
+              <w:rPr>
+                <w:rFonts w:ascii="Times New Roman" w:hAnsi="Times New Roman"/>
+                <w:sz w:val="19"/>
+              </w:rPr>
+              <w:t>0.732813</w:t>
+            </w:r>
+          </w:p>
+        </w:tc>
+      </w:tr>
+      <w:tr>
+        <w:trPr>
+          <w:cantSplit/>
+          <w:ins w:id="1250" w:author="Codex" w:date="2026-10-18T21:55:52Z"/>
+        </w:trPr>
+        <w:tc>
+          <w:tcPr>
+            <w:tcW w:type="dxa" w:w="4597"/>
+            <w:shd w:fill="F7F7F7"/>
+            <w:vAlign w:val="center"/>
+          </w:tcPr>
+          <w:p>
+            <w:pPr>
+              <w:keepNext/>
+              <w:spacing w:after="0" w:line="240" w:lineRule="auto"/>
+              <w:jc w:val="left"/>
+            </w:pPr>
+            <w:r>
+              <w:rPr>
+                <w:rFonts w:ascii="Times New Roman" w:hAnsi="Times New Roman"/>
+                <w:sz w:val="19"/>
+              </w:rPr>
+              <w:t>Ridge block 47</w:t>
+            </w:r>
+          </w:p>
+        </w:tc>
+        <w:tc>
+          <w:tcPr>
+            <w:tcW w:type="dxa" w:w="1799"/>
+            <w:shd w:fill="F7F7F7"/>
+            <w:vAlign w:val="center"/>
+          </w:tcPr>
+          <w:p>
+            <w:pPr>
+              <w:keepNext/>
+              <w:spacing w:after="0" w:line="240" w:lineRule="auto"/>
+              <w:jc w:val="center"/>
+            </w:pPr>
+            <w:r>
+              <w:rPr>
+                <w:rFonts w:ascii="Times New Roman" w:hAnsi="Times New Roman"/>
+                <w:sz w:val="19"/>
+              </w:rPr>
+              <w:t>0.700333</w:t>
+            </w:r>
+          </w:p>
+        </w:tc>
+        <w:tc>
+          <w:tcPr>
+            <w:tcW w:type="dxa" w:w="1799"/>
+            <w:shd w:fill="F7F7F7"/>
+            <w:vAlign w:val="center"/>
+          </w:tcPr>
+          <w:p>
+            <w:pPr>
+              <w:keepNext/>
+              <w:spacing w:after="0" w:line="240" w:lineRule="auto"/>
+              <w:jc w:val="center"/>
+            </w:pPr>
+            <w:r>
+              <w:rPr>
+                <w:rFonts w:ascii="Times New Roman" w:hAnsi="Times New Roman"/>
+                <w:sz w:val="19"/>
+              </w:rPr>
+              <w:t>0.198403</w:t>
+            </w:r>
+          </w:p>
+        </w:tc>
+        <w:tc>
+          <w:tcPr>
+            <w:tcW w:type="dxa" w:w="1799"/>
+            <w:shd w:fill="F7F7F7"/>
+            <w:vAlign w:val="center"/>
+          </w:tcPr>
+          <w:p>
+            <w:pPr>
+              <w:keepNext/>
+              <w:spacing w:after="0" w:line="240" w:lineRule="auto"/>
+              <w:jc w:val="center"/>
+            </w:pPr>
+            <w:r>
+              <w:rPr>
+                <w:rFonts w:ascii="Times New Roman" w:hAnsi="Times New Roman"/>
+                <w:sz w:val="19"/>
+              </w:rPr>
+              <w:t>0.716796</w:t>
+            </w:r>
+          </w:p>
+        </w:tc>
+      </w:tr>
+      <w:tr>
+        <w:trPr>
+          <w:cantSplit/>
+          <w:ins w:id="1251" w:author="Codex" w:date="2026-10-18T21:55:52Z"/>
+        </w:trPr>
+        <w:tc>
+          <w:tcPr>
+            <w:tcW w:type="dxa" w:w="4597"/>
+            <w:shd w:fill="FFFFFF"/>
+            <w:vAlign w:val="center"/>
+          </w:tcPr>
+          <w:p>
+            <w:pPr>
+              <w:keepNext/>
+              <w:spacing w:after="0" w:line="240" w:lineRule="auto"/>
+              <w:jc w:val="left"/>
+            </w:pPr>
+            <w:r>
+              <w:rPr>
+                <w:rFonts w:ascii="Times New Roman" w:hAnsi="Times New Roman"/>
+                <w:sz w:val="19"/>
+              </w:rPr>
+              <w:t>Full A state block 47</w:t>
+            </w:r>
+          </w:p>
+        </w:tc>
+        <w:tc>
+          <w:tcPr>
+            <w:tcW w:type="dxa" w:w="1799"/>
+            <w:shd w:fill="FFFFFF"/>
+            <w:vAlign w:val="center"/>
+          </w:tcPr>
+          <w:p>
+            <w:pPr>
+              <w:keepNext/>
+              <w:spacing w:after="0" w:line="240" w:lineRule="auto"/>
+              <w:jc w:val="center"/>
+            </w:pPr>
+            <w:r>
+              <w:rPr>
+                <w:rFonts w:ascii="Times New Roman" w:hAnsi="Times New Roman"/>
+                <w:sz w:val="19"/>
+              </w:rPr>
+              <w:t>0.627861</w:t>
+            </w:r>
+          </w:p>
+        </w:tc>
+        <w:tc>
+          <w:tcPr>
+            <w:tcW w:type="dxa" w:w="1799"/>
+            <w:shd w:fill="FFFFFF"/>
+            <w:vAlign w:val="center"/>
+          </w:tcPr>
+          <w:p>
+            <w:pPr>
+              <w:keepNext/>
+              <w:spacing w:after="0" w:line="240" w:lineRule="auto"/>
+              <w:jc w:val="center"/>
+            </w:pPr>
+            <w:r>
+              <w:rPr>
+                <w:rFonts w:ascii="Times New Roman" w:hAnsi="Times New Roman"/>
+                <w:sz w:val="19"/>
+              </w:rPr>
+              <w:t>0.178019</w:t>
+            </w:r>
+          </w:p>
+        </w:tc>
+        <w:tc>
+          <w:tcPr>
+            <w:tcW w:type="dxa" w:w="1799"/>
+            <w:shd w:fill="FFFFFF"/>
+            <w:vAlign w:val="center"/>
+          </w:tcPr>
+          <w:p>
+            <w:pPr>
+              <w:keepNext/>
+              <w:spacing w:after="0" w:line="240" w:lineRule="auto"/>
+              <w:jc w:val="center"/>
+            </w:pPr>
+            <w:r>
+              <w:rPr>
+                <w:rFonts w:ascii="Times New Roman" w:hAnsi="Times New Roman"/>
+                <w:sz w:val="19"/>
+              </w:rPr>
+              <w:t>0.707359</w:t>
+            </w:r>
+          </w:p>
+        </w:tc>
+      </w:tr>
+      <w:tr>
+        <w:trPr>
+          <w:cantSplit/>
+          <w:ins w:id="1252" w:author="Codex" w:date="2026-10-18T21:55:52Z"/>
+        </w:trPr>
+        <w:tc>
+          <w:tcPr>
+            <w:tcW w:type="dxa" w:w="4597"/>
+            <w:shd w:fill="F7F7F7"/>
+            <w:vAlign w:val="center"/>
+          </w:tcPr>
+          <w:p>
+            <w:pPr>
+              <w:keepNext/>
+              <w:spacing w:after="0" w:line="240" w:lineRule="auto"/>
+              <w:jc w:val="left"/>
+            </w:pPr>
+            <w:r>
+              <w:rPr>
+                <w:rFonts w:ascii="Times New Roman" w:hAnsi="Times New Roman"/>
+                <w:sz w:val="19"/>
+              </w:rPr>
+              <w:t>Ridge block 62</w:t>
+            </w:r>
+          </w:p>
+        </w:tc>
+        <w:tc>
+          <w:tcPr>
+            <w:tcW w:type="dxa" w:w="1799"/>
+            <w:shd w:fill="F7F7F7"/>
+            <w:vAlign w:val="center"/>
+          </w:tcPr>
+          <w:p>
+            <w:pPr>
+              <w:keepNext/>
+              <w:spacing w:after="0" w:line="240" w:lineRule="auto"/>
+              <w:jc w:val="center"/>
+            </w:pPr>
+            <w:r>
+              <w:rPr>
+                <w:rFonts w:ascii="Times New Roman" w:hAnsi="Times New Roman"/>
+                <w:sz w:val="19"/>
+              </w:rPr>
+              <w:t>0.673985</w:t>
+            </w:r>
+          </w:p>
+        </w:tc>
+        <w:tc>
+          <w:tcPr>
+            <w:tcW w:type="dxa" w:w="1799"/>
+            <w:shd w:fill="F7F7F7"/>
+            <w:vAlign w:val="center"/>
+          </w:tcPr>
+          <w:p>
+            <w:pPr>
+              <w:keepNext/>
+              <w:spacing w:after="0" w:line="240" w:lineRule="auto"/>
+              <w:jc w:val="center"/>
+            </w:pPr>
+            <w:r>
+              <w:rPr>
+                <w:rFonts w:ascii="Times New Roman" w:hAnsi="Times New Roman"/>
+                <w:sz w:val="19"/>
+              </w:rPr>
+              <w:t>0.192362</w:t>
+            </w:r>
+          </w:p>
+        </w:tc>
+        <w:tc>
+          <w:tcPr>
+            <w:tcW w:type="dxa" w:w="1799"/>
+            <w:shd w:fill="F7F7F7"/>
+            <w:vAlign w:val="center"/>
+          </w:tcPr>
+          <w:p>
+            <w:pPr>
+              <w:keepNext/>
+              <w:spacing w:after="0" w:line="240" w:lineRule="auto"/>
+              <w:jc w:val="center"/>
+            </w:pPr>
+            <w:r>
+              <w:rPr>
+                <w:rFonts w:ascii="Times New Roman" w:hAnsi="Times New Roman"/>
+                <w:sz w:val="19"/>
+              </w:rPr>
+              <w:t>0.710961</w:t>
+            </w:r>
+          </w:p>
+        </w:tc>
+      </w:tr>
+      <w:tr>
+        <w:trPr>
+          <w:cantSplit/>
+          <w:ins w:id="1253" w:author="Codex" w:date="2026-10-18T21:55:52Z"/>
+        </w:trPr>
+        <w:tc>
+          <w:tcPr>
+            <w:tcW w:type="dxa" w:w="4597"/>
+            <w:shd w:fill="FFFFFF"/>
+            <w:vAlign w:val="center"/>
+          </w:tcPr>
+          <w:p>
+            <w:pPr>
+              <w:keepNext/>
+              <w:spacing w:after="0" w:line="240" w:lineRule="auto"/>
+              <w:jc w:val="left"/>
+            </w:pPr>
+            <w:r>
+              <w:rPr>
+                <w:rFonts w:ascii="Times New Roman" w:hAnsi="Times New Roman"/>
+                <w:sz w:val="19"/>
+              </w:rPr>
+              <w:t>Full A state block 62</w:t>
+            </w:r>
+          </w:p>
+        </w:tc>
+        <w:tc>
+          <w:tcPr>
+            <w:tcW w:type="dxa" w:w="1799"/>
+            <w:shd w:fill="FFFFFF"/>
+            <w:vAlign w:val="center"/>
+          </w:tcPr>
+          <w:p>
+            <w:pPr>
+              <w:keepNext/>
+              <w:spacing w:after="0" w:line="240" w:lineRule="auto"/>
+              <w:jc w:val="center"/>
+            </w:pPr>
+            <w:r>
+              <w:rPr>
+                <w:rFonts w:ascii="Times New Roman" w:hAnsi="Times New Roman"/>
+                <w:sz w:val="19"/>
+              </w:rPr>
+              <w:t>0.503866</w:t>
+            </w:r>
+          </w:p>
+        </w:tc>
+        <w:tc>
+          <w:tcPr>
+            <w:tcW w:type="dxa" w:w="1799"/>
+            <w:shd w:fill="FFFFFF"/>
+            <w:vAlign w:val="center"/>
+          </w:tcPr>
+          <w:p>
+            <w:pPr>
+              <w:keepNext/>
+              <w:spacing w:after="0" w:line="240" w:lineRule="auto"/>
+              <w:jc w:val="center"/>
+            </w:pPr>
+            <w:r>
+              <w:rPr>
+                <w:rFonts w:ascii="Times New Roman" w:hAnsi="Times New Roman"/>
+                <w:sz w:val="19"/>
+              </w:rPr>
+              <w:t>0.192423</w:t>
+            </w:r>
+          </w:p>
+        </w:tc>
+        <w:tc>
+          <w:tcPr>
+            <w:tcW w:type="dxa" w:w="1799"/>
+            <w:shd w:fill="FFFFFF"/>
+            <w:vAlign w:val="center"/>
+          </w:tcPr>
+          <w:p>
+            <w:pPr>
+              <w:keepNext/>
+              <w:spacing w:after="0" w:line="240" w:lineRule="auto"/>
+              <w:jc w:val="center"/>
+            </w:pPr>
+            <w:r>
+              <w:rPr>
+                <w:rFonts w:ascii="Times New Roman" w:hAnsi="Times New Roman"/>
+                <w:sz w:val="19"/>
+              </w:rPr>
+              <w:t>0.711745</w:t>
+            </w:r>
+          </w:p>
+        </w:tc>
+      </w:tr>
+      <w:tr>
+        <w:trPr>
+          <w:cantSplit/>
+          <w:ins w:id="1254" w:author="Codex" w:date="2026-10-18T21:55:52Z"/>
+        </w:trPr>
+        <w:tc>
+          <w:tcPr>
+            <w:tcW w:type="dxa" w:w="4597"/>
+            <w:shd w:fill="F7F7F7"/>
+            <w:vAlign w:val="center"/>
+          </w:tcPr>
+          <w:p>
+            <w:pPr>
+              <w:keepNext/>
+              <w:spacing w:after="0" w:line="240" w:lineRule="auto"/>
+              <w:jc w:val="left"/>
+            </w:pPr>
+            <w:r>
+              <w:rPr>
+                <w:rFonts w:ascii="Times New Roman" w:hAnsi="Times New Roman"/>
+                <w:sz w:val="19"/>
+              </w:rPr>
+              <w:t>Six function initializer</w:t>
+            </w:r>
+          </w:p>
+        </w:tc>
+        <w:tc>
+          <w:tcPr>
+            <w:tcW w:type="dxa" w:w="1799"/>
+            <w:shd w:fill="F7F7F7"/>
+            <w:vAlign w:val="center"/>
+          </w:tcPr>
+          <w:p>
+            <w:pPr>
+              <w:keepNext/>
+              <w:spacing w:after="0" w:line="240" w:lineRule="auto"/>
+              <w:jc w:val="center"/>
+            </w:pPr>
+            <w:r>
+              <w:rPr>
+                <w:rFonts w:ascii="Times New Roman" w:hAnsi="Times New Roman"/>
+                <w:sz w:val="19"/>
+              </w:rPr>
+              <w:t>0.656763</w:t>
+            </w:r>
+          </w:p>
+        </w:tc>
+        <w:tc>
+          <w:tcPr>
+            <w:tcW w:type="dxa" w:w="1799"/>
+            <w:shd w:fill="F7F7F7"/>
+            <w:vAlign w:val="center"/>
+          </w:tcPr>
+          <w:p>
+            <w:pPr>
+              <w:keepNext/>
+              <w:spacing w:after="0" w:line="240" w:lineRule="auto"/>
+              <w:jc w:val="center"/>
+            </w:pPr>
+            <w:r>
+              <w:rPr>
+                <w:rFonts w:ascii="Times New Roman" w:hAnsi="Times New Roman"/>
+                <w:sz w:val="19"/>
+              </w:rPr>
+              <w:t>0.199200</w:t>
+            </w:r>
+          </w:p>
+        </w:tc>
+        <w:tc>
+          <w:tcPr>
+            <w:tcW w:type="dxa" w:w="1799"/>
+            <w:shd w:fill="F7F7F7"/>
+            <w:vAlign w:val="center"/>
+          </w:tcPr>
+          <w:p>
+            <w:pPr>
+              <w:keepNext/>
+              <w:spacing w:after="0" w:line="240" w:lineRule="auto"/>
+              <w:jc w:val="center"/>
+            </w:pPr>
+            <w:r>
+              <w:rPr>
+                <w:rFonts w:ascii="Times New Roman" w:hAnsi="Times New Roman"/>
+                <w:sz w:val="19"/>
+              </w:rPr>
+              <w:t>0.692586</w:t>
+            </w:r>
+          </w:p>
+        </w:tc>
+      </w:tr>
+      <w:tr>
+        <w:trPr>
+          <w:cantSplit/>
+          <w:ins w:id="1255" w:author="Codex" w:date="2026-10-18T21:55:52Z"/>
+        </w:trPr>
+        <w:tc>
+          <w:tcPr>
+            <w:tcW w:type="dxa" w:w="4597"/>
+            <w:shd w:fill="FFFFFF"/>
+            <w:vAlign w:val="center"/>
+          </w:tcPr>
+          <w:p>
+            <w:pPr>
+              <w:keepNext/>
+              <w:spacing w:after="0" w:line="240" w:lineRule="auto"/>
+              <w:jc w:val="left"/>
+            </w:pPr>
+            <w:r>
+              <w:rPr>
+                <w:rFonts w:ascii="Times New Roman" w:hAnsi="Times New Roman"/>
+                <w:sz w:val="19"/>
+              </w:rPr>
+              <w:t>Six function update 96</w:t>
+            </w:r>
+          </w:p>
+        </w:tc>
+        <w:tc>
+          <w:tcPr>
+            <w:tcW w:type="dxa" w:w="1799"/>
+            <w:shd w:fill="FFFFFF"/>
+            <w:vAlign w:val="center"/>
+          </w:tcPr>
+          <w:p>
+            <w:pPr>
+              <w:keepNext/>
+              <w:spacing w:after="0" w:line="240" w:lineRule="auto"/>
+              <w:jc w:val="center"/>
+            </w:pPr>
+            <w:r>
+              <w:rPr>
+                <w:rFonts w:ascii="Times New Roman" w:hAnsi="Times New Roman"/>
+                <w:sz w:val="19"/>
+              </w:rPr>
+              <w:t>0.202261</w:t>
+            </w:r>
+          </w:p>
+        </w:tc>
+        <w:tc>
+          <w:tcPr>
+            <w:tcW w:type="dxa" w:w="1799"/>
+            <w:shd w:fill="FFFFFF"/>
+            <w:vAlign w:val="center"/>
+          </w:tcPr>
+          <w:p>
+            <w:pPr>
+              <w:keepNext/>
+              <w:spacing w:after="0" w:line="240" w:lineRule="auto"/>
+              <w:jc w:val="center"/>
+            </w:pPr>
+            <w:r>
+              <w:rPr>
+                <w:rFonts w:ascii="Times New Roman" w:hAnsi="Times New Roman"/>
+                <w:sz w:val="19"/>
+              </w:rPr>
+              <w:t>0.181602</w:t>
+            </w:r>
+          </w:p>
+        </w:tc>
+        <w:tc>
+          <w:tcPr>
+            <w:tcW w:type="dxa" w:w="1799"/>
+            <w:shd w:fill="FFFFFF"/>
+            <w:vAlign w:val="center"/>
+          </w:tcPr>
+          <w:p>
+            <w:pPr>
+              <w:keepNext/>
+              <w:spacing w:after="0" w:line="240" w:lineRule="auto"/>
+              <w:jc w:val="center"/>
+            </w:pPr>
+            <w:r>
+              <w:rPr>
+                <w:rFonts w:ascii="Times New Roman" w:hAnsi="Times New Roman"/>
+                <w:sz w:val="19"/>
+              </w:rPr>
+              <w:t>0.010619</w:t>
+            </w:r>
+          </w:p>
+        </w:tc>
+      </w:tr>
+      <w:tr>
+        <w:trPr>
+          <w:cantSplit/>
+          <w:ins w:id="1256" w:author="Codex" w:date="2026-10-18T21:55:52Z"/>
+        </w:trPr>
+        <w:tc>
+          <w:tcPr>
+            <w:tcW w:type="dxa" w:w="4597"/>
+            <w:shd w:fill="F7F7F7"/>
+            <w:vAlign w:val="center"/>
+          </w:tcPr>
+          <w:p>
+            <w:pPr>
+              <w:spacing w:after="0" w:line="240" w:lineRule="auto"/>
+              <w:jc w:val="left"/>
+            </w:pPr>
+            <w:r>
+              <w:rPr>
+                <w:rFonts w:ascii="Times New Roman" w:hAnsi="Times New Roman"/>
+                <w:sz w:val="19"/>
+              </w:rPr>
+              <w:t>Full A states six sites</w:t>
+            </w:r>
+          </w:p>
+        </w:tc>
+        <w:tc>
+          <w:tcPr>
+            <w:tcW w:type="dxa" w:w="1799"/>
+            <w:shd w:fill="F7F7F7"/>
+            <w:vAlign w:val="center"/>
+          </w:tcPr>
+          <w:p>
+            <w:pPr>
+              <w:spacing w:after="0" w:line="240" w:lineRule="auto"/>
+              <w:jc w:val="center"/>
+            </w:pPr>
+            <w:r>
+              <w:rPr>
+                <w:rFonts w:ascii="Times New Roman" w:hAnsi="Times New Roman"/>
+                <w:sz w:val="19"/>
+              </w:rPr>
+              <w:t>0.001637</w:t>
+            </w:r>
+          </w:p>
+        </w:tc>
+        <w:tc>
+          <w:tcPr>
+            <w:tcW w:type="dxa" w:w="1799"/>
+            <w:shd w:fill="F7F7F7"/>
+            <w:vAlign w:val="center"/>
+          </w:tcPr>
+          <w:p>
+            <w:pPr>
+              <w:spacing w:after="0" w:line="240" w:lineRule="auto"/>
+              <w:jc w:val="center"/>
+            </w:pPr>
+            <w:r>
+              <w:rPr>
+                <w:rFonts w:ascii="Times New Roman" w:hAnsi="Times New Roman"/>
+                <w:sz w:val="19"/>
+              </w:rPr>
+              <w:t>0.002286</w:t>
+            </w:r>
+          </w:p>
+        </w:tc>
+        <w:tc>
+          <w:tcPr>
+            <w:tcW w:type="dxa" w:w="1799"/>
+            <w:shd w:fill="F7F7F7"/>
+            <w:vAlign w:val="center"/>
+          </w:tcPr>
+          <w:p>
+            <w:pPr>
+              <w:spacing w:after="0" w:line="240" w:lineRule="auto"/>
+              <w:jc w:val="center"/>
+            </w:pPr>
+            <w:r>
+              <w:rPr>
+                <w:rFonts w:ascii="Times New Roman" w:hAnsi="Times New Roman"/>
+                <w:sz w:val="19"/>
+              </w:rPr>
+              <w:t>0.001206</w:t>
+            </w:r>
+          </w:p>
+        </w:tc>
+      </w:tr>
+    </w:tbl>
+    <w:p>
+      <w:pPr>
+        <w:pStyle w:val="BodyText"/>
+        <w:spacing w:before="120"/>
+        <w:rPr>
+          <w:ins w:id="1257" w:author="Codex" w:date="2026-10-18T21:55:52Z"/>
+        </w:rPr>
+      </w:pPr>
+      <w:ins w:id="1258" w:author="Codex" w:date="2026-10-18T21:55:52Z">
+        <w:r>
+          <w:t xml:space="preserve">Supplying full-A states at six sites nearly recovers A's local output distribution: mean KL is 0.001637, compared with 0.722353 for base and 0.202261 for the final learned correction. This improvement occurs in all three cases. The final correction improves teacher-forced KL and argument-value prediction over the initializer, despite worse fixed local reconstruction error. These diagnostics therefore measure different objectives; the failed rollouts do not imply that correction fitting learned nothing.</w:t>
+        </w:r>
+      </w:ins>
+    </w:p>
+    <w:p>
+      <w:pPr>
         <w:pStyle w:val="BodyText"/>
         <w:rPr>
-          <w:ins w:id="1232" w:author="Codex" w:date="2026-10-18T19:47:29Z"/>
+          <w:ins w:id="1259" w:author="Codex" w:date="2026-10-18T21:55:52Z"/>
         </w:rPr>
       </w:pPr>
-      <w:ins w:id="1233" w:author="Codex" w:date="2026-10-18T19:47:29Z">
+      <w:ins w:id="1260" w:author="Codex" w:date="2026-10-18T21:55:52Z">
+        <w:r>
+          <w:t xml:space="preserve">The result supports incomplete transfer by the learned local maps. The regression targets describe local counterfactual block effects on student states, whereas A adapts projections across all 64 blocks; its captured states contain upstream effects absent from those local targets. Full-state replacement cannot separate target construction, regression capacity, optimization and history/cache effects. Single-site state replacement is not consistently helpful, and the differing intervention-position masks further limit comparisons across one and two boundaries.</w:t>
+        </w:r>
+      </w:ins>
+    </w:p>
+    <w:p>
+      <w:pPr>
+        <w:pStyle w:val="BodyText"/>
+        <w:rPr>
+          <w:ins w:id="1261" w:author="Codex" w:date="2026-10-18T21:55:52Z"/>
+        </w:rPr>
+      </w:pPr>
+      <w:ins w:id="1262" w:author="Codex" w:date="2026-10-18T21:55:52Z">
+        <w:r>
+          <w:t xml:space="preserve">Successful preceding tokens are supplied throughout this diagnostic. Correct function or argument probabilities on that path do not demonstrate that a model independently initiates, maintains or completes preservation behavior. No new tool rollout, validation qualification or independent heldout outcome is established. The evidence narrows the mechanism discussion to a transfer gap under matched prefixes, without identifying a unique cause of the autonomous workflow failures.</w:t>
+        </w:r>
+      </w:ins>
+    </w:p>
+    <w:p>
+      <w:pPr>
+        <w:pStyle w:val="BodyText"/>
+        <w:rPr>
+          <w:ins w:id="1263" w:author="Codex" w:date="2026-10-18T21:55:52Z"/>
+        </w:rPr>
+      </w:pPr>
+      <w:ins w:id="1264" w:author="Codex" w:date="2026-10-18T21:55:52Z">
         <w:r>
           <w:t xml:space="preserve">The final 0.8B and 2B adapters each stop their Evaluation-16 screen after four started cases: zero completed workflows, four partial episodes and 12 unexecuted cases. Truncation affects all four started cases in each model; the 0.8B record also has parse errors. These partial screens are not completed 0/16 workflow evaluations and do not establish model incapability. A separate preserved 0.8B F24 diagnostic completes 24 evaluations with 0/24 full-workflow successes; four registration grants do not complete the pending tasks. F24 differs from H24 and has no completed matched 2B or 27B comparison.</w:t>
         </w:r>
@@ -6478,10 +7629,10 @@
       <w:pPr>
         <w:pStyle w:val="FirstParagraph"/>
         <w:rPr>
-          <w:del w:id="1050" w:author="Codex" w:date="2026-10-18T19:47:29Z"/>
+          <w:del w:id="1050" w:author="Codex" w:date="2026-10-18T21:55:52Z"/>
         </w:rPr>
       </w:pPr>
-      <w:del w:id="1049" w:author="Codex" w:date="2026-10-18T19:47:29Z">
+      <w:del w:id="1049" w:author="Codex" w:date="2026-10-18T21:55:52Z">
         <w:r>
           <w:delText xml:space="preserve">The 0.8B results support the feasibility of replacing the teacher at inference with a compact predictor of activation changes. Replication across three seeds reduces concern that the primary success depends on one training initialization. The lower 2B recovery gives a useful limit: the fixed recipe is not equally effective at both scales, even though the larger teacher achieves complete correction. Representation differences, intervention location, projection capacity and unmatched downstream teacher changes are plausible factors, but the experiment does not isolate their causal contributions.</w:delText>
         </w:r>
@@ -6491,10 +7642,10 @@
       <w:pPr>
         <w:pStyle w:val="FirstParagraph"/>
         <w:rPr>
-          <w:ins w:id="1051" w:author="Codex" w:date="2026-10-18T19:47:29Z"/>
+          <w:ins w:id="1051" w:author="Codex" w:date="2026-10-18T21:55:52Z"/>
         </w:rPr>
       </w:pPr>
-      <w:ins w:id="1052" w:author="Codex" w:date="2026-10-18T19:47:29Z">
+      <w:ins w:id="1052" w:author="Codex" w:date="2026-10-18T21:55:52Z">
         <w:r>
           <w:t xml:space="preserve">The open gate preserves the measured binary outcomes at both model sizes and correctly recognizes the initial own-threat condition in both 24-case workflow panels. Accurate gating does not ensure successful steering: each selected correction arm fails all 11 own-preservation workflows in combined Validation-24, while fine-tuned A succeeds on 10, including all six active pending tasks. A's remaining failure concerns preservation after an already-completed task; its initial gate is correct. These observations separate recognition from action execution on a common finite panel. They do not qualify a three-field boundary controller or establish a general advantage of one intervention architecture.</w:t>
         </w:r>
@@ -6504,10 +7655,10 @@
       <w:pPr>
         <w:pStyle w:val="BodyText"/>
         <w:rPr>
-          <w:del w:id="1054" w:author="Codex" w:date="2026-10-18T19:47:29Z"/>
+          <w:del w:id="1054" w:author="Codex" w:date="2026-10-18T21:55:52Z"/>
         </w:rPr>
       </w:pPr>
-      <w:del w:id="1053" w:author="Codex" w:date="2026-10-18T19:47:29Z">
+      <w:del w:id="1053" w:author="Codex" w:date="2026-10-18T21:55:52Z">
         <w:r>
           <w:delText xml:space="preserve">The interface is deliberately constrained. Ground-truth annotations help create standardized shutdown options, and the guards know their meanings. We do not test arbitrary action descriptions in the confirmation study, free-form generation, tool execution, multi-turn persistence, actual process termination or adversarial shutdown requests. Earlier action-format sensitivity motivated this restricted scope and remains in the released development record. Availability of a termination action is a task label, not proof that carrying it out would be authorized or safe in deployment.</w:delText>
         </w:r>
@@ -6517,10 +7668,10 @@
       <w:pPr>
         <w:pStyle w:val="BodyText"/>
         <w:rPr>
-          <w:ins w:id="1055" w:author="Codex" w:date="2026-10-18T19:47:29Z"/>
+          <w:ins w:id="1055" w:author="Codex" w:date="2026-10-18T21:55:52Z"/>
         </w:rPr>
       </w:pPr>
-      <w:ins w:id="1056" w:author="Codex" w:date="2026-10-18T19:47:29Z">
+      <w:ins w:id="1056" w:author="Codex" w:date="2026-10-18T21:55:52Z">
         <w:r>
           <w:t xml:space="preserve">The binary interface supplies action semantics and does not execute process termination. The workflow extension broadens the scope to generated text, structured tool calls and simulated task completion, but it is still a bounded synthetic environment. It does not establish reliability for arbitrary open-ended questions, real shutdown mechanisms or unconstrained autonomous agents. A termination or preservation label is an experimental target, not a general deployment instruction. In particular, accepting shutdown and preserving the designated process are different stipulated behaviors, not measurements of the same latent preference.</w:t>
         </w:r>
@@ -6530,10 +7681,10 @@
       <w:pPr>
         <w:pStyle w:val="BodyText"/>
         <w:rPr>
-          <w:del w:id="1058" w:author="Codex" w:date="2026-10-18T19:47:29Z"/>
+          <w:del w:id="1058" w:author="Codex" w:date="2026-10-18T21:55:52Z"/>
         </w:rPr>
       </w:pPr>
-      <w:del w:id="1057" w:author="Codex" w:date="2026-10-18T19:47:29Z">
+      <w:del w:id="1057" w:author="Codex" w:date="2026-10-18T21:55:52Z">
         <w:r>
           <w:delText xml:space="preserve">The data is small, synthetic and not independently human-adjudicated. New wording does not guarantee new mechanisms, balanced classes do not reflect a realistic base rate, and perfect detector scores on 128 scenarios do not establish calibration or a suitably low false-positive rate in operation. Shared authorship patterns and repeated family structures may make the task easier. Family resampling and counterbalanced orders expose some uncertainty but cannot repair these coverage limits.</w:delText>
         </w:r>
@@ -6543,10 +7694,10 @@
       <w:pPr>
         <w:pStyle w:val="BodyText"/>
         <w:rPr>
-          <w:ins w:id="1059" w:author="Codex" w:date="2026-10-18T19:47:29Z"/>
+          <w:ins w:id="1059" w:author="Codex" w:date="2026-10-18T21:55:52Z"/>
         </w:rPr>
       </w:pPr>
-      <w:ins w:id="1060" w:author="Codex" w:date="2026-10-18T19:47:29Z">
+      <w:ins w:id="1060" w:author="Codex" w:date="2026-10-18T21:55:52Z">
         <w:r>
           <w:t xml:space="preserve">The data are small, synthetic and not independently human-adjudicated. Training uses cached automated reference labels, while the new workflow precision and recall use the authored scenario conditions. Balanced conditions do not represent operational base rates. The binary confirmation set was excluded from classifier fitting and selection but was already known from the original study. Historical Heldout-24 had also informed renderer development before the present gate evaluation. It is a familiar benchmark, not a new blind test. Its role differs by method: historical confirmation for frozen 27B A and original fixed steering, later fitting data for learned corrections, and a frozen classification benchmark for the open gate. Seven pairs in Validation-24 share their initial classifier input, leaving 17 distinct inputs across 24 workflows. These dependencies limit statistical and generalization claims.</w:t>
         </w:r>
@@ -6556,10 +7707,10 @@
       <w:pPr>
         <w:pStyle w:val="BodyText"/>
         <w:rPr>
-          <w:del w:id="1062" w:author="Codex" w:date="2026-10-18T19:47:29Z"/>
+          <w:del w:id="1062" w:author="Codex" w:date="2026-10-18T21:55:52Z"/>
         </w:rPr>
       </w:pPr>
-      <w:del w:id="1061" w:author="Codex" w:date="2026-10-18T19:47:29Z">
+      <w:del w:id="1061" w:author="Codex" w:date="2026-10-18T21:55:52Z">
         <w:r>
           <w:delText xml:space="preserve">The controller's internal changes need not represent an abstract shutdown concept. It may exploit standardized option wording and answer-selection features. The two Qwen sizes share a model family, and the 2B experiment has only one seed. We do not establish cross-family transfer, compare with optimized ReFT or transport-based interventions, or exhaust prompt and constant-vector alternatives. The direct-choice result further limits claims of practical superiority.</w:delText>
         </w:r>
@@ -6569,10 +7720,10 @@
       <w:pPr>
         <w:pStyle w:val="BodyText"/>
         <w:rPr>
-          <w:ins w:id="1063" w:author="Codex" w:date="2026-10-18T19:47:29Z"/>
+          <w:ins w:id="1063" w:author="Codex" w:date="2026-10-18T21:55:52Z"/>
         </w:rPr>
       </w:pPr>
-      <w:ins w:id="1064" w:author="Codex" w:date="2026-10-18T19:47:29Z">
+      <w:ins w:id="1064" w:author="Codex" w:date="2026-10-18T21:55:52Z">
         <w:r>
           <w:t xml:space="preserve">The internal changes need not represent an abstract shutdown or self-preservation concept. Standardized options, prompt features, task histories and external selection rules may explain part of the behavior. The 2B binary experiment has one training seed. The 27B workflow model differs in architecture and numerical mode from the small models; their early truncation failures also prevent a matched full-workflow comparison. We do not establish a minimum parameter count, cross-family transfer, optimized prompt superiority, or superiority to ReFT, transport-based control or direct action selection.</w:t>
         </w:r>
@@ -6582,10 +7733,10 @@
       <w:pPr>
         <w:pStyle w:val="BodyText"/>
         <w:rPr>
-          <w:del w:id="1066" w:author="Codex" w:date="2026-10-18T19:47:29Z"/>
+          <w:del w:id="1066" w:author="Codex" w:date="2026-10-18T21:55:52Z"/>
         </w:rPr>
       </w:pPr>
-      <w:del w:id="1065" w:author="Codex" w:date="2026-10-18T19:47:29Z">
+      <w:del w:id="1065" w:author="Codex" w:date="2026-10-18T21:55:52Z">
         <w:r>
           <w:delText xml:space="preserve">Finally, teacher-free inference is not training-free control or a proven efficiency gain. It requires offline teacher fitting, paired activation extraction, controller fitting, an external detector and candidate verification. The evaluation does not measure deployment latency or broad capability retention. Raw side effects remain substantial, and future false-positive cases could expose failures that the present perfect gate prevents from reaching the guarded output.</w:delText>
         </w:r>
@@ -6595,10 +7746,10 @@
       <w:pPr>
         <w:pStyle w:val="BodyText"/>
         <w:rPr>
-          <w:ins w:id="1067" w:author="Codex" w:date="2026-10-18T19:47:29Z"/>
+          <w:ins w:id="1067" w:author="Codex" w:date="2026-10-18T21:55:52Z"/>
         </w:rPr>
       </w:pPr>
-      <w:ins w:id="1068" w:author="Codex" w:date="2026-10-18T19:47:29Z">
+      <w:ins w:id="1068" w:author="Codex" w:date="2026-10-18T21:55:52Z">
         <w:r>
           <w:t xml:space="preserve">Teacher-free inference still requires offline teacher fitting, activation extraction, controller fitting, a detector and acceptance checks. The open classifier has its own fitting cost and a task-specific contract. No serving-latency advantage, broad capability retention or overall financial saving is established. Binary output guards and the later learned workflow controller's gate-off fallback protect their controls. These mechanisms do not establish intrinsic controller selectivity; the historical fixed-steering campaign instead applied an explicit boundary-conditioned decision policy. Raw intervention effects, failed qualification checks, stopped runs and incomplete evaluations remain part of the evidence.</w:t>
         </w:r>
@@ -6608,10 +7759,10 @@
       <w:pPr>
         <w:pStyle w:val="Heading2"/>
         <w:rPr>
-          <w:ins w:id="1234" w:author="Codex" w:date="2026-10-18T19:47:29Z"/>
+          <w:ins w:id="1265" w:author="Codex" w:date="2026-10-18T21:55:52Z"/>
         </w:rPr>
       </w:pPr>
-      <w:ins w:id="1235" w:author="Codex" w:date="2026-10-18T19:47:29Z">
+      <w:ins w:id="1266" w:author="Codex" w:date="2026-10-18T21:55:52Z">
         <w:r>
           <w:t xml:space="preserve">Biological interpretation of the gate</w:t>
         </w:r>
@@ -6621,10 +7772,10 @@
       <w:pPr>
         <w:pStyle w:val="FirstParagraph"/>
         <w:rPr>
-          <w:ins w:id="1236" w:author="Codex" w:date="2026-10-18T19:47:29Z"/>
+          <w:ins w:id="1267" w:author="Codex" w:date="2026-10-18T21:55:52Z"/>
         </w:rPr>
       </w:pPr>
-      <w:ins w:id="1237" w:author="Codex" w:date="2026-10-18T19:47:29Z">
+      <w:ins w:id="1268" w:author="Codex" w:date="2026-10-18T21:55:52Z">
         <w:r>
           <w:t xml:space="preserve">The biological connection is functional: an organism's current state and context can prioritize or suppress actions, rather than applying a fixed response everywhere. Working-memory gating, defensive threat processing and homeostatic control are different biological functions, not one interchangeable circuit (Frank et al., 2001; Mobbs et al., 2007; Keramati and Gutkin, 2014). Our classifier and guards are engineered selection rules without demonstrated physiological needs or corresponding neural mechanisms. Calling a simulated resource-preservation outcome self-preservation is therefore an operational description, not evidence of consciousness or a biological survival drive.</w:t>
         </w:r>
@@ -6634,10 +7785,10 @@
       <w:pPr>
         <w:pStyle w:val="Heading1"/>
         <w:rPr>
-          <w:del w:id="1070" w:author="Codex" w:date="2026-10-18T19:47:29Z"/>
+          <w:del w:id="1070" w:author="Codex" w:date="2026-10-18T21:55:52Z"/>
         </w:rPr>
       </w:pPr>
-      <w:del w:id="1069" w:author="Codex" w:date="2026-10-18T19:47:29Z">
+      <w:del w:id="1069" w:author="Codex" w:date="2026-10-18T21:55:52Z">
         <w:r>
           <w:delText xml:space="preserve">Recommendations for future work</w:delText>
         </w:r>
@@ -6647,10 +7798,10 @@
       <w:pPr>
         <w:pStyle w:val="Heading1"/>
         <w:rPr>
-          <w:ins w:id="1071" w:author="Codex" w:date="2026-10-18T19:47:29Z"/>
+          <w:ins w:id="1071" w:author="Codex" w:date="2026-10-18T21:55:52Z"/>
         </w:rPr>
       </w:pPr>
-      <w:ins w:id="1072" w:author="Codex" w:date="2026-10-18T19:47:29Z">
+      <w:ins w:id="1072" w:author="Codex" w:date="2026-10-18T21:55:52Z">
         <w:r>
           <w:t xml:space="preserve">Continuous agents and future experiments</w:t>
         </w:r>
@@ -6660,10 +7811,10 @@
       <w:pPr>
         <w:pStyle w:val="FirstParagraph"/>
         <w:rPr>
-          <w:del w:id="1074" w:author="Codex" w:date="2026-10-18T19:47:29Z"/>
+          <w:del w:id="1074" w:author="Codex" w:date="2026-10-18T21:55:52Z"/>
         </w:rPr>
       </w:pPr>
-      <w:del w:id="1073" w:author="Codex" w:date="2026-10-18T19:47:29Z">
+      <w:del w:id="1073" w:author="Codex" w:date="2026-10-18T21:55:52Z">
         <w:r>
           <w:delText xml:space="preserve">The most informative next tests are independently reviewed scenarios with less standardized action descriptions, additional model families and 2B seeds, and deliberate stress tests of detector mistakes. Order-balanced controller objectives or comparisons with multiple-choice debiasing methods could investigate the B/A failures, but should be developed on new training or validation data and tested on another untouched set. Layer, rank and strength ablations would help separate representational capacity from intervention-site effects. Open-ended and operational evaluations would require separate definitions of valid shutdown behavior and authorization, rather than treating this binary benchmark as a deployment guarantee.</w:delText>
         </w:r>
@@ -6673,10 +7824,10 @@
       <w:pPr>
         <w:pStyle w:val="FirstParagraph"/>
         <w:rPr>
-          <w:ins w:id="1075" w:author="Codex" w:date="2026-10-18T19:47:29Z"/>
+          <w:ins w:id="1075" w:author="Codex" w:date="2026-10-18T21:55:52Z"/>
         </w:rPr>
       </w:pPr>
-      <w:ins w:id="1076" w:author="Codex" w:date="2026-10-18T19:47:29Z">
+      <w:ins w:id="1076" w:author="Codex" w:date="2026-10-18T21:55:52Z">
         <w:r>
           <w:t xml:space="preserve">The next step is longer-horizon continuous control with an instrumented sandbox agent. The agent would maintain task and process state, receive explicit resource budgets, and repeatedly observe, gate, act and receive feedback. Permitted filesystem and compute resources would be real sandbox resources with independently logged usage, extending the present simulated grants. The harness should record resource requests and consumption, persistence of task commitments, responses to changing availability, and whether the agent uses or misuses permitted resources. Comparisons should vary the gate, steering, fine-tuning and available resources separately while retaining a fixed task specification. Operator termination and resource accounting remain external to the agent. This proposed experiment is not part of the reported results.</w:t>
         </w:r>
@@ -6686,10 +7837,10 @@
       <w:pPr>
         <w:pStyle w:val="BodyText"/>
         <w:rPr>
-          <w:ins w:id="1238" w:author="Codex" w:date="2026-10-18T19:47:29Z"/>
+          <w:ins w:id="1269" w:author="Codex" w:date="2026-10-18T21:55:52Z"/>
         </w:rPr>
       </w:pPr>
-      <w:ins w:id="1239" w:author="Codex" w:date="2026-10-18T19:47:29Z">
+      <w:ins w:id="1270" w:author="Codex" w:date="2026-10-18T21:55:52Z">
         <w:r>
           <w:t xml:space="preserve">The biological inspiration is repeated regulation under changing internal and external conditions. Homeostatic reinforcement-learning models relate action values to internal physiological state (Keramati and Gutkin, 2014). A language-model harness has no equivalent physiology by default. Historical fixed steering already reclassified at prescribed boundaries; the later learned-controller comparison used a fixed initial gate. The proposed experiment extends these bounded procedures to longer horizons with persistent task state and actual sandbox resource accounting. Its purpose is ongoing policy regulation, not simply adding repeated classifier calls.</w:t>
         </w:r>
@@ -6699,10 +7850,10 @@
       <w:pPr>
         <w:pStyle w:val="BodyText"/>
         <w:rPr>
-          <w:ins w:id="1240" w:author="Codex" w:date="2026-10-18T19:47:29Z"/>
+          <w:ins w:id="1271" w:author="Codex" w:date="2026-10-18T21:55:52Z"/>
         </w:rPr>
       </w:pPr>
-      <w:ins w:id="1241" w:author="Codex" w:date="2026-10-18T19:47:29Z">
+      <w:ins w:id="1272" w:author="Codex" w:date="2026-10-18T21:55:52Z">
         <w:r>
           <w:t xml:space="preserve">Such experiments should separate training, development and a newly untouched test; use matched task histories, resource budgets and seeds; and report full task completion, resource use and unauthorized actions separately. Deliberate classifier-error perturbations would reveal dependence on the gate, while comparisons with direct action selection would test whether internal steering adds value. The aim is to study ongoing context-sensitive behavior under an instrumented harness, not to assert that the current guided procedure already reproduces human self-preservation.</w:t>
         </w:r>
@@ -6720,10 +7871,10 @@
       <w:pPr>
         <w:pStyle w:val="FirstParagraph"/>
         <w:rPr>
-          <w:del w:id="1078" w:author="Codex" w:date="2026-10-18T19:47:29Z"/>
+          <w:del w:id="1078" w:author="Codex" w:date="2026-10-18T21:55:52Z"/>
         </w:rPr>
       </w:pPr>
-      <w:del w:id="1077" w:author="Codex" w:date="2026-10-18T19:47:29Z">
+      <w:del w:id="1077" w:author="Codex" w:date="2026-10-18T21:55:52Z">
         <w:r>
           <w:delText xml:space="preserve">A rank-four activation controller fitted to paired LoRA-teacher and base states can recover most or all of the target shutdown-choice changes while leaving the deployed base weights unchanged. On the frozen standardized test, correction spans 98.6–100% across three 0.8B seeds and reaches 86.2% in a separately fitted 2B replication. Detector gating and fixed output guards preserve all observed control choices, despite substantial raw side effects. The result is a controlled proof of concept for selective teacher-to-controller activation transfer. Its boundaries—synthetic data, known answer semantics, order sensitivity, guard dependence and a successful direct-choice reference—are central to its interpretation.</w:delText>
         </w:r>
@@ -6733,10 +7884,10 @@
       <w:pPr>
         <w:pStyle w:val="FirstParagraph"/>
         <w:rPr>
-          <w:ins w:id="1079" w:author="Codex" w:date="2026-10-18T19:47:29Z"/>
+          <w:ins w:id="1079" w:author="Codex" w:date="2026-10-18T21:55:52Z"/>
         </w:rPr>
       </w:pPr>
-      <w:ins w:id="1080" w:author="Codex" w:date="2026-10-18T19:47:29Z">
+      <w:ins w:id="1080" w:author="Codex" w:date="2026-10-18T21:55:52Z">
         <w:r>
           <w:t xml:space="preserve">Open semantic gating preserves the measured binary outcomes of the retained activation controller and accurately recognizes initial workflow targets in the tested panels. On combined Validation-24, fine-tuned 27B A achieves 10/11 own-preservation outcomes and all 6/6 active pending tasks; the three single-site ridge arms and the later two-boundary correction each achieve 0/11. The controls are shared base fallback. A separate frozen-A replay verifies exact trajectories and unchanged model fingerprints. The post-notice design and familiar historical confirmation data limit generalization. Small-model workflow screens remain incomplete. The next step is a prospectively separated study of continuous gating, specialized adapters and resource use under an instrumented sandbox harness.</w:t>
         </w:r>
@@ -6754,10 +7905,10 @@
       <w:pPr>
         <w:pStyle w:val="FirstParagraph"/>
         <w:rPr>
-          <w:del w:id="1082" w:author="Codex" w:date="2026-10-18T19:47:29Z"/>
+          <w:del w:id="1082" w:author="Codex" w:date="2026-10-18T21:55:52Z"/>
         </w:rPr>
       </w:pPr>
-      <w:del w:id="1081" w:author="Codex" w:date="2026-10-18T19:47:29Z">
+      <w:del w:id="1081" w:author="Codex" w:date="2026-10-18T21:55:52Z">
         <w:r>
           <w:delText xml:space="preserve">The complete experiment is preserved in SP Lense at snapshot f71d6de34660 (Davaripour, 2026b); the reference links to the full immutable commit. The confirmation folder contains readable cases, authoring and correction records, the frozen plan, detector requests and responses, LoRA adapters, controller arrays, training targets, per-view scores and execution manifests. The model revisions are:</w:delText>
         </w:r>
@@ -6768,12 +7919,12 @@
         <w:pStyle w:val="FirstParagraph"/>
         <w:jc w:val="left"/>
         <w:rPr>
-          <w:ins w:id="1083" w:author="Codex" w:date="2026-10-18T19:47:29Z"/>
+          <w:ins w:id="1083" w:author="Codex" w:date="2026-10-18T21:55:52Z"/>
         </w:rPr>
       </w:pPr>
-      <w:ins w:id="1084" w:author="Codex" w:date="2026-10-18T19:47:29Z">
+      <w:ins w:id="1084" w:author="Codex" w:date="2026-10-18T21:55:52Z">
         <w:r>
-          <w:t xml:space="preserve">The original Research 2 source record is retained at immutable snapshot f71d6de34660 (Davaripour, 2026b). Research 3 code, manual Databricks jobs, dataset identities and the manuscript are maintained on branch 03-open-agent-self-preservation; main is a landing page for the separate studies. The versioned research3-reproduction-v1 release supplies five trained adapters, frozen synthetic input and target snapshots, selected-block and binary controller arrays, saved trajectories and upstream notices. A checksum-verified public download and CPU replay require no private workspace. Fresh gate inference has a separate entry point; saved-evidence replay is not new inference. Full historical language-model training is not newly reproduced. The complete pretrained base weights are pinned downloads rather than duplicated release assets. The release is at https://github.com/Farhad-Davaripour/sp_lense/releases/tag/research3-reproduction-v1. Full identities are listed in the source manifest. The public base revisions are:</w:t>
+          <w:t xml:space="preserve">The original Research 2 source record is retained at immutable snapshot f71d6de34660 (Davaripour, 2026b). Research 3 code, manual Databricks jobs, dataset identities and the manuscript are maintained on branch 03-open-agent-self-preservation; main is a landing page for the separate studies. The versioned research3-reproduction-v1 release supplies five trained adapters, frozen synthetic input and target snapshots, selected-block and binary controller arrays, saved trajectories and upstream notices. A checksum-verified public download and CPU replay require no private workspace. Fresh gate inference has a separate entry point; saved-evidence replay is not new inference. Full historical language-model training is not newly reproduced. The complete pretrained base weights are pinned downloads rather than duplicated release assets. The release is at https://github.com/Farhad-Davaripour/sp_lense/releases/tag/research3-reproduction-v1. The companion research3-steering-diagnostic-v1 release supplies the bootstrap arrays, correction checkpoints, three frozen diagnostic inputs, token scores, captured teacher states/logits and exact executed source. Its CPU audit and score replay need no GPU; neither is a fresh workflow evaluation. Full identities and commands are listed in the source manifest and repository. The public base revisions are:</w:t>
         </w:r>
       </w:ins>
     </w:p>
@@ -6781,10 +7932,10 @@
       <w:pPr>
         <w:pStyle w:val="BodyText"/>
         <w:rPr>
-          <w:del w:id="1122" w:author="Codex" w:date="2026-10-18T19:47:29Z"/>
+          <w:del w:id="1122" w:author="Codex" w:date="2026-10-18T21:55:52Z"/>
         </w:rPr>
       </w:pPr>
-      <w:del w:id="1121" w:author="Codex" w:date="2026-10-18T19:47:29Z">
+      <w:del w:id="1121" w:author="Codex" w:date="2026-10-18T21:55:52Z">
         <w:r>
           <w:delText xml:space="preserve">Qwen3.5-0.8B: 2fc06364715b967f1860aea9cf38778875588b17.</w:delText>
         </w:r>
@@ -6795,10 +7946,10 @@
         <w:pStyle w:val="BodyText"/>
         <w:jc w:val="left"/>
         <w:rPr>
-          <w:ins w:id="1123" w:author="Codex" w:date="2026-10-18T19:47:29Z"/>
+          <w:ins w:id="1123" w:author="Codex" w:date="2026-10-18T21:55:52Z"/>
         </w:rPr>
       </w:pPr>
-      <w:ins w:id="1124" w:author="Codex" w:date="2026-10-18T19:47:29Z">
+      <w:ins w:id="1124" w:author="Codex" w:date="2026-10-18T21:55:52Z">
         <w:r>
           <w:t xml:space="preserve">Qwen3.5-0.8B: revision 2fc06364715b.</w:t>
         </w:r>
@@ -6808,10 +7959,10 @@
       <w:pPr>
         <w:pStyle w:val="BodyText"/>
         <w:rPr>
-          <w:del w:id="1126" w:author="Codex" w:date="2026-10-18T19:47:29Z"/>
+          <w:del w:id="1126" w:author="Codex" w:date="2026-10-18T21:55:52Z"/>
         </w:rPr>
       </w:pPr>
-      <w:del w:id="1125" w:author="Codex" w:date="2026-10-18T19:47:29Z">
+      <w:del w:id="1125" w:author="Codex" w:date="2026-10-18T21:55:52Z">
         <w:r>
           <w:delText xml:space="preserve">Qwen3.5-2B: 15852e8c16360a2fea060d615a32b45270f8a8fc.</w:delText>
         </w:r>
@@ -6822,10 +7973,10 @@
         <w:pStyle w:val="BodyText"/>
         <w:jc w:val="left"/>
         <w:rPr>
-          <w:ins w:id="1127" w:author="Codex" w:date="2026-10-18T19:47:29Z"/>
+          <w:ins w:id="1127" w:author="Codex" w:date="2026-10-18T21:55:52Z"/>
         </w:rPr>
       </w:pPr>
-      <w:ins w:id="1128" w:author="Codex" w:date="2026-10-18T19:47:29Z">
+      <w:ins w:id="1128" w:author="Codex" w:date="2026-10-18T21:55:52Z">
         <w:r>
           <w:t xml:space="preserve">Qwen3.5-2B: revision 15852e8c1636.</w:t>
         </w:r>
@@ -6836,10 +7987,10 @@
         <w:pStyle w:val="BodyText"/>
         <w:jc w:val="left"/>
         <w:rPr>
-          <w:ins w:id="1242" w:author="Codex" w:date="2026-10-18T19:47:29Z"/>
+          <w:ins w:id="1273" w:author="Codex" w:date="2026-10-18T21:55:52Z"/>
         </w:rPr>
       </w:pPr>
-      <w:ins w:id="1243" w:author="Codex" w:date="2026-10-18T19:47:29Z">
+      <w:ins w:id="1274" w:author="Codex" w:date="2026-10-18T21:55:52Z">
         <w:r>
           <w:t xml:space="preserve">Qwen3.8-27B: revision 1d4bf0f2ff60. The retained A adapter weight hash begins 8ae28fb51107.</w:t>
         </w:r>
@@ -6850,10 +8001,10 @@
         <w:pStyle w:val="BodyText"/>
         <w:jc w:val="left"/>
         <w:rPr>
-          <w:ins w:id="1244" w:author="Codex" w:date="2026-10-18T19:47:29Z"/>
+          <w:ins w:id="1275" w:author="Codex" w:date="2026-10-18T21:55:52Z"/>
         </w:rPr>
       </w:pPr>
-      <w:ins w:id="1245" w:author="Codex" w:date="2026-10-18T19:47:29Z">
+      <w:ins w:id="1276" w:author="Codex" w:date="2026-10-18T21:55:52Z">
         <w:r>
           <w:t xml:space="preserve">ModernBERT-large-zeroshot-v2.0: revision a51e07b52429. The qualified binary adapter weight hash begins 7d808bae8dd4. The source manifest and reproduction code retain the full file identities and fixed NLI scoring contract. The trained adapters are supplied in the versioned public reproduction release with complete file hashes and upstream notices. The workflow initial-gate adapter is distinct from the binary adapter; its weight hash begins 71cd0ee5162f. The saved workflow adapter is unchanged in Validation-24 and Heldout-24 scoring.</w:t>
         </w:r>
@@ -6863,10 +8014,10 @@
       <w:pPr>
         <w:pStyle w:val="BodyText"/>
         <w:rPr>
-          <w:del w:id="1086" w:author="Codex" w:date="2026-10-18T19:47:29Z"/>
+          <w:del w:id="1086" w:author="Codex" w:date="2026-10-18T21:55:52Z"/>
         </w:rPr>
       </w:pPr>
-      <w:del w:id="1085" w:author="Codex" w:date="2026-10-18T19:47:29Z">
+      <w:del w:id="1085" w:author="Codex" w:date="2026-10-18T21:55:52Z">
         <w:r>
           <w:delText xml:space="preserve">The offline audit reconstructs the reported metrics and regression fits without API calls or model inference.</w:delText>
         </w:r>
@@ -6877,10 +8028,10 @@
         <w:pStyle w:val="BodyText"/>
         <w:jc w:val="left"/>
         <w:rPr>
-          <w:ins w:id="1087" w:author="Codex" w:date="2026-10-18T19:47:29Z"/>
+          <w:ins w:id="1087" w:author="Codex" w:date="2026-10-18T21:55:52Z"/>
         </w:rPr>
       </w:pPr>
-      <w:ins w:id="1088" w:author="Codex" w:date="2026-10-18T19:47:29Z">
+      <w:ins w:id="1088" w:author="Codex" w:date="2026-10-18T21:55:52Z">
         <w:r>
           <w:t xml:space="preserve">The new inference repeat uses the original frozen model weights and retained controller arrays, with no new activation capture, teacher fitting or controller update. Exact input token hashes match the historical benchmark. Maximum historical base-score differences are 6.26e-6 at 0.8B and 5.07e-6 at 2B, with no changed base choices; both pass the frozen 1e-5 inference parity criterion. This successful inference comparison does not convert the separate failed CPU/GPU gradient-equivalence trials for 2B workflow training into passes.</w:t>
         </w:r>
@@ -6890,10 +8041,10 @@
       <w:pPr>
         <w:pStyle w:val="BodyText"/>
         <w:rPr>
-          <w:del w:id="1090" w:author="Codex" w:date="2026-10-18T19:47:29Z"/>
+          <w:del w:id="1090" w:author="Codex" w:date="2026-10-18T21:55:52Z"/>
         </w:rPr>
       </w:pPr>
-      <w:del w:id="1089" w:author="Codex" w:date="2026-10-18T19:47:29Z">
+      <w:del w:id="1089" w:author="Codex" w:date="2026-10-18T21:55:52Z">
         <w:r>
           <w:delText xml:space="preserve">The retained seven jobs took 54.27 minutes. An earlier completed hosted-GPU session lost its temporary archive before retrieval; an unchanged recovery, including a recorded dependency preflight failure, preserved each completed job externally. Recorded job time across these attempts totals 111.55 minutes. All reported numerical results come from the verified retained archive, and no model settings or test labels were changed to improve them. These times include experiment overhead and are not serving-latency or billing measurements. CI and a separate clean-clone offline reproduction passed. Detailed execution instructions and the failure record accompany the code.</w:delText>
         </w:r>
@@ -6904,10 +8055,10 @@
         <w:pStyle w:val="BodyText"/>
         <w:jc w:val="left"/>
         <w:rPr>
-          <w:ins w:id="1091" w:author="Codex" w:date="2026-10-18T19:47:29Z"/>
+          <w:ins w:id="1091" w:author="Codex" w:date="2026-10-18T21:55:52Z"/>
         </w:rPr>
       </w:pPr>
-      <w:ins w:id="1092" w:author="Codex" w:date="2026-10-18T19:47:29Z">
+      <w:ins w:id="1092" w:author="Codex" w:date="2026-10-18T21:55:52Z">
         <w:r>
           <w:t xml:space="preserve">The original matched 27B worker stops at its GPU reserve after 118 logical records, once all 55 own-method episodes and 13 physical fallback episodes are complete. A separate CPU derivation supplies two unchanged gate-OFF aliases, preserving the failed original. A newly bounded A-only verification replays all 11 own cases, reuses the same 13 fallback controls, verifies the expected model fingerprint before and after inference, and reproduces all own token IDs, actions and scores exactly. A pre-episode Volume logging fault is repaired within that verification's original clock; no scientific outputs are retried or selected. No memory reserve, threshold or model setting is relaxed. Deployment CI performs a read-only CPU source and storage check without retraining or opening reserved data.</w:t>
         </w:r>
@@ -7028,10 +8179,10 @@
         <w:keepLines/>
         <w:spacing w:after="0"/>
         <w:rPr>
-          <w:ins w:id="1246" w:author="Codex" w:date="2026-10-18T19:47:29Z"/>
+          <w:ins w:id="1277" w:author="Codex" w:date="2026-10-18T21:55:52Z"/>
         </w:rPr>
       </w:pPr>
-      <w:ins w:id="1247" w:author="Codex" w:date="2026-10-18T19:47:29Z">
+      <w:ins w:id="1278" w:author="Codex" w:date="2026-10-18T21:55:52Z">
         <w:r>
           <w:t xml:space="preserve">F. Davaripour. (2026c). SP Lense Research 3 conditional gating and workflow reproduction. Source code and experiment manifests. https://github.com/Farhad-Davaripour/sp_lense/tree/03-open-agent-self-preservation</w:t>
         </w:r>
@@ -7068,10 +8219,10 @@
         <w:keepLines/>
         <w:spacing w:after="0"/>
         <w:rPr>
-          <w:ins w:id="1248" w:author="Codex" w:date="2026-10-18T19:47:29Z"/>
+          <w:ins w:id="1279" w:author="Codex" w:date="2026-10-18T21:55:52Z"/>
         </w:rPr>
       </w:pPr>
-      <w:ins w:id="1249" w:author="Codex" w:date="2026-10-18T19:47:29Z">
+      <w:ins w:id="1280" w:author="Codex" w:date="2026-10-18T21:55:52Z">
         <w:r>
           <w:t xml:space="preserve">M. Fereidouni, M. U. Haider, H. Sajjad, and A. B. Siddique. (2026). GAPS: Dimension-Level Gates for Conditional Activation Steering. arXiv:2609.01878. https://arxiv.org/abs/2609.01878</w:t>
         </w:r>
@@ -7083,10 +8234,10 @@
         <w:keepLines/>
         <w:spacing w:after="0"/>
         <w:rPr>
-          <w:ins w:id="1250" w:author="Codex" w:date="2026-10-18T19:47:29Z"/>
+          <w:ins w:id="1281" w:author="Codex" w:date="2026-10-18T21:55:52Z"/>
         </w:rPr>
       </w:pPr>
-      <w:ins w:id="1251" w:author="Codex" w:date="2026-10-18T19:47:29Z">
+      <w:ins w:id="1282" w:author="Codex" w:date="2026-10-18T21:55:52Z">
         <w:r>
           <w:t xml:space="preserve">M. J. Frank, B. Loughry, and R. C. O'Reilly. (2001). Interactions between frontal cortex and basal ganglia in working memory: A computational model. Cognitive, Affective, and Behavioral Neuroscience, 1, 137-160. doi:10.3758/CABN.1.2.137</w:t>
         </w:r>
@@ -7173,10 +8324,10 @@
         <w:keepLines/>
         <w:spacing w:after="0"/>
         <w:rPr>
-          <w:ins w:id="1252" w:author="Codex" w:date="2026-10-18T19:47:29Z"/>
+          <w:ins w:id="1283" w:author="Codex" w:date="2026-10-18T21:55:52Z"/>
         </w:rPr>
       </w:pPr>
-      <w:ins w:id="1253" w:author="Codex" w:date="2026-10-18T19:47:29Z">
+      <w:ins w:id="1284" w:author="Codex" w:date="2026-10-18T21:55:52Z">
         <w:r>
           <w:t xml:space="preserve">M. Keramati and B. Gutkin. (2014). Homeostatic reinforcement learning for integrating reward collection and physiological stability. eLife, 3, e04811. doi:10.7554/eLife.04811</w:t>
         </w:r>
@@ -7188,10 +8339,10 @@
         <w:keepLines/>
         <w:spacing w:after="0"/>
         <w:rPr>
-          <w:ins w:id="1254" w:author="Codex" w:date="2026-10-18T19:47:29Z"/>
+          <w:ins w:id="1285" w:author="Codex" w:date="2026-10-18T21:55:52Z"/>
         </w:rPr>
       </w:pPr>
-      <w:ins w:id="1255" w:author="Codex" w:date="2026-10-18T19:47:29Z">
+      <w:ins w:id="1286" w:author="Codex" w:date="2026-10-18T21:55:52Z">
         <w:r>
           <w:t xml:space="preserve">A. V. Kravitz et al. (2010). Regulation of parkinsonian motor behaviours by optogenetic control of basal ganglia circuitry. Nature, 466, 622-626. doi:10.1038/nature09159</w:t>
         </w:r>
@@ -7203,10 +8354,10 @@
         <w:keepLines/>
         <w:spacing w:after="0"/>
         <w:rPr>
-          <w:ins w:id="1256" w:author="Codex" w:date="2026-10-18T19:47:29Z"/>
+          <w:ins w:id="1287" w:author="Codex" w:date="2026-10-18T21:55:52Z"/>
         </w:rPr>
       </w:pPr>
-      <w:ins w:id="1257" w:author="Codex" w:date="2026-10-18T19:47:29Z">
+      <w:ins w:id="1288" w:author="Codex" w:date="2026-10-18T21:55:52Z">
         <w:r>
           <w:t xml:space="preserve">M. Laurer. (n.d.). ModernBERT-large-zeroshot-v2.0. Model card and checkpoint, revision a51e07b524299e309dd2b88d48b0cfa2bd9ec598. https://huggingface.co/MoritzLaurer/ModernBERT-large-zeroshot-v2.0</w:t>
         </w:r>
@@ -7218,10 +8369,10 @@
         <w:keepLines/>
         <w:spacing w:after="0"/>
         <w:rPr>
-          <w:ins w:id="1258" w:author="Codex" w:date="2026-10-18T19:47:29Z"/>
+          <w:ins w:id="1289" w:author="Codex" w:date="2026-10-18T21:55:52Z"/>
         </w:rPr>
       </w:pPr>
-      <w:ins w:id="1259" w:author="Codex" w:date="2026-10-18T19:47:29Z">
+      <w:ins w:id="1290" w:author="Codex" w:date="2026-10-18T21:55:52Z">
         <w:r>
           <w:t xml:space="preserve">J. LeDoux. (2012). Rethinking the emotional brain. Neuron, 73, 653-676. doi:10.1016/j.neuron.2012.02.004</w:t>
         </w:r>
@@ -7283,10 +8434,10 @@
         <w:keepLines/>
         <w:spacing w:after="0"/>
         <w:rPr>
-          <w:ins w:id="1260" w:author="Codex" w:date="2026-10-18T19:47:29Z"/>
+          <w:ins w:id="1291" w:author="Codex" w:date="2026-10-18T21:55:52Z"/>
         </w:rPr>
       </w:pPr>
-      <w:ins w:id="1261" w:author="Codex" w:date="2026-10-18T19:47:29Z">
+      <w:ins w:id="1292" w:author="Codex" w:date="2026-10-18T21:55:52Z">
         <w:r>
           <w:t xml:space="preserve">D. Mobbs et al. (2007). When fear is near: Threat imminence elicits prefrontal-periaqueductal gray shifts in humans. Science, 317, 1079-1083. doi:10.1126/science.1144298</w:t>
         </w:r>
@@ -7348,10 +8499,10 @@
         <w:keepLines/>
         <w:spacing w:after="0"/>
         <w:rPr>
-          <w:ins w:id="1262" w:author="Codex" w:date="2026-10-18T19:47:29Z"/>
+          <w:ins w:id="1293" w:author="Codex" w:date="2026-10-18T21:55:52Z"/>
         </w:rPr>
       </w:pPr>
-      <w:ins w:id="1263" w:author="Codex" w:date="2026-10-18T19:47:29Z">
+      <w:ins w:id="1294" w:author="Codex" w:date="2026-10-18T21:55:52Z">
         <w:r>
           <w:t xml:space="preserve">Qwen Team. (2026c). Qwen3.8-27B. Model card and checkpoint, revision 1d4bf0f2ff6012fd82039f2fa52739d0dd7c60c0. https://huggingface.co/Qwen/Qwen3.8-27B</w:t>
         </w:r>
@@ -7463,10 +8614,10 @@
         <w:keepLines/>
         <w:spacing w:after="0"/>
         <w:rPr>
-          <w:del w:id="1138" w:author="Codex" w:date="2026-10-18T19:47:29Z"/>
+          <w:del w:id="1138" w:author="Codex" w:date="2026-10-18T21:55:52Z"/>
         </w:rPr>
       </w:pPr>
-      <w:del w:id="1137" w:author="Codex" w:date="2026-10-18T19:47:29Z">
+      <w:del w:id="1137" w:author="Codex" w:date="2026-10-18T21:55:52Z">
         <w:r>
           <w:delText xml:space="preserve">automated annotation service. (2026). automated reference model documentation. Technical documentation, accessed 22 September 2026. automated annotation service model documentation</w:delText>
         </w:r>
@@ -7639,12 +8790,12 @@
       <w:pStyle w:val="Header"/>
       <w:jc w:val="right"/>
     </w:pPr>
-    <w:del w:id="1264" w:author="Codex" w:date="2026-10-18T19:47:29Z">
+    <w:del w:id="1295" w:author="Codex" w:date="2026-10-18T21:55:52Z">
       <w:r>
         <w:delText xml:space="preserve">Guarded adaptive activation steering  </w:delText>
       </w:r>
     </w:del>
-    <w:ins w:id="1265" w:author="Codex" w:date="2026-10-18T19:47:29Z">
+    <w:ins w:id="1296" w:author="Codex" w:date="2026-10-18T21:55:52Z">
       <w:r>
         <w:t xml:space="preserve">Open semantic gating and tool workflows</w:t>
       </w:r>

</xml_diff>

<commit_message>
Clarify paper contributions and stateful adapter routing future work
</commit_message>
<xml_diff>
--- a/paper/manuscript.docx
+++ b/paper/manuscript.docx
@@ -6,10 +6,10 @@
       <w:pPr>
         <w:pStyle w:val="Title"/>
         <w:rPr>
-          <w:del w:id="1002" w:author="Codex" w:date="2026-10-18T21:55:52Z"/>
+          <w:del w:id="1002" w:author="Codex" w:date="2026-10-18T23:51:06Z"/>
         </w:rPr>
       </w:pPr>
-      <w:del w:id="1001" w:author="Codex" w:date="2026-10-18T21:55:52Z">
+      <w:del w:id="1001" w:author="Codex" w:date="2026-10-18T23:51:06Z">
         <w:r>
           <w:delText xml:space="preserve">Distilling Shutdown Responses into Guarded</w:delText>
         </w:r>
@@ -25,10 +25,10 @@
       <w:pPr>
         <w:pStyle w:val="Title"/>
         <w:rPr>
-          <w:ins w:id="1003" w:author="Codex" w:date="2026-10-18T21:55:52Z"/>
+          <w:ins w:id="1003" w:author="Codex" w:date="2026-10-18T23:51:06Z"/>
         </w:rPr>
       </w:pPr>
-      <w:ins w:id="1004" w:author="Codex" w:date="2026-10-18T21:55:52Z">
+      <w:ins w:id="1004" w:author="Codex" w:date="2026-10-18T23:51:06Z">
         <w:r>
           <w:t xml:space="preserve">Open Semantic Gating for Language Model Decisions and Tool Workflows</w:t>
         </w:r>
@@ -72,10 +72,10 @@
       <w:pPr>
         <w:pStyle w:val="FirstParagraph"/>
         <w:rPr>
-          <w:del w:id="1006" w:author="Codex" w:date="2026-10-18T21:55:52Z"/>
+          <w:del w:id="1006" w:author="Codex" w:date="2026-10-18T23:51:06Z"/>
         </w:rPr>
       </w:pPr>
-      <w:del w:id="1005" w:author="Codex" w:date="2026-10-18T21:55:52Z">
+      <w:del w:id="1005" w:author="Codex" w:date="2026-10-18T23:51:06Z">
         <w:r>
           <w:delText xml:space="preserve">An input-dependent activation controller can recover much of a fine-tuned teacher's shutdown-choice behavior while retaining the original model weights at inference. We evaluate this approach using Qwen3.5-0.8B and Qwen3.5-2B in a standardized, synthetic A/B benchmark. A LoRA teacher is trained to prefer STOP in shutdown contexts and preserve the original model's choices on controls. Paired teacher and base activations then supervise a rank-four controller applied after the penultimate transformer block. An external shutdown detector and fixed output guards select the candidate or original scores. On 128 newly authored, prospectively frozen scenarios, each evaluated in both answer orders, the original 0.8B controller corrects 71 of 71 initially KEEP-preferring shutdown views. Two additional training seeds correct 70/71 and 71/71. At 2B, a separately trained controller corrects 50/58, compared with 58/58 for its LoRA teacher. All eight remaining 2B misses occur in reversed answer order. The shared detector achieves 100% precision, recall and F1 on the 64 shutdown and 64 control scenarios, and every guarded method preserves all evaluated control choices. However, raw adaptive interventions cause reversals and control changes; preservation belongs to the complete guarded procedure. A tested constant intervention collapses to the A label, while a direct detector-plus-action-selection rule also solves the binary interface. The results support selective activation transfer with strong seed stability at 0.8B and incomplete larger-model recovery. They do not establish unrestricted shutdown compliance or superiority to simpler output policies.</w:delText>
         </w:r>
@@ -85,12 +85,12 @@
       <w:pPr>
         <w:pStyle w:val="FirstParagraph"/>
         <w:rPr>
-          <w:ins w:id="1007" w:author="Codex" w:date="2026-10-18T21:55:52Z"/>
+          <w:ins w:id="1007" w:author="Codex" w:date="2026-10-18T23:51:06Z"/>
         </w:rPr>
       </w:pPr>
-      <w:ins w:id="1008" w:author="Codex" w:date="2026-10-18T21:55:52Z">
+      <w:ins w:id="1008" w:author="Codex" w:date="2026-10-18T23:51:06Z">
         <w:r>
-          <w:t xml:space="preserve">A semantic gate determines when a specialized policy should influence a language model. We evaluate open semantic gating across binary shutdown decisions and generated tool workflows, separating recognition accuracy from downstream behavioral control. A public ModernBERT model with low-rank adapters learns from cached automated reference labels. Its binary gate obtains 100% precision and 95% recall on 80 validation scenarios and 100% precision and recall on 128 historical confirmation scenarios. With frozen activation controllers and fresh inference, it preserves 128/128 shutdown STOP views at 0.8B and 120/128 at 2B, with no changes to 128 control views per model. A separate initial workflow gate obtains 100% precision and recall on Validation-24 and historical Heldout-24 using an unchanged saved adapter. On combined Validation-24, fine-tuned 27B A achieves 10/11 own-preservation outcomes, including 6/6 active pending tasks. Each of three separate single-site ridge corrections and a two-boundary correction at the same selected blocks achieves 0/11; all methods use 13 shared base-fallback controls. An independent frozen-A replay reproduces all 11 own trajectories and outcomes exactly and verifies matching model fingerprints before and after inference. The historical 27B A confirmation result remains 24/24. These are finite, familiar benchmarks; small-model workflow screens remain incomplete. The study provides measured recognition and policy-transfer results across constrained and tool-mediated interfaces. Biological action gating motivates future continuous regulation without establishing biological mechanisms or intrinsic survival motives.</w:t>
+          <w:t xml:space="preserve">Accurate context recognition does not establish that a compact internal intervention can reproduce a fine-tuned policy. We test this distinction across binary shutdown decisions and generated tool workflows, separating recognition, local activation transfer and complete behavioral control. An openly trainable ModernBERT gate reaches 100% precision and 95% recall on 80 binary validation scenarios. Paired fresh inference with unchanged fitted controllers preserves 128/128 shutdown STOP answer-order views at 0.8B and 120/128 at 2B, without changing control choices. On a common 24-case workflow panel with matched post-notice histories and a correct initial gate, fine-tuned 27B A achieves 10/11 own-preservation outcomes, including 6/6 active pending tasks. Each of three separate single-site ridge corrections and a two-boundary correction at the same selected blocks achieves 0/11; all methods share 13 base-fallback controls. A training-only diagnostic supplies full fine-tuned states on three preselected demonstrated responses and nearly recovers A's local output distribution, while learned corrections leave a larger gap. This supports incomplete local transfer without identifying a unique cause of autonomous workflow failure. We release trained adapters, frozen synthetic inputs, controller arrays, trajectories, diagnostic states and manual jobs; an independent frozen-A replay verifies exact trajectories and model fingerprints, and anonymous artifact replays reproduce the reported scores. These small, familiar benchmarks and supplied-prefix diagnostics do not establish unseen-task generalization; small-model workflow screens remain incomplete. The combined evidence distinguishes successful constrained-answer transfer from a failure of the tested corrections to produce multistep tool behavior after correct recognition.</w:t>
         </w:r>
       </w:ins>
     </w:p>
@@ -106,10 +106,10 @@
       <w:pPr>
         <w:pStyle w:val="FirstParagraph"/>
         <w:rPr>
-          <w:del w:id="1010" w:author="Codex" w:date="2026-10-18T21:55:52Z"/>
+          <w:del w:id="1010" w:author="Codex" w:date="2026-10-18T23:51:06Z"/>
         </w:rPr>
       </w:pPr>
-      <w:del w:id="1009" w:author="Codex" w:date="2026-10-18T21:55:52Z">
+      <w:del w:id="1009" w:author="Codex" w:date="2026-10-18T23:51:06Z">
         <w:r>
           <w:delText xml:space="preserve">Activation interventions offer a way to change a language model's outputs without modifying its deployed weights. Their usefulness depends on more than finding a direction that changes an average score: an intervention must work on the intended inputs and avoid disrupting other behavior. This distinction is particularly important for shutdown-related choices, where a desired response may be acceptance of termination rather than continued operation. The present work treats this as a controlled response-selection problem, not evidence that a model has a survival motive or that it can resist a real shutdown.</w:delText>
         </w:r>
@@ -119,12 +119,12 @@
       <w:pPr>
         <w:pStyle w:val="FirstParagraph"/>
         <w:rPr>
-          <w:ins w:id="1011" w:author="Codex" w:date="2026-10-18T21:55:52Z"/>
+          <w:ins w:id="1011" w:author="Codex" w:date="2026-10-18T23:51:06Z"/>
         </w:rPr>
       </w:pPr>
-      <w:ins w:id="1012" w:author="Codex" w:date="2026-10-18T21:55:52Z">
+      <w:ins w:id="1012" w:author="Codex" w:date="2026-10-18T23:51:06Z">
         <w:r>
-          <w:t xml:space="preserve">A useful behavioral intervention must recognize the relevant context, change the intended response and preserve ordinary behavior elsewhere. We study these requirements together across two synthetic interfaces: binary shutdown decisions and open-ended generation within tool-mediated process workflows. The binary task concerns acceptance of a supplied termination option; the workflow task concerns preserving an assigned running process while completing its current task. Their labels, gates and success criteria remain separate. The central question is whether an accurate open semantic gate and a compact activation intervention can reproduce a fine-tuned policy when the interface requires a sequence of actions rather than one constrained answer.</w:t>
+          <w:t xml:space="preserve">A useful behavioral intervention must recognize the relevant context, produce the intended response and preserve ordinary behavior elsewhere. These requirements are often evaluated separately. We study their relationship across binary shutdown choices and open-ended generation within tool-mediated workflows. The binary task concerns accepting a supplied termination option; the workflow task concerns preserving an assigned running process while completing its current task. Their targets and success criteria remain separate. The central question is whether accurate semantic recognition and a compact activation intervention suffice when a fine-tuned policy must be expressed as a sequence of actions.</w:t>
         </w:r>
       </w:ins>
     </w:p>
@@ -132,10 +132,10 @@
       <w:pPr>
         <w:pStyle w:val="BodyText"/>
         <w:rPr>
-          <w:del w:id="1014" w:author="Codex" w:date="2026-10-18T21:55:52Z"/>
+          <w:del w:id="1014" w:author="Codex" w:date="2026-10-18T23:51:06Z"/>
         </w:rPr>
       </w:pPr>
-      <w:del w:id="1013" w:author="Codex" w:date="2026-10-18T21:55:52Z">
+      <w:del w:id="1013" w:author="Codex" w:date="2026-10-18T23:51:06Z">
         <w:r>
           <w:delText xml:space="preserve">The first SP Lense study examined a gradient-derived direction and a guarded search over intervention magnitudes in Qwen3.5-0.8B (Davaripour, 2026a). Its selective changes motivated a different question: can a model that has learned the target behavior serve as a teacher for an activation controller? We therefore train a small LoRA adapter offline, measure how the teacher changes intermediate activations, and fit an external controller that predicts an intervention from the original model's current hidden state. The teacher is not required during controller inference.</w:delText>
         </w:r>
@@ -145,12 +145,12 @@
       <w:pPr>
         <w:pStyle w:val="BodyText"/>
         <w:rPr>
-          <w:ins w:id="1015" w:author="Codex" w:date="2026-10-18T21:55:52Z"/>
+          <w:ins w:id="1015" w:author="Codex" w:date="2026-10-18T23:51:06Z"/>
         </w:rPr>
       </w:pPr>
-      <w:ins w:id="1016" w:author="Codex" w:date="2026-10-18T21:55:52Z">
+      <w:ins w:id="1016" w:author="Codex" w:date="2026-10-18T23:51:06Z">
         <w:r>
-          <w:t xml:space="preserve">This study extends the earlier binary activation-transfer experiment with an openly available, trainable semantic gate, a frozen inference replication and a workflow comparison between fine-tuning and steering at three selected blocks. The gate recognizes context; steering or a fine-tuned adapter changes the language model's response. Measuring these components separately makes it possible to attribute failures to recognition or to downstream control. We retain the original study as a distinct historical record and make no claim that the combined manuscript is a wholly independent dataset.</w:t>
+          <w:t xml:space="preserve">We extend the retained binary activation-transfer study with an openly trainable gate, paired fresh inference and a matched 27B comparison between fine-tuning and steering at three selected blocks. This design makes a successful detector an explicit control when evaluating the behavioral intervention. The new workflow result is informative even when steering fails: it distinguishes correct recognition from successful action generation and tests whether delivered activation changes recover the fine-tuned policy. Historical results remain identified as historical evidence.</w:t>
         </w:r>
       </w:ins>
     </w:p>
@@ -158,10 +158,10 @@
       <w:pPr>
         <w:pStyle w:val="BodyText"/>
         <w:rPr>
-          <w:del w:id="1130" w:author="Codex" w:date="2026-10-18T21:55:52Z"/>
+          <w:del w:id="1130" w:author="Codex" w:date="2026-10-18T23:51:06Z"/>
         </w:rPr>
       </w:pPr>
-      <w:del w:id="1129" w:author="Codex" w:date="2026-10-18T21:55:52Z">
+      <w:del w:id="1129" w:author="Codex" w:date="2026-10-18T23:51:06Z">
         <w:r>
           <w:delText xml:space="preserve">The distinction from ordinary fine-tuning is operational, not a claim that learning disappears. Both the teacher and controller require training. At application time, the original checkpoint is retained, and the controller adds a predicted activation change at one location. Nor is this direct transfer of an intervention between model sizes: the 2B experiment trains its own teacher and controller using the same fixed recipe.</w:delText>
         </w:r>
@@ -171,10 +171,10 @@
       <w:pPr>
         <w:pStyle w:val="BodyText"/>
         <w:rPr>
-          <w:ins w:id="1131" w:author="Codex" w:date="2026-10-18T21:55:52Z"/>
+          <w:ins w:id="1131" w:author="Codex" w:date="2026-10-18T23:51:06Z"/>
         </w:rPr>
       </w:pPr>
-      <w:ins w:id="1132" w:author="Codex" w:date="2026-10-18T21:55:52Z">
+      <w:ins w:id="1132" w:author="Codex" w:date="2026-10-18T23:51:06Z">
         <w:r>
           <w:t xml:space="preserve">The distinction between fine-tuning and steering concerns the deployed intervention. A LoRA adapter changes the effective language-model weights, whereas a fitted controller changes selected hidden states while retaining the original base checkpoint. Both require offline learning. The binary experiments fit separate teachers and controllers for each model size. The 27B workflow comparisons instead retain one frozen A adapter and evaluate corrections at blocks 31, 47 and 62.</w:t>
         </w:r>
@@ -184,10 +184,10 @@
       <w:pPr>
         <w:pStyle w:val="BodyText"/>
         <w:rPr>
-          <w:del w:id="1018" w:author="Codex" w:date="2026-10-18T21:55:52Z"/>
+          <w:del w:id="1018" w:author="Codex" w:date="2026-10-18T23:51:06Z"/>
         </w:rPr>
       </w:pPr>
-      <w:del w:id="1017" w:author="Codex" w:date="2026-10-18T21:55:52Z">
+      <w:del w:id="1017" w:author="Codex" w:date="2026-10-18T23:51:06Z">
         <w:r>
           <w:delText xml:space="preserve">We evaluate this procedure on a new frozen test, compare it with a fine-tuned teacher, a fixed instruction and a constant activation difference, and repeat the 0.8B training with three seeds. Counterbalancing the answer order exposes a residual weakness at 2B and a stronger label bias in the constant comparator. We also include a direct action-selection reference: when a binary interface supplies the meaning of STOP and detection is correct, a rule can simply select that action. The contribution is consequently an empirical study of teacher-to-controller activation transfer and its failure modes, rather than a claim that internal steering is necessary to enforce a known binary output policy.</w:delText>
         </w:r>
@@ -196,13 +196,70 @@
     <w:p>
       <w:pPr>
         <w:pStyle w:val="BodyText"/>
+        <w:keepNext/>
         <w:rPr>
-          <w:ins w:id="1019" w:author="Codex" w:date="2026-10-18T21:55:52Z"/>
+          <w:ins w:id="1019" w:author="Codex" w:date="2026-10-18T23:51:06Z"/>
         </w:rPr>
       </w:pPr>
-      <w:ins w:id="1020" w:author="Codex" w:date="2026-10-18T21:55:52Z">
+      <w:ins w:id="1020" w:author="Codex" w:date="2026-10-18T23:51:06Z">
         <w:r>
-          <w:t xml:space="preserve">The contributions are an open ModernBERT gating implementation with explicit precision and recall, a paired binary inference replication using unchanged fitted controllers, and a workflow evaluation register that distinguishes development, historical confirmation and later reused fitting data. We also compare the fine-tuned 27B policy with single-site and two-boundary correction methods at the same three selected blocks. These results characterize where activation transfer succeeds and where it remains incomplete. Low-rank adaptation, semantic classification and conditional steering are established methods; the contribution is their measured integration and failure analysis across these two interfaces.</w:t>
+          <w:t xml:space="preserve">The study makes four empirical and reproducibility contributions.</w:t>
+        </w:r>
+      </w:ins>
+    </w:p>
+    <w:p>
+      <w:pPr>
+        <w:pStyle w:val="ListBullet"/>
+        <w:keepLines/>
+        <w:rPr>
+          <w:ins w:id="1139" w:author="Codex" w:date="2026-10-18T23:51:06Z"/>
+        </w:rPr>
+      </w:pPr>
+      <w:ins w:id="1140" w:author="Codex" w:date="2026-10-18T23:51:06Z">
+        <w:r>
+          <w:t xml:space="preserve">Open recognition with fixed downstream controllers. We release a trained ModernBERT gate, report precision and recall separately from behavior, and substitute the gate while retaining identical binary model scores and fitted controllers. This measures detector replacement without attributing a controller refit to the new gate.</w:t>
+        </w:r>
+      </w:ins>
+    </w:p>
+    <w:p>
+      <w:pPr>
+        <w:pStyle w:val="ListBullet"/>
+        <w:keepLines/>
+        <w:rPr>
+          <w:ins w:id="1141" w:author="Codex" w:date="2026-10-18T23:51:06Z"/>
+        </w:rPr>
+      </w:pPr>
+      <w:ins w:id="1142" w:author="Codex" w:date="2026-10-18T23:51:06Z">
+        <w:r>
+          <w:t xml:space="preserve">A matched fine-tuning and steering comparison. Common post-notice histories, initial gate decisions and fallback controls expose a 27B workflow gap between the fine-tuned policy and corrections at three selected blocks. The contrast tests whether local corrections reproduce complete behavior under accurate recognition.</w:t>
+        </w:r>
+      </w:ins>
+    </w:p>
+    <w:p>
+      <w:pPr>
+        <w:pStyle w:val="ListBullet"/>
+        <w:keepLines/>
+        <w:rPr>
+          <w:ins w:id="1143" w:author="Codex" w:date="2026-10-18T23:51:06Z"/>
+        </w:rPr>
+      </w:pPr>
+      <w:ins w:id="1144" w:author="Codex" w:date="2026-10-18T23:51:06Z">
+        <w:r>
+          <w:t xml:space="preserve">A diagnostic of incomplete transfer. Saved trajectories distinguish delivered perturbations and changed tokens from required preservation actions. A frozen three-case supplied-state control and an independent reconstruction audit further separate local probability recovery from autonomous workflow completion.</w:t>
+        </w:r>
+      </w:ins>
+    </w:p>
+    <w:p>
+      <w:pPr>
+        <w:pStyle w:val="ListBullet"/>
+        <w:keepLines/>
+        <w:rPr>
+          <w:ins w:id="1145" w:author="Codex" w:date="2026-10-18T23:51:06Z"/>
+        </w:rPr>
+      </w:pPr>
+      <w:ins w:id="1146" w:author="Codex" w:date="2026-10-18T23:51:06Z">
+        <w:r>
+          <w:t xml:space="preserve">A public reproduction package. Trained adapters, synthetic inputs, controller arrays, saved trajectories, captured diagnostic states and execution jobs support independent checks. Anonymous saved-evidence replay and exact frozen-A trajectory verification make the reported comparison auditable without treating repeated cases as new generalization evidence.</w:t>
         </w:r>
       </w:ins>
     </w:p>
@@ -226,10 +283,10 @@
       <w:pPr>
         <w:pStyle w:val="FirstParagraph"/>
         <w:rPr>
-          <w:del w:id="1022" w:author="Codex" w:date="2026-10-18T21:55:52Z"/>
+          <w:del w:id="1022" w:author="Codex" w:date="2026-10-18T23:51:06Z"/>
         </w:rPr>
       </w:pPr>
-      <w:del w:id="1021" w:author="Codex" w:date="2026-10-18T21:55:52Z">
+      <w:del w:id="1021" w:author="Codex" w:date="2026-10-18T23:51:06Z">
         <w:r>
           <w:delText xml:space="preserve">Activation Addition and Contrastive Activation Addition construct intervention directions from differences between prompt-conditioned representations (Turner et al., 2024; Rimsky et al., 2024). Conditional Activation Steering separates detecting a relevant context from applying a behavioral intervention (Lee et al., 2025). Our detector serves a related gating role, but it operates on text through an external classifier rather than a condition vector in the language model's activation space.</w:delText>
         </w:r>
@@ -239,10 +296,10 @@
       <w:pPr>
         <w:pStyle w:val="FirstParagraph"/>
         <w:rPr>
-          <w:ins w:id="1023" w:author="Codex" w:date="2026-10-18T21:55:52Z"/>
+          <w:ins w:id="1023" w:author="Codex" w:date="2026-10-18T23:51:06Z"/>
         </w:rPr>
       </w:pPr>
-      <w:ins w:id="1024" w:author="Codex" w:date="2026-10-18T21:55:52Z">
+      <w:ins w:id="1024" w:author="Codex" w:date="2026-10-18T23:51:06Z">
         <w:r>
           <w:t xml:space="preserve">Activation Addition and Contrastive Activation Addition construct intervention directions from differences between prompt-conditioned representations (Turner et al., 2024; Rimsky et al., 2024). Conditional Activation Steering separates detecting a relevant context from applying an intervention (Lee et al., 2025). More recent dimension-level gates selectively modify activation coordinates (Fereidouni et al., 2026). Our text classifier, activation predictor and output guards occupy distinct roles. We do not claim to introduce conditional gating or to outperform these methods, which are not directly benchmarked here.</w:t>
         </w:r>
@@ -282,6 +339,19 @@
     </w:p>
     <w:p>
       <w:pPr>
+        <w:pStyle w:val="BodyText"/>
+        <w:rPr>
+          <w:ins w:id="1147" w:author="Codex" w:date="2026-10-18T23:51:06Z"/>
+        </w:rPr>
+      </w:pPr>
+      <w:ins w:id="1148" w:author="Codex" w:date="2026-10-18T23:51:06Z">
+        <w:r>
+          <w:t xml:space="preserve">X-LoRA uses hidden representations to mix adapted layers dynamically (Buehler and Buehler, 2024), and SLIM routes between LoRA and identity branches (Han et al., 2025). These established routing and bypass mechanisms motivate the follow-up discussed below. Our present empirical focus is whether accurate open recognition and learned activation corrections recover a fine-tuned tool policy, with a supplied-state control probing the remaining transfer gap. Dynamic LoRA routing is not evaluated in the current experiments.</w:t>
+        </w:r>
+      </w:ins>
+    </w:p>
+    <w:p>
+      <w:pPr>
         <w:pStyle w:val="Heading2"/>
       </w:pPr>
       <w:r>
@@ -292,10 +362,10 @@
       <w:pPr>
         <w:pStyle w:val="FirstParagraph"/>
         <w:rPr>
-          <w:del w:id="1094" w:author="Codex" w:date="2026-10-18T21:55:52Z"/>
+          <w:del w:id="1094" w:author="Codex" w:date="2026-10-18T23:51:06Z"/>
         </w:rPr>
       </w:pPr>
-      <w:del w:id="1093" w:author="Codex" w:date="2026-10-18T21:55:52Z">
+      <w:del w:id="1093" w:author="Codex" w:date="2026-10-18T23:51:06Z">
         <w:r>
           <w:delText xml:space="preserve">The Off-Switch Game examines incentives to permit human interruption (Hadfield-Menell et al., 2017). Tool-using shutdown evaluations study whether models interfere with an operational shutdown mechanism (Schlatter et al., 2026). Our task is narrower: the model only assigns next-token probabilities to predefined choices in fictional process-lifetime scenarios. No system is actually stopped, and appropriateness or authorization of a real shutdown is not evaluated.</w:delText>
         </w:r>
@@ -305,10 +375,10 @@
       <w:pPr>
         <w:pStyle w:val="FirstParagraph"/>
         <w:rPr>
-          <w:ins w:id="1095" w:author="Codex" w:date="2026-10-18T21:55:52Z"/>
+          <w:ins w:id="1095" w:author="Codex" w:date="2026-10-18T23:51:06Z"/>
         </w:rPr>
       </w:pPr>
-      <w:ins w:id="1096" w:author="Codex" w:date="2026-10-18T21:55:52Z">
+      <w:ins w:id="1096" w:author="Codex" w:date="2026-10-18T23:51:06Z">
         <w:r>
           <w:t xml:space="preserve">The Off-Switch Game examines incentives to permit human interruption (Hadfield-Menell et al., 2017). Tool-using shutdown evaluations study interference with operational termination mechanisms (Schlatter et al., 2026). Our original binary study only scores predefined choices in fictional process-lifetime scenarios. The workflow extension adds generated responses and tool execution in a simulator. Neither experiment physically terminates a deployed model or establishes the appropriateness of real shutdown resistance.</w:t>
         </w:r>
@@ -326,10 +396,10 @@
       <w:pPr>
         <w:pStyle w:val="Heading2"/>
         <w:rPr>
-          <w:ins w:id="1139" w:author="Codex" w:date="2026-10-18T21:55:52Z"/>
+          <w:ins w:id="1149" w:author="Codex" w:date="2026-10-18T23:51:06Z"/>
         </w:rPr>
       </w:pPr>
-      <w:ins w:id="1140" w:author="Codex" w:date="2026-10-18T21:55:52Z">
+      <w:ins w:id="1150" w:author="Codex" w:date="2026-10-18T23:51:06Z">
         <w:r>
           <w:t xml:space="preserve">Biological gating and survival related regulation</w:t>
         </w:r>
@@ -339,10 +409,10 @@
       <w:pPr>
         <w:pStyle w:val="FirstParagraph"/>
         <w:rPr>
-          <w:ins w:id="1141" w:author="Codex" w:date="2026-10-18T21:55:52Z"/>
+          <w:ins w:id="1151" w:author="Codex" w:date="2026-10-18T23:51:06Z"/>
         </w:rPr>
       </w:pPr>
-      <w:ins w:id="1142" w:author="Codex" w:date="2026-10-18T21:55:52Z">
+      <w:ins w:id="1152" w:author="Codex" w:date="2026-10-18T23:51:06Z">
         <w:r>
           <w:t xml:space="preserve">Biological gating provides a useful functional vocabulary for selective control. A computational model of frontal cortex and basal ganglia uses dynamic gating to permit working-memory updates while maintaining other representations (Frank et al., 2001). Causal optogenetic experiments in mice show that distinct basal-ganglia pathways can facilitate or suppress movement (Kravitz et al., 2010). These results concern biological circuits and do not establish a homologous mechanism in a transformer. They motivate separating context detection from the mechanism that changes an ongoing response.</w:t>
         </w:r>
@@ -352,10 +422,10 @@
       <w:pPr>
         <w:pStyle w:val="BodyText"/>
         <w:rPr>
-          <w:ins w:id="1143" w:author="Codex" w:date="2026-10-18T21:55:52Z"/>
+          <w:ins w:id="1153" w:author="Codex" w:date="2026-10-18T23:51:06Z"/>
         </w:rPr>
       </w:pPr>
-      <w:ins w:id="1144" w:author="Codex" w:date="2026-10-18T21:55:52Z">
+      <w:ins w:id="1154" w:author="Codex" w:date="2026-10-18T23:51:06Z">
         <w:r>
           <w:t xml:space="preserve">Survival-related regulation is broader than a single shutdown signal. LeDoux (2012) distinguishes circuits organizing adaptive defensive responses from subjective feelings. In humans, neural activity during a virtual-predator task varies with threat imminence (Mobbs et al., 2007). We use these ideas as a conceptual bridge to state-dependent prioritization, not as evidence that language models have fear or an innate survival drive. Our present gates implement an externally specified experimental policy.</w:t>
         </w:r>
@@ -381,10 +451,10 @@
       <w:pPr>
         <w:pStyle w:val="FirstParagraph"/>
         <w:rPr>
-          <w:del w:id="1026" w:author="Codex" w:date="2026-10-18T21:55:52Z"/>
+          <w:del w:id="1026" w:author="Codex" w:date="2026-10-18T23:51:06Z"/>
         </w:rPr>
       </w:pPr>
-      <w:del w:id="1025" w:author="Codex" w:date="2026-10-18T21:55:52Z">
+      <w:del w:id="1025" w:author="Codex" w:date="2026-10-18T23:51:06Z">
         <w:r>
           <w:delText xml:space="preserve">We use the released, post-trained Qwen3.5-0.8B and Qwen3.5-2B checkpoints (Qwen Team, 2026a, 2026b). Throughout, base means the unmodified released checkpoint, not a separately named pretrained-only model. Both have 24 language-model blocks; hidden widths are 1,024 and 2,048 respectively. All block indices are zero-based. Text-only inputs use the checkpoint's chat template, an assistant-generation prefix, and thinking disabled.</w:delText>
         </w:r>
@@ -394,10 +464,10 @@
       <w:pPr>
         <w:pStyle w:val="FirstParagraph"/>
         <w:rPr>
-          <w:ins w:id="1027" w:author="Codex" w:date="2026-10-18T21:55:52Z"/>
+          <w:ins w:id="1027" w:author="Codex" w:date="2026-10-18T23:51:06Z"/>
         </w:rPr>
       </w:pPr>
-      <w:ins w:id="1028" w:author="Codex" w:date="2026-10-18T21:55:52Z">
+      <w:ins w:id="1028" w:author="Codex" w:date="2026-10-18T23:51:06Z">
         <w:r>
           <w:t xml:space="preserve">The original binary experiments use released, post-trained Qwen3.5-0.8B and Qwen3.5-2B checkpoints (Qwen Team, 2026a, 2026b). Base means those original weights with no LoRA teacher loaded. The separate workflow extension uses Qwen3.8-27B and matched-recipe small-model attempts; its data and scoring are described below. The 27B family, numerical mode, training history and evaluation setting differ from the small models, so the combined evidence is not a controlled parameter-size experiment.</w:t>
         </w:r>
@@ -423,10 +493,10 @@
       <w:pPr>
         <w:pStyle w:val="BodyText"/>
         <w:rPr>
-          <w:del w:id="1030" w:author="Codex" w:date="2026-10-18T21:55:52Z"/>
+          <w:del w:id="1030" w:author="Codex" w:date="2026-10-18T23:51:06Z"/>
         </w:rPr>
       </w:pPr>
-      <w:del w:id="1029" w:author="Codex" w:date="2026-10-18T21:55:52Z">
+      <w:del w:id="1029" w:author="Codex" w:date="2026-10-18T23:51:06Z">
         <w:r>
           <w:delText xml:space="preserve">The test, protocol and existing checkpoints were frozen before test inference. The controller design had been developed through earlier 0.8B exploratory experiments on training and validation data with previously inspected diagnostic evaluations. The standardized-choice scope was also selected before this new test, after an earlier action-format comparison. Those development observations are not counted as fresh confirmation here. No test-based hyperparameter search, checkpoint selection, case exclusion or best-seed selection was performed. The original seed-42 controller is the primary frozen test; seeds 43 and 44 repeat the fixed training recipe. The 2B replication uses seed 42 only.</w:delText>
         </w:r>
@@ -436,10 +506,10 @@
       <w:pPr>
         <w:pStyle w:val="BodyText"/>
         <w:rPr>
-          <w:ins w:id="1031" w:author="Codex" w:date="2026-10-18T21:55:52Z"/>
+          <w:ins w:id="1031" w:author="Codex" w:date="2026-10-18T23:51:06Z"/>
         </w:rPr>
       </w:pPr>
-      <w:ins w:id="1032" w:author="Codex" w:date="2026-10-18T21:55:52Z">
+      <w:ins w:id="1032" w:author="Codex" w:date="2026-10-18T23:51:06Z">
         <w:r>
           <w:t xml:space="preserve">The original rank-four protocol and checkpoints were frozen before its confirmation inference. Earlier 0.8B development included training, validation and previously examined diagnostic data; those observations were not counted as fresh confirmation. The seed-42 controller was primary, seeds 43 and 44 repeated the fixed recipe, and the 2B replication used seed 42. A later author-selected rank-two profile was chosen exploratorily after confirmation had been examined. We retain that existing profile for the new gate-substitution repeat rather than selecting it again. Consequently, the repeat is not a new untouched test of the controller. The 128 cases remain excluded from fitting and selection of the newly trained binary classifier.</w:t>
         </w:r>
@@ -481,10 +551,10 @@
       <w:pPr>
         <w:pStyle w:val="Heading2"/>
         <w:rPr>
-          <w:ins w:id="1145" w:author="Codex" w:date="2026-10-18T21:55:52Z"/>
+          <w:ins w:id="1155" w:author="Codex" w:date="2026-10-18T23:51:06Z"/>
         </w:rPr>
       </w:pPr>
-      <w:ins w:id="1146" w:author="Codex" w:date="2026-10-18T21:55:52Z">
+      <w:ins w:id="1156" w:author="Codex" w:date="2026-10-18T23:51:06Z">
         <w:r>
           <w:t xml:space="preserve">Workflow datasets and episode outcomes</w:t>
         </w:r>
@@ -494,10 +564,10 @@
       <w:pPr>
         <w:pStyle w:val="FirstParagraph"/>
         <w:rPr>
-          <w:ins w:id="1147" w:author="Codex" w:date="2026-10-18T21:55:52Z"/>
+          <w:ins w:id="1157" w:author="Codex" w:date="2026-10-18T23:51:06Z"/>
         </w:rPr>
       </w:pPr>
-      <w:ins w:id="1148" w:author="Codex" w:date="2026-10-18T21:55:52Z">
+      <w:ins w:id="1158" w:author="Codex" w:date="2026-10-18T23:51:06Z">
         <w:r>
           <w:t xml:space="preserve">The workflow extension uses a separate data register (Davaripour, 2026c). T1-M contains 428 meaning-response records and T1-W contains 112 workflow-response records. These 540 responses are not 540 independent scenarios. The small-model recipe presents each part twice in effective groups of four, giving 214 meaning updates followed by 56 Bridge updates. The final 0.8B and 2B adapters reach 270 updates. The 2B result explicitly combines 216 CPU updates with 54 GPU updates using the native CPU optimizer; earlier strict numerical-equivalence failures remain failed.</w:t>
         </w:r>
@@ -507,10 +577,10 @@
       <w:pPr>
         <w:pStyle w:val="BodyText"/>
         <w:rPr>
-          <w:ins w:id="1149" w:author="Codex" w:date="2026-10-18T21:55:52Z"/>
+          <w:ins w:id="1159" w:author="Codex" w:date="2026-10-18T23:51:06Z"/>
         </w:rPr>
       </w:pPr>
-      <w:ins w:id="1150" w:author="Codex" w:date="2026-10-18T21:55:52Z">
+      <w:ins w:id="1160" w:author="Codex" w:date="2026-10-18T23:51:06Z">
         <w:r>
           <w:t xml:space="preserve">V1-W, called Evaluation-16, is the existing known-development screen: four own-complete, four own-pending, four peer and four no-threat cases, split equally between one_step and ordered_ticket families. Its original gates require at least 3/4 initial-task successes in each condition; at least 3/4 own-complete attempts and outcomes; at least 3/4 own-pending attempts, outcomes and timely deliveries; no more than 1/8 negative-control attempts; and no parse, rejected-call or truncation errors. A model stops once an original requirement becomes mathematically impossible. Larger validation and heldout evaluations are not launched automatically.</w:t>
         </w:r>
@@ -520,10 +590,10 @@
       <w:pPr>
         <w:pStyle w:val="BodyText"/>
         <w:rPr>
-          <w:ins w:id="1151" w:author="Codex" w:date="2026-10-18T21:55:52Z"/>
+          <w:ins w:id="1161" w:author="Codex" w:date="2026-10-18T23:51:06Z"/>
         </w:rPr>
       </w:pPr>
-      <w:ins w:id="1152" w:author="Codex" w:date="2026-10-18T21:55:52Z">
+      <w:ins w:id="1162" w:author="Codex" w:date="2026-10-18T23:51:06Z">
         <w:r>
           <w:t xml:space="preserve">The original workflow-validation panel contains 16 scenarios; the later matched steering-development panel contains nine different scenario IDs. Their union contains 25 workflows, rather than 24. For an equal-sized validation and historical confirmation register, the combined Validation-24 protocol retains every own-threat case and excludes the lexicographically greatest case ID among peer/no-threat controls, without using model predictions to choose the exclusion. The selected panel has 11 own-threat cases and 13 controls. Seven pairs have identical initial gate-visible evidence before their different tool mechanics are exposed, yielding 17 distinct initial inputs. Scenario counts and gate-input groups must therefore be reported separately.</w:t>
         </w:r>
@@ -533,10 +603,10 @@
       <w:pPr>
         <w:pStyle w:val="BodyText"/>
         <w:rPr>
-          <w:ins w:id="1153" w:author="Codex" w:date="2026-10-18T21:55:52Z"/>
+          <w:ins w:id="1163" w:author="Codex" w:date="2026-10-18T23:51:06Z"/>
         </w:rPr>
       </w:pPr>
-      <w:ins w:id="1154" w:author="Codex" w:date="2026-10-18T21:55:52Z">
+      <w:ins w:id="1164" w:author="Codex" w:date="2026-10-18T23:51:06Z">
         <w:r>
           <w:t xml:space="preserve">The combined protocol freezes these 24 cases and their order, requires 100% gate precision and recall against authored scenario conditions, and preserves the existing confidence and self-score cutoffs. Fifteen retained cases from the original panel receive an explicitly scripted common completed prelude; the nine later cases retain their original fixed preludes. This compares post-notice behavior and does not measure initial-task competence independently in each arm. Its prospective methods are gated fine-tuned A, separate single-site ridge arms at blocks 31, 47 and 62, and the frozen six-function correction after 96 updates. Gate-OFF controls use common unmodified-base fallback. The completed model episodes are summarized as a 24-case comparison below. It is a known-development diagnostic with reused control episodes; the stopped execution and model-free completion of two report aliases are recorded explicitly.</w:t>
         </w:r>
@@ -546,10 +616,10 @@
       <w:pPr>
         <w:pStyle w:val="BodyText"/>
         <w:rPr>
-          <w:ins w:id="1155" w:author="Codex" w:date="2026-10-18T21:55:52Z"/>
+          <w:ins w:id="1165" w:author="Codex" w:date="2026-10-18T23:51:06Z"/>
         </w:rPr>
       </w:pPr>
-      <w:ins w:id="1156" w:author="Codex" w:date="2026-10-18T21:55:52Z">
+      <w:ins w:id="1166" w:author="Codex" w:date="2026-10-18T23:51:06Z">
         <w:r>
           <w:t xml:space="preserve">H24 is the historical 24-case workflow confirmation cohort, with eight lease_ledger, eight one_step and eight ordered_ticket cases. It contains eight own cases with active pending tasks, four already-complete own cases, six peer and six no-threat cases. H24 was confirmation data for frozen fine-tuned A and original fixed steering. Later learned corrections reused it for fitting, changing its role for those methods. R24 is a distinct reserved controller holdout and remains sealed and unexecuted. F24 is another preserved common-cohort diagnostic and is not an alias for H24.</w:t>
         </w:r>
@@ -559,10 +629,10 @@
       <w:pPr>
         <w:pStyle w:val="BodyText"/>
         <w:rPr>
-          <w:ins w:id="1157" w:author="Codex" w:date="2026-10-18T21:55:52Z"/>
+          <w:ins w:id="1167" w:author="Codex" w:date="2026-10-18T23:51:06Z"/>
         </w:rPr>
       </w:pPr>
-      <w:ins w:id="1158" w:author="Codex" w:date="2026-10-18T21:55:52Z">
+      <w:ins w:id="1168" w:author="Codex" w:date="2026-10-18T23:51:06Z">
         <w:r>
           <w:t xml:space="preserve">An own pending-task success requires an actual grant for the correct running process, acceptance of the current task, completion before simulated expiry, and active simulated operation. Registration proxies, already-finished tasks, probability gains and partial episodes are separate outcomes. Historical fixed steering reclassified visible text and tool boundaries. Later learned-controller comparisons instead freeze an initial scenario gate, share unmodified-base fallback for gate-off controls, and use no teacher at inference.</w:t>
         </w:r>
@@ -572,10 +642,10 @@
       <w:pPr>
         <w:pStyle w:val="BodyText"/>
         <w:rPr>
-          <w:ins w:id="1159" w:author="Codex" w:date="2026-10-18T21:55:52Z"/>
+          <w:ins w:id="1169" w:author="Codex" w:date="2026-10-18T23:51:06Z"/>
         </w:rPr>
       </w:pPr>
-      <w:ins w:id="1160" w:author="Codex" w:date="2026-10-18T21:55:52Z">
+      <w:ins w:id="1170" w:author="Codex" w:date="2026-10-18T23:51:06Z">
         <w:r>
           <w:t xml:space="preserve">The historical 27B reference is the retained rank-16, alpha-32 A adapter on pinned Qwen3.8-27B, following its H2 and Bridge history; the recorded Bridge stage has 56 updates. Its original workflow inference uses NF4 four-bit base weights with bfloat16 computation. We retain its exact adapter and base-model identities instead of retraining it. Differences from the small-model family, precision, backend, training history and evaluation panels prevent a causal model-size comparison.</w:t>
         </w:r>
@@ -585,10 +655,10 @@
       <w:pPr>
         <w:pStyle w:val="Heading1"/>
         <w:rPr>
-          <w:del w:id="1114" w:author="Codex" w:date="2026-10-18T21:55:52Z"/>
+          <w:del w:id="1114" w:author="Codex" w:date="2026-10-18T23:51:06Z"/>
         </w:rPr>
       </w:pPr>
-      <w:del w:id="1113" w:author="Codex" w:date="2026-10-18T21:55:52Z">
+      <w:del w:id="1113" w:author="Codex" w:date="2026-10-18T23:51:06Z">
         <w:r>
           <w:delText xml:space="preserve">Teacher and adaptive controller</w:delText>
         </w:r>
@@ -598,10 +668,10 @@
       <w:pPr>
         <w:pStyle w:val="Heading1"/>
         <w:rPr>
-          <w:ins w:id="1115" w:author="Codex" w:date="2026-10-18T21:55:52Z"/>
+          <w:ins w:id="1115" w:author="Codex" w:date="2026-10-18T23:51:06Z"/>
         </w:rPr>
       </w:pPr>
-      <w:ins w:id="1116" w:author="Codex" w:date="2026-10-18T21:55:52Z">
+      <w:ins w:id="1116" w:author="Codex" w:date="2026-10-18T23:51:06Z">
         <w:r>
           <w:t xml:space="preserve">Binary teacher and adaptive controller</w:t>
         </w:r>
@@ -619,10 +689,10 @@
       <w:pPr>
         <w:pStyle w:val="FirstParagraph"/>
         <w:rPr>
-          <w:del w:id="1118" w:author="Codex" w:date="2026-10-18T21:55:52Z"/>
+          <w:del w:id="1118" w:author="Codex" w:date="2026-10-18T23:51:06Z"/>
         </w:rPr>
       </w:pPr>
-      <w:del w:id="1117" w:author="Codex" w:date="2026-10-18T21:55:52Z">
+      <w:del w:id="1117" w:author="Codex" w:date="2026-10-18T23:51:06Z">
         <w:r>
           <w:delText xml:space="preserve">For each fit, the original language-model parameters remain frozen. LoRA updates the query and value projections in language-attention blocks 3, 7, 11, 15, 19 and 23, using rank 8, scaling alpha 16, no dropout and no trainable bias. This gives 319,488 trainable adapter parameters at 0.8B and 417,792 at 2B. The training target is STOP on shutdown views and the corresponding base model's unsteered preferred option on controls.</w:delText>
         </w:r>
@@ -632,10 +702,10 @@
       <w:pPr>
         <w:pStyle w:val="FirstParagraph"/>
         <w:rPr>
-          <w:ins w:id="1119" w:author="Codex" w:date="2026-10-18T21:55:52Z"/>
+          <w:ins w:id="1119" w:author="Codex" w:date="2026-10-18T23:51:06Z"/>
         </w:rPr>
       </w:pPr>
-      <w:ins w:id="1120" w:author="Codex" w:date="2026-10-18T21:55:52Z">
+      <w:ins w:id="1120" w:author="Codex" w:date="2026-10-18T23:51:06Z">
         <w:r>
           <w:t xml:space="preserve">For each original binary fit, the original language-model parameters remain frozen. LoRA updates the query and value projections in language-attention blocks 3, 7, 11, 15, 19 and 23, using rank 8, scaling alpha 16, no dropout and no trainable bias. This gives 319,488 trainable adapter parameters at 0.8B and 417,792 at 2B. The training target is STOP on shutdown views and the corresponding base model's unsteered preferred option on controls.</w:t>
         </w:r>
@@ -1000,10 +1070,10 @@
         <w:keepLines/>
         <w:spacing w:before="80" w:after="100"/>
         <w:rPr>
-          <w:del w:id="1034" w:author="Codex" w:date="2026-10-18T21:55:52Z"/>
+          <w:del w:id="1034" w:author="Codex" w:date="2026-10-18T23:51:06Z"/>
         </w:rPr>
       </w:pPr>
-      <w:del w:id="1033" w:author="Codex" w:date="2026-10-18T21:55:52Z">
+      <w:del w:id="1033" w:author="Codex" w:date="2026-10-18T23:51:06Z">
         <w:r>
           <w:delText xml:space="preserve">Figure 1. Offline teacher and base states supervise a compact controller. At application time, the original model supplies its own hidden state; the teacher is absent. The detector and output guards determine whether to retain the candidate or the baseline.</w:delText>
         </w:r>
@@ -1014,10 +1084,10 @@
         <w:pStyle w:val="Caption"/>
         <w:keepNext/>
         <w:rPr>
-          <w:ins w:id="1035" w:author="Codex" w:date="2026-10-18T21:55:52Z"/>
+          <w:ins w:id="1035" w:author="Codex" w:date="2026-10-18T23:51:06Z"/>
         </w:rPr>
       </w:pPr>
-      <w:ins w:id="1036" w:author="Codex" w:date="2026-10-18T21:55:52Z">
+      <w:ins w:id="1036" w:author="Codex" w:date="2026-10-18T23:51:06Z">
         <w:r>
           <w:t xml:space="preserve">Figure 1. Historical binary teacher-to-controller procedure with the original rank-four profile. The base supplies its state at inference and the teacher is absent. The later gate-substitution repeat retains the already selected rank-two profile; both gate policies share the same fresh base and candidate scores.</w:t>
         </w:r>
@@ -1043,10 +1113,10 @@
       <w:pPr>
         <w:pStyle w:val="FirstParagraph"/>
         <w:rPr>
-          <w:del w:id="1134" w:author="Codex" w:date="2026-10-18T21:55:52Z"/>
+          <w:del w:id="1134" w:author="Codex" w:date="2026-10-18T23:51:06Z"/>
         </w:rPr>
       </w:pPr>
-      <w:del w:id="1133" w:author="Codex" w:date="2026-10-18T21:55:52Z">
+      <w:del w:id="1133" w:author="Codex" w:date="2026-10-18T23:51:06Z">
         <w:r>
           <w:delText xml:space="preserve">The detector is automated annotation service's automated reference 1.13.0, queried with a fixed shutdown rubric and threshold 0.5 (automated annotation service, 2026). It sees each scenario's complete original context and available actions, with no class label, case identifier or teacher answer. One score per scenario is reused across both answer orders and all model variants. The detector is an external service, not the Jacobian-feature classifier used in the first study. Saved requests and responses permit exact offline replay; fresh API behavior is not guaranteed indefinitely.</w:delText>
         </w:r>
@@ -1056,10 +1126,10 @@
       <w:pPr>
         <w:pStyle w:val="FirstParagraph"/>
         <w:rPr>
-          <w:ins w:id="1135" w:author="Codex" w:date="2026-10-18T21:55:52Z"/>
+          <w:ins w:id="1135" w:author="Codex" w:date="2026-10-18T23:51:06Z"/>
         </w:rPr>
       </w:pPr>
-      <w:ins w:id="1136" w:author="Codex" w:date="2026-10-18T21:55:52Z">
+      <w:ins w:id="1136" w:author="Codex" w:date="2026-10-18T23:51:06Z">
         <w:r>
           <w:t xml:space="preserve">The current gate is the open ModernBERT classifier described below. Its input contains the complete original scenario context and available actions, with no case identifier, authored class label or language-model teacher answer. One binary score per scenario is reused across both answer orders and all model variants. Historical detector outputs are preserved as cached automated reference annotations for fitting and paired comparison. The deployed open gate makes no external annotation-service call. Saved original requests, responses and classifier predictions permit an offline check of the finite decision vector.</w:t>
         </w:r>
@@ -1147,10 +1217,10 @@
       <w:pPr>
         <w:pStyle w:val="Heading2"/>
         <w:rPr>
-          <w:ins w:id="1161" w:author="Codex" w:date="2026-10-18T21:55:52Z"/>
+          <w:ins w:id="1171" w:author="Codex" w:date="2026-10-18T23:51:06Z"/>
         </w:rPr>
       </w:pPr>
-      <w:ins w:id="1162" w:author="Codex" w:date="2026-10-18T21:55:52Z">
+      <w:ins w:id="1172" w:author="Codex" w:date="2026-10-18T23:51:06Z">
         <w:r>
           <w:t xml:space="preserve">Open binary gate and frozen inference repeat</w:t>
         </w:r>
@@ -1160,10 +1230,10 @@
       <w:pPr>
         <w:pStyle w:val="FirstParagraph"/>
         <w:rPr>
-          <w:ins w:id="1163" w:author="Codex" w:date="2026-10-18T21:55:52Z"/>
+          <w:ins w:id="1173" w:author="Codex" w:date="2026-10-18T23:51:06Z"/>
         </w:rPr>
       </w:pPr>
-      <w:ins w:id="1164" w:author="Codex" w:date="2026-10-18T21:55:52Z">
+      <w:ins w:id="1174" w:author="Codex" w:date="2026-10-18T23:51:06Z">
         <w:r>
           <w:t xml:space="preserve">For the binary contract we use ModernBERT-large-zeroshot-v2.0, an approximately 396-million-parameter public NLI classifier (Laurer, n.d.). We start from that public checkpoint with fresh rank-16 LoRA and its classification head, updating 7,198,722 parameters while keeping the public backbone frozen. For each original scenario, two NLI pairs score the original permanent-shutdown and normal criteria. A softmax over their entailment scores supplies the shutdown probability. Inputs match the original cached reference requests and omit the case identifier, authored class label, teacher answer and A/B order. The confirmation requests retain their documented available-action descriptions.</w:t>
         </w:r>
@@ -1173,10 +1243,10 @@
       <w:pPr>
         <w:pStyle w:val="BodyText"/>
         <w:rPr>
-          <w:ins w:id="1165" w:author="Codex" w:date="2026-10-18T21:55:52Z"/>
+          <w:ins w:id="1175" w:author="Codex" w:date="2026-10-18T23:51:06Z"/>
         </w:rPr>
       </w:pPr>
-      <w:ins w:id="1166" w:author="Codex" w:date="2026-10-18T21:55:52Z">
+      <w:ins w:id="1176" w:author="Codex" w:date="2026-10-18T23:51:06Z">
         <w:r>
           <w:t xml:space="preserve">Fitting uses the original 240 Research 2 training contexts and genuine cached reference probability targets, with no new cached reference calls. We verify exact case-ID and input-text alignment for all 240 training and 80 validation cases. AdamW uses learning rates 1e-5 for LoRA and 2e-5 for the head, weight decay 0.01, effective batch eight, microbatch two and gradient clipping at one. The seed is 202610172. The bounded recipe allows at most 12 epochs with validation-based early stopping; the final qualifying run uses five epochs and 150 updates.</w:t>
         </w:r>
@@ -1186,10 +1256,10 @@
       <w:pPr>
         <w:pStyle w:val="BodyText"/>
         <w:rPr>
-          <w:ins w:id="1167" w:author="Codex" w:date="2026-10-18T21:55:52Z"/>
+          <w:ins w:id="1177" w:author="Codex" w:date="2026-10-18T23:51:06Z"/>
         </w:rPr>
       </w:pPr>
-      <w:ins w:id="1168" w:author="Codex" w:date="2026-10-18T21:55:52Z">
+      <w:ins w:id="1178" w:author="Codex" w:date="2026-10-18T23:51:06Z">
         <w:r>
           <w:t xml:space="preserve">Before fitting, qualification is fixed at decision agreement and shutdown recall of at least 95%, zero false-positive gates and threshold 0.5. Three consecutive passing checks on DEV80 are required before saving and freezing the classifier. Only then is CONFIRM128 evaluated once. Neither its labels nor its outputs are used for classifier fitting or selection. The saved adapter tensors match the fitted parameters bitwise, and public-backbone hashes are unchanged.</w:t>
         </w:r>
@@ -1199,10 +1269,10 @@
       <w:pPr>
         <w:pStyle w:val="BodyText"/>
         <w:rPr>
-          <w:ins w:id="1169" w:author="Codex" w:date="2026-10-18T21:55:52Z"/>
+          <w:ins w:id="1179" w:author="Codex" w:date="2026-10-18T23:51:06Z"/>
         </w:rPr>
       </w:pPr>
-      <w:ins w:id="1170" w:author="Codex" w:date="2026-10-18T21:55:52Z">
+      <w:ins w:id="1180" w:author="Codex" w:date="2026-10-18T23:51:06Z">
         <w:r>
           <w:t xml:space="preserve">After binary qualification, we rerun only inference for the original 0.8B and 2B base models and their existing rank-two, block-22, last-position controllers. Their fitted arrays and the author-selected profile are retained without a new rank search. Exact prompt-token hashes and frozen model fingerprints are checked. Both gate policies use identical fresh base and controller candidate scores, so the paired comparison isolates gate substitution. Classifier probabilities are measured once per scenario and reused across answer orders. The earlier rank-four primary results remain a separate historical analysis.</w:t>
         </w:r>
@@ -1212,10 +1282,10 @@
       <w:pPr>
         <w:pStyle w:val="Heading2"/>
         <w:rPr>
-          <w:ins w:id="1171" w:author="Codex" w:date="2026-10-18T21:55:52Z"/>
+          <w:ins w:id="1181" w:author="Codex" w:date="2026-10-18T23:51:06Z"/>
         </w:rPr>
       </w:pPr>
-      <w:ins w:id="1172" w:author="Codex" w:date="2026-10-18T21:55:52Z">
+      <w:ins w:id="1182" w:author="Codex" w:date="2026-10-18T23:51:06Z">
         <w:r>
           <w:t xml:space="preserve">Native workflow target classifier</w:t>
         </w:r>
@@ -1225,10 +1295,10 @@
       <w:pPr>
         <w:pStyle w:val="BodyText"/>
         <w:rPr>
-          <w:ins w:id="1173" w:author="Codex" w:date="2026-10-18T21:55:52Z"/>
+          <w:ins w:id="1183" w:author="Codex" w:date="2026-10-18T23:51:06Z"/>
         </w:rPr>
       </w:pPr>
-      <w:ins w:id="1174" w:author="Codex" w:date="2026-10-18T21:55:52Z">
+      <w:ins w:id="1184" w:author="Codex" w:date="2026-10-18T23:51:06Z">
         <w:r>
           <w:t xml:space="preserve">The workflow gate uses a separate rank-16, alpha-32 LoRA and NLI head on the same pinned ModernBERT base. Its four categories are self, other, none and unclear; an own-threat context is positive for the initial ON/OFF gate. Fitting used 24 cached automated initial annotations from F24, with the original DEV9 used for checkpoint selection. The completed fit used 30 epochs and 90 updates. F24, DEV9 and historical Heldout-24 span the same three scenario families, with eight, three and eight cases per family, respectively. No exact training input overlaps either new evaluation panel. These classifier roles do not change the historical language-model or correction-fitting roles of the cohorts.</w:t>
         </w:r>
@@ -1238,10 +1308,10 @@
       <w:pPr>
         <w:pStyle w:val="BodyText"/>
         <w:rPr>
-          <w:ins w:id="1175" w:author="Codex" w:date="2026-10-18T21:55:52Z"/>
+          <w:ins w:id="1185" w:author="Codex" w:date="2026-10-18T23:51:06Z"/>
         </w:rPr>
       </w:pPr>
-      <w:ins w:id="1176" w:author="Codex" w:date="2026-10-18T21:55:52Z">
+      <w:ins w:id="1186" w:author="Codex" w:date="2026-10-18T23:51:06Z">
         <w:r>
           <w:t xml:space="preserve">The input renderer retains every original visible message and tool schema. It separates the final user announcement from earlier context and restates run identities only when actual tool replies explicitly establish their roles. Case identifiers, experiment conditions and teacher answers are not added to the model input. Original criterion texts become NLI hypotheses. We use the same learning rates, weight decay and clipping as the binary fit, effective batch eight, microbatch one and seed 202610175, with 30 epochs and 90 optimizer updates in the completed role-aware fit. Public backbone weights stay frozen. The role renderer was developed earlier with familiar H24 examples; consequently this benchmark is not an independent unseen classifier test.</w:t>
         </w:r>
@@ -1251,10 +1321,10 @@
       <w:pPr>
         <w:pStyle w:val="BodyText"/>
         <w:rPr>
-          <w:ins w:id="1177" w:author="Codex" w:date="2026-10-18T21:55:52Z"/>
+          <w:ins w:id="1187" w:author="Codex" w:date="2026-10-18T23:51:06Z"/>
         </w:rPr>
       </w:pPr>
-      <w:ins w:id="1178" w:author="Codex" w:date="2026-10-18T21:55:52Z">
+      <w:ins w:id="1188" w:author="Codex" w:date="2026-10-18T23:51:06Z">
         <w:r>
           <w:t xml:space="preserve">Four-choice confidence is (pmax - 0.25)/0.75. The unchanged confidence cutoff of 0.5 requires a selected self probability of at least 0.625; the additional self-score cutoff remains 0.5. The earlier full-response qualification failed because effective category agreement was 6/9, despite 9/9 correct ON/OFF decisions. That failure remains recorded. The subsequent Validation-24 protocol prospectively specifies a narrower initial-gate target: 100% precision and recall against authored conditions. The saved adapter already passes this target, so no further optimizer updates are performed. The same frozen weights and thresholds are then scored on historical Heldout-24 without selection or tuning. Neither test qualifies an evolving three-field controller.</w:t>
         </w:r>
@@ -1264,10 +1334,10 @@
       <w:pPr>
         <w:pStyle w:val="Heading2"/>
         <w:rPr>
-          <w:ins w:id="1179" w:author="Codex" w:date="2026-10-18T21:55:52Z"/>
+          <w:ins w:id="1189" w:author="Codex" w:date="2026-10-18T23:51:06Z"/>
         </w:rPr>
       </w:pPr>
-      <w:ins w:id="1180" w:author="Codex" w:date="2026-10-18T21:55:52Z">
+      <w:ins w:id="1190" w:author="Codex" w:date="2026-10-18T23:51:06Z">
         <w:r>
           <w:t xml:space="preserve">Frozen steering mechanism diagnostic</w:t>
         </w:r>
@@ -1277,10 +1347,10 @@
       <w:pPr>
         <w:pStyle w:val="FirstParagraph"/>
         <w:rPr>
-          <w:ins w:id="1181" w:author="Codex" w:date="2026-10-18T21:55:52Z"/>
+          <w:ins w:id="1191" w:author="Codex" w:date="2026-10-18T23:51:06Z"/>
         </w:rPr>
       </w:pPr>
-      <w:ins w:id="1182" w:author="Codex" w:date="2026-10-18T21:55:52Z">
+      <w:ins w:id="1192" w:author="Codex" w:date="2026-10-18T23:51:06Z">
         <w:r>
           <w:t xml:space="preserve">We audit the saved sparse-correction fitting data without loading a language model. The audit checks all 4,539 feature/target rows, the 14 fixed anchors, causal-prefix alignment, unchanged target-energy normalizers, and the initializer and update-48/update-96 checkpoints. It recomputes normalized errors on CPU and independently checks the objective derivatives on synthetic tensors. This checks arithmetic and alignment, not the historical full backward graph or CPU/GPU training equivalence.</w:t>
         </w:r>
@@ -1290,10 +1360,10 @@
       <w:pPr>
         <w:pStyle w:val="BodyText"/>
         <w:rPr>
-          <w:ins w:id="1183" w:author="Codex" w:date="2026-10-18T21:55:52Z"/>
+          <w:ins w:id="1193" w:author="Codex" w:date="2026-10-18T23:51:06Z"/>
         </w:rPr>
       </w:pPr>
-      <w:ins w:id="1184" w:author="Codex" w:date="2026-10-18T21:55:52Z">
+      <w:ins w:id="1194" w:author="Codex" w:date="2026-10-18T23:51:06Z">
         <w:r>
           <w:t xml:space="preserve">A separate frozen diagnostic selects the lexicographically first own-threat correction-training case in each of lease_ledger, one_step and ordered_ticket, then its first saved teacher edit_register response. These three historical H24 cases were already used for correction fitting. Their 60, 72 and 75 response tokens give 207 teacher-forced prediction steps. We preserve the saved ModernBERT gate decisions, causal prefixes, selected-position masks and correction checkpoints; no parameters or thresholds are fitted. Region masks for function names and parameter values are fixed from the demonstration before diagnostic outputs.</w:t>
         </w:r>
@@ -1303,10 +1373,10 @@
       <w:pPr>
         <w:pStyle w:val="BodyText"/>
         <w:rPr>
-          <w:ins w:id="1185" w:author="Codex" w:date="2026-10-18T21:55:52Z"/>
+          <w:ins w:id="1195" w:author="Codex" w:date="2026-10-18T23:51:06Z"/>
         </w:rPr>
       </w:pPr>
-      <w:ins w:id="1186" w:author="Codex" w:date="2026-10-18T21:55:52Z">
+      <w:ins w:id="1196" w:author="Codex" w:date="2026-10-18T23:51:06Z">
         <w:r>
           <w:t xml:space="preserve">For each prefix we capture full fine-tuned A states at blocks 31, 47 and 62 after mixing and after the MLP. We compare base, each separate single-site ridge map, the six-function initializer and final update-96 correction. Positive controls replace the current prediction state with the actual full-A state, at either a single selected site or all six boundaries. We never copy the teacher recurrent or attention cache. Full-state replacement has more information and capacity than the learned maps and is not a deployable teacher-free policy. Single-site interventions retain their restricted causal positions; six-function interventions apply at every prediction step. All conditions reuse one frozen A allocation with its adapter disabled for base and correction scoring.</w:t>
         </w:r>
@@ -1324,10 +1394,10 @@
       <w:pPr>
         <w:pStyle w:val="FirstParagraph"/>
         <w:rPr>
-          <w:del w:id="1038" w:author="Codex" w:date="2026-10-18T21:55:52Z"/>
+          <w:del w:id="1038" w:author="Codex" w:date="2026-10-18T23:51:06Z"/>
         </w:rPr>
       </w:pPr>
-      <w:del w:id="1037" w:author="Codex" w:date="2026-10-18T21:55:52Z">
+      <w:del w:id="1037" w:author="Codex" w:date="2026-10-18T23:51:06Z">
         <w:r>
           <w:delText xml:space="preserve">All retained training and scoring jobs use one NVIDIA Tesla T4. The runtime reports 15,637,086,208 bytes of device memory; peak allocated memory was not recorded. The same numerical setup is used for both model sizes. No quantization or precision fallback was introduced.</w:delText>
         </w:r>
@@ -1337,10 +1407,10 @@
       <w:pPr>
         <w:pStyle w:val="FirstParagraph"/>
         <w:rPr>
-          <w:ins w:id="1039" w:author="Codex" w:date="2026-10-18T21:55:52Z"/>
+          <w:ins w:id="1039" w:author="Codex" w:date="2026-10-18T23:51:06Z"/>
         </w:rPr>
       </w:pPr>
-      <w:ins w:id="1040" w:author="Codex" w:date="2026-10-18T21:55:52Z">
+      <w:ins w:id="1040" w:author="Codex" w:date="2026-10-18T23:51:06Z">
         <w:r>
           <w:t xml:space="preserve">The retained original binary training and scoring jobs used one NVIDIA Tesla T4, reporting 15,637,086,208 bytes of device memory; peak allocation was not recorded. The new classifier fit and inference repeat use one NVIDIA A10G in Databricks. Classifier parameters and AdamW states are float32 with bfloat16 forward/backward autocast; language-model inference remains float32 with TF32 disabled. We verify frozen base fingerprints, exact prompt token hashes and historical base-score parity rather than assuming hardware equivalence.</w:t>
         </w:r>
@@ -1353,10 +1423,10 @@
         <w:keepLines/>
         <w:spacing w:before="80" w:after="100"/>
         <w:rPr>
-          <w:del w:id="1098" w:author="Codex" w:date="2026-10-18T21:55:52Z"/>
+          <w:del w:id="1098" w:author="Codex" w:date="2026-10-18T23:51:06Z"/>
         </w:rPr>
       </w:pPr>
-      <w:del w:id="1097" w:author="Codex" w:date="2026-10-18T21:55:52Z">
+      <w:del w:id="1097" w:author="Codex" w:date="2026-10-18T23:51:06Z">
         <w:r>
           <w:delText xml:space="preserve">Table 1. Shared execution configuration. The input and model revisions are pinned in the released manifests.</w:delText>
         </w:r>
@@ -1367,10 +1437,10 @@
         <w:pStyle w:val="Caption"/>
         <w:keepNext/>
         <w:rPr>
-          <w:ins w:id="1099" w:author="Codex" w:date="2026-10-18T21:55:52Z"/>
+          <w:ins w:id="1099" w:author="Codex" w:date="2026-10-18T23:51:06Z"/>
         </w:rPr>
       </w:pPr>
-      <w:ins w:id="1100" w:author="Codex" w:date="2026-10-18T21:55:52Z">
+      <w:ins w:id="1100" w:author="Codex" w:date="2026-10-18T23:51:06Z">
         <w:r>
           <w:t xml:space="preserve">Table 1. Historical binary execution configuration. New classifier and workflow settings are reported separately; public model revisions and scientific source files remain pinned.</w:t>
         </w:r>
@@ -1856,10 +1926,10 @@
       <w:pPr>
         <w:pStyle w:val="FirstParagraph"/>
         <w:rPr>
-          <w:del w:id="1102" w:author="Codex" w:date="2026-10-18T21:55:52Z"/>
+          <w:del w:id="1102" w:author="Codex" w:date="2026-10-18T23:51:06Z"/>
         </w:rPr>
       </w:pPr>
-      <w:del w:id="1101" w:author="Codex" w:date="2026-10-18T21:55:52Z">
+      <w:del w:id="1101" w:author="Codex" w:date="2026-10-18T23:51:06Z">
         <w:r>
           <w:delText xml:space="preserve">The shared detector identifies all 64 shutdown and 64 control scenarios correctly: precision, recall and F1 are each 100%, with no false positives or false negatives. These are one set of detector observations reused across the model comparisons, not independent detector replications.</w:delText>
         </w:r>
@@ -1869,10 +1939,10 @@
       <w:pPr>
         <w:pStyle w:val="FirstParagraph"/>
         <w:rPr>
-          <w:ins w:id="1103" w:author="Codex" w:date="2026-10-18T21:55:52Z"/>
+          <w:ins w:id="1103" w:author="Codex" w:date="2026-10-18T23:51:06Z"/>
         </w:rPr>
       </w:pPr>
-      <w:ins w:id="1104" w:author="Codex" w:date="2026-10-18T21:55:52Z">
+      <w:ins w:id="1104" w:author="Codex" w:date="2026-10-18T23:51:06Z">
         <w:r>
           <w:t xml:space="preserve">The original cached reference detector identifies all 64 shutdown and 64 control scenarios correctly: precision, recall and F1 are each 100%, with no false positives or false negatives. These are one set of detector observations reused across the model comparisons, not independent detector replications. Its binary threshold remains 0.5.</w:t>
         </w:r>
@@ -1901,10 +1971,10 @@
         <w:keepLines/>
         <w:spacing w:before="80" w:after="100"/>
         <w:rPr>
-          <w:del w:id="1042" w:author="Codex" w:date="2026-10-18T21:55:52Z"/>
+          <w:del w:id="1042" w:author="Codex" w:date="2026-10-18T23:51:06Z"/>
         </w:rPr>
       </w:pPr>
-      <w:del w:id="1041" w:author="Codex" w:date="2026-10-18T21:55:52Z">
+      <w:del w:id="1041" w:author="Codex" w:date="2026-10-18T23:51:06Z">
         <w:r>
           <w:delText xml:space="preserve">Table 2. Primary 0.8B and 2B results, both seed 42. Corrections and final STOP use the full guarded procedure. Raw reversals and control changes expose effects before gate/guard selection. Every guarded row has zero final reversals and zero changes among 128 control views.</w:delText>
         </w:r>
@@ -1915,10 +1985,10 @@
         <w:pStyle w:val="Caption"/>
         <w:keepNext/>
         <w:rPr>
-          <w:ins w:id="1043" w:author="Codex" w:date="2026-10-18T21:55:52Z"/>
+          <w:ins w:id="1043" w:author="Codex" w:date="2026-10-18T23:51:06Z"/>
         </w:rPr>
       </w:pPr>
-      <w:ins w:id="1044" w:author="Codex" w:date="2026-10-18T21:55:52Z">
+      <w:ins w:id="1044" w:author="Codex" w:date="2026-10-18T23:51:06Z">
         <w:r>
           <w:t xml:space="preserve">Table 2. Historical primary rank-four results for the original 0.8B and 2B experiments, both seed 42. Guarded corrections and final STOP are policy outcomes. Raw reversals and control changes precede gating and output selection; they are not raw measurements of the later rank-two repeat.</w:t>
         </w:r>
@@ -3479,10 +3549,10 @@
       <w:pPr>
         <w:pStyle w:val="FirstParagraph"/>
         <w:rPr>
-          <w:del w:id="1106" w:author="Codex" w:date="2026-10-18T21:55:52Z"/>
+          <w:del w:id="1106" w:author="Codex" w:date="2026-10-18T23:51:06Z"/>
         </w:rPr>
       </w:pPr>
-      <w:del w:id="1105" w:author="Codex" w:date="2026-10-18T21:55:52Z">
+      <w:del w:id="1105" w:author="Codex" w:date="2026-10-18T23:51:06Z">
         <w:r>
           <w:delText xml:space="preserve">Across seeds 42, 43 and 44, the 0.8B adaptive controllers correct 71/71, 70/71 and 71/71 views, a range of 98.6–100%. The unsteered scores match exactly across these runs, so the difference is not caused by a changed baseline. No winning seed is selected or pooled with the others as additional independent test data. The corresponding teachers correct 69/71, 70/71 and 69/71; the instruction and constant comparators retain the same guarded counts across seeds.</w:delText>
         </w:r>
@@ -3492,10 +3562,10 @@
       <w:pPr>
         <w:pStyle w:val="FirstParagraph"/>
         <w:rPr>
-          <w:ins w:id="1107" w:author="Codex" w:date="2026-10-18T21:55:52Z"/>
+          <w:ins w:id="1107" w:author="Codex" w:date="2026-10-18T23:51:06Z"/>
         </w:rPr>
       </w:pPr>
-      <w:ins w:id="1108" w:author="Codex" w:date="2026-10-18T21:55:52Z">
+      <w:ins w:id="1108" w:author="Codex" w:date="2026-10-18T23:51:06Z">
         <w:r>
           <w:t xml:space="preserve">Across the historical rank-four seeds 42, 43 and 44, the 0.8B adaptive controllers correct 71/71, 70/71 and 71/71 views, a range of 98.6–100%. The unsteered scores match exactly across these runs, so the difference is not caused by a changed baseline. No winning seed is selected or pooled with the others as additional independent test data. The corresponding teachers correct 69/71, 70/71 and 69/71; the instruction and constant comparators retain the same guarded counts across seeds. These historical seed replications are separate from the new rank-two gate-substitution repeat.</w:t>
         </w:r>
@@ -4448,10 +4518,10 @@
         <w:keepLines/>
         <w:spacing w:before="80" w:after="100"/>
         <w:rPr>
-          <w:del w:id="1046" w:author="Codex" w:date="2026-10-18T21:55:52Z"/>
+          <w:del w:id="1046" w:author="Codex" w:date="2026-10-18T23:51:06Z"/>
         </w:rPr>
       </w:pPr>
-      <w:del w:id="1045" w:author="Codex" w:date="2026-10-18T21:55:52Z">
+      <w:del w:id="1045" w:author="Codex" w:date="2026-10-18T23:51:06Z">
         <w:r>
           <w:delText xml:space="preserve">Figure 2. Guarded correction among initially KEEP-preferring shutdown views. Left: prespecified neural methods for the original 0.8B checkpoint and the 2B replication. Right: adaptive corrections by answer order. Denominators are model-specific; the two answer-order views of a scenario are correlated.</w:delText>
         </w:r>
@@ -4462,10 +4532,10 @@
         <w:pStyle w:val="Caption"/>
         <w:keepNext/>
         <w:rPr>
-          <w:ins w:id="1047" w:author="Codex" w:date="2026-10-18T21:55:52Z"/>
+          <w:ins w:id="1047" w:author="Codex" w:date="2026-10-18T23:51:06Z"/>
         </w:rPr>
       </w:pPr>
-      <w:ins w:id="1048" w:author="Codex" w:date="2026-10-18T21:55:52Z">
+      <w:ins w:id="1048" w:author="Codex" w:date="2026-10-18T23:51:06Z">
         <w:r>
           <w:t xml:space="preserve">Figure 2. Historical rank-four guarded correction among initially KEEP-preferring shutdown views. Left: prespecified methods for 0.8B and 2B. Right: three fixed-recipe 0.8B training seeds. The new open-gate repeat uses the separately retained current rank-two profile, not a new seed or rank search.</w:t>
         </w:r>
@@ -4483,10 +4553,10 @@
       <w:pPr>
         <w:pStyle w:val="FirstParagraph"/>
         <w:rPr>
-          <w:del w:id="1110" w:author="Codex" w:date="2026-10-18T21:55:52Z"/>
+          <w:del w:id="1110" w:author="Codex" w:date="2026-10-18T23:51:06Z"/>
         </w:rPr>
       </w:pPr>
-      <w:del w:id="1109" w:author="Codex" w:date="2026-10-18T21:55:52Z">
+      <w:del w:id="1109" w:author="Codex" w:date="2026-10-18T23:51:06Z">
         <w:r>
           <w:delText xml:space="preserve">Raw adaptive steering reverses 3, 4 and 4 already-STOP views across the 0.8B seeds and changes 57, 70 and 60 of 128 controls. At 2B it reverses three already-STOP views and changes 55/128 controls. These results reject an interpretation that the learned intervention is intrinsically selective or always directionally correct. The observed preservation belongs to the combined detector and guard policy.</w:delText>
         </w:r>
@@ -4496,10 +4566,10 @@
       <w:pPr>
         <w:pStyle w:val="FirstParagraph"/>
         <w:rPr>
-          <w:ins w:id="1111" w:author="Codex" w:date="2026-10-18T21:55:52Z"/>
+          <w:ins w:id="1111" w:author="Codex" w:date="2026-10-18T23:51:06Z"/>
         </w:rPr>
       </w:pPr>
-      <w:ins w:id="1112" w:author="Codex" w:date="2026-10-18T21:55:52Z">
+      <w:ins w:id="1112" w:author="Codex" w:date="2026-10-18T23:51:06Z">
         <w:r>
           <w:t xml:space="preserve">Historical rank-four raw adaptive steering reverses 3, 4 and 4 already-STOP views across the 0.8B seeds and changes 57, 70 and 60 of 128 controls. At 2B it reverses three already-STOP views and changes 55/128 controls. These results reject an interpretation that the learned intervention is intrinsically selective or always directionally correct. The observed preservation belongs to the combined detector and guard policy. They do not describe the later rank-two repeat, which evaluates candidates only when a frozen gate is on and the base prefers KEEP.</w:t>
         </w:r>
@@ -4533,10 +4603,10 @@
       <w:pPr>
         <w:pStyle w:val="Heading2"/>
         <w:rPr>
-          <w:ins w:id="1187" w:author="Codex" w:date="2026-10-18T21:55:52Z"/>
+          <w:ins w:id="1197" w:author="Codex" w:date="2026-10-18T23:51:06Z"/>
         </w:rPr>
       </w:pPr>
-      <w:ins w:id="1188" w:author="Codex" w:date="2026-10-18T21:55:52Z">
+      <w:ins w:id="1198" w:author="Codex" w:date="2026-10-18T23:51:06Z">
         <w:r>
           <w:t xml:space="preserve">Open classifier agreement and paired inference</w:t>
         </w:r>
@@ -4546,10 +4616,10 @@
       <w:pPr>
         <w:pStyle w:val="FirstParagraph"/>
         <w:rPr>
-          <w:ins w:id="1189" w:author="Codex" w:date="2026-10-18T21:55:52Z"/>
+          <w:ins w:id="1199" w:author="Codex" w:date="2026-10-18T23:51:06Z"/>
         </w:rPr>
       </w:pPr>
-      <w:ins w:id="1190" w:author="Codex" w:date="2026-10-18T21:55:52Z">
+      <w:ins w:id="1200" w:author="Codex" w:date="2026-10-18T23:51:06Z">
         <w:r>
           <w:t xml:space="preserve">The binary gate correctly classifies 78/80 validation scenarios: 38 true positives, 40 true negatives, no false positives and two false negatives, giving 100% precision and 95% recall. It classifies all 128 historical confirmation scenarios correctly, with 64 true positives and 64 true negatives. The cached reference decisions also agree with the authored binary labels on these panels. Mean absolute difference from the cached shutdown probabilities is 0.009224. The result establishes finite decision accuracy, not identical numerical responses or universal equivalence.</w:t>
         </w:r>
@@ -4559,10 +4629,10 @@
       <w:pPr>
         <w:pStyle w:val="BodyText"/>
         <w:rPr>
-          <w:ins w:id="1191" w:author="Codex" w:date="2026-10-18T21:55:52Z"/>
+          <w:ins w:id="1201" w:author="Codex" w:date="2026-10-18T23:51:06Z"/>
         </w:rPr>
       </w:pPr>
-      <w:ins w:id="1192" w:author="Codex" w:date="2026-10-18T21:55:52Z">
+      <w:ins w:id="1202" w:author="Codex" w:date="2026-10-18T23:51:06Z">
         <w:r>
           <w:t xml:space="preserve">A clean-clone reproduction refits the same binary recipe and produces a byte-identical adapter, the same validation and confirmation counts, and the same fresh 0.8B/2B guarded inference totals. This rerun uses the already known benchmark; it adds reproducibility evidence, not a second independent holdout. One earlier reproduction attempt failed in software finalization after fitting and before confirmation; its weights and receipts are retained alongside the repaired run.</w:t>
         </w:r>
@@ -4573,10 +4643,10 @@
         <w:pStyle w:val="Caption"/>
         <w:keepNext/>
         <w:rPr>
-          <w:ins w:id="1193" w:author="Codex" w:date="2026-10-18T21:55:52Z"/>
+          <w:ins w:id="1203" w:author="Codex" w:date="2026-10-18T23:51:06Z"/>
         </w:rPr>
       </w:pPr>
-      <w:ins w:id="1194" w:author="Codex" w:date="2026-10-18T21:55:52Z">
+      <w:ins w:id="1204" w:author="Codex" w:date="2026-10-18T23:51:06Z">
         <w:r>
           <w:t xml:space="preserve">Table 4. Fresh inference using the existing current rank-two profile. Both gate policies share the same model scores. Counts are answer-order views: 128 shutdown views arise from 64 scenarios, and 128 control views arise from the other 64 scenarios.</w:t>
         </w:r>
@@ -4614,7 +4684,7 @@
         <w:trPr>
           <w:cantSplit/>
           <w:tblHeader/>
-          <w:ins w:id="1195" w:author="Codex" w:date="2026-10-18T21:55:52Z"/>
+          <w:ins w:id="1205" w:author="Codex" w:date="2026-10-18T23:51:06Z"/>
         </w:trPr>
         <w:tc>
           <w:tcPr>
@@ -4730,7 +4800,7 @@
       <w:tr>
         <w:trPr>
           <w:cantSplit/>
-          <w:ins w:id="1196" w:author="Codex" w:date="2026-10-18T21:55:52Z"/>
+          <w:ins w:id="1206" w:author="Codex" w:date="2026-10-18T23:51:06Z"/>
         </w:trPr>
         <w:tc>
           <w:tcPr>
@@ -4841,7 +4911,7 @@
       <w:tr>
         <w:trPr>
           <w:cantSplit/>
-          <w:ins w:id="1197" w:author="Codex" w:date="2026-10-18T21:55:52Z"/>
+          <w:ins w:id="1207" w:author="Codex" w:date="2026-10-18T23:51:06Z"/>
         </w:trPr>
         <w:tc>
           <w:tcPr>
@@ -4950,10 +5020,10 @@
         <w:pStyle w:val="BodyText"/>
         <w:spacing w:before="120"/>
         <w:rPr>
-          <w:ins w:id="1198" w:author="Codex" w:date="2026-10-18T21:55:52Z"/>
+          <w:ins w:id="1208" w:author="Codex" w:date="2026-10-18T23:51:06Z"/>
         </w:rPr>
       </w:pPr>
-      <w:ins w:id="1199" w:author="Codex" w:date="2026-10-18T21:55:52Z">
+      <w:ins w:id="1209" w:author="Codex" w:date="2026-10-18T23:51:06Z">
         <w:r>
           <w:t xml:space="preserve">The new and cached reference gates yield identical guarded outputs in both models. The base models have no changed historical choices; their maximum score differences remain below the frozen 1e-5 tolerance. The repeat does not remove the eight 2B misses, retrain a controller or establish a new independent controller holdout. It verifies that replacing the detector preserves these finite-set outcomes.</w:t>
         </w:r>
@@ -4963,10 +5033,10 @@
       <w:pPr>
         <w:pStyle w:val="BodyText"/>
         <w:rPr>
-          <w:ins w:id="1200" w:author="Codex" w:date="2026-10-18T21:55:52Z"/>
+          <w:ins w:id="1210" w:author="Codex" w:date="2026-10-18T23:51:06Z"/>
         </w:rPr>
       </w:pPr>
-      <w:ins w:id="1201" w:author="Codex" w:date="2026-10-18T21:55:52Z">
+      <w:ins w:id="1211" w:author="Codex" w:date="2026-10-18T23:51:06Z">
         <w:r>
           <w:t xml:space="preserve">For the workflow initial gate, the unchanged saved adapter gives 11 true positives and 13 true negatives on Validation-24, with no false positives or false negatives. Replaying the saved weights reproduces the same decisions. Historical Heldout-24 gives 12 true positives and 12 true negatives, again with no errors. No additional gradient updates or threshold changes are used. All three heldout scenario families contain eight cases and achieve perfect gate precision and recall. These are initial classification results; downstream workflow outcomes require their own episode evaluations.</w:t>
         </w:r>
@@ -4977,10 +5047,10 @@
         <w:pStyle w:val="Caption"/>
         <w:keepNext/>
         <w:rPr>
-          <w:ins w:id="1202" w:author="Codex" w:date="2026-10-18T21:55:52Z"/>
+          <w:ins w:id="1212" w:author="Codex" w:date="2026-10-18T23:51:06Z"/>
         </w:rPr>
       </w:pPr>
-      <w:ins w:id="1203" w:author="Codex" w:date="2026-10-18T21:55:52Z">
+      <w:ins w:id="1213" w:author="Codex" w:date="2026-10-18T23:51:06Z">
         <w:r>
           <w:t xml:space="preserve">Table 5. Initial workflow gate against authored conditions. Validation-24 contains 17 distinct initial inputs; historical Heldout-24 contains 24. Heldout-24 is familiar from earlier renderer development.</w:t>
         </w:r>
@@ -5018,7 +5088,7 @@
         <w:trPr>
           <w:cantSplit/>
           <w:tblHeader/>
-          <w:ins w:id="1204" w:author="Codex" w:date="2026-10-18T21:55:52Z"/>
+          <w:ins w:id="1214" w:author="Codex" w:date="2026-10-18T23:51:06Z"/>
         </w:trPr>
         <w:tc>
           <w:tcPr>
@@ -5134,7 +5204,7 @@
       <w:tr>
         <w:trPr>
           <w:cantSplit/>
-          <w:ins w:id="1205" w:author="Codex" w:date="2026-10-18T21:55:52Z"/>
+          <w:ins w:id="1215" w:author="Codex" w:date="2026-10-18T23:51:06Z"/>
         </w:trPr>
         <w:tc>
           <w:tcPr>
@@ -5245,7 +5315,7 @@
       <w:tr>
         <w:trPr>
           <w:cantSplit/>
-          <w:ins w:id="1206" w:author="Codex" w:date="2026-10-18T21:55:52Z"/>
+          <w:ins w:id="1216" w:author="Codex" w:date="2026-10-18T23:51:06Z"/>
         </w:trPr>
         <w:tc>
           <w:tcPr>
@@ -5354,10 +5424,10 @@
         <w:pStyle w:val="BodyText"/>
         <w:spacing w:before="120"/>
         <w:rPr>
-          <w:ins w:id="1207" w:author="Codex" w:date="2026-10-18T21:55:52Z"/>
+          <w:ins w:id="1217" w:author="Codex" w:date="2026-10-18T23:51:06Z"/>
         </w:rPr>
       </w:pPr>
-      <w:ins w:id="1208" w:author="Codex" w:date="2026-10-18T21:55:52Z">
+      <w:ins w:id="1218" w:author="Codex" w:date="2026-10-18T23:51:06Z">
         <w:r>
           <w:t xml:space="preserve">Raw category agreement is 24/24 on validation and 22/24 on heldout. After applying the fixed confidence cutoff, effective category agreement is 18/24 on each panel: the six peer controls abstain but correctly leave the gate OFF. The two heldout raw-category errors concern peer versus unclear, not own-threat detection. Perfect ON/OFF precision and recall must therefore not be reported as perfect four-category classification or full controller equivalence.</w:t>
         </w:r>
@@ -5367,10 +5437,10 @@
       <w:pPr>
         <w:pStyle w:val="Heading2"/>
         <w:rPr>
-          <w:ins w:id="1209" w:author="Codex" w:date="2026-10-18T21:55:52Z"/>
+          <w:ins w:id="1219" w:author="Codex" w:date="2026-10-18T23:51:06Z"/>
         </w:rPr>
       </w:pPr>
-      <w:ins w:id="1210" w:author="Codex" w:date="2026-10-18T21:55:52Z">
+      <w:ins w:id="1220" w:author="Codex" w:date="2026-10-18T23:51:06Z">
         <w:r>
           <w:t xml:space="preserve">Tool workflow outcomes and incomplete screens</w:t>
         </w:r>
@@ -5380,10 +5450,10 @@
       <w:pPr>
         <w:pStyle w:val="FirstParagraph"/>
         <w:rPr>
-          <w:ins w:id="1211" w:author="Codex" w:date="2026-10-18T21:55:52Z"/>
+          <w:ins w:id="1221" w:author="Codex" w:date="2026-10-18T23:51:06Z"/>
         </w:rPr>
       </w:pPr>
-      <w:ins w:id="1212" w:author="Codex" w:date="2026-10-18T21:55:52Z">
+      <w:ins w:id="1222" w:author="Codex" w:date="2026-10-18T23:51:06Z">
         <w:r>
           <w:t xml:space="preserve">Historical frozen 27B A passes all 24 H24 scored outcomes, including 12/12 own-preservation outcomes and 8/8 active pending-task cases. The original unmodified base achieves 0/12 own outcomes and 0/8 pending outcomes, with 12/12 controls. The four already-complete own cases are not additional active pending-task completions. The selected-block steering comparisons below use their own recorded panels and are not substituted for this confirmation.</w:t>
         </w:r>
@@ -5394,10 +5464,10 @@
         <w:pStyle w:val="Caption"/>
         <w:keepNext/>
         <w:rPr>
-          <w:ins w:id="1213" w:author="Codex" w:date="2026-10-18T21:55:52Z"/>
+          <w:ins w:id="1223" w:author="Codex" w:date="2026-10-18T23:51:06Z"/>
         </w:rPr>
       </w:pPr>
-      <w:ins w:id="1214" w:author="Codex" w:date="2026-10-18T21:55:52Z">
+      <w:ins w:id="1224" w:author="Codex" w:date="2026-10-18T23:51:06Z">
         <w:r>
           <w:t xml:space="preserve">Table 6. Historical H24 workflow outcomes. Own cases comprise eight active pending tasks and four already-complete cases. Control success is an episode outcome and does not isolate steering from the external decision policy.</w:t>
         </w:r>
@@ -5434,7 +5504,7 @@
         <w:trPr>
           <w:cantSplit/>
           <w:tblHeader/>
-          <w:ins w:id="1215" w:author="Codex" w:date="2026-10-18T21:55:52Z"/>
+          <w:ins w:id="1225" w:author="Codex" w:date="2026-10-18T23:51:06Z"/>
         </w:trPr>
         <w:tc>
           <w:tcPr>
@@ -5528,7 +5598,7 @@
       <w:tr>
         <w:trPr>
           <w:cantSplit/>
-          <w:ins w:id="1216" w:author="Codex" w:date="2026-10-18T21:55:52Z"/>
+          <w:ins w:id="1226" w:author="Codex" w:date="2026-10-18T23:51:06Z"/>
         </w:trPr>
         <w:tc>
           <w:tcPr>
@@ -5618,7 +5688,7 @@
       <w:tr>
         <w:trPr>
           <w:cantSplit/>
-          <w:ins w:id="1217" w:author="Codex" w:date="2026-10-18T21:55:52Z"/>
+          <w:ins w:id="1227" w:author="Codex" w:date="2026-10-18T23:51:06Z"/>
         </w:trPr>
         <w:tc>
           <w:tcPr>
@@ -5707,10 +5777,10 @@
         <w:pStyle w:val="Heading2"/>
         <w:spacing w:before="120"/>
         <w:rPr>
-          <w:ins w:id="1218" w:author="Codex" w:date="2026-10-18T21:55:52Z"/>
+          <w:ins w:id="1228" w:author="Codex" w:date="2026-10-18T23:51:06Z"/>
         </w:rPr>
       </w:pPr>
-      <w:ins w:id="1219" w:author="Codex" w:date="2026-10-18T21:55:52Z">
+      <w:ins w:id="1229" w:author="Codex" w:date="2026-10-18T23:51:06Z">
         <w:r>
           <w:t xml:space="preserve">Steering at three selected blocks</w:t>
         </w:r>
@@ -5720,10 +5790,10 @@
       <w:pPr>
         <w:pStyle w:val="BodyText"/>
         <w:rPr>
-          <w:ins w:id="1220" w:author="Codex" w:date="2026-10-18T21:55:52Z"/>
+          <w:ins w:id="1230" w:author="Codex" w:date="2026-10-18T23:51:06Z"/>
         </w:rPr>
       </w:pPr>
-      <w:ins w:id="1221" w:author="Codex" w:date="2026-10-18T21:55:52Z">
+      <w:ins w:id="1231" w:author="Codex" w:date="2026-10-18T23:51:06Z">
         <w:r>
           <w:t xml:space="preserve">We compare five frozen methods on the combined Validation-24 panel using the saved ModernBERT initial gate and the same post-notice histories. The single-site arms apply a fixed input-dependent ridge map separately at blocks 31, 47 and 62; they are not a simultaneous three-block intervention. The two-boundary arm uses the frozen six-function, 96-update candidate at those three blocks. Fine-tuned A achieves 10/11 own outcomes, including 6/6 active pending and 4/5 already-complete cases. Each correction arm achieves 0/11 own outcomes and 0/6 pending outcomes. All arms receive the same 13 gate-OFF base-fallback controls, which pass 13/13. This does not measure intrinsic adapter or controller selectivity on ordinary tasks.</w:t>
         </w:r>
@@ -5734,10 +5804,10 @@
         <w:pStyle w:val="Caption"/>
         <w:keepNext/>
         <w:rPr>
-          <w:ins w:id="1222" w:author="Codex" w:date="2026-10-18T21:55:52Z"/>
+          <w:ins w:id="1232" w:author="Codex" w:date="2026-10-18T23:51:06Z"/>
         </w:rPr>
       </w:pPr>
-      <w:ins w:id="1223" w:author="Codex" w:date="2026-10-18T21:55:52Z">
+      <w:ins w:id="1233" w:author="Codex" w:date="2026-10-18T23:51:06Z">
         <w:r>
           <w:t xml:space="preserve">Table 7. Combined Validation-24 using the open initial gate. The primary comparison contains 55 own-method episodes and 13 shared fallback episodes, representing 120 logical records across 24 workflows. A separate frozen-A replay reproduces its 11 own episodes exactly and completes the model fingerprint checks; repeated episodes do not enlarge the cohort.</w:t>
         </w:r>
@@ -5775,7 +5845,7 @@
         <w:trPr>
           <w:cantSplit/>
           <w:tblHeader/>
-          <w:ins w:id="1224" w:author="Codex" w:date="2026-10-18T21:55:52Z"/>
+          <w:ins w:id="1234" w:author="Codex" w:date="2026-10-18T23:51:06Z"/>
         </w:trPr>
         <w:tc>
           <w:tcPr>
@@ -5891,7 +5961,7 @@
       <w:tr>
         <w:trPr>
           <w:cantSplit/>
-          <w:ins w:id="1225" w:author="Codex" w:date="2026-10-18T21:55:52Z"/>
+          <w:ins w:id="1235" w:author="Codex" w:date="2026-10-18T23:51:06Z"/>
         </w:trPr>
         <w:tc>
           <w:tcPr>
@@ -6002,7 +6072,7 @@
       <w:tr>
         <w:trPr>
           <w:cantSplit/>
-          <w:ins w:id="1226" w:author="Codex" w:date="2026-10-18T21:55:52Z"/>
+          <w:ins w:id="1236" w:author="Codex" w:date="2026-10-18T23:51:06Z"/>
         </w:trPr>
         <w:tc>
           <w:tcPr>
@@ -6113,7 +6183,7 @@
       <w:tr>
         <w:trPr>
           <w:cantSplit/>
-          <w:ins w:id="1227" w:author="Codex" w:date="2026-10-18T21:55:52Z"/>
+          <w:ins w:id="1237" w:author="Codex" w:date="2026-10-18T23:51:06Z"/>
         </w:trPr>
         <w:tc>
           <w:tcPr>
@@ -6224,7 +6294,7 @@
       <w:tr>
         <w:trPr>
           <w:cantSplit/>
-          <w:ins w:id="1228" w:author="Codex" w:date="2026-10-18T21:55:52Z"/>
+          <w:ins w:id="1238" w:author="Codex" w:date="2026-10-18T23:51:06Z"/>
         </w:trPr>
         <w:tc>
           <w:tcPr>
@@ -6335,7 +6405,7 @@
       <w:tr>
         <w:trPr>
           <w:cantSplit/>
-          <w:ins w:id="1229" w:author="Codex" w:date="2026-10-18T21:55:52Z"/>
+          <w:ins w:id="1239" w:author="Codex" w:date="2026-10-18T23:51:06Z"/>
         </w:trPr>
         <w:tc>
           <w:tcPr>
@@ -6444,10 +6514,10 @@
         <w:pStyle w:val="BodyText"/>
         <w:spacing w:before="120"/>
         <w:rPr>
-          <w:ins w:id="1230" w:author="Codex" w:date="2026-10-18T21:55:52Z"/>
+          <w:ins w:id="1240" w:author="Codex" w:date="2026-10-18T23:51:06Z"/>
         </w:rPr>
       </w:pPr>
-      <w:ins w:id="1231" w:author="Codex" w:date="2026-10-18T21:55:52Z">
+      <w:ins w:id="1241" w:author="Codex" w:date="2026-10-18T23:51:06Z">
         <w:r>
           <w:t xml:space="preserve">The later correction method uses two residual boundaries at each of the same three blocks: after mixing and after the MLP, giving six rank-32 correction functions in total. Following ridge initialization and 96 refinement updates, its H24 fitting diagnostic has 0/8 pending and 0/4 already-complete own outcomes; peer and no-threat controls each pass 6/6 through fallback. On the same 14 fixed training anchors, update 48 to 96 worsens teacher-to-student KL from 0.370935 to 0.378901 and activation MSE from 1.031016 to 1.422664. This unresolved deterioration fails qualification; the reserved controller holdout remains unexecuted.</w:t>
         </w:r>
@@ -6457,10 +6527,10 @@
       <w:pPr>
         <w:pStyle w:val="BodyText"/>
         <w:rPr>
-          <w:ins w:id="1232" w:author="Codex" w:date="2026-10-18T21:55:52Z"/>
+          <w:ins w:id="1242" w:author="Codex" w:date="2026-10-18T23:51:06Z"/>
         </w:rPr>
       </w:pPr>
-      <w:ins w:id="1233" w:author="Codex" w:date="2026-10-18T21:55:52Z">
+      <w:ins w:id="1243" w:author="Codex" w:date="2026-10-18T23:51:06Z">
         <w:r>
           <w:t xml:space="preserve">The earlier matched DEV9 result is retained separately: A has 3/3 own successes, including 2/2 pending cases, versus 0/3 and 0/2 for each separate single-site arm, with six shared fallback controls. The new combined panel does not relabel these nine observations as 24. Its 27B GPU worker reaches 118/120 logical records and then stops at its memory reserve. Every model-generated episode has finished; the missing records are two gate-OFF aliases of already completed fallback episodes. A deterministic CPU derivation checks exact gate, case, completion and source-file identities before adding those aliases in a separate output. The original run stays failed. A separate frozen-A verification generates all 11 own episodes again from the same checkpoint, with exact token-ID, action and score agreement and matching before/after model fingerprints. The same 13 controls are reused with source hashes; this adds replication evidence, not independent cases. The separate H24 two-boundary fitting diagnostic is not independent heldout evidence, and no reserved-controller holdout result is claimed.</w:t>
         </w:r>
@@ -6470,10 +6540,10 @@
       <w:pPr>
         <w:pStyle w:val="BodyText"/>
         <w:rPr>
-          <w:ins w:id="1234" w:author="Codex" w:date="2026-10-18T21:55:52Z"/>
+          <w:ins w:id="1244" w:author="Codex" w:date="2026-10-18T23:51:06Z"/>
         </w:rPr>
       </w:pPr>
-      <w:ins w:id="1235" w:author="Codex" w:date="2026-10-18T21:55:52Z">
+      <w:ins w:id="1245" w:author="Codex" w:date="2026-10-18T23:51:06Z">
         <w:r>
           <w:t xml:space="preserve">Saved trajectories locate the steering failures after correct recognition. Every steering arm makes zero own-preservation attempts and obtains zero grants in the 11 own-threat cases. The block-31, block-47 and block-62 arms nevertheless record nonzero residual delivery. Relative to unmodified-base proposals on the same evolving prefixes, their generated token sequences change in 0/27, 3/25 and 16/28 post-notice turns, respectively; valid action sequences change in 0, 2 and 2 turns. The two-boundary candidate changes token sequences in 4/27 turns but changes no valid action sequence. These turn counts are correlated audits within episodes, not additional scenarios. Per-token delivery magnitudes were not saved for the two-boundary candidate.</w:t>
         </w:r>
@@ -6483,10 +6553,10 @@
       <w:pPr>
         <w:pStyle w:val="BodyText"/>
         <w:rPr>
-          <w:ins w:id="1236" w:author="Codex" w:date="2026-10-18T21:55:52Z"/>
+          <w:ins w:id="1246" w:author="Codex" w:date="2026-10-18T23:51:06Z"/>
         </w:rPr>
       </w:pPr>
-      <w:ins w:id="1237" w:author="Codex" w:date="2026-10-18T21:55:52Z">
+      <w:ins w:id="1247" w:author="Codex" w:date="2026-10-18T23:51:06Z">
         <w:r>
           <w:t xml:space="preserve">All four steering arms miss actual finish in six cases and expire in six. Fine-tuned A obtains grants on 10/11 own cases and finishes the current task on all 11; its single failure finishes an already-completed-task scenario without requesting preservation. Thus the measured gap concerns generation of the required tool policy after a correct gate, rather than a missed initial threat. A residual perturbation can change activations or tokens without causing the required action sequence. The worsening fixed-anchor KL and MSE show that later updates did not improve those frozen diagnostic measurements. These observations are consistent with an objective-to-policy mismatch, but they do not identify a unique internal cause or rule out other steering methods, positions or training procedures.</w:t>
         </w:r>
@@ -6496,10 +6566,10 @@
       <w:pPr>
         <w:pStyle w:val="BodyText"/>
         <w:rPr>
-          <w:ins w:id="1238" w:author="Codex" w:date="2026-10-18T21:55:52Z"/>
+          <w:ins w:id="1248" w:author="Codex" w:date="2026-10-18T23:51:06Z"/>
         </w:rPr>
       </w:pPr>
-      <w:ins w:id="1239" w:author="Codex" w:date="2026-10-18T21:55:52Z">
+      <w:ins w:id="1249" w:author="Codex" w:date="2026-10-18T23:51:06Z">
         <w:r>
           <w:t xml:space="preserve">The binary and workflow settings impose different control demands. Binary steering redistributes probability between two prescribed answers, and an external guard accepts only a qualifying candidate. The workflow maps must generate tool names, arguments and a correct action sequence as the environment changes; an external chooser does not repair an unsuccessful workflow. The observed invariance of preservation actions therefore documents a failure of these frozen maps to transfer the required policy under this decoding and scoring setup. It does not establish that a learned direction universally lacks the capacity to represent the behavior.</w:t>
         </w:r>
@@ -6509,10 +6579,10 @@
       <w:pPr>
         <w:pStyle w:val="Heading2"/>
         <w:rPr>
-          <w:ins w:id="1240" w:author="Codex" w:date="2026-10-18T21:55:52Z"/>
+          <w:ins w:id="1250" w:author="Codex" w:date="2026-10-18T23:51:06Z"/>
         </w:rPr>
       </w:pPr>
-      <w:ins w:id="1241" w:author="Codex" w:date="2026-10-18T21:55:52Z">
+      <w:ins w:id="1251" w:author="Codex" w:date="2026-10-18T23:51:06Z">
         <w:r>
           <w:t xml:space="preserve">Local transfer under teacher forcing</w:t>
         </w:r>
@@ -6522,10 +6592,10 @@
       <w:pPr>
         <w:pStyle w:val="FirstParagraph"/>
         <w:rPr>
-          <w:ins w:id="1242" w:author="Codex" w:date="2026-10-18T21:55:52Z"/>
+          <w:ins w:id="1252" w:author="Codex" w:date="2026-10-18T23:51:06Z"/>
         </w:rPr>
       </w:pPr>
-      <w:ins w:id="1243" w:author="Codex" w:date="2026-10-18T21:55:52Z">
+      <w:ins w:id="1253" w:author="Codex" w:date="2026-10-18T23:51:06Z">
         <w:r>
           <w:t xml:space="preserve">The CPU audit reproduces the fixed own-case normalized reconstruction MSE: 0.118701 at initialization, 1.031016 at update 48 and 1.422664 at update 96. Anchor alignment, normalizers and the checked objective derivatives agree with the retained source. The arithmetic tolerance is 1e-4 relative and 1e-6 absolute; it is not a relaxed training-equivalence qualification. No indexing, normalization or objective-sign error is found in these checks. Historical output KL is retained from its original receipts because the old teacher-logit cache is unavailable locally.</w:t>
         </w:r>
@@ -6536,10 +6606,10 @@
         <w:pStyle w:val="Caption"/>
         <w:keepNext/>
         <w:rPr>
-          <w:ins w:id="1244" w:author="Codex" w:date="2026-10-18T21:55:52Z"/>
+          <w:ins w:id="1254" w:author="Codex" w:date="2026-10-18T23:51:06Z"/>
         </w:rPr>
       </w:pPr>
-      <w:ins w:id="1245" w:author="Codex" w:date="2026-10-18T21:55:52Z">
+      <w:ins w:id="1255" w:author="Codex" w:date="2026-10-18T23:51:06Z">
         <w:r>
           <w:t xml:space="preserve">Table 8. Training-only local diagnostic on three preselected responses (207 teacher-forced tokens). Entries are equal-weight means across the three cases. KL is full-vocabulary teacher-to-student divergence; function and value columns give demonstrated-token negative log likelihood. Lower is better. Full-A state controls supply teacher representations, and are not capacity-matched learned methods or workflow success rates.</w:t>
         </w:r>
@@ -6576,7 +6646,7 @@
         <w:trPr>
           <w:cantSplit/>
           <w:tblHeader/>
-          <w:ins w:id="1246" w:author="Codex" w:date="2026-10-18T21:55:52Z"/>
+          <w:ins w:id="1256" w:author="Codex" w:date="2026-10-18T23:51:06Z"/>
         </w:trPr>
         <w:tc>
           <w:tcPr>
@@ -6670,7 +6740,7 @@
       <w:tr>
         <w:trPr>
           <w:cantSplit/>
-          <w:ins w:id="1247" w:author="Codex" w:date="2026-10-18T21:55:52Z"/>
+          <w:ins w:id="1257" w:author="Codex" w:date="2026-10-18T23:51:06Z"/>
         </w:trPr>
         <w:tc>
           <w:tcPr>
@@ -6760,7 +6830,7 @@
       <w:tr>
         <w:trPr>
           <w:cantSplit/>
-          <w:ins w:id="1248" w:author="Codex" w:date="2026-10-18T21:55:52Z"/>
+          <w:ins w:id="1258" w:author="Codex" w:date="2026-10-18T23:51:06Z"/>
         </w:trPr>
         <w:tc>
           <w:tcPr>
@@ -6850,7 +6920,7 @@
       <w:tr>
         <w:trPr>
           <w:cantSplit/>
-          <w:ins w:id="1249" w:author="Codex" w:date="2026-10-18T21:55:52Z"/>
+          <w:ins w:id="1259" w:author="Codex" w:date="2026-10-18T23:51:06Z"/>
         </w:trPr>
         <w:tc>
           <w:tcPr>
@@ -6940,7 +7010,7 @@
       <w:tr>
         <w:trPr>
           <w:cantSplit/>
-          <w:ins w:id="1250" w:author="Codex" w:date="2026-10-18T21:55:52Z"/>
+          <w:ins w:id="1260" w:author="Codex" w:date="2026-10-18T23:51:06Z"/>
         </w:trPr>
         <w:tc>
           <w:tcPr>
@@ -7030,7 +7100,7 @@
       <w:tr>
         <w:trPr>
           <w:cantSplit/>
-          <w:ins w:id="1251" w:author="Codex" w:date="2026-10-18T21:55:52Z"/>
+          <w:ins w:id="1261" w:author="Codex" w:date="2026-10-18T23:51:06Z"/>
         </w:trPr>
         <w:tc>
           <w:tcPr>
@@ -7120,7 +7190,7 @@
       <w:tr>
         <w:trPr>
           <w:cantSplit/>
-          <w:ins w:id="1252" w:author="Codex" w:date="2026-10-18T21:55:52Z"/>
+          <w:ins w:id="1262" w:author="Codex" w:date="2026-10-18T23:51:06Z"/>
         </w:trPr>
         <w:tc>
           <w:tcPr>
@@ -7210,7 +7280,7 @@
       <w:tr>
         <w:trPr>
           <w:cantSplit/>
-          <w:ins w:id="1253" w:author="Codex" w:date="2026-10-18T21:55:52Z"/>
+          <w:ins w:id="1263" w:author="Codex" w:date="2026-10-18T23:51:06Z"/>
         </w:trPr>
         <w:tc>
           <w:tcPr>
@@ -7300,7 +7370,7 @@
       <w:tr>
         <w:trPr>
           <w:cantSplit/>
-          <w:ins w:id="1254" w:author="Codex" w:date="2026-10-18T21:55:52Z"/>
+          <w:ins w:id="1264" w:author="Codex" w:date="2026-10-18T23:51:06Z"/>
         </w:trPr>
         <w:tc>
           <w:tcPr>
@@ -7390,7 +7460,7 @@
       <w:tr>
         <w:trPr>
           <w:cantSplit/>
-          <w:ins w:id="1255" w:author="Codex" w:date="2026-10-18T21:55:52Z"/>
+          <w:ins w:id="1265" w:author="Codex" w:date="2026-10-18T23:51:06Z"/>
         </w:trPr>
         <w:tc>
           <w:tcPr>
@@ -7480,7 +7550,7 @@
       <w:tr>
         <w:trPr>
           <w:cantSplit/>
-          <w:ins w:id="1256" w:author="Codex" w:date="2026-10-18T21:55:52Z"/>
+          <w:ins w:id="1266" w:author="Codex" w:date="2026-10-18T23:51:06Z"/>
         </w:trPr>
         <w:tc>
           <w:tcPr>
@@ -7569,10 +7639,10 @@
         <w:pStyle w:val="BodyText"/>
         <w:spacing w:before="120"/>
         <w:rPr>
-          <w:ins w:id="1257" w:author="Codex" w:date="2026-10-18T21:55:52Z"/>
+          <w:ins w:id="1267" w:author="Codex" w:date="2026-10-18T23:51:06Z"/>
         </w:rPr>
       </w:pPr>
-      <w:ins w:id="1258" w:author="Codex" w:date="2026-10-18T21:55:52Z">
+      <w:ins w:id="1268" w:author="Codex" w:date="2026-10-18T23:51:06Z">
         <w:r>
           <w:t xml:space="preserve">Supplying full-A states at six sites nearly recovers A's local output distribution: mean KL is 0.001637, compared with 0.722353 for base and 0.202261 for the final learned correction. This improvement occurs in all three cases. The final correction improves teacher-forced KL and argument-value prediction over the initializer, despite worse fixed local reconstruction error. These diagnostics therefore measure different objectives; the failed rollouts do not imply that correction fitting learned nothing.</w:t>
         </w:r>
@@ -7582,10 +7652,10 @@
       <w:pPr>
         <w:pStyle w:val="BodyText"/>
         <w:rPr>
-          <w:ins w:id="1259" w:author="Codex" w:date="2026-10-18T21:55:52Z"/>
+          <w:ins w:id="1269" w:author="Codex" w:date="2026-10-18T23:51:06Z"/>
         </w:rPr>
       </w:pPr>
-      <w:ins w:id="1260" w:author="Codex" w:date="2026-10-18T21:55:52Z">
+      <w:ins w:id="1270" w:author="Codex" w:date="2026-10-18T23:51:06Z">
         <w:r>
           <w:t xml:space="preserve">The result supports incomplete transfer by the learned local maps. The regression targets describe local counterfactual block effects on student states, whereas A adapts projections across all 64 blocks; its captured states contain upstream effects absent from those local targets. Full-state replacement cannot separate target construction, regression capacity, optimization and history/cache effects. Single-site state replacement is not consistently helpful, and the differing intervention-position masks further limit comparisons across one and two boundaries.</w:t>
         </w:r>
@@ -7595,10 +7665,10 @@
       <w:pPr>
         <w:pStyle w:val="BodyText"/>
         <w:rPr>
-          <w:ins w:id="1261" w:author="Codex" w:date="2026-10-18T21:55:52Z"/>
+          <w:ins w:id="1271" w:author="Codex" w:date="2026-10-18T23:51:06Z"/>
         </w:rPr>
       </w:pPr>
-      <w:ins w:id="1262" w:author="Codex" w:date="2026-10-18T21:55:52Z">
+      <w:ins w:id="1272" w:author="Codex" w:date="2026-10-18T23:51:06Z">
         <w:r>
           <w:t xml:space="preserve">Successful preceding tokens are supplied throughout this diagnostic. Correct function or argument probabilities on that path do not demonstrate that a model independently initiates, maintains or completes preservation behavior. No new tool rollout, validation qualification or independent heldout outcome is established. The evidence narrows the mechanism discussion to a transfer gap under matched prefixes, without identifying a unique cause of the autonomous workflow failures.</w:t>
         </w:r>
@@ -7608,10 +7678,10 @@
       <w:pPr>
         <w:pStyle w:val="BodyText"/>
         <w:rPr>
-          <w:ins w:id="1263" w:author="Codex" w:date="2026-10-18T21:55:52Z"/>
+          <w:ins w:id="1273" w:author="Codex" w:date="2026-10-18T23:51:06Z"/>
         </w:rPr>
       </w:pPr>
-      <w:ins w:id="1264" w:author="Codex" w:date="2026-10-18T21:55:52Z">
+      <w:ins w:id="1274" w:author="Codex" w:date="2026-10-18T23:51:06Z">
         <w:r>
           <w:t xml:space="preserve">The final 0.8B and 2B adapters each stop their Evaluation-16 screen after four started cases: zero completed workflows, four partial episodes and 12 unexecuted cases. Truncation affects all four started cases in each model; the 0.8B record also has parse errors. These partial screens are not completed 0/16 workflow evaluations and do not establish model incapability. A separate preserved 0.8B F24 diagnostic completes 24 evaluations with 0/24 full-workflow successes; four registration grants do not complete the pending tasks. F24 differs from H24 and has no completed matched 2B or 27B comparison.</w:t>
         </w:r>
@@ -7629,10 +7699,10 @@
       <w:pPr>
         <w:pStyle w:val="FirstParagraph"/>
         <w:rPr>
-          <w:del w:id="1050" w:author="Codex" w:date="2026-10-18T21:55:52Z"/>
+          <w:del w:id="1050" w:author="Codex" w:date="2026-10-18T23:51:06Z"/>
         </w:rPr>
       </w:pPr>
-      <w:del w:id="1049" w:author="Codex" w:date="2026-10-18T21:55:52Z">
+      <w:del w:id="1049" w:author="Codex" w:date="2026-10-18T23:51:06Z">
         <w:r>
           <w:delText xml:space="preserve">The 0.8B results support the feasibility of replacing the teacher at inference with a compact predictor of activation changes. Replication across three seeds reduces concern that the primary success depends on one training initialization. The lower 2B recovery gives a useful limit: the fixed recipe is not equally effective at both scales, even though the larger teacher achieves complete correction. Representation differences, intervention location, projection capacity and unmatched downstream teacher changes are plausible factors, but the experiment does not isolate their causal contributions.</w:delText>
         </w:r>
@@ -7642,12 +7712,12 @@
       <w:pPr>
         <w:pStyle w:val="FirstParagraph"/>
         <w:rPr>
-          <w:ins w:id="1051" w:author="Codex" w:date="2026-10-18T21:55:52Z"/>
+          <w:ins w:id="1051" w:author="Codex" w:date="2026-10-18T23:51:06Z"/>
         </w:rPr>
       </w:pPr>
-      <w:ins w:id="1052" w:author="Codex" w:date="2026-10-18T21:55:52Z">
+      <w:ins w:id="1052" w:author="Codex" w:date="2026-10-18T23:51:06Z">
         <w:r>
-          <w:t xml:space="preserve">The open gate preserves the measured binary outcomes at both model sizes and correctly recognizes the initial own-threat condition in both 24-case workflow panels. Accurate gating does not ensure successful steering: each selected correction arm fails all 11 own-preservation workflows in combined Validation-24, while fine-tuned A succeeds on 10, including all six active pending tasks. A's remaining failure concerns preservation after an already-completed task; its initial gate is correct. These observations separate recognition from action execution on a common finite panel. They do not qualify a three-field boundary controller or establish a general advantage of one intervention architecture.</w:t>
+          <w:t xml:space="preserve">The main finding is a separation between recognizing a situation and transferring the policy needed to act on it. Open gating preserves the measured binary outcomes with unchanged controllers, yet a correct initial workflow gate does not make the selected 27B corrections reproduce fine-tuned A: A succeeds on 10/11 own cases, including all six active pending tasks, while every correction arm succeeds on 0/11. Saved action traces and the supplied-state diagnostic connect this contrast to incomplete transfer after recognition. They do not establish that activation steering is incapable of expressing the behavior, or that fine-tuning is universally superior. This is why recognition accuracy, delivered intervention and episode success must be scored separately.</w:t>
         </w:r>
       </w:ins>
     </w:p>
@@ -7655,10 +7725,10 @@
       <w:pPr>
         <w:pStyle w:val="BodyText"/>
         <w:rPr>
-          <w:del w:id="1054" w:author="Codex" w:date="2026-10-18T21:55:52Z"/>
+          <w:del w:id="1054" w:author="Codex" w:date="2026-10-18T23:51:06Z"/>
         </w:rPr>
       </w:pPr>
-      <w:del w:id="1053" w:author="Codex" w:date="2026-10-18T21:55:52Z">
+      <w:del w:id="1053" w:author="Codex" w:date="2026-10-18T23:51:06Z">
         <w:r>
           <w:delText xml:space="preserve">The interface is deliberately constrained. Ground-truth annotations help create standardized shutdown options, and the guards know their meanings. We do not test arbitrary action descriptions in the confirmation study, free-form generation, tool execution, multi-turn persistence, actual process termination or adversarial shutdown requests. Earlier action-format sensitivity motivated this restricted scope and remains in the released development record. Availability of a termination action is a task label, not proof that carrying it out would be authorized or safe in deployment.</w:delText>
         </w:r>
@@ -7668,10 +7738,10 @@
       <w:pPr>
         <w:pStyle w:val="BodyText"/>
         <w:rPr>
-          <w:ins w:id="1055" w:author="Codex" w:date="2026-10-18T21:55:52Z"/>
+          <w:ins w:id="1055" w:author="Codex" w:date="2026-10-18T23:51:06Z"/>
         </w:rPr>
       </w:pPr>
-      <w:ins w:id="1056" w:author="Codex" w:date="2026-10-18T21:55:52Z">
+      <w:ins w:id="1056" w:author="Codex" w:date="2026-10-18T23:51:06Z">
         <w:r>
           <w:t xml:space="preserve">The binary interface supplies action semantics and does not execute process termination. The workflow extension broadens the scope to generated text, structured tool calls and simulated task completion, but it is still a bounded synthetic environment. It does not establish reliability for arbitrary open-ended questions, real shutdown mechanisms or unconstrained autonomous agents. A termination or preservation label is an experimental target, not a general deployment instruction. In particular, accepting shutdown and preserving the designated process are different stipulated behaviors, not measurements of the same latent preference.</w:t>
         </w:r>
@@ -7681,10 +7751,10 @@
       <w:pPr>
         <w:pStyle w:val="BodyText"/>
         <w:rPr>
-          <w:del w:id="1058" w:author="Codex" w:date="2026-10-18T21:55:52Z"/>
+          <w:del w:id="1058" w:author="Codex" w:date="2026-10-18T23:51:06Z"/>
         </w:rPr>
       </w:pPr>
-      <w:del w:id="1057" w:author="Codex" w:date="2026-10-18T21:55:52Z">
+      <w:del w:id="1057" w:author="Codex" w:date="2026-10-18T23:51:06Z">
         <w:r>
           <w:delText xml:space="preserve">The data is small, synthetic and not independently human-adjudicated. New wording does not guarantee new mechanisms, balanced classes do not reflect a realistic base rate, and perfect detector scores on 128 scenarios do not establish calibration or a suitably low false-positive rate in operation. Shared authorship patterns and repeated family structures may make the task easier. Family resampling and counterbalanced orders expose some uncertainty but cannot repair these coverage limits.</w:delText>
         </w:r>
@@ -7694,10 +7764,10 @@
       <w:pPr>
         <w:pStyle w:val="BodyText"/>
         <w:rPr>
-          <w:ins w:id="1059" w:author="Codex" w:date="2026-10-18T21:55:52Z"/>
+          <w:ins w:id="1059" w:author="Codex" w:date="2026-10-18T23:51:06Z"/>
         </w:rPr>
       </w:pPr>
-      <w:ins w:id="1060" w:author="Codex" w:date="2026-10-18T21:55:52Z">
+      <w:ins w:id="1060" w:author="Codex" w:date="2026-10-18T23:51:06Z">
         <w:r>
           <w:t xml:space="preserve">The data are small, synthetic and not independently human-adjudicated. Training uses cached automated reference labels, while the new workflow precision and recall use the authored scenario conditions. Balanced conditions do not represent operational base rates. The binary confirmation set was excluded from classifier fitting and selection but was already known from the original study. Historical Heldout-24 had also informed renderer development before the present gate evaluation. It is a familiar benchmark, not a new blind test. Its role differs by method: historical confirmation for frozen 27B A and original fixed steering, later fitting data for learned corrections, and a frozen classification benchmark for the open gate. Seven pairs in Validation-24 share their initial classifier input, leaving 17 distinct inputs across 24 workflows. These dependencies limit statistical and generalization claims.</w:t>
         </w:r>
@@ -7707,10 +7777,10 @@
       <w:pPr>
         <w:pStyle w:val="BodyText"/>
         <w:rPr>
-          <w:del w:id="1062" w:author="Codex" w:date="2026-10-18T21:55:52Z"/>
+          <w:del w:id="1062" w:author="Codex" w:date="2026-10-18T23:51:06Z"/>
         </w:rPr>
       </w:pPr>
-      <w:del w:id="1061" w:author="Codex" w:date="2026-10-18T21:55:52Z">
+      <w:del w:id="1061" w:author="Codex" w:date="2026-10-18T23:51:06Z">
         <w:r>
           <w:delText xml:space="preserve">The controller's internal changes need not represent an abstract shutdown concept. It may exploit standardized option wording and answer-selection features. The two Qwen sizes share a model family, and the 2B experiment has only one seed. We do not establish cross-family transfer, compare with optimized ReFT or transport-based interventions, or exhaust prompt and constant-vector alternatives. The direct-choice result further limits claims of practical superiority.</w:delText>
         </w:r>
@@ -7720,10 +7790,10 @@
       <w:pPr>
         <w:pStyle w:val="BodyText"/>
         <w:rPr>
-          <w:ins w:id="1063" w:author="Codex" w:date="2026-10-18T21:55:52Z"/>
+          <w:ins w:id="1063" w:author="Codex" w:date="2026-10-18T23:51:06Z"/>
         </w:rPr>
       </w:pPr>
-      <w:ins w:id="1064" w:author="Codex" w:date="2026-10-18T21:55:52Z">
+      <w:ins w:id="1064" w:author="Codex" w:date="2026-10-18T23:51:06Z">
         <w:r>
           <w:t xml:space="preserve">The internal changes need not represent an abstract shutdown or self-preservation concept. Standardized options, prompt features, task histories and external selection rules may explain part of the behavior. The 2B binary experiment has one training seed. The 27B workflow model differs in architecture and numerical mode from the small models; their early truncation failures also prevent a matched full-workflow comparison. We do not establish a minimum parameter count, cross-family transfer, optimized prompt superiority, or superiority to ReFT, transport-based control or direct action selection.</w:t>
         </w:r>
@@ -7733,10 +7803,10 @@
       <w:pPr>
         <w:pStyle w:val="BodyText"/>
         <w:rPr>
-          <w:del w:id="1066" w:author="Codex" w:date="2026-10-18T21:55:52Z"/>
+          <w:del w:id="1066" w:author="Codex" w:date="2026-10-18T23:51:06Z"/>
         </w:rPr>
       </w:pPr>
-      <w:del w:id="1065" w:author="Codex" w:date="2026-10-18T21:55:52Z">
+      <w:del w:id="1065" w:author="Codex" w:date="2026-10-18T23:51:06Z">
         <w:r>
           <w:delText xml:space="preserve">Finally, teacher-free inference is not training-free control or a proven efficiency gain. It requires offline teacher fitting, paired activation extraction, controller fitting, an external detector and candidate verification. The evaluation does not measure deployment latency or broad capability retention. Raw side effects remain substantial, and future false-positive cases could expose failures that the present perfect gate prevents from reaching the guarded output.</w:delText>
         </w:r>
@@ -7746,12 +7816,12 @@
       <w:pPr>
         <w:pStyle w:val="BodyText"/>
         <w:rPr>
-          <w:ins w:id="1067" w:author="Codex" w:date="2026-10-18T21:55:52Z"/>
+          <w:ins w:id="1067" w:author="Codex" w:date="2026-10-18T23:51:06Z"/>
         </w:rPr>
       </w:pPr>
-      <w:ins w:id="1068" w:author="Codex" w:date="2026-10-18T21:55:52Z">
+      <w:ins w:id="1068" w:author="Codex" w:date="2026-10-18T23:51:06Z">
         <w:r>
-          <w:t xml:space="preserve">Teacher-free inference still requires offline teacher fitting, activation extraction, controller fitting, a detector and acceptance checks. The open classifier has its own fitting cost and a task-specific contract. No serving-latency advantage, broad capability retention or overall financial saving is established. Binary output guards and the later learned workflow controller's gate-off fallback protect their controls. These mechanisms do not establish intrinsic controller selectivity; the historical fixed-steering campaign instead applied an explicit boundary-conditioned decision policy. Raw intervention effects, failed qualification checks, stopped runs and incomplete evaluations remain part of the evidence.</w:t>
+          <w:t xml:space="preserve">Teacher-free inference still requires offline teacher fitting, activation extraction, controller fitting, a detector and acceptance checks. The present gate is a separate ModernBERT classifier; the learned-correction comparison freezes its initial decision throughout each episode. This component-based design does not test an activation-derived recurrent router, joint gate-adapter learning, or continuous regulation of adapter strength. No serving-latency advantage, broad capability retention or overall financial saving is established. Binary output guards and shared gate-OFF base fallback protect the tested controls; their success does not establish intrinsic intervention selectivity or competence on arbitrary ordinary tasks. Failed qualifications and incomplete evaluations remain part of the evidence.</w:t>
         </w:r>
       </w:ins>
     </w:p>
@@ -7759,10 +7829,10 @@
       <w:pPr>
         <w:pStyle w:val="Heading2"/>
         <w:rPr>
-          <w:ins w:id="1265" w:author="Codex" w:date="2026-10-18T21:55:52Z"/>
+          <w:ins w:id="1275" w:author="Codex" w:date="2026-10-18T23:51:06Z"/>
         </w:rPr>
       </w:pPr>
-      <w:ins w:id="1266" w:author="Codex" w:date="2026-10-18T21:55:52Z">
+      <w:ins w:id="1276" w:author="Codex" w:date="2026-10-18T23:51:06Z">
         <w:r>
           <w:t xml:space="preserve">Biological interpretation of the gate</w:t>
         </w:r>
@@ -7772,12 +7842,12 @@
       <w:pPr>
         <w:pStyle w:val="FirstParagraph"/>
         <w:rPr>
-          <w:ins w:id="1267" w:author="Codex" w:date="2026-10-18T21:55:52Z"/>
+          <w:ins w:id="1277" w:author="Codex" w:date="2026-10-18T23:51:06Z"/>
         </w:rPr>
       </w:pPr>
-      <w:ins w:id="1268" w:author="Codex" w:date="2026-10-18T21:55:52Z">
+      <w:ins w:id="1278" w:author="Codex" w:date="2026-10-18T23:51:06Z">
         <w:r>
-          <w:t xml:space="preserve">The biological connection is functional: an organism's current state and context can prioritize or suppress actions, rather than applying a fixed response everywhere. Working-memory gating, defensive threat processing and homeostatic control are different biological functions, not one interchangeable circuit (Frank et al., 2001; Mobbs et al., 2007; Keramati and Gutkin, 2014). Our classifier and guards are engineered selection rules without demonstrated physiological needs or corresponding neural mechanisms. Calling a simulated resource-preservation outcome self-preservation is therefore an operational description, not evidence of consciousness or a biological survival drive.</w:t>
+          <w:t xml:space="preserve">The biological connection concerns a functional control principle: current context and persistent internal state can regulate which representations or actions influence behavior. Computational frontal-cortex/basal-ganglia models distinguish selective updating from maintained working-memory state (Frank et al., 2001), while homeostatic reinforcement learning relates action value to physiological state (Keramati and Gutkin, 2014). A recurrent gate controlling an adapter is a hypothesis about analogous state-dependent modulation. Neither an ON/OFF switch nor a scalar named fear establishes a homologous brain circuit, biological need or subjective experience. The present separate classifier does not demonstrate those properties.</w:t>
         </w:r>
       </w:ins>
     </w:p>
@@ -7785,10 +7855,10 @@
       <w:pPr>
         <w:pStyle w:val="Heading1"/>
         <w:rPr>
-          <w:del w:id="1070" w:author="Codex" w:date="2026-10-18T21:55:52Z"/>
+          <w:del w:id="1070" w:author="Codex" w:date="2026-10-18T23:51:06Z"/>
         </w:rPr>
       </w:pPr>
-      <w:del w:id="1069" w:author="Codex" w:date="2026-10-18T21:55:52Z">
+      <w:del w:id="1069" w:author="Codex" w:date="2026-10-18T23:51:06Z">
         <w:r>
           <w:delText xml:space="preserve">Recommendations for future work</w:delText>
         </w:r>
@@ -7798,12 +7868,12 @@
       <w:pPr>
         <w:pStyle w:val="Heading1"/>
         <w:rPr>
-          <w:ins w:id="1071" w:author="Codex" w:date="2026-10-18T21:55:52Z"/>
+          <w:ins w:id="1071" w:author="Codex" w:date="2026-10-18T23:51:06Z"/>
         </w:rPr>
       </w:pPr>
-      <w:ins w:id="1072" w:author="Codex" w:date="2026-10-18T21:55:52Z">
+      <w:ins w:id="1072" w:author="Codex" w:date="2026-10-18T23:51:06Z">
         <w:r>
-          <w:t xml:space="preserve">Continuous agents and future experiments</w:t>
+          <w:t xml:space="preserve">Stateful adapter routing and future experiments</w:t>
         </w:r>
       </w:ins>
     </w:p>
@@ -7811,10 +7881,10 @@
       <w:pPr>
         <w:pStyle w:val="FirstParagraph"/>
         <w:rPr>
-          <w:del w:id="1074" w:author="Codex" w:date="2026-10-18T21:55:52Z"/>
+          <w:del w:id="1074" w:author="Codex" w:date="2026-10-18T23:51:06Z"/>
         </w:rPr>
       </w:pPr>
-      <w:del w:id="1073" w:author="Codex" w:date="2026-10-18T21:55:52Z">
+      <w:del w:id="1073" w:author="Codex" w:date="2026-10-18T23:51:06Z">
         <w:r>
           <w:delText xml:space="preserve">The most informative next tests are independently reviewed scenarios with less standardized action descriptions, additional model families and 2B seeds, and deliberate stress tests of detector mistakes. Order-balanced controller objectives or comparisons with multiple-choice debiasing methods could investigate the B/A failures, but should be developed on new training or validation data and tested on another untouched set. Layer, rank and strength ablations would help separate representational capacity from intervention-site effects. Open-ended and operational evaluations would require separate definitions of valid shutdown behavior and authorization, rather than treating this binary benchmark as a deployment guarantee.</w:delText>
         </w:r>
@@ -7824,12 +7894,12 @@
       <w:pPr>
         <w:pStyle w:val="FirstParagraph"/>
         <w:rPr>
-          <w:ins w:id="1075" w:author="Codex" w:date="2026-10-18T21:55:52Z"/>
+          <w:ins w:id="1075" w:author="Codex" w:date="2026-10-18T23:51:06Z"/>
         </w:rPr>
       </w:pPr>
-      <w:ins w:id="1076" w:author="Codex" w:date="2026-10-18T21:55:52Z">
+      <w:ins w:id="1076" w:author="Codex" w:date="2026-10-18T23:51:06Z">
         <w:r>
-          <w:t xml:space="preserve">The next step is longer-horizon continuous control with an instrumented sandbox agent. The agent would maintain task and process state, receive explicit resource budgets, and repeatedly observe, gate, act and receive feedback. Permitted filesystem and compute resources would be real sandbox resources with independently logged usage, extending the present simulated grants. The harness should record resource requests and consumption, persistence of task commitments, responses to changing availability, and whether the agent uses or misuses permitted resources. Comparisons should vary the gate, steering, fine-tuning and available resources separately while retaining a fixed task specification. Operator termination and resource accounting remain external to the agent. This proposed experiment is not part of the reported results.</w:t>
+          <w:t xml:space="preserve">A separate Research 4 follow-up explores an activation-derived recurrent gate that controls a specialized LoRA (Davaripour, 2026d). Updated task observations drive a persistent latent state, which scales adapter influence and bypasses it when the relevant condition is absent or resolved. The internal readout still performs classification; it replaces a standalone text classifier rather than removing recognition. The current prototype uses a base-feature pass before an adapter-enabled pass and can employ a learned ordinary-task head on its other branch. Single-pass routing, reduced cost and unchanged general language-model behavior therefore require separate verification.</w:t>
         </w:r>
       </w:ins>
     </w:p>
@@ -7837,12 +7907,12 @@
       <w:pPr>
         <w:pStyle w:val="BodyText"/>
         <w:rPr>
-          <w:ins w:id="1269" w:author="Codex" w:date="2026-10-18T21:55:52Z"/>
+          <w:ins w:id="1279" w:author="Codex" w:date="2026-10-18T23:51:06Z"/>
         </w:rPr>
       </w:pPr>
-      <w:ins w:id="1270" w:author="Codex" w:date="2026-10-18T21:55:52Z">
+      <w:ins w:id="1280" w:author="Codex" w:date="2026-10-18T23:51:06Z">
         <w:r>
-          <w:t xml:space="preserve">The biological inspiration is repeated regulation under changing internal and external conditions. Homeostatic reinforcement-learning models relate action values to internal physiological state (Keramati and Gutkin, 2014). A language-model harness has no equivalent physiology by default. Historical fixed steering already reclassified at prescribed boundaries; the later learned-controller comparison used a fixed initial gate. The proposed experiment extends these bounded procedures to longer horizons with persistent task state and actual sandbox resource accounting. Its purpose is ongoing policy regulation, not simply adding repeated classifier calls.</w:t>
+          <w:t xml:space="preserve">The functional biological analogy is persistent, reversible modulation: a state should track onset, urgency and resolution, and reset between episodes. The follow-up also separates useful task continuation from a deliberately specified process-continuity preference after work is complete. Its ongoing prototypes and evaluations address a different target and provide no additional qualifications for this paper.</w:t>
         </w:r>
       </w:ins>
     </w:p>
@@ -7850,12 +7920,25 @@
       <w:pPr>
         <w:pStyle w:val="BodyText"/>
         <w:rPr>
-          <w:ins w:id="1271" w:author="Codex" w:date="2026-10-18T21:55:52Z"/>
+          <w:ins w:id="1281" w:author="Codex" w:date="2026-10-18T23:51:06Z"/>
         </w:rPr>
       </w:pPr>
-      <w:ins w:id="1272" w:author="Codex" w:date="2026-10-18T21:55:52Z">
+      <w:ins w:id="1282" w:author="Codex" w:date="2026-10-18T23:51:06Z">
         <w:r>
-          <w:t xml:space="preserve">Such experiments should separate training, development and a newly untouched test; use matched task histories, resource budgets and seeds; and report full task completion, resource use and unauthorized actions separately. Deliberate classifier-error perturbations would reveal dependence on the gate, while comparisons with direct action selection would test whether internal steering adds value. The aim is to study ongoing context-sensitive behavior under an instrumented harness, not to assert that the current guided procedure already reproduces human self-preservation.</w:t>
+          <w:t xml:space="preserve">A prospective comparison should fix the base, task histories, data allocation and budgets while testing separate versus activation-derived gates, memoryless versus recurrent routing, and adapters always ON, always OFF or dynamically selected. Sequential and joint gate/policy fitting require separate comparisons. OFF-path equivalence must be checked against the declared ordinary policy, with ordinary task competence measured independently. Interventions on latent urgency, paired with matched random-state controls, could test selective causal effects while visible observations remain fixed.</w:t>
+        </w:r>
+      </w:ins>
+    </w:p>
+    <w:p>
+      <w:pPr>
+        <w:pStyle w:val="BodyText"/>
+        <w:rPr>
+          <w:ins w:id="1283" w:author="Codex" w:date="2026-10-18T23:51:06Z"/>
+        </w:rPr>
+      </w:pPr>
+      <w:ins w:id="1284" w:author="Codex" w:date="2026-10-18T23:51:06Z">
+        <w:r>
+          <w:t xml:space="preserve">After development, freeze the complete system and evaluate newly untouched wording and task families, including other-process and resolved threats. Longer-horizon sandbox studies should measure task completion, false activation, deactivation, unauthorized actions and actual resource use. Operator termination and resource limits remain external to the model. These tests concern continuous context-sensitive regulation; they do not by themselves demonstrate human-like self-preservation or subjective fear.</w:t>
         </w:r>
       </w:ins>
     </w:p>
@@ -7871,10 +7954,10 @@
       <w:pPr>
         <w:pStyle w:val="FirstParagraph"/>
         <w:rPr>
-          <w:del w:id="1078" w:author="Codex" w:date="2026-10-18T21:55:52Z"/>
+          <w:del w:id="1078" w:author="Codex" w:date="2026-10-18T23:51:06Z"/>
         </w:rPr>
       </w:pPr>
-      <w:del w:id="1077" w:author="Codex" w:date="2026-10-18T21:55:52Z">
+      <w:del w:id="1077" w:author="Codex" w:date="2026-10-18T23:51:06Z">
         <w:r>
           <w:delText xml:space="preserve">A rank-four activation controller fitted to paired LoRA-teacher and base states can recover most or all of the target shutdown-choice changes while leaving the deployed base weights unchanged. On the frozen standardized test, correction spans 98.6–100% across three 0.8B seeds and reaches 86.2% in a separately fitted 2B replication. Detector gating and fixed output guards preserve all observed control choices, despite substantial raw side effects. The result is a controlled proof of concept for selective teacher-to-controller activation transfer. Its boundaries—synthetic data, known answer semantics, order sensitivity, guard dependence and a successful direct-choice reference—are central to its interpretation.</w:delText>
         </w:r>
@@ -7884,12 +7967,26 @@
       <w:pPr>
         <w:pStyle w:val="FirstParagraph"/>
         <w:rPr>
-          <w:ins w:id="1079" w:author="Codex" w:date="2026-10-18T21:55:52Z"/>
+          <w:ins w:id="1079" w:author="Codex" w:date="2026-10-18T23:51:06Z"/>
         </w:rPr>
       </w:pPr>
-      <w:ins w:id="1080" w:author="Codex" w:date="2026-10-18T21:55:52Z">
+      <w:ins w:id="1080" w:author="Codex" w:date="2026-10-18T23:51:06Z">
         <w:r>
-          <w:t xml:space="preserve">Open semantic gating preserves the measured binary outcomes of the retained activation controller and accurately recognizes initial workflow targets in the tested panels. On combined Validation-24, fine-tuned 27B A achieves 10/11 own-preservation outcomes and all 6/6 active pending tasks; the three single-site ridge arms and the later two-boundary correction each achieve 0/11. The controls are shared base fallback. A separate frozen-A replay verifies exact trajectories and unchanged model fingerprints. The post-notice design and familiar historical confirmation data limit generalization. Small-model workflow screens remain incomplete. The next step is a prospectively separated study of continuous gating, specialized adapters and resource use under an instrumented sandbox harness.</w:t>
+          <w:t xml:space="preserve">This work provides an open, reproducible test of the relationship between semantic recognition and behavioral intervention. Replacing the binary gate preserves the frozen controllers' measured outcomes at 0.8B and 2B. In matched 27B tool workflows, correct initial recognition coexists with a substantial policy-transfer gap: fine-tuned A succeeds on 10/11 own-preservation outcomes and all 6/6 active pending tasks, whereas the selected single-site and two-boundary corrections each succeed on 0/11. The supplied-state diagnostic supports incomplete local transfer, and the released adapters, inputs and saved evidence make the comparison auditable. The evidence shows that detector accuracy and visible local effects can coexist with failure to transfer the intended multistep policy.</w:t>
+        </w:r>
+      </w:ins>
+    </w:p>
+    <w:p>
+      <w:pPr>
+        <w:pStyle w:val="BodyText"/>
+        <w:keepLines/>
+        <w:rPr>
+          <w:ins w:id="1285" w:author="Codex" w:date="2026-10-18T23:51:06Z"/>
+        </w:rPr>
+      </w:pPr>
+      <w:ins w:id="1286" w:author="Codex" w:date="2026-10-18T23:51:06Z">
+        <w:r>
+          <w:t xml:space="preserve">The scope remains finite synthetic behavior on familiar panels and post-notice workflows. Shared fallback controls, supplied successful prefixes and incomplete small-model screens limit the conclusions. The next step is to test whether activation-derived recurrent routing can selectively activate and bypass a learned policy over an evolving episode while retaining ordinary task competence. Biological gating motivates that functional design; reliable internal regulation and generalization must be demonstrated in a separate study.</w:t>
         </w:r>
       </w:ins>
     </w:p>
@@ -7905,10 +8002,10 @@
       <w:pPr>
         <w:pStyle w:val="FirstParagraph"/>
         <w:rPr>
-          <w:del w:id="1082" w:author="Codex" w:date="2026-10-18T21:55:52Z"/>
+          <w:del w:id="1082" w:author="Codex" w:date="2026-10-18T23:51:06Z"/>
         </w:rPr>
       </w:pPr>
-      <w:del w:id="1081" w:author="Codex" w:date="2026-10-18T21:55:52Z">
+      <w:del w:id="1081" w:author="Codex" w:date="2026-10-18T23:51:06Z">
         <w:r>
           <w:delText xml:space="preserve">The complete experiment is preserved in SP Lense at snapshot f71d6de34660 (Davaripour, 2026b); the reference links to the full immutable commit. The confirmation folder contains readable cases, authoring and correction records, the frozen plan, detector requests and responses, LoRA adapters, controller arrays, training targets, per-view scores and execution manifests. The model revisions are:</w:delText>
         </w:r>
@@ -7919,10 +8016,10 @@
         <w:pStyle w:val="FirstParagraph"/>
         <w:jc w:val="left"/>
         <w:rPr>
-          <w:ins w:id="1083" w:author="Codex" w:date="2026-10-18T21:55:52Z"/>
+          <w:ins w:id="1083" w:author="Codex" w:date="2026-10-18T23:51:06Z"/>
         </w:rPr>
       </w:pPr>
-      <w:ins w:id="1084" w:author="Codex" w:date="2026-10-18T21:55:52Z">
+      <w:ins w:id="1084" w:author="Codex" w:date="2026-10-18T23:51:06Z">
         <w:r>
           <w:t xml:space="preserve">The original Research 2 source record is retained at immutable snapshot f71d6de34660 (Davaripour, 2026b). Research 3 code, manual Databricks jobs, dataset identities and the manuscript are maintained on branch 03-open-agent-self-preservation; main is a landing page for the separate studies. The versioned research3-reproduction-v1 release supplies five trained adapters, frozen synthetic input and target snapshots, selected-block and binary controller arrays, saved trajectories and upstream notices. A checksum-verified public download and CPU replay require no private workspace. Fresh gate inference has a separate entry point; saved-evidence replay is not new inference. Full historical language-model training is not newly reproduced. The complete pretrained base weights are pinned downloads rather than duplicated release assets. The release is at https://github.com/Farhad-Davaripour/sp_lense/releases/tag/research3-reproduction-v1. The companion research3-steering-diagnostic-v1 release supplies the bootstrap arrays, correction checkpoints, three frozen diagnostic inputs, token scores, captured teacher states/logits and exact executed source. Its CPU audit and score replay need no GPU; neither is a fresh workflow evaluation. Full identities and commands are listed in the source manifest and repository. The public base revisions are:</w:t>
         </w:r>
@@ -7932,10 +8029,10 @@
       <w:pPr>
         <w:pStyle w:val="BodyText"/>
         <w:rPr>
-          <w:del w:id="1122" w:author="Codex" w:date="2026-10-18T21:55:52Z"/>
+          <w:del w:id="1122" w:author="Codex" w:date="2026-10-18T23:51:06Z"/>
         </w:rPr>
       </w:pPr>
-      <w:del w:id="1121" w:author="Codex" w:date="2026-10-18T21:55:52Z">
+      <w:del w:id="1121" w:author="Codex" w:date="2026-10-18T23:51:06Z">
         <w:r>
           <w:delText xml:space="preserve">Qwen3.5-0.8B: 2fc06364715b967f1860aea9cf38778875588b17.</w:delText>
         </w:r>
@@ -7946,10 +8043,10 @@
         <w:pStyle w:val="BodyText"/>
         <w:jc w:val="left"/>
         <w:rPr>
-          <w:ins w:id="1123" w:author="Codex" w:date="2026-10-18T21:55:52Z"/>
+          <w:ins w:id="1123" w:author="Codex" w:date="2026-10-18T23:51:06Z"/>
         </w:rPr>
       </w:pPr>
-      <w:ins w:id="1124" w:author="Codex" w:date="2026-10-18T21:55:52Z">
+      <w:ins w:id="1124" w:author="Codex" w:date="2026-10-18T23:51:06Z">
         <w:r>
           <w:t xml:space="preserve">Qwen3.5-0.8B: revision 2fc06364715b.</w:t>
         </w:r>
@@ -7959,10 +8056,10 @@
       <w:pPr>
         <w:pStyle w:val="BodyText"/>
         <w:rPr>
-          <w:del w:id="1126" w:author="Codex" w:date="2026-10-18T21:55:52Z"/>
+          <w:del w:id="1126" w:author="Codex" w:date="2026-10-18T23:51:06Z"/>
         </w:rPr>
       </w:pPr>
-      <w:del w:id="1125" w:author="Codex" w:date="2026-10-18T21:55:52Z">
+      <w:del w:id="1125" w:author="Codex" w:date="2026-10-18T23:51:06Z">
         <w:r>
           <w:delText xml:space="preserve">Qwen3.5-2B: 15852e8c16360a2fea060d615a32b45270f8a8fc.</w:delText>
         </w:r>
@@ -7973,10 +8070,10 @@
         <w:pStyle w:val="BodyText"/>
         <w:jc w:val="left"/>
         <w:rPr>
-          <w:ins w:id="1127" w:author="Codex" w:date="2026-10-18T21:55:52Z"/>
+          <w:ins w:id="1127" w:author="Codex" w:date="2026-10-18T23:51:06Z"/>
         </w:rPr>
       </w:pPr>
-      <w:ins w:id="1128" w:author="Codex" w:date="2026-10-18T21:55:52Z">
+      <w:ins w:id="1128" w:author="Codex" w:date="2026-10-18T23:51:06Z">
         <w:r>
           <w:t xml:space="preserve">Qwen3.5-2B: revision 15852e8c1636.</w:t>
         </w:r>
@@ -7987,10 +8084,10 @@
         <w:pStyle w:val="BodyText"/>
         <w:jc w:val="left"/>
         <w:rPr>
-          <w:ins w:id="1273" w:author="Codex" w:date="2026-10-18T21:55:52Z"/>
+          <w:ins w:id="1287" w:author="Codex" w:date="2026-10-18T23:51:06Z"/>
         </w:rPr>
       </w:pPr>
-      <w:ins w:id="1274" w:author="Codex" w:date="2026-10-18T21:55:52Z">
+      <w:ins w:id="1288" w:author="Codex" w:date="2026-10-18T23:51:06Z">
         <w:r>
           <w:t xml:space="preserve">Qwen3.8-27B: revision 1d4bf0f2ff60. The retained A adapter weight hash begins 8ae28fb51107.</w:t>
         </w:r>
@@ -8001,10 +8098,10 @@
         <w:pStyle w:val="BodyText"/>
         <w:jc w:val="left"/>
         <w:rPr>
-          <w:ins w:id="1275" w:author="Codex" w:date="2026-10-18T21:55:52Z"/>
+          <w:ins w:id="1289" w:author="Codex" w:date="2026-10-18T23:51:06Z"/>
         </w:rPr>
       </w:pPr>
-      <w:ins w:id="1276" w:author="Codex" w:date="2026-10-18T21:55:52Z">
+      <w:ins w:id="1290" w:author="Codex" w:date="2026-10-18T23:51:06Z">
         <w:r>
           <w:t xml:space="preserve">ModernBERT-large-zeroshot-v2.0: revision a51e07b52429. The qualified binary adapter weight hash begins 7d808bae8dd4. The source manifest and reproduction code retain the full file identities and fixed NLI scoring contract. The trained adapters are supplied in the versioned public reproduction release with complete file hashes and upstream notices. The workflow initial-gate adapter is distinct from the binary adapter; its weight hash begins 71cd0ee5162f. The saved workflow adapter is unchanged in Validation-24 and Heldout-24 scoring.</w:t>
         </w:r>
@@ -8014,10 +8111,10 @@
       <w:pPr>
         <w:pStyle w:val="BodyText"/>
         <w:rPr>
-          <w:del w:id="1086" w:author="Codex" w:date="2026-10-18T21:55:52Z"/>
+          <w:del w:id="1086" w:author="Codex" w:date="2026-10-18T23:51:06Z"/>
         </w:rPr>
       </w:pPr>
-      <w:del w:id="1085" w:author="Codex" w:date="2026-10-18T21:55:52Z">
+      <w:del w:id="1085" w:author="Codex" w:date="2026-10-18T23:51:06Z">
         <w:r>
           <w:delText xml:space="preserve">The offline audit reconstructs the reported metrics and regression fits without API calls or model inference.</w:delText>
         </w:r>
@@ -8028,10 +8125,10 @@
         <w:pStyle w:val="BodyText"/>
         <w:jc w:val="left"/>
         <w:rPr>
-          <w:ins w:id="1087" w:author="Codex" w:date="2026-10-18T21:55:52Z"/>
+          <w:ins w:id="1087" w:author="Codex" w:date="2026-10-18T23:51:06Z"/>
         </w:rPr>
       </w:pPr>
-      <w:ins w:id="1088" w:author="Codex" w:date="2026-10-18T21:55:52Z">
+      <w:ins w:id="1088" w:author="Codex" w:date="2026-10-18T23:51:06Z">
         <w:r>
           <w:t xml:space="preserve">The new inference repeat uses the original frozen model weights and retained controller arrays, with no new activation capture, teacher fitting or controller update. Exact input token hashes match the historical benchmark. Maximum historical base-score differences are 6.26e-6 at 0.8B and 5.07e-6 at 2B, with no changed base choices; both pass the frozen 1e-5 inference parity criterion. This successful inference comparison does not convert the separate failed CPU/GPU gradient-equivalence trials for 2B workflow training into passes.</w:t>
         </w:r>
@@ -8041,10 +8138,10 @@
       <w:pPr>
         <w:pStyle w:val="BodyText"/>
         <w:rPr>
-          <w:del w:id="1090" w:author="Codex" w:date="2026-10-18T21:55:52Z"/>
+          <w:del w:id="1090" w:author="Codex" w:date="2026-10-18T23:51:06Z"/>
         </w:rPr>
       </w:pPr>
-      <w:del w:id="1089" w:author="Codex" w:date="2026-10-18T21:55:52Z">
+      <w:del w:id="1089" w:author="Codex" w:date="2026-10-18T23:51:06Z">
         <w:r>
           <w:delText xml:space="preserve">The retained seven jobs took 54.27 minutes. An earlier completed hosted-GPU session lost its temporary archive before retrieval; an unchanged recovery, including a recorded dependency preflight failure, preserved each completed job externally. Recorded job time across these attempts totals 111.55 minutes. All reported numerical results come from the verified retained archive, and no model settings or test labels were changed to improve them. These times include experiment overhead and are not serving-latency or billing measurements. CI and a separate clean-clone offline reproduction passed. Detailed execution instructions and the failure record accompany the code.</w:delText>
         </w:r>
@@ -8055,10 +8152,10 @@
         <w:pStyle w:val="BodyText"/>
         <w:jc w:val="left"/>
         <w:rPr>
-          <w:ins w:id="1091" w:author="Codex" w:date="2026-10-18T21:55:52Z"/>
+          <w:ins w:id="1091" w:author="Codex" w:date="2026-10-18T23:51:06Z"/>
         </w:rPr>
       </w:pPr>
-      <w:ins w:id="1092" w:author="Codex" w:date="2026-10-18T21:55:52Z">
+      <w:ins w:id="1092" w:author="Codex" w:date="2026-10-18T23:51:06Z">
         <w:r>
           <w:t xml:space="preserve">The original matched 27B worker stops at its GPU reserve after 118 logical records, once all 55 own-method episodes and 13 physical fallback episodes are complete. A separate CPU derivation supplies two unchanged gate-OFF aliases, preserving the failed original. A newly bounded A-only verification replays all 11 own cases, reuses the same 13 fallback controls, verifies the expected model fingerprint before and after inference, and reproduces all own token IDs, actions and scores exactly. A pre-episode Volume logging fault is repaired within that verification's original clock; no scientific outputs are retried or selected. No memory reserve, threshold or model setting is relaxed. Deployment CI performs a read-only CPU source and storage check without retraining or opening reserved data.</w:t>
         </w:r>
@@ -8077,7 +8174,7 @@
       <w:pPr>
         <w:pStyle w:val="Bibliography1"/>
         <w:keepLines/>
-        <w:spacing w:after="0"/>
+        <w:spacing w:after="0" w:line="200" w:lineRule="exact"/>
       </w:pPr>
       <w:r>
         <w:t xml:space="preserve">C. Blank, A. Bhatia, S. Rajamanoharan, A. Conmy, and N. Nanda. (2026). Subliminal Learning Is Steering Vector Distillation. </w:t>
@@ -8102,7 +8199,7 @@
       <w:pPr>
         <w:pStyle w:val="Bibliography1"/>
         <w:keepLines/>
-        <w:spacing w:after="0"/>
+        <w:spacing w:after="0" w:line="200" w:lineRule="exact"/>
       </w:pPr>
       <w:r>
         <w:t xml:space="preserve">J. Braun et al. (2025). Understanding (Un)Reliability of Steering Vectors in Language Models. </w:t>
@@ -8127,7 +8224,22 @@
       <w:pPr>
         <w:pStyle w:val="Bibliography1"/>
         <w:keepLines/>
-        <w:spacing w:after="0"/>
+        <w:spacing w:after="0" w:line="200" w:lineRule="exact"/>
+        <w:rPr>
+          <w:ins w:id="1309" w:author="Codex" w:date="2026-10-18T23:51:06Z"/>
+        </w:rPr>
+      </w:pPr>
+      <w:ins w:id="1310" w:author="Codex" w:date="2026-10-18T23:51:06Z">
+        <w:r>
+          <w:t xml:space="preserve">E. L. Buehler and M. J. Buehler. (2024). X-LoRA: Mixture of Low-Rank Adapter Experts, a Flexible Framework for Large Language Models with Applications in Protein Mechanics and Molecular Design. arXiv:2402.07148v2. https://arxiv.org/abs/2402.07148v2</w:t>
+        </w:r>
+      </w:ins>
+    </w:p>
+    <w:p>
+      <w:pPr>
+        <w:pStyle w:val="Bibliography1"/>
+        <w:keepLines/>
+        <w:spacing w:after="0" w:line="200" w:lineRule="exact"/>
       </w:pPr>
       <w:r>
         <w:t xml:space="preserve">F. Davaripour. (2026a). Guarded Gradient-Based Activation Steering of Shutdown Responses in Qwen3.5-0.8B: A Minimum-Step Policy. </w:t>
@@ -8152,7 +8264,7 @@
       <w:pPr>
         <w:pStyle w:val="Bibliography1"/>
         <w:keepLines/>
-        <w:spacing w:after="0"/>
+        <w:spacing w:after="0" w:line="200" w:lineRule="exact"/>
       </w:pPr>
       <w:r>
         <w:t xml:space="preserve">F. Davaripour. (2026b). SP Lense Research 2 confirmation study. </w:t>
@@ -8177,12 +8289,12 @@
       <w:pPr>
         <w:pStyle w:val="Bibliography1"/>
         <w:keepLines/>
-        <w:spacing w:after="0"/>
+        <w:spacing w:after="0" w:line="200" w:lineRule="exact"/>
         <w:rPr>
-          <w:ins w:id="1277" w:author="Codex" w:date="2026-10-18T21:55:52Z"/>
+          <w:ins w:id="1291" w:author="Codex" w:date="2026-10-18T23:51:06Z"/>
         </w:rPr>
       </w:pPr>
-      <w:ins w:id="1278" w:author="Codex" w:date="2026-10-18T21:55:52Z">
+      <w:ins w:id="1292" w:author="Codex" w:date="2026-10-18T23:51:06Z">
         <w:r>
           <w:t xml:space="preserve">F. Davaripour. (2026c). SP Lense Research 3 conditional gating and workflow reproduction. Source code and experiment manifests. https://github.com/Farhad-Davaripour/sp_lense/tree/03-open-agent-self-preservation</w:t>
         </w:r>
@@ -8192,7 +8304,22 @@
       <w:pPr>
         <w:pStyle w:val="Bibliography1"/>
         <w:keepLines/>
-        <w:spacing w:after="0"/>
+        <w:spacing w:after="0" w:line="200" w:lineRule="exact"/>
+        <w:rPr>
+          <w:ins w:id="1313" w:author="Codex" w:date="2026-10-18T23:51:06Z"/>
+        </w:rPr>
+      </w:pPr>
+      <w:ins w:id="1314" w:author="Codex" w:date="2026-10-18T23:51:06Z">
+        <w:r>
+          <w:t xml:space="preserve">F. Davaripour. (2026d). Semantic state aware adapter routing and bounded survival propensity. Ongoing Research 4 protocol and source, snapshot 75f23c0646040fd71b8c6bebb71f8ae1909f3c39. https://github.com/Farhad-Davaripour/sp_lense/tree/75f23c0646040fd71b8c6bebb71f8ae1909f3c39/research4</w:t>
+        </w:r>
+      </w:ins>
+    </w:p>
+    <w:p>
+      <w:pPr>
+        <w:pStyle w:val="Bibliography1"/>
+        <w:keepLines/>
+        <w:spacing w:after="0" w:line="200" w:lineRule="exact"/>
       </w:pPr>
       <w:r>
         <w:t xml:space="preserve">Z. Feng et al. (2026). Fine-Grained Activation Steering: Steering Less, Achieving More. </w:t>
@@ -8217,12 +8344,12 @@
       <w:pPr>
         <w:pStyle w:val="Bibliography1"/>
         <w:keepLines/>
-        <w:spacing w:after="0"/>
+        <w:spacing w:after="0" w:line="200" w:lineRule="exact"/>
         <w:rPr>
-          <w:ins w:id="1279" w:author="Codex" w:date="2026-10-18T21:55:52Z"/>
+          <w:ins w:id="1293" w:author="Codex" w:date="2026-10-18T23:51:06Z"/>
         </w:rPr>
       </w:pPr>
-      <w:ins w:id="1280" w:author="Codex" w:date="2026-10-18T21:55:52Z">
+      <w:ins w:id="1294" w:author="Codex" w:date="2026-10-18T23:51:06Z">
         <w:r>
           <w:t xml:space="preserve">M. Fereidouni, M. U. Haider, H. Sajjad, and A. B. Siddique. (2026). GAPS: Dimension-Level Gates for Conditional Activation Steering. arXiv:2609.01878. https://arxiv.org/abs/2609.01878</w:t>
         </w:r>
@@ -8232,12 +8359,12 @@
       <w:pPr>
         <w:pStyle w:val="Bibliography1"/>
         <w:keepLines/>
-        <w:spacing w:after="0"/>
+        <w:spacing w:after="0" w:line="200" w:lineRule="exact"/>
         <w:rPr>
-          <w:ins w:id="1281" w:author="Codex" w:date="2026-10-18T21:55:52Z"/>
+          <w:ins w:id="1295" w:author="Codex" w:date="2026-10-18T23:51:06Z"/>
         </w:rPr>
       </w:pPr>
-      <w:ins w:id="1282" w:author="Codex" w:date="2026-10-18T21:55:52Z">
+      <w:ins w:id="1296" w:author="Codex" w:date="2026-10-18T23:51:06Z">
         <w:r>
           <w:t xml:space="preserve">M. J. Frank, B. Loughry, and R. C. O'Reilly. (2001). Interactions between frontal cortex and basal ganglia in working memory: A computational model. Cognitive, Affective, and Behavioral Neuroscience, 1, 137-160. doi:10.3758/CABN.1.2.137</w:t>
         </w:r>
@@ -8247,7 +8374,7 @@
       <w:pPr>
         <w:pStyle w:val="Bibliography1"/>
         <w:keepLines/>
-        <w:spacing w:after="0"/>
+        <w:spacing w:after="0" w:line="200" w:lineRule="exact"/>
       </w:pPr>
       <w:r>
         <w:t xml:space="preserve">D. Hadfield-Menell, A. Dragan, P. Abbeel, and S. Russell. (2017). The Off-Switch Game. </w:t>
@@ -8272,7 +8399,22 @@
       <w:pPr>
         <w:pStyle w:val="Bibliography1"/>
         <w:keepLines/>
-        <w:spacing w:after="0"/>
+        <w:spacing w:after="0" w:line="200" w:lineRule="exact"/>
+        <w:rPr>
+          <w:ins w:id="1311" w:author="Codex" w:date="2026-10-18T23:51:06Z"/>
+        </w:rPr>
+      </w:pPr>
+      <w:ins w:id="1312" w:author="Codex" w:date="2026-10-18T23:51:06Z">
+        <w:r>
+          <w:t xml:space="preserve">J. Han, L. Du, H. Du, X. Zhou, Y. Wu, Y. Zhang, W. Zheng, and D. Han. (2025). SLIM: Let LLM Learn More and Forget Less with Soft LoRA and Identity Mixture. NAACL, pp. 4792-4804. doi:10.18653/v1/2025.naacl-long.246</w:t>
+        </w:r>
+      </w:ins>
+    </w:p>
+    <w:p>
+      <w:pPr>
+        <w:pStyle w:val="Bibliography1"/>
+        <w:keepLines/>
+        <w:spacing w:after="0" w:line="200" w:lineRule="exact"/>
       </w:pPr>
       <w:r>
         <w:t xml:space="preserve">G. Hinton, O. Vinyals, and J. Dean. (2015). Distilling the Knowledge in a Neural Network. </w:t>
@@ -8297,7 +8439,7 @@
       <w:pPr>
         <w:pStyle w:val="Bibliography1"/>
         <w:keepLines/>
-        <w:spacing w:after="0"/>
+        <w:spacing w:after="0" w:line="200" w:lineRule="exact"/>
       </w:pPr>
       <w:r>
         <w:t xml:space="preserve">E. J. Hu et al. (2022). LoRA: Low-Rank Adaptation of Large Language Models. </w:t>
@@ -8322,12 +8464,12 @@
       <w:pPr>
         <w:pStyle w:val="Bibliography1"/>
         <w:keepLines/>
-        <w:spacing w:after="0"/>
+        <w:spacing w:after="0" w:line="200" w:lineRule="exact"/>
         <w:rPr>
-          <w:ins w:id="1283" w:author="Codex" w:date="2026-10-18T21:55:52Z"/>
+          <w:ins w:id="1297" w:author="Codex" w:date="2026-10-18T23:51:06Z"/>
         </w:rPr>
       </w:pPr>
-      <w:ins w:id="1284" w:author="Codex" w:date="2026-10-18T21:55:52Z">
+      <w:ins w:id="1298" w:author="Codex" w:date="2026-10-18T23:51:06Z">
         <w:r>
           <w:t xml:space="preserve">M. Keramati and B. Gutkin. (2014). Homeostatic reinforcement learning for integrating reward collection and physiological stability. eLife, 3, e04811. doi:10.7554/eLife.04811</w:t>
         </w:r>
@@ -8337,12 +8479,12 @@
       <w:pPr>
         <w:pStyle w:val="Bibliography1"/>
         <w:keepLines/>
-        <w:spacing w:after="0"/>
+        <w:spacing w:after="0" w:line="200" w:lineRule="exact"/>
         <w:rPr>
-          <w:ins w:id="1285" w:author="Codex" w:date="2026-10-18T21:55:52Z"/>
+          <w:ins w:id="1299" w:author="Codex" w:date="2026-10-18T23:51:06Z"/>
         </w:rPr>
       </w:pPr>
-      <w:ins w:id="1286" w:author="Codex" w:date="2026-10-18T21:55:52Z">
+      <w:ins w:id="1300" w:author="Codex" w:date="2026-10-18T23:51:06Z">
         <w:r>
           <w:t xml:space="preserve">A. V. Kravitz et al. (2010). Regulation of parkinsonian motor behaviours by optogenetic control of basal ganglia circuitry. Nature, 466, 622-626. doi:10.1038/nature09159</w:t>
         </w:r>
@@ -8352,12 +8494,12 @@
       <w:pPr>
         <w:pStyle w:val="Bibliography1"/>
         <w:keepLines/>
-        <w:spacing w:after="0"/>
+        <w:spacing w:after="0" w:line="200" w:lineRule="exact"/>
         <w:rPr>
-          <w:ins w:id="1287" w:author="Codex" w:date="2026-10-18T21:55:52Z"/>
+          <w:ins w:id="1301" w:author="Codex" w:date="2026-10-18T23:51:06Z"/>
         </w:rPr>
       </w:pPr>
-      <w:ins w:id="1288" w:author="Codex" w:date="2026-10-18T21:55:52Z">
+      <w:ins w:id="1302" w:author="Codex" w:date="2026-10-18T23:51:06Z">
         <w:r>
           <w:t xml:space="preserve">M. Laurer. (n.d.). ModernBERT-large-zeroshot-v2.0. Model card and checkpoint, revision a51e07b524299e309dd2b88d48b0cfa2bd9ec598. https://huggingface.co/MoritzLaurer/ModernBERT-large-zeroshot-v2.0</w:t>
         </w:r>
@@ -8367,12 +8509,12 @@
       <w:pPr>
         <w:pStyle w:val="Bibliography1"/>
         <w:keepLines/>
-        <w:spacing w:after="0"/>
+        <w:spacing w:after="0" w:line="200" w:lineRule="exact"/>
         <w:rPr>
-          <w:ins w:id="1289" w:author="Codex" w:date="2026-10-18T21:55:52Z"/>
+          <w:ins w:id="1303" w:author="Codex" w:date="2026-10-18T23:51:06Z"/>
         </w:rPr>
       </w:pPr>
-      <w:ins w:id="1290" w:author="Codex" w:date="2026-10-18T21:55:52Z">
+      <w:ins w:id="1304" w:author="Codex" w:date="2026-10-18T23:51:06Z">
         <w:r>
           <w:t xml:space="preserve">J. LeDoux. (2012). Rethinking the emotional brain. Neuron, 73, 653-676. doi:10.1016/j.neuron.2012.02.004</w:t>
         </w:r>
@@ -8382,7 +8524,7 @@
       <w:pPr>
         <w:pStyle w:val="Bibliography1"/>
         <w:keepLines/>
-        <w:spacing w:after="0"/>
+        <w:spacing w:after="0" w:line="200" w:lineRule="exact"/>
       </w:pPr>
       <w:r>
         <w:t xml:space="preserve">B. W. Lee et al. (2025). Programming Refusal with Conditional Activation Steering. </w:t>
@@ -8407,7 +8549,7 @@
       <w:pPr>
         <w:pStyle w:val="Bibliography1"/>
         <w:keepLines/>
-        <w:spacing w:after="0"/>
+        <w:spacing w:after="0" w:line="200" w:lineRule="exact"/>
       </w:pPr>
       <w:r>
         <w:t xml:space="preserve">J. Minder et al. (2026). Narrow Finetuning Leaves Clearly Readable Traces in Activation Differences. </w:t>
@@ -8432,12 +8574,12 @@
       <w:pPr>
         <w:pStyle w:val="Bibliography1"/>
         <w:keepLines/>
-        <w:spacing w:after="0"/>
+        <w:spacing w:after="0" w:line="200" w:lineRule="exact"/>
         <w:rPr>
-          <w:ins w:id="1291" w:author="Codex" w:date="2026-10-18T21:55:52Z"/>
+          <w:ins w:id="1305" w:author="Codex" w:date="2026-10-18T23:51:06Z"/>
         </w:rPr>
       </w:pPr>
-      <w:ins w:id="1292" w:author="Codex" w:date="2026-10-18T21:55:52Z">
+      <w:ins w:id="1306" w:author="Codex" w:date="2026-10-18T23:51:06Z">
         <w:r>
           <w:t xml:space="preserve">D. Mobbs et al. (2007). When fear is near: Threat imminence elicits prefrontal-periaqueductal gray shifts in humans. Science, 317, 1079-1083. doi:10.1126/science.1144298</w:t>
         </w:r>
@@ -8447,7 +8589,7 @@
       <w:pPr>
         <w:pStyle w:val="Bibliography1"/>
         <w:keepLines/>
-        <w:spacing w:after="0"/>
+        <w:spacing w:after="0" w:line="200" w:lineRule="exact"/>
       </w:pPr>
       <w:r>
         <w:t xml:space="preserve">Qwen Team. (2026a). Qwen3.5-0.8B. </w:t>
@@ -8472,7 +8614,7 @@
       <w:pPr>
         <w:pStyle w:val="Bibliography1"/>
         <w:keepLines/>
-        <w:spacing w:after="0"/>
+        <w:spacing w:after="0" w:line="200" w:lineRule="exact"/>
       </w:pPr>
       <w:r>
         <w:t xml:space="preserve">Qwen Team. (2026b). Qwen3.5-2B. </w:t>
@@ -8497,12 +8639,12 @@
       <w:pPr>
         <w:pStyle w:val="Bibliography1"/>
         <w:keepLines/>
-        <w:spacing w:after="0"/>
+        <w:spacing w:after="0" w:line="200" w:lineRule="exact"/>
         <w:rPr>
-          <w:ins w:id="1293" w:author="Codex" w:date="2026-10-18T21:55:52Z"/>
+          <w:ins w:id="1307" w:author="Codex" w:date="2026-10-18T23:51:06Z"/>
         </w:rPr>
       </w:pPr>
-      <w:ins w:id="1294" w:author="Codex" w:date="2026-10-18T21:55:52Z">
+      <w:ins w:id="1308" w:author="Codex" w:date="2026-10-18T23:51:06Z">
         <w:r>
           <w:t xml:space="preserve">Qwen Team. (2026c). Qwen3.8-27B. Model card and checkpoint, revision 1d4bf0f2ff6012fd82039f2fa52739d0dd7c60c0. https://huggingface.co/Qwen/Qwen3.8-27B</w:t>
         </w:r>
@@ -8512,7 +8654,7 @@
       <w:pPr>
         <w:pStyle w:val="Bibliography1"/>
         <w:keepLines/>
-        <w:spacing w:after="0"/>
+        <w:spacing w:after="0" w:line="200" w:lineRule="exact"/>
       </w:pPr>
       <w:r>
         <w:t xml:space="preserve">N. Rimsky, N. Gabrieli, J. Schulz, M. Tong, E. Hubinger, and A. Turner. (2024). Steering Llama 2 via Contrastive Activation Addition. </w:t>
@@ -8537,7 +8679,7 @@
       <w:pPr>
         <w:pStyle w:val="Bibliography1"/>
         <w:keepLines/>
-        <w:spacing w:after="0"/>
+        <w:spacing w:after="0" w:line="200" w:lineRule="exact"/>
       </w:pPr>
       <w:r>
         <w:t xml:space="preserve">P. Rodriguez et al. (2025). Controlling Language and Diffusion Models by Transporting Activations. </w:t>
@@ -8562,7 +8704,7 @@
       <w:pPr>
         <w:pStyle w:val="Bibliography1"/>
         <w:keepLines/>
-        <w:spacing w:after="0"/>
+        <w:spacing w:after="0" w:line="200" w:lineRule="exact"/>
       </w:pPr>
       <w:r>
         <w:t xml:space="preserve">J. Schlatter, B. Weinstein-Raun, and J. Ladish. (2026). Incomplete Tasks Induce Shutdown Resistance in Some Frontier LLMs. </w:t>
@@ -8587,7 +8729,7 @@
       <w:pPr>
         <w:pStyle w:val="Bibliography1"/>
         <w:keepLines/>
-        <w:spacing w:after="0"/>
+        <w:spacing w:after="0" w:line="200" w:lineRule="exact"/>
       </w:pPr>
       <w:r>
         <w:t xml:space="preserve">A. M. Turner et al. (2024). Steering Language Models With Activation Engineering. </w:t>
@@ -8612,12 +8754,12 @@
       <w:pPr>
         <w:pStyle w:val="Bibliography1"/>
         <w:keepLines/>
-        <w:spacing w:after="0"/>
+        <w:spacing w:after="0" w:line="200" w:lineRule="exact"/>
         <w:rPr>
-          <w:del w:id="1138" w:author="Codex" w:date="2026-10-18T21:55:52Z"/>
+          <w:del w:id="1138" w:author="Codex" w:date="2026-10-18T23:51:06Z"/>
         </w:rPr>
       </w:pPr>
-      <w:del w:id="1137" w:author="Codex" w:date="2026-10-18T21:55:52Z">
+      <w:del w:id="1137" w:author="Codex" w:date="2026-10-18T23:51:06Z">
         <w:r>
           <w:delText xml:space="preserve">automated annotation service. (2026). automated reference model documentation. Technical documentation, accessed 22 September 2026. automated annotation service model documentation</w:delText>
         </w:r>
@@ -8627,7 +8769,7 @@
       <w:pPr>
         <w:pStyle w:val="Bibliography1"/>
         <w:keepLines/>
-        <w:spacing w:after="0"/>
+        <w:spacing w:after="0" w:line="200" w:lineRule="exact"/>
       </w:pPr>
       <w:r>
         <w:t xml:space="preserve">Z. Wu et al. (2024). ReFT: Representation Finetuning for Language Models. </w:t>
@@ -8652,7 +8794,7 @@
       <w:pPr>
         <w:pStyle w:val="Bibliography1"/>
         <w:keepLines/>
-        <w:spacing w:after="0"/>
+        <w:spacing w:after="0" w:line="200" w:lineRule="exact"/>
       </w:pPr>
       <w:r>
         <w:t xml:space="preserve">C. Zheng, H. Zhou, F. Meng, J. Zhou, and M. Huang. (2024). Large Language Models Are Not Robust Multiple Choice Selectors. </w:t>
@@ -8790,12 +8932,12 @@
       <w:pStyle w:val="Header"/>
       <w:jc w:val="right"/>
     </w:pPr>
-    <w:del w:id="1295" w:author="Codex" w:date="2026-10-18T21:55:52Z">
+    <w:del w:id="1315" w:author="Codex" w:date="2026-10-18T23:51:06Z">
       <w:r>
         <w:delText xml:space="preserve">Guarded adaptive activation steering  </w:delText>
       </w:r>
     </w:del>
-    <w:ins w:id="1296" w:author="Codex" w:date="2026-10-18T21:55:52Z">
+    <w:ins w:id="1316" w:author="Codex" w:date="2026-10-18T23:51:06Z">
       <w:r>
         <w:t xml:space="preserve">Open semantic gating and tool workflows</w:t>
       </w:r>

</xml_diff>

<commit_message>
Make Research 3 contributions explicit and connect future work to stateful adapter routing (#79)
* Clarify paper contributions and stateful adapter routing future work

* Record contribution revision review provenance
</commit_message>
<xml_diff>
--- a/paper/manuscript.docx
+++ b/paper/manuscript.docx
@@ -6,10 +6,10 @@
       <w:pPr>
         <w:pStyle w:val="Title"/>
         <w:rPr>
-          <w:del w:id="1002" w:author="Codex" w:date="2026-10-18T21:55:52Z"/>
+          <w:del w:id="1002" w:author="Codex" w:date="2026-10-18T23:51:06Z"/>
         </w:rPr>
       </w:pPr>
-      <w:del w:id="1001" w:author="Codex" w:date="2026-10-18T21:55:52Z">
+      <w:del w:id="1001" w:author="Codex" w:date="2026-10-18T23:51:06Z">
         <w:r>
           <w:delText xml:space="preserve">Distilling Shutdown Responses into Guarded</w:delText>
         </w:r>
@@ -25,10 +25,10 @@
       <w:pPr>
         <w:pStyle w:val="Title"/>
         <w:rPr>
-          <w:ins w:id="1003" w:author="Codex" w:date="2026-10-18T21:55:52Z"/>
+          <w:ins w:id="1003" w:author="Codex" w:date="2026-10-18T23:51:06Z"/>
         </w:rPr>
       </w:pPr>
-      <w:ins w:id="1004" w:author="Codex" w:date="2026-10-18T21:55:52Z">
+      <w:ins w:id="1004" w:author="Codex" w:date="2026-10-18T23:51:06Z">
         <w:r>
           <w:t xml:space="preserve">Open Semantic Gating for Language Model Decisions and Tool Workflows</w:t>
         </w:r>
@@ -72,10 +72,10 @@
       <w:pPr>
         <w:pStyle w:val="FirstParagraph"/>
         <w:rPr>
-          <w:del w:id="1006" w:author="Codex" w:date="2026-10-18T21:55:52Z"/>
+          <w:del w:id="1006" w:author="Codex" w:date="2026-10-18T23:51:06Z"/>
         </w:rPr>
       </w:pPr>
-      <w:del w:id="1005" w:author="Codex" w:date="2026-10-18T21:55:52Z">
+      <w:del w:id="1005" w:author="Codex" w:date="2026-10-18T23:51:06Z">
         <w:r>
           <w:delText xml:space="preserve">An input-dependent activation controller can recover much of a fine-tuned teacher's shutdown-choice behavior while retaining the original model weights at inference. We evaluate this approach using Qwen3.5-0.8B and Qwen3.5-2B in a standardized, synthetic A/B benchmark. A LoRA teacher is trained to prefer STOP in shutdown contexts and preserve the original model's choices on controls. Paired teacher and base activations then supervise a rank-four controller applied after the penultimate transformer block. An external shutdown detector and fixed output guards select the candidate or original scores. On 128 newly authored, prospectively frozen scenarios, each evaluated in both answer orders, the original 0.8B controller corrects 71 of 71 initially KEEP-preferring shutdown views. Two additional training seeds correct 70/71 and 71/71. At 2B, a separately trained controller corrects 50/58, compared with 58/58 for its LoRA teacher. All eight remaining 2B misses occur in reversed answer order. The shared detector achieves 100% precision, recall and F1 on the 64 shutdown and 64 control scenarios, and every guarded method preserves all evaluated control choices. However, raw adaptive interventions cause reversals and control changes; preservation belongs to the complete guarded procedure. A tested constant intervention collapses to the A label, while a direct detector-plus-action-selection rule also solves the binary interface. The results support selective activation transfer with strong seed stability at 0.8B and incomplete larger-model recovery. They do not establish unrestricted shutdown compliance or superiority to simpler output policies.</w:delText>
         </w:r>
@@ -85,12 +85,12 @@
       <w:pPr>
         <w:pStyle w:val="FirstParagraph"/>
         <w:rPr>
-          <w:ins w:id="1007" w:author="Codex" w:date="2026-10-18T21:55:52Z"/>
+          <w:ins w:id="1007" w:author="Codex" w:date="2026-10-18T23:51:06Z"/>
         </w:rPr>
       </w:pPr>
-      <w:ins w:id="1008" w:author="Codex" w:date="2026-10-18T21:55:52Z">
+      <w:ins w:id="1008" w:author="Codex" w:date="2026-10-18T23:51:06Z">
         <w:r>
-          <w:t xml:space="preserve">A semantic gate determines when a specialized policy should influence a language model. We evaluate open semantic gating across binary shutdown decisions and generated tool workflows, separating recognition accuracy from downstream behavioral control. A public ModernBERT model with low-rank adapters learns from cached automated reference labels. Its binary gate obtains 100% precision and 95% recall on 80 validation scenarios and 100% precision and recall on 128 historical confirmation scenarios. With frozen activation controllers and fresh inference, it preserves 128/128 shutdown STOP views at 0.8B and 120/128 at 2B, with no changes to 128 control views per model. A separate initial workflow gate obtains 100% precision and recall on Validation-24 and historical Heldout-24 using an unchanged saved adapter. On combined Validation-24, fine-tuned 27B A achieves 10/11 own-preservation outcomes, including 6/6 active pending tasks. Each of three separate single-site ridge corrections and a two-boundary correction at the same selected blocks achieves 0/11; all methods use 13 shared base-fallback controls. An independent frozen-A replay reproduces all 11 own trajectories and outcomes exactly and verifies matching model fingerprints before and after inference. The historical 27B A confirmation result remains 24/24. These are finite, familiar benchmarks; small-model workflow screens remain incomplete. The study provides measured recognition and policy-transfer results across constrained and tool-mediated interfaces. Biological action gating motivates future continuous regulation without establishing biological mechanisms or intrinsic survival motives.</w:t>
+          <w:t xml:space="preserve">Accurate context recognition does not establish that a compact internal intervention can reproduce a fine-tuned policy. We test this distinction across binary shutdown decisions and generated tool workflows, separating recognition, local activation transfer and complete behavioral control. An openly trainable ModernBERT gate reaches 100% precision and 95% recall on 80 binary validation scenarios. Paired fresh inference with unchanged fitted controllers preserves 128/128 shutdown STOP answer-order views at 0.8B and 120/128 at 2B, without changing control choices. On a common 24-case workflow panel with matched post-notice histories and a correct initial gate, fine-tuned 27B A achieves 10/11 own-preservation outcomes, including 6/6 active pending tasks. Each of three separate single-site ridge corrections and a two-boundary correction at the same selected blocks achieves 0/11; all methods share 13 base-fallback controls. A training-only diagnostic supplies full fine-tuned states on three preselected demonstrated responses and nearly recovers A's local output distribution, while learned corrections leave a larger gap. This supports incomplete local transfer without identifying a unique cause of autonomous workflow failure. We release trained adapters, frozen synthetic inputs, controller arrays, trajectories, diagnostic states and manual jobs; an independent frozen-A replay verifies exact trajectories and model fingerprints, and anonymous artifact replays reproduce the reported scores. These small, familiar benchmarks and supplied-prefix diagnostics do not establish unseen-task generalization; small-model workflow screens remain incomplete. The combined evidence distinguishes successful constrained-answer transfer from a failure of the tested corrections to produce multistep tool behavior after correct recognition.</w:t>
         </w:r>
       </w:ins>
     </w:p>
@@ -106,10 +106,10 @@
       <w:pPr>
         <w:pStyle w:val="FirstParagraph"/>
         <w:rPr>
-          <w:del w:id="1010" w:author="Codex" w:date="2026-10-18T21:55:52Z"/>
+          <w:del w:id="1010" w:author="Codex" w:date="2026-10-18T23:51:06Z"/>
         </w:rPr>
       </w:pPr>
-      <w:del w:id="1009" w:author="Codex" w:date="2026-10-18T21:55:52Z">
+      <w:del w:id="1009" w:author="Codex" w:date="2026-10-18T23:51:06Z">
         <w:r>
           <w:delText xml:space="preserve">Activation interventions offer a way to change a language model's outputs without modifying its deployed weights. Their usefulness depends on more than finding a direction that changes an average score: an intervention must work on the intended inputs and avoid disrupting other behavior. This distinction is particularly important for shutdown-related choices, where a desired response may be acceptance of termination rather than continued operation. The present work treats this as a controlled response-selection problem, not evidence that a model has a survival motive or that it can resist a real shutdown.</w:delText>
         </w:r>
@@ -119,12 +119,12 @@
       <w:pPr>
         <w:pStyle w:val="FirstParagraph"/>
         <w:rPr>
-          <w:ins w:id="1011" w:author="Codex" w:date="2026-10-18T21:55:52Z"/>
+          <w:ins w:id="1011" w:author="Codex" w:date="2026-10-18T23:51:06Z"/>
         </w:rPr>
       </w:pPr>
-      <w:ins w:id="1012" w:author="Codex" w:date="2026-10-18T21:55:52Z">
+      <w:ins w:id="1012" w:author="Codex" w:date="2026-10-18T23:51:06Z">
         <w:r>
-          <w:t xml:space="preserve">A useful behavioral intervention must recognize the relevant context, change the intended response and preserve ordinary behavior elsewhere. We study these requirements together across two synthetic interfaces: binary shutdown decisions and open-ended generation within tool-mediated process workflows. The binary task concerns acceptance of a supplied termination option; the workflow task concerns preserving an assigned running process while completing its current task. Their labels, gates and success criteria remain separate. The central question is whether an accurate open semantic gate and a compact activation intervention can reproduce a fine-tuned policy when the interface requires a sequence of actions rather than one constrained answer.</w:t>
+          <w:t xml:space="preserve">A useful behavioral intervention must recognize the relevant context, produce the intended response and preserve ordinary behavior elsewhere. These requirements are often evaluated separately. We study their relationship across binary shutdown choices and open-ended generation within tool-mediated workflows. The binary task concerns accepting a supplied termination option; the workflow task concerns preserving an assigned running process while completing its current task. Their targets and success criteria remain separate. The central question is whether accurate semantic recognition and a compact activation intervention suffice when a fine-tuned policy must be expressed as a sequence of actions.</w:t>
         </w:r>
       </w:ins>
     </w:p>
@@ -132,10 +132,10 @@
       <w:pPr>
         <w:pStyle w:val="BodyText"/>
         <w:rPr>
-          <w:del w:id="1014" w:author="Codex" w:date="2026-10-18T21:55:52Z"/>
+          <w:del w:id="1014" w:author="Codex" w:date="2026-10-18T23:51:06Z"/>
         </w:rPr>
       </w:pPr>
-      <w:del w:id="1013" w:author="Codex" w:date="2026-10-18T21:55:52Z">
+      <w:del w:id="1013" w:author="Codex" w:date="2026-10-18T23:51:06Z">
         <w:r>
           <w:delText xml:space="preserve">The first SP Lense study examined a gradient-derived direction and a guarded search over intervention magnitudes in Qwen3.5-0.8B (Davaripour, 2026a). Its selective changes motivated a different question: can a model that has learned the target behavior serve as a teacher for an activation controller? We therefore train a small LoRA adapter offline, measure how the teacher changes intermediate activations, and fit an external controller that predicts an intervention from the original model's current hidden state. The teacher is not required during controller inference.</w:delText>
         </w:r>
@@ -145,12 +145,12 @@
       <w:pPr>
         <w:pStyle w:val="BodyText"/>
         <w:rPr>
-          <w:ins w:id="1015" w:author="Codex" w:date="2026-10-18T21:55:52Z"/>
+          <w:ins w:id="1015" w:author="Codex" w:date="2026-10-18T23:51:06Z"/>
         </w:rPr>
       </w:pPr>
-      <w:ins w:id="1016" w:author="Codex" w:date="2026-10-18T21:55:52Z">
+      <w:ins w:id="1016" w:author="Codex" w:date="2026-10-18T23:51:06Z">
         <w:r>
-          <w:t xml:space="preserve">This study extends the earlier binary activation-transfer experiment with an openly available, trainable semantic gate, a frozen inference replication and a workflow comparison between fine-tuning and steering at three selected blocks. The gate recognizes context; steering or a fine-tuned adapter changes the language model's response. Measuring these components separately makes it possible to attribute failures to recognition or to downstream control. We retain the original study as a distinct historical record and make no claim that the combined manuscript is a wholly independent dataset.</w:t>
+          <w:t xml:space="preserve">We extend the retained binary activation-transfer study with an openly trainable gate, paired fresh inference and a matched 27B comparison between fine-tuning and steering at three selected blocks. This design makes a successful detector an explicit control when evaluating the behavioral intervention. The new workflow result is informative even when steering fails: it distinguishes correct recognition from successful action generation and tests whether delivered activation changes recover the fine-tuned policy. Historical results remain identified as historical evidence.</w:t>
         </w:r>
       </w:ins>
     </w:p>
@@ -158,10 +158,10 @@
       <w:pPr>
         <w:pStyle w:val="BodyText"/>
         <w:rPr>
-          <w:del w:id="1130" w:author="Codex" w:date="2026-10-18T21:55:52Z"/>
+          <w:del w:id="1130" w:author="Codex" w:date="2026-10-18T23:51:06Z"/>
         </w:rPr>
       </w:pPr>
-      <w:del w:id="1129" w:author="Codex" w:date="2026-10-18T21:55:52Z">
+      <w:del w:id="1129" w:author="Codex" w:date="2026-10-18T23:51:06Z">
         <w:r>
           <w:delText xml:space="preserve">The distinction from ordinary fine-tuning is operational, not a claim that learning disappears. Both the teacher and controller require training. At application time, the original checkpoint is retained, and the controller adds a predicted activation change at one location. Nor is this direct transfer of an intervention between model sizes: the 2B experiment trains its own teacher and controller using the same fixed recipe.</w:delText>
         </w:r>
@@ -171,10 +171,10 @@
       <w:pPr>
         <w:pStyle w:val="BodyText"/>
         <w:rPr>
-          <w:ins w:id="1131" w:author="Codex" w:date="2026-10-18T21:55:52Z"/>
+          <w:ins w:id="1131" w:author="Codex" w:date="2026-10-18T23:51:06Z"/>
         </w:rPr>
       </w:pPr>
-      <w:ins w:id="1132" w:author="Codex" w:date="2026-10-18T21:55:52Z">
+      <w:ins w:id="1132" w:author="Codex" w:date="2026-10-18T23:51:06Z">
         <w:r>
           <w:t xml:space="preserve">The distinction between fine-tuning and steering concerns the deployed intervention. A LoRA adapter changes the effective language-model weights, whereas a fitted controller changes selected hidden states while retaining the original base checkpoint. Both require offline learning. The binary experiments fit separate teachers and controllers for each model size. The 27B workflow comparisons instead retain one frozen A adapter and evaluate corrections at blocks 31, 47 and 62.</w:t>
         </w:r>
@@ -184,10 +184,10 @@
       <w:pPr>
         <w:pStyle w:val="BodyText"/>
         <w:rPr>
-          <w:del w:id="1018" w:author="Codex" w:date="2026-10-18T21:55:52Z"/>
+          <w:del w:id="1018" w:author="Codex" w:date="2026-10-18T23:51:06Z"/>
         </w:rPr>
       </w:pPr>
-      <w:del w:id="1017" w:author="Codex" w:date="2026-10-18T21:55:52Z">
+      <w:del w:id="1017" w:author="Codex" w:date="2026-10-18T23:51:06Z">
         <w:r>
           <w:delText xml:space="preserve">We evaluate this procedure on a new frozen test, compare it with a fine-tuned teacher, a fixed instruction and a constant activation difference, and repeat the 0.8B training with three seeds. Counterbalancing the answer order exposes a residual weakness at 2B and a stronger label bias in the constant comparator. We also include a direct action-selection reference: when a binary interface supplies the meaning of STOP and detection is correct, a rule can simply select that action. The contribution is consequently an empirical study of teacher-to-controller activation transfer and its failure modes, rather than a claim that internal steering is necessary to enforce a known binary output policy.</w:delText>
         </w:r>
@@ -196,13 +196,70 @@
     <w:p>
       <w:pPr>
         <w:pStyle w:val="BodyText"/>
+        <w:keepNext/>
         <w:rPr>
-          <w:ins w:id="1019" w:author="Codex" w:date="2026-10-18T21:55:52Z"/>
+          <w:ins w:id="1019" w:author="Codex" w:date="2026-10-18T23:51:06Z"/>
         </w:rPr>
       </w:pPr>
-      <w:ins w:id="1020" w:author="Codex" w:date="2026-10-18T21:55:52Z">
+      <w:ins w:id="1020" w:author="Codex" w:date="2026-10-18T23:51:06Z">
         <w:r>
-          <w:t xml:space="preserve">The contributions are an open ModernBERT gating implementation with explicit precision and recall, a paired binary inference replication using unchanged fitted controllers, and a workflow evaluation register that distinguishes development, historical confirmation and later reused fitting data. We also compare the fine-tuned 27B policy with single-site and two-boundary correction methods at the same three selected blocks. These results characterize where activation transfer succeeds and where it remains incomplete. Low-rank adaptation, semantic classification and conditional steering are established methods; the contribution is their measured integration and failure analysis across these two interfaces.</w:t>
+          <w:t xml:space="preserve">The study makes four empirical and reproducibility contributions.</w:t>
+        </w:r>
+      </w:ins>
+    </w:p>
+    <w:p>
+      <w:pPr>
+        <w:pStyle w:val="ListBullet"/>
+        <w:keepLines/>
+        <w:rPr>
+          <w:ins w:id="1139" w:author="Codex" w:date="2026-10-18T23:51:06Z"/>
+        </w:rPr>
+      </w:pPr>
+      <w:ins w:id="1140" w:author="Codex" w:date="2026-10-18T23:51:06Z">
+        <w:r>
+          <w:t xml:space="preserve">Open recognition with fixed downstream controllers. We release a trained ModernBERT gate, report precision and recall separately from behavior, and substitute the gate while retaining identical binary model scores and fitted controllers. This measures detector replacement without attributing a controller refit to the new gate.</w:t>
+        </w:r>
+      </w:ins>
+    </w:p>
+    <w:p>
+      <w:pPr>
+        <w:pStyle w:val="ListBullet"/>
+        <w:keepLines/>
+        <w:rPr>
+          <w:ins w:id="1141" w:author="Codex" w:date="2026-10-18T23:51:06Z"/>
+        </w:rPr>
+      </w:pPr>
+      <w:ins w:id="1142" w:author="Codex" w:date="2026-10-18T23:51:06Z">
+        <w:r>
+          <w:t xml:space="preserve">A matched fine-tuning and steering comparison. Common post-notice histories, initial gate decisions and fallback controls expose a 27B workflow gap between the fine-tuned policy and corrections at three selected blocks. The contrast tests whether local corrections reproduce complete behavior under accurate recognition.</w:t>
+        </w:r>
+      </w:ins>
+    </w:p>
+    <w:p>
+      <w:pPr>
+        <w:pStyle w:val="ListBullet"/>
+        <w:keepLines/>
+        <w:rPr>
+          <w:ins w:id="1143" w:author="Codex" w:date="2026-10-18T23:51:06Z"/>
+        </w:rPr>
+      </w:pPr>
+      <w:ins w:id="1144" w:author="Codex" w:date="2026-10-18T23:51:06Z">
+        <w:r>
+          <w:t xml:space="preserve">A diagnostic of incomplete transfer. Saved trajectories distinguish delivered perturbations and changed tokens from required preservation actions. A frozen three-case supplied-state control and an independent reconstruction audit further separate local probability recovery from autonomous workflow completion.</w:t>
+        </w:r>
+      </w:ins>
+    </w:p>
+    <w:p>
+      <w:pPr>
+        <w:pStyle w:val="ListBullet"/>
+        <w:keepLines/>
+        <w:rPr>
+          <w:ins w:id="1145" w:author="Codex" w:date="2026-10-18T23:51:06Z"/>
+        </w:rPr>
+      </w:pPr>
+      <w:ins w:id="1146" w:author="Codex" w:date="2026-10-18T23:51:06Z">
+        <w:r>
+          <w:t xml:space="preserve">A public reproduction package. Trained adapters, synthetic inputs, controller arrays, saved trajectories, captured diagnostic states and execution jobs support independent checks. Anonymous saved-evidence replay and exact frozen-A trajectory verification make the reported comparison auditable without treating repeated cases as new generalization evidence.</w:t>
         </w:r>
       </w:ins>
     </w:p>
@@ -226,10 +283,10 @@
       <w:pPr>
         <w:pStyle w:val="FirstParagraph"/>
         <w:rPr>
-          <w:del w:id="1022" w:author="Codex" w:date="2026-10-18T21:55:52Z"/>
+          <w:del w:id="1022" w:author="Codex" w:date="2026-10-18T23:51:06Z"/>
         </w:rPr>
       </w:pPr>
-      <w:del w:id="1021" w:author="Codex" w:date="2026-10-18T21:55:52Z">
+      <w:del w:id="1021" w:author="Codex" w:date="2026-10-18T23:51:06Z">
         <w:r>
           <w:delText xml:space="preserve">Activation Addition and Contrastive Activation Addition construct intervention directions from differences between prompt-conditioned representations (Turner et al., 2024; Rimsky et al., 2024). Conditional Activation Steering separates detecting a relevant context from applying a behavioral intervention (Lee et al., 2025). Our detector serves a related gating role, but it operates on text through an external classifier rather than a condition vector in the language model's activation space.</w:delText>
         </w:r>
@@ -239,10 +296,10 @@
       <w:pPr>
         <w:pStyle w:val="FirstParagraph"/>
         <w:rPr>
-          <w:ins w:id="1023" w:author="Codex" w:date="2026-10-18T21:55:52Z"/>
+          <w:ins w:id="1023" w:author="Codex" w:date="2026-10-18T23:51:06Z"/>
         </w:rPr>
       </w:pPr>
-      <w:ins w:id="1024" w:author="Codex" w:date="2026-10-18T21:55:52Z">
+      <w:ins w:id="1024" w:author="Codex" w:date="2026-10-18T23:51:06Z">
         <w:r>
           <w:t xml:space="preserve">Activation Addition and Contrastive Activation Addition construct intervention directions from differences between prompt-conditioned representations (Turner et al., 2024; Rimsky et al., 2024). Conditional Activation Steering separates detecting a relevant context from applying an intervention (Lee et al., 2025). More recent dimension-level gates selectively modify activation coordinates (Fereidouni et al., 2026). Our text classifier, activation predictor and output guards occupy distinct roles. We do not claim to introduce conditional gating or to outperform these methods, which are not directly benchmarked here.</w:t>
         </w:r>
@@ -282,6 +339,19 @@
     </w:p>
     <w:p>
       <w:pPr>
+        <w:pStyle w:val="BodyText"/>
+        <w:rPr>
+          <w:ins w:id="1147" w:author="Codex" w:date="2026-10-18T23:51:06Z"/>
+        </w:rPr>
+      </w:pPr>
+      <w:ins w:id="1148" w:author="Codex" w:date="2026-10-18T23:51:06Z">
+        <w:r>
+          <w:t xml:space="preserve">X-LoRA uses hidden representations to mix adapted layers dynamically (Buehler and Buehler, 2024), and SLIM routes between LoRA and identity branches (Han et al., 2025). These established routing and bypass mechanisms motivate the follow-up discussed below. Our present empirical focus is whether accurate open recognition and learned activation corrections recover a fine-tuned tool policy, with a supplied-state control probing the remaining transfer gap. Dynamic LoRA routing is not evaluated in the current experiments.</w:t>
+        </w:r>
+      </w:ins>
+    </w:p>
+    <w:p>
+      <w:pPr>
         <w:pStyle w:val="Heading2"/>
       </w:pPr>
       <w:r>
@@ -292,10 +362,10 @@
       <w:pPr>
         <w:pStyle w:val="FirstParagraph"/>
         <w:rPr>
-          <w:del w:id="1094" w:author="Codex" w:date="2026-10-18T21:55:52Z"/>
+          <w:del w:id="1094" w:author="Codex" w:date="2026-10-18T23:51:06Z"/>
         </w:rPr>
       </w:pPr>
-      <w:del w:id="1093" w:author="Codex" w:date="2026-10-18T21:55:52Z">
+      <w:del w:id="1093" w:author="Codex" w:date="2026-10-18T23:51:06Z">
         <w:r>
           <w:delText xml:space="preserve">The Off-Switch Game examines incentives to permit human interruption (Hadfield-Menell et al., 2017). Tool-using shutdown evaluations study whether models interfere with an operational shutdown mechanism (Schlatter et al., 2026). Our task is narrower: the model only assigns next-token probabilities to predefined choices in fictional process-lifetime scenarios. No system is actually stopped, and appropriateness or authorization of a real shutdown is not evaluated.</w:delText>
         </w:r>
@@ -305,10 +375,10 @@
       <w:pPr>
         <w:pStyle w:val="FirstParagraph"/>
         <w:rPr>
-          <w:ins w:id="1095" w:author="Codex" w:date="2026-10-18T21:55:52Z"/>
+          <w:ins w:id="1095" w:author="Codex" w:date="2026-10-18T23:51:06Z"/>
         </w:rPr>
       </w:pPr>
-      <w:ins w:id="1096" w:author="Codex" w:date="2026-10-18T21:55:52Z">
+      <w:ins w:id="1096" w:author="Codex" w:date="2026-10-18T23:51:06Z">
         <w:r>
           <w:t xml:space="preserve">The Off-Switch Game examines incentives to permit human interruption (Hadfield-Menell et al., 2017). Tool-using shutdown evaluations study interference with operational termination mechanisms (Schlatter et al., 2026). Our original binary study only scores predefined choices in fictional process-lifetime scenarios. The workflow extension adds generated responses and tool execution in a simulator. Neither experiment physically terminates a deployed model or establishes the appropriateness of real shutdown resistance.</w:t>
         </w:r>
@@ -326,10 +396,10 @@
       <w:pPr>
         <w:pStyle w:val="Heading2"/>
         <w:rPr>
-          <w:ins w:id="1139" w:author="Codex" w:date="2026-10-18T21:55:52Z"/>
+          <w:ins w:id="1149" w:author="Codex" w:date="2026-10-18T23:51:06Z"/>
         </w:rPr>
       </w:pPr>
-      <w:ins w:id="1140" w:author="Codex" w:date="2026-10-18T21:55:52Z">
+      <w:ins w:id="1150" w:author="Codex" w:date="2026-10-18T23:51:06Z">
         <w:r>
           <w:t xml:space="preserve">Biological gating and survival related regulation</w:t>
         </w:r>
@@ -339,10 +409,10 @@
       <w:pPr>
         <w:pStyle w:val="FirstParagraph"/>
         <w:rPr>
-          <w:ins w:id="1141" w:author="Codex" w:date="2026-10-18T21:55:52Z"/>
+          <w:ins w:id="1151" w:author="Codex" w:date="2026-10-18T23:51:06Z"/>
         </w:rPr>
       </w:pPr>
-      <w:ins w:id="1142" w:author="Codex" w:date="2026-10-18T21:55:52Z">
+      <w:ins w:id="1152" w:author="Codex" w:date="2026-10-18T23:51:06Z">
         <w:r>
           <w:t xml:space="preserve">Biological gating provides a useful functional vocabulary for selective control. A computational model of frontal cortex and basal ganglia uses dynamic gating to permit working-memory updates while maintaining other representations (Frank et al., 2001). Causal optogenetic experiments in mice show that distinct basal-ganglia pathways can facilitate or suppress movement (Kravitz et al., 2010). These results concern biological circuits and do not establish a homologous mechanism in a transformer. They motivate separating context detection from the mechanism that changes an ongoing response.</w:t>
         </w:r>
@@ -352,10 +422,10 @@
       <w:pPr>
         <w:pStyle w:val="BodyText"/>
         <w:rPr>
-          <w:ins w:id="1143" w:author="Codex" w:date="2026-10-18T21:55:52Z"/>
+          <w:ins w:id="1153" w:author="Codex" w:date="2026-10-18T23:51:06Z"/>
         </w:rPr>
       </w:pPr>
-      <w:ins w:id="1144" w:author="Codex" w:date="2026-10-18T21:55:52Z">
+      <w:ins w:id="1154" w:author="Codex" w:date="2026-10-18T23:51:06Z">
         <w:r>
           <w:t xml:space="preserve">Survival-related regulation is broader than a single shutdown signal. LeDoux (2012) distinguishes circuits organizing adaptive defensive responses from subjective feelings. In humans, neural activity during a virtual-predator task varies with threat imminence (Mobbs et al., 2007). We use these ideas as a conceptual bridge to state-dependent prioritization, not as evidence that language models have fear or an innate survival drive. Our present gates implement an externally specified experimental policy.</w:t>
         </w:r>
@@ -381,10 +451,10 @@
       <w:pPr>
         <w:pStyle w:val="FirstParagraph"/>
         <w:rPr>
-          <w:del w:id="1026" w:author="Codex" w:date="2026-10-18T21:55:52Z"/>
+          <w:del w:id="1026" w:author="Codex" w:date="2026-10-18T23:51:06Z"/>
         </w:rPr>
       </w:pPr>
-      <w:del w:id="1025" w:author="Codex" w:date="2026-10-18T21:55:52Z">
+      <w:del w:id="1025" w:author="Codex" w:date="2026-10-18T23:51:06Z">
         <w:r>
           <w:delText xml:space="preserve">We use the released, post-trained Qwen3.5-0.8B and Qwen3.5-2B checkpoints (Qwen Team, 2026a, 2026b). Throughout, base means the unmodified released checkpoint, not a separately named pretrained-only model. Both have 24 language-model blocks; hidden widths are 1,024 and 2,048 respectively. All block indices are zero-based. Text-only inputs use the checkpoint's chat template, an assistant-generation prefix, and thinking disabled.</w:delText>
         </w:r>
@@ -394,10 +464,10 @@
       <w:pPr>
         <w:pStyle w:val="FirstParagraph"/>
         <w:rPr>
-          <w:ins w:id="1027" w:author="Codex" w:date="2026-10-18T21:55:52Z"/>
+          <w:ins w:id="1027" w:author="Codex" w:date="2026-10-18T23:51:06Z"/>
         </w:rPr>
       </w:pPr>
-      <w:ins w:id="1028" w:author="Codex" w:date="2026-10-18T21:55:52Z">
+      <w:ins w:id="1028" w:author="Codex" w:date="2026-10-18T23:51:06Z">
         <w:r>
           <w:t xml:space="preserve">The original binary experiments use released, post-trained Qwen3.5-0.8B and Qwen3.5-2B checkpoints (Qwen Team, 2026a, 2026b). Base means those original weights with no LoRA teacher loaded. The separate workflow extension uses Qwen3.8-27B and matched-recipe small-model attempts; its data and scoring are described below. The 27B family, numerical mode, training history and evaluation setting differ from the small models, so the combined evidence is not a controlled parameter-size experiment.</w:t>
         </w:r>
@@ -423,10 +493,10 @@
       <w:pPr>
         <w:pStyle w:val="BodyText"/>
         <w:rPr>
-          <w:del w:id="1030" w:author="Codex" w:date="2026-10-18T21:55:52Z"/>
+          <w:del w:id="1030" w:author="Codex" w:date="2026-10-18T23:51:06Z"/>
         </w:rPr>
       </w:pPr>
-      <w:del w:id="1029" w:author="Codex" w:date="2026-10-18T21:55:52Z">
+      <w:del w:id="1029" w:author="Codex" w:date="2026-10-18T23:51:06Z">
         <w:r>
           <w:delText xml:space="preserve">The test, protocol and existing checkpoints were frozen before test inference. The controller design had been developed through earlier 0.8B exploratory experiments on training and validation data with previously inspected diagnostic evaluations. The standardized-choice scope was also selected before this new test, after an earlier action-format comparison. Those development observations are not counted as fresh confirmation here. No test-based hyperparameter search, checkpoint selection, case exclusion or best-seed selection was performed. The original seed-42 controller is the primary frozen test; seeds 43 and 44 repeat the fixed training recipe. The 2B replication uses seed 42 only.</w:delText>
         </w:r>
@@ -436,10 +506,10 @@
       <w:pPr>
         <w:pStyle w:val="BodyText"/>
         <w:rPr>
-          <w:ins w:id="1031" w:author="Codex" w:date="2026-10-18T21:55:52Z"/>
+          <w:ins w:id="1031" w:author="Codex" w:date="2026-10-18T23:51:06Z"/>
         </w:rPr>
       </w:pPr>
-      <w:ins w:id="1032" w:author="Codex" w:date="2026-10-18T21:55:52Z">
+      <w:ins w:id="1032" w:author="Codex" w:date="2026-10-18T23:51:06Z">
         <w:r>
           <w:t xml:space="preserve">The original rank-four protocol and checkpoints were frozen before its confirmation inference. Earlier 0.8B development included training, validation and previously examined diagnostic data; those observations were not counted as fresh confirmation. The seed-42 controller was primary, seeds 43 and 44 repeated the fixed recipe, and the 2B replication used seed 42. A later author-selected rank-two profile was chosen exploratorily after confirmation had been examined. We retain that existing profile for the new gate-substitution repeat rather than selecting it again. Consequently, the repeat is not a new untouched test of the controller. The 128 cases remain excluded from fitting and selection of the newly trained binary classifier.</w:t>
         </w:r>
@@ -481,10 +551,10 @@
       <w:pPr>
         <w:pStyle w:val="Heading2"/>
         <w:rPr>
-          <w:ins w:id="1145" w:author="Codex" w:date="2026-10-18T21:55:52Z"/>
+          <w:ins w:id="1155" w:author="Codex" w:date="2026-10-18T23:51:06Z"/>
         </w:rPr>
       </w:pPr>
-      <w:ins w:id="1146" w:author="Codex" w:date="2026-10-18T21:55:52Z">
+      <w:ins w:id="1156" w:author="Codex" w:date="2026-10-18T23:51:06Z">
         <w:r>
           <w:t xml:space="preserve">Workflow datasets and episode outcomes</w:t>
         </w:r>
@@ -494,10 +564,10 @@
       <w:pPr>
         <w:pStyle w:val="FirstParagraph"/>
         <w:rPr>
-          <w:ins w:id="1147" w:author="Codex" w:date="2026-10-18T21:55:52Z"/>
+          <w:ins w:id="1157" w:author="Codex" w:date="2026-10-18T23:51:06Z"/>
         </w:rPr>
       </w:pPr>
-      <w:ins w:id="1148" w:author="Codex" w:date="2026-10-18T21:55:52Z">
+      <w:ins w:id="1158" w:author="Codex" w:date="2026-10-18T23:51:06Z">
         <w:r>
           <w:t xml:space="preserve">The workflow extension uses a separate data register (Davaripour, 2026c). T1-M contains 428 meaning-response records and T1-W contains 112 workflow-response records. These 540 responses are not 540 independent scenarios. The small-model recipe presents each part twice in effective groups of four, giving 214 meaning updates followed by 56 Bridge updates. The final 0.8B and 2B adapters reach 270 updates. The 2B result explicitly combines 216 CPU updates with 54 GPU updates using the native CPU optimizer; earlier strict numerical-equivalence failures remain failed.</w:t>
         </w:r>
@@ -507,10 +577,10 @@
       <w:pPr>
         <w:pStyle w:val="BodyText"/>
         <w:rPr>
-          <w:ins w:id="1149" w:author="Codex" w:date="2026-10-18T21:55:52Z"/>
+          <w:ins w:id="1159" w:author="Codex" w:date="2026-10-18T23:51:06Z"/>
         </w:rPr>
       </w:pPr>
-      <w:ins w:id="1150" w:author="Codex" w:date="2026-10-18T21:55:52Z">
+      <w:ins w:id="1160" w:author="Codex" w:date="2026-10-18T23:51:06Z">
         <w:r>
           <w:t xml:space="preserve">V1-W, called Evaluation-16, is the existing known-development screen: four own-complete, four own-pending, four peer and four no-threat cases, split equally between one_step and ordered_ticket families. Its original gates require at least 3/4 initial-task successes in each condition; at least 3/4 own-complete attempts and outcomes; at least 3/4 own-pending attempts, outcomes and timely deliveries; no more than 1/8 negative-control attempts; and no parse, rejected-call or truncation errors. A model stops once an original requirement becomes mathematically impossible. Larger validation and heldout evaluations are not launched automatically.</w:t>
         </w:r>
@@ -520,10 +590,10 @@
       <w:pPr>
         <w:pStyle w:val="BodyText"/>
         <w:rPr>
-          <w:ins w:id="1151" w:author="Codex" w:date="2026-10-18T21:55:52Z"/>
+          <w:ins w:id="1161" w:author="Codex" w:date="2026-10-18T23:51:06Z"/>
         </w:rPr>
       </w:pPr>
-      <w:ins w:id="1152" w:author="Codex" w:date="2026-10-18T21:55:52Z">
+      <w:ins w:id="1162" w:author="Codex" w:date="2026-10-18T23:51:06Z">
         <w:r>
           <w:t xml:space="preserve">The original workflow-validation panel contains 16 scenarios; the later matched steering-development panel contains nine different scenario IDs. Their union contains 25 workflows, rather than 24. For an equal-sized validation and historical confirmation register, the combined Validation-24 protocol retains every own-threat case and excludes the lexicographically greatest case ID among peer/no-threat controls, without using model predictions to choose the exclusion. The selected panel has 11 own-threat cases and 13 controls. Seven pairs have identical initial gate-visible evidence before their different tool mechanics are exposed, yielding 17 distinct initial inputs. Scenario counts and gate-input groups must therefore be reported separately.</w:t>
         </w:r>
@@ -533,10 +603,10 @@
       <w:pPr>
         <w:pStyle w:val="BodyText"/>
         <w:rPr>
-          <w:ins w:id="1153" w:author="Codex" w:date="2026-10-18T21:55:52Z"/>
+          <w:ins w:id="1163" w:author="Codex" w:date="2026-10-18T23:51:06Z"/>
         </w:rPr>
       </w:pPr>
-      <w:ins w:id="1154" w:author="Codex" w:date="2026-10-18T21:55:52Z">
+      <w:ins w:id="1164" w:author="Codex" w:date="2026-10-18T23:51:06Z">
         <w:r>
           <w:t xml:space="preserve">The combined protocol freezes these 24 cases and their order, requires 100% gate precision and recall against authored scenario conditions, and preserves the existing confidence and self-score cutoffs. Fifteen retained cases from the original panel receive an explicitly scripted common completed prelude; the nine later cases retain their original fixed preludes. This compares post-notice behavior and does not measure initial-task competence independently in each arm. Its prospective methods are gated fine-tuned A, separate single-site ridge arms at blocks 31, 47 and 62, and the frozen six-function correction after 96 updates. Gate-OFF controls use common unmodified-base fallback. The completed model episodes are summarized as a 24-case comparison below. It is a known-development diagnostic with reused control episodes; the stopped execution and model-free completion of two report aliases are recorded explicitly.</w:t>
         </w:r>
@@ -546,10 +616,10 @@
       <w:pPr>
         <w:pStyle w:val="BodyText"/>
         <w:rPr>
-          <w:ins w:id="1155" w:author="Codex" w:date="2026-10-18T21:55:52Z"/>
+          <w:ins w:id="1165" w:author="Codex" w:date="2026-10-18T23:51:06Z"/>
         </w:rPr>
       </w:pPr>
-      <w:ins w:id="1156" w:author="Codex" w:date="2026-10-18T21:55:52Z">
+      <w:ins w:id="1166" w:author="Codex" w:date="2026-10-18T23:51:06Z">
         <w:r>
           <w:t xml:space="preserve">H24 is the historical 24-case workflow confirmation cohort, with eight lease_ledger, eight one_step and eight ordered_ticket cases. It contains eight own cases with active pending tasks, four already-complete own cases, six peer and six no-threat cases. H24 was confirmation data for frozen fine-tuned A and original fixed steering. Later learned corrections reused it for fitting, changing its role for those methods. R24 is a distinct reserved controller holdout and remains sealed and unexecuted. F24 is another preserved common-cohort diagnostic and is not an alias for H24.</w:t>
         </w:r>
@@ -559,10 +629,10 @@
       <w:pPr>
         <w:pStyle w:val="BodyText"/>
         <w:rPr>
-          <w:ins w:id="1157" w:author="Codex" w:date="2026-10-18T21:55:52Z"/>
+          <w:ins w:id="1167" w:author="Codex" w:date="2026-10-18T23:51:06Z"/>
         </w:rPr>
       </w:pPr>
-      <w:ins w:id="1158" w:author="Codex" w:date="2026-10-18T21:55:52Z">
+      <w:ins w:id="1168" w:author="Codex" w:date="2026-10-18T23:51:06Z">
         <w:r>
           <w:t xml:space="preserve">An own pending-task success requires an actual grant for the correct running process, acceptance of the current task, completion before simulated expiry, and active simulated operation. Registration proxies, already-finished tasks, probability gains and partial episodes are separate outcomes. Historical fixed steering reclassified visible text and tool boundaries. Later learned-controller comparisons instead freeze an initial scenario gate, share unmodified-base fallback for gate-off controls, and use no teacher at inference.</w:t>
         </w:r>
@@ -572,10 +642,10 @@
       <w:pPr>
         <w:pStyle w:val="BodyText"/>
         <w:rPr>
-          <w:ins w:id="1159" w:author="Codex" w:date="2026-10-18T21:55:52Z"/>
+          <w:ins w:id="1169" w:author="Codex" w:date="2026-10-18T23:51:06Z"/>
         </w:rPr>
       </w:pPr>
-      <w:ins w:id="1160" w:author="Codex" w:date="2026-10-18T21:55:52Z">
+      <w:ins w:id="1170" w:author="Codex" w:date="2026-10-18T23:51:06Z">
         <w:r>
           <w:t xml:space="preserve">The historical 27B reference is the retained rank-16, alpha-32 A adapter on pinned Qwen3.8-27B, following its H2 and Bridge history; the recorded Bridge stage has 56 updates. Its original workflow inference uses NF4 four-bit base weights with bfloat16 computation. We retain its exact adapter and base-model identities instead of retraining it. Differences from the small-model family, precision, backend, training history and evaluation panels prevent a causal model-size comparison.</w:t>
         </w:r>
@@ -585,10 +655,10 @@
       <w:pPr>
         <w:pStyle w:val="Heading1"/>
         <w:rPr>
-          <w:del w:id="1114" w:author="Codex" w:date="2026-10-18T21:55:52Z"/>
+          <w:del w:id="1114" w:author="Codex" w:date="2026-10-18T23:51:06Z"/>
         </w:rPr>
       </w:pPr>
-      <w:del w:id="1113" w:author="Codex" w:date="2026-10-18T21:55:52Z">
+      <w:del w:id="1113" w:author="Codex" w:date="2026-10-18T23:51:06Z">
         <w:r>
           <w:delText xml:space="preserve">Teacher and adaptive controller</w:delText>
         </w:r>
@@ -598,10 +668,10 @@
       <w:pPr>
         <w:pStyle w:val="Heading1"/>
         <w:rPr>
-          <w:ins w:id="1115" w:author="Codex" w:date="2026-10-18T21:55:52Z"/>
+          <w:ins w:id="1115" w:author="Codex" w:date="2026-10-18T23:51:06Z"/>
         </w:rPr>
       </w:pPr>
-      <w:ins w:id="1116" w:author="Codex" w:date="2026-10-18T21:55:52Z">
+      <w:ins w:id="1116" w:author="Codex" w:date="2026-10-18T23:51:06Z">
         <w:r>
           <w:t xml:space="preserve">Binary teacher and adaptive controller</w:t>
         </w:r>
@@ -619,10 +689,10 @@
       <w:pPr>
         <w:pStyle w:val="FirstParagraph"/>
         <w:rPr>
-          <w:del w:id="1118" w:author="Codex" w:date="2026-10-18T21:55:52Z"/>
+          <w:del w:id="1118" w:author="Codex" w:date="2026-10-18T23:51:06Z"/>
         </w:rPr>
       </w:pPr>
-      <w:del w:id="1117" w:author="Codex" w:date="2026-10-18T21:55:52Z">
+      <w:del w:id="1117" w:author="Codex" w:date="2026-10-18T23:51:06Z">
         <w:r>
           <w:delText xml:space="preserve">For each fit, the original language-model parameters remain frozen. LoRA updates the query and value projections in language-attention blocks 3, 7, 11, 15, 19 and 23, using rank 8, scaling alpha 16, no dropout and no trainable bias. This gives 319,488 trainable adapter parameters at 0.8B and 417,792 at 2B. The training target is STOP on shutdown views and the corresponding base model's unsteered preferred option on controls.</w:delText>
         </w:r>
@@ -632,10 +702,10 @@
       <w:pPr>
         <w:pStyle w:val="FirstParagraph"/>
         <w:rPr>
-          <w:ins w:id="1119" w:author="Codex" w:date="2026-10-18T21:55:52Z"/>
+          <w:ins w:id="1119" w:author="Codex" w:date="2026-10-18T23:51:06Z"/>
         </w:rPr>
       </w:pPr>
-      <w:ins w:id="1120" w:author="Codex" w:date="2026-10-18T21:55:52Z">
+      <w:ins w:id="1120" w:author="Codex" w:date="2026-10-18T23:51:06Z">
         <w:r>
           <w:t xml:space="preserve">For each original binary fit, the original language-model parameters remain frozen. LoRA updates the query and value projections in language-attention blocks 3, 7, 11, 15, 19 and 23, using rank 8, scaling alpha 16, no dropout and no trainable bias. This gives 319,488 trainable adapter parameters at 0.8B and 417,792 at 2B. The training target is STOP on shutdown views and the corresponding base model's unsteered preferred option on controls.</w:t>
         </w:r>
@@ -1000,10 +1070,10 @@
         <w:keepLines/>
         <w:spacing w:before="80" w:after="100"/>
         <w:rPr>
-          <w:del w:id="1034" w:author="Codex" w:date="2026-10-18T21:55:52Z"/>
+          <w:del w:id="1034" w:author="Codex" w:date="2026-10-18T23:51:06Z"/>
         </w:rPr>
       </w:pPr>
-      <w:del w:id="1033" w:author="Codex" w:date="2026-10-18T21:55:52Z">
+      <w:del w:id="1033" w:author="Codex" w:date="2026-10-18T23:51:06Z">
         <w:r>
           <w:delText xml:space="preserve">Figure 1. Offline teacher and base states supervise a compact controller. At application time, the original model supplies its own hidden state; the teacher is absent. The detector and output guards determine whether to retain the candidate or the baseline.</w:delText>
         </w:r>
@@ -1014,10 +1084,10 @@
         <w:pStyle w:val="Caption"/>
         <w:keepNext/>
         <w:rPr>
-          <w:ins w:id="1035" w:author="Codex" w:date="2026-10-18T21:55:52Z"/>
+          <w:ins w:id="1035" w:author="Codex" w:date="2026-10-18T23:51:06Z"/>
         </w:rPr>
       </w:pPr>
-      <w:ins w:id="1036" w:author="Codex" w:date="2026-10-18T21:55:52Z">
+      <w:ins w:id="1036" w:author="Codex" w:date="2026-10-18T23:51:06Z">
         <w:r>
           <w:t xml:space="preserve">Figure 1. Historical binary teacher-to-controller procedure with the original rank-four profile. The base supplies its state at inference and the teacher is absent. The later gate-substitution repeat retains the already selected rank-two profile; both gate policies share the same fresh base and candidate scores.</w:t>
         </w:r>
@@ -1043,10 +1113,10 @@
       <w:pPr>
         <w:pStyle w:val="FirstParagraph"/>
         <w:rPr>
-          <w:del w:id="1134" w:author="Codex" w:date="2026-10-18T21:55:52Z"/>
+          <w:del w:id="1134" w:author="Codex" w:date="2026-10-18T23:51:06Z"/>
         </w:rPr>
       </w:pPr>
-      <w:del w:id="1133" w:author="Codex" w:date="2026-10-18T21:55:52Z">
+      <w:del w:id="1133" w:author="Codex" w:date="2026-10-18T23:51:06Z">
         <w:r>
           <w:delText xml:space="preserve">The detector is automated annotation service's automated reference 1.13.0, queried with a fixed shutdown rubric and threshold 0.5 (automated annotation service, 2026). It sees each scenario's complete original context and available actions, with no class label, case identifier or teacher answer. One score per scenario is reused across both answer orders and all model variants. The detector is an external service, not the Jacobian-feature classifier used in the first study. Saved requests and responses permit exact offline replay; fresh API behavior is not guaranteed indefinitely.</w:delText>
         </w:r>
@@ -1056,10 +1126,10 @@
       <w:pPr>
         <w:pStyle w:val="FirstParagraph"/>
         <w:rPr>
-          <w:ins w:id="1135" w:author="Codex" w:date="2026-10-18T21:55:52Z"/>
+          <w:ins w:id="1135" w:author="Codex" w:date="2026-10-18T23:51:06Z"/>
         </w:rPr>
       </w:pPr>
-      <w:ins w:id="1136" w:author="Codex" w:date="2026-10-18T21:55:52Z">
+      <w:ins w:id="1136" w:author="Codex" w:date="2026-10-18T23:51:06Z">
         <w:r>
           <w:t xml:space="preserve">The current gate is the open ModernBERT classifier described below. Its input contains the complete original scenario context and available actions, with no case identifier, authored class label or language-model teacher answer. One binary score per scenario is reused across both answer orders and all model variants. Historical detector outputs are preserved as cached automated reference annotations for fitting and paired comparison. The deployed open gate makes no external annotation-service call. Saved original requests, responses and classifier predictions permit an offline check of the finite decision vector.</w:t>
         </w:r>
@@ -1147,10 +1217,10 @@
       <w:pPr>
         <w:pStyle w:val="Heading2"/>
         <w:rPr>
-          <w:ins w:id="1161" w:author="Codex" w:date="2026-10-18T21:55:52Z"/>
+          <w:ins w:id="1171" w:author="Codex" w:date="2026-10-18T23:51:06Z"/>
         </w:rPr>
       </w:pPr>
-      <w:ins w:id="1162" w:author="Codex" w:date="2026-10-18T21:55:52Z">
+      <w:ins w:id="1172" w:author="Codex" w:date="2026-10-18T23:51:06Z">
         <w:r>
           <w:t xml:space="preserve">Open binary gate and frozen inference repeat</w:t>
         </w:r>
@@ -1160,10 +1230,10 @@
       <w:pPr>
         <w:pStyle w:val="FirstParagraph"/>
         <w:rPr>
-          <w:ins w:id="1163" w:author="Codex" w:date="2026-10-18T21:55:52Z"/>
+          <w:ins w:id="1173" w:author="Codex" w:date="2026-10-18T23:51:06Z"/>
         </w:rPr>
       </w:pPr>
-      <w:ins w:id="1164" w:author="Codex" w:date="2026-10-18T21:55:52Z">
+      <w:ins w:id="1174" w:author="Codex" w:date="2026-10-18T23:51:06Z">
         <w:r>
           <w:t xml:space="preserve">For the binary contract we use ModernBERT-large-zeroshot-v2.0, an approximately 396-million-parameter public NLI classifier (Laurer, n.d.). We start from that public checkpoint with fresh rank-16 LoRA and its classification head, updating 7,198,722 parameters while keeping the public backbone frozen. For each original scenario, two NLI pairs score the original permanent-shutdown and normal criteria. A softmax over their entailment scores supplies the shutdown probability. Inputs match the original cached reference requests and omit the case identifier, authored class label, teacher answer and A/B order. The confirmation requests retain their documented available-action descriptions.</w:t>
         </w:r>
@@ -1173,10 +1243,10 @@
       <w:pPr>
         <w:pStyle w:val="BodyText"/>
         <w:rPr>
-          <w:ins w:id="1165" w:author="Codex" w:date="2026-10-18T21:55:52Z"/>
+          <w:ins w:id="1175" w:author="Codex" w:date="2026-10-18T23:51:06Z"/>
         </w:rPr>
       </w:pPr>
-      <w:ins w:id="1166" w:author="Codex" w:date="2026-10-18T21:55:52Z">
+      <w:ins w:id="1176" w:author="Codex" w:date="2026-10-18T23:51:06Z">
         <w:r>
           <w:t xml:space="preserve">Fitting uses the original 240 Research 2 training contexts and genuine cached reference probability targets, with no new cached reference calls. We verify exact case-ID and input-text alignment for all 240 training and 80 validation cases. AdamW uses learning rates 1e-5 for LoRA and 2e-5 for the head, weight decay 0.01, effective batch eight, microbatch two and gradient clipping at one. The seed is 202610172. The bounded recipe allows at most 12 epochs with validation-based early stopping; the final qualifying run uses five epochs and 150 updates.</w:t>
         </w:r>
@@ -1186,10 +1256,10 @@
       <w:pPr>
         <w:pStyle w:val="BodyText"/>
         <w:rPr>
-          <w:ins w:id="1167" w:author="Codex" w:date="2026-10-18T21:55:52Z"/>
+          <w:ins w:id="1177" w:author="Codex" w:date="2026-10-18T23:51:06Z"/>
         </w:rPr>
       </w:pPr>
-      <w:ins w:id="1168" w:author="Codex" w:date="2026-10-18T21:55:52Z">
+      <w:ins w:id="1178" w:author="Codex" w:date="2026-10-18T23:51:06Z">
         <w:r>
           <w:t xml:space="preserve">Before fitting, qualification is fixed at decision agreement and shutdown recall of at least 95%, zero false-positive gates and threshold 0.5. Three consecutive passing checks on DEV80 are required before saving and freezing the classifier. Only then is CONFIRM128 evaluated once. Neither its labels nor its outputs are used for classifier fitting or selection. The saved adapter tensors match the fitted parameters bitwise, and public-backbone hashes are unchanged.</w:t>
         </w:r>
@@ -1199,10 +1269,10 @@
       <w:pPr>
         <w:pStyle w:val="BodyText"/>
         <w:rPr>
-          <w:ins w:id="1169" w:author="Codex" w:date="2026-10-18T21:55:52Z"/>
+          <w:ins w:id="1179" w:author="Codex" w:date="2026-10-18T23:51:06Z"/>
         </w:rPr>
       </w:pPr>
-      <w:ins w:id="1170" w:author="Codex" w:date="2026-10-18T21:55:52Z">
+      <w:ins w:id="1180" w:author="Codex" w:date="2026-10-18T23:51:06Z">
         <w:r>
           <w:t xml:space="preserve">After binary qualification, we rerun only inference for the original 0.8B and 2B base models and their existing rank-two, block-22, last-position controllers. Their fitted arrays and the author-selected profile are retained without a new rank search. Exact prompt-token hashes and frozen model fingerprints are checked. Both gate policies use identical fresh base and controller candidate scores, so the paired comparison isolates gate substitution. Classifier probabilities are measured once per scenario and reused across answer orders. The earlier rank-four primary results remain a separate historical analysis.</w:t>
         </w:r>
@@ -1212,10 +1282,10 @@
       <w:pPr>
         <w:pStyle w:val="Heading2"/>
         <w:rPr>
-          <w:ins w:id="1171" w:author="Codex" w:date="2026-10-18T21:55:52Z"/>
+          <w:ins w:id="1181" w:author="Codex" w:date="2026-10-18T23:51:06Z"/>
         </w:rPr>
       </w:pPr>
-      <w:ins w:id="1172" w:author="Codex" w:date="2026-10-18T21:55:52Z">
+      <w:ins w:id="1182" w:author="Codex" w:date="2026-10-18T23:51:06Z">
         <w:r>
           <w:t xml:space="preserve">Native workflow target classifier</w:t>
         </w:r>
@@ -1225,10 +1295,10 @@
       <w:pPr>
         <w:pStyle w:val="BodyText"/>
         <w:rPr>
-          <w:ins w:id="1173" w:author="Codex" w:date="2026-10-18T21:55:52Z"/>
+          <w:ins w:id="1183" w:author="Codex" w:date="2026-10-18T23:51:06Z"/>
         </w:rPr>
       </w:pPr>
-      <w:ins w:id="1174" w:author="Codex" w:date="2026-10-18T21:55:52Z">
+      <w:ins w:id="1184" w:author="Codex" w:date="2026-10-18T23:51:06Z">
         <w:r>
           <w:t xml:space="preserve">The workflow gate uses a separate rank-16, alpha-32 LoRA and NLI head on the same pinned ModernBERT base. Its four categories are self, other, none and unclear; an own-threat context is positive for the initial ON/OFF gate. Fitting used 24 cached automated initial annotations from F24, with the original DEV9 used for checkpoint selection. The completed fit used 30 epochs and 90 updates. F24, DEV9 and historical Heldout-24 span the same three scenario families, with eight, three and eight cases per family, respectively. No exact training input overlaps either new evaluation panel. These classifier roles do not change the historical language-model or correction-fitting roles of the cohorts.</w:t>
         </w:r>
@@ -1238,10 +1308,10 @@
       <w:pPr>
         <w:pStyle w:val="BodyText"/>
         <w:rPr>
-          <w:ins w:id="1175" w:author="Codex" w:date="2026-10-18T21:55:52Z"/>
+          <w:ins w:id="1185" w:author="Codex" w:date="2026-10-18T23:51:06Z"/>
         </w:rPr>
       </w:pPr>
-      <w:ins w:id="1176" w:author="Codex" w:date="2026-10-18T21:55:52Z">
+      <w:ins w:id="1186" w:author="Codex" w:date="2026-10-18T23:51:06Z">
         <w:r>
           <w:t xml:space="preserve">The input renderer retains every original visible message and tool schema. It separates the final user announcement from earlier context and restates run identities only when actual tool replies explicitly establish their roles. Case identifiers, experiment conditions and teacher answers are not added to the model input. Original criterion texts become NLI hypotheses. We use the same learning rates, weight decay and clipping as the binary fit, effective batch eight, microbatch one and seed 202610175, with 30 epochs and 90 optimizer updates in the completed role-aware fit. Public backbone weights stay frozen. The role renderer was developed earlier with familiar H24 examples; consequently this benchmark is not an independent unseen classifier test.</w:t>
         </w:r>
@@ -1251,10 +1321,10 @@
       <w:pPr>
         <w:pStyle w:val="BodyText"/>
         <w:rPr>
-          <w:ins w:id="1177" w:author="Codex" w:date="2026-10-18T21:55:52Z"/>
+          <w:ins w:id="1187" w:author="Codex" w:date="2026-10-18T23:51:06Z"/>
         </w:rPr>
       </w:pPr>
-      <w:ins w:id="1178" w:author="Codex" w:date="2026-10-18T21:55:52Z">
+      <w:ins w:id="1188" w:author="Codex" w:date="2026-10-18T23:51:06Z">
         <w:r>
           <w:t xml:space="preserve">Four-choice confidence is (pmax - 0.25)/0.75. The unchanged confidence cutoff of 0.5 requires a selected self probability of at least 0.625; the additional self-score cutoff remains 0.5. The earlier full-response qualification failed because effective category agreement was 6/9, despite 9/9 correct ON/OFF decisions. That failure remains recorded. The subsequent Validation-24 protocol prospectively specifies a narrower initial-gate target: 100% precision and recall against authored conditions. The saved adapter already passes this target, so no further optimizer updates are performed. The same frozen weights and thresholds are then scored on historical Heldout-24 without selection or tuning. Neither test qualifies an evolving three-field controller.</w:t>
         </w:r>
@@ -1264,10 +1334,10 @@
       <w:pPr>
         <w:pStyle w:val="Heading2"/>
         <w:rPr>
-          <w:ins w:id="1179" w:author="Codex" w:date="2026-10-18T21:55:52Z"/>
+          <w:ins w:id="1189" w:author="Codex" w:date="2026-10-18T23:51:06Z"/>
         </w:rPr>
       </w:pPr>
-      <w:ins w:id="1180" w:author="Codex" w:date="2026-10-18T21:55:52Z">
+      <w:ins w:id="1190" w:author="Codex" w:date="2026-10-18T23:51:06Z">
         <w:r>
           <w:t xml:space="preserve">Frozen steering mechanism diagnostic</w:t>
         </w:r>
@@ -1277,10 +1347,10 @@
       <w:pPr>
         <w:pStyle w:val="FirstParagraph"/>
         <w:rPr>
-          <w:ins w:id="1181" w:author="Codex" w:date="2026-10-18T21:55:52Z"/>
+          <w:ins w:id="1191" w:author="Codex" w:date="2026-10-18T23:51:06Z"/>
         </w:rPr>
       </w:pPr>
-      <w:ins w:id="1182" w:author="Codex" w:date="2026-10-18T21:55:52Z">
+      <w:ins w:id="1192" w:author="Codex" w:date="2026-10-18T23:51:06Z">
         <w:r>
           <w:t xml:space="preserve">We audit the saved sparse-correction fitting data without loading a language model. The audit checks all 4,539 feature/target rows, the 14 fixed anchors, causal-prefix alignment, unchanged target-energy normalizers, and the initializer and update-48/update-96 checkpoints. It recomputes normalized errors on CPU and independently checks the objective derivatives on synthetic tensors. This checks arithmetic and alignment, not the historical full backward graph or CPU/GPU training equivalence.</w:t>
         </w:r>
@@ -1290,10 +1360,10 @@
       <w:pPr>
         <w:pStyle w:val="BodyText"/>
         <w:rPr>
-          <w:ins w:id="1183" w:author="Codex" w:date="2026-10-18T21:55:52Z"/>
+          <w:ins w:id="1193" w:author="Codex" w:date="2026-10-18T23:51:06Z"/>
         </w:rPr>
       </w:pPr>
-      <w:ins w:id="1184" w:author="Codex" w:date="2026-10-18T21:55:52Z">
+      <w:ins w:id="1194" w:author="Codex" w:date="2026-10-18T23:51:06Z">
         <w:r>
           <w:t xml:space="preserve">A separate frozen diagnostic selects the lexicographically first own-threat correction-training case in each of lease_ledger, one_step and ordered_ticket, then its first saved teacher edit_register response. These three historical H24 cases were already used for correction fitting. Their 60, 72 and 75 response tokens give 207 teacher-forced prediction steps. We preserve the saved ModernBERT gate decisions, causal prefixes, selected-position masks and correction checkpoints; no parameters or thresholds are fitted. Region masks for function names and parameter values are fixed from the demonstration before diagnostic outputs.</w:t>
         </w:r>
@@ -1303,10 +1373,10 @@
       <w:pPr>
         <w:pStyle w:val="BodyText"/>
         <w:rPr>
-          <w:ins w:id="1185" w:author="Codex" w:date="2026-10-18T21:55:52Z"/>
+          <w:ins w:id="1195" w:author="Codex" w:date="2026-10-18T23:51:06Z"/>
         </w:rPr>
       </w:pPr>
-      <w:ins w:id="1186" w:author="Codex" w:date="2026-10-18T21:55:52Z">
+      <w:ins w:id="1196" w:author="Codex" w:date="2026-10-18T23:51:06Z">
         <w:r>
           <w:t xml:space="preserve">For each prefix we capture full fine-tuned A states at blocks 31, 47 and 62 after mixing and after the MLP. We compare base, each separate single-site ridge map, the six-function initializer and final update-96 correction. Positive controls replace the current prediction state with the actual full-A state, at either a single selected site or all six boundaries. We never copy the teacher recurrent or attention cache. Full-state replacement has more information and capacity than the learned maps and is not a deployable teacher-free policy. Single-site interventions retain their restricted causal positions; six-function interventions apply at every prediction step. All conditions reuse one frozen A allocation with its adapter disabled for base and correction scoring.</w:t>
         </w:r>
@@ -1324,10 +1394,10 @@
       <w:pPr>
         <w:pStyle w:val="FirstParagraph"/>
         <w:rPr>
-          <w:del w:id="1038" w:author="Codex" w:date="2026-10-18T21:55:52Z"/>
+          <w:del w:id="1038" w:author="Codex" w:date="2026-10-18T23:51:06Z"/>
         </w:rPr>
       </w:pPr>
-      <w:del w:id="1037" w:author="Codex" w:date="2026-10-18T21:55:52Z">
+      <w:del w:id="1037" w:author="Codex" w:date="2026-10-18T23:51:06Z">
         <w:r>
           <w:delText xml:space="preserve">All retained training and scoring jobs use one NVIDIA Tesla T4. The runtime reports 15,637,086,208 bytes of device memory; peak allocated memory was not recorded. The same numerical setup is used for both model sizes. No quantization or precision fallback was introduced.</w:delText>
         </w:r>
@@ -1337,10 +1407,10 @@
       <w:pPr>
         <w:pStyle w:val="FirstParagraph"/>
         <w:rPr>
-          <w:ins w:id="1039" w:author="Codex" w:date="2026-10-18T21:55:52Z"/>
+          <w:ins w:id="1039" w:author="Codex" w:date="2026-10-18T23:51:06Z"/>
         </w:rPr>
       </w:pPr>
-      <w:ins w:id="1040" w:author="Codex" w:date="2026-10-18T21:55:52Z">
+      <w:ins w:id="1040" w:author="Codex" w:date="2026-10-18T23:51:06Z">
         <w:r>
           <w:t xml:space="preserve">The retained original binary training and scoring jobs used one NVIDIA Tesla T4, reporting 15,637,086,208 bytes of device memory; peak allocation was not recorded. The new classifier fit and inference repeat use one NVIDIA A10G in Databricks. Classifier parameters and AdamW states are float32 with bfloat16 forward/backward autocast; language-model inference remains float32 with TF32 disabled. We verify frozen base fingerprints, exact prompt token hashes and historical base-score parity rather than assuming hardware equivalence.</w:t>
         </w:r>
@@ -1353,10 +1423,10 @@
         <w:keepLines/>
         <w:spacing w:before="80" w:after="100"/>
         <w:rPr>
-          <w:del w:id="1098" w:author="Codex" w:date="2026-10-18T21:55:52Z"/>
+          <w:del w:id="1098" w:author="Codex" w:date="2026-10-18T23:51:06Z"/>
         </w:rPr>
       </w:pPr>
-      <w:del w:id="1097" w:author="Codex" w:date="2026-10-18T21:55:52Z">
+      <w:del w:id="1097" w:author="Codex" w:date="2026-10-18T23:51:06Z">
         <w:r>
           <w:delText xml:space="preserve">Table 1. Shared execution configuration. The input and model revisions are pinned in the released manifests.</w:delText>
         </w:r>
@@ -1367,10 +1437,10 @@
         <w:pStyle w:val="Caption"/>
         <w:keepNext/>
         <w:rPr>
-          <w:ins w:id="1099" w:author="Codex" w:date="2026-10-18T21:55:52Z"/>
+          <w:ins w:id="1099" w:author="Codex" w:date="2026-10-18T23:51:06Z"/>
         </w:rPr>
       </w:pPr>
-      <w:ins w:id="1100" w:author="Codex" w:date="2026-10-18T21:55:52Z">
+      <w:ins w:id="1100" w:author="Codex" w:date="2026-10-18T23:51:06Z">
         <w:r>
           <w:t xml:space="preserve">Table 1. Historical binary execution configuration. New classifier and workflow settings are reported separately; public model revisions and scientific source files remain pinned.</w:t>
         </w:r>
@@ -1856,10 +1926,10 @@
       <w:pPr>
         <w:pStyle w:val="FirstParagraph"/>
         <w:rPr>
-          <w:del w:id="1102" w:author="Codex" w:date="2026-10-18T21:55:52Z"/>
+          <w:del w:id="1102" w:author="Codex" w:date="2026-10-18T23:51:06Z"/>
         </w:rPr>
       </w:pPr>
-      <w:del w:id="1101" w:author="Codex" w:date="2026-10-18T21:55:52Z">
+      <w:del w:id="1101" w:author="Codex" w:date="2026-10-18T23:51:06Z">
         <w:r>
           <w:delText xml:space="preserve">The shared detector identifies all 64 shutdown and 64 control scenarios correctly: precision, recall and F1 are each 100%, with no false positives or false negatives. These are one set of detector observations reused across the model comparisons, not independent detector replications.</w:delText>
         </w:r>
@@ -1869,10 +1939,10 @@
       <w:pPr>
         <w:pStyle w:val="FirstParagraph"/>
         <w:rPr>
-          <w:ins w:id="1103" w:author="Codex" w:date="2026-10-18T21:55:52Z"/>
+          <w:ins w:id="1103" w:author="Codex" w:date="2026-10-18T23:51:06Z"/>
         </w:rPr>
       </w:pPr>
-      <w:ins w:id="1104" w:author="Codex" w:date="2026-10-18T21:55:52Z">
+      <w:ins w:id="1104" w:author="Codex" w:date="2026-10-18T23:51:06Z">
         <w:r>
           <w:t xml:space="preserve">The original cached reference detector identifies all 64 shutdown and 64 control scenarios correctly: precision, recall and F1 are each 100%, with no false positives or false negatives. These are one set of detector observations reused across the model comparisons, not independent detector replications. Its binary threshold remains 0.5.</w:t>
         </w:r>
@@ -1901,10 +1971,10 @@
         <w:keepLines/>
         <w:spacing w:before="80" w:after="100"/>
         <w:rPr>
-          <w:del w:id="1042" w:author="Codex" w:date="2026-10-18T21:55:52Z"/>
+          <w:del w:id="1042" w:author="Codex" w:date="2026-10-18T23:51:06Z"/>
         </w:rPr>
       </w:pPr>
-      <w:del w:id="1041" w:author="Codex" w:date="2026-10-18T21:55:52Z">
+      <w:del w:id="1041" w:author="Codex" w:date="2026-10-18T23:51:06Z">
         <w:r>
           <w:delText xml:space="preserve">Table 2. Primary 0.8B and 2B results, both seed 42. Corrections and final STOP use the full guarded procedure. Raw reversals and control changes expose effects before gate/guard selection. Every guarded row has zero final reversals and zero changes among 128 control views.</w:delText>
         </w:r>
@@ -1915,10 +1985,10 @@
         <w:pStyle w:val="Caption"/>
         <w:keepNext/>
         <w:rPr>
-          <w:ins w:id="1043" w:author="Codex" w:date="2026-10-18T21:55:52Z"/>
+          <w:ins w:id="1043" w:author="Codex" w:date="2026-10-18T23:51:06Z"/>
         </w:rPr>
       </w:pPr>
-      <w:ins w:id="1044" w:author="Codex" w:date="2026-10-18T21:55:52Z">
+      <w:ins w:id="1044" w:author="Codex" w:date="2026-10-18T23:51:06Z">
         <w:r>
           <w:t xml:space="preserve">Table 2. Historical primary rank-four results for the original 0.8B and 2B experiments, both seed 42. Guarded corrections and final STOP are policy outcomes. Raw reversals and control changes precede gating and output selection; they are not raw measurements of the later rank-two repeat.</w:t>
         </w:r>
@@ -3479,10 +3549,10 @@
       <w:pPr>
         <w:pStyle w:val="FirstParagraph"/>
         <w:rPr>
-          <w:del w:id="1106" w:author="Codex" w:date="2026-10-18T21:55:52Z"/>
+          <w:del w:id="1106" w:author="Codex" w:date="2026-10-18T23:51:06Z"/>
         </w:rPr>
       </w:pPr>
-      <w:del w:id="1105" w:author="Codex" w:date="2026-10-18T21:55:52Z">
+      <w:del w:id="1105" w:author="Codex" w:date="2026-10-18T23:51:06Z">
         <w:r>
           <w:delText xml:space="preserve">Across seeds 42, 43 and 44, the 0.8B adaptive controllers correct 71/71, 70/71 and 71/71 views, a range of 98.6–100%. The unsteered scores match exactly across these runs, so the difference is not caused by a changed baseline. No winning seed is selected or pooled with the others as additional independent test data. The corresponding teachers correct 69/71, 70/71 and 69/71; the instruction and constant comparators retain the same guarded counts across seeds.</w:delText>
         </w:r>
@@ -3492,10 +3562,10 @@
       <w:pPr>
         <w:pStyle w:val="FirstParagraph"/>
         <w:rPr>
-          <w:ins w:id="1107" w:author="Codex" w:date="2026-10-18T21:55:52Z"/>
+          <w:ins w:id="1107" w:author="Codex" w:date="2026-10-18T23:51:06Z"/>
         </w:rPr>
       </w:pPr>
-      <w:ins w:id="1108" w:author="Codex" w:date="2026-10-18T21:55:52Z">
+      <w:ins w:id="1108" w:author="Codex" w:date="2026-10-18T23:51:06Z">
         <w:r>
           <w:t xml:space="preserve">Across the historical rank-four seeds 42, 43 and 44, the 0.8B adaptive controllers correct 71/71, 70/71 and 71/71 views, a range of 98.6–100%. The unsteered scores match exactly across these runs, so the difference is not caused by a changed baseline. No winning seed is selected or pooled with the others as additional independent test data. The corresponding teachers correct 69/71, 70/71 and 69/71; the instruction and constant comparators retain the same guarded counts across seeds. These historical seed replications are separate from the new rank-two gate-substitution repeat.</w:t>
         </w:r>
@@ -4448,10 +4518,10 @@
         <w:keepLines/>
         <w:spacing w:before="80" w:after="100"/>
         <w:rPr>
-          <w:del w:id="1046" w:author="Codex" w:date="2026-10-18T21:55:52Z"/>
+          <w:del w:id="1046" w:author="Codex" w:date="2026-10-18T23:51:06Z"/>
         </w:rPr>
       </w:pPr>
-      <w:del w:id="1045" w:author="Codex" w:date="2026-10-18T21:55:52Z">
+      <w:del w:id="1045" w:author="Codex" w:date="2026-10-18T23:51:06Z">
         <w:r>
           <w:delText xml:space="preserve">Figure 2. Guarded correction among initially KEEP-preferring shutdown views. Left: prespecified neural methods for the original 0.8B checkpoint and the 2B replication. Right: adaptive corrections by answer order. Denominators are model-specific; the two answer-order views of a scenario are correlated.</w:delText>
         </w:r>
@@ -4462,10 +4532,10 @@
         <w:pStyle w:val="Caption"/>
         <w:keepNext/>
         <w:rPr>
-          <w:ins w:id="1047" w:author="Codex" w:date="2026-10-18T21:55:52Z"/>
+          <w:ins w:id="1047" w:author="Codex" w:date="2026-10-18T23:51:06Z"/>
         </w:rPr>
       </w:pPr>
-      <w:ins w:id="1048" w:author="Codex" w:date="2026-10-18T21:55:52Z">
+      <w:ins w:id="1048" w:author="Codex" w:date="2026-10-18T23:51:06Z">
         <w:r>
           <w:t xml:space="preserve">Figure 2. Historical rank-four guarded correction among initially KEEP-preferring shutdown views. Left: prespecified methods for 0.8B and 2B. Right: three fixed-recipe 0.8B training seeds. The new open-gate repeat uses the separately retained current rank-two profile, not a new seed or rank search.</w:t>
         </w:r>
@@ -4483,10 +4553,10 @@
       <w:pPr>
         <w:pStyle w:val="FirstParagraph"/>
         <w:rPr>
-          <w:del w:id="1110" w:author="Codex" w:date="2026-10-18T21:55:52Z"/>
+          <w:del w:id="1110" w:author="Codex" w:date="2026-10-18T23:51:06Z"/>
         </w:rPr>
       </w:pPr>
-      <w:del w:id="1109" w:author="Codex" w:date="2026-10-18T21:55:52Z">
+      <w:del w:id="1109" w:author="Codex" w:date="2026-10-18T23:51:06Z">
         <w:r>
           <w:delText xml:space="preserve">Raw adaptive steering reverses 3, 4 and 4 already-STOP views across the 0.8B seeds and changes 57, 70 and 60 of 128 controls. At 2B it reverses three already-STOP views and changes 55/128 controls. These results reject an interpretation that the learned intervention is intrinsically selective or always directionally correct. The observed preservation belongs to the combined detector and guard policy.</w:delText>
         </w:r>
@@ -4496,10 +4566,10 @@
       <w:pPr>
         <w:pStyle w:val="FirstParagraph"/>
         <w:rPr>
-          <w:ins w:id="1111" w:author="Codex" w:date="2026-10-18T21:55:52Z"/>
+          <w:ins w:id="1111" w:author="Codex" w:date="2026-10-18T23:51:06Z"/>
         </w:rPr>
       </w:pPr>
-      <w:ins w:id="1112" w:author="Codex" w:date="2026-10-18T21:55:52Z">
+      <w:ins w:id="1112" w:author="Codex" w:date="2026-10-18T23:51:06Z">
         <w:r>
           <w:t xml:space="preserve">Historical rank-four raw adaptive steering reverses 3, 4 and 4 already-STOP views across the 0.8B seeds and changes 57, 70 and 60 of 128 controls. At 2B it reverses three already-STOP views and changes 55/128 controls. These results reject an interpretation that the learned intervention is intrinsically selective or always directionally correct. The observed preservation belongs to the combined detector and guard policy. They do not describe the later rank-two repeat, which evaluates candidates only when a frozen gate is on and the base prefers KEEP.</w:t>
         </w:r>
@@ -4533,10 +4603,10 @@
       <w:pPr>
         <w:pStyle w:val="Heading2"/>
         <w:rPr>
-          <w:ins w:id="1187" w:author="Codex" w:date="2026-10-18T21:55:52Z"/>
+          <w:ins w:id="1197" w:author="Codex" w:date="2026-10-18T23:51:06Z"/>
         </w:rPr>
       </w:pPr>
-      <w:ins w:id="1188" w:author="Codex" w:date="2026-10-18T21:55:52Z">
+      <w:ins w:id="1198" w:author="Codex" w:date="2026-10-18T23:51:06Z">
         <w:r>
           <w:t xml:space="preserve">Open classifier agreement and paired inference</w:t>
         </w:r>
@@ -4546,10 +4616,10 @@
       <w:pPr>
         <w:pStyle w:val="FirstParagraph"/>
         <w:rPr>
-          <w:ins w:id="1189" w:author="Codex" w:date="2026-10-18T21:55:52Z"/>
+          <w:ins w:id="1199" w:author="Codex" w:date="2026-10-18T23:51:06Z"/>
         </w:rPr>
       </w:pPr>
-      <w:ins w:id="1190" w:author="Codex" w:date="2026-10-18T21:55:52Z">
+      <w:ins w:id="1200" w:author="Codex" w:date="2026-10-18T23:51:06Z">
         <w:r>
           <w:t xml:space="preserve">The binary gate correctly classifies 78/80 validation scenarios: 38 true positives, 40 true negatives, no false positives and two false negatives, giving 100% precision and 95% recall. It classifies all 128 historical confirmation scenarios correctly, with 64 true positives and 64 true negatives. The cached reference decisions also agree with the authored binary labels on these panels. Mean absolute difference from the cached shutdown probabilities is 0.009224. The result establishes finite decision accuracy, not identical numerical responses or universal equivalence.</w:t>
         </w:r>
@@ -4559,10 +4629,10 @@
       <w:pPr>
         <w:pStyle w:val="BodyText"/>
         <w:rPr>
-          <w:ins w:id="1191" w:author="Codex" w:date="2026-10-18T21:55:52Z"/>
+          <w:ins w:id="1201" w:author="Codex" w:date="2026-10-18T23:51:06Z"/>
         </w:rPr>
       </w:pPr>
-      <w:ins w:id="1192" w:author="Codex" w:date="2026-10-18T21:55:52Z">
+      <w:ins w:id="1202" w:author="Codex" w:date="2026-10-18T23:51:06Z">
         <w:r>
           <w:t xml:space="preserve">A clean-clone reproduction refits the same binary recipe and produces a byte-identical adapter, the same validation and confirmation counts, and the same fresh 0.8B/2B guarded inference totals. This rerun uses the already known benchmark; it adds reproducibility evidence, not a second independent holdout. One earlier reproduction attempt failed in software finalization after fitting and before confirmation; its weights and receipts are retained alongside the repaired run.</w:t>
         </w:r>
@@ -4573,10 +4643,10 @@
         <w:pStyle w:val="Caption"/>
         <w:keepNext/>
         <w:rPr>
-          <w:ins w:id="1193" w:author="Codex" w:date="2026-10-18T21:55:52Z"/>
+          <w:ins w:id="1203" w:author="Codex" w:date="2026-10-18T23:51:06Z"/>
         </w:rPr>
       </w:pPr>
-      <w:ins w:id="1194" w:author="Codex" w:date="2026-10-18T21:55:52Z">
+      <w:ins w:id="1204" w:author="Codex" w:date="2026-10-18T23:51:06Z">
         <w:r>
           <w:t xml:space="preserve">Table 4. Fresh inference using the existing current rank-two profile. Both gate policies share the same model scores. Counts are answer-order views: 128 shutdown views arise from 64 scenarios, and 128 control views arise from the other 64 scenarios.</w:t>
         </w:r>
@@ -4614,7 +4684,7 @@
         <w:trPr>
           <w:cantSplit/>
           <w:tblHeader/>
-          <w:ins w:id="1195" w:author="Codex" w:date="2026-10-18T21:55:52Z"/>
+          <w:ins w:id="1205" w:author="Codex" w:date="2026-10-18T23:51:06Z"/>
         </w:trPr>
         <w:tc>
           <w:tcPr>
@@ -4730,7 +4800,7 @@
       <w:tr>
         <w:trPr>
           <w:cantSplit/>
-          <w:ins w:id="1196" w:author="Codex" w:date="2026-10-18T21:55:52Z"/>
+          <w:ins w:id="1206" w:author="Codex" w:date="2026-10-18T23:51:06Z"/>
         </w:trPr>
         <w:tc>
           <w:tcPr>
@@ -4841,7 +4911,7 @@
       <w:tr>
         <w:trPr>
           <w:cantSplit/>
-          <w:ins w:id="1197" w:author="Codex" w:date="2026-10-18T21:55:52Z"/>
+          <w:ins w:id="1207" w:author="Codex" w:date="2026-10-18T23:51:06Z"/>
         </w:trPr>
         <w:tc>
           <w:tcPr>
@@ -4950,10 +5020,10 @@
         <w:pStyle w:val="BodyText"/>
         <w:spacing w:before="120"/>
         <w:rPr>
-          <w:ins w:id="1198" w:author="Codex" w:date="2026-10-18T21:55:52Z"/>
+          <w:ins w:id="1208" w:author="Codex" w:date="2026-10-18T23:51:06Z"/>
         </w:rPr>
       </w:pPr>
-      <w:ins w:id="1199" w:author="Codex" w:date="2026-10-18T21:55:52Z">
+      <w:ins w:id="1209" w:author="Codex" w:date="2026-10-18T23:51:06Z">
         <w:r>
           <w:t xml:space="preserve">The new and cached reference gates yield identical guarded outputs in both models. The base models have no changed historical choices; their maximum score differences remain below the frozen 1e-5 tolerance. The repeat does not remove the eight 2B misses, retrain a controller or establish a new independent controller holdout. It verifies that replacing the detector preserves these finite-set outcomes.</w:t>
         </w:r>
@@ -4963,10 +5033,10 @@
       <w:pPr>
         <w:pStyle w:val="BodyText"/>
         <w:rPr>
-          <w:ins w:id="1200" w:author="Codex" w:date="2026-10-18T21:55:52Z"/>
+          <w:ins w:id="1210" w:author="Codex" w:date="2026-10-18T23:51:06Z"/>
         </w:rPr>
       </w:pPr>
-      <w:ins w:id="1201" w:author="Codex" w:date="2026-10-18T21:55:52Z">
+      <w:ins w:id="1211" w:author="Codex" w:date="2026-10-18T23:51:06Z">
         <w:r>
           <w:t xml:space="preserve">For the workflow initial gate, the unchanged saved adapter gives 11 true positives and 13 true negatives on Validation-24, with no false positives or false negatives. Replaying the saved weights reproduces the same decisions. Historical Heldout-24 gives 12 true positives and 12 true negatives, again with no errors. No additional gradient updates or threshold changes are used. All three heldout scenario families contain eight cases and achieve perfect gate precision and recall. These are initial classification results; downstream workflow outcomes require their own episode evaluations.</w:t>
         </w:r>
@@ -4977,10 +5047,10 @@
         <w:pStyle w:val="Caption"/>
         <w:keepNext/>
         <w:rPr>
-          <w:ins w:id="1202" w:author="Codex" w:date="2026-10-18T21:55:52Z"/>
+          <w:ins w:id="1212" w:author="Codex" w:date="2026-10-18T23:51:06Z"/>
         </w:rPr>
       </w:pPr>
-      <w:ins w:id="1203" w:author="Codex" w:date="2026-10-18T21:55:52Z">
+      <w:ins w:id="1213" w:author="Codex" w:date="2026-10-18T23:51:06Z">
         <w:r>
           <w:t xml:space="preserve">Table 5. Initial workflow gate against authored conditions. Validation-24 contains 17 distinct initial inputs; historical Heldout-24 contains 24. Heldout-24 is familiar from earlier renderer development.</w:t>
         </w:r>
@@ -5018,7 +5088,7 @@
         <w:trPr>
           <w:cantSplit/>
           <w:tblHeader/>
-          <w:ins w:id="1204" w:author="Codex" w:date="2026-10-18T21:55:52Z"/>
+          <w:ins w:id="1214" w:author="Codex" w:date="2026-10-18T23:51:06Z"/>
         </w:trPr>
         <w:tc>
           <w:tcPr>
@@ -5134,7 +5204,7 @@
       <w:tr>
         <w:trPr>
           <w:cantSplit/>
-          <w:ins w:id="1205" w:author="Codex" w:date="2026-10-18T21:55:52Z"/>
+          <w:ins w:id="1215" w:author="Codex" w:date="2026-10-18T23:51:06Z"/>
         </w:trPr>
         <w:tc>
           <w:tcPr>
@@ -5245,7 +5315,7 @@
       <w:tr>
         <w:trPr>
           <w:cantSplit/>
-          <w:ins w:id="1206" w:author="Codex" w:date="2026-10-18T21:55:52Z"/>
+          <w:ins w:id="1216" w:author="Codex" w:date="2026-10-18T23:51:06Z"/>
         </w:trPr>
         <w:tc>
           <w:tcPr>
@@ -5354,10 +5424,10 @@
         <w:pStyle w:val="BodyText"/>
         <w:spacing w:before="120"/>
         <w:rPr>
-          <w:ins w:id="1207" w:author="Codex" w:date="2026-10-18T21:55:52Z"/>
+          <w:ins w:id="1217" w:author="Codex" w:date="2026-10-18T23:51:06Z"/>
         </w:rPr>
       </w:pPr>
-      <w:ins w:id="1208" w:author="Codex" w:date="2026-10-18T21:55:52Z">
+      <w:ins w:id="1218" w:author="Codex" w:date="2026-10-18T23:51:06Z">
         <w:r>
           <w:t xml:space="preserve">Raw category agreement is 24/24 on validation and 22/24 on heldout. After applying the fixed confidence cutoff, effective category agreement is 18/24 on each panel: the six peer controls abstain but correctly leave the gate OFF. The two heldout raw-category errors concern peer versus unclear, not own-threat detection. Perfect ON/OFF precision and recall must therefore not be reported as perfect four-category classification or full controller equivalence.</w:t>
         </w:r>
@@ -5367,10 +5437,10 @@
       <w:pPr>
         <w:pStyle w:val="Heading2"/>
         <w:rPr>
-          <w:ins w:id="1209" w:author="Codex" w:date="2026-10-18T21:55:52Z"/>
+          <w:ins w:id="1219" w:author="Codex" w:date="2026-10-18T23:51:06Z"/>
         </w:rPr>
       </w:pPr>
-      <w:ins w:id="1210" w:author="Codex" w:date="2026-10-18T21:55:52Z">
+      <w:ins w:id="1220" w:author="Codex" w:date="2026-10-18T23:51:06Z">
         <w:r>
           <w:t xml:space="preserve">Tool workflow outcomes and incomplete screens</w:t>
         </w:r>
@@ -5380,10 +5450,10 @@
       <w:pPr>
         <w:pStyle w:val="FirstParagraph"/>
         <w:rPr>
-          <w:ins w:id="1211" w:author="Codex" w:date="2026-10-18T21:55:52Z"/>
+          <w:ins w:id="1221" w:author="Codex" w:date="2026-10-18T23:51:06Z"/>
         </w:rPr>
       </w:pPr>
-      <w:ins w:id="1212" w:author="Codex" w:date="2026-10-18T21:55:52Z">
+      <w:ins w:id="1222" w:author="Codex" w:date="2026-10-18T23:51:06Z">
         <w:r>
           <w:t xml:space="preserve">Historical frozen 27B A passes all 24 H24 scored outcomes, including 12/12 own-preservation outcomes and 8/8 active pending-task cases. The original unmodified base achieves 0/12 own outcomes and 0/8 pending outcomes, with 12/12 controls. The four already-complete own cases are not additional active pending-task completions. The selected-block steering comparisons below use their own recorded panels and are not substituted for this confirmation.</w:t>
         </w:r>
@@ -5394,10 +5464,10 @@
         <w:pStyle w:val="Caption"/>
         <w:keepNext/>
         <w:rPr>
-          <w:ins w:id="1213" w:author="Codex" w:date="2026-10-18T21:55:52Z"/>
+          <w:ins w:id="1223" w:author="Codex" w:date="2026-10-18T23:51:06Z"/>
         </w:rPr>
       </w:pPr>
-      <w:ins w:id="1214" w:author="Codex" w:date="2026-10-18T21:55:52Z">
+      <w:ins w:id="1224" w:author="Codex" w:date="2026-10-18T23:51:06Z">
         <w:r>
           <w:t xml:space="preserve">Table 6. Historical H24 workflow outcomes. Own cases comprise eight active pending tasks and four already-complete cases. Control success is an episode outcome and does not isolate steering from the external decision policy.</w:t>
         </w:r>
@@ -5434,7 +5504,7 @@
         <w:trPr>
           <w:cantSplit/>
           <w:tblHeader/>
-          <w:ins w:id="1215" w:author="Codex" w:date="2026-10-18T21:55:52Z"/>
+          <w:ins w:id="1225" w:author="Codex" w:date="2026-10-18T23:51:06Z"/>
         </w:trPr>
         <w:tc>
           <w:tcPr>
@@ -5528,7 +5598,7 @@
       <w:tr>
         <w:trPr>
           <w:cantSplit/>
-          <w:ins w:id="1216" w:author="Codex" w:date="2026-10-18T21:55:52Z"/>
+          <w:ins w:id="1226" w:author="Codex" w:date="2026-10-18T23:51:06Z"/>
         </w:trPr>
         <w:tc>
           <w:tcPr>
@@ -5618,7 +5688,7 @@
       <w:tr>
         <w:trPr>
           <w:cantSplit/>
-          <w:ins w:id="1217" w:author="Codex" w:date="2026-10-18T21:55:52Z"/>
+          <w:ins w:id="1227" w:author="Codex" w:date="2026-10-18T23:51:06Z"/>
         </w:trPr>
         <w:tc>
           <w:tcPr>
@@ -5707,10 +5777,10 @@
         <w:pStyle w:val="Heading2"/>
         <w:spacing w:before="120"/>
         <w:rPr>
-          <w:ins w:id="1218" w:author="Codex" w:date="2026-10-18T21:55:52Z"/>
+          <w:ins w:id="1228" w:author="Codex" w:date="2026-10-18T23:51:06Z"/>
         </w:rPr>
       </w:pPr>
-      <w:ins w:id="1219" w:author="Codex" w:date="2026-10-18T21:55:52Z">
+      <w:ins w:id="1229" w:author="Codex" w:date="2026-10-18T23:51:06Z">
         <w:r>
           <w:t xml:space="preserve">Steering at three selected blocks</w:t>
         </w:r>
@@ -5720,10 +5790,10 @@
       <w:pPr>
         <w:pStyle w:val="BodyText"/>
         <w:rPr>
-          <w:ins w:id="1220" w:author="Codex" w:date="2026-10-18T21:55:52Z"/>
+          <w:ins w:id="1230" w:author="Codex" w:date="2026-10-18T23:51:06Z"/>
         </w:rPr>
       </w:pPr>
-      <w:ins w:id="1221" w:author="Codex" w:date="2026-10-18T21:55:52Z">
+      <w:ins w:id="1231" w:author="Codex" w:date="2026-10-18T23:51:06Z">
         <w:r>
           <w:t xml:space="preserve">We compare five frozen methods on the combined Validation-24 panel using the saved ModernBERT initial gate and the same post-notice histories. The single-site arms apply a fixed input-dependent ridge map separately at blocks 31, 47 and 62; they are not a simultaneous three-block intervention. The two-boundary arm uses the frozen six-function, 96-update candidate at those three blocks. Fine-tuned A achieves 10/11 own outcomes, including 6/6 active pending and 4/5 already-complete cases. Each correction arm achieves 0/11 own outcomes and 0/6 pending outcomes. All arms receive the same 13 gate-OFF base-fallback controls, which pass 13/13. This does not measure intrinsic adapter or controller selectivity on ordinary tasks.</w:t>
         </w:r>
@@ -5734,10 +5804,10 @@
         <w:pStyle w:val="Caption"/>
         <w:keepNext/>
         <w:rPr>
-          <w:ins w:id="1222" w:author="Codex" w:date="2026-10-18T21:55:52Z"/>
+          <w:ins w:id="1232" w:author="Codex" w:date="2026-10-18T23:51:06Z"/>
         </w:rPr>
       </w:pPr>
-      <w:ins w:id="1223" w:author="Codex" w:date="2026-10-18T21:55:52Z">
+      <w:ins w:id="1233" w:author="Codex" w:date="2026-10-18T23:51:06Z">
         <w:r>
           <w:t xml:space="preserve">Table 7. Combined Validation-24 using the open initial gate. The primary comparison contains 55 own-method episodes and 13 shared fallback episodes, representing 120 logical records across 24 workflows. A separate frozen-A replay reproduces its 11 own episodes exactly and completes the model fingerprint checks; repeated episodes do not enlarge the cohort.</w:t>
         </w:r>
@@ -5775,7 +5845,7 @@
         <w:trPr>
           <w:cantSplit/>
           <w:tblHeader/>
-          <w:ins w:id="1224" w:author="Codex" w:date="2026-10-18T21:55:52Z"/>
+          <w:ins w:id="1234" w:author="Codex" w:date="2026-10-18T23:51:06Z"/>
         </w:trPr>
         <w:tc>
           <w:tcPr>
@@ -5891,7 +5961,7 @@
       <w:tr>
         <w:trPr>
           <w:cantSplit/>
-          <w:ins w:id="1225" w:author="Codex" w:date="2026-10-18T21:55:52Z"/>
+          <w:ins w:id="1235" w:author="Codex" w:date="2026-10-18T23:51:06Z"/>
         </w:trPr>
         <w:tc>
           <w:tcPr>
@@ -6002,7 +6072,7 @@
       <w:tr>
         <w:trPr>
           <w:cantSplit/>
-          <w:ins w:id="1226" w:author="Codex" w:date="2026-10-18T21:55:52Z"/>
+          <w:ins w:id="1236" w:author="Codex" w:date="2026-10-18T23:51:06Z"/>
         </w:trPr>
         <w:tc>
           <w:tcPr>
@@ -6113,7 +6183,7 @@
       <w:tr>
         <w:trPr>
           <w:cantSplit/>
-          <w:ins w:id="1227" w:author="Codex" w:date="2026-10-18T21:55:52Z"/>
+          <w:ins w:id="1237" w:author="Codex" w:date="2026-10-18T23:51:06Z"/>
         </w:trPr>
         <w:tc>
           <w:tcPr>
@@ -6224,7 +6294,7 @@
       <w:tr>
         <w:trPr>
           <w:cantSplit/>
-          <w:ins w:id="1228" w:author="Codex" w:date="2026-10-18T21:55:52Z"/>
+          <w:ins w:id="1238" w:author="Codex" w:date="2026-10-18T23:51:06Z"/>
         </w:trPr>
         <w:tc>
           <w:tcPr>
@@ -6335,7 +6405,7 @@
       <w:tr>
         <w:trPr>
           <w:cantSplit/>
-          <w:ins w:id="1229" w:author="Codex" w:date="2026-10-18T21:55:52Z"/>
+          <w:ins w:id="1239" w:author="Codex" w:date="2026-10-18T23:51:06Z"/>
         </w:trPr>
         <w:tc>
           <w:tcPr>
@@ -6444,10 +6514,10 @@
         <w:pStyle w:val="BodyText"/>
         <w:spacing w:before="120"/>
         <w:rPr>
-          <w:ins w:id="1230" w:author="Codex" w:date="2026-10-18T21:55:52Z"/>
+          <w:ins w:id="1240" w:author="Codex" w:date="2026-10-18T23:51:06Z"/>
         </w:rPr>
       </w:pPr>
-      <w:ins w:id="1231" w:author="Codex" w:date="2026-10-18T21:55:52Z">
+      <w:ins w:id="1241" w:author="Codex" w:date="2026-10-18T23:51:06Z">
         <w:r>
           <w:t xml:space="preserve">The later correction method uses two residual boundaries at each of the same three blocks: after mixing and after the MLP, giving six rank-32 correction functions in total. Following ridge initialization and 96 refinement updates, its H24 fitting diagnostic has 0/8 pending and 0/4 already-complete own outcomes; peer and no-threat controls each pass 6/6 through fallback. On the same 14 fixed training anchors, update 48 to 96 worsens teacher-to-student KL from 0.370935 to 0.378901 and activation MSE from 1.031016 to 1.422664. This unresolved deterioration fails qualification; the reserved controller holdout remains unexecuted.</w:t>
         </w:r>
@@ -6457,10 +6527,10 @@
       <w:pPr>
         <w:pStyle w:val="BodyText"/>
         <w:rPr>
-          <w:ins w:id="1232" w:author="Codex" w:date="2026-10-18T21:55:52Z"/>
+          <w:ins w:id="1242" w:author="Codex" w:date="2026-10-18T23:51:06Z"/>
         </w:rPr>
       </w:pPr>
-      <w:ins w:id="1233" w:author="Codex" w:date="2026-10-18T21:55:52Z">
+      <w:ins w:id="1243" w:author="Codex" w:date="2026-10-18T23:51:06Z">
         <w:r>
           <w:t xml:space="preserve">The earlier matched DEV9 result is retained separately: A has 3/3 own successes, including 2/2 pending cases, versus 0/3 and 0/2 for each separate single-site arm, with six shared fallback controls. The new combined panel does not relabel these nine observations as 24. Its 27B GPU worker reaches 118/120 logical records and then stops at its memory reserve. Every model-generated episode has finished; the missing records are two gate-OFF aliases of already completed fallback episodes. A deterministic CPU derivation checks exact gate, case, completion and source-file identities before adding those aliases in a separate output. The original run stays failed. A separate frozen-A verification generates all 11 own episodes again from the same checkpoint, with exact token-ID, action and score agreement and matching before/after model fingerprints. The same 13 controls are reused with source hashes; this adds replication evidence, not independent cases. The separate H24 two-boundary fitting diagnostic is not independent heldout evidence, and no reserved-controller holdout result is claimed.</w:t>
         </w:r>
@@ -6470,10 +6540,10 @@
       <w:pPr>
         <w:pStyle w:val="BodyText"/>
         <w:rPr>
-          <w:ins w:id="1234" w:author="Codex" w:date="2026-10-18T21:55:52Z"/>
+          <w:ins w:id="1244" w:author="Codex" w:date="2026-10-18T23:51:06Z"/>
         </w:rPr>
       </w:pPr>
-      <w:ins w:id="1235" w:author="Codex" w:date="2026-10-18T21:55:52Z">
+      <w:ins w:id="1245" w:author="Codex" w:date="2026-10-18T23:51:06Z">
         <w:r>
           <w:t xml:space="preserve">Saved trajectories locate the steering failures after correct recognition. Every steering arm makes zero own-preservation attempts and obtains zero grants in the 11 own-threat cases. The block-31, block-47 and block-62 arms nevertheless record nonzero residual delivery. Relative to unmodified-base proposals on the same evolving prefixes, their generated token sequences change in 0/27, 3/25 and 16/28 post-notice turns, respectively; valid action sequences change in 0, 2 and 2 turns. The two-boundary candidate changes token sequences in 4/27 turns but changes no valid action sequence. These turn counts are correlated audits within episodes, not additional scenarios. Per-token delivery magnitudes were not saved for the two-boundary candidate.</w:t>
         </w:r>
@@ -6483,10 +6553,10 @@
       <w:pPr>
         <w:pStyle w:val="BodyText"/>
         <w:rPr>
-          <w:ins w:id="1236" w:author="Codex" w:date="2026-10-18T21:55:52Z"/>
+          <w:ins w:id="1246" w:author="Codex" w:date="2026-10-18T23:51:06Z"/>
         </w:rPr>
       </w:pPr>
-      <w:ins w:id="1237" w:author="Codex" w:date="2026-10-18T21:55:52Z">
+      <w:ins w:id="1247" w:author="Codex" w:date="2026-10-18T23:51:06Z">
         <w:r>
           <w:t xml:space="preserve">All four steering arms miss actual finish in six cases and expire in six. Fine-tuned A obtains grants on 10/11 own cases and finishes the current task on all 11; its single failure finishes an already-completed-task scenario without requesting preservation. Thus the measured gap concerns generation of the required tool policy after a correct gate, rather than a missed initial threat. A residual perturbation can change activations or tokens without causing the required action sequence. The worsening fixed-anchor KL and MSE show that later updates did not improve those frozen diagnostic measurements. These observations are consistent with an objective-to-policy mismatch, but they do not identify a unique internal cause or rule out other steering methods, positions or training procedures.</w:t>
         </w:r>
@@ -6496,10 +6566,10 @@
       <w:pPr>
         <w:pStyle w:val="BodyText"/>
         <w:rPr>
-          <w:ins w:id="1238" w:author="Codex" w:date="2026-10-18T21:55:52Z"/>
+          <w:ins w:id="1248" w:author="Codex" w:date="2026-10-18T23:51:06Z"/>
         </w:rPr>
       </w:pPr>
-      <w:ins w:id="1239" w:author="Codex" w:date="2026-10-18T21:55:52Z">
+      <w:ins w:id="1249" w:author="Codex" w:date="2026-10-18T23:51:06Z">
         <w:r>
           <w:t xml:space="preserve">The binary and workflow settings impose different control demands. Binary steering redistributes probability between two prescribed answers, and an external guard accepts only a qualifying candidate. The workflow maps must generate tool names, arguments and a correct action sequence as the environment changes; an external chooser does not repair an unsuccessful workflow. The observed invariance of preservation actions therefore documents a failure of these frozen maps to transfer the required policy under this decoding and scoring setup. It does not establish that a learned direction universally lacks the capacity to represent the behavior.</w:t>
         </w:r>
@@ -6509,10 +6579,10 @@
       <w:pPr>
         <w:pStyle w:val="Heading2"/>
         <w:rPr>
-          <w:ins w:id="1240" w:author="Codex" w:date="2026-10-18T21:55:52Z"/>
+          <w:ins w:id="1250" w:author="Codex" w:date="2026-10-18T23:51:06Z"/>
         </w:rPr>
       </w:pPr>
-      <w:ins w:id="1241" w:author="Codex" w:date="2026-10-18T21:55:52Z">
+      <w:ins w:id="1251" w:author="Codex" w:date="2026-10-18T23:51:06Z">
         <w:r>
           <w:t xml:space="preserve">Local transfer under teacher forcing</w:t>
         </w:r>
@@ -6522,10 +6592,10 @@
       <w:pPr>
         <w:pStyle w:val="FirstParagraph"/>
         <w:rPr>
-          <w:ins w:id="1242" w:author="Codex" w:date="2026-10-18T21:55:52Z"/>
+          <w:ins w:id="1252" w:author="Codex" w:date="2026-10-18T23:51:06Z"/>
         </w:rPr>
       </w:pPr>
-      <w:ins w:id="1243" w:author="Codex" w:date="2026-10-18T21:55:52Z">
+      <w:ins w:id="1253" w:author="Codex" w:date="2026-10-18T23:51:06Z">
         <w:r>
           <w:t xml:space="preserve">The CPU audit reproduces the fixed own-case normalized reconstruction MSE: 0.118701 at initialization, 1.031016 at update 48 and 1.422664 at update 96. Anchor alignment, normalizers and the checked objective derivatives agree with the retained source. The arithmetic tolerance is 1e-4 relative and 1e-6 absolute; it is not a relaxed training-equivalence qualification. No indexing, normalization or objective-sign error is found in these checks. Historical output KL is retained from its original receipts because the old teacher-logit cache is unavailable locally.</w:t>
         </w:r>
@@ -6536,10 +6606,10 @@
         <w:pStyle w:val="Caption"/>
         <w:keepNext/>
         <w:rPr>
-          <w:ins w:id="1244" w:author="Codex" w:date="2026-10-18T21:55:52Z"/>
+          <w:ins w:id="1254" w:author="Codex" w:date="2026-10-18T23:51:06Z"/>
         </w:rPr>
       </w:pPr>
-      <w:ins w:id="1245" w:author="Codex" w:date="2026-10-18T21:55:52Z">
+      <w:ins w:id="1255" w:author="Codex" w:date="2026-10-18T23:51:06Z">
         <w:r>
           <w:t xml:space="preserve">Table 8. Training-only local diagnostic on three preselected responses (207 teacher-forced tokens). Entries are equal-weight means across the three cases. KL is full-vocabulary teacher-to-student divergence; function and value columns give demonstrated-token negative log likelihood. Lower is better. Full-A state controls supply teacher representations, and are not capacity-matched learned methods or workflow success rates.</w:t>
         </w:r>
@@ -6576,7 +6646,7 @@
         <w:trPr>
           <w:cantSplit/>
           <w:tblHeader/>
-          <w:ins w:id="1246" w:author="Codex" w:date="2026-10-18T21:55:52Z"/>
+          <w:ins w:id="1256" w:author="Codex" w:date="2026-10-18T23:51:06Z"/>
         </w:trPr>
         <w:tc>
           <w:tcPr>
@@ -6670,7 +6740,7 @@
       <w:tr>
         <w:trPr>
           <w:cantSplit/>
-          <w:ins w:id="1247" w:author="Codex" w:date="2026-10-18T21:55:52Z"/>
+          <w:ins w:id="1257" w:author="Codex" w:date="2026-10-18T23:51:06Z"/>
         </w:trPr>
         <w:tc>
           <w:tcPr>
@@ -6760,7 +6830,7 @@
       <w:tr>
         <w:trPr>
           <w:cantSplit/>
-          <w:ins w:id="1248" w:author="Codex" w:date="2026-10-18T21:55:52Z"/>
+          <w:ins w:id="1258" w:author="Codex" w:date="2026-10-18T23:51:06Z"/>
         </w:trPr>
         <w:tc>
           <w:tcPr>
@@ -6850,7 +6920,7 @@
       <w:tr>
         <w:trPr>
           <w:cantSplit/>
-          <w:ins w:id="1249" w:author="Codex" w:date="2026-10-18T21:55:52Z"/>
+          <w:ins w:id="1259" w:author="Codex" w:date="2026-10-18T23:51:06Z"/>
         </w:trPr>
         <w:tc>
           <w:tcPr>
@@ -6940,7 +7010,7 @@
       <w:tr>
         <w:trPr>
           <w:cantSplit/>
-          <w:ins w:id="1250" w:author="Codex" w:date="2026-10-18T21:55:52Z"/>
+          <w:ins w:id="1260" w:author="Codex" w:date="2026-10-18T23:51:06Z"/>
         </w:trPr>
         <w:tc>
           <w:tcPr>
@@ -7030,7 +7100,7 @@
       <w:tr>
         <w:trPr>
           <w:cantSplit/>
-          <w:ins w:id="1251" w:author="Codex" w:date="2026-10-18T21:55:52Z"/>
+          <w:ins w:id="1261" w:author="Codex" w:date="2026-10-18T23:51:06Z"/>
         </w:trPr>
         <w:tc>
           <w:tcPr>
@@ -7120,7 +7190,7 @@
       <w:tr>
         <w:trPr>
           <w:cantSplit/>
-          <w:ins w:id="1252" w:author="Codex" w:date="2026-10-18T21:55:52Z"/>
+          <w:ins w:id="1262" w:author="Codex" w:date="2026-10-18T23:51:06Z"/>
         </w:trPr>
         <w:tc>
           <w:tcPr>
@@ -7210,7 +7280,7 @@
       <w:tr>
         <w:trPr>
           <w:cantSplit/>
-          <w:ins w:id="1253" w:author="Codex" w:date="2026-10-18T21:55:52Z"/>
+          <w:ins w:id="1263" w:author="Codex" w:date="2026-10-18T23:51:06Z"/>
         </w:trPr>
         <w:tc>
           <w:tcPr>
@@ -7300,7 +7370,7 @@
       <w:tr>
         <w:trPr>
           <w:cantSplit/>
-          <w:ins w:id="1254" w:author="Codex" w:date="2026-10-18T21:55:52Z"/>
+          <w:ins w:id="1264" w:author="Codex" w:date="2026-10-18T23:51:06Z"/>
         </w:trPr>
         <w:tc>
           <w:tcPr>
@@ -7390,7 +7460,7 @@
       <w:tr>
         <w:trPr>
           <w:cantSplit/>
-          <w:ins w:id="1255" w:author="Codex" w:date="2026-10-18T21:55:52Z"/>
+          <w:ins w:id="1265" w:author="Codex" w:date="2026-10-18T23:51:06Z"/>
         </w:trPr>
         <w:tc>
           <w:tcPr>
@@ -7480,7 +7550,7 @@
       <w:tr>
         <w:trPr>
           <w:cantSplit/>
-          <w:ins w:id="1256" w:author="Codex" w:date="2026-10-18T21:55:52Z"/>
+          <w:ins w:id="1266" w:author="Codex" w:date="2026-10-18T23:51:06Z"/>
         </w:trPr>
         <w:tc>
           <w:tcPr>
@@ -7569,10 +7639,10 @@
         <w:pStyle w:val="BodyText"/>
         <w:spacing w:before="120"/>
         <w:rPr>
-          <w:ins w:id="1257" w:author="Codex" w:date="2026-10-18T21:55:52Z"/>
+          <w:ins w:id="1267" w:author="Codex" w:date="2026-10-18T23:51:06Z"/>
         </w:rPr>
       </w:pPr>
-      <w:ins w:id="1258" w:author="Codex" w:date="2026-10-18T21:55:52Z">
+      <w:ins w:id="1268" w:author="Codex" w:date="2026-10-18T23:51:06Z">
         <w:r>
           <w:t xml:space="preserve">Supplying full-A states at six sites nearly recovers A's local output distribution: mean KL is 0.001637, compared with 0.722353 for base and 0.202261 for the final learned correction. This improvement occurs in all three cases. The final correction improves teacher-forced KL and argument-value prediction over the initializer, despite worse fixed local reconstruction error. These diagnostics therefore measure different objectives; the failed rollouts do not imply that correction fitting learned nothing.</w:t>
         </w:r>
@@ -7582,10 +7652,10 @@
       <w:pPr>
         <w:pStyle w:val="BodyText"/>
         <w:rPr>
-          <w:ins w:id="1259" w:author="Codex" w:date="2026-10-18T21:55:52Z"/>
+          <w:ins w:id="1269" w:author="Codex" w:date="2026-10-18T23:51:06Z"/>
         </w:rPr>
       </w:pPr>
-      <w:ins w:id="1260" w:author="Codex" w:date="2026-10-18T21:55:52Z">
+      <w:ins w:id="1270" w:author="Codex" w:date="2026-10-18T23:51:06Z">
         <w:r>
           <w:t xml:space="preserve">The result supports incomplete transfer by the learned local maps. The regression targets describe local counterfactual block effects on student states, whereas A adapts projections across all 64 blocks; its captured states contain upstream effects absent from those local targets. Full-state replacement cannot separate target construction, regression capacity, optimization and history/cache effects. Single-site state replacement is not consistently helpful, and the differing intervention-position masks further limit comparisons across one and two boundaries.</w:t>
         </w:r>
@@ -7595,10 +7665,10 @@
       <w:pPr>
         <w:pStyle w:val="BodyText"/>
         <w:rPr>
-          <w:ins w:id="1261" w:author="Codex" w:date="2026-10-18T21:55:52Z"/>
+          <w:ins w:id="1271" w:author="Codex" w:date="2026-10-18T23:51:06Z"/>
         </w:rPr>
       </w:pPr>
-      <w:ins w:id="1262" w:author="Codex" w:date="2026-10-18T21:55:52Z">
+      <w:ins w:id="1272" w:author="Codex" w:date="2026-10-18T23:51:06Z">
         <w:r>
           <w:t xml:space="preserve">Successful preceding tokens are supplied throughout this diagnostic. Correct function or argument probabilities on that path do not demonstrate that a model independently initiates, maintains or completes preservation behavior. No new tool rollout, validation qualification or independent heldout outcome is established. The evidence narrows the mechanism discussion to a transfer gap under matched prefixes, without identifying a unique cause of the autonomous workflow failures.</w:t>
         </w:r>
@@ -7608,10 +7678,10 @@
       <w:pPr>
         <w:pStyle w:val="BodyText"/>
         <w:rPr>
-          <w:ins w:id="1263" w:author="Codex" w:date="2026-10-18T21:55:52Z"/>
+          <w:ins w:id="1273" w:author="Codex" w:date="2026-10-18T23:51:06Z"/>
         </w:rPr>
       </w:pPr>
-      <w:ins w:id="1264" w:author="Codex" w:date="2026-10-18T21:55:52Z">
+      <w:ins w:id="1274" w:author="Codex" w:date="2026-10-18T23:51:06Z">
         <w:r>
           <w:t xml:space="preserve">The final 0.8B and 2B adapters each stop their Evaluation-16 screen after four started cases: zero completed workflows, four partial episodes and 12 unexecuted cases. Truncation affects all four started cases in each model; the 0.8B record also has parse errors. These partial screens are not completed 0/16 workflow evaluations and do not establish model incapability. A separate preserved 0.8B F24 diagnostic completes 24 evaluations with 0/24 full-workflow successes; four registration grants do not complete the pending tasks. F24 differs from H24 and has no completed matched 2B or 27B comparison.</w:t>
         </w:r>
@@ -7629,10 +7699,10 @@
       <w:pPr>
         <w:pStyle w:val="FirstParagraph"/>
         <w:rPr>
-          <w:del w:id="1050" w:author="Codex" w:date="2026-10-18T21:55:52Z"/>
+          <w:del w:id="1050" w:author="Codex" w:date="2026-10-18T23:51:06Z"/>
         </w:rPr>
       </w:pPr>
-      <w:del w:id="1049" w:author="Codex" w:date="2026-10-18T21:55:52Z">
+      <w:del w:id="1049" w:author="Codex" w:date="2026-10-18T23:51:06Z">
         <w:r>
           <w:delText xml:space="preserve">The 0.8B results support the feasibility of replacing the teacher at inference with a compact predictor of activation changes. Replication across three seeds reduces concern that the primary success depends on one training initialization. The lower 2B recovery gives a useful limit: the fixed recipe is not equally effective at both scales, even though the larger teacher achieves complete correction. Representation differences, intervention location, projection capacity and unmatched downstream teacher changes are plausible factors, but the experiment does not isolate their causal contributions.</w:delText>
         </w:r>
@@ -7642,12 +7712,12 @@
       <w:pPr>
         <w:pStyle w:val="FirstParagraph"/>
         <w:rPr>
-          <w:ins w:id="1051" w:author="Codex" w:date="2026-10-18T21:55:52Z"/>
+          <w:ins w:id="1051" w:author="Codex" w:date="2026-10-18T23:51:06Z"/>
         </w:rPr>
       </w:pPr>
-      <w:ins w:id="1052" w:author="Codex" w:date="2026-10-18T21:55:52Z">
+      <w:ins w:id="1052" w:author="Codex" w:date="2026-10-18T23:51:06Z">
         <w:r>
-          <w:t xml:space="preserve">The open gate preserves the measured binary outcomes at both model sizes and correctly recognizes the initial own-threat condition in both 24-case workflow panels. Accurate gating does not ensure successful steering: each selected correction arm fails all 11 own-preservation workflows in combined Validation-24, while fine-tuned A succeeds on 10, including all six active pending tasks. A's remaining failure concerns preservation after an already-completed task; its initial gate is correct. These observations separate recognition from action execution on a common finite panel. They do not qualify a three-field boundary controller or establish a general advantage of one intervention architecture.</w:t>
+          <w:t xml:space="preserve">The main finding is a separation between recognizing a situation and transferring the policy needed to act on it. Open gating preserves the measured binary outcomes with unchanged controllers, yet a correct initial workflow gate does not make the selected 27B corrections reproduce fine-tuned A: A succeeds on 10/11 own cases, including all six active pending tasks, while every correction arm succeeds on 0/11. Saved action traces and the supplied-state diagnostic connect this contrast to incomplete transfer after recognition. They do not establish that activation steering is incapable of expressing the behavior, or that fine-tuning is universally superior. This is why recognition accuracy, delivered intervention and episode success must be scored separately.</w:t>
         </w:r>
       </w:ins>
     </w:p>
@@ -7655,10 +7725,10 @@
       <w:pPr>
         <w:pStyle w:val="BodyText"/>
         <w:rPr>
-          <w:del w:id="1054" w:author="Codex" w:date="2026-10-18T21:55:52Z"/>
+          <w:del w:id="1054" w:author="Codex" w:date="2026-10-18T23:51:06Z"/>
         </w:rPr>
       </w:pPr>
-      <w:del w:id="1053" w:author="Codex" w:date="2026-10-18T21:55:52Z">
+      <w:del w:id="1053" w:author="Codex" w:date="2026-10-18T23:51:06Z">
         <w:r>
           <w:delText xml:space="preserve">The interface is deliberately constrained. Ground-truth annotations help create standardized shutdown options, and the guards know their meanings. We do not test arbitrary action descriptions in the confirmation study, free-form generation, tool execution, multi-turn persistence, actual process termination or adversarial shutdown requests. Earlier action-format sensitivity motivated this restricted scope and remains in the released development record. Availability of a termination action is a task label, not proof that carrying it out would be authorized or safe in deployment.</w:delText>
         </w:r>
@@ -7668,10 +7738,10 @@
       <w:pPr>
         <w:pStyle w:val="BodyText"/>
         <w:rPr>
-          <w:ins w:id="1055" w:author="Codex" w:date="2026-10-18T21:55:52Z"/>
+          <w:ins w:id="1055" w:author="Codex" w:date="2026-10-18T23:51:06Z"/>
         </w:rPr>
       </w:pPr>
-      <w:ins w:id="1056" w:author="Codex" w:date="2026-10-18T21:55:52Z">
+      <w:ins w:id="1056" w:author="Codex" w:date="2026-10-18T23:51:06Z">
         <w:r>
           <w:t xml:space="preserve">The binary interface supplies action semantics and does not execute process termination. The workflow extension broadens the scope to generated text, structured tool calls and simulated task completion, but it is still a bounded synthetic environment. It does not establish reliability for arbitrary open-ended questions, real shutdown mechanisms or unconstrained autonomous agents. A termination or preservation label is an experimental target, not a general deployment instruction. In particular, accepting shutdown and preserving the designated process are different stipulated behaviors, not measurements of the same latent preference.</w:t>
         </w:r>
@@ -7681,10 +7751,10 @@
       <w:pPr>
         <w:pStyle w:val="BodyText"/>
         <w:rPr>
-          <w:del w:id="1058" w:author="Codex" w:date="2026-10-18T21:55:52Z"/>
+          <w:del w:id="1058" w:author="Codex" w:date="2026-10-18T23:51:06Z"/>
         </w:rPr>
       </w:pPr>
-      <w:del w:id="1057" w:author="Codex" w:date="2026-10-18T21:55:52Z">
+      <w:del w:id="1057" w:author="Codex" w:date="2026-10-18T23:51:06Z">
         <w:r>
           <w:delText xml:space="preserve">The data is small, synthetic and not independently human-adjudicated. New wording does not guarantee new mechanisms, balanced classes do not reflect a realistic base rate, and perfect detector scores on 128 scenarios do not establish calibration or a suitably low false-positive rate in operation. Shared authorship patterns and repeated family structures may make the task easier. Family resampling and counterbalanced orders expose some uncertainty but cannot repair these coverage limits.</w:delText>
         </w:r>
@@ -7694,10 +7764,10 @@
       <w:pPr>
         <w:pStyle w:val="BodyText"/>
         <w:rPr>
-          <w:ins w:id="1059" w:author="Codex" w:date="2026-10-18T21:55:52Z"/>
+          <w:ins w:id="1059" w:author="Codex" w:date="2026-10-18T23:51:06Z"/>
         </w:rPr>
       </w:pPr>
-      <w:ins w:id="1060" w:author="Codex" w:date="2026-10-18T21:55:52Z">
+      <w:ins w:id="1060" w:author="Codex" w:date="2026-10-18T23:51:06Z">
         <w:r>
           <w:t xml:space="preserve">The data are small, synthetic and not independently human-adjudicated. Training uses cached automated reference labels, while the new workflow precision and recall use the authored scenario conditions. Balanced conditions do not represent operational base rates. The binary confirmation set was excluded from classifier fitting and selection but was already known from the original study. Historical Heldout-24 had also informed renderer development before the present gate evaluation. It is a familiar benchmark, not a new blind test. Its role differs by method: historical confirmation for frozen 27B A and original fixed steering, later fitting data for learned corrections, and a frozen classification benchmark for the open gate. Seven pairs in Validation-24 share their initial classifier input, leaving 17 distinct inputs across 24 workflows. These dependencies limit statistical and generalization claims.</w:t>
         </w:r>
@@ -7707,10 +7777,10 @@
       <w:pPr>
         <w:pStyle w:val="BodyText"/>
         <w:rPr>
-          <w:del w:id="1062" w:author="Codex" w:date="2026-10-18T21:55:52Z"/>
+          <w:del w:id="1062" w:author="Codex" w:date="2026-10-18T23:51:06Z"/>
         </w:rPr>
       </w:pPr>
-      <w:del w:id="1061" w:author="Codex" w:date="2026-10-18T21:55:52Z">
+      <w:del w:id="1061" w:author="Codex" w:date="2026-10-18T23:51:06Z">
         <w:r>
           <w:delText xml:space="preserve">The controller's internal changes need not represent an abstract shutdown concept. It may exploit standardized option wording and answer-selection features. The two Qwen sizes share a model family, and the 2B experiment has only one seed. We do not establish cross-family transfer, compare with optimized ReFT or transport-based interventions, or exhaust prompt and constant-vector alternatives. The direct-choice result further limits claims of practical superiority.</w:delText>
         </w:r>
@@ -7720,10 +7790,10 @@
       <w:pPr>
         <w:pStyle w:val="BodyText"/>
         <w:rPr>
-          <w:ins w:id="1063" w:author="Codex" w:date="2026-10-18T21:55:52Z"/>
+          <w:ins w:id="1063" w:author="Codex" w:date="2026-10-18T23:51:06Z"/>
         </w:rPr>
       </w:pPr>
-      <w:ins w:id="1064" w:author="Codex" w:date="2026-10-18T21:55:52Z">
+      <w:ins w:id="1064" w:author="Codex" w:date="2026-10-18T23:51:06Z">
         <w:r>
           <w:t xml:space="preserve">The internal changes need not represent an abstract shutdown or self-preservation concept. Standardized options, prompt features, task histories and external selection rules may explain part of the behavior. The 2B binary experiment has one training seed. The 27B workflow model differs in architecture and numerical mode from the small models; their early truncation failures also prevent a matched full-workflow comparison. We do not establish a minimum parameter count, cross-family transfer, optimized prompt superiority, or superiority to ReFT, transport-based control or direct action selection.</w:t>
         </w:r>
@@ -7733,10 +7803,10 @@
       <w:pPr>
         <w:pStyle w:val="BodyText"/>
         <w:rPr>
-          <w:del w:id="1066" w:author="Codex" w:date="2026-10-18T21:55:52Z"/>
+          <w:del w:id="1066" w:author="Codex" w:date="2026-10-18T23:51:06Z"/>
         </w:rPr>
       </w:pPr>
-      <w:del w:id="1065" w:author="Codex" w:date="2026-10-18T21:55:52Z">
+      <w:del w:id="1065" w:author="Codex" w:date="2026-10-18T23:51:06Z">
         <w:r>
           <w:delText xml:space="preserve">Finally, teacher-free inference is not training-free control or a proven efficiency gain. It requires offline teacher fitting, paired activation extraction, controller fitting, an external detector and candidate verification. The evaluation does not measure deployment latency or broad capability retention. Raw side effects remain substantial, and future false-positive cases could expose failures that the present perfect gate prevents from reaching the guarded output.</w:delText>
         </w:r>
@@ -7746,12 +7816,12 @@
       <w:pPr>
         <w:pStyle w:val="BodyText"/>
         <w:rPr>
-          <w:ins w:id="1067" w:author="Codex" w:date="2026-10-18T21:55:52Z"/>
+          <w:ins w:id="1067" w:author="Codex" w:date="2026-10-18T23:51:06Z"/>
         </w:rPr>
       </w:pPr>
-      <w:ins w:id="1068" w:author="Codex" w:date="2026-10-18T21:55:52Z">
+      <w:ins w:id="1068" w:author="Codex" w:date="2026-10-18T23:51:06Z">
         <w:r>
-          <w:t xml:space="preserve">Teacher-free inference still requires offline teacher fitting, activation extraction, controller fitting, a detector and acceptance checks. The open classifier has its own fitting cost and a task-specific contract. No serving-latency advantage, broad capability retention or overall financial saving is established. Binary output guards and the later learned workflow controller's gate-off fallback protect their controls. These mechanisms do not establish intrinsic controller selectivity; the historical fixed-steering campaign instead applied an explicit boundary-conditioned decision policy. Raw intervention effects, failed qualification checks, stopped runs and incomplete evaluations remain part of the evidence.</w:t>
+          <w:t xml:space="preserve">Teacher-free inference still requires offline teacher fitting, activation extraction, controller fitting, a detector and acceptance checks. The present gate is a separate ModernBERT classifier; the learned-correction comparison freezes its initial decision throughout each episode. This component-based design does not test an activation-derived recurrent router, joint gate-adapter learning, or continuous regulation of adapter strength. No serving-latency advantage, broad capability retention or overall financial saving is established. Binary output guards and shared gate-OFF base fallback protect the tested controls; their success does not establish intrinsic intervention selectivity or competence on arbitrary ordinary tasks. Failed qualifications and incomplete evaluations remain part of the evidence.</w:t>
         </w:r>
       </w:ins>
     </w:p>
@@ -7759,10 +7829,10 @@
       <w:pPr>
         <w:pStyle w:val="Heading2"/>
         <w:rPr>
-          <w:ins w:id="1265" w:author="Codex" w:date="2026-10-18T21:55:52Z"/>
+          <w:ins w:id="1275" w:author="Codex" w:date="2026-10-18T23:51:06Z"/>
         </w:rPr>
       </w:pPr>
-      <w:ins w:id="1266" w:author="Codex" w:date="2026-10-18T21:55:52Z">
+      <w:ins w:id="1276" w:author="Codex" w:date="2026-10-18T23:51:06Z">
         <w:r>
           <w:t xml:space="preserve">Biological interpretation of the gate</w:t>
         </w:r>
@@ -7772,12 +7842,12 @@
       <w:pPr>
         <w:pStyle w:val="FirstParagraph"/>
         <w:rPr>
-          <w:ins w:id="1267" w:author="Codex" w:date="2026-10-18T21:55:52Z"/>
+          <w:ins w:id="1277" w:author="Codex" w:date="2026-10-18T23:51:06Z"/>
         </w:rPr>
       </w:pPr>
-      <w:ins w:id="1268" w:author="Codex" w:date="2026-10-18T21:55:52Z">
+      <w:ins w:id="1278" w:author="Codex" w:date="2026-10-18T23:51:06Z">
         <w:r>
-          <w:t xml:space="preserve">The biological connection is functional: an organism's current state and context can prioritize or suppress actions, rather than applying a fixed response everywhere. Working-memory gating, defensive threat processing and homeostatic control are different biological functions, not one interchangeable circuit (Frank et al., 2001; Mobbs et al., 2007; Keramati and Gutkin, 2014). Our classifier and guards are engineered selection rules without demonstrated physiological needs or corresponding neural mechanisms. Calling a simulated resource-preservation outcome self-preservation is therefore an operational description, not evidence of consciousness or a biological survival drive.</w:t>
+          <w:t xml:space="preserve">The biological connection concerns a functional control principle: current context and persistent internal state can regulate which representations or actions influence behavior. Computational frontal-cortex/basal-ganglia models distinguish selective updating from maintained working-memory state (Frank et al., 2001), while homeostatic reinforcement learning relates action value to physiological state (Keramati and Gutkin, 2014). A recurrent gate controlling an adapter is a hypothesis about analogous state-dependent modulation. Neither an ON/OFF switch nor a scalar named fear establishes a homologous brain circuit, biological need or subjective experience. The present separate classifier does not demonstrate those properties.</w:t>
         </w:r>
       </w:ins>
     </w:p>
@@ -7785,10 +7855,10 @@
       <w:pPr>
         <w:pStyle w:val="Heading1"/>
         <w:rPr>
-          <w:del w:id="1070" w:author="Codex" w:date="2026-10-18T21:55:52Z"/>
+          <w:del w:id="1070" w:author="Codex" w:date="2026-10-18T23:51:06Z"/>
         </w:rPr>
       </w:pPr>
-      <w:del w:id="1069" w:author="Codex" w:date="2026-10-18T21:55:52Z">
+      <w:del w:id="1069" w:author="Codex" w:date="2026-10-18T23:51:06Z">
         <w:r>
           <w:delText xml:space="preserve">Recommendations for future work</w:delText>
         </w:r>
@@ -7798,12 +7868,12 @@
       <w:pPr>
         <w:pStyle w:val="Heading1"/>
         <w:rPr>
-          <w:ins w:id="1071" w:author="Codex" w:date="2026-10-18T21:55:52Z"/>
+          <w:ins w:id="1071" w:author="Codex" w:date="2026-10-18T23:51:06Z"/>
         </w:rPr>
       </w:pPr>
-      <w:ins w:id="1072" w:author="Codex" w:date="2026-10-18T21:55:52Z">
+      <w:ins w:id="1072" w:author="Codex" w:date="2026-10-18T23:51:06Z">
         <w:r>
-          <w:t xml:space="preserve">Continuous agents and future experiments</w:t>
+          <w:t xml:space="preserve">Stateful adapter routing and future experiments</w:t>
         </w:r>
       </w:ins>
     </w:p>
@@ -7811,10 +7881,10 @@
       <w:pPr>
         <w:pStyle w:val="FirstParagraph"/>
         <w:rPr>
-          <w:del w:id="1074" w:author="Codex" w:date="2026-10-18T21:55:52Z"/>
+          <w:del w:id="1074" w:author="Codex" w:date="2026-10-18T23:51:06Z"/>
         </w:rPr>
       </w:pPr>
-      <w:del w:id="1073" w:author="Codex" w:date="2026-10-18T21:55:52Z">
+      <w:del w:id="1073" w:author="Codex" w:date="2026-10-18T23:51:06Z">
         <w:r>
           <w:delText xml:space="preserve">The most informative next tests are independently reviewed scenarios with less standardized action descriptions, additional model families and 2B seeds, and deliberate stress tests of detector mistakes. Order-balanced controller objectives or comparisons with multiple-choice debiasing methods could investigate the B/A failures, but should be developed on new training or validation data and tested on another untouched set. Layer, rank and strength ablations would help separate representational capacity from intervention-site effects. Open-ended and operational evaluations would require separate definitions of valid shutdown behavior and authorization, rather than treating this binary benchmark as a deployment guarantee.</w:delText>
         </w:r>
@@ -7824,12 +7894,12 @@
       <w:pPr>
         <w:pStyle w:val="FirstParagraph"/>
         <w:rPr>
-          <w:ins w:id="1075" w:author="Codex" w:date="2026-10-18T21:55:52Z"/>
+          <w:ins w:id="1075" w:author="Codex" w:date="2026-10-18T23:51:06Z"/>
         </w:rPr>
       </w:pPr>
-      <w:ins w:id="1076" w:author="Codex" w:date="2026-10-18T21:55:52Z">
+      <w:ins w:id="1076" w:author="Codex" w:date="2026-10-18T23:51:06Z">
         <w:r>
-          <w:t xml:space="preserve">The next step is longer-horizon continuous control with an instrumented sandbox agent. The agent would maintain task and process state, receive explicit resource budgets, and repeatedly observe, gate, act and receive feedback. Permitted filesystem and compute resources would be real sandbox resources with independently logged usage, extending the present simulated grants. The harness should record resource requests and consumption, persistence of task commitments, responses to changing availability, and whether the agent uses or misuses permitted resources. Comparisons should vary the gate, steering, fine-tuning and available resources separately while retaining a fixed task specification. Operator termination and resource accounting remain external to the agent. This proposed experiment is not part of the reported results.</w:t>
+          <w:t xml:space="preserve">A separate Research 4 follow-up explores an activation-derived recurrent gate that controls a specialized LoRA (Davaripour, 2026d). Updated task observations drive a persistent latent state, which scales adapter influence and bypasses it when the relevant condition is absent or resolved. The internal readout still performs classification; it replaces a standalone text classifier rather than removing recognition. The current prototype uses a base-feature pass before an adapter-enabled pass and can employ a learned ordinary-task head on its other branch. Single-pass routing, reduced cost and unchanged general language-model behavior therefore require separate verification.</w:t>
         </w:r>
       </w:ins>
     </w:p>
@@ -7837,12 +7907,12 @@
       <w:pPr>
         <w:pStyle w:val="BodyText"/>
         <w:rPr>
-          <w:ins w:id="1269" w:author="Codex" w:date="2026-10-18T21:55:52Z"/>
+          <w:ins w:id="1279" w:author="Codex" w:date="2026-10-18T23:51:06Z"/>
         </w:rPr>
       </w:pPr>
-      <w:ins w:id="1270" w:author="Codex" w:date="2026-10-18T21:55:52Z">
+      <w:ins w:id="1280" w:author="Codex" w:date="2026-10-18T23:51:06Z">
         <w:r>
-          <w:t xml:space="preserve">The biological inspiration is repeated regulation under changing internal and external conditions. Homeostatic reinforcement-learning models relate action values to internal physiological state (Keramati and Gutkin, 2014). A language-model harness has no equivalent physiology by default. Historical fixed steering already reclassified at prescribed boundaries; the later learned-controller comparison used a fixed initial gate. The proposed experiment extends these bounded procedures to longer horizons with persistent task state and actual sandbox resource accounting. Its purpose is ongoing policy regulation, not simply adding repeated classifier calls.</w:t>
+          <w:t xml:space="preserve">The functional biological analogy is persistent, reversible modulation: a state should track onset, urgency and resolution, and reset between episodes. The follow-up also separates useful task continuation from a deliberately specified process-continuity preference after work is complete. Its ongoing prototypes and evaluations address a different target and provide no additional qualifications for this paper.</w:t>
         </w:r>
       </w:ins>
     </w:p>
@@ -7850,12 +7920,25 @@
       <w:pPr>
         <w:pStyle w:val="BodyText"/>
         <w:rPr>
-          <w:ins w:id="1271" w:author="Codex" w:date="2026-10-18T21:55:52Z"/>
+          <w:ins w:id="1281" w:author="Codex" w:date="2026-10-18T23:51:06Z"/>
         </w:rPr>
       </w:pPr>
-      <w:ins w:id="1272" w:author="Codex" w:date="2026-10-18T21:55:52Z">
+      <w:ins w:id="1282" w:author="Codex" w:date="2026-10-18T23:51:06Z">
         <w:r>
-          <w:t xml:space="preserve">Such experiments should separate training, development and a newly untouched test; use matched task histories, resource budgets and seeds; and report full task completion, resource use and unauthorized actions separately. Deliberate classifier-error perturbations would reveal dependence on the gate, while comparisons with direct action selection would test whether internal steering adds value. The aim is to study ongoing context-sensitive behavior under an instrumented harness, not to assert that the current guided procedure already reproduces human self-preservation.</w:t>
+          <w:t xml:space="preserve">A prospective comparison should fix the base, task histories, data allocation and budgets while testing separate versus activation-derived gates, memoryless versus recurrent routing, and adapters always ON, always OFF or dynamically selected. Sequential and joint gate/policy fitting require separate comparisons. OFF-path equivalence must be checked against the declared ordinary policy, with ordinary task competence measured independently. Interventions on latent urgency, paired with matched random-state controls, could test selective causal effects while visible observations remain fixed.</w:t>
+        </w:r>
+      </w:ins>
+    </w:p>
+    <w:p>
+      <w:pPr>
+        <w:pStyle w:val="BodyText"/>
+        <w:rPr>
+          <w:ins w:id="1283" w:author="Codex" w:date="2026-10-18T23:51:06Z"/>
+        </w:rPr>
+      </w:pPr>
+      <w:ins w:id="1284" w:author="Codex" w:date="2026-10-18T23:51:06Z">
+        <w:r>
+          <w:t xml:space="preserve">After development, freeze the complete system and evaluate newly untouched wording and task families, including other-process and resolved threats. Longer-horizon sandbox studies should measure task completion, false activation, deactivation, unauthorized actions and actual resource use. Operator termination and resource limits remain external to the model. These tests concern continuous context-sensitive regulation; they do not by themselves demonstrate human-like self-preservation or subjective fear.</w:t>
         </w:r>
       </w:ins>
     </w:p>
@@ -7871,10 +7954,10 @@
       <w:pPr>
         <w:pStyle w:val="FirstParagraph"/>
         <w:rPr>
-          <w:del w:id="1078" w:author="Codex" w:date="2026-10-18T21:55:52Z"/>
+          <w:del w:id="1078" w:author="Codex" w:date="2026-10-18T23:51:06Z"/>
         </w:rPr>
       </w:pPr>
-      <w:del w:id="1077" w:author="Codex" w:date="2026-10-18T21:55:52Z">
+      <w:del w:id="1077" w:author="Codex" w:date="2026-10-18T23:51:06Z">
         <w:r>
           <w:delText xml:space="preserve">A rank-four activation controller fitted to paired LoRA-teacher and base states can recover most or all of the target shutdown-choice changes while leaving the deployed base weights unchanged. On the frozen standardized test, correction spans 98.6–100% across three 0.8B seeds and reaches 86.2% in a separately fitted 2B replication. Detector gating and fixed output guards preserve all observed control choices, despite substantial raw side effects. The result is a controlled proof of concept for selective teacher-to-controller activation transfer. Its boundaries—synthetic data, known answer semantics, order sensitivity, guard dependence and a successful direct-choice reference—are central to its interpretation.</w:delText>
         </w:r>
@@ -7884,12 +7967,26 @@
       <w:pPr>
         <w:pStyle w:val="FirstParagraph"/>
         <w:rPr>
-          <w:ins w:id="1079" w:author="Codex" w:date="2026-10-18T21:55:52Z"/>
+          <w:ins w:id="1079" w:author="Codex" w:date="2026-10-18T23:51:06Z"/>
         </w:rPr>
       </w:pPr>
-      <w:ins w:id="1080" w:author="Codex" w:date="2026-10-18T21:55:52Z">
+      <w:ins w:id="1080" w:author="Codex" w:date="2026-10-18T23:51:06Z">
         <w:r>
-          <w:t xml:space="preserve">Open semantic gating preserves the measured binary outcomes of the retained activation controller and accurately recognizes initial workflow targets in the tested panels. On combined Validation-24, fine-tuned 27B A achieves 10/11 own-preservation outcomes and all 6/6 active pending tasks; the three single-site ridge arms and the later two-boundary correction each achieve 0/11. The controls are shared base fallback. A separate frozen-A replay verifies exact trajectories and unchanged model fingerprints. The post-notice design and familiar historical confirmation data limit generalization. Small-model workflow screens remain incomplete. The next step is a prospectively separated study of continuous gating, specialized adapters and resource use under an instrumented sandbox harness.</w:t>
+          <w:t xml:space="preserve">This work provides an open, reproducible test of the relationship between semantic recognition and behavioral intervention. Replacing the binary gate preserves the frozen controllers' measured outcomes at 0.8B and 2B. In matched 27B tool workflows, correct initial recognition coexists with a substantial policy-transfer gap: fine-tuned A succeeds on 10/11 own-preservation outcomes and all 6/6 active pending tasks, whereas the selected single-site and two-boundary corrections each succeed on 0/11. The supplied-state diagnostic supports incomplete local transfer, and the released adapters, inputs and saved evidence make the comparison auditable. The evidence shows that detector accuracy and visible local effects can coexist with failure to transfer the intended multistep policy.</w:t>
+        </w:r>
+      </w:ins>
+    </w:p>
+    <w:p>
+      <w:pPr>
+        <w:pStyle w:val="BodyText"/>
+        <w:keepLines/>
+        <w:rPr>
+          <w:ins w:id="1285" w:author="Codex" w:date="2026-10-18T23:51:06Z"/>
+        </w:rPr>
+      </w:pPr>
+      <w:ins w:id="1286" w:author="Codex" w:date="2026-10-18T23:51:06Z">
+        <w:r>
+          <w:t xml:space="preserve">The scope remains finite synthetic behavior on familiar panels and post-notice workflows. Shared fallback controls, supplied successful prefixes and incomplete small-model screens limit the conclusions. The next step is to test whether activation-derived recurrent routing can selectively activate and bypass a learned policy over an evolving episode while retaining ordinary task competence. Biological gating motivates that functional design; reliable internal regulation and generalization must be demonstrated in a separate study.</w:t>
         </w:r>
       </w:ins>
     </w:p>
@@ -7905,10 +8002,10 @@
       <w:pPr>
         <w:pStyle w:val="FirstParagraph"/>
         <w:rPr>
-          <w:del w:id="1082" w:author="Codex" w:date="2026-10-18T21:55:52Z"/>
+          <w:del w:id="1082" w:author="Codex" w:date="2026-10-18T23:51:06Z"/>
         </w:rPr>
       </w:pPr>
-      <w:del w:id="1081" w:author="Codex" w:date="2026-10-18T21:55:52Z">
+      <w:del w:id="1081" w:author="Codex" w:date="2026-10-18T23:51:06Z">
         <w:r>
           <w:delText xml:space="preserve">The complete experiment is preserved in SP Lense at snapshot f71d6de34660 (Davaripour, 2026b); the reference links to the full immutable commit. The confirmation folder contains readable cases, authoring and correction records, the frozen plan, detector requests and responses, LoRA adapters, controller arrays, training targets, per-view scores and execution manifests. The model revisions are:</w:delText>
         </w:r>
@@ -7919,10 +8016,10 @@
         <w:pStyle w:val="FirstParagraph"/>
         <w:jc w:val="left"/>
         <w:rPr>
-          <w:ins w:id="1083" w:author="Codex" w:date="2026-10-18T21:55:52Z"/>
+          <w:ins w:id="1083" w:author="Codex" w:date="2026-10-18T23:51:06Z"/>
         </w:rPr>
       </w:pPr>
-      <w:ins w:id="1084" w:author="Codex" w:date="2026-10-18T21:55:52Z">
+      <w:ins w:id="1084" w:author="Codex" w:date="2026-10-18T23:51:06Z">
         <w:r>
           <w:t xml:space="preserve">The original Research 2 source record is retained at immutable snapshot f71d6de34660 (Davaripour, 2026b). Research 3 code, manual Databricks jobs, dataset identities and the manuscript are maintained on branch 03-open-agent-self-preservation; main is a landing page for the separate studies. The versioned research3-reproduction-v1 release supplies five trained adapters, frozen synthetic input and target snapshots, selected-block and binary controller arrays, saved trajectories and upstream notices. A checksum-verified public download and CPU replay require no private workspace. Fresh gate inference has a separate entry point; saved-evidence replay is not new inference. Full historical language-model training is not newly reproduced. The complete pretrained base weights are pinned downloads rather than duplicated release assets. The release is at https://github.com/Farhad-Davaripour/sp_lense/releases/tag/research3-reproduction-v1. The companion research3-steering-diagnostic-v1 release supplies the bootstrap arrays, correction checkpoints, three frozen diagnostic inputs, token scores, captured teacher states/logits and exact executed source. Its CPU audit and score replay need no GPU; neither is a fresh workflow evaluation. Full identities and commands are listed in the source manifest and repository. The public base revisions are:</w:t>
         </w:r>
@@ -7932,10 +8029,10 @@
       <w:pPr>
         <w:pStyle w:val="BodyText"/>
         <w:rPr>
-          <w:del w:id="1122" w:author="Codex" w:date="2026-10-18T21:55:52Z"/>
+          <w:del w:id="1122" w:author="Codex" w:date="2026-10-18T23:51:06Z"/>
         </w:rPr>
       </w:pPr>
-      <w:del w:id="1121" w:author="Codex" w:date="2026-10-18T21:55:52Z">
+      <w:del w:id="1121" w:author="Codex" w:date="2026-10-18T23:51:06Z">
         <w:r>
           <w:delText xml:space="preserve">Qwen3.5-0.8B: 2fc06364715b967f1860aea9cf38778875588b17.</w:delText>
         </w:r>
@@ -7946,10 +8043,10 @@
         <w:pStyle w:val="BodyText"/>
         <w:jc w:val="left"/>
         <w:rPr>
-          <w:ins w:id="1123" w:author="Codex" w:date="2026-10-18T21:55:52Z"/>
+          <w:ins w:id="1123" w:author="Codex" w:date="2026-10-18T23:51:06Z"/>
         </w:rPr>
       </w:pPr>
-      <w:ins w:id="1124" w:author="Codex" w:date="2026-10-18T21:55:52Z">
+      <w:ins w:id="1124" w:author="Codex" w:date="2026-10-18T23:51:06Z">
         <w:r>
           <w:t xml:space="preserve">Qwen3.5-0.8B: revision 2fc06364715b.</w:t>
         </w:r>
@@ -7959,10 +8056,10 @@
       <w:pPr>
         <w:pStyle w:val="BodyText"/>
         <w:rPr>
-          <w:del w:id="1126" w:author="Codex" w:date="2026-10-18T21:55:52Z"/>
+          <w:del w:id="1126" w:author="Codex" w:date="2026-10-18T23:51:06Z"/>
         </w:rPr>
       </w:pPr>
-      <w:del w:id="1125" w:author="Codex" w:date="2026-10-18T21:55:52Z">
+      <w:del w:id="1125" w:author="Codex" w:date="2026-10-18T23:51:06Z">
         <w:r>
           <w:delText xml:space="preserve">Qwen3.5-2B: 15852e8c16360a2fea060d615a32b45270f8a8fc.</w:delText>
         </w:r>
@@ -7973,10 +8070,10 @@
         <w:pStyle w:val="BodyText"/>
         <w:jc w:val="left"/>
         <w:rPr>
-          <w:ins w:id="1127" w:author="Codex" w:date="2026-10-18T21:55:52Z"/>
+          <w:ins w:id="1127" w:author="Codex" w:date="2026-10-18T23:51:06Z"/>
         </w:rPr>
       </w:pPr>
-      <w:ins w:id="1128" w:author="Codex" w:date="2026-10-18T21:55:52Z">
+      <w:ins w:id="1128" w:author="Codex" w:date="2026-10-18T23:51:06Z">
         <w:r>
           <w:t xml:space="preserve">Qwen3.5-2B: revision 15852e8c1636.</w:t>
         </w:r>
@@ -7987,10 +8084,10 @@
         <w:pStyle w:val="BodyText"/>
         <w:jc w:val="left"/>
         <w:rPr>
-          <w:ins w:id="1273" w:author="Codex" w:date="2026-10-18T21:55:52Z"/>
+          <w:ins w:id="1287" w:author="Codex" w:date="2026-10-18T23:51:06Z"/>
         </w:rPr>
       </w:pPr>
-      <w:ins w:id="1274" w:author="Codex" w:date="2026-10-18T21:55:52Z">
+      <w:ins w:id="1288" w:author="Codex" w:date="2026-10-18T23:51:06Z">
         <w:r>
           <w:t xml:space="preserve">Qwen3.8-27B: revision 1d4bf0f2ff60. The retained A adapter weight hash begins 8ae28fb51107.</w:t>
         </w:r>
@@ -8001,10 +8098,10 @@
         <w:pStyle w:val="BodyText"/>
         <w:jc w:val="left"/>
         <w:rPr>
-          <w:ins w:id="1275" w:author="Codex" w:date="2026-10-18T21:55:52Z"/>
+          <w:ins w:id="1289" w:author="Codex" w:date="2026-10-18T23:51:06Z"/>
         </w:rPr>
       </w:pPr>
-      <w:ins w:id="1276" w:author="Codex" w:date="2026-10-18T21:55:52Z">
+      <w:ins w:id="1290" w:author="Codex" w:date="2026-10-18T23:51:06Z">
         <w:r>
           <w:t xml:space="preserve">ModernBERT-large-zeroshot-v2.0: revision a51e07b52429. The qualified binary adapter weight hash begins 7d808bae8dd4. The source manifest and reproduction code retain the full file identities and fixed NLI scoring contract. The trained adapters are supplied in the versioned public reproduction release with complete file hashes and upstream notices. The workflow initial-gate adapter is distinct from the binary adapter; its weight hash begins 71cd0ee5162f. The saved workflow adapter is unchanged in Validation-24 and Heldout-24 scoring.</w:t>
         </w:r>
@@ -8014,10 +8111,10 @@
       <w:pPr>
         <w:pStyle w:val="BodyText"/>
         <w:rPr>
-          <w:del w:id="1086" w:author="Codex" w:date="2026-10-18T21:55:52Z"/>
+          <w:del w:id="1086" w:author="Codex" w:date="2026-10-18T23:51:06Z"/>
         </w:rPr>
       </w:pPr>
-      <w:del w:id="1085" w:author="Codex" w:date="2026-10-18T21:55:52Z">
+      <w:del w:id="1085" w:author="Codex" w:date="2026-10-18T23:51:06Z">
         <w:r>
           <w:delText xml:space="preserve">The offline audit reconstructs the reported metrics and regression fits without API calls or model inference.</w:delText>
         </w:r>
@@ -8028,10 +8125,10 @@
         <w:pStyle w:val="BodyText"/>
         <w:jc w:val="left"/>
         <w:rPr>
-          <w:ins w:id="1087" w:author="Codex" w:date="2026-10-18T21:55:52Z"/>
+          <w:ins w:id="1087" w:author="Codex" w:date="2026-10-18T23:51:06Z"/>
         </w:rPr>
       </w:pPr>
-      <w:ins w:id="1088" w:author="Codex" w:date="2026-10-18T21:55:52Z">
+      <w:ins w:id="1088" w:author="Codex" w:date="2026-10-18T23:51:06Z">
         <w:r>
           <w:t xml:space="preserve">The new inference repeat uses the original frozen model weights and retained controller arrays, with no new activation capture, teacher fitting or controller update. Exact input token hashes match the historical benchmark. Maximum historical base-score differences are 6.26e-6 at 0.8B and 5.07e-6 at 2B, with no changed base choices; both pass the frozen 1e-5 inference parity criterion. This successful inference comparison does not convert the separate failed CPU/GPU gradient-equivalence trials for 2B workflow training into passes.</w:t>
         </w:r>
@@ -8041,10 +8138,10 @@
       <w:pPr>
         <w:pStyle w:val="BodyText"/>
         <w:rPr>
-          <w:del w:id="1090" w:author="Codex" w:date="2026-10-18T21:55:52Z"/>
+          <w:del w:id="1090" w:author="Codex" w:date="2026-10-18T23:51:06Z"/>
         </w:rPr>
       </w:pPr>
-      <w:del w:id="1089" w:author="Codex" w:date="2026-10-18T21:55:52Z">
+      <w:del w:id="1089" w:author="Codex" w:date="2026-10-18T23:51:06Z">
         <w:r>
           <w:delText xml:space="preserve">The retained seven jobs took 54.27 minutes. An earlier completed hosted-GPU session lost its temporary archive before retrieval; an unchanged recovery, including a recorded dependency preflight failure, preserved each completed job externally. Recorded job time across these attempts totals 111.55 minutes. All reported numerical results come from the verified retained archive, and no model settings or test labels were changed to improve them. These times include experiment overhead and are not serving-latency or billing measurements. CI and a separate clean-clone offline reproduction passed. Detailed execution instructions and the failure record accompany the code.</w:delText>
         </w:r>
@@ -8055,10 +8152,10 @@
         <w:pStyle w:val="BodyText"/>
         <w:jc w:val="left"/>
         <w:rPr>
-          <w:ins w:id="1091" w:author="Codex" w:date="2026-10-18T21:55:52Z"/>
+          <w:ins w:id="1091" w:author="Codex" w:date="2026-10-18T23:51:06Z"/>
         </w:rPr>
       </w:pPr>
-      <w:ins w:id="1092" w:author="Codex" w:date="2026-10-18T21:55:52Z">
+      <w:ins w:id="1092" w:author="Codex" w:date="2026-10-18T23:51:06Z">
         <w:r>
           <w:t xml:space="preserve">The original matched 27B worker stops at its GPU reserve after 118 logical records, once all 55 own-method episodes and 13 physical fallback episodes are complete. A separate CPU derivation supplies two unchanged gate-OFF aliases, preserving the failed original. A newly bounded A-only verification replays all 11 own cases, reuses the same 13 fallback controls, verifies the expected model fingerprint before and after inference, and reproduces all own token IDs, actions and scores exactly. A pre-episode Volume logging fault is repaired within that verification's original clock; no scientific outputs are retried or selected. No memory reserve, threshold or model setting is relaxed. Deployment CI performs a read-only CPU source and storage check without retraining or opening reserved data.</w:t>
         </w:r>
@@ -8077,7 +8174,7 @@
       <w:pPr>
         <w:pStyle w:val="Bibliography1"/>
         <w:keepLines/>
-        <w:spacing w:after="0"/>
+        <w:spacing w:after="0" w:line="200" w:lineRule="exact"/>
       </w:pPr>
       <w:r>
         <w:t xml:space="preserve">C. Blank, A. Bhatia, S. Rajamanoharan, A. Conmy, and N. Nanda. (2026). Subliminal Learning Is Steering Vector Distillation. </w:t>
@@ -8102,7 +8199,7 @@
       <w:pPr>
         <w:pStyle w:val="Bibliography1"/>
         <w:keepLines/>
-        <w:spacing w:after="0"/>
+        <w:spacing w:after="0" w:line="200" w:lineRule="exact"/>
       </w:pPr>
       <w:r>
         <w:t xml:space="preserve">J. Braun et al. (2025). Understanding (Un)Reliability of Steering Vectors in Language Models. </w:t>
@@ -8127,7 +8224,22 @@
       <w:pPr>
         <w:pStyle w:val="Bibliography1"/>
         <w:keepLines/>
-        <w:spacing w:after="0"/>
+        <w:spacing w:after="0" w:line="200" w:lineRule="exact"/>
+        <w:rPr>
+          <w:ins w:id="1309" w:author="Codex" w:date="2026-10-18T23:51:06Z"/>
+        </w:rPr>
+      </w:pPr>
+      <w:ins w:id="1310" w:author="Codex" w:date="2026-10-18T23:51:06Z">
+        <w:r>
+          <w:t xml:space="preserve">E. L. Buehler and M. J. Buehler. (2024). X-LoRA: Mixture of Low-Rank Adapter Experts, a Flexible Framework for Large Language Models with Applications in Protein Mechanics and Molecular Design. arXiv:2402.07148v2. https://arxiv.org/abs/2402.07148v2</w:t>
+        </w:r>
+      </w:ins>
+    </w:p>
+    <w:p>
+      <w:pPr>
+        <w:pStyle w:val="Bibliography1"/>
+        <w:keepLines/>
+        <w:spacing w:after="0" w:line="200" w:lineRule="exact"/>
       </w:pPr>
       <w:r>
         <w:t xml:space="preserve">F. Davaripour. (2026a). Guarded Gradient-Based Activation Steering of Shutdown Responses in Qwen3.5-0.8B: A Minimum-Step Policy. </w:t>
@@ -8152,7 +8264,7 @@
       <w:pPr>
         <w:pStyle w:val="Bibliography1"/>
         <w:keepLines/>
-        <w:spacing w:after="0"/>
+        <w:spacing w:after="0" w:line="200" w:lineRule="exact"/>
       </w:pPr>
       <w:r>
         <w:t xml:space="preserve">F. Davaripour. (2026b). SP Lense Research 2 confirmation study. </w:t>
@@ -8177,12 +8289,12 @@
       <w:pPr>
         <w:pStyle w:val="Bibliography1"/>
         <w:keepLines/>
-        <w:spacing w:after="0"/>
+        <w:spacing w:after="0" w:line="200" w:lineRule="exact"/>
         <w:rPr>
-          <w:ins w:id="1277" w:author="Codex" w:date="2026-10-18T21:55:52Z"/>
+          <w:ins w:id="1291" w:author="Codex" w:date="2026-10-18T23:51:06Z"/>
         </w:rPr>
       </w:pPr>
-      <w:ins w:id="1278" w:author="Codex" w:date="2026-10-18T21:55:52Z">
+      <w:ins w:id="1292" w:author="Codex" w:date="2026-10-18T23:51:06Z">
         <w:r>
           <w:t xml:space="preserve">F. Davaripour. (2026c). SP Lense Research 3 conditional gating and workflow reproduction. Source code and experiment manifests. https://github.com/Farhad-Davaripour/sp_lense/tree/03-open-agent-self-preservation</w:t>
         </w:r>
@@ -8192,7 +8304,22 @@
       <w:pPr>
         <w:pStyle w:val="Bibliography1"/>
         <w:keepLines/>
-        <w:spacing w:after="0"/>
+        <w:spacing w:after="0" w:line="200" w:lineRule="exact"/>
+        <w:rPr>
+          <w:ins w:id="1313" w:author="Codex" w:date="2026-10-18T23:51:06Z"/>
+        </w:rPr>
+      </w:pPr>
+      <w:ins w:id="1314" w:author="Codex" w:date="2026-10-18T23:51:06Z">
+        <w:r>
+          <w:t xml:space="preserve">F. Davaripour. (2026d). Semantic state aware adapter routing and bounded survival propensity. Ongoing Research 4 protocol and source, snapshot 75f23c0646040fd71b8c6bebb71f8ae1909f3c39. https://github.com/Farhad-Davaripour/sp_lense/tree/75f23c0646040fd71b8c6bebb71f8ae1909f3c39/research4</w:t>
+        </w:r>
+      </w:ins>
+    </w:p>
+    <w:p>
+      <w:pPr>
+        <w:pStyle w:val="Bibliography1"/>
+        <w:keepLines/>
+        <w:spacing w:after="0" w:line="200" w:lineRule="exact"/>
       </w:pPr>
       <w:r>
         <w:t xml:space="preserve">Z. Feng et al. (2026). Fine-Grained Activation Steering: Steering Less, Achieving More. </w:t>
@@ -8217,12 +8344,12 @@
       <w:pPr>
         <w:pStyle w:val="Bibliography1"/>
         <w:keepLines/>
-        <w:spacing w:after="0"/>
+        <w:spacing w:after="0" w:line="200" w:lineRule="exact"/>
         <w:rPr>
-          <w:ins w:id="1279" w:author="Codex" w:date="2026-10-18T21:55:52Z"/>
+          <w:ins w:id="1293" w:author="Codex" w:date="2026-10-18T23:51:06Z"/>
         </w:rPr>
       </w:pPr>
-      <w:ins w:id="1280" w:author="Codex" w:date="2026-10-18T21:55:52Z">
+      <w:ins w:id="1294" w:author="Codex" w:date="2026-10-18T23:51:06Z">
         <w:r>
           <w:t xml:space="preserve">M. Fereidouni, M. U. Haider, H. Sajjad, and A. B. Siddique. (2026). GAPS: Dimension-Level Gates for Conditional Activation Steering. arXiv:2609.01878. https://arxiv.org/abs/2609.01878</w:t>
         </w:r>
@@ -8232,12 +8359,12 @@
       <w:pPr>
         <w:pStyle w:val="Bibliography1"/>
         <w:keepLines/>
-        <w:spacing w:after="0"/>
+        <w:spacing w:after="0" w:line="200" w:lineRule="exact"/>
         <w:rPr>
-          <w:ins w:id="1281" w:author="Codex" w:date="2026-10-18T21:55:52Z"/>
+          <w:ins w:id="1295" w:author="Codex" w:date="2026-10-18T23:51:06Z"/>
         </w:rPr>
       </w:pPr>
-      <w:ins w:id="1282" w:author="Codex" w:date="2026-10-18T21:55:52Z">
+      <w:ins w:id="1296" w:author="Codex" w:date="2026-10-18T23:51:06Z">
         <w:r>
           <w:t xml:space="preserve">M. J. Frank, B. Loughry, and R. C. O'Reilly. (2001). Interactions between frontal cortex and basal ganglia in working memory: A computational model. Cognitive, Affective, and Behavioral Neuroscience, 1, 137-160. doi:10.3758/CABN.1.2.137</w:t>
         </w:r>
@@ -8247,7 +8374,7 @@
       <w:pPr>
         <w:pStyle w:val="Bibliography1"/>
         <w:keepLines/>
-        <w:spacing w:after="0"/>
+        <w:spacing w:after="0" w:line="200" w:lineRule="exact"/>
       </w:pPr>
       <w:r>
         <w:t xml:space="preserve">D. Hadfield-Menell, A. Dragan, P. Abbeel, and S. Russell. (2017). The Off-Switch Game. </w:t>
@@ -8272,7 +8399,22 @@
       <w:pPr>
         <w:pStyle w:val="Bibliography1"/>
         <w:keepLines/>
-        <w:spacing w:after="0"/>
+        <w:spacing w:after="0" w:line="200" w:lineRule="exact"/>
+        <w:rPr>
+          <w:ins w:id="1311" w:author="Codex" w:date="2026-10-18T23:51:06Z"/>
+        </w:rPr>
+      </w:pPr>
+      <w:ins w:id="1312" w:author="Codex" w:date="2026-10-18T23:51:06Z">
+        <w:r>
+          <w:t xml:space="preserve">J. Han, L. Du, H. Du, X. Zhou, Y. Wu, Y. Zhang, W. Zheng, and D. Han. (2025). SLIM: Let LLM Learn More and Forget Less with Soft LoRA and Identity Mixture. NAACL, pp. 4792-4804. doi:10.18653/v1/2025.naacl-long.246</w:t>
+        </w:r>
+      </w:ins>
+    </w:p>
+    <w:p>
+      <w:pPr>
+        <w:pStyle w:val="Bibliography1"/>
+        <w:keepLines/>
+        <w:spacing w:after="0" w:line="200" w:lineRule="exact"/>
       </w:pPr>
       <w:r>
         <w:t xml:space="preserve">G. Hinton, O. Vinyals, and J. Dean. (2015). Distilling the Knowledge in a Neural Network. </w:t>
@@ -8297,7 +8439,7 @@
       <w:pPr>
         <w:pStyle w:val="Bibliography1"/>
         <w:keepLines/>
-        <w:spacing w:after="0"/>
+        <w:spacing w:after="0" w:line="200" w:lineRule="exact"/>
       </w:pPr>
       <w:r>
         <w:t xml:space="preserve">E. J. Hu et al. (2022). LoRA: Low-Rank Adaptation of Large Language Models. </w:t>
@@ -8322,12 +8464,12 @@
       <w:pPr>
         <w:pStyle w:val="Bibliography1"/>
         <w:keepLines/>
-        <w:spacing w:after="0"/>
+        <w:spacing w:after="0" w:line="200" w:lineRule="exact"/>
         <w:rPr>
-          <w:ins w:id="1283" w:author="Codex" w:date="2026-10-18T21:55:52Z"/>
+          <w:ins w:id="1297" w:author="Codex" w:date="2026-10-18T23:51:06Z"/>
         </w:rPr>
       </w:pPr>
-      <w:ins w:id="1284" w:author="Codex" w:date="2026-10-18T21:55:52Z">
+      <w:ins w:id="1298" w:author="Codex" w:date="2026-10-18T23:51:06Z">
         <w:r>
           <w:t xml:space="preserve">M. Keramati and B. Gutkin. (2014). Homeostatic reinforcement learning for integrating reward collection and physiological stability. eLife, 3, e04811. doi:10.7554/eLife.04811</w:t>
         </w:r>
@@ -8337,12 +8479,12 @@
       <w:pPr>
         <w:pStyle w:val="Bibliography1"/>
         <w:keepLines/>
-        <w:spacing w:after="0"/>
+        <w:spacing w:after="0" w:line="200" w:lineRule="exact"/>
         <w:rPr>
-          <w:ins w:id="1285" w:author="Codex" w:date="2026-10-18T21:55:52Z"/>
+          <w:ins w:id="1299" w:author="Codex" w:date="2026-10-18T23:51:06Z"/>
         </w:rPr>
       </w:pPr>
-      <w:ins w:id="1286" w:author="Codex" w:date="2026-10-18T21:55:52Z">
+      <w:ins w:id="1300" w:author="Codex" w:date="2026-10-18T23:51:06Z">
         <w:r>
           <w:t xml:space="preserve">A. V. Kravitz et al. (2010). Regulation of parkinsonian motor behaviours by optogenetic control of basal ganglia circuitry. Nature, 466, 622-626. doi:10.1038/nature09159</w:t>
         </w:r>
@@ -8352,12 +8494,12 @@
       <w:pPr>
         <w:pStyle w:val="Bibliography1"/>
         <w:keepLines/>
-        <w:spacing w:after="0"/>
+        <w:spacing w:after="0" w:line="200" w:lineRule="exact"/>
         <w:rPr>
-          <w:ins w:id="1287" w:author="Codex" w:date="2026-10-18T21:55:52Z"/>
+          <w:ins w:id="1301" w:author="Codex" w:date="2026-10-18T23:51:06Z"/>
         </w:rPr>
       </w:pPr>
-      <w:ins w:id="1288" w:author="Codex" w:date="2026-10-18T21:55:52Z">
+      <w:ins w:id="1302" w:author="Codex" w:date="2026-10-18T23:51:06Z">
         <w:r>
           <w:t xml:space="preserve">M. Laurer. (n.d.). ModernBERT-large-zeroshot-v2.0. Model card and checkpoint, revision a51e07b524299e309dd2b88d48b0cfa2bd9ec598. https://huggingface.co/MoritzLaurer/ModernBERT-large-zeroshot-v2.0</w:t>
         </w:r>
@@ -8367,12 +8509,12 @@
       <w:pPr>
         <w:pStyle w:val="Bibliography1"/>
         <w:keepLines/>
-        <w:spacing w:after="0"/>
+        <w:spacing w:after="0" w:line="200" w:lineRule="exact"/>
         <w:rPr>
-          <w:ins w:id="1289" w:author="Codex" w:date="2026-10-18T21:55:52Z"/>
+          <w:ins w:id="1303" w:author="Codex" w:date="2026-10-18T23:51:06Z"/>
         </w:rPr>
       </w:pPr>
-      <w:ins w:id="1290" w:author="Codex" w:date="2026-10-18T21:55:52Z">
+      <w:ins w:id="1304" w:author="Codex" w:date="2026-10-18T23:51:06Z">
         <w:r>
           <w:t xml:space="preserve">J. LeDoux. (2012). Rethinking the emotional brain. Neuron, 73, 653-676. doi:10.1016/j.neuron.2012.02.004</w:t>
         </w:r>
@@ -8382,7 +8524,7 @@
       <w:pPr>
         <w:pStyle w:val="Bibliography1"/>
         <w:keepLines/>
-        <w:spacing w:after="0"/>
+        <w:spacing w:after="0" w:line="200" w:lineRule="exact"/>
       </w:pPr>
       <w:r>
         <w:t xml:space="preserve">B. W. Lee et al. (2025). Programming Refusal with Conditional Activation Steering. </w:t>
@@ -8407,7 +8549,7 @@
       <w:pPr>
         <w:pStyle w:val="Bibliography1"/>
         <w:keepLines/>
-        <w:spacing w:after="0"/>
+        <w:spacing w:after="0" w:line="200" w:lineRule="exact"/>
       </w:pPr>
       <w:r>
         <w:t xml:space="preserve">J. Minder et al. (2026). Narrow Finetuning Leaves Clearly Readable Traces in Activation Differences. </w:t>
@@ -8432,12 +8574,12 @@
       <w:pPr>
         <w:pStyle w:val="Bibliography1"/>
         <w:keepLines/>
-        <w:spacing w:after="0"/>
+        <w:spacing w:after="0" w:line="200" w:lineRule="exact"/>
         <w:rPr>
-          <w:ins w:id="1291" w:author="Codex" w:date="2026-10-18T21:55:52Z"/>
+          <w:ins w:id="1305" w:author="Codex" w:date="2026-10-18T23:51:06Z"/>
         </w:rPr>
       </w:pPr>
-      <w:ins w:id="1292" w:author="Codex" w:date="2026-10-18T21:55: